<commit_message>
add: Se agrego la tabla y los datos del scrum master al documento Peaceathome.docx en la rama kcuyuch-2024177
</commit_message>
<xml_diff>
--- a/Peaceathome.docx
+++ b/Peaceathome.docx
@@ -656,20 +656,35 @@
                 <w:lang w:val="es-ES"/>
               </w:rPr>
             </w:pPr>
-          </w:p>
-        </w:tc>
-        <w:tc>
-          <w:tcPr>
-            <w:tcW w:w="5395" w:type="dxa"/>
-          </w:tcPr>
-          <w:p>
-            <w:pPr>
-              <w:jc w:val="center"/>
-              <w:rPr>
-                <w:rFonts w:ascii="Arial" w:eastAsiaTheme="minorHAnsi" w:hAnsi="Arial" w:cs="Arial"/>
-                <w:sz w:val="24"/>
-              </w:rPr>
-            </w:pPr>
+            <w:r>
+              <w:rPr>
+                <w:rFonts w:ascii="Arial" w:eastAsiaTheme="minorHAnsi" w:hAnsi="Arial" w:cs="Arial"/>
+                <w:sz w:val="24"/>
+                <w:lang w:val="es-ES"/>
+              </w:rPr>
+              <w:t>Kenet Efraín Cuyuch Joj</w:t>
+            </w:r>
+          </w:p>
+        </w:tc>
+        <w:tc>
+          <w:tcPr>
+            <w:tcW w:w="5395" w:type="dxa"/>
+          </w:tcPr>
+          <w:p>
+            <w:pPr>
+              <w:jc w:val="center"/>
+              <w:rPr>
+                <w:rFonts w:ascii="Arial" w:eastAsiaTheme="minorHAnsi" w:hAnsi="Arial" w:cs="Arial"/>
+                <w:sz w:val="24"/>
+              </w:rPr>
+            </w:pPr>
+            <w:r>
+              <w:rPr>
+                <w:rFonts w:ascii="Arial" w:eastAsiaTheme="minorHAnsi" w:hAnsi="Arial" w:cs="Arial"/>
+                <w:sz w:val="24"/>
+              </w:rPr>
+              <w:t>Scrum Master</w:t>
+            </w:r>
           </w:p>
         </w:tc>
       </w:tr>
@@ -702,6 +717,8 @@
             </w:pPr>
           </w:p>
         </w:tc>
+        <w:bookmarkStart w:id="0" w:name="_GoBack"/>
+        <w:bookmarkEnd w:id="0"/>
       </w:tr>
       <w:tr>
         <w:tc>
@@ -1028,8 +1045,6 @@
         </w:rPr>
         <w:t xml:space="preserve">    </w:t>
       </w:r>
-      <w:bookmarkStart w:id="0" w:name="_GoBack"/>
-      <w:bookmarkEnd w:id="0"/>
     </w:p>
     <w:sectPr>
       <w:pgSz w:w="12240" w:h="15840"/>

</xml_diff>

<commit_message>
add:Se Agrego los datos del programador apadilla-20024102 al documento Peaceathome.docx en la rama apadilla-2024102
</commit_message>
<xml_diff>
--- a/Peaceathome.docx
+++ b/Peaceathome.docx
@@ -1,6 +1,6 @@
 
 <file path=word/document.xml><?xml version="1.0" encoding="utf-8"?>
-<w:document xmlns:wpc="http://schemas.microsoft.com/office/word/2010/wordprocessingCanvas" xmlns:cx="http://schemas.microsoft.com/office/drawing/2014/chartex" xmlns:cx1="http://schemas.microsoft.com/office/drawing/2015/9/8/chartex" xmlns:mc="http://schemas.openxmlformats.org/markup-compatibility/2006" xmlns:o="urn:schemas-microsoft-com:office:office" xmlns:r="http://schemas.openxmlformats.org/officeDocument/2006/relationships" xmlns:m="http://schemas.openxmlformats.org/officeDocument/2006/math" xmlns:v="urn:schemas-microsoft-com:vml" xmlns:wp14="http://schemas.microsoft.com/office/word/2010/wordprocessingDrawing" xmlns:wp="http://schemas.openxmlformats.org/drawingml/2006/wordprocessingDrawing" xmlns:w10="urn:schemas-microsoft-com:office:word" xmlns:w="http://schemas.openxmlformats.org/wordprocessingml/2006/main" xmlns:w14="http://schemas.microsoft.com/office/word/2010/wordml" xmlns:w15="http://schemas.microsoft.com/office/word/2012/wordml" xmlns:w16se="http://schemas.microsoft.com/office/word/2015/wordml/symex" xmlns:wpg="http://schemas.microsoft.com/office/word/2010/wordprocessingGroup" xmlns:wpi="http://schemas.microsoft.com/office/word/2010/wordprocessingInk" xmlns:wne="http://schemas.microsoft.com/office/word/2006/wordml" xmlns:wps="http://schemas.microsoft.com/office/word/2010/wordprocessingShape" mc:Ignorable="w14 w15 w16se wp14">
+<w:document xmlns:wpc="http://schemas.microsoft.com/office/word/2010/wordprocessingCanvas" xmlns:cx="http://schemas.microsoft.com/office/drawing/2014/chartex" xmlns:cx1="http://schemas.microsoft.com/office/drawing/2015/9/8/chartex" xmlns:cx2="http://schemas.microsoft.com/office/drawing/2015/10/21/chartex" xmlns:cx3="http://schemas.microsoft.com/office/drawing/2016/5/9/chartex" xmlns:cx4="http://schemas.microsoft.com/office/drawing/2016/5/10/chartex" xmlns:cx5="http://schemas.microsoft.com/office/drawing/2016/5/11/chartex" xmlns:cx6="http://schemas.microsoft.com/office/drawing/2016/5/12/chartex" xmlns:cx7="http://schemas.microsoft.com/office/drawing/2016/5/13/chartex" xmlns:cx8="http://schemas.microsoft.com/office/drawing/2016/5/14/chartex" xmlns:mc="http://schemas.openxmlformats.org/markup-compatibility/2006" xmlns:aink="http://schemas.microsoft.com/office/drawing/2016/ink" xmlns:am3d="http://schemas.microsoft.com/office/drawing/2017/model3d" xmlns:o="urn:schemas-microsoft-com:office:office" xmlns:oel="http://schemas.microsoft.com/office/2019/extlst" xmlns:r="http://schemas.openxmlformats.org/officeDocument/2006/relationships" xmlns:m="http://schemas.openxmlformats.org/officeDocument/2006/math" xmlns:v="urn:schemas-microsoft-com:vml" xmlns:wp14="http://schemas.microsoft.com/office/word/2010/wordprocessingDrawing" xmlns:wp="http://schemas.openxmlformats.org/drawingml/2006/wordprocessingDrawing" xmlns:w10="urn:schemas-microsoft-com:office:word" xmlns:w="http://schemas.openxmlformats.org/wordprocessingml/2006/main" xmlns:w14="http://schemas.microsoft.com/office/word/2010/wordml" xmlns:w15="http://schemas.microsoft.com/office/word/2012/wordml" xmlns:w16cex="http://schemas.microsoft.com/office/word/2018/wordml/cex" xmlns:w16cid="http://schemas.microsoft.com/office/word/2016/wordml/cid" xmlns:w16="http://schemas.microsoft.com/office/word/2018/wordml" xmlns:w16sdtdh="http://schemas.microsoft.com/office/word/2020/wordml/sdtdatahash" xmlns:w16se="http://schemas.microsoft.com/office/word/2015/wordml/symex" xmlns:wpg="http://schemas.microsoft.com/office/word/2010/wordprocessingGroup" xmlns:wpi="http://schemas.microsoft.com/office/word/2010/wordprocessingInk" xmlns:wne="http://schemas.microsoft.com/office/word/2006/wordml" xmlns:wps="http://schemas.microsoft.com/office/word/2010/wordprocessingShape" mc:Ignorable="w14 w15 w16se w16cid w16 w16cex w16sdtdh wp14">
   <w:body>
     <w:p>
       <w:pPr>
@@ -656,20 +656,35 @@
                 <w:lang w:val="es-ES"/>
               </w:rPr>
             </w:pPr>
-          </w:p>
-        </w:tc>
-        <w:tc>
-          <w:tcPr>
-            <w:tcW w:w="5395" w:type="dxa"/>
-          </w:tcPr>
-          <w:p>
-            <w:pPr>
-              <w:jc w:val="center"/>
-              <w:rPr>
-                <w:rFonts w:ascii="Arial" w:eastAsiaTheme="minorHAnsi" w:hAnsi="Arial" w:cs="Arial"/>
-                <w:sz w:val="24"/>
-              </w:rPr>
-            </w:pPr>
+            <w:r>
+              <w:rPr>
+                <w:rFonts w:ascii="Arial" w:eastAsiaTheme="minorHAnsi" w:hAnsi="Arial" w:cs="Arial"/>
+                <w:sz w:val="24"/>
+                <w:lang w:val="es-ES"/>
+              </w:rPr>
+              <w:t>Kenet Efraín Cuyuch Joj</w:t>
+            </w:r>
+          </w:p>
+        </w:tc>
+        <w:tc>
+          <w:tcPr>
+            <w:tcW w:w="5395" w:type="dxa"/>
+          </w:tcPr>
+          <w:p>
+            <w:pPr>
+              <w:jc w:val="center"/>
+              <w:rPr>
+                <w:rFonts w:ascii="Arial" w:eastAsiaTheme="minorHAnsi" w:hAnsi="Arial" w:cs="Arial"/>
+                <w:sz w:val="24"/>
+              </w:rPr>
+            </w:pPr>
+            <w:r>
+              <w:rPr>
+                <w:rFonts w:ascii="Arial" w:eastAsiaTheme="minorHAnsi" w:hAnsi="Arial" w:cs="Arial"/>
+                <w:sz w:val="24"/>
+              </w:rPr>
+              <w:t>Scrum Master</w:t>
+            </w:r>
           </w:p>
         </w:tc>
       </w:tr>
@@ -686,20 +701,35 @@
                 <w:sz w:val="24"/>
               </w:rPr>
             </w:pPr>
-          </w:p>
-        </w:tc>
-        <w:tc>
-          <w:tcPr>
-            <w:tcW w:w="5395" w:type="dxa"/>
-          </w:tcPr>
-          <w:p>
-            <w:pPr>
-              <w:jc w:val="center"/>
-              <w:rPr>
-                <w:rFonts w:ascii="Arial" w:eastAsiaTheme="minorHAnsi" w:hAnsi="Arial" w:cs="Arial"/>
-                <w:sz w:val="24"/>
-              </w:rPr>
-            </w:pPr>
+            <w:r>
+              <w:rPr>
+                <w:rFonts w:ascii="Arial" w:eastAsiaTheme="minorHAnsi" w:hAnsi="Arial" w:cs="Arial"/>
+                <w:sz w:val="24"/>
+              </w:rPr>
+              <w:t>Angel Gahel Padilla Pacheco</w:t>
+            </w:r>
+          </w:p>
+        </w:tc>
+        <w:tc>
+          <w:tcPr>
+            <w:tcW w:w="5395" w:type="dxa"/>
+          </w:tcPr>
+          <w:p>
+            <w:pPr>
+              <w:jc w:val="center"/>
+              <w:rPr>
+                <w:rFonts w:ascii="Arial" w:eastAsiaTheme="minorHAnsi" w:hAnsi="Arial" w:cs="Arial"/>
+                <w:sz w:val="24"/>
+                <w:u w:val="single"/>
+              </w:rPr>
+            </w:pPr>
+            <w:r>
+              <w:rPr>
+                <w:rFonts w:ascii="Arial" w:eastAsiaTheme="minorHAnsi" w:hAnsi="Arial" w:cs="Arial"/>
+                <w:sz w:val="24"/>
+              </w:rPr>
+              <w:t>Programador</w:t>
+            </w:r>
           </w:p>
         </w:tc>
       </w:tr>
@@ -1028,8 +1058,6 @@
         </w:rPr>
         <w:t xml:space="preserve">    </w:t>
       </w:r>
-      <w:bookmarkStart w:id="0" w:name="_GoBack"/>
-      <w:bookmarkEnd w:id="0"/>
     </w:p>
     <w:sectPr>
       <w:pgSz w:w="12240" w:h="15840"/>
@@ -1042,7 +1070,7 @@
 </file>
 
 <file path=word/styles.xml><?xml version="1.0" encoding="utf-8"?>
-<w:styles xmlns:mc="http://schemas.openxmlformats.org/markup-compatibility/2006" xmlns:r="http://schemas.openxmlformats.org/officeDocument/2006/relationships" xmlns:w="http://schemas.openxmlformats.org/wordprocessingml/2006/main" xmlns:w14="http://schemas.microsoft.com/office/word/2010/wordml" xmlns:w15="http://schemas.microsoft.com/office/word/2012/wordml" xmlns:w16se="http://schemas.microsoft.com/office/word/2015/wordml/symex" mc:Ignorable="w14 w15 w16se">
+<w:styles xmlns:mc="http://schemas.openxmlformats.org/markup-compatibility/2006" xmlns:r="http://schemas.openxmlformats.org/officeDocument/2006/relationships" xmlns:w="http://schemas.openxmlformats.org/wordprocessingml/2006/main" xmlns:w14="http://schemas.microsoft.com/office/word/2010/wordml" xmlns:w15="http://schemas.microsoft.com/office/word/2012/wordml" xmlns:w16cex="http://schemas.microsoft.com/office/word/2018/wordml/cex" xmlns:w16cid="http://schemas.microsoft.com/office/word/2016/wordml/cid" xmlns:w16="http://schemas.microsoft.com/office/word/2018/wordml" xmlns:w16sdtdh="http://schemas.microsoft.com/office/word/2020/wordml/sdtdatahash" xmlns:w16se="http://schemas.microsoft.com/office/word/2015/wordml/symex" mc:Ignorable="w14 w15 w16se w16cid w16 w16cex w16sdtdh">
   <w:docDefaults>
     <w:rPrDefault>
       <w:rPr>
@@ -1058,7 +1086,7 @@
       </w:pPr>
     </w:pPrDefault>
   </w:docDefaults>
-  <w:latentStyles w:defLockedState="0" w:defUIPriority="99" w:defSemiHidden="0" w:defUnhideWhenUsed="0" w:defQFormat="0" w:count="371">
+  <w:latentStyles w:defLockedState="0" w:defUIPriority="99" w:defSemiHidden="0" w:defUnhideWhenUsed="0" w:defQFormat="0" w:count="376">
     <w:lsdException w:name="Normal" w:uiPriority="0" w:qFormat="1"/>
     <w:lsdException w:name="heading 1" w:uiPriority="9" w:qFormat="1"/>
     <w:lsdException w:name="heading 2" w:semiHidden="1" w:uiPriority="9" w:unhideWhenUsed="1" w:qFormat="1"/>
@@ -1430,6 +1458,11 @@
     <w:lsdException w:name="List Table 5 Dark Accent 6" w:uiPriority="50"/>
     <w:lsdException w:name="List Table 6 Colorful Accent 6" w:uiPriority="51"/>
     <w:lsdException w:name="List Table 7 Colorful Accent 6" w:uiPriority="52"/>
+    <w:lsdException w:name="Mention" w:semiHidden="1" w:unhideWhenUsed="1"/>
+    <w:lsdException w:name="Smart Hyperlink" w:semiHidden="1" w:unhideWhenUsed="1"/>
+    <w:lsdException w:name="Hashtag" w:semiHidden="1" w:unhideWhenUsed="1"/>
+    <w:lsdException w:name="Unresolved Mention" w:semiHidden="1" w:unhideWhenUsed="1"/>
+    <w:lsdException w:name="Smart Link" w:semiHidden="1" w:unhideWhenUsed="1"/>
   </w:latentStyles>
   <w:style w:type="paragraph" w:default="1" w:styleId="Normal">
     <w:name w:val="Normal"/>

</xml_diff>

<commit_message>
add:Se Agrego los datos del programador jcuc-2024100 al documento Peaceathome.docx en la rama jcuc-2024100
</commit_message>
<xml_diff>
--- a/Peaceathome.docx
+++ b/Peaceathome.docx
@@ -1,6 +1,6 @@
 
 <file path=word/document.xml><?xml version="1.0" encoding="utf-8"?>
-<w:document xmlns:wpc="http://schemas.microsoft.com/office/word/2010/wordprocessingCanvas" xmlns:cx="http://schemas.microsoft.com/office/drawing/2014/chartex" xmlns:cx1="http://schemas.microsoft.com/office/drawing/2015/9/8/chartex" xmlns:mc="http://schemas.openxmlformats.org/markup-compatibility/2006" xmlns:o="urn:schemas-microsoft-com:office:office" xmlns:r="http://schemas.openxmlformats.org/officeDocument/2006/relationships" xmlns:m="http://schemas.openxmlformats.org/officeDocument/2006/math" xmlns:v="urn:schemas-microsoft-com:vml" xmlns:wp14="http://schemas.microsoft.com/office/word/2010/wordprocessingDrawing" xmlns:wp="http://schemas.openxmlformats.org/drawingml/2006/wordprocessingDrawing" xmlns:w10="urn:schemas-microsoft-com:office:word" xmlns:w="http://schemas.openxmlformats.org/wordprocessingml/2006/main" xmlns:w14="http://schemas.microsoft.com/office/word/2010/wordml" xmlns:w15="http://schemas.microsoft.com/office/word/2012/wordml" xmlns:w16se="http://schemas.microsoft.com/office/word/2015/wordml/symex" xmlns:wpg="http://schemas.microsoft.com/office/word/2010/wordprocessingGroup" xmlns:wpi="http://schemas.microsoft.com/office/word/2010/wordprocessingInk" xmlns:wne="http://schemas.microsoft.com/office/word/2006/wordml" xmlns:wps="http://schemas.microsoft.com/office/word/2010/wordprocessingShape" mc:Ignorable="w14 w15 w16se wp14">
+<w:document xmlns:wpc="http://schemas.microsoft.com/office/word/2010/wordprocessingCanvas" xmlns:cx="http://schemas.microsoft.com/office/drawing/2014/chartex" xmlns:cx1="http://schemas.microsoft.com/office/drawing/2015/9/8/chartex" xmlns:cx2="http://schemas.microsoft.com/office/drawing/2015/10/21/chartex" xmlns:cx3="http://schemas.microsoft.com/office/drawing/2016/5/9/chartex" xmlns:cx4="http://schemas.microsoft.com/office/drawing/2016/5/10/chartex" xmlns:cx5="http://schemas.microsoft.com/office/drawing/2016/5/11/chartex" xmlns:cx6="http://schemas.microsoft.com/office/drawing/2016/5/12/chartex" xmlns:cx7="http://schemas.microsoft.com/office/drawing/2016/5/13/chartex" xmlns:cx8="http://schemas.microsoft.com/office/drawing/2016/5/14/chartex" xmlns:mc="http://schemas.openxmlformats.org/markup-compatibility/2006" xmlns:aink="http://schemas.microsoft.com/office/drawing/2016/ink" xmlns:am3d="http://schemas.microsoft.com/office/drawing/2017/model3d" xmlns:o="urn:schemas-microsoft-com:office:office" xmlns:oel="http://schemas.microsoft.com/office/2019/extlst" xmlns:r="http://schemas.openxmlformats.org/officeDocument/2006/relationships" xmlns:m="http://schemas.openxmlformats.org/officeDocument/2006/math" xmlns:v="urn:schemas-microsoft-com:vml" xmlns:wp14="http://schemas.microsoft.com/office/word/2010/wordprocessingDrawing" xmlns:wp="http://schemas.openxmlformats.org/drawingml/2006/wordprocessingDrawing" xmlns:w10="urn:schemas-microsoft-com:office:word" xmlns:w="http://schemas.openxmlformats.org/wordprocessingml/2006/main" xmlns:w14="http://schemas.microsoft.com/office/word/2010/wordml" xmlns:w15="http://schemas.microsoft.com/office/word/2012/wordml" xmlns:w16cex="http://schemas.microsoft.com/office/word/2018/wordml/cex" xmlns:w16cid="http://schemas.microsoft.com/office/word/2016/wordml/cid" xmlns:w16="http://schemas.microsoft.com/office/word/2018/wordml" xmlns:w16du="http://schemas.microsoft.com/office/word/2023/wordml/word16du" xmlns:w16sdtdh="http://schemas.microsoft.com/office/word/2020/wordml/sdtdatahash" xmlns:w16sdtfl="http://schemas.microsoft.com/office/word/2024/wordml/sdtformatlock" xmlns:w16se="http://schemas.microsoft.com/office/word/2015/wordml/symex" xmlns:wpg="http://schemas.microsoft.com/office/word/2010/wordprocessingGroup" xmlns:wpi="http://schemas.microsoft.com/office/word/2010/wordprocessingInk" xmlns:wne="http://schemas.microsoft.com/office/word/2006/wordml" xmlns:wps="http://schemas.microsoft.com/office/word/2010/wordprocessingShape" mc:Ignorable="w14 w15 w16se w16cid w16 w16cex w16sdtdh w16sdtfl w16du wp14">
   <w:body>
     <w:p>
       <w:pPr>
@@ -656,20 +656,73 @@
                 <w:lang w:val="es-ES"/>
               </w:rPr>
             </w:pPr>
-          </w:p>
-        </w:tc>
-        <w:tc>
-          <w:tcPr>
-            <w:tcW w:w="5395" w:type="dxa"/>
-          </w:tcPr>
-          <w:p>
-            <w:pPr>
-              <w:jc w:val="center"/>
-              <w:rPr>
-                <w:rFonts w:ascii="Arial" w:eastAsiaTheme="minorHAnsi" w:hAnsi="Arial" w:cs="Arial"/>
-                <w:sz w:val="24"/>
-              </w:rPr>
-            </w:pPr>
+            <w:proofErr w:type="spellStart"/>
+            <w:r>
+              <w:rPr>
+                <w:rFonts w:ascii="Arial" w:eastAsiaTheme="minorHAnsi" w:hAnsi="Arial" w:cs="Arial"/>
+                <w:sz w:val="24"/>
+                <w:lang w:val="es-ES"/>
+              </w:rPr>
+              <w:t>Kenet</w:t>
+            </w:r>
+            <w:proofErr w:type="spellEnd"/>
+            <w:r>
+              <w:rPr>
+                <w:rFonts w:ascii="Arial" w:eastAsiaTheme="minorHAnsi" w:hAnsi="Arial" w:cs="Arial"/>
+                <w:sz w:val="24"/>
+                <w:lang w:val="es-ES"/>
+              </w:rPr>
+              <w:t xml:space="preserve"> Efraín </w:t>
+            </w:r>
+            <w:proofErr w:type="spellStart"/>
+            <w:r>
+              <w:rPr>
+                <w:rFonts w:ascii="Arial" w:eastAsiaTheme="minorHAnsi" w:hAnsi="Arial" w:cs="Arial"/>
+                <w:sz w:val="24"/>
+                <w:lang w:val="es-ES"/>
+              </w:rPr>
+              <w:t>Cuyuch</w:t>
+            </w:r>
+            <w:proofErr w:type="spellEnd"/>
+            <w:r>
+              <w:rPr>
+                <w:rFonts w:ascii="Arial" w:eastAsiaTheme="minorHAnsi" w:hAnsi="Arial" w:cs="Arial"/>
+                <w:sz w:val="24"/>
+                <w:lang w:val="es-ES"/>
+              </w:rPr>
+              <w:t xml:space="preserve"> </w:t>
+            </w:r>
+            <w:proofErr w:type="spellStart"/>
+            <w:r>
+              <w:rPr>
+                <w:rFonts w:ascii="Arial" w:eastAsiaTheme="minorHAnsi" w:hAnsi="Arial" w:cs="Arial"/>
+                <w:sz w:val="24"/>
+                <w:lang w:val="es-ES"/>
+              </w:rPr>
+              <w:t>Joj</w:t>
+            </w:r>
+            <w:proofErr w:type="spellEnd"/>
+          </w:p>
+        </w:tc>
+        <w:tc>
+          <w:tcPr>
+            <w:tcW w:w="5395" w:type="dxa"/>
+          </w:tcPr>
+          <w:p>
+            <w:pPr>
+              <w:jc w:val="center"/>
+              <w:rPr>
+                <w:rFonts w:ascii="Arial" w:eastAsiaTheme="minorHAnsi" w:hAnsi="Arial" w:cs="Arial"/>
+                <w:sz w:val="24"/>
+              </w:rPr>
+            </w:pPr>
+            <w:r>
+              <w:rPr>
+                <w:rFonts w:ascii="Arial" w:eastAsiaTheme="minorHAnsi" w:hAnsi="Arial" w:cs="Arial"/>
+                <w:sz w:val="24"/>
+              </w:rPr>
+              <w:t>Scrum Master</w:t>
+            </w:r>
           </w:p>
         </w:tc>
       </w:tr>
@@ -686,20 +739,60 @@
                 <w:sz w:val="24"/>
               </w:rPr>
             </w:pPr>
-          </w:p>
-        </w:tc>
-        <w:tc>
-          <w:tcPr>
-            <w:tcW w:w="5395" w:type="dxa"/>
-          </w:tcPr>
-          <w:p>
-            <w:pPr>
-              <w:jc w:val="center"/>
-              <w:rPr>
-                <w:rFonts w:ascii="Arial" w:eastAsiaTheme="minorHAnsi" w:hAnsi="Arial" w:cs="Arial"/>
-                <w:sz w:val="24"/>
-              </w:rPr>
-            </w:pPr>
+            <w:proofErr w:type="spellStart"/>
+            <w:r>
+              <w:rPr>
+                <w:rFonts w:ascii="Arial" w:eastAsiaTheme="minorHAnsi" w:hAnsi="Arial" w:cs="Arial"/>
+                <w:sz w:val="24"/>
+              </w:rPr>
+              <w:t>Angel</w:t>
+            </w:r>
+            <w:proofErr w:type="spellEnd"/>
+            <w:r>
+              <w:rPr>
+                <w:rFonts w:ascii="Arial" w:eastAsiaTheme="minorHAnsi" w:hAnsi="Arial" w:cs="Arial"/>
+                <w:sz w:val="24"/>
+              </w:rPr>
+              <w:t xml:space="preserve"> </w:t>
+            </w:r>
+            <w:proofErr w:type="spellStart"/>
+            <w:r>
+              <w:rPr>
+                <w:rFonts w:ascii="Arial" w:eastAsiaTheme="minorHAnsi" w:hAnsi="Arial" w:cs="Arial"/>
+                <w:sz w:val="24"/>
+              </w:rPr>
+              <w:t>Gahel</w:t>
+            </w:r>
+            <w:proofErr w:type="spellEnd"/>
+            <w:r>
+              <w:rPr>
+                <w:rFonts w:ascii="Arial" w:eastAsiaTheme="minorHAnsi" w:hAnsi="Arial" w:cs="Arial"/>
+                <w:sz w:val="24"/>
+              </w:rPr>
+              <w:t xml:space="preserve"> Padilla Pacheco</w:t>
+            </w:r>
+          </w:p>
+        </w:tc>
+        <w:tc>
+          <w:tcPr>
+            <w:tcW w:w="5395" w:type="dxa"/>
+          </w:tcPr>
+          <w:p>
+            <w:pPr>
+              <w:jc w:val="center"/>
+              <w:rPr>
+                <w:rFonts w:ascii="Arial" w:eastAsiaTheme="minorHAnsi" w:hAnsi="Arial" w:cs="Arial"/>
+                <w:sz w:val="24"/>
+                <w:u w:val="single"/>
+              </w:rPr>
+            </w:pPr>
+            <w:r>
+              <w:rPr>
+                <w:rFonts w:ascii="Arial" w:eastAsiaTheme="minorHAnsi" w:hAnsi="Arial" w:cs="Arial"/>
+                <w:sz w:val="24"/>
+              </w:rPr>
+              <w:t>Programador</w:t>
+            </w:r>
           </w:p>
         </w:tc>
       </w:tr>
@@ -716,20 +809,68 @@
                 <w:sz w:val="24"/>
               </w:rPr>
             </w:pPr>
-          </w:p>
-        </w:tc>
-        <w:tc>
-          <w:tcPr>
-            <w:tcW w:w="5395" w:type="dxa"/>
-          </w:tcPr>
-          <w:p>
-            <w:pPr>
-              <w:jc w:val="center"/>
-              <w:rPr>
-                <w:rFonts w:ascii="Arial" w:eastAsiaTheme="minorHAnsi" w:hAnsi="Arial" w:cs="Arial"/>
-                <w:sz w:val="24"/>
-              </w:rPr>
-            </w:pPr>
+            <w:proofErr w:type="spellStart"/>
+            <w:r>
+              <w:rPr>
+                <w:rFonts w:ascii="Arial" w:eastAsiaTheme="minorHAnsi" w:hAnsi="Arial" w:cs="Arial"/>
+                <w:sz w:val="24"/>
+              </w:rPr>
+              <w:t>Jose</w:t>
+            </w:r>
+            <w:proofErr w:type="spellEnd"/>
+            <w:r>
+              <w:rPr>
+                <w:rFonts w:ascii="Arial" w:eastAsiaTheme="minorHAnsi" w:hAnsi="Arial" w:cs="Arial"/>
+                <w:sz w:val="24"/>
+              </w:rPr>
+              <w:t xml:space="preserve"> Enrique </w:t>
+            </w:r>
+            <w:proofErr w:type="spellStart"/>
+            <w:r>
+              <w:rPr>
+                <w:rFonts w:ascii="Arial" w:eastAsiaTheme="minorHAnsi" w:hAnsi="Arial" w:cs="Arial"/>
+                <w:sz w:val="24"/>
+              </w:rPr>
+              <w:t>cuc</w:t>
+            </w:r>
+            <w:proofErr w:type="spellEnd"/>
+            <w:r>
+              <w:rPr>
+                <w:rFonts w:ascii="Arial" w:eastAsiaTheme="minorHAnsi" w:hAnsi="Arial" w:cs="Arial"/>
+                <w:sz w:val="24"/>
+              </w:rPr>
+              <w:t xml:space="preserve"> </w:t>
+            </w:r>
+            <w:proofErr w:type="spellStart"/>
+            <w:r>
+              <w:rPr>
+                <w:rFonts w:ascii="Arial" w:eastAsiaTheme="minorHAnsi" w:hAnsi="Arial" w:cs="Arial"/>
+                <w:sz w:val="24"/>
+              </w:rPr>
+              <w:t>cutz</w:t>
+            </w:r>
+            <w:proofErr w:type="spellEnd"/>
+          </w:p>
+        </w:tc>
+        <w:tc>
+          <w:tcPr>
+            <w:tcW w:w="5395" w:type="dxa"/>
+          </w:tcPr>
+          <w:p>
+            <w:pPr>
+              <w:jc w:val="center"/>
+              <w:rPr>
+                <w:rFonts w:ascii="Arial" w:eastAsiaTheme="minorHAnsi" w:hAnsi="Arial" w:cs="Arial"/>
+                <w:sz w:val="24"/>
+              </w:rPr>
+            </w:pPr>
+            <w:r>
+              <w:rPr>
+                <w:rFonts w:ascii="Arial" w:eastAsiaTheme="minorHAnsi" w:hAnsi="Arial" w:cs="Arial"/>
+                <w:sz w:val="24"/>
+              </w:rPr>
+              <w:t>Programador</w:t>
+            </w:r>
           </w:p>
         </w:tc>
       </w:tr>
@@ -1028,8 +1169,6 @@
         </w:rPr>
         <w:t xml:space="preserve">    </w:t>
       </w:r>
-      <w:bookmarkStart w:id="0" w:name="_GoBack"/>
-      <w:bookmarkEnd w:id="0"/>
     </w:p>
     <w:sectPr>
       <w:pgSz w:w="12240" w:h="15840"/>
@@ -1042,7 +1181,7 @@
 </file>
 
 <file path=word/styles.xml><?xml version="1.0" encoding="utf-8"?>
-<w:styles xmlns:mc="http://schemas.openxmlformats.org/markup-compatibility/2006" xmlns:r="http://schemas.openxmlformats.org/officeDocument/2006/relationships" xmlns:w="http://schemas.openxmlformats.org/wordprocessingml/2006/main" xmlns:w14="http://schemas.microsoft.com/office/word/2010/wordml" xmlns:w15="http://schemas.microsoft.com/office/word/2012/wordml" xmlns:w16se="http://schemas.microsoft.com/office/word/2015/wordml/symex" mc:Ignorable="w14 w15 w16se">
+<w:styles xmlns:mc="http://schemas.openxmlformats.org/markup-compatibility/2006" xmlns:r="http://schemas.openxmlformats.org/officeDocument/2006/relationships" xmlns:w="http://schemas.openxmlformats.org/wordprocessingml/2006/main" xmlns:w14="http://schemas.microsoft.com/office/word/2010/wordml" xmlns:w15="http://schemas.microsoft.com/office/word/2012/wordml" xmlns:w16cex="http://schemas.microsoft.com/office/word/2018/wordml/cex" xmlns:w16cid="http://schemas.microsoft.com/office/word/2016/wordml/cid" xmlns:w16="http://schemas.microsoft.com/office/word/2018/wordml" xmlns:w16du="http://schemas.microsoft.com/office/word/2023/wordml/word16du" xmlns:w16sdtdh="http://schemas.microsoft.com/office/word/2020/wordml/sdtdatahash" xmlns:w16sdtfl="http://schemas.microsoft.com/office/word/2024/wordml/sdtformatlock" xmlns:w16se="http://schemas.microsoft.com/office/word/2015/wordml/symex" mc:Ignorable="w14 w15 w16se w16cid w16 w16cex w16sdtdh w16sdtfl w16du">
   <w:docDefaults>
     <w:rPrDefault>
       <w:rPr>
@@ -1058,7 +1197,7 @@
       </w:pPr>
     </w:pPrDefault>
   </w:docDefaults>
-  <w:latentStyles w:defLockedState="0" w:defUIPriority="99" w:defSemiHidden="0" w:defUnhideWhenUsed="0" w:defQFormat="0" w:count="371">
+  <w:latentStyles w:defLockedState="0" w:defUIPriority="99" w:defSemiHidden="0" w:defUnhideWhenUsed="0" w:defQFormat="0" w:count="376">
     <w:lsdException w:name="Normal" w:uiPriority="0" w:qFormat="1"/>
     <w:lsdException w:name="heading 1" w:uiPriority="9" w:qFormat="1"/>
     <w:lsdException w:name="heading 2" w:semiHidden="1" w:uiPriority="9" w:unhideWhenUsed="1" w:qFormat="1"/>
@@ -1430,6 +1569,11 @@
     <w:lsdException w:name="List Table 5 Dark Accent 6" w:uiPriority="50"/>
     <w:lsdException w:name="List Table 6 Colorful Accent 6" w:uiPriority="51"/>
     <w:lsdException w:name="List Table 7 Colorful Accent 6" w:uiPriority="52"/>
+    <w:lsdException w:name="Mention" w:semiHidden="1" w:unhideWhenUsed="1"/>
+    <w:lsdException w:name="Smart Hyperlink" w:semiHidden="1" w:unhideWhenUsed="1"/>
+    <w:lsdException w:name="Hashtag" w:semiHidden="1" w:unhideWhenUsed="1"/>
+    <w:lsdException w:name="Unresolved Mention" w:semiHidden="1" w:unhideWhenUsed="1"/>
+    <w:lsdException w:name="Smart Link" w:semiHidden="1" w:unhideWhenUsed="1"/>
   </w:latentStyles>
   <w:style w:type="paragraph" w:default="1" w:styleId="Normal">
     <w:name w:val="Normal"/>

</xml_diff>

<commit_message>
add:Se Agrego los datos del programador clopez-2024242 al documento Peaceathome.docx en la rama clopez-2024242
</commit_message>
<xml_diff>
--- a/Peaceathome.docx
+++ b/Peaceathome.docx
@@ -1,6 +1,6 @@
 
 <file path=word/document.xml><?xml version="1.0" encoding="utf-8"?>
-<w:document xmlns:wpc="http://schemas.microsoft.com/office/word/2010/wordprocessingCanvas" xmlns:cx="http://schemas.microsoft.com/office/drawing/2014/chartex" xmlns:cx1="http://schemas.microsoft.com/office/drawing/2015/9/8/chartex" xmlns:mc="http://schemas.openxmlformats.org/markup-compatibility/2006" xmlns:o="urn:schemas-microsoft-com:office:office" xmlns:r="http://schemas.openxmlformats.org/officeDocument/2006/relationships" xmlns:m="http://schemas.openxmlformats.org/officeDocument/2006/math" xmlns:v="urn:schemas-microsoft-com:vml" xmlns:wp14="http://schemas.microsoft.com/office/word/2010/wordprocessingDrawing" xmlns:wp="http://schemas.openxmlformats.org/drawingml/2006/wordprocessingDrawing" xmlns:w10="urn:schemas-microsoft-com:office:word" xmlns:w="http://schemas.openxmlformats.org/wordprocessingml/2006/main" xmlns:w14="http://schemas.microsoft.com/office/word/2010/wordml" xmlns:w15="http://schemas.microsoft.com/office/word/2012/wordml" xmlns:w16se="http://schemas.microsoft.com/office/word/2015/wordml/symex" xmlns:wpg="http://schemas.microsoft.com/office/word/2010/wordprocessingGroup" xmlns:wpi="http://schemas.microsoft.com/office/word/2010/wordprocessingInk" xmlns:wne="http://schemas.microsoft.com/office/word/2006/wordml" xmlns:wps="http://schemas.microsoft.com/office/word/2010/wordprocessingShape" mc:Ignorable="w14 w15 w16se wp14">
+<w:document xmlns:wpc="http://schemas.microsoft.com/office/word/2010/wordprocessingCanvas" xmlns:cx="http://schemas.microsoft.com/office/drawing/2014/chartex" xmlns:cx1="http://schemas.microsoft.com/office/drawing/2015/9/8/chartex" xmlns:cx2="http://schemas.microsoft.com/office/drawing/2015/10/21/chartex" xmlns:cx3="http://schemas.microsoft.com/office/drawing/2016/5/9/chartex" xmlns:cx4="http://schemas.microsoft.com/office/drawing/2016/5/10/chartex" xmlns:cx5="http://schemas.microsoft.com/office/drawing/2016/5/11/chartex" xmlns:cx6="http://schemas.microsoft.com/office/drawing/2016/5/12/chartex" xmlns:cx7="http://schemas.microsoft.com/office/drawing/2016/5/13/chartex" xmlns:cx8="http://schemas.microsoft.com/office/drawing/2016/5/14/chartex" xmlns:mc="http://schemas.openxmlformats.org/markup-compatibility/2006" xmlns:aink="http://schemas.microsoft.com/office/drawing/2016/ink" xmlns:am3d="http://schemas.microsoft.com/office/drawing/2017/model3d" xmlns:o="urn:schemas-microsoft-com:office:office" xmlns:oel="http://schemas.microsoft.com/office/2019/extlst" xmlns:r="http://schemas.openxmlformats.org/officeDocument/2006/relationships" xmlns:m="http://schemas.openxmlformats.org/officeDocument/2006/math" xmlns:v="urn:schemas-microsoft-com:vml" xmlns:wp14="http://schemas.microsoft.com/office/word/2010/wordprocessingDrawing" xmlns:wp="http://schemas.openxmlformats.org/drawingml/2006/wordprocessingDrawing" xmlns:w10="urn:schemas-microsoft-com:office:word" xmlns:w="http://schemas.openxmlformats.org/wordprocessingml/2006/main" xmlns:w14="http://schemas.microsoft.com/office/word/2010/wordml" xmlns:w15="http://schemas.microsoft.com/office/word/2012/wordml" xmlns:w16cex="http://schemas.microsoft.com/office/word/2018/wordml/cex" xmlns:w16cid="http://schemas.microsoft.com/office/word/2016/wordml/cid" xmlns:w16="http://schemas.microsoft.com/office/word/2018/wordml" xmlns:w16du="http://schemas.microsoft.com/office/word/2023/wordml/word16du" xmlns:w16sdtdh="http://schemas.microsoft.com/office/word/2020/wordml/sdtdatahash" xmlns:w16sdtfl="http://schemas.microsoft.com/office/word/2024/wordml/sdtformatlock" xmlns:w16se="http://schemas.microsoft.com/office/word/2015/wordml/symex" xmlns:wpg="http://schemas.microsoft.com/office/word/2010/wordprocessingGroup" xmlns:wpi="http://schemas.microsoft.com/office/word/2010/wordprocessingInk" xmlns:wne="http://schemas.microsoft.com/office/word/2006/wordml" xmlns:wps="http://schemas.microsoft.com/office/word/2010/wordprocessingShape" mc:Ignorable="w14 w15 w16se w16cid w16 w16cex w16sdtdh w16sdtfl w16du wp14">
   <w:body>
     <w:p>
       <w:pPr>
@@ -19,8 +19,8 @@
           <w:lang w:eastAsia="es-GT"/>
         </w:rPr>
         <w:drawing>
-          <wp:inline distT="0" distB="0" distL="0" distR="0" wp14:anchorId="61DA3BD1" wp14:editId="0C35A376">
-            <wp:extent cx="2249144" cy="847725"/>
+          <wp:inline distT="0" distB="0" distL="0" distR="0" wp14:anchorId="2FEE8166" wp14:editId="6BE70031">
+            <wp:extent cx="2248535" cy="847725"/>
             <wp:effectExtent l="0" t="0" r="0" b="0"/>
             <wp:docPr id="2" name="Imagen 2"/>
             <wp:cNvGraphicFramePr>
@@ -30,13 +30,13 @@
               <a:graphicData uri="http://schemas.openxmlformats.org/drawingml/2006/picture">
                 <pic:pic xmlns:pic="http://schemas.openxmlformats.org/drawingml/2006/picture">
                   <pic:nvPicPr>
-                    <pic:cNvPr id="0" name="Picture 1"/>
+                    <pic:cNvPr id="2" name="Imagen 2"/>
                     <pic:cNvPicPr>
                       <a:picLocks noChangeAspect="1" noChangeArrowheads="1"/>
                     </pic:cNvPicPr>
                   </pic:nvPicPr>
                   <pic:blipFill>
-                    <a:blip r:embed="rId4" cstate="print">
+                    <a:blip r:embed="rId6" cstate="print">
                       <a:extLst>
                         <a:ext uri="{28A0092B-C50C-407E-A947-70E740481C1C}">
                           <a14:useLocalDpi xmlns:a14="http://schemas.microsoft.com/office/drawing/2010/main" val="0"/>
@@ -48,7 +48,7 @@
                       <a:fillRect/>
                     </a:stretch>
                   </pic:blipFill>
-                  <pic:spPr bwMode="auto">
+                  <pic:spPr>
                     <a:xfrm>
                       <a:off x="0" y="0"/>
                       <a:ext cx="2253277" cy="849283"/>
@@ -120,13 +120,7 @@
         <w:rPr>
           <w:rFonts w:ascii="Arial" w:hAnsi="Arial" w:cs="Arial"/>
         </w:rPr>
-        <w:t>5TO. PERITO EN INFORMATICA</w:t>
-      </w:r>
-      <w:r>
-        <w:rPr>
-          <w:rFonts w:ascii="Arial" w:hAnsi="Arial" w:cs="Arial"/>
-        </w:rPr>
-        <w:t xml:space="preserve"> </w:t>
+        <w:t xml:space="preserve">5TO. PERITO EN INFORMATICA </w:t>
       </w:r>
     </w:p>
     <w:p>
@@ -507,56 +501,7 @@
           <w:rFonts w:ascii="Arial" w:hAnsi="Arial" w:cs="Arial"/>
           <w:sz w:val="24"/>
         </w:rPr>
-        <w:t xml:space="preserve">Guatemala, </w:t>
-      </w:r>
-      <w:r>
-        <w:rPr>
-          <w:rFonts w:ascii="Arial" w:hAnsi="Arial" w:cs="Arial"/>
-          <w:sz w:val="24"/>
-        </w:rPr>
-        <w:t xml:space="preserve">15 </w:t>
-      </w:r>
-      <w:r>
-        <w:rPr>
-          <w:rFonts w:ascii="Arial" w:hAnsi="Arial" w:cs="Arial"/>
-          <w:sz w:val="24"/>
-        </w:rPr>
-        <w:t xml:space="preserve">de </w:t>
-      </w:r>
-      <w:r>
-        <w:rPr>
-          <w:rFonts w:ascii="Arial" w:hAnsi="Arial" w:cs="Arial"/>
-          <w:sz w:val="24"/>
-        </w:rPr>
-        <w:t xml:space="preserve">Julio </w:t>
-      </w:r>
-      <w:r>
-        <w:rPr>
-          <w:rFonts w:ascii="Arial" w:hAnsi="Arial" w:cs="Arial"/>
-          <w:sz w:val="24"/>
-        </w:rPr>
-        <w:t>de 20</w:t>
-      </w:r>
-      <w:r>
-        <w:rPr>
-          <w:rFonts w:ascii="Arial" w:hAnsi="Arial" w:cs="Arial"/>
-          <w:sz w:val="24"/>
-        </w:rPr>
-        <w:t>2</w:t>
-      </w:r>
-      <w:r>
-        <w:rPr>
-          <w:rFonts w:ascii="Arial" w:hAnsi="Arial" w:cs="Arial"/>
-          <w:sz w:val="24"/>
-        </w:rPr>
-        <w:t>5</w:t>
-      </w:r>
-      <w:r>
-        <w:rPr>
-          <w:rFonts w:ascii="Arial" w:hAnsi="Arial" w:cs="Arial"/>
-          <w:sz w:val="24"/>
-        </w:rPr>
-        <w:t>.</w:t>
+        <w:t>Guatemala, 15 de Julio de 2025.</w:t>
       </w:r>
     </w:p>
     <w:p>
@@ -590,6 +535,7 @@
           </w:tcPr>
           <w:p>
             <w:pPr>
+              <w:spacing w:after="0" w:line="240" w:lineRule="auto"/>
               <w:jc w:val="center"/>
               <w:rPr>
                 <w:rFonts w:ascii="Arial" w:eastAsiaTheme="minorHAnsi" w:hAnsi="Arial" w:cs="Arial"/>
@@ -624,6 +570,7 @@
           </w:tcPr>
           <w:p>
             <w:pPr>
+              <w:spacing w:after="0" w:line="240" w:lineRule="auto"/>
               <w:jc w:val="center"/>
               <w:rPr>
                 <w:rFonts w:ascii="Arial" w:eastAsiaTheme="minorHAnsi" w:hAnsi="Arial" w:cs="Arial"/>
@@ -649,6 +596,7 @@
           </w:tcPr>
           <w:p>
             <w:pPr>
+              <w:spacing w:after="0" w:line="240" w:lineRule="auto"/>
               <w:jc w:val="center"/>
               <w:rPr>
                 <w:rFonts w:ascii="Arial" w:eastAsiaTheme="minorHAnsi" w:hAnsi="Arial" w:cs="Arial"/>
@@ -656,20 +604,83 @@
                 <w:lang w:val="es-ES"/>
               </w:rPr>
             </w:pPr>
-          </w:p>
-        </w:tc>
-        <w:tc>
-          <w:tcPr>
-            <w:tcW w:w="5395" w:type="dxa"/>
-          </w:tcPr>
-          <w:p>
-            <w:pPr>
-              <w:jc w:val="center"/>
-              <w:rPr>
-                <w:rFonts w:ascii="Arial" w:eastAsiaTheme="minorHAnsi" w:hAnsi="Arial" w:cs="Arial"/>
-                <w:sz w:val="24"/>
-              </w:rPr>
-            </w:pPr>
+            <w:proofErr w:type="spellStart"/>
+            <w:r>
+              <w:rPr>
+                <w:rFonts w:ascii="Arial" w:eastAsiaTheme="minorHAnsi" w:hAnsi="Arial" w:cs="Arial"/>
+                <w:sz w:val="24"/>
+                <w:lang w:val="es-ES"/>
+              </w:rPr>
+              <w:t>Kenet</w:t>
+            </w:r>
+            <w:proofErr w:type="spellEnd"/>
+            <w:r>
+              <w:rPr>
+                <w:rFonts w:ascii="Arial" w:eastAsiaTheme="minorHAnsi" w:hAnsi="Arial" w:cs="Arial"/>
+                <w:sz w:val="24"/>
+                <w:lang w:val="es-ES"/>
+              </w:rPr>
+              <w:t xml:space="preserve"> Efraín </w:t>
+            </w:r>
+            <w:proofErr w:type="spellStart"/>
+            <w:r>
+              <w:rPr>
+                <w:rFonts w:ascii="Arial" w:eastAsiaTheme="minorHAnsi" w:hAnsi="Arial" w:cs="Arial"/>
+                <w:sz w:val="24"/>
+                <w:lang w:val="es-ES"/>
+              </w:rPr>
+              <w:t>Cuyuch</w:t>
+            </w:r>
+            <w:proofErr w:type="spellEnd"/>
+            <w:r>
+              <w:rPr>
+                <w:rFonts w:ascii="Arial" w:eastAsiaTheme="minorHAnsi" w:hAnsi="Arial" w:cs="Arial"/>
+                <w:sz w:val="24"/>
+                <w:lang w:val="es-ES"/>
+              </w:rPr>
+              <w:t xml:space="preserve"> </w:t>
+            </w:r>
+            <w:proofErr w:type="spellStart"/>
+            <w:r>
+              <w:rPr>
+                <w:rFonts w:ascii="Arial" w:eastAsiaTheme="minorHAnsi" w:hAnsi="Arial" w:cs="Arial"/>
+                <w:sz w:val="24"/>
+                <w:lang w:val="es-ES"/>
+              </w:rPr>
+              <w:t>Joj</w:t>
+            </w:r>
+            <w:proofErr w:type="spellEnd"/>
+          </w:p>
+        </w:tc>
+        <w:tc>
+          <w:tcPr>
+            <w:tcW w:w="5395" w:type="dxa"/>
+          </w:tcPr>
+          <w:p>
+            <w:pPr>
+              <w:spacing w:after="0" w:line="240" w:lineRule="auto"/>
+              <w:jc w:val="center"/>
+              <w:rPr>
+                <w:rFonts w:ascii="Arial" w:eastAsiaTheme="minorHAnsi" w:hAnsi="Arial" w:cs="Arial"/>
+                <w:sz w:val="24"/>
+              </w:rPr>
+            </w:pPr>
+            <w:r>
+              <w:rPr>
+                <w:rFonts w:ascii="Arial" w:eastAsiaTheme="minorHAnsi" w:hAnsi="Arial" w:cs="Arial"/>
+                <w:sz w:val="24"/>
+              </w:rPr>
+              <w:t xml:space="preserve">Scrum </w:t>
+            </w:r>
+            <w:proofErr w:type="gramStart"/>
+            <w:r>
+              <w:rPr>
+                <w:rFonts w:ascii="Arial" w:eastAsiaTheme="minorHAnsi" w:hAnsi="Arial" w:cs="Arial"/>
+                <w:sz w:val="24"/>
+              </w:rPr>
+              <w:t>Master</w:t>
+            </w:r>
+            <w:proofErr w:type="gramEnd"/>
           </w:p>
         </w:tc>
       </w:tr>
@@ -680,26 +691,68 @@
           </w:tcPr>
           <w:p>
             <w:pPr>
-              <w:jc w:val="center"/>
-              <w:rPr>
-                <w:rFonts w:ascii="Arial" w:eastAsiaTheme="minorHAnsi" w:hAnsi="Arial" w:cs="Arial"/>
-                <w:sz w:val="24"/>
-              </w:rPr>
-            </w:pPr>
-          </w:p>
-        </w:tc>
-        <w:tc>
-          <w:tcPr>
-            <w:tcW w:w="5395" w:type="dxa"/>
-          </w:tcPr>
-          <w:p>
-            <w:pPr>
-              <w:jc w:val="center"/>
-              <w:rPr>
-                <w:rFonts w:ascii="Arial" w:eastAsiaTheme="minorHAnsi" w:hAnsi="Arial" w:cs="Arial"/>
-                <w:sz w:val="24"/>
-              </w:rPr>
-            </w:pPr>
+              <w:spacing w:after="0" w:line="240" w:lineRule="auto"/>
+              <w:jc w:val="center"/>
+              <w:rPr>
+                <w:rFonts w:ascii="Arial" w:eastAsiaTheme="minorHAnsi" w:hAnsi="Arial" w:cs="Arial"/>
+                <w:sz w:val="24"/>
+              </w:rPr>
+            </w:pPr>
+            <w:proofErr w:type="spellStart"/>
+            <w:r>
+              <w:rPr>
+                <w:rFonts w:ascii="Arial" w:eastAsiaTheme="minorHAnsi" w:hAnsi="Arial" w:cs="Arial"/>
+                <w:sz w:val="24"/>
+              </w:rPr>
+              <w:t>Angel</w:t>
+            </w:r>
+            <w:proofErr w:type="spellEnd"/>
+            <w:r>
+              <w:rPr>
+                <w:rFonts w:ascii="Arial" w:eastAsiaTheme="minorHAnsi" w:hAnsi="Arial" w:cs="Arial"/>
+                <w:sz w:val="24"/>
+              </w:rPr>
+              <w:t xml:space="preserve"> </w:t>
+            </w:r>
+            <w:proofErr w:type="spellStart"/>
+            <w:r>
+              <w:rPr>
+                <w:rFonts w:ascii="Arial" w:eastAsiaTheme="minorHAnsi" w:hAnsi="Arial" w:cs="Arial"/>
+                <w:sz w:val="24"/>
+              </w:rPr>
+              <w:t>Gahel</w:t>
+            </w:r>
+            <w:proofErr w:type="spellEnd"/>
+            <w:r>
+              <w:rPr>
+                <w:rFonts w:ascii="Arial" w:eastAsiaTheme="minorHAnsi" w:hAnsi="Arial" w:cs="Arial"/>
+                <w:sz w:val="24"/>
+              </w:rPr>
+              <w:t xml:space="preserve"> Padilla Pacheco</w:t>
+            </w:r>
+          </w:p>
+        </w:tc>
+        <w:tc>
+          <w:tcPr>
+            <w:tcW w:w="5395" w:type="dxa"/>
+          </w:tcPr>
+          <w:p>
+            <w:pPr>
+              <w:spacing w:after="0" w:line="240" w:lineRule="auto"/>
+              <w:jc w:val="center"/>
+              <w:rPr>
+                <w:rFonts w:ascii="Arial" w:eastAsiaTheme="minorHAnsi" w:hAnsi="Arial" w:cs="Arial"/>
+                <w:sz w:val="24"/>
+                <w:u w:val="single"/>
+              </w:rPr>
+            </w:pPr>
+            <w:r>
+              <w:rPr>
+                <w:rFonts w:ascii="Arial" w:eastAsiaTheme="minorHAnsi" w:hAnsi="Arial" w:cs="Arial"/>
+                <w:sz w:val="24"/>
+              </w:rPr>
+              <w:t>Programador</w:t>
+            </w:r>
           </w:p>
         </w:tc>
       </w:tr>
@@ -710,26 +763,76 @@
           </w:tcPr>
           <w:p>
             <w:pPr>
-              <w:jc w:val="center"/>
-              <w:rPr>
-                <w:rFonts w:ascii="Arial" w:eastAsiaTheme="minorHAnsi" w:hAnsi="Arial" w:cs="Arial"/>
-                <w:sz w:val="24"/>
-              </w:rPr>
-            </w:pPr>
-          </w:p>
-        </w:tc>
-        <w:tc>
-          <w:tcPr>
-            <w:tcW w:w="5395" w:type="dxa"/>
-          </w:tcPr>
-          <w:p>
-            <w:pPr>
-              <w:jc w:val="center"/>
-              <w:rPr>
-                <w:rFonts w:ascii="Arial" w:eastAsiaTheme="minorHAnsi" w:hAnsi="Arial" w:cs="Arial"/>
-                <w:sz w:val="24"/>
-              </w:rPr>
-            </w:pPr>
+              <w:spacing w:after="0" w:line="240" w:lineRule="auto"/>
+              <w:jc w:val="center"/>
+              <w:rPr>
+                <w:rFonts w:ascii="Arial" w:eastAsiaTheme="minorHAnsi" w:hAnsi="Arial" w:cs="Arial"/>
+                <w:sz w:val="24"/>
+              </w:rPr>
+            </w:pPr>
+            <w:proofErr w:type="spellStart"/>
+            <w:r>
+              <w:rPr>
+                <w:rFonts w:ascii="Arial" w:eastAsiaTheme="minorHAnsi" w:hAnsi="Arial" w:cs="Arial"/>
+                <w:sz w:val="24"/>
+              </w:rPr>
+              <w:t>Jose</w:t>
+            </w:r>
+            <w:proofErr w:type="spellEnd"/>
+            <w:r>
+              <w:rPr>
+                <w:rFonts w:ascii="Arial" w:eastAsiaTheme="minorHAnsi" w:hAnsi="Arial" w:cs="Arial"/>
+                <w:sz w:val="24"/>
+              </w:rPr>
+              <w:t xml:space="preserve"> Enrique </w:t>
+            </w:r>
+            <w:proofErr w:type="spellStart"/>
+            <w:r>
+              <w:rPr>
+                <w:rFonts w:ascii="Arial" w:eastAsiaTheme="minorHAnsi" w:hAnsi="Arial" w:cs="Arial"/>
+                <w:sz w:val="24"/>
+              </w:rPr>
+              <w:t>cuc</w:t>
+            </w:r>
+            <w:proofErr w:type="spellEnd"/>
+            <w:r>
+              <w:rPr>
+                <w:rFonts w:ascii="Arial" w:eastAsiaTheme="minorHAnsi" w:hAnsi="Arial" w:cs="Arial"/>
+                <w:sz w:val="24"/>
+              </w:rPr>
+              <w:t xml:space="preserve"> </w:t>
+            </w:r>
+            <w:proofErr w:type="spellStart"/>
+            <w:r>
+              <w:rPr>
+                <w:rFonts w:ascii="Arial" w:eastAsiaTheme="minorHAnsi" w:hAnsi="Arial" w:cs="Arial"/>
+                <w:sz w:val="24"/>
+              </w:rPr>
+              <w:t>cutz</w:t>
+            </w:r>
+            <w:proofErr w:type="spellEnd"/>
+          </w:p>
+        </w:tc>
+        <w:tc>
+          <w:tcPr>
+            <w:tcW w:w="5395" w:type="dxa"/>
+          </w:tcPr>
+          <w:p>
+            <w:pPr>
+              <w:spacing w:after="0" w:line="240" w:lineRule="auto"/>
+              <w:jc w:val="center"/>
+              <w:rPr>
+                <w:rFonts w:ascii="Arial" w:eastAsiaTheme="minorHAnsi" w:hAnsi="Arial" w:cs="Arial"/>
+                <w:sz w:val="24"/>
+              </w:rPr>
+            </w:pPr>
+            <w:r>
+              <w:rPr>
+                <w:rFonts w:ascii="Arial" w:eastAsiaTheme="minorHAnsi" w:hAnsi="Arial" w:cs="Arial"/>
+                <w:sz w:val="24"/>
+              </w:rPr>
+              <w:t>Programador</w:t>
+            </w:r>
           </w:p>
         </w:tc>
       </w:tr>
@@ -740,26 +843,84 @@
           </w:tcPr>
           <w:p>
             <w:pPr>
-              <w:jc w:val="center"/>
-              <w:rPr>
-                <w:rFonts w:ascii="Arial" w:eastAsiaTheme="minorHAnsi" w:hAnsi="Arial" w:cs="Arial"/>
-                <w:sz w:val="24"/>
-              </w:rPr>
-            </w:pPr>
-          </w:p>
-        </w:tc>
-        <w:tc>
-          <w:tcPr>
-            <w:tcW w:w="5395" w:type="dxa"/>
-          </w:tcPr>
-          <w:p>
-            <w:pPr>
-              <w:jc w:val="center"/>
-              <w:rPr>
-                <w:rFonts w:ascii="Arial" w:eastAsiaTheme="minorHAnsi" w:hAnsi="Arial" w:cs="Arial"/>
-                <w:sz w:val="24"/>
-              </w:rPr>
-            </w:pPr>
+              <w:spacing w:after="0" w:line="240" w:lineRule="auto"/>
+              <w:jc w:val="center"/>
+              <w:rPr>
+                <w:rFonts w:ascii="Arial" w:eastAsiaTheme="minorEastAsia" w:hAnsi="Arial" w:cs="Arial"/>
+                <w:sz w:val="24"/>
+                <w:szCs w:val="24"/>
+              </w:rPr>
+            </w:pPr>
+            <w:proofErr w:type="spellStart"/>
+            <w:r>
+              <w:rPr>
+                <w:rFonts w:ascii="Arial" w:eastAsiaTheme="minorEastAsia" w:hAnsi="Arial" w:cs="Arial"/>
+                <w:sz w:val="24"/>
+                <w:szCs w:val="24"/>
+              </w:rPr>
+              <w:t>Jeferson</w:t>
+            </w:r>
+            <w:proofErr w:type="spellEnd"/>
+            <w:r>
+              <w:rPr>
+                <w:rFonts w:ascii="Arial" w:eastAsiaTheme="minorEastAsia" w:hAnsi="Arial" w:cs="Arial"/>
+                <w:sz w:val="24"/>
+                <w:szCs w:val="24"/>
+              </w:rPr>
+              <w:t xml:space="preserve"> </w:t>
+            </w:r>
+            <w:proofErr w:type="spellStart"/>
+            <w:r>
+              <w:rPr>
+                <w:rFonts w:ascii="Arial" w:eastAsiaTheme="minorEastAsia" w:hAnsi="Arial" w:cs="Arial"/>
+                <w:sz w:val="24"/>
+                <w:szCs w:val="24"/>
+              </w:rPr>
+              <w:t>Andre</w:t>
+            </w:r>
+            <w:proofErr w:type="spellEnd"/>
+            <w:r>
+              <w:rPr>
+                <w:rFonts w:ascii="Arial" w:eastAsiaTheme="minorEastAsia" w:hAnsi="Arial" w:cs="Arial"/>
+                <w:sz w:val="24"/>
+                <w:szCs w:val="24"/>
+              </w:rPr>
+              <w:t xml:space="preserve"> Cano </w:t>
+            </w:r>
+            <w:proofErr w:type="spellStart"/>
+            <w:r>
+              <w:rPr>
+                <w:rFonts w:ascii="Arial" w:eastAsiaTheme="minorEastAsia" w:hAnsi="Arial" w:cs="Arial"/>
+                <w:sz w:val="24"/>
+                <w:szCs w:val="24"/>
+              </w:rPr>
+              <w:t>Lopez</w:t>
+            </w:r>
+            <w:proofErr w:type="spellEnd"/>
+          </w:p>
+        </w:tc>
+        <w:tc>
+          <w:tcPr>
+            <w:tcW w:w="5395" w:type="dxa"/>
+          </w:tcPr>
+          <w:p>
+            <w:pPr>
+              <w:spacing w:after="0" w:line="240" w:lineRule="auto"/>
+              <w:jc w:val="center"/>
+              <w:rPr>
+                <w:rFonts w:ascii="Arial" w:eastAsiaTheme="minorEastAsia" w:hAnsi="Arial" w:cs="Arial"/>
+                <w:sz w:val="24"/>
+                <w:szCs w:val="24"/>
+              </w:rPr>
+            </w:pPr>
+            <w:r>
+              <w:rPr>
+                <w:rFonts w:ascii="Arial" w:eastAsiaTheme="minorEastAsia" w:hAnsi="Arial" w:cs="Arial"/>
+                <w:sz w:val="24"/>
+                <w:szCs w:val="24"/>
+              </w:rPr>
+              <w:t>Programador</w:t>
+            </w:r>
           </w:p>
         </w:tc>
       </w:tr>
@@ -770,26 +931,42 @@
           </w:tcPr>
           <w:p>
             <w:pPr>
-              <w:jc w:val="center"/>
-              <w:rPr>
-                <w:rFonts w:ascii="Arial" w:eastAsiaTheme="minorHAnsi" w:hAnsi="Arial" w:cs="Arial"/>
-                <w:sz w:val="24"/>
-              </w:rPr>
-            </w:pPr>
-          </w:p>
-        </w:tc>
-        <w:tc>
-          <w:tcPr>
-            <w:tcW w:w="5395" w:type="dxa"/>
-          </w:tcPr>
-          <w:p>
-            <w:pPr>
-              <w:jc w:val="center"/>
-              <w:rPr>
-                <w:rFonts w:ascii="Arial" w:eastAsiaTheme="minorHAnsi" w:hAnsi="Arial" w:cs="Arial"/>
-                <w:sz w:val="24"/>
-              </w:rPr>
-            </w:pPr>
+              <w:spacing w:after="0" w:line="240" w:lineRule="auto"/>
+              <w:jc w:val="center"/>
+              <w:rPr>
+                <w:rFonts w:ascii="Arial" w:eastAsiaTheme="minorHAnsi" w:hAnsi="Arial" w:cs="Arial"/>
+                <w:sz w:val="24"/>
+              </w:rPr>
+            </w:pPr>
+            <w:r>
+              <w:rPr>
+                <w:rFonts w:ascii="Arial" w:eastAsiaTheme="minorHAnsi" w:hAnsi="Arial" w:cs="Arial"/>
+                <w:sz w:val="24"/>
+              </w:rPr>
+              <w:t>Carlos Enrique López Quino</w:t>
+            </w:r>
+          </w:p>
+        </w:tc>
+        <w:tc>
+          <w:tcPr>
+            <w:tcW w:w="5395" w:type="dxa"/>
+          </w:tcPr>
+          <w:p>
+            <w:pPr>
+              <w:spacing w:after="0" w:line="240" w:lineRule="auto"/>
+              <w:jc w:val="center"/>
+              <w:rPr>
+                <w:rFonts w:ascii="Arial" w:eastAsiaTheme="minorHAnsi" w:hAnsi="Arial" w:cs="Arial"/>
+                <w:sz w:val="24"/>
+              </w:rPr>
+            </w:pPr>
+            <w:r>
+              <w:rPr>
+                <w:rFonts w:ascii="Arial" w:eastAsiaTheme="minorHAnsi" w:hAnsi="Arial" w:cs="Arial"/>
+                <w:sz w:val="24"/>
+              </w:rPr>
+              <w:t>Programador</w:t>
+            </w:r>
           </w:p>
         </w:tc>
       </w:tr>
@@ -800,20 +977,22 @@
           </w:tcPr>
           <w:p>
             <w:pPr>
-              <w:jc w:val="center"/>
-              <w:rPr>
-                <w:rFonts w:ascii="Arial" w:eastAsiaTheme="minorHAnsi" w:hAnsi="Arial" w:cs="Arial"/>
-                <w:sz w:val="24"/>
-              </w:rPr>
-            </w:pPr>
-          </w:p>
-        </w:tc>
-        <w:tc>
-          <w:tcPr>
-            <w:tcW w:w="5395" w:type="dxa"/>
-          </w:tcPr>
-          <w:p>
-            <w:pPr>
+              <w:spacing w:after="0" w:line="240" w:lineRule="auto"/>
+              <w:jc w:val="center"/>
+              <w:rPr>
+                <w:rFonts w:ascii="Arial" w:eastAsiaTheme="minorHAnsi" w:hAnsi="Arial" w:cs="Arial"/>
+                <w:sz w:val="24"/>
+              </w:rPr>
+            </w:pPr>
+          </w:p>
+        </w:tc>
+        <w:tc>
+          <w:tcPr>
+            <w:tcW w:w="5395" w:type="dxa"/>
+          </w:tcPr>
+          <w:p>
+            <w:pPr>
+              <w:spacing w:after="0" w:line="240" w:lineRule="auto"/>
               <w:jc w:val="center"/>
               <w:rPr>
                 <w:rFonts w:ascii="Arial" w:eastAsiaTheme="minorHAnsi" w:hAnsi="Arial" w:cs="Arial"/>
@@ -830,20 +1009,22 @@
           </w:tcPr>
           <w:p>
             <w:pPr>
-              <w:jc w:val="center"/>
-              <w:rPr>
-                <w:rFonts w:ascii="Arial" w:eastAsiaTheme="minorHAnsi" w:hAnsi="Arial" w:cs="Arial"/>
-                <w:sz w:val="24"/>
-              </w:rPr>
-            </w:pPr>
-          </w:p>
-        </w:tc>
-        <w:tc>
-          <w:tcPr>
-            <w:tcW w:w="5395" w:type="dxa"/>
-          </w:tcPr>
-          <w:p>
-            <w:pPr>
+              <w:spacing w:after="0" w:line="240" w:lineRule="auto"/>
+              <w:jc w:val="center"/>
+              <w:rPr>
+                <w:rFonts w:ascii="Arial" w:eastAsiaTheme="minorHAnsi" w:hAnsi="Arial" w:cs="Arial"/>
+                <w:sz w:val="24"/>
+              </w:rPr>
+            </w:pPr>
+          </w:p>
+        </w:tc>
+        <w:tc>
+          <w:tcPr>
+            <w:tcW w:w="5395" w:type="dxa"/>
+          </w:tcPr>
+          <w:p>
+            <w:pPr>
+              <w:spacing w:after="0" w:line="240" w:lineRule="auto"/>
               <w:jc w:val="center"/>
               <w:rPr>
                 <w:rFonts w:ascii="Arial" w:eastAsiaTheme="minorHAnsi" w:hAnsi="Arial" w:cs="Arial"/>
@@ -860,20 +1041,22 @@
           </w:tcPr>
           <w:p>
             <w:pPr>
-              <w:jc w:val="center"/>
-              <w:rPr>
-                <w:rFonts w:ascii="Arial" w:eastAsiaTheme="minorHAnsi" w:hAnsi="Arial" w:cs="Arial"/>
-                <w:sz w:val="24"/>
-              </w:rPr>
-            </w:pPr>
-          </w:p>
-        </w:tc>
-        <w:tc>
-          <w:tcPr>
-            <w:tcW w:w="5395" w:type="dxa"/>
-          </w:tcPr>
-          <w:p>
-            <w:pPr>
+              <w:spacing w:after="0" w:line="240" w:lineRule="auto"/>
+              <w:jc w:val="center"/>
+              <w:rPr>
+                <w:rFonts w:ascii="Arial" w:eastAsiaTheme="minorHAnsi" w:hAnsi="Arial" w:cs="Arial"/>
+                <w:sz w:val="24"/>
+              </w:rPr>
+            </w:pPr>
+          </w:p>
+        </w:tc>
+        <w:tc>
+          <w:tcPr>
+            <w:tcW w:w="5395" w:type="dxa"/>
+          </w:tcPr>
+          <w:p>
+            <w:pPr>
+              <w:spacing w:after="0" w:line="240" w:lineRule="auto"/>
               <w:jc w:val="center"/>
               <w:rPr>
                 <w:rFonts w:ascii="Arial" w:eastAsiaTheme="minorHAnsi" w:hAnsi="Arial" w:cs="Arial"/>
@@ -890,6 +1073,7 @@
           </w:tcPr>
           <w:p>
             <w:pPr>
+              <w:spacing w:after="0" w:line="240" w:lineRule="auto"/>
               <w:jc w:val="center"/>
               <w:rPr>
                 <w:rFonts w:ascii="Arial" w:eastAsiaTheme="minorEastAsia" w:hAnsi="Arial" w:cs="Arial"/>
@@ -905,6 +1089,7 @@
           </w:tcPr>
           <w:p>
             <w:pPr>
+              <w:spacing w:after="0" w:line="240" w:lineRule="auto"/>
               <w:jc w:val="center"/>
               <w:rPr>
                 <w:rFonts w:ascii="Arial" w:eastAsiaTheme="minorEastAsia" w:hAnsi="Arial" w:cs="Arial"/>
@@ -922,20 +1107,22 @@
           </w:tcPr>
           <w:p>
             <w:pPr>
-              <w:jc w:val="center"/>
-              <w:rPr>
-                <w:rFonts w:ascii="Arial" w:eastAsiaTheme="minorHAnsi" w:hAnsi="Arial" w:cs="Arial"/>
-                <w:sz w:val="24"/>
-              </w:rPr>
-            </w:pPr>
-          </w:p>
-        </w:tc>
-        <w:tc>
-          <w:tcPr>
-            <w:tcW w:w="5395" w:type="dxa"/>
-          </w:tcPr>
-          <w:p>
-            <w:pPr>
+              <w:spacing w:after="0" w:line="240" w:lineRule="auto"/>
+              <w:jc w:val="center"/>
+              <w:rPr>
+                <w:rFonts w:ascii="Arial" w:eastAsiaTheme="minorHAnsi" w:hAnsi="Arial" w:cs="Arial"/>
+                <w:sz w:val="24"/>
+              </w:rPr>
+            </w:pPr>
+          </w:p>
+        </w:tc>
+        <w:tc>
+          <w:tcPr>
+            <w:tcW w:w="5395" w:type="dxa"/>
+          </w:tcPr>
+          <w:p>
+            <w:pPr>
+              <w:spacing w:after="0" w:line="240" w:lineRule="auto"/>
               <w:jc w:val="center"/>
               <w:rPr>
                 <w:rFonts w:ascii="Arial" w:eastAsiaTheme="minorHAnsi" w:hAnsi="Arial" w:cs="Arial"/>
@@ -952,20 +1139,22 @@
           </w:tcPr>
           <w:p>
             <w:pPr>
-              <w:jc w:val="center"/>
-              <w:rPr>
-                <w:rFonts w:ascii="Arial" w:eastAsiaTheme="minorHAnsi" w:hAnsi="Arial" w:cs="Arial"/>
-                <w:sz w:val="24"/>
-              </w:rPr>
-            </w:pPr>
-          </w:p>
-        </w:tc>
-        <w:tc>
-          <w:tcPr>
-            <w:tcW w:w="5395" w:type="dxa"/>
-          </w:tcPr>
-          <w:p>
-            <w:pPr>
+              <w:spacing w:after="0" w:line="240" w:lineRule="auto"/>
+              <w:jc w:val="center"/>
+              <w:rPr>
+                <w:rFonts w:ascii="Arial" w:eastAsiaTheme="minorHAnsi" w:hAnsi="Arial" w:cs="Arial"/>
+                <w:sz w:val="24"/>
+              </w:rPr>
+            </w:pPr>
+          </w:p>
+        </w:tc>
+        <w:tc>
+          <w:tcPr>
+            <w:tcW w:w="5395" w:type="dxa"/>
+          </w:tcPr>
+          <w:p>
+            <w:pPr>
+              <w:spacing w:after="0" w:line="240" w:lineRule="auto"/>
               <w:jc w:val="center"/>
               <w:rPr>
                 <w:rFonts w:ascii="Arial" w:eastAsiaTheme="minorHAnsi" w:hAnsi="Arial" w:cs="Arial"/>
@@ -982,20 +1171,22 @@
           </w:tcPr>
           <w:p>
             <w:pPr>
-              <w:jc w:val="center"/>
-              <w:rPr>
-                <w:rFonts w:ascii="Arial" w:eastAsiaTheme="minorHAnsi" w:hAnsi="Arial" w:cs="Arial"/>
-                <w:sz w:val="24"/>
-              </w:rPr>
-            </w:pPr>
-          </w:p>
-        </w:tc>
-        <w:tc>
-          <w:tcPr>
-            <w:tcW w:w="5395" w:type="dxa"/>
-          </w:tcPr>
-          <w:p>
-            <w:pPr>
+              <w:spacing w:after="0" w:line="240" w:lineRule="auto"/>
+              <w:jc w:val="center"/>
+              <w:rPr>
+                <w:rFonts w:ascii="Arial" w:eastAsiaTheme="minorHAnsi" w:hAnsi="Arial" w:cs="Arial"/>
+                <w:sz w:val="24"/>
+              </w:rPr>
+            </w:pPr>
+          </w:p>
+        </w:tc>
+        <w:tc>
+          <w:tcPr>
+            <w:tcW w:w="5395" w:type="dxa"/>
+          </w:tcPr>
+          <w:p>
+            <w:pPr>
+              <w:spacing w:after="0" w:line="240" w:lineRule="auto"/>
               <w:jc w:val="center"/>
               <w:rPr>
                 <w:rFonts w:ascii="Arial" w:eastAsiaTheme="minorHAnsi" w:hAnsi="Arial" w:cs="Arial"/>
@@ -1028,8 +1219,6 @@
         </w:rPr>
         <w:t xml:space="preserve">    </w:t>
       </w:r>
-      <w:bookmarkStart w:id="0" w:name="_GoBack"/>
-      <w:bookmarkEnd w:id="0"/>
     </w:p>
     <w:sectPr>
       <w:pgSz w:w="12240" w:h="15840"/>
@@ -1041,24 +1230,68 @@
 </w:document>
 </file>
 
+<file path=word/endnotes.xml><?xml version="1.0" encoding="utf-8"?>
+<w:endnotes xmlns:wpc="http://schemas.microsoft.com/office/word/2010/wordprocessingCanvas" xmlns:cx="http://schemas.microsoft.com/office/drawing/2014/chartex" xmlns:cx1="http://schemas.microsoft.com/office/drawing/2015/9/8/chartex" xmlns:cx2="http://schemas.microsoft.com/office/drawing/2015/10/21/chartex" xmlns:cx3="http://schemas.microsoft.com/office/drawing/2016/5/9/chartex" xmlns:cx4="http://schemas.microsoft.com/office/drawing/2016/5/10/chartex" xmlns:cx5="http://schemas.microsoft.com/office/drawing/2016/5/11/chartex" xmlns:cx6="http://schemas.microsoft.com/office/drawing/2016/5/12/chartex" xmlns:cx7="http://schemas.microsoft.com/office/drawing/2016/5/13/chartex" xmlns:cx8="http://schemas.microsoft.com/office/drawing/2016/5/14/chartex" xmlns:mc="http://schemas.openxmlformats.org/markup-compatibility/2006" xmlns:aink="http://schemas.microsoft.com/office/drawing/2016/ink" xmlns:am3d="http://schemas.microsoft.com/office/drawing/2017/model3d" xmlns:o="urn:schemas-microsoft-com:office:office" xmlns:oel="http://schemas.microsoft.com/office/2019/extlst" xmlns:r="http://schemas.openxmlformats.org/officeDocument/2006/relationships" xmlns:m="http://schemas.openxmlformats.org/officeDocument/2006/math" xmlns:v="urn:schemas-microsoft-com:vml" xmlns:wp14="http://schemas.microsoft.com/office/word/2010/wordprocessingDrawing" xmlns:wp="http://schemas.openxmlformats.org/drawingml/2006/wordprocessingDrawing" xmlns:w10="urn:schemas-microsoft-com:office:word" xmlns:w="http://schemas.openxmlformats.org/wordprocessingml/2006/main" xmlns:w14="http://schemas.microsoft.com/office/word/2010/wordml" xmlns:w15="http://schemas.microsoft.com/office/word/2012/wordml" xmlns:w16cex="http://schemas.microsoft.com/office/word/2018/wordml/cex" xmlns:w16cid="http://schemas.microsoft.com/office/word/2016/wordml/cid" xmlns:w16="http://schemas.microsoft.com/office/word/2018/wordml" xmlns:w16du="http://schemas.microsoft.com/office/word/2023/wordml/word16du" xmlns:w16sdtdh="http://schemas.microsoft.com/office/word/2020/wordml/sdtdatahash" xmlns:w16sdtfl="http://schemas.microsoft.com/office/word/2024/wordml/sdtformatlock" xmlns:w16se="http://schemas.microsoft.com/office/word/2015/wordml/symex" xmlns:wpg="http://schemas.microsoft.com/office/word/2010/wordprocessingGroup" xmlns:wpi="http://schemas.microsoft.com/office/word/2010/wordprocessingInk" xmlns:wne="http://schemas.microsoft.com/office/word/2006/wordml" xmlns:wps="http://schemas.microsoft.com/office/word/2010/wordprocessingShape" mc:Ignorable="w14 w15 w16se w16cid w16 w16cex w16sdtdh w16sdtfl w16du wp14">
+  <w:endnote w:type="separator" w:id="-1">
+    <w:p>
+      <w:pPr>
+        <w:spacing w:line="240" w:lineRule="auto"/>
+      </w:pPr>
+      <w:r>
+        <w:separator/>
+      </w:r>
+    </w:p>
+  </w:endnote>
+  <w:endnote w:type="continuationSeparator" w:id="0">
+    <w:p>
+      <w:pPr>
+        <w:spacing w:line="240" w:lineRule="auto"/>
+      </w:pPr>
+      <w:r>
+        <w:continuationSeparator/>
+      </w:r>
+    </w:p>
+  </w:endnote>
+</w:endnotes>
+</file>
+
+<file path=word/footnotes.xml><?xml version="1.0" encoding="utf-8"?>
+<w:footnotes xmlns:wpc="http://schemas.microsoft.com/office/word/2010/wordprocessingCanvas" xmlns:cx="http://schemas.microsoft.com/office/drawing/2014/chartex" xmlns:cx1="http://schemas.microsoft.com/office/drawing/2015/9/8/chartex" xmlns:cx2="http://schemas.microsoft.com/office/drawing/2015/10/21/chartex" xmlns:cx3="http://schemas.microsoft.com/office/drawing/2016/5/9/chartex" xmlns:cx4="http://schemas.microsoft.com/office/drawing/2016/5/10/chartex" xmlns:cx5="http://schemas.microsoft.com/office/drawing/2016/5/11/chartex" xmlns:cx6="http://schemas.microsoft.com/office/drawing/2016/5/12/chartex" xmlns:cx7="http://schemas.microsoft.com/office/drawing/2016/5/13/chartex" xmlns:cx8="http://schemas.microsoft.com/office/drawing/2016/5/14/chartex" xmlns:mc="http://schemas.openxmlformats.org/markup-compatibility/2006" xmlns:aink="http://schemas.microsoft.com/office/drawing/2016/ink" xmlns:am3d="http://schemas.microsoft.com/office/drawing/2017/model3d" xmlns:o="urn:schemas-microsoft-com:office:office" xmlns:oel="http://schemas.microsoft.com/office/2019/extlst" xmlns:r="http://schemas.openxmlformats.org/officeDocument/2006/relationships" xmlns:m="http://schemas.openxmlformats.org/officeDocument/2006/math" xmlns:v="urn:schemas-microsoft-com:vml" xmlns:wp14="http://schemas.microsoft.com/office/word/2010/wordprocessingDrawing" xmlns:wp="http://schemas.openxmlformats.org/drawingml/2006/wordprocessingDrawing" xmlns:w10="urn:schemas-microsoft-com:office:word" xmlns:w="http://schemas.openxmlformats.org/wordprocessingml/2006/main" xmlns:w14="http://schemas.microsoft.com/office/word/2010/wordml" xmlns:w15="http://schemas.microsoft.com/office/word/2012/wordml" xmlns:w16cex="http://schemas.microsoft.com/office/word/2018/wordml/cex" xmlns:w16cid="http://schemas.microsoft.com/office/word/2016/wordml/cid" xmlns:w16="http://schemas.microsoft.com/office/word/2018/wordml" xmlns:w16du="http://schemas.microsoft.com/office/word/2023/wordml/word16du" xmlns:w16sdtdh="http://schemas.microsoft.com/office/word/2020/wordml/sdtdatahash" xmlns:w16sdtfl="http://schemas.microsoft.com/office/word/2024/wordml/sdtformatlock" xmlns:w16se="http://schemas.microsoft.com/office/word/2015/wordml/symex" xmlns:wpg="http://schemas.microsoft.com/office/word/2010/wordprocessingGroup" xmlns:wpi="http://schemas.microsoft.com/office/word/2010/wordprocessingInk" xmlns:wne="http://schemas.microsoft.com/office/word/2006/wordml" xmlns:wps="http://schemas.microsoft.com/office/word/2010/wordprocessingShape" mc:Ignorable="w14 w15 w16se w16cid w16 w16cex w16sdtdh w16sdtfl w16du wp14">
+  <w:footnote w:type="separator" w:id="-1">
+    <w:p>
+      <w:pPr>
+        <w:spacing w:after="0"/>
+      </w:pPr>
+      <w:r>
+        <w:separator/>
+      </w:r>
+    </w:p>
+  </w:footnote>
+  <w:footnote w:type="continuationSeparator" w:id="0">
+    <w:p>
+      <w:pPr>
+        <w:spacing w:after="0"/>
+      </w:pPr>
+      <w:r>
+        <w:continuationSeparator/>
+      </w:r>
+    </w:p>
+  </w:footnote>
+</w:footnotes>
+</file>
+
 <file path=word/styles.xml><?xml version="1.0" encoding="utf-8"?>
-<w:styles xmlns:mc="http://schemas.openxmlformats.org/markup-compatibility/2006" xmlns:r="http://schemas.openxmlformats.org/officeDocument/2006/relationships" xmlns:w="http://schemas.openxmlformats.org/wordprocessingml/2006/main" xmlns:w14="http://schemas.microsoft.com/office/word/2010/wordml" xmlns:w15="http://schemas.microsoft.com/office/word/2012/wordml" xmlns:w16se="http://schemas.microsoft.com/office/word/2015/wordml/symex" mc:Ignorable="w14 w15 w16se">
+<w:styles xmlns:mc="http://schemas.openxmlformats.org/markup-compatibility/2006" xmlns:r="http://schemas.openxmlformats.org/officeDocument/2006/relationships" xmlns:w="http://schemas.openxmlformats.org/wordprocessingml/2006/main" xmlns:w14="http://schemas.microsoft.com/office/word/2010/wordml" xmlns:w15="http://schemas.microsoft.com/office/word/2012/wordml" xmlns:w16cex="http://schemas.microsoft.com/office/word/2018/wordml/cex" xmlns:w16cid="http://schemas.microsoft.com/office/word/2016/wordml/cid" xmlns:w16="http://schemas.microsoft.com/office/word/2018/wordml" xmlns:w16du="http://schemas.microsoft.com/office/word/2023/wordml/word16du" xmlns:w16sdtdh="http://schemas.microsoft.com/office/word/2020/wordml/sdtdatahash" xmlns:w16sdtfl="http://schemas.microsoft.com/office/word/2024/wordml/sdtformatlock" xmlns:w16se="http://schemas.microsoft.com/office/word/2015/wordml/symex" mc:Ignorable="w14 w15 w16se w16cid w16 w16cex w16sdtdh w16sdtfl w16du">
   <w:docDefaults>
     <w:rPrDefault>
       <w:rPr>
         <w:rFonts w:asciiTheme="minorHAnsi" w:eastAsiaTheme="minorHAnsi" w:hAnsiTheme="minorHAnsi" w:cstheme="minorBidi"/>
-        <w:sz w:val="22"/>
-        <w:szCs w:val="22"/>
-        <w:lang w:val="es-GT" w:eastAsia="en-US" w:bidi="ar-SA"/>
+        <w:lang w:val="es-MX" w:eastAsia="es-MX" w:bidi="ar-SA"/>
       </w:rPr>
     </w:rPrDefault>
-    <w:pPrDefault>
-      <w:pPr>
-        <w:spacing w:after="160" w:line="259" w:lineRule="auto"/>
-      </w:pPr>
-    </w:pPrDefault>
+    <w:pPrDefault/>
   </w:docDefaults>
-  <w:latentStyles w:defLockedState="0" w:defUIPriority="99" w:defSemiHidden="0" w:defUnhideWhenUsed="0" w:defQFormat="0" w:count="371">
+  <w:latentStyles w:defLockedState="0" w:defUIPriority="99" w:defSemiHidden="0" w:defUnhideWhenUsed="0" w:defQFormat="0" w:count="376">
     <w:lsdException w:name="Normal" w:uiPriority="0" w:qFormat="1"/>
     <w:lsdException w:name="heading 1" w:uiPriority="9" w:qFormat="1"/>
     <w:lsdException w:name="heading 2" w:semiHidden="1" w:uiPriority="9" w:unhideWhenUsed="1" w:qFormat="1"/>
@@ -1089,7 +1322,7 @@
     <w:lsdException w:name="toc 9" w:semiHidden="1" w:uiPriority="39" w:unhideWhenUsed="1"/>
     <w:lsdException w:name="Normal Indent" w:semiHidden="1" w:unhideWhenUsed="1"/>
     <w:lsdException w:name="footnote text" w:semiHidden="1" w:unhideWhenUsed="1"/>
-    <w:lsdException w:name="annotation text" w:semiHidden="1" w:unhideWhenUsed="1"/>
+    <w:lsdException w:name="annotation text" w:semiHidden="1" w:unhideWhenUsed="1" w:qFormat="1"/>
     <w:lsdException w:name="header" w:semiHidden="1" w:unhideWhenUsed="1"/>
     <w:lsdException w:name="footer" w:semiHidden="1" w:unhideWhenUsed="1"/>
     <w:lsdException w:name="index heading" w:semiHidden="1" w:unhideWhenUsed="1"/>
@@ -1153,7 +1386,7 @@
     <w:lsdException w:name="E-mail Signature" w:semiHidden="1" w:unhideWhenUsed="1"/>
     <w:lsdException w:name="HTML Top of Form" w:semiHidden="1" w:unhideWhenUsed="1"/>
     <w:lsdException w:name="HTML Bottom of Form" w:semiHidden="1" w:unhideWhenUsed="1"/>
-    <w:lsdException w:name="Normal (Web)" w:semiHidden="1" w:unhideWhenUsed="1"/>
+    <w:lsdException w:name="Normal (Web)" w:semiHidden="1" w:unhideWhenUsed="1" w:qFormat="1"/>
     <w:lsdException w:name="HTML Acronym" w:semiHidden="1" w:unhideWhenUsed="1"/>
     <w:lsdException w:name="HTML Address" w:semiHidden="1" w:unhideWhenUsed="1"/>
     <w:lsdException w:name="HTML Cite" w:semiHidden="1" w:unhideWhenUsed="1"/>
@@ -1164,8 +1397,8 @@
     <w:lsdException w:name="HTML Sample" w:semiHidden="1" w:unhideWhenUsed="1"/>
     <w:lsdException w:name="HTML Typewriter" w:semiHidden="1" w:unhideWhenUsed="1"/>
     <w:lsdException w:name="HTML Variable" w:semiHidden="1" w:unhideWhenUsed="1"/>
-    <w:lsdException w:name="Normal Table" w:semiHidden="1" w:unhideWhenUsed="1"/>
-    <w:lsdException w:name="annotation subject" w:semiHidden="1" w:unhideWhenUsed="1"/>
+    <w:lsdException w:name="Normal Table" w:semiHidden="1" w:unhideWhenUsed="1" w:qFormat="1"/>
+    <w:lsdException w:name="annotation subject" w:semiHidden="1" w:unhideWhenUsed="1" w:qFormat="1"/>
     <w:lsdException w:name="No List" w:semiHidden="1" w:unhideWhenUsed="1"/>
     <w:lsdException w:name="Outline List 1" w:semiHidden="1" w:unhideWhenUsed="1"/>
     <w:lsdException w:name="Outline List 2" w:semiHidden="1" w:unhideWhenUsed="1"/>
@@ -1212,113 +1445,113 @@
     <w:lsdException w:name="Table Web 1" w:semiHidden="1" w:unhideWhenUsed="1"/>
     <w:lsdException w:name="Table Web 2" w:semiHidden="1" w:unhideWhenUsed="1"/>
     <w:lsdException w:name="Table Web 3" w:semiHidden="1" w:unhideWhenUsed="1"/>
-    <w:lsdException w:name="Balloon Text" w:semiHidden="1" w:unhideWhenUsed="1"/>
-    <w:lsdException w:name="Table Grid" w:uiPriority="39"/>
+    <w:lsdException w:name="Balloon Text" w:semiHidden="1" w:unhideWhenUsed="1" w:qFormat="1"/>
+    <w:lsdException w:name="Table Grid" w:uiPriority="39" w:qFormat="1"/>
     <w:lsdException w:name="Table Theme" w:semiHidden="1" w:unhideWhenUsed="1"/>
-    <w:lsdException w:name="Placeholder Text" w:semiHidden="1"/>
+    <w:lsdException w:name="Placeholder Text" w:semiHidden="1" w:unhideWhenUsed="1"/>
     <w:lsdException w:name="No Spacing" w:uiPriority="1" w:qFormat="1"/>
-    <w:lsdException w:name="Light Shading" w:uiPriority="60"/>
-    <w:lsdException w:name="Light List" w:uiPriority="61"/>
-    <w:lsdException w:name="Light Grid" w:uiPriority="62"/>
-    <w:lsdException w:name="Medium Shading 1" w:uiPriority="63"/>
-    <w:lsdException w:name="Medium Shading 2" w:uiPriority="64"/>
-    <w:lsdException w:name="Medium List 1" w:uiPriority="65"/>
-    <w:lsdException w:name="Medium List 2" w:uiPriority="66"/>
-    <w:lsdException w:name="Medium Grid 1" w:uiPriority="67"/>
-    <w:lsdException w:name="Medium Grid 2" w:uiPriority="68"/>
-    <w:lsdException w:name="Medium Grid 3" w:uiPriority="69"/>
-    <w:lsdException w:name="Dark List" w:uiPriority="70"/>
-    <w:lsdException w:name="Colorful Shading" w:uiPriority="71"/>
-    <w:lsdException w:name="Colorful List" w:uiPriority="72"/>
-    <w:lsdException w:name="Colorful Grid" w:uiPriority="73"/>
-    <w:lsdException w:name="Light Shading Accent 1" w:uiPriority="60"/>
-    <w:lsdException w:name="Light List Accent 1" w:uiPriority="61"/>
-    <w:lsdException w:name="Light Grid Accent 1" w:uiPriority="62"/>
-    <w:lsdException w:name="Medium Shading 1 Accent 1" w:uiPriority="63"/>
-    <w:lsdException w:name="Medium Shading 2 Accent 1" w:uiPriority="64"/>
-    <w:lsdException w:name="Medium List 1 Accent 1" w:uiPriority="65"/>
-    <w:lsdException w:name="Revision" w:semiHidden="1"/>
-    <w:lsdException w:name="List Paragraph" w:uiPriority="34" w:qFormat="1"/>
-    <w:lsdException w:name="Quote" w:uiPriority="29" w:qFormat="1"/>
-    <w:lsdException w:name="Intense Quote" w:uiPriority="30" w:qFormat="1"/>
-    <w:lsdException w:name="Medium List 2 Accent 1" w:uiPriority="66"/>
-    <w:lsdException w:name="Medium Grid 1 Accent 1" w:uiPriority="67"/>
-    <w:lsdException w:name="Medium Grid 2 Accent 1" w:uiPriority="68"/>
-    <w:lsdException w:name="Medium Grid 3 Accent 1" w:uiPriority="69"/>
-    <w:lsdException w:name="Dark List Accent 1" w:uiPriority="70"/>
-    <w:lsdException w:name="Colorful Shading Accent 1" w:uiPriority="71"/>
-    <w:lsdException w:name="Colorful List Accent 1" w:uiPriority="72"/>
-    <w:lsdException w:name="Colorful Grid Accent 1" w:uiPriority="73"/>
-    <w:lsdException w:name="Light Shading Accent 2" w:uiPriority="60"/>
-    <w:lsdException w:name="Light List Accent 2" w:uiPriority="61"/>
-    <w:lsdException w:name="Light Grid Accent 2" w:uiPriority="62"/>
-    <w:lsdException w:name="Medium Shading 1 Accent 2" w:uiPriority="63"/>
-    <w:lsdException w:name="Medium Shading 2 Accent 2" w:uiPriority="64"/>
-    <w:lsdException w:name="Medium List 1 Accent 2" w:uiPriority="65"/>
-    <w:lsdException w:name="Medium List 2 Accent 2" w:uiPriority="66"/>
-    <w:lsdException w:name="Medium Grid 1 Accent 2" w:uiPriority="67"/>
-    <w:lsdException w:name="Medium Grid 2 Accent 2" w:uiPriority="68"/>
-    <w:lsdException w:name="Medium Grid 3 Accent 2" w:uiPriority="69"/>
-    <w:lsdException w:name="Dark List Accent 2" w:uiPriority="70"/>
-    <w:lsdException w:name="Colorful Shading Accent 2" w:uiPriority="71"/>
-    <w:lsdException w:name="Colorful List Accent 2" w:uiPriority="72"/>
-    <w:lsdException w:name="Colorful Grid Accent 2" w:uiPriority="73"/>
-    <w:lsdException w:name="Light Shading Accent 3" w:uiPriority="60"/>
-    <w:lsdException w:name="Light List Accent 3" w:uiPriority="61"/>
-    <w:lsdException w:name="Light Grid Accent 3" w:uiPriority="62"/>
-    <w:lsdException w:name="Medium Shading 1 Accent 3" w:uiPriority="63"/>
-    <w:lsdException w:name="Medium Shading 2 Accent 3" w:uiPriority="64"/>
-    <w:lsdException w:name="Medium List 1 Accent 3" w:uiPriority="65"/>
-    <w:lsdException w:name="Medium List 2 Accent 3" w:uiPriority="66"/>
-    <w:lsdException w:name="Medium Grid 1 Accent 3" w:uiPriority="67"/>
-    <w:lsdException w:name="Medium Grid 2 Accent 3" w:uiPriority="68"/>
-    <w:lsdException w:name="Medium Grid 3 Accent 3" w:uiPriority="69"/>
-    <w:lsdException w:name="Dark List Accent 3" w:uiPriority="70"/>
-    <w:lsdException w:name="Colorful Shading Accent 3" w:uiPriority="71"/>
-    <w:lsdException w:name="Colorful List Accent 3" w:uiPriority="72"/>
-    <w:lsdException w:name="Colorful Grid Accent 3" w:uiPriority="73"/>
-    <w:lsdException w:name="Light Shading Accent 4" w:uiPriority="60"/>
-    <w:lsdException w:name="Light List Accent 4" w:uiPriority="61"/>
-    <w:lsdException w:name="Light Grid Accent 4" w:uiPriority="62"/>
-    <w:lsdException w:name="Medium Shading 1 Accent 4" w:uiPriority="63"/>
-    <w:lsdException w:name="Medium Shading 2 Accent 4" w:uiPriority="64"/>
-    <w:lsdException w:name="Medium List 1 Accent 4" w:uiPriority="65"/>
-    <w:lsdException w:name="Medium List 2 Accent 4" w:uiPriority="66"/>
-    <w:lsdException w:name="Medium Grid 1 Accent 4" w:uiPriority="67"/>
-    <w:lsdException w:name="Medium Grid 2 Accent 4" w:uiPriority="68"/>
-    <w:lsdException w:name="Medium Grid 3 Accent 4" w:uiPriority="69"/>
-    <w:lsdException w:name="Dark List Accent 4" w:uiPriority="70"/>
-    <w:lsdException w:name="Colorful Shading Accent 4" w:uiPriority="71"/>
-    <w:lsdException w:name="Colorful List Accent 4" w:uiPriority="72"/>
-    <w:lsdException w:name="Colorful Grid Accent 4" w:uiPriority="73"/>
-    <w:lsdException w:name="Light Shading Accent 5" w:uiPriority="60"/>
-    <w:lsdException w:name="Light List Accent 5" w:uiPriority="61"/>
-    <w:lsdException w:name="Light Grid Accent 5" w:uiPriority="62"/>
-    <w:lsdException w:name="Medium Shading 1 Accent 5" w:uiPriority="63"/>
-    <w:lsdException w:name="Medium Shading 2 Accent 5" w:uiPriority="64"/>
-    <w:lsdException w:name="Medium List 1 Accent 5" w:uiPriority="65"/>
-    <w:lsdException w:name="Medium List 2 Accent 5" w:uiPriority="66"/>
-    <w:lsdException w:name="Medium Grid 1 Accent 5" w:uiPriority="67"/>
-    <w:lsdException w:name="Medium Grid 2 Accent 5" w:uiPriority="68"/>
-    <w:lsdException w:name="Medium Grid 3 Accent 5" w:uiPriority="69"/>
-    <w:lsdException w:name="Dark List Accent 5" w:uiPriority="70"/>
-    <w:lsdException w:name="Colorful Shading Accent 5" w:uiPriority="71"/>
-    <w:lsdException w:name="Colorful List Accent 5" w:uiPriority="72"/>
-    <w:lsdException w:name="Colorful Grid Accent 5" w:uiPriority="73"/>
-    <w:lsdException w:name="Light Shading Accent 6" w:uiPriority="60"/>
-    <w:lsdException w:name="Light List Accent 6" w:uiPriority="61"/>
-    <w:lsdException w:name="Light Grid Accent 6" w:uiPriority="62"/>
-    <w:lsdException w:name="Medium Shading 1 Accent 6" w:uiPriority="63"/>
-    <w:lsdException w:name="Medium Shading 2 Accent 6" w:uiPriority="64"/>
-    <w:lsdException w:name="Medium List 1 Accent 6" w:uiPriority="65"/>
-    <w:lsdException w:name="Medium List 2 Accent 6" w:uiPriority="66"/>
-    <w:lsdException w:name="Medium Grid 1 Accent 6" w:uiPriority="67"/>
-    <w:lsdException w:name="Medium Grid 2 Accent 6" w:uiPriority="68"/>
-    <w:lsdException w:name="Medium Grid 3 Accent 6" w:uiPriority="69"/>
-    <w:lsdException w:name="Dark List Accent 6" w:uiPriority="70"/>
-    <w:lsdException w:name="Colorful Shading Accent 6" w:uiPriority="71"/>
-    <w:lsdException w:name="Colorful List Accent 6" w:uiPriority="72"/>
-    <w:lsdException w:name="Colorful Grid Accent 6" w:uiPriority="73"/>
+    <w:lsdException w:name="Light Shading"/>
+    <w:lsdException w:name="Light List"/>
+    <w:lsdException w:name="Light Grid"/>
+    <w:lsdException w:name="Medium Shading 1"/>
+    <w:lsdException w:name="Medium Shading 2"/>
+    <w:lsdException w:name="Medium List 1"/>
+    <w:lsdException w:name="Medium List 2"/>
+    <w:lsdException w:name="Medium Grid 1"/>
+    <w:lsdException w:name="Medium Grid 2"/>
+    <w:lsdException w:name="Medium Grid 3"/>
+    <w:lsdException w:name="Dark List"/>
+    <w:lsdException w:name="Colorful Shading"/>
+    <w:lsdException w:name="Colorful List"/>
+    <w:lsdException w:name="Colorful Grid"/>
+    <w:lsdException w:name="Light Shading Accent 1"/>
+    <w:lsdException w:name="Light List Accent 1"/>
+    <w:lsdException w:name="Light Grid Accent 1"/>
+    <w:lsdException w:name="Medium Shading 1 Accent 1"/>
+    <w:lsdException w:name="Medium Shading 2 Accent 1"/>
+    <w:lsdException w:name="Medium List 1 Accent 1"/>
+    <w:lsdException w:name="Revision" w:semiHidden="1" w:unhideWhenUsed="1"/>
+    <w:lsdException w:name="List Paragraph" w:semiHidden="1" w:unhideWhenUsed="1"/>
+    <w:lsdException w:name="Quote" w:semiHidden="1" w:unhideWhenUsed="1"/>
+    <w:lsdException w:name="Intense Quote" w:semiHidden="1" w:unhideWhenUsed="1"/>
+    <w:lsdException w:name="Medium List 2 Accent 1"/>
+    <w:lsdException w:name="Medium Grid 1 Accent 1"/>
+    <w:lsdException w:name="Medium Grid 2 Accent 1"/>
+    <w:lsdException w:name="Medium Grid 3 Accent 1"/>
+    <w:lsdException w:name="Dark List Accent 1"/>
+    <w:lsdException w:name="Colorful Shading Accent 1"/>
+    <w:lsdException w:name="Colorful List Accent 1"/>
+    <w:lsdException w:name="Colorful Grid Accent 1"/>
+    <w:lsdException w:name="Light Shading Accent 2"/>
+    <w:lsdException w:name="Light List Accent 2"/>
+    <w:lsdException w:name="Light Grid Accent 2"/>
+    <w:lsdException w:name="Medium Shading 1 Accent 2"/>
+    <w:lsdException w:name="Medium Shading 2 Accent 2"/>
+    <w:lsdException w:name="Medium List 1 Accent 2"/>
+    <w:lsdException w:name="Medium List 2 Accent 2"/>
+    <w:lsdException w:name="Medium Grid 1 Accent 2"/>
+    <w:lsdException w:name="Medium Grid 2 Accent 2"/>
+    <w:lsdException w:name="Medium Grid 3 Accent 2"/>
+    <w:lsdException w:name="Dark List Accent 2"/>
+    <w:lsdException w:name="Colorful Shading Accent 2"/>
+    <w:lsdException w:name="Colorful List Accent 2"/>
+    <w:lsdException w:name="Colorful Grid Accent 2"/>
+    <w:lsdException w:name="Light Shading Accent 3"/>
+    <w:lsdException w:name="Light List Accent 3"/>
+    <w:lsdException w:name="Light Grid Accent 3"/>
+    <w:lsdException w:name="Medium Shading 1 Accent 3"/>
+    <w:lsdException w:name="Medium Shading 2 Accent 3"/>
+    <w:lsdException w:name="Medium List 1 Accent 3"/>
+    <w:lsdException w:name="Medium List 2 Accent 3"/>
+    <w:lsdException w:name="Medium Grid 1 Accent 3"/>
+    <w:lsdException w:name="Medium Grid 2 Accent 3"/>
+    <w:lsdException w:name="Medium Grid 3 Accent 3"/>
+    <w:lsdException w:name="Dark List Accent 3"/>
+    <w:lsdException w:name="Colorful Shading Accent 3"/>
+    <w:lsdException w:name="Colorful List Accent 3"/>
+    <w:lsdException w:name="Colorful Grid Accent 3"/>
+    <w:lsdException w:name="Light Shading Accent 4"/>
+    <w:lsdException w:name="Light List Accent 4"/>
+    <w:lsdException w:name="Light Grid Accent 4"/>
+    <w:lsdException w:name="Medium Shading 1 Accent 4"/>
+    <w:lsdException w:name="Medium Shading 2 Accent 4"/>
+    <w:lsdException w:name="Medium List 1 Accent 4"/>
+    <w:lsdException w:name="Medium List 2 Accent 4"/>
+    <w:lsdException w:name="Medium Grid 1 Accent 4"/>
+    <w:lsdException w:name="Medium Grid 2 Accent 4"/>
+    <w:lsdException w:name="Medium Grid 3 Accent 4"/>
+    <w:lsdException w:name="Dark List Accent 4"/>
+    <w:lsdException w:name="Colorful Shading Accent 4"/>
+    <w:lsdException w:name="Colorful List Accent 4"/>
+    <w:lsdException w:name="Colorful Grid Accent 4"/>
+    <w:lsdException w:name="Light Shading Accent 5"/>
+    <w:lsdException w:name="Light List Accent 5"/>
+    <w:lsdException w:name="Light Grid Accent 5"/>
+    <w:lsdException w:name="Medium Shading 1 Accent 5"/>
+    <w:lsdException w:name="Medium Shading 2 Accent 5"/>
+    <w:lsdException w:name="Medium List 1 Accent 5"/>
+    <w:lsdException w:name="Medium List 2 Accent 5"/>
+    <w:lsdException w:name="Medium Grid 1 Accent 5"/>
+    <w:lsdException w:name="Medium Grid 2 Accent 5"/>
+    <w:lsdException w:name="Medium Grid 3 Accent 5"/>
+    <w:lsdException w:name="Dark List Accent 5"/>
+    <w:lsdException w:name="Colorful Shading Accent 5"/>
+    <w:lsdException w:name="Colorful List Accent 5"/>
+    <w:lsdException w:name="Colorful Grid Accent 5"/>
+    <w:lsdException w:name="Light Shading Accent 6"/>
+    <w:lsdException w:name="Light List Accent 6"/>
+    <w:lsdException w:name="Light Grid Accent 6"/>
+    <w:lsdException w:name="Medium Shading 1 Accent 6"/>
+    <w:lsdException w:name="Medium Shading 2 Accent 6"/>
+    <w:lsdException w:name="Medium List 1 Accent 6"/>
+    <w:lsdException w:name="Medium List 2 Accent 6"/>
+    <w:lsdException w:name="Medium Grid 1 Accent 6"/>
+    <w:lsdException w:name="Medium Grid 2 Accent 6"/>
+    <w:lsdException w:name="Medium Grid 3 Accent 6"/>
+    <w:lsdException w:name="Dark List Accent 6"/>
+    <w:lsdException w:name="Colorful Shading Accent 6"/>
+    <w:lsdException w:name="Colorful List Accent 6"/>
+    <w:lsdException w:name="Colorful Grid Accent 6"/>
     <w:lsdException w:name="Subtle Emphasis" w:uiPriority="19" w:qFormat="1"/>
     <w:lsdException w:name="Intense Emphasis" w:uiPriority="21" w:qFormat="1"/>
     <w:lsdException w:name="Subtle Reference" w:uiPriority="31" w:qFormat="1"/>
@@ -1430,13 +1663,23 @@
     <w:lsdException w:name="List Table 5 Dark Accent 6" w:uiPriority="50"/>
     <w:lsdException w:name="List Table 6 Colorful Accent 6" w:uiPriority="51"/>
     <w:lsdException w:name="List Table 7 Colorful Accent 6" w:uiPriority="52"/>
+    <w:lsdException w:name="Mention" w:semiHidden="1" w:unhideWhenUsed="1"/>
+    <w:lsdException w:name="Smart Hyperlink" w:semiHidden="1" w:unhideWhenUsed="1"/>
+    <w:lsdException w:name="Hashtag" w:semiHidden="1" w:unhideWhenUsed="1"/>
+    <w:lsdException w:name="Unresolved Mention" w:semiHidden="1" w:unhideWhenUsed="1"/>
+    <w:lsdException w:name="Smart Link" w:semiHidden="1" w:unhideWhenUsed="1"/>
   </w:latentStyles>
   <w:style w:type="paragraph" w:default="1" w:styleId="Normal">
     <w:name w:val="Normal"/>
     <w:qFormat/>
-    <w:rsid w:val="00D75182"/>
+    <w:pPr>
+      <w:spacing w:after="160" w:line="259" w:lineRule="auto"/>
+    </w:pPr>
     <w:rPr>
       <w:rFonts w:eastAsia="MS Mincho"/>
+      <w:sz w:val="22"/>
+      <w:szCs w:val="22"/>
+      <w:lang w:val="es-GT" w:eastAsia="en-US"/>
     </w:rPr>
   </w:style>
   <w:style w:type="character" w:default="1" w:styleId="Fuentedeprrafopredeter">
@@ -1466,54 +1709,25 @@
     <w:semiHidden/>
     <w:unhideWhenUsed/>
   </w:style>
-  <w:style w:type="paragraph" w:styleId="Sinespaciado">
-    <w:name w:val="No Spacing"/>
-    <w:uiPriority w:val="1"/>
-    <w:qFormat/>
-    <w:rsid w:val="007B480D"/>
-    <w:pPr>
-      <w:spacing w:after="0" w:line="240" w:lineRule="auto"/>
-    </w:pPr>
-  </w:style>
   <w:style w:type="character" w:styleId="Refdecomentario">
     <w:name w:val="annotation reference"/>
     <w:basedOn w:val="Fuentedeprrafopredeter"/>
     <w:uiPriority w:val="99"/>
     <w:semiHidden/>
     <w:unhideWhenUsed/>
-    <w:rsid w:val="00EB52AC"/>
     <w:rPr>
       <w:sz w:val="16"/>
       <w:szCs w:val="16"/>
     </w:rPr>
   </w:style>
-  <w:style w:type="paragraph" w:styleId="Textocomentario">
-    <w:name w:val="annotation text"/>
-    <w:basedOn w:val="Normal"/>
-    <w:link w:val="TextocomentarioCar"/>
-    <w:uiPriority w:val="99"/>
-    <w:semiHidden/>
-    <w:unhideWhenUsed/>
-    <w:rsid w:val="00EB52AC"/>
-    <w:pPr>
-      <w:spacing w:line="240" w:lineRule="auto"/>
-    </w:pPr>
+  <w:style w:type="character" w:styleId="Textoennegrita">
+    <w:name w:val="Strong"/>
+    <w:basedOn w:val="Fuentedeprrafopredeter"/>
+    <w:uiPriority w:val="22"/>
+    <w:qFormat/>
     <w:rPr>
-      <w:sz w:val="20"/>
-      <w:szCs w:val="20"/>
-    </w:rPr>
-  </w:style>
-  <w:style w:type="character" w:customStyle="1" w:styleId="TextocomentarioCar">
-    <w:name w:val="Texto comentario Car"/>
-    <w:basedOn w:val="Fuentedeprrafopredeter"/>
-    <w:link w:val="Textocomentario"/>
-    <w:uiPriority w:val="99"/>
-    <w:semiHidden/>
-    <w:rsid w:val="00EB52AC"/>
-    <w:rPr>
-      <w:rFonts w:eastAsia="MS Mincho"/>
-      <w:sz w:val="20"/>
-      <w:szCs w:val="20"/>
+      <w:b/>
+      <w:bCs/>
     </w:rPr>
   </w:style>
   <w:style w:type="paragraph" w:styleId="Asuntodelcomentario">
@@ -1524,23 +1738,24 @@
     <w:uiPriority w:val="99"/>
     <w:semiHidden/>
     <w:unhideWhenUsed/>
-    <w:rsid w:val="00EB52AC"/>
+    <w:qFormat/>
     <w:rPr>
       <w:b/>
       <w:bCs/>
     </w:rPr>
   </w:style>
-  <w:style w:type="character" w:customStyle="1" w:styleId="AsuntodelcomentarioCar">
-    <w:name w:val="Asunto del comentario Car"/>
-    <w:basedOn w:val="TextocomentarioCar"/>
-    <w:link w:val="Asuntodelcomentario"/>
+  <w:style w:type="paragraph" w:styleId="Textocomentario">
+    <w:name w:val="annotation text"/>
+    <w:basedOn w:val="Normal"/>
+    <w:link w:val="TextocomentarioCar"/>
     <w:uiPriority w:val="99"/>
     <w:semiHidden/>
-    <w:rsid w:val="00EB52AC"/>
+    <w:unhideWhenUsed/>
+    <w:qFormat/>
+    <w:pPr>
+      <w:spacing w:line="240" w:lineRule="auto"/>
+    </w:pPr>
     <w:rPr>
-      <w:rFonts w:eastAsia="MS Mincho"/>
-      <w:b/>
-      <w:bCs/>
       <w:sz w:val="20"/>
       <w:szCs w:val="20"/>
     </w:rPr>
@@ -1552,7 +1767,7 @@
     <w:uiPriority w:val="99"/>
     <w:semiHidden/>
     <w:unhideWhenUsed/>
-    <w:rsid w:val="0005271C"/>
+    <w:qFormat/>
     <w:pPr>
       <w:spacing w:after="0" w:line="240" w:lineRule="auto"/>
     </w:pPr>
@@ -1562,32 +1777,28 @@
       <w:szCs w:val="18"/>
     </w:rPr>
   </w:style>
-  <w:style w:type="character" w:customStyle="1" w:styleId="TextodegloboCar">
-    <w:name w:val="Texto de globo Car"/>
-    <w:basedOn w:val="Fuentedeprrafopredeter"/>
-    <w:link w:val="Textodeglobo"/>
+  <w:style w:type="paragraph" w:styleId="NormalWeb">
+    <w:name w:val="Normal (Web)"/>
+    <w:basedOn w:val="Normal"/>
     <w:uiPriority w:val="99"/>
     <w:semiHidden/>
-    <w:rsid w:val="0005271C"/>
+    <w:unhideWhenUsed/>
+    <w:qFormat/>
+    <w:pPr>
+      <w:spacing w:before="100" w:beforeAutospacing="1" w:after="100" w:afterAutospacing="1" w:line="240" w:lineRule="auto"/>
+    </w:pPr>
     <w:rPr>
-      <w:rFonts w:ascii="Segoe UI" w:eastAsia="MS Mincho" w:hAnsi="Segoe UI" w:cs="Segoe UI"/>
-      <w:sz w:val="18"/>
-      <w:szCs w:val="18"/>
+      <w:rFonts w:ascii="Times New Roman" w:eastAsia="Times New Roman" w:hAnsi="Times New Roman" w:cs="Times New Roman"/>
+      <w:sz w:val="24"/>
+      <w:szCs w:val="24"/>
+      <w:lang w:eastAsia="es-GT"/>
     </w:rPr>
-  </w:style>
-  <w:style w:type="character" w:customStyle="1" w:styleId="oypena">
-    <w:name w:val="oypena"/>
-    <w:basedOn w:val="Fuentedeprrafopredeter"/>
-    <w:rsid w:val="003F5629"/>
   </w:style>
   <w:style w:type="table" w:styleId="Tablaconcuadrcula">
     <w:name w:val="Table Grid"/>
     <w:basedOn w:val="Tablanormal"/>
     <w:uiPriority w:val="39"/>
-    <w:rsid w:val="00C251FB"/>
-    <w:pPr>
-      <w:spacing w:after="0" w:line="240" w:lineRule="auto"/>
-    </w:pPr>
+    <w:qFormat/>
     <w:tblPr>
       <w:tblBorders>
         <w:top w:val="single" w:sz="4" w:space="0" w:color="auto"/>
@@ -1599,10 +1810,66 @@
       </w:tblBorders>
     </w:tblPr>
   </w:style>
+  <w:style w:type="paragraph" w:styleId="Sinespaciado">
+    <w:name w:val="No Spacing"/>
+    <w:uiPriority w:val="1"/>
+    <w:qFormat/>
+    <w:rPr>
+      <w:sz w:val="22"/>
+      <w:szCs w:val="22"/>
+      <w:lang w:val="es-GT" w:eastAsia="en-US"/>
+    </w:rPr>
+  </w:style>
+  <w:style w:type="character" w:customStyle="1" w:styleId="TextocomentarioCar">
+    <w:name w:val="Texto comentario Car"/>
+    <w:basedOn w:val="Fuentedeprrafopredeter"/>
+    <w:link w:val="Textocomentario"/>
+    <w:uiPriority w:val="99"/>
+    <w:semiHidden/>
+    <w:qFormat/>
+    <w:rPr>
+      <w:rFonts w:eastAsia="MS Mincho"/>
+      <w:sz w:val="20"/>
+      <w:szCs w:val="20"/>
+    </w:rPr>
+  </w:style>
+  <w:style w:type="character" w:customStyle="1" w:styleId="AsuntodelcomentarioCar">
+    <w:name w:val="Asunto del comentario Car"/>
+    <w:basedOn w:val="TextocomentarioCar"/>
+    <w:link w:val="Asuntodelcomentario"/>
+    <w:uiPriority w:val="99"/>
+    <w:semiHidden/>
+    <w:qFormat/>
+    <w:rPr>
+      <w:rFonts w:eastAsia="MS Mincho"/>
+      <w:b/>
+      <w:bCs/>
+      <w:sz w:val="20"/>
+      <w:szCs w:val="20"/>
+    </w:rPr>
+  </w:style>
+  <w:style w:type="character" w:customStyle="1" w:styleId="TextodegloboCar">
+    <w:name w:val="Texto de globo Car"/>
+    <w:basedOn w:val="Fuentedeprrafopredeter"/>
+    <w:link w:val="Textodeglobo"/>
+    <w:uiPriority w:val="99"/>
+    <w:semiHidden/>
+    <w:qFormat/>
+    <w:rPr>
+      <w:rFonts w:ascii="Segoe UI" w:eastAsia="MS Mincho" w:hAnsi="Segoe UI" w:cs="Segoe UI"/>
+      <w:sz w:val="18"/>
+      <w:szCs w:val="18"/>
+    </w:rPr>
+  </w:style>
+  <w:style w:type="character" w:customStyle="1" w:styleId="oypena">
+    <w:name w:val="oypena"/>
+    <w:basedOn w:val="Fuentedeprrafopredeter"/>
+    <w:qFormat/>
+  </w:style>
   <w:style w:type="paragraph" w:customStyle="1" w:styleId="paragraph">
     <w:name w:val="paragraph"/>
     <w:basedOn w:val="Normal"/>
-    <w:rsid w:val="006E1988"/>
+    <w:qFormat/>
     <w:pPr>
       <w:spacing w:before="100" w:beforeAutospacing="1" w:after="100" w:afterAutospacing="1" w:line="240" w:lineRule="auto"/>
     </w:pPr>
@@ -1616,49 +1883,21 @@
   <w:style w:type="character" w:customStyle="1" w:styleId="normaltextrun">
     <w:name w:val="normaltextrun"/>
     <w:basedOn w:val="Fuentedeprrafopredeter"/>
-    <w:rsid w:val="006E1988"/>
+    <w:qFormat/>
   </w:style>
   <w:style w:type="character" w:customStyle="1" w:styleId="eop">
     <w:name w:val="eop"/>
     <w:basedOn w:val="Fuentedeprrafopredeter"/>
-    <w:rsid w:val="006E1988"/>
-  </w:style>
-  <w:style w:type="paragraph" w:styleId="NormalWeb">
-    <w:name w:val="Normal (Web)"/>
-    <w:basedOn w:val="Normal"/>
-    <w:uiPriority w:val="99"/>
-    <w:semiHidden/>
-    <w:unhideWhenUsed/>
-    <w:rsid w:val="00B952EC"/>
-    <w:pPr>
-      <w:spacing w:before="100" w:beforeAutospacing="1" w:after="100" w:afterAutospacing="1" w:line="240" w:lineRule="auto"/>
-    </w:pPr>
-    <w:rPr>
-      <w:rFonts w:ascii="Times New Roman" w:eastAsia="Times New Roman" w:hAnsi="Times New Roman" w:cs="Times New Roman"/>
-      <w:sz w:val="24"/>
-      <w:szCs w:val="24"/>
-      <w:lang w:eastAsia="es-GT"/>
-    </w:rPr>
+    <w:qFormat/>
   </w:style>
   <w:style w:type="character" w:customStyle="1" w:styleId="cf01">
     <w:name w:val="cf01"/>
     <w:basedOn w:val="Fuentedeprrafopredeter"/>
-    <w:rsid w:val="00B952EC"/>
+    <w:qFormat/>
     <w:rPr>
       <w:rFonts w:ascii="Consolas" w:hAnsi="Consolas" w:hint="default"/>
       <w:sz w:val="22"/>
       <w:szCs w:val="22"/>
-    </w:rPr>
-  </w:style>
-  <w:style w:type="character" w:styleId="Textoennegrita">
-    <w:name w:val="Strong"/>
-    <w:basedOn w:val="Fuentedeprrafopredeter"/>
-    <w:uiPriority w:val="22"/>
-    <w:qFormat/>
-    <w:rsid w:val="0078207B"/>
-    <w:rPr>
-      <w:b/>
-      <w:bCs/>
     </w:rPr>
   </w:style>
 </w:styles>
@@ -1707,7 +1946,7 @@
     </a:clrScheme>
     <a:fontScheme name="Office">
       <a:majorFont>
-        <a:latin typeface="Calibri Light" panose="020F0302020204030204"/>
+        <a:latin typeface="Calibri Light"/>
         <a:ea typeface=""/>
         <a:cs typeface=""/>
         <a:font script="Jpan" typeface="游ゴシック Light"/>
@@ -1740,26 +1979,9 @@
         <a:font script="Viet" typeface="Times New Roman"/>
         <a:font script="Uigh" typeface="Microsoft Uighur"/>
         <a:font script="Geor" typeface="Sylfaen"/>
-        <a:font script="Armn" typeface="Arial"/>
-        <a:font script="Bugi" typeface="Leelawadee UI"/>
-        <a:font script="Bopo" typeface="Microsoft JhengHei"/>
-        <a:font script="Java" typeface="Javanese Text"/>
-        <a:font script="Lisu" typeface="Segoe UI"/>
-        <a:font script="Mymr" typeface="Myanmar Text"/>
-        <a:font script="Nkoo" typeface="Ebrima"/>
-        <a:font script="Olck" typeface="Nirmala UI"/>
-        <a:font script="Osma" typeface="Ebrima"/>
-        <a:font script="Phag" typeface="Phagspa"/>
-        <a:font script="Syrn" typeface="Estrangelo Edessa"/>
-        <a:font script="Syrj" typeface="Estrangelo Edessa"/>
-        <a:font script="Syre" typeface="Estrangelo Edessa"/>
-        <a:font script="Sora" typeface="Nirmala UI"/>
-        <a:font script="Tale" typeface="Microsoft Tai Le"/>
-        <a:font script="Talu" typeface="Microsoft New Tai Lue"/>
-        <a:font script="Tfng" typeface="Ebrima"/>
       </a:majorFont>
       <a:minorFont>
-        <a:latin typeface="Calibri" panose="020F0502020204030204"/>
+        <a:latin typeface="Calibri"/>
         <a:ea typeface=""/>
         <a:cs typeface=""/>
         <a:font script="Jpan" typeface="游明朝"/>
@@ -1792,23 +2014,6 @@
         <a:font script="Viet" typeface="Arial"/>
         <a:font script="Uigh" typeface="Microsoft Uighur"/>
         <a:font script="Geor" typeface="Sylfaen"/>
-        <a:font script="Armn" typeface="Arial"/>
-        <a:font script="Bugi" typeface="Leelawadee UI"/>
-        <a:font script="Bopo" typeface="Microsoft JhengHei"/>
-        <a:font script="Java" typeface="Javanese Text"/>
-        <a:font script="Lisu" typeface="Segoe UI"/>
-        <a:font script="Mymr" typeface="Myanmar Text"/>
-        <a:font script="Nkoo" typeface="Ebrima"/>
-        <a:font script="Olck" typeface="Nirmala UI"/>
-        <a:font script="Osma" typeface="Ebrima"/>
-        <a:font script="Phag" typeface="Phagspa"/>
-        <a:font script="Syrn" typeface="Estrangelo Edessa"/>
-        <a:font script="Syrj" typeface="Estrangelo Edessa"/>
-        <a:font script="Syre" typeface="Estrangelo Edessa"/>
-        <a:font script="Sora" typeface="Nirmala UI"/>
-        <a:font script="Tale" typeface="Microsoft Tai Le"/>
-        <a:font script="Talu" typeface="Microsoft New Tai Lue"/>
-        <a:font script="Tfng" typeface="Ebrima"/>
       </a:minorFont>
     </a:fontScheme>
     <a:fmtScheme name="Office">
@@ -1951,10 +2156,5 @@
   </a:themeElements>
   <a:objectDefaults/>
   <a:extraClrSchemeLst/>
-  <a:extLst>
-    <a:ext uri="{05A4C25C-085E-4340-85A3-A5531E510DB2}">
-      <thm15:themeFamily xmlns:thm15="http://schemas.microsoft.com/office/thememl/2012/main" name="Office Theme" id="{62F939B6-93AF-4DB8-9C6B-D6C7DFDC589F}" vid="{4A3C46E8-61CC-4603-A589-7422A47A8E4A}"/>
-    </a:ext>
-  </a:extLst>
 </a:theme>
 </file>
</xml_diff>

<commit_message>
add:Se Agrego los datos del programador rhernandez-2024310 al documento Peaceathome.docx en la rama rhernandez-2024310
</commit_message>
<xml_diff>
--- a/Peaceathome.docx
+++ b/Peaceathome.docx
@@ -16,11 +16,11 @@
           <w:rFonts w:ascii="Arial" w:hAnsi="Arial" w:cs="Arial"/>
           <w:b/>
           <w:noProof/>
-          <w:lang w:eastAsia="es-GT"/>
+          <w:lang w:val="en-US"/>
         </w:rPr>
         <w:drawing>
-          <wp:inline distT="0" distB="0" distL="0" distR="0" wp14:anchorId="61DA3BD1" wp14:editId="0C35A376">
-            <wp:extent cx="2249144" cy="847725"/>
+          <wp:inline distT="0" distB="0" distL="0" distR="0" wp14:anchorId="2FEE8166" wp14:editId="6BE70031">
+            <wp:extent cx="2248535" cy="847725"/>
             <wp:effectExtent l="0" t="0" r="0" b="0"/>
             <wp:docPr id="2" name="Imagen 2"/>
             <wp:cNvGraphicFramePr>
@@ -30,13 +30,13 @@
               <a:graphicData uri="http://schemas.openxmlformats.org/drawingml/2006/picture">
                 <pic:pic xmlns:pic="http://schemas.openxmlformats.org/drawingml/2006/picture">
                   <pic:nvPicPr>
-                    <pic:cNvPr id="0" name="Picture 1"/>
+                    <pic:cNvPr id="2" name="Imagen 2"/>
                     <pic:cNvPicPr>
                       <a:picLocks noChangeAspect="1" noChangeArrowheads="1"/>
                     </pic:cNvPicPr>
                   </pic:nvPicPr>
                   <pic:blipFill>
-                    <a:blip r:embed="rId4" cstate="print">
+                    <a:blip r:embed="rId6" cstate="print">
                       <a:extLst>
                         <a:ext uri="{28A0092B-C50C-407E-A947-70E740481C1C}">
                           <a14:useLocalDpi xmlns:a14="http://schemas.microsoft.com/office/drawing/2010/main" val="0"/>
@@ -48,7 +48,7 @@
                       <a:fillRect/>
                     </a:stretch>
                   </pic:blipFill>
-                  <pic:spPr bwMode="auto">
+                  <pic:spPr>
                     <a:xfrm>
                       <a:off x="0" y="0"/>
                       <a:ext cx="2253277" cy="849283"/>
@@ -120,13 +120,7 @@
         <w:rPr>
           <w:rFonts w:ascii="Arial" w:hAnsi="Arial" w:cs="Arial"/>
         </w:rPr>
-        <w:t>5TO. PERITO EN INFORMATICA</w:t>
-      </w:r>
-      <w:r>
-        <w:rPr>
-          <w:rFonts w:ascii="Arial" w:hAnsi="Arial" w:cs="Arial"/>
-        </w:rPr>
-        <w:t xml:space="preserve"> </w:t>
+        <w:t xml:space="preserve">5TO. PERITO EN INFORMATICA </w:t>
       </w:r>
     </w:p>
     <w:p>
@@ -507,56 +501,7 @@
           <w:rFonts w:ascii="Arial" w:hAnsi="Arial" w:cs="Arial"/>
           <w:sz w:val="24"/>
         </w:rPr>
-        <w:t xml:space="preserve">Guatemala, </w:t>
-      </w:r>
-      <w:r>
-        <w:rPr>
-          <w:rFonts w:ascii="Arial" w:hAnsi="Arial" w:cs="Arial"/>
-          <w:sz w:val="24"/>
-        </w:rPr>
-        <w:t xml:space="preserve">15 </w:t>
-      </w:r>
-      <w:r>
-        <w:rPr>
-          <w:rFonts w:ascii="Arial" w:hAnsi="Arial" w:cs="Arial"/>
-          <w:sz w:val="24"/>
-        </w:rPr>
-        <w:t xml:space="preserve">de </w:t>
-      </w:r>
-      <w:r>
-        <w:rPr>
-          <w:rFonts w:ascii="Arial" w:hAnsi="Arial" w:cs="Arial"/>
-          <w:sz w:val="24"/>
-        </w:rPr>
-        <w:t xml:space="preserve">Julio </w:t>
-      </w:r>
-      <w:r>
-        <w:rPr>
-          <w:rFonts w:ascii="Arial" w:hAnsi="Arial" w:cs="Arial"/>
-          <w:sz w:val="24"/>
-        </w:rPr>
-        <w:t>de 20</w:t>
-      </w:r>
-      <w:r>
-        <w:rPr>
-          <w:rFonts w:ascii="Arial" w:hAnsi="Arial" w:cs="Arial"/>
-          <w:sz w:val="24"/>
-        </w:rPr>
-        <w:t>2</w:t>
-      </w:r>
-      <w:r>
-        <w:rPr>
-          <w:rFonts w:ascii="Arial" w:hAnsi="Arial" w:cs="Arial"/>
-          <w:sz w:val="24"/>
-        </w:rPr>
-        <w:t>5</w:t>
-      </w:r>
-      <w:r>
-        <w:rPr>
-          <w:rFonts w:ascii="Arial" w:hAnsi="Arial" w:cs="Arial"/>
-          <w:sz w:val="24"/>
-        </w:rPr>
-        <w:t>.</w:t>
+        <w:t>Guatemala, 15 de Julio de 2025.</w:t>
       </w:r>
     </w:p>
     <w:p>
@@ -590,6 +535,7 @@
           </w:tcPr>
           <w:p>
             <w:pPr>
+              <w:spacing w:after="0" w:line="240" w:lineRule="auto"/>
               <w:jc w:val="center"/>
               <w:rPr>
                 <w:rFonts w:ascii="Arial" w:eastAsiaTheme="minorHAnsi" w:hAnsi="Arial" w:cs="Arial"/>
@@ -624,6 +570,7 @@
           </w:tcPr>
           <w:p>
             <w:pPr>
+              <w:spacing w:after="0" w:line="240" w:lineRule="auto"/>
               <w:jc w:val="center"/>
               <w:rPr>
                 <w:rFonts w:ascii="Arial" w:eastAsiaTheme="minorHAnsi" w:hAnsi="Arial" w:cs="Arial"/>
@@ -649,6 +596,7 @@
           </w:tcPr>
           <w:p>
             <w:pPr>
+              <w:spacing w:after="0" w:line="240" w:lineRule="auto"/>
               <w:jc w:val="center"/>
               <w:rPr>
                 <w:rFonts w:ascii="Arial" w:eastAsiaTheme="minorHAnsi" w:hAnsi="Arial" w:cs="Arial"/>
@@ -656,20 +604,36 @@
                 <w:lang w:val="es-ES"/>
               </w:rPr>
             </w:pPr>
-          </w:p>
-        </w:tc>
-        <w:tc>
-          <w:tcPr>
-            <w:tcW w:w="5395" w:type="dxa"/>
-          </w:tcPr>
-          <w:p>
-            <w:pPr>
-              <w:jc w:val="center"/>
-              <w:rPr>
-                <w:rFonts w:ascii="Arial" w:eastAsiaTheme="minorHAnsi" w:hAnsi="Arial" w:cs="Arial"/>
-                <w:sz w:val="24"/>
-              </w:rPr>
-            </w:pPr>
+            <w:r>
+              <w:rPr>
+                <w:rFonts w:ascii="Arial" w:eastAsiaTheme="minorHAnsi" w:hAnsi="Arial" w:cs="Arial"/>
+                <w:sz w:val="24"/>
+                <w:lang w:val="es-ES"/>
+              </w:rPr>
+              <w:t>Kenet Efraín Cuyuch Joj</w:t>
+            </w:r>
+          </w:p>
+        </w:tc>
+        <w:tc>
+          <w:tcPr>
+            <w:tcW w:w="5395" w:type="dxa"/>
+          </w:tcPr>
+          <w:p>
+            <w:pPr>
+              <w:spacing w:after="0" w:line="240" w:lineRule="auto"/>
+              <w:jc w:val="center"/>
+              <w:rPr>
+                <w:rFonts w:ascii="Arial" w:eastAsiaTheme="minorHAnsi" w:hAnsi="Arial" w:cs="Arial"/>
+                <w:sz w:val="24"/>
+              </w:rPr>
+            </w:pPr>
+            <w:r>
+              <w:rPr>
+                <w:rFonts w:ascii="Arial" w:eastAsiaTheme="minorHAnsi" w:hAnsi="Arial" w:cs="Arial"/>
+                <w:sz w:val="24"/>
+              </w:rPr>
+              <w:t>Scrum Master</w:t>
+            </w:r>
           </w:p>
         </w:tc>
       </w:tr>
@@ -680,26 +644,50 @@
           </w:tcPr>
           <w:p>
             <w:pPr>
-              <w:jc w:val="center"/>
-              <w:rPr>
-                <w:rFonts w:ascii="Arial" w:eastAsiaTheme="minorHAnsi" w:hAnsi="Arial" w:cs="Arial"/>
-                <w:sz w:val="24"/>
-              </w:rPr>
-            </w:pPr>
-          </w:p>
-        </w:tc>
-        <w:tc>
-          <w:tcPr>
-            <w:tcW w:w="5395" w:type="dxa"/>
-          </w:tcPr>
-          <w:p>
-            <w:pPr>
-              <w:jc w:val="center"/>
-              <w:rPr>
-                <w:rFonts w:ascii="Arial" w:eastAsiaTheme="minorHAnsi" w:hAnsi="Arial" w:cs="Arial"/>
-                <w:sz w:val="24"/>
-              </w:rPr>
-            </w:pPr>
+              <w:spacing w:after="0" w:line="240" w:lineRule="auto"/>
+              <w:jc w:val="center"/>
+              <w:rPr>
+                <w:rFonts w:ascii="Arial" w:eastAsiaTheme="minorHAnsi" w:hAnsi="Arial" w:cs="Arial"/>
+                <w:sz w:val="24"/>
+              </w:rPr>
+            </w:pPr>
+            <w:r>
+              <w:rPr>
+                <w:rFonts w:ascii="Arial" w:eastAsiaTheme="minorHAnsi" w:hAnsi="Arial" w:cs="Arial"/>
+                <w:sz w:val="24"/>
+              </w:rPr>
+              <w:t>Angel Gahel</w:t>
+            </w:r>
+            <w:r>
+              <w:rPr>
+                <w:rFonts w:ascii="Arial" w:eastAsiaTheme="minorHAnsi" w:hAnsi="Arial" w:cs="Arial"/>
+                <w:sz w:val="24"/>
+              </w:rPr>
+              <w:t xml:space="preserve"> Padilla Pacheco</w:t>
+            </w:r>
+          </w:p>
+        </w:tc>
+        <w:tc>
+          <w:tcPr>
+            <w:tcW w:w="5395" w:type="dxa"/>
+          </w:tcPr>
+          <w:p>
+            <w:pPr>
+              <w:spacing w:after="0" w:line="240" w:lineRule="auto"/>
+              <w:jc w:val="center"/>
+              <w:rPr>
+                <w:rFonts w:ascii="Arial" w:eastAsiaTheme="minorHAnsi" w:hAnsi="Arial" w:cs="Arial"/>
+                <w:sz w:val="24"/>
+                <w:u w:val="single"/>
+              </w:rPr>
+            </w:pPr>
+            <w:r>
+              <w:rPr>
+                <w:rFonts w:ascii="Arial" w:eastAsiaTheme="minorHAnsi" w:hAnsi="Arial" w:cs="Arial"/>
+                <w:sz w:val="24"/>
+              </w:rPr>
+              <w:t>Programador</w:t>
+            </w:r>
           </w:p>
         </w:tc>
       </w:tr>
@@ -710,26 +698,42 @@
           </w:tcPr>
           <w:p>
             <w:pPr>
-              <w:jc w:val="center"/>
-              <w:rPr>
-                <w:rFonts w:ascii="Arial" w:eastAsiaTheme="minorHAnsi" w:hAnsi="Arial" w:cs="Arial"/>
-                <w:sz w:val="24"/>
-              </w:rPr>
-            </w:pPr>
-          </w:p>
-        </w:tc>
-        <w:tc>
-          <w:tcPr>
-            <w:tcW w:w="5395" w:type="dxa"/>
-          </w:tcPr>
-          <w:p>
-            <w:pPr>
-              <w:jc w:val="center"/>
-              <w:rPr>
-                <w:rFonts w:ascii="Arial" w:eastAsiaTheme="minorHAnsi" w:hAnsi="Arial" w:cs="Arial"/>
-                <w:sz w:val="24"/>
-              </w:rPr>
-            </w:pPr>
+              <w:spacing w:after="0" w:line="240" w:lineRule="auto"/>
+              <w:jc w:val="center"/>
+              <w:rPr>
+                <w:rFonts w:ascii="Arial" w:eastAsiaTheme="minorHAnsi" w:hAnsi="Arial" w:cs="Arial"/>
+                <w:sz w:val="24"/>
+              </w:rPr>
+            </w:pPr>
+            <w:r>
+              <w:rPr>
+                <w:rFonts w:ascii="Arial" w:eastAsiaTheme="minorHAnsi" w:hAnsi="Arial" w:cs="Arial"/>
+                <w:sz w:val="24"/>
+              </w:rPr>
+              <w:t>Jose Enrique cuc cutz</w:t>
+            </w:r>
+          </w:p>
+        </w:tc>
+        <w:tc>
+          <w:tcPr>
+            <w:tcW w:w="5395" w:type="dxa"/>
+          </w:tcPr>
+          <w:p>
+            <w:pPr>
+              <w:spacing w:after="0" w:line="240" w:lineRule="auto"/>
+              <w:jc w:val="center"/>
+              <w:rPr>
+                <w:rFonts w:ascii="Arial" w:eastAsiaTheme="minorHAnsi" w:hAnsi="Arial" w:cs="Arial"/>
+                <w:sz w:val="24"/>
+              </w:rPr>
+            </w:pPr>
+            <w:r>
+              <w:rPr>
+                <w:rFonts w:ascii="Arial" w:eastAsiaTheme="minorHAnsi" w:hAnsi="Arial" w:cs="Arial"/>
+                <w:sz w:val="24"/>
+              </w:rPr>
+              <w:t>Programador</w:t>
+            </w:r>
           </w:p>
         </w:tc>
       </w:tr>
@@ -740,26 +744,46 @@
           </w:tcPr>
           <w:p>
             <w:pPr>
-              <w:jc w:val="center"/>
-              <w:rPr>
-                <w:rFonts w:ascii="Arial" w:eastAsiaTheme="minorHAnsi" w:hAnsi="Arial" w:cs="Arial"/>
-                <w:sz w:val="24"/>
-              </w:rPr>
-            </w:pPr>
-          </w:p>
-        </w:tc>
-        <w:tc>
-          <w:tcPr>
-            <w:tcW w:w="5395" w:type="dxa"/>
-          </w:tcPr>
-          <w:p>
-            <w:pPr>
-              <w:jc w:val="center"/>
-              <w:rPr>
-                <w:rFonts w:ascii="Arial" w:eastAsiaTheme="minorHAnsi" w:hAnsi="Arial" w:cs="Arial"/>
-                <w:sz w:val="24"/>
-              </w:rPr>
-            </w:pPr>
+              <w:spacing w:after="0" w:line="240" w:lineRule="auto"/>
+              <w:jc w:val="center"/>
+              <w:rPr>
+                <w:rFonts w:ascii="Arial" w:eastAsiaTheme="minorEastAsia" w:hAnsi="Arial" w:cs="Arial"/>
+                <w:sz w:val="24"/>
+                <w:szCs w:val="24"/>
+              </w:rPr>
+            </w:pPr>
+            <w:r>
+              <w:rPr>
+                <w:rFonts w:ascii="Arial" w:eastAsiaTheme="minorEastAsia" w:hAnsi="Arial" w:cs="Arial"/>
+                <w:sz w:val="24"/>
+                <w:szCs w:val="24"/>
+              </w:rPr>
+              <w:t>Jeferson Andre Cano Lopez</w:t>
+            </w:r>
+          </w:p>
+        </w:tc>
+        <w:tc>
+          <w:tcPr>
+            <w:tcW w:w="5395" w:type="dxa"/>
+          </w:tcPr>
+          <w:p>
+            <w:pPr>
+              <w:spacing w:after="0" w:line="240" w:lineRule="auto"/>
+              <w:jc w:val="center"/>
+              <w:rPr>
+                <w:rFonts w:ascii="Arial" w:eastAsiaTheme="minorEastAsia" w:hAnsi="Arial" w:cs="Arial"/>
+                <w:sz w:val="24"/>
+                <w:szCs w:val="24"/>
+              </w:rPr>
+            </w:pPr>
+            <w:r>
+              <w:rPr>
+                <w:rFonts w:ascii="Arial" w:eastAsiaTheme="minorEastAsia" w:hAnsi="Arial" w:cs="Arial"/>
+                <w:sz w:val="24"/>
+                <w:szCs w:val="24"/>
+              </w:rPr>
+              <w:t>Programador</w:t>
+            </w:r>
           </w:p>
         </w:tc>
       </w:tr>
@@ -770,26 +794,42 @@
           </w:tcPr>
           <w:p>
             <w:pPr>
-              <w:jc w:val="center"/>
-              <w:rPr>
-                <w:rFonts w:ascii="Arial" w:eastAsiaTheme="minorHAnsi" w:hAnsi="Arial" w:cs="Arial"/>
-                <w:sz w:val="24"/>
-              </w:rPr>
-            </w:pPr>
-          </w:p>
-        </w:tc>
-        <w:tc>
-          <w:tcPr>
-            <w:tcW w:w="5395" w:type="dxa"/>
-          </w:tcPr>
-          <w:p>
-            <w:pPr>
-              <w:jc w:val="center"/>
-              <w:rPr>
-                <w:rFonts w:ascii="Arial" w:eastAsiaTheme="minorHAnsi" w:hAnsi="Arial" w:cs="Arial"/>
-                <w:sz w:val="24"/>
-              </w:rPr>
-            </w:pPr>
+              <w:spacing w:after="0" w:line="240" w:lineRule="auto"/>
+              <w:jc w:val="center"/>
+              <w:rPr>
+                <w:rFonts w:ascii="Arial" w:eastAsiaTheme="minorHAnsi" w:hAnsi="Arial" w:cs="Arial"/>
+                <w:sz w:val="24"/>
+              </w:rPr>
+            </w:pPr>
+            <w:r>
+              <w:rPr>
+                <w:rFonts w:ascii="Arial" w:eastAsiaTheme="minorHAnsi" w:hAnsi="Arial" w:cs="Arial"/>
+                <w:sz w:val="24"/>
+              </w:rPr>
+              <w:t>Carlos Enrique López Quino</w:t>
+            </w:r>
+          </w:p>
+        </w:tc>
+        <w:tc>
+          <w:tcPr>
+            <w:tcW w:w="5395" w:type="dxa"/>
+          </w:tcPr>
+          <w:p>
+            <w:pPr>
+              <w:spacing w:after="0" w:line="240" w:lineRule="auto"/>
+              <w:jc w:val="center"/>
+              <w:rPr>
+                <w:rFonts w:ascii="Arial" w:eastAsiaTheme="minorHAnsi" w:hAnsi="Arial" w:cs="Arial"/>
+                <w:sz w:val="24"/>
+              </w:rPr>
+            </w:pPr>
+            <w:r>
+              <w:rPr>
+                <w:rFonts w:ascii="Arial" w:eastAsiaTheme="minorHAnsi" w:hAnsi="Arial" w:cs="Arial"/>
+                <w:sz w:val="24"/>
+              </w:rPr>
+              <w:t>Programador</w:t>
+            </w:r>
           </w:p>
         </w:tc>
       </w:tr>
@@ -800,26 +840,42 @@
           </w:tcPr>
           <w:p>
             <w:pPr>
-              <w:jc w:val="center"/>
-              <w:rPr>
-                <w:rFonts w:ascii="Arial" w:eastAsiaTheme="minorHAnsi" w:hAnsi="Arial" w:cs="Arial"/>
-                <w:sz w:val="24"/>
-              </w:rPr>
-            </w:pPr>
-          </w:p>
-        </w:tc>
-        <w:tc>
-          <w:tcPr>
-            <w:tcW w:w="5395" w:type="dxa"/>
-          </w:tcPr>
-          <w:p>
-            <w:pPr>
-              <w:jc w:val="center"/>
-              <w:rPr>
-                <w:rFonts w:ascii="Arial" w:eastAsiaTheme="minorHAnsi" w:hAnsi="Arial" w:cs="Arial"/>
-                <w:sz w:val="24"/>
-              </w:rPr>
-            </w:pPr>
+              <w:spacing w:after="0" w:line="240" w:lineRule="auto"/>
+              <w:jc w:val="center"/>
+              <w:rPr>
+                <w:rFonts w:ascii="Arial" w:eastAsiaTheme="minorHAnsi" w:hAnsi="Arial" w:cs="Arial"/>
+                <w:sz w:val="24"/>
+              </w:rPr>
+            </w:pPr>
+            <w:r>
+              <w:rPr>
+                <w:rFonts w:ascii="Arial" w:eastAsiaTheme="minorHAnsi" w:hAnsi="Arial" w:cs="Arial"/>
+                <w:sz w:val="24"/>
+              </w:rPr>
+              <w:t>Ricardo Alejandro Hernández Hernández</w:t>
+            </w:r>
+          </w:p>
+        </w:tc>
+        <w:tc>
+          <w:tcPr>
+            <w:tcW w:w="5395" w:type="dxa"/>
+          </w:tcPr>
+          <w:p>
+            <w:pPr>
+              <w:spacing w:after="0" w:line="240" w:lineRule="auto"/>
+              <w:jc w:val="center"/>
+              <w:rPr>
+                <w:rFonts w:ascii="Arial" w:eastAsiaTheme="minorHAnsi" w:hAnsi="Arial" w:cs="Arial"/>
+                <w:sz w:val="24"/>
+              </w:rPr>
+            </w:pPr>
+            <w:r>
+              <w:rPr>
+                <w:rFonts w:ascii="Arial" w:eastAsiaTheme="minorHAnsi" w:hAnsi="Arial" w:cs="Arial"/>
+                <w:sz w:val="24"/>
+              </w:rPr>
+              <w:t>Programador</w:t>
+            </w:r>
           </w:p>
         </w:tc>
       </w:tr>
@@ -830,20 +886,22 @@
           </w:tcPr>
           <w:p>
             <w:pPr>
-              <w:jc w:val="center"/>
-              <w:rPr>
-                <w:rFonts w:ascii="Arial" w:eastAsiaTheme="minorHAnsi" w:hAnsi="Arial" w:cs="Arial"/>
-                <w:sz w:val="24"/>
-              </w:rPr>
-            </w:pPr>
-          </w:p>
-        </w:tc>
-        <w:tc>
-          <w:tcPr>
-            <w:tcW w:w="5395" w:type="dxa"/>
-          </w:tcPr>
-          <w:p>
-            <w:pPr>
+              <w:spacing w:after="0" w:line="240" w:lineRule="auto"/>
+              <w:jc w:val="center"/>
+              <w:rPr>
+                <w:rFonts w:ascii="Arial" w:eastAsiaTheme="minorHAnsi" w:hAnsi="Arial" w:cs="Arial"/>
+                <w:sz w:val="24"/>
+              </w:rPr>
+            </w:pPr>
+          </w:p>
+        </w:tc>
+        <w:tc>
+          <w:tcPr>
+            <w:tcW w:w="5395" w:type="dxa"/>
+          </w:tcPr>
+          <w:p>
+            <w:pPr>
+              <w:spacing w:after="0" w:line="240" w:lineRule="auto"/>
               <w:jc w:val="center"/>
               <w:rPr>
                 <w:rFonts w:ascii="Arial" w:eastAsiaTheme="minorHAnsi" w:hAnsi="Arial" w:cs="Arial"/>
@@ -860,20 +918,22 @@
           </w:tcPr>
           <w:p>
             <w:pPr>
-              <w:jc w:val="center"/>
-              <w:rPr>
-                <w:rFonts w:ascii="Arial" w:eastAsiaTheme="minorHAnsi" w:hAnsi="Arial" w:cs="Arial"/>
-                <w:sz w:val="24"/>
-              </w:rPr>
-            </w:pPr>
-          </w:p>
-        </w:tc>
-        <w:tc>
-          <w:tcPr>
-            <w:tcW w:w="5395" w:type="dxa"/>
-          </w:tcPr>
-          <w:p>
-            <w:pPr>
+              <w:spacing w:after="0" w:line="240" w:lineRule="auto"/>
+              <w:jc w:val="center"/>
+              <w:rPr>
+                <w:rFonts w:ascii="Arial" w:eastAsiaTheme="minorHAnsi" w:hAnsi="Arial" w:cs="Arial"/>
+                <w:sz w:val="24"/>
+              </w:rPr>
+            </w:pPr>
+          </w:p>
+        </w:tc>
+        <w:tc>
+          <w:tcPr>
+            <w:tcW w:w="5395" w:type="dxa"/>
+          </w:tcPr>
+          <w:p>
+            <w:pPr>
+              <w:spacing w:after="0" w:line="240" w:lineRule="auto"/>
               <w:jc w:val="center"/>
               <w:rPr>
                 <w:rFonts w:ascii="Arial" w:eastAsiaTheme="minorHAnsi" w:hAnsi="Arial" w:cs="Arial"/>
@@ -890,6 +950,7 @@
           </w:tcPr>
           <w:p>
             <w:pPr>
+              <w:spacing w:after="0" w:line="240" w:lineRule="auto"/>
               <w:jc w:val="center"/>
               <w:rPr>
                 <w:rFonts w:ascii="Arial" w:eastAsiaTheme="minorEastAsia" w:hAnsi="Arial" w:cs="Arial"/>
@@ -905,6 +966,7 @@
           </w:tcPr>
           <w:p>
             <w:pPr>
+              <w:spacing w:after="0" w:line="240" w:lineRule="auto"/>
               <w:jc w:val="center"/>
               <w:rPr>
                 <w:rFonts w:ascii="Arial" w:eastAsiaTheme="minorEastAsia" w:hAnsi="Arial" w:cs="Arial"/>
@@ -922,20 +984,22 @@
           </w:tcPr>
           <w:p>
             <w:pPr>
-              <w:jc w:val="center"/>
-              <w:rPr>
-                <w:rFonts w:ascii="Arial" w:eastAsiaTheme="minorHAnsi" w:hAnsi="Arial" w:cs="Arial"/>
-                <w:sz w:val="24"/>
-              </w:rPr>
-            </w:pPr>
-          </w:p>
-        </w:tc>
-        <w:tc>
-          <w:tcPr>
-            <w:tcW w:w="5395" w:type="dxa"/>
-          </w:tcPr>
-          <w:p>
-            <w:pPr>
+              <w:spacing w:after="0" w:line="240" w:lineRule="auto"/>
+              <w:jc w:val="center"/>
+              <w:rPr>
+                <w:rFonts w:ascii="Arial" w:eastAsiaTheme="minorHAnsi" w:hAnsi="Arial" w:cs="Arial"/>
+                <w:sz w:val="24"/>
+              </w:rPr>
+            </w:pPr>
+          </w:p>
+        </w:tc>
+        <w:tc>
+          <w:tcPr>
+            <w:tcW w:w="5395" w:type="dxa"/>
+          </w:tcPr>
+          <w:p>
+            <w:pPr>
+              <w:spacing w:after="0" w:line="240" w:lineRule="auto"/>
               <w:jc w:val="center"/>
               <w:rPr>
                 <w:rFonts w:ascii="Arial" w:eastAsiaTheme="minorHAnsi" w:hAnsi="Arial" w:cs="Arial"/>
@@ -952,20 +1016,22 @@
           </w:tcPr>
           <w:p>
             <w:pPr>
-              <w:jc w:val="center"/>
-              <w:rPr>
-                <w:rFonts w:ascii="Arial" w:eastAsiaTheme="minorHAnsi" w:hAnsi="Arial" w:cs="Arial"/>
-                <w:sz w:val="24"/>
-              </w:rPr>
-            </w:pPr>
-          </w:p>
-        </w:tc>
-        <w:tc>
-          <w:tcPr>
-            <w:tcW w:w="5395" w:type="dxa"/>
-          </w:tcPr>
-          <w:p>
-            <w:pPr>
+              <w:spacing w:after="0" w:line="240" w:lineRule="auto"/>
+              <w:jc w:val="center"/>
+              <w:rPr>
+                <w:rFonts w:ascii="Arial" w:eastAsiaTheme="minorHAnsi" w:hAnsi="Arial" w:cs="Arial"/>
+                <w:sz w:val="24"/>
+              </w:rPr>
+            </w:pPr>
+          </w:p>
+        </w:tc>
+        <w:tc>
+          <w:tcPr>
+            <w:tcW w:w="5395" w:type="dxa"/>
+          </w:tcPr>
+          <w:p>
+            <w:pPr>
+              <w:spacing w:after="0" w:line="240" w:lineRule="auto"/>
               <w:jc w:val="center"/>
               <w:rPr>
                 <w:rFonts w:ascii="Arial" w:eastAsiaTheme="minorHAnsi" w:hAnsi="Arial" w:cs="Arial"/>
@@ -982,20 +1048,22 @@
           </w:tcPr>
           <w:p>
             <w:pPr>
-              <w:jc w:val="center"/>
-              <w:rPr>
-                <w:rFonts w:ascii="Arial" w:eastAsiaTheme="minorHAnsi" w:hAnsi="Arial" w:cs="Arial"/>
-                <w:sz w:val="24"/>
-              </w:rPr>
-            </w:pPr>
-          </w:p>
-        </w:tc>
-        <w:tc>
-          <w:tcPr>
-            <w:tcW w:w="5395" w:type="dxa"/>
-          </w:tcPr>
-          <w:p>
-            <w:pPr>
+              <w:spacing w:after="0" w:line="240" w:lineRule="auto"/>
+              <w:jc w:val="center"/>
+              <w:rPr>
+                <w:rFonts w:ascii="Arial" w:eastAsiaTheme="minorHAnsi" w:hAnsi="Arial" w:cs="Arial"/>
+                <w:sz w:val="24"/>
+              </w:rPr>
+            </w:pPr>
+          </w:p>
+        </w:tc>
+        <w:tc>
+          <w:tcPr>
+            <w:tcW w:w="5395" w:type="dxa"/>
+          </w:tcPr>
+          <w:p>
+            <w:pPr>
+              <w:spacing w:after="0" w:line="240" w:lineRule="auto"/>
               <w:jc w:val="center"/>
               <w:rPr>
                 <w:rFonts w:ascii="Arial" w:eastAsiaTheme="minorHAnsi" w:hAnsi="Arial" w:cs="Arial"/>
@@ -1041,22 +1109,66 @@
 </w:document>
 </file>
 
+<file path=word/endnotes.xml><?xml version="1.0" encoding="utf-8"?>
+<w:endnotes xmlns:wpc="http://schemas.microsoft.com/office/word/2010/wordprocessingCanvas" xmlns:cx="http://schemas.microsoft.com/office/drawing/2014/chartex" xmlns:cx1="http://schemas.microsoft.com/office/drawing/2015/9/8/chartex" xmlns:mc="http://schemas.openxmlformats.org/markup-compatibility/2006" xmlns:o="urn:schemas-microsoft-com:office:office" xmlns:r="http://schemas.openxmlformats.org/officeDocument/2006/relationships" xmlns:m="http://schemas.openxmlformats.org/officeDocument/2006/math" xmlns:v="urn:schemas-microsoft-com:vml" xmlns:wp14="http://schemas.microsoft.com/office/word/2010/wordprocessingDrawing" xmlns:wp="http://schemas.openxmlformats.org/drawingml/2006/wordprocessingDrawing" xmlns:w10="urn:schemas-microsoft-com:office:word" xmlns:w="http://schemas.openxmlformats.org/wordprocessingml/2006/main" xmlns:w14="http://schemas.microsoft.com/office/word/2010/wordml" xmlns:w15="http://schemas.microsoft.com/office/word/2012/wordml" xmlns:w16se="http://schemas.microsoft.com/office/word/2015/wordml/symex" xmlns:wpg="http://schemas.microsoft.com/office/word/2010/wordprocessingGroup" xmlns:wpi="http://schemas.microsoft.com/office/word/2010/wordprocessingInk" xmlns:wne="http://schemas.microsoft.com/office/word/2006/wordml" xmlns:wps="http://schemas.microsoft.com/office/word/2010/wordprocessingShape" mc:Ignorable="w14 w15 w16se wp14">
+  <w:endnote w:type="separator" w:id="-1">
+    <w:p>
+      <w:pPr>
+        <w:spacing w:line="240" w:lineRule="auto"/>
+      </w:pPr>
+      <w:r>
+        <w:separator/>
+      </w:r>
+    </w:p>
+  </w:endnote>
+  <w:endnote w:type="continuationSeparator" w:id="0">
+    <w:p>
+      <w:pPr>
+        <w:spacing w:line="240" w:lineRule="auto"/>
+      </w:pPr>
+      <w:r>
+        <w:continuationSeparator/>
+      </w:r>
+    </w:p>
+  </w:endnote>
+</w:endnotes>
+</file>
+
+<file path=word/footnotes.xml><?xml version="1.0" encoding="utf-8"?>
+<w:footnotes xmlns:wpc="http://schemas.microsoft.com/office/word/2010/wordprocessingCanvas" xmlns:cx="http://schemas.microsoft.com/office/drawing/2014/chartex" xmlns:cx1="http://schemas.microsoft.com/office/drawing/2015/9/8/chartex" xmlns:mc="http://schemas.openxmlformats.org/markup-compatibility/2006" xmlns:o="urn:schemas-microsoft-com:office:office" xmlns:r="http://schemas.openxmlformats.org/officeDocument/2006/relationships" xmlns:m="http://schemas.openxmlformats.org/officeDocument/2006/math" xmlns:v="urn:schemas-microsoft-com:vml" xmlns:wp14="http://schemas.microsoft.com/office/word/2010/wordprocessingDrawing" xmlns:wp="http://schemas.openxmlformats.org/drawingml/2006/wordprocessingDrawing" xmlns:w10="urn:schemas-microsoft-com:office:word" xmlns:w="http://schemas.openxmlformats.org/wordprocessingml/2006/main" xmlns:w14="http://schemas.microsoft.com/office/word/2010/wordml" xmlns:w15="http://schemas.microsoft.com/office/word/2012/wordml" xmlns:w16se="http://schemas.microsoft.com/office/word/2015/wordml/symex" xmlns:wpg="http://schemas.microsoft.com/office/word/2010/wordprocessingGroup" xmlns:wpi="http://schemas.microsoft.com/office/word/2010/wordprocessingInk" xmlns:wne="http://schemas.microsoft.com/office/word/2006/wordml" xmlns:wps="http://schemas.microsoft.com/office/word/2010/wordprocessingShape" mc:Ignorable="w14 w15 w16se wp14">
+  <w:footnote w:type="separator" w:id="-1">
+    <w:p>
+      <w:pPr>
+        <w:spacing w:after="0"/>
+      </w:pPr>
+      <w:r>
+        <w:separator/>
+      </w:r>
+    </w:p>
+  </w:footnote>
+  <w:footnote w:type="continuationSeparator" w:id="0">
+    <w:p>
+      <w:pPr>
+        <w:spacing w:after="0"/>
+      </w:pPr>
+      <w:r>
+        <w:continuationSeparator/>
+      </w:r>
+    </w:p>
+  </w:footnote>
+</w:footnotes>
+</file>
+
 <file path=word/styles.xml><?xml version="1.0" encoding="utf-8"?>
 <w:styles xmlns:mc="http://schemas.openxmlformats.org/markup-compatibility/2006" xmlns:r="http://schemas.openxmlformats.org/officeDocument/2006/relationships" xmlns:w="http://schemas.openxmlformats.org/wordprocessingml/2006/main" xmlns:w14="http://schemas.microsoft.com/office/word/2010/wordml" xmlns:w15="http://schemas.microsoft.com/office/word/2012/wordml" xmlns:w16se="http://schemas.microsoft.com/office/word/2015/wordml/symex" mc:Ignorable="w14 w15 w16se">
   <w:docDefaults>
     <w:rPrDefault>
       <w:rPr>
         <w:rFonts w:asciiTheme="minorHAnsi" w:eastAsiaTheme="minorHAnsi" w:hAnsiTheme="minorHAnsi" w:cstheme="minorBidi"/>
-        <w:sz w:val="22"/>
-        <w:szCs w:val="22"/>
-        <w:lang w:val="es-GT" w:eastAsia="en-US" w:bidi="ar-SA"/>
+        <w:lang w:val="es-MX" w:eastAsia="es-MX" w:bidi="ar-SA"/>
       </w:rPr>
     </w:rPrDefault>
-    <w:pPrDefault>
-      <w:pPr>
-        <w:spacing w:after="160" w:line="259" w:lineRule="auto"/>
-      </w:pPr>
-    </w:pPrDefault>
+    <w:pPrDefault/>
   </w:docDefaults>
   <w:latentStyles w:defLockedState="0" w:defUIPriority="99" w:defSemiHidden="0" w:defUnhideWhenUsed="0" w:defQFormat="0" w:count="371">
     <w:lsdException w:name="Normal" w:uiPriority="0" w:qFormat="1"/>
@@ -1089,7 +1201,7 @@
     <w:lsdException w:name="toc 9" w:semiHidden="1" w:uiPriority="39" w:unhideWhenUsed="1"/>
     <w:lsdException w:name="Normal Indent" w:semiHidden="1" w:unhideWhenUsed="1"/>
     <w:lsdException w:name="footnote text" w:semiHidden="1" w:unhideWhenUsed="1"/>
-    <w:lsdException w:name="annotation text" w:semiHidden="1" w:unhideWhenUsed="1"/>
+    <w:lsdException w:name="annotation text" w:semiHidden="1" w:unhideWhenUsed="1" w:qFormat="1"/>
     <w:lsdException w:name="header" w:semiHidden="1" w:unhideWhenUsed="1"/>
     <w:lsdException w:name="footer" w:semiHidden="1" w:unhideWhenUsed="1"/>
     <w:lsdException w:name="index heading" w:semiHidden="1" w:unhideWhenUsed="1"/>
@@ -1153,7 +1265,7 @@
     <w:lsdException w:name="E-mail Signature" w:semiHidden="1" w:unhideWhenUsed="1"/>
     <w:lsdException w:name="HTML Top of Form" w:semiHidden="1" w:unhideWhenUsed="1"/>
     <w:lsdException w:name="HTML Bottom of Form" w:semiHidden="1" w:unhideWhenUsed="1"/>
-    <w:lsdException w:name="Normal (Web)" w:semiHidden="1" w:unhideWhenUsed="1"/>
+    <w:lsdException w:name="Normal (Web)" w:semiHidden="1" w:unhideWhenUsed="1" w:qFormat="1"/>
     <w:lsdException w:name="HTML Acronym" w:semiHidden="1" w:unhideWhenUsed="1"/>
     <w:lsdException w:name="HTML Address" w:semiHidden="1" w:unhideWhenUsed="1"/>
     <w:lsdException w:name="HTML Cite" w:semiHidden="1" w:unhideWhenUsed="1"/>
@@ -1164,8 +1276,8 @@
     <w:lsdException w:name="HTML Sample" w:semiHidden="1" w:unhideWhenUsed="1"/>
     <w:lsdException w:name="HTML Typewriter" w:semiHidden="1" w:unhideWhenUsed="1"/>
     <w:lsdException w:name="HTML Variable" w:semiHidden="1" w:unhideWhenUsed="1"/>
-    <w:lsdException w:name="Normal Table" w:semiHidden="1" w:unhideWhenUsed="1"/>
-    <w:lsdException w:name="annotation subject" w:semiHidden="1" w:unhideWhenUsed="1"/>
+    <w:lsdException w:name="Normal Table" w:semiHidden="1" w:unhideWhenUsed="1" w:qFormat="1"/>
+    <w:lsdException w:name="annotation subject" w:semiHidden="1" w:unhideWhenUsed="1" w:qFormat="1"/>
     <w:lsdException w:name="No List" w:semiHidden="1" w:unhideWhenUsed="1"/>
     <w:lsdException w:name="Outline List 1" w:semiHidden="1" w:unhideWhenUsed="1"/>
     <w:lsdException w:name="Outline List 2" w:semiHidden="1" w:unhideWhenUsed="1"/>
@@ -1212,113 +1324,113 @@
     <w:lsdException w:name="Table Web 1" w:semiHidden="1" w:unhideWhenUsed="1"/>
     <w:lsdException w:name="Table Web 2" w:semiHidden="1" w:unhideWhenUsed="1"/>
     <w:lsdException w:name="Table Web 3" w:semiHidden="1" w:unhideWhenUsed="1"/>
-    <w:lsdException w:name="Balloon Text" w:semiHidden="1" w:unhideWhenUsed="1"/>
-    <w:lsdException w:name="Table Grid" w:uiPriority="39"/>
+    <w:lsdException w:name="Balloon Text" w:semiHidden="1" w:unhideWhenUsed="1" w:qFormat="1"/>
+    <w:lsdException w:name="Table Grid" w:uiPriority="39" w:qFormat="1"/>
     <w:lsdException w:name="Table Theme" w:semiHidden="1" w:unhideWhenUsed="1"/>
-    <w:lsdException w:name="Placeholder Text" w:semiHidden="1"/>
+    <w:lsdException w:name="Placeholder Text" w:semiHidden="1" w:unhideWhenUsed="1"/>
     <w:lsdException w:name="No Spacing" w:uiPriority="1" w:qFormat="1"/>
-    <w:lsdException w:name="Light Shading" w:uiPriority="60"/>
-    <w:lsdException w:name="Light List" w:uiPriority="61"/>
-    <w:lsdException w:name="Light Grid" w:uiPriority="62"/>
-    <w:lsdException w:name="Medium Shading 1" w:uiPriority="63"/>
-    <w:lsdException w:name="Medium Shading 2" w:uiPriority="64"/>
-    <w:lsdException w:name="Medium List 1" w:uiPriority="65"/>
-    <w:lsdException w:name="Medium List 2" w:uiPriority="66"/>
-    <w:lsdException w:name="Medium Grid 1" w:uiPriority="67"/>
-    <w:lsdException w:name="Medium Grid 2" w:uiPriority="68"/>
-    <w:lsdException w:name="Medium Grid 3" w:uiPriority="69"/>
-    <w:lsdException w:name="Dark List" w:uiPriority="70"/>
-    <w:lsdException w:name="Colorful Shading" w:uiPriority="71"/>
-    <w:lsdException w:name="Colorful List" w:uiPriority="72"/>
-    <w:lsdException w:name="Colorful Grid" w:uiPriority="73"/>
-    <w:lsdException w:name="Light Shading Accent 1" w:uiPriority="60"/>
-    <w:lsdException w:name="Light List Accent 1" w:uiPriority="61"/>
-    <w:lsdException w:name="Light Grid Accent 1" w:uiPriority="62"/>
-    <w:lsdException w:name="Medium Shading 1 Accent 1" w:uiPriority="63"/>
-    <w:lsdException w:name="Medium Shading 2 Accent 1" w:uiPriority="64"/>
-    <w:lsdException w:name="Medium List 1 Accent 1" w:uiPriority="65"/>
-    <w:lsdException w:name="Revision" w:semiHidden="1"/>
-    <w:lsdException w:name="List Paragraph" w:uiPriority="34" w:qFormat="1"/>
-    <w:lsdException w:name="Quote" w:uiPriority="29" w:qFormat="1"/>
-    <w:lsdException w:name="Intense Quote" w:uiPriority="30" w:qFormat="1"/>
-    <w:lsdException w:name="Medium List 2 Accent 1" w:uiPriority="66"/>
-    <w:lsdException w:name="Medium Grid 1 Accent 1" w:uiPriority="67"/>
-    <w:lsdException w:name="Medium Grid 2 Accent 1" w:uiPriority="68"/>
-    <w:lsdException w:name="Medium Grid 3 Accent 1" w:uiPriority="69"/>
-    <w:lsdException w:name="Dark List Accent 1" w:uiPriority="70"/>
-    <w:lsdException w:name="Colorful Shading Accent 1" w:uiPriority="71"/>
-    <w:lsdException w:name="Colorful List Accent 1" w:uiPriority="72"/>
-    <w:lsdException w:name="Colorful Grid Accent 1" w:uiPriority="73"/>
-    <w:lsdException w:name="Light Shading Accent 2" w:uiPriority="60"/>
-    <w:lsdException w:name="Light List Accent 2" w:uiPriority="61"/>
-    <w:lsdException w:name="Light Grid Accent 2" w:uiPriority="62"/>
-    <w:lsdException w:name="Medium Shading 1 Accent 2" w:uiPriority="63"/>
-    <w:lsdException w:name="Medium Shading 2 Accent 2" w:uiPriority="64"/>
-    <w:lsdException w:name="Medium List 1 Accent 2" w:uiPriority="65"/>
-    <w:lsdException w:name="Medium List 2 Accent 2" w:uiPriority="66"/>
-    <w:lsdException w:name="Medium Grid 1 Accent 2" w:uiPriority="67"/>
-    <w:lsdException w:name="Medium Grid 2 Accent 2" w:uiPriority="68"/>
-    <w:lsdException w:name="Medium Grid 3 Accent 2" w:uiPriority="69"/>
-    <w:lsdException w:name="Dark List Accent 2" w:uiPriority="70"/>
-    <w:lsdException w:name="Colorful Shading Accent 2" w:uiPriority="71"/>
-    <w:lsdException w:name="Colorful List Accent 2" w:uiPriority="72"/>
-    <w:lsdException w:name="Colorful Grid Accent 2" w:uiPriority="73"/>
-    <w:lsdException w:name="Light Shading Accent 3" w:uiPriority="60"/>
-    <w:lsdException w:name="Light List Accent 3" w:uiPriority="61"/>
-    <w:lsdException w:name="Light Grid Accent 3" w:uiPriority="62"/>
-    <w:lsdException w:name="Medium Shading 1 Accent 3" w:uiPriority="63"/>
-    <w:lsdException w:name="Medium Shading 2 Accent 3" w:uiPriority="64"/>
-    <w:lsdException w:name="Medium List 1 Accent 3" w:uiPriority="65"/>
-    <w:lsdException w:name="Medium List 2 Accent 3" w:uiPriority="66"/>
-    <w:lsdException w:name="Medium Grid 1 Accent 3" w:uiPriority="67"/>
-    <w:lsdException w:name="Medium Grid 2 Accent 3" w:uiPriority="68"/>
-    <w:lsdException w:name="Medium Grid 3 Accent 3" w:uiPriority="69"/>
-    <w:lsdException w:name="Dark List Accent 3" w:uiPriority="70"/>
-    <w:lsdException w:name="Colorful Shading Accent 3" w:uiPriority="71"/>
-    <w:lsdException w:name="Colorful List Accent 3" w:uiPriority="72"/>
-    <w:lsdException w:name="Colorful Grid Accent 3" w:uiPriority="73"/>
-    <w:lsdException w:name="Light Shading Accent 4" w:uiPriority="60"/>
-    <w:lsdException w:name="Light List Accent 4" w:uiPriority="61"/>
-    <w:lsdException w:name="Light Grid Accent 4" w:uiPriority="62"/>
-    <w:lsdException w:name="Medium Shading 1 Accent 4" w:uiPriority="63"/>
-    <w:lsdException w:name="Medium Shading 2 Accent 4" w:uiPriority="64"/>
-    <w:lsdException w:name="Medium List 1 Accent 4" w:uiPriority="65"/>
-    <w:lsdException w:name="Medium List 2 Accent 4" w:uiPriority="66"/>
-    <w:lsdException w:name="Medium Grid 1 Accent 4" w:uiPriority="67"/>
-    <w:lsdException w:name="Medium Grid 2 Accent 4" w:uiPriority="68"/>
-    <w:lsdException w:name="Medium Grid 3 Accent 4" w:uiPriority="69"/>
-    <w:lsdException w:name="Dark List Accent 4" w:uiPriority="70"/>
-    <w:lsdException w:name="Colorful Shading Accent 4" w:uiPriority="71"/>
-    <w:lsdException w:name="Colorful List Accent 4" w:uiPriority="72"/>
-    <w:lsdException w:name="Colorful Grid Accent 4" w:uiPriority="73"/>
-    <w:lsdException w:name="Light Shading Accent 5" w:uiPriority="60"/>
-    <w:lsdException w:name="Light List Accent 5" w:uiPriority="61"/>
-    <w:lsdException w:name="Light Grid Accent 5" w:uiPriority="62"/>
-    <w:lsdException w:name="Medium Shading 1 Accent 5" w:uiPriority="63"/>
-    <w:lsdException w:name="Medium Shading 2 Accent 5" w:uiPriority="64"/>
-    <w:lsdException w:name="Medium List 1 Accent 5" w:uiPriority="65"/>
-    <w:lsdException w:name="Medium List 2 Accent 5" w:uiPriority="66"/>
-    <w:lsdException w:name="Medium Grid 1 Accent 5" w:uiPriority="67"/>
-    <w:lsdException w:name="Medium Grid 2 Accent 5" w:uiPriority="68"/>
-    <w:lsdException w:name="Medium Grid 3 Accent 5" w:uiPriority="69"/>
-    <w:lsdException w:name="Dark List Accent 5" w:uiPriority="70"/>
-    <w:lsdException w:name="Colorful Shading Accent 5" w:uiPriority="71"/>
-    <w:lsdException w:name="Colorful List Accent 5" w:uiPriority="72"/>
-    <w:lsdException w:name="Colorful Grid Accent 5" w:uiPriority="73"/>
-    <w:lsdException w:name="Light Shading Accent 6" w:uiPriority="60"/>
-    <w:lsdException w:name="Light List Accent 6" w:uiPriority="61"/>
-    <w:lsdException w:name="Light Grid Accent 6" w:uiPriority="62"/>
-    <w:lsdException w:name="Medium Shading 1 Accent 6" w:uiPriority="63"/>
-    <w:lsdException w:name="Medium Shading 2 Accent 6" w:uiPriority="64"/>
-    <w:lsdException w:name="Medium List 1 Accent 6" w:uiPriority="65"/>
-    <w:lsdException w:name="Medium List 2 Accent 6" w:uiPriority="66"/>
-    <w:lsdException w:name="Medium Grid 1 Accent 6" w:uiPriority="67"/>
-    <w:lsdException w:name="Medium Grid 2 Accent 6" w:uiPriority="68"/>
-    <w:lsdException w:name="Medium Grid 3 Accent 6" w:uiPriority="69"/>
-    <w:lsdException w:name="Dark List Accent 6" w:uiPriority="70"/>
-    <w:lsdException w:name="Colorful Shading Accent 6" w:uiPriority="71"/>
-    <w:lsdException w:name="Colorful List Accent 6" w:uiPriority="72"/>
-    <w:lsdException w:name="Colorful Grid Accent 6" w:uiPriority="73"/>
+    <w:lsdException w:name="Light Shading"/>
+    <w:lsdException w:name="Light List"/>
+    <w:lsdException w:name="Light Grid"/>
+    <w:lsdException w:name="Medium Shading 1"/>
+    <w:lsdException w:name="Medium Shading 2"/>
+    <w:lsdException w:name="Medium List 1"/>
+    <w:lsdException w:name="Medium List 2"/>
+    <w:lsdException w:name="Medium Grid 1"/>
+    <w:lsdException w:name="Medium Grid 2"/>
+    <w:lsdException w:name="Medium Grid 3"/>
+    <w:lsdException w:name="Dark List"/>
+    <w:lsdException w:name="Colorful Shading"/>
+    <w:lsdException w:name="Colorful List"/>
+    <w:lsdException w:name="Colorful Grid"/>
+    <w:lsdException w:name="Light Shading Accent 1"/>
+    <w:lsdException w:name="Light List Accent 1"/>
+    <w:lsdException w:name="Light Grid Accent 1"/>
+    <w:lsdException w:name="Medium Shading 1 Accent 1"/>
+    <w:lsdException w:name="Medium Shading 2 Accent 1"/>
+    <w:lsdException w:name="Medium List 1 Accent 1"/>
+    <w:lsdException w:name="Revision" w:semiHidden="1" w:unhideWhenUsed="1"/>
+    <w:lsdException w:name="List Paragraph" w:semiHidden="1" w:unhideWhenUsed="1"/>
+    <w:lsdException w:name="Quote" w:semiHidden="1" w:unhideWhenUsed="1"/>
+    <w:lsdException w:name="Intense Quote" w:semiHidden="1" w:unhideWhenUsed="1"/>
+    <w:lsdException w:name="Medium List 2 Accent 1"/>
+    <w:lsdException w:name="Medium Grid 1 Accent 1"/>
+    <w:lsdException w:name="Medium Grid 2 Accent 1"/>
+    <w:lsdException w:name="Medium Grid 3 Accent 1"/>
+    <w:lsdException w:name="Dark List Accent 1"/>
+    <w:lsdException w:name="Colorful Shading Accent 1"/>
+    <w:lsdException w:name="Colorful List Accent 1"/>
+    <w:lsdException w:name="Colorful Grid Accent 1"/>
+    <w:lsdException w:name="Light Shading Accent 2"/>
+    <w:lsdException w:name="Light List Accent 2"/>
+    <w:lsdException w:name="Light Grid Accent 2"/>
+    <w:lsdException w:name="Medium Shading 1 Accent 2"/>
+    <w:lsdException w:name="Medium Shading 2 Accent 2"/>
+    <w:lsdException w:name="Medium List 1 Accent 2"/>
+    <w:lsdException w:name="Medium List 2 Accent 2"/>
+    <w:lsdException w:name="Medium Grid 1 Accent 2"/>
+    <w:lsdException w:name="Medium Grid 2 Accent 2"/>
+    <w:lsdException w:name="Medium Grid 3 Accent 2"/>
+    <w:lsdException w:name="Dark List Accent 2"/>
+    <w:lsdException w:name="Colorful Shading Accent 2"/>
+    <w:lsdException w:name="Colorful List Accent 2"/>
+    <w:lsdException w:name="Colorful Grid Accent 2"/>
+    <w:lsdException w:name="Light Shading Accent 3"/>
+    <w:lsdException w:name="Light List Accent 3"/>
+    <w:lsdException w:name="Light Grid Accent 3"/>
+    <w:lsdException w:name="Medium Shading 1 Accent 3"/>
+    <w:lsdException w:name="Medium Shading 2 Accent 3"/>
+    <w:lsdException w:name="Medium List 1 Accent 3"/>
+    <w:lsdException w:name="Medium List 2 Accent 3"/>
+    <w:lsdException w:name="Medium Grid 1 Accent 3"/>
+    <w:lsdException w:name="Medium Grid 2 Accent 3"/>
+    <w:lsdException w:name="Medium Grid 3 Accent 3"/>
+    <w:lsdException w:name="Dark List Accent 3"/>
+    <w:lsdException w:name="Colorful Shading Accent 3"/>
+    <w:lsdException w:name="Colorful List Accent 3"/>
+    <w:lsdException w:name="Colorful Grid Accent 3"/>
+    <w:lsdException w:name="Light Shading Accent 4"/>
+    <w:lsdException w:name="Light List Accent 4"/>
+    <w:lsdException w:name="Light Grid Accent 4"/>
+    <w:lsdException w:name="Medium Shading 1 Accent 4"/>
+    <w:lsdException w:name="Medium Shading 2 Accent 4"/>
+    <w:lsdException w:name="Medium List 1 Accent 4"/>
+    <w:lsdException w:name="Medium List 2 Accent 4"/>
+    <w:lsdException w:name="Medium Grid 1 Accent 4"/>
+    <w:lsdException w:name="Medium Grid 2 Accent 4"/>
+    <w:lsdException w:name="Medium Grid 3 Accent 4"/>
+    <w:lsdException w:name="Dark List Accent 4"/>
+    <w:lsdException w:name="Colorful Shading Accent 4"/>
+    <w:lsdException w:name="Colorful List Accent 4"/>
+    <w:lsdException w:name="Colorful Grid Accent 4"/>
+    <w:lsdException w:name="Light Shading Accent 5"/>
+    <w:lsdException w:name="Light List Accent 5"/>
+    <w:lsdException w:name="Light Grid Accent 5"/>
+    <w:lsdException w:name="Medium Shading 1 Accent 5"/>
+    <w:lsdException w:name="Medium Shading 2 Accent 5"/>
+    <w:lsdException w:name="Medium List 1 Accent 5"/>
+    <w:lsdException w:name="Medium List 2 Accent 5"/>
+    <w:lsdException w:name="Medium Grid 1 Accent 5"/>
+    <w:lsdException w:name="Medium Grid 2 Accent 5"/>
+    <w:lsdException w:name="Medium Grid 3 Accent 5"/>
+    <w:lsdException w:name="Dark List Accent 5"/>
+    <w:lsdException w:name="Colorful Shading Accent 5"/>
+    <w:lsdException w:name="Colorful List Accent 5"/>
+    <w:lsdException w:name="Colorful Grid Accent 5"/>
+    <w:lsdException w:name="Light Shading Accent 6"/>
+    <w:lsdException w:name="Light List Accent 6"/>
+    <w:lsdException w:name="Light Grid Accent 6"/>
+    <w:lsdException w:name="Medium Shading 1 Accent 6"/>
+    <w:lsdException w:name="Medium Shading 2 Accent 6"/>
+    <w:lsdException w:name="Medium List 1 Accent 6"/>
+    <w:lsdException w:name="Medium List 2 Accent 6"/>
+    <w:lsdException w:name="Medium Grid 1 Accent 6"/>
+    <w:lsdException w:name="Medium Grid 2 Accent 6"/>
+    <w:lsdException w:name="Medium Grid 3 Accent 6"/>
+    <w:lsdException w:name="Dark List Accent 6"/>
+    <w:lsdException w:name="Colorful Shading Accent 6"/>
+    <w:lsdException w:name="Colorful List Accent 6"/>
+    <w:lsdException w:name="Colorful Grid Accent 6"/>
     <w:lsdException w:name="Subtle Emphasis" w:uiPriority="19" w:qFormat="1"/>
     <w:lsdException w:name="Intense Emphasis" w:uiPriority="21" w:qFormat="1"/>
     <w:lsdException w:name="Subtle Reference" w:uiPriority="31" w:qFormat="1"/>
@@ -1434,9 +1546,14 @@
   <w:style w:type="paragraph" w:default="1" w:styleId="Normal">
     <w:name w:val="Normal"/>
     <w:qFormat/>
-    <w:rsid w:val="00D75182"/>
+    <w:pPr>
+      <w:spacing w:after="160" w:line="259" w:lineRule="auto"/>
+    </w:pPr>
     <w:rPr>
       <w:rFonts w:eastAsia="MS Mincho"/>
+      <w:sz w:val="22"/>
+      <w:szCs w:val="22"/>
+      <w:lang w:val="es-GT" w:eastAsia="en-US"/>
     </w:rPr>
   </w:style>
   <w:style w:type="character" w:default="1" w:styleId="Fuentedeprrafopredeter">
@@ -1466,54 +1583,25 @@
     <w:semiHidden/>
     <w:unhideWhenUsed/>
   </w:style>
-  <w:style w:type="paragraph" w:styleId="Sinespaciado">
-    <w:name w:val="No Spacing"/>
-    <w:uiPriority w:val="1"/>
-    <w:qFormat/>
-    <w:rsid w:val="007B480D"/>
-    <w:pPr>
-      <w:spacing w:after="0" w:line="240" w:lineRule="auto"/>
-    </w:pPr>
-  </w:style>
   <w:style w:type="character" w:styleId="Refdecomentario">
     <w:name w:val="annotation reference"/>
     <w:basedOn w:val="Fuentedeprrafopredeter"/>
     <w:uiPriority w:val="99"/>
     <w:semiHidden/>
     <w:unhideWhenUsed/>
-    <w:rsid w:val="00EB52AC"/>
     <w:rPr>
       <w:sz w:val="16"/>
       <w:szCs w:val="16"/>
     </w:rPr>
   </w:style>
-  <w:style w:type="paragraph" w:styleId="Textocomentario">
-    <w:name w:val="annotation text"/>
-    <w:basedOn w:val="Normal"/>
-    <w:link w:val="TextocomentarioCar"/>
-    <w:uiPriority w:val="99"/>
-    <w:semiHidden/>
-    <w:unhideWhenUsed/>
-    <w:rsid w:val="00EB52AC"/>
-    <w:pPr>
-      <w:spacing w:line="240" w:lineRule="auto"/>
-    </w:pPr>
+  <w:style w:type="character" w:styleId="Textoennegrita">
+    <w:name w:val="Strong"/>
+    <w:basedOn w:val="Fuentedeprrafopredeter"/>
+    <w:uiPriority w:val="22"/>
+    <w:qFormat/>
     <w:rPr>
-      <w:sz w:val="20"/>
-      <w:szCs w:val="20"/>
-    </w:rPr>
-  </w:style>
-  <w:style w:type="character" w:customStyle="1" w:styleId="TextocomentarioCar">
-    <w:name w:val="Texto comentario Car"/>
-    <w:basedOn w:val="Fuentedeprrafopredeter"/>
-    <w:link w:val="Textocomentario"/>
-    <w:uiPriority w:val="99"/>
-    <w:semiHidden/>
-    <w:rsid w:val="00EB52AC"/>
-    <w:rPr>
-      <w:rFonts w:eastAsia="MS Mincho"/>
-      <w:sz w:val="20"/>
-      <w:szCs w:val="20"/>
+      <w:b/>
+      <w:bCs/>
     </w:rPr>
   </w:style>
   <w:style w:type="paragraph" w:styleId="Asuntodelcomentario">
@@ -1524,23 +1612,24 @@
     <w:uiPriority w:val="99"/>
     <w:semiHidden/>
     <w:unhideWhenUsed/>
-    <w:rsid w:val="00EB52AC"/>
+    <w:qFormat/>
     <w:rPr>
       <w:b/>
       <w:bCs/>
     </w:rPr>
   </w:style>
-  <w:style w:type="character" w:customStyle="1" w:styleId="AsuntodelcomentarioCar">
-    <w:name w:val="Asunto del comentario Car"/>
-    <w:basedOn w:val="TextocomentarioCar"/>
-    <w:link w:val="Asuntodelcomentario"/>
+  <w:style w:type="paragraph" w:styleId="Textocomentario">
+    <w:name w:val="annotation text"/>
+    <w:basedOn w:val="Normal"/>
+    <w:link w:val="TextocomentarioCar"/>
     <w:uiPriority w:val="99"/>
     <w:semiHidden/>
-    <w:rsid w:val="00EB52AC"/>
+    <w:unhideWhenUsed/>
+    <w:qFormat/>
+    <w:pPr>
+      <w:spacing w:line="240" w:lineRule="auto"/>
+    </w:pPr>
     <w:rPr>
-      <w:rFonts w:eastAsia="MS Mincho"/>
-      <w:b/>
-      <w:bCs/>
       <w:sz w:val="20"/>
       <w:szCs w:val="20"/>
     </w:rPr>
@@ -1552,7 +1641,7 @@
     <w:uiPriority w:val="99"/>
     <w:semiHidden/>
     <w:unhideWhenUsed/>
-    <w:rsid w:val="0005271C"/>
+    <w:qFormat/>
     <w:pPr>
       <w:spacing w:after="0" w:line="240" w:lineRule="auto"/>
     </w:pPr>
@@ -1562,32 +1651,28 @@
       <w:szCs w:val="18"/>
     </w:rPr>
   </w:style>
-  <w:style w:type="character" w:customStyle="1" w:styleId="TextodegloboCar">
-    <w:name w:val="Texto de globo Car"/>
-    <w:basedOn w:val="Fuentedeprrafopredeter"/>
-    <w:link w:val="Textodeglobo"/>
+  <w:style w:type="paragraph" w:styleId="NormalWeb">
+    <w:name w:val="Normal (Web)"/>
+    <w:basedOn w:val="Normal"/>
     <w:uiPriority w:val="99"/>
     <w:semiHidden/>
-    <w:rsid w:val="0005271C"/>
+    <w:unhideWhenUsed/>
+    <w:qFormat/>
+    <w:pPr>
+      <w:spacing w:before="100" w:beforeAutospacing="1" w:after="100" w:afterAutospacing="1" w:line="240" w:lineRule="auto"/>
+    </w:pPr>
     <w:rPr>
-      <w:rFonts w:ascii="Segoe UI" w:eastAsia="MS Mincho" w:hAnsi="Segoe UI" w:cs="Segoe UI"/>
-      <w:sz w:val="18"/>
-      <w:szCs w:val="18"/>
+      <w:rFonts w:ascii="Times New Roman" w:eastAsia="Times New Roman" w:hAnsi="Times New Roman" w:cs="Times New Roman"/>
+      <w:sz w:val="24"/>
+      <w:szCs w:val="24"/>
+      <w:lang w:eastAsia="es-GT"/>
     </w:rPr>
-  </w:style>
-  <w:style w:type="character" w:customStyle="1" w:styleId="oypena">
-    <w:name w:val="oypena"/>
-    <w:basedOn w:val="Fuentedeprrafopredeter"/>
-    <w:rsid w:val="003F5629"/>
   </w:style>
   <w:style w:type="table" w:styleId="Tablaconcuadrcula">
     <w:name w:val="Table Grid"/>
     <w:basedOn w:val="Tablanormal"/>
     <w:uiPriority w:val="39"/>
-    <w:rsid w:val="00C251FB"/>
-    <w:pPr>
-      <w:spacing w:after="0" w:line="240" w:lineRule="auto"/>
-    </w:pPr>
+    <w:qFormat/>
     <w:tblPr>
       <w:tblBorders>
         <w:top w:val="single" w:sz="4" w:space="0" w:color="auto"/>
@@ -1599,10 +1684,66 @@
       </w:tblBorders>
     </w:tblPr>
   </w:style>
+  <w:style w:type="paragraph" w:styleId="Sinespaciado">
+    <w:name w:val="No Spacing"/>
+    <w:uiPriority w:val="1"/>
+    <w:qFormat/>
+    <w:rPr>
+      <w:sz w:val="22"/>
+      <w:szCs w:val="22"/>
+      <w:lang w:val="es-GT" w:eastAsia="en-US"/>
+    </w:rPr>
+  </w:style>
+  <w:style w:type="character" w:customStyle="1" w:styleId="TextocomentarioCar">
+    <w:name w:val="Texto comentario Car"/>
+    <w:basedOn w:val="Fuentedeprrafopredeter"/>
+    <w:link w:val="Textocomentario"/>
+    <w:uiPriority w:val="99"/>
+    <w:semiHidden/>
+    <w:qFormat/>
+    <w:rPr>
+      <w:rFonts w:eastAsia="MS Mincho"/>
+      <w:sz w:val="20"/>
+      <w:szCs w:val="20"/>
+    </w:rPr>
+  </w:style>
+  <w:style w:type="character" w:customStyle="1" w:styleId="AsuntodelcomentarioCar">
+    <w:name w:val="Asunto del comentario Car"/>
+    <w:basedOn w:val="TextocomentarioCar"/>
+    <w:link w:val="Asuntodelcomentario"/>
+    <w:uiPriority w:val="99"/>
+    <w:semiHidden/>
+    <w:qFormat/>
+    <w:rPr>
+      <w:rFonts w:eastAsia="MS Mincho"/>
+      <w:b/>
+      <w:bCs/>
+      <w:sz w:val="20"/>
+      <w:szCs w:val="20"/>
+    </w:rPr>
+  </w:style>
+  <w:style w:type="character" w:customStyle="1" w:styleId="TextodegloboCar">
+    <w:name w:val="Texto de globo Car"/>
+    <w:basedOn w:val="Fuentedeprrafopredeter"/>
+    <w:link w:val="Textodeglobo"/>
+    <w:uiPriority w:val="99"/>
+    <w:semiHidden/>
+    <w:qFormat/>
+    <w:rPr>
+      <w:rFonts w:ascii="Segoe UI" w:eastAsia="MS Mincho" w:hAnsi="Segoe UI" w:cs="Segoe UI"/>
+      <w:sz w:val="18"/>
+      <w:szCs w:val="18"/>
+    </w:rPr>
+  </w:style>
+  <w:style w:type="character" w:customStyle="1" w:styleId="oypena">
+    <w:name w:val="oypena"/>
+    <w:basedOn w:val="Fuentedeprrafopredeter"/>
+    <w:qFormat/>
+  </w:style>
   <w:style w:type="paragraph" w:customStyle="1" w:styleId="paragraph">
     <w:name w:val="paragraph"/>
     <w:basedOn w:val="Normal"/>
-    <w:rsid w:val="006E1988"/>
+    <w:qFormat/>
     <w:pPr>
       <w:spacing w:before="100" w:beforeAutospacing="1" w:after="100" w:afterAutospacing="1" w:line="240" w:lineRule="auto"/>
     </w:pPr>
@@ -1616,49 +1757,21 @@
   <w:style w:type="character" w:customStyle="1" w:styleId="normaltextrun">
     <w:name w:val="normaltextrun"/>
     <w:basedOn w:val="Fuentedeprrafopredeter"/>
-    <w:rsid w:val="006E1988"/>
+    <w:qFormat/>
   </w:style>
   <w:style w:type="character" w:customStyle="1" w:styleId="eop">
     <w:name w:val="eop"/>
     <w:basedOn w:val="Fuentedeprrafopredeter"/>
-    <w:rsid w:val="006E1988"/>
-  </w:style>
-  <w:style w:type="paragraph" w:styleId="NormalWeb">
-    <w:name w:val="Normal (Web)"/>
-    <w:basedOn w:val="Normal"/>
-    <w:uiPriority w:val="99"/>
-    <w:semiHidden/>
-    <w:unhideWhenUsed/>
-    <w:rsid w:val="00B952EC"/>
-    <w:pPr>
-      <w:spacing w:before="100" w:beforeAutospacing="1" w:after="100" w:afterAutospacing="1" w:line="240" w:lineRule="auto"/>
-    </w:pPr>
-    <w:rPr>
-      <w:rFonts w:ascii="Times New Roman" w:eastAsia="Times New Roman" w:hAnsi="Times New Roman" w:cs="Times New Roman"/>
-      <w:sz w:val="24"/>
-      <w:szCs w:val="24"/>
-      <w:lang w:eastAsia="es-GT"/>
-    </w:rPr>
+    <w:qFormat/>
   </w:style>
   <w:style w:type="character" w:customStyle="1" w:styleId="cf01">
     <w:name w:val="cf01"/>
     <w:basedOn w:val="Fuentedeprrafopredeter"/>
-    <w:rsid w:val="00B952EC"/>
+    <w:qFormat/>
     <w:rPr>
       <w:rFonts w:ascii="Consolas" w:hAnsi="Consolas" w:hint="default"/>
       <w:sz w:val="22"/>
       <w:szCs w:val="22"/>
-    </w:rPr>
-  </w:style>
-  <w:style w:type="character" w:styleId="Textoennegrita">
-    <w:name w:val="Strong"/>
-    <w:basedOn w:val="Fuentedeprrafopredeter"/>
-    <w:uiPriority w:val="22"/>
-    <w:qFormat/>
-    <w:rsid w:val="0078207B"/>
-    <w:rPr>
-      <w:b/>
-      <w:bCs/>
     </w:rPr>
   </w:style>
 </w:styles>
@@ -1707,7 +1820,7 @@
     </a:clrScheme>
     <a:fontScheme name="Office">
       <a:majorFont>
-        <a:latin typeface="Calibri Light" panose="020F0302020204030204"/>
+        <a:latin typeface="Calibri Light"/>
         <a:ea typeface=""/>
         <a:cs typeface=""/>
         <a:font script="Jpan" typeface="游ゴシック Light"/>
@@ -1740,26 +1853,9 @@
         <a:font script="Viet" typeface="Times New Roman"/>
         <a:font script="Uigh" typeface="Microsoft Uighur"/>
         <a:font script="Geor" typeface="Sylfaen"/>
-        <a:font script="Armn" typeface="Arial"/>
-        <a:font script="Bugi" typeface="Leelawadee UI"/>
-        <a:font script="Bopo" typeface="Microsoft JhengHei"/>
-        <a:font script="Java" typeface="Javanese Text"/>
-        <a:font script="Lisu" typeface="Segoe UI"/>
-        <a:font script="Mymr" typeface="Myanmar Text"/>
-        <a:font script="Nkoo" typeface="Ebrima"/>
-        <a:font script="Olck" typeface="Nirmala UI"/>
-        <a:font script="Osma" typeface="Ebrima"/>
-        <a:font script="Phag" typeface="Phagspa"/>
-        <a:font script="Syrn" typeface="Estrangelo Edessa"/>
-        <a:font script="Syrj" typeface="Estrangelo Edessa"/>
-        <a:font script="Syre" typeface="Estrangelo Edessa"/>
-        <a:font script="Sora" typeface="Nirmala UI"/>
-        <a:font script="Tale" typeface="Microsoft Tai Le"/>
-        <a:font script="Talu" typeface="Microsoft New Tai Lue"/>
-        <a:font script="Tfng" typeface="Ebrima"/>
       </a:majorFont>
       <a:minorFont>
-        <a:latin typeface="Calibri" panose="020F0502020204030204"/>
+        <a:latin typeface="Calibri"/>
         <a:ea typeface=""/>
         <a:cs typeface=""/>
         <a:font script="Jpan" typeface="游明朝"/>
@@ -1792,23 +1888,6 @@
         <a:font script="Viet" typeface="Arial"/>
         <a:font script="Uigh" typeface="Microsoft Uighur"/>
         <a:font script="Geor" typeface="Sylfaen"/>
-        <a:font script="Armn" typeface="Arial"/>
-        <a:font script="Bugi" typeface="Leelawadee UI"/>
-        <a:font script="Bopo" typeface="Microsoft JhengHei"/>
-        <a:font script="Java" typeface="Javanese Text"/>
-        <a:font script="Lisu" typeface="Segoe UI"/>
-        <a:font script="Mymr" typeface="Myanmar Text"/>
-        <a:font script="Nkoo" typeface="Ebrima"/>
-        <a:font script="Olck" typeface="Nirmala UI"/>
-        <a:font script="Osma" typeface="Ebrima"/>
-        <a:font script="Phag" typeface="Phagspa"/>
-        <a:font script="Syrn" typeface="Estrangelo Edessa"/>
-        <a:font script="Syrj" typeface="Estrangelo Edessa"/>
-        <a:font script="Syre" typeface="Estrangelo Edessa"/>
-        <a:font script="Sora" typeface="Nirmala UI"/>
-        <a:font script="Tale" typeface="Microsoft Tai Le"/>
-        <a:font script="Talu" typeface="Microsoft New Tai Lue"/>
-        <a:font script="Tfng" typeface="Ebrima"/>
       </a:minorFont>
     </a:fontScheme>
     <a:fmtScheme name="Office">
@@ -1951,10 +2030,5 @@
   </a:themeElements>
   <a:objectDefaults/>
   <a:extraClrSchemeLst/>
-  <a:extLst>
-    <a:ext uri="{05A4C25C-085E-4340-85A3-A5531E510DB2}">
-      <thm15:themeFamily xmlns:thm15="http://schemas.microsoft.com/office/thememl/2012/main" name="Office Theme" id="{62F939B6-93AF-4DB8-9C6B-D6C7DFDC589F}" vid="{4A3C46E8-61CC-4603-A589-7422A47A8E4A}"/>
-    </a:ext>
-  </a:extLst>
 </a:theme>
 </file>
</xml_diff>

<commit_message>
add:Se Agrego los datos del programador oveliz-2024369 al documento Peaceathome.docx en la rama oveliz-2024369
</commit_message>
<xml_diff>
--- a/Peaceathome.docx
+++ b/Peaceathome.docx
@@ -1,6 +1,6 @@
 
 <file path=word/document.xml><?xml version="1.0" encoding="utf-8"?>
-<w:document xmlns:wpc="http://schemas.microsoft.com/office/word/2010/wordprocessingCanvas" xmlns:cx="http://schemas.microsoft.com/office/drawing/2014/chartex" xmlns:cx1="http://schemas.microsoft.com/office/drawing/2015/9/8/chartex" xmlns:mc="http://schemas.openxmlformats.org/markup-compatibility/2006" xmlns:o="urn:schemas-microsoft-com:office:office" xmlns:r="http://schemas.openxmlformats.org/officeDocument/2006/relationships" xmlns:m="http://schemas.openxmlformats.org/officeDocument/2006/math" xmlns:v="urn:schemas-microsoft-com:vml" xmlns:wp14="http://schemas.microsoft.com/office/word/2010/wordprocessingDrawing" xmlns:wp="http://schemas.openxmlformats.org/drawingml/2006/wordprocessingDrawing" xmlns:w10="urn:schemas-microsoft-com:office:word" xmlns:w="http://schemas.openxmlformats.org/wordprocessingml/2006/main" xmlns:w14="http://schemas.microsoft.com/office/word/2010/wordml" xmlns:w15="http://schemas.microsoft.com/office/word/2012/wordml" xmlns:w16se="http://schemas.microsoft.com/office/word/2015/wordml/symex" xmlns:wpg="http://schemas.microsoft.com/office/word/2010/wordprocessingGroup" xmlns:wpi="http://schemas.microsoft.com/office/word/2010/wordprocessingInk" xmlns:wne="http://schemas.microsoft.com/office/word/2006/wordml" xmlns:wps="http://schemas.microsoft.com/office/word/2010/wordprocessingShape" mc:Ignorable="w14 w15 w16se wp14">
+<w:document xmlns:wpc="http://schemas.microsoft.com/office/word/2010/wordprocessingCanvas" xmlns:cx="http://schemas.microsoft.com/office/drawing/2014/chartex" xmlns:cx1="http://schemas.microsoft.com/office/drawing/2015/9/8/chartex" xmlns:cx2="http://schemas.microsoft.com/office/drawing/2015/10/21/chartex" xmlns:cx3="http://schemas.microsoft.com/office/drawing/2016/5/9/chartex" xmlns:cx4="http://schemas.microsoft.com/office/drawing/2016/5/10/chartex" xmlns:cx5="http://schemas.microsoft.com/office/drawing/2016/5/11/chartex" xmlns:cx6="http://schemas.microsoft.com/office/drawing/2016/5/12/chartex" xmlns:cx7="http://schemas.microsoft.com/office/drawing/2016/5/13/chartex" xmlns:cx8="http://schemas.microsoft.com/office/drawing/2016/5/14/chartex" xmlns:mc="http://schemas.openxmlformats.org/markup-compatibility/2006" xmlns:aink="http://schemas.microsoft.com/office/drawing/2016/ink" xmlns:am3d="http://schemas.microsoft.com/office/drawing/2017/model3d" xmlns:o="urn:schemas-microsoft-com:office:office" xmlns:oel="http://schemas.microsoft.com/office/2019/extlst" xmlns:r="http://schemas.openxmlformats.org/officeDocument/2006/relationships" xmlns:m="http://schemas.openxmlformats.org/officeDocument/2006/math" xmlns:v="urn:schemas-microsoft-com:vml" xmlns:wp14="http://schemas.microsoft.com/office/word/2010/wordprocessingDrawing" xmlns:wp="http://schemas.openxmlformats.org/drawingml/2006/wordprocessingDrawing" xmlns:w10="urn:schemas-microsoft-com:office:word" xmlns:w="http://schemas.openxmlformats.org/wordprocessingml/2006/main" xmlns:w14="http://schemas.microsoft.com/office/word/2010/wordml" xmlns:w15="http://schemas.microsoft.com/office/word/2012/wordml" xmlns:w16cex="http://schemas.microsoft.com/office/word/2018/wordml/cex" xmlns:w16cid="http://schemas.microsoft.com/office/word/2016/wordml/cid" xmlns:w16="http://schemas.microsoft.com/office/word/2018/wordml" xmlns:w16du="http://schemas.microsoft.com/office/word/2023/wordml/word16du" xmlns:w16sdtdh="http://schemas.microsoft.com/office/word/2020/wordml/sdtdatahash" xmlns:w16sdtfl="http://schemas.microsoft.com/office/word/2024/wordml/sdtformatlock" xmlns:w16se="http://schemas.microsoft.com/office/word/2015/wordml/symex" xmlns:wpg="http://schemas.microsoft.com/office/word/2010/wordprocessingGroup" xmlns:wpi="http://schemas.microsoft.com/office/word/2010/wordprocessingInk" xmlns:wne="http://schemas.microsoft.com/office/word/2006/wordml" xmlns:wps="http://schemas.microsoft.com/office/word/2010/wordprocessingShape" mc:Ignorable="w14 w15 w16se w16cid w16 w16cex w16sdtdh w16sdtfl w16du wp14">
   <w:body>
     <w:p>
       <w:pPr>
@@ -16,11 +16,11 @@
           <w:rFonts w:ascii="Arial" w:hAnsi="Arial" w:cs="Arial"/>
           <w:b/>
           <w:noProof/>
-          <w:lang w:eastAsia="es-GT"/>
+          <w:lang w:val="en-US"/>
         </w:rPr>
         <w:drawing>
-          <wp:inline distT="0" distB="0" distL="0" distR="0" wp14:anchorId="61DA3BD1" wp14:editId="0C35A376">
-            <wp:extent cx="2249144" cy="847725"/>
+          <wp:inline distT="0" distB="0" distL="0" distR="0" wp14:anchorId="2FEE8166" wp14:editId="6BE70031">
+            <wp:extent cx="2248535" cy="847725"/>
             <wp:effectExtent l="0" t="0" r="0" b="0"/>
             <wp:docPr id="2" name="Imagen 2"/>
             <wp:cNvGraphicFramePr>
@@ -30,13 +30,13 @@
               <a:graphicData uri="http://schemas.openxmlformats.org/drawingml/2006/picture">
                 <pic:pic xmlns:pic="http://schemas.openxmlformats.org/drawingml/2006/picture">
                   <pic:nvPicPr>
-                    <pic:cNvPr id="0" name="Picture 1"/>
+                    <pic:cNvPr id="2" name="Imagen 2"/>
                     <pic:cNvPicPr>
                       <a:picLocks noChangeAspect="1" noChangeArrowheads="1"/>
                     </pic:cNvPicPr>
                   </pic:nvPicPr>
                   <pic:blipFill>
-                    <a:blip r:embed="rId4" cstate="print">
+                    <a:blip r:embed="rId6" cstate="print">
                       <a:extLst>
                         <a:ext uri="{28A0092B-C50C-407E-A947-70E740481C1C}">
                           <a14:useLocalDpi xmlns:a14="http://schemas.microsoft.com/office/drawing/2010/main" val="0"/>
@@ -48,7 +48,7 @@
                       <a:fillRect/>
                     </a:stretch>
                   </pic:blipFill>
-                  <pic:spPr bwMode="auto">
+                  <pic:spPr>
                     <a:xfrm>
                       <a:off x="0" y="0"/>
                       <a:ext cx="2253277" cy="849283"/>
@@ -120,13 +120,7 @@
         <w:rPr>
           <w:rFonts w:ascii="Arial" w:hAnsi="Arial" w:cs="Arial"/>
         </w:rPr>
-        <w:t>5TO. PERITO EN INFORMATICA</w:t>
-      </w:r>
-      <w:r>
-        <w:rPr>
-          <w:rFonts w:ascii="Arial" w:hAnsi="Arial" w:cs="Arial"/>
-        </w:rPr>
-        <w:t xml:space="preserve"> </w:t>
+        <w:t xml:space="preserve">5TO. PERITO EN INFORMATICA </w:t>
       </w:r>
     </w:p>
     <w:p>
@@ -507,56 +501,7 @@
           <w:rFonts w:ascii="Arial" w:hAnsi="Arial" w:cs="Arial"/>
           <w:sz w:val="24"/>
         </w:rPr>
-        <w:t xml:space="preserve">Guatemala, </w:t>
-      </w:r>
-      <w:r>
-        <w:rPr>
-          <w:rFonts w:ascii="Arial" w:hAnsi="Arial" w:cs="Arial"/>
-          <w:sz w:val="24"/>
-        </w:rPr>
-        <w:t xml:space="preserve">15 </w:t>
-      </w:r>
-      <w:r>
-        <w:rPr>
-          <w:rFonts w:ascii="Arial" w:hAnsi="Arial" w:cs="Arial"/>
-          <w:sz w:val="24"/>
-        </w:rPr>
-        <w:t xml:space="preserve">de </w:t>
-      </w:r>
-      <w:r>
-        <w:rPr>
-          <w:rFonts w:ascii="Arial" w:hAnsi="Arial" w:cs="Arial"/>
-          <w:sz w:val="24"/>
-        </w:rPr>
-        <w:t xml:space="preserve">Julio </w:t>
-      </w:r>
-      <w:r>
-        <w:rPr>
-          <w:rFonts w:ascii="Arial" w:hAnsi="Arial" w:cs="Arial"/>
-          <w:sz w:val="24"/>
-        </w:rPr>
-        <w:t>de 20</w:t>
-      </w:r>
-      <w:r>
-        <w:rPr>
-          <w:rFonts w:ascii="Arial" w:hAnsi="Arial" w:cs="Arial"/>
-          <w:sz w:val="24"/>
-        </w:rPr>
-        <w:t>2</w:t>
-      </w:r>
-      <w:r>
-        <w:rPr>
-          <w:rFonts w:ascii="Arial" w:hAnsi="Arial" w:cs="Arial"/>
-          <w:sz w:val="24"/>
-        </w:rPr>
-        <w:t>5</w:t>
-      </w:r>
-      <w:r>
-        <w:rPr>
-          <w:rFonts w:ascii="Arial" w:hAnsi="Arial" w:cs="Arial"/>
-          <w:sz w:val="24"/>
-        </w:rPr>
-        <w:t>.</w:t>
+        <w:t>Guatemala, 15 de Julio de 2025.</w:t>
       </w:r>
     </w:p>
     <w:p>
@@ -590,6 +535,7 @@
           </w:tcPr>
           <w:p>
             <w:pPr>
+              <w:spacing w:after="0" w:line="240" w:lineRule="auto"/>
               <w:jc w:val="center"/>
               <w:rPr>
                 <w:rFonts w:ascii="Arial" w:eastAsiaTheme="minorHAnsi" w:hAnsi="Arial" w:cs="Arial"/>
@@ -624,6 +570,7 @@
           </w:tcPr>
           <w:p>
             <w:pPr>
+              <w:spacing w:after="0" w:line="240" w:lineRule="auto"/>
               <w:jc w:val="center"/>
               <w:rPr>
                 <w:rFonts w:ascii="Arial" w:eastAsiaTheme="minorHAnsi" w:hAnsi="Arial" w:cs="Arial"/>
@@ -649,6 +596,7 @@
           </w:tcPr>
           <w:p>
             <w:pPr>
+              <w:spacing w:after="0" w:line="240" w:lineRule="auto"/>
               <w:jc w:val="center"/>
               <w:rPr>
                 <w:rFonts w:ascii="Arial" w:eastAsiaTheme="minorHAnsi" w:hAnsi="Arial" w:cs="Arial"/>
@@ -656,20 +604,36 @@
                 <w:lang w:val="es-ES"/>
               </w:rPr>
             </w:pPr>
-          </w:p>
-        </w:tc>
-        <w:tc>
-          <w:tcPr>
-            <w:tcW w:w="5395" w:type="dxa"/>
-          </w:tcPr>
-          <w:p>
-            <w:pPr>
-              <w:jc w:val="center"/>
-              <w:rPr>
-                <w:rFonts w:ascii="Arial" w:eastAsiaTheme="minorHAnsi" w:hAnsi="Arial" w:cs="Arial"/>
-                <w:sz w:val="24"/>
-              </w:rPr>
-            </w:pPr>
+            <w:r>
+              <w:rPr>
+                <w:rFonts w:ascii="Arial" w:eastAsiaTheme="minorHAnsi" w:hAnsi="Arial" w:cs="Arial"/>
+                <w:sz w:val="24"/>
+                <w:lang w:val="es-ES"/>
+              </w:rPr>
+              <w:t>Kenet Efraín Cuyuch Joj</w:t>
+            </w:r>
+          </w:p>
+        </w:tc>
+        <w:tc>
+          <w:tcPr>
+            <w:tcW w:w="5395" w:type="dxa"/>
+          </w:tcPr>
+          <w:p>
+            <w:pPr>
+              <w:spacing w:after="0" w:line="240" w:lineRule="auto"/>
+              <w:jc w:val="center"/>
+              <w:rPr>
+                <w:rFonts w:ascii="Arial" w:eastAsiaTheme="minorHAnsi" w:hAnsi="Arial" w:cs="Arial"/>
+                <w:sz w:val="24"/>
+              </w:rPr>
+            </w:pPr>
+            <w:r>
+              <w:rPr>
+                <w:rFonts w:ascii="Arial" w:eastAsiaTheme="minorHAnsi" w:hAnsi="Arial" w:cs="Arial"/>
+                <w:sz w:val="24"/>
+              </w:rPr>
+              <w:t>Scrum Master</w:t>
+            </w:r>
           </w:p>
         </w:tc>
       </w:tr>
@@ -680,26 +644,43 @@
           </w:tcPr>
           <w:p>
             <w:pPr>
-              <w:jc w:val="center"/>
-              <w:rPr>
-                <w:rFonts w:ascii="Arial" w:eastAsiaTheme="minorHAnsi" w:hAnsi="Arial" w:cs="Arial"/>
-                <w:sz w:val="24"/>
-              </w:rPr>
-            </w:pPr>
-          </w:p>
-        </w:tc>
-        <w:tc>
-          <w:tcPr>
-            <w:tcW w:w="5395" w:type="dxa"/>
-          </w:tcPr>
-          <w:p>
-            <w:pPr>
-              <w:jc w:val="center"/>
-              <w:rPr>
-                <w:rFonts w:ascii="Arial" w:eastAsiaTheme="minorHAnsi" w:hAnsi="Arial" w:cs="Arial"/>
-                <w:sz w:val="24"/>
-              </w:rPr>
-            </w:pPr>
+              <w:spacing w:after="0" w:line="240" w:lineRule="auto"/>
+              <w:jc w:val="center"/>
+              <w:rPr>
+                <w:rFonts w:ascii="Arial" w:eastAsiaTheme="minorHAnsi" w:hAnsi="Arial" w:cs="Arial"/>
+                <w:sz w:val="24"/>
+              </w:rPr>
+            </w:pPr>
+            <w:r>
+              <w:rPr>
+                <w:rFonts w:ascii="Arial" w:eastAsiaTheme="minorHAnsi" w:hAnsi="Arial" w:cs="Arial"/>
+                <w:sz w:val="24"/>
+              </w:rPr>
+              <w:t>Angel Gahel Padilla Pacheco</w:t>
+            </w:r>
+          </w:p>
+        </w:tc>
+        <w:tc>
+          <w:tcPr>
+            <w:tcW w:w="5395" w:type="dxa"/>
+          </w:tcPr>
+          <w:p>
+            <w:pPr>
+              <w:spacing w:after="0" w:line="240" w:lineRule="auto"/>
+              <w:jc w:val="center"/>
+              <w:rPr>
+                <w:rFonts w:ascii="Arial" w:eastAsiaTheme="minorHAnsi" w:hAnsi="Arial" w:cs="Arial"/>
+                <w:sz w:val="24"/>
+                <w:u w:val="single"/>
+              </w:rPr>
+            </w:pPr>
+            <w:r>
+              <w:rPr>
+                <w:rFonts w:ascii="Arial" w:eastAsiaTheme="minorHAnsi" w:hAnsi="Arial" w:cs="Arial"/>
+                <w:sz w:val="24"/>
+              </w:rPr>
+              <w:t>Programador</w:t>
+            </w:r>
           </w:p>
         </w:tc>
       </w:tr>
@@ -710,26 +691,42 @@
           </w:tcPr>
           <w:p>
             <w:pPr>
-              <w:jc w:val="center"/>
-              <w:rPr>
-                <w:rFonts w:ascii="Arial" w:eastAsiaTheme="minorHAnsi" w:hAnsi="Arial" w:cs="Arial"/>
-                <w:sz w:val="24"/>
-              </w:rPr>
-            </w:pPr>
-          </w:p>
-        </w:tc>
-        <w:tc>
-          <w:tcPr>
-            <w:tcW w:w="5395" w:type="dxa"/>
-          </w:tcPr>
-          <w:p>
-            <w:pPr>
-              <w:jc w:val="center"/>
-              <w:rPr>
-                <w:rFonts w:ascii="Arial" w:eastAsiaTheme="minorHAnsi" w:hAnsi="Arial" w:cs="Arial"/>
-                <w:sz w:val="24"/>
-              </w:rPr>
-            </w:pPr>
+              <w:spacing w:after="0" w:line="240" w:lineRule="auto"/>
+              <w:jc w:val="center"/>
+              <w:rPr>
+                <w:rFonts w:ascii="Arial" w:eastAsiaTheme="minorHAnsi" w:hAnsi="Arial" w:cs="Arial"/>
+                <w:sz w:val="24"/>
+              </w:rPr>
+            </w:pPr>
+            <w:r>
+              <w:rPr>
+                <w:rFonts w:ascii="Arial" w:eastAsiaTheme="minorHAnsi" w:hAnsi="Arial" w:cs="Arial"/>
+                <w:sz w:val="24"/>
+              </w:rPr>
+              <w:t>Jose Enrique cuc cutz</w:t>
+            </w:r>
+          </w:p>
+        </w:tc>
+        <w:tc>
+          <w:tcPr>
+            <w:tcW w:w="5395" w:type="dxa"/>
+          </w:tcPr>
+          <w:p>
+            <w:pPr>
+              <w:spacing w:after="0" w:line="240" w:lineRule="auto"/>
+              <w:jc w:val="center"/>
+              <w:rPr>
+                <w:rFonts w:ascii="Arial" w:eastAsiaTheme="minorHAnsi" w:hAnsi="Arial" w:cs="Arial"/>
+                <w:sz w:val="24"/>
+              </w:rPr>
+            </w:pPr>
+            <w:r>
+              <w:rPr>
+                <w:rFonts w:ascii="Arial" w:eastAsiaTheme="minorHAnsi" w:hAnsi="Arial" w:cs="Arial"/>
+                <w:sz w:val="24"/>
+              </w:rPr>
+              <w:t>Programador</w:t>
+            </w:r>
           </w:p>
         </w:tc>
       </w:tr>
@@ -740,26 +737,46 @@
           </w:tcPr>
           <w:p>
             <w:pPr>
-              <w:jc w:val="center"/>
-              <w:rPr>
-                <w:rFonts w:ascii="Arial" w:eastAsiaTheme="minorHAnsi" w:hAnsi="Arial" w:cs="Arial"/>
-                <w:sz w:val="24"/>
-              </w:rPr>
-            </w:pPr>
-          </w:p>
-        </w:tc>
-        <w:tc>
-          <w:tcPr>
-            <w:tcW w:w="5395" w:type="dxa"/>
-          </w:tcPr>
-          <w:p>
-            <w:pPr>
-              <w:jc w:val="center"/>
-              <w:rPr>
-                <w:rFonts w:ascii="Arial" w:eastAsiaTheme="minorHAnsi" w:hAnsi="Arial" w:cs="Arial"/>
-                <w:sz w:val="24"/>
-              </w:rPr>
-            </w:pPr>
+              <w:spacing w:after="0" w:line="240" w:lineRule="auto"/>
+              <w:jc w:val="center"/>
+              <w:rPr>
+                <w:rFonts w:ascii="Arial" w:eastAsiaTheme="minorEastAsia" w:hAnsi="Arial" w:cs="Arial"/>
+                <w:sz w:val="24"/>
+                <w:szCs w:val="24"/>
+              </w:rPr>
+            </w:pPr>
+            <w:r>
+              <w:rPr>
+                <w:rFonts w:ascii="Arial" w:eastAsiaTheme="minorEastAsia" w:hAnsi="Arial" w:cs="Arial"/>
+                <w:sz w:val="24"/>
+                <w:szCs w:val="24"/>
+              </w:rPr>
+              <w:t>Jeferson Andre Cano Lopez</w:t>
+            </w:r>
+          </w:p>
+        </w:tc>
+        <w:tc>
+          <w:tcPr>
+            <w:tcW w:w="5395" w:type="dxa"/>
+          </w:tcPr>
+          <w:p>
+            <w:pPr>
+              <w:spacing w:after="0" w:line="240" w:lineRule="auto"/>
+              <w:jc w:val="center"/>
+              <w:rPr>
+                <w:rFonts w:ascii="Arial" w:eastAsiaTheme="minorEastAsia" w:hAnsi="Arial" w:cs="Arial"/>
+                <w:sz w:val="24"/>
+                <w:szCs w:val="24"/>
+              </w:rPr>
+            </w:pPr>
+            <w:r>
+              <w:rPr>
+                <w:rFonts w:ascii="Arial" w:eastAsiaTheme="minorEastAsia" w:hAnsi="Arial" w:cs="Arial"/>
+                <w:sz w:val="24"/>
+                <w:szCs w:val="24"/>
+              </w:rPr>
+              <w:t>Programador</w:t>
+            </w:r>
           </w:p>
         </w:tc>
       </w:tr>
@@ -770,26 +787,42 @@
           </w:tcPr>
           <w:p>
             <w:pPr>
-              <w:jc w:val="center"/>
-              <w:rPr>
-                <w:rFonts w:ascii="Arial" w:eastAsiaTheme="minorHAnsi" w:hAnsi="Arial" w:cs="Arial"/>
-                <w:sz w:val="24"/>
-              </w:rPr>
-            </w:pPr>
-          </w:p>
-        </w:tc>
-        <w:tc>
-          <w:tcPr>
-            <w:tcW w:w="5395" w:type="dxa"/>
-          </w:tcPr>
-          <w:p>
-            <w:pPr>
-              <w:jc w:val="center"/>
-              <w:rPr>
-                <w:rFonts w:ascii="Arial" w:eastAsiaTheme="minorHAnsi" w:hAnsi="Arial" w:cs="Arial"/>
-                <w:sz w:val="24"/>
-              </w:rPr>
-            </w:pPr>
+              <w:spacing w:after="0" w:line="240" w:lineRule="auto"/>
+              <w:jc w:val="center"/>
+              <w:rPr>
+                <w:rFonts w:ascii="Arial" w:eastAsiaTheme="minorHAnsi" w:hAnsi="Arial" w:cs="Arial"/>
+                <w:sz w:val="24"/>
+              </w:rPr>
+            </w:pPr>
+            <w:r>
+              <w:rPr>
+                <w:rFonts w:ascii="Arial" w:eastAsiaTheme="minorHAnsi" w:hAnsi="Arial" w:cs="Arial"/>
+                <w:sz w:val="24"/>
+              </w:rPr>
+              <w:t>Carlos Enrique López Quino</w:t>
+            </w:r>
+          </w:p>
+        </w:tc>
+        <w:tc>
+          <w:tcPr>
+            <w:tcW w:w="5395" w:type="dxa"/>
+          </w:tcPr>
+          <w:p>
+            <w:pPr>
+              <w:spacing w:after="0" w:line="240" w:lineRule="auto"/>
+              <w:jc w:val="center"/>
+              <w:rPr>
+                <w:rFonts w:ascii="Arial" w:eastAsiaTheme="minorHAnsi" w:hAnsi="Arial" w:cs="Arial"/>
+                <w:sz w:val="24"/>
+              </w:rPr>
+            </w:pPr>
+            <w:r>
+              <w:rPr>
+                <w:rFonts w:ascii="Arial" w:eastAsiaTheme="minorHAnsi" w:hAnsi="Arial" w:cs="Arial"/>
+                <w:sz w:val="24"/>
+              </w:rPr>
+              <w:t>Programador</w:t>
+            </w:r>
           </w:p>
         </w:tc>
       </w:tr>
@@ -800,26 +833,42 @@
           </w:tcPr>
           <w:p>
             <w:pPr>
-              <w:jc w:val="center"/>
-              <w:rPr>
-                <w:rFonts w:ascii="Arial" w:eastAsiaTheme="minorHAnsi" w:hAnsi="Arial" w:cs="Arial"/>
-                <w:sz w:val="24"/>
-              </w:rPr>
-            </w:pPr>
-          </w:p>
-        </w:tc>
-        <w:tc>
-          <w:tcPr>
-            <w:tcW w:w="5395" w:type="dxa"/>
-          </w:tcPr>
-          <w:p>
-            <w:pPr>
-              <w:jc w:val="center"/>
-              <w:rPr>
-                <w:rFonts w:ascii="Arial" w:eastAsiaTheme="minorHAnsi" w:hAnsi="Arial" w:cs="Arial"/>
-                <w:sz w:val="24"/>
-              </w:rPr>
-            </w:pPr>
+              <w:spacing w:after="0" w:line="240" w:lineRule="auto"/>
+              <w:jc w:val="center"/>
+              <w:rPr>
+                <w:rFonts w:ascii="Arial" w:eastAsiaTheme="minorHAnsi" w:hAnsi="Arial" w:cs="Arial"/>
+                <w:sz w:val="24"/>
+              </w:rPr>
+            </w:pPr>
+            <w:r>
+              <w:rPr>
+                <w:rFonts w:ascii="Arial" w:eastAsiaTheme="minorHAnsi" w:hAnsi="Arial" w:cs="Arial"/>
+                <w:sz w:val="24"/>
+              </w:rPr>
+              <w:t>Ricardo Alejandro Hernández Hernández</w:t>
+            </w:r>
+          </w:p>
+        </w:tc>
+        <w:tc>
+          <w:tcPr>
+            <w:tcW w:w="5395" w:type="dxa"/>
+          </w:tcPr>
+          <w:p>
+            <w:pPr>
+              <w:spacing w:after="0" w:line="240" w:lineRule="auto"/>
+              <w:jc w:val="center"/>
+              <w:rPr>
+                <w:rFonts w:ascii="Arial" w:eastAsiaTheme="minorHAnsi" w:hAnsi="Arial" w:cs="Arial"/>
+                <w:sz w:val="24"/>
+              </w:rPr>
+            </w:pPr>
+            <w:r>
+              <w:rPr>
+                <w:rFonts w:ascii="Arial" w:eastAsiaTheme="minorHAnsi" w:hAnsi="Arial" w:cs="Arial"/>
+                <w:sz w:val="24"/>
+              </w:rPr>
+              <w:t>Programador</w:t>
+            </w:r>
           </w:p>
         </w:tc>
       </w:tr>
@@ -830,26 +879,42 @@
           </w:tcPr>
           <w:p>
             <w:pPr>
-              <w:jc w:val="center"/>
-              <w:rPr>
-                <w:rFonts w:ascii="Arial" w:eastAsiaTheme="minorHAnsi" w:hAnsi="Arial" w:cs="Arial"/>
-                <w:sz w:val="24"/>
-              </w:rPr>
-            </w:pPr>
-          </w:p>
-        </w:tc>
-        <w:tc>
-          <w:tcPr>
-            <w:tcW w:w="5395" w:type="dxa"/>
-          </w:tcPr>
-          <w:p>
-            <w:pPr>
-              <w:jc w:val="center"/>
-              <w:rPr>
-                <w:rFonts w:ascii="Arial" w:eastAsiaTheme="minorHAnsi" w:hAnsi="Arial" w:cs="Arial"/>
-                <w:sz w:val="24"/>
-              </w:rPr>
-            </w:pPr>
+              <w:spacing w:after="0" w:line="240" w:lineRule="auto"/>
+              <w:jc w:val="center"/>
+              <w:rPr>
+                <w:rFonts w:ascii="Arial" w:eastAsiaTheme="minorHAnsi" w:hAnsi="Arial" w:cs="Arial"/>
+                <w:sz w:val="24"/>
+              </w:rPr>
+            </w:pPr>
+            <w:r>
+              <w:rPr>
+                <w:rFonts w:ascii="Arial" w:eastAsiaTheme="minorHAnsi" w:hAnsi="Arial" w:cs="Arial"/>
+                <w:sz w:val="24"/>
+              </w:rPr>
+              <w:t>Osman Emmanuell Veliz Guzmán</w:t>
+            </w:r>
+          </w:p>
+        </w:tc>
+        <w:tc>
+          <w:tcPr>
+            <w:tcW w:w="5395" w:type="dxa"/>
+          </w:tcPr>
+          <w:p>
+            <w:pPr>
+              <w:spacing w:after="0" w:line="240" w:lineRule="auto"/>
+              <w:jc w:val="center"/>
+              <w:rPr>
+                <w:rFonts w:ascii="Arial" w:eastAsiaTheme="minorHAnsi" w:hAnsi="Arial" w:cs="Arial"/>
+                <w:sz w:val="24"/>
+              </w:rPr>
+            </w:pPr>
+            <w:r>
+              <w:rPr>
+                <w:rFonts w:ascii="Arial" w:eastAsiaTheme="minorHAnsi" w:hAnsi="Arial" w:cs="Arial"/>
+                <w:sz w:val="24"/>
+              </w:rPr>
+              <w:t>Programador</w:t>
+            </w:r>
           </w:p>
         </w:tc>
       </w:tr>
@@ -860,20 +925,22 @@
           </w:tcPr>
           <w:p>
             <w:pPr>
-              <w:jc w:val="center"/>
-              <w:rPr>
-                <w:rFonts w:ascii="Arial" w:eastAsiaTheme="minorHAnsi" w:hAnsi="Arial" w:cs="Arial"/>
-                <w:sz w:val="24"/>
-              </w:rPr>
-            </w:pPr>
-          </w:p>
-        </w:tc>
-        <w:tc>
-          <w:tcPr>
-            <w:tcW w:w="5395" w:type="dxa"/>
-          </w:tcPr>
-          <w:p>
-            <w:pPr>
+              <w:spacing w:after="0" w:line="240" w:lineRule="auto"/>
+              <w:jc w:val="center"/>
+              <w:rPr>
+                <w:rFonts w:ascii="Arial" w:eastAsiaTheme="minorHAnsi" w:hAnsi="Arial" w:cs="Arial"/>
+                <w:sz w:val="24"/>
+              </w:rPr>
+            </w:pPr>
+          </w:p>
+        </w:tc>
+        <w:tc>
+          <w:tcPr>
+            <w:tcW w:w="5395" w:type="dxa"/>
+          </w:tcPr>
+          <w:p>
+            <w:pPr>
+              <w:spacing w:after="0" w:line="240" w:lineRule="auto"/>
               <w:jc w:val="center"/>
               <w:rPr>
                 <w:rFonts w:ascii="Arial" w:eastAsiaTheme="minorHAnsi" w:hAnsi="Arial" w:cs="Arial"/>
@@ -890,6 +957,7 @@
           </w:tcPr>
           <w:p>
             <w:pPr>
+              <w:spacing w:after="0" w:line="240" w:lineRule="auto"/>
               <w:jc w:val="center"/>
               <w:rPr>
                 <w:rFonts w:ascii="Arial" w:eastAsiaTheme="minorEastAsia" w:hAnsi="Arial" w:cs="Arial"/>
@@ -905,6 +973,7 @@
           </w:tcPr>
           <w:p>
             <w:pPr>
+              <w:spacing w:after="0" w:line="240" w:lineRule="auto"/>
               <w:jc w:val="center"/>
               <w:rPr>
                 <w:rFonts w:ascii="Arial" w:eastAsiaTheme="minorEastAsia" w:hAnsi="Arial" w:cs="Arial"/>
@@ -922,20 +991,22 @@
           </w:tcPr>
           <w:p>
             <w:pPr>
-              <w:jc w:val="center"/>
-              <w:rPr>
-                <w:rFonts w:ascii="Arial" w:eastAsiaTheme="minorHAnsi" w:hAnsi="Arial" w:cs="Arial"/>
-                <w:sz w:val="24"/>
-              </w:rPr>
-            </w:pPr>
-          </w:p>
-        </w:tc>
-        <w:tc>
-          <w:tcPr>
-            <w:tcW w:w="5395" w:type="dxa"/>
-          </w:tcPr>
-          <w:p>
-            <w:pPr>
+              <w:spacing w:after="0" w:line="240" w:lineRule="auto"/>
+              <w:jc w:val="center"/>
+              <w:rPr>
+                <w:rFonts w:ascii="Arial" w:eastAsiaTheme="minorHAnsi" w:hAnsi="Arial" w:cs="Arial"/>
+                <w:sz w:val="24"/>
+              </w:rPr>
+            </w:pPr>
+          </w:p>
+        </w:tc>
+        <w:tc>
+          <w:tcPr>
+            <w:tcW w:w="5395" w:type="dxa"/>
+          </w:tcPr>
+          <w:p>
+            <w:pPr>
+              <w:spacing w:after="0" w:line="240" w:lineRule="auto"/>
               <w:jc w:val="center"/>
               <w:rPr>
                 <w:rFonts w:ascii="Arial" w:eastAsiaTheme="minorHAnsi" w:hAnsi="Arial" w:cs="Arial"/>
@@ -952,20 +1023,22 @@
           </w:tcPr>
           <w:p>
             <w:pPr>
-              <w:jc w:val="center"/>
-              <w:rPr>
-                <w:rFonts w:ascii="Arial" w:eastAsiaTheme="minorHAnsi" w:hAnsi="Arial" w:cs="Arial"/>
-                <w:sz w:val="24"/>
-              </w:rPr>
-            </w:pPr>
-          </w:p>
-        </w:tc>
-        <w:tc>
-          <w:tcPr>
-            <w:tcW w:w="5395" w:type="dxa"/>
-          </w:tcPr>
-          <w:p>
-            <w:pPr>
+              <w:spacing w:after="0" w:line="240" w:lineRule="auto"/>
+              <w:jc w:val="center"/>
+              <w:rPr>
+                <w:rFonts w:ascii="Arial" w:eastAsiaTheme="minorHAnsi" w:hAnsi="Arial" w:cs="Arial"/>
+                <w:sz w:val="24"/>
+              </w:rPr>
+            </w:pPr>
+          </w:p>
+        </w:tc>
+        <w:tc>
+          <w:tcPr>
+            <w:tcW w:w="5395" w:type="dxa"/>
+          </w:tcPr>
+          <w:p>
+            <w:pPr>
+              <w:spacing w:after="0" w:line="240" w:lineRule="auto"/>
               <w:jc w:val="center"/>
               <w:rPr>
                 <w:rFonts w:ascii="Arial" w:eastAsiaTheme="minorHAnsi" w:hAnsi="Arial" w:cs="Arial"/>
@@ -982,20 +1055,22 @@
           </w:tcPr>
           <w:p>
             <w:pPr>
-              <w:jc w:val="center"/>
-              <w:rPr>
-                <w:rFonts w:ascii="Arial" w:eastAsiaTheme="minorHAnsi" w:hAnsi="Arial" w:cs="Arial"/>
-                <w:sz w:val="24"/>
-              </w:rPr>
-            </w:pPr>
-          </w:p>
-        </w:tc>
-        <w:tc>
-          <w:tcPr>
-            <w:tcW w:w="5395" w:type="dxa"/>
-          </w:tcPr>
-          <w:p>
-            <w:pPr>
+              <w:spacing w:after="0" w:line="240" w:lineRule="auto"/>
+              <w:jc w:val="center"/>
+              <w:rPr>
+                <w:rFonts w:ascii="Arial" w:eastAsiaTheme="minorHAnsi" w:hAnsi="Arial" w:cs="Arial"/>
+                <w:sz w:val="24"/>
+              </w:rPr>
+            </w:pPr>
+          </w:p>
+        </w:tc>
+        <w:tc>
+          <w:tcPr>
+            <w:tcW w:w="5395" w:type="dxa"/>
+          </w:tcPr>
+          <w:p>
+            <w:pPr>
+              <w:spacing w:after="0" w:line="240" w:lineRule="auto"/>
               <w:jc w:val="center"/>
               <w:rPr>
                 <w:rFonts w:ascii="Arial" w:eastAsiaTheme="minorHAnsi" w:hAnsi="Arial" w:cs="Arial"/>
@@ -1028,8 +1103,6 @@
         </w:rPr>
         <w:t xml:space="preserve">    </w:t>
       </w:r>
-      <w:bookmarkStart w:id="0" w:name="_GoBack"/>
-      <w:bookmarkEnd w:id="0"/>
     </w:p>
     <w:sectPr>
       <w:pgSz w:w="12240" w:h="15840"/>
@@ -1041,24 +1114,68 @@
 </w:document>
 </file>
 
+<file path=word/endnotes.xml><?xml version="1.0" encoding="utf-8"?>
+<w:endnotes xmlns:wpc="http://schemas.microsoft.com/office/word/2010/wordprocessingCanvas" xmlns:cx="http://schemas.microsoft.com/office/drawing/2014/chartex" xmlns:cx1="http://schemas.microsoft.com/office/drawing/2015/9/8/chartex" xmlns:cx2="http://schemas.microsoft.com/office/drawing/2015/10/21/chartex" xmlns:cx3="http://schemas.microsoft.com/office/drawing/2016/5/9/chartex" xmlns:cx4="http://schemas.microsoft.com/office/drawing/2016/5/10/chartex" xmlns:cx5="http://schemas.microsoft.com/office/drawing/2016/5/11/chartex" xmlns:cx6="http://schemas.microsoft.com/office/drawing/2016/5/12/chartex" xmlns:cx7="http://schemas.microsoft.com/office/drawing/2016/5/13/chartex" xmlns:cx8="http://schemas.microsoft.com/office/drawing/2016/5/14/chartex" xmlns:mc="http://schemas.openxmlformats.org/markup-compatibility/2006" xmlns:aink="http://schemas.microsoft.com/office/drawing/2016/ink" xmlns:am3d="http://schemas.microsoft.com/office/drawing/2017/model3d" xmlns:o="urn:schemas-microsoft-com:office:office" xmlns:oel="http://schemas.microsoft.com/office/2019/extlst" xmlns:r="http://schemas.openxmlformats.org/officeDocument/2006/relationships" xmlns:m="http://schemas.openxmlformats.org/officeDocument/2006/math" xmlns:v="urn:schemas-microsoft-com:vml" xmlns:wp14="http://schemas.microsoft.com/office/word/2010/wordprocessingDrawing" xmlns:wp="http://schemas.openxmlformats.org/drawingml/2006/wordprocessingDrawing" xmlns:w10="urn:schemas-microsoft-com:office:word" xmlns:w="http://schemas.openxmlformats.org/wordprocessingml/2006/main" xmlns:w14="http://schemas.microsoft.com/office/word/2010/wordml" xmlns:w15="http://schemas.microsoft.com/office/word/2012/wordml" xmlns:w16cex="http://schemas.microsoft.com/office/word/2018/wordml/cex" xmlns:w16cid="http://schemas.microsoft.com/office/word/2016/wordml/cid" xmlns:w16="http://schemas.microsoft.com/office/word/2018/wordml" xmlns:w16du="http://schemas.microsoft.com/office/word/2023/wordml/word16du" xmlns:w16sdtdh="http://schemas.microsoft.com/office/word/2020/wordml/sdtdatahash" xmlns:w16sdtfl="http://schemas.microsoft.com/office/word/2024/wordml/sdtformatlock" xmlns:w16se="http://schemas.microsoft.com/office/word/2015/wordml/symex" xmlns:wpg="http://schemas.microsoft.com/office/word/2010/wordprocessingGroup" xmlns:wpi="http://schemas.microsoft.com/office/word/2010/wordprocessingInk" xmlns:wne="http://schemas.microsoft.com/office/word/2006/wordml" xmlns:wps="http://schemas.microsoft.com/office/word/2010/wordprocessingShape" mc:Ignorable="w14 w15 w16se w16cid w16 w16cex w16sdtdh w16sdtfl w16du wp14">
+  <w:endnote w:type="separator" w:id="-1">
+    <w:p>
+      <w:pPr>
+        <w:spacing w:line="240" w:lineRule="auto"/>
+      </w:pPr>
+      <w:r>
+        <w:separator/>
+      </w:r>
+    </w:p>
+  </w:endnote>
+  <w:endnote w:type="continuationSeparator" w:id="0">
+    <w:p>
+      <w:pPr>
+        <w:spacing w:line="240" w:lineRule="auto"/>
+      </w:pPr>
+      <w:r>
+        <w:continuationSeparator/>
+      </w:r>
+    </w:p>
+  </w:endnote>
+</w:endnotes>
+</file>
+
+<file path=word/footnotes.xml><?xml version="1.0" encoding="utf-8"?>
+<w:footnotes xmlns:wpc="http://schemas.microsoft.com/office/word/2010/wordprocessingCanvas" xmlns:cx="http://schemas.microsoft.com/office/drawing/2014/chartex" xmlns:cx1="http://schemas.microsoft.com/office/drawing/2015/9/8/chartex" xmlns:cx2="http://schemas.microsoft.com/office/drawing/2015/10/21/chartex" xmlns:cx3="http://schemas.microsoft.com/office/drawing/2016/5/9/chartex" xmlns:cx4="http://schemas.microsoft.com/office/drawing/2016/5/10/chartex" xmlns:cx5="http://schemas.microsoft.com/office/drawing/2016/5/11/chartex" xmlns:cx6="http://schemas.microsoft.com/office/drawing/2016/5/12/chartex" xmlns:cx7="http://schemas.microsoft.com/office/drawing/2016/5/13/chartex" xmlns:cx8="http://schemas.microsoft.com/office/drawing/2016/5/14/chartex" xmlns:mc="http://schemas.openxmlformats.org/markup-compatibility/2006" xmlns:aink="http://schemas.microsoft.com/office/drawing/2016/ink" xmlns:am3d="http://schemas.microsoft.com/office/drawing/2017/model3d" xmlns:o="urn:schemas-microsoft-com:office:office" xmlns:oel="http://schemas.microsoft.com/office/2019/extlst" xmlns:r="http://schemas.openxmlformats.org/officeDocument/2006/relationships" xmlns:m="http://schemas.openxmlformats.org/officeDocument/2006/math" xmlns:v="urn:schemas-microsoft-com:vml" xmlns:wp14="http://schemas.microsoft.com/office/word/2010/wordprocessingDrawing" xmlns:wp="http://schemas.openxmlformats.org/drawingml/2006/wordprocessingDrawing" xmlns:w10="urn:schemas-microsoft-com:office:word" xmlns:w="http://schemas.openxmlformats.org/wordprocessingml/2006/main" xmlns:w14="http://schemas.microsoft.com/office/word/2010/wordml" xmlns:w15="http://schemas.microsoft.com/office/word/2012/wordml" xmlns:w16cex="http://schemas.microsoft.com/office/word/2018/wordml/cex" xmlns:w16cid="http://schemas.microsoft.com/office/word/2016/wordml/cid" xmlns:w16="http://schemas.microsoft.com/office/word/2018/wordml" xmlns:w16du="http://schemas.microsoft.com/office/word/2023/wordml/word16du" xmlns:w16sdtdh="http://schemas.microsoft.com/office/word/2020/wordml/sdtdatahash" xmlns:w16sdtfl="http://schemas.microsoft.com/office/word/2024/wordml/sdtformatlock" xmlns:w16se="http://schemas.microsoft.com/office/word/2015/wordml/symex" xmlns:wpg="http://schemas.microsoft.com/office/word/2010/wordprocessingGroup" xmlns:wpi="http://schemas.microsoft.com/office/word/2010/wordprocessingInk" xmlns:wne="http://schemas.microsoft.com/office/word/2006/wordml" xmlns:wps="http://schemas.microsoft.com/office/word/2010/wordprocessingShape" mc:Ignorable="w14 w15 w16se w16cid w16 w16cex w16sdtdh w16sdtfl w16du wp14">
+  <w:footnote w:type="separator" w:id="-1">
+    <w:p>
+      <w:pPr>
+        <w:spacing w:after="0"/>
+      </w:pPr>
+      <w:r>
+        <w:separator/>
+      </w:r>
+    </w:p>
+  </w:footnote>
+  <w:footnote w:type="continuationSeparator" w:id="0">
+    <w:p>
+      <w:pPr>
+        <w:spacing w:after="0"/>
+      </w:pPr>
+      <w:r>
+        <w:continuationSeparator/>
+      </w:r>
+    </w:p>
+  </w:footnote>
+</w:footnotes>
+</file>
+
 <file path=word/styles.xml><?xml version="1.0" encoding="utf-8"?>
-<w:styles xmlns:mc="http://schemas.openxmlformats.org/markup-compatibility/2006" xmlns:r="http://schemas.openxmlformats.org/officeDocument/2006/relationships" xmlns:w="http://schemas.openxmlformats.org/wordprocessingml/2006/main" xmlns:w14="http://schemas.microsoft.com/office/word/2010/wordml" xmlns:w15="http://schemas.microsoft.com/office/word/2012/wordml" xmlns:w16se="http://schemas.microsoft.com/office/word/2015/wordml/symex" mc:Ignorable="w14 w15 w16se">
+<w:styles xmlns:mc="http://schemas.openxmlformats.org/markup-compatibility/2006" xmlns:r="http://schemas.openxmlformats.org/officeDocument/2006/relationships" xmlns:w="http://schemas.openxmlformats.org/wordprocessingml/2006/main" xmlns:w14="http://schemas.microsoft.com/office/word/2010/wordml" xmlns:w15="http://schemas.microsoft.com/office/word/2012/wordml" xmlns:w16cex="http://schemas.microsoft.com/office/word/2018/wordml/cex" xmlns:w16cid="http://schemas.microsoft.com/office/word/2016/wordml/cid" xmlns:w16="http://schemas.microsoft.com/office/word/2018/wordml" xmlns:w16du="http://schemas.microsoft.com/office/word/2023/wordml/word16du" xmlns:w16sdtdh="http://schemas.microsoft.com/office/word/2020/wordml/sdtdatahash" xmlns:w16sdtfl="http://schemas.microsoft.com/office/word/2024/wordml/sdtformatlock" xmlns:w16se="http://schemas.microsoft.com/office/word/2015/wordml/symex" mc:Ignorable="w14 w15 w16se w16cid w16 w16cex w16sdtdh w16sdtfl w16du">
   <w:docDefaults>
     <w:rPrDefault>
       <w:rPr>
         <w:rFonts w:asciiTheme="minorHAnsi" w:eastAsiaTheme="minorHAnsi" w:hAnsiTheme="minorHAnsi" w:cstheme="minorBidi"/>
-        <w:sz w:val="22"/>
-        <w:szCs w:val="22"/>
-        <w:lang w:val="es-GT" w:eastAsia="en-US" w:bidi="ar-SA"/>
+        <w:lang w:val="es-MX" w:eastAsia="es-MX" w:bidi="ar-SA"/>
       </w:rPr>
     </w:rPrDefault>
-    <w:pPrDefault>
-      <w:pPr>
-        <w:spacing w:after="160" w:line="259" w:lineRule="auto"/>
-      </w:pPr>
-    </w:pPrDefault>
+    <w:pPrDefault/>
   </w:docDefaults>
-  <w:latentStyles w:defLockedState="0" w:defUIPriority="99" w:defSemiHidden="0" w:defUnhideWhenUsed="0" w:defQFormat="0" w:count="371">
+  <w:latentStyles w:defLockedState="0" w:defUIPriority="99" w:defSemiHidden="0" w:defUnhideWhenUsed="0" w:defQFormat="0" w:count="376">
     <w:lsdException w:name="Normal" w:uiPriority="0" w:qFormat="1"/>
     <w:lsdException w:name="heading 1" w:uiPriority="9" w:qFormat="1"/>
     <w:lsdException w:name="heading 2" w:semiHidden="1" w:uiPriority="9" w:unhideWhenUsed="1" w:qFormat="1"/>
@@ -1089,7 +1206,7 @@
     <w:lsdException w:name="toc 9" w:semiHidden="1" w:uiPriority="39" w:unhideWhenUsed="1"/>
     <w:lsdException w:name="Normal Indent" w:semiHidden="1" w:unhideWhenUsed="1"/>
     <w:lsdException w:name="footnote text" w:semiHidden="1" w:unhideWhenUsed="1"/>
-    <w:lsdException w:name="annotation text" w:semiHidden="1" w:unhideWhenUsed="1"/>
+    <w:lsdException w:name="annotation text" w:semiHidden="1" w:unhideWhenUsed="1" w:qFormat="1"/>
     <w:lsdException w:name="header" w:semiHidden="1" w:unhideWhenUsed="1"/>
     <w:lsdException w:name="footer" w:semiHidden="1" w:unhideWhenUsed="1"/>
     <w:lsdException w:name="index heading" w:semiHidden="1" w:unhideWhenUsed="1"/>
@@ -1153,7 +1270,7 @@
     <w:lsdException w:name="E-mail Signature" w:semiHidden="1" w:unhideWhenUsed="1"/>
     <w:lsdException w:name="HTML Top of Form" w:semiHidden="1" w:unhideWhenUsed="1"/>
     <w:lsdException w:name="HTML Bottom of Form" w:semiHidden="1" w:unhideWhenUsed="1"/>
-    <w:lsdException w:name="Normal (Web)" w:semiHidden="1" w:unhideWhenUsed="1"/>
+    <w:lsdException w:name="Normal (Web)" w:semiHidden="1" w:unhideWhenUsed="1" w:qFormat="1"/>
     <w:lsdException w:name="HTML Acronym" w:semiHidden="1" w:unhideWhenUsed="1"/>
     <w:lsdException w:name="HTML Address" w:semiHidden="1" w:unhideWhenUsed="1"/>
     <w:lsdException w:name="HTML Cite" w:semiHidden="1" w:unhideWhenUsed="1"/>
@@ -1164,8 +1281,8 @@
     <w:lsdException w:name="HTML Sample" w:semiHidden="1" w:unhideWhenUsed="1"/>
     <w:lsdException w:name="HTML Typewriter" w:semiHidden="1" w:unhideWhenUsed="1"/>
     <w:lsdException w:name="HTML Variable" w:semiHidden="1" w:unhideWhenUsed="1"/>
-    <w:lsdException w:name="Normal Table" w:semiHidden="1" w:unhideWhenUsed="1"/>
-    <w:lsdException w:name="annotation subject" w:semiHidden="1" w:unhideWhenUsed="1"/>
+    <w:lsdException w:name="Normal Table" w:semiHidden="1" w:unhideWhenUsed="1" w:qFormat="1"/>
+    <w:lsdException w:name="annotation subject" w:semiHidden="1" w:unhideWhenUsed="1" w:qFormat="1"/>
     <w:lsdException w:name="No List" w:semiHidden="1" w:unhideWhenUsed="1"/>
     <w:lsdException w:name="Outline List 1" w:semiHidden="1" w:unhideWhenUsed="1"/>
     <w:lsdException w:name="Outline List 2" w:semiHidden="1" w:unhideWhenUsed="1"/>
@@ -1212,113 +1329,113 @@
     <w:lsdException w:name="Table Web 1" w:semiHidden="1" w:unhideWhenUsed="1"/>
     <w:lsdException w:name="Table Web 2" w:semiHidden="1" w:unhideWhenUsed="1"/>
     <w:lsdException w:name="Table Web 3" w:semiHidden="1" w:unhideWhenUsed="1"/>
-    <w:lsdException w:name="Balloon Text" w:semiHidden="1" w:unhideWhenUsed="1"/>
-    <w:lsdException w:name="Table Grid" w:uiPriority="39"/>
+    <w:lsdException w:name="Balloon Text" w:semiHidden="1" w:unhideWhenUsed="1" w:qFormat="1"/>
+    <w:lsdException w:name="Table Grid" w:uiPriority="39" w:qFormat="1"/>
     <w:lsdException w:name="Table Theme" w:semiHidden="1" w:unhideWhenUsed="1"/>
-    <w:lsdException w:name="Placeholder Text" w:semiHidden="1"/>
+    <w:lsdException w:name="Placeholder Text" w:semiHidden="1" w:unhideWhenUsed="1"/>
     <w:lsdException w:name="No Spacing" w:uiPriority="1" w:qFormat="1"/>
-    <w:lsdException w:name="Light Shading" w:uiPriority="60"/>
-    <w:lsdException w:name="Light List" w:uiPriority="61"/>
-    <w:lsdException w:name="Light Grid" w:uiPriority="62"/>
-    <w:lsdException w:name="Medium Shading 1" w:uiPriority="63"/>
-    <w:lsdException w:name="Medium Shading 2" w:uiPriority="64"/>
-    <w:lsdException w:name="Medium List 1" w:uiPriority="65"/>
-    <w:lsdException w:name="Medium List 2" w:uiPriority="66"/>
-    <w:lsdException w:name="Medium Grid 1" w:uiPriority="67"/>
-    <w:lsdException w:name="Medium Grid 2" w:uiPriority="68"/>
-    <w:lsdException w:name="Medium Grid 3" w:uiPriority="69"/>
-    <w:lsdException w:name="Dark List" w:uiPriority="70"/>
-    <w:lsdException w:name="Colorful Shading" w:uiPriority="71"/>
-    <w:lsdException w:name="Colorful List" w:uiPriority="72"/>
-    <w:lsdException w:name="Colorful Grid" w:uiPriority="73"/>
-    <w:lsdException w:name="Light Shading Accent 1" w:uiPriority="60"/>
-    <w:lsdException w:name="Light List Accent 1" w:uiPriority="61"/>
-    <w:lsdException w:name="Light Grid Accent 1" w:uiPriority="62"/>
-    <w:lsdException w:name="Medium Shading 1 Accent 1" w:uiPriority="63"/>
-    <w:lsdException w:name="Medium Shading 2 Accent 1" w:uiPriority="64"/>
-    <w:lsdException w:name="Medium List 1 Accent 1" w:uiPriority="65"/>
-    <w:lsdException w:name="Revision" w:semiHidden="1"/>
-    <w:lsdException w:name="List Paragraph" w:uiPriority="34" w:qFormat="1"/>
-    <w:lsdException w:name="Quote" w:uiPriority="29" w:qFormat="1"/>
-    <w:lsdException w:name="Intense Quote" w:uiPriority="30" w:qFormat="1"/>
-    <w:lsdException w:name="Medium List 2 Accent 1" w:uiPriority="66"/>
-    <w:lsdException w:name="Medium Grid 1 Accent 1" w:uiPriority="67"/>
-    <w:lsdException w:name="Medium Grid 2 Accent 1" w:uiPriority="68"/>
-    <w:lsdException w:name="Medium Grid 3 Accent 1" w:uiPriority="69"/>
-    <w:lsdException w:name="Dark List Accent 1" w:uiPriority="70"/>
-    <w:lsdException w:name="Colorful Shading Accent 1" w:uiPriority="71"/>
-    <w:lsdException w:name="Colorful List Accent 1" w:uiPriority="72"/>
-    <w:lsdException w:name="Colorful Grid Accent 1" w:uiPriority="73"/>
-    <w:lsdException w:name="Light Shading Accent 2" w:uiPriority="60"/>
-    <w:lsdException w:name="Light List Accent 2" w:uiPriority="61"/>
-    <w:lsdException w:name="Light Grid Accent 2" w:uiPriority="62"/>
-    <w:lsdException w:name="Medium Shading 1 Accent 2" w:uiPriority="63"/>
-    <w:lsdException w:name="Medium Shading 2 Accent 2" w:uiPriority="64"/>
-    <w:lsdException w:name="Medium List 1 Accent 2" w:uiPriority="65"/>
-    <w:lsdException w:name="Medium List 2 Accent 2" w:uiPriority="66"/>
-    <w:lsdException w:name="Medium Grid 1 Accent 2" w:uiPriority="67"/>
-    <w:lsdException w:name="Medium Grid 2 Accent 2" w:uiPriority="68"/>
-    <w:lsdException w:name="Medium Grid 3 Accent 2" w:uiPriority="69"/>
-    <w:lsdException w:name="Dark List Accent 2" w:uiPriority="70"/>
-    <w:lsdException w:name="Colorful Shading Accent 2" w:uiPriority="71"/>
-    <w:lsdException w:name="Colorful List Accent 2" w:uiPriority="72"/>
-    <w:lsdException w:name="Colorful Grid Accent 2" w:uiPriority="73"/>
-    <w:lsdException w:name="Light Shading Accent 3" w:uiPriority="60"/>
-    <w:lsdException w:name="Light List Accent 3" w:uiPriority="61"/>
-    <w:lsdException w:name="Light Grid Accent 3" w:uiPriority="62"/>
-    <w:lsdException w:name="Medium Shading 1 Accent 3" w:uiPriority="63"/>
-    <w:lsdException w:name="Medium Shading 2 Accent 3" w:uiPriority="64"/>
-    <w:lsdException w:name="Medium List 1 Accent 3" w:uiPriority="65"/>
-    <w:lsdException w:name="Medium List 2 Accent 3" w:uiPriority="66"/>
-    <w:lsdException w:name="Medium Grid 1 Accent 3" w:uiPriority="67"/>
-    <w:lsdException w:name="Medium Grid 2 Accent 3" w:uiPriority="68"/>
-    <w:lsdException w:name="Medium Grid 3 Accent 3" w:uiPriority="69"/>
-    <w:lsdException w:name="Dark List Accent 3" w:uiPriority="70"/>
-    <w:lsdException w:name="Colorful Shading Accent 3" w:uiPriority="71"/>
-    <w:lsdException w:name="Colorful List Accent 3" w:uiPriority="72"/>
-    <w:lsdException w:name="Colorful Grid Accent 3" w:uiPriority="73"/>
-    <w:lsdException w:name="Light Shading Accent 4" w:uiPriority="60"/>
-    <w:lsdException w:name="Light List Accent 4" w:uiPriority="61"/>
-    <w:lsdException w:name="Light Grid Accent 4" w:uiPriority="62"/>
-    <w:lsdException w:name="Medium Shading 1 Accent 4" w:uiPriority="63"/>
-    <w:lsdException w:name="Medium Shading 2 Accent 4" w:uiPriority="64"/>
-    <w:lsdException w:name="Medium List 1 Accent 4" w:uiPriority="65"/>
-    <w:lsdException w:name="Medium List 2 Accent 4" w:uiPriority="66"/>
-    <w:lsdException w:name="Medium Grid 1 Accent 4" w:uiPriority="67"/>
-    <w:lsdException w:name="Medium Grid 2 Accent 4" w:uiPriority="68"/>
-    <w:lsdException w:name="Medium Grid 3 Accent 4" w:uiPriority="69"/>
-    <w:lsdException w:name="Dark List Accent 4" w:uiPriority="70"/>
-    <w:lsdException w:name="Colorful Shading Accent 4" w:uiPriority="71"/>
-    <w:lsdException w:name="Colorful List Accent 4" w:uiPriority="72"/>
-    <w:lsdException w:name="Colorful Grid Accent 4" w:uiPriority="73"/>
-    <w:lsdException w:name="Light Shading Accent 5" w:uiPriority="60"/>
-    <w:lsdException w:name="Light List Accent 5" w:uiPriority="61"/>
-    <w:lsdException w:name="Light Grid Accent 5" w:uiPriority="62"/>
-    <w:lsdException w:name="Medium Shading 1 Accent 5" w:uiPriority="63"/>
-    <w:lsdException w:name="Medium Shading 2 Accent 5" w:uiPriority="64"/>
-    <w:lsdException w:name="Medium List 1 Accent 5" w:uiPriority="65"/>
-    <w:lsdException w:name="Medium List 2 Accent 5" w:uiPriority="66"/>
-    <w:lsdException w:name="Medium Grid 1 Accent 5" w:uiPriority="67"/>
-    <w:lsdException w:name="Medium Grid 2 Accent 5" w:uiPriority="68"/>
-    <w:lsdException w:name="Medium Grid 3 Accent 5" w:uiPriority="69"/>
-    <w:lsdException w:name="Dark List Accent 5" w:uiPriority="70"/>
-    <w:lsdException w:name="Colorful Shading Accent 5" w:uiPriority="71"/>
-    <w:lsdException w:name="Colorful List Accent 5" w:uiPriority="72"/>
-    <w:lsdException w:name="Colorful Grid Accent 5" w:uiPriority="73"/>
-    <w:lsdException w:name="Light Shading Accent 6" w:uiPriority="60"/>
-    <w:lsdException w:name="Light List Accent 6" w:uiPriority="61"/>
-    <w:lsdException w:name="Light Grid Accent 6" w:uiPriority="62"/>
-    <w:lsdException w:name="Medium Shading 1 Accent 6" w:uiPriority="63"/>
-    <w:lsdException w:name="Medium Shading 2 Accent 6" w:uiPriority="64"/>
-    <w:lsdException w:name="Medium List 1 Accent 6" w:uiPriority="65"/>
-    <w:lsdException w:name="Medium List 2 Accent 6" w:uiPriority="66"/>
-    <w:lsdException w:name="Medium Grid 1 Accent 6" w:uiPriority="67"/>
-    <w:lsdException w:name="Medium Grid 2 Accent 6" w:uiPriority="68"/>
-    <w:lsdException w:name="Medium Grid 3 Accent 6" w:uiPriority="69"/>
-    <w:lsdException w:name="Dark List Accent 6" w:uiPriority="70"/>
-    <w:lsdException w:name="Colorful Shading Accent 6" w:uiPriority="71"/>
-    <w:lsdException w:name="Colorful List Accent 6" w:uiPriority="72"/>
-    <w:lsdException w:name="Colorful Grid Accent 6" w:uiPriority="73"/>
+    <w:lsdException w:name="Light Shading"/>
+    <w:lsdException w:name="Light List"/>
+    <w:lsdException w:name="Light Grid"/>
+    <w:lsdException w:name="Medium Shading 1"/>
+    <w:lsdException w:name="Medium Shading 2"/>
+    <w:lsdException w:name="Medium List 1"/>
+    <w:lsdException w:name="Medium List 2"/>
+    <w:lsdException w:name="Medium Grid 1"/>
+    <w:lsdException w:name="Medium Grid 2"/>
+    <w:lsdException w:name="Medium Grid 3"/>
+    <w:lsdException w:name="Dark List"/>
+    <w:lsdException w:name="Colorful Shading"/>
+    <w:lsdException w:name="Colorful List"/>
+    <w:lsdException w:name="Colorful Grid"/>
+    <w:lsdException w:name="Light Shading Accent 1"/>
+    <w:lsdException w:name="Light List Accent 1"/>
+    <w:lsdException w:name="Light Grid Accent 1"/>
+    <w:lsdException w:name="Medium Shading 1 Accent 1"/>
+    <w:lsdException w:name="Medium Shading 2 Accent 1"/>
+    <w:lsdException w:name="Medium List 1 Accent 1"/>
+    <w:lsdException w:name="Revision" w:semiHidden="1" w:unhideWhenUsed="1"/>
+    <w:lsdException w:name="List Paragraph" w:semiHidden="1" w:unhideWhenUsed="1"/>
+    <w:lsdException w:name="Quote" w:semiHidden="1" w:unhideWhenUsed="1"/>
+    <w:lsdException w:name="Intense Quote" w:semiHidden="1" w:unhideWhenUsed="1"/>
+    <w:lsdException w:name="Medium List 2 Accent 1"/>
+    <w:lsdException w:name="Medium Grid 1 Accent 1"/>
+    <w:lsdException w:name="Medium Grid 2 Accent 1"/>
+    <w:lsdException w:name="Medium Grid 3 Accent 1"/>
+    <w:lsdException w:name="Dark List Accent 1"/>
+    <w:lsdException w:name="Colorful Shading Accent 1"/>
+    <w:lsdException w:name="Colorful List Accent 1"/>
+    <w:lsdException w:name="Colorful Grid Accent 1"/>
+    <w:lsdException w:name="Light Shading Accent 2"/>
+    <w:lsdException w:name="Light List Accent 2"/>
+    <w:lsdException w:name="Light Grid Accent 2"/>
+    <w:lsdException w:name="Medium Shading 1 Accent 2"/>
+    <w:lsdException w:name="Medium Shading 2 Accent 2"/>
+    <w:lsdException w:name="Medium List 1 Accent 2"/>
+    <w:lsdException w:name="Medium List 2 Accent 2"/>
+    <w:lsdException w:name="Medium Grid 1 Accent 2"/>
+    <w:lsdException w:name="Medium Grid 2 Accent 2"/>
+    <w:lsdException w:name="Medium Grid 3 Accent 2"/>
+    <w:lsdException w:name="Dark List Accent 2"/>
+    <w:lsdException w:name="Colorful Shading Accent 2"/>
+    <w:lsdException w:name="Colorful List Accent 2"/>
+    <w:lsdException w:name="Colorful Grid Accent 2"/>
+    <w:lsdException w:name="Light Shading Accent 3"/>
+    <w:lsdException w:name="Light List Accent 3"/>
+    <w:lsdException w:name="Light Grid Accent 3"/>
+    <w:lsdException w:name="Medium Shading 1 Accent 3"/>
+    <w:lsdException w:name="Medium Shading 2 Accent 3"/>
+    <w:lsdException w:name="Medium List 1 Accent 3"/>
+    <w:lsdException w:name="Medium List 2 Accent 3"/>
+    <w:lsdException w:name="Medium Grid 1 Accent 3"/>
+    <w:lsdException w:name="Medium Grid 2 Accent 3"/>
+    <w:lsdException w:name="Medium Grid 3 Accent 3"/>
+    <w:lsdException w:name="Dark List Accent 3"/>
+    <w:lsdException w:name="Colorful Shading Accent 3"/>
+    <w:lsdException w:name="Colorful List Accent 3"/>
+    <w:lsdException w:name="Colorful Grid Accent 3"/>
+    <w:lsdException w:name="Light Shading Accent 4"/>
+    <w:lsdException w:name="Light List Accent 4"/>
+    <w:lsdException w:name="Light Grid Accent 4"/>
+    <w:lsdException w:name="Medium Shading 1 Accent 4"/>
+    <w:lsdException w:name="Medium Shading 2 Accent 4"/>
+    <w:lsdException w:name="Medium List 1 Accent 4"/>
+    <w:lsdException w:name="Medium List 2 Accent 4"/>
+    <w:lsdException w:name="Medium Grid 1 Accent 4"/>
+    <w:lsdException w:name="Medium Grid 2 Accent 4"/>
+    <w:lsdException w:name="Medium Grid 3 Accent 4"/>
+    <w:lsdException w:name="Dark List Accent 4"/>
+    <w:lsdException w:name="Colorful Shading Accent 4"/>
+    <w:lsdException w:name="Colorful List Accent 4"/>
+    <w:lsdException w:name="Colorful Grid Accent 4"/>
+    <w:lsdException w:name="Light Shading Accent 5"/>
+    <w:lsdException w:name="Light List Accent 5"/>
+    <w:lsdException w:name="Light Grid Accent 5"/>
+    <w:lsdException w:name="Medium Shading 1 Accent 5"/>
+    <w:lsdException w:name="Medium Shading 2 Accent 5"/>
+    <w:lsdException w:name="Medium List 1 Accent 5"/>
+    <w:lsdException w:name="Medium List 2 Accent 5"/>
+    <w:lsdException w:name="Medium Grid 1 Accent 5"/>
+    <w:lsdException w:name="Medium Grid 2 Accent 5"/>
+    <w:lsdException w:name="Medium Grid 3 Accent 5"/>
+    <w:lsdException w:name="Dark List Accent 5"/>
+    <w:lsdException w:name="Colorful Shading Accent 5"/>
+    <w:lsdException w:name="Colorful List Accent 5"/>
+    <w:lsdException w:name="Colorful Grid Accent 5"/>
+    <w:lsdException w:name="Light Shading Accent 6"/>
+    <w:lsdException w:name="Light List Accent 6"/>
+    <w:lsdException w:name="Light Grid Accent 6"/>
+    <w:lsdException w:name="Medium Shading 1 Accent 6"/>
+    <w:lsdException w:name="Medium Shading 2 Accent 6"/>
+    <w:lsdException w:name="Medium List 1 Accent 6"/>
+    <w:lsdException w:name="Medium List 2 Accent 6"/>
+    <w:lsdException w:name="Medium Grid 1 Accent 6"/>
+    <w:lsdException w:name="Medium Grid 2 Accent 6"/>
+    <w:lsdException w:name="Medium Grid 3 Accent 6"/>
+    <w:lsdException w:name="Dark List Accent 6"/>
+    <w:lsdException w:name="Colorful Shading Accent 6"/>
+    <w:lsdException w:name="Colorful List Accent 6"/>
+    <w:lsdException w:name="Colorful Grid Accent 6"/>
     <w:lsdException w:name="Subtle Emphasis" w:uiPriority="19" w:qFormat="1"/>
     <w:lsdException w:name="Intense Emphasis" w:uiPriority="21" w:qFormat="1"/>
     <w:lsdException w:name="Subtle Reference" w:uiPriority="31" w:qFormat="1"/>
@@ -1430,13 +1547,23 @@
     <w:lsdException w:name="List Table 5 Dark Accent 6" w:uiPriority="50"/>
     <w:lsdException w:name="List Table 6 Colorful Accent 6" w:uiPriority="51"/>
     <w:lsdException w:name="List Table 7 Colorful Accent 6" w:uiPriority="52"/>
+    <w:lsdException w:name="Mention" w:semiHidden="1" w:unhideWhenUsed="1"/>
+    <w:lsdException w:name="Smart Hyperlink" w:semiHidden="1" w:unhideWhenUsed="1"/>
+    <w:lsdException w:name="Hashtag" w:semiHidden="1" w:unhideWhenUsed="1"/>
+    <w:lsdException w:name="Unresolved Mention" w:semiHidden="1" w:unhideWhenUsed="1"/>
+    <w:lsdException w:name="Smart Link" w:semiHidden="1" w:unhideWhenUsed="1"/>
   </w:latentStyles>
   <w:style w:type="paragraph" w:default="1" w:styleId="Normal">
     <w:name w:val="Normal"/>
     <w:qFormat/>
-    <w:rsid w:val="00D75182"/>
+    <w:pPr>
+      <w:spacing w:after="160" w:line="259" w:lineRule="auto"/>
+    </w:pPr>
     <w:rPr>
       <w:rFonts w:eastAsia="MS Mincho"/>
+      <w:sz w:val="22"/>
+      <w:szCs w:val="22"/>
+      <w:lang w:val="es-GT" w:eastAsia="en-US"/>
     </w:rPr>
   </w:style>
   <w:style w:type="character" w:default="1" w:styleId="Fuentedeprrafopredeter">
@@ -1466,54 +1593,25 @@
     <w:semiHidden/>
     <w:unhideWhenUsed/>
   </w:style>
-  <w:style w:type="paragraph" w:styleId="Sinespaciado">
-    <w:name w:val="No Spacing"/>
-    <w:uiPriority w:val="1"/>
-    <w:qFormat/>
-    <w:rsid w:val="007B480D"/>
-    <w:pPr>
-      <w:spacing w:after="0" w:line="240" w:lineRule="auto"/>
-    </w:pPr>
-  </w:style>
   <w:style w:type="character" w:styleId="Refdecomentario">
     <w:name w:val="annotation reference"/>
     <w:basedOn w:val="Fuentedeprrafopredeter"/>
     <w:uiPriority w:val="99"/>
     <w:semiHidden/>
     <w:unhideWhenUsed/>
-    <w:rsid w:val="00EB52AC"/>
     <w:rPr>
       <w:sz w:val="16"/>
       <w:szCs w:val="16"/>
     </w:rPr>
   </w:style>
-  <w:style w:type="paragraph" w:styleId="Textocomentario">
-    <w:name w:val="annotation text"/>
-    <w:basedOn w:val="Normal"/>
-    <w:link w:val="TextocomentarioCar"/>
-    <w:uiPriority w:val="99"/>
-    <w:semiHidden/>
-    <w:unhideWhenUsed/>
-    <w:rsid w:val="00EB52AC"/>
-    <w:pPr>
-      <w:spacing w:line="240" w:lineRule="auto"/>
-    </w:pPr>
+  <w:style w:type="character" w:styleId="Textoennegrita">
+    <w:name w:val="Strong"/>
+    <w:basedOn w:val="Fuentedeprrafopredeter"/>
+    <w:uiPriority w:val="22"/>
+    <w:qFormat/>
     <w:rPr>
-      <w:sz w:val="20"/>
-      <w:szCs w:val="20"/>
-    </w:rPr>
-  </w:style>
-  <w:style w:type="character" w:customStyle="1" w:styleId="TextocomentarioCar">
-    <w:name w:val="Texto comentario Car"/>
-    <w:basedOn w:val="Fuentedeprrafopredeter"/>
-    <w:link w:val="Textocomentario"/>
-    <w:uiPriority w:val="99"/>
-    <w:semiHidden/>
-    <w:rsid w:val="00EB52AC"/>
-    <w:rPr>
-      <w:rFonts w:eastAsia="MS Mincho"/>
-      <w:sz w:val="20"/>
-      <w:szCs w:val="20"/>
+      <w:b/>
+      <w:bCs/>
     </w:rPr>
   </w:style>
   <w:style w:type="paragraph" w:styleId="Asuntodelcomentario">
@@ -1524,23 +1622,24 @@
     <w:uiPriority w:val="99"/>
     <w:semiHidden/>
     <w:unhideWhenUsed/>
-    <w:rsid w:val="00EB52AC"/>
+    <w:qFormat/>
     <w:rPr>
       <w:b/>
       <w:bCs/>
     </w:rPr>
   </w:style>
-  <w:style w:type="character" w:customStyle="1" w:styleId="AsuntodelcomentarioCar">
-    <w:name w:val="Asunto del comentario Car"/>
-    <w:basedOn w:val="TextocomentarioCar"/>
-    <w:link w:val="Asuntodelcomentario"/>
+  <w:style w:type="paragraph" w:styleId="Textocomentario">
+    <w:name w:val="annotation text"/>
+    <w:basedOn w:val="Normal"/>
+    <w:link w:val="TextocomentarioCar"/>
     <w:uiPriority w:val="99"/>
     <w:semiHidden/>
-    <w:rsid w:val="00EB52AC"/>
+    <w:unhideWhenUsed/>
+    <w:qFormat/>
+    <w:pPr>
+      <w:spacing w:line="240" w:lineRule="auto"/>
+    </w:pPr>
     <w:rPr>
-      <w:rFonts w:eastAsia="MS Mincho"/>
-      <w:b/>
-      <w:bCs/>
       <w:sz w:val="20"/>
       <w:szCs w:val="20"/>
     </w:rPr>
@@ -1552,7 +1651,7 @@
     <w:uiPriority w:val="99"/>
     <w:semiHidden/>
     <w:unhideWhenUsed/>
-    <w:rsid w:val="0005271C"/>
+    <w:qFormat/>
     <w:pPr>
       <w:spacing w:after="0" w:line="240" w:lineRule="auto"/>
     </w:pPr>
@@ -1562,32 +1661,28 @@
       <w:szCs w:val="18"/>
     </w:rPr>
   </w:style>
-  <w:style w:type="character" w:customStyle="1" w:styleId="TextodegloboCar">
-    <w:name w:val="Texto de globo Car"/>
-    <w:basedOn w:val="Fuentedeprrafopredeter"/>
-    <w:link w:val="Textodeglobo"/>
+  <w:style w:type="paragraph" w:styleId="NormalWeb">
+    <w:name w:val="Normal (Web)"/>
+    <w:basedOn w:val="Normal"/>
     <w:uiPriority w:val="99"/>
     <w:semiHidden/>
-    <w:rsid w:val="0005271C"/>
+    <w:unhideWhenUsed/>
+    <w:qFormat/>
+    <w:pPr>
+      <w:spacing w:before="100" w:beforeAutospacing="1" w:after="100" w:afterAutospacing="1" w:line="240" w:lineRule="auto"/>
+    </w:pPr>
     <w:rPr>
-      <w:rFonts w:ascii="Segoe UI" w:eastAsia="MS Mincho" w:hAnsi="Segoe UI" w:cs="Segoe UI"/>
-      <w:sz w:val="18"/>
-      <w:szCs w:val="18"/>
+      <w:rFonts w:ascii="Times New Roman" w:eastAsia="Times New Roman" w:hAnsi="Times New Roman" w:cs="Times New Roman"/>
+      <w:sz w:val="24"/>
+      <w:szCs w:val="24"/>
+      <w:lang w:eastAsia="es-GT"/>
     </w:rPr>
-  </w:style>
-  <w:style w:type="character" w:customStyle="1" w:styleId="oypena">
-    <w:name w:val="oypena"/>
-    <w:basedOn w:val="Fuentedeprrafopredeter"/>
-    <w:rsid w:val="003F5629"/>
   </w:style>
   <w:style w:type="table" w:styleId="Tablaconcuadrcula">
     <w:name w:val="Table Grid"/>
     <w:basedOn w:val="Tablanormal"/>
     <w:uiPriority w:val="39"/>
-    <w:rsid w:val="00C251FB"/>
-    <w:pPr>
-      <w:spacing w:after="0" w:line="240" w:lineRule="auto"/>
-    </w:pPr>
+    <w:qFormat/>
     <w:tblPr>
       <w:tblBorders>
         <w:top w:val="single" w:sz="4" w:space="0" w:color="auto"/>
@@ -1599,10 +1694,66 @@
       </w:tblBorders>
     </w:tblPr>
   </w:style>
+  <w:style w:type="paragraph" w:styleId="Sinespaciado">
+    <w:name w:val="No Spacing"/>
+    <w:uiPriority w:val="1"/>
+    <w:qFormat/>
+    <w:rPr>
+      <w:sz w:val="22"/>
+      <w:szCs w:val="22"/>
+      <w:lang w:val="es-GT" w:eastAsia="en-US"/>
+    </w:rPr>
+  </w:style>
+  <w:style w:type="character" w:customStyle="1" w:styleId="TextocomentarioCar">
+    <w:name w:val="Texto comentario Car"/>
+    <w:basedOn w:val="Fuentedeprrafopredeter"/>
+    <w:link w:val="Textocomentario"/>
+    <w:uiPriority w:val="99"/>
+    <w:semiHidden/>
+    <w:qFormat/>
+    <w:rPr>
+      <w:rFonts w:eastAsia="MS Mincho"/>
+      <w:sz w:val="20"/>
+      <w:szCs w:val="20"/>
+    </w:rPr>
+  </w:style>
+  <w:style w:type="character" w:customStyle="1" w:styleId="AsuntodelcomentarioCar">
+    <w:name w:val="Asunto del comentario Car"/>
+    <w:basedOn w:val="TextocomentarioCar"/>
+    <w:link w:val="Asuntodelcomentario"/>
+    <w:uiPriority w:val="99"/>
+    <w:semiHidden/>
+    <w:qFormat/>
+    <w:rPr>
+      <w:rFonts w:eastAsia="MS Mincho"/>
+      <w:b/>
+      <w:bCs/>
+      <w:sz w:val="20"/>
+      <w:szCs w:val="20"/>
+    </w:rPr>
+  </w:style>
+  <w:style w:type="character" w:customStyle="1" w:styleId="TextodegloboCar">
+    <w:name w:val="Texto de globo Car"/>
+    <w:basedOn w:val="Fuentedeprrafopredeter"/>
+    <w:link w:val="Textodeglobo"/>
+    <w:uiPriority w:val="99"/>
+    <w:semiHidden/>
+    <w:qFormat/>
+    <w:rPr>
+      <w:rFonts w:ascii="Segoe UI" w:eastAsia="MS Mincho" w:hAnsi="Segoe UI" w:cs="Segoe UI"/>
+      <w:sz w:val="18"/>
+      <w:szCs w:val="18"/>
+    </w:rPr>
+  </w:style>
+  <w:style w:type="character" w:customStyle="1" w:styleId="oypena">
+    <w:name w:val="oypena"/>
+    <w:basedOn w:val="Fuentedeprrafopredeter"/>
+    <w:qFormat/>
+  </w:style>
   <w:style w:type="paragraph" w:customStyle="1" w:styleId="paragraph">
     <w:name w:val="paragraph"/>
     <w:basedOn w:val="Normal"/>
-    <w:rsid w:val="006E1988"/>
+    <w:qFormat/>
     <w:pPr>
       <w:spacing w:before="100" w:beforeAutospacing="1" w:after="100" w:afterAutospacing="1" w:line="240" w:lineRule="auto"/>
     </w:pPr>
@@ -1616,49 +1767,21 @@
   <w:style w:type="character" w:customStyle="1" w:styleId="normaltextrun">
     <w:name w:val="normaltextrun"/>
     <w:basedOn w:val="Fuentedeprrafopredeter"/>
-    <w:rsid w:val="006E1988"/>
+    <w:qFormat/>
   </w:style>
   <w:style w:type="character" w:customStyle="1" w:styleId="eop">
     <w:name w:val="eop"/>
     <w:basedOn w:val="Fuentedeprrafopredeter"/>
-    <w:rsid w:val="006E1988"/>
-  </w:style>
-  <w:style w:type="paragraph" w:styleId="NormalWeb">
-    <w:name w:val="Normal (Web)"/>
-    <w:basedOn w:val="Normal"/>
-    <w:uiPriority w:val="99"/>
-    <w:semiHidden/>
-    <w:unhideWhenUsed/>
-    <w:rsid w:val="00B952EC"/>
-    <w:pPr>
-      <w:spacing w:before="100" w:beforeAutospacing="1" w:after="100" w:afterAutospacing="1" w:line="240" w:lineRule="auto"/>
-    </w:pPr>
-    <w:rPr>
-      <w:rFonts w:ascii="Times New Roman" w:eastAsia="Times New Roman" w:hAnsi="Times New Roman" w:cs="Times New Roman"/>
-      <w:sz w:val="24"/>
-      <w:szCs w:val="24"/>
-      <w:lang w:eastAsia="es-GT"/>
-    </w:rPr>
+    <w:qFormat/>
   </w:style>
   <w:style w:type="character" w:customStyle="1" w:styleId="cf01">
     <w:name w:val="cf01"/>
     <w:basedOn w:val="Fuentedeprrafopredeter"/>
-    <w:rsid w:val="00B952EC"/>
+    <w:qFormat/>
     <w:rPr>
       <w:rFonts w:ascii="Consolas" w:hAnsi="Consolas" w:hint="default"/>
       <w:sz w:val="22"/>
       <w:szCs w:val="22"/>
-    </w:rPr>
-  </w:style>
-  <w:style w:type="character" w:styleId="Textoennegrita">
-    <w:name w:val="Strong"/>
-    <w:basedOn w:val="Fuentedeprrafopredeter"/>
-    <w:uiPriority w:val="22"/>
-    <w:qFormat/>
-    <w:rsid w:val="0078207B"/>
-    <w:rPr>
-      <w:b/>
-      <w:bCs/>
     </w:rPr>
   </w:style>
 </w:styles>
@@ -1707,7 +1830,7 @@
     </a:clrScheme>
     <a:fontScheme name="Office">
       <a:majorFont>
-        <a:latin typeface="Calibri Light" panose="020F0302020204030204"/>
+        <a:latin typeface="Calibri Light"/>
         <a:ea typeface=""/>
         <a:cs typeface=""/>
         <a:font script="Jpan" typeface="游ゴシック Light"/>
@@ -1740,26 +1863,9 @@
         <a:font script="Viet" typeface="Times New Roman"/>
         <a:font script="Uigh" typeface="Microsoft Uighur"/>
         <a:font script="Geor" typeface="Sylfaen"/>
-        <a:font script="Armn" typeface="Arial"/>
-        <a:font script="Bugi" typeface="Leelawadee UI"/>
-        <a:font script="Bopo" typeface="Microsoft JhengHei"/>
-        <a:font script="Java" typeface="Javanese Text"/>
-        <a:font script="Lisu" typeface="Segoe UI"/>
-        <a:font script="Mymr" typeface="Myanmar Text"/>
-        <a:font script="Nkoo" typeface="Ebrima"/>
-        <a:font script="Olck" typeface="Nirmala UI"/>
-        <a:font script="Osma" typeface="Ebrima"/>
-        <a:font script="Phag" typeface="Phagspa"/>
-        <a:font script="Syrn" typeface="Estrangelo Edessa"/>
-        <a:font script="Syrj" typeface="Estrangelo Edessa"/>
-        <a:font script="Syre" typeface="Estrangelo Edessa"/>
-        <a:font script="Sora" typeface="Nirmala UI"/>
-        <a:font script="Tale" typeface="Microsoft Tai Le"/>
-        <a:font script="Talu" typeface="Microsoft New Tai Lue"/>
-        <a:font script="Tfng" typeface="Ebrima"/>
       </a:majorFont>
       <a:minorFont>
-        <a:latin typeface="Calibri" panose="020F0502020204030204"/>
+        <a:latin typeface="Calibri"/>
         <a:ea typeface=""/>
         <a:cs typeface=""/>
         <a:font script="Jpan" typeface="游明朝"/>
@@ -1792,23 +1898,6 @@
         <a:font script="Viet" typeface="Arial"/>
         <a:font script="Uigh" typeface="Microsoft Uighur"/>
         <a:font script="Geor" typeface="Sylfaen"/>
-        <a:font script="Armn" typeface="Arial"/>
-        <a:font script="Bugi" typeface="Leelawadee UI"/>
-        <a:font script="Bopo" typeface="Microsoft JhengHei"/>
-        <a:font script="Java" typeface="Javanese Text"/>
-        <a:font script="Lisu" typeface="Segoe UI"/>
-        <a:font script="Mymr" typeface="Myanmar Text"/>
-        <a:font script="Nkoo" typeface="Ebrima"/>
-        <a:font script="Olck" typeface="Nirmala UI"/>
-        <a:font script="Osma" typeface="Ebrima"/>
-        <a:font script="Phag" typeface="Phagspa"/>
-        <a:font script="Syrn" typeface="Estrangelo Edessa"/>
-        <a:font script="Syrj" typeface="Estrangelo Edessa"/>
-        <a:font script="Syre" typeface="Estrangelo Edessa"/>
-        <a:font script="Sora" typeface="Nirmala UI"/>
-        <a:font script="Tale" typeface="Microsoft Tai Le"/>
-        <a:font script="Talu" typeface="Microsoft New Tai Lue"/>
-        <a:font script="Tfng" typeface="Ebrima"/>
       </a:minorFont>
     </a:fontScheme>
     <a:fmtScheme name="Office">
@@ -1951,10 +2040,5 @@
   </a:themeElements>
   <a:objectDefaults/>
   <a:extraClrSchemeLst/>
-  <a:extLst>
-    <a:ext uri="{05A4C25C-085E-4340-85A3-A5531E510DB2}">
-      <thm15:themeFamily xmlns:thm15="http://schemas.microsoft.com/office/thememl/2012/main" name="Office Theme" id="{62F939B6-93AF-4DB8-9C6B-D6C7DFDC589F}" vid="{4A3C46E8-61CC-4603-A589-7422A47A8E4A}"/>
-    </a:ext>
-  </a:extLst>
 </a:theme>
 </file>
</xml_diff>

<commit_message>
add:Se Agrego los datos del programador fpaiz-2024264 al documento Peaceathome.docx en la rama fpaiz-2024264
</commit_message>
<xml_diff>
--- a/Peaceathome.docx
+++ b/Peaceathome.docx
@@ -1,6 +1,6 @@
 
 <file path=word/document.xml><?xml version="1.0" encoding="utf-8"?>
-<w:document xmlns:wpc="http://schemas.microsoft.com/office/word/2010/wordprocessingCanvas" xmlns:cx="http://schemas.microsoft.com/office/drawing/2014/chartex" xmlns:cx1="http://schemas.microsoft.com/office/drawing/2015/9/8/chartex" xmlns:mc="http://schemas.openxmlformats.org/markup-compatibility/2006" xmlns:o="urn:schemas-microsoft-com:office:office" xmlns:r="http://schemas.openxmlformats.org/officeDocument/2006/relationships" xmlns:m="http://schemas.openxmlformats.org/officeDocument/2006/math" xmlns:v="urn:schemas-microsoft-com:vml" xmlns:wp14="http://schemas.microsoft.com/office/word/2010/wordprocessingDrawing" xmlns:wp="http://schemas.openxmlformats.org/drawingml/2006/wordprocessingDrawing" xmlns:w10="urn:schemas-microsoft-com:office:word" xmlns:w="http://schemas.openxmlformats.org/wordprocessingml/2006/main" xmlns:w14="http://schemas.microsoft.com/office/word/2010/wordml" xmlns:w15="http://schemas.microsoft.com/office/word/2012/wordml" xmlns:w16se="http://schemas.microsoft.com/office/word/2015/wordml/symex" xmlns:wpg="http://schemas.microsoft.com/office/word/2010/wordprocessingGroup" xmlns:wpi="http://schemas.microsoft.com/office/word/2010/wordprocessingInk" xmlns:wne="http://schemas.microsoft.com/office/word/2006/wordml" xmlns:wps="http://schemas.microsoft.com/office/word/2010/wordprocessingShape" mc:Ignorable="w14 w15 w16se wp14">
+<w:document xmlns:wpc="http://schemas.microsoft.com/office/word/2010/wordprocessingCanvas" xmlns:cx="http://schemas.microsoft.com/office/drawing/2014/chartex" xmlns:cx1="http://schemas.microsoft.com/office/drawing/2015/9/8/chartex" xmlns:cx2="http://schemas.microsoft.com/office/drawing/2015/10/21/chartex" xmlns:cx3="http://schemas.microsoft.com/office/drawing/2016/5/9/chartex" xmlns:cx4="http://schemas.microsoft.com/office/drawing/2016/5/10/chartex" xmlns:cx5="http://schemas.microsoft.com/office/drawing/2016/5/11/chartex" xmlns:cx6="http://schemas.microsoft.com/office/drawing/2016/5/12/chartex" xmlns:cx7="http://schemas.microsoft.com/office/drawing/2016/5/13/chartex" xmlns:cx8="http://schemas.microsoft.com/office/drawing/2016/5/14/chartex" xmlns:mc="http://schemas.openxmlformats.org/markup-compatibility/2006" xmlns:aink="http://schemas.microsoft.com/office/drawing/2016/ink" xmlns:am3d="http://schemas.microsoft.com/office/drawing/2017/model3d" xmlns:o="urn:schemas-microsoft-com:office:office" xmlns:oel="http://schemas.microsoft.com/office/2019/extlst" xmlns:r="http://schemas.openxmlformats.org/officeDocument/2006/relationships" xmlns:m="http://schemas.openxmlformats.org/officeDocument/2006/math" xmlns:v="urn:schemas-microsoft-com:vml" xmlns:wp14="http://schemas.microsoft.com/office/word/2010/wordprocessingDrawing" xmlns:wp="http://schemas.openxmlformats.org/drawingml/2006/wordprocessingDrawing" xmlns:w10="urn:schemas-microsoft-com:office:word" xmlns:w="http://schemas.openxmlformats.org/wordprocessingml/2006/main" xmlns:w14="http://schemas.microsoft.com/office/word/2010/wordml" xmlns:w15="http://schemas.microsoft.com/office/word/2012/wordml" xmlns:w16cex="http://schemas.microsoft.com/office/word/2018/wordml/cex" xmlns:w16cid="http://schemas.microsoft.com/office/word/2016/wordml/cid" xmlns:w16="http://schemas.microsoft.com/office/word/2018/wordml" xmlns:w16du="http://schemas.microsoft.com/office/word/2023/wordml/word16du" xmlns:w16sdtdh="http://schemas.microsoft.com/office/word/2020/wordml/sdtdatahash" xmlns:w16sdtfl="http://schemas.microsoft.com/office/word/2024/wordml/sdtformatlock" xmlns:w16se="http://schemas.microsoft.com/office/word/2015/wordml/symex" xmlns:wpg="http://schemas.microsoft.com/office/word/2010/wordprocessingGroup" xmlns:wpi="http://schemas.microsoft.com/office/word/2010/wordprocessingInk" xmlns:wne="http://schemas.microsoft.com/office/word/2006/wordml" xmlns:wps="http://schemas.microsoft.com/office/word/2010/wordprocessingShape" mc:Ignorable="w14 w15 w16se w16cid w16 w16cex w16sdtdh w16sdtfl w16du wp14">
   <w:body>
     <w:p>
       <w:pPr>
@@ -16,11 +16,11 @@
           <w:rFonts w:ascii="Arial" w:hAnsi="Arial" w:cs="Arial"/>
           <w:b/>
           <w:noProof/>
-          <w:lang w:eastAsia="es-GT"/>
+          <w:lang w:val="en-US"/>
         </w:rPr>
         <w:drawing>
-          <wp:inline distT="0" distB="0" distL="0" distR="0" wp14:anchorId="61DA3BD1" wp14:editId="0C35A376">
-            <wp:extent cx="2249144" cy="847725"/>
+          <wp:inline distT="0" distB="0" distL="0" distR="0" wp14:anchorId="2FEE8166" wp14:editId="6BE70031">
+            <wp:extent cx="2248535" cy="847725"/>
             <wp:effectExtent l="0" t="0" r="0" b="0"/>
             <wp:docPr id="2" name="Imagen 2"/>
             <wp:cNvGraphicFramePr>
@@ -30,13 +30,13 @@
               <a:graphicData uri="http://schemas.openxmlformats.org/drawingml/2006/picture">
                 <pic:pic xmlns:pic="http://schemas.openxmlformats.org/drawingml/2006/picture">
                   <pic:nvPicPr>
-                    <pic:cNvPr id="0" name="Picture 1"/>
+                    <pic:cNvPr id="2" name="Imagen 2"/>
                     <pic:cNvPicPr>
                       <a:picLocks noChangeAspect="1" noChangeArrowheads="1"/>
                     </pic:cNvPicPr>
                   </pic:nvPicPr>
                   <pic:blipFill>
-                    <a:blip r:embed="rId4" cstate="print">
+                    <a:blip r:embed="rId6" cstate="print">
                       <a:extLst>
                         <a:ext uri="{28A0092B-C50C-407E-A947-70E740481C1C}">
                           <a14:useLocalDpi xmlns:a14="http://schemas.microsoft.com/office/drawing/2010/main" val="0"/>
@@ -48,7 +48,7 @@
                       <a:fillRect/>
                     </a:stretch>
                   </pic:blipFill>
-                  <pic:spPr bwMode="auto">
+                  <pic:spPr>
                     <a:xfrm>
                       <a:off x="0" y="0"/>
                       <a:ext cx="2253277" cy="849283"/>
@@ -120,13 +120,7 @@
         <w:rPr>
           <w:rFonts w:ascii="Arial" w:hAnsi="Arial" w:cs="Arial"/>
         </w:rPr>
-        <w:t>5TO. PERITO EN INFORMATICA</w:t>
-      </w:r>
-      <w:r>
-        <w:rPr>
-          <w:rFonts w:ascii="Arial" w:hAnsi="Arial" w:cs="Arial"/>
-        </w:rPr>
-        <w:t xml:space="preserve"> </w:t>
+        <w:t xml:space="preserve">5TO. PERITO EN INFORMATICA </w:t>
       </w:r>
     </w:p>
     <w:p>
@@ -507,56 +501,7 @@
           <w:rFonts w:ascii="Arial" w:hAnsi="Arial" w:cs="Arial"/>
           <w:sz w:val="24"/>
         </w:rPr>
-        <w:t xml:space="preserve">Guatemala, </w:t>
-      </w:r>
-      <w:r>
-        <w:rPr>
-          <w:rFonts w:ascii="Arial" w:hAnsi="Arial" w:cs="Arial"/>
-          <w:sz w:val="24"/>
-        </w:rPr>
-        <w:t xml:space="preserve">15 </w:t>
-      </w:r>
-      <w:r>
-        <w:rPr>
-          <w:rFonts w:ascii="Arial" w:hAnsi="Arial" w:cs="Arial"/>
-          <w:sz w:val="24"/>
-        </w:rPr>
-        <w:t xml:space="preserve">de </w:t>
-      </w:r>
-      <w:r>
-        <w:rPr>
-          <w:rFonts w:ascii="Arial" w:hAnsi="Arial" w:cs="Arial"/>
-          <w:sz w:val="24"/>
-        </w:rPr>
-        <w:t xml:space="preserve">Julio </w:t>
-      </w:r>
-      <w:r>
-        <w:rPr>
-          <w:rFonts w:ascii="Arial" w:hAnsi="Arial" w:cs="Arial"/>
-          <w:sz w:val="24"/>
-        </w:rPr>
-        <w:t>de 20</w:t>
-      </w:r>
-      <w:r>
-        <w:rPr>
-          <w:rFonts w:ascii="Arial" w:hAnsi="Arial" w:cs="Arial"/>
-          <w:sz w:val="24"/>
-        </w:rPr>
-        <w:t>2</w:t>
-      </w:r>
-      <w:r>
-        <w:rPr>
-          <w:rFonts w:ascii="Arial" w:hAnsi="Arial" w:cs="Arial"/>
-          <w:sz w:val="24"/>
-        </w:rPr>
-        <w:t>5</w:t>
-      </w:r>
-      <w:r>
-        <w:rPr>
-          <w:rFonts w:ascii="Arial" w:hAnsi="Arial" w:cs="Arial"/>
-          <w:sz w:val="24"/>
-        </w:rPr>
-        <w:t>.</w:t>
+        <w:t>Guatemala, 15 de Julio de 2025.</w:t>
       </w:r>
     </w:p>
     <w:p>
@@ -590,6 +535,7 @@
           </w:tcPr>
           <w:p>
             <w:pPr>
+              <w:spacing w:after="0" w:line="240" w:lineRule="auto"/>
               <w:jc w:val="center"/>
               <w:rPr>
                 <w:rFonts w:ascii="Arial" w:eastAsiaTheme="minorHAnsi" w:hAnsi="Arial" w:cs="Arial"/>
@@ -624,6 +570,7 @@
           </w:tcPr>
           <w:p>
             <w:pPr>
+              <w:spacing w:after="0" w:line="240" w:lineRule="auto"/>
               <w:jc w:val="center"/>
               <w:rPr>
                 <w:rFonts w:ascii="Arial" w:eastAsiaTheme="minorHAnsi" w:hAnsi="Arial" w:cs="Arial"/>
@@ -649,6 +596,7 @@
           </w:tcPr>
           <w:p>
             <w:pPr>
+              <w:spacing w:after="0" w:line="240" w:lineRule="auto"/>
               <w:jc w:val="center"/>
               <w:rPr>
                 <w:rFonts w:ascii="Arial" w:eastAsiaTheme="minorHAnsi" w:hAnsi="Arial" w:cs="Arial"/>
@@ -656,20 +604,83 @@
                 <w:lang w:val="es-ES"/>
               </w:rPr>
             </w:pPr>
-          </w:p>
-        </w:tc>
-        <w:tc>
-          <w:tcPr>
-            <w:tcW w:w="5395" w:type="dxa"/>
-          </w:tcPr>
-          <w:p>
-            <w:pPr>
-              <w:jc w:val="center"/>
-              <w:rPr>
-                <w:rFonts w:ascii="Arial" w:eastAsiaTheme="minorHAnsi" w:hAnsi="Arial" w:cs="Arial"/>
-                <w:sz w:val="24"/>
-              </w:rPr>
-            </w:pPr>
+            <w:proofErr w:type="spellStart"/>
+            <w:r>
+              <w:rPr>
+                <w:rFonts w:ascii="Arial" w:eastAsiaTheme="minorHAnsi" w:hAnsi="Arial" w:cs="Arial"/>
+                <w:sz w:val="24"/>
+                <w:lang w:val="es-ES"/>
+              </w:rPr>
+              <w:t>Kenet</w:t>
+            </w:r>
+            <w:proofErr w:type="spellEnd"/>
+            <w:r>
+              <w:rPr>
+                <w:rFonts w:ascii="Arial" w:eastAsiaTheme="minorHAnsi" w:hAnsi="Arial" w:cs="Arial"/>
+                <w:sz w:val="24"/>
+                <w:lang w:val="es-ES"/>
+              </w:rPr>
+              <w:t xml:space="preserve"> Efraín </w:t>
+            </w:r>
+            <w:proofErr w:type="spellStart"/>
+            <w:r>
+              <w:rPr>
+                <w:rFonts w:ascii="Arial" w:eastAsiaTheme="minorHAnsi" w:hAnsi="Arial" w:cs="Arial"/>
+                <w:sz w:val="24"/>
+                <w:lang w:val="es-ES"/>
+              </w:rPr>
+              <w:t>Cuyuch</w:t>
+            </w:r>
+            <w:proofErr w:type="spellEnd"/>
+            <w:r>
+              <w:rPr>
+                <w:rFonts w:ascii="Arial" w:eastAsiaTheme="minorHAnsi" w:hAnsi="Arial" w:cs="Arial"/>
+                <w:sz w:val="24"/>
+                <w:lang w:val="es-ES"/>
+              </w:rPr>
+              <w:t xml:space="preserve"> </w:t>
+            </w:r>
+            <w:proofErr w:type="spellStart"/>
+            <w:r>
+              <w:rPr>
+                <w:rFonts w:ascii="Arial" w:eastAsiaTheme="minorHAnsi" w:hAnsi="Arial" w:cs="Arial"/>
+                <w:sz w:val="24"/>
+                <w:lang w:val="es-ES"/>
+              </w:rPr>
+              <w:t>Joj</w:t>
+            </w:r>
+            <w:proofErr w:type="spellEnd"/>
+          </w:p>
+        </w:tc>
+        <w:tc>
+          <w:tcPr>
+            <w:tcW w:w="5395" w:type="dxa"/>
+          </w:tcPr>
+          <w:p>
+            <w:pPr>
+              <w:spacing w:after="0" w:line="240" w:lineRule="auto"/>
+              <w:jc w:val="center"/>
+              <w:rPr>
+                <w:rFonts w:ascii="Arial" w:eastAsiaTheme="minorHAnsi" w:hAnsi="Arial" w:cs="Arial"/>
+                <w:sz w:val="24"/>
+              </w:rPr>
+            </w:pPr>
+            <w:r>
+              <w:rPr>
+                <w:rFonts w:ascii="Arial" w:eastAsiaTheme="minorHAnsi" w:hAnsi="Arial" w:cs="Arial"/>
+                <w:sz w:val="24"/>
+              </w:rPr>
+              <w:t xml:space="preserve">Scrum </w:t>
+            </w:r>
+            <w:proofErr w:type="gramStart"/>
+            <w:r>
+              <w:rPr>
+                <w:rFonts w:ascii="Arial" w:eastAsiaTheme="minorHAnsi" w:hAnsi="Arial" w:cs="Arial"/>
+                <w:sz w:val="24"/>
+              </w:rPr>
+              <w:t>Master</w:t>
+            </w:r>
+            <w:proofErr w:type="gramEnd"/>
           </w:p>
         </w:tc>
       </w:tr>
@@ -680,26 +691,68 @@
           </w:tcPr>
           <w:p>
             <w:pPr>
-              <w:jc w:val="center"/>
-              <w:rPr>
-                <w:rFonts w:ascii="Arial" w:eastAsiaTheme="minorHAnsi" w:hAnsi="Arial" w:cs="Arial"/>
-                <w:sz w:val="24"/>
-              </w:rPr>
-            </w:pPr>
-          </w:p>
-        </w:tc>
-        <w:tc>
-          <w:tcPr>
-            <w:tcW w:w="5395" w:type="dxa"/>
-          </w:tcPr>
-          <w:p>
-            <w:pPr>
-              <w:jc w:val="center"/>
-              <w:rPr>
-                <w:rFonts w:ascii="Arial" w:eastAsiaTheme="minorHAnsi" w:hAnsi="Arial" w:cs="Arial"/>
-                <w:sz w:val="24"/>
-              </w:rPr>
-            </w:pPr>
+              <w:spacing w:after="0" w:line="240" w:lineRule="auto"/>
+              <w:jc w:val="center"/>
+              <w:rPr>
+                <w:rFonts w:ascii="Arial" w:eastAsiaTheme="minorHAnsi" w:hAnsi="Arial" w:cs="Arial"/>
+                <w:sz w:val="24"/>
+              </w:rPr>
+            </w:pPr>
+            <w:proofErr w:type="spellStart"/>
+            <w:r>
+              <w:rPr>
+                <w:rFonts w:ascii="Arial" w:eastAsiaTheme="minorHAnsi" w:hAnsi="Arial" w:cs="Arial"/>
+                <w:sz w:val="24"/>
+              </w:rPr>
+              <w:t>Angel</w:t>
+            </w:r>
+            <w:proofErr w:type="spellEnd"/>
+            <w:r>
+              <w:rPr>
+                <w:rFonts w:ascii="Arial" w:eastAsiaTheme="minorHAnsi" w:hAnsi="Arial" w:cs="Arial"/>
+                <w:sz w:val="24"/>
+              </w:rPr>
+              <w:t xml:space="preserve"> </w:t>
+            </w:r>
+            <w:proofErr w:type="spellStart"/>
+            <w:r>
+              <w:rPr>
+                <w:rFonts w:ascii="Arial" w:eastAsiaTheme="minorHAnsi" w:hAnsi="Arial" w:cs="Arial"/>
+                <w:sz w:val="24"/>
+              </w:rPr>
+              <w:t>Gahel</w:t>
+            </w:r>
+            <w:proofErr w:type="spellEnd"/>
+            <w:r>
+              <w:rPr>
+                <w:rFonts w:ascii="Arial" w:eastAsiaTheme="minorHAnsi" w:hAnsi="Arial" w:cs="Arial"/>
+                <w:sz w:val="24"/>
+              </w:rPr>
+              <w:t xml:space="preserve"> Padilla Pacheco</w:t>
+            </w:r>
+          </w:p>
+        </w:tc>
+        <w:tc>
+          <w:tcPr>
+            <w:tcW w:w="5395" w:type="dxa"/>
+          </w:tcPr>
+          <w:p>
+            <w:pPr>
+              <w:spacing w:after="0" w:line="240" w:lineRule="auto"/>
+              <w:jc w:val="center"/>
+              <w:rPr>
+                <w:rFonts w:ascii="Arial" w:eastAsiaTheme="minorHAnsi" w:hAnsi="Arial" w:cs="Arial"/>
+                <w:sz w:val="24"/>
+                <w:u w:val="single"/>
+              </w:rPr>
+            </w:pPr>
+            <w:r>
+              <w:rPr>
+                <w:rFonts w:ascii="Arial" w:eastAsiaTheme="minorHAnsi" w:hAnsi="Arial" w:cs="Arial"/>
+                <w:sz w:val="24"/>
+              </w:rPr>
+              <w:t>Programador</w:t>
+            </w:r>
           </w:p>
         </w:tc>
       </w:tr>
@@ -710,26 +763,76 @@
           </w:tcPr>
           <w:p>
             <w:pPr>
-              <w:jc w:val="center"/>
-              <w:rPr>
-                <w:rFonts w:ascii="Arial" w:eastAsiaTheme="minorHAnsi" w:hAnsi="Arial" w:cs="Arial"/>
-                <w:sz w:val="24"/>
-              </w:rPr>
-            </w:pPr>
-          </w:p>
-        </w:tc>
-        <w:tc>
-          <w:tcPr>
-            <w:tcW w:w="5395" w:type="dxa"/>
-          </w:tcPr>
-          <w:p>
-            <w:pPr>
-              <w:jc w:val="center"/>
-              <w:rPr>
-                <w:rFonts w:ascii="Arial" w:eastAsiaTheme="minorHAnsi" w:hAnsi="Arial" w:cs="Arial"/>
-                <w:sz w:val="24"/>
-              </w:rPr>
-            </w:pPr>
+              <w:spacing w:after="0" w:line="240" w:lineRule="auto"/>
+              <w:jc w:val="center"/>
+              <w:rPr>
+                <w:rFonts w:ascii="Arial" w:eastAsiaTheme="minorHAnsi" w:hAnsi="Arial" w:cs="Arial"/>
+                <w:sz w:val="24"/>
+              </w:rPr>
+            </w:pPr>
+            <w:proofErr w:type="spellStart"/>
+            <w:r>
+              <w:rPr>
+                <w:rFonts w:ascii="Arial" w:eastAsiaTheme="minorHAnsi" w:hAnsi="Arial" w:cs="Arial"/>
+                <w:sz w:val="24"/>
+              </w:rPr>
+              <w:t>Jose</w:t>
+            </w:r>
+            <w:proofErr w:type="spellEnd"/>
+            <w:r>
+              <w:rPr>
+                <w:rFonts w:ascii="Arial" w:eastAsiaTheme="minorHAnsi" w:hAnsi="Arial" w:cs="Arial"/>
+                <w:sz w:val="24"/>
+              </w:rPr>
+              <w:t xml:space="preserve"> Enrique </w:t>
+            </w:r>
+            <w:proofErr w:type="spellStart"/>
+            <w:r>
+              <w:rPr>
+                <w:rFonts w:ascii="Arial" w:eastAsiaTheme="minorHAnsi" w:hAnsi="Arial" w:cs="Arial"/>
+                <w:sz w:val="24"/>
+              </w:rPr>
+              <w:t>cuc</w:t>
+            </w:r>
+            <w:proofErr w:type="spellEnd"/>
+            <w:r>
+              <w:rPr>
+                <w:rFonts w:ascii="Arial" w:eastAsiaTheme="minorHAnsi" w:hAnsi="Arial" w:cs="Arial"/>
+                <w:sz w:val="24"/>
+              </w:rPr>
+              <w:t xml:space="preserve"> </w:t>
+            </w:r>
+            <w:proofErr w:type="spellStart"/>
+            <w:r>
+              <w:rPr>
+                <w:rFonts w:ascii="Arial" w:eastAsiaTheme="minorHAnsi" w:hAnsi="Arial" w:cs="Arial"/>
+                <w:sz w:val="24"/>
+              </w:rPr>
+              <w:t>cutz</w:t>
+            </w:r>
+            <w:proofErr w:type="spellEnd"/>
+          </w:p>
+        </w:tc>
+        <w:tc>
+          <w:tcPr>
+            <w:tcW w:w="5395" w:type="dxa"/>
+          </w:tcPr>
+          <w:p>
+            <w:pPr>
+              <w:spacing w:after="0" w:line="240" w:lineRule="auto"/>
+              <w:jc w:val="center"/>
+              <w:rPr>
+                <w:rFonts w:ascii="Arial" w:eastAsiaTheme="minorHAnsi" w:hAnsi="Arial" w:cs="Arial"/>
+                <w:sz w:val="24"/>
+              </w:rPr>
+            </w:pPr>
+            <w:r>
+              <w:rPr>
+                <w:rFonts w:ascii="Arial" w:eastAsiaTheme="minorHAnsi" w:hAnsi="Arial" w:cs="Arial"/>
+                <w:sz w:val="24"/>
+              </w:rPr>
+              <w:t>Programador</w:t>
+            </w:r>
           </w:p>
         </w:tc>
       </w:tr>
@@ -740,26 +843,84 @@
           </w:tcPr>
           <w:p>
             <w:pPr>
-              <w:jc w:val="center"/>
-              <w:rPr>
-                <w:rFonts w:ascii="Arial" w:eastAsiaTheme="minorHAnsi" w:hAnsi="Arial" w:cs="Arial"/>
-                <w:sz w:val="24"/>
-              </w:rPr>
-            </w:pPr>
-          </w:p>
-        </w:tc>
-        <w:tc>
-          <w:tcPr>
-            <w:tcW w:w="5395" w:type="dxa"/>
-          </w:tcPr>
-          <w:p>
-            <w:pPr>
-              <w:jc w:val="center"/>
-              <w:rPr>
-                <w:rFonts w:ascii="Arial" w:eastAsiaTheme="minorHAnsi" w:hAnsi="Arial" w:cs="Arial"/>
-                <w:sz w:val="24"/>
-              </w:rPr>
-            </w:pPr>
+              <w:spacing w:after="0" w:line="240" w:lineRule="auto"/>
+              <w:jc w:val="center"/>
+              <w:rPr>
+                <w:rFonts w:ascii="Arial" w:eastAsiaTheme="minorEastAsia" w:hAnsi="Arial" w:cs="Arial"/>
+                <w:sz w:val="24"/>
+                <w:szCs w:val="24"/>
+              </w:rPr>
+            </w:pPr>
+            <w:proofErr w:type="spellStart"/>
+            <w:r>
+              <w:rPr>
+                <w:rFonts w:ascii="Arial" w:eastAsiaTheme="minorEastAsia" w:hAnsi="Arial" w:cs="Arial"/>
+                <w:sz w:val="24"/>
+                <w:szCs w:val="24"/>
+              </w:rPr>
+              <w:t>Jeferson</w:t>
+            </w:r>
+            <w:proofErr w:type="spellEnd"/>
+            <w:r>
+              <w:rPr>
+                <w:rFonts w:ascii="Arial" w:eastAsiaTheme="minorEastAsia" w:hAnsi="Arial" w:cs="Arial"/>
+                <w:sz w:val="24"/>
+                <w:szCs w:val="24"/>
+              </w:rPr>
+              <w:t xml:space="preserve"> </w:t>
+            </w:r>
+            <w:proofErr w:type="spellStart"/>
+            <w:r>
+              <w:rPr>
+                <w:rFonts w:ascii="Arial" w:eastAsiaTheme="minorEastAsia" w:hAnsi="Arial" w:cs="Arial"/>
+                <w:sz w:val="24"/>
+                <w:szCs w:val="24"/>
+              </w:rPr>
+              <w:t>Andre</w:t>
+            </w:r>
+            <w:proofErr w:type="spellEnd"/>
+            <w:r>
+              <w:rPr>
+                <w:rFonts w:ascii="Arial" w:eastAsiaTheme="minorEastAsia" w:hAnsi="Arial" w:cs="Arial"/>
+                <w:sz w:val="24"/>
+                <w:szCs w:val="24"/>
+              </w:rPr>
+              <w:t xml:space="preserve"> Cano </w:t>
+            </w:r>
+            <w:proofErr w:type="spellStart"/>
+            <w:r>
+              <w:rPr>
+                <w:rFonts w:ascii="Arial" w:eastAsiaTheme="minorEastAsia" w:hAnsi="Arial" w:cs="Arial"/>
+                <w:sz w:val="24"/>
+                <w:szCs w:val="24"/>
+              </w:rPr>
+              <w:t>Lopez</w:t>
+            </w:r>
+            <w:proofErr w:type="spellEnd"/>
+          </w:p>
+        </w:tc>
+        <w:tc>
+          <w:tcPr>
+            <w:tcW w:w="5395" w:type="dxa"/>
+          </w:tcPr>
+          <w:p>
+            <w:pPr>
+              <w:spacing w:after="0" w:line="240" w:lineRule="auto"/>
+              <w:jc w:val="center"/>
+              <w:rPr>
+                <w:rFonts w:ascii="Arial" w:eastAsiaTheme="minorEastAsia" w:hAnsi="Arial" w:cs="Arial"/>
+                <w:sz w:val="24"/>
+                <w:szCs w:val="24"/>
+              </w:rPr>
+            </w:pPr>
+            <w:r>
+              <w:rPr>
+                <w:rFonts w:ascii="Arial" w:eastAsiaTheme="minorEastAsia" w:hAnsi="Arial" w:cs="Arial"/>
+                <w:sz w:val="24"/>
+                <w:szCs w:val="24"/>
+              </w:rPr>
+              <w:t>Programador</w:t>
+            </w:r>
           </w:p>
         </w:tc>
       </w:tr>
@@ -770,26 +931,42 @@
           </w:tcPr>
           <w:p>
             <w:pPr>
-              <w:jc w:val="center"/>
-              <w:rPr>
-                <w:rFonts w:ascii="Arial" w:eastAsiaTheme="minorHAnsi" w:hAnsi="Arial" w:cs="Arial"/>
-                <w:sz w:val="24"/>
-              </w:rPr>
-            </w:pPr>
-          </w:p>
-        </w:tc>
-        <w:tc>
-          <w:tcPr>
-            <w:tcW w:w="5395" w:type="dxa"/>
-          </w:tcPr>
-          <w:p>
-            <w:pPr>
-              <w:jc w:val="center"/>
-              <w:rPr>
-                <w:rFonts w:ascii="Arial" w:eastAsiaTheme="minorHAnsi" w:hAnsi="Arial" w:cs="Arial"/>
-                <w:sz w:val="24"/>
-              </w:rPr>
-            </w:pPr>
+              <w:spacing w:after="0" w:line="240" w:lineRule="auto"/>
+              <w:jc w:val="center"/>
+              <w:rPr>
+                <w:rFonts w:ascii="Arial" w:eastAsiaTheme="minorHAnsi" w:hAnsi="Arial" w:cs="Arial"/>
+                <w:sz w:val="24"/>
+              </w:rPr>
+            </w:pPr>
+            <w:r>
+              <w:rPr>
+                <w:rFonts w:ascii="Arial" w:eastAsiaTheme="minorHAnsi" w:hAnsi="Arial" w:cs="Arial"/>
+                <w:sz w:val="24"/>
+              </w:rPr>
+              <w:t>Carlos Enrique López Quino</w:t>
+            </w:r>
+          </w:p>
+        </w:tc>
+        <w:tc>
+          <w:tcPr>
+            <w:tcW w:w="5395" w:type="dxa"/>
+          </w:tcPr>
+          <w:p>
+            <w:pPr>
+              <w:spacing w:after="0" w:line="240" w:lineRule="auto"/>
+              <w:jc w:val="center"/>
+              <w:rPr>
+                <w:rFonts w:ascii="Arial" w:eastAsiaTheme="minorHAnsi" w:hAnsi="Arial" w:cs="Arial"/>
+                <w:sz w:val="24"/>
+              </w:rPr>
+            </w:pPr>
+            <w:r>
+              <w:rPr>
+                <w:rFonts w:ascii="Arial" w:eastAsiaTheme="minorHAnsi" w:hAnsi="Arial" w:cs="Arial"/>
+                <w:sz w:val="24"/>
+              </w:rPr>
+              <w:t>Programador</w:t>
+            </w:r>
           </w:p>
         </w:tc>
       </w:tr>
@@ -800,26 +977,51 @@
           </w:tcPr>
           <w:p>
             <w:pPr>
-              <w:jc w:val="center"/>
-              <w:rPr>
-                <w:rFonts w:ascii="Arial" w:eastAsiaTheme="minorHAnsi" w:hAnsi="Arial" w:cs="Arial"/>
-                <w:sz w:val="24"/>
-              </w:rPr>
-            </w:pPr>
-          </w:p>
-        </w:tc>
-        <w:tc>
-          <w:tcPr>
-            <w:tcW w:w="5395" w:type="dxa"/>
-          </w:tcPr>
-          <w:p>
-            <w:pPr>
-              <w:jc w:val="center"/>
-              <w:rPr>
-                <w:rFonts w:ascii="Arial" w:eastAsiaTheme="minorHAnsi" w:hAnsi="Arial" w:cs="Arial"/>
-                <w:sz w:val="24"/>
-              </w:rPr>
-            </w:pPr>
+              <w:spacing w:after="0" w:line="240" w:lineRule="auto"/>
+              <w:jc w:val="center"/>
+              <w:rPr>
+                <w:rFonts w:ascii="Arial" w:eastAsiaTheme="minorHAnsi" w:hAnsi="Arial" w:cs="Arial"/>
+                <w:sz w:val="24"/>
+              </w:rPr>
+            </w:pPr>
+            <w:r>
+              <w:rPr>
+                <w:rFonts w:ascii="Arial" w:eastAsiaTheme="minorHAnsi" w:hAnsi="Arial" w:cs="Arial"/>
+                <w:sz w:val="24"/>
+              </w:rPr>
+              <w:t xml:space="preserve">Ricardo Alejandro Hernández </w:t>
+            </w:r>
+            <w:proofErr w:type="spellStart"/>
+            <w:r>
+              <w:rPr>
+                <w:rFonts w:ascii="Arial" w:eastAsiaTheme="minorHAnsi" w:hAnsi="Arial" w:cs="Arial"/>
+                <w:sz w:val="24"/>
+              </w:rPr>
+              <w:t>Hernández</w:t>
+            </w:r>
+            <w:proofErr w:type="spellEnd"/>
+          </w:p>
+        </w:tc>
+        <w:tc>
+          <w:tcPr>
+            <w:tcW w:w="5395" w:type="dxa"/>
+          </w:tcPr>
+          <w:p>
+            <w:pPr>
+              <w:spacing w:after="0" w:line="240" w:lineRule="auto"/>
+              <w:jc w:val="center"/>
+              <w:rPr>
+                <w:rFonts w:ascii="Arial" w:eastAsiaTheme="minorHAnsi" w:hAnsi="Arial" w:cs="Arial"/>
+                <w:sz w:val="24"/>
+              </w:rPr>
+            </w:pPr>
+            <w:r>
+              <w:rPr>
+                <w:rFonts w:ascii="Arial" w:eastAsiaTheme="minorHAnsi" w:hAnsi="Arial" w:cs="Arial"/>
+                <w:sz w:val="24"/>
+              </w:rPr>
+              <w:t>Programador</w:t>
+            </w:r>
           </w:p>
         </w:tc>
       </w:tr>
@@ -830,26 +1032,58 @@
           </w:tcPr>
           <w:p>
             <w:pPr>
-              <w:jc w:val="center"/>
-              <w:rPr>
-                <w:rFonts w:ascii="Arial" w:eastAsiaTheme="minorHAnsi" w:hAnsi="Arial" w:cs="Arial"/>
-                <w:sz w:val="24"/>
-              </w:rPr>
-            </w:pPr>
-          </w:p>
-        </w:tc>
-        <w:tc>
-          <w:tcPr>
-            <w:tcW w:w="5395" w:type="dxa"/>
-          </w:tcPr>
-          <w:p>
-            <w:pPr>
-              <w:jc w:val="center"/>
-              <w:rPr>
-                <w:rFonts w:ascii="Arial" w:eastAsiaTheme="minorHAnsi" w:hAnsi="Arial" w:cs="Arial"/>
-                <w:sz w:val="24"/>
-              </w:rPr>
-            </w:pPr>
+              <w:spacing w:after="0" w:line="240" w:lineRule="auto"/>
+              <w:jc w:val="center"/>
+              <w:rPr>
+                <w:rFonts w:ascii="Arial" w:eastAsiaTheme="minorHAnsi" w:hAnsi="Arial" w:cs="Arial"/>
+                <w:sz w:val="24"/>
+              </w:rPr>
+            </w:pPr>
+            <w:r>
+              <w:rPr>
+                <w:rFonts w:ascii="Arial" w:eastAsiaTheme="minorHAnsi" w:hAnsi="Arial" w:cs="Arial"/>
+                <w:sz w:val="24"/>
+              </w:rPr>
+              <w:t xml:space="preserve">Osman </w:t>
+            </w:r>
+            <w:proofErr w:type="spellStart"/>
+            <w:r>
+              <w:rPr>
+                <w:rFonts w:ascii="Arial" w:eastAsiaTheme="minorHAnsi" w:hAnsi="Arial" w:cs="Arial"/>
+                <w:sz w:val="24"/>
+              </w:rPr>
+              <w:t>Emmanuell</w:t>
+            </w:r>
+            <w:proofErr w:type="spellEnd"/>
+            <w:r>
+              <w:rPr>
+                <w:rFonts w:ascii="Arial" w:eastAsiaTheme="minorHAnsi" w:hAnsi="Arial" w:cs="Arial"/>
+                <w:sz w:val="24"/>
+              </w:rPr>
+              <w:t xml:space="preserve"> Veliz Guzmán</w:t>
+            </w:r>
+          </w:p>
+        </w:tc>
+        <w:tc>
+          <w:tcPr>
+            <w:tcW w:w="5395" w:type="dxa"/>
+          </w:tcPr>
+          <w:p>
+            <w:pPr>
+              <w:spacing w:after="0" w:line="240" w:lineRule="auto"/>
+              <w:jc w:val="center"/>
+              <w:rPr>
+                <w:rFonts w:ascii="Arial" w:eastAsiaTheme="minorHAnsi" w:hAnsi="Arial" w:cs="Arial"/>
+                <w:sz w:val="24"/>
+              </w:rPr>
+            </w:pPr>
+            <w:r>
+              <w:rPr>
+                <w:rFonts w:ascii="Arial" w:eastAsiaTheme="minorHAnsi" w:hAnsi="Arial" w:cs="Arial"/>
+                <w:sz w:val="24"/>
+              </w:rPr>
+              <w:t>Programador</w:t>
+            </w:r>
           </w:p>
         </w:tc>
       </w:tr>
@@ -860,26 +1094,42 @@
           </w:tcPr>
           <w:p>
             <w:pPr>
-              <w:jc w:val="center"/>
-              <w:rPr>
-                <w:rFonts w:ascii="Arial" w:eastAsiaTheme="minorHAnsi" w:hAnsi="Arial" w:cs="Arial"/>
-                <w:sz w:val="24"/>
-              </w:rPr>
-            </w:pPr>
-          </w:p>
-        </w:tc>
-        <w:tc>
-          <w:tcPr>
-            <w:tcW w:w="5395" w:type="dxa"/>
-          </w:tcPr>
-          <w:p>
-            <w:pPr>
-              <w:jc w:val="center"/>
-              <w:rPr>
-                <w:rFonts w:ascii="Arial" w:eastAsiaTheme="minorHAnsi" w:hAnsi="Arial" w:cs="Arial"/>
-                <w:sz w:val="24"/>
-              </w:rPr>
-            </w:pPr>
+              <w:spacing w:after="0" w:line="240" w:lineRule="auto"/>
+              <w:jc w:val="center"/>
+              <w:rPr>
+                <w:rFonts w:ascii="Arial" w:eastAsiaTheme="minorHAnsi" w:hAnsi="Arial" w:cs="Arial"/>
+                <w:sz w:val="24"/>
+              </w:rPr>
+            </w:pPr>
+            <w:r>
+              <w:rPr>
+                <w:rFonts w:ascii="Arial" w:eastAsiaTheme="minorHAnsi" w:hAnsi="Arial" w:cs="Arial"/>
+                <w:sz w:val="24"/>
+              </w:rPr>
+              <w:t>Franklin Stev Paiz Chavez</w:t>
+            </w:r>
+          </w:p>
+        </w:tc>
+        <w:tc>
+          <w:tcPr>
+            <w:tcW w:w="5395" w:type="dxa"/>
+          </w:tcPr>
+          <w:p>
+            <w:pPr>
+              <w:spacing w:after="0" w:line="240" w:lineRule="auto"/>
+              <w:jc w:val="center"/>
+              <w:rPr>
+                <w:rFonts w:ascii="Arial" w:eastAsiaTheme="minorHAnsi" w:hAnsi="Arial" w:cs="Arial"/>
+                <w:sz w:val="24"/>
+              </w:rPr>
+            </w:pPr>
+            <w:r>
+              <w:rPr>
+                <w:rFonts w:ascii="Arial" w:eastAsiaTheme="minorHAnsi" w:hAnsi="Arial" w:cs="Arial"/>
+                <w:sz w:val="24"/>
+              </w:rPr>
+              <w:t>Programador</w:t>
+            </w:r>
           </w:p>
         </w:tc>
       </w:tr>
@@ -890,6 +1140,7 @@
           </w:tcPr>
           <w:p>
             <w:pPr>
+              <w:spacing w:after="0" w:line="240" w:lineRule="auto"/>
               <w:jc w:val="center"/>
               <w:rPr>
                 <w:rFonts w:ascii="Arial" w:eastAsiaTheme="minorEastAsia" w:hAnsi="Arial" w:cs="Arial"/>
@@ -905,6 +1156,7 @@
           </w:tcPr>
           <w:p>
             <w:pPr>
+              <w:spacing w:after="0" w:line="240" w:lineRule="auto"/>
               <w:jc w:val="center"/>
               <w:rPr>
                 <w:rFonts w:ascii="Arial" w:eastAsiaTheme="minorEastAsia" w:hAnsi="Arial" w:cs="Arial"/>
@@ -922,20 +1174,22 @@
           </w:tcPr>
           <w:p>
             <w:pPr>
-              <w:jc w:val="center"/>
-              <w:rPr>
-                <w:rFonts w:ascii="Arial" w:eastAsiaTheme="minorHAnsi" w:hAnsi="Arial" w:cs="Arial"/>
-                <w:sz w:val="24"/>
-              </w:rPr>
-            </w:pPr>
-          </w:p>
-        </w:tc>
-        <w:tc>
-          <w:tcPr>
-            <w:tcW w:w="5395" w:type="dxa"/>
-          </w:tcPr>
-          <w:p>
-            <w:pPr>
+              <w:spacing w:after="0" w:line="240" w:lineRule="auto"/>
+              <w:jc w:val="center"/>
+              <w:rPr>
+                <w:rFonts w:ascii="Arial" w:eastAsiaTheme="minorHAnsi" w:hAnsi="Arial" w:cs="Arial"/>
+                <w:sz w:val="24"/>
+              </w:rPr>
+            </w:pPr>
+          </w:p>
+        </w:tc>
+        <w:tc>
+          <w:tcPr>
+            <w:tcW w:w="5395" w:type="dxa"/>
+          </w:tcPr>
+          <w:p>
+            <w:pPr>
+              <w:spacing w:after="0" w:line="240" w:lineRule="auto"/>
               <w:jc w:val="center"/>
               <w:rPr>
                 <w:rFonts w:ascii="Arial" w:eastAsiaTheme="minorHAnsi" w:hAnsi="Arial" w:cs="Arial"/>
@@ -952,20 +1206,22 @@
           </w:tcPr>
           <w:p>
             <w:pPr>
-              <w:jc w:val="center"/>
-              <w:rPr>
-                <w:rFonts w:ascii="Arial" w:eastAsiaTheme="minorHAnsi" w:hAnsi="Arial" w:cs="Arial"/>
-                <w:sz w:val="24"/>
-              </w:rPr>
-            </w:pPr>
-          </w:p>
-        </w:tc>
-        <w:tc>
-          <w:tcPr>
-            <w:tcW w:w="5395" w:type="dxa"/>
-          </w:tcPr>
-          <w:p>
-            <w:pPr>
+              <w:spacing w:after="0" w:line="240" w:lineRule="auto"/>
+              <w:jc w:val="center"/>
+              <w:rPr>
+                <w:rFonts w:ascii="Arial" w:eastAsiaTheme="minorHAnsi" w:hAnsi="Arial" w:cs="Arial"/>
+                <w:sz w:val="24"/>
+              </w:rPr>
+            </w:pPr>
+          </w:p>
+        </w:tc>
+        <w:tc>
+          <w:tcPr>
+            <w:tcW w:w="5395" w:type="dxa"/>
+          </w:tcPr>
+          <w:p>
+            <w:pPr>
+              <w:spacing w:after="0" w:line="240" w:lineRule="auto"/>
               <w:jc w:val="center"/>
               <w:rPr>
                 <w:rFonts w:ascii="Arial" w:eastAsiaTheme="minorHAnsi" w:hAnsi="Arial" w:cs="Arial"/>
@@ -982,20 +1238,22 @@
           </w:tcPr>
           <w:p>
             <w:pPr>
-              <w:jc w:val="center"/>
-              <w:rPr>
-                <w:rFonts w:ascii="Arial" w:eastAsiaTheme="minorHAnsi" w:hAnsi="Arial" w:cs="Arial"/>
-                <w:sz w:val="24"/>
-              </w:rPr>
-            </w:pPr>
-          </w:p>
-        </w:tc>
-        <w:tc>
-          <w:tcPr>
-            <w:tcW w:w="5395" w:type="dxa"/>
-          </w:tcPr>
-          <w:p>
-            <w:pPr>
+              <w:spacing w:after="0" w:line="240" w:lineRule="auto"/>
+              <w:jc w:val="center"/>
+              <w:rPr>
+                <w:rFonts w:ascii="Arial" w:eastAsiaTheme="minorHAnsi" w:hAnsi="Arial" w:cs="Arial"/>
+                <w:sz w:val="24"/>
+              </w:rPr>
+            </w:pPr>
+          </w:p>
+        </w:tc>
+        <w:tc>
+          <w:tcPr>
+            <w:tcW w:w="5395" w:type="dxa"/>
+          </w:tcPr>
+          <w:p>
+            <w:pPr>
+              <w:spacing w:after="0" w:line="240" w:lineRule="auto"/>
               <w:jc w:val="center"/>
               <w:rPr>
                 <w:rFonts w:ascii="Arial" w:eastAsiaTheme="minorHAnsi" w:hAnsi="Arial" w:cs="Arial"/>
@@ -1028,8 +1286,6 @@
         </w:rPr>
         <w:t xml:space="preserve">    </w:t>
       </w:r>
-      <w:bookmarkStart w:id="0" w:name="_GoBack"/>
-      <w:bookmarkEnd w:id="0"/>
     </w:p>
     <w:sectPr>
       <w:pgSz w:w="12240" w:h="15840"/>
@@ -1041,24 +1297,68 @@
 </w:document>
 </file>
 
+<file path=word/endnotes.xml><?xml version="1.0" encoding="utf-8"?>
+<w:endnotes xmlns:wpc="http://schemas.microsoft.com/office/word/2010/wordprocessingCanvas" xmlns:cx="http://schemas.microsoft.com/office/drawing/2014/chartex" xmlns:cx1="http://schemas.microsoft.com/office/drawing/2015/9/8/chartex" xmlns:cx2="http://schemas.microsoft.com/office/drawing/2015/10/21/chartex" xmlns:cx3="http://schemas.microsoft.com/office/drawing/2016/5/9/chartex" xmlns:cx4="http://schemas.microsoft.com/office/drawing/2016/5/10/chartex" xmlns:cx5="http://schemas.microsoft.com/office/drawing/2016/5/11/chartex" xmlns:cx6="http://schemas.microsoft.com/office/drawing/2016/5/12/chartex" xmlns:cx7="http://schemas.microsoft.com/office/drawing/2016/5/13/chartex" xmlns:cx8="http://schemas.microsoft.com/office/drawing/2016/5/14/chartex" xmlns:mc="http://schemas.openxmlformats.org/markup-compatibility/2006" xmlns:aink="http://schemas.microsoft.com/office/drawing/2016/ink" xmlns:am3d="http://schemas.microsoft.com/office/drawing/2017/model3d" xmlns:o="urn:schemas-microsoft-com:office:office" xmlns:oel="http://schemas.microsoft.com/office/2019/extlst" xmlns:r="http://schemas.openxmlformats.org/officeDocument/2006/relationships" xmlns:m="http://schemas.openxmlformats.org/officeDocument/2006/math" xmlns:v="urn:schemas-microsoft-com:vml" xmlns:wp14="http://schemas.microsoft.com/office/word/2010/wordprocessingDrawing" xmlns:wp="http://schemas.openxmlformats.org/drawingml/2006/wordprocessingDrawing" xmlns:w10="urn:schemas-microsoft-com:office:word" xmlns:w="http://schemas.openxmlformats.org/wordprocessingml/2006/main" xmlns:w14="http://schemas.microsoft.com/office/word/2010/wordml" xmlns:w15="http://schemas.microsoft.com/office/word/2012/wordml" xmlns:w16cex="http://schemas.microsoft.com/office/word/2018/wordml/cex" xmlns:w16cid="http://schemas.microsoft.com/office/word/2016/wordml/cid" xmlns:w16="http://schemas.microsoft.com/office/word/2018/wordml" xmlns:w16du="http://schemas.microsoft.com/office/word/2023/wordml/word16du" xmlns:w16sdtdh="http://schemas.microsoft.com/office/word/2020/wordml/sdtdatahash" xmlns:w16sdtfl="http://schemas.microsoft.com/office/word/2024/wordml/sdtformatlock" xmlns:w16se="http://schemas.microsoft.com/office/word/2015/wordml/symex" xmlns:wpg="http://schemas.microsoft.com/office/word/2010/wordprocessingGroup" xmlns:wpi="http://schemas.microsoft.com/office/word/2010/wordprocessingInk" xmlns:wne="http://schemas.microsoft.com/office/word/2006/wordml" xmlns:wps="http://schemas.microsoft.com/office/word/2010/wordprocessingShape" mc:Ignorable="w14 w15 w16se w16cid w16 w16cex w16sdtdh w16sdtfl w16du wp14">
+  <w:endnote w:type="separator" w:id="-1">
+    <w:p>
+      <w:pPr>
+        <w:spacing w:line="240" w:lineRule="auto"/>
+      </w:pPr>
+      <w:r>
+        <w:separator/>
+      </w:r>
+    </w:p>
+  </w:endnote>
+  <w:endnote w:type="continuationSeparator" w:id="0">
+    <w:p>
+      <w:pPr>
+        <w:spacing w:line="240" w:lineRule="auto"/>
+      </w:pPr>
+      <w:r>
+        <w:continuationSeparator/>
+      </w:r>
+    </w:p>
+  </w:endnote>
+</w:endnotes>
+</file>
+
+<file path=word/footnotes.xml><?xml version="1.0" encoding="utf-8"?>
+<w:footnotes xmlns:wpc="http://schemas.microsoft.com/office/word/2010/wordprocessingCanvas" xmlns:cx="http://schemas.microsoft.com/office/drawing/2014/chartex" xmlns:cx1="http://schemas.microsoft.com/office/drawing/2015/9/8/chartex" xmlns:cx2="http://schemas.microsoft.com/office/drawing/2015/10/21/chartex" xmlns:cx3="http://schemas.microsoft.com/office/drawing/2016/5/9/chartex" xmlns:cx4="http://schemas.microsoft.com/office/drawing/2016/5/10/chartex" xmlns:cx5="http://schemas.microsoft.com/office/drawing/2016/5/11/chartex" xmlns:cx6="http://schemas.microsoft.com/office/drawing/2016/5/12/chartex" xmlns:cx7="http://schemas.microsoft.com/office/drawing/2016/5/13/chartex" xmlns:cx8="http://schemas.microsoft.com/office/drawing/2016/5/14/chartex" xmlns:mc="http://schemas.openxmlformats.org/markup-compatibility/2006" xmlns:aink="http://schemas.microsoft.com/office/drawing/2016/ink" xmlns:am3d="http://schemas.microsoft.com/office/drawing/2017/model3d" xmlns:o="urn:schemas-microsoft-com:office:office" xmlns:oel="http://schemas.microsoft.com/office/2019/extlst" xmlns:r="http://schemas.openxmlformats.org/officeDocument/2006/relationships" xmlns:m="http://schemas.openxmlformats.org/officeDocument/2006/math" xmlns:v="urn:schemas-microsoft-com:vml" xmlns:wp14="http://schemas.microsoft.com/office/word/2010/wordprocessingDrawing" xmlns:wp="http://schemas.openxmlformats.org/drawingml/2006/wordprocessingDrawing" xmlns:w10="urn:schemas-microsoft-com:office:word" xmlns:w="http://schemas.openxmlformats.org/wordprocessingml/2006/main" xmlns:w14="http://schemas.microsoft.com/office/word/2010/wordml" xmlns:w15="http://schemas.microsoft.com/office/word/2012/wordml" xmlns:w16cex="http://schemas.microsoft.com/office/word/2018/wordml/cex" xmlns:w16cid="http://schemas.microsoft.com/office/word/2016/wordml/cid" xmlns:w16="http://schemas.microsoft.com/office/word/2018/wordml" xmlns:w16du="http://schemas.microsoft.com/office/word/2023/wordml/word16du" xmlns:w16sdtdh="http://schemas.microsoft.com/office/word/2020/wordml/sdtdatahash" xmlns:w16sdtfl="http://schemas.microsoft.com/office/word/2024/wordml/sdtformatlock" xmlns:w16se="http://schemas.microsoft.com/office/word/2015/wordml/symex" xmlns:wpg="http://schemas.microsoft.com/office/word/2010/wordprocessingGroup" xmlns:wpi="http://schemas.microsoft.com/office/word/2010/wordprocessingInk" xmlns:wne="http://schemas.microsoft.com/office/word/2006/wordml" xmlns:wps="http://schemas.microsoft.com/office/word/2010/wordprocessingShape" mc:Ignorable="w14 w15 w16se w16cid w16 w16cex w16sdtdh w16sdtfl w16du wp14">
+  <w:footnote w:type="separator" w:id="-1">
+    <w:p>
+      <w:pPr>
+        <w:spacing w:after="0"/>
+      </w:pPr>
+      <w:r>
+        <w:separator/>
+      </w:r>
+    </w:p>
+  </w:footnote>
+  <w:footnote w:type="continuationSeparator" w:id="0">
+    <w:p>
+      <w:pPr>
+        <w:spacing w:after="0"/>
+      </w:pPr>
+      <w:r>
+        <w:continuationSeparator/>
+      </w:r>
+    </w:p>
+  </w:footnote>
+</w:footnotes>
+</file>
+
 <file path=word/styles.xml><?xml version="1.0" encoding="utf-8"?>
-<w:styles xmlns:mc="http://schemas.openxmlformats.org/markup-compatibility/2006" xmlns:r="http://schemas.openxmlformats.org/officeDocument/2006/relationships" xmlns:w="http://schemas.openxmlformats.org/wordprocessingml/2006/main" xmlns:w14="http://schemas.microsoft.com/office/word/2010/wordml" xmlns:w15="http://schemas.microsoft.com/office/word/2012/wordml" xmlns:w16se="http://schemas.microsoft.com/office/word/2015/wordml/symex" mc:Ignorable="w14 w15 w16se">
+<w:styles xmlns:mc="http://schemas.openxmlformats.org/markup-compatibility/2006" xmlns:r="http://schemas.openxmlformats.org/officeDocument/2006/relationships" xmlns:w="http://schemas.openxmlformats.org/wordprocessingml/2006/main" xmlns:w14="http://schemas.microsoft.com/office/word/2010/wordml" xmlns:w15="http://schemas.microsoft.com/office/word/2012/wordml" xmlns:w16cex="http://schemas.microsoft.com/office/word/2018/wordml/cex" xmlns:w16cid="http://schemas.microsoft.com/office/word/2016/wordml/cid" xmlns:w16="http://schemas.microsoft.com/office/word/2018/wordml" xmlns:w16du="http://schemas.microsoft.com/office/word/2023/wordml/word16du" xmlns:w16sdtdh="http://schemas.microsoft.com/office/word/2020/wordml/sdtdatahash" xmlns:w16sdtfl="http://schemas.microsoft.com/office/word/2024/wordml/sdtformatlock" xmlns:w16se="http://schemas.microsoft.com/office/word/2015/wordml/symex" mc:Ignorable="w14 w15 w16se w16cid w16 w16cex w16sdtdh w16sdtfl w16du">
   <w:docDefaults>
     <w:rPrDefault>
       <w:rPr>
         <w:rFonts w:asciiTheme="minorHAnsi" w:eastAsiaTheme="minorHAnsi" w:hAnsiTheme="minorHAnsi" w:cstheme="minorBidi"/>
-        <w:sz w:val="22"/>
-        <w:szCs w:val="22"/>
-        <w:lang w:val="es-GT" w:eastAsia="en-US" w:bidi="ar-SA"/>
+        <w:lang w:val="es-MX" w:eastAsia="es-MX" w:bidi="ar-SA"/>
       </w:rPr>
     </w:rPrDefault>
-    <w:pPrDefault>
-      <w:pPr>
-        <w:spacing w:after="160" w:line="259" w:lineRule="auto"/>
-      </w:pPr>
-    </w:pPrDefault>
+    <w:pPrDefault/>
   </w:docDefaults>
-  <w:latentStyles w:defLockedState="0" w:defUIPriority="99" w:defSemiHidden="0" w:defUnhideWhenUsed="0" w:defQFormat="0" w:count="371">
+  <w:latentStyles w:defLockedState="0" w:defUIPriority="99" w:defSemiHidden="0" w:defUnhideWhenUsed="0" w:defQFormat="0" w:count="376">
     <w:lsdException w:name="Normal" w:uiPriority="0" w:qFormat="1"/>
     <w:lsdException w:name="heading 1" w:uiPriority="9" w:qFormat="1"/>
     <w:lsdException w:name="heading 2" w:semiHidden="1" w:uiPriority="9" w:unhideWhenUsed="1" w:qFormat="1"/>
@@ -1089,7 +1389,7 @@
     <w:lsdException w:name="toc 9" w:semiHidden="1" w:uiPriority="39" w:unhideWhenUsed="1"/>
     <w:lsdException w:name="Normal Indent" w:semiHidden="1" w:unhideWhenUsed="1"/>
     <w:lsdException w:name="footnote text" w:semiHidden="1" w:unhideWhenUsed="1"/>
-    <w:lsdException w:name="annotation text" w:semiHidden="1" w:unhideWhenUsed="1"/>
+    <w:lsdException w:name="annotation text" w:semiHidden="1" w:unhideWhenUsed="1" w:qFormat="1"/>
     <w:lsdException w:name="header" w:semiHidden="1" w:unhideWhenUsed="1"/>
     <w:lsdException w:name="footer" w:semiHidden="1" w:unhideWhenUsed="1"/>
     <w:lsdException w:name="index heading" w:semiHidden="1" w:unhideWhenUsed="1"/>
@@ -1153,7 +1453,7 @@
     <w:lsdException w:name="E-mail Signature" w:semiHidden="1" w:unhideWhenUsed="1"/>
     <w:lsdException w:name="HTML Top of Form" w:semiHidden="1" w:unhideWhenUsed="1"/>
     <w:lsdException w:name="HTML Bottom of Form" w:semiHidden="1" w:unhideWhenUsed="1"/>
-    <w:lsdException w:name="Normal (Web)" w:semiHidden="1" w:unhideWhenUsed="1"/>
+    <w:lsdException w:name="Normal (Web)" w:semiHidden="1" w:unhideWhenUsed="1" w:qFormat="1"/>
     <w:lsdException w:name="HTML Acronym" w:semiHidden="1" w:unhideWhenUsed="1"/>
     <w:lsdException w:name="HTML Address" w:semiHidden="1" w:unhideWhenUsed="1"/>
     <w:lsdException w:name="HTML Cite" w:semiHidden="1" w:unhideWhenUsed="1"/>
@@ -1164,8 +1464,8 @@
     <w:lsdException w:name="HTML Sample" w:semiHidden="1" w:unhideWhenUsed="1"/>
     <w:lsdException w:name="HTML Typewriter" w:semiHidden="1" w:unhideWhenUsed="1"/>
     <w:lsdException w:name="HTML Variable" w:semiHidden="1" w:unhideWhenUsed="1"/>
-    <w:lsdException w:name="Normal Table" w:semiHidden="1" w:unhideWhenUsed="1"/>
-    <w:lsdException w:name="annotation subject" w:semiHidden="1" w:unhideWhenUsed="1"/>
+    <w:lsdException w:name="Normal Table" w:semiHidden="1" w:unhideWhenUsed="1" w:qFormat="1"/>
+    <w:lsdException w:name="annotation subject" w:semiHidden="1" w:unhideWhenUsed="1" w:qFormat="1"/>
     <w:lsdException w:name="No List" w:semiHidden="1" w:unhideWhenUsed="1"/>
     <w:lsdException w:name="Outline List 1" w:semiHidden="1" w:unhideWhenUsed="1"/>
     <w:lsdException w:name="Outline List 2" w:semiHidden="1" w:unhideWhenUsed="1"/>
@@ -1212,113 +1512,113 @@
     <w:lsdException w:name="Table Web 1" w:semiHidden="1" w:unhideWhenUsed="1"/>
     <w:lsdException w:name="Table Web 2" w:semiHidden="1" w:unhideWhenUsed="1"/>
     <w:lsdException w:name="Table Web 3" w:semiHidden="1" w:unhideWhenUsed="1"/>
-    <w:lsdException w:name="Balloon Text" w:semiHidden="1" w:unhideWhenUsed="1"/>
-    <w:lsdException w:name="Table Grid" w:uiPriority="39"/>
+    <w:lsdException w:name="Balloon Text" w:semiHidden="1" w:unhideWhenUsed="1" w:qFormat="1"/>
+    <w:lsdException w:name="Table Grid" w:uiPriority="39" w:qFormat="1"/>
     <w:lsdException w:name="Table Theme" w:semiHidden="1" w:unhideWhenUsed="1"/>
-    <w:lsdException w:name="Placeholder Text" w:semiHidden="1"/>
+    <w:lsdException w:name="Placeholder Text" w:semiHidden="1" w:unhideWhenUsed="1"/>
     <w:lsdException w:name="No Spacing" w:uiPriority="1" w:qFormat="1"/>
-    <w:lsdException w:name="Light Shading" w:uiPriority="60"/>
-    <w:lsdException w:name="Light List" w:uiPriority="61"/>
-    <w:lsdException w:name="Light Grid" w:uiPriority="62"/>
-    <w:lsdException w:name="Medium Shading 1" w:uiPriority="63"/>
-    <w:lsdException w:name="Medium Shading 2" w:uiPriority="64"/>
-    <w:lsdException w:name="Medium List 1" w:uiPriority="65"/>
-    <w:lsdException w:name="Medium List 2" w:uiPriority="66"/>
-    <w:lsdException w:name="Medium Grid 1" w:uiPriority="67"/>
-    <w:lsdException w:name="Medium Grid 2" w:uiPriority="68"/>
-    <w:lsdException w:name="Medium Grid 3" w:uiPriority="69"/>
-    <w:lsdException w:name="Dark List" w:uiPriority="70"/>
-    <w:lsdException w:name="Colorful Shading" w:uiPriority="71"/>
-    <w:lsdException w:name="Colorful List" w:uiPriority="72"/>
-    <w:lsdException w:name="Colorful Grid" w:uiPriority="73"/>
-    <w:lsdException w:name="Light Shading Accent 1" w:uiPriority="60"/>
-    <w:lsdException w:name="Light List Accent 1" w:uiPriority="61"/>
-    <w:lsdException w:name="Light Grid Accent 1" w:uiPriority="62"/>
-    <w:lsdException w:name="Medium Shading 1 Accent 1" w:uiPriority="63"/>
-    <w:lsdException w:name="Medium Shading 2 Accent 1" w:uiPriority="64"/>
-    <w:lsdException w:name="Medium List 1 Accent 1" w:uiPriority="65"/>
-    <w:lsdException w:name="Revision" w:semiHidden="1"/>
-    <w:lsdException w:name="List Paragraph" w:uiPriority="34" w:qFormat="1"/>
-    <w:lsdException w:name="Quote" w:uiPriority="29" w:qFormat="1"/>
-    <w:lsdException w:name="Intense Quote" w:uiPriority="30" w:qFormat="1"/>
-    <w:lsdException w:name="Medium List 2 Accent 1" w:uiPriority="66"/>
-    <w:lsdException w:name="Medium Grid 1 Accent 1" w:uiPriority="67"/>
-    <w:lsdException w:name="Medium Grid 2 Accent 1" w:uiPriority="68"/>
-    <w:lsdException w:name="Medium Grid 3 Accent 1" w:uiPriority="69"/>
-    <w:lsdException w:name="Dark List Accent 1" w:uiPriority="70"/>
-    <w:lsdException w:name="Colorful Shading Accent 1" w:uiPriority="71"/>
-    <w:lsdException w:name="Colorful List Accent 1" w:uiPriority="72"/>
-    <w:lsdException w:name="Colorful Grid Accent 1" w:uiPriority="73"/>
-    <w:lsdException w:name="Light Shading Accent 2" w:uiPriority="60"/>
-    <w:lsdException w:name="Light List Accent 2" w:uiPriority="61"/>
-    <w:lsdException w:name="Light Grid Accent 2" w:uiPriority="62"/>
-    <w:lsdException w:name="Medium Shading 1 Accent 2" w:uiPriority="63"/>
-    <w:lsdException w:name="Medium Shading 2 Accent 2" w:uiPriority="64"/>
-    <w:lsdException w:name="Medium List 1 Accent 2" w:uiPriority="65"/>
-    <w:lsdException w:name="Medium List 2 Accent 2" w:uiPriority="66"/>
-    <w:lsdException w:name="Medium Grid 1 Accent 2" w:uiPriority="67"/>
-    <w:lsdException w:name="Medium Grid 2 Accent 2" w:uiPriority="68"/>
-    <w:lsdException w:name="Medium Grid 3 Accent 2" w:uiPriority="69"/>
-    <w:lsdException w:name="Dark List Accent 2" w:uiPriority="70"/>
-    <w:lsdException w:name="Colorful Shading Accent 2" w:uiPriority="71"/>
-    <w:lsdException w:name="Colorful List Accent 2" w:uiPriority="72"/>
-    <w:lsdException w:name="Colorful Grid Accent 2" w:uiPriority="73"/>
-    <w:lsdException w:name="Light Shading Accent 3" w:uiPriority="60"/>
-    <w:lsdException w:name="Light List Accent 3" w:uiPriority="61"/>
-    <w:lsdException w:name="Light Grid Accent 3" w:uiPriority="62"/>
-    <w:lsdException w:name="Medium Shading 1 Accent 3" w:uiPriority="63"/>
-    <w:lsdException w:name="Medium Shading 2 Accent 3" w:uiPriority="64"/>
-    <w:lsdException w:name="Medium List 1 Accent 3" w:uiPriority="65"/>
-    <w:lsdException w:name="Medium List 2 Accent 3" w:uiPriority="66"/>
-    <w:lsdException w:name="Medium Grid 1 Accent 3" w:uiPriority="67"/>
-    <w:lsdException w:name="Medium Grid 2 Accent 3" w:uiPriority="68"/>
-    <w:lsdException w:name="Medium Grid 3 Accent 3" w:uiPriority="69"/>
-    <w:lsdException w:name="Dark List Accent 3" w:uiPriority="70"/>
-    <w:lsdException w:name="Colorful Shading Accent 3" w:uiPriority="71"/>
-    <w:lsdException w:name="Colorful List Accent 3" w:uiPriority="72"/>
-    <w:lsdException w:name="Colorful Grid Accent 3" w:uiPriority="73"/>
-    <w:lsdException w:name="Light Shading Accent 4" w:uiPriority="60"/>
-    <w:lsdException w:name="Light List Accent 4" w:uiPriority="61"/>
-    <w:lsdException w:name="Light Grid Accent 4" w:uiPriority="62"/>
-    <w:lsdException w:name="Medium Shading 1 Accent 4" w:uiPriority="63"/>
-    <w:lsdException w:name="Medium Shading 2 Accent 4" w:uiPriority="64"/>
-    <w:lsdException w:name="Medium List 1 Accent 4" w:uiPriority="65"/>
-    <w:lsdException w:name="Medium List 2 Accent 4" w:uiPriority="66"/>
-    <w:lsdException w:name="Medium Grid 1 Accent 4" w:uiPriority="67"/>
-    <w:lsdException w:name="Medium Grid 2 Accent 4" w:uiPriority="68"/>
-    <w:lsdException w:name="Medium Grid 3 Accent 4" w:uiPriority="69"/>
-    <w:lsdException w:name="Dark List Accent 4" w:uiPriority="70"/>
-    <w:lsdException w:name="Colorful Shading Accent 4" w:uiPriority="71"/>
-    <w:lsdException w:name="Colorful List Accent 4" w:uiPriority="72"/>
-    <w:lsdException w:name="Colorful Grid Accent 4" w:uiPriority="73"/>
-    <w:lsdException w:name="Light Shading Accent 5" w:uiPriority="60"/>
-    <w:lsdException w:name="Light List Accent 5" w:uiPriority="61"/>
-    <w:lsdException w:name="Light Grid Accent 5" w:uiPriority="62"/>
-    <w:lsdException w:name="Medium Shading 1 Accent 5" w:uiPriority="63"/>
-    <w:lsdException w:name="Medium Shading 2 Accent 5" w:uiPriority="64"/>
-    <w:lsdException w:name="Medium List 1 Accent 5" w:uiPriority="65"/>
-    <w:lsdException w:name="Medium List 2 Accent 5" w:uiPriority="66"/>
-    <w:lsdException w:name="Medium Grid 1 Accent 5" w:uiPriority="67"/>
-    <w:lsdException w:name="Medium Grid 2 Accent 5" w:uiPriority="68"/>
-    <w:lsdException w:name="Medium Grid 3 Accent 5" w:uiPriority="69"/>
-    <w:lsdException w:name="Dark List Accent 5" w:uiPriority="70"/>
-    <w:lsdException w:name="Colorful Shading Accent 5" w:uiPriority="71"/>
-    <w:lsdException w:name="Colorful List Accent 5" w:uiPriority="72"/>
-    <w:lsdException w:name="Colorful Grid Accent 5" w:uiPriority="73"/>
-    <w:lsdException w:name="Light Shading Accent 6" w:uiPriority="60"/>
-    <w:lsdException w:name="Light List Accent 6" w:uiPriority="61"/>
-    <w:lsdException w:name="Light Grid Accent 6" w:uiPriority="62"/>
-    <w:lsdException w:name="Medium Shading 1 Accent 6" w:uiPriority="63"/>
-    <w:lsdException w:name="Medium Shading 2 Accent 6" w:uiPriority="64"/>
-    <w:lsdException w:name="Medium List 1 Accent 6" w:uiPriority="65"/>
-    <w:lsdException w:name="Medium List 2 Accent 6" w:uiPriority="66"/>
-    <w:lsdException w:name="Medium Grid 1 Accent 6" w:uiPriority="67"/>
-    <w:lsdException w:name="Medium Grid 2 Accent 6" w:uiPriority="68"/>
-    <w:lsdException w:name="Medium Grid 3 Accent 6" w:uiPriority="69"/>
-    <w:lsdException w:name="Dark List Accent 6" w:uiPriority="70"/>
-    <w:lsdException w:name="Colorful Shading Accent 6" w:uiPriority="71"/>
-    <w:lsdException w:name="Colorful List Accent 6" w:uiPriority="72"/>
-    <w:lsdException w:name="Colorful Grid Accent 6" w:uiPriority="73"/>
+    <w:lsdException w:name="Light Shading"/>
+    <w:lsdException w:name="Light List"/>
+    <w:lsdException w:name="Light Grid"/>
+    <w:lsdException w:name="Medium Shading 1"/>
+    <w:lsdException w:name="Medium Shading 2"/>
+    <w:lsdException w:name="Medium List 1"/>
+    <w:lsdException w:name="Medium List 2"/>
+    <w:lsdException w:name="Medium Grid 1"/>
+    <w:lsdException w:name="Medium Grid 2"/>
+    <w:lsdException w:name="Medium Grid 3"/>
+    <w:lsdException w:name="Dark List"/>
+    <w:lsdException w:name="Colorful Shading"/>
+    <w:lsdException w:name="Colorful List"/>
+    <w:lsdException w:name="Colorful Grid"/>
+    <w:lsdException w:name="Light Shading Accent 1"/>
+    <w:lsdException w:name="Light List Accent 1"/>
+    <w:lsdException w:name="Light Grid Accent 1"/>
+    <w:lsdException w:name="Medium Shading 1 Accent 1"/>
+    <w:lsdException w:name="Medium Shading 2 Accent 1"/>
+    <w:lsdException w:name="Medium List 1 Accent 1"/>
+    <w:lsdException w:name="Revision" w:semiHidden="1" w:unhideWhenUsed="1"/>
+    <w:lsdException w:name="List Paragraph" w:semiHidden="1" w:unhideWhenUsed="1"/>
+    <w:lsdException w:name="Quote" w:semiHidden="1" w:unhideWhenUsed="1"/>
+    <w:lsdException w:name="Intense Quote" w:semiHidden="1" w:unhideWhenUsed="1"/>
+    <w:lsdException w:name="Medium List 2 Accent 1"/>
+    <w:lsdException w:name="Medium Grid 1 Accent 1"/>
+    <w:lsdException w:name="Medium Grid 2 Accent 1"/>
+    <w:lsdException w:name="Medium Grid 3 Accent 1"/>
+    <w:lsdException w:name="Dark List Accent 1"/>
+    <w:lsdException w:name="Colorful Shading Accent 1"/>
+    <w:lsdException w:name="Colorful List Accent 1"/>
+    <w:lsdException w:name="Colorful Grid Accent 1"/>
+    <w:lsdException w:name="Light Shading Accent 2"/>
+    <w:lsdException w:name="Light List Accent 2"/>
+    <w:lsdException w:name="Light Grid Accent 2"/>
+    <w:lsdException w:name="Medium Shading 1 Accent 2"/>
+    <w:lsdException w:name="Medium Shading 2 Accent 2"/>
+    <w:lsdException w:name="Medium List 1 Accent 2"/>
+    <w:lsdException w:name="Medium List 2 Accent 2"/>
+    <w:lsdException w:name="Medium Grid 1 Accent 2"/>
+    <w:lsdException w:name="Medium Grid 2 Accent 2"/>
+    <w:lsdException w:name="Medium Grid 3 Accent 2"/>
+    <w:lsdException w:name="Dark List Accent 2"/>
+    <w:lsdException w:name="Colorful Shading Accent 2"/>
+    <w:lsdException w:name="Colorful List Accent 2"/>
+    <w:lsdException w:name="Colorful Grid Accent 2"/>
+    <w:lsdException w:name="Light Shading Accent 3"/>
+    <w:lsdException w:name="Light List Accent 3"/>
+    <w:lsdException w:name="Light Grid Accent 3"/>
+    <w:lsdException w:name="Medium Shading 1 Accent 3"/>
+    <w:lsdException w:name="Medium Shading 2 Accent 3"/>
+    <w:lsdException w:name="Medium List 1 Accent 3"/>
+    <w:lsdException w:name="Medium List 2 Accent 3"/>
+    <w:lsdException w:name="Medium Grid 1 Accent 3"/>
+    <w:lsdException w:name="Medium Grid 2 Accent 3"/>
+    <w:lsdException w:name="Medium Grid 3 Accent 3"/>
+    <w:lsdException w:name="Dark List Accent 3"/>
+    <w:lsdException w:name="Colorful Shading Accent 3"/>
+    <w:lsdException w:name="Colorful List Accent 3"/>
+    <w:lsdException w:name="Colorful Grid Accent 3"/>
+    <w:lsdException w:name="Light Shading Accent 4"/>
+    <w:lsdException w:name="Light List Accent 4"/>
+    <w:lsdException w:name="Light Grid Accent 4"/>
+    <w:lsdException w:name="Medium Shading 1 Accent 4"/>
+    <w:lsdException w:name="Medium Shading 2 Accent 4"/>
+    <w:lsdException w:name="Medium List 1 Accent 4"/>
+    <w:lsdException w:name="Medium List 2 Accent 4"/>
+    <w:lsdException w:name="Medium Grid 1 Accent 4"/>
+    <w:lsdException w:name="Medium Grid 2 Accent 4"/>
+    <w:lsdException w:name="Medium Grid 3 Accent 4"/>
+    <w:lsdException w:name="Dark List Accent 4"/>
+    <w:lsdException w:name="Colorful Shading Accent 4"/>
+    <w:lsdException w:name="Colorful List Accent 4"/>
+    <w:lsdException w:name="Colorful Grid Accent 4"/>
+    <w:lsdException w:name="Light Shading Accent 5"/>
+    <w:lsdException w:name="Light List Accent 5"/>
+    <w:lsdException w:name="Light Grid Accent 5"/>
+    <w:lsdException w:name="Medium Shading 1 Accent 5"/>
+    <w:lsdException w:name="Medium Shading 2 Accent 5"/>
+    <w:lsdException w:name="Medium List 1 Accent 5"/>
+    <w:lsdException w:name="Medium List 2 Accent 5"/>
+    <w:lsdException w:name="Medium Grid 1 Accent 5"/>
+    <w:lsdException w:name="Medium Grid 2 Accent 5"/>
+    <w:lsdException w:name="Medium Grid 3 Accent 5"/>
+    <w:lsdException w:name="Dark List Accent 5"/>
+    <w:lsdException w:name="Colorful Shading Accent 5"/>
+    <w:lsdException w:name="Colorful List Accent 5"/>
+    <w:lsdException w:name="Colorful Grid Accent 5"/>
+    <w:lsdException w:name="Light Shading Accent 6"/>
+    <w:lsdException w:name="Light List Accent 6"/>
+    <w:lsdException w:name="Light Grid Accent 6"/>
+    <w:lsdException w:name="Medium Shading 1 Accent 6"/>
+    <w:lsdException w:name="Medium Shading 2 Accent 6"/>
+    <w:lsdException w:name="Medium List 1 Accent 6"/>
+    <w:lsdException w:name="Medium List 2 Accent 6"/>
+    <w:lsdException w:name="Medium Grid 1 Accent 6"/>
+    <w:lsdException w:name="Medium Grid 2 Accent 6"/>
+    <w:lsdException w:name="Medium Grid 3 Accent 6"/>
+    <w:lsdException w:name="Dark List Accent 6"/>
+    <w:lsdException w:name="Colorful Shading Accent 6"/>
+    <w:lsdException w:name="Colorful List Accent 6"/>
+    <w:lsdException w:name="Colorful Grid Accent 6"/>
     <w:lsdException w:name="Subtle Emphasis" w:uiPriority="19" w:qFormat="1"/>
     <w:lsdException w:name="Intense Emphasis" w:uiPriority="21" w:qFormat="1"/>
     <w:lsdException w:name="Subtle Reference" w:uiPriority="31" w:qFormat="1"/>
@@ -1430,13 +1730,23 @@
     <w:lsdException w:name="List Table 5 Dark Accent 6" w:uiPriority="50"/>
     <w:lsdException w:name="List Table 6 Colorful Accent 6" w:uiPriority="51"/>
     <w:lsdException w:name="List Table 7 Colorful Accent 6" w:uiPriority="52"/>
+    <w:lsdException w:name="Mention" w:semiHidden="1" w:unhideWhenUsed="1"/>
+    <w:lsdException w:name="Smart Hyperlink" w:semiHidden="1" w:unhideWhenUsed="1"/>
+    <w:lsdException w:name="Hashtag" w:semiHidden="1" w:unhideWhenUsed="1"/>
+    <w:lsdException w:name="Unresolved Mention" w:semiHidden="1" w:unhideWhenUsed="1"/>
+    <w:lsdException w:name="Smart Link" w:semiHidden="1" w:unhideWhenUsed="1"/>
   </w:latentStyles>
   <w:style w:type="paragraph" w:default="1" w:styleId="Normal">
     <w:name w:val="Normal"/>
     <w:qFormat/>
-    <w:rsid w:val="00D75182"/>
+    <w:pPr>
+      <w:spacing w:after="160" w:line="259" w:lineRule="auto"/>
+    </w:pPr>
     <w:rPr>
       <w:rFonts w:eastAsia="MS Mincho"/>
+      <w:sz w:val="22"/>
+      <w:szCs w:val="22"/>
+      <w:lang w:val="es-GT" w:eastAsia="en-US"/>
     </w:rPr>
   </w:style>
   <w:style w:type="character" w:default="1" w:styleId="Fuentedeprrafopredeter">
@@ -1466,54 +1776,25 @@
     <w:semiHidden/>
     <w:unhideWhenUsed/>
   </w:style>
-  <w:style w:type="paragraph" w:styleId="Sinespaciado">
-    <w:name w:val="No Spacing"/>
-    <w:uiPriority w:val="1"/>
-    <w:qFormat/>
-    <w:rsid w:val="007B480D"/>
-    <w:pPr>
-      <w:spacing w:after="0" w:line="240" w:lineRule="auto"/>
-    </w:pPr>
-  </w:style>
   <w:style w:type="character" w:styleId="Refdecomentario">
     <w:name w:val="annotation reference"/>
     <w:basedOn w:val="Fuentedeprrafopredeter"/>
     <w:uiPriority w:val="99"/>
     <w:semiHidden/>
     <w:unhideWhenUsed/>
-    <w:rsid w:val="00EB52AC"/>
     <w:rPr>
       <w:sz w:val="16"/>
       <w:szCs w:val="16"/>
     </w:rPr>
   </w:style>
-  <w:style w:type="paragraph" w:styleId="Textocomentario">
-    <w:name w:val="annotation text"/>
-    <w:basedOn w:val="Normal"/>
-    <w:link w:val="TextocomentarioCar"/>
-    <w:uiPriority w:val="99"/>
-    <w:semiHidden/>
-    <w:unhideWhenUsed/>
-    <w:rsid w:val="00EB52AC"/>
-    <w:pPr>
-      <w:spacing w:line="240" w:lineRule="auto"/>
-    </w:pPr>
+  <w:style w:type="character" w:styleId="Textoennegrita">
+    <w:name w:val="Strong"/>
+    <w:basedOn w:val="Fuentedeprrafopredeter"/>
+    <w:uiPriority w:val="22"/>
+    <w:qFormat/>
     <w:rPr>
-      <w:sz w:val="20"/>
-      <w:szCs w:val="20"/>
-    </w:rPr>
-  </w:style>
-  <w:style w:type="character" w:customStyle="1" w:styleId="TextocomentarioCar">
-    <w:name w:val="Texto comentario Car"/>
-    <w:basedOn w:val="Fuentedeprrafopredeter"/>
-    <w:link w:val="Textocomentario"/>
-    <w:uiPriority w:val="99"/>
-    <w:semiHidden/>
-    <w:rsid w:val="00EB52AC"/>
-    <w:rPr>
-      <w:rFonts w:eastAsia="MS Mincho"/>
-      <w:sz w:val="20"/>
-      <w:szCs w:val="20"/>
+      <w:b/>
+      <w:bCs/>
     </w:rPr>
   </w:style>
   <w:style w:type="paragraph" w:styleId="Asuntodelcomentario">
@@ -1524,23 +1805,24 @@
     <w:uiPriority w:val="99"/>
     <w:semiHidden/>
     <w:unhideWhenUsed/>
-    <w:rsid w:val="00EB52AC"/>
+    <w:qFormat/>
     <w:rPr>
       <w:b/>
       <w:bCs/>
     </w:rPr>
   </w:style>
-  <w:style w:type="character" w:customStyle="1" w:styleId="AsuntodelcomentarioCar">
-    <w:name w:val="Asunto del comentario Car"/>
-    <w:basedOn w:val="TextocomentarioCar"/>
-    <w:link w:val="Asuntodelcomentario"/>
+  <w:style w:type="paragraph" w:styleId="Textocomentario">
+    <w:name w:val="annotation text"/>
+    <w:basedOn w:val="Normal"/>
+    <w:link w:val="TextocomentarioCar"/>
     <w:uiPriority w:val="99"/>
     <w:semiHidden/>
-    <w:rsid w:val="00EB52AC"/>
+    <w:unhideWhenUsed/>
+    <w:qFormat/>
+    <w:pPr>
+      <w:spacing w:line="240" w:lineRule="auto"/>
+    </w:pPr>
     <w:rPr>
-      <w:rFonts w:eastAsia="MS Mincho"/>
-      <w:b/>
-      <w:bCs/>
       <w:sz w:val="20"/>
       <w:szCs w:val="20"/>
     </w:rPr>
@@ -1552,7 +1834,7 @@
     <w:uiPriority w:val="99"/>
     <w:semiHidden/>
     <w:unhideWhenUsed/>
-    <w:rsid w:val="0005271C"/>
+    <w:qFormat/>
     <w:pPr>
       <w:spacing w:after="0" w:line="240" w:lineRule="auto"/>
     </w:pPr>
@@ -1562,32 +1844,28 @@
       <w:szCs w:val="18"/>
     </w:rPr>
   </w:style>
-  <w:style w:type="character" w:customStyle="1" w:styleId="TextodegloboCar">
-    <w:name w:val="Texto de globo Car"/>
-    <w:basedOn w:val="Fuentedeprrafopredeter"/>
-    <w:link w:val="Textodeglobo"/>
+  <w:style w:type="paragraph" w:styleId="NormalWeb">
+    <w:name w:val="Normal (Web)"/>
+    <w:basedOn w:val="Normal"/>
     <w:uiPriority w:val="99"/>
     <w:semiHidden/>
-    <w:rsid w:val="0005271C"/>
+    <w:unhideWhenUsed/>
+    <w:qFormat/>
+    <w:pPr>
+      <w:spacing w:before="100" w:beforeAutospacing="1" w:after="100" w:afterAutospacing="1" w:line="240" w:lineRule="auto"/>
+    </w:pPr>
     <w:rPr>
-      <w:rFonts w:ascii="Segoe UI" w:eastAsia="MS Mincho" w:hAnsi="Segoe UI" w:cs="Segoe UI"/>
-      <w:sz w:val="18"/>
-      <w:szCs w:val="18"/>
+      <w:rFonts w:ascii="Times New Roman" w:eastAsia="Times New Roman" w:hAnsi="Times New Roman" w:cs="Times New Roman"/>
+      <w:sz w:val="24"/>
+      <w:szCs w:val="24"/>
+      <w:lang w:eastAsia="es-GT"/>
     </w:rPr>
-  </w:style>
-  <w:style w:type="character" w:customStyle="1" w:styleId="oypena">
-    <w:name w:val="oypena"/>
-    <w:basedOn w:val="Fuentedeprrafopredeter"/>
-    <w:rsid w:val="003F5629"/>
   </w:style>
   <w:style w:type="table" w:styleId="Tablaconcuadrcula">
     <w:name w:val="Table Grid"/>
     <w:basedOn w:val="Tablanormal"/>
     <w:uiPriority w:val="39"/>
-    <w:rsid w:val="00C251FB"/>
-    <w:pPr>
-      <w:spacing w:after="0" w:line="240" w:lineRule="auto"/>
-    </w:pPr>
+    <w:qFormat/>
     <w:tblPr>
       <w:tblBorders>
         <w:top w:val="single" w:sz="4" w:space="0" w:color="auto"/>
@@ -1599,10 +1877,66 @@
       </w:tblBorders>
     </w:tblPr>
   </w:style>
+  <w:style w:type="paragraph" w:styleId="Sinespaciado">
+    <w:name w:val="No Spacing"/>
+    <w:uiPriority w:val="1"/>
+    <w:qFormat/>
+    <w:rPr>
+      <w:sz w:val="22"/>
+      <w:szCs w:val="22"/>
+      <w:lang w:val="es-GT" w:eastAsia="en-US"/>
+    </w:rPr>
+  </w:style>
+  <w:style w:type="character" w:customStyle="1" w:styleId="TextocomentarioCar">
+    <w:name w:val="Texto comentario Car"/>
+    <w:basedOn w:val="Fuentedeprrafopredeter"/>
+    <w:link w:val="Textocomentario"/>
+    <w:uiPriority w:val="99"/>
+    <w:semiHidden/>
+    <w:qFormat/>
+    <w:rPr>
+      <w:rFonts w:eastAsia="MS Mincho"/>
+      <w:sz w:val="20"/>
+      <w:szCs w:val="20"/>
+    </w:rPr>
+  </w:style>
+  <w:style w:type="character" w:customStyle="1" w:styleId="AsuntodelcomentarioCar">
+    <w:name w:val="Asunto del comentario Car"/>
+    <w:basedOn w:val="TextocomentarioCar"/>
+    <w:link w:val="Asuntodelcomentario"/>
+    <w:uiPriority w:val="99"/>
+    <w:semiHidden/>
+    <w:qFormat/>
+    <w:rPr>
+      <w:rFonts w:eastAsia="MS Mincho"/>
+      <w:b/>
+      <w:bCs/>
+      <w:sz w:val="20"/>
+      <w:szCs w:val="20"/>
+    </w:rPr>
+  </w:style>
+  <w:style w:type="character" w:customStyle="1" w:styleId="TextodegloboCar">
+    <w:name w:val="Texto de globo Car"/>
+    <w:basedOn w:val="Fuentedeprrafopredeter"/>
+    <w:link w:val="Textodeglobo"/>
+    <w:uiPriority w:val="99"/>
+    <w:semiHidden/>
+    <w:qFormat/>
+    <w:rPr>
+      <w:rFonts w:ascii="Segoe UI" w:eastAsia="MS Mincho" w:hAnsi="Segoe UI" w:cs="Segoe UI"/>
+      <w:sz w:val="18"/>
+      <w:szCs w:val="18"/>
+    </w:rPr>
+  </w:style>
+  <w:style w:type="character" w:customStyle="1" w:styleId="oypena">
+    <w:name w:val="oypena"/>
+    <w:basedOn w:val="Fuentedeprrafopredeter"/>
+    <w:qFormat/>
+  </w:style>
   <w:style w:type="paragraph" w:customStyle="1" w:styleId="paragraph">
     <w:name w:val="paragraph"/>
     <w:basedOn w:val="Normal"/>
-    <w:rsid w:val="006E1988"/>
+    <w:qFormat/>
     <w:pPr>
       <w:spacing w:before="100" w:beforeAutospacing="1" w:after="100" w:afterAutospacing="1" w:line="240" w:lineRule="auto"/>
     </w:pPr>
@@ -1616,49 +1950,21 @@
   <w:style w:type="character" w:customStyle="1" w:styleId="normaltextrun">
     <w:name w:val="normaltextrun"/>
     <w:basedOn w:val="Fuentedeprrafopredeter"/>
-    <w:rsid w:val="006E1988"/>
+    <w:qFormat/>
   </w:style>
   <w:style w:type="character" w:customStyle="1" w:styleId="eop">
     <w:name w:val="eop"/>
     <w:basedOn w:val="Fuentedeprrafopredeter"/>
-    <w:rsid w:val="006E1988"/>
-  </w:style>
-  <w:style w:type="paragraph" w:styleId="NormalWeb">
-    <w:name w:val="Normal (Web)"/>
-    <w:basedOn w:val="Normal"/>
-    <w:uiPriority w:val="99"/>
-    <w:semiHidden/>
-    <w:unhideWhenUsed/>
-    <w:rsid w:val="00B952EC"/>
-    <w:pPr>
-      <w:spacing w:before="100" w:beforeAutospacing="1" w:after="100" w:afterAutospacing="1" w:line="240" w:lineRule="auto"/>
-    </w:pPr>
-    <w:rPr>
-      <w:rFonts w:ascii="Times New Roman" w:eastAsia="Times New Roman" w:hAnsi="Times New Roman" w:cs="Times New Roman"/>
-      <w:sz w:val="24"/>
-      <w:szCs w:val="24"/>
-      <w:lang w:eastAsia="es-GT"/>
-    </w:rPr>
+    <w:qFormat/>
   </w:style>
   <w:style w:type="character" w:customStyle="1" w:styleId="cf01">
     <w:name w:val="cf01"/>
     <w:basedOn w:val="Fuentedeprrafopredeter"/>
-    <w:rsid w:val="00B952EC"/>
+    <w:qFormat/>
     <w:rPr>
       <w:rFonts w:ascii="Consolas" w:hAnsi="Consolas" w:hint="default"/>
       <w:sz w:val="22"/>
       <w:szCs w:val="22"/>
-    </w:rPr>
-  </w:style>
-  <w:style w:type="character" w:styleId="Textoennegrita">
-    <w:name w:val="Strong"/>
-    <w:basedOn w:val="Fuentedeprrafopredeter"/>
-    <w:uiPriority w:val="22"/>
-    <w:qFormat/>
-    <w:rsid w:val="0078207B"/>
-    <w:rPr>
-      <w:b/>
-      <w:bCs/>
     </w:rPr>
   </w:style>
 </w:styles>
@@ -1707,7 +2013,7 @@
     </a:clrScheme>
     <a:fontScheme name="Office">
       <a:majorFont>
-        <a:latin typeface="Calibri Light" panose="020F0302020204030204"/>
+        <a:latin typeface="Calibri Light"/>
         <a:ea typeface=""/>
         <a:cs typeface=""/>
         <a:font script="Jpan" typeface="游ゴシック Light"/>
@@ -1740,26 +2046,9 @@
         <a:font script="Viet" typeface="Times New Roman"/>
         <a:font script="Uigh" typeface="Microsoft Uighur"/>
         <a:font script="Geor" typeface="Sylfaen"/>
-        <a:font script="Armn" typeface="Arial"/>
-        <a:font script="Bugi" typeface="Leelawadee UI"/>
-        <a:font script="Bopo" typeface="Microsoft JhengHei"/>
-        <a:font script="Java" typeface="Javanese Text"/>
-        <a:font script="Lisu" typeface="Segoe UI"/>
-        <a:font script="Mymr" typeface="Myanmar Text"/>
-        <a:font script="Nkoo" typeface="Ebrima"/>
-        <a:font script="Olck" typeface="Nirmala UI"/>
-        <a:font script="Osma" typeface="Ebrima"/>
-        <a:font script="Phag" typeface="Phagspa"/>
-        <a:font script="Syrn" typeface="Estrangelo Edessa"/>
-        <a:font script="Syrj" typeface="Estrangelo Edessa"/>
-        <a:font script="Syre" typeface="Estrangelo Edessa"/>
-        <a:font script="Sora" typeface="Nirmala UI"/>
-        <a:font script="Tale" typeface="Microsoft Tai Le"/>
-        <a:font script="Talu" typeface="Microsoft New Tai Lue"/>
-        <a:font script="Tfng" typeface="Ebrima"/>
       </a:majorFont>
       <a:minorFont>
-        <a:latin typeface="Calibri" panose="020F0502020204030204"/>
+        <a:latin typeface="Calibri"/>
         <a:ea typeface=""/>
         <a:cs typeface=""/>
         <a:font script="Jpan" typeface="游明朝"/>
@@ -1792,23 +2081,6 @@
         <a:font script="Viet" typeface="Arial"/>
         <a:font script="Uigh" typeface="Microsoft Uighur"/>
         <a:font script="Geor" typeface="Sylfaen"/>
-        <a:font script="Armn" typeface="Arial"/>
-        <a:font script="Bugi" typeface="Leelawadee UI"/>
-        <a:font script="Bopo" typeface="Microsoft JhengHei"/>
-        <a:font script="Java" typeface="Javanese Text"/>
-        <a:font script="Lisu" typeface="Segoe UI"/>
-        <a:font script="Mymr" typeface="Myanmar Text"/>
-        <a:font script="Nkoo" typeface="Ebrima"/>
-        <a:font script="Olck" typeface="Nirmala UI"/>
-        <a:font script="Osma" typeface="Ebrima"/>
-        <a:font script="Phag" typeface="Phagspa"/>
-        <a:font script="Syrn" typeface="Estrangelo Edessa"/>
-        <a:font script="Syrj" typeface="Estrangelo Edessa"/>
-        <a:font script="Syre" typeface="Estrangelo Edessa"/>
-        <a:font script="Sora" typeface="Nirmala UI"/>
-        <a:font script="Tale" typeface="Microsoft Tai Le"/>
-        <a:font script="Talu" typeface="Microsoft New Tai Lue"/>
-        <a:font script="Tfng" typeface="Ebrima"/>
       </a:minorFont>
     </a:fontScheme>
     <a:fmtScheme name="Office">
@@ -1951,10 +2223,5 @@
   </a:themeElements>
   <a:objectDefaults/>
   <a:extraClrSchemeLst/>
-  <a:extLst>
-    <a:ext uri="{05A4C25C-085E-4340-85A3-A5531E510DB2}">
-      <thm15:themeFamily xmlns:thm15="http://schemas.microsoft.com/office/thememl/2012/main" name="Office Theme" id="{62F939B6-93AF-4DB8-9C6B-D6C7DFDC589F}" vid="{4A3C46E8-61CC-4603-A589-7422A47A8E4A}"/>
-    </a:ext>
-  </a:extLst>
 </a:theme>
 </file>
</xml_diff>

<commit_message>
add:Se Agrego los datos del programador agrijalva-2024337 al documento Peaceathome.docx en la rama agrijalva-2024337
</commit_message>
<xml_diff>
--- a/Peaceathome.docx
+++ b/Peaceathome.docx
@@ -1,6 +1,6 @@
 
 <file path=word/document.xml><?xml version="1.0" encoding="utf-8"?>
-<w:document xmlns:wpc="http://schemas.microsoft.com/office/word/2010/wordprocessingCanvas" xmlns:cx="http://schemas.microsoft.com/office/drawing/2014/chartex" xmlns:cx1="http://schemas.microsoft.com/office/drawing/2015/9/8/chartex" xmlns:mc="http://schemas.openxmlformats.org/markup-compatibility/2006" xmlns:o="urn:schemas-microsoft-com:office:office" xmlns:r="http://schemas.openxmlformats.org/officeDocument/2006/relationships" xmlns:m="http://schemas.openxmlformats.org/officeDocument/2006/math" xmlns:v="urn:schemas-microsoft-com:vml" xmlns:wp14="http://schemas.microsoft.com/office/word/2010/wordprocessingDrawing" xmlns:wp="http://schemas.openxmlformats.org/drawingml/2006/wordprocessingDrawing" xmlns:w10="urn:schemas-microsoft-com:office:word" xmlns:w="http://schemas.openxmlformats.org/wordprocessingml/2006/main" xmlns:w14="http://schemas.microsoft.com/office/word/2010/wordml" xmlns:w15="http://schemas.microsoft.com/office/word/2012/wordml" xmlns:w16se="http://schemas.microsoft.com/office/word/2015/wordml/symex" xmlns:wpg="http://schemas.microsoft.com/office/word/2010/wordprocessingGroup" xmlns:wpi="http://schemas.microsoft.com/office/word/2010/wordprocessingInk" xmlns:wne="http://schemas.microsoft.com/office/word/2006/wordml" xmlns:wps="http://schemas.microsoft.com/office/word/2010/wordprocessingShape" mc:Ignorable="w14 w15 w16se wp14">
+<w:document xmlns:wpc="http://schemas.microsoft.com/office/word/2010/wordprocessingCanvas" xmlns:cx="http://schemas.microsoft.com/office/drawing/2014/chartex" xmlns:cx1="http://schemas.microsoft.com/office/drawing/2015/9/8/chartex" xmlns:cx2="http://schemas.microsoft.com/office/drawing/2015/10/21/chartex" xmlns:cx3="http://schemas.microsoft.com/office/drawing/2016/5/9/chartex" xmlns:cx4="http://schemas.microsoft.com/office/drawing/2016/5/10/chartex" xmlns:cx5="http://schemas.microsoft.com/office/drawing/2016/5/11/chartex" xmlns:cx6="http://schemas.microsoft.com/office/drawing/2016/5/12/chartex" xmlns:cx7="http://schemas.microsoft.com/office/drawing/2016/5/13/chartex" xmlns:cx8="http://schemas.microsoft.com/office/drawing/2016/5/14/chartex" xmlns:mc="http://schemas.openxmlformats.org/markup-compatibility/2006" xmlns:aink="http://schemas.microsoft.com/office/drawing/2016/ink" xmlns:am3d="http://schemas.microsoft.com/office/drawing/2017/model3d" xmlns:o="urn:schemas-microsoft-com:office:office" xmlns:oel="http://schemas.microsoft.com/office/2019/extlst" xmlns:r="http://schemas.openxmlformats.org/officeDocument/2006/relationships" xmlns:m="http://schemas.openxmlformats.org/officeDocument/2006/math" xmlns:v="urn:schemas-microsoft-com:vml" xmlns:wp14="http://schemas.microsoft.com/office/word/2010/wordprocessingDrawing" xmlns:wp="http://schemas.openxmlformats.org/drawingml/2006/wordprocessingDrawing" xmlns:w10="urn:schemas-microsoft-com:office:word" xmlns:w="http://schemas.openxmlformats.org/wordprocessingml/2006/main" xmlns:w14="http://schemas.microsoft.com/office/word/2010/wordml" xmlns:w15="http://schemas.microsoft.com/office/word/2012/wordml" xmlns:w16cex="http://schemas.microsoft.com/office/word/2018/wordml/cex" xmlns:w16cid="http://schemas.microsoft.com/office/word/2016/wordml/cid" xmlns:w16="http://schemas.microsoft.com/office/word/2018/wordml" xmlns:w16sdtdh="http://schemas.microsoft.com/office/word/2020/wordml/sdtdatahash" xmlns:w16se="http://schemas.microsoft.com/office/word/2015/wordml/symex" xmlns:wpg="http://schemas.microsoft.com/office/word/2010/wordprocessingGroup" xmlns:wpi="http://schemas.microsoft.com/office/word/2010/wordprocessingInk" xmlns:wne="http://schemas.microsoft.com/office/word/2006/wordml" xmlns:wps="http://schemas.microsoft.com/office/word/2010/wordprocessingShape" mc:Ignorable="w14 w15 w16se w16cid w16 w16cex w16sdtdh wp14">
   <w:body>
     <w:p>
       <w:pPr>
@@ -16,11 +16,11 @@
           <w:rFonts w:ascii="Arial" w:hAnsi="Arial" w:cs="Arial"/>
           <w:b/>
           <w:noProof/>
-          <w:lang w:eastAsia="es-GT"/>
+          <w:lang w:val="en-US"/>
         </w:rPr>
         <w:drawing>
-          <wp:inline distT="0" distB="0" distL="0" distR="0" wp14:anchorId="61DA3BD1" wp14:editId="0C35A376">
-            <wp:extent cx="2249144" cy="847725"/>
+          <wp:inline distT="0" distB="0" distL="0" distR="0" wp14:anchorId="2FEE8166" wp14:editId="6BE70031">
+            <wp:extent cx="2248535" cy="847725"/>
             <wp:effectExtent l="0" t="0" r="0" b="0"/>
             <wp:docPr id="2" name="Imagen 2"/>
             <wp:cNvGraphicFramePr>
@@ -30,13 +30,13 @@
               <a:graphicData uri="http://schemas.openxmlformats.org/drawingml/2006/picture">
                 <pic:pic xmlns:pic="http://schemas.openxmlformats.org/drawingml/2006/picture">
                   <pic:nvPicPr>
-                    <pic:cNvPr id="0" name="Picture 1"/>
+                    <pic:cNvPr id="2" name="Imagen 2"/>
                     <pic:cNvPicPr>
                       <a:picLocks noChangeAspect="1" noChangeArrowheads="1"/>
                     </pic:cNvPicPr>
                   </pic:nvPicPr>
                   <pic:blipFill>
-                    <a:blip r:embed="rId4" cstate="print">
+                    <a:blip r:embed="rId6" cstate="print">
                       <a:extLst>
                         <a:ext uri="{28A0092B-C50C-407E-A947-70E740481C1C}">
                           <a14:useLocalDpi xmlns:a14="http://schemas.microsoft.com/office/drawing/2010/main" val="0"/>
@@ -48,7 +48,7 @@
                       <a:fillRect/>
                     </a:stretch>
                   </pic:blipFill>
-                  <pic:spPr bwMode="auto">
+                  <pic:spPr>
                     <a:xfrm>
                       <a:off x="0" y="0"/>
                       <a:ext cx="2253277" cy="849283"/>
@@ -120,13 +120,7 @@
         <w:rPr>
           <w:rFonts w:ascii="Arial" w:hAnsi="Arial" w:cs="Arial"/>
         </w:rPr>
-        <w:t>5TO. PERITO EN INFORMATICA</w:t>
-      </w:r>
-      <w:r>
-        <w:rPr>
-          <w:rFonts w:ascii="Arial" w:hAnsi="Arial" w:cs="Arial"/>
-        </w:rPr>
-        <w:t xml:space="preserve"> </w:t>
+        <w:t xml:space="preserve">5TO. PERITO EN INFORMATICA </w:t>
       </w:r>
     </w:p>
     <w:p>
@@ -507,56 +501,7 @@
           <w:rFonts w:ascii="Arial" w:hAnsi="Arial" w:cs="Arial"/>
           <w:sz w:val="24"/>
         </w:rPr>
-        <w:t xml:space="preserve">Guatemala, </w:t>
-      </w:r>
-      <w:r>
-        <w:rPr>
-          <w:rFonts w:ascii="Arial" w:hAnsi="Arial" w:cs="Arial"/>
-          <w:sz w:val="24"/>
-        </w:rPr>
-        <w:t xml:space="preserve">15 </w:t>
-      </w:r>
-      <w:r>
-        <w:rPr>
-          <w:rFonts w:ascii="Arial" w:hAnsi="Arial" w:cs="Arial"/>
-          <w:sz w:val="24"/>
-        </w:rPr>
-        <w:t xml:space="preserve">de </w:t>
-      </w:r>
-      <w:r>
-        <w:rPr>
-          <w:rFonts w:ascii="Arial" w:hAnsi="Arial" w:cs="Arial"/>
-          <w:sz w:val="24"/>
-        </w:rPr>
-        <w:t xml:space="preserve">Julio </w:t>
-      </w:r>
-      <w:r>
-        <w:rPr>
-          <w:rFonts w:ascii="Arial" w:hAnsi="Arial" w:cs="Arial"/>
-          <w:sz w:val="24"/>
-        </w:rPr>
-        <w:t>de 20</w:t>
-      </w:r>
-      <w:r>
-        <w:rPr>
-          <w:rFonts w:ascii="Arial" w:hAnsi="Arial" w:cs="Arial"/>
-          <w:sz w:val="24"/>
-        </w:rPr>
-        <w:t>2</w:t>
-      </w:r>
-      <w:r>
-        <w:rPr>
-          <w:rFonts w:ascii="Arial" w:hAnsi="Arial" w:cs="Arial"/>
-          <w:sz w:val="24"/>
-        </w:rPr>
-        <w:t>5</w:t>
-      </w:r>
-      <w:r>
-        <w:rPr>
-          <w:rFonts w:ascii="Arial" w:hAnsi="Arial" w:cs="Arial"/>
-          <w:sz w:val="24"/>
-        </w:rPr>
-        <w:t>.</w:t>
+        <w:t>Guatemala, 15 de Julio de 2025.</w:t>
       </w:r>
     </w:p>
     <w:p>
@@ -590,6 +535,7 @@
           </w:tcPr>
           <w:p>
             <w:pPr>
+              <w:spacing w:after="0" w:line="240" w:lineRule="auto"/>
               <w:jc w:val="center"/>
               <w:rPr>
                 <w:rFonts w:ascii="Arial" w:eastAsiaTheme="minorHAnsi" w:hAnsi="Arial" w:cs="Arial"/>
@@ -624,6 +570,7 @@
           </w:tcPr>
           <w:p>
             <w:pPr>
+              <w:spacing w:after="0" w:line="240" w:lineRule="auto"/>
               <w:jc w:val="center"/>
               <w:rPr>
                 <w:rFonts w:ascii="Arial" w:eastAsiaTheme="minorHAnsi" w:hAnsi="Arial" w:cs="Arial"/>
@@ -649,6 +596,7 @@
           </w:tcPr>
           <w:p>
             <w:pPr>
+              <w:spacing w:after="0" w:line="240" w:lineRule="auto"/>
               <w:jc w:val="center"/>
               <w:rPr>
                 <w:rFonts w:ascii="Arial" w:eastAsiaTheme="minorHAnsi" w:hAnsi="Arial" w:cs="Arial"/>
@@ -656,20 +604,74 @@
                 <w:lang w:val="es-ES"/>
               </w:rPr>
             </w:pPr>
-          </w:p>
-        </w:tc>
-        <w:tc>
-          <w:tcPr>
-            <w:tcW w:w="5395" w:type="dxa"/>
-          </w:tcPr>
-          <w:p>
-            <w:pPr>
-              <w:jc w:val="center"/>
-              <w:rPr>
-                <w:rFonts w:ascii="Arial" w:eastAsiaTheme="minorHAnsi" w:hAnsi="Arial" w:cs="Arial"/>
-                <w:sz w:val="24"/>
-              </w:rPr>
-            </w:pPr>
+            <w:proofErr w:type="spellStart"/>
+            <w:r>
+              <w:rPr>
+                <w:rFonts w:ascii="Arial" w:eastAsiaTheme="minorHAnsi" w:hAnsi="Arial" w:cs="Arial"/>
+                <w:sz w:val="24"/>
+                <w:lang w:val="es-ES"/>
+              </w:rPr>
+              <w:t>Kenet</w:t>
+            </w:r>
+            <w:proofErr w:type="spellEnd"/>
+            <w:r>
+              <w:rPr>
+                <w:rFonts w:ascii="Arial" w:eastAsiaTheme="minorHAnsi" w:hAnsi="Arial" w:cs="Arial"/>
+                <w:sz w:val="24"/>
+                <w:lang w:val="es-ES"/>
+              </w:rPr>
+              <w:t xml:space="preserve"> Efraín </w:t>
+            </w:r>
+            <w:proofErr w:type="spellStart"/>
+            <w:r>
+              <w:rPr>
+                <w:rFonts w:ascii="Arial" w:eastAsiaTheme="minorHAnsi" w:hAnsi="Arial" w:cs="Arial"/>
+                <w:sz w:val="24"/>
+                <w:lang w:val="es-ES"/>
+              </w:rPr>
+              <w:t>Cuyuch</w:t>
+            </w:r>
+            <w:proofErr w:type="spellEnd"/>
+            <w:r>
+              <w:rPr>
+                <w:rFonts w:ascii="Arial" w:eastAsiaTheme="minorHAnsi" w:hAnsi="Arial" w:cs="Arial"/>
+                <w:sz w:val="24"/>
+                <w:lang w:val="es-ES"/>
+              </w:rPr>
+              <w:t xml:space="preserve"> </w:t>
+            </w:r>
+            <w:proofErr w:type="spellStart"/>
+            <w:r>
+              <w:rPr>
+                <w:rFonts w:ascii="Arial" w:eastAsiaTheme="minorHAnsi" w:hAnsi="Arial" w:cs="Arial"/>
+                <w:sz w:val="24"/>
+                <w:lang w:val="es-ES"/>
+              </w:rPr>
+              <w:t>Joj</w:t>
+            </w:r>
+            <w:proofErr w:type="spellEnd"/>
+          </w:p>
+        </w:tc>
+        <w:tc>
+          <w:tcPr>
+            <w:tcW w:w="5395" w:type="dxa"/>
+          </w:tcPr>
+          <w:p>
+            <w:pPr>
+              <w:spacing w:after="0" w:line="240" w:lineRule="auto"/>
+              <w:jc w:val="center"/>
+              <w:rPr>
+                <w:rFonts w:ascii="Arial" w:eastAsiaTheme="minorHAnsi" w:hAnsi="Arial" w:cs="Arial"/>
+                <w:sz w:val="24"/>
+              </w:rPr>
+            </w:pPr>
+            <w:r>
+              <w:rPr>
+                <w:rFonts w:ascii="Arial" w:eastAsiaTheme="minorHAnsi" w:hAnsi="Arial" w:cs="Arial"/>
+                <w:sz w:val="24"/>
+              </w:rPr>
+              <w:t>Scrum Master</w:t>
+            </w:r>
           </w:p>
         </w:tc>
       </w:tr>
@@ -680,26 +682,68 @@
           </w:tcPr>
           <w:p>
             <w:pPr>
-              <w:jc w:val="center"/>
-              <w:rPr>
-                <w:rFonts w:ascii="Arial" w:eastAsiaTheme="minorHAnsi" w:hAnsi="Arial" w:cs="Arial"/>
-                <w:sz w:val="24"/>
-              </w:rPr>
-            </w:pPr>
-          </w:p>
-        </w:tc>
-        <w:tc>
-          <w:tcPr>
-            <w:tcW w:w="5395" w:type="dxa"/>
-          </w:tcPr>
-          <w:p>
-            <w:pPr>
-              <w:jc w:val="center"/>
-              <w:rPr>
-                <w:rFonts w:ascii="Arial" w:eastAsiaTheme="minorHAnsi" w:hAnsi="Arial" w:cs="Arial"/>
-                <w:sz w:val="24"/>
-              </w:rPr>
-            </w:pPr>
+              <w:spacing w:after="0" w:line="240" w:lineRule="auto"/>
+              <w:jc w:val="center"/>
+              <w:rPr>
+                <w:rFonts w:ascii="Arial" w:eastAsiaTheme="minorHAnsi" w:hAnsi="Arial" w:cs="Arial"/>
+                <w:sz w:val="24"/>
+              </w:rPr>
+            </w:pPr>
+            <w:proofErr w:type="spellStart"/>
+            <w:r>
+              <w:rPr>
+                <w:rFonts w:ascii="Arial" w:eastAsiaTheme="minorHAnsi" w:hAnsi="Arial" w:cs="Arial"/>
+                <w:sz w:val="24"/>
+              </w:rPr>
+              <w:t>Angel</w:t>
+            </w:r>
+            <w:proofErr w:type="spellEnd"/>
+            <w:r>
+              <w:rPr>
+                <w:rFonts w:ascii="Arial" w:eastAsiaTheme="minorHAnsi" w:hAnsi="Arial" w:cs="Arial"/>
+                <w:sz w:val="24"/>
+              </w:rPr>
+              <w:t xml:space="preserve"> </w:t>
+            </w:r>
+            <w:proofErr w:type="spellStart"/>
+            <w:r>
+              <w:rPr>
+                <w:rFonts w:ascii="Arial" w:eastAsiaTheme="minorHAnsi" w:hAnsi="Arial" w:cs="Arial"/>
+                <w:sz w:val="24"/>
+              </w:rPr>
+              <w:t>Gahel</w:t>
+            </w:r>
+            <w:proofErr w:type="spellEnd"/>
+            <w:r>
+              <w:rPr>
+                <w:rFonts w:ascii="Arial" w:eastAsiaTheme="minorHAnsi" w:hAnsi="Arial" w:cs="Arial"/>
+                <w:sz w:val="24"/>
+              </w:rPr>
+              <w:t xml:space="preserve"> Padilla Pacheco</w:t>
+            </w:r>
+          </w:p>
+        </w:tc>
+        <w:tc>
+          <w:tcPr>
+            <w:tcW w:w="5395" w:type="dxa"/>
+          </w:tcPr>
+          <w:p>
+            <w:pPr>
+              <w:spacing w:after="0" w:line="240" w:lineRule="auto"/>
+              <w:jc w:val="center"/>
+              <w:rPr>
+                <w:rFonts w:ascii="Arial" w:eastAsiaTheme="minorHAnsi" w:hAnsi="Arial" w:cs="Arial"/>
+                <w:sz w:val="24"/>
+                <w:u w:val="single"/>
+              </w:rPr>
+            </w:pPr>
+            <w:r>
+              <w:rPr>
+                <w:rFonts w:ascii="Arial" w:eastAsiaTheme="minorHAnsi" w:hAnsi="Arial" w:cs="Arial"/>
+                <w:sz w:val="24"/>
+              </w:rPr>
+              <w:t>Programador</w:t>
+            </w:r>
           </w:p>
         </w:tc>
       </w:tr>
@@ -710,26 +754,76 @@
           </w:tcPr>
           <w:p>
             <w:pPr>
-              <w:jc w:val="center"/>
-              <w:rPr>
-                <w:rFonts w:ascii="Arial" w:eastAsiaTheme="minorHAnsi" w:hAnsi="Arial" w:cs="Arial"/>
-                <w:sz w:val="24"/>
-              </w:rPr>
-            </w:pPr>
-          </w:p>
-        </w:tc>
-        <w:tc>
-          <w:tcPr>
-            <w:tcW w:w="5395" w:type="dxa"/>
-          </w:tcPr>
-          <w:p>
-            <w:pPr>
-              <w:jc w:val="center"/>
-              <w:rPr>
-                <w:rFonts w:ascii="Arial" w:eastAsiaTheme="minorHAnsi" w:hAnsi="Arial" w:cs="Arial"/>
-                <w:sz w:val="24"/>
-              </w:rPr>
-            </w:pPr>
+              <w:spacing w:after="0" w:line="240" w:lineRule="auto"/>
+              <w:jc w:val="center"/>
+              <w:rPr>
+                <w:rFonts w:ascii="Arial" w:eastAsiaTheme="minorHAnsi" w:hAnsi="Arial" w:cs="Arial"/>
+                <w:sz w:val="24"/>
+              </w:rPr>
+            </w:pPr>
+            <w:proofErr w:type="spellStart"/>
+            <w:r>
+              <w:rPr>
+                <w:rFonts w:ascii="Arial" w:eastAsiaTheme="minorHAnsi" w:hAnsi="Arial" w:cs="Arial"/>
+                <w:sz w:val="24"/>
+              </w:rPr>
+              <w:t>Jose</w:t>
+            </w:r>
+            <w:proofErr w:type="spellEnd"/>
+            <w:r>
+              <w:rPr>
+                <w:rFonts w:ascii="Arial" w:eastAsiaTheme="minorHAnsi" w:hAnsi="Arial" w:cs="Arial"/>
+                <w:sz w:val="24"/>
+              </w:rPr>
+              <w:t xml:space="preserve"> Enrique </w:t>
+            </w:r>
+            <w:proofErr w:type="spellStart"/>
+            <w:r>
+              <w:rPr>
+                <w:rFonts w:ascii="Arial" w:eastAsiaTheme="minorHAnsi" w:hAnsi="Arial" w:cs="Arial"/>
+                <w:sz w:val="24"/>
+              </w:rPr>
+              <w:t>cuc</w:t>
+            </w:r>
+            <w:proofErr w:type="spellEnd"/>
+            <w:r>
+              <w:rPr>
+                <w:rFonts w:ascii="Arial" w:eastAsiaTheme="minorHAnsi" w:hAnsi="Arial" w:cs="Arial"/>
+                <w:sz w:val="24"/>
+              </w:rPr>
+              <w:t xml:space="preserve"> </w:t>
+            </w:r>
+            <w:proofErr w:type="spellStart"/>
+            <w:r>
+              <w:rPr>
+                <w:rFonts w:ascii="Arial" w:eastAsiaTheme="minorHAnsi" w:hAnsi="Arial" w:cs="Arial"/>
+                <w:sz w:val="24"/>
+              </w:rPr>
+              <w:t>cutz</w:t>
+            </w:r>
+            <w:proofErr w:type="spellEnd"/>
+          </w:p>
+        </w:tc>
+        <w:tc>
+          <w:tcPr>
+            <w:tcW w:w="5395" w:type="dxa"/>
+          </w:tcPr>
+          <w:p>
+            <w:pPr>
+              <w:spacing w:after="0" w:line="240" w:lineRule="auto"/>
+              <w:jc w:val="center"/>
+              <w:rPr>
+                <w:rFonts w:ascii="Arial" w:eastAsiaTheme="minorHAnsi" w:hAnsi="Arial" w:cs="Arial"/>
+                <w:sz w:val="24"/>
+              </w:rPr>
+            </w:pPr>
+            <w:r>
+              <w:rPr>
+                <w:rFonts w:ascii="Arial" w:eastAsiaTheme="minorHAnsi" w:hAnsi="Arial" w:cs="Arial"/>
+                <w:sz w:val="24"/>
+              </w:rPr>
+              <w:t>Programador</w:t>
+            </w:r>
           </w:p>
         </w:tc>
       </w:tr>
@@ -740,26 +834,84 @@
           </w:tcPr>
           <w:p>
             <w:pPr>
-              <w:jc w:val="center"/>
-              <w:rPr>
-                <w:rFonts w:ascii="Arial" w:eastAsiaTheme="minorHAnsi" w:hAnsi="Arial" w:cs="Arial"/>
-                <w:sz w:val="24"/>
-              </w:rPr>
-            </w:pPr>
-          </w:p>
-        </w:tc>
-        <w:tc>
-          <w:tcPr>
-            <w:tcW w:w="5395" w:type="dxa"/>
-          </w:tcPr>
-          <w:p>
-            <w:pPr>
-              <w:jc w:val="center"/>
-              <w:rPr>
-                <w:rFonts w:ascii="Arial" w:eastAsiaTheme="minorHAnsi" w:hAnsi="Arial" w:cs="Arial"/>
-                <w:sz w:val="24"/>
-              </w:rPr>
-            </w:pPr>
+              <w:spacing w:after="0" w:line="240" w:lineRule="auto"/>
+              <w:jc w:val="center"/>
+              <w:rPr>
+                <w:rFonts w:ascii="Arial" w:eastAsiaTheme="minorEastAsia" w:hAnsi="Arial" w:cs="Arial"/>
+                <w:sz w:val="24"/>
+                <w:szCs w:val="24"/>
+              </w:rPr>
+            </w:pPr>
+            <w:proofErr w:type="spellStart"/>
+            <w:r>
+              <w:rPr>
+                <w:rFonts w:ascii="Arial" w:eastAsiaTheme="minorEastAsia" w:hAnsi="Arial" w:cs="Arial"/>
+                <w:sz w:val="24"/>
+                <w:szCs w:val="24"/>
+              </w:rPr>
+              <w:t>Jeferson</w:t>
+            </w:r>
+            <w:proofErr w:type="spellEnd"/>
+            <w:r>
+              <w:rPr>
+                <w:rFonts w:ascii="Arial" w:eastAsiaTheme="minorEastAsia" w:hAnsi="Arial" w:cs="Arial"/>
+                <w:sz w:val="24"/>
+                <w:szCs w:val="24"/>
+              </w:rPr>
+              <w:t xml:space="preserve"> </w:t>
+            </w:r>
+            <w:proofErr w:type="spellStart"/>
+            <w:r>
+              <w:rPr>
+                <w:rFonts w:ascii="Arial" w:eastAsiaTheme="minorEastAsia" w:hAnsi="Arial" w:cs="Arial"/>
+                <w:sz w:val="24"/>
+                <w:szCs w:val="24"/>
+              </w:rPr>
+              <w:t>Andre</w:t>
+            </w:r>
+            <w:proofErr w:type="spellEnd"/>
+            <w:r>
+              <w:rPr>
+                <w:rFonts w:ascii="Arial" w:eastAsiaTheme="minorEastAsia" w:hAnsi="Arial" w:cs="Arial"/>
+                <w:sz w:val="24"/>
+                <w:szCs w:val="24"/>
+              </w:rPr>
+              <w:t xml:space="preserve"> Cano </w:t>
+            </w:r>
+            <w:proofErr w:type="spellStart"/>
+            <w:r>
+              <w:rPr>
+                <w:rFonts w:ascii="Arial" w:eastAsiaTheme="minorEastAsia" w:hAnsi="Arial" w:cs="Arial"/>
+                <w:sz w:val="24"/>
+                <w:szCs w:val="24"/>
+              </w:rPr>
+              <w:t>Lopez</w:t>
+            </w:r>
+            <w:proofErr w:type="spellEnd"/>
+          </w:p>
+        </w:tc>
+        <w:tc>
+          <w:tcPr>
+            <w:tcW w:w="5395" w:type="dxa"/>
+          </w:tcPr>
+          <w:p>
+            <w:pPr>
+              <w:spacing w:after="0" w:line="240" w:lineRule="auto"/>
+              <w:jc w:val="center"/>
+              <w:rPr>
+                <w:rFonts w:ascii="Arial" w:eastAsiaTheme="minorEastAsia" w:hAnsi="Arial" w:cs="Arial"/>
+                <w:sz w:val="24"/>
+                <w:szCs w:val="24"/>
+              </w:rPr>
+            </w:pPr>
+            <w:r>
+              <w:rPr>
+                <w:rFonts w:ascii="Arial" w:eastAsiaTheme="minorEastAsia" w:hAnsi="Arial" w:cs="Arial"/>
+                <w:sz w:val="24"/>
+                <w:szCs w:val="24"/>
+              </w:rPr>
+              <w:t>Programador</w:t>
+            </w:r>
           </w:p>
         </w:tc>
       </w:tr>
@@ -770,26 +922,42 @@
           </w:tcPr>
           <w:p>
             <w:pPr>
-              <w:jc w:val="center"/>
-              <w:rPr>
-                <w:rFonts w:ascii="Arial" w:eastAsiaTheme="minorHAnsi" w:hAnsi="Arial" w:cs="Arial"/>
-                <w:sz w:val="24"/>
-              </w:rPr>
-            </w:pPr>
-          </w:p>
-        </w:tc>
-        <w:tc>
-          <w:tcPr>
-            <w:tcW w:w="5395" w:type="dxa"/>
-          </w:tcPr>
-          <w:p>
-            <w:pPr>
-              <w:jc w:val="center"/>
-              <w:rPr>
-                <w:rFonts w:ascii="Arial" w:eastAsiaTheme="minorHAnsi" w:hAnsi="Arial" w:cs="Arial"/>
-                <w:sz w:val="24"/>
-              </w:rPr>
-            </w:pPr>
+              <w:spacing w:after="0" w:line="240" w:lineRule="auto"/>
+              <w:jc w:val="center"/>
+              <w:rPr>
+                <w:rFonts w:ascii="Arial" w:eastAsiaTheme="minorHAnsi" w:hAnsi="Arial" w:cs="Arial"/>
+                <w:sz w:val="24"/>
+              </w:rPr>
+            </w:pPr>
+            <w:r>
+              <w:rPr>
+                <w:rFonts w:ascii="Arial" w:eastAsiaTheme="minorHAnsi" w:hAnsi="Arial" w:cs="Arial"/>
+                <w:sz w:val="24"/>
+              </w:rPr>
+              <w:t>Carlos Enrique López Quino</w:t>
+            </w:r>
+          </w:p>
+        </w:tc>
+        <w:tc>
+          <w:tcPr>
+            <w:tcW w:w="5395" w:type="dxa"/>
+          </w:tcPr>
+          <w:p>
+            <w:pPr>
+              <w:spacing w:after="0" w:line="240" w:lineRule="auto"/>
+              <w:jc w:val="center"/>
+              <w:rPr>
+                <w:rFonts w:ascii="Arial" w:eastAsiaTheme="minorHAnsi" w:hAnsi="Arial" w:cs="Arial"/>
+                <w:sz w:val="24"/>
+              </w:rPr>
+            </w:pPr>
+            <w:r>
+              <w:rPr>
+                <w:rFonts w:ascii="Arial" w:eastAsiaTheme="minorHAnsi" w:hAnsi="Arial" w:cs="Arial"/>
+                <w:sz w:val="24"/>
+              </w:rPr>
+              <w:t>Programador</w:t>
+            </w:r>
           </w:p>
         </w:tc>
       </w:tr>
@@ -800,26 +968,51 @@
           </w:tcPr>
           <w:p>
             <w:pPr>
-              <w:jc w:val="center"/>
-              <w:rPr>
-                <w:rFonts w:ascii="Arial" w:eastAsiaTheme="minorHAnsi" w:hAnsi="Arial" w:cs="Arial"/>
-                <w:sz w:val="24"/>
-              </w:rPr>
-            </w:pPr>
-          </w:p>
-        </w:tc>
-        <w:tc>
-          <w:tcPr>
-            <w:tcW w:w="5395" w:type="dxa"/>
-          </w:tcPr>
-          <w:p>
-            <w:pPr>
-              <w:jc w:val="center"/>
-              <w:rPr>
-                <w:rFonts w:ascii="Arial" w:eastAsiaTheme="minorHAnsi" w:hAnsi="Arial" w:cs="Arial"/>
-                <w:sz w:val="24"/>
-              </w:rPr>
-            </w:pPr>
+              <w:spacing w:after="0" w:line="240" w:lineRule="auto"/>
+              <w:jc w:val="center"/>
+              <w:rPr>
+                <w:rFonts w:ascii="Arial" w:eastAsiaTheme="minorHAnsi" w:hAnsi="Arial" w:cs="Arial"/>
+                <w:sz w:val="24"/>
+              </w:rPr>
+            </w:pPr>
+            <w:r>
+              <w:rPr>
+                <w:rFonts w:ascii="Arial" w:eastAsiaTheme="minorHAnsi" w:hAnsi="Arial" w:cs="Arial"/>
+                <w:sz w:val="24"/>
+              </w:rPr>
+              <w:t xml:space="preserve">Ricardo Alejandro Hernández </w:t>
+            </w:r>
+            <w:proofErr w:type="spellStart"/>
+            <w:r>
+              <w:rPr>
+                <w:rFonts w:ascii="Arial" w:eastAsiaTheme="minorHAnsi" w:hAnsi="Arial" w:cs="Arial"/>
+                <w:sz w:val="24"/>
+              </w:rPr>
+              <w:t>Hernández</w:t>
+            </w:r>
+            <w:proofErr w:type="spellEnd"/>
+          </w:p>
+        </w:tc>
+        <w:tc>
+          <w:tcPr>
+            <w:tcW w:w="5395" w:type="dxa"/>
+          </w:tcPr>
+          <w:p>
+            <w:pPr>
+              <w:spacing w:after="0" w:line="240" w:lineRule="auto"/>
+              <w:jc w:val="center"/>
+              <w:rPr>
+                <w:rFonts w:ascii="Arial" w:eastAsiaTheme="minorHAnsi" w:hAnsi="Arial" w:cs="Arial"/>
+                <w:sz w:val="24"/>
+              </w:rPr>
+            </w:pPr>
+            <w:r>
+              <w:rPr>
+                <w:rFonts w:ascii="Arial" w:eastAsiaTheme="minorHAnsi" w:hAnsi="Arial" w:cs="Arial"/>
+                <w:sz w:val="24"/>
+              </w:rPr>
+              <w:t>Programador</w:t>
+            </w:r>
           </w:p>
         </w:tc>
       </w:tr>
@@ -830,26 +1023,58 @@
           </w:tcPr>
           <w:p>
             <w:pPr>
-              <w:jc w:val="center"/>
-              <w:rPr>
-                <w:rFonts w:ascii="Arial" w:eastAsiaTheme="minorHAnsi" w:hAnsi="Arial" w:cs="Arial"/>
-                <w:sz w:val="24"/>
-              </w:rPr>
-            </w:pPr>
-          </w:p>
-        </w:tc>
-        <w:tc>
-          <w:tcPr>
-            <w:tcW w:w="5395" w:type="dxa"/>
-          </w:tcPr>
-          <w:p>
-            <w:pPr>
-              <w:jc w:val="center"/>
-              <w:rPr>
-                <w:rFonts w:ascii="Arial" w:eastAsiaTheme="minorHAnsi" w:hAnsi="Arial" w:cs="Arial"/>
-                <w:sz w:val="24"/>
-              </w:rPr>
-            </w:pPr>
+              <w:spacing w:after="0" w:line="240" w:lineRule="auto"/>
+              <w:jc w:val="center"/>
+              <w:rPr>
+                <w:rFonts w:ascii="Arial" w:eastAsiaTheme="minorHAnsi" w:hAnsi="Arial" w:cs="Arial"/>
+                <w:sz w:val="24"/>
+              </w:rPr>
+            </w:pPr>
+            <w:r>
+              <w:rPr>
+                <w:rFonts w:ascii="Arial" w:eastAsiaTheme="minorHAnsi" w:hAnsi="Arial" w:cs="Arial"/>
+                <w:sz w:val="24"/>
+              </w:rPr>
+              <w:t xml:space="preserve">Osman </w:t>
+            </w:r>
+            <w:proofErr w:type="spellStart"/>
+            <w:r>
+              <w:rPr>
+                <w:rFonts w:ascii="Arial" w:eastAsiaTheme="minorHAnsi" w:hAnsi="Arial" w:cs="Arial"/>
+                <w:sz w:val="24"/>
+              </w:rPr>
+              <w:t>Emmanuell</w:t>
+            </w:r>
+            <w:proofErr w:type="spellEnd"/>
+            <w:r>
+              <w:rPr>
+                <w:rFonts w:ascii="Arial" w:eastAsiaTheme="minorHAnsi" w:hAnsi="Arial" w:cs="Arial"/>
+                <w:sz w:val="24"/>
+              </w:rPr>
+              <w:t xml:space="preserve"> Veliz Guzmán</w:t>
+            </w:r>
+          </w:p>
+        </w:tc>
+        <w:tc>
+          <w:tcPr>
+            <w:tcW w:w="5395" w:type="dxa"/>
+          </w:tcPr>
+          <w:p>
+            <w:pPr>
+              <w:spacing w:after="0" w:line="240" w:lineRule="auto"/>
+              <w:jc w:val="center"/>
+              <w:rPr>
+                <w:rFonts w:ascii="Arial" w:eastAsiaTheme="minorHAnsi" w:hAnsi="Arial" w:cs="Arial"/>
+                <w:sz w:val="24"/>
+              </w:rPr>
+            </w:pPr>
+            <w:r>
+              <w:rPr>
+                <w:rFonts w:ascii="Arial" w:eastAsiaTheme="minorHAnsi" w:hAnsi="Arial" w:cs="Arial"/>
+                <w:sz w:val="24"/>
+              </w:rPr>
+              <w:t>Programador</w:t>
+            </w:r>
           </w:p>
         </w:tc>
       </w:tr>
@@ -860,26 +1085,42 @@
           </w:tcPr>
           <w:p>
             <w:pPr>
-              <w:jc w:val="center"/>
-              <w:rPr>
-                <w:rFonts w:ascii="Arial" w:eastAsiaTheme="minorHAnsi" w:hAnsi="Arial" w:cs="Arial"/>
-                <w:sz w:val="24"/>
-              </w:rPr>
-            </w:pPr>
-          </w:p>
-        </w:tc>
-        <w:tc>
-          <w:tcPr>
-            <w:tcW w:w="5395" w:type="dxa"/>
-          </w:tcPr>
-          <w:p>
-            <w:pPr>
-              <w:jc w:val="center"/>
-              <w:rPr>
-                <w:rFonts w:ascii="Arial" w:eastAsiaTheme="minorHAnsi" w:hAnsi="Arial" w:cs="Arial"/>
-                <w:sz w:val="24"/>
-              </w:rPr>
-            </w:pPr>
+              <w:spacing w:after="0" w:line="240" w:lineRule="auto"/>
+              <w:jc w:val="center"/>
+              <w:rPr>
+                <w:rFonts w:ascii="Arial" w:eastAsiaTheme="minorHAnsi" w:hAnsi="Arial" w:cs="Arial"/>
+                <w:sz w:val="24"/>
+              </w:rPr>
+            </w:pPr>
+            <w:r>
+              <w:rPr>
+                <w:rFonts w:ascii="Arial" w:eastAsiaTheme="minorHAnsi" w:hAnsi="Arial" w:cs="Arial"/>
+                <w:sz w:val="24"/>
+              </w:rPr>
+              <w:t>Franklin Stev Paiz Chavez</w:t>
+            </w:r>
+          </w:p>
+        </w:tc>
+        <w:tc>
+          <w:tcPr>
+            <w:tcW w:w="5395" w:type="dxa"/>
+          </w:tcPr>
+          <w:p>
+            <w:pPr>
+              <w:spacing w:after="0" w:line="240" w:lineRule="auto"/>
+              <w:jc w:val="center"/>
+              <w:rPr>
+                <w:rFonts w:ascii="Arial" w:eastAsiaTheme="minorHAnsi" w:hAnsi="Arial" w:cs="Arial"/>
+                <w:sz w:val="24"/>
+              </w:rPr>
+            </w:pPr>
+            <w:r>
+              <w:rPr>
+                <w:rFonts w:ascii="Arial" w:eastAsiaTheme="minorHAnsi" w:hAnsi="Arial" w:cs="Arial"/>
+                <w:sz w:val="24"/>
+              </w:rPr>
+              <w:t>Programador</w:t>
+            </w:r>
           </w:p>
         </w:tc>
       </w:tr>
@@ -890,6 +1131,7 @@
           </w:tcPr>
           <w:p>
             <w:pPr>
+              <w:spacing w:after="0" w:line="240" w:lineRule="auto"/>
               <w:jc w:val="center"/>
               <w:rPr>
                 <w:rFonts w:ascii="Arial" w:eastAsiaTheme="minorEastAsia" w:hAnsi="Arial" w:cs="Arial"/>
@@ -897,21 +1139,48 @@
                 <w:szCs w:val="24"/>
               </w:rPr>
             </w:pPr>
-          </w:p>
-        </w:tc>
-        <w:tc>
-          <w:tcPr>
-            <w:tcW w:w="5395" w:type="dxa"/>
-          </w:tcPr>
-          <w:p>
-            <w:pPr>
-              <w:jc w:val="center"/>
+            <w:proofErr w:type="spellStart"/>
+            <w:r>
               <w:rPr>
                 <w:rFonts w:ascii="Arial" w:eastAsiaTheme="minorEastAsia" w:hAnsi="Arial" w:cs="Arial"/>
                 <w:sz w:val="24"/>
                 <w:szCs w:val="24"/>
               </w:rPr>
-            </w:pPr>
+              <w:t>Angel</w:t>
+            </w:r>
+            <w:proofErr w:type="spellEnd"/>
+            <w:r>
+              <w:rPr>
+                <w:rFonts w:ascii="Arial" w:eastAsiaTheme="minorEastAsia" w:hAnsi="Arial" w:cs="Arial"/>
+                <w:sz w:val="24"/>
+                <w:szCs w:val="24"/>
+              </w:rPr>
+              <w:t xml:space="preserve"> Gabriel Ernesto Grijalva Castro</w:t>
+            </w:r>
+          </w:p>
+        </w:tc>
+        <w:tc>
+          <w:tcPr>
+            <w:tcW w:w="5395" w:type="dxa"/>
+          </w:tcPr>
+          <w:p>
+            <w:pPr>
+              <w:spacing w:after="0" w:line="240" w:lineRule="auto"/>
+              <w:jc w:val="center"/>
+              <w:rPr>
+                <w:rFonts w:ascii="Arial" w:eastAsiaTheme="minorEastAsia" w:hAnsi="Arial" w:cs="Arial"/>
+                <w:sz w:val="24"/>
+                <w:szCs w:val="24"/>
+              </w:rPr>
+            </w:pPr>
+            <w:r>
+              <w:rPr>
+                <w:rFonts w:ascii="Arial" w:eastAsiaTheme="minorEastAsia" w:hAnsi="Arial" w:cs="Arial"/>
+                <w:sz w:val="24"/>
+                <w:szCs w:val="24"/>
+              </w:rPr>
+              <w:t>Programador</w:t>
+            </w:r>
           </w:p>
         </w:tc>
       </w:tr>
@@ -922,20 +1191,22 @@
           </w:tcPr>
           <w:p>
             <w:pPr>
-              <w:jc w:val="center"/>
-              <w:rPr>
-                <w:rFonts w:ascii="Arial" w:eastAsiaTheme="minorHAnsi" w:hAnsi="Arial" w:cs="Arial"/>
-                <w:sz w:val="24"/>
-              </w:rPr>
-            </w:pPr>
-          </w:p>
-        </w:tc>
-        <w:tc>
-          <w:tcPr>
-            <w:tcW w:w="5395" w:type="dxa"/>
-          </w:tcPr>
-          <w:p>
-            <w:pPr>
+              <w:spacing w:after="0" w:line="240" w:lineRule="auto"/>
+              <w:jc w:val="center"/>
+              <w:rPr>
+                <w:rFonts w:ascii="Arial" w:eastAsiaTheme="minorHAnsi" w:hAnsi="Arial" w:cs="Arial"/>
+                <w:sz w:val="24"/>
+              </w:rPr>
+            </w:pPr>
+          </w:p>
+        </w:tc>
+        <w:tc>
+          <w:tcPr>
+            <w:tcW w:w="5395" w:type="dxa"/>
+          </w:tcPr>
+          <w:p>
+            <w:pPr>
+              <w:spacing w:after="0" w:line="240" w:lineRule="auto"/>
               <w:jc w:val="center"/>
               <w:rPr>
                 <w:rFonts w:ascii="Arial" w:eastAsiaTheme="minorHAnsi" w:hAnsi="Arial" w:cs="Arial"/>
@@ -952,20 +1223,22 @@
           </w:tcPr>
           <w:p>
             <w:pPr>
-              <w:jc w:val="center"/>
-              <w:rPr>
-                <w:rFonts w:ascii="Arial" w:eastAsiaTheme="minorHAnsi" w:hAnsi="Arial" w:cs="Arial"/>
-                <w:sz w:val="24"/>
-              </w:rPr>
-            </w:pPr>
-          </w:p>
-        </w:tc>
-        <w:tc>
-          <w:tcPr>
-            <w:tcW w:w="5395" w:type="dxa"/>
-          </w:tcPr>
-          <w:p>
-            <w:pPr>
+              <w:spacing w:after="0" w:line="240" w:lineRule="auto"/>
+              <w:jc w:val="center"/>
+              <w:rPr>
+                <w:rFonts w:ascii="Arial" w:eastAsiaTheme="minorHAnsi" w:hAnsi="Arial" w:cs="Arial"/>
+                <w:sz w:val="24"/>
+              </w:rPr>
+            </w:pPr>
+          </w:p>
+        </w:tc>
+        <w:tc>
+          <w:tcPr>
+            <w:tcW w:w="5395" w:type="dxa"/>
+          </w:tcPr>
+          <w:p>
+            <w:pPr>
+              <w:spacing w:after="0" w:line="240" w:lineRule="auto"/>
               <w:jc w:val="center"/>
               <w:rPr>
                 <w:rFonts w:ascii="Arial" w:eastAsiaTheme="minorHAnsi" w:hAnsi="Arial" w:cs="Arial"/>
@@ -982,20 +1255,22 @@
           </w:tcPr>
           <w:p>
             <w:pPr>
-              <w:jc w:val="center"/>
-              <w:rPr>
-                <w:rFonts w:ascii="Arial" w:eastAsiaTheme="minorHAnsi" w:hAnsi="Arial" w:cs="Arial"/>
-                <w:sz w:val="24"/>
-              </w:rPr>
-            </w:pPr>
-          </w:p>
-        </w:tc>
-        <w:tc>
-          <w:tcPr>
-            <w:tcW w:w="5395" w:type="dxa"/>
-          </w:tcPr>
-          <w:p>
-            <w:pPr>
+              <w:spacing w:after="0" w:line="240" w:lineRule="auto"/>
+              <w:jc w:val="center"/>
+              <w:rPr>
+                <w:rFonts w:ascii="Arial" w:eastAsiaTheme="minorHAnsi" w:hAnsi="Arial" w:cs="Arial"/>
+                <w:sz w:val="24"/>
+              </w:rPr>
+            </w:pPr>
+          </w:p>
+        </w:tc>
+        <w:tc>
+          <w:tcPr>
+            <w:tcW w:w="5395" w:type="dxa"/>
+          </w:tcPr>
+          <w:p>
+            <w:pPr>
+              <w:spacing w:after="0" w:line="240" w:lineRule="auto"/>
               <w:jc w:val="center"/>
               <w:rPr>
                 <w:rFonts w:ascii="Arial" w:eastAsiaTheme="minorHAnsi" w:hAnsi="Arial" w:cs="Arial"/>
@@ -1028,8 +1303,6 @@
         </w:rPr>
         <w:t xml:space="preserve">    </w:t>
       </w:r>
-      <w:bookmarkStart w:id="0" w:name="_GoBack"/>
-      <w:bookmarkEnd w:id="0"/>
     </w:p>
     <w:sectPr>
       <w:pgSz w:w="12240" w:h="15840"/>
@@ -1041,24 +1314,68 @@
 </w:document>
 </file>
 
+<file path=word/endnotes.xml><?xml version="1.0" encoding="utf-8"?>
+<w:endnotes xmlns:wpc="http://schemas.microsoft.com/office/word/2010/wordprocessingCanvas" xmlns:cx="http://schemas.microsoft.com/office/drawing/2014/chartex" xmlns:cx1="http://schemas.microsoft.com/office/drawing/2015/9/8/chartex" xmlns:cx2="http://schemas.microsoft.com/office/drawing/2015/10/21/chartex" xmlns:cx3="http://schemas.microsoft.com/office/drawing/2016/5/9/chartex" xmlns:cx4="http://schemas.microsoft.com/office/drawing/2016/5/10/chartex" xmlns:cx5="http://schemas.microsoft.com/office/drawing/2016/5/11/chartex" xmlns:cx6="http://schemas.microsoft.com/office/drawing/2016/5/12/chartex" xmlns:cx7="http://schemas.microsoft.com/office/drawing/2016/5/13/chartex" xmlns:cx8="http://schemas.microsoft.com/office/drawing/2016/5/14/chartex" xmlns:mc="http://schemas.openxmlformats.org/markup-compatibility/2006" xmlns:aink="http://schemas.microsoft.com/office/drawing/2016/ink" xmlns:am3d="http://schemas.microsoft.com/office/drawing/2017/model3d" xmlns:o="urn:schemas-microsoft-com:office:office" xmlns:oel="http://schemas.microsoft.com/office/2019/extlst" xmlns:r="http://schemas.openxmlformats.org/officeDocument/2006/relationships" xmlns:m="http://schemas.openxmlformats.org/officeDocument/2006/math" xmlns:v="urn:schemas-microsoft-com:vml" xmlns:wp14="http://schemas.microsoft.com/office/word/2010/wordprocessingDrawing" xmlns:wp="http://schemas.openxmlformats.org/drawingml/2006/wordprocessingDrawing" xmlns:w10="urn:schemas-microsoft-com:office:word" xmlns:w="http://schemas.openxmlformats.org/wordprocessingml/2006/main" xmlns:w14="http://schemas.microsoft.com/office/word/2010/wordml" xmlns:w15="http://schemas.microsoft.com/office/word/2012/wordml" xmlns:w16cex="http://schemas.microsoft.com/office/word/2018/wordml/cex" xmlns:w16cid="http://schemas.microsoft.com/office/word/2016/wordml/cid" xmlns:w16="http://schemas.microsoft.com/office/word/2018/wordml" xmlns:w16sdtdh="http://schemas.microsoft.com/office/word/2020/wordml/sdtdatahash" xmlns:w16se="http://schemas.microsoft.com/office/word/2015/wordml/symex" xmlns:wpg="http://schemas.microsoft.com/office/word/2010/wordprocessingGroup" xmlns:wpi="http://schemas.microsoft.com/office/word/2010/wordprocessingInk" xmlns:wne="http://schemas.microsoft.com/office/word/2006/wordml" xmlns:wps="http://schemas.microsoft.com/office/word/2010/wordprocessingShape" mc:Ignorable="w14 w15 w16se w16cid w16 w16cex w16sdtdh wp14">
+  <w:endnote w:type="separator" w:id="-1">
+    <w:p>
+      <w:pPr>
+        <w:spacing w:line="240" w:lineRule="auto"/>
+      </w:pPr>
+      <w:r>
+        <w:separator/>
+      </w:r>
+    </w:p>
+  </w:endnote>
+  <w:endnote w:type="continuationSeparator" w:id="0">
+    <w:p>
+      <w:pPr>
+        <w:spacing w:line="240" w:lineRule="auto"/>
+      </w:pPr>
+      <w:r>
+        <w:continuationSeparator/>
+      </w:r>
+    </w:p>
+  </w:endnote>
+</w:endnotes>
+</file>
+
+<file path=word/footnotes.xml><?xml version="1.0" encoding="utf-8"?>
+<w:footnotes xmlns:wpc="http://schemas.microsoft.com/office/word/2010/wordprocessingCanvas" xmlns:cx="http://schemas.microsoft.com/office/drawing/2014/chartex" xmlns:cx1="http://schemas.microsoft.com/office/drawing/2015/9/8/chartex" xmlns:cx2="http://schemas.microsoft.com/office/drawing/2015/10/21/chartex" xmlns:cx3="http://schemas.microsoft.com/office/drawing/2016/5/9/chartex" xmlns:cx4="http://schemas.microsoft.com/office/drawing/2016/5/10/chartex" xmlns:cx5="http://schemas.microsoft.com/office/drawing/2016/5/11/chartex" xmlns:cx6="http://schemas.microsoft.com/office/drawing/2016/5/12/chartex" xmlns:cx7="http://schemas.microsoft.com/office/drawing/2016/5/13/chartex" xmlns:cx8="http://schemas.microsoft.com/office/drawing/2016/5/14/chartex" xmlns:mc="http://schemas.openxmlformats.org/markup-compatibility/2006" xmlns:aink="http://schemas.microsoft.com/office/drawing/2016/ink" xmlns:am3d="http://schemas.microsoft.com/office/drawing/2017/model3d" xmlns:o="urn:schemas-microsoft-com:office:office" xmlns:oel="http://schemas.microsoft.com/office/2019/extlst" xmlns:r="http://schemas.openxmlformats.org/officeDocument/2006/relationships" xmlns:m="http://schemas.openxmlformats.org/officeDocument/2006/math" xmlns:v="urn:schemas-microsoft-com:vml" xmlns:wp14="http://schemas.microsoft.com/office/word/2010/wordprocessingDrawing" xmlns:wp="http://schemas.openxmlformats.org/drawingml/2006/wordprocessingDrawing" xmlns:w10="urn:schemas-microsoft-com:office:word" xmlns:w="http://schemas.openxmlformats.org/wordprocessingml/2006/main" xmlns:w14="http://schemas.microsoft.com/office/word/2010/wordml" xmlns:w15="http://schemas.microsoft.com/office/word/2012/wordml" xmlns:w16cex="http://schemas.microsoft.com/office/word/2018/wordml/cex" xmlns:w16cid="http://schemas.microsoft.com/office/word/2016/wordml/cid" xmlns:w16="http://schemas.microsoft.com/office/word/2018/wordml" xmlns:w16sdtdh="http://schemas.microsoft.com/office/word/2020/wordml/sdtdatahash" xmlns:w16se="http://schemas.microsoft.com/office/word/2015/wordml/symex" xmlns:wpg="http://schemas.microsoft.com/office/word/2010/wordprocessingGroup" xmlns:wpi="http://schemas.microsoft.com/office/word/2010/wordprocessingInk" xmlns:wne="http://schemas.microsoft.com/office/word/2006/wordml" xmlns:wps="http://schemas.microsoft.com/office/word/2010/wordprocessingShape" mc:Ignorable="w14 w15 w16se w16cid w16 w16cex w16sdtdh wp14">
+  <w:footnote w:type="separator" w:id="-1">
+    <w:p>
+      <w:pPr>
+        <w:spacing w:after="0"/>
+      </w:pPr>
+      <w:r>
+        <w:separator/>
+      </w:r>
+    </w:p>
+  </w:footnote>
+  <w:footnote w:type="continuationSeparator" w:id="0">
+    <w:p>
+      <w:pPr>
+        <w:spacing w:after="0"/>
+      </w:pPr>
+      <w:r>
+        <w:continuationSeparator/>
+      </w:r>
+    </w:p>
+  </w:footnote>
+</w:footnotes>
+</file>
+
 <file path=word/styles.xml><?xml version="1.0" encoding="utf-8"?>
-<w:styles xmlns:mc="http://schemas.openxmlformats.org/markup-compatibility/2006" xmlns:r="http://schemas.openxmlformats.org/officeDocument/2006/relationships" xmlns:w="http://schemas.openxmlformats.org/wordprocessingml/2006/main" xmlns:w14="http://schemas.microsoft.com/office/word/2010/wordml" xmlns:w15="http://schemas.microsoft.com/office/word/2012/wordml" xmlns:w16se="http://schemas.microsoft.com/office/word/2015/wordml/symex" mc:Ignorable="w14 w15 w16se">
+<w:styles xmlns:mc="http://schemas.openxmlformats.org/markup-compatibility/2006" xmlns:r="http://schemas.openxmlformats.org/officeDocument/2006/relationships" xmlns:w="http://schemas.openxmlformats.org/wordprocessingml/2006/main" xmlns:w14="http://schemas.microsoft.com/office/word/2010/wordml" xmlns:w15="http://schemas.microsoft.com/office/word/2012/wordml" xmlns:w16cex="http://schemas.microsoft.com/office/word/2018/wordml/cex" xmlns:w16cid="http://schemas.microsoft.com/office/word/2016/wordml/cid" xmlns:w16="http://schemas.microsoft.com/office/word/2018/wordml" xmlns:w16sdtdh="http://schemas.microsoft.com/office/word/2020/wordml/sdtdatahash" xmlns:w16se="http://schemas.microsoft.com/office/word/2015/wordml/symex" mc:Ignorable="w14 w15 w16se w16cid w16 w16cex w16sdtdh">
   <w:docDefaults>
     <w:rPrDefault>
       <w:rPr>
         <w:rFonts w:asciiTheme="minorHAnsi" w:eastAsiaTheme="minorHAnsi" w:hAnsiTheme="minorHAnsi" w:cstheme="minorBidi"/>
-        <w:sz w:val="22"/>
-        <w:szCs w:val="22"/>
-        <w:lang w:val="es-GT" w:eastAsia="en-US" w:bidi="ar-SA"/>
+        <w:lang w:val="es-MX" w:eastAsia="es-MX" w:bidi="ar-SA"/>
       </w:rPr>
     </w:rPrDefault>
-    <w:pPrDefault>
-      <w:pPr>
-        <w:spacing w:after="160" w:line="259" w:lineRule="auto"/>
-      </w:pPr>
-    </w:pPrDefault>
+    <w:pPrDefault/>
   </w:docDefaults>
-  <w:latentStyles w:defLockedState="0" w:defUIPriority="99" w:defSemiHidden="0" w:defUnhideWhenUsed="0" w:defQFormat="0" w:count="371">
+  <w:latentStyles w:defLockedState="0" w:defUIPriority="99" w:defSemiHidden="0" w:defUnhideWhenUsed="0" w:defQFormat="0" w:count="376">
     <w:lsdException w:name="Normal" w:uiPriority="0" w:qFormat="1"/>
     <w:lsdException w:name="heading 1" w:uiPriority="9" w:qFormat="1"/>
     <w:lsdException w:name="heading 2" w:semiHidden="1" w:uiPriority="9" w:unhideWhenUsed="1" w:qFormat="1"/>
@@ -1089,7 +1406,7 @@
     <w:lsdException w:name="toc 9" w:semiHidden="1" w:uiPriority="39" w:unhideWhenUsed="1"/>
     <w:lsdException w:name="Normal Indent" w:semiHidden="1" w:unhideWhenUsed="1"/>
     <w:lsdException w:name="footnote text" w:semiHidden="1" w:unhideWhenUsed="1"/>
-    <w:lsdException w:name="annotation text" w:semiHidden="1" w:unhideWhenUsed="1"/>
+    <w:lsdException w:name="annotation text" w:semiHidden="1" w:unhideWhenUsed="1" w:qFormat="1"/>
     <w:lsdException w:name="header" w:semiHidden="1" w:unhideWhenUsed="1"/>
     <w:lsdException w:name="footer" w:semiHidden="1" w:unhideWhenUsed="1"/>
     <w:lsdException w:name="index heading" w:semiHidden="1" w:unhideWhenUsed="1"/>
@@ -1153,7 +1470,7 @@
     <w:lsdException w:name="E-mail Signature" w:semiHidden="1" w:unhideWhenUsed="1"/>
     <w:lsdException w:name="HTML Top of Form" w:semiHidden="1" w:unhideWhenUsed="1"/>
     <w:lsdException w:name="HTML Bottom of Form" w:semiHidden="1" w:unhideWhenUsed="1"/>
-    <w:lsdException w:name="Normal (Web)" w:semiHidden="1" w:unhideWhenUsed="1"/>
+    <w:lsdException w:name="Normal (Web)" w:semiHidden="1" w:unhideWhenUsed="1" w:qFormat="1"/>
     <w:lsdException w:name="HTML Acronym" w:semiHidden="1" w:unhideWhenUsed="1"/>
     <w:lsdException w:name="HTML Address" w:semiHidden="1" w:unhideWhenUsed="1"/>
     <w:lsdException w:name="HTML Cite" w:semiHidden="1" w:unhideWhenUsed="1"/>
@@ -1164,8 +1481,8 @@
     <w:lsdException w:name="HTML Sample" w:semiHidden="1" w:unhideWhenUsed="1"/>
     <w:lsdException w:name="HTML Typewriter" w:semiHidden="1" w:unhideWhenUsed="1"/>
     <w:lsdException w:name="HTML Variable" w:semiHidden="1" w:unhideWhenUsed="1"/>
-    <w:lsdException w:name="Normal Table" w:semiHidden="1" w:unhideWhenUsed="1"/>
-    <w:lsdException w:name="annotation subject" w:semiHidden="1" w:unhideWhenUsed="1"/>
+    <w:lsdException w:name="Normal Table" w:semiHidden="1" w:unhideWhenUsed="1" w:qFormat="1"/>
+    <w:lsdException w:name="annotation subject" w:semiHidden="1" w:unhideWhenUsed="1" w:qFormat="1"/>
     <w:lsdException w:name="No List" w:semiHidden="1" w:unhideWhenUsed="1"/>
     <w:lsdException w:name="Outline List 1" w:semiHidden="1" w:unhideWhenUsed="1"/>
     <w:lsdException w:name="Outline List 2" w:semiHidden="1" w:unhideWhenUsed="1"/>
@@ -1212,113 +1529,113 @@
     <w:lsdException w:name="Table Web 1" w:semiHidden="1" w:unhideWhenUsed="1"/>
     <w:lsdException w:name="Table Web 2" w:semiHidden="1" w:unhideWhenUsed="1"/>
     <w:lsdException w:name="Table Web 3" w:semiHidden="1" w:unhideWhenUsed="1"/>
-    <w:lsdException w:name="Balloon Text" w:semiHidden="1" w:unhideWhenUsed="1"/>
-    <w:lsdException w:name="Table Grid" w:uiPriority="39"/>
+    <w:lsdException w:name="Balloon Text" w:semiHidden="1" w:unhideWhenUsed="1" w:qFormat="1"/>
+    <w:lsdException w:name="Table Grid" w:uiPriority="39" w:qFormat="1"/>
     <w:lsdException w:name="Table Theme" w:semiHidden="1" w:unhideWhenUsed="1"/>
-    <w:lsdException w:name="Placeholder Text" w:semiHidden="1"/>
+    <w:lsdException w:name="Placeholder Text" w:semiHidden="1" w:unhideWhenUsed="1"/>
     <w:lsdException w:name="No Spacing" w:uiPriority="1" w:qFormat="1"/>
-    <w:lsdException w:name="Light Shading" w:uiPriority="60"/>
-    <w:lsdException w:name="Light List" w:uiPriority="61"/>
-    <w:lsdException w:name="Light Grid" w:uiPriority="62"/>
-    <w:lsdException w:name="Medium Shading 1" w:uiPriority="63"/>
-    <w:lsdException w:name="Medium Shading 2" w:uiPriority="64"/>
-    <w:lsdException w:name="Medium List 1" w:uiPriority="65"/>
-    <w:lsdException w:name="Medium List 2" w:uiPriority="66"/>
-    <w:lsdException w:name="Medium Grid 1" w:uiPriority="67"/>
-    <w:lsdException w:name="Medium Grid 2" w:uiPriority="68"/>
-    <w:lsdException w:name="Medium Grid 3" w:uiPriority="69"/>
-    <w:lsdException w:name="Dark List" w:uiPriority="70"/>
-    <w:lsdException w:name="Colorful Shading" w:uiPriority="71"/>
-    <w:lsdException w:name="Colorful List" w:uiPriority="72"/>
-    <w:lsdException w:name="Colorful Grid" w:uiPriority="73"/>
-    <w:lsdException w:name="Light Shading Accent 1" w:uiPriority="60"/>
-    <w:lsdException w:name="Light List Accent 1" w:uiPriority="61"/>
-    <w:lsdException w:name="Light Grid Accent 1" w:uiPriority="62"/>
-    <w:lsdException w:name="Medium Shading 1 Accent 1" w:uiPriority="63"/>
-    <w:lsdException w:name="Medium Shading 2 Accent 1" w:uiPriority="64"/>
-    <w:lsdException w:name="Medium List 1 Accent 1" w:uiPriority="65"/>
-    <w:lsdException w:name="Revision" w:semiHidden="1"/>
-    <w:lsdException w:name="List Paragraph" w:uiPriority="34" w:qFormat="1"/>
-    <w:lsdException w:name="Quote" w:uiPriority="29" w:qFormat="1"/>
-    <w:lsdException w:name="Intense Quote" w:uiPriority="30" w:qFormat="1"/>
-    <w:lsdException w:name="Medium List 2 Accent 1" w:uiPriority="66"/>
-    <w:lsdException w:name="Medium Grid 1 Accent 1" w:uiPriority="67"/>
-    <w:lsdException w:name="Medium Grid 2 Accent 1" w:uiPriority="68"/>
-    <w:lsdException w:name="Medium Grid 3 Accent 1" w:uiPriority="69"/>
-    <w:lsdException w:name="Dark List Accent 1" w:uiPriority="70"/>
-    <w:lsdException w:name="Colorful Shading Accent 1" w:uiPriority="71"/>
-    <w:lsdException w:name="Colorful List Accent 1" w:uiPriority="72"/>
-    <w:lsdException w:name="Colorful Grid Accent 1" w:uiPriority="73"/>
-    <w:lsdException w:name="Light Shading Accent 2" w:uiPriority="60"/>
-    <w:lsdException w:name="Light List Accent 2" w:uiPriority="61"/>
-    <w:lsdException w:name="Light Grid Accent 2" w:uiPriority="62"/>
-    <w:lsdException w:name="Medium Shading 1 Accent 2" w:uiPriority="63"/>
-    <w:lsdException w:name="Medium Shading 2 Accent 2" w:uiPriority="64"/>
-    <w:lsdException w:name="Medium List 1 Accent 2" w:uiPriority="65"/>
-    <w:lsdException w:name="Medium List 2 Accent 2" w:uiPriority="66"/>
-    <w:lsdException w:name="Medium Grid 1 Accent 2" w:uiPriority="67"/>
-    <w:lsdException w:name="Medium Grid 2 Accent 2" w:uiPriority="68"/>
-    <w:lsdException w:name="Medium Grid 3 Accent 2" w:uiPriority="69"/>
-    <w:lsdException w:name="Dark List Accent 2" w:uiPriority="70"/>
-    <w:lsdException w:name="Colorful Shading Accent 2" w:uiPriority="71"/>
-    <w:lsdException w:name="Colorful List Accent 2" w:uiPriority="72"/>
-    <w:lsdException w:name="Colorful Grid Accent 2" w:uiPriority="73"/>
-    <w:lsdException w:name="Light Shading Accent 3" w:uiPriority="60"/>
-    <w:lsdException w:name="Light List Accent 3" w:uiPriority="61"/>
-    <w:lsdException w:name="Light Grid Accent 3" w:uiPriority="62"/>
-    <w:lsdException w:name="Medium Shading 1 Accent 3" w:uiPriority="63"/>
-    <w:lsdException w:name="Medium Shading 2 Accent 3" w:uiPriority="64"/>
-    <w:lsdException w:name="Medium List 1 Accent 3" w:uiPriority="65"/>
-    <w:lsdException w:name="Medium List 2 Accent 3" w:uiPriority="66"/>
-    <w:lsdException w:name="Medium Grid 1 Accent 3" w:uiPriority="67"/>
-    <w:lsdException w:name="Medium Grid 2 Accent 3" w:uiPriority="68"/>
-    <w:lsdException w:name="Medium Grid 3 Accent 3" w:uiPriority="69"/>
-    <w:lsdException w:name="Dark List Accent 3" w:uiPriority="70"/>
-    <w:lsdException w:name="Colorful Shading Accent 3" w:uiPriority="71"/>
-    <w:lsdException w:name="Colorful List Accent 3" w:uiPriority="72"/>
-    <w:lsdException w:name="Colorful Grid Accent 3" w:uiPriority="73"/>
-    <w:lsdException w:name="Light Shading Accent 4" w:uiPriority="60"/>
-    <w:lsdException w:name="Light List Accent 4" w:uiPriority="61"/>
-    <w:lsdException w:name="Light Grid Accent 4" w:uiPriority="62"/>
-    <w:lsdException w:name="Medium Shading 1 Accent 4" w:uiPriority="63"/>
-    <w:lsdException w:name="Medium Shading 2 Accent 4" w:uiPriority="64"/>
-    <w:lsdException w:name="Medium List 1 Accent 4" w:uiPriority="65"/>
-    <w:lsdException w:name="Medium List 2 Accent 4" w:uiPriority="66"/>
-    <w:lsdException w:name="Medium Grid 1 Accent 4" w:uiPriority="67"/>
-    <w:lsdException w:name="Medium Grid 2 Accent 4" w:uiPriority="68"/>
-    <w:lsdException w:name="Medium Grid 3 Accent 4" w:uiPriority="69"/>
-    <w:lsdException w:name="Dark List Accent 4" w:uiPriority="70"/>
-    <w:lsdException w:name="Colorful Shading Accent 4" w:uiPriority="71"/>
-    <w:lsdException w:name="Colorful List Accent 4" w:uiPriority="72"/>
-    <w:lsdException w:name="Colorful Grid Accent 4" w:uiPriority="73"/>
-    <w:lsdException w:name="Light Shading Accent 5" w:uiPriority="60"/>
-    <w:lsdException w:name="Light List Accent 5" w:uiPriority="61"/>
-    <w:lsdException w:name="Light Grid Accent 5" w:uiPriority="62"/>
-    <w:lsdException w:name="Medium Shading 1 Accent 5" w:uiPriority="63"/>
-    <w:lsdException w:name="Medium Shading 2 Accent 5" w:uiPriority="64"/>
-    <w:lsdException w:name="Medium List 1 Accent 5" w:uiPriority="65"/>
-    <w:lsdException w:name="Medium List 2 Accent 5" w:uiPriority="66"/>
-    <w:lsdException w:name="Medium Grid 1 Accent 5" w:uiPriority="67"/>
-    <w:lsdException w:name="Medium Grid 2 Accent 5" w:uiPriority="68"/>
-    <w:lsdException w:name="Medium Grid 3 Accent 5" w:uiPriority="69"/>
-    <w:lsdException w:name="Dark List Accent 5" w:uiPriority="70"/>
-    <w:lsdException w:name="Colorful Shading Accent 5" w:uiPriority="71"/>
-    <w:lsdException w:name="Colorful List Accent 5" w:uiPriority="72"/>
-    <w:lsdException w:name="Colorful Grid Accent 5" w:uiPriority="73"/>
-    <w:lsdException w:name="Light Shading Accent 6" w:uiPriority="60"/>
-    <w:lsdException w:name="Light List Accent 6" w:uiPriority="61"/>
-    <w:lsdException w:name="Light Grid Accent 6" w:uiPriority="62"/>
-    <w:lsdException w:name="Medium Shading 1 Accent 6" w:uiPriority="63"/>
-    <w:lsdException w:name="Medium Shading 2 Accent 6" w:uiPriority="64"/>
-    <w:lsdException w:name="Medium List 1 Accent 6" w:uiPriority="65"/>
-    <w:lsdException w:name="Medium List 2 Accent 6" w:uiPriority="66"/>
-    <w:lsdException w:name="Medium Grid 1 Accent 6" w:uiPriority="67"/>
-    <w:lsdException w:name="Medium Grid 2 Accent 6" w:uiPriority="68"/>
-    <w:lsdException w:name="Medium Grid 3 Accent 6" w:uiPriority="69"/>
-    <w:lsdException w:name="Dark List Accent 6" w:uiPriority="70"/>
-    <w:lsdException w:name="Colorful Shading Accent 6" w:uiPriority="71"/>
-    <w:lsdException w:name="Colorful List Accent 6" w:uiPriority="72"/>
-    <w:lsdException w:name="Colorful Grid Accent 6" w:uiPriority="73"/>
+    <w:lsdException w:name="Light Shading"/>
+    <w:lsdException w:name="Light List"/>
+    <w:lsdException w:name="Light Grid"/>
+    <w:lsdException w:name="Medium Shading 1"/>
+    <w:lsdException w:name="Medium Shading 2"/>
+    <w:lsdException w:name="Medium List 1"/>
+    <w:lsdException w:name="Medium List 2"/>
+    <w:lsdException w:name="Medium Grid 1"/>
+    <w:lsdException w:name="Medium Grid 2"/>
+    <w:lsdException w:name="Medium Grid 3"/>
+    <w:lsdException w:name="Dark List"/>
+    <w:lsdException w:name="Colorful Shading"/>
+    <w:lsdException w:name="Colorful List"/>
+    <w:lsdException w:name="Colorful Grid"/>
+    <w:lsdException w:name="Light Shading Accent 1"/>
+    <w:lsdException w:name="Light List Accent 1"/>
+    <w:lsdException w:name="Light Grid Accent 1"/>
+    <w:lsdException w:name="Medium Shading 1 Accent 1"/>
+    <w:lsdException w:name="Medium Shading 2 Accent 1"/>
+    <w:lsdException w:name="Medium List 1 Accent 1"/>
+    <w:lsdException w:name="Revision" w:semiHidden="1" w:unhideWhenUsed="1"/>
+    <w:lsdException w:name="List Paragraph" w:semiHidden="1" w:unhideWhenUsed="1"/>
+    <w:lsdException w:name="Quote" w:semiHidden="1" w:unhideWhenUsed="1"/>
+    <w:lsdException w:name="Intense Quote" w:semiHidden="1" w:unhideWhenUsed="1"/>
+    <w:lsdException w:name="Medium List 2 Accent 1"/>
+    <w:lsdException w:name="Medium Grid 1 Accent 1"/>
+    <w:lsdException w:name="Medium Grid 2 Accent 1"/>
+    <w:lsdException w:name="Medium Grid 3 Accent 1"/>
+    <w:lsdException w:name="Dark List Accent 1"/>
+    <w:lsdException w:name="Colorful Shading Accent 1"/>
+    <w:lsdException w:name="Colorful List Accent 1"/>
+    <w:lsdException w:name="Colorful Grid Accent 1"/>
+    <w:lsdException w:name="Light Shading Accent 2"/>
+    <w:lsdException w:name="Light List Accent 2"/>
+    <w:lsdException w:name="Light Grid Accent 2"/>
+    <w:lsdException w:name="Medium Shading 1 Accent 2"/>
+    <w:lsdException w:name="Medium Shading 2 Accent 2"/>
+    <w:lsdException w:name="Medium List 1 Accent 2"/>
+    <w:lsdException w:name="Medium List 2 Accent 2"/>
+    <w:lsdException w:name="Medium Grid 1 Accent 2"/>
+    <w:lsdException w:name="Medium Grid 2 Accent 2"/>
+    <w:lsdException w:name="Medium Grid 3 Accent 2"/>
+    <w:lsdException w:name="Dark List Accent 2"/>
+    <w:lsdException w:name="Colorful Shading Accent 2"/>
+    <w:lsdException w:name="Colorful List Accent 2"/>
+    <w:lsdException w:name="Colorful Grid Accent 2"/>
+    <w:lsdException w:name="Light Shading Accent 3"/>
+    <w:lsdException w:name="Light List Accent 3"/>
+    <w:lsdException w:name="Light Grid Accent 3"/>
+    <w:lsdException w:name="Medium Shading 1 Accent 3"/>
+    <w:lsdException w:name="Medium Shading 2 Accent 3"/>
+    <w:lsdException w:name="Medium List 1 Accent 3"/>
+    <w:lsdException w:name="Medium List 2 Accent 3"/>
+    <w:lsdException w:name="Medium Grid 1 Accent 3"/>
+    <w:lsdException w:name="Medium Grid 2 Accent 3"/>
+    <w:lsdException w:name="Medium Grid 3 Accent 3"/>
+    <w:lsdException w:name="Dark List Accent 3"/>
+    <w:lsdException w:name="Colorful Shading Accent 3"/>
+    <w:lsdException w:name="Colorful List Accent 3"/>
+    <w:lsdException w:name="Colorful Grid Accent 3"/>
+    <w:lsdException w:name="Light Shading Accent 4"/>
+    <w:lsdException w:name="Light List Accent 4"/>
+    <w:lsdException w:name="Light Grid Accent 4"/>
+    <w:lsdException w:name="Medium Shading 1 Accent 4"/>
+    <w:lsdException w:name="Medium Shading 2 Accent 4"/>
+    <w:lsdException w:name="Medium List 1 Accent 4"/>
+    <w:lsdException w:name="Medium List 2 Accent 4"/>
+    <w:lsdException w:name="Medium Grid 1 Accent 4"/>
+    <w:lsdException w:name="Medium Grid 2 Accent 4"/>
+    <w:lsdException w:name="Medium Grid 3 Accent 4"/>
+    <w:lsdException w:name="Dark List Accent 4"/>
+    <w:lsdException w:name="Colorful Shading Accent 4"/>
+    <w:lsdException w:name="Colorful List Accent 4"/>
+    <w:lsdException w:name="Colorful Grid Accent 4"/>
+    <w:lsdException w:name="Light Shading Accent 5"/>
+    <w:lsdException w:name="Light List Accent 5"/>
+    <w:lsdException w:name="Light Grid Accent 5"/>
+    <w:lsdException w:name="Medium Shading 1 Accent 5"/>
+    <w:lsdException w:name="Medium Shading 2 Accent 5"/>
+    <w:lsdException w:name="Medium List 1 Accent 5"/>
+    <w:lsdException w:name="Medium List 2 Accent 5"/>
+    <w:lsdException w:name="Medium Grid 1 Accent 5"/>
+    <w:lsdException w:name="Medium Grid 2 Accent 5"/>
+    <w:lsdException w:name="Medium Grid 3 Accent 5"/>
+    <w:lsdException w:name="Dark List Accent 5"/>
+    <w:lsdException w:name="Colorful Shading Accent 5"/>
+    <w:lsdException w:name="Colorful List Accent 5"/>
+    <w:lsdException w:name="Colorful Grid Accent 5"/>
+    <w:lsdException w:name="Light Shading Accent 6"/>
+    <w:lsdException w:name="Light List Accent 6"/>
+    <w:lsdException w:name="Light Grid Accent 6"/>
+    <w:lsdException w:name="Medium Shading 1 Accent 6"/>
+    <w:lsdException w:name="Medium Shading 2 Accent 6"/>
+    <w:lsdException w:name="Medium List 1 Accent 6"/>
+    <w:lsdException w:name="Medium List 2 Accent 6"/>
+    <w:lsdException w:name="Medium Grid 1 Accent 6"/>
+    <w:lsdException w:name="Medium Grid 2 Accent 6"/>
+    <w:lsdException w:name="Medium Grid 3 Accent 6"/>
+    <w:lsdException w:name="Dark List Accent 6"/>
+    <w:lsdException w:name="Colorful Shading Accent 6"/>
+    <w:lsdException w:name="Colorful List Accent 6"/>
+    <w:lsdException w:name="Colorful Grid Accent 6"/>
     <w:lsdException w:name="Subtle Emphasis" w:uiPriority="19" w:qFormat="1"/>
     <w:lsdException w:name="Intense Emphasis" w:uiPriority="21" w:qFormat="1"/>
     <w:lsdException w:name="Subtle Reference" w:uiPriority="31" w:qFormat="1"/>
@@ -1430,13 +1747,23 @@
     <w:lsdException w:name="List Table 5 Dark Accent 6" w:uiPriority="50"/>
     <w:lsdException w:name="List Table 6 Colorful Accent 6" w:uiPriority="51"/>
     <w:lsdException w:name="List Table 7 Colorful Accent 6" w:uiPriority="52"/>
+    <w:lsdException w:name="Mention" w:semiHidden="1" w:unhideWhenUsed="1"/>
+    <w:lsdException w:name="Smart Hyperlink" w:semiHidden="1" w:unhideWhenUsed="1"/>
+    <w:lsdException w:name="Hashtag" w:semiHidden="1" w:unhideWhenUsed="1"/>
+    <w:lsdException w:name="Unresolved Mention" w:semiHidden="1" w:unhideWhenUsed="1"/>
+    <w:lsdException w:name="Smart Link" w:semiHidden="1" w:unhideWhenUsed="1"/>
   </w:latentStyles>
   <w:style w:type="paragraph" w:default="1" w:styleId="Normal">
     <w:name w:val="Normal"/>
     <w:qFormat/>
-    <w:rsid w:val="00D75182"/>
+    <w:pPr>
+      <w:spacing w:after="160" w:line="259" w:lineRule="auto"/>
+    </w:pPr>
     <w:rPr>
       <w:rFonts w:eastAsia="MS Mincho"/>
+      <w:sz w:val="22"/>
+      <w:szCs w:val="22"/>
+      <w:lang w:val="es-GT" w:eastAsia="en-US"/>
     </w:rPr>
   </w:style>
   <w:style w:type="character" w:default="1" w:styleId="Fuentedeprrafopredeter">
@@ -1466,54 +1793,25 @@
     <w:semiHidden/>
     <w:unhideWhenUsed/>
   </w:style>
-  <w:style w:type="paragraph" w:styleId="Sinespaciado">
-    <w:name w:val="No Spacing"/>
-    <w:uiPriority w:val="1"/>
-    <w:qFormat/>
-    <w:rsid w:val="007B480D"/>
-    <w:pPr>
-      <w:spacing w:after="0" w:line="240" w:lineRule="auto"/>
-    </w:pPr>
-  </w:style>
   <w:style w:type="character" w:styleId="Refdecomentario">
     <w:name w:val="annotation reference"/>
     <w:basedOn w:val="Fuentedeprrafopredeter"/>
     <w:uiPriority w:val="99"/>
     <w:semiHidden/>
     <w:unhideWhenUsed/>
-    <w:rsid w:val="00EB52AC"/>
     <w:rPr>
       <w:sz w:val="16"/>
       <w:szCs w:val="16"/>
     </w:rPr>
   </w:style>
-  <w:style w:type="paragraph" w:styleId="Textocomentario">
-    <w:name w:val="annotation text"/>
-    <w:basedOn w:val="Normal"/>
-    <w:link w:val="TextocomentarioCar"/>
-    <w:uiPriority w:val="99"/>
-    <w:semiHidden/>
-    <w:unhideWhenUsed/>
-    <w:rsid w:val="00EB52AC"/>
-    <w:pPr>
-      <w:spacing w:line="240" w:lineRule="auto"/>
-    </w:pPr>
+  <w:style w:type="character" w:styleId="Textoennegrita">
+    <w:name w:val="Strong"/>
+    <w:basedOn w:val="Fuentedeprrafopredeter"/>
+    <w:uiPriority w:val="22"/>
+    <w:qFormat/>
     <w:rPr>
-      <w:sz w:val="20"/>
-      <w:szCs w:val="20"/>
-    </w:rPr>
-  </w:style>
-  <w:style w:type="character" w:customStyle="1" w:styleId="TextocomentarioCar">
-    <w:name w:val="Texto comentario Car"/>
-    <w:basedOn w:val="Fuentedeprrafopredeter"/>
-    <w:link w:val="Textocomentario"/>
-    <w:uiPriority w:val="99"/>
-    <w:semiHidden/>
-    <w:rsid w:val="00EB52AC"/>
-    <w:rPr>
-      <w:rFonts w:eastAsia="MS Mincho"/>
-      <w:sz w:val="20"/>
-      <w:szCs w:val="20"/>
+      <w:b/>
+      <w:bCs/>
     </w:rPr>
   </w:style>
   <w:style w:type="paragraph" w:styleId="Asuntodelcomentario">
@@ -1524,23 +1822,24 @@
     <w:uiPriority w:val="99"/>
     <w:semiHidden/>
     <w:unhideWhenUsed/>
-    <w:rsid w:val="00EB52AC"/>
+    <w:qFormat/>
     <w:rPr>
       <w:b/>
       <w:bCs/>
     </w:rPr>
   </w:style>
-  <w:style w:type="character" w:customStyle="1" w:styleId="AsuntodelcomentarioCar">
-    <w:name w:val="Asunto del comentario Car"/>
-    <w:basedOn w:val="TextocomentarioCar"/>
-    <w:link w:val="Asuntodelcomentario"/>
+  <w:style w:type="paragraph" w:styleId="Textocomentario">
+    <w:name w:val="annotation text"/>
+    <w:basedOn w:val="Normal"/>
+    <w:link w:val="TextocomentarioCar"/>
     <w:uiPriority w:val="99"/>
     <w:semiHidden/>
-    <w:rsid w:val="00EB52AC"/>
+    <w:unhideWhenUsed/>
+    <w:qFormat/>
+    <w:pPr>
+      <w:spacing w:line="240" w:lineRule="auto"/>
+    </w:pPr>
     <w:rPr>
-      <w:rFonts w:eastAsia="MS Mincho"/>
-      <w:b/>
-      <w:bCs/>
       <w:sz w:val="20"/>
       <w:szCs w:val="20"/>
     </w:rPr>
@@ -1552,7 +1851,7 @@
     <w:uiPriority w:val="99"/>
     <w:semiHidden/>
     <w:unhideWhenUsed/>
-    <w:rsid w:val="0005271C"/>
+    <w:qFormat/>
     <w:pPr>
       <w:spacing w:after="0" w:line="240" w:lineRule="auto"/>
     </w:pPr>
@@ -1562,32 +1861,28 @@
       <w:szCs w:val="18"/>
     </w:rPr>
   </w:style>
-  <w:style w:type="character" w:customStyle="1" w:styleId="TextodegloboCar">
-    <w:name w:val="Texto de globo Car"/>
-    <w:basedOn w:val="Fuentedeprrafopredeter"/>
-    <w:link w:val="Textodeglobo"/>
+  <w:style w:type="paragraph" w:styleId="NormalWeb">
+    <w:name w:val="Normal (Web)"/>
+    <w:basedOn w:val="Normal"/>
     <w:uiPriority w:val="99"/>
     <w:semiHidden/>
-    <w:rsid w:val="0005271C"/>
+    <w:unhideWhenUsed/>
+    <w:qFormat/>
+    <w:pPr>
+      <w:spacing w:before="100" w:beforeAutospacing="1" w:after="100" w:afterAutospacing="1" w:line="240" w:lineRule="auto"/>
+    </w:pPr>
     <w:rPr>
-      <w:rFonts w:ascii="Segoe UI" w:eastAsia="MS Mincho" w:hAnsi="Segoe UI" w:cs="Segoe UI"/>
-      <w:sz w:val="18"/>
-      <w:szCs w:val="18"/>
+      <w:rFonts w:ascii="Times New Roman" w:eastAsia="Times New Roman" w:hAnsi="Times New Roman" w:cs="Times New Roman"/>
+      <w:sz w:val="24"/>
+      <w:szCs w:val="24"/>
+      <w:lang w:eastAsia="es-GT"/>
     </w:rPr>
-  </w:style>
-  <w:style w:type="character" w:customStyle="1" w:styleId="oypena">
-    <w:name w:val="oypena"/>
-    <w:basedOn w:val="Fuentedeprrafopredeter"/>
-    <w:rsid w:val="003F5629"/>
   </w:style>
   <w:style w:type="table" w:styleId="Tablaconcuadrcula">
     <w:name w:val="Table Grid"/>
     <w:basedOn w:val="Tablanormal"/>
     <w:uiPriority w:val="39"/>
-    <w:rsid w:val="00C251FB"/>
-    <w:pPr>
-      <w:spacing w:after="0" w:line="240" w:lineRule="auto"/>
-    </w:pPr>
+    <w:qFormat/>
     <w:tblPr>
       <w:tblBorders>
         <w:top w:val="single" w:sz="4" w:space="0" w:color="auto"/>
@@ -1599,10 +1894,66 @@
       </w:tblBorders>
     </w:tblPr>
   </w:style>
+  <w:style w:type="paragraph" w:styleId="Sinespaciado">
+    <w:name w:val="No Spacing"/>
+    <w:uiPriority w:val="1"/>
+    <w:qFormat/>
+    <w:rPr>
+      <w:sz w:val="22"/>
+      <w:szCs w:val="22"/>
+      <w:lang w:val="es-GT" w:eastAsia="en-US"/>
+    </w:rPr>
+  </w:style>
+  <w:style w:type="character" w:customStyle="1" w:styleId="TextocomentarioCar">
+    <w:name w:val="Texto comentario Car"/>
+    <w:basedOn w:val="Fuentedeprrafopredeter"/>
+    <w:link w:val="Textocomentario"/>
+    <w:uiPriority w:val="99"/>
+    <w:semiHidden/>
+    <w:qFormat/>
+    <w:rPr>
+      <w:rFonts w:eastAsia="MS Mincho"/>
+      <w:sz w:val="20"/>
+      <w:szCs w:val="20"/>
+    </w:rPr>
+  </w:style>
+  <w:style w:type="character" w:customStyle="1" w:styleId="AsuntodelcomentarioCar">
+    <w:name w:val="Asunto del comentario Car"/>
+    <w:basedOn w:val="TextocomentarioCar"/>
+    <w:link w:val="Asuntodelcomentario"/>
+    <w:uiPriority w:val="99"/>
+    <w:semiHidden/>
+    <w:qFormat/>
+    <w:rPr>
+      <w:rFonts w:eastAsia="MS Mincho"/>
+      <w:b/>
+      <w:bCs/>
+      <w:sz w:val="20"/>
+      <w:szCs w:val="20"/>
+    </w:rPr>
+  </w:style>
+  <w:style w:type="character" w:customStyle="1" w:styleId="TextodegloboCar">
+    <w:name w:val="Texto de globo Car"/>
+    <w:basedOn w:val="Fuentedeprrafopredeter"/>
+    <w:link w:val="Textodeglobo"/>
+    <w:uiPriority w:val="99"/>
+    <w:semiHidden/>
+    <w:qFormat/>
+    <w:rPr>
+      <w:rFonts w:ascii="Segoe UI" w:eastAsia="MS Mincho" w:hAnsi="Segoe UI" w:cs="Segoe UI"/>
+      <w:sz w:val="18"/>
+      <w:szCs w:val="18"/>
+    </w:rPr>
+  </w:style>
+  <w:style w:type="character" w:customStyle="1" w:styleId="oypena">
+    <w:name w:val="oypena"/>
+    <w:basedOn w:val="Fuentedeprrafopredeter"/>
+    <w:qFormat/>
+  </w:style>
   <w:style w:type="paragraph" w:customStyle="1" w:styleId="paragraph">
     <w:name w:val="paragraph"/>
     <w:basedOn w:val="Normal"/>
-    <w:rsid w:val="006E1988"/>
+    <w:qFormat/>
     <w:pPr>
       <w:spacing w:before="100" w:beforeAutospacing="1" w:after="100" w:afterAutospacing="1" w:line="240" w:lineRule="auto"/>
     </w:pPr>
@@ -1616,49 +1967,21 @@
   <w:style w:type="character" w:customStyle="1" w:styleId="normaltextrun">
     <w:name w:val="normaltextrun"/>
     <w:basedOn w:val="Fuentedeprrafopredeter"/>
-    <w:rsid w:val="006E1988"/>
+    <w:qFormat/>
   </w:style>
   <w:style w:type="character" w:customStyle="1" w:styleId="eop">
     <w:name w:val="eop"/>
     <w:basedOn w:val="Fuentedeprrafopredeter"/>
-    <w:rsid w:val="006E1988"/>
-  </w:style>
-  <w:style w:type="paragraph" w:styleId="NormalWeb">
-    <w:name w:val="Normal (Web)"/>
-    <w:basedOn w:val="Normal"/>
-    <w:uiPriority w:val="99"/>
-    <w:semiHidden/>
-    <w:unhideWhenUsed/>
-    <w:rsid w:val="00B952EC"/>
-    <w:pPr>
-      <w:spacing w:before="100" w:beforeAutospacing="1" w:after="100" w:afterAutospacing="1" w:line="240" w:lineRule="auto"/>
-    </w:pPr>
-    <w:rPr>
-      <w:rFonts w:ascii="Times New Roman" w:eastAsia="Times New Roman" w:hAnsi="Times New Roman" w:cs="Times New Roman"/>
-      <w:sz w:val="24"/>
-      <w:szCs w:val="24"/>
-      <w:lang w:eastAsia="es-GT"/>
-    </w:rPr>
+    <w:qFormat/>
   </w:style>
   <w:style w:type="character" w:customStyle="1" w:styleId="cf01">
     <w:name w:val="cf01"/>
     <w:basedOn w:val="Fuentedeprrafopredeter"/>
-    <w:rsid w:val="00B952EC"/>
+    <w:qFormat/>
     <w:rPr>
       <w:rFonts w:ascii="Consolas" w:hAnsi="Consolas" w:hint="default"/>
       <w:sz w:val="22"/>
       <w:szCs w:val="22"/>
-    </w:rPr>
-  </w:style>
-  <w:style w:type="character" w:styleId="Textoennegrita">
-    <w:name w:val="Strong"/>
-    <w:basedOn w:val="Fuentedeprrafopredeter"/>
-    <w:uiPriority w:val="22"/>
-    <w:qFormat/>
-    <w:rsid w:val="0078207B"/>
-    <w:rPr>
-      <w:b/>
-      <w:bCs/>
     </w:rPr>
   </w:style>
 </w:styles>
@@ -1707,7 +2030,7 @@
     </a:clrScheme>
     <a:fontScheme name="Office">
       <a:majorFont>
-        <a:latin typeface="Calibri Light" panose="020F0302020204030204"/>
+        <a:latin typeface="Calibri Light"/>
         <a:ea typeface=""/>
         <a:cs typeface=""/>
         <a:font script="Jpan" typeface="游ゴシック Light"/>
@@ -1740,26 +2063,9 @@
         <a:font script="Viet" typeface="Times New Roman"/>
         <a:font script="Uigh" typeface="Microsoft Uighur"/>
         <a:font script="Geor" typeface="Sylfaen"/>
-        <a:font script="Armn" typeface="Arial"/>
-        <a:font script="Bugi" typeface="Leelawadee UI"/>
-        <a:font script="Bopo" typeface="Microsoft JhengHei"/>
-        <a:font script="Java" typeface="Javanese Text"/>
-        <a:font script="Lisu" typeface="Segoe UI"/>
-        <a:font script="Mymr" typeface="Myanmar Text"/>
-        <a:font script="Nkoo" typeface="Ebrima"/>
-        <a:font script="Olck" typeface="Nirmala UI"/>
-        <a:font script="Osma" typeface="Ebrima"/>
-        <a:font script="Phag" typeface="Phagspa"/>
-        <a:font script="Syrn" typeface="Estrangelo Edessa"/>
-        <a:font script="Syrj" typeface="Estrangelo Edessa"/>
-        <a:font script="Syre" typeface="Estrangelo Edessa"/>
-        <a:font script="Sora" typeface="Nirmala UI"/>
-        <a:font script="Tale" typeface="Microsoft Tai Le"/>
-        <a:font script="Talu" typeface="Microsoft New Tai Lue"/>
-        <a:font script="Tfng" typeface="Ebrima"/>
       </a:majorFont>
       <a:minorFont>
-        <a:latin typeface="Calibri" panose="020F0502020204030204"/>
+        <a:latin typeface="Calibri"/>
         <a:ea typeface=""/>
         <a:cs typeface=""/>
         <a:font script="Jpan" typeface="游明朝"/>
@@ -1792,23 +2098,6 @@
         <a:font script="Viet" typeface="Arial"/>
         <a:font script="Uigh" typeface="Microsoft Uighur"/>
         <a:font script="Geor" typeface="Sylfaen"/>
-        <a:font script="Armn" typeface="Arial"/>
-        <a:font script="Bugi" typeface="Leelawadee UI"/>
-        <a:font script="Bopo" typeface="Microsoft JhengHei"/>
-        <a:font script="Java" typeface="Javanese Text"/>
-        <a:font script="Lisu" typeface="Segoe UI"/>
-        <a:font script="Mymr" typeface="Myanmar Text"/>
-        <a:font script="Nkoo" typeface="Ebrima"/>
-        <a:font script="Olck" typeface="Nirmala UI"/>
-        <a:font script="Osma" typeface="Ebrima"/>
-        <a:font script="Phag" typeface="Phagspa"/>
-        <a:font script="Syrn" typeface="Estrangelo Edessa"/>
-        <a:font script="Syrj" typeface="Estrangelo Edessa"/>
-        <a:font script="Syre" typeface="Estrangelo Edessa"/>
-        <a:font script="Sora" typeface="Nirmala UI"/>
-        <a:font script="Tale" typeface="Microsoft Tai Le"/>
-        <a:font script="Talu" typeface="Microsoft New Tai Lue"/>
-        <a:font script="Tfng" typeface="Ebrima"/>
       </a:minorFont>
     </a:fontScheme>
     <a:fmtScheme name="Office">
@@ -1951,10 +2240,5 @@
   </a:themeElements>
   <a:objectDefaults/>
   <a:extraClrSchemeLst/>
-  <a:extLst>
-    <a:ext uri="{05A4C25C-085E-4340-85A3-A5531E510DB2}">
-      <thm15:themeFamily xmlns:thm15="http://schemas.microsoft.com/office/thememl/2012/main" name="Office Theme" id="{62F939B6-93AF-4DB8-9C6B-D6C7DFDC589F}" vid="{4A3C46E8-61CC-4603-A589-7422A47A8E4A}"/>
-    </a:ext>
-  </a:extLst>
 </a:theme>
 </file>
</xml_diff>

<commit_message>
add:Se Agrego los datos del programador bargueta-2024358 al documento Peaceathome.docx en la rama bargueta-2024358
</commit_message>
<xml_diff>
--- a/Peaceathome.docx
+++ b/Peaceathome.docx
@@ -1,6 +1,6 @@
 
 <file path=word/document.xml><?xml version="1.0" encoding="utf-8"?>
-<w:document xmlns:wpc="http://schemas.microsoft.com/office/word/2010/wordprocessingCanvas" xmlns:cx="http://schemas.microsoft.com/office/drawing/2014/chartex" xmlns:cx1="http://schemas.microsoft.com/office/drawing/2015/9/8/chartex" xmlns:mc="http://schemas.openxmlformats.org/markup-compatibility/2006" xmlns:o="urn:schemas-microsoft-com:office:office" xmlns:r="http://schemas.openxmlformats.org/officeDocument/2006/relationships" xmlns:m="http://schemas.openxmlformats.org/officeDocument/2006/math" xmlns:v="urn:schemas-microsoft-com:vml" xmlns:wp14="http://schemas.microsoft.com/office/word/2010/wordprocessingDrawing" xmlns:wp="http://schemas.openxmlformats.org/drawingml/2006/wordprocessingDrawing" xmlns:w10="urn:schemas-microsoft-com:office:word" xmlns:w="http://schemas.openxmlformats.org/wordprocessingml/2006/main" xmlns:w14="http://schemas.microsoft.com/office/word/2010/wordml" xmlns:w15="http://schemas.microsoft.com/office/word/2012/wordml" xmlns:w16se="http://schemas.microsoft.com/office/word/2015/wordml/symex" xmlns:wpg="http://schemas.microsoft.com/office/word/2010/wordprocessingGroup" xmlns:wpi="http://schemas.microsoft.com/office/word/2010/wordprocessingInk" xmlns:wne="http://schemas.microsoft.com/office/word/2006/wordml" xmlns:wps="http://schemas.microsoft.com/office/word/2010/wordprocessingShape" mc:Ignorable="w14 w15 w16se wp14">
+<w:document xmlns:wpc="http://schemas.microsoft.com/office/word/2010/wordprocessingCanvas" xmlns:cx="http://schemas.microsoft.com/office/drawing/2014/chartex" xmlns:cx1="http://schemas.microsoft.com/office/drawing/2015/9/8/chartex" xmlns:cx2="http://schemas.microsoft.com/office/drawing/2015/10/21/chartex" xmlns:cx3="http://schemas.microsoft.com/office/drawing/2016/5/9/chartex" xmlns:cx4="http://schemas.microsoft.com/office/drawing/2016/5/10/chartex" xmlns:cx5="http://schemas.microsoft.com/office/drawing/2016/5/11/chartex" xmlns:cx6="http://schemas.microsoft.com/office/drawing/2016/5/12/chartex" xmlns:cx7="http://schemas.microsoft.com/office/drawing/2016/5/13/chartex" xmlns:cx8="http://schemas.microsoft.com/office/drawing/2016/5/14/chartex" xmlns:mc="http://schemas.openxmlformats.org/markup-compatibility/2006" xmlns:aink="http://schemas.microsoft.com/office/drawing/2016/ink" xmlns:am3d="http://schemas.microsoft.com/office/drawing/2017/model3d" xmlns:o="urn:schemas-microsoft-com:office:office" xmlns:oel="http://schemas.microsoft.com/office/2019/extlst" xmlns:r="http://schemas.openxmlformats.org/officeDocument/2006/relationships" xmlns:m="http://schemas.openxmlformats.org/officeDocument/2006/math" xmlns:v="urn:schemas-microsoft-com:vml" xmlns:wp14="http://schemas.microsoft.com/office/word/2010/wordprocessingDrawing" xmlns:wp="http://schemas.openxmlformats.org/drawingml/2006/wordprocessingDrawing" xmlns:w10="urn:schemas-microsoft-com:office:word" xmlns:w="http://schemas.openxmlformats.org/wordprocessingml/2006/main" xmlns:w14="http://schemas.microsoft.com/office/word/2010/wordml" xmlns:w15="http://schemas.microsoft.com/office/word/2012/wordml" xmlns:w16cex="http://schemas.microsoft.com/office/word/2018/wordml/cex" xmlns:w16cid="http://schemas.microsoft.com/office/word/2016/wordml/cid" xmlns:w16="http://schemas.microsoft.com/office/word/2018/wordml" xmlns:w16du="http://schemas.microsoft.com/office/word/2023/wordml/word16du" xmlns:w16sdtdh="http://schemas.microsoft.com/office/word/2020/wordml/sdtdatahash" xmlns:w16sdtfl="http://schemas.microsoft.com/office/word/2024/wordml/sdtformatlock" xmlns:w16se="http://schemas.microsoft.com/office/word/2015/wordml/symex" xmlns:wpg="http://schemas.microsoft.com/office/word/2010/wordprocessingGroup" xmlns:wpi="http://schemas.microsoft.com/office/word/2010/wordprocessingInk" xmlns:wne="http://schemas.microsoft.com/office/word/2006/wordml" xmlns:wps="http://schemas.microsoft.com/office/word/2010/wordprocessingShape" mc:Ignorable="w14 w15 w16se w16cid w16 w16cex w16sdtdh w16sdtfl w16du wp14">
   <w:body>
     <w:p>
       <w:pPr>
@@ -16,11 +16,11 @@
           <w:rFonts w:ascii="Arial" w:hAnsi="Arial" w:cs="Arial"/>
           <w:b/>
           <w:noProof/>
-          <w:lang w:eastAsia="es-GT"/>
+          <w:lang w:val="en-US"/>
         </w:rPr>
         <w:drawing>
-          <wp:inline distT="0" distB="0" distL="0" distR="0" wp14:anchorId="61DA3BD1" wp14:editId="0C35A376">
-            <wp:extent cx="2249144" cy="847725"/>
+          <wp:inline distT="0" distB="0" distL="0" distR="0" wp14:anchorId="2FEE8166" wp14:editId="6BE70031">
+            <wp:extent cx="2248535" cy="847725"/>
             <wp:effectExtent l="0" t="0" r="0" b="0"/>
             <wp:docPr id="2" name="Imagen 2"/>
             <wp:cNvGraphicFramePr>
@@ -30,13 +30,13 @@
               <a:graphicData uri="http://schemas.openxmlformats.org/drawingml/2006/picture">
                 <pic:pic xmlns:pic="http://schemas.openxmlformats.org/drawingml/2006/picture">
                   <pic:nvPicPr>
-                    <pic:cNvPr id="0" name="Picture 1"/>
+                    <pic:cNvPr id="2" name="Imagen 2"/>
                     <pic:cNvPicPr>
                       <a:picLocks noChangeAspect="1" noChangeArrowheads="1"/>
                     </pic:cNvPicPr>
                   </pic:nvPicPr>
                   <pic:blipFill>
-                    <a:blip r:embed="rId4" cstate="print">
+                    <a:blip r:embed="rId6" cstate="print">
                       <a:extLst>
                         <a:ext uri="{28A0092B-C50C-407E-A947-70E740481C1C}">
                           <a14:useLocalDpi xmlns:a14="http://schemas.microsoft.com/office/drawing/2010/main" val="0"/>
@@ -48,7 +48,7 @@
                       <a:fillRect/>
                     </a:stretch>
                   </pic:blipFill>
-                  <pic:spPr bwMode="auto">
+                  <pic:spPr>
                     <a:xfrm>
                       <a:off x="0" y="0"/>
                       <a:ext cx="2253277" cy="849283"/>
@@ -120,13 +120,7 @@
         <w:rPr>
           <w:rFonts w:ascii="Arial" w:hAnsi="Arial" w:cs="Arial"/>
         </w:rPr>
-        <w:t>5TO. PERITO EN INFORMATICA</w:t>
-      </w:r>
-      <w:r>
-        <w:rPr>
-          <w:rFonts w:ascii="Arial" w:hAnsi="Arial" w:cs="Arial"/>
-        </w:rPr>
-        <w:t xml:space="preserve"> </w:t>
+        <w:t xml:space="preserve">5TO. PERITO EN INFORMATICA </w:t>
       </w:r>
     </w:p>
     <w:p>
@@ -507,56 +501,7 @@
           <w:rFonts w:ascii="Arial" w:hAnsi="Arial" w:cs="Arial"/>
           <w:sz w:val="24"/>
         </w:rPr>
-        <w:t xml:space="preserve">Guatemala, </w:t>
-      </w:r>
-      <w:r>
-        <w:rPr>
-          <w:rFonts w:ascii="Arial" w:hAnsi="Arial" w:cs="Arial"/>
-          <w:sz w:val="24"/>
-        </w:rPr>
-        <w:t xml:space="preserve">15 </w:t>
-      </w:r>
-      <w:r>
-        <w:rPr>
-          <w:rFonts w:ascii="Arial" w:hAnsi="Arial" w:cs="Arial"/>
-          <w:sz w:val="24"/>
-        </w:rPr>
-        <w:t xml:space="preserve">de </w:t>
-      </w:r>
-      <w:r>
-        <w:rPr>
-          <w:rFonts w:ascii="Arial" w:hAnsi="Arial" w:cs="Arial"/>
-          <w:sz w:val="24"/>
-        </w:rPr>
-        <w:t xml:space="preserve">Julio </w:t>
-      </w:r>
-      <w:r>
-        <w:rPr>
-          <w:rFonts w:ascii="Arial" w:hAnsi="Arial" w:cs="Arial"/>
-          <w:sz w:val="24"/>
-        </w:rPr>
-        <w:t>de 20</w:t>
-      </w:r>
-      <w:r>
-        <w:rPr>
-          <w:rFonts w:ascii="Arial" w:hAnsi="Arial" w:cs="Arial"/>
-          <w:sz w:val="24"/>
-        </w:rPr>
-        <w:t>2</w:t>
-      </w:r>
-      <w:r>
-        <w:rPr>
-          <w:rFonts w:ascii="Arial" w:hAnsi="Arial" w:cs="Arial"/>
-          <w:sz w:val="24"/>
-        </w:rPr>
-        <w:t>5</w:t>
-      </w:r>
-      <w:r>
-        <w:rPr>
-          <w:rFonts w:ascii="Arial" w:hAnsi="Arial" w:cs="Arial"/>
-          <w:sz w:val="24"/>
-        </w:rPr>
-        <w:t>.</w:t>
+        <w:t>Guatemala, 15 de Julio de 2025.</w:t>
       </w:r>
     </w:p>
     <w:p>
@@ -590,6 +535,7 @@
           </w:tcPr>
           <w:p>
             <w:pPr>
+              <w:spacing w:after="0" w:line="240" w:lineRule="auto"/>
               <w:jc w:val="center"/>
               <w:rPr>
                 <w:rFonts w:ascii="Arial" w:eastAsiaTheme="minorHAnsi" w:hAnsi="Arial" w:cs="Arial"/>
@@ -624,6 +570,7 @@
           </w:tcPr>
           <w:p>
             <w:pPr>
+              <w:spacing w:after="0" w:line="240" w:lineRule="auto"/>
               <w:jc w:val="center"/>
               <w:rPr>
                 <w:rFonts w:ascii="Arial" w:eastAsiaTheme="minorHAnsi" w:hAnsi="Arial" w:cs="Arial"/>
@@ -649,6 +596,7 @@
           </w:tcPr>
           <w:p>
             <w:pPr>
+              <w:spacing w:after="0" w:line="240" w:lineRule="auto"/>
               <w:jc w:val="center"/>
               <w:rPr>
                 <w:rFonts w:ascii="Arial" w:eastAsiaTheme="minorHAnsi" w:hAnsi="Arial" w:cs="Arial"/>
@@ -656,20 +604,74 @@
                 <w:lang w:val="es-ES"/>
               </w:rPr>
             </w:pPr>
-          </w:p>
-        </w:tc>
-        <w:tc>
-          <w:tcPr>
-            <w:tcW w:w="5395" w:type="dxa"/>
-          </w:tcPr>
-          <w:p>
-            <w:pPr>
-              <w:jc w:val="center"/>
-              <w:rPr>
-                <w:rFonts w:ascii="Arial" w:eastAsiaTheme="minorHAnsi" w:hAnsi="Arial" w:cs="Arial"/>
-                <w:sz w:val="24"/>
-              </w:rPr>
-            </w:pPr>
+            <w:proofErr w:type="spellStart"/>
+            <w:r>
+              <w:rPr>
+                <w:rFonts w:ascii="Arial" w:eastAsiaTheme="minorHAnsi" w:hAnsi="Arial" w:cs="Arial"/>
+                <w:sz w:val="24"/>
+                <w:lang w:val="es-ES"/>
+              </w:rPr>
+              <w:t>Kenet</w:t>
+            </w:r>
+            <w:proofErr w:type="spellEnd"/>
+            <w:r>
+              <w:rPr>
+                <w:rFonts w:ascii="Arial" w:eastAsiaTheme="minorHAnsi" w:hAnsi="Arial" w:cs="Arial"/>
+                <w:sz w:val="24"/>
+                <w:lang w:val="es-ES"/>
+              </w:rPr>
+              <w:t xml:space="preserve"> Efraín </w:t>
+            </w:r>
+            <w:proofErr w:type="spellStart"/>
+            <w:r>
+              <w:rPr>
+                <w:rFonts w:ascii="Arial" w:eastAsiaTheme="minorHAnsi" w:hAnsi="Arial" w:cs="Arial"/>
+                <w:sz w:val="24"/>
+                <w:lang w:val="es-ES"/>
+              </w:rPr>
+              <w:t>Cuyuch</w:t>
+            </w:r>
+            <w:proofErr w:type="spellEnd"/>
+            <w:r>
+              <w:rPr>
+                <w:rFonts w:ascii="Arial" w:eastAsiaTheme="minorHAnsi" w:hAnsi="Arial" w:cs="Arial"/>
+                <w:sz w:val="24"/>
+                <w:lang w:val="es-ES"/>
+              </w:rPr>
+              <w:t xml:space="preserve"> </w:t>
+            </w:r>
+            <w:proofErr w:type="spellStart"/>
+            <w:r>
+              <w:rPr>
+                <w:rFonts w:ascii="Arial" w:eastAsiaTheme="minorHAnsi" w:hAnsi="Arial" w:cs="Arial"/>
+                <w:sz w:val="24"/>
+                <w:lang w:val="es-ES"/>
+              </w:rPr>
+              <w:t>Joj</w:t>
+            </w:r>
+            <w:proofErr w:type="spellEnd"/>
+          </w:p>
+        </w:tc>
+        <w:tc>
+          <w:tcPr>
+            <w:tcW w:w="5395" w:type="dxa"/>
+          </w:tcPr>
+          <w:p>
+            <w:pPr>
+              <w:spacing w:after="0" w:line="240" w:lineRule="auto"/>
+              <w:jc w:val="center"/>
+              <w:rPr>
+                <w:rFonts w:ascii="Arial" w:eastAsiaTheme="minorHAnsi" w:hAnsi="Arial" w:cs="Arial"/>
+                <w:sz w:val="24"/>
+              </w:rPr>
+            </w:pPr>
+            <w:r>
+              <w:rPr>
+                <w:rFonts w:ascii="Arial" w:eastAsiaTheme="minorHAnsi" w:hAnsi="Arial" w:cs="Arial"/>
+                <w:sz w:val="24"/>
+              </w:rPr>
+              <w:t>Scrum Master</w:t>
+            </w:r>
           </w:p>
         </w:tc>
       </w:tr>
@@ -680,26 +682,68 @@
           </w:tcPr>
           <w:p>
             <w:pPr>
-              <w:jc w:val="center"/>
-              <w:rPr>
-                <w:rFonts w:ascii="Arial" w:eastAsiaTheme="minorHAnsi" w:hAnsi="Arial" w:cs="Arial"/>
-                <w:sz w:val="24"/>
-              </w:rPr>
-            </w:pPr>
-          </w:p>
-        </w:tc>
-        <w:tc>
-          <w:tcPr>
-            <w:tcW w:w="5395" w:type="dxa"/>
-          </w:tcPr>
-          <w:p>
-            <w:pPr>
-              <w:jc w:val="center"/>
-              <w:rPr>
-                <w:rFonts w:ascii="Arial" w:eastAsiaTheme="minorHAnsi" w:hAnsi="Arial" w:cs="Arial"/>
-                <w:sz w:val="24"/>
-              </w:rPr>
-            </w:pPr>
+              <w:spacing w:after="0" w:line="240" w:lineRule="auto"/>
+              <w:jc w:val="center"/>
+              <w:rPr>
+                <w:rFonts w:ascii="Arial" w:eastAsiaTheme="minorHAnsi" w:hAnsi="Arial" w:cs="Arial"/>
+                <w:sz w:val="24"/>
+              </w:rPr>
+            </w:pPr>
+            <w:proofErr w:type="spellStart"/>
+            <w:r>
+              <w:rPr>
+                <w:rFonts w:ascii="Arial" w:eastAsiaTheme="minorHAnsi" w:hAnsi="Arial" w:cs="Arial"/>
+                <w:sz w:val="24"/>
+              </w:rPr>
+              <w:t>Angel</w:t>
+            </w:r>
+            <w:proofErr w:type="spellEnd"/>
+            <w:r>
+              <w:rPr>
+                <w:rFonts w:ascii="Arial" w:eastAsiaTheme="minorHAnsi" w:hAnsi="Arial" w:cs="Arial"/>
+                <w:sz w:val="24"/>
+              </w:rPr>
+              <w:t xml:space="preserve"> </w:t>
+            </w:r>
+            <w:proofErr w:type="spellStart"/>
+            <w:r>
+              <w:rPr>
+                <w:rFonts w:ascii="Arial" w:eastAsiaTheme="minorHAnsi" w:hAnsi="Arial" w:cs="Arial"/>
+                <w:sz w:val="24"/>
+              </w:rPr>
+              <w:t>Gahel</w:t>
+            </w:r>
+            <w:proofErr w:type="spellEnd"/>
+            <w:r>
+              <w:rPr>
+                <w:rFonts w:ascii="Arial" w:eastAsiaTheme="minorHAnsi" w:hAnsi="Arial" w:cs="Arial"/>
+                <w:sz w:val="24"/>
+              </w:rPr>
+              <w:t xml:space="preserve"> Padilla Pacheco</w:t>
+            </w:r>
+          </w:p>
+        </w:tc>
+        <w:tc>
+          <w:tcPr>
+            <w:tcW w:w="5395" w:type="dxa"/>
+          </w:tcPr>
+          <w:p>
+            <w:pPr>
+              <w:spacing w:after="0" w:line="240" w:lineRule="auto"/>
+              <w:jc w:val="center"/>
+              <w:rPr>
+                <w:rFonts w:ascii="Arial" w:eastAsiaTheme="minorHAnsi" w:hAnsi="Arial" w:cs="Arial"/>
+                <w:sz w:val="24"/>
+                <w:u w:val="single"/>
+              </w:rPr>
+            </w:pPr>
+            <w:r>
+              <w:rPr>
+                <w:rFonts w:ascii="Arial" w:eastAsiaTheme="minorHAnsi" w:hAnsi="Arial" w:cs="Arial"/>
+                <w:sz w:val="24"/>
+              </w:rPr>
+              <w:t>Programador</w:t>
+            </w:r>
           </w:p>
         </w:tc>
       </w:tr>
@@ -710,26 +754,76 @@
           </w:tcPr>
           <w:p>
             <w:pPr>
-              <w:jc w:val="center"/>
-              <w:rPr>
-                <w:rFonts w:ascii="Arial" w:eastAsiaTheme="minorHAnsi" w:hAnsi="Arial" w:cs="Arial"/>
-                <w:sz w:val="24"/>
-              </w:rPr>
-            </w:pPr>
-          </w:p>
-        </w:tc>
-        <w:tc>
-          <w:tcPr>
-            <w:tcW w:w="5395" w:type="dxa"/>
-          </w:tcPr>
-          <w:p>
-            <w:pPr>
-              <w:jc w:val="center"/>
-              <w:rPr>
-                <w:rFonts w:ascii="Arial" w:eastAsiaTheme="minorHAnsi" w:hAnsi="Arial" w:cs="Arial"/>
-                <w:sz w:val="24"/>
-              </w:rPr>
-            </w:pPr>
+              <w:spacing w:after="0" w:line="240" w:lineRule="auto"/>
+              <w:jc w:val="center"/>
+              <w:rPr>
+                <w:rFonts w:ascii="Arial" w:eastAsiaTheme="minorHAnsi" w:hAnsi="Arial" w:cs="Arial"/>
+                <w:sz w:val="24"/>
+              </w:rPr>
+            </w:pPr>
+            <w:proofErr w:type="spellStart"/>
+            <w:r>
+              <w:rPr>
+                <w:rFonts w:ascii="Arial" w:eastAsiaTheme="minorHAnsi" w:hAnsi="Arial" w:cs="Arial"/>
+                <w:sz w:val="24"/>
+              </w:rPr>
+              <w:t>Jose</w:t>
+            </w:r>
+            <w:proofErr w:type="spellEnd"/>
+            <w:r>
+              <w:rPr>
+                <w:rFonts w:ascii="Arial" w:eastAsiaTheme="minorHAnsi" w:hAnsi="Arial" w:cs="Arial"/>
+                <w:sz w:val="24"/>
+              </w:rPr>
+              <w:t xml:space="preserve"> Enrique </w:t>
+            </w:r>
+            <w:proofErr w:type="spellStart"/>
+            <w:r>
+              <w:rPr>
+                <w:rFonts w:ascii="Arial" w:eastAsiaTheme="minorHAnsi" w:hAnsi="Arial" w:cs="Arial"/>
+                <w:sz w:val="24"/>
+              </w:rPr>
+              <w:t>cuc</w:t>
+            </w:r>
+            <w:proofErr w:type="spellEnd"/>
+            <w:r>
+              <w:rPr>
+                <w:rFonts w:ascii="Arial" w:eastAsiaTheme="minorHAnsi" w:hAnsi="Arial" w:cs="Arial"/>
+                <w:sz w:val="24"/>
+              </w:rPr>
+              <w:t xml:space="preserve"> </w:t>
+            </w:r>
+            <w:proofErr w:type="spellStart"/>
+            <w:r>
+              <w:rPr>
+                <w:rFonts w:ascii="Arial" w:eastAsiaTheme="minorHAnsi" w:hAnsi="Arial" w:cs="Arial"/>
+                <w:sz w:val="24"/>
+              </w:rPr>
+              <w:t>cutz</w:t>
+            </w:r>
+            <w:proofErr w:type="spellEnd"/>
+          </w:p>
+        </w:tc>
+        <w:tc>
+          <w:tcPr>
+            <w:tcW w:w="5395" w:type="dxa"/>
+          </w:tcPr>
+          <w:p>
+            <w:pPr>
+              <w:spacing w:after="0" w:line="240" w:lineRule="auto"/>
+              <w:jc w:val="center"/>
+              <w:rPr>
+                <w:rFonts w:ascii="Arial" w:eastAsiaTheme="minorHAnsi" w:hAnsi="Arial" w:cs="Arial"/>
+                <w:sz w:val="24"/>
+              </w:rPr>
+            </w:pPr>
+            <w:r>
+              <w:rPr>
+                <w:rFonts w:ascii="Arial" w:eastAsiaTheme="minorHAnsi" w:hAnsi="Arial" w:cs="Arial"/>
+                <w:sz w:val="24"/>
+              </w:rPr>
+              <w:t>Programador</w:t>
+            </w:r>
           </w:p>
         </w:tc>
       </w:tr>
@@ -740,26 +834,84 @@
           </w:tcPr>
           <w:p>
             <w:pPr>
-              <w:jc w:val="center"/>
-              <w:rPr>
-                <w:rFonts w:ascii="Arial" w:eastAsiaTheme="minorHAnsi" w:hAnsi="Arial" w:cs="Arial"/>
-                <w:sz w:val="24"/>
-              </w:rPr>
-            </w:pPr>
-          </w:p>
-        </w:tc>
-        <w:tc>
-          <w:tcPr>
-            <w:tcW w:w="5395" w:type="dxa"/>
-          </w:tcPr>
-          <w:p>
-            <w:pPr>
-              <w:jc w:val="center"/>
-              <w:rPr>
-                <w:rFonts w:ascii="Arial" w:eastAsiaTheme="minorHAnsi" w:hAnsi="Arial" w:cs="Arial"/>
-                <w:sz w:val="24"/>
-              </w:rPr>
-            </w:pPr>
+              <w:spacing w:after="0" w:line="240" w:lineRule="auto"/>
+              <w:jc w:val="center"/>
+              <w:rPr>
+                <w:rFonts w:ascii="Arial" w:eastAsiaTheme="minorEastAsia" w:hAnsi="Arial" w:cs="Arial"/>
+                <w:sz w:val="24"/>
+                <w:szCs w:val="24"/>
+              </w:rPr>
+            </w:pPr>
+            <w:proofErr w:type="spellStart"/>
+            <w:r>
+              <w:rPr>
+                <w:rFonts w:ascii="Arial" w:eastAsiaTheme="minorEastAsia" w:hAnsi="Arial" w:cs="Arial"/>
+                <w:sz w:val="24"/>
+                <w:szCs w:val="24"/>
+              </w:rPr>
+              <w:t>Jeferson</w:t>
+            </w:r>
+            <w:proofErr w:type="spellEnd"/>
+            <w:r>
+              <w:rPr>
+                <w:rFonts w:ascii="Arial" w:eastAsiaTheme="minorEastAsia" w:hAnsi="Arial" w:cs="Arial"/>
+                <w:sz w:val="24"/>
+                <w:szCs w:val="24"/>
+              </w:rPr>
+              <w:t xml:space="preserve"> </w:t>
+            </w:r>
+            <w:proofErr w:type="spellStart"/>
+            <w:r>
+              <w:rPr>
+                <w:rFonts w:ascii="Arial" w:eastAsiaTheme="minorEastAsia" w:hAnsi="Arial" w:cs="Arial"/>
+                <w:sz w:val="24"/>
+                <w:szCs w:val="24"/>
+              </w:rPr>
+              <w:t>Andre</w:t>
+            </w:r>
+            <w:proofErr w:type="spellEnd"/>
+            <w:r>
+              <w:rPr>
+                <w:rFonts w:ascii="Arial" w:eastAsiaTheme="minorEastAsia" w:hAnsi="Arial" w:cs="Arial"/>
+                <w:sz w:val="24"/>
+                <w:szCs w:val="24"/>
+              </w:rPr>
+              <w:t xml:space="preserve"> Cano </w:t>
+            </w:r>
+            <w:proofErr w:type="spellStart"/>
+            <w:r>
+              <w:rPr>
+                <w:rFonts w:ascii="Arial" w:eastAsiaTheme="minorEastAsia" w:hAnsi="Arial" w:cs="Arial"/>
+                <w:sz w:val="24"/>
+                <w:szCs w:val="24"/>
+              </w:rPr>
+              <w:t>Lopez</w:t>
+            </w:r>
+            <w:proofErr w:type="spellEnd"/>
+          </w:p>
+        </w:tc>
+        <w:tc>
+          <w:tcPr>
+            <w:tcW w:w="5395" w:type="dxa"/>
+          </w:tcPr>
+          <w:p>
+            <w:pPr>
+              <w:spacing w:after="0" w:line="240" w:lineRule="auto"/>
+              <w:jc w:val="center"/>
+              <w:rPr>
+                <w:rFonts w:ascii="Arial" w:eastAsiaTheme="minorEastAsia" w:hAnsi="Arial" w:cs="Arial"/>
+                <w:sz w:val="24"/>
+                <w:szCs w:val="24"/>
+              </w:rPr>
+            </w:pPr>
+            <w:r>
+              <w:rPr>
+                <w:rFonts w:ascii="Arial" w:eastAsiaTheme="minorEastAsia" w:hAnsi="Arial" w:cs="Arial"/>
+                <w:sz w:val="24"/>
+                <w:szCs w:val="24"/>
+              </w:rPr>
+              <w:t>Programador</w:t>
+            </w:r>
           </w:p>
         </w:tc>
       </w:tr>
@@ -770,26 +922,42 @@
           </w:tcPr>
           <w:p>
             <w:pPr>
-              <w:jc w:val="center"/>
-              <w:rPr>
-                <w:rFonts w:ascii="Arial" w:eastAsiaTheme="minorHAnsi" w:hAnsi="Arial" w:cs="Arial"/>
-                <w:sz w:val="24"/>
-              </w:rPr>
-            </w:pPr>
-          </w:p>
-        </w:tc>
-        <w:tc>
-          <w:tcPr>
-            <w:tcW w:w="5395" w:type="dxa"/>
-          </w:tcPr>
-          <w:p>
-            <w:pPr>
-              <w:jc w:val="center"/>
-              <w:rPr>
-                <w:rFonts w:ascii="Arial" w:eastAsiaTheme="minorHAnsi" w:hAnsi="Arial" w:cs="Arial"/>
-                <w:sz w:val="24"/>
-              </w:rPr>
-            </w:pPr>
+              <w:spacing w:after="0" w:line="240" w:lineRule="auto"/>
+              <w:jc w:val="center"/>
+              <w:rPr>
+                <w:rFonts w:ascii="Arial" w:eastAsiaTheme="minorHAnsi" w:hAnsi="Arial" w:cs="Arial"/>
+                <w:sz w:val="24"/>
+              </w:rPr>
+            </w:pPr>
+            <w:r>
+              <w:rPr>
+                <w:rFonts w:ascii="Arial" w:eastAsiaTheme="minorHAnsi" w:hAnsi="Arial" w:cs="Arial"/>
+                <w:sz w:val="24"/>
+              </w:rPr>
+              <w:t>Carlos Enrique López Quino</w:t>
+            </w:r>
+          </w:p>
+        </w:tc>
+        <w:tc>
+          <w:tcPr>
+            <w:tcW w:w="5395" w:type="dxa"/>
+          </w:tcPr>
+          <w:p>
+            <w:pPr>
+              <w:spacing w:after="0" w:line="240" w:lineRule="auto"/>
+              <w:jc w:val="center"/>
+              <w:rPr>
+                <w:rFonts w:ascii="Arial" w:eastAsiaTheme="minorHAnsi" w:hAnsi="Arial" w:cs="Arial"/>
+                <w:sz w:val="24"/>
+              </w:rPr>
+            </w:pPr>
+            <w:r>
+              <w:rPr>
+                <w:rFonts w:ascii="Arial" w:eastAsiaTheme="minorHAnsi" w:hAnsi="Arial" w:cs="Arial"/>
+                <w:sz w:val="24"/>
+              </w:rPr>
+              <w:t>Programador</w:t>
+            </w:r>
           </w:p>
         </w:tc>
       </w:tr>
@@ -800,26 +968,51 @@
           </w:tcPr>
           <w:p>
             <w:pPr>
-              <w:jc w:val="center"/>
-              <w:rPr>
-                <w:rFonts w:ascii="Arial" w:eastAsiaTheme="minorHAnsi" w:hAnsi="Arial" w:cs="Arial"/>
-                <w:sz w:val="24"/>
-              </w:rPr>
-            </w:pPr>
-          </w:p>
-        </w:tc>
-        <w:tc>
-          <w:tcPr>
-            <w:tcW w:w="5395" w:type="dxa"/>
-          </w:tcPr>
-          <w:p>
-            <w:pPr>
-              <w:jc w:val="center"/>
-              <w:rPr>
-                <w:rFonts w:ascii="Arial" w:eastAsiaTheme="minorHAnsi" w:hAnsi="Arial" w:cs="Arial"/>
-                <w:sz w:val="24"/>
-              </w:rPr>
-            </w:pPr>
+              <w:spacing w:after="0" w:line="240" w:lineRule="auto"/>
+              <w:jc w:val="center"/>
+              <w:rPr>
+                <w:rFonts w:ascii="Arial" w:eastAsiaTheme="minorHAnsi" w:hAnsi="Arial" w:cs="Arial"/>
+                <w:sz w:val="24"/>
+              </w:rPr>
+            </w:pPr>
+            <w:r>
+              <w:rPr>
+                <w:rFonts w:ascii="Arial" w:eastAsiaTheme="minorHAnsi" w:hAnsi="Arial" w:cs="Arial"/>
+                <w:sz w:val="24"/>
+              </w:rPr>
+              <w:t xml:space="preserve">Ricardo Alejandro Hernández </w:t>
+            </w:r>
+            <w:proofErr w:type="spellStart"/>
+            <w:r>
+              <w:rPr>
+                <w:rFonts w:ascii="Arial" w:eastAsiaTheme="minorHAnsi" w:hAnsi="Arial" w:cs="Arial"/>
+                <w:sz w:val="24"/>
+              </w:rPr>
+              <w:t>Hernández</w:t>
+            </w:r>
+            <w:proofErr w:type="spellEnd"/>
+          </w:p>
+        </w:tc>
+        <w:tc>
+          <w:tcPr>
+            <w:tcW w:w="5395" w:type="dxa"/>
+          </w:tcPr>
+          <w:p>
+            <w:pPr>
+              <w:spacing w:after="0" w:line="240" w:lineRule="auto"/>
+              <w:jc w:val="center"/>
+              <w:rPr>
+                <w:rFonts w:ascii="Arial" w:eastAsiaTheme="minorHAnsi" w:hAnsi="Arial" w:cs="Arial"/>
+                <w:sz w:val="24"/>
+              </w:rPr>
+            </w:pPr>
+            <w:r>
+              <w:rPr>
+                <w:rFonts w:ascii="Arial" w:eastAsiaTheme="minorHAnsi" w:hAnsi="Arial" w:cs="Arial"/>
+                <w:sz w:val="24"/>
+              </w:rPr>
+              <w:t>Programador</w:t>
+            </w:r>
           </w:p>
         </w:tc>
       </w:tr>
@@ -830,26 +1023,58 @@
           </w:tcPr>
           <w:p>
             <w:pPr>
-              <w:jc w:val="center"/>
-              <w:rPr>
-                <w:rFonts w:ascii="Arial" w:eastAsiaTheme="minorHAnsi" w:hAnsi="Arial" w:cs="Arial"/>
-                <w:sz w:val="24"/>
-              </w:rPr>
-            </w:pPr>
-          </w:p>
-        </w:tc>
-        <w:tc>
-          <w:tcPr>
-            <w:tcW w:w="5395" w:type="dxa"/>
-          </w:tcPr>
-          <w:p>
-            <w:pPr>
-              <w:jc w:val="center"/>
-              <w:rPr>
-                <w:rFonts w:ascii="Arial" w:eastAsiaTheme="minorHAnsi" w:hAnsi="Arial" w:cs="Arial"/>
-                <w:sz w:val="24"/>
-              </w:rPr>
-            </w:pPr>
+              <w:spacing w:after="0" w:line="240" w:lineRule="auto"/>
+              <w:jc w:val="center"/>
+              <w:rPr>
+                <w:rFonts w:ascii="Arial" w:eastAsiaTheme="minorHAnsi" w:hAnsi="Arial" w:cs="Arial"/>
+                <w:sz w:val="24"/>
+              </w:rPr>
+            </w:pPr>
+            <w:r>
+              <w:rPr>
+                <w:rFonts w:ascii="Arial" w:eastAsiaTheme="minorHAnsi" w:hAnsi="Arial" w:cs="Arial"/>
+                <w:sz w:val="24"/>
+              </w:rPr>
+              <w:t xml:space="preserve">Osman </w:t>
+            </w:r>
+            <w:proofErr w:type="spellStart"/>
+            <w:r>
+              <w:rPr>
+                <w:rFonts w:ascii="Arial" w:eastAsiaTheme="minorHAnsi" w:hAnsi="Arial" w:cs="Arial"/>
+                <w:sz w:val="24"/>
+              </w:rPr>
+              <w:t>Emmanuell</w:t>
+            </w:r>
+            <w:proofErr w:type="spellEnd"/>
+            <w:r>
+              <w:rPr>
+                <w:rFonts w:ascii="Arial" w:eastAsiaTheme="minorHAnsi" w:hAnsi="Arial" w:cs="Arial"/>
+                <w:sz w:val="24"/>
+              </w:rPr>
+              <w:t xml:space="preserve"> Veliz Guzmán</w:t>
+            </w:r>
+          </w:p>
+        </w:tc>
+        <w:tc>
+          <w:tcPr>
+            <w:tcW w:w="5395" w:type="dxa"/>
+          </w:tcPr>
+          <w:p>
+            <w:pPr>
+              <w:spacing w:after="0" w:line="240" w:lineRule="auto"/>
+              <w:jc w:val="center"/>
+              <w:rPr>
+                <w:rFonts w:ascii="Arial" w:eastAsiaTheme="minorHAnsi" w:hAnsi="Arial" w:cs="Arial"/>
+                <w:sz w:val="24"/>
+              </w:rPr>
+            </w:pPr>
+            <w:r>
+              <w:rPr>
+                <w:rFonts w:ascii="Arial" w:eastAsiaTheme="minorHAnsi" w:hAnsi="Arial" w:cs="Arial"/>
+                <w:sz w:val="24"/>
+              </w:rPr>
+              <w:t>Programador</w:t>
+            </w:r>
           </w:p>
         </w:tc>
       </w:tr>
@@ -860,26 +1085,42 @@
           </w:tcPr>
           <w:p>
             <w:pPr>
-              <w:jc w:val="center"/>
-              <w:rPr>
-                <w:rFonts w:ascii="Arial" w:eastAsiaTheme="minorHAnsi" w:hAnsi="Arial" w:cs="Arial"/>
-                <w:sz w:val="24"/>
-              </w:rPr>
-            </w:pPr>
-          </w:p>
-        </w:tc>
-        <w:tc>
-          <w:tcPr>
-            <w:tcW w:w="5395" w:type="dxa"/>
-          </w:tcPr>
-          <w:p>
-            <w:pPr>
-              <w:jc w:val="center"/>
-              <w:rPr>
-                <w:rFonts w:ascii="Arial" w:eastAsiaTheme="minorHAnsi" w:hAnsi="Arial" w:cs="Arial"/>
-                <w:sz w:val="24"/>
-              </w:rPr>
-            </w:pPr>
+              <w:spacing w:after="0" w:line="240" w:lineRule="auto"/>
+              <w:jc w:val="center"/>
+              <w:rPr>
+                <w:rFonts w:ascii="Arial" w:eastAsiaTheme="minorHAnsi" w:hAnsi="Arial" w:cs="Arial"/>
+                <w:sz w:val="24"/>
+              </w:rPr>
+            </w:pPr>
+            <w:r>
+              <w:rPr>
+                <w:rFonts w:ascii="Arial" w:eastAsiaTheme="minorHAnsi" w:hAnsi="Arial" w:cs="Arial"/>
+                <w:sz w:val="24"/>
+              </w:rPr>
+              <w:t>Franklin Stev Paiz Chavez</w:t>
+            </w:r>
+          </w:p>
+        </w:tc>
+        <w:tc>
+          <w:tcPr>
+            <w:tcW w:w="5395" w:type="dxa"/>
+          </w:tcPr>
+          <w:p>
+            <w:pPr>
+              <w:spacing w:after="0" w:line="240" w:lineRule="auto"/>
+              <w:jc w:val="center"/>
+              <w:rPr>
+                <w:rFonts w:ascii="Arial" w:eastAsiaTheme="minorHAnsi" w:hAnsi="Arial" w:cs="Arial"/>
+                <w:sz w:val="24"/>
+              </w:rPr>
+            </w:pPr>
+            <w:r>
+              <w:rPr>
+                <w:rFonts w:ascii="Arial" w:eastAsiaTheme="minorHAnsi" w:hAnsi="Arial" w:cs="Arial"/>
+                <w:sz w:val="24"/>
+              </w:rPr>
+              <w:t>Programador</w:t>
+            </w:r>
           </w:p>
         </w:tc>
       </w:tr>
@@ -890,6 +1131,7 @@
           </w:tcPr>
           <w:p>
             <w:pPr>
+              <w:spacing w:after="0" w:line="240" w:lineRule="auto"/>
               <w:jc w:val="center"/>
               <w:rPr>
                 <w:rFonts w:ascii="Arial" w:eastAsiaTheme="minorEastAsia" w:hAnsi="Arial" w:cs="Arial"/>
@@ -897,21 +1139,48 @@
                 <w:szCs w:val="24"/>
               </w:rPr>
             </w:pPr>
-          </w:p>
-        </w:tc>
-        <w:tc>
-          <w:tcPr>
-            <w:tcW w:w="5395" w:type="dxa"/>
-          </w:tcPr>
-          <w:p>
-            <w:pPr>
-              <w:jc w:val="center"/>
+            <w:proofErr w:type="spellStart"/>
+            <w:r>
               <w:rPr>
                 <w:rFonts w:ascii="Arial" w:eastAsiaTheme="minorEastAsia" w:hAnsi="Arial" w:cs="Arial"/>
                 <w:sz w:val="24"/>
                 <w:szCs w:val="24"/>
               </w:rPr>
-            </w:pPr>
+              <w:t>Angel</w:t>
+            </w:r>
+            <w:proofErr w:type="spellEnd"/>
+            <w:r>
+              <w:rPr>
+                <w:rFonts w:ascii="Arial" w:eastAsiaTheme="minorEastAsia" w:hAnsi="Arial" w:cs="Arial"/>
+                <w:sz w:val="24"/>
+                <w:szCs w:val="24"/>
+              </w:rPr>
+              <w:t xml:space="preserve"> Gabriel Ernesto Grijalva Castro</w:t>
+            </w:r>
+          </w:p>
+        </w:tc>
+        <w:tc>
+          <w:tcPr>
+            <w:tcW w:w="5395" w:type="dxa"/>
+          </w:tcPr>
+          <w:p>
+            <w:pPr>
+              <w:spacing w:after="0" w:line="240" w:lineRule="auto"/>
+              <w:jc w:val="center"/>
+              <w:rPr>
+                <w:rFonts w:ascii="Arial" w:eastAsiaTheme="minorEastAsia" w:hAnsi="Arial" w:cs="Arial"/>
+                <w:sz w:val="24"/>
+                <w:szCs w:val="24"/>
+              </w:rPr>
+            </w:pPr>
+            <w:r>
+              <w:rPr>
+                <w:rFonts w:ascii="Arial" w:eastAsiaTheme="minorEastAsia" w:hAnsi="Arial" w:cs="Arial"/>
+                <w:sz w:val="24"/>
+                <w:szCs w:val="24"/>
+              </w:rPr>
+              <w:t>Programador</w:t>
+            </w:r>
           </w:p>
         </w:tc>
       </w:tr>
@@ -922,26 +1191,42 @@
           </w:tcPr>
           <w:p>
             <w:pPr>
-              <w:jc w:val="center"/>
-              <w:rPr>
-                <w:rFonts w:ascii="Arial" w:eastAsiaTheme="minorHAnsi" w:hAnsi="Arial" w:cs="Arial"/>
-                <w:sz w:val="24"/>
-              </w:rPr>
-            </w:pPr>
-          </w:p>
-        </w:tc>
-        <w:tc>
-          <w:tcPr>
-            <w:tcW w:w="5395" w:type="dxa"/>
-          </w:tcPr>
-          <w:p>
-            <w:pPr>
-              <w:jc w:val="center"/>
-              <w:rPr>
-                <w:rFonts w:ascii="Arial" w:eastAsiaTheme="minorHAnsi" w:hAnsi="Arial" w:cs="Arial"/>
-                <w:sz w:val="24"/>
-              </w:rPr>
-            </w:pPr>
+              <w:spacing w:after="0" w:line="240" w:lineRule="auto"/>
+              <w:jc w:val="center"/>
+              <w:rPr>
+                <w:rFonts w:ascii="Arial" w:eastAsiaTheme="minorHAnsi" w:hAnsi="Arial" w:cs="Arial"/>
+                <w:sz w:val="24"/>
+              </w:rPr>
+            </w:pPr>
+            <w:r>
+              <w:rPr>
+                <w:rFonts w:ascii="Arial" w:eastAsiaTheme="minorHAnsi" w:hAnsi="Arial" w:cs="Arial"/>
+                <w:sz w:val="24"/>
+              </w:rPr>
+              <w:t>Benjamin Elí Argueta Caal</w:t>
+            </w:r>
+          </w:p>
+        </w:tc>
+        <w:tc>
+          <w:tcPr>
+            <w:tcW w:w="5395" w:type="dxa"/>
+          </w:tcPr>
+          <w:p>
+            <w:pPr>
+              <w:spacing w:after="0" w:line="240" w:lineRule="auto"/>
+              <w:jc w:val="center"/>
+              <w:rPr>
+                <w:rFonts w:ascii="Arial" w:eastAsiaTheme="minorHAnsi" w:hAnsi="Arial" w:cs="Arial"/>
+                <w:sz w:val="24"/>
+              </w:rPr>
+            </w:pPr>
+            <w:r>
+              <w:rPr>
+                <w:rFonts w:ascii="Arial" w:eastAsiaTheme="minorHAnsi" w:hAnsi="Arial" w:cs="Arial"/>
+                <w:sz w:val="24"/>
+              </w:rPr>
+              <w:t>Programador</w:t>
+            </w:r>
           </w:p>
         </w:tc>
       </w:tr>
@@ -952,20 +1237,22 @@
           </w:tcPr>
           <w:p>
             <w:pPr>
-              <w:jc w:val="center"/>
-              <w:rPr>
-                <w:rFonts w:ascii="Arial" w:eastAsiaTheme="minorHAnsi" w:hAnsi="Arial" w:cs="Arial"/>
-                <w:sz w:val="24"/>
-              </w:rPr>
-            </w:pPr>
-          </w:p>
-        </w:tc>
-        <w:tc>
-          <w:tcPr>
-            <w:tcW w:w="5395" w:type="dxa"/>
-          </w:tcPr>
-          <w:p>
-            <w:pPr>
+              <w:spacing w:after="0" w:line="240" w:lineRule="auto"/>
+              <w:jc w:val="center"/>
+              <w:rPr>
+                <w:rFonts w:ascii="Arial" w:eastAsiaTheme="minorHAnsi" w:hAnsi="Arial" w:cs="Arial"/>
+                <w:sz w:val="24"/>
+              </w:rPr>
+            </w:pPr>
+          </w:p>
+        </w:tc>
+        <w:tc>
+          <w:tcPr>
+            <w:tcW w:w="5395" w:type="dxa"/>
+          </w:tcPr>
+          <w:p>
+            <w:pPr>
+              <w:spacing w:after="0" w:line="240" w:lineRule="auto"/>
               <w:jc w:val="center"/>
               <w:rPr>
                 <w:rFonts w:ascii="Arial" w:eastAsiaTheme="minorHAnsi" w:hAnsi="Arial" w:cs="Arial"/>
@@ -982,20 +1269,22 @@
           </w:tcPr>
           <w:p>
             <w:pPr>
-              <w:jc w:val="center"/>
-              <w:rPr>
-                <w:rFonts w:ascii="Arial" w:eastAsiaTheme="minorHAnsi" w:hAnsi="Arial" w:cs="Arial"/>
-                <w:sz w:val="24"/>
-              </w:rPr>
-            </w:pPr>
-          </w:p>
-        </w:tc>
-        <w:tc>
-          <w:tcPr>
-            <w:tcW w:w="5395" w:type="dxa"/>
-          </w:tcPr>
-          <w:p>
-            <w:pPr>
+              <w:spacing w:after="0" w:line="240" w:lineRule="auto"/>
+              <w:jc w:val="center"/>
+              <w:rPr>
+                <w:rFonts w:ascii="Arial" w:eastAsiaTheme="minorHAnsi" w:hAnsi="Arial" w:cs="Arial"/>
+                <w:sz w:val="24"/>
+              </w:rPr>
+            </w:pPr>
+          </w:p>
+        </w:tc>
+        <w:tc>
+          <w:tcPr>
+            <w:tcW w:w="5395" w:type="dxa"/>
+          </w:tcPr>
+          <w:p>
+            <w:pPr>
+              <w:spacing w:after="0" w:line="240" w:lineRule="auto"/>
               <w:jc w:val="center"/>
               <w:rPr>
                 <w:rFonts w:ascii="Arial" w:eastAsiaTheme="minorHAnsi" w:hAnsi="Arial" w:cs="Arial"/>
@@ -1019,6 +1308,7 @@
         <w:rPr>
           <w:rFonts w:ascii="Arial" w:eastAsiaTheme="minorHAnsi" w:hAnsi="Arial" w:cs="Arial"/>
           <w:bCs/>
+          <w:u w:val="single"/>
         </w:rPr>
       </w:pPr>
       <w:r>
@@ -1028,8 +1318,6 @@
         </w:rPr>
         <w:t xml:space="preserve">    </w:t>
       </w:r>
-      <w:bookmarkStart w:id="0" w:name="_GoBack"/>
-      <w:bookmarkEnd w:id="0"/>
     </w:p>
     <w:sectPr>
       <w:pgSz w:w="12240" w:h="15840"/>
@@ -1041,24 +1329,68 @@
 </w:document>
 </file>
 
+<file path=word/endnotes.xml><?xml version="1.0" encoding="utf-8"?>
+<w:endnotes xmlns:wpc="http://schemas.microsoft.com/office/word/2010/wordprocessingCanvas" xmlns:cx="http://schemas.microsoft.com/office/drawing/2014/chartex" xmlns:cx1="http://schemas.microsoft.com/office/drawing/2015/9/8/chartex" xmlns:cx2="http://schemas.microsoft.com/office/drawing/2015/10/21/chartex" xmlns:cx3="http://schemas.microsoft.com/office/drawing/2016/5/9/chartex" xmlns:cx4="http://schemas.microsoft.com/office/drawing/2016/5/10/chartex" xmlns:cx5="http://schemas.microsoft.com/office/drawing/2016/5/11/chartex" xmlns:cx6="http://schemas.microsoft.com/office/drawing/2016/5/12/chartex" xmlns:cx7="http://schemas.microsoft.com/office/drawing/2016/5/13/chartex" xmlns:cx8="http://schemas.microsoft.com/office/drawing/2016/5/14/chartex" xmlns:mc="http://schemas.openxmlformats.org/markup-compatibility/2006" xmlns:aink="http://schemas.microsoft.com/office/drawing/2016/ink" xmlns:am3d="http://schemas.microsoft.com/office/drawing/2017/model3d" xmlns:o="urn:schemas-microsoft-com:office:office" xmlns:oel="http://schemas.microsoft.com/office/2019/extlst" xmlns:r="http://schemas.openxmlformats.org/officeDocument/2006/relationships" xmlns:m="http://schemas.openxmlformats.org/officeDocument/2006/math" xmlns:v="urn:schemas-microsoft-com:vml" xmlns:wp14="http://schemas.microsoft.com/office/word/2010/wordprocessingDrawing" xmlns:wp="http://schemas.openxmlformats.org/drawingml/2006/wordprocessingDrawing" xmlns:w10="urn:schemas-microsoft-com:office:word" xmlns:w="http://schemas.openxmlformats.org/wordprocessingml/2006/main" xmlns:w14="http://schemas.microsoft.com/office/word/2010/wordml" xmlns:w15="http://schemas.microsoft.com/office/word/2012/wordml" xmlns:w16cex="http://schemas.microsoft.com/office/word/2018/wordml/cex" xmlns:w16cid="http://schemas.microsoft.com/office/word/2016/wordml/cid" xmlns:w16="http://schemas.microsoft.com/office/word/2018/wordml" xmlns:w16du="http://schemas.microsoft.com/office/word/2023/wordml/word16du" xmlns:w16sdtdh="http://schemas.microsoft.com/office/word/2020/wordml/sdtdatahash" xmlns:w16sdtfl="http://schemas.microsoft.com/office/word/2024/wordml/sdtformatlock" xmlns:w16se="http://schemas.microsoft.com/office/word/2015/wordml/symex" xmlns:wpg="http://schemas.microsoft.com/office/word/2010/wordprocessingGroup" xmlns:wpi="http://schemas.microsoft.com/office/word/2010/wordprocessingInk" xmlns:wne="http://schemas.microsoft.com/office/word/2006/wordml" xmlns:wps="http://schemas.microsoft.com/office/word/2010/wordprocessingShape" mc:Ignorable="w14 w15 w16se w16cid w16 w16cex w16sdtdh w16sdtfl w16du wp14">
+  <w:endnote w:type="separator" w:id="-1">
+    <w:p>
+      <w:pPr>
+        <w:spacing w:line="240" w:lineRule="auto"/>
+      </w:pPr>
+      <w:r>
+        <w:separator/>
+      </w:r>
+    </w:p>
+  </w:endnote>
+  <w:endnote w:type="continuationSeparator" w:id="0">
+    <w:p>
+      <w:pPr>
+        <w:spacing w:line="240" w:lineRule="auto"/>
+      </w:pPr>
+      <w:r>
+        <w:continuationSeparator/>
+      </w:r>
+    </w:p>
+  </w:endnote>
+</w:endnotes>
+</file>
+
+<file path=word/footnotes.xml><?xml version="1.0" encoding="utf-8"?>
+<w:footnotes xmlns:wpc="http://schemas.microsoft.com/office/word/2010/wordprocessingCanvas" xmlns:cx="http://schemas.microsoft.com/office/drawing/2014/chartex" xmlns:cx1="http://schemas.microsoft.com/office/drawing/2015/9/8/chartex" xmlns:cx2="http://schemas.microsoft.com/office/drawing/2015/10/21/chartex" xmlns:cx3="http://schemas.microsoft.com/office/drawing/2016/5/9/chartex" xmlns:cx4="http://schemas.microsoft.com/office/drawing/2016/5/10/chartex" xmlns:cx5="http://schemas.microsoft.com/office/drawing/2016/5/11/chartex" xmlns:cx6="http://schemas.microsoft.com/office/drawing/2016/5/12/chartex" xmlns:cx7="http://schemas.microsoft.com/office/drawing/2016/5/13/chartex" xmlns:cx8="http://schemas.microsoft.com/office/drawing/2016/5/14/chartex" xmlns:mc="http://schemas.openxmlformats.org/markup-compatibility/2006" xmlns:aink="http://schemas.microsoft.com/office/drawing/2016/ink" xmlns:am3d="http://schemas.microsoft.com/office/drawing/2017/model3d" xmlns:o="urn:schemas-microsoft-com:office:office" xmlns:oel="http://schemas.microsoft.com/office/2019/extlst" xmlns:r="http://schemas.openxmlformats.org/officeDocument/2006/relationships" xmlns:m="http://schemas.openxmlformats.org/officeDocument/2006/math" xmlns:v="urn:schemas-microsoft-com:vml" xmlns:wp14="http://schemas.microsoft.com/office/word/2010/wordprocessingDrawing" xmlns:wp="http://schemas.openxmlformats.org/drawingml/2006/wordprocessingDrawing" xmlns:w10="urn:schemas-microsoft-com:office:word" xmlns:w="http://schemas.openxmlformats.org/wordprocessingml/2006/main" xmlns:w14="http://schemas.microsoft.com/office/word/2010/wordml" xmlns:w15="http://schemas.microsoft.com/office/word/2012/wordml" xmlns:w16cex="http://schemas.microsoft.com/office/word/2018/wordml/cex" xmlns:w16cid="http://schemas.microsoft.com/office/word/2016/wordml/cid" xmlns:w16="http://schemas.microsoft.com/office/word/2018/wordml" xmlns:w16du="http://schemas.microsoft.com/office/word/2023/wordml/word16du" xmlns:w16sdtdh="http://schemas.microsoft.com/office/word/2020/wordml/sdtdatahash" xmlns:w16sdtfl="http://schemas.microsoft.com/office/word/2024/wordml/sdtformatlock" xmlns:w16se="http://schemas.microsoft.com/office/word/2015/wordml/symex" xmlns:wpg="http://schemas.microsoft.com/office/word/2010/wordprocessingGroup" xmlns:wpi="http://schemas.microsoft.com/office/word/2010/wordprocessingInk" xmlns:wne="http://schemas.microsoft.com/office/word/2006/wordml" xmlns:wps="http://schemas.microsoft.com/office/word/2010/wordprocessingShape" mc:Ignorable="w14 w15 w16se w16cid w16 w16cex w16sdtdh w16sdtfl w16du wp14">
+  <w:footnote w:type="separator" w:id="-1">
+    <w:p>
+      <w:pPr>
+        <w:spacing w:after="0"/>
+      </w:pPr>
+      <w:r>
+        <w:separator/>
+      </w:r>
+    </w:p>
+  </w:footnote>
+  <w:footnote w:type="continuationSeparator" w:id="0">
+    <w:p>
+      <w:pPr>
+        <w:spacing w:after="0"/>
+      </w:pPr>
+      <w:r>
+        <w:continuationSeparator/>
+      </w:r>
+    </w:p>
+  </w:footnote>
+</w:footnotes>
+</file>
+
 <file path=word/styles.xml><?xml version="1.0" encoding="utf-8"?>
-<w:styles xmlns:mc="http://schemas.openxmlformats.org/markup-compatibility/2006" xmlns:r="http://schemas.openxmlformats.org/officeDocument/2006/relationships" xmlns:w="http://schemas.openxmlformats.org/wordprocessingml/2006/main" xmlns:w14="http://schemas.microsoft.com/office/word/2010/wordml" xmlns:w15="http://schemas.microsoft.com/office/word/2012/wordml" xmlns:w16se="http://schemas.microsoft.com/office/word/2015/wordml/symex" mc:Ignorable="w14 w15 w16se">
+<w:styles xmlns:mc="http://schemas.openxmlformats.org/markup-compatibility/2006" xmlns:r="http://schemas.openxmlformats.org/officeDocument/2006/relationships" xmlns:w="http://schemas.openxmlformats.org/wordprocessingml/2006/main" xmlns:w14="http://schemas.microsoft.com/office/word/2010/wordml" xmlns:w15="http://schemas.microsoft.com/office/word/2012/wordml" xmlns:w16cex="http://schemas.microsoft.com/office/word/2018/wordml/cex" xmlns:w16cid="http://schemas.microsoft.com/office/word/2016/wordml/cid" xmlns:w16="http://schemas.microsoft.com/office/word/2018/wordml" xmlns:w16du="http://schemas.microsoft.com/office/word/2023/wordml/word16du" xmlns:w16sdtdh="http://schemas.microsoft.com/office/word/2020/wordml/sdtdatahash" xmlns:w16sdtfl="http://schemas.microsoft.com/office/word/2024/wordml/sdtformatlock" xmlns:w16se="http://schemas.microsoft.com/office/word/2015/wordml/symex" mc:Ignorable="w14 w15 w16se w16cid w16 w16cex w16sdtdh w16sdtfl w16du">
   <w:docDefaults>
     <w:rPrDefault>
       <w:rPr>
         <w:rFonts w:asciiTheme="minorHAnsi" w:eastAsiaTheme="minorHAnsi" w:hAnsiTheme="minorHAnsi" w:cstheme="minorBidi"/>
-        <w:sz w:val="22"/>
-        <w:szCs w:val="22"/>
-        <w:lang w:val="es-GT" w:eastAsia="en-US" w:bidi="ar-SA"/>
+        <w:lang w:val="es-MX" w:eastAsia="es-MX" w:bidi="ar-SA"/>
       </w:rPr>
     </w:rPrDefault>
-    <w:pPrDefault>
-      <w:pPr>
-        <w:spacing w:after="160" w:line="259" w:lineRule="auto"/>
-      </w:pPr>
-    </w:pPrDefault>
+    <w:pPrDefault/>
   </w:docDefaults>
-  <w:latentStyles w:defLockedState="0" w:defUIPriority="99" w:defSemiHidden="0" w:defUnhideWhenUsed="0" w:defQFormat="0" w:count="371">
+  <w:latentStyles w:defLockedState="0" w:defUIPriority="99" w:defSemiHidden="0" w:defUnhideWhenUsed="0" w:defQFormat="0" w:count="376">
     <w:lsdException w:name="Normal" w:uiPriority="0" w:qFormat="1"/>
     <w:lsdException w:name="heading 1" w:uiPriority="9" w:qFormat="1"/>
     <w:lsdException w:name="heading 2" w:semiHidden="1" w:uiPriority="9" w:unhideWhenUsed="1" w:qFormat="1"/>
@@ -1089,7 +1421,7 @@
     <w:lsdException w:name="toc 9" w:semiHidden="1" w:uiPriority="39" w:unhideWhenUsed="1"/>
     <w:lsdException w:name="Normal Indent" w:semiHidden="1" w:unhideWhenUsed="1"/>
     <w:lsdException w:name="footnote text" w:semiHidden="1" w:unhideWhenUsed="1"/>
-    <w:lsdException w:name="annotation text" w:semiHidden="1" w:unhideWhenUsed="1"/>
+    <w:lsdException w:name="annotation text" w:semiHidden="1" w:unhideWhenUsed="1" w:qFormat="1"/>
     <w:lsdException w:name="header" w:semiHidden="1" w:unhideWhenUsed="1"/>
     <w:lsdException w:name="footer" w:semiHidden="1" w:unhideWhenUsed="1"/>
     <w:lsdException w:name="index heading" w:semiHidden="1" w:unhideWhenUsed="1"/>
@@ -1153,7 +1485,7 @@
     <w:lsdException w:name="E-mail Signature" w:semiHidden="1" w:unhideWhenUsed="1"/>
     <w:lsdException w:name="HTML Top of Form" w:semiHidden="1" w:unhideWhenUsed="1"/>
     <w:lsdException w:name="HTML Bottom of Form" w:semiHidden="1" w:unhideWhenUsed="1"/>
-    <w:lsdException w:name="Normal (Web)" w:semiHidden="1" w:unhideWhenUsed="1"/>
+    <w:lsdException w:name="Normal (Web)" w:semiHidden="1" w:unhideWhenUsed="1" w:qFormat="1"/>
     <w:lsdException w:name="HTML Acronym" w:semiHidden="1" w:unhideWhenUsed="1"/>
     <w:lsdException w:name="HTML Address" w:semiHidden="1" w:unhideWhenUsed="1"/>
     <w:lsdException w:name="HTML Cite" w:semiHidden="1" w:unhideWhenUsed="1"/>
@@ -1164,8 +1496,8 @@
     <w:lsdException w:name="HTML Sample" w:semiHidden="1" w:unhideWhenUsed="1"/>
     <w:lsdException w:name="HTML Typewriter" w:semiHidden="1" w:unhideWhenUsed="1"/>
     <w:lsdException w:name="HTML Variable" w:semiHidden="1" w:unhideWhenUsed="1"/>
-    <w:lsdException w:name="Normal Table" w:semiHidden="1" w:unhideWhenUsed="1"/>
-    <w:lsdException w:name="annotation subject" w:semiHidden="1" w:unhideWhenUsed="1"/>
+    <w:lsdException w:name="Normal Table" w:semiHidden="1" w:unhideWhenUsed="1" w:qFormat="1"/>
+    <w:lsdException w:name="annotation subject" w:semiHidden="1" w:unhideWhenUsed="1" w:qFormat="1"/>
     <w:lsdException w:name="No List" w:semiHidden="1" w:unhideWhenUsed="1"/>
     <w:lsdException w:name="Outline List 1" w:semiHidden="1" w:unhideWhenUsed="1"/>
     <w:lsdException w:name="Outline List 2" w:semiHidden="1" w:unhideWhenUsed="1"/>
@@ -1212,113 +1544,113 @@
     <w:lsdException w:name="Table Web 1" w:semiHidden="1" w:unhideWhenUsed="1"/>
     <w:lsdException w:name="Table Web 2" w:semiHidden="1" w:unhideWhenUsed="1"/>
     <w:lsdException w:name="Table Web 3" w:semiHidden="1" w:unhideWhenUsed="1"/>
-    <w:lsdException w:name="Balloon Text" w:semiHidden="1" w:unhideWhenUsed="1"/>
-    <w:lsdException w:name="Table Grid" w:uiPriority="39"/>
+    <w:lsdException w:name="Balloon Text" w:semiHidden="1" w:unhideWhenUsed="1" w:qFormat="1"/>
+    <w:lsdException w:name="Table Grid" w:uiPriority="39" w:qFormat="1"/>
     <w:lsdException w:name="Table Theme" w:semiHidden="1" w:unhideWhenUsed="1"/>
-    <w:lsdException w:name="Placeholder Text" w:semiHidden="1"/>
+    <w:lsdException w:name="Placeholder Text" w:semiHidden="1" w:unhideWhenUsed="1"/>
     <w:lsdException w:name="No Spacing" w:uiPriority="1" w:qFormat="1"/>
-    <w:lsdException w:name="Light Shading" w:uiPriority="60"/>
-    <w:lsdException w:name="Light List" w:uiPriority="61"/>
-    <w:lsdException w:name="Light Grid" w:uiPriority="62"/>
-    <w:lsdException w:name="Medium Shading 1" w:uiPriority="63"/>
-    <w:lsdException w:name="Medium Shading 2" w:uiPriority="64"/>
-    <w:lsdException w:name="Medium List 1" w:uiPriority="65"/>
-    <w:lsdException w:name="Medium List 2" w:uiPriority="66"/>
-    <w:lsdException w:name="Medium Grid 1" w:uiPriority="67"/>
-    <w:lsdException w:name="Medium Grid 2" w:uiPriority="68"/>
-    <w:lsdException w:name="Medium Grid 3" w:uiPriority="69"/>
-    <w:lsdException w:name="Dark List" w:uiPriority="70"/>
-    <w:lsdException w:name="Colorful Shading" w:uiPriority="71"/>
-    <w:lsdException w:name="Colorful List" w:uiPriority="72"/>
-    <w:lsdException w:name="Colorful Grid" w:uiPriority="73"/>
-    <w:lsdException w:name="Light Shading Accent 1" w:uiPriority="60"/>
-    <w:lsdException w:name="Light List Accent 1" w:uiPriority="61"/>
-    <w:lsdException w:name="Light Grid Accent 1" w:uiPriority="62"/>
-    <w:lsdException w:name="Medium Shading 1 Accent 1" w:uiPriority="63"/>
-    <w:lsdException w:name="Medium Shading 2 Accent 1" w:uiPriority="64"/>
-    <w:lsdException w:name="Medium List 1 Accent 1" w:uiPriority="65"/>
-    <w:lsdException w:name="Revision" w:semiHidden="1"/>
-    <w:lsdException w:name="List Paragraph" w:uiPriority="34" w:qFormat="1"/>
-    <w:lsdException w:name="Quote" w:uiPriority="29" w:qFormat="1"/>
-    <w:lsdException w:name="Intense Quote" w:uiPriority="30" w:qFormat="1"/>
-    <w:lsdException w:name="Medium List 2 Accent 1" w:uiPriority="66"/>
-    <w:lsdException w:name="Medium Grid 1 Accent 1" w:uiPriority="67"/>
-    <w:lsdException w:name="Medium Grid 2 Accent 1" w:uiPriority="68"/>
-    <w:lsdException w:name="Medium Grid 3 Accent 1" w:uiPriority="69"/>
-    <w:lsdException w:name="Dark List Accent 1" w:uiPriority="70"/>
-    <w:lsdException w:name="Colorful Shading Accent 1" w:uiPriority="71"/>
-    <w:lsdException w:name="Colorful List Accent 1" w:uiPriority="72"/>
-    <w:lsdException w:name="Colorful Grid Accent 1" w:uiPriority="73"/>
-    <w:lsdException w:name="Light Shading Accent 2" w:uiPriority="60"/>
-    <w:lsdException w:name="Light List Accent 2" w:uiPriority="61"/>
-    <w:lsdException w:name="Light Grid Accent 2" w:uiPriority="62"/>
-    <w:lsdException w:name="Medium Shading 1 Accent 2" w:uiPriority="63"/>
-    <w:lsdException w:name="Medium Shading 2 Accent 2" w:uiPriority="64"/>
-    <w:lsdException w:name="Medium List 1 Accent 2" w:uiPriority="65"/>
-    <w:lsdException w:name="Medium List 2 Accent 2" w:uiPriority="66"/>
-    <w:lsdException w:name="Medium Grid 1 Accent 2" w:uiPriority="67"/>
-    <w:lsdException w:name="Medium Grid 2 Accent 2" w:uiPriority="68"/>
-    <w:lsdException w:name="Medium Grid 3 Accent 2" w:uiPriority="69"/>
-    <w:lsdException w:name="Dark List Accent 2" w:uiPriority="70"/>
-    <w:lsdException w:name="Colorful Shading Accent 2" w:uiPriority="71"/>
-    <w:lsdException w:name="Colorful List Accent 2" w:uiPriority="72"/>
-    <w:lsdException w:name="Colorful Grid Accent 2" w:uiPriority="73"/>
-    <w:lsdException w:name="Light Shading Accent 3" w:uiPriority="60"/>
-    <w:lsdException w:name="Light List Accent 3" w:uiPriority="61"/>
-    <w:lsdException w:name="Light Grid Accent 3" w:uiPriority="62"/>
-    <w:lsdException w:name="Medium Shading 1 Accent 3" w:uiPriority="63"/>
-    <w:lsdException w:name="Medium Shading 2 Accent 3" w:uiPriority="64"/>
-    <w:lsdException w:name="Medium List 1 Accent 3" w:uiPriority="65"/>
-    <w:lsdException w:name="Medium List 2 Accent 3" w:uiPriority="66"/>
-    <w:lsdException w:name="Medium Grid 1 Accent 3" w:uiPriority="67"/>
-    <w:lsdException w:name="Medium Grid 2 Accent 3" w:uiPriority="68"/>
-    <w:lsdException w:name="Medium Grid 3 Accent 3" w:uiPriority="69"/>
-    <w:lsdException w:name="Dark List Accent 3" w:uiPriority="70"/>
-    <w:lsdException w:name="Colorful Shading Accent 3" w:uiPriority="71"/>
-    <w:lsdException w:name="Colorful List Accent 3" w:uiPriority="72"/>
-    <w:lsdException w:name="Colorful Grid Accent 3" w:uiPriority="73"/>
-    <w:lsdException w:name="Light Shading Accent 4" w:uiPriority="60"/>
-    <w:lsdException w:name="Light List Accent 4" w:uiPriority="61"/>
-    <w:lsdException w:name="Light Grid Accent 4" w:uiPriority="62"/>
-    <w:lsdException w:name="Medium Shading 1 Accent 4" w:uiPriority="63"/>
-    <w:lsdException w:name="Medium Shading 2 Accent 4" w:uiPriority="64"/>
-    <w:lsdException w:name="Medium List 1 Accent 4" w:uiPriority="65"/>
-    <w:lsdException w:name="Medium List 2 Accent 4" w:uiPriority="66"/>
-    <w:lsdException w:name="Medium Grid 1 Accent 4" w:uiPriority="67"/>
-    <w:lsdException w:name="Medium Grid 2 Accent 4" w:uiPriority="68"/>
-    <w:lsdException w:name="Medium Grid 3 Accent 4" w:uiPriority="69"/>
-    <w:lsdException w:name="Dark List Accent 4" w:uiPriority="70"/>
-    <w:lsdException w:name="Colorful Shading Accent 4" w:uiPriority="71"/>
-    <w:lsdException w:name="Colorful List Accent 4" w:uiPriority="72"/>
-    <w:lsdException w:name="Colorful Grid Accent 4" w:uiPriority="73"/>
-    <w:lsdException w:name="Light Shading Accent 5" w:uiPriority="60"/>
-    <w:lsdException w:name="Light List Accent 5" w:uiPriority="61"/>
-    <w:lsdException w:name="Light Grid Accent 5" w:uiPriority="62"/>
-    <w:lsdException w:name="Medium Shading 1 Accent 5" w:uiPriority="63"/>
-    <w:lsdException w:name="Medium Shading 2 Accent 5" w:uiPriority="64"/>
-    <w:lsdException w:name="Medium List 1 Accent 5" w:uiPriority="65"/>
-    <w:lsdException w:name="Medium List 2 Accent 5" w:uiPriority="66"/>
-    <w:lsdException w:name="Medium Grid 1 Accent 5" w:uiPriority="67"/>
-    <w:lsdException w:name="Medium Grid 2 Accent 5" w:uiPriority="68"/>
-    <w:lsdException w:name="Medium Grid 3 Accent 5" w:uiPriority="69"/>
-    <w:lsdException w:name="Dark List Accent 5" w:uiPriority="70"/>
-    <w:lsdException w:name="Colorful Shading Accent 5" w:uiPriority="71"/>
-    <w:lsdException w:name="Colorful List Accent 5" w:uiPriority="72"/>
-    <w:lsdException w:name="Colorful Grid Accent 5" w:uiPriority="73"/>
-    <w:lsdException w:name="Light Shading Accent 6" w:uiPriority="60"/>
-    <w:lsdException w:name="Light List Accent 6" w:uiPriority="61"/>
-    <w:lsdException w:name="Light Grid Accent 6" w:uiPriority="62"/>
-    <w:lsdException w:name="Medium Shading 1 Accent 6" w:uiPriority="63"/>
-    <w:lsdException w:name="Medium Shading 2 Accent 6" w:uiPriority="64"/>
-    <w:lsdException w:name="Medium List 1 Accent 6" w:uiPriority="65"/>
-    <w:lsdException w:name="Medium List 2 Accent 6" w:uiPriority="66"/>
-    <w:lsdException w:name="Medium Grid 1 Accent 6" w:uiPriority="67"/>
-    <w:lsdException w:name="Medium Grid 2 Accent 6" w:uiPriority="68"/>
-    <w:lsdException w:name="Medium Grid 3 Accent 6" w:uiPriority="69"/>
-    <w:lsdException w:name="Dark List Accent 6" w:uiPriority="70"/>
-    <w:lsdException w:name="Colorful Shading Accent 6" w:uiPriority="71"/>
-    <w:lsdException w:name="Colorful List Accent 6" w:uiPriority="72"/>
-    <w:lsdException w:name="Colorful Grid Accent 6" w:uiPriority="73"/>
+    <w:lsdException w:name="Light Shading"/>
+    <w:lsdException w:name="Light List"/>
+    <w:lsdException w:name="Light Grid"/>
+    <w:lsdException w:name="Medium Shading 1"/>
+    <w:lsdException w:name="Medium Shading 2"/>
+    <w:lsdException w:name="Medium List 1"/>
+    <w:lsdException w:name="Medium List 2"/>
+    <w:lsdException w:name="Medium Grid 1"/>
+    <w:lsdException w:name="Medium Grid 2"/>
+    <w:lsdException w:name="Medium Grid 3"/>
+    <w:lsdException w:name="Dark List"/>
+    <w:lsdException w:name="Colorful Shading"/>
+    <w:lsdException w:name="Colorful List"/>
+    <w:lsdException w:name="Colorful Grid"/>
+    <w:lsdException w:name="Light Shading Accent 1"/>
+    <w:lsdException w:name="Light List Accent 1"/>
+    <w:lsdException w:name="Light Grid Accent 1"/>
+    <w:lsdException w:name="Medium Shading 1 Accent 1"/>
+    <w:lsdException w:name="Medium Shading 2 Accent 1"/>
+    <w:lsdException w:name="Medium List 1 Accent 1"/>
+    <w:lsdException w:name="Revision" w:semiHidden="1" w:unhideWhenUsed="1"/>
+    <w:lsdException w:name="List Paragraph" w:semiHidden="1" w:unhideWhenUsed="1"/>
+    <w:lsdException w:name="Quote" w:semiHidden="1" w:unhideWhenUsed="1"/>
+    <w:lsdException w:name="Intense Quote" w:semiHidden="1" w:unhideWhenUsed="1"/>
+    <w:lsdException w:name="Medium List 2 Accent 1"/>
+    <w:lsdException w:name="Medium Grid 1 Accent 1"/>
+    <w:lsdException w:name="Medium Grid 2 Accent 1"/>
+    <w:lsdException w:name="Medium Grid 3 Accent 1"/>
+    <w:lsdException w:name="Dark List Accent 1"/>
+    <w:lsdException w:name="Colorful Shading Accent 1"/>
+    <w:lsdException w:name="Colorful List Accent 1"/>
+    <w:lsdException w:name="Colorful Grid Accent 1"/>
+    <w:lsdException w:name="Light Shading Accent 2"/>
+    <w:lsdException w:name="Light List Accent 2"/>
+    <w:lsdException w:name="Light Grid Accent 2"/>
+    <w:lsdException w:name="Medium Shading 1 Accent 2"/>
+    <w:lsdException w:name="Medium Shading 2 Accent 2"/>
+    <w:lsdException w:name="Medium List 1 Accent 2"/>
+    <w:lsdException w:name="Medium List 2 Accent 2"/>
+    <w:lsdException w:name="Medium Grid 1 Accent 2"/>
+    <w:lsdException w:name="Medium Grid 2 Accent 2"/>
+    <w:lsdException w:name="Medium Grid 3 Accent 2"/>
+    <w:lsdException w:name="Dark List Accent 2"/>
+    <w:lsdException w:name="Colorful Shading Accent 2"/>
+    <w:lsdException w:name="Colorful List Accent 2"/>
+    <w:lsdException w:name="Colorful Grid Accent 2"/>
+    <w:lsdException w:name="Light Shading Accent 3"/>
+    <w:lsdException w:name="Light List Accent 3"/>
+    <w:lsdException w:name="Light Grid Accent 3"/>
+    <w:lsdException w:name="Medium Shading 1 Accent 3"/>
+    <w:lsdException w:name="Medium Shading 2 Accent 3"/>
+    <w:lsdException w:name="Medium List 1 Accent 3"/>
+    <w:lsdException w:name="Medium List 2 Accent 3"/>
+    <w:lsdException w:name="Medium Grid 1 Accent 3"/>
+    <w:lsdException w:name="Medium Grid 2 Accent 3"/>
+    <w:lsdException w:name="Medium Grid 3 Accent 3"/>
+    <w:lsdException w:name="Dark List Accent 3"/>
+    <w:lsdException w:name="Colorful Shading Accent 3"/>
+    <w:lsdException w:name="Colorful List Accent 3"/>
+    <w:lsdException w:name="Colorful Grid Accent 3"/>
+    <w:lsdException w:name="Light Shading Accent 4"/>
+    <w:lsdException w:name="Light List Accent 4"/>
+    <w:lsdException w:name="Light Grid Accent 4"/>
+    <w:lsdException w:name="Medium Shading 1 Accent 4"/>
+    <w:lsdException w:name="Medium Shading 2 Accent 4"/>
+    <w:lsdException w:name="Medium List 1 Accent 4"/>
+    <w:lsdException w:name="Medium List 2 Accent 4"/>
+    <w:lsdException w:name="Medium Grid 1 Accent 4"/>
+    <w:lsdException w:name="Medium Grid 2 Accent 4"/>
+    <w:lsdException w:name="Medium Grid 3 Accent 4"/>
+    <w:lsdException w:name="Dark List Accent 4"/>
+    <w:lsdException w:name="Colorful Shading Accent 4"/>
+    <w:lsdException w:name="Colorful List Accent 4"/>
+    <w:lsdException w:name="Colorful Grid Accent 4"/>
+    <w:lsdException w:name="Light Shading Accent 5"/>
+    <w:lsdException w:name="Light List Accent 5"/>
+    <w:lsdException w:name="Light Grid Accent 5"/>
+    <w:lsdException w:name="Medium Shading 1 Accent 5"/>
+    <w:lsdException w:name="Medium Shading 2 Accent 5"/>
+    <w:lsdException w:name="Medium List 1 Accent 5"/>
+    <w:lsdException w:name="Medium List 2 Accent 5"/>
+    <w:lsdException w:name="Medium Grid 1 Accent 5"/>
+    <w:lsdException w:name="Medium Grid 2 Accent 5"/>
+    <w:lsdException w:name="Medium Grid 3 Accent 5"/>
+    <w:lsdException w:name="Dark List Accent 5"/>
+    <w:lsdException w:name="Colorful Shading Accent 5"/>
+    <w:lsdException w:name="Colorful List Accent 5"/>
+    <w:lsdException w:name="Colorful Grid Accent 5"/>
+    <w:lsdException w:name="Light Shading Accent 6"/>
+    <w:lsdException w:name="Light List Accent 6"/>
+    <w:lsdException w:name="Light Grid Accent 6"/>
+    <w:lsdException w:name="Medium Shading 1 Accent 6"/>
+    <w:lsdException w:name="Medium Shading 2 Accent 6"/>
+    <w:lsdException w:name="Medium List 1 Accent 6"/>
+    <w:lsdException w:name="Medium List 2 Accent 6"/>
+    <w:lsdException w:name="Medium Grid 1 Accent 6"/>
+    <w:lsdException w:name="Medium Grid 2 Accent 6"/>
+    <w:lsdException w:name="Medium Grid 3 Accent 6"/>
+    <w:lsdException w:name="Dark List Accent 6"/>
+    <w:lsdException w:name="Colorful Shading Accent 6"/>
+    <w:lsdException w:name="Colorful List Accent 6"/>
+    <w:lsdException w:name="Colorful Grid Accent 6"/>
     <w:lsdException w:name="Subtle Emphasis" w:uiPriority="19" w:qFormat="1"/>
     <w:lsdException w:name="Intense Emphasis" w:uiPriority="21" w:qFormat="1"/>
     <w:lsdException w:name="Subtle Reference" w:uiPriority="31" w:qFormat="1"/>
@@ -1430,13 +1762,23 @@
     <w:lsdException w:name="List Table 5 Dark Accent 6" w:uiPriority="50"/>
     <w:lsdException w:name="List Table 6 Colorful Accent 6" w:uiPriority="51"/>
     <w:lsdException w:name="List Table 7 Colorful Accent 6" w:uiPriority="52"/>
+    <w:lsdException w:name="Mention" w:semiHidden="1" w:unhideWhenUsed="1"/>
+    <w:lsdException w:name="Smart Hyperlink" w:semiHidden="1" w:unhideWhenUsed="1"/>
+    <w:lsdException w:name="Hashtag" w:semiHidden="1" w:unhideWhenUsed="1"/>
+    <w:lsdException w:name="Unresolved Mention" w:semiHidden="1" w:unhideWhenUsed="1"/>
+    <w:lsdException w:name="Smart Link" w:semiHidden="1" w:unhideWhenUsed="1"/>
   </w:latentStyles>
   <w:style w:type="paragraph" w:default="1" w:styleId="Normal">
     <w:name w:val="Normal"/>
     <w:qFormat/>
-    <w:rsid w:val="00D75182"/>
+    <w:pPr>
+      <w:spacing w:after="160" w:line="259" w:lineRule="auto"/>
+    </w:pPr>
     <w:rPr>
       <w:rFonts w:eastAsia="MS Mincho"/>
+      <w:sz w:val="22"/>
+      <w:szCs w:val="22"/>
+      <w:lang w:val="es-GT" w:eastAsia="en-US"/>
     </w:rPr>
   </w:style>
   <w:style w:type="character" w:default="1" w:styleId="Fuentedeprrafopredeter">
@@ -1466,54 +1808,25 @@
     <w:semiHidden/>
     <w:unhideWhenUsed/>
   </w:style>
-  <w:style w:type="paragraph" w:styleId="Sinespaciado">
-    <w:name w:val="No Spacing"/>
-    <w:uiPriority w:val="1"/>
-    <w:qFormat/>
-    <w:rsid w:val="007B480D"/>
-    <w:pPr>
-      <w:spacing w:after="0" w:line="240" w:lineRule="auto"/>
-    </w:pPr>
-  </w:style>
   <w:style w:type="character" w:styleId="Refdecomentario">
     <w:name w:val="annotation reference"/>
     <w:basedOn w:val="Fuentedeprrafopredeter"/>
     <w:uiPriority w:val="99"/>
     <w:semiHidden/>
     <w:unhideWhenUsed/>
-    <w:rsid w:val="00EB52AC"/>
     <w:rPr>
       <w:sz w:val="16"/>
       <w:szCs w:val="16"/>
     </w:rPr>
   </w:style>
-  <w:style w:type="paragraph" w:styleId="Textocomentario">
-    <w:name w:val="annotation text"/>
-    <w:basedOn w:val="Normal"/>
-    <w:link w:val="TextocomentarioCar"/>
-    <w:uiPriority w:val="99"/>
-    <w:semiHidden/>
-    <w:unhideWhenUsed/>
-    <w:rsid w:val="00EB52AC"/>
-    <w:pPr>
-      <w:spacing w:line="240" w:lineRule="auto"/>
-    </w:pPr>
+  <w:style w:type="character" w:styleId="Textoennegrita">
+    <w:name w:val="Strong"/>
+    <w:basedOn w:val="Fuentedeprrafopredeter"/>
+    <w:uiPriority w:val="22"/>
+    <w:qFormat/>
     <w:rPr>
-      <w:sz w:val="20"/>
-      <w:szCs w:val="20"/>
-    </w:rPr>
-  </w:style>
-  <w:style w:type="character" w:customStyle="1" w:styleId="TextocomentarioCar">
-    <w:name w:val="Texto comentario Car"/>
-    <w:basedOn w:val="Fuentedeprrafopredeter"/>
-    <w:link w:val="Textocomentario"/>
-    <w:uiPriority w:val="99"/>
-    <w:semiHidden/>
-    <w:rsid w:val="00EB52AC"/>
-    <w:rPr>
-      <w:rFonts w:eastAsia="MS Mincho"/>
-      <w:sz w:val="20"/>
-      <w:szCs w:val="20"/>
+      <w:b/>
+      <w:bCs/>
     </w:rPr>
   </w:style>
   <w:style w:type="paragraph" w:styleId="Asuntodelcomentario">
@@ -1524,23 +1837,24 @@
     <w:uiPriority w:val="99"/>
     <w:semiHidden/>
     <w:unhideWhenUsed/>
-    <w:rsid w:val="00EB52AC"/>
+    <w:qFormat/>
     <w:rPr>
       <w:b/>
       <w:bCs/>
     </w:rPr>
   </w:style>
-  <w:style w:type="character" w:customStyle="1" w:styleId="AsuntodelcomentarioCar">
-    <w:name w:val="Asunto del comentario Car"/>
-    <w:basedOn w:val="TextocomentarioCar"/>
-    <w:link w:val="Asuntodelcomentario"/>
+  <w:style w:type="paragraph" w:styleId="Textocomentario">
+    <w:name w:val="annotation text"/>
+    <w:basedOn w:val="Normal"/>
+    <w:link w:val="TextocomentarioCar"/>
     <w:uiPriority w:val="99"/>
     <w:semiHidden/>
-    <w:rsid w:val="00EB52AC"/>
+    <w:unhideWhenUsed/>
+    <w:qFormat/>
+    <w:pPr>
+      <w:spacing w:line="240" w:lineRule="auto"/>
+    </w:pPr>
     <w:rPr>
-      <w:rFonts w:eastAsia="MS Mincho"/>
-      <w:b/>
-      <w:bCs/>
       <w:sz w:val="20"/>
       <w:szCs w:val="20"/>
     </w:rPr>
@@ -1552,7 +1866,7 @@
     <w:uiPriority w:val="99"/>
     <w:semiHidden/>
     <w:unhideWhenUsed/>
-    <w:rsid w:val="0005271C"/>
+    <w:qFormat/>
     <w:pPr>
       <w:spacing w:after="0" w:line="240" w:lineRule="auto"/>
     </w:pPr>
@@ -1562,32 +1876,28 @@
       <w:szCs w:val="18"/>
     </w:rPr>
   </w:style>
-  <w:style w:type="character" w:customStyle="1" w:styleId="TextodegloboCar">
-    <w:name w:val="Texto de globo Car"/>
-    <w:basedOn w:val="Fuentedeprrafopredeter"/>
-    <w:link w:val="Textodeglobo"/>
+  <w:style w:type="paragraph" w:styleId="NormalWeb">
+    <w:name w:val="Normal (Web)"/>
+    <w:basedOn w:val="Normal"/>
     <w:uiPriority w:val="99"/>
     <w:semiHidden/>
-    <w:rsid w:val="0005271C"/>
+    <w:unhideWhenUsed/>
+    <w:qFormat/>
+    <w:pPr>
+      <w:spacing w:before="100" w:beforeAutospacing="1" w:after="100" w:afterAutospacing="1" w:line="240" w:lineRule="auto"/>
+    </w:pPr>
     <w:rPr>
-      <w:rFonts w:ascii="Segoe UI" w:eastAsia="MS Mincho" w:hAnsi="Segoe UI" w:cs="Segoe UI"/>
-      <w:sz w:val="18"/>
-      <w:szCs w:val="18"/>
+      <w:rFonts w:ascii="Times New Roman" w:eastAsia="Times New Roman" w:hAnsi="Times New Roman" w:cs="Times New Roman"/>
+      <w:sz w:val="24"/>
+      <w:szCs w:val="24"/>
+      <w:lang w:eastAsia="es-GT"/>
     </w:rPr>
-  </w:style>
-  <w:style w:type="character" w:customStyle="1" w:styleId="oypena">
-    <w:name w:val="oypena"/>
-    <w:basedOn w:val="Fuentedeprrafopredeter"/>
-    <w:rsid w:val="003F5629"/>
   </w:style>
   <w:style w:type="table" w:styleId="Tablaconcuadrcula">
     <w:name w:val="Table Grid"/>
     <w:basedOn w:val="Tablanormal"/>
     <w:uiPriority w:val="39"/>
-    <w:rsid w:val="00C251FB"/>
-    <w:pPr>
-      <w:spacing w:after="0" w:line="240" w:lineRule="auto"/>
-    </w:pPr>
+    <w:qFormat/>
     <w:tblPr>
       <w:tblBorders>
         <w:top w:val="single" w:sz="4" w:space="0" w:color="auto"/>
@@ -1599,10 +1909,66 @@
       </w:tblBorders>
     </w:tblPr>
   </w:style>
+  <w:style w:type="paragraph" w:styleId="Sinespaciado">
+    <w:name w:val="No Spacing"/>
+    <w:uiPriority w:val="1"/>
+    <w:qFormat/>
+    <w:rPr>
+      <w:sz w:val="22"/>
+      <w:szCs w:val="22"/>
+      <w:lang w:val="es-GT" w:eastAsia="en-US"/>
+    </w:rPr>
+  </w:style>
+  <w:style w:type="character" w:customStyle="1" w:styleId="TextocomentarioCar">
+    <w:name w:val="Texto comentario Car"/>
+    <w:basedOn w:val="Fuentedeprrafopredeter"/>
+    <w:link w:val="Textocomentario"/>
+    <w:uiPriority w:val="99"/>
+    <w:semiHidden/>
+    <w:qFormat/>
+    <w:rPr>
+      <w:rFonts w:eastAsia="MS Mincho"/>
+      <w:sz w:val="20"/>
+      <w:szCs w:val="20"/>
+    </w:rPr>
+  </w:style>
+  <w:style w:type="character" w:customStyle="1" w:styleId="AsuntodelcomentarioCar">
+    <w:name w:val="Asunto del comentario Car"/>
+    <w:basedOn w:val="TextocomentarioCar"/>
+    <w:link w:val="Asuntodelcomentario"/>
+    <w:uiPriority w:val="99"/>
+    <w:semiHidden/>
+    <w:qFormat/>
+    <w:rPr>
+      <w:rFonts w:eastAsia="MS Mincho"/>
+      <w:b/>
+      <w:bCs/>
+      <w:sz w:val="20"/>
+      <w:szCs w:val="20"/>
+    </w:rPr>
+  </w:style>
+  <w:style w:type="character" w:customStyle="1" w:styleId="TextodegloboCar">
+    <w:name w:val="Texto de globo Car"/>
+    <w:basedOn w:val="Fuentedeprrafopredeter"/>
+    <w:link w:val="Textodeglobo"/>
+    <w:uiPriority w:val="99"/>
+    <w:semiHidden/>
+    <w:qFormat/>
+    <w:rPr>
+      <w:rFonts w:ascii="Segoe UI" w:eastAsia="MS Mincho" w:hAnsi="Segoe UI" w:cs="Segoe UI"/>
+      <w:sz w:val="18"/>
+      <w:szCs w:val="18"/>
+    </w:rPr>
+  </w:style>
+  <w:style w:type="character" w:customStyle="1" w:styleId="oypena">
+    <w:name w:val="oypena"/>
+    <w:basedOn w:val="Fuentedeprrafopredeter"/>
+    <w:qFormat/>
+  </w:style>
   <w:style w:type="paragraph" w:customStyle="1" w:styleId="paragraph">
     <w:name w:val="paragraph"/>
     <w:basedOn w:val="Normal"/>
-    <w:rsid w:val="006E1988"/>
+    <w:qFormat/>
     <w:pPr>
       <w:spacing w:before="100" w:beforeAutospacing="1" w:after="100" w:afterAutospacing="1" w:line="240" w:lineRule="auto"/>
     </w:pPr>
@@ -1616,49 +1982,21 @@
   <w:style w:type="character" w:customStyle="1" w:styleId="normaltextrun">
     <w:name w:val="normaltextrun"/>
     <w:basedOn w:val="Fuentedeprrafopredeter"/>
-    <w:rsid w:val="006E1988"/>
+    <w:qFormat/>
   </w:style>
   <w:style w:type="character" w:customStyle="1" w:styleId="eop">
     <w:name w:val="eop"/>
     <w:basedOn w:val="Fuentedeprrafopredeter"/>
-    <w:rsid w:val="006E1988"/>
-  </w:style>
-  <w:style w:type="paragraph" w:styleId="NormalWeb">
-    <w:name w:val="Normal (Web)"/>
-    <w:basedOn w:val="Normal"/>
-    <w:uiPriority w:val="99"/>
-    <w:semiHidden/>
-    <w:unhideWhenUsed/>
-    <w:rsid w:val="00B952EC"/>
-    <w:pPr>
-      <w:spacing w:before="100" w:beforeAutospacing="1" w:after="100" w:afterAutospacing="1" w:line="240" w:lineRule="auto"/>
-    </w:pPr>
-    <w:rPr>
-      <w:rFonts w:ascii="Times New Roman" w:eastAsia="Times New Roman" w:hAnsi="Times New Roman" w:cs="Times New Roman"/>
-      <w:sz w:val="24"/>
-      <w:szCs w:val="24"/>
-      <w:lang w:eastAsia="es-GT"/>
-    </w:rPr>
+    <w:qFormat/>
   </w:style>
   <w:style w:type="character" w:customStyle="1" w:styleId="cf01">
     <w:name w:val="cf01"/>
     <w:basedOn w:val="Fuentedeprrafopredeter"/>
-    <w:rsid w:val="00B952EC"/>
+    <w:qFormat/>
     <w:rPr>
       <w:rFonts w:ascii="Consolas" w:hAnsi="Consolas" w:hint="default"/>
       <w:sz w:val="22"/>
       <w:szCs w:val="22"/>
-    </w:rPr>
-  </w:style>
-  <w:style w:type="character" w:styleId="Textoennegrita">
-    <w:name w:val="Strong"/>
-    <w:basedOn w:val="Fuentedeprrafopredeter"/>
-    <w:uiPriority w:val="22"/>
-    <w:qFormat/>
-    <w:rsid w:val="0078207B"/>
-    <w:rPr>
-      <w:b/>
-      <w:bCs/>
     </w:rPr>
   </w:style>
 </w:styles>
@@ -1707,7 +2045,7 @@
     </a:clrScheme>
     <a:fontScheme name="Office">
       <a:majorFont>
-        <a:latin typeface="Calibri Light" panose="020F0302020204030204"/>
+        <a:latin typeface="Calibri Light"/>
         <a:ea typeface=""/>
         <a:cs typeface=""/>
         <a:font script="Jpan" typeface="游ゴシック Light"/>
@@ -1740,26 +2078,9 @@
         <a:font script="Viet" typeface="Times New Roman"/>
         <a:font script="Uigh" typeface="Microsoft Uighur"/>
         <a:font script="Geor" typeface="Sylfaen"/>
-        <a:font script="Armn" typeface="Arial"/>
-        <a:font script="Bugi" typeface="Leelawadee UI"/>
-        <a:font script="Bopo" typeface="Microsoft JhengHei"/>
-        <a:font script="Java" typeface="Javanese Text"/>
-        <a:font script="Lisu" typeface="Segoe UI"/>
-        <a:font script="Mymr" typeface="Myanmar Text"/>
-        <a:font script="Nkoo" typeface="Ebrima"/>
-        <a:font script="Olck" typeface="Nirmala UI"/>
-        <a:font script="Osma" typeface="Ebrima"/>
-        <a:font script="Phag" typeface="Phagspa"/>
-        <a:font script="Syrn" typeface="Estrangelo Edessa"/>
-        <a:font script="Syrj" typeface="Estrangelo Edessa"/>
-        <a:font script="Syre" typeface="Estrangelo Edessa"/>
-        <a:font script="Sora" typeface="Nirmala UI"/>
-        <a:font script="Tale" typeface="Microsoft Tai Le"/>
-        <a:font script="Talu" typeface="Microsoft New Tai Lue"/>
-        <a:font script="Tfng" typeface="Ebrima"/>
       </a:majorFont>
       <a:minorFont>
-        <a:latin typeface="Calibri" panose="020F0502020204030204"/>
+        <a:latin typeface="Calibri"/>
         <a:ea typeface=""/>
         <a:cs typeface=""/>
         <a:font script="Jpan" typeface="游明朝"/>
@@ -1792,23 +2113,6 @@
         <a:font script="Viet" typeface="Arial"/>
         <a:font script="Uigh" typeface="Microsoft Uighur"/>
         <a:font script="Geor" typeface="Sylfaen"/>
-        <a:font script="Armn" typeface="Arial"/>
-        <a:font script="Bugi" typeface="Leelawadee UI"/>
-        <a:font script="Bopo" typeface="Microsoft JhengHei"/>
-        <a:font script="Java" typeface="Javanese Text"/>
-        <a:font script="Lisu" typeface="Segoe UI"/>
-        <a:font script="Mymr" typeface="Myanmar Text"/>
-        <a:font script="Nkoo" typeface="Ebrima"/>
-        <a:font script="Olck" typeface="Nirmala UI"/>
-        <a:font script="Osma" typeface="Ebrima"/>
-        <a:font script="Phag" typeface="Phagspa"/>
-        <a:font script="Syrn" typeface="Estrangelo Edessa"/>
-        <a:font script="Syrj" typeface="Estrangelo Edessa"/>
-        <a:font script="Syre" typeface="Estrangelo Edessa"/>
-        <a:font script="Sora" typeface="Nirmala UI"/>
-        <a:font script="Tale" typeface="Microsoft Tai Le"/>
-        <a:font script="Talu" typeface="Microsoft New Tai Lue"/>
-        <a:font script="Tfng" typeface="Ebrima"/>
       </a:minorFont>
     </a:fontScheme>
     <a:fmtScheme name="Office">
@@ -1951,10 +2255,5 @@
   </a:themeElements>
   <a:objectDefaults/>
   <a:extraClrSchemeLst/>
-  <a:extLst>
-    <a:ext uri="{05A4C25C-085E-4340-85A3-A5531E510DB2}">
-      <thm15:themeFamily xmlns:thm15="http://schemas.microsoft.com/office/thememl/2012/main" name="Office Theme" id="{62F939B6-93AF-4DB8-9C6B-D6C7DFDC589F}" vid="{4A3C46E8-61CC-4603-A589-7422A47A8E4A}"/>
-    </a:ext>
-  </a:extLst>
 </a:theme>
 </file>
</xml_diff>

<commit_message>
add:Se Agrego los datos del programador cpatal-2024136 al documento Peaceathome.docx en la rama cpatal-2024136
</commit_message>
<xml_diff>
--- a/Peaceathome.docx
+++ b/Peaceathome.docx
@@ -1,6 +1,6 @@
 
 <file path=word/document.xml><?xml version="1.0" encoding="utf-8"?>
-<w:document xmlns:wpc="http://schemas.microsoft.com/office/word/2010/wordprocessingCanvas" xmlns:cx="http://schemas.microsoft.com/office/drawing/2014/chartex" xmlns:cx1="http://schemas.microsoft.com/office/drawing/2015/9/8/chartex" xmlns:mc="http://schemas.openxmlformats.org/markup-compatibility/2006" xmlns:o="urn:schemas-microsoft-com:office:office" xmlns:r="http://schemas.openxmlformats.org/officeDocument/2006/relationships" xmlns:m="http://schemas.openxmlformats.org/officeDocument/2006/math" xmlns:v="urn:schemas-microsoft-com:vml" xmlns:wp14="http://schemas.microsoft.com/office/word/2010/wordprocessingDrawing" xmlns:wp="http://schemas.openxmlformats.org/drawingml/2006/wordprocessingDrawing" xmlns:w10="urn:schemas-microsoft-com:office:word" xmlns:w="http://schemas.openxmlformats.org/wordprocessingml/2006/main" xmlns:w14="http://schemas.microsoft.com/office/word/2010/wordml" xmlns:w15="http://schemas.microsoft.com/office/word/2012/wordml" xmlns:w16se="http://schemas.microsoft.com/office/word/2015/wordml/symex" xmlns:wpg="http://schemas.microsoft.com/office/word/2010/wordprocessingGroup" xmlns:wpi="http://schemas.microsoft.com/office/word/2010/wordprocessingInk" xmlns:wne="http://schemas.microsoft.com/office/word/2006/wordml" xmlns:wps="http://schemas.microsoft.com/office/word/2010/wordprocessingShape" mc:Ignorable="w14 w15 w16se wp14">
+<w:document xmlns:wpc="http://schemas.microsoft.com/office/word/2010/wordprocessingCanvas" xmlns:cx="http://schemas.microsoft.com/office/drawing/2014/chartex" xmlns:cx1="http://schemas.microsoft.com/office/drawing/2015/9/8/chartex" xmlns:cx2="http://schemas.microsoft.com/office/drawing/2015/10/21/chartex" xmlns:cx3="http://schemas.microsoft.com/office/drawing/2016/5/9/chartex" xmlns:cx4="http://schemas.microsoft.com/office/drawing/2016/5/10/chartex" xmlns:cx5="http://schemas.microsoft.com/office/drawing/2016/5/11/chartex" xmlns:cx6="http://schemas.microsoft.com/office/drawing/2016/5/12/chartex" xmlns:cx7="http://schemas.microsoft.com/office/drawing/2016/5/13/chartex" xmlns:cx8="http://schemas.microsoft.com/office/drawing/2016/5/14/chartex" xmlns:mc="http://schemas.openxmlformats.org/markup-compatibility/2006" xmlns:aink="http://schemas.microsoft.com/office/drawing/2016/ink" xmlns:am3d="http://schemas.microsoft.com/office/drawing/2017/model3d" xmlns:o="urn:schemas-microsoft-com:office:office" xmlns:oel="http://schemas.microsoft.com/office/2019/extlst" xmlns:r="http://schemas.openxmlformats.org/officeDocument/2006/relationships" xmlns:m="http://schemas.openxmlformats.org/officeDocument/2006/math" xmlns:v="urn:schemas-microsoft-com:vml" xmlns:wp14="http://schemas.microsoft.com/office/word/2010/wordprocessingDrawing" xmlns:wp="http://schemas.openxmlformats.org/drawingml/2006/wordprocessingDrawing" xmlns:w10="urn:schemas-microsoft-com:office:word" xmlns:w="http://schemas.openxmlformats.org/wordprocessingml/2006/main" xmlns:w14="http://schemas.microsoft.com/office/word/2010/wordml" xmlns:w15="http://schemas.microsoft.com/office/word/2012/wordml" xmlns:w16cex="http://schemas.microsoft.com/office/word/2018/wordml/cex" xmlns:w16cid="http://schemas.microsoft.com/office/word/2016/wordml/cid" xmlns:w16="http://schemas.microsoft.com/office/word/2018/wordml" xmlns:w16du="http://schemas.microsoft.com/office/word/2023/wordml/word16du" xmlns:w16sdtdh="http://schemas.microsoft.com/office/word/2020/wordml/sdtdatahash" xmlns:w16sdtfl="http://schemas.microsoft.com/office/word/2024/wordml/sdtformatlock" xmlns:w16se="http://schemas.microsoft.com/office/word/2015/wordml/symex" xmlns:wpg="http://schemas.microsoft.com/office/word/2010/wordprocessingGroup" xmlns:wpi="http://schemas.microsoft.com/office/word/2010/wordprocessingInk" xmlns:wne="http://schemas.microsoft.com/office/word/2006/wordml" xmlns:wps="http://schemas.microsoft.com/office/word/2010/wordprocessingShape" mc:Ignorable="w14 w15 w16se w16cid w16 w16cex w16sdtdh w16sdtfl w16du wp14">
   <w:body>
     <w:p>
       <w:pPr>
@@ -16,11 +16,11 @@
           <w:rFonts w:ascii="Arial" w:hAnsi="Arial" w:cs="Arial"/>
           <w:b/>
           <w:noProof/>
-          <w:lang w:eastAsia="es-GT"/>
+          <w:lang w:val="en-US"/>
         </w:rPr>
         <w:drawing>
-          <wp:inline distT="0" distB="0" distL="0" distR="0" wp14:anchorId="61DA3BD1" wp14:editId="0C35A376">
-            <wp:extent cx="2249144" cy="847725"/>
+          <wp:inline distT="0" distB="0" distL="0" distR="0" wp14:anchorId="2FEE8166" wp14:editId="6BE70031">
+            <wp:extent cx="2248535" cy="847725"/>
             <wp:effectExtent l="0" t="0" r="0" b="0"/>
             <wp:docPr id="2" name="Imagen 2"/>
             <wp:cNvGraphicFramePr>
@@ -30,13 +30,13 @@
               <a:graphicData uri="http://schemas.openxmlformats.org/drawingml/2006/picture">
                 <pic:pic xmlns:pic="http://schemas.openxmlformats.org/drawingml/2006/picture">
                   <pic:nvPicPr>
-                    <pic:cNvPr id="0" name="Picture 1"/>
+                    <pic:cNvPr id="2" name="Imagen 2"/>
                     <pic:cNvPicPr>
                       <a:picLocks noChangeAspect="1" noChangeArrowheads="1"/>
                     </pic:cNvPicPr>
                   </pic:nvPicPr>
                   <pic:blipFill>
-                    <a:blip r:embed="rId4" cstate="print">
+                    <a:blip r:embed="rId6" cstate="print">
                       <a:extLst>
                         <a:ext uri="{28A0092B-C50C-407E-A947-70E740481C1C}">
                           <a14:useLocalDpi xmlns:a14="http://schemas.microsoft.com/office/drawing/2010/main" val="0"/>
@@ -48,7 +48,7 @@
                       <a:fillRect/>
                     </a:stretch>
                   </pic:blipFill>
-                  <pic:spPr bwMode="auto">
+                  <pic:spPr>
                     <a:xfrm>
                       <a:off x="0" y="0"/>
                       <a:ext cx="2253277" cy="849283"/>
@@ -120,13 +120,7 @@
         <w:rPr>
           <w:rFonts w:ascii="Arial" w:hAnsi="Arial" w:cs="Arial"/>
         </w:rPr>
-        <w:t>5TO. PERITO EN INFORMATICA</w:t>
-      </w:r>
-      <w:r>
-        <w:rPr>
-          <w:rFonts w:ascii="Arial" w:hAnsi="Arial" w:cs="Arial"/>
-        </w:rPr>
-        <w:t xml:space="preserve"> </w:t>
+        <w:t xml:space="preserve">5TO. PERITO EN INFORMATICA </w:t>
       </w:r>
     </w:p>
     <w:p>
@@ -507,56 +501,7 @@
           <w:rFonts w:ascii="Arial" w:hAnsi="Arial" w:cs="Arial"/>
           <w:sz w:val="24"/>
         </w:rPr>
-        <w:t xml:space="preserve">Guatemala, </w:t>
-      </w:r>
-      <w:r>
-        <w:rPr>
-          <w:rFonts w:ascii="Arial" w:hAnsi="Arial" w:cs="Arial"/>
-          <w:sz w:val="24"/>
-        </w:rPr>
-        <w:t xml:space="preserve">15 </w:t>
-      </w:r>
-      <w:r>
-        <w:rPr>
-          <w:rFonts w:ascii="Arial" w:hAnsi="Arial" w:cs="Arial"/>
-          <w:sz w:val="24"/>
-        </w:rPr>
-        <w:t xml:space="preserve">de </w:t>
-      </w:r>
-      <w:r>
-        <w:rPr>
-          <w:rFonts w:ascii="Arial" w:hAnsi="Arial" w:cs="Arial"/>
-          <w:sz w:val="24"/>
-        </w:rPr>
-        <w:t xml:space="preserve">Julio </w:t>
-      </w:r>
-      <w:r>
-        <w:rPr>
-          <w:rFonts w:ascii="Arial" w:hAnsi="Arial" w:cs="Arial"/>
-          <w:sz w:val="24"/>
-        </w:rPr>
-        <w:t>de 20</w:t>
-      </w:r>
-      <w:r>
-        <w:rPr>
-          <w:rFonts w:ascii="Arial" w:hAnsi="Arial" w:cs="Arial"/>
-          <w:sz w:val="24"/>
-        </w:rPr>
-        <w:t>2</w:t>
-      </w:r>
-      <w:r>
-        <w:rPr>
-          <w:rFonts w:ascii="Arial" w:hAnsi="Arial" w:cs="Arial"/>
-          <w:sz w:val="24"/>
-        </w:rPr>
-        <w:t>5</w:t>
-      </w:r>
-      <w:r>
-        <w:rPr>
-          <w:rFonts w:ascii="Arial" w:hAnsi="Arial" w:cs="Arial"/>
-          <w:sz w:val="24"/>
-        </w:rPr>
-        <w:t>.</w:t>
+        <w:t>Guatemala, 15 de Julio de 2025.</w:t>
       </w:r>
     </w:p>
     <w:p>
@@ -590,6 +535,7 @@
           </w:tcPr>
           <w:p>
             <w:pPr>
+              <w:spacing w:after="0" w:line="240" w:lineRule="auto"/>
               <w:jc w:val="center"/>
               <w:rPr>
                 <w:rFonts w:ascii="Arial" w:eastAsiaTheme="minorHAnsi" w:hAnsi="Arial" w:cs="Arial"/>
@@ -624,6 +570,7 @@
           </w:tcPr>
           <w:p>
             <w:pPr>
+              <w:spacing w:after="0" w:line="240" w:lineRule="auto"/>
               <w:jc w:val="center"/>
               <w:rPr>
                 <w:rFonts w:ascii="Arial" w:eastAsiaTheme="minorHAnsi" w:hAnsi="Arial" w:cs="Arial"/>
@@ -649,6 +596,7 @@
           </w:tcPr>
           <w:p>
             <w:pPr>
+              <w:spacing w:after="0" w:line="240" w:lineRule="auto"/>
               <w:jc w:val="center"/>
               <w:rPr>
                 <w:rFonts w:ascii="Arial" w:eastAsiaTheme="minorHAnsi" w:hAnsi="Arial" w:cs="Arial"/>
@@ -656,20 +604,74 @@
                 <w:lang w:val="es-ES"/>
               </w:rPr>
             </w:pPr>
-          </w:p>
-        </w:tc>
-        <w:tc>
-          <w:tcPr>
-            <w:tcW w:w="5395" w:type="dxa"/>
-          </w:tcPr>
-          <w:p>
-            <w:pPr>
-              <w:jc w:val="center"/>
-              <w:rPr>
-                <w:rFonts w:ascii="Arial" w:eastAsiaTheme="minorHAnsi" w:hAnsi="Arial" w:cs="Arial"/>
-                <w:sz w:val="24"/>
-              </w:rPr>
-            </w:pPr>
+            <w:proofErr w:type="spellStart"/>
+            <w:r>
+              <w:rPr>
+                <w:rFonts w:ascii="Arial" w:eastAsiaTheme="minorHAnsi" w:hAnsi="Arial" w:cs="Arial"/>
+                <w:sz w:val="24"/>
+                <w:lang w:val="es-ES"/>
+              </w:rPr>
+              <w:t>Kenet</w:t>
+            </w:r>
+            <w:proofErr w:type="spellEnd"/>
+            <w:r>
+              <w:rPr>
+                <w:rFonts w:ascii="Arial" w:eastAsiaTheme="minorHAnsi" w:hAnsi="Arial" w:cs="Arial"/>
+                <w:sz w:val="24"/>
+                <w:lang w:val="es-ES"/>
+              </w:rPr>
+              <w:t xml:space="preserve"> Efraín </w:t>
+            </w:r>
+            <w:proofErr w:type="spellStart"/>
+            <w:r>
+              <w:rPr>
+                <w:rFonts w:ascii="Arial" w:eastAsiaTheme="minorHAnsi" w:hAnsi="Arial" w:cs="Arial"/>
+                <w:sz w:val="24"/>
+                <w:lang w:val="es-ES"/>
+              </w:rPr>
+              <w:t>Cuyuch</w:t>
+            </w:r>
+            <w:proofErr w:type="spellEnd"/>
+            <w:r>
+              <w:rPr>
+                <w:rFonts w:ascii="Arial" w:eastAsiaTheme="minorHAnsi" w:hAnsi="Arial" w:cs="Arial"/>
+                <w:sz w:val="24"/>
+                <w:lang w:val="es-ES"/>
+              </w:rPr>
+              <w:t xml:space="preserve"> </w:t>
+            </w:r>
+            <w:proofErr w:type="spellStart"/>
+            <w:r>
+              <w:rPr>
+                <w:rFonts w:ascii="Arial" w:eastAsiaTheme="minorHAnsi" w:hAnsi="Arial" w:cs="Arial"/>
+                <w:sz w:val="24"/>
+                <w:lang w:val="es-ES"/>
+              </w:rPr>
+              <w:t>Joj</w:t>
+            </w:r>
+            <w:proofErr w:type="spellEnd"/>
+          </w:p>
+        </w:tc>
+        <w:tc>
+          <w:tcPr>
+            <w:tcW w:w="5395" w:type="dxa"/>
+          </w:tcPr>
+          <w:p>
+            <w:pPr>
+              <w:spacing w:after="0" w:line="240" w:lineRule="auto"/>
+              <w:jc w:val="center"/>
+              <w:rPr>
+                <w:rFonts w:ascii="Arial" w:eastAsiaTheme="minorHAnsi" w:hAnsi="Arial" w:cs="Arial"/>
+                <w:sz w:val="24"/>
+              </w:rPr>
+            </w:pPr>
+            <w:r>
+              <w:rPr>
+                <w:rFonts w:ascii="Arial" w:eastAsiaTheme="minorHAnsi" w:hAnsi="Arial" w:cs="Arial"/>
+                <w:sz w:val="24"/>
+              </w:rPr>
+              <w:t>Scrum Master</w:t>
+            </w:r>
           </w:p>
         </w:tc>
       </w:tr>
@@ -680,26 +682,68 @@
           </w:tcPr>
           <w:p>
             <w:pPr>
-              <w:jc w:val="center"/>
-              <w:rPr>
-                <w:rFonts w:ascii="Arial" w:eastAsiaTheme="minorHAnsi" w:hAnsi="Arial" w:cs="Arial"/>
-                <w:sz w:val="24"/>
-              </w:rPr>
-            </w:pPr>
-          </w:p>
-        </w:tc>
-        <w:tc>
-          <w:tcPr>
-            <w:tcW w:w="5395" w:type="dxa"/>
-          </w:tcPr>
-          <w:p>
-            <w:pPr>
-              <w:jc w:val="center"/>
-              <w:rPr>
-                <w:rFonts w:ascii="Arial" w:eastAsiaTheme="minorHAnsi" w:hAnsi="Arial" w:cs="Arial"/>
-                <w:sz w:val="24"/>
-              </w:rPr>
-            </w:pPr>
+              <w:spacing w:after="0" w:line="240" w:lineRule="auto"/>
+              <w:jc w:val="center"/>
+              <w:rPr>
+                <w:rFonts w:ascii="Arial" w:eastAsiaTheme="minorHAnsi" w:hAnsi="Arial" w:cs="Arial"/>
+                <w:sz w:val="24"/>
+              </w:rPr>
+            </w:pPr>
+            <w:proofErr w:type="spellStart"/>
+            <w:r>
+              <w:rPr>
+                <w:rFonts w:ascii="Arial" w:eastAsiaTheme="minorHAnsi" w:hAnsi="Arial" w:cs="Arial"/>
+                <w:sz w:val="24"/>
+              </w:rPr>
+              <w:t>Angel</w:t>
+            </w:r>
+            <w:proofErr w:type="spellEnd"/>
+            <w:r>
+              <w:rPr>
+                <w:rFonts w:ascii="Arial" w:eastAsiaTheme="minorHAnsi" w:hAnsi="Arial" w:cs="Arial"/>
+                <w:sz w:val="24"/>
+              </w:rPr>
+              <w:t xml:space="preserve"> </w:t>
+            </w:r>
+            <w:proofErr w:type="spellStart"/>
+            <w:r>
+              <w:rPr>
+                <w:rFonts w:ascii="Arial" w:eastAsiaTheme="minorHAnsi" w:hAnsi="Arial" w:cs="Arial"/>
+                <w:sz w:val="24"/>
+              </w:rPr>
+              <w:t>Gahel</w:t>
+            </w:r>
+            <w:proofErr w:type="spellEnd"/>
+            <w:r>
+              <w:rPr>
+                <w:rFonts w:ascii="Arial" w:eastAsiaTheme="minorHAnsi" w:hAnsi="Arial" w:cs="Arial"/>
+                <w:sz w:val="24"/>
+              </w:rPr>
+              <w:t xml:space="preserve"> Padilla Pacheco</w:t>
+            </w:r>
+          </w:p>
+        </w:tc>
+        <w:tc>
+          <w:tcPr>
+            <w:tcW w:w="5395" w:type="dxa"/>
+          </w:tcPr>
+          <w:p>
+            <w:pPr>
+              <w:spacing w:after="0" w:line="240" w:lineRule="auto"/>
+              <w:jc w:val="center"/>
+              <w:rPr>
+                <w:rFonts w:ascii="Arial" w:eastAsiaTheme="minorHAnsi" w:hAnsi="Arial" w:cs="Arial"/>
+                <w:sz w:val="24"/>
+                <w:u w:val="single"/>
+              </w:rPr>
+            </w:pPr>
+            <w:r>
+              <w:rPr>
+                <w:rFonts w:ascii="Arial" w:eastAsiaTheme="minorHAnsi" w:hAnsi="Arial" w:cs="Arial"/>
+                <w:sz w:val="24"/>
+              </w:rPr>
+              <w:t>Programador</w:t>
+            </w:r>
           </w:p>
         </w:tc>
       </w:tr>
@@ -710,26 +754,76 @@
           </w:tcPr>
           <w:p>
             <w:pPr>
-              <w:jc w:val="center"/>
-              <w:rPr>
-                <w:rFonts w:ascii="Arial" w:eastAsiaTheme="minorHAnsi" w:hAnsi="Arial" w:cs="Arial"/>
-                <w:sz w:val="24"/>
-              </w:rPr>
-            </w:pPr>
-          </w:p>
-        </w:tc>
-        <w:tc>
-          <w:tcPr>
-            <w:tcW w:w="5395" w:type="dxa"/>
-          </w:tcPr>
-          <w:p>
-            <w:pPr>
-              <w:jc w:val="center"/>
-              <w:rPr>
-                <w:rFonts w:ascii="Arial" w:eastAsiaTheme="minorHAnsi" w:hAnsi="Arial" w:cs="Arial"/>
-                <w:sz w:val="24"/>
-              </w:rPr>
-            </w:pPr>
+              <w:spacing w:after="0" w:line="240" w:lineRule="auto"/>
+              <w:jc w:val="center"/>
+              <w:rPr>
+                <w:rFonts w:ascii="Arial" w:eastAsiaTheme="minorHAnsi" w:hAnsi="Arial" w:cs="Arial"/>
+                <w:sz w:val="24"/>
+              </w:rPr>
+            </w:pPr>
+            <w:proofErr w:type="spellStart"/>
+            <w:r>
+              <w:rPr>
+                <w:rFonts w:ascii="Arial" w:eastAsiaTheme="minorHAnsi" w:hAnsi="Arial" w:cs="Arial"/>
+                <w:sz w:val="24"/>
+              </w:rPr>
+              <w:t>Jose</w:t>
+            </w:r>
+            <w:proofErr w:type="spellEnd"/>
+            <w:r>
+              <w:rPr>
+                <w:rFonts w:ascii="Arial" w:eastAsiaTheme="minorHAnsi" w:hAnsi="Arial" w:cs="Arial"/>
+                <w:sz w:val="24"/>
+              </w:rPr>
+              <w:t xml:space="preserve"> Enrique </w:t>
+            </w:r>
+            <w:proofErr w:type="spellStart"/>
+            <w:r>
+              <w:rPr>
+                <w:rFonts w:ascii="Arial" w:eastAsiaTheme="minorHAnsi" w:hAnsi="Arial" w:cs="Arial"/>
+                <w:sz w:val="24"/>
+              </w:rPr>
+              <w:t>cuc</w:t>
+            </w:r>
+            <w:proofErr w:type="spellEnd"/>
+            <w:r>
+              <w:rPr>
+                <w:rFonts w:ascii="Arial" w:eastAsiaTheme="minorHAnsi" w:hAnsi="Arial" w:cs="Arial"/>
+                <w:sz w:val="24"/>
+              </w:rPr>
+              <w:t xml:space="preserve"> </w:t>
+            </w:r>
+            <w:proofErr w:type="spellStart"/>
+            <w:r>
+              <w:rPr>
+                <w:rFonts w:ascii="Arial" w:eastAsiaTheme="minorHAnsi" w:hAnsi="Arial" w:cs="Arial"/>
+                <w:sz w:val="24"/>
+              </w:rPr>
+              <w:t>cutz</w:t>
+            </w:r>
+            <w:proofErr w:type="spellEnd"/>
+          </w:p>
+        </w:tc>
+        <w:tc>
+          <w:tcPr>
+            <w:tcW w:w="5395" w:type="dxa"/>
+          </w:tcPr>
+          <w:p>
+            <w:pPr>
+              <w:spacing w:after="0" w:line="240" w:lineRule="auto"/>
+              <w:jc w:val="center"/>
+              <w:rPr>
+                <w:rFonts w:ascii="Arial" w:eastAsiaTheme="minorHAnsi" w:hAnsi="Arial" w:cs="Arial"/>
+                <w:sz w:val="24"/>
+              </w:rPr>
+            </w:pPr>
+            <w:r>
+              <w:rPr>
+                <w:rFonts w:ascii="Arial" w:eastAsiaTheme="minorHAnsi" w:hAnsi="Arial" w:cs="Arial"/>
+                <w:sz w:val="24"/>
+              </w:rPr>
+              <w:t>Programador</w:t>
+            </w:r>
           </w:p>
         </w:tc>
       </w:tr>
@@ -740,26 +834,84 @@
           </w:tcPr>
           <w:p>
             <w:pPr>
-              <w:jc w:val="center"/>
-              <w:rPr>
-                <w:rFonts w:ascii="Arial" w:eastAsiaTheme="minorHAnsi" w:hAnsi="Arial" w:cs="Arial"/>
-                <w:sz w:val="24"/>
-              </w:rPr>
-            </w:pPr>
-          </w:p>
-        </w:tc>
-        <w:tc>
-          <w:tcPr>
-            <w:tcW w:w="5395" w:type="dxa"/>
-          </w:tcPr>
-          <w:p>
-            <w:pPr>
-              <w:jc w:val="center"/>
-              <w:rPr>
-                <w:rFonts w:ascii="Arial" w:eastAsiaTheme="minorHAnsi" w:hAnsi="Arial" w:cs="Arial"/>
-                <w:sz w:val="24"/>
-              </w:rPr>
-            </w:pPr>
+              <w:spacing w:after="0" w:line="240" w:lineRule="auto"/>
+              <w:jc w:val="center"/>
+              <w:rPr>
+                <w:rFonts w:ascii="Arial" w:eastAsiaTheme="minorEastAsia" w:hAnsi="Arial" w:cs="Arial"/>
+                <w:sz w:val="24"/>
+                <w:szCs w:val="24"/>
+              </w:rPr>
+            </w:pPr>
+            <w:proofErr w:type="spellStart"/>
+            <w:r>
+              <w:rPr>
+                <w:rFonts w:ascii="Arial" w:eastAsiaTheme="minorEastAsia" w:hAnsi="Arial" w:cs="Arial"/>
+                <w:sz w:val="24"/>
+                <w:szCs w:val="24"/>
+              </w:rPr>
+              <w:t>Jeferson</w:t>
+            </w:r>
+            <w:proofErr w:type="spellEnd"/>
+            <w:r>
+              <w:rPr>
+                <w:rFonts w:ascii="Arial" w:eastAsiaTheme="minorEastAsia" w:hAnsi="Arial" w:cs="Arial"/>
+                <w:sz w:val="24"/>
+                <w:szCs w:val="24"/>
+              </w:rPr>
+              <w:t xml:space="preserve"> </w:t>
+            </w:r>
+            <w:proofErr w:type="spellStart"/>
+            <w:r>
+              <w:rPr>
+                <w:rFonts w:ascii="Arial" w:eastAsiaTheme="minorEastAsia" w:hAnsi="Arial" w:cs="Arial"/>
+                <w:sz w:val="24"/>
+                <w:szCs w:val="24"/>
+              </w:rPr>
+              <w:t>Andre</w:t>
+            </w:r>
+            <w:proofErr w:type="spellEnd"/>
+            <w:r>
+              <w:rPr>
+                <w:rFonts w:ascii="Arial" w:eastAsiaTheme="minorEastAsia" w:hAnsi="Arial" w:cs="Arial"/>
+                <w:sz w:val="24"/>
+                <w:szCs w:val="24"/>
+              </w:rPr>
+              <w:t xml:space="preserve"> Cano </w:t>
+            </w:r>
+            <w:proofErr w:type="spellStart"/>
+            <w:r>
+              <w:rPr>
+                <w:rFonts w:ascii="Arial" w:eastAsiaTheme="minorEastAsia" w:hAnsi="Arial" w:cs="Arial"/>
+                <w:sz w:val="24"/>
+                <w:szCs w:val="24"/>
+              </w:rPr>
+              <w:t>Lopez</w:t>
+            </w:r>
+            <w:proofErr w:type="spellEnd"/>
+          </w:p>
+        </w:tc>
+        <w:tc>
+          <w:tcPr>
+            <w:tcW w:w="5395" w:type="dxa"/>
+          </w:tcPr>
+          <w:p>
+            <w:pPr>
+              <w:spacing w:after="0" w:line="240" w:lineRule="auto"/>
+              <w:jc w:val="center"/>
+              <w:rPr>
+                <w:rFonts w:ascii="Arial" w:eastAsiaTheme="minorEastAsia" w:hAnsi="Arial" w:cs="Arial"/>
+                <w:sz w:val="24"/>
+                <w:szCs w:val="24"/>
+              </w:rPr>
+            </w:pPr>
+            <w:r>
+              <w:rPr>
+                <w:rFonts w:ascii="Arial" w:eastAsiaTheme="minorEastAsia" w:hAnsi="Arial" w:cs="Arial"/>
+                <w:sz w:val="24"/>
+                <w:szCs w:val="24"/>
+              </w:rPr>
+              <w:t>Programador</w:t>
+            </w:r>
           </w:p>
         </w:tc>
       </w:tr>
@@ -770,26 +922,42 @@
           </w:tcPr>
           <w:p>
             <w:pPr>
-              <w:jc w:val="center"/>
-              <w:rPr>
-                <w:rFonts w:ascii="Arial" w:eastAsiaTheme="minorHAnsi" w:hAnsi="Arial" w:cs="Arial"/>
-                <w:sz w:val="24"/>
-              </w:rPr>
-            </w:pPr>
-          </w:p>
-        </w:tc>
-        <w:tc>
-          <w:tcPr>
-            <w:tcW w:w="5395" w:type="dxa"/>
-          </w:tcPr>
-          <w:p>
-            <w:pPr>
-              <w:jc w:val="center"/>
-              <w:rPr>
-                <w:rFonts w:ascii="Arial" w:eastAsiaTheme="minorHAnsi" w:hAnsi="Arial" w:cs="Arial"/>
-                <w:sz w:val="24"/>
-              </w:rPr>
-            </w:pPr>
+              <w:spacing w:after="0" w:line="240" w:lineRule="auto"/>
+              <w:jc w:val="center"/>
+              <w:rPr>
+                <w:rFonts w:ascii="Arial" w:eastAsiaTheme="minorHAnsi" w:hAnsi="Arial" w:cs="Arial"/>
+                <w:sz w:val="24"/>
+              </w:rPr>
+            </w:pPr>
+            <w:r>
+              <w:rPr>
+                <w:rFonts w:ascii="Arial" w:eastAsiaTheme="minorHAnsi" w:hAnsi="Arial" w:cs="Arial"/>
+                <w:sz w:val="24"/>
+              </w:rPr>
+              <w:t>Carlos Enrique López Quino</w:t>
+            </w:r>
+          </w:p>
+        </w:tc>
+        <w:tc>
+          <w:tcPr>
+            <w:tcW w:w="5395" w:type="dxa"/>
+          </w:tcPr>
+          <w:p>
+            <w:pPr>
+              <w:spacing w:after="0" w:line="240" w:lineRule="auto"/>
+              <w:jc w:val="center"/>
+              <w:rPr>
+                <w:rFonts w:ascii="Arial" w:eastAsiaTheme="minorHAnsi" w:hAnsi="Arial" w:cs="Arial"/>
+                <w:sz w:val="24"/>
+              </w:rPr>
+            </w:pPr>
+            <w:r>
+              <w:rPr>
+                <w:rFonts w:ascii="Arial" w:eastAsiaTheme="minorHAnsi" w:hAnsi="Arial" w:cs="Arial"/>
+                <w:sz w:val="24"/>
+              </w:rPr>
+              <w:t>Programador</w:t>
+            </w:r>
           </w:p>
         </w:tc>
       </w:tr>
@@ -800,26 +968,51 @@
           </w:tcPr>
           <w:p>
             <w:pPr>
-              <w:jc w:val="center"/>
-              <w:rPr>
-                <w:rFonts w:ascii="Arial" w:eastAsiaTheme="minorHAnsi" w:hAnsi="Arial" w:cs="Arial"/>
-                <w:sz w:val="24"/>
-              </w:rPr>
-            </w:pPr>
-          </w:p>
-        </w:tc>
-        <w:tc>
-          <w:tcPr>
-            <w:tcW w:w="5395" w:type="dxa"/>
-          </w:tcPr>
-          <w:p>
-            <w:pPr>
-              <w:jc w:val="center"/>
-              <w:rPr>
-                <w:rFonts w:ascii="Arial" w:eastAsiaTheme="minorHAnsi" w:hAnsi="Arial" w:cs="Arial"/>
-                <w:sz w:val="24"/>
-              </w:rPr>
-            </w:pPr>
+              <w:spacing w:after="0" w:line="240" w:lineRule="auto"/>
+              <w:jc w:val="center"/>
+              <w:rPr>
+                <w:rFonts w:ascii="Arial" w:eastAsiaTheme="minorHAnsi" w:hAnsi="Arial" w:cs="Arial"/>
+                <w:sz w:val="24"/>
+              </w:rPr>
+            </w:pPr>
+            <w:r>
+              <w:rPr>
+                <w:rFonts w:ascii="Arial" w:eastAsiaTheme="minorHAnsi" w:hAnsi="Arial" w:cs="Arial"/>
+                <w:sz w:val="24"/>
+              </w:rPr>
+              <w:t xml:space="preserve">Ricardo Alejandro Hernández </w:t>
+            </w:r>
+            <w:proofErr w:type="spellStart"/>
+            <w:r>
+              <w:rPr>
+                <w:rFonts w:ascii="Arial" w:eastAsiaTheme="minorHAnsi" w:hAnsi="Arial" w:cs="Arial"/>
+                <w:sz w:val="24"/>
+              </w:rPr>
+              <w:t>Hernández</w:t>
+            </w:r>
+            <w:proofErr w:type="spellEnd"/>
+          </w:p>
+        </w:tc>
+        <w:tc>
+          <w:tcPr>
+            <w:tcW w:w="5395" w:type="dxa"/>
+          </w:tcPr>
+          <w:p>
+            <w:pPr>
+              <w:spacing w:after="0" w:line="240" w:lineRule="auto"/>
+              <w:jc w:val="center"/>
+              <w:rPr>
+                <w:rFonts w:ascii="Arial" w:eastAsiaTheme="minorHAnsi" w:hAnsi="Arial" w:cs="Arial"/>
+                <w:sz w:val="24"/>
+              </w:rPr>
+            </w:pPr>
+            <w:r>
+              <w:rPr>
+                <w:rFonts w:ascii="Arial" w:eastAsiaTheme="minorHAnsi" w:hAnsi="Arial" w:cs="Arial"/>
+                <w:sz w:val="24"/>
+              </w:rPr>
+              <w:t>Programador</w:t>
+            </w:r>
           </w:p>
         </w:tc>
       </w:tr>
@@ -830,26 +1023,58 @@
           </w:tcPr>
           <w:p>
             <w:pPr>
-              <w:jc w:val="center"/>
-              <w:rPr>
-                <w:rFonts w:ascii="Arial" w:eastAsiaTheme="minorHAnsi" w:hAnsi="Arial" w:cs="Arial"/>
-                <w:sz w:val="24"/>
-              </w:rPr>
-            </w:pPr>
-          </w:p>
-        </w:tc>
-        <w:tc>
-          <w:tcPr>
-            <w:tcW w:w="5395" w:type="dxa"/>
-          </w:tcPr>
-          <w:p>
-            <w:pPr>
-              <w:jc w:val="center"/>
-              <w:rPr>
-                <w:rFonts w:ascii="Arial" w:eastAsiaTheme="minorHAnsi" w:hAnsi="Arial" w:cs="Arial"/>
-                <w:sz w:val="24"/>
-              </w:rPr>
-            </w:pPr>
+              <w:spacing w:after="0" w:line="240" w:lineRule="auto"/>
+              <w:jc w:val="center"/>
+              <w:rPr>
+                <w:rFonts w:ascii="Arial" w:eastAsiaTheme="minorHAnsi" w:hAnsi="Arial" w:cs="Arial"/>
+                <w:sz w:val="24"/>
+              </w:rPr>
+            </w:pPr>
+            <w:r>
+              <w:rPr>
+                <w:rFonts w:ascii="Arial" w:eastAsiaTheme="minorHAnsi" w:hAnsi="Arial" w:cs="Arial"/>
+                <w:sz w:val="24"/>
+              </w:rPr>
+              <w:t xml:space="preserve">Osman </w:t>
+            </w:r>
+            <w:proofErr w:type="spellStart"/>
+            <w:r>
+              <w:rPr>
+                <w:rFonts w:ascii="Arial" w:eastAsiaTheme="minorHAnsi" w:hAnsi="Arial" w:cs="Arial"/>
+                <w:sz w:val="24"/>
+              </w:rPr>
+              <w:t>Emmanuell</w:t>
+            </w:r>
+            <w:proofErr w:type="spellEnd"/>
+            <w:r>
+              <w:rPr>
+                <w:rFonts w:ascii="Arial" w:eastAsiaTheme="minorHAnsi" w:hAnsi="Arial" w:cs="Arial"/>
+                <w:sz w:val="24"/>
+              </w:rPr>
+              <w:t xml:space="preserve"> Veliz Guzmán</w:t>
+            </w:r>
+          </w:p>
+        </w:tc>
+        <w:tc>
+          <w:tcPr>
+            <w:tcW w:w="5395" w:type="dxa"/>
+          </w:tcPr>
+          <w:p>
+            <w:pPr>
+              <w:spacing w:after="0" w:line="240" w:lineRule="auto"/>
+              <w:jc w:val="center"/>
+              <w:rPr>
+                <w:rFonts w:ascii="Arial" w:eastAsiaTheme="minorHAnsi" w:hAnsi="Arial" w:cs="Arial"/>
+                <w:sz w:val="24"/>
+              </w:rPr>
+            </w:pPr>
+            <w:r>
+              <w:rPr>
+                <w:rFonts w:ascii="Arial" w:eastAsiaTheme="minorHAnsi" w:hAnsi="Arial" w:cs="Arial"/>
+                <w:sz w:val="24"/>
+              </w:rPr>
+              <w:t>Programador</w:t>
+            </w:r>
           </w:p>
         </w:tc>
       </w:tr>
@@ -860,26 +1085,42 @@
           </w:tcPr>
           <w:p>
             <w:pPr>
-              <w:jc w:val="center"/>
-              <w:rPr>
-                <w:rFonts w:ascii="Arial" w:eastAsiaTheme="minorHAnsi" w:hAnsi="Arial" w:cs="Arial"/>
-                <w:sz w:val="24"/>
-              </w:rPr>
-            </w:pPr>
-          </w:p>
-        </w:tc>
-        <w:tc>
-          <w:tcPr>
-            <w:tcW w:w="5395" w:type="dxa"/>
-          </w:tcPr>
-          <w:p>
-            <w:pPr>
-              <w:jc w:val="center"/>
-              <w:rPr>
-                <w:rFonts w:ascii="Arial" w:eastAsiaTheme="minorHAnsi" w:hAnsi="Arial" w:cs="Arial"/>
-                <w:sz w:val="24"/>
-              </w:rPr>
-            </w:pPr>
+              <w:spacing w:after="0" w:line="240" w:lineRule="auto"/>
+              <w:jc w:val="center"/>
+              <w:rPr>
+                <w:rFonts w:ascii="Arial" w:eastAsiaTheme="minorHAnsi" w:hAnsi="Arial" w:cs="Arial"/>
+                <w:sz w:val="24"/>
+              </w:rPr>
+            </w:pPr>
+            <w:r>
+              <w:rPr>
+                <w:rFonts w:ascii="Arial" w:eastAsiaTheme="minorHAnsi" w:hAnsi="Arial" w:cs="Arial"/>
+                <w:sz w:val="24"/>
+              </w:rPr>
+              <w:t>Franklin Stev Paiz Chavez</w:t>
+            </w:r>
+          </w:p>
+        </w:tc>
+        <w:tc>
+          <w:tcPr>
+            <w:tcW w:w="5395" w:type="dxa"/>
+          </w:tcPr>
+          <w:p>
+            <w:pPr>
+              <w:spacing w:after="0" w:line="240" w:lineRule="auto"/>
+              <w:jc w:val="center"/>
+              <w:rPr>
+                <w:rFonts w:ascii="Arial" w:eastAsiaTheme="minorHAnsi" w:hAnsi="Arial" w:cs="Arial"/>
+                <w:sz w:val="24"/>
+              </w:rPr>
+            </w:pPr>
+            <w:r>
+              <w:rPr>
+                <w:rFonts w:ascii="Arial" w:eastAsiaTheme="minorHAnsi" w:hAnsi="Arial" w:cs="Arial"/>
+                <w:sz w:val="24"/>
+              </w:rPr>
+              <w:t>Programador</w:t>
+            </w:r>
           </w:p>
         </w:tc>
       </w:tr>
@@ -890,6 +1131,7 @@
           </w:tcPr>
           <w:p>
             <w:pPr>
+              <w:spacing w:after="0" w:line="240" w:lineRule="auto"/>
               <w:jc w:val="center"/>
               <w:rPr>
                 <w:rFonts w:ascii="Arial" w:eastAsiaTheme="minorEastAsia" w:hAnsi="Arial" w:cs="Arial"/>
@@ -897,21 +1139,48 @@
                 <w:szCs w:val="24"/>
               </w:rPr>
             </w:pPr>
-          </w:p>
-        </w:tc>
-        <w:tc>
-          <w:tcPr>
-            <w:tcW w:w="5395" w:type="dxa"/>
-          </w:tcPr>
-          <w:p>
-            <w:pPr>
-              <w:jc w:val="center"/>
+            <w:proofErr w:type="spellStart"/>
+            <w:r>
               <w:rPr>
                 <w:rFonts w:ascii="Arial" w:eastAsiaTheme="minorEastAsia" w:hAnsi="Arial" w:cs="Arial"/>
                 <w:sz w:val="24"/>
                 <w:szCs w:val="24"/>
               </w:rPr>
-            </w:pPr>
+              <w:t>Angel</w:t>
+            </w:r>
+            <w:proofErr w:type="spellEnd"/>
+            <w:r>
+              <w:rPr>
+                <w:rFonts w:ascii="Arial" w:eastAsiaTheme="minorEastAsia" w:hAnsi="Arial" w:cs="Arial"/>
+                <w:sz w:val="24"/>
+                <w:szCs w:val="24"/>
+              </w:rPr>
+              <w:t xml:space="preserve"> Gabriel Ernesto Grijalva Castro</w:t>
+            </w:r>
+          </w:p>
+        </w:tc>
+        <w:tc>
+          <w:tcPr>
+            <w:tcW w:w="5395" w:type="dxa"/>
+          </w:tcPr>
+          <w:p>
+            <w:pPr>
+              <w:spacing w:after="0" w:line="240" w:lineRule="auto"/>
+              <w:jc w:val="center"/>
+              <w:rPr>
+                <w:rFonts w:ascii="Arial" w:eastAsiaTheme="minorEastAsia" w:hAnsi="Arial" w:cs="Arial"/>
+                <w:sz w:val="24"/>
+                <w:szCs w:val="24"/>
+              </w:rPr>
+            </w:pPr>
+            <w:r>
+              <w:rPr>
+                <w:rFonts w:ascii="Arial" w:eastAsiaTheme="minorEastAsia" w:hAnsi="Arial" w:cs="Arial"/>
+                <w:sz w:val="24"/>
+                <w:szCs w:val="24"/>
+              </w:rPr>
+              <w:t>Programador</w:t>
+            </w:r>
           </w:p>
         </w:tc>
       </w:tr>
@@ -922,26 +1191,42 @@
           </w:tcPr>
           <w:p>
             <w:pPr>
-              <w:jc w:val="center"/>
-              <w:rPr>
-                <w:rFonts w:ascii="Arial" w:eastAsiaTheme="minorHAnsi" w:hAnsi="Arial" w:cs="Arial"/>
-                <w:sz w:val="24"/>
-              </w:rPr>
-            </w:pPr>
-          </w:p>
-        </w:tc>
-        <w:tc>
-          <w:tcPr>
-            <w:tcW w:w="5395" w:type="dxa"/>
-          </w:tcPr>
-          <w:p>
-            <w:pPr>
-              <w:jc w:val="center"/>
-              <w:rPr>
-                <w:rFonts w:ascii="Arial" w:eastAsiaTheme="minorHAnsi" w:hAnsi="Arial" w:cs="Arial"/>
-                <w:sz w:val="24"/>
-              </w:rPr>
-            </w:pPr>
+              <w:spacing w:after="0" w:line="240" w:lineRule="auto"/>
+              <w:jc w:val="center"/>
+              <w:rPr>
+                <w:rFonts w:ascii="Arial" w:eastAsiaTheme="minorHAnsi" w:hAnsi="Arial" w:cs="Arial"/>
+                <w:sz w:val="24"/>
+              </w:rPr>
+            </w:pPr>
+            <w:r>
+              <w:rPr>
+                <w:rFonts w:ascii="Arial" w:eastAsiaTheme="minorHAnsi" w:hAnsi="Arial" w:cs="Arial"/>
+                <w:sz w:val="24"/>
+              </w:rPr>
+              <w:t>Benjamin Elí Argueta Caal</w:t>
+            </w:r>
+          </w:p>
+        </w:tc>
+        <w:tc>
+          <w:tcPr>
+            <w:tcW w:w="5395" w:type="dxa"/>
+          </w:tcPr>
+          <w:p>
+            <w:pPr>
+              <w:spacing w:after="0" w:line="240" w:lineRule="auto"/>
+              <w:jc w:val="center"/>
+              <w:rPr>
+                <w:rFonts w:ascii="Arial" w:eastAsiaTheme="minorHAnsi" w:hAnsi="Arial" w:cs="Arial"/>
+                <w:sz w:val="24"/>
+              </w:rPr>
+            </w:pPr>
+            <w:r>
+              <w:rPr>
+                <w:rFonts w:ascii="Arial" w:eastAsiaTheme="minorHAnsi" w:hAnsi="Arial" w:cs="Arial"/>
+                <w:sz w:val="24"/>
+              </w:rPr>
+              <w:t>Programador</w:t>
+            </w:r>
           </w:p>
         </w:tc>
       </w:tr>
@@ -952,26 +1237,52 @@
           </w:tcPr>
           <w:p>
             <w:pPr>
-              <w:jc w:val="center"/>
-              <w:rPr>
-                <w:rFonts w:ascii="Arial" w:eastAsiaTheme="minorHAnsi" w:hAnsi="Arial" w:cs="Arial"/>
-                <w:sz w:val="24"/>
-              </w:rPr>
-            </w:pPr>
-          </w:p>
-        </w:tc>
-        <w:tc>
-          <w:tcPr>
-            <w:tcW w:w="5395" w:type="dxa"/>
-          </w:tcPr>
-          <w:p>
-            <w:pPr>
-              <w:jc w:val="center"/>
-              <w:rPr>
-                <w:rFonts w:ascii="Arial" w:eastAsiaTheme="minorHAnsi" w:hAnsi="Arial" w:cs="Arial"/>
-                <w:sz w:val="24"/>
-              </w:rPr>
-            </w:pPr>
+              <w:spacing w:after="0" w:line="240" w:lineRule="auto"/>
+              <w:jc w:val="center"/>
+              <w:rPr>
+                <w:rFonts w:ascii="Arial" w:eastAsiaTheme="minorHAnsi" w:hAnsi="Arial" w:cs="Arial"/>
+                <w:sz w:val="24"/>
+              </w:rPr>
+            </w:pPr>
+            <w:r>
+              <w:rPr>
+                <w:rFonts w:ascii="Arial" w:eastAsiaTheme="minorHAnsi" w:hAnsi="Arial" w:cs="Arial"/>
+                <w:sz w:val="24"/>
+              </w:rPr>
+              <w:t xml:space="preserve">Carlos Alejandro Patal </w:t>
+            </w:r>
+            <w:proofErr w:type="spellStart"/>
+            <w:r>
+              <w:rPr>
+                <w:rFonts w:ascii="Arial" w:eastAsiaTheme="minorHAnsi" w:hAnsi="Arial" w:cs="Arial"/>
+                <w:sz w:val="24"/>
+              </w:rPr>
+              <w:t>Choc</w:t>
+            </w:r>
+            <w:proofErr w:type="spellEnd"/>
+          </w:p>
+        </w:tc>
+        <w:tc>
+          <w:tcPr>
+            <w:tcW w:w="5395" w:type="dxa"/>
+          </w:tcPr>
+          <w:p>
+            <w:pPr>
+              <w:spacing w:after="0" w:line="240" w:lineRule="auto"/>
+              <w:jc w:val="center"/>
+              <w:rPr>
+                <w:rFonts w:ascii="Arial" w:eastAsiaTheme="minorHAnsi" w:hAnsi="Arial" w:cs="Arial"/>
+                <w:sz w:val="24"/>
+                <w:u w:val="single"/>
+              </w:rPr>
+            </w:pPr>
+            <w:r>
+              <w:rPr>
+                <w:rFonts w:ascii="Arial" w:eastAsiaTheme="minorHAnsi" w:hAnsi="Arial" w:cs="Arial"/>
+                <w:sz w:val="24"/>
+              </w:rPr>
+              <w:t>Programador</w:t>
+            </w:r>
           </w:p>
         </w:tc>
       </w:tr>
@@ -982,20 +1293,22 @@
           </w:tcPr>
           <w:p>
             <w:pPr>
-              <w:jc w:val="center"/>
-              <w:rPr>
-                <w:rFonts w:ascii="Arial" w:eastAsiaTheme="minorHAnsi" w:hAnsi="Arial" w:cs="Arial"/>
-                <w:sz w:val="24"/>
-              </w:rPr>
-            </w:pPr>
-          </w:p>
-        </w:tc>
-        <w:tc>
-          <w:tcPr>
-            <w:tcW w:w="5395" w:type="dxa"/>
-          </w:tcPr>
-          <w:p>
-            <w:pPr>
+              <w:spacing w:after="0" w:line="240" w:lineRule="auto"/>
+              <w:jc w:val="center"/>
+              <w:rPr>
+                <w:rFonts w:ascii="Arial" w:eastAsiaTheme="minorHAnsi" w:hAnsi="Arial" w:cs="Arial"/>
+                <w:sz w:val="24"/>
+              </w:rPr>
+            </w:pPr>
+          </w:p>
+        </w:tc>
+        <w:tc>
+          <w:tcPr>
+            <w:tcW w:w="5395" w:type="dxa"/>
+          </w:tcPr>
+          <w:p>
+            <w:pPr>
+              <w:spacing w:after="0" w:line="240" w:lineRule="auto"/>
               <w:jc w:val="center"/>
               <w:rPr>
                 <w:rFonts w:ascii="Arial" w:eastAsiaTheme="minorHAnsi" w:hAnsi="Arial" w:cs="Arial"/>
@@ -1019,6 +1332,7 @@
         <w:rPr>
           <w:rFonts w:ascii="Arial" w:eastAsiaTheme="minorHAnsi" w:hAnsi="Arial" w:cs="Arial"/>
           <w:bCs/>
+          <w:u w:val="single"/>
         </w:rPr>
       </w:pPr>
       <w:r>
@@ -1028,8 +1342,6 @@
         </w:rPr>
         <w:t xml:space="preserve">    </w:t>
       </w:r>
-      <w:bookmarkStart w:id="0" w:name="_GoBack"/>
-      <w:bookmarkEnd w:id="0"/>
     </w:p>
     <w:sectPr>
       <w:pgSz w:w="12240" w:h="15840"/>
@@ -1041,24 +1353,68 @@
 </w:document>
 </file>
 
+<file path=word/endnotes.xml><?xml version="1.0" encoding="utf-8"?>
+<w:endnotes xmlns:wpc="http://schemas.microsoft.com/office/word/2010/wordprocessingCanvas" xmlns:cx="http://schemas.microsoft.com/office/drawing/2014/chartex" xmlns:cx1="http://schemas.microsoft.com/office/drawing/2015/9/8/chartex" xmlns:cx2="http://schemas.microsoft.com/office/drawing/2015/10/21/chartex" xmlns:cx3="http://schemas.microsoft.com/office/drawing/2016/5/9/chartex" xmlns:cx4="http://schemas.microsoft.com/office/drawing/2016/5/10/chartex" xmlns:cx5="http://schemas.microsoft.com/office/drawing/2016/5/11/chartex" xmlns:cx6="http://schemas.microsoft.com/office/drawing/2016/5/12/chartex" xmlns:cx7="http://schemas.microsoft.com/office/drawing/2016/5/13/chartex" xmlns:cx8="http://schemas.microsoft.com/office/drawing/2016/5/14/chartex" xmlns:mc="http://schemas.openxmlformats.org/markup-compatibility/2006" xmlns:aink="http://schemas.microsoft.com/office/drawing/2016/ink" xmlns:am3d="http://schemas.microsoft.com/office/drawing/2017/model3d" xmlns:o="urn:schemas-microsoft-com:office:office" xmlns:oel="http://schemas.microsoft.com/office/2019/extlst" xmlns:r="http://schemas.openxmlformats.org/officeDocument/2006/relationships" xmlns:m="http://schemas.openxmlformats.org/officeDocument/2006/math" xmlns:v="urn:schemas-microsoft-com:vml" xmlns:wp14="http://schemas.microsoft.com/office/word/2010/wordprocessingDrawing" xmlns:wp="http://schemas.openxmlformats.org/drawingml/2006/wordprocessingDrawing" xmlns:w10="urn:schemas-microsoft-com:office:word" xmlns:w="http://schemas.openxmlformats.org/wordprocessingml/2006/main" xmlns:w14="http://schemas.microsoft.com/office/word/2010/wordml" xmlns:w15="http://schemas.microsoft.com/office/word/2012/wordml" xmlns:w16cex="http://schemas.microsoft.com/office/word/2018/wordml/cex" xmlns:w16cid="http://schemas.microsoft.com/office/word/2016/wordml/cid" xmlns:w16="http://schemas.microsoft.com/office/word/2018/wordml" xmlns:w16du="http://schemas.microsoft.com/office/word/2023/wordml/word16du" xmlns:w16sdtdh="http://schemas.microsoft.com/office/word/2020/wordml/sdtdatahash" xmlns:w16sdtfl="http://schemas.microsoft.com/office/word/2024/wordml/sdtformatlock" xmlns:w16se="http://schemas.microsoft.com/office/word/2015/wordml/symex" xmlns:wpg="http://schemas.microsoft.com/office/word/2010/wordprocessingGroup" xmlns:wpi="http://schemas.microsoft.com/office/word/2010/wordprocessingInk" xmlns:wne="http://schemas.microsoft.com/office/word/2006/wordml" xmlns:wps="http://schemas.microsoft.com/office/word/2010/wordprocessingShape" mc:Ignorable="w14 w15 w16se w16cid w16 w16cex w16sdtdh w16sdtfl w16du wp14">
+  <w:endnote w:type="separator" w:id="-1">
+    <w:p>
+      <w:pPr>
+        <w:spacing w:line="240" w:lineRule="auto"/>
+      </w:pPr>
+      <w:r>
+        <w:separator/>
+      </w:r>
+    </w:p>
+  </w:endnote>
+  <w:endnote w:type="continuationSeparator" w:id="0">
+    <w:p>
+      <w:pPr>
+        <w:spacing w:line="240" w:lineRule="auto"/>
+      </w:pPr>
+      <w:r>
+        <w:continuationSeparator/>
+      </w:r>
+    </w:p>
+  </w:endnote>
+</w:endnotes>
+</file>
+
+<file path=word/footnotes.xml><?xml version="1.0" encoding="utf-8"?>
+<w:footnotes xmlns:wpc="http://schemas.microsoft.com/office/word/2010/wordprocessingCanvas" xmlns:cx="http://schemas.microsoft.com/office/drawing/2014/chartex" xmlns:cx1="http://schemas.microsoft.com/office/drawing/2015/9/8/chartex" xmlns:cx2="http://schemas.microsoft.com/office/drawing/2015/10/21/chartex" xmlns:cx3="http://schemas.microsoft.com/office/drawing/2016/5/9/chartex" xmlns:cx4="http://schemas.microsoft.com/office/drawing/2016/5/10/chartex" xmlns:cx5="http://schemas.microsoft.com/office/drawing/2016/5/11/chartex" xmlns:cx6="http://schemas.microsoft.com/office/drawing/2016/5/12/chartex" xmlns:cx7="http://schemas.microsoft.com/office/drawing/2016/5/13/chartex" xmlns:cx8="http://schemas.microsoft.com/office/drawing/2016/5/14/chartex" xmlns:mc="http://schemas.openxmlformats.org/markup-compatibility/2006" xmlns:aink="http://schemas.microsoft.com/office/drawing/2016/ink" xmlns:am3d="http://schemas.microsoft.com/office/drawing/2017/model3d" xmlns:o="urn:schemas-microsoft-com:office:office" xmlns:oel="http://schemas.microsoft.com/office/2019/extlst" xmlns:r="http://schemas.openxmlformats.org/officeDocument/2006/relationships" xmlns:m="http://schemas.openxmlformats.org/officeDocument/2006/math" xmlns:v="urn:schemas-microsoft-com:vml" xmlns:wp14="http://schemas.microsoft.com/office/word/2010/wordprocessingDrawing" xmlns:wp="http://schemas.openxmlformats.org/drawingml/2006/wordprocessingDrawing" xmlns:w10="urn:schemas-microsoft-com:office:word" xmlns:w="http://schemas.openxmlformats.org/wordprocessingml/2006/main" xmlns:w14="http://schemas.microsoft.com/office/word/2010/wordml" xmlns:w15="http://schemas.microsoft.com/office/word/2012/wordml" xmlns:w16cex="http://schemas.microsoft.com/office/word/2018/wordml/cex" xmlns:w16cid="http://schemas.microsoft.com/office/word/2016/wordml/cid" xmlns:w16="http://schemas.microsoft.com/office/word/2018/wordml" xmlns:w16du="http://schemas.microsoft.com/office/word/2023/wordml/word16du" xmlns:w16sdtdh="http://schemas.microsoft.com/office/word/2020/wordml/sdtdatahash" xmlns:w16sdtfl="http://schemas.microsoft.com/office/word/2024/wordml/sdtformatlock" xmlns:w16se="http://schemas.microsoft.com/office/word/2015/wordml/symex" xmlns:wpg="http://schemas.microsoft.com/office/word/2010/wordprocessingGroup" xmlns:wpi="http://schemas.microsoft.com/office/word/2010/wordprocessingInk" xmlns:wne="http://schemas.microsoft.com/office/word/2006/wordml" xmlns:wps="http://schemas.microsoft.com/office/word/2010/wordprocessingShape" mc:Ignorable="w14 w15 w16se w16cid w16 w16cex w16sdtdh w16sdtfl w16du wp14">
+  <w:footnote w:type="separator" w:id="-1">
+    <w:p>
+      <w:pPr>
+        <w:spacing w:after="0"/>
+      </w:pPr>
+      <w:r>
+        <w:separator/>
+      </w:r>
+    </w:p>
+  </w:footnote>
+  <w:footnote w:type="continuationSeparator" w:id="0">
+    <w:p>
+      <w:pPr>
+        <w:spacing w:after="0"/>
+      </w:pPr>
+      <w:r>
+        <w:continuationSeparator/>
+      </w:r>
+    </w:p>
+  </w:footnote>
+</w:footnotes>
+</file>
+
 <file path=word/styles.xml><?xml version="1.0" encoding="utf-8"?>
-<w:styles xmlns:mc="http://schemas.openxmlformats.org/markup-compatibility/2006" xmlns:r="http://schemas.openxmlformats.org/officeDocument/2006/relationships" xmlns:w="http://schemas.openxmlformats.org/wordprocessingml/2006/main" xmlns:w14="http://schemas.microsoft.com/office/word/2010/wordml" xmlns:w15="http://schemas.microsoft.com/office/word/2012/wordml" xmlns:w16se="http://schemas.microsoft.com/office/word/2015/wordml/symex" mc:Ignorable="w14 w15 w16se">
+<w:styles xmlns:mc="http://schemas.openxmlformats.org/markup-compatibility/2006" xmlns:r="http://schemas.openxmlformats.org/officeDocument/2006/relationships" xmlns:w="http://schemas.openxmlformats.org/wordprocessingml/2006/main" xmlns:w14="http://schemas.microsoft.com/office/word/2010/wordml" xmlns:w15="http://schemas.microsoft.com/office/word/2012/wordml" xmlns:w16cex="http://schemas.microsoft.com/office/word/2018/wordml/cex" xmlns:w16cid="http://schemas.microsoft.com/office/word/2016/wordml/cid" xmlns:w16="http://schemas.microsoft.com/office/word/2018/wordml" xmlns:w16du="http://schemas.microsoft.com/office/word/2023/wordml/word16du" xmlns:w16sdtdh="http://schemas.microsoft.com/office/word/2020/wordml/sdtdatahash" xmlns:w16sdtfl="http://schemas.microsoft.com/office/word/2024/wordml/sdtformatlock" xmlns:w16se="http://schemas.microsoft.com/office/word/2015/wordml/symex" mc:Ignorable="w14 w15 w16se w16cid w16 w16cex w16sdtdh w16sdtfl w16du">
   <w:docDefaults>
     <w:rPrDefault>
       <w:rPr>
         <w:rFonts w:asciiTheme="minorHAnsi" w:eastAsiaTheme="minorHAnsi" w:hAnsiTheme="minorHAnsi" w:cstheme="minorBidi"/>
-        <w:sz w:val="22"/>
-        <w:szCs w:val="22"/>
-        <w:lang w:val="es-GT" w:eastAsia="en-US" w:bidi="ar-SA"/>
+        <w:lang w:val="es-MX" w:eastAsia="es-MX" w:bidi="ar-SA"/>
       </w:rPr>
     </w:rPrDefault>
-    <w:pPrDefault>
-      <w:pPr>
-        <w:spacing w:after="160" w:line="259" w:lineRule="auto"/>
-      </w:pPr>
-    </w:pPrDefault>
+    <w:pPrDefault/>
   </w:docDefaults>
-  <w:latentStyles w:defLockedState="0" w:defUIPriority="99" w:defSemiHidden="0" w:defUnhideWhenUsed="0" w:defQFormat="0" w:count="371">
+  <w:latentStyles w:defLockedState="0" w:defUIPriority="99" w:defSemiHidden="0" w:defUnhideWhenUsed="0" w:defQFormat="0" w:count="376">
     <w:lsdException w:name="Normal" w:uiPriority="0" w:qFormat="1"/>
     <w:lsdException w:name="heading 1" w:uiPriority="9" w:qFormat="1"/>
     <w:lsdException w:name="heading 2" w:semiHidden="1" w:uiPriority="9" w:unhideWhenUsed="1" w:qFormat="1"/>
@@ -1089,7 +1445,7 @@
     <w:lsdException w:name="toc 9" w:semiHidden="1" w:uiPriority="39" w:unhideWhenUsed="1"/>
     <w:lsdException w:name="Normal Indent" w:semiHidden="1" w:unhideWhenUsed="1"/>
     <w:lsdException w:name="footnote text" w:semiHidden="1" w:unhideWhenUsed="1"/>
-    <w:lsdException w:name="annotation text" w:semiHidden="1" w:unhideWhenUsed="1"/>
+    <w:lsdException w:name="annotation text" w:semiHidden="1" w:unhideWhenUsed="1" w:qFormat="1"/>
     <w:lsdException w:name="header" w:semiHidden="1" w:unhideWhenUsed="1"/>
     <w:lsdException w:name="footer" w:semiHidden="1" w:unhideWhenUsed="1"/>
     <w:lsdException w:name="index heading" w:semiHidden="1" w:unhideWhenUsed="1"/>
@@ -1153,7 +1509,7 @@
     <w:lsdException w:name="E-mail Signature" w:semiHidden="1" w:unhideWhenUsed="1"/>
     <w:lsdException w:name="HTML Top of Form" w:semiHidden="1" w:unhideWhenUsed="1"/>
     <w:lsdException w:name="HTML Bottom of Form" w:semiHidden="1" w:unhideWhenUsed="1"/>
-    <w:lsdException w:name="Normal (Web)" w:semiHidden="1" w:unhideWhenUsed="1"/>
+    <w:lsdException w:name="Normal (Web)" w:semiHidden="1" w:unhideWhenUsed="1" w:qFormat="1"/>
     <w:lsdException w:name="HTML Acronym" w:semiHidden="1" w:unhideWhenUsed="1"/>
     <w:lsdException w:name="HTML Address" w:semiHidden="1" w:unhideWhenUsed="1"/>
     <w:lsdException w:name="HTML Cite" w:semiHidden="1" w:unhideWhenUsed="1"/>
@@ -1164,8 +1520,8 @@
     <w:lsdException w:name="HTML Sample" w:semiHidden="1" w:unhideWhenUsed="1"/>
     <w:lsdException w:name="HTML Typewriter" w:semiHidden="1" w:unhideWhenUsed="1"/>
     <w:lsdException w:name="HTML Variable" w:semiHidden="1" w:unhideWhenUsed="1"/>
-    <w:lsdException w:name="Normal Table" w:semiHidden="1" w:unhideWhenUsed="1"/>
-    <w:lsdException w:name="annotation subject" w:semiHidden="1" w:unhideWhenUsed="1"/>
+    <w:lsdException w:name="Normal Table" w:semiHidden="1" w:unhideWhenUsed="1" w:qFormat="1"/>
+    <w:lsdException w:name="annotation subject" w:semiHidden="1" w:unhideWhenUsed="1" w:qFormat="1"/>
     <w:lsdException w:name="No List" w:semiHidden="1" w:unhideWhenUsed="1"/>
     <w:lsdException w:name="Outline List 1" w:semiHidden="1" w:unhideWhenUsed="1"/>
     <w:lsdException w:name="Outline List 2" w:semiHidden="1" w:unhideWhenUsed="1"/>
@@ -1212,113 +1568,113 @@
     <w:lsdException w:name="Table Web 1" w:semiHidden="1" w:unhideWhenUsed="1"/>
     <w:lsdException w:name="Table Web 2" w:semiHidden="1" w:unhideWhenUsed="1"/>
     <w:lsdException w:name="Table Web 3" w:semiHidden="1" w:unhideWhenUsed="1"/>
-    <w:lsdException w:name="Balloon Text" w:semiHidden="1" w:unhideWhenUsed="1"/>
-    <w:lsdException w:name="Table Grid" w:uiPriority="39"/>
+    <w:lsdException w:name="Balloon Text" w:semiHidden="1" w:unhideWhenUsed="1" w:qFormat="1"/>
+    <w:lsdException w:name="Table Grid" w:uiPriority="39" w:qFormat="1"/>
     <w:lsdException w:name="Table Theme" w:semiHidden="1" w:unhideWhenUsed="1"/>
-    <w:lsdException w:name="Placeholder Text" w:semiHidden="1"/>
+    <w:lsdException w:name="Placeholder Text" w:semiHidden="1" w:unhideWhenUsed="1"/>
     <w:lsdException w:name="No Spacing" w:uiPriority="1" w:qFormat="1"/>
-    <w:lsdException w:name="Light Shading" w:uiPriority="60"/>
-    <w:lsdException w:name="Light List" w:uiPriority="61"/>
-    <w:lsdException w:name="Light Grid" w:uiPriority="62"/>
-    <w:lsdException w:name="Medium Shading 1" w:uiPriority="63"/>
-    <w:lsdException w:name="Medium Shading 2" w:uiPriority="64"/>
-    <w:lsdException w:name="Medium List 1" w:uiPriority="65"/>
-    <w:lsdException w:name="Medium List 2" w:uiPriority="66"/>
-    <w:lsdException w:name="Medium Grid 1" w:uiPriority="67"/>
-    <w:lsdException w:name="Medium Grid 2" w:uiPriority="68"/>
-    <w:lsdException w:name="Medium Grid 3" w:uiPriority="69"/>
-    <w:lsdException w:name="Dark List" w:uiPriority="70"/>
-    <w:lsdException w:name="Colorful Shading" w:uiPriority="71"/>
-    <w:lsdException w:name="Colorful List" w:uiPriority="72"/>
-    <w:lsdException w:name="Colorful Grid" w:uiPriority="73"/>
-    <w:lsdException w:name="Light Shading Accent 1" w:uiPriority="60"/>
-    <w:lsdException w:name="Light List Accent 1" w:uiPriority="61"/>
-    <w:lsdException w:name="Light Grid Accent 1" w:uiPriority="62"/>
-    <w:lsdException w:name="Medium Shading 1 Accent 1" w:uiPriority="63"/>
-    <w:lsdException w:name="Medium Shading 2 Accent 1" w:uiPriority="64"/>
-    <w:lsdException w:name="Medium List 1 Accent 1" w:uiPriority="65"/>
-    <w:lsdException w:name="Revision" w:semiHidden="1"/>
-    <w:lsdException w:name="List Paragraph" w:uiPriority="34" w:qFormat="1"/>
-    <w:lsdException w:name="Quote" w:uiPriority="29" w:qFormat="1"/>
-    <w:lsdException w:name="Intense Quote" w:uiPriority="30" w:qFormat="1"/>
-    <w:lsdException w:name="Medium List 2 Accent 1" w:uiPriority="66"/>
-    <w:lsdException w:name="Medium Grid 1 Accent 1" w:uiPriority="67"/>
-    <w:lsdException w:name="Medium Grid 2 Accent 1" w:uiPriority="68"/>
-    <w:lsdException w:name="Medium Grid 3 Accent 1" w:uiPriority="69"/>
-    <w:lsdException w:name="Dark List Accent 1" w:uiPriority="70"/>
-    <w:lsdException w:name="Colorful Shading Accent 1" w:uiPriority="71"/>
-    <w:lsdException w:name="Colorful List Accent 1" w:uiPriority="72"/>
-    <w:lsdException w:name="Colorful Grid Accent 1" w:uiPriority="73"/>
-    <w:lsdException w:name="Light Shading Accent 2" w:uiPriority="60"/>
-    <w:lsdException w:name="Light List Accent 2" w:uiPriority="61"/>
-    <w:lsdException w:name="Light Grid Accent 2" w:uiPriority="62"/>
-    <w:lsdException w:name="Medium Shading 1 Accent 2" w:uiPriority="63"/>
-    <w:lsdException w:name="Medium Shading 2 Accent 2" w:uiPriority="64"/>
-    <w:lsdException w:name="Medium List 1 Accent 2" w:uiPriority="65"/>
-    <w:lsdException w:name="Medium List 2 Accent 2" w:uiPriority="66"/>
-    <w:lsdException w:name="Medium Grid 1 Accent 2" w:uiPriority="67"/>
-    <w:lsdException w:name="Medium Grid 2 Accent 2" w:uiPriority="68"/>
-    <w:lsdException w:name="Medium Grid 3 Accent 2" w:uiPriority="69"/>
-    <w:lsdException w:name="Dark List Accent 2" w:uiPriority="70"/>
-    <w:lsdException w:name="Colorful Shading Accent 2" w:uiPriority="71"/>
-    <w:lsdException w:name="Colorful List Accent 2" w:uiPriority="72"/>
-    <w:lsdException w:name="Colorful Grid Accent 2" w:uiPriority="73"/>
-    <w:lsdException w:name="Light Shading Accent 3" w:uiPriority="60"/>
-    <w:lsdException w:name="Light List Accent 3" w:uiPriority="61"/>
-    <w:lsdException w:name="Light Grid Accent 3" w:uiPriority="62"/>
-    <w:lsdException w:name="Medium Shading 1 Accent 3" w:uiPriority="63"/>
-    <w:lsdException w:name="Medium Shading 2 Accent 3" w:uiPriority="64"/>
-    <w:lsdException w:name="Medium List 1 Accent 3" w:uiPriority="65"/>
-    <w:lsdException w:name="Medium List 2 Accent 3" w:uiPriority="66"/>
-    <w:lsdException w:name="Medium Grid 1 Accent 3" w:uiPriority="67"/>
-    <w:lsdException w:name="Medium Grid 2 Accent 3" w:uiPriority="68"/>
-    <w:lsdException w:name="Medium Grid 3 Accent 3" w:uiPriority="69"/>
-    <w:lsdException w:name="Dark List Accent 3" w:uiPriority="70"/>
-    <w:lsdException w:name="Colorful Shading Accent 3" w:uiPriority="71"/>
-    <w:lsdException w:name="Colorful List Accent 3" w:uiPriority="72"/>
-    <w:lsdException w:name="Colorful Grid Accent 3" w:uiPriority="73"/>
-    <w:lsdException w:name="Light Shading Accent 4" w:uiPriority="60"/>
-    <w:lsdException w:name="Light List Accent 4" w:uiPriority="61"/>
-    <w:lsdException w:name="Light Grid Accent 4" w:uiPriority="62"/>
-    <w:lsdException w:name="Medium Shading 1 Accent 4" w:uiPriority="63"/>
-    <w:lsdException w:name="Medium Shading 2 Accent 4" w:uiPriority="64"/>
-    <w:lsdException w:name="Medium List 1 Accent 4" w:uiPriority="65"/>
-    <w:lsdException w:name="Medium List 2 Accent 4" w:uiPriority="66"/>
-    <w:lsdException w:name="Medium Grid 1 Accent 4" w:uiPriority="67"/>
-    <w:lsdException w:name="Medium Grid 2 Accent 4" w:uiPriority="68"/>
-    <w:lsdException w:name="Medium Grid 3 Accent 4" w:uiPriority="69"/>
-    <w:lsdException w:name="Dark List Accent 4" w:uiPriority="70"/>
-    <w:lsdException w:name="Colorful Shading Accent 4" w:uiPriority="71"/>
-    <w:lsdException w:name="Colorful List Accent 4" w:uiPriority="72"/>
-    <w:lsdException w:name="Colorful Grid Accent 4" w:uiPriority="73"/>
-    <w:lsdException w:name="Light Shading Accent 5" w:uiPriority="60"/>
-    <w:lsdException w:name="Light List Accent 5" w:uiPriority="61"/>
-    <w:lsdException w:name="Light Grid Accent 5" w:uiPriority="62"/>
-    <w:lsdException w:name="Medium Shading 1 Accent 5" w:uiPriority="63"/>
-    <w:lsdException w:name="Medium Shading 2 Accent 5" w:uiPriority="64"/>
-    <w:lsdException w:name="Medium List 1 Accent 5" w:uiPriority="65"/>
-    <w:lsdException w:name="Medium List 2 Accent 5" w:uiPriority="66"/>
-    <w:lsdException w:name="Medium Grid 1 Accent 5" w:uiPriority="67"/>
-    <w:lsdException w:name="Medium Grid 2 Accent 5" w:uiPriority="68"/>
-    <w:lsdException w:name="Medium Grid 3 Accent 5" w:uiPriority="69"/>
-    <w:lsdException w:name="Dark List Accent 5" w:uiPriority="70"/>
-    <w:lsdException w:name="Colorful Shading Accent 5" w:uiPriority="71"/>
-    <w:lsdException w:name="Colorful List Accent 5" w:uiPriority="72"/>
-    <w:lsdException w:name="Colorful Grid Accent 5" w:uiPriority="73"/>
-    <w:lsdException w:name="Light Shading Accent 6" w:uiPriority="60"/>
-    <w:lsdException w:name="Light List Accent 6" w:uiPriority="61"/>
-    <w:lsdException w:name="Light Grid Accent 6" w:uiPriority="62"/>
-    <w:lsdException w:name="Medium Shading 1 Accent 6" w:uiPriority="63"/>
-    <w:lsdException w:name="Medium Shading 2 Accent 6" w:uiPriority="64"/>
-    <w:lsdException w:name="Medium List 1 Accent 6" w:uiPriority="65"/>
-    <w:lsdException w:name="Medium List 2 Accent 6" w:uiPriority="66"/>
-    <w:lsdException w:name="Medium Grid 1 Accent 6" w:uiPriority="67"/>
-    <w:lsdException w:name="Medium Grid 2 Accent 6" w:uiPriority="68"/>
-    <w:lsdException w:name="Medium Grid 3 Accent 6" w:uiPriority="69"/>
-    <w:lsdException w:name="Dark List Accent 6" w:uiPriority="70"/>
-    <w:lsdException w:name="Colorful Shading Accent 6" w:uiPriority="71"/>
-    <w:lsdException w:name="Colorful List Accent 6" w:uiPriority="72"/>
-    <w:lsdException w:name="Colorful Grid Accent 6" w:uiPriority="73"/>
+    <w:lsdException w:name="Light Shading"/>
+    <w:lsdException w:name="Light List"/>
+    <w:lsdException w:name="Light Grid"/>
+    <w:lsdException w:name="Medium Shading 1"/>
+    <w:lsdException w:name="Medium Shading 2"/>
+    <w:lsdException w:name="Medium List 1"/>
+    <w:lsdException w:name="Medium List 2"/>
+    <w:lsdException w:name="Medium Grid 1"/>
+    <w:lsdException w:name="Medium Grid 2"/>
+    <w:lsdException w:name="Medium Grid 3"/>
+    <w:lsdException w:name="Dark List"/>
+    <w:lsdException w:name="Colorful Shading"/>
+    <w:lsdException w:name="Colorful List"/>
+    <w:lsdException w:name="Colorful Grid"/>
+    <w:lsdException w:name="Light Shading Accent 1"/>
+    <w:lsdException w:name="Light List Accent 1"/>
+    <w:lsdException w:name="Light Grid Accent 1"/>
+    <w:lsdException w:name="Medium Shading 1 Accent 1"/>
+    <w:lsdException w:name="Medium Shading 2 Accent 1"/>
+    <w:lsdException w:name="Medium List 1 Accent 1"/>
+    <w:lsdException w:name="Revision" w:semiHidden="1" w:unhideWhenUsed="1"/>
+    <w:lsdException w:name="List Paragraph" w:semiHidden="1" w:unhideWhenUsed="1"/>
+    <w:lsdException w:name="Quote" w:semiHidden="1" w:unhideWhenUsed="1"/>
+    <w:lsdException w:name="Intense Quote" w:semiHidden="1" w:unhideWhenUsed="1"/>
+    <w:lsdException w:name="Medium List 2 Accent 1"/>
+    <w:lsdException w:name="Medium Grid 1 Accent 1"/>
+    <w:lsdException w:name="Medium Grid 2 Accent 1"/>
+    <w:lsdException w:name="Medium Grid 3 Accent 1"/>
+    <w:lsdException w:name="Dark List Accent 1"/>
+    <w:lsdException w:name="Colorful Shading Accent 1"/>
+    <w:lsdException w:name="Colorful List Accent 1"/>
+    <w:lsdException w:name="Colorful Grid Accent 1"/>
+    <w:lsdException w:name="Light Shading Accent 2"/>
+    <w:lsdException w:name="Light List Accent 2"/>
+    <w:lsdException w:name="Light Grid Accent 2"/>
+    <w:lsdException w:name="Medium Shading 1 Accent 2"/>
+    <w:lsdException w:name="Medium Shading 2 Accent 2"/>
+    <w:lsdException w:name="Medium List 1 Accent 2"/>
+    <w:lsdException w:name="Medium List 2 Accent 2"/>
+    <w:lsdException w:name="Medium Grid 1 Accent 2"/>
+    <w:lsdException w:name="Medium Grid 2 Accent 2"/>
+    <w:lsdException w:name="Medium Grid 3 Accent 2"/>
+    <w:lsdException w:name="Dark List Accent 2"/>
+    <w:lsdException w:name="Colorful Shading Accent 2"/>
+    <w:lsdException w:name="Colorful List Accent 2"/>
+    <w:lsdException w:name="Colorful Grid Accent 2"/>
+    <w:lsdException w:name="Light Shading Accent 3"/>
+    <w:lsdException w:name="Light List Accent 3"/>
+    <w:lsdException w:name="Light Grid Accent 3"/>
+    <w:lsdException w:name="Medium Shading 1 Accent 3"/>
+    <w:lsdException w:name="Medium Shading 2 Accent 3"/>
+    <w:lsdException w:name="Medium List 1 Accent 3"/>
+    <w:lsdException w:name="Medium List 2 Accent 3"/>
+    <w:lsdException w:name="Medium Grid 1 Accent 3"/>
+    <w:lsdException w:name="Medium Grid 2 Accent 3"/>
+    <w:lsdException w:name="Medium Grid 3 Accent 3"/>
+    <w:lsdException w:name="Dark List Accent 3"/>
+    <w:lsdException w:name="Colorful Shading Accent 3"/>
+    <w:lsdException w:name="Colorful List Accent 3"/>
+    <w:lsdException w:name="Colorful Grid Accent 3"/>
+    <w:lsdException w:name="Light Shading Accent 4"/>
+    <w:lsdException w:name="Light List Accent 4"/>
+    <w:lsdException w:name="Light Grid Accent 4"/>
+    <w:lsdException w:name="Medium Shading 1 Accent 4"/>
+    <w:lsdException w:name="Medium Shading 2 Accent 4"/>
+    <w:lsdException w:name="Medium List 1 Accent 4"/>
+    <w:lsdException w:name="Medium List 2 Accent 4"/>
+    <w:lsdException w:name="Medium Grid 1 Accent 4"/>
+    <w:lsdException w:name="Medium Grid 2 Accent 4"/>
+    <w:lsdException w:name="Medium Grid 3 Accent 4"/>
+    <w:lsdException w:name="Dark List Accent 4"/>
+    <w:lsdException w:name="Colorful Shading Accent 4"/>
+    <w:lsdException w:name="Colorful List Accent 4"/>
+    <w:lsdException w:name="Colorful Grid Accent 4"/>
+    <w:lsdException w:name="Light Shading Accent 5"/>
+    <w:lsdException w:name="Light List Accent 5"/>
+    <w:lsdException w:name="Light Grid Accent 5"/>
+    <w:lsdException w:name="Medium Shading 1 Accent 5"/>
+    <w:lsdException w:name="Medium Shading 2 Accent 5"/>
+    <w:lsdException w:name="Medium List 1 Accent 5"/>
+    <w:lsdException w:name="Medium List 2 Accent 5"/>
+    <w:lsdException w:name="Medium Grid 1 Accent 5"/>
+    <w:lsdException w:name="Medium Grid 2 Accent 5"/>
+    <w:lsdException w:name="Medium Grid 3 Accent 5"/>
+    <w:lsdException w:name="Dark List Accent 5"/>
+    <w:lsdException w:name="Colorful Shading Accent 5"/>
+    <w:lsdException w:name="Colorful List Accent 5"/>
+    <w:lsdException w:name="Colorful Grid Accent 5"/>
+    <w:lsdException w:name="Light Shading Accent 6"/>
+    <w:lsdException w:name="Light List Accent 6"/>
+    <w:lsdException w:name="Light Grid Accent 6"/>
+    <w:lsdException w:name="Medium Shading 1 Accent 6"/>
+    <w:lsdException w:name="Medium Shading 2 Accent 6"/>
+    <w:lsdException w:name="Medium List 1 Accent 6"/>
+    <w:lsdException w:name="Medium List 2 Accent 6"/>
+    <w:lsdException w:name="Medium Grid 1 Accent 6"/>
+    <w:lsdException w:name="Medium Grid 2 Accent 6"/>
+    <w:lsdException w:name="Medium Grid 3 Accent 6"/>
+    <w:lsdException w:name="Dark List Accent 6"/>
+    <w:lsdException w:name="Colorful Shading Accent 6"/>
+    <w:lsdException w:name="Colorful List Accent 6"/>
+    <w:lsdException w:name="Colorful Grid Accent 6"/>
     <w:lsdException w:name="Subtle Emphasis" w:uiPriority="19" w:qFormat="1"/>
     <w:lsdException w:name="Intense Emphasis" w:uiPriority="21" w:qFormat="1"/>
     <w:lsdException w:name="Subtle Reference" w:uiPriority="31" w:qFormat="1"/>
@@ -1430,13 +1786,23 @@
     <w:lsdException w:name="List Table 5 Dark Accent 6" w:uiPriority="50"/>
     <w:lsdException w:name="List Table 6 Colorful Accent 6" w:uiPriority="51"/>
     <w:lsdException w:name="List Table 7 Colorful Accent 6" w:uiPriority="52"/>
+    <w:lsdException w:name="Mention" w:semiHidden="1" w:unhideWhenUsed="1"/>
+    <w:lsdException w:name="Smart Hyperlink" w:semiHidden="1" w:unhideWhenUsed="1"/>
+    <w:lsdException w:name="Hashtag" w:semiHidden="1" w:unhideWhenUsed="1"/>
+    <w:lsdException w:name="Unresolved Mention" w:semiHidden="1" w:unhideWhenUsed="1"/>
+    <w:lsdException w:name="Smart Link" w:semiHidden="1" w:unhideWhenUsed="1"/>
   </w:latentStyles>
   <w:style w:type="paragraph" w:default="1" w:styleId="Normal">
     <w:name w:val="Normal"/>
     <w:qFormat/>
-    <w:rsid w:val="00D75182"/>
+    <w:pPr>
+      <w:spacing w:after="160" w:line="259" w:lineRule="auto"/>
+    </w:pPr>
     <w:rPr>
       <w:rFonts w:eastAsia="MS Mincho"/>
+      <w:sz w:val="22"/>
+      <w:szCs w:val="22"/>
+      <w:lang w:val="es-GT" w:eastAsia="en-US"/>
     </w:rPr>
   </w:style>
   <w:style w:type="character" w:default="1" w:styleId="Fuentedeprrafopredeter">
@@ -1466,54 +1832,25 @@
     <w:semiHidden/>
     <w:unhideWhenUsed/>
   </w:style>
-  <w:style w:type="paragraph" w:styleId="Sinespaciado">
-    <w:name w:val="No Spacing"/>
-    <w:uiPriority w:val="1"/>
-    <w:qFormat/>
-    <w:rsid w:val="007B480D"/>
-    <w:pPr>
-      <w:spacing w:after="0" w:line="240" w:lineRule="auto"/>
-    </w:pPr>
-  </w:style>
   <w:style w:type="character" w:styleId="Refdecomentario">
     <w:name w:val="annotation reference"/>
     <w:basedOn w:val="Fuentedeprrafopredeter"/>
     <w:uiPriority w:val="99"/>
     <w:semiHidden/>
     <w:unhideWhenUsed/>
-    <w:rsid w:val="00EB52AC"/>
     <w:rPr>
       <w:sz w:val="16"/>
       <w:szCs w:val="16"/>
     </w:rPr>
   </w:style>
-  <w:style w:type="paragraph" w:styleId="Textocomentario">
-    <w:name w:val="annotation text"/>
-    <w:basedOn w:val="Normal"/>
-    <w:link w:val="TextocomentarioCar"/>
-    <w:uiPriority w:val="99"/>
-    <w:semiHidden/>
-    <w:unhideWhenUsed/>
-    <w:rsid w:val="00EB52AC"/>
-    <w:pPr>
-      <w:spacing w:line="240" w:lineRule="auto"/>
-    </w:pPr>
+  <w:style w:type="character" w:styleId="Textoennegrita">
+    <w:name w:val="Strong"/>
+    <w:basedOn w:val="Fuentedeprrafopredeter"/>
+    <w:uiPriority w:val="22"/>
+    <w:qFormat/>
     <w:rPr>
-      <w:sz w:val="20"/>
-      <w:szCs w:val="20"/>
-    </w:rPr>
-  </w:style>
-  <w:style w:type="character" w:customStyle="1" w:styleId="TextocomentarioCar">
-    <w:name w:val="Texto comentario Car"/>
-    <w:basedOn w:val="Fuentedeprrafopredeter"/>
-    <w:link w:val="Textocomentario"/>
-    <w:uiPriority w:val="99"/>
-    <w:semiHidden/>
-    <w:rsid w:val="00EB52AC"/>
-    <w:rPr>
-      <w:rFonts w:eastAsia="MS Mincho"/>
-      <w:sz w:val="20"/>
-      <w:szCs w:val="20"/>
+      <w:b/>
+      <w:bCs/>
     </w:rPr>
   </w:style>
   <w:style w:type="paragraph" w:styleId="Asuntodelcomentario">
@@ -1524,23 +1861,24 @@
     <w:uiPriority w:val="99"/>
     <w:semiHidden/>
     <w:unhideWhenUsed/>
-    <w:rsid w:val="00EB52AC"/>
+    <w:qFormat/>
     <w:rPr>
       <w:b/>
       <w:bCs/>
     </w:rPr>
   </w:style>
-  <w:style w:type="character" w:customStyle="1" w:styleId="AsuntodelcomentarioCar">
-    <w:name w:val="Asunto del comentario Car"/>
-    <w:basedOn w:val="TextocomentarioCar"/>
-    <w:link w:val="Asuntodelcomentario"/>
+  <w:style w:type="paragraph" w:styleId="Textocomentario">
+    <w:name w:val="annotation text"/>
+    <w:basedOn w:val="Normal"/>
+    <w:link w:val="TextocomentarioCar"/>
     <w:uiPriority w:val="99"/>
     <w:semiHidden/>
-    <w:rsid w:val="00EB52AC"/>
+    <w:unhideWhenUsed/>
+    <w:qFormat/>
+    <w:pPr>
+      <w:spacing w:line="240" w:lineRule="auto"/>
+    </w:pPr>
     <w:rPr>
-      <w:rFonts w:eastAsia="MS Mincho"/>
-      <w:b/>
-      <w:bCs/>
       <w:sz w:val="20"/>
       <w:szCs w:val="20"/>
     </w:rPr>
@@ -1552,7 +1890,7 @@
     <w:uiPriority w:val="99"/>
     <w:semiHidden/>
     <w:unhideWhenUsed/>
-    <w:rsid w:val="0005271C"/>
+    <w:qFormat/>
     <w:pPr>
       <w:spacing w:after="0" w:line="240" w:lineRule="auto"/>
     </w:pPr>
@@ -1562,32 +1900,28 @@
       <w:szCs w:val="18"/>
     </w:rPr>
   </w:style>
-  <w:style w:type="character" w:customStyle="1" w:styleId="TextodegloboCar">
-    <w:name w:val="Texto de globo Car"/>
-    <w:basedOn w:val="Fuentedeprrafopredeter"/>
-    <w:link w:val="Textodeglobo"/>
+  <w:style w:type="paragraph" w:styleId="NormalWeb">
+    <w:name w:val="Normal (Web)"/>
+    <w:basedOn w:val="Normal"/>
     <w:uiPriority w:val="99"/>
     <w:semiHidden/>
-    <w:rsid w:val="0005271C"/>
+    <w:unhideWhenUsed/>
+    <w:qFormat/>
+    <w:pPr>
+      <w:spacing w:before="100" w:beforeAutospacing="1" w:after="100" w:afterAutospacing="1" w:line="240" w:lineRule="auto"/>
+    </w:pPr>
     <w:rPr>
-      <w:rFonts w:ascii="Segoe UI" w:eastAsia="MS Mincho" w:hAnsi="Segoe UI" w:cs="Segoe UI"/>
-      <w:sz w:val="18"/>
-      <w:szCs w:val="18"/>
+      <w:rFonts w:ascii="Times New Roman" w:eastAsia="Times New Roman" w:hAnsi="Times New Roman" w:cs="Times New Roman"/>
+      <w:sz w:val="24"/>
+      <w:szCs w:val="24"/>
+      <w:lang w:eastAsia="es-GT"/>
     </w:rPr>
-  </w:style>
-  <w:style w:type="character" w:customStyle="1" w:styleId="oypena">
-    <w:name w:val="oypena"/>
-    <w:basedOn w:val="Fuentedeprrafopredeter"/>
-    <w:rsid w:val="003F5629"/>
   </w:style>
   <w:style w:type="table" w:styleId="Tablaconcuadrcula">
     <w:name w:val="Table Grid"/>
     <w:basedOn w:val="Tablanormal"/>
     <w:uiPriority w:val="39"/>
-    <w:rsid w:val="00C251FB"/>
-    <w:pPr>
-      <w:spacing w:after="0" w:line="240" w:lineRule="auto"/>
-    </w:pPr>
+    <w:qFormat/>
     <w:tblPr>
       <w:tblBorders>
         <w:top w:val="single" w:sz="4" w:space="0" w:color="auto"/>
@@ -1599,10 +1933,66 @@
       </w:tblBorders>
     </w:tblPr>
   </w:style>
+  <w:style w:type="paragraph" w:styleId="Sinespaciado">
+    <w:name w:val="No Spacing"/>
+    <w:uiPriority w:val="1"/>
+    <w:qFormat/>
+    <w:rPr>
+      <w:sz w:val="22"/>
+      <w:szCs w:val="22"/>
+      <w:lang w:val="es-GT" w:eastAsia="en-US"/>
+    </w:rPr>
+  </w:style>
+  <w:style w:type="character" w:customStyle="1" w:styleId="TextocomentarioCar">
+    <w:name w:val="Texto comentario Car"/>
+    <w:basedOn w:val="Fuentedeprrafopredeter"/>
+    <w:link w:val="Textocomentario"/>
+    <w:uiPriority w:val="99"/>
+    <w:semiHidden/>
+    <w:qFormat/>
+    <w:rPr>
+      <w:rFonts w:eastAsia="MS Mincho"/>
+      <w:sz w:val="20"/>
+      <w:szCs w:val="20"/>
+    </w:rPr>
+  </w:style>
+  <w:style w:type="character" w:customStyle="1" w:styleId="AsuntodelcomentarioCar">
+    <w:name w:val="Asunto del comentario Car"/>
+    <w:basedOn w:val="TextocomentarioCar"/>
+    <w:link w:val="Asuntodelcomentario"/>
+    <w:uiPriority w:val="99"/>
+    <w:semiHidden/>
+    <w:qFormat/>
+    <w:rPr>
+      <w:rFonts w:eastAsia="MS Mincho"/>
+      <w:b/>
+      <w:bCs/>
+      <w:sz w:val="20"/>
+      <w:szCs w:val="20"/>
+    </w:rPr>
+  </w:style>
+  <w:style w:type="character" w:customStyle="1" w:styleId="TextodegloboCar">
+    <w:name w:val="Texto de globo Car"/>
+    <w:basedOn w:val="Fuentedeprrafopredeter"/>
+    <w:link w:val="Textodeglobo"/>
+    <w:uiPriority w:val="99"/>
+    <w:semiHidden/>
+    <w:qFormat/>
+    <w:rPr>
+      <w:rFonts w:ascii="Segoe UI" w:eastAsia="MS Mincho" w:hAnsi="Segoe UI" w:cs="Segoe UI"/>
+      <w:sz w:val="18"/>
+      <w:szCs w:val="18"/>
+    </w:rPr>
+  </w:style>
+  <w:style w:type="character" w:customStyle="1" w:styleId="oypena">
+    <w:name w:val="oypena"/>
+    <w:basedOn w:val="Fuentedeprrafopredeter"/>
+    <w:qFormat/>
+  </w:style>
   <w:style w:type="paragraph" w:customStyle="1" w:styleId="paragraph">
     <w:name w:val="paragraph"/>
     <w:basedOn w:val="Normal"/>
-    <w:rsid w:val="006E1988"/>
+    <w:qFormat/>
     <w:pPr>
       <w:spacing w:before="100" w:beforeAutospacing="1" w:after="100" w:afterAutospacing="1" w:line="240" w:lineRule="auto"/>
     </w:pPr>
@@ -1616,49 +2006,21 @@
   <w:style w:type="character" w:customStyle="1" w:styleId="normaltextrun">
     <w:name w:val="normaltextrun"/>
     <w:basedOn w:val="Fuentedeprrafopredeter"/>
-    <w:rsid w:val="006E1988"/>
+    <w:qFormat/>
   </w:style>
   <w:style w:type="character" w:customStyle="1" w:styleId="eop">
     <w:name w:val="eop"/>
     <w:basedOn w:val="Fuentedeprrafopredeter"/>
-    <w:rsid w:val="006E1988"/>
-  </w:style>
-  <w:style w:type="paragraph" w:styleId="NormalWeb">
-    <w:name w:val="Normal (Web)"/>
-    <w:basedOn w:val="Normal"/>
-    <w:uiPriority w:val="99"/>
-    <w:semiHidden/>
-    <w:unhideWhenUsed/>
-    <w:rsid w:val="00B952EC"/>
-    <w:pPr>
-      <w:spacing w:before="100" w:beforeAutospacing="1" w:after="100" w:afterAutospacing="1" w:line="240" w:lineRule="auto"/>
-    </w:pPr>
-    <w:rPr>
-      <w:rFonts w:ascii="Times New Roman" w:eastAsia="Times New Roman" w:hAnsi="Times New Roman" w:cs="Times New Roman"/>
-      <w:sz w:val="24"/>
-      <w:szCs w:val="24"/>
-      <w:lang w:eastAsia="es-GT"/>
-    </w:rPr>
+    <w:qFormat/>
   </w:style>
   <w:style w:type="character" w:customStyle="1" w:styleId="cf01">
     <w:name w:val="cf01"/>
     <w:basedOn w:val="Fuentedeprrafopredeter"/>
-    <w:rsid w:val="00B952EC"/>
+    <w:qFormat/>
     <w:rPr>
       <w:rFonts w:ascii="Consolas" w:hAnsi="Consolas" w:hint="default"/>
       <w:sz w:val="22"/>
       <w:szCs w:val="22"/>
-    </w:rPr>
-  </w:style>
-  <w:style w:type="character" w:styleId="Textoennegrita">
-    <w:name w:val="Strong"/>
-    <w:basedOn w:val="Fuentedeprrafopredeter"/>
-    <w:uiPriority w:val="22"/>
-    <w:qFormat/>
-    <w:rsid w:val="0078207B"/>
-    <w:rPr>
-      <w:b/>
-      <w:bCs/>
     </w:rPr>
   </w:style>
 </w:styles>
@@ -1707,7 +2069,7 @@
     </a:clrScheme>
     <a:fontScheme name="Office">
       <a:majorFont>
-        <a:latin typeface="Calibri Light" panose="020F0302020204030204"/>
+        <a:latin typeface="Calibri Light"/>
         <a:ea typeface=""/>
         <a:cs typeface=""/>
         <a:font script="Jpan" typeface="游ゴシック Light"/>
@@ -1740,26 +2102,9 @@
         <a:font script="Viet" typeface="Times New Roman"/>
         <a:font script="Uigh" typeface="Microsoft Uighur"/>
         <a:font script="Geor" typeface="Sylfaen"/>
-        <a:font script="Armn" typeface="Arial"/>
-        <a:font script="Bugi" typeface="Leelawadee UI"/>
-        <a:font script="Bopo" typeface="Microsoft JhengHei"/>
-        <a:font script="Java" typeface="Javanese Text"/>
-        <a:font script="Lisu" typeface="Segoe UI"/>
-        <a:font script="Mymr" typeface="Myanmar Text"/>
-        <a:font script="Nkoo" typeface="Ebrima"/>
-        <a:font script="Olck" typeface="Nirmala UI"/>
-        <a:font script="Osma" typeface="Ebrima"/>
-        <a:font script="Phag" typeface="Phagspa"/>
-        <a:font script="Syrn" typeface="Estrangelo Edessa"/>
-        <a:font script="Syrj" typeface="Estrangelo Edessa"/>
-        <a:font script="Syre" typeface="Estrangelo Edessa"/>
-        <a:font script="Sora" typeface="Nirmala UI"/>
-        <a:font script="Tale" typeface="Microsoft Tai Le"/>
-        <a:font script="Talu" typeface="Microsoft New Tai Lue"/>
-        <a:font script="Tfng" typeface="Ebrima"/>
       </a:majorFont>
       <a:minorFont>
-        <a:latin typeface="Calibri" panose="020F0502020204030204"/>
+        <a:latin typeface="Calibri"/>
         <a:ea typeface=""/>
         <a:cs typeface=""/>
         <a:font script="Jpan" typeface="游明朝"/>
@@ -1792,23 +2137,6 @@
         <a:font script="Viet" typeface="Arial"/>
         <a:font script="Uigh" typeface="Microsoft Uighur"/>
         <a:font script="Geor" typeface="Sylfaen"/>
-        <a:font script="Armn" typeface="Arial"/>
-        <a:font script="Bugi" typeface="Leelawadee UI"/>
-        <a:font script="Bopo" typeface="Microsoft JhengHei"/>
-        <a:font script="Java" typeface="Javanese Text"/>
-        <a:font script="Lisu" typeface="Segoe UI"/>
-        <a:font script="Mymr" typeface="Myanmar Text"/>
-        <a:font script="Nkoo" typeface="Ebrima"/>
-        <a:font script="Olck" typeface="Nirmala UI"/>
-        <a:font script="Osma" typeface="Ebrima"/>
-        <a:font script="Phag" typeface="Phagspa"/>
-        <a:font script="Syrn" typeface="Estrangelo Edessa"/>
-        <a:font script="Syrj" typeface="Estrangelo Edessa"/>
-        <a:font script="Syre" typeface="Estrangelo Edessa"/>
-        <a:font script="Sora" typeface="Nirmala UI"/>
-        <a:font script="Tale" typeface="Microsoft Tai Le"/>
-        <a:font script="Talu" typeface="Microsoft New Tai Lue"/>
-        <a:font script="Tfng" typeface="Ebrima"/>
       </a:minorFont>
     </a:fontScheme>
     <a:fmtScheme name="Office">
@@ -1951,10 +2279,5 @@
   </a:themeElements>
   <a:objectDefaults/>
   <a:extraClrSchemeLst/>
-  <a:extLst>
-    <a:ext uri="{05A4C25C-085E-4340-85A3-A5531E510DB2}">
-      <thm15:themeFamily xmlns:thm15="http://schemas.microsoft.com/office/thememl/2012/main" name="Office Theme" id="{62F939B6-93AF-4DB8-9C6B-D6C7DFDC589F}" vid="{4A3C46E8-61CC-4603-A589-7422A47A8E4A}"/>
-    </a:ext>
-  </a:extLst>
 </a:theme>
 </file>
</xml_diff>

<commit_message>
add: Se agrego historia de usuario HUKC-001 dentro del documento Peaceathome.docx en la rama kcuyuch-2024177
</commit_message>
<xml_diff>
--- a/Peaceathome.docx
+++ b/Peaceathome.docx
@@ -19,8 +19,8 @@
           <w:lang w:eastAsia="es-GT"/>
         </w:rPr>
         <w:drawing>
-          <wp:inline distT="0" distB="0" distL="0" distR="0" wp14:anchorId="61DA3BD1" wp14:editId="0C35A376">
-            <wp:extent cx="2249144" cy="847725"/>
+          <wp:inline distT="0" distB="0" distL="0" distR="0" wp14:anchorId="2FEE8166" wp14:editId="6BE70031">
+            <wp:extent cx="2248535" cy="847725"/>
             <wp:effectExtent l="0" t="0" r="0" b="0"/>
             <wp:docPr id="2" name="Imagen 2"/>
             <wp:cNvGraphicFramePr>
@@ -30,13 +30,13 @@
               <a:graphicData uri="http://schemas.openxmlformats.org/drawingml/2006/picture">
                 <pic:pic xmlns:pic="http://schemas.openxmlformats.org/drawingml/2006/picture">
                   <pic:nvPicPr>
-                    <pic:cNvPr id="0" name="Picture 1"/>
+                    <pic:cNvPr id="2" name="Imagen 2"/>
                     <pic:cNvPicPr>
                       <a:picLocks noChangeAspect="1" noChangeArrowheads="1"/>
                     </pic:cNvPicPr>
                   </pic:nvPicPr>
                   <pic:blipFill>
-                    <a:blip r:embed="rId4" cstate="print">
+                    <a:blip r:embed="rId6" cstate="print">
                       <a:extLst>
                         <a:ext uri="{28A0092B-C50C-407E-A947-70E740481C1C}">
                           <a14:useLocalDpi xmlns:a14="http://schemas.microsoft.com/office/drawing/2010/main" val="0"/>
@@ -48,7 +48,7 @@
                       <a:fillRect/>
                     </a:stretch>
                   </pic:blipFill>
-                  <pic:spPr bwMode="auto">
+                  <pic:spPr>
                     <a:xfrm>
                       <a:off x="0" y="0"/>
                       <a:ext cx="2253277" cy="849283"/>
@@ -120,13 +120,7 @@
         <w:rPr>
           <w:rFonts w:ascii="Arial" w:hAnsi="Arial" w:cs="Arial"/>
         </w:rPr>
-        <w:t>5TO. PERITO EN INFORMATICA</w:t>
-      </w:r>
-      <w:r>
-        <w:rPr>
-          <w:rFonts w:ascii="Arial" w:hAnsi="Arial" w:cs="Arial"/>
-        </w:rPr>
-        <w:t xml:space="preserve"> </w:t>
+        <w:t xml:space="preserve">5TO. PERITO EN INFORMATICA </w:t>
       </w:r>
     </w:p>
     <w:p>
@@ -507,56 +501,7 @@
           <w:rFonts w:ascii="Arial" w:hAnsi="Arial" w:cs="Arial"/>
           <w:sz w:val="24"/>
         </w:rPr>
-        <w:t xml:space="preserve">Guatemala, </w:t>
-      </w:r>
-      <w:r>
-        <w:rPr>
-          <w:rFonts w:ascii="Arial" w:hAnsi="Arial" w:cs="Arial"/>
-          <w:sz w:val="24"/>
-        </w:rPr>
-        <w:t xml:space="preserve">15 </w:t>
-      </w:r>
-      <w:r>
-        <w:rPr>
-          <w:rFonts w:ascii="Arial" w:hAnsi="Arial" w:cs="Arial"/>
-          <w:sz w:val="24"/>
-        </w:rPr>
-        <w:t xml:space="preserve">de </w:t>
-      </w:r>
-      <w:r>
-        <w:rPr>
-          <w:rFonts w:ascii="Arial" w:hAnsi="Arial" w:cs="Arial"/>
-          <w:sz w:val="24"/>
-        </w:rPr>
-        <w:t xml:space="preserve">Julio </w:t>
-      </w:r>
-      <w:r>
-        <w:rPr>
-          <w:rFonts w:ascii="Arial" w:hAnsi="Arial" w:cs="Arial"/>
-          <w:sz w:val="24"/>
-        </w:rPr>
-        <w:t>de 20</w:t>
-      </w:r>
-      <w:r>
-        <w:rPr>
-          <w:rFonts w:ascii="Arial" w:hAnsi="Arial" w:cs="Arial"/>
-          <w:sz w:val="24"/>
-        </w:rPr>
-        <w:t>2</w:t>
-      </w:r>
-      <w:r>
-        <w:rPr>
-          <w:rFonts w:ascii="Arial" w:hAnsi="Arial" w:cs="Arial"/>
-          <w:sz w:val="24"/>
-        </w:rPr>
-        <w:t>5</w:t>
-      </w:r>
-      <w:r>
-        <w:rPr>
-          <w:rFonts w:ascii="Arial" w:hAnsi="Arial" w:cs="Arial"/>
-          <w:sz w:val="24"/>
-        </w:rPr>
-        <w:t>.</w:t>
+        <w:t>Guatemala, 15 de Julio de 2025.</w:t>
       </w:r>
     </w:p>
     <w:p>
@@ -573,9 +518,93 @@
         </w:sectPr>
       </w:pPr>
     </w:p>
+    <w:p>
+      <w:pPr>
+        <w:rPr>
+          <w:rFonts w:ascii="Arial" w:eastAsiaTheme="minorHAnsi" w:hAnsi="Arial" w:cs="Arial"/>
+          <w:sz w:val="24"/>
+        </w:rPr>
+      </w:pPr>
+    </w:p>
+    <w:p>
+      <w:pPr>
+        <w:rPr>
+          <w:rFonts w:ascii="Arial" w:eastAsiaTheme="minorHAnsi" w:hAnsi="Arial" w:cs="Arial"/>
+          <w:bCs/>
+        </w:rPr>
+      </w:pPr>
+      <w:r>
+        <w:rPr>
+          <w:rFonts w:ascii="Arial" w:eastAsiaTheme="minorHAnsi" w:hAnsi="Arial" w:cs="Arial"/>
+          <w:bCs/>
+        </w:rPr>
+        <w:t xml:space="preserve">    </w:t>
+      </w:r>
+    </w:p>
+    <w:p>
+      <w:pPr>
+        <w:jc w:val="center"/>
+        <w:rPr>
+          <w:rFonts w:ascii="Arial" w:eastAsiaTheme="minorHAnsi" w:hAnsi="Arial" w:cs="Arial"/>
+          <w:b/>
+          <w:bCs/>
+          <w:sz w:val="44"/>
+        </w:rPr>
+      </w:pPr>
+      <w:r>
+        <w:rPr>
+          <w:rFonts w:ascii="Arial" w:eastAsiaTheme="minorHAnsi" w:hAnsi="Arial" w:cs="Arial"/>
+          <w:b/>
+          <w:bCs/>
+          <w:sz w:val="44"/>
+        </w:rPr>
+        <w:t>Tabla de Integrantes</w:t>
+      </w:r>
+    </w:p>
+    <w:p>
+      <w:pPr>
+        <w:rPr>
+          <w:rFonts w:ascii="Arial" w:eastAsiaTheme="minorHAnsi" w:hAnsi="Arial" w:cs="Arial"/>
+          <w:bCs/>
+        </w:rPr>
+      </w:pPr>
+    </w:p>
+    <w:p>
+      <w:pPr>
+        <w:rPr>
+          <w:rFonts w:ascii="Arial" w:eastAsiaTheme="minorHAnsi" w:hAnsi="Arial" w:cs="Arial"/>
+          <w:bCs/>
+        </w:rPr>
+      </w:pPr>
+    </w:p>
+    <w:p>
+      <w:pPr>
+        <w:rPr>
+          <w:rFonts w:ascii="Arial" w:eastAsiaTheme="minorHAnsi" w:hAnsi="Arial" w:cs="Arial"/>
+          <w:bCs/>
+        </w:rPr>
+      </w:pPr>
+    </w:p>
+    <w:p>
+      <w:pPr>
+        <w:rPr>
+          <w:rFonts w:ascii="Arial" w:eastAsiaTheme="minorHAnsi" w:hAnsi="Arial" w:cs="Arial"/>
+          <w:bCs/>
+        </w:rPr>
+      </w:pPr>
+    </w:p>
+    <w:p>
+      <w:pPr>
+        <w:rPr>
+          <w:rFonts w:ascii="Arial" w:eastAsiaTheme="minorHAnsi" w:hAnsi="Arial" w:cs="Arial"/>
+          <w:bCs/>
+        </w:rPr>
+      </w:pPr>
+    </w:p>
     <w:tbl>
       <w:tblPr>
         <w:tblStyle w:val="Tablaconcuadrcula"/>
+        <w:tblpPr w:leftFromText="141" w:rightFromText="141" w:vertAnchor="page" w:horzAnchor="margin" w:tblpY="4527"/>
         <w:tblW w:w="0" w:type="auto"/>
         <w:tblLook w:val="04A0" w:firstRow="1" w:lastRow="0" w:firstColumn="1" w:lastColumn="0" w:noHBand="0" w:noVBand="1"/>
       </w:tblPr>
@@ -590,6 +619,7 @@
           </w:tcPr>
           <w:p>
             <w:pPr>
+              <w:spacing w:after="0" w:line="240" w:lineRule="auto"/>
               <w:jc w:val="center"/>
               <w:rPr>
                 <w:rFonts w:ascii="Arial" w:eastAsiaTheme="minorHAnsi" w:hAnsi="Arial" w:cs="Arial"/>
@@ -604,7 +634,6 @@
                 <w:b/>
                 <w:sz w:val="24"/>
               </w:rPr>
-              <w:lastRenderedPageBreak/>
               <w:t xml:space="preserve">Nombre </w:t>
             </w:r>
             <w:r>
@@ -624,6 +653,7 @@
           </w:tcPr>
           <w:p>
             <w:pPr>
+              <w:spacing w:after="0" w:line="240" w:lineRule="auto"/>
               <w:jc w:val="center"/>
               <w:rPr>
                 <w:rFonts w:ascii="Arial" w:eastAsiaTheme="minorHAnsi" w:hAnsi="Arial" w:cs="Arial"/>
@@ -649,6 +679,7 @@
           </w:tcPr>
           <w:p>
             <w:pPr>
+              <w:spacing w:after="0" w:line="240" w:lineRule="auto"/>
               <w:jc w:val="center"/>
               <w:rPr>
                 <w:rFonts w:ascii="Arial" w:eastAsiaTheme="minorHAnsi" w:hAnsi="Arial" w:cs="Arial"/>
@@ -672,6 +703,7 @@
           </w:tcPr>
           <w:p>
             <w:pPr>
+              <w:spacing w:after="0" w:line="240" w:lineRule="auto"/>
               <w:jc w:val="center"/>
               <w:rPr>
                 <w:rFonts w:ascii="Arial" w:eastAsiaTheme="minorHAnsi" w:hAnsi="Arial" w:cs="Arial"/>
@@ -695,12 +727,20 @@
           </w:tcPr>
           <w:p>
             <w:pPr>
+              <w:spacing w:after="0" w:line="240" w:lineRule="auto"/>
               <w:jc w:val="center"/>
               <w:rPr>
                 <w:rFonts w:ascii="Arial" w:eastAsiaTheme="minorHAnsi" w:hAnsi="Arial" w:cs="Arial"/>
                 <w:sz w:val="24"/>
               </w:rPr>
             </w:pPr>
+            <w:r>
+              <w:rPr>
+                <w:rFonts w:ascii="Arial" w:eastAsiaTheme="minorHAnsi" w:hAnsi="Arial" w:cs="Arial"/>
+                <w:sz w:val="24"/>
+              </w:rPr>
+              <w:t>Angel Gahel Padilla Pacheco</w:t>
+            </w:r>
           </w:p>
         </w:tc>
         <w:tc>
@@ -709,44 +749,21 @@
           </w:tcPr>
           <w:p>
             <w:pPr>
+              <w:spacing w:after="0" w:line="240" w:lineRule="auto"/>
               <w:jc w:val="center"/>
               <w:rPr>
                 <w:rFonts w:ascii="Arial" w:eastAsiaTheme="minorHAnsi" w:hAnsi="Arial" w:cs="Arial"/>
                 <w:sz w:val="24"/>
+                <w:u w:val="single"/>
               </w:rPr>
             </w:pPr>
-          </w:p>
-        </w:tc>
-        <w:bookmarkStart w:id="0" w:name="_GoBack"/>
-        <w:bookmarkEnd w:id="0"/>
-      </w:tr>
-      <w:tr>
-        <w:tc>
-          <w:tcPr>
-            <w:tcW w:w="5395" w:type="dxa"/>
-          </w:tcPr>
-          <w:p>
-            <w:pPr>
-              <w:jc w:val="center"/>
+            <w:r>
               <w:rPr>
                 <w:rFonts w:ascii="Arial" w:eastAsiaTheme="minorHAnsi" w:hAnsi="Arial" w:cs="Arial"/>
                 <w:sz w:val="24"/>
               </w:rPr>
-            </w:pPr>
-          </w:p>
-        </w:tc>
-        <w:tc>
-          <w:tcPr>
-            <w:tcW w:w="5395" w:type="dxa"/>
-          </w:tcPr>
-          <w:p>
-            <w:pPr>
-              <w:jc w:val="center"/>
-              <w:rPr>
-                <w:rFonts w:ascii="Arial" w:eastAsiaTheme="minorHAnsi" w:hAnsi="Arial" w:cs="Arial"/>
-                <w:sz w:val="24"/>
-              </w:rPr>
-            </w:pPr>
+              <w:t>Programador</w:t>
+            </w:r>
           </w:p>
         </w:tc>
       </w:tr>
@@ -757,12 +774,20 @@
           </w:tcPr>
           <w:p>
             <w:pPr>
+              <w:spacing w:after="0" w:line="240" w:lineRule="auto"/>
               <w:jc w:val="center"/>
               <w:rPr>
                 <w:rFonts w:ascii="Arial" w:eastAsiaTheme="minorHAnsi" w:hAnsi="Arial" w:cs="Arial"/>
                 <w:sz w:val="24"/>
               </w:rPr>
             </w:pPr>
+            <w:r>
+              <w:rPr>
+                <w:rFonts w:ascii="Arial" w:eastAsiaTheme="minorHAnsi" w:hAnsi="Arial" w:cs="Arial"/>
+                <w:sz w:val="24"/>
+              </w:rPr>
+              <w:t>Jose Enrique cuc cutz</w:t>
+            </w:r>
           </w:p>
         </w:tc>
         <w:tc>
@@ -771,12 +796,20 @@
           </w:tcPr>
           <w:p>
             <w:pPr>
+              <w:spacing w:after="0" w:line="240" w:lineRule="auto"/>
               <w:jc w:val="center"/>
               <w:rPr>
                 <w:rFonts w:ascii="Arial" w:eastAsiaTheme="minorHAnsi" w:hAnsi="Arial" w:cs="Arial"/>
                 <w:sz w:val="24"/>
               </w:rPr>
             </w:pPr>
+            <w:r>
+              <w:rPr>
+                <w:rFonts w:ascii="Arial" w:eastAsiaTheme="minorHAnsi" w:hAnsi="Arial" w:cs="Arial"/>
+                <w:sz w:val="24"/>
+              </w:rPr>
+              <w:t>Programador</w:t>
+            </w:r>
           </w:p>
         </w:tc>
       </w:tr>
@@ -787,12 +820,22 @@
           </w:tcPr>
           <w:p>
             <w:pPr>
+              <w:spacing w:after="0" w:line="240" w:lineRule="auto"/>
               <w:jc w:val="center"/>
               <w:rPr>
-                <w:rFonts w:ascii="Arial" w:eastAsiaTheme="minorHAnsi" w:hAnsi="Arial" w:cs="Arial"/>
-                <w:sz w:val="24"/>
+                <w:rFonts w:ascii="Arial" w:eastAsiaTheme="minorEastAsia" w:hAnsi="Arial" w:cs="Arial"/>
+                <w:sz w:val="24"/>
+                <w:szCs w:val="24"/>
               </w:rPr>
             </w:pPr>
+            <w:r>
+              <w:rPr>
+                <w:rFonts w:ascii="Arial" w:eastAsiaTheme="minorEastAsia" w:hAnsi="Arial" w:cs="Arial"/>
+                <w:sz w:val="24"/>
+                <w:szCs w:val="24"/>
+              </w:rPr>
+              <w:t>Jeferson Andre Cano Lopez</w:t>
+            </w:r>
           </w:p>
         </w:tc>
         <w:tc>
@@ -801,12 +844,22 @@
           </w:tcPr>
           <w:p>
             <w:pPr>
+              <w:spacing w:after="0" w:line="240" w:lineRule="auto"/>
               <w:jc w:val="center"/>
               <w:rPr>
-                <w:rFonts w:ascii="Arial" w:eastAsiaTheme="minorHAnsi" w:hAnsi="Arial" w:cs="Arial"/>
-                <w:sz w:val="24"/>
+                <w:rFonts w:ascii="Arial" w:eastAsiaTheme="minorEastAsia" w:hAnsi="Arial" w:cs="Arial"/>
+                <w:sz w:val="24"/>
+                <w:szCs w:val="24"/>
               </w:rPr>
             </w:pPr>
+            <w:r>
+              <w:rPr>
+                <w:rFonts w:ascii="Arial" w:eastAsiaTheme="minorEastAsia" w:hAnsi="Arial" w:cs="Arial"/>
+                <w:sz w:val="24"/>
+                <w:szCs w:val="24"/>
+              </w:rPr>
+              <w:t>Programador</w:t>
+            </w:r>
           </w:p>
         </w:tc>
       </w:tr>
@@ -817,12 +870,20 @@
           </w:tcPr>
           <w:p>
             <w:pPr>
+              <w:spacing w:after="0" w:line="240" w:lineRule="auto"/>
               <w:jc w:val="center"/>
               <w:rPr>
                 <w:rFonts w:ascii="Arial" w:eastAsiaTheme="minorHAnsi" w:hAnsi="Arial" w:cs="Arial"/>
                 <w:sz w:val="24"/>
               </w:rPr>
             </w:pPr>
+            <w:r>
+              <w:rPr>
+                <w:rFonts w:ascii="Arial" w:eastAsiaTheme="minorHAnsi" w:hAnsi="Arial" w:cs="Arial"/>
+                <w:sz w:val="24"/>
+              </w:rPr>
+              <w:t>Carlos Enrique López Quino</w:t>
+            </w:r>
           </w:p>
         </w:tc>
         <w:tc>
@@ -831,12 +892,20 @@
           </w:tcPr>
           <w:p>
             <w:pPr>
+              <w:spacing w:after="0" w:line="240" w:lineRule="auto"/>
               <w:jc w:val="center"/>
               <w:rPr>
                 <w:rFonts w:ascii="Arial" w:eastAsiaTheme="minorHAnsi" w:hAnsi="Arial" w:cs="Arial"/>
                 <w:sz w:val="24"/>
               </w:rPr>
             </w:pPr>
+            <w:r>
+              <w:rPr>
+                <w:rFonts w:ascii="Arial" w:eastAsiaTheme="minorHAnsi" w:hAnsi="Arial" w:cs="Arial"/>
+                <w:sz w:val="24"/>
+              </w:rPr>
+              <w:t>Programador</w:t>
+            </w:r>
           </w:p>
         </w:tc>
       </w:tr>
@@ -847,12 +916,20 @@
           </w:tcPr>
           <w:p>
             <w:pPr>
+              <w:spacing w:after="0" w:line="240" w:lineRule="auto"/>
               <w:jc w:val="center"/>
               <w:rPr>
                 <w:rFonts w:ascii="Arial" w:eastAsiaTheme="minorHAnsi" w:hAnsi="Arial" w:cs="Arial"/>
                 <w:sz w:val="24"/>
               </w:rPr>
             </w:pPr>
+            <w:r>
+              <w:rPr>
+                <w:rFonts w:ascii="Arial" w:eastAsiaTheme="minorHAnsi" w:hAnsi="Arial" w:cs="Arial"/>
+                <w:sz w:val="24"/>
+              </w:rPr>
+              <w:t>Ricardo Alejandro Hernández Hernández</w:t>
+            </w:r>
           </w:p>
         </w:tc>
         <w:tc>
@@ -861,12 +938,20 @@
           </w:tcPr>
           <w:p>
             <w:pPr>
+              <w:spacing w:after="0" w:line="240" w:lineRule="auto"/>
               <w:jc w:val="center"/>
               <w:rPr>
                 <w:rFonts w:ascii="Arial" w:eastAsiaTheme="minorHAnsi" w:hAnsi="Arial" w:cs="Arial"/>
                 <w:sz w:val="24"/>
               </w:rPr>
             </w:pPr>
+            <w:r>
+              <w:rPr>
+                <w:rFonts w:ascii="Arial" w:eastAsiaTheme="minorHAnsi" w:hAnsi="Arial" w:cs="Arial"/>
+                <w:sz w:val="24"/>
+              </w:rPr>
+              <w:t>Programador</w:t>
+            </w:r>
           </w:p>
         </w:tc>
       </w:tr>
@@ -877,12 +962,20 @@
           </w:tcPr>
           <w:p>
             <w:pPr>
+              <w:spacing w:after="0" w:line="240" w:lineRule="auto"/>
               <w:jc w:val="center"/>
               <w:rPr>
                 <w:rFonts w:ascii="Arial" w:eastAsiaTheme="minorHAnsi" w:hAnsi="Arial" w:cs="Arial"/>
                 <w:sz w:val="24"/>
               </w:rPr>
             </w:pPr>
+            <w:r>
+              <w:rPr>
+                <w:rFonts w:ascii="Arial" w:eastAsiaTheme="minorHAnsi" w:hAnsi="Arial" w:cs="Arial"/>
+                <w:sz w:val="24"/>
+              </w:rPr>
+              <w:t>Osman Emmanuell Veliz Guzmán</w:t>
+            </w:r>
           </w:p>
         </w:tc>
         <w:tc>
@@ -891,12 +984,20 @@
           </w:tcPr>
           <w:p>
             <w:pPr>
+              <w:spacing w:after="0" w:line="240" w:lineRule="auto"/>
               <w:jc w:val="center"/>
               <w:rPr>
                 <w:rFonts w:ascii="Arial" w:eastAsiaTheme="minorHAnsi" w:hAnsi="Arial" w:cs="Arial"/>
                 <w:sz w:val="24"/>
               </w:rPr>
             </w:pPr>
+            <w:r>
+              <w:rPr>
+                <w:rFonts w:ascii="Arial" w:eastAsiaTheme="minorHAnsi" w:hAnsi="Arial" w:cs="Arial"/>
+                <w:sz w:val="24"/>
+              </w:rPr>
+              <w:t>Programador</w:t>
+            </w:r>
           </w:p>
         </w:tc>
       </w:tr>
@@ -907,13 +1008,20 @@
           </w:tcPr>
           <w:p>
             <w:pPr>
+              <w:spacing w:after="0" w:line="240" w:lineRule="auto"/>
               <w:jc w:val="center"/>
               <w:rPr>
-                <w:rFonts w:ascii="Arial" w:eastAsiaTheme="minorEastAsia" w:hAnsi="Arial" w:cs="Arial"/>
-                <w:sz w:val="24"/>
-                <w:szCs w:val="24"/>
+                <w:rFonts w:ascii="Arial" w:eastAsiaTheme="minorHAnsi" w:hAnsi="Arial" w:cs="Arial"/>
+                <w:sz w:val="24"/>
               </w:rPr>
             </w:pPr>
+            <w:r>
+              <w:rPr>
+                <w:rFonts w:ascii="Arial" w:eastAsiaTheme="minorHAnsi" w:hAnsi="Arial" w:cs="Arial"/>
+                <w:sz w:val="24"/>
+              </w:rPr>
+              <w:t>Franklin Stev Paiz Chavez</w:t>
+            </w:r>
           </w:p>
         </w:tc>
         <w:tc>
@@ -922,13 +1030,20 @@
           </w:tcPr>
           <w:p>
             <w:pPr>
+              <w:spacing w:after="0" w:line="240" w:lineRule="auto"/>
               <w:jc w:val="center"/>
               <w:rPr>
-                <w:rFonts w:ascii="Arial" w:eastAsiaTheme="minorEastAsia" w:hAnsi="Arial" w:cs="Arial"/>
-                <w:sz w:val="24"/>
-                <w:szCs w:val="24"/>
+                <w:rFonts w:ascii="Arial" w:eastAsiaTheme="minorHAnsi" w:hAnsi="Arial" w:cs="Arial"/>
+                <w:sz w:val="24"/>
               </w:rPr>
             </w:pPr>
+            <w:r>
+              <w:rPr>
+                <w:rFonts w:ascii="Arial" w:eastAsiaTheme="minorHAnsi" w:hAnsi="Arial" w:cs="Arial"/>
+                <w:sz w:val="24"/>
+              </w:rPr>
+              <w:t>Programador</w:t>
+            </w:r>
           </w:p>
         </w:tc>
       </w:tr>
@@ -939,12 +1054,22 @@
           </w:tcPr>
           <w:p>
             <w:pPr>
+              <w:spacing w:after="0" w:line="240" w:lineRule="auto"/>
               <w:jc w:val="center"/>
               <w:rPr>
-                <w:rFonts w:ascii="Arial" w:eastAsiaTheme="minorHAnsi" w:hAnsi="Arial" w:cs="Arial"/>
-                <w:sz w:val="24"/>
+                <w:rFonts w:ascii="Arial" w:eastAsiaTheme="minorEastAsia" w:hAnsi="Arial" w:cs="Arial"/>
+                <w:sz w:val="24"/>
+                <w:szCs w:val="24"/>
               </w:rPr>
             </w:pPr>
+            <w:r>
+              <w:rPr>
+                <w:rFonts w:ascii="Arial" w:eastAsiaTheme="minorEastAsia" w:hAnsi="Arial" w:cs="Arial"/>
+                <w:sz w:val="24"/>
+                <w:szCs w:val="24"/>
+              </w:rPr>
+              <w:t>Angel Gabriel Ernesto Grijalva Castro</w:t>
+            </w:r>
           </w:p>
         </w:tc>
         <w:tc>
@@ -953,12 +1078,22 @@
           </w:tcPr>
           <w:p>
             <w:pPr>
+              <w:spacing w:after="0" w:line="240" w:lineRule="auto"/>
               <w:jc w:val="center"/>
               <w:rPr>
-                <w:rFonts w:ascii="Arial" w:eastAsiaTheme="minorHAnsi" w:hAnsi="Arial" w:cs="Arial"/>
-                <w:sz w:val="24"/>
+                <w:rFonts w:ascii="Arial" w:eastAsiaTheme="minorEastAsia" w:hAnsi="Arial" w:cs="Arial"/>
+                <w:sz w:val="24"/>
+                <w:szCs w:val="24"/>
               </w:rPr>
             </w:pPr>
+            <w:r>
+              <w:rPr>
+                <w:rFonts w:ascii="Arial" w:eastAsiaTheme="minorEastAsia" w:hAnsi="Arial" w:cs="Arial"/>
+                <w:sz w:val="24"/>
+                <w:szCs w:val="24"/>
+              </w:rPr>
+              <w:t>Programador</w:t>
+            </w:r>
           </w:p>
         </w:tc>
       </w:tr>
@@ -969,12 +1104,20 @@
           </w:tcPr>
           <w:p>
             <w:pPr>
+              <w:spacing w:after="0" w:line="240" w:lineRule="auto"/>
               <w:jc w:val="center"/>
               <w:rPr>
                 <w:rFonts w:ascii="Arial" w:eastAsiaTheme="minorHAnsi" w:hAnsi="Arial" w:cs="Arial"/>
                 <w:sz w:val="24"/>
               </w:rPr>
             </w:pPr>
+            <w:r>
+              <w:rPr>
+                <w:rFonts w:ascii="Arial" w:eastAsiaTheme="minorHAnsi" w:hAnsi="Arial" w:cs="Arial"/>
+                <w:sz w:val="24"/>
+              </w:rPr>
+              <w:t>Benjamin Elí Argueta Caal</w:t>
+            </w:r>
           </w:p>
         </w:tc>
         <w:tc>
@@ -983,12 +1126,20 @@
           </w:tcPr>
           <w:p>
             <w:pPr>
+              <w:spacing w:after="0" w:line="240" w:lineRule="auto"/>
               <w:jc w:val="center"/>
               <w:rPr>
                 <w:rFonts w:ascii="Arial" w:eastAsiaTheme="minorHAnsi" w:hAnsi="Arial" w:cs="Arial"/>
                 <w:sz w:val="24"/>
               </w:rPr>
             </w:pPr>
+            <w:r>
+              <w:rPr>
+                <w:rFonts w:ascii="Arial" w:eastAsiaTheme="minorHAnsi" w:hAnsi="Arial" w:cs="Arial"/>
+                <w:sz w:val="24"/>
+              </w:rPr>
+              <w:t>Programador</w:t>
+            </w:r>
           </w:p>
         </w:tc>
       </w:tr>
@@ -999,12 +1150,20 @@
           </w:tcPr>
           <w:p>
             <w:pPr>
+              <w:spacing w:after="0" w:line="240" w:lineRule="auto"/>
               <w:jc w:val="center"/>
               <w:rPr>
                 <w:rFonts w:ascii="Arial" w:eastAsiaTheme="minorHAnsi" w:hAnsi="Arial" w:cs="Arial"/>
                 <w:sz w:val="24"/>
               </w:rPr>
             </w:pPr>
+            <w:r>
+              <w:rPr>
+                <w:rFonts w:ascii="Arial" w:eastAsiaTheme="minorHAnsi" w:hAnsi="Arial" w:cs="Arial"/>
+                <w:sz w:val="24"/>
+              </w:rPr>
+              <w:t>Carlos Alejandro Patal Choc</w:t>
+            </w:r>
           </w:p>
         </w:tc>
         <w:tc>
@@ -1013,12 +1172,21 @@
           </w:tcPr>
           <w:p>
             <w:pPr>
+              <w:spacing w:after="0" w:line="240" w:lineRule="auto"/>
               <w:jc w:val="center"/>
               <w:rPr>
                 <w:rFonts w:ascii="Arial" w:eastAsiaTheme="minorHAnsi" w:hAnsi="Arial" w:cs="Arial"/>
                 <w:sz w:val="24"/>
+                <w:u w:val="single"/>
               </w:rPr>
             </w:pPr>
+            <w:r>
+              <w:rPr>
+                <w:rFonts w:ascii="Arial" w:eastAsiaTheme="minorHAnsi" w:hAnsi="Arial" w:cs="Arial"/>
+                <w:sz w:val="24"/>
+              </w:rPr>
+              <w:t>Programador</w:t>
+            </w:r>
           </w:p>
         </w:tc>
       </w:tr>
@@ -1027,7 +1195,7 @@
       <w:pPr>
         <w:rPr>
           <w:rFonts w:ascii="Arial" w:eastAsiaTheme="minorHAnsi" w:hAnsi="Arial" w:cs="Arial"/>
-          <w:sz w:val="24"/>
+          <w:bCs/>
         </w:rPr>
       </w:pPr>
     </w:p>
@@ -1036,15 +1204,2404 @@
         <w:rPr>
           <w:rFonts w:ascii="Arial" w:eastAsiaTheme="minorHAnsi" w:hAnsi="Arial" w:cs="Arial"/>
           <w:bCs/>
-        </w:rPr>
-      </w:pPr>
-      <w:r>
+          <w:u w:val="single"/>
+        </w:rPr>
+      </w:pPr>
+    </w:p>
+    <w:p>
+      <w:pPr>
         <w:rPr>
           <w:rFonts w:ascii="Arial" w:eastAsiaTheme="minorHAnsi" w:hAnsi="Arial" w:cs="Arial"/>
           <w:bCs/>
-        </w:rPr>
-        <w:t xml:space="preserve">    </w:t>
+          <w:u w:val="single"/>
+        </w:rPr>
+      </w:pPr>
+    </w:p>
+    <w:p>
+      <w:pPr>
+        <w:rPr>
+          <w:rFonts w:ascii="Arial" w:eastAsiaTheme="minorHAnsi" w:hAnsi="Arial" w:cs="Arial"/>
+          <w:bCs/>
+          <w:u w:val="single"/>
+        </w:rPr>
+      </w:pPr>
+    </w:p>
+    <w:p>
+      <w:pPr>
+        <w:rPr>
+          <w:rFonts w:ascii="Arial" w:eastAsiaTheme="minorHAnsi" w:hAnsi="Arial" w:cs="Arial"/>
+          <w:bCs/>
+          <w:u w:val="single"/>
+        </w:rPr>
+      </w:pPr>
+    </w:p>
+    <w:p>
+      <w:pPr>
+        <w:rPr>
+          <w:rFonts w:ascii="Arial" w:eastAsiaTheme="minorHAnsi" w:hAnsi="Arial" w:cs="Arial"/>
+          <w:bCs/>
+          <w:u w:val="single"/>
+        </w:rPr>
+      </w:pPr>
+    </w:p>
+    <w:p>
+      <w:pPr>
+        <w:rPr>
+          <w:rFonts w:ascii="Arial" w:eastAsiaTheme="minorHAnsi" w:hAnsi="Arial" w:cs="Arial"/>
+          <w:bCs/>
+          <w:u w:val="single"/>
+        </w:rPr>
+      </w:pPr>
+    </w:p>
+    <w:p>
+      <w:pPr>
+        <w:rPr>
+          <w:rFonts w:ascii="Arial" w:eastAsiaTheme="minorHAnsi" w:hAnsi="Arial" w:cs="Arial"/>
+          <w:bCs/>
+          <w:u w:val="single"/>
+        </w:rPr>
+      </w:pPr>
+    </w:p>
+    <w:p>
+      <w:pPr>
+        <w:rPr>
+          <w:rFonts w:ascii="Arial" w:eastAsiaTheme="minorHAnsi" w:hAnsi="Arial" w:cs="Arial"/>
+          <w:bCs/>
+          <w:u w:val="single"/>
+        </w:rPr>
+      </w:pPr>
+    </w:p>
+    <w:p>
+      <w:pPr>
+        <w:rPr>
+          <w:rFonts w:ascii="Arial" w:eastAsiaTheme="minorHAnsi" w:hAnsi="Arial" w:cs="Arial"/>
+          <w:bCs/>
+          <w:u w:val="single"/>
+        </w:rPr>
+      </w:pPr>
+    </w:p>
+    <w:p>
+      <w:pPr>
+        <w:rPr>
+          <w:rFonts w:ascii="Arial" w:eastAsiaTheme="minorHAnsi" w:hAnsi="Arial" w:cs="Arial"/>
+          <w:bCs/>
+          <w:u w:val="single"/>
+        </w:rPr>
+      </w:pPr>
+    </w:p>
+    <w:p>
+      <w:pPr>
+        <w:rPr>
+          <w:rFonts w:ascii="Arial" w:eastAsiaTheme="minorHAnsi" w:hAnsi="Arial" w:cs="Arial"/>
+          <w:bCs/>
+          <w:u w:val="single"/>
+        </w:rPr>
+      </w:pPr>
+    </w:p>
+    <w:p>
+      <w:pPr>
+        <w:rPr>
+          <w:rFonts w:ascii="Arial" w:eastAsiaTheme="minorHAnsi" w:hAnsi="Arial" w:cs="Arial"/>
+          <w:bCs/>
+          <w:u w:val="single"/>
+        </w:rPr>
+      </w:pPr>
+    </w:p>
+    <w:p>
+      <w:pPr>
+        <w:rPr>
+          <w:rFonts w:ascii="Arial" w:eastAsiaTheme="minorHAnsi" w:hAnsi="Arial" w:cs="Arial"/>
+          <w:bCs/>
+          <w:u w:val="single"/>
+        </w:rPr>
+      </w:pPr>
+    </w:p>
+    <w:p>
+      <w:pPr>
+        <w:rPr>
+          <w:rFonts w:ascii="Arial" w:eastAsiaTheme="minorHAnsi" w:hAnsi="Arial" w:cs="Arial"/>
+          <w:bCs/>
+          <w:u w:val="single"/>
+        </w:rPr>
+      </w:pPr>
+    </w:p>
+    <w:p>
+      <w:pPr>
+        <w:rPr>
+          <w:rFonts w:ascii="Arial" w:eastAsiaTheme="minorHAnsi" w:hAnsi="Arial" w:cs="Arial"/>
+          <w:bCs/>
+          <w:u w:val="single"/>
+        </w:rPr>
+      </w:pPr>
+    </w:p>
+    <w:p>
+      <w:pPr>
+        <w:rPr>
+          <w:rFonts w:ascii="Arial" w:eastAsiaTheme="minorHAnsi" w:hAnsi="Arial" w:cs="Arial"/>
+          <w:bCs/>
+          <w:u w:val="single"/>
+        </w:rPr>
+      </w:pPr>
+    </w:p>
+    <w:p>
+      <w:pPr>
+        <w:jc w:val="center"/>
+        <w:rPr>
+          <w:rFonts w:ascii="Arial" w:eastAsiaTheme="minorHAnsi" w:hAnsi="Arial" w:cs="Arial"/>
+          <w:b/>
+          <w:sz w:val="44"/>
+          <w:szCs w:val="44"/>
+        </w:rPr>
+      </w:pPr>
+      <w:r>
+        <w:rPr>
+          <w:rFonts w:ascii="Arial" w:eastAsiaTheme="minorHAnsi" w:hAnsi="Arial" w:cs="Arial"/>
+          <w:b/>
+          <w:sz w:val="44"/>
+          <w:szCs w:val="44"/>
+        </w:rPr>
+        <w:t>Historias de Usuario</w:t>
       </w:r>
+    </w:p>
+    <w:p>
+      <w:pPr>
+        <w:jc w:val="center"/>
+        <w:rPr>
+          <w:rFonts w:ascii="Arial" w:eastAsiaTheme="minorHAnsi" w:hAnsi="Arial" w:cs="Arial"/>
+          <w:b/>
+          <w:sz w:val="44"/>
+          <w:szCs w:val="44"/>
+        </w:rPr>
+      </w:pPr>
+      <w:bookmarkStart w:id="0" w:name="_GoBack"/>
+      <w:bookmarkEnd w:id="0"/>
+    </w:p>
+    <w:p>
+      <w:pPr>
+        <w:jc w:val="center"/>
+        <w:rPr>
+          <w:rFonts w:ascii="Arial" w:eastAsiaTheme="minorHAnsi" w:hAnsi="Arial" w:cs="Arial"/>
+          <w:b/>
+          <w:sz w:val="44"/>
+          <w:szCs w:val="44"/>
+        </w:rPr>
+      </w:pPr>
+    </w:p>
+    <w:p>
+      <w:pPr>
+        <w:rPr>
+          <w:rFonts w:ascii="Arial" w:eastAsiaTheme="minorHAnsi" w:hAnsi="Arial" w:cs="Arial"/>
+          <w:b/>
+          <w:sz w:val="24"/>
+          <w:szCs w:val="20"/>
+        </w:rPr>
+      </w:pPr>
+      <w:r>
+        <w:rPr>
+          <w:rFonts w:ascii="Arial" w:eastAsiaTheme="minorHAnsi" w:hAnsi="Arial" w:cs="Arial"/>
+          <w:b/>
+          <w:sz w:val="24"/>
+          <w:szCs w:val="20"/>
+        </w:rPr>
+        <w:t>Tupla: Usuario</w:t>
+      </w:r>
+    </w:p>
+    <w:p>
+      <w:pPr>
+        <w:spacing w:before="100" w:beforeAutospacing="1" w:after="100" w:afterAutospacing="1" w:line="240" w:lineRule="auto"/>
+        <w:rPr>
+          <w:rFonts w:ascii="Arial" w:eastAsia="Times New Roman" w:hAnsi="Arial" w:cs="Arial"/>
+          <w:szCs w:val="24"/>
+          <w:lang w:eastAsia="es-GT"/>
+        </w:rPr>
+      </w:pPr>
+      <w:r>
+        <w:rPr>
+          <w:rFonts w:ascii="Arial" w:eastAsia="Times New Roman" w:hAnsi="Arial" w:cs="Arial"/>
+          <w:bCs/>
+          <w:szCs w:val="24"/>
+          <w:lang w:eastAsia="es-GT"/>
+        </w:rPr>
+        <w:t>HUKC-001</w:t>
+      </w:r>
+      <w:r>
+        <w:rPr>
+          <w:rFonts w:ascii="Arial" w:eastAsia="Times New Roman" w:hAnsi="Arial" w:cs="Arial"/>
+          <w:b/>
+          <w:bCs/>
+          <w:szCs w:val="24"/>
+          <w:lang w:eastAsia="es-GT"/>
+        </w:rPr>
+        <w:t xml:space="preserve"> Registro de Nuevo Usuario</w:t>
+      </w:r>
+    </w:p>
+    <w:p>
+      <w:pPr>
+        <w:spacing w:before="100" w:beforeAutospacing="1" w:after="100" w:afterAutospacing="1" w:line="240" w:lineRule="auto"/>
+        <w:rPr>
+          <w:rFonts w:ascii="Arial" w:eastAsia="Times New Roman" w:hAnsi="Arial" w:cs="Arial"/>
+          <w:szCs w:val="24"/>
+          <w:lang w:eastAsia="es-GT"/>
+        </w:rPr>
+      </w:pPr>
+      <w:r>
+        <w:rPr>
+          <w:rFonts w:ascii="Arial" w:eastAsia="Times New Roman" w:hAnsi="Arial" w:cs="Arial"/>
+          <w:b/>
+          <w:szCs w:val="24"/>
+          <w:lang w:eastAsia="es-GT"/>
+        </w:rPr>
+        <w:t>Como</w:t>
+      </w:r>
+      <w:r>
+        <w:rPr>
+          <w:rFonts w:ascii="Arial" w:eastAsia="Times New Roman" w:hAnsi="Arial" w:cs="Arial"/>
+          <w:szCs w:val="24"/>
+          <w:lang w:eastAsia="es-GT"/>
+        </w:rPr>
+        <w:t xml:space="preserve">: Un nuevo usuario (anfitrión o invitado) </w:t>
+      </w:r>
+    </w:p>
+    <w:p>
+      <w:pPr>
+        <w:spacing w:before="100" w:beforeAutospacing="1" w:after="100" w:afterAutospacing="1" w:line="240" w:lineRule="auto"/>
+        <w:rPr>
+          <w:rFonts w:ascii="Arial" w:eastAsia="Times New Roman" w:hAnsi="Arial" w:cs="Arial"/>
+          <w:szCs w:val="24"/>
+          <w:lang w:eastAsia="es-GT"/>
+        </w:rPr>
+      </w:pPr>
+      <w:r>
+        <w:rPr>
+          <w:rFonts w:ascii="Arial" w:eastAsia="Times New Roman" w:hAnsi="Arial" w:cs="Arial"/>
+          <w:b/>
+          <w:szCs w:val="24"/>
+          <w:lang w:eastAsia="es-GT"/>
+        </w:rPr>
+        <w:t>Quiero</w:t>
+      </w:r>
+      <w:r>
+        <w:rPr>
+          <w:rFonts w:ascii="Arial" w:eastAsia="Times New Roman" w:hAnsi="Arial" w:cs="Arial"/>
+          <w:szCs w:val="24"/>
+          <w:lang w:eastAsia="es-GT"/>
+        </w:rPr>
+        <w:t xml:space="preserve">: Registrarme en el sistema proporcionando mi nombre, correo, teléfono, fecha de nacimiento y tipo de usuario (anfitrión o invitado) </w:t>
+      </w:r>
+    </w:p>
+    <w:p>
+      <w:pPr>
+        <w:spacing w:before="100" w:beforeAutospacing="1" w:after="100" w:afterAutospacing="1" w:line="240" w:lineRule="auto"/>
+        <w:rPr>
+          <w:rFonts w:ascii="Arial" w:eastAsia="Times New Roman" w:hAnsi="Arial" w:cs="Arial"/>
+          <w:szCs w:val="24"/>
+          <w:lang w:eastAsia="es-GT"/>
+        </w:rPr>
+      </w:pPr>
+      <w:r>
+        <w:rPr>
+          <w:rFonts w:ascii="Arial" w:eastAsia="Times New Roman" w:hAnsi="Arial" w:cs="Arial"/>
+          <w:b/>
+          <w:szCs w:val="24"/>
+          <w:lang w:eastAsia="es-GT"/>
+        </w:rPr>
+        <w:t>Para</w:t>
+      </w:r>
+      <w:r>
+        <w:rPr>
+          <w:rFonts w:ascii="Arial" w:eastAsia="Times New Roman" w:hAnsi="Arial" w:cs="Arial"/>
+          <w:szCs w:val="24"/>
+          <w:lang w:eastAsia="es-GT"/>
+        </w:rPr>
+        <w:t>: Poder utilizar los servicios de la plataforma, ya sea para ofrecer propiedades o para reservarlas.</w:t>
+      </w:r>
+    </w:p>
+    <w:p>
+      <w:pPr>
+        <w:spacing w:before="100" w:beforeAutospacing="1" w:after="100" w:afterAutospacing="1" w:line="240" w:lineRule="auto"/>
+        <w:rPr>
+          <w:rFonts w:ascii="Arial" w:eastAsia="Times New Roman" w:hAnsi="Arial" w:cs="Arial"/>
+          <w:szCs w:val="24"/>
+          <w:lang w:eastAsia="es-GT"/>
+        </w:rPr>
+      </w:pPr>
+    </w:p>
+    <w:p>
+      <w:pPr>
+        <w:spacing w:before="100" w:beforeAutospacing="1" w:after="100" w:afterAutospacing="1" w:line="240" w:lineRule="auto"/>
+        <w:rPr>
+          <w:rFonts w:ascii="Arial" w:eastAsia="Times New Roman" w:hAnsi="Arial" w:cs="Arial"/>
+          <w:sz w:val="24"/>
+          <w:szCs w:val="24"/>
+          <w:lang w:eastAsia="es-GT"/>
+        </w:rPr>
+      </w:pPr>
+    </w:p>
+    <w:p>
+      <w:pPr>
+        <w:spacing w:before="100" w:beforeAutospacing="1" w:after="100" w:afterAutospacing="1" w:line="240" w:lineRule="auto"/>
+        <w:rPr>
+          <w:rFonts w:ascii="Arial" w:eastAsia="Times New Roman" w:hAnsi="Arial" w:cs="Arial"/>
+          <w:sz w:val="24"/>
+          <w:szCs w:val="24"/>
+          <w:lang w:eastAsia="es-GT"/>
+        </w:rPr>
+      </w:pPr>
+    </w:p>
+    <w:p>
+      <w:pPr>
+        <w:spacing w:before="100" w:beforeAutospacing="1" w:after="100" w:afterAutospacing="1" w:line="240" w:lineRule="auto"/>
+        <w:rPr>
+          <w:rFonts w:ascii="Arial" w:eastAsia="Times New Roman" w:hAnsi="Arial" w:cs="Arial"/>
+          <w:sz w:val="24"/>
+          <w:szCs w:val="24"/>
+          <w:lang w:eastAsia="es-GT"/>
+        </w:rPr>
+      </w:pPr>
+    </w:p>
+    <w:p>
+      <w:pPr>
+        <w:spacing w:before="100" w:beforeAutospacing="1" w:after="100" w:afterAutospacing="1" w:line="240" w:lineRule="auto"/>
+        <w:rPr>
+          <w:rFonts w:ascii="Arial" w:eastAsia="Times New Roman" w:hAnsi="Arial" w:cs="Arial"/>
+          <w:sz w:val="24"/>
+          <w:szCs w:val="24"/>
+          <w:lang w:eastAsia="es-GT"/>
+        </w:rPr>
+      </w:pPr>
+    </w:p>
+    <w:p>
+      <w:pPr>
+        <w:spacing w:before="100" w:beforeAutospacing="1" w:after="100" w:afterAutospacing="1" w:line="240" w:lineRule="auto"/>
+        <w:rPr>
+          <w:rFonts w:ascii="Arial" w:eastAsia="Times New Roman" w:hAnsi="Arial" w:cs="Arial"/>
+          <w:sz w:val="24"/>
+          <w:szCs w:val="24"/>
+          <w:lang w:eastAsia="es-GT"/>
+        </w:rPr>
+      </w:pPr>
+    </w:p>
+    <w:p>
+      <w:pPr>
+        <w:spacing w:before="100" w:beforeAutospacing="1" w:after="100" w:afterAutospacing="1" w:line="240" w:lineRule="auto"/>
+        <w:rPr>
+          <w:rFonts w:ascii="Arial" w:eastAsia="Times New Roman" w:hAnsi="Arial" w:cs="Arial"/>
+          <w:sz w:val="24"/>
+          <w:szCs w:val="24"/>
+          <w:lang w:eastAsia="es-GT"/>
+        </w:rPr>
+      </w:pPr>
+    </w:p>
+    <w:p>
+      <w:pPr>
+        <w:spacing w:before="100" w:beforeAutospacing="1" w:after="100" w:afterAutospacing="1" w:line="240" w:lineRule="auto"/>
+        <w:rPr>
+          <w:rFonts w:ascii="Arial" w:eastAsia="Times New Roman" w:hAnsi="Arial" w:cs="Arial"/>
+          <w:sz w:val="24"/>
+          <w:szCs w:val="24"/>
+          <w:lang w:eastAsia="es-GT"/>
+        </w:rPr>
+      </w:pPr>
+    </w:p>
+    <w:p>
+      <w:pPr>
+        <w:spacing w:before="100" w:beforeAutospacing="1" w:after="100" w:afterAutospacing="1" w:line="240" w:lineRule="auto"/>
+        <w:rPr>
+          <w:rFonts w:ascii="Arial" w:eastAsia="Times New Roman" w:hAnsi="Arial" w:cs="Arial"/>
+          <w:sz w:val="24"/>
+          <w:szCs w:val="24"/>
+          <w:lang w:eastAsia="es-GT"/>
+        </w:rPr>
+      </w:pPr>
+    </w:p>
+    <w:p>
+      <w:pPr>
+        <w:spacing w:before="100" w:beforeAutospacing="1" w:after="100" w:afterAutospacing="1" w:line="240" w:lineRule="auto"/>
+        <w:rPr>
+          <w:rFonts w:ascii="Arial" w:eastAsia="Times New Roman" w:hAnsi="Arial" w:cs="Arial"/>
+          <w:sz w:val="24"/>
+          <w:szCs w:val="24"/>
+          <w:lang w:eastAsia="es-GT"/>
+        </w:rPr>
+      </w:pPr>
+    </w:p>
+    <w:p>
+      <w:pPr>
+        <w:spacing w:before="100" w:beforeAutospacing="1" w:after="100" w:afterAutospacing="1" w:line="240" w:lineRule="auto"/>
+        <w:rPr>
+          <w:rFonts w:ascii="Arial" w:eastAsia="Times New Roman" w:hAnsi="Arial" w:cs="Arial"/>
+          <w:sz w:val="24"/>
+          <w:szCs w:val="24"/>
+          <w:lang w:eastAsia="es-GT"/>
+        </w:rPr>
+      </w:pPr>
+    </w:p>
+    <w:p>
+      <w:pPr>
+        <w:spacing w:before="100" w:beforeAutospacing="1" w:after="100" w:afterAutospacing="1" w:line="240" w:lineRule="auto"/>
+        <w:rPr>
+          <w:rFonts w:ascii="Arial" w:eastAsia="Times New Roman" w:hAnsi="Arial" w:cs="Arial"/>
+          <w:sz w:val="24"/>
+          <w:szCs w:val="24"/>
+          <w:lang w:eastAsia="es-GT"/>
+        </w:rPr>
+      </w:pPr>
+    </w:p>
+    <w:p>
+      <w:pPr>
+        <w:spacing w:before="100" w:beforeAutospacing="1" w:after="100" w:afterAutospacing="1" w:line="240" w:lineRule="auto"/>
+        <w:rPr>
+          <w:rFonts w:ascii="Arial" w:eastAsia="Times New Roman" w:hAnsi="Arial" w:cs="Arial"/>
+          <w:sz w:val="24"/>
+          <w:szCs w:val="24"/>
+          <w:lang w:eastAsia="es-GT"/>
+        </w:rPr>
+      </w:pPr>
+    </w:p>
+    <w:p>
+      <w:pPr>
+        <w:spacing w:before="100" w:beforeAutospacing="1" w:after="100" w:afterAutospacing="1" w:line="240" w:lineRule="auto"/>
+        <w:rPr>
+          <w:rFonts w:ascii="Arial" w:eastAsia="Times New Roman" w:hAnsi="Arial" w:cs="Arial"/>
+          <w:sz w:val="24"/>
+          <w:szCs w:val="24"/>
+          <w:lang w:eastAsia="es-GT"/>
+        </w:rPr>
+      </w:pPr>
+    </w:p>
+    <w:p>
+      <w:pPr>
+        <w:spacing w:before="100" w:beforeAutospacing="1" w:after="100" w:afterAutospacing="1" w:line="240" w:lineRule="auto"/>
+        <w:rPr>
+          <w:rFonts w:ascii="Arial" w:eastAsia="Times New Roman" w:hAnsi="Arial" w:cs="Arial"/>
+          <w:sz w:val="24"/>
+          <w:szCs w:val="24"/>
+          <w:lang w:eastAsia="es-GT"/>
+        </w:rPr>
+      </w:pPr>
+    </w:p>
+    <w:p>
+      <w:pPr>
+        <w:spacing w:before="100" w:beforeAutospacing="1" w:after="100" w:afterAutospacing="1" w:line="240" w:lineRule="auto"/>
+        <w:rPr>
+          <w:rFonts w:ascii="Arial" w:eastAsia="Times New Roman" w:hAnsi="Arial" w:cs="Arial"/>
+          <w:sz w:val="24"/>
+          <w:szCs w:val="24"/>
+          <w:lang w:eastAsia="es-GT"/>
+        </w:rPr>
+      </w:pPr>
+    </w:p>
+    <w:p>
+      <w:pPr>
+        <w:spacing w:before="100" w:beforeAutospacing="1" w:after="100" w:afterAutospacing="1" w:line="240" w:lineRule="auto"/>
+        <w:rPr>
+          <w:rFonts w:ascii="Arial" w:eastAsia="Times New Roman" w:hAnsi="Arial" w:cs="Arial"/>
+          <w:sz w:val="24"/>
+          <w:szCs w:val="24"/>
+          <w:lang w:eastAsia="es-GT"/>
+        </w:rPr>
+      </w:pPr>
+    </w:p>
+    <w:p>
+      <w:pPr>
+        <w:spacing w:before="100" w:beforeAutospacing="1" w:after="100" w:afterAutospacing="1" w:line="240" w:lineRule="auto"/>
+        <w:rPr>
+          <w:rFonts w:ascii="Arial" w:eastAsia="Times New Roman" w:hAnsi="Arial" w:cs="Arial"/>
+          <w:sz w:val="24"/>
+          <w:szCs w:val="24"/>
+          <w:lang w:eastAsia="es-GT"/>
+        </w:rPr>
+      </w:pPr>
+    </w:p>
+    <w:p>
+      <w:pPr>
+        <w:spacing w:before="100" w:beforeAutospacing="1" w:after="100" w:afterAutospacing="1" w:line="240" w:lineRule="auto"/>
+        <w:rPr>
+          <w:rFonts w:ascii="Arial" w:eastAsia="Times New Roman" w:hAnsi="Arial" w:cs="Arial"/>
+          <w:sz w:val="24"/>
+          <w:szCs w:val="24"/>
+          <w:lang w:eastAsia="es-GT"/>
+        </w:rPr>
+      </w:pPr>
+    </w:p>
+    <w:p>
+      <w:pPr>
+        <w:spacing w:before="100" w:beforeAutospacing="1" w:after="100" w:afterAutospacing="1" w:line="240" w:lineRule="auto"/>
+        <w:rPr>
+          <w:rFonts w:ascii="Arial" w:eastAsia="Times New Roman" w:hAnsi="Arial" w:cs="Arial"/>
+          <w:sz w:val="24"/>
+          <w:szCs w:val="24"/>
+          <w:lang w:eastAsia="es-GT"/>
+        </w:rPr>
+      </w:pPr>
+    </w:p>
+    <w:p>
+      <w:pPr>
+        <w:spacing w:before="100" w:beforeAutospacing="1" w:after="100" w:afterAutospacing="1" w:line="240" w:lineRule="auto"/>
+        <w:rPr>
+          <w:rFonts w:ascii="Arial" w:eastAsia="Times New Roman" w:hAnsi="Arial" w:cs="Arial"/>
+          <w:sz w:val="24"/>
+          <w:szCs w:val="24"/>
+          <w:lang w:eastAsia="es-GT"/>
+        </w:rPr>
+      </w:pPr>
+    </w:p>
+    <w:p>
+      <w:pPr>
+        <w:spacing w:before="100" w:beforeAutospacing="1" w:after="100" w:afterAutospacing="1" w:line="240" w:lineRule="auto"/>
+        <w:rPr>
+          <w:rFonts w:ascii="Arial" w:eastAsia="Times New Roman" w:hAnsi="Arial" w:cs="Arial"/>
+          <w:sz w:val="24"/>
+          <w:szCs w:val="24"/>
+          <w:lang w:eastAsia="es-GT"/>
+        </w:rPr>
+      </w:pPr>
+    </w:p>
+    <w:p>
+      <w:pPr>
+        <w:spacing w:before="100" w:beforeAutospacing="1" w:after="100" w:afterAutospacing="1" w:line="240" w:lineRule="auto"/>
+        <w:rPr>
+          <w:rFonts w:ascii="Arial" w:eastAsia="Times New Roman" w:hAnsi="Arial" w:cs="Arial"/>
+          <w:sz w:val="24"/>
+          <w:szCs w:val="24"/>
+          <w:lang w:eastAsia="es-GT"/>
+        </w:rPr>
+      </w:pPr>
+    </w:p>
+    <w:p>
+      <w:pPr>
+        <w:spacing w:before="100" w:beforeAutospacing="1" w:after="100" w:afterAutospacing="1" w:line="240" w:lineRule="auto"/>
+        <w:rPr>
+          <w:rFonts w:ascii="Arial" w:eastAsia="Times New Roman" w:hAnsi="Arial" w:cs="Arial"/>
+          <w:sz w:val="24"/>
+          <w:szCs w:val="24"/>
+          <w:lang w:eastAsia="es-GT"/>
+        </w:rPr>
+      </w:pPr>
+    </w:p>
+    <w:p>
+      <w:pPr>
+        <w:spacing w:before="100" w:beforeAutospacing="1" w:after="100" w:afterAutospacing="1" w:line="240" w:lineRule="auto"/>
+        <w:rPr>
+          <w:rFonts w:ascii="Arial" w:eastAsia="Times New Roman" w:hAnsi="Arial" w:cs="Arial"/>
+          <w:sz w:val="24"/>
+          <w:szCs w:val="24"/>
+          <w:lang w:eastAsia="es-GT"/>
+        </w:rPr>
+      </w:pPr>
+    </w:p>
+    <w:p>
+      <w:pPr>
+        <w:spacing w:before="100" w:beforeAutospacing="1" w:after="100" w:afterAutospacing="1" w:line="240" w:lineRule="auto"/>
+        <w:rPr>
+          <w:rFonts w:ascii="Arial" w:eastAsia="Times New Roman" w:hAnsi="Arial" w:cs="Arial"/>
+          <w:sz w:val="24"/>
+          <w:szCs w:val="24"/>
+          <w:lang w:eastAsia="es-GT"/>
+        </w:rPr>
+      </w:pPr>
+    </w:p>
+    <w:p>
+      <w:pPr>
+        <w:spacing w:before="100" w:beforeAutospacing="1" w:after="100" w:afterAutospacing="1" w:line="240" w:lineRule="auto"/>
+        <w:rPr>
+          <w:rFonts w:ascii="Arial" w:eastAsia="Times New Roman" w:hAnsi="Arial" w:cs="Arial"/>
+          <w:sz w:val="24"/>
+          <w:szCs w:val="24"/>
+          <w:lang w:eastAsia="es-GT"/>
+        </w:rPr>
+      </w:pPr>
+    </w:p>
+    <w:p>
+      <w:pPr>
+        <w:spacing w:before="100" w:beforeAutospacing="1" w:after="100" w:afterAutospacing="1" w:line="240" w:lineRule="auto"/>
+        <w:rPr>
+          <w:rFonts w:ascii="Arial" w:eastAsia="Times New Roman" w:hAnsi="Arial" w:cs="Arial"/>
+          <w:sz w:val="24"/>
+          <w:szCs w:val="24"/>
+          <w:lang w:eastAsia="es-GT"/>
+        </w:rPr>
+      </w:pPr>
+    </w:p>
+    <w:p>
+      <w:pPr>
+        <w:spacing w:before="100" w:beforeAutospacing="1" w:after="100" w:afterAutospacing="1" w:line="240" w:lineRule="auto"/>
+        <w:rPr>
+          <w:rFonts w:ascii="Arial" w:eastAsia="Times New Roman" w:hAnsi="Arial" w:cs="Arial"/>
+          <w:sz w:val="24"/>
+          <w:szCs w:val="24"/>
+          <w:lang w:eastAsia="es-GT"/>
+        </w:rPr>
+      </w:pPr>
+    </w:p>
+    <w:p>
+      <w:pPr>
+        <w:spacing w:before="100" w:beforeAutospacing="1" w:after="100" w:afterAutospacing="1" w:line="240" w:lineRule="auto"/>
+        <w:rPr>
+          <w:rFonts w:ascii="Arial" w:eastAsia="Times New Roman" w:hAnsi="Arial" w:cs="Arial"/>
+          <w:sz w:val="24"/>
+          <w:szCs w:val="24"/>
+          <w:lang w:eastAsia="es-GT"/>
+        </w:rPr>
+      </w:pPr>
+    </w:p>
+    <w:p>
+      <w:pPr>
+        <w:spacing w:before="100" w:beforeAutospacing="1" w:after="100" w:afterAutospacing="1" w:line="240" w:lineRule="auto"/>
+        <w:rPr>
+          <w:rFonts w:ascii="Arial" w:eastAsia="Times New Roman" w:hAnsi="Arial" w:cs="Arial"/>
+          <w:sz w:val="24"/>
+          <w:szCs w:val="24"/>
+          <w:lang w:eastAsia="es-GT"/>
+        </w:rPr>
+      </w:pPr>
+    </w:p>
+    <w:p>
+      <w:pPr>
+        <w:spacing w:before="100" w:beforeAutospacing="1" w:after="100" w:afterAutospacing="1" w:line="240" w:lineRule="auto"/>
+        <w:rPr>
+          <w:rFonts w:ascii="Arial" w:eastAsia="Times New Roman" w:hAnsi="Arial" w:cs="Arial"/>
+          <w:sz w:val="24"/>
+          <w:szCs w:val="24"/>
+          <w:lang w:eastAsia="es-GT"/>
+        </w:rPr>
+      </w:pPr>
+    </w:p>
+    <w:p>
+      <w:pPr>
+        <w:spacing w:before="100" w:beforeAutospacing="1" w:after="100" w:afterAutospacing="1" w:line="240" w:lineRule="auto"/>
+        <w:rPr>
+          <w:rFonts w:ascii="Arial" w:eastAsia="Times New Roman" w:hAnsi="Arial" w:cs="Arial"/>
+          <w:sz w:val="24"/>
+          <w:szCs w:val="24"/>
+          <w:lang w:eastAsia="es-GT"/>
+        </w:rPr>
+      </w:pPr>
+    </w:p>
+    <w:p>
+      <w:pPr>
+        <w:spacing w:before="100" w:beforeAutospacing="1" w:after="100" w:afterAutospacing="1" w:line="240" w:lineRule="auto"/>
+        <w:rPr>
+          <w:rFonts w:ascii="Arial" w:eastAsia="Times New Roman" w:hAnsi="Arial" w:cs="Arial"/>
+          <w:sz w:val="24"/>
+          <w:szCs w:val="24"/>
+          <w:lang w:eastAsia="es-GT"/>
+        </w:rPr>
+      </w:pPr>
+    </w:p>
+    <w:p>
+      <w:pPr>
+        <w:spacing w:before="100" w:beforeAutospacing="1" w:after="100" w:afterAutospacing="1" w:line="240" w:lineRule="auto"/>
+        <w:rPr>
+          <w:rFonts w:ascii="Arial" w:eastAsia="Times New Roman" w:hAnsi="Arial" w:cs="Arial"/>
+          <w:sz w:val="24"/>
+          <w:szCs w:val="24"/>
+          <w:lang w:eastAsia="es-GT"/>
+        </w:rPr>
+      </w:pPr>
+    </w:p>
+    <w:p>
+      <w:pPr>
+        <w:spacing w:before="100" w:beforeAutospacing="1" w:after="100" w:afterAutospacing="1" w:line="240" w:lineRule="auto"/>
+        <w:rPr>
+          <w:rFonts w:ascii="Arial" w:eastAsia="Times New Roman" w:hAnsi="Arial" w:cs="Arial"/>
+          <w:sz w:val="24"/>
+          <w:szCs w:val="24"/>
+          <w:lang w:eastAsia="es-GT"/>
+        </w:rPr>
+      </w:pPr>
+    </w:p>
+    <w:p>
+      <w:pPr>
+        <w:spacing w:before="100" w:beforeAutospacing="1" w:after="100" w:afterAutospacing="1" w:line="240" w:lineRule="auto"/>
+        <w:rPr>
+          <w:rFonts w:ascii="Arial" w:eastAsia="Times New Roman" w:hAnsi="Arial" w:cs="Arial"/>
+          <w:sz w:val="24"/>
+          <w:szCs w:val="24"/>
+          <w:lang w:eastAsia="es-GT"/>
+        </w:rPr>
+      </w:pPr>
+    </w:p>
+    <w:p>
+      <w:pPr>
+        <w:spacing w:before="100" w:beforeAutospacing="1" w:after="100" w:afterAutospacing="1" w:line="240" w:lineRule="auto"/>
+        <w:rPr>
+          <w:rFonts w:ascii="Arial" w:eastAsia="Times New Roman" w:hAnsi="Arial" w:cs="Arial"/>
+          <w:sz w:val="24"/>
+          <w:szCs w:val="24"/>
+          <w:lang w:eastAsia="es-GT"/>
+        </w:rPr>
+      </w:pPr>
+    </w:p>
+    <w:p>
+      <w:pPr>
+        <w:spacing w:before="100" w:beforeAutospacing="1" w:after="100" w:afterAutospacing="1" w:line="240" w:lineRule="auto"/>
+        <w:rPr>
+          <w:rFonts w:ascii="Arial" w:eastAsia="Times New Roman" w:hAnsi="Arial" w:cs="Arial"/>
+          <w:sz w:val="24"/>
+          <w:szCs w:val="24"/>
+          <w:lang w:eastAsia="es-GT"/>
+        </w:rPr>
+      </w:pPr>
+    </w:p>
+    <w:p>
+      <w:pPr>
+        <w:spacing w:before="100" w:beforeAutospacing="1" w:after="100" w:afterAutospacing="1" w:line="240" w:lineRule="auto"/>
+        <w:rPr>
+          <w:rFonts w:ascii="Arial" w:eastAsia="Times New Roman" w:hAnsi="Arial" w:cs="Arial"/>
+          <w:sz w:val="24"/>
+          <w:szCs w:val="24"/>
+          <w:lang w:eastAsia="es-GT"/>
+        </w:rPr>
+      </w:pPr>
+    </w:p>
+    <w:p>
+      <w:pPr>
+        <w:spacing w:before="100" w:beforeAutospacing="1" w:after="100" w:afterAutospacing="1" w:line="240" w:lineRule="auto"/>
+        <w:rPr>
+          <w:rFonts w:ascii="Arial" w:eastAsia="Times New Roman" w:hAnsi="Arial" w:cs="Arial"/>
+          <w:sz w:val="24"/>
+          <w:szCs w:val="24"/>
+          <w:lang w:eastAsia="es-GT"/>
+        </w:rPr>
+      </w:pPr>
+    </w:p>
+    <w:p>
+      <w:pPr>
+        <w:spacing w:before="100" w:beforeAutospacing="1" w:after="100" w:afterAutospacing="1" w:line="240" w:lineRule="auto"/>
+        <w:rPr>
+          <w:rFonts w:ascii="Arial" w:eastAsia="Times New Roman" w:hAnsi="Arial" w:cs="Arial"/>
+          <w:sz w:val="24"/>
+          <w:szCs w:val="24"/>
+          <w:lang w:eastAsia="es-GT"/>
+        </w:rPr>
+      </w:pPr>
+    </w:p>
+    <w:p>
+      <w:pPr>
+        <w:spacing w:before="100" w:beforeAutospacing="1" w:after="100" w:afterAutospacing="1" w:line="240" w:lineRule="auto"/>
+        <w:rPr>
+          <w:rFonts w:ascii="Arial" w:eastAsia="Times New Roman" w:hAnsi="Arial" w:cs="Arial"/>
+          <w:sz w:val="24"/>
+          <w:szCs w:val="24"/>
+          <w:lang w:eastAsia="es-GT"/>
+        </w:rPr>
+      </w:pPr>
+    </w:p>
+    <w:p>
+      <w:pPr>
+        <w:spacing w:before="100" w:beforeAutospacing="1" w:after="100" w:afterAutospacing="1" w:line="240" w:lineRule="auto"/>
+        <w:rPr>
+          <w:rFonts w:ascii="Arial" w:eastAsia="Times New Roman" w:hAnsi="Arial" w:cs="Arial"/>
+          <w:sz w:val="24"/>
+          <w:szCs w:val="24"/>
+          <w:lang w:eastAsia="es-GT"/>
+        </w:rPr>
+      </w:pPr>
+    </w:p>
+    <w:p>
+      <w:pPr>
+        <w:spacing w:before="100" w:beforeAutospacing="1" w:after="100" w:afterAutospacing="1" w:line="240" w:lineRule="auto"/>
+        <w:rPr>
+          <w:rFonts w:ascii="Arial" w:eastAsia="Times New Roman" w:hAnsi="Arial" w:cs="Arial"/>
+          <w:sz w:val="24"/>
+          <w:szCs w:val="24"/>
+          <w:lang w:eastAsia="es-GT"/>
+        </w:rPr>
+      </w:pPr>
+    </w:p>
+    <w:p>
+      <w:pPr>
+        <w:spacing w:before="100" w:beforeAutospacing="1" w:after="100" w:afterAutospacing="1" w:line="240" w:lineRule="auto"/>
+        <w:rPr>
+          <w:rFonts w:ascii="Arial" w:eastAsia="Times New Roman" w:hAnsi="Arial" w:cs="Arial"/>
+          <w:sz w:val="24"/>
+          <w:szCs w:val="24"/>
+          <w:lang w:eastAsia="es-GT"/>
+        </w:rPr>
+      </w:pPr>
+    </w:p>
+    <w:p>
+      <w:pPr>
+        <w:spacing w:before="100" w:beforeAutospacing="1" w:after="100" w:afterAutospacing="1" w:line="240" w:lineRule="auto"/>
+        <w:rPr>
+          <w:rFonts w:ascii="Arial" w:eastAsia="Times New Roman" w:hAnsi="Arial" w:cs="Arial"/>
+          <w:sz w:val="24"/>
+          <w:szCs w:val="24"/>
+          <w:lang w:eastAsia="es-GT"/>
+        </w:rPr>
+      </w:pPr>
+    </w:p>
+    <w:p>
+      <w:pPr>
+        <w:spacing w:before="100" w:beforeAutospacing="1" w:after="100" w:afterAutospacing="1" w:line="240" w:lineRule="auto"/>
+        <w:rPr>
+          <w:rFonts w:ascii="Arial" w:eastAsia="Times New Roman" w:hAnsi="Arial" w:cs="Arial"/>
+          <w:sz w:val="24"/>
+          <w:szCs w:val="24"/>
+          <w:lang w:eastAsia="es-GT"/>
+        </w:rPr>
+      </w:pPr>
+    </w:p>
+    <w:p>
+      <w:pPr>
+        <w:spacing w:before="100" w:beforeAutospacing="1" w:after="100" w:afterAutospacing="1" w:line="240" w:lineRule="auto"/>
+        <w:rPr>
+          <w:rFonts w:ascii="Arial" w:eastAsia="Times New Roman" w:hAnsi="Arial" w:cs="Arial"/>
+          <w:sz w:val="24"/>
+          <w:szCs w:val="24"/>
+          <w:lang w:eastAsia="es-GT"/>
+        </w:rPr>
+      </w:pPr>
+    </w:p>
+    <w:p>
+      <w:pPr>
+        <w:spacing w:before="100" w:beforeAutospacing="1" w:after="100" w:afterAutospacing="1" w:line="240" w:lineRule="auto"/>
+        <w:rPr>
+          <w:rFonts w:ascii="Arial" w:eastAsia="Times New Roman" w:hAnsi="Arial" w:cs="Arial"/>
+          <w:sz w:val="24"/>
+          <w:szCs w:val="24"/>
+          <w:lang w:eastAsia="es-GT"/>
+        </w:rPr>
+      </w:pPr>
+    </w:p>
+    <w:p>
+      <w:pPr>
+        <w:spacing w:before="100" w:beforeAutospacing="1" w:after="100" w:afterAutospacing="1" w:line="240" w:lineRule="auto"/>
+        <w:rPr>
+          <w:rFonts w:ascii="Arial" w:eastAsia="Times New Roman" w:hAnsi="Arial" w:cs="Arial"/>
+          <w:sz w:val="24"/>
+          <w:szCs w:val="24"/>
+          <w:lang w:eastAsia="es-GT"/>
+        </w:rPr>
+      </w:pPr>
+    </w:p>
+    <w:p>
+      <w:pPr>
+        <w:spacing w:before="100" w:beforeAutospacing="1" w:after="100" w:afterAutospacing="1" w:line="240" w:lineRule="auto"/>
+        <w:rPr>
+          <w:rFonts w:ascii="Arial" w:eastAsia="Times New Roman" w:hAnsi="Arial" w:cs="Arial"/>
+          <w:sz w:val="24"/>
+          <w:szCs w:val="24"/>
+          <w:lang w:eastAsia="es-GT"/>
+        </w:rPr>
+      </w:pPr>
+    </w:p>
+    <w:p>
+      <w:pPr>
+        <w:spacing w:before="100" w:beforeAutospacing="1" w:after="100" w:afterAutospacing="1" w:line="240" w:lineRule="auto"/>
+        <w:rPr>
+          <w:rFonts w:ascii="Arial" w:eastAsia="Times New Roman" w:hAnsi="Arial" w:cs="Arial"/>
+          <w:sz w:val="24"/>
+          <w:szCs w:val="24"/>
+          <w:lang w:eastAsia="es-GT"/>
+        </w:rPr>
+      </w:pPr>
+    </w:p>
+    <w:p>
+      <w:pPr>
+        <w:spacing w:before="100" w:beforeAutospacing="1" w:after="100" w:afterAutospacing="1" w:line="240" w:lineRule="auto"/>
+        <w:rPr>
+          <w:rFonts w:ascii="Arial" w:eastAsia="Times New Roman" w:hAnsi="Arial" w:cs="Arial"/>
+          <w:sz w:val="24"/>
+          <w:szCs w:val="24"/>
+          <w:lang w:eastAsia="es-GT"/>
+        </w:rPr>
+      </w:pPr>
+    </w:p>
+    <w:p>
+      <w:pPr>
+        <w:spacing w:before="100" w:beforeAutospacing="1" w:after="100" w:afterAutospacing="1" w:line="240" w:lineRule="auto"/>
+        <w:rPr>
+          <w:rFonts w:ascii="Arial" w:eastAsia="Times New Roman" w:hAnsi="Arial" w:cs="Arial"/>
+          <w:sz w:val="24"/>
+          <w:szCs w:val="24"/>
+          <w:lang w:eastAsia="es-GT"/>
+        </w:rPr>
+      </w:pPr>
+    </w:p>
+    <w:p>
+      <w:pPr>
+        <w:spacing w:before="100" w:beforeAutospacing="1" w:after="100" w:afterAutospacing="1" w:line="240" w:lineRule="auto"/>
+        <w:rPr>
+          <w:rFonts w:ascii="Arial" w:eastAsia="Times New Roman" w:hAnsi="Arial" w:cs="Arial"/>
+          <w:sz w:val="24"/>
+          <w:szCs w:val="24"/>
+          <w:lang w:eastAsia="es-GT"/>
+        </w:rPr>
+      </w:pPr>
+    </w:p>
+    <w:p>
+      <w:pPr>
+        <w:spacing w:before="100" w:beforeAutospacing="1" w:after="100" w:afterAutospacing="1" w:line="240" w:lineRule="auto"/>
+        <w:rPr>
+          <w:rFonts w:ascii="Arial" w:eastAsia="Times New Roman" w:hAnsi="Arial" w:cs="Arial"/>
+          <w:sz w:val="24"/>
+          <w:szCs w:val="24"/>
+          <w:lang w:eastAsia="es-GT"/>
+        </w:rPr>
+      </w:pPr>
+    </w:p>
+    <w:p>
+      <w:pPr>
+        <w:spacing w:before="100" w:beforeAutospacing="1" w:after="100" w:afterAutospacing="1" w:line="240" w:lineRule="auto"/>
+        <w:rPr>
+          <w:rFonts w:ascii="Arial" w:eastAsia="Times New Roman" w:hAnsi="Arial" w:cs="Arial"/>
+          <w:sz w:val="24"/>
+          <w:szCs w:val="24"/>
+          <w:lang w:eastAsia="es-GT"/>
+        </w:rPr>
+      </w:pPr>
+    </w:p>
+    <w:p>
+      <w:pPr>
+        <w:spacing w:before="100" w:beforeAutospacing="1" w:after="100" w:afterAutospacing="1" w:line="240" w:lineRule="auto"/>
+        <w:rPr>
+          <w:rFonts w:ascii="Arial" w:eastAsia="Times New Roman" w:hAnsi="Arial" w:cs="Arial"/>
+          <w:sz w:val="24"/>
+          <w:szCs w:val="24"/>
+          <w:lang w:eastAsia="es-GT"/>
+        </w:rPr>
+      </w:pPr>
+    </w:p>
+    <w:p>
+      <w:pPr>
+        <w:spacing w:before="100" w:beforeAutospacing="1" w:after="100" w:afterAutospacing="1" w:line="240" w:lineRule="auto"/>
+        <w:rPr>
+          <w:rFonts w:ascii="Arial" w:eastAsia="Times New Roman" w:hAnsi="Arial" w:cs="Arial"/>
+          <w:sz w:val="24"/>
+          <w:szCs w:val="24"/>
+          <w:lang w:eastAsia="es-GT"/>
+        </w:rPr>
+      </w:pPr>
+    </w:p>
+    <w:p>
+      <w:pPr>
+        <w:spacing w:before="100" w:beforeAutospacing="1" w:after="100" w:afterAutospacing="1" w:line="240" w:lineRule="auto"/>
+        <w:rPr>
+          <w:rFonts w:ascii="Arial" w:eastAsia="Times New Roman" w:hAnsi="Arial" w:cs="Arial"/>
+          <w:sz w:val="24"/>
+          <w:szCs w:val="24"/>
+          <w:lang w:eastAsia="es-GT"/>
+        </w:rPr>
+      </w:pPr>
+    </w:p>
+    <w:p>
+      <w:pPr>
+        <w:spacing w:before="100" w:beforeAutospacing="1" w:after="100" w:afterAutospacing="1" w:line="240" w:lineRule="auto"/>
+        <w:rPr>
+          <w:rFonts w:ascii="Arial" w:eastAsia="Times New Roman" w:hAnsi="Arial" w:cs="Arial"/>
+          <w:sz w:val="24"/>
+          <w:szCs w:val="24"/>
+          <w:lang w:eastAsia="es-GT"/>
+        </w:rPr>
+      </w:pPr>
+    </w:p>
+    <w:p>
+      <w:pPr>
+        <w:spacing w:before="100" w:beforeAutospacing="1" w:after="100" w:afterAutospacing="1" w:line="240" w:lineRule="auto"/>
+        <w:rPr>
+          <w:rFonts w:ascii="Arial" w:eastAsia="Times New Roman" w:hAnsi="Arial" w:cs="Arial"/>
+          <w:sz w:val="24"/>
+          <w:szCs w:val="24"/>
+          <w:lang w:eastAsia="es-GT"/>
+        </w:rPr>
+      </w:pPr>
+    </w:p>
+    <w:p>
+      <w:pPr>
+        <w:spacing w:before="100" w:beforeAutospacing="1" w:after="100" w:afterAutospacing="1" w:line="240" w:lineRule="auto"/>
+        <w:rPr>
+          <w:rFonts w:ascii="Arial" w:eastAsia="Times New Roman" w:hAnsi="Arial" w:cs="Arial"/>
+          <w:sz w:val="24"/>
+          <w:szCs w:val="24"/>
+          <w:lang w:eastAsia="es-GT"/>
+        </w:rPr>
+      </w:pPr>
+    </w:p>
+    <w:p>
+      <w:pPr>
+        <w:spacing w:before="100" w:beforeAutospacing="1" w:after="100" w:afterAutospacing="1" w:line="240" w:lineRule="auto"/>
+        <w:rPr>
+          <w:rFonts w:ascii="Arial" w:eastAsia="Times New Roman" w:hAnsi="Arial" w:cs="Arial"/>
+          <w:sz w:val="24"/>
+          <w:szCs w:val="24"/>
+          <w:lang w:eastAsia="es-GT"/>
+        </w:rPr>
+      </w:pPr>
+    </w:p>
+    <w:p>
+      <w:pPr>
+        <w:spacing w:before="100" w:beforeAutospacing="1" w:after="100" w:afterAutospacing="1" w:line="240" w:lineRule="auto"/>
+        <w:rPr>
+          <w:rFonts w:ascii="Arial" w:eastAsia="Times New Roman" w:hAnsi="Arial" w:cs="Arial"/>
+          <w:sz w:val="24"/>
+          <w:szCs w:val="24"/>
+          <w:lang w:eastAsia="es-GT"/>
+        </w:rPr>
+      </w:pPr>
+    </w:p>
+    <w:p>
+      <w:pPr>
+        <w:spacing w:before="100" w:beforeAutospacing="1" w:after="100" w:afterAutospacing="1" w:line="240" w:lineRule="auto"/>
+        <w:rPr>
+          <w:rFonts w:ascii="Arial" w:eastAsia="Times New Roman" w:hAnsi="Arial" w:cs="Arial"/>
+          <w:sz w:val="24"/>
+          <w:szCs w:val="24"/>
+          <w:lang w:eastAsia="es-GT"/>
+        </w:rPr>
+      </w:pPr>
+    </w:p>
+    <w:p>
+      <w:pPr>
+        <w:spacing w:before="100" w:beforeAutospacing="1" w:after="100" w:afterAutospacing="1" w:line="240" w:lineRule="auto"/>
+        <w:rPr>
+          <w:rFonts w:ascii="Arial" w:eastAsia="Times New Roman" w:hAnsi="Arial" w:cs="Arial"/>
+          <w:sz w:val="24"/>
+          <w:szCs w:val="24"/>
+          <w:lang w:eastAsia="es-GT"/>
+        </w:rPr>
+      </w:pPr>
+    </w:p>
+    <w:p>
+      <w:pPr>
+        <w:spacing w:before="100" w:beforeAutospacing="1" w:after="100" w:afterAutospacing="1" w:line="240" w:lineRule="auto"/>
+        <w:rPr>
+          <w:rFonts w:ascii="Arial" w:eastAsia="Times New Roman" w:hAnsi="Arial" w:cs="Arial"/>
+          <w:sz w:val="24"/>
+          <w:szCs w:val="24"/>
+          <w:lang w:eastAsia="es-GT"/>
+        </w:rPr>
+      </w:pPr>
+    </w:p>
+    <w:p>
+      <w:pPr>
+        <w:spacing w:before="100" w:beforeAutospacing="1" w:after="100" w:afterAutospacing="1" w:line="240" w:lineRule="auto"/>
+        <w:rPr>
+          <w:rFonts w:ascii="Arial" w:eastAsia="Times New Roman" w:hAnsi="Arial" w:cs="Arial"/>
+          <w:sz w:val="24"/>
+          <w:szCs w:val="24"/>
+          <w:lang w:eastAsia="es-GT"/>
+        </w:rPr>
+      </w:pPr>
+    </w:p>
+    <w:p>
+      <w:pPr>
+        <w:spacing w:before="100" w:beforeAutospacing="1" w:after="100" w:afterAutospacing="1" w:line="240" w:lineRule="auto"/>
+        <w:rPr>
+          <w:rFonts w:ascii="Arial" w:eastAsia="Times New Roman" w:hAnsi="Arial" w:cs="Arial"/>
+          <w:sz w:val="24"/>
+          <w:szCs w:val="24"/>
+          <w:lang w:eastAsia="es-GT"/>
+        </w:rPr>
+      </w:pPr>
+    </w:p>
+    <w:p>
+      <w:pPr>
+        <w:spacing w:before="100" w:beforeAutospacing="1" w:after="100" w:afterAutospacing="1" w:line="240" w:lineRule="auto"/>
+        <w:rPr>
+          <w:rFonts w:ascii="Arial" w:eastAsia="Times New Roman" w:hAnsi="Arial" w:cs="Arial"/>
+          <w:sz w:val="24"/>
+          <w:szCs w:val="24"/>
+          <w:lang w:eastAsia="es-GT"/>
+        </w:rPr>
+      </w:pPr>
+    </w:p>
+    <w:p>
+      <w:pPr>
+        <w:spacing w:before="100" w:beforeAutospacing="1" w:after="100" w:afterAutospacing="1" w:line="240" w:lineRule="auto"/>
+        <w:rPr>
+          <w:rFonts w:ascii="Arial" w:eastAsia="Times New Roman" w:hAnsi="Arial" w:cs="Arial"/>
+          <w:sz w:val="24"/>
+          <w:szCs w:val="24"/>
+          <w:lang w:eastAsia="es-GT"/>
+        </w:rPr>
+      </w:pPr>
+    </w:p>
+    <w:p>
+      <w:pPr>
+        <w:spacing w:before="100" w:beforeAutospacing="1" w:after="100" w:afterAutospacing="1" w:line="240" w:lineRule="auto"/>
+        <w:rPr>
+          <w:rFonts w:ascii="Arial" w:eastAsia="Times New Roman" w:hAnsi="Arial" w:cs="Arial"/>
+          <w:sz w:val="24"/>
+          <w:szCs w:val="24"/>
+          <w:lang w:eastAsia="es-GT"/>
+        </w:rPr>
+      </w:pPr>
+    </w:p>
+    <w:p>
+      <w:pPr>
+        <w:spacing w:before="100" w:beforeAutospacing="1" w:after="100" w:afterAutospacing="1" w:line="240" w:lineRule="auto"/>
+        <w:rPr>
+          <w:rFonts w:ascii="Arial" w:eastAsia="Times New Roman" w:hAnsi="Arial" w:cs="Arial"/>
+          <w:sz w:val="24"/>
+          <w:szCs w:val="24"/>
+          <w:lang w:eastAsia="es-GT"/>
+        </w:rPr>
+      </w:pPr>
+    </w:p>
+    <w:p>
+      <w:pPr>
+        <w:spacing w:before="100" w:beforeAutospacing="1" w:after="100" w:afterAutospacing="1" w:line="240" w:lineRule="auto"/>
+        <w:rPr>
+          <w:rFonts w:ascii="Arial" w:eastAsia="Times New Roman" w:hAnsi="Arial" w:cs="Arial"/>
+          <w:sz w:val="24"/>
+          <w:szCs w:val="24"/>
+          <w:lang w:eastAsia="es-GT"/>
+        </w:rPr>
+      </w:pPr>
+    </w:p>
+    <w:p>
+      <w:pPr>
+        <w:spacing w:before="100" w:beforeAutospacing="1" w:after="100" w:afterAutospacing="1" w:line="240" w:lineRule="auto"/>
+        <w:rPr>
+          <w:rFonts w:ascii="Arial" w:eastAsia="Times New Roman" w:hAnsi="Arial" w:cs="Arial"/>
+          <w:sz w:val="24"/>
+          <w:szCs w:val="24"/>
+          <w:lang w:eastAsia="es-GT"/>
+        </w:rPr>
+      </w:pPr>
+    </w:p>
+    <w:p>
+      <w:pPr>
+        <w:spacing w:before="100" w:beforeAutospacing="1" w:after="100" w:afterAutospacing="1" w:line="240" w:lineRule="auto"/>
+        <w:rPr>
+          <w:rFonts w:ascii="Arial" w:eastAsia="Times New Roman" w:hAnsi="Arial" w:cs="Arial"/>
+          <w:sz w:val="24"/>
+          <w:szCs w:val="24"/>
+          <w:lang w:eastAsia="es-GT"/>
+        </w:rPr>
+      </w:pPr>
+    </w:p>
+    <w:p>
+      <w:pPr>
+        <w:spacing w:before="100" w:beforeAutospacing="1" w:after="100" w:afterAutospacing="1" w:line="240" w:lineRule="auto"/>
+        <w:rPr>
+          <w:rFonts w:ascii="Arial" w:eastAsia="Times New Roman" w:hAnsi="Arial" w:cs="Arial"/>
+          <w:sz w:val="24"/>
+          <w:szCs w:val="24"/>
+          <w:lang w:eastAsia="es-GT"/>
+        </w:rPr>
+      </w:pPr>
+    </w:p>
+    <w:p>
+      <w:pPr>
+        <w:spacing w:before="100" w:beforeAutospacing="1" w:after="100" w:afterAutospacing="1" w:line="240" w:lineRule="auto"/>
+        <w:rPr>
+          <w:rFonts w:ascii="Arial" w:eastAsia="Times New Roman" w:hAnsi="Arial" w:cs="Arial"/>
+          <w:sz w:val="24"/>
+          <w:szCs w:val="24"/>
+          <w:lang w:eastAsia="es-GT"/>
+        </w:rPr>
+      </w:pPr>
+    </w:p>
+    <w:p>
+      <w:pPr>
+        <w:spacing w:before="100" w:beforeAutospacing="1" w:after="100" w:afterAutospacing="1" w:line="240" w:lineRule="auto"/>
+        <w:rPr>
+          <w:rFonts w:ascii="Arial" w:eastAsia="Times New Roman" w:hAnsi="Arial" w:cs="Arial"/>
+          <w:sz w:val="24"/>
+          <w:szCs w:val="24"/>
+          <w:lang w:eastAsia="es-GT"/>
+        </w:rPr>
+      </w:pPr>
+    </w:p>
+    <w:p>
+      <w:pPr>
+        <w:spacing w:before="100" w:beforeAutospacing="1" w:after="100" w:afterAutospacing="1" w:line="240" w:lineRule="auto"/>
+        <w:rPr>
+          <w:rFonts w:ascii="Arial" w:eastAsia="Times New Roman" w:hAnsi="Arial" w:cs="Arial"/>
+          <w:sz w:val="24"/>
+          <w:szCs w:val="24"/>
+          <w:lang w:eastAsia="es-GT"/>
+        </w:rPr>
+      </w:pPr>
+    </w:p>
+    <w:p>
+      <w:pPr>
+        <w:spacing w:before="100" w:beforeAutospacing="1" w:after="100" w:afterAutospacing="1" w:line="240" w:lineRule="auto"/>
+        <w:rPr>
+          <w:rFonts w:ascii="Arial" w:eastAsia="Times New Roman" w:hAnsi="Arial" w:cs="Arial"/>
+          <w:sz w:val="24"/>
+          <w:szCs w:val="24"/>
+          <w:lang w:eastAsia="es-GT"/>
+        </w:rPr>
+      </w:pPr>
+    </w:p>
+    <w:p>
+      <w:pPr>
+        <w:spacing w:before="100" w:beforeAutospacing="1" w:after="100" w:afterAutospacing="1" w:line="240" w:lineRule="auto"/>
+        <w:rPr>
+          <w:rFonts w:ascii="Arial" w:eastAsia="Times New Roman" w:hAnsi="Arial" w:cs="Arial"/>
+          <w:sz w:val="24"/>
+          <w:szCs w:val="24"/>
+          <w:lang w:eastAsia="es-GT"/>
+        </w:rPr>
+      </w:pPr>
+    </w:p>
+    <w:p>
+      <w:pPr>
+        <w:spacing w:before="100" w:beforeAutospacing="1" w:after="100" w:afterAutospacing="1" w:line="240" w:lineRule="auto"/>
+        <w:rPr>
+          <w:rFonts w:ascii="Arial" w:eastAsia="Times New Roman" w:hAnsi="Arial" w:cs="Arial"/>
+          <w:sz w:val="24"/>
+          <w:szCs w:val="24"/>
+          <w:lang w:eastAsia="es-GT"/>
+        </w:rPr>
+      </w:pPr>
+    </w:p>
+    <w:p>
+      <w:pPr>
+        <w:spacing w:before="100" w:beforeAutospacing="1" w:after="100" w:afterAutospacing="1" w:line="240" w:lineRule="auto"/>
+        <w:rPr>
+          <w:rFonts w:ascii="Arial" w:eastAsia="Times New Roman" w:hAnsi="Arial" w:cs="Arial"/>
+          <w:sz w:val="24"/>
+          <w:szCs w:val="24"/>
+          <w:lang w:eastAsia="es-GT"/>
+        </w:rPr>
+      </w:pPr>
+    </w:p>
+    <w:p>
+      <w:pPr>
+        <w:spacing w:before="100" w:beforeAutospacing="1" w:after="100" w:afterAutospacing="1" w:line="240" w:lineRule="auto"/>
+        <w:rPr>
+          <w:rFonts w:ascii="Arial" w:eastAsia="Times New Roman" w:hAnsi="Arial" w:cs="Arial"/>
+          <w:sz w:val="24"/>
+          <w:szCs w:val="24"/>
+          <w:lang w:eastAsia="es-GT"/>
+        </w:rPr>
+      </w:pPr>
+    </w:p>
+    <w:p>
+      <w:pPr>
+        <w:spacing w:before="100" w:beforeAutospacing="1" w:after="100" w:afterAutospacing="1" w:line="240" w:lineRule="auto"/>
+        <w:rPr>
+          <w:rFonts w:ascii="Arial" w:eastAsia="Times New Roman" w:hAnsi="Arial" w:cs="Arial"/>
+          <w:sz w:val="24"/>
+          <w:szCs w:val="24"/>
+          <w:lang w:eastAsia="es-GT"/>
+        </w:rPr>
+      </w:pPr>
+    </w:p>
+    <w:p>
+      <w:pPr>
+        <w:spacing w:before="100" w:beforeAutospacing="1" w:after="100" w:afterAutospacing="1" w:line="240" w:lineRule="auto"/>
+        <w:rPr>
+          <w:rFonts w:ascii="Arial" w:eastAsia="Times New Roman" w:hAnsi="Arial" w:cs="Arial"/>
+          <w:sz w:val="24"/>
+          <w:szCs w:val="24"/>
+          <w:lang w:eastAsia="es-GT"/>
+        </w:rPr>
+      </w:pPr>
+    </w:p>
+    <w:p>
+      <w:pPr>
+        <w:spacing w:before="100" w:beforeAutospacing="1" w:after="100" w:afterAutospacing="1" w:line="240" w:lineRule="auto"/>
+        <w:rPr>
+          <w:rFonts w:ascii="Arial" w:eastAsia="Times New Roman" w:hAnsi="Arial" w:cs="Arial"/>
+          <w:sz w:val="24"/>
+          <w:szCs w:val="24"/>
+          <w:lang w:eastAsia="es-GT"/>
+        </w:rPr>
+      </w:pPr>
+    </w:p>
+    <w:p>
+      <w:pPr>
+        <w:spacing w:before="100" w:beforeAutospacing="1" w:after="100" w:afterAutospacing="1" w:line="240" w:lineRule="auto"/>
+        <w:rPr>
+          <w:rFonts w:ascii="Arial" w:eastAsia="Times New Roman" w:hAnsi="Arial" w:cs="Arial"/>
+          <w:sz w:val="24"/>
+          <w:szCs w:val="24"/>
+          <w:lang w:eastAsia="es-GT"/>
+        </w:rPr>
+      </w:pPr>
+    </w:p>
+    <w:p>
+      <w:pPr>
+        <w:spacing w:before="100" w:beforeAutospacing="1" w:after="100" w:afterAutospacing="1" w:line="240" w:lineRule="auto"/>
+        <w:rPr>
+          <w:rFonts w:ascii="Arial" w:eastAsia="Times New Roman" w:hAnsi="Arial" w:cs="Arial"/>
+          <w:sz w:val="24"/>
+          <w:szCs w:val="24"/>
+          <w:lang w:eastAsia="es-GT"/>
+        </w:rPr>
+      </w:pPr>
+    </w:p>
+    <w:p>
+      <w:pPr>
+        <w:spacing w:before="100" w:beforeAutospacing="1" w:after="100" w:afterAutospacing="1" w:line="240" w:lineRule="auto"/>
+        <w:rPr>
+          <w:rFonts w:ascii="Arial" w:eastAsia="Times New Roman" w:hAnsi="Arial" w:cs="Arial"/>
+          <w:sz w:val="24"/>
+          <w:szCs w:val="24"/>
+          <w:lang w:eastAsia="es-GT"/>
+        </w:rPr>
+      </w:pPr>
+    </w:p>
+    <w:p>
+      <w:pPr>
+        <w:spacing w:before="100" w:beforeAutospacing="1" w:after="100" w:afterAutospacing="1" w:line="240" w:lineRule="auto"/>
+        <w:rPr>
+          <w:rFonts w:ascii="Arial" w:eastAsia="Times New Roman" w:hAnsi="Arial" w:cs="Arial"/>
+          <w:sz w:val="24"/>
+          <w:szCs w:val="24"/>
+          <w:lang w:eastAsia="es-GT"/>
+        </w:rPr>
+      </w:pPr>
+    </w:p>
+    <w:p>
+      <w:pPr>
+        <w:spacing w:before="100" w:beforeAutospacing="1" w:after="100" w:afterAutospacing="1" w:line="240" w:lineRule="auto"/>
+        <w:rPr>
+          <w:rFonts w:ascii="Arial" w:eastAsia="Times New Roman" w:hAnsi="Arial" w:cs="Arial"/>
+          <w:sz w:val="24"/>
+          <w:szCs w:val="24"/>
+          <w:lang w:eastAsia="es-GT"/>
+        </w:rPr>
+      </w:pPr>
+    </w:p>
+    <w:p>
+      <w:pPr>
+        <w:spacing w:before="100" w:beforeAutospacing="1" w:after="100" w:afterAutospacing="1" w:line="240" w:lineRule="auto"/>
+        <w:rPr>
+          <w:rFonts w:ascii="Arial" w:eastAsia="Times New Roman" w:hAnsi="Arial" w:cs="Arial"/>
+          <w:sz w:val="24"/>
+          <w:szCs w:val="24"/>
+          <w:lang w:eastAsia="es-GT"/>
+        </w:rPr>
+      </w:pPr>
+    </w:p>
+    <w:p>
+      <w:pPr>
+        <w:spacing w:before="100" w:beforeAutospacing="1" w:after="100" w:afterAutospacing="1" w:line="240" w:lineRule="auto"/>
+        <w:rPr>
+          <w:rFonts w:ascii="Arial" w:eastAsia="Times New Roman" w:hAnsi="Arial" w:cs="Arial"/>
+          <w:sz w:val="24"/>
+          <w:szCs w:val="24"/>
+          <w:lang w:eastAsia="es-GT"/>
+        </w:rPr>
+      </w:pPr>
+    </w:p>
+    <w:p>
+      <w:pPr>
+        <w:spacing w:before="100" w:beforeAutospacing="1" w:after="100" w:afterAutospacing="1" w:line="240" w:lineRule="auto"/>
+        <w:rPr>
+          <w:rFonts w:ascii="Arial" w:eastAsia="Times New Roman" w:hAnsi="Arial" w:cs="Arial"/>
+          <w:sz w:val="24"/>
+          <w:szCs w:val="24"/>
+          <w:lang w:eastAsia="es-GT"/>
+        </w:rPr>
+      </w:pPr>
+    </w:p>
+    <w:p>
+      <w:pPr>
+        <w:spacing w:before="100" w:beforeAutospacing="1" w:after="100" w:afterAutospacing="1" w:line="240" w:lineRule="auto"/>
+        <w:rPr>
+          <w:rFonts w:ascii="Arial" w:eastAsia="Times New Roman" w:hAnsi="Arial" w:cs="Arial"/>
+          <w:sz w:val="24"/>
+          <w:szCs w:val="24"/>
+          <w:lang w:eastAsia="es-GT"/>
+        </w:rPr>
+      </w:pPr>
+    </w:p>
+    <w:p>
+      <w:pPr>
+        <w:spacing w:before="100" w:beforeAutospacing="1" w:after="100" w:afterAutospacing="1" w:line="240" w:lineRule="auto"/>
+        <w:rPr>
+          <w:rFonts w:ascii="Arial" w:eastAsia="Times New Roman" w:hAnsi="Arial" w:cs="Arial"/>
+          <w:sz w:val="24"/>
+          <w:szCs w:val="24"/>
+          <w:lang w:eastAsia="es-GT"/>
+        </w:rPr>
+      </w:pPr>
+    </w:p>
+    <w:p>
+      <w:pPr>
+        <w:spacing w:before="100" w:beforeAutospacing="1" w:after="100" w:afterAutospacing="1" w:line="240" w:lineRule="auto"/>
+        <w:rPr>
+          <w:rFonts w:ascii="Arial" w:eastAsia="Times New Roman" w:hAnsi="Arial" w:cs="Arial"/>
+          <w:sz w:val="24"/>
+          <w:szCs w:val="24"/>
+          <w:lang w:eastAsia="es-GT"/>
+        </w:rPr>
+      </w:pPr>
+    </w:p>
+    <w:p>
+      <w:pPr>
+        <w:spacing w:before="100" w:beforeAutospacing="1" w:after="100" w:afterAutospacing="1" w:line="240" w:lineRule="auto"/>
+        <w:rPr>
+          <w:rFonts w:ascii="Arial" w:eastAsia="Times New Roman" w:hAnsi="Arial" w:cs="Arial"/>
+          <w:sz w:val="24"/>
+          <w:szCs w:val="24"/>
+          <w:lang w:eastAsia="es-GT"/>
+        </w:rPr>
+      </w:pPr>
+    </w:p>
+    <w:p>
+      <w:pPr>
+        <w:spacing w:before="100" w:beforeAutospacing="1" w:after="100" w:afterAutospacing="1" w:line="240" w:lineRule="auto"/>
+        <w:rPr>
+          <w:rFonts w:ascii="Arial" w:eastAsia="Times New Roman" w:hAnsi="Arial" w:cs="Arial"/>
+          <w:sz w:val="24"/>
+          <w:szCs w:val="24"/>
+          <w:lang w:eastAsia="es-GT"/>
+        </w:rPr>
+      </w:pPr>
+    </w:p>
+    <w:p>
+      <w:pPr>
+        <w:spacing w:before="100" w:beforeAutospacing="1" w:after="100" w:afterAutospacing="1" w:line="240" w:lineRule="auto"/>
+        <w:rPr>
+          <w:rFonts w:ascii="Arial" w:eastAsia="Times New Roman" w:hAnsi="Arial" w:cs="Arial"/>
+          <w:sz w:val="24"/>
+          <w:szCs w:val="24"/>
+          <w:lang w:eastAsia="es-GT"/>
+        </w:rPr>
+      </w:pPr>
+    </w:p>
+    <w:p>
+      <w:pPr>
+        <w:spacing w:before="100" w:beforeAutospacing="1" w:after="100" w:afterAutospacing="1" w:line="240" w:lineRule="auto"/>
+        <w:rPr>
+          <w:rFonts w:ascii="Arial" w:eastAsia="Times New Roman" w:hAnsi="Arial" w:cs="Arial"/>
+          <w:sz w:val="24"/>
+          <w:szCs w:val="24"/>
+          <w:lang w:eastAsia="es-GT"/>
+        </w:rPr>
+      </w:pPr>
+    </w:p>
+    <w:p>
+      <w:pPr>
+        <w:spacing w:before="100" w:beforeAutospacing="1" w:after="100" w:afterAutospacing="1" w:line="240" w:lineRule="auto"/>
+        <w:rPr>
+          <w:rFonts w:ascii="Arial" w:eastAsia="Times New Roman" w:hAnsi="Arial" w:cs="Arial"/>
+          <w:sz w:val="24"/>
+          <w:szCs w:val="24"/>
+          <w:lang w:eastAsia="es-GT"/>
+        </w:rPr>
+      </w:pPr>
+    </w:p>
+    <w:p>
+      <w:pPr>
+        <w:spacing w:before="100" w:beforeAutospacing="1" w:after="100" w:afterAutospacing="1" w:line="240" w:lineRule="auto"/>
+        <w:rPr>
+          <w:rFonts w:ascii="Arial" w:eastAsia="Times New Roman" w:hAnsi="Arial" w:cs="Arial"/>
+          <w:sz w:val="24"/>
+          <w:szCs w:val="24"/>
+          <w:lang w:eastAsia="es-GT"/>
+        </w:rPr>
+      </w:pPr>
+    </w:p>
+    <w:p>
+      <w:pPr>
+        <w:spacing w:before="100" w:beforeAutospacing="1" w:after="100" w:afterAutospacing="1" w:line="240" w:lineRule="auto"/>
+        <w:rPr>
+          <w:rFonts w:ascii="Arial" w:eastAsia="Times New Roman" w:hAnsi="Arial" w:cs="Arial"/>
+          <w:sz w:val="24"/>
+          <w:szCs w:val="24"/>
+          <w:lang w:eastAsia="es-GT"/>
+        </w:rPr>
+      </w:pPr>
+    </w:p>
+    <w:p>
+      <w:pPr>
+        <w:spacing w:before="100" w:beforeAutospacing="1" w:after="100" w:afterAutospacing="1" w:line="240" w:lineRule="auto"/>
+        <w:rPr>
+          <w:rFonts w:ascii="Arial" w:eastAsia="Times New Roman" w:hAnsi="Arial" w:cs="Arial"/>
+          <w:sz w:val="24"/>
+          <w:szCs w:val="24"/>
+          <w:lang w:eastAsia="es-GT"/>
+        </w:rPr>
+      </w:pPr>
+    </w:p>
+    <w:p>
+      <w:pPr>
+        <w:spacing w:before="100" w:beforeAutospacing="1" w:after="100" w:afterAutospacing="1" w:line="240" w:lineRule="auto"/>
+        <w:rPr>
+          <w:rFonts w:ascii="Arial" w:eastAsia="Times New Roman" w:hAnsi="Arial" w:cs="Arial"/>
+          <w:sz w:val="24"/>
+          <w:szCs w:val="24"/>
+          <w:lang w:eastAsia="es-GT"/>
+        </w:rPr>
+      </w:pPr>
+    </w:p>
+    <w:p>
+      <w:pPr>
+        <w:spacing w:before="100" w:beforeAutospacing="1" w:after="100" w:afterAutospacing="1" w:line="240" w:lineRule="auto"/>
+        <w:rPr>
+          <w:rFonts w:ascii="Arial" w:eastAsia="Times New Roman" w:hAnsi="Arial" w:cs="Arial"/>
+          <w:sz w:val="24"/>
+          <w:szCs w:val="24"/>
+          <w:lang w:eastAsia="es-GT"/>
+        </w:rPr>
+      </w:pPr>
+    </w:p>
+    <w:p>
+      <w:pPr>
+        <w:spacing w:before="100" w:beforeAutospacing="1" w:after="100" w:afterAutospacing="1" w:line="240" w:lineRule="auto"/>
+        <w:rPr>
+          <w:rFonts w:ascii="Arial" w:eastAsia="Times New Roman" w:hAnsi="Arial" w:cs="Arial"/>
+          <w:sz w:val="24"/>
+          <w:szCs w:val="24"/>
+          <w:lang w:eastAsia="es-GT"/>
+        </w:rPr>
+      </w:pPr>
+    </w:p>
+    <w:p>
+      <w:pPr>
+        <w:spacing w:before="100" w:beforeAutospacing="1" w:after="100" w:afterAutospacing="1" w:line="240" w:lineRule="auto"/>
+        <w:rPr>
+          <w:rFonts w:ascii="Arial" w:eastAsia="Times New Roman" w:hAnsi="Arial" w:cs="Arial"/>
+          <w:sz w:val="24"/>
+          <w:szCs w:val="24"/>
+          <w:lang w:eastAsia="es-GT"/>
+        </w:rPr>
+      </w:pPr>
+    </w:p>
+    <w:p>
+      <w:pPr>
+        <w:spacing w:before="100" w:beforeAutospacing="1" w:after="100" w:afterAutospacing="1" w:line="240" w:lineRule="auto"/>
+        <w:rPr>
+          <w:rFonts w:ascii="Arial" w:eastAsia="Times New Roman" w:hAnsi="Arial" w:cs="Arial"/>
+          <w:sz w:val="24"/>
+          <w:szCs w:val="24"/>
+          <w:lang w:eastAsia="es-GT"/>
+        </w:rPr>
+      </w:pPr>
+    </w:p>
+    <w:p>
+      <w:pPr>
+        <w:spacing w:before="100" w:beforeAutospacing="1" w:after="100" w:afterAutospacing="1" w:line="240" w:lineRule="auto"/>
+        <w:rPr>
+          <w:rFonts w:ascii="Arial" w:eastAsia="Times New Roman" w:hAnsi="Arial" w:cs="Arial"/>
+          <w:sz w:val="24"/>
+          <w:szCs w:val="24"/>
+          <w:lang w:eastAsia="es-GT"/>
+        </w:rPr>
+      </w:pPr>
+    </w:p>
+    <w:p>
+      <w:pPr>
+        <w:spacing w:before="100" w:beforeAutospacing="1" w:after="100" w:afterAutospacing="1" w:line="240" w:lineRule="auto"/>
+        <w:rPr>
+          <w:rFonts w:ascii="Arial" w:eastAsia="Times New Roman" w:hAnsi="Arial" w:cs="Arial"/>
+          <w:sz w:val="24"/>
+          <w:szCs w:val="24"/>
+          <w:lang w:eastAsia="es-GT"/>
+        </w:rPr>
+      </w:pPr>
+    </w:p>
+    <w:p>
+      <w:pPr>
+        <w:spacing w:before="100" w:beforeAutospacing="1" w:after="100" w:afterAutospacing="1" w:line="240" w:lineRule="auto"/>
+        <w:rPr>
+          <w:rFonts w:ascii="Arial" w:eastAsia="Times New Roman" w:hAnsi="Arial" w:cs="Arial"/>
+          <w:sz w:val="24"/>
+          <w:szCs w:val="24"/>
+          <w:lang w:eastAsia="es-GT"/>
+        </w:rPr>
+      </w:pPr>
+    </w:p>
+    <w:p>
+      <w:pPr>
+        <w:spacing w:before="100" w:beforeAutospacing="1" w:after="100" w:afterAutospacing="1" w:line="240" w:lineRule="auto"/>
+        <w:rPr>
+          <w:rFonts w:ascii="Arial" w:eastAsia="Times New Roman" w:hAnsi="Arial" w:cs="Arial"/>
+          <w:sz w:val="24"/>
+          <w:szCs w:val="24"/>
+          <w:lang w:eastAsia="es-GT"/>
+        </w:rPr>
+      </w:pPr>
+    </w:p>
+    <w:p>
+      <w:pPr>
+        <w:spacing w:before="100" w:beforeAutospacing="1" w:after="100" w:afterAutospacing="1" w:line="240" w:lineRule="auto"/>
+        <w:rPr>
+          <w:rFonts w:ascii="Arial" w:eastAsia="Times New Roman" w:hAnsi="Arial" w:cs="Arial"/>
+          <w:sz w:val="24"/>
+          <w:szCs w:val="24"/>
+          <w:lang w:eastAsia="es-GT"/>
+        </w:rPr>
+      </w:pPr>
+    </w:p>
+    <w:p>
+      <w:pPr>
+        <w:spacing w:before="100" w:beforeAutospacing="1" w:after="100" w:afterAutospacing="1" w:line="240" w:lineRule="auto"/>
+        <w:rPr>
+          <w:rFonts w:ascii="Arial" w:eastAsia="Times New Roman" w:hAnsi="Arial" w:cs="Arial"/>
+          <w:sz w:val="24"/>
+          <w:szCs w:val="24"/>
+          <w:lang w:eastAsia="es-GT"/>
+        </w:rPr>
+      </w:pPr>
+    </w:p>
+    <w:p>
+      <w:pPr>
+        <w:spacing w:before="100" w:beforeAutospacing="1" w:after="100" w:afterAutospacing="1" w:line="240" w:lineRule="auto"/>
+        <w:rPr>
+          <w:rFonts w:ascii="Arial" w:eastAsia="Times New Roman" w:hAnsi="Arial" w:cs="Arial"/>
+          <w:sz w:val="24"/>
+          <w:szCs w:val="24"/>
+          <w:lang w:eastAsia="es-GT"/>
+        </w:rPr>
+      </w:pPr>
+    </w:p>
+    <w:p>
+      <w:pPr>
+        <w:spacing w:before="100" w:beforeAutospacing="1" w:after="100" w:afterAutospacing="1" w:line="240" w:lineRule="auto"/>
+        <w:rPr>
+          <w:rFonts w:ascii="Arial" w:eastAsia="Times New Roman" w:hAnsi="Arial" w:cs="Arial"/>
+          <w:sz w:val="24"/>
+          <w:szCs w:val="24"/>
+          <w:lang w:eastAsia="es-GT"/>
+        </w:rPr>
+      </w:pPr>
+    </w:p>
+    <w:p>
+      <w:pPr>
+        <w:spacing w:before="100" w:beforeAutospacing="1" w:after="100" w:afterAutospacing="1" w:line="240" w:lineRule="auto"/>
+        <w:rPr>
+          <w:rFonts w:ascii="Arial" w:eastAsia="Times New Roman" w:hAnsi="Arial" w:cs="Arial"/>
+          <w:sz w:val="24"/>
+          <w:szCs w:val="24"/>
+          <w:lang w:eastAsia="es-GT"/>
+        </w:rPr>
+      </w:pPr>
+    </w:p>
+    <w:p>
+      <w:pPr>
+        <w:spacing w:before="100" w:beforeAutospacing="1" w:after="100" w:afterAutospacing="1" w:line="240" w:lineRule="auto"/>
+        <w:rPr>
+          <w:rFonts w:ascii="Arial" w:eastAsia="Times New Roman" w:hAnsi="Arial" w:cs="Arial"/>
+          <w:sz w:val="24"/>
+          <w:szCs w:val="24"/>
+          <w:lang w:eastAsia="es-GT"/>
+        </w:rPr>
+      </w:pPr>
+    </w:p>
+    <w:p>
+      <w:pPr>
+        <w:spacing w:before="100" w:beforeAutospacing="1" w:after="100" w:afterAutospacing="1" w:line="240" w:lineRule="auto"/>
+        <w:rPr>
+          <w:rFonts w:ascii="Arial" w:eastAsia="Times New Roman" w:hAnsi="Arial" w:cs="Arial"/>
+          <w:sz w:val="24"/>
+          <w:szCs w:val="24"/>
+          <w:lang w:eastAsia="es-GT"/>
+        </w:rPr>
+      </w:pPr>
+    </w:p>
+    <w:p>
+      <w:pPr>
+        <w:spacing w:before="100" w:beforeAutospacing="1" w:after="100" w:afterAutospacing="1" w:line="240" w:lineRule="auto"/>
+        <w:rPr>
+          <w:rFonts w:ascii="Arial" w:eastAsia="Times New Roman" w:hAnsi="Arial" w:cs="Arial"/>
+          <w:sz w:val="24"/>
+          <w:szCs w:val="24"/>
+          <w:lang w:eastAsia="es-GT"/>
+        </w:rPr>
+      </w:pPr>
+    </w:p>
+    <w:p>
+      <w:pPr>
+        <w:spacing w:before="100" w:beforeAutospacing="1" w:after="100" w:afterAutospacing="1" w:line="240" w:lineRule="auto"/>
+        <w:rPr>
+          <w:rFonts w:ascii="Arial" w:eastAsia="Times New Roman" w:hAnsi="Arial" w:cs="Arial"/>
+          <w:sz w:val="24"/>
+          <w:szCs w:val="24"/>
+          <w:lang w:eastAsia="es-GT"/>
+        </w:rPr>
+      </w:pPr>
+    </w:p>
+    <w:p>
+      <w:pPr>
+        <w:spacing w:before="100" w:beforeAutospacing="1" w:after="100" w:afterAutospacing="1" w:line="240" w:lineRule="auto"/>
+        <w:rPr>
+          <w:rFonts w:ascii="Arial" w:eastAsia="Times New Roman" w:hAnsi="Arial" w:cs="Arial"/>
+          <w:sz w:val="24"/>
+          <w:szCs w:val="24"/>
+          <w:lang w:eastAsia="es-GT"/>
+        </w:rPr>
+      </w:pPr>
+    </w:p>
+    <w:p>
+      <w:pPr>
+        <w:spacing w:before="100" w:beforeAutospacing="1" w:after="100" w:afterAutospacing="1" w:line="240" w:lineRule="auto"/>
+        <w:rPr>
+          <w:rFonts w:ascii="Arial" w:eastAsia="Times New Roman" w:hAnsi="Arial" w:cs="Arial"/>
+          <w:sz w:val="24"/>
+          <w:szCs w:val="24"/>
+          <w:lang w:eastAsia="es-GT"/>
+        </w:rPr>
+      </w:pPr>
+    </w:p>
+    <w:p>
+      <w:pPr>
+        <w:spacing w:before="100" w:beforeAutospacing="1" w:after="100" w:afterAutospacing="1" w:line="240" w:lineRule="auto"/>
+        <w:rPr>
+          <w:rFonts w:ascii="Arial" w:eastAsia="Times New Roman" w:hAnsi="Arial" w:cs="Arial"/>
+          <w:sz w:val="24"/>
+          <w:szCs w:val="24"/>
+          <w:lang w:eastAsia="es-GT"/>
+        </w:rPr>
+      </w:pPr>
+    </w:p>
+    <w:p>
+      <w:pPr>
+        <w:spacing w:before="100" w:beforeAutospacing="1" w:after="100" w:afterAutospacing="1" w:line="240" w:lineRule="auto"/>
+        <w:rPr>
+          <w:rFonts w:ascii="Arial" w:eastAsia="Times New Roman" w:hAnsi="Arial" w:cs="Arial"/>
+          <w:sz w:val="24"/>
+          <w:szCs w:val="24"/>
+          <w:lang w:eastAsia="es-GT"/>
+        </w:rPr>
+      </w:pPr>
+    </w:p>
+    <w:p>
+      <w:pPr>
+        <w:spacing w:before="100" w:beforeAutospacing="1" w:after="100" w:afterAutospacing="1" w:line="240" w:lineRule="auto"/>
+        <w:rPr>
+          <w:rFonts w:ascii="Arial" w:eastAsia="Times New Roman" w:hAnsi="Arial" w:cs="Arial"/>
+          <w:sz w:val="24"/>
+          <w:szCs w:val="24"/>
+          <w:lang w:eastAsia="es-GT"/>
+        </w:rPr>
+      </w:pPr>
+    </w:p>
+    <w:p>
+      <w:pPr>
+        <w:spacing w:before="100" w:beforeAutospacing="1" w:after="100" w:afterAutospacing="1" w:line="240" w:lineRule="auto"/>
+        <w:rPr>
+          <w:rFonts w:ascii="Arial" w:eastAsia="Times New Roman" w:hAnsi="Arial" w:cs="Arial"/>
+          <w:sz w:val="24"/>
+          <w:szCs w:val="24"/>
+          <w:lang w:eastAsia="es-GT"/>
+        </w:rPr>
+      </w:pPr>
+    </w:p>
+    <w:p>
+      <w:pPr>
+        <w:spacing w:before="100" w:beforeAutospacing="1" w:after="100" w:afterAutospacing="1" w:line="240" w:lineRule="auto"/>
+        <w:rPr>
+          <w:rFonts w:ascii="Arial" w:eastAsia="Times New Roman" w:hAnsi="Arial" w:cs="Arial"/>
+          <w:sz w:val="24"/>
+          <w:szCs w:val="24"/>
+          <w:lang w:eastAsia="es-GT"/>
+        </w:rPr>
+      </w:pPr>
+    </w:p>
+    <w:p>
+      <w:pPr>
+        <w:spacing w:before="100" w:beforeAutospacing="1" w:after="100" w:afterAutospacing="1" w:line="240" w:lineRule="auto"/>
+        <w:rPr>
+          <w:rFonts w:ascii="Arial" w:eastAsia="Times New Roman" w:hAnsi="Arial" w:cs="Arial"/>
+          <w:sz w:val="24"/>
+          <w:szCs w:val="24"/>
+          <w:lang w:eastAsia="es-GT"/>
+        </w:rPr>
+      </w:pPr>
+    </w:p>
+    <w:p>
+      <w:pPr>
+        <w:spacing w:before="100" w:beforeAutospacing="1" w:after="100" w:afterAutospacing="1" w:line="240" w:lineRule="auto"/>
+        <w:rPr>
+          <w:rFonts w:ascii="Arial" w:eastAsia="Times New Roman" w:hAnsi="Arial" w:cs="Arial"/>
+          <w:sz w:val="24"/>
+          <w:szCs w:val="24"/>
+          <w:lang w:eastAsia="es-GT"/>
+        </w:rPr>
+      </w:pPr>
+    </w:p>
+    <w:p>
+      <w:pPr>
+        <w:spacing w:before="100" w:beforeAutospacing="1" w:after="100" w:afterAutospacing="1" w:line="240" w:lineRule="auto"/>
+        <w:rPr>
+          <w:rFonts w:ascii="Arial" w:eastAsia="Times New Roman" w:hAnsi="Arial" w:cs="Arial"/>
+          <w:sz w:val="24"/>
+          <w:szCs w:val="24"/>
+          <w:lang w:eastAsia="es-GT"/>
+        </w:rPr>
+      </w:pPr>
+    </w:p>
+    <w:p>
+      <w:pPr>
+        <w:spacing w:before="100" w:beforeAutospacing="1" w:after="100" w:afterAutospacing="1" w:line="240" w:lineRule="auto"/>
+        <w:rPr>
+          <w:rFonts w:ascii="Arial" w:eastAsia="Times New Roman" w:hAnsi="Arial" w:cs="Arial"/>
+          <w:sz w:val="24"/>
+          <w:szCs w:val="24"/>
+          <w:lang w:eastAsia="es-GT"/>
+        </w:rPr>
+      </w:pPr>
+    </w:p>
+    <w:p>
+      <w:pPr>
+        <w:spacing w:before="100" w:beforeAutospacing="1" w:after="100" w:afterAutospacing="1" w:line="240" w:lineRule="auto"/>
+        <w:rPr>
+          <w:rFonts w:ascii="Arial" w:eastAsia="Times New Roman" w:hAnsi="Arial" w:cs="Arial"/>
+          <w:sz w:val="24"/>
+          <w:szCs w:val="24"/>
+          <w:lang w:eastAsia="es-GT"/>
+        </w:rPr>
+      </w:pPr>
+    </w:p>
+    <w:p>
+      <w:pPr>
+        <w:spacing w:before="100" w:beforeAutospacing="1" w:after="100" w:afterAutospacing="1" w:line="240" w:lineRule="auto"/>
+        <w:rPr>
+          <w:rFonts w:ascii="Arial" w:eastAsia="Times New Roman" w:hAnsi="Arial" w:cs="Arial"/>
+          <w:sz w:val="24"/>
+          <w:szCs w:val="24"/>
+          <w:lang w:eastAsia="es-GT"/>
+        </w:rPr>
+      </w:pPr>
+    </w:p>
+    <w:p>
+      <w:pPr>
+        <w:spacing w:before="100" w:beforeAutospacing="1" w:after="100" w:afterAutospacing="1" w:line="240" w:lineRule="auto"/>
+        <w:rPr>
+          <w:rFonts w:ascii="Arial" w:eastAsia="Times New Roman" w:hAnsi="Arial" w:cs="Arial"/>
+          <w:sz w:val="24"/>
+          <w:szCs w:val="24"/>
+          <w:lang w:eastAsia="es-GT"/>
+        </w:rPr>
+      </w:pPr>
+    </w:p>
+    <w:p>
+      <w:pPr>
+        <w:spacing w:before="100" w:beforeAutospacing="1" w:after="100" w:afterAutospacing="1" w:line="240" w:lineRule="auto"/>
+        <w:rPr>
+          <w:rFonts w:ascii="Arial" w:eastAsia="Times New Roman" w:hAnsi="Arial" w:cs="Arial"/>
+          <w:sz w:val="24"/>
+          <w:szCs w:val="24"/>
+          <w:lang w:eastAsia="es-GT"/>
+        </w:rPr>
+      </w:pPr>
+    </w:p>
+    <w:p>
+      <w:pPr>
+        <w:spacing w:before="100" w:beforeAutospacing="1" w:after="100" w:afterAutospacing="1" w:line="240" w:lineRule="auto"/>
+        <w:rPr>
+          <w:rFonts w:ascii="Arial" w:eastAsia="Times New Roman" w:hAnsi="Arial" w:cs="Arial"/>
+          <w:sz w:val="24"/>
+          <w:szCs w:val="24"/>
+          <w:lang w:eastAsia="es-GT"/>
+        </w:rPr>
+      </w:pPr>
+    </w:p>
+    <w:p>
+      <w:pPr>
+        <w:spacing w:before="100" w:beforeAutospacing="1" w:after="100" w:afterAutospacing="1" w:line="240" w:lineRule="auto"/>
+        <w:rPr>
+          <w:rFonts w:ascii="Arial" w:eastAsia="Times New Roman" w:hAnsi="Arial" w:cs="Arial"/>
+          <w:sz w:val="24"/>
+          <w:szCs w:val="24"/>
+          <w:lang w:eastAsia="es-GT"/>
+        </w:rPr>
+      </w:pPr>
+    </w:p>
+    <w:p>
+      <w:pPr>
+        <w:spacing w:before="100" w:beforeAutospacing="1" w:after="100" w:afterAutospacing="1" w:line="240" w:lineRule="auto"/>
+        <w:rPr>
+          <w:rFonts w:ascii="Arial" w:eastAsia="Times New Roman" w:hAnsi="Arial" w:cs="Arial"/>
+          <w:sz w:val="24"/>
+          <w:szCs w:val="24"/>
+          <w:lang w:eastAsia="es-GT"/>
+        </w:rPr>
+      </w:pPr>
+    </w:p>
+    <w:p>
+      <w:pPr>
+        <w:spacing w:before="100" w:beforeAutospacing="1" w:after="100" w:afterAutospacing="1" w:line="240" w:lineRule="auto"/>
+        <w:rPr>
+          <w:rFonts w:ascii="Arial" w:eastAsia="Times New Roman" w:hAnsi="Arial" w:cs="Arial"/>
+          <w:sz w:val="24"/>
+          <w:szCs w:val="24"/>
+          <w:lang w:eastAsia="es-GT"/>
+        </w:rPr>
+      </w:pPr>
+    </w:p>
+    <w:p>
+      <w:pPr>
+        <w:spacing w:before="100" w:beforeAutospacing="1" w:after="100" w:afterAutospacing="1" w:line="240" w:lineRule="auto"/>
+        <w:rPr>
+          <w:rFonts w:ascii="Arial" w:eastAsia="Times New Roman" w:hAnsi="Arial" w:cs="Arial"/>
+          <w:sz w:val="24"/>
+          <w:szCs w:val="24"/>
+          <w:lang w:eastAsia="es-GT"/>
+        </w:rPr>
+      </w:pPr>
+    </w:p>
+    <w:p>
+      <w:pPr>
+        <w:spacing w:before="100" w:beforeAutospacing="1" w:after="100" w:afterAutospacing="1" w:line="240" w:lineRule="auto"/>
+        <w:rPr>
+          <w:rFonts w:ascii="Arial" w:eastAsia="Times New Roman" w:hAnsi="Arial" w:cs="Arial"/>
+          <w:sz w:val="24"/>
+          <w:szCs w:val="24"/>
+          <w:lang w:eastAsia="es-GT"/>
+        </w:rPr>
+      </w:pPr>
+    </w:p>
+    <w:p>
+      <w:pPr>
+        <w:spacing w:before="100" w:beforeAutospacing="1" w:after="100" w:afterAutospacing="1" w:line="240" w:lineRule="auto"/>
+        <w:rPr>
+          <w:rFonts w:ascii="Arial" w:eastAsia="Times New Roman" w:hAnsi="Arial" w:cs="Arial"/>
+          <w:sz w:val="24"/>
+          <w:szCs w:val="24"/>
+          <w:lang w:eastAsia="es-GT"/>
+        </w:rPr>
+      </w:pPr>
+    </w:p>
+    <w:p>
+      <w:pPr>
+        <w:spacing w:before="100" w:beforeAutospacing="1" w:after="100" w:afterAutospacing="1" w:line="240" w:lineRule="auto"/>
+        <w:rPr>
+          <w:rFonts w:ascii="Arial" w:eastAsia="Times New Roman" w:hAnsi="Arial" w:cs="Arial"/>
+          <w:sz w:val="24"/>
+          <w:szCs w:val="24"/>
+          <w:lang w:eastAsia="es-GT"/>
+        </w:rPr>
+      </w:pPr>
+    </w:p>
+    <w:p>
+      <w:pPr>
+        <w:spacing w:before="100" w:beforeAutospacing="1" w:after="100" w:afterAutospacing="1" w:line="240" w:lineRule="auto"/>
+        <w:rPr>
+          <w:rFonts w:ascii="Arial" w:eastAsia="Times New Roman" w:hAnsi="Arial" w:cs="Arial"/>
+          <w:sz w:val="24"/>
+          <w:szCs w:val="24"/>
+          <w:lang w:eastAsia="es-GT"/>
+        </w:rPr>
+      </w:pPr>
+    </w:p>
+    <w:p>
+      <w:pPr>
+        <w:spacing w:before="100" w:beforeAutospacing="1" w:after="100" w:afterAutospacing="1" w:line="240" w:lineRule="auto"/>
+        <w:rPr>
+          <w:rFonts w:ascii="Arial" w:eastAsia="Times New Roman" w:hAnsi="Arial" w:cs="Arial"/>
+          <w:sz w:val="24"/>
+          <w:szCs w:val="24"/>
+          <w:lang w:eastAsia="es-GT"/>
+        </w:rPr>
+      </w:pPr>
+    </w:p>
+    <w:p>
+      <w:pPr>
+        <w:spacing w:before="100" w:beforeAutospacing="1" w:after="100" w:afterAutospacing="1" w:line="240" w:lineRule="auto"/>
+        <w:rPr>
+          <w:rFonts w:ascii="Arial" w:eastAsia="Times New Roman" w:hAnsi="Arial" w:cs="Arial"/>
+          <w:sz w:val="24"/>
+          <w:szCs w:val="24"/>
+          <w:lang w:eastAsia="es-GT"/>
+        </w:rPr>
+      </w:pPr>
+    </w:p>
+    <w:p>
+      <w:pPr>
+        <w:spacing w:before="100" w:beforeAutospacing="1" w:after="100" w:afterAutospacing="1" w:line="240" w:lineRule="auto"/>
+        <w:rPr>
+          <w:rFonts w:ascii="Arial" w:eastAsia="Times New Roman" w:hAnsi="Arial" w:cs="Arial"/>
+          <w:sz w:val="24"/>
+          <w:szCs w:val="24"/>
+          <w:lang w:eastAsia="es-GT"/>
+        </w:rPr>
+      </w:pPr>
+    </w:p>
+    <w:p>
+      <w:pPr>
+        <w:spacing w:before="100" w:beforeAutospacing="1" w:after="100" w:afterAutospacing="1" w:line="240" w:lineRule="auto"/>
+        <w:rPr>
+          <w:rFonts w:ascii="Arial" w:eastAsia="Times New Roman" w:hAnsi="Arial" w:cs="Arial"/>
+          <w:sz w:val="24"/>
+          <w:szCs w:val="24"/>
+          <w:lang w:eastAsia="es-GT"/>
+        </w:rPr>
+      </w:pPr>
+    </w:p>
+    <w:p>
+      <w:pPr>
+        <w:spacing w:before="100" w:beforeAutospacing="1" w:after="100" w:afterAutospacing="1" w:line="240" w:lineRule="auto"/>
+        <w:rPr>
+          <w:rFonts w:ascii="Arial" w:eastAsia="Times New Roman" w:hAnsi="Arial" w:cs="Arial"/>
+          <w:sz w:val="24"/>
+          <w:szCs w:val="24"/>
+          <w:lang w:eastAsia="es-GT"/>
+        </w:rPr>
+      </w:pPr>
+    </w:p>
+    <w:p>
+      <w:pPr>
+        <w:spacing w:before="100" w:beforeAutospacing="1" w:after="100" w:afterAutospacing="1" w:line="240" w:lineRule="auto"/>
+        <w:rPr>
+          <w:rFonts w:ascii="Arial" w:eastAsia="Times New Roman" w:hAnsi="Arial" w:cs="Arial"/>
+          <w:sz w:val="24"/>
+          <w:szCs w:val="24"/>
+          <w:lang w:eastAsia="es-GT"/>
+        </w:rPr>
+      </w:pPr>
+    </w:p>
+    <w:p>
+      <w:pPr>
+        <w:spacing w:before="100" w:beforeAutospacing="1" w:after="100" w:afterAutospacing="1" w:line="240" w:lineRule="auto"/>
+        <w:rPr>
+          <w:rFonts w:ascii="Arial" w:eastAsia="Times New Roman" w:hAnsi="Arial" w:cs="Arial"/>
+          <w:sz w:val="24"/>
+          <w:szCs w:val="24"/>
+          <w:lang w:eastAsia="es-GT"/>
+        </w:rPr>
+      </w:pPr>
+    </w:p>
+    <w:p>
+      <w:pPr>
+        <w:spacing w:before="100" w:beforeAutospacing="1" w:after="100" w:afterAutospacing="1" w:line="240" w:lineRule="auto"/>
+        <w:rPr>
+          <w:rFonts w:ascii="Arial" w:eastAsia="Times New Roman" w:hAnsi="Arial" w:cs="Arial"/>
+          <w:sz w:val="24"/>
+          <w:szCs w:val="24"/>
+          <w:lang w:eastAsia="es-GT"/>
+        </w:rPr>
+      </w:pPr>
+    </w:p>
+    <w:p>
+      <w:pPr>
+        <w:spacing w:before="100" w:beforeAutospacing="1" w:after="100" w:afterAutospacing="1" w:line="240" w:lineRule="auto"/>
+        <w:rPr>
+          <w:rFonts w:ascii="Arial" w:eastAsia="Times New Roman" w:hAnsi="Arial" w:cs="Arial"/>
+          <w:sz w:val="24"/>
+          <w:szCs w:val="24"/>
+          <w:lang w:eastAsia="es-GT"/>
+        </w:rPr>
+      </w:pPr>
+    </w:p>
+    <w:p>
+      <w:pPr>
+        <w:spacing w:before="100" w:beforeAutospacing="1" w:after="100" w:afterAutospacing="1" w:line="240" w:lineRule="auto"/>
+        <w:rPr>
+          <w:rFonts w:ascii="Arial" w:eastAsia="Times New Roman" w:hAnsi="Arial" w:cs="Arial"/>
+          <w:sz w:val="24"/>
+          <w:szCs w:val="24"/>
+          <w:lang w:eastAsia="es-GT"/>
+        </w:rPr>
+      </w:pPr>
+    </w:p>
+    <w:p>
+      <w:pPr>
+        <w:spacing w:before="100" w:beforeAutospacing="1" w:after="100" w:afterAutospacing="1" w:line="240" w:lineRule="auto"/>
+        <w:rPr>
+          <w:rFonts w:ascii="Arial" w:eastAsia="Times New Roman" w:hAnsi="Arial" w:cs="Arial"/>
+          <w:sz w:val="24"/>
+          <w:szCs w:val="24"/>
+          <w:lang w:eastAsia="es-GT"/>
+        </w:rPr>
+      </w:pPr>
+    </w:p>
+    <w:p>
+      <w:pPr>
+        <w:spacing w:before="100" w:beforeAutospacing="1" w:after="100" w:afterAutospacing="1" w:line="240" w:lineRule="auto"/>
+        <w:rPr>
+          <w:rFonts w:ascii="Arial" w:eastAsia="Times New Roman" w:hAnsi="Arial" w:cs="Arial"/>
+          <w:sz w:val="24"/>
+          <w:szCs w:val="24"/>
+          <w:lang w:eastAsia="es-GT"/>
+        </w:rPr>
+      </w:pPr>
+    </w:p>
+    <w:p>
+      <w:pPr>
+        <w:spacing w:before="100" w:beforeAutospacing="1" w:after="100" w:afterAutospacing="1" w:line="240" w:lineRule="auto"/>
+        <w:rPr>
+          <w:rFonts w:ascii="Arial" w:eastAsia="Times New Roman" w:hAnsi="Arial" w:cs="Arial"/>
+          <w:sz w:val="24"/>
+          <w:szCs w:val="24"/>
+          <w:lang w:eastAsia="es-GT"/>
+        </w:rPr>
+      </w:pPr>
+    </w:p>
+    <w:p>
+      <w:pPr>
+        <w:spacing w:before="100" w:beforeAutospacing="1" w:after="100" w:afterAutospacing="1" w:line="240" w:lineRule="auto"/>
+        <w:rPr>
+          <w:rFonts w:ascii="Arial" w:eastAsia="Times New Roman" w:hAnsi="Arial" w:cs="Arial"/>
+          <w:sz w:val="24"/>
+          <w:szCs w:val="24"/>
+          <w:lang w:eastAsia="es-GT"/>
+        </w:rPr>
+      </w:pPr>
+    </w:p>
+    <w:p>
+      <w:pPr>
+        <w:spacing w:before="100" w:beforeAutospacing="1" w:after="100" w:afterAutospacing="1" w:line="240" w:lineRule="auto"/>
+        <w:rPr>
+          <w:rFonts w:ascii="Arial" w:eastAsia="Times New Roman" w:hAnsi="Arial" w:cs="Arial"/>
+          <w:sz w:val="24"/>
+          <w:szCs w:val="24"/>
+          <w:lang w:eastAsia="es-GT"/>
+        </w:rPr>
+      </w:pPr>
+    </w:p>
+    <w:p>
+      <w:pPr>
+        <w:spacing w:before="100" w:beforeAutospacing="1" w:after="100" w:afterAutospacing="1" w:line="240" w:lineRule="auto"/>
+        <w:rPr>
+          <w:rFonts w:ascii="Arial" w:eastAsia="Times New Roman" w:hAnsi="Arial" w:cs="Arial"/>
+          <w:sz w:val="24"/>
+          <w:szCs w:val="24"/>
+          <w:lang w:eastAsia="es-GT"/>
+        </w:rPr>
+      </w:pPr>
+    </w:p>
+    <w:p>
+      <w:pPr>
+        <w:spacing w:before="100" w:beforeAutospacing="1" w:after="100" w:afterAutospacing="1" w:line="240" w:lineRule="auto"/>
+        <w:rPr>
+          <w:rFonts w:ascii="Arial" w:eastAsia="Times New Roman" w:hAnsi="Arial" w:cs="Arial"/>
+          <w:sz w:val="24"/>
+          <w:szCs w:val="24"/>
+          <w:lang w:eastAsia="es-GT"/>
+        </w:rPr>
+      </w:pPr>
+    </w:p>
+    <w:p>
+      <w:pPr>
+        <w:spacing w:before="100" w:beforeAutospacing="1" w:after="100" w:afterAutospacing="1" w:line="240" w:lineRule="auto"/>
+        <w:rPr>
+          <w:rFonts w:ascii="Arial" w:eastAsia="Times New Roman" w:hAnsi="Arial" w:cs="Arial"/>
+          <w:sz w:val="24"/>
+          <w:szCs w:val="24"/>
+          <w:lang w:eastAsia="es-GT"/>
+        </w:rPr>
+      </w:pPr>
+    </w:p>
+    <w:p>
+      <w:pPr>
+        <w:spacing w:before="100" w:beforeAutospacing="1" w:after="100" w:afterAutospacing="1" w:line="240" w:lineRule="auto"/>
+        <w:rPr>
+          <w:rFonts w:ascii="Arial" w:eastAsia="Times New Roman" w:hAnsi="Arial" w:cs="Arial"/>
+          <w:sz w:val="24"/>
+          <w:szCs w:val="24"/>
+          <w:lang w:eastAsia="es-GT"/>
+        </w:rPr>
+      </w:pPr>
+    </w:p>
+    <w:p>
+      <w:pPr>
+        <w:spacing w:before="100" w:beforeAutospacing="1" w:after="100" w:afterAutospacing="1" w:line="240" w:lineRule="auto"/>
+        <w:rPr>
+          <w:rFonts w:ascii="Arial" w:eastAsia="Times New Roman" w:hAnsi="Arial" w:cs="Arial"/>
+          <w:sz w:val="24"/>
+          <w:szCs w:val="24"/>
+          <w:lang w:eastAsia="es-GT"/>
+        </w:rPr>
+      </w:pPr>
+    </w:p>
+    <w:p>
+      <w:pPr>
+        <w:spacing w:before="100" w:beforeAutospacing="1" w:after="100" w:afterAutospacing="1" w:line="240" w:lineRule="auto"/>
+        <w:rPr>
+          <w:rFonts w:ascii="Arial" w:eastAsia="Times New Roman" w:hAnsi="Arial" w:cs="Arial"/>
+          <w:sz w:val="24"/>
+          <w:szCs w:val="24"/>
+          <w:lang w:eastAsia="es-GT"/>
+        </w:rPr>
+      </w:pPr>
+    </w:p>
+    <w:p>
+      <w:pPr>
+        <w:spacing w:before="100" w:beforeAutospacing="1" w:after="100" w:afterAutospacing="1" w:line="240" w:lineRule="auto"/>
+        <w:rPr>
+          <w:rFonts w:ascii="Arial" w:eastAsia="Times New Roman" w:hAnsi="Arial" w:cs="Arial"/>
+          <w:sz w:val="24"/>
+          <w:szCs w:val="24"/>
+          <w:lang w:eastAsia="es-GT"/>
+        </w:rPr>
+      </w:pPr>
+    </w:p>
+    <w:p>
+      <w:pPr>
+        <w:spacing w:before="100" w:beforeAutospacing="1" w:after="100" w:afterAutospacing="1" w:line="240" w:lineRule="auto"/>
+        <w:rPr>
+          <w:rFonts w:ascii="Arial" w:eastAsia="Times New Roman" w:hAnsi="Arial" w:cs="Arial"/>
+          <w:sz w:val="24"/>
+          <w:szCs w:val="24"/>
+          <w:lang w:eastAsia="es-GT"/>
+        </w:rPr>
+      </w:pPr>
+    </w:p>
+    <w:p>
+      <w:pPr>
+        <w:spacing w:before="100" w:beforeAutospacing="1" w:after="100" w:afterAutospacing="1" w:line="240" w:lineRule="auto"/>
+        <w:rPr>
+          <w:rFonts w:ascii="Arial" w:eastAsia="Times New Roman" w:hAnsi="Arial" w:cs="Arial"/>
+          <w:sz w:val="24"/>
+          <w:szCs w:val="24"/>
+          <w:lang w:eastAsia="es-GT"/>
+        </w:rPr>
+      </w:pPr>
+    </w:p>
+    <w:p>
+      <w:pPr>
+        <w:spacing w:before="100" w:beforeAutospacing="1" w:after="100" w:afterAutospacing="1" w:line="240" w:lineRule="auto"/>
+        <w:rPr>
+          <w:rFonts w:ascii="Arial" w:eastAsia="Times New Roman" w:hAnsi="Arial" w:cs="Arial"/>
+          <w:sz w:val="24"/>
+          <w:szCs w:val="24"/>
+          <w:lang w:eastAsia="es-GT"/>
+        </w:rPr>
+      </w:pPr>
+    </w:p>
+    <w:p>
+      <w:pPr>
+        <w:spacing w:before="100" w:beforeAutospacing="1" w:after="100" w:afterAutospacing="1" w:line="240" w:lineRule="auto"/>
+        <w:rPr>
+          <w:rFonts w:ascii="Arial" w:eastAsia="Times New Roman" w:hAnsi="Arial" w:cs="Arial"/>
+          <w:sz w:val="24"/>
+          <w:szCs w:val="24"/>
+          <w:lang w:eastAsia="es-GT"/>
+        </w:rPr>
+      </w:pPr>
+    </w:p>
+    <w:p>
+      <w:pPr>
+        <w:spacing w:before="100" w:beforeAutospacing="1" w:after="100" w:afterAutospacing="1" w:line="240" w:lineRule="auto"/>
+        <w:rPr>
+          <w:rFonts w:ascii="Arial" w:eastAsia="Times New Roman" w:hAnsi="Arial" w:cs="Arial"/>
+          <w:sz w:val="24"/>
+          <w:szCs w:val="24"/>
+          <w:lang w:eastAsia="es-GT"/>
+        </w:rPr>
+      </w:pPr>
+    </w:p>
+    <w:p>
+      <w:pPr>
+        <w:spacing w:before="100" w:beforeAutospacing="1" w:after="100" w:afterAutospacing="1" w:line="240" w:lineRule="auto"/>
+        <w:rPr>
+          <w:rFonts w:ascii="Arial" w:eastAsia="Times New Roman" w:hAnsi="Arial" w:cs="Arial"/>
+          <w:sz w:val="24"/>
+          <w:szCs w:val="24"/>
+          <w:lang w:eastAsia="es-GT"/>
+        </w:rPr>
+      </w:pPr>
+    </w:p>
+    <w:p>
+      <w:pPr>
+        <w:spacing w:before="100" w:beforeAutospacing="1" w:after="100" w:afterAutospacing="1" w:line="240" w:lineRule="auto"/>
+        <w:rPr>
+          <w:rFonts w:ascii="Arial" w:eastAsia="Times New Roman" w:hAnsi="Arial" w:cs="Arial"/>
+          <w:sz w:val="24"/>
+          <w:szCs w:val="24"/>
+          <w:lang w:eastAsia="es-GT"/>
+        </w:rPr>
+      </w:pPr>
+    </w:p>
+    <w:p>
+      <w:pPr>
+        <w:spacing w:before="100" w:beforeAutospacing="1" w:after="100" w:afterAutospacing="1" w:line="240" w:lineRule="auto"/>
+        <w:rPr>
+          <w:rFonts w:ascii="Arial" w:eastAsia="Times New Roman" w:hAnsi="Arial" w:cs="Arial"/>
+          <w:sz w:val="24"/>
+          <w:szCs w:val="24"/>
+          <w:lang w:eastAsia="es-GT"/>
+        </w:rPr>
+      </w:pPr>
+    </w:p>
+    <w:p>
+      <w:pPr>
+        <w:spacing w:before="100" w:beforeAutospacing="1" w:after="100" w:afterAutospacing="1" w:line="240" w:lineRule="auto"/>
+        <w:rPr>
+          <w:rFonts w:ascii="Arial" w:eastAsia="Times New Roman" w:hAnsi="Arial" w:cs="Arial"/>
+          <w:sz w:val="24"/>
+          <w:szCs w:val="24"/>
+          <w:lang w:eastAsia="es-GT"/>
+        </w:rPr>
+      </w:pPr>
+    </w:p>
+    <w:p>
+      <w:pPr>
+        <w:spacing w:before="100" w:beforeAutospacing="1" w:after="100" w:afterAutospacing="1" w:line="240" w:lineRule="auto"/>
+        <w:rPr>
+          <w:rFonts w:ascii="Arial" w:eastAsia="Times New Roman" w:hAnsi="Arial" w:cs="Arial"/>
+          <w:sz w:val="24"/>
+          <w:szCs w:val="24"/>
+          <w:lang w:eastAsia="es-GT"/>
+        </w:rPr>
+      </w:pPr>
+    </w:p>
+    <w:p>
+      <w:pPr>
+        <w:spacing w:before="100" w:beforeAutospacing="1" w:after="100" w:afterAutospacing="1" w:line="240" w:lineRule="auto"/>
+        <w:rPr>
+          <w:rFonts w:ascii="Arial" w:eastAsia="Times New Roman" w:hAnsi="Arial" w:cs="Arial"/>
+          <w:sz w:val="24"/>
+          <w:szCs w:val="24"/>
+          <w:lang w:eastAsia="es-GT"/>
+        </w:rPr>
+      </w:pPr>
+    </w:p>
+    <w:p>
+      <w:pPr>
+        <w:spacing w:before="100" w:beforeAutospacing="1" w:after="100" w:afterAutospacing="1" w:line="240" w:lineRule="auto"/>
+        <w:rPr>
+          <w:rFonts w:ascii="Arial" w:eastAsia="Times New Roman" w:hAnsi="Arial" w:cs="Arial"/>
+          <w:sz w:val="24"/>
+          <w:szCs w:val="24"/>
+          <w:lang w:eastAsia="es-GT"/>
+        </w:rPr>
+      </w:pPr>
+    </w:p>
+    <w:p>
+      <w:pPr>
+        <w:spacing w:before="100" w:beforeAutospacing="1" w:after="100" w:afterAutospacing="1" w:line="240" w:lineRule="auto"/>
+        <w:rPr>
+          <w:rFonts w:ascii="Arial" w:eastAsia="Times New Roman" w:hAnsi="Arial" w:cs="Arial"/>
+          <w:sz w:val="24"/>
+          <w:szCs w:val="24"/>
+          <w:lang w:eastAsia="es-GT"/>
+        </w:rPr>
+      </w:pPr>
+    </w:p>
+    <w:p>
+      <w:pPr>
+        <w:spacing w:before="100" w:beforeAutospacing="1" w:after="100" w:afterAutospacing="1" w:line="240" w:lineRule="auto"/>
+        <w:rPr>
+          <w:rFonts w:ascii="Arial" w:eastAsia="Times New Roman" w:hAnsi="Arial" w:cs="Arial"/>
+          <w:sz w:val="24"/>
+          <w:szCs w:val="24"/>
+          <w:lang w:eastAsia="es-GT"/>
+        </w:rPr>
+      </w:pPr>
+    </w:p>
+    <w:p>
+      <w:pPr>
+        <w:spacing w:before="100" w:beforeAutospacing="1" w:after="100" w:afterAutospacing="1" w:line="240" w:lineRule="auto"/>
+        <w:rPr>
+          <w:rFonts w:ascii="Arial" w:eastAsia="Times New Roman" w:hAnsi="Arial" w:cs="Arial"/>
+          <w:sz w:val="24"/>
+          <w:szCs w:val="24"/>
+          <w:lang w:eastAsia="es-GT"/>
+        </w:rPr>
+      </w:pPr>
+    </w:p>
+    <w:p>
+      <w:pPr>
+        <w:spacing w:before="100" w:beforeAutospacing="1" w:after="100" w:afterAutospacing="1" w:line="240" w:lineRule="auto"/>
+        <w:rPr>
+          <w:rFonts w:ascii="Arial" w:eastAsia="Times New Roman" w:hAnsi="Arial" w:cs="Arial"/>
+          <w:sz w:val="24"/>
+          <w:szCs w:val="24"/>
+          <w:lang w:eastAsia="es-GT"/>
+        </w:rPr>
+      </w:pPr>
+    </w:p>
+    <w:p>
+      <w:pPr>
+        <w:rPr>
+          <w:rFonts w:ascii="Arial" w:eastAsiaTheme="minorHAnsi" w:hAnsi="Arial" w:cs="Arial"/>
+          <w:bCs/>
+          <w:u w:val="single"/>
+        </w:rPr>
+      </w:pPr>
     </w:p>
     <w:sectPr>
       <w:pgSz w:w="12240" w:h="15840"/>
@@ -1056,22 +3613,66 @@
 </w:document>
 </file>
 
+<file path=word/endnotes.xml><?xml version="1.0" encoding="utf-8"?>
+<w:endnotes xmlns:wpc="http://schemas.microsoft.com/office/word/2010/wordprocessingCanvas" xmlns:cx="http://schemas.microsoft.com/office/drawing/2014/chartex" xmlns:cx1="http://schemas.microsoft.com/office/drawing/2015/9/8/chartex" xmlns:mc="http://schemas.openxmlformats.org/markup-compatibility/2006" xmlns:o="urn:schemas-microsoft-com:office:office" xmlns:r="http://schemas.openxmlformats.org/officeDocument/2006/relationships" xmlns:m="http://schemas.openxmlformats.org/officeDocument/2006/math" xmlns:v="urn:schemas-microsoft-com:vml" xmlns:wp14="http://schemas.microsoft.com/office/word/2010/wordprocessingDrawing" xmlns:wp="http://schemas.openxmlformats.org/drawingml/2006/wordprocessingDrawing" xmlns:w10="urn:schemas-microsoft-com:office:word" xmlns:w="http://schemas.openxmlformats.org/wordprocessingml/2006/main" xmlns:w14="http://schemas.microsoft.com/office/word/2010/wordml" xmlns:w15="http://schemas.microsoft.com/office/word/2012/wordml" xmlns:w16se="http://schemas.microsoft.com/office/word/2015/wordml/symex" xmlns:wpg="http://schemas.microsoft.com/office/word/2010/wordprocessingGroup" xmlns:wpi="http://schemas.microsoft.com/office/word/2010/wordprocessingInk" xmlns:wne="http://schemas.microsoft.com/office/word/2006/wordml" xmlns:wps="http://schemas.microsoft.com/office/word/2010/wordprocessingShape" mc:Ignorable="w14 w15 w16se wp14">
+  <w:endnote w:type="separator" w:id="-1">
+    <w:p>
+      <w:pPr>
+        <w:spacing w:line="240" w:lineRule="auto"/>
+      </w:pPr>
+      <w:r>
+        <w:separator/>
+      </w:r>
+    </w:p>
+  </w:endnote>
+  <w:endnote w:type="continuationSeparator" w:id="0">
+    <w:p>
+      <w:pPr>
+        <w:spacing w:line="240" w:lineRule="auto"/>
+      </w:pPr>
+      <w:r>
+        <w:continuationSeparator/>
+      </w:r>
+    </w:p>
+  </w:endnote>
+</w:endnotes>
+</file>
+
+<file path=word/footnotes.xml><?xml version="1.0" encoding="utf-8"?>
+<w:footnotes xmlns:wpc="http://schemas.microsoft.com/office/word/2010/wordprocessingCanvas" xmlns:cx="http://schemas.microsoft.com/office/drawing/2014/chartex" xmlns:cx1="http://schemas.microsoft.com/office/drawing/2015/9/8/chartex" xmlns:mc="http://schemas.openxmlformats.org/markup-compatibility/2006" xmlns:o="urn:schemas-microsoft-com:office:office" xmlns:r="http://schemas.openxmlformats.org/officeDocument/2006/relationships" xmlns:m="http://schemas.openxmlformats.org/officeDocument/2006/math" xmlns:v="urn:schemas-microsoft-com:vml" xmlns:wp14="http://schemas.microsoft.com/office/word/2010/wordprocessingDrawing" xmlns:wp="http://schemas.openxmlformats.org/drawingml/2006/wordprocessingDrawing" xmlns:w10="urn:schemas-microsoft-com:office:word" xmlns:w="http://schemas.openxmlformats.org/wordprocessingml/2006/main" xmlns:w14="http://schemas.microsoft.com/office/word/2010/wordml" xmlns:w15="http://schemas.microsoft.com/office/word/2012/wordml" xmlns:w16se="http://schemas.microsoft.com/office/word/2015/wordml/symex" xmlns:wpg="http://schemas.microsoft.com/office/word/2010/wordprocessingGroup" xmlns:wpi="http://schemas.microsoft.com/office/word/2010/wordprocessingInk" xmlns:wne="http://schemas.microsoft.com/office/word/2006/wordml" xmlns:wps="http://schemas.microsoft.com/office/word/2010/wordprocessingShape" mc:Ignorable="w14 w15 w16se wp14">
+  <w:footnote w:type="separator" w:id="-1">
+    <w:p>
+      <w:pPr>
+        <w:spacing w:after="0"/>
+      </w:pPr>
+      <w:r>
+        <w:separator/>
+      </w:r>
+    </w:p>
+  </w:footnote>
+  <w:footnote w:type="continuationSeparator" w:id="0">
+    <w:p>
+      <w:pPr>
+        <w:spacing w:after="0"/>
+      </w:pPr>
+      <w:r>
+        <w:continuationSeparator/>
+      </w:r>
+    </w:p>
+  </w:footnote>
+</w:footnotes>
+</file>
+
 <file path=word/styles.xml><?xml version="1.0" encoding="utf-8"?>
 <w:styles xmlns:mc="http://schemas.openxmlformats.org/markup-compatibility/2006" xmlns:r="http://schemas.openxmlformats.org/officeDocument/2006/relationships" xmlns:w="http://schemas.openxmlformats.org/wordprocessingml/2006/main" xmlns:w14="http://schemas.microsoft.com/office/word/2010/wordml" xmlns:w15="http://schemas.microsoft.com/office/word/2012/wordml" xmlns:w16se="http://schemas.microsoft.com/office/word/2015/wordml/symex" mc:Ignorable="w14 w15 w16se">
   <w:docDefaults>
     <w:rPrDefault>
       <w:rPr>
         <w:rFonts w:asciiTheme="minorHAnsi" w:eastAsiaTheme="minorHAnsi" w:hAnsiTheme="minorHAnsi" w:cstheme="minorBidi"/>
-        <w:sz w:val="22"/>
-        <w:szCs w:val="22"/>
-        <w:lang w:val="es-GT" w:eastAsia="en-US" w:bidi="ar-SA"/>
+        <w:lang w:val="es-MX" w:eastAsia="es-MX" w:bidi="ar-SA"/>
       </w:rPr>
     </w:rPrDefault>
-    <w:pPrDefault>
-      <w:pPr>
-        <w:spacing w:after="160" w:line="259" w:lineRule="auto"/>
-      </w:pPr>
-    </w:pPrDefault>
+    <w:pPrDefault/>
   </w:docDefaults>
   <w:latentStyles w:defLockedState="0" w:defUIPriority="99" w:defSemiHidden="0" w:defUnhideWhenUsed="0" w:defQFormat="0" w:count="371">
     <w:lsdException w:name="Normal" w:uiPriority="0" w:qFormat="1"/>
@@ -1104,7 +3705,7 @@
     <w:lsdException w:name="toc 9" w:semiHidden="1" w:uiPriority="39" w:unhideWhenUsed="1"/>
     <w:lsdException w:name="Normal Indent" w:semiHidden="1" w:unhideWhenUsed="1"/>
     <w:lsdException w:name="footnote text" w:semiHidden="1" w:unhideWhenUsed="1"/>
-    <w:lsdException w:name="annotation text" w:semiHidden="1" w:unhideWhenUsed="1"/>
+    <w:lsdException w:name="annotation text" w:semiHidden="1" w:unhideWhenUsed="1" w:qFormat="1"/>
     <w:lsdException w:name="header" w:semiHidden="1" w:unhideWhenUsed="1"/>
     <w:lsdException w:name="footer" w:semiHidden="1" w:unhideWhenUsed="1"/>
     <w:lsdException w:name="index heading" w:semiHidden="1" w:unhideWhenUsed="1"/>
@@ -1168,7 +3769,7 @@
     <w:lsdException w:name="E-mail Signature" w:semiHidden="1" w:unhideWhenUsed="1"/>
     <w:lsdException w:name="HTML Top of Form" w:semiHidden="1" w:unhideWhenUsed="1"/>
     <w:lsdException w:name="HTML Bottom of Form" w:semiHidden="1" w:unhideWhenUsed="1"/>
-    <w:lsdException w:name="Normal (Web)" w:semiHidden="1" w:unhideWhenUsed="1"/>
+    <w:lsdException w:name="Normal (Web)" w:semiHidden="1" w:unhideWhenUsed="1" w:qFormat="1"/>
     <w:lsdException w:name="HTML Acronym" w:semiHidden="1" w:unhideWhenUsed="1"/>
     <w:lsdException w:name="HTML Address" w:semiHidden="1" w:unhideWhenUsed="1"/>
     <w:lsdException w:name="HTML Cite" w:semiHidden="1" w:unhideWhenUsed="1"/>
@@ -1179,8 +3780,8 @@
     <w:lsdException w:name="HTML Sample" w:semiHidden="1" w:unhideWhenUsed="1"/>
     <w:lsdException w:name="HTML Typewriter" w:semiHidden="1" w:unhideWhenUsed="1"/>
     <w:lsdException w:name="HTML Variable" w:semiHidden="1" w:unhideWhenUsed="1"/>
-    <w:lsdException w:name="Normal Table" w:semiHidden="1" w:unhideWhenUsed="1"/>
-    <w:lsdException w:name="annotation subject" w:semiHidden="1" w:unhideWhenUsed="1"/>
+    <w:lsdException w:name="Normal Table" w:semiHidden="1" w:unhideWhenUsed="1" w:qFormat="1"/>
+    <w:lsdException w:name="annotation subject" w:semiHidden="1" w:unhideWhenUsed="1" w:qFormat="1"/>
     <w:lsdException w:name="No List" w:semiHidden="1" w:unhideWhenUsed="1"/>
     <w:lsdException w:name="Outline List 1" w:semiHidden="1" w:unhideWhenUsed="1"/>
     <w:lsdException w:name="Outline List 2" w:semiHidden="1" w:unhideWhenUsed="1"/>
@@ -1227,113 +3828,113 @@
     <w:lsdException w:name="Table Web 1" w:semiHidden="1" w:unhideWhenUsed="1"/>
     <w:lsdException w:name="Table Web 2" w:semiHidden="1" w:unhideWhenUsed="1"/>
     <w:lsdException w:name="Table Web 3" w:semiHidden="1" w:unhideWhenUsed="1"/>
-    <w:lsdException w:name="Balloon Text" w:semiHidden="1" w:unhideWhenUsed="1"/>
-    <w:lsdException w:name="Table Grid" w:uiPriority="39"/>
+    <w:lsdException w:name="Balloon Text" w:semiHidden="1" w:unhideWhenUsed="1" w:qFormat="1"/>
+    <w:lsdException w:name="Table Grid" w:uiPriority="39" w:qFormat="1"/>
     <w:lsdException w:name="Table Theme" w:semiHidden="1" w:unhideWhenUsed="1"/>
-    <w:lsdException w:name="Placeholder Text" w:semiHidden="1"/>
+    <w:lsdException w:name="Placeholder Text" w:semiHidden="1" w:unhideWhenUsed="1"/>
     <w:lsdException w:name="No Spacing" w:uiPriority="1" w:qFormat="1"/>
-    <w:lsdException w:name="Light Shading" w:uiPriority="60"/>
-    <w:lsdException w:name="Light List" w:uiPriority="61"/>
-    <w:lsdException w:name="Light Grid" w:uiPriority="62"/>
-    <w:lsdException w:name="Medium Shading 1" w:uiPriority="63"/>
-    <w:lsdException w:name="Medium Shading 2" w:uiPriority="64"/>
-    <w:lsdException w:name="Medium List 1" w:uiPriority="65"/>
-    <w:lsdException w:name="Medium List 2" w:uiPriority="66"/>
-    <w:lsdException w:name="Medium Grid 1" w:uiPriority="67"/>
-    <w:lsdException w:name="Medium Grid 2" w:uiPriority="68"/>
-    <w:lsdException w:name="Medium Grid 3" w:uiPriority="69"/>
-    <w:lsdException w:name="Dark List" w:uiPriority="70"/>
-    <w:lsdException w:name="Colorful Shading" w:uiPriority="71"/>
-    <w:lsdException w:name="Colorful List" w:uiPriority="72"/>
-    <w:lsdException w:name="Colorful Grid" w:uiPriority="73"/>
-    <w:lsdException w:name="Light Shading Accent 1" w:uiPriority="60"/>
-    <w:lsdException w:name="Light List Accent 1" w:uiPriority="61"/>
-    <w:lsdException w:name="Light Grid Accent 1" w:uiPriority="62"/>
-    <w:lsdException w:name="Medium Shading 1 Accent 1" w:uiPriority="63"/>
-    <w:lsdException w:name="Medium Shading 2 Accent 1" w:uiPriority="64"/>
-    <w:lsdException w:name="Medium List 1 Accent 1" w:uiPriority="65"/>
-    <w:lsdException w:name="Revision" w:semiHidden="1"/>
-    <w:lsdException w:name="List Paragraph" w:uiPriority="34" w:qFormat="1"/>
-    <w:lsdException w:name="Quote" w:uiPriority="29" w:qFormat="1"/>
-    <w:lsdException w:name="Intense Quote" w:uiPriority="30" w:qFormat="1"/>
-    <w:lsdException w:name="Medium List 2 Accent 1" w:uiPriority="66"/>
-    <w:lsdException w:name="Medium Grid 1 Accent 1" w:uiPriority="67"/>
-    <w:lsdException w:name="Medium Grid 2 Accent 1" w:uiPriority="68"/>
-    <w:lsdException w:name="Medium Grid 3 Accent 1" w:uiPriority="69"/>
-    <w:lsdException w:name="Dark List Accent 1" w:uiPriority="70"/>
-    <w:lsdException w:name="Colorful Shading Accent 1" w:uiPriority="71"/>
-    <w:lsdException w:name="Colorful List Accent 1" w:uiPriority="72"/>
-    <w:lsdException w:name="Colorful Grid Accent 1" w:uiPriority="73"/>
-    <w:lsdException w:name="Light Shading Accent 2" w:uiPriority="60"/>
-    <w:lsdException w:name="Light List Accent 2" w:uiPriority="61"/>
-    <w:lsdException w:name="Light Grid Accent 2" w:uiPriority="62"/>
-    <w:lsdException w:name="Medium Shading 1 Accent 2" w:uiPriority="63"/>
-    <w:lsdException w:name="Medium Shading 2 Accent 2" w:uiPriority="64"/>
-    <w:lsdException w:name="Medium List 1 Accent 2" w:uiPriority="65"/>
-    <w:lsdException w:name="Medium List 2 Accent 2" w:uiPriority="66"/>
-    <w:lsdException w:name="Medium Grid 1 Accent 2" w:uiPriority="67"/>
-    <w:lsdException w:name="Medium Grid 2 Accent 2" w:uiPriority="68"/>
-    <w:lsdException w:name="Medium Grid 3 Accent 2" w:uiPriority="69"/>
-    <w:lsdException w:name="Dark List Accent 2" w:uiPriority="70"/>
-    <w:lsdException w:name="Colorful Shading Accent 2" w:uiPriority="71"/>
-    <w:lsdException w:name="Colorful List Accent 2" w:uiPriority="72"/>
-    <w:lsdException w:name="Colorful Grid Accent 2" w:uiPriority="73"/>
-    <w:lsdException w:name="Light Shading Accent 3" w:uiPriority="60"/>
-    <w:lsdException w:name="Light List Accent 3" w:uiPriority="61"/>
-    <w:lsdException w:name="Light Grid Accent 3" w:uiPriority="62"/>
-    <w:lsdException w:name="Medium Shading 1 Accent 3" w:uiPriority="63"/>
-    <w:lsdException w:name="Medium Shading 2 Accent 3" w:uiPriority="64"/>
-    <w:lsdException w:name="Medium List 1 Accent 3" w:uiPriority="65"/>
-    <w:lsdException w:name="Medium List 2 Accent 3" w:uiPriority="66"/>
-    <w:lsdException w:name="Medium Grid 1 Accent 3" w:uiPriority="67"/>
-    <w:lsdException w:name="Medium Grid 2 Accent 3" w:uiPriority="68"/>
-    <w:lsdException w:name="Medium Grid 3 Accent 3" w:uiPriority="69"/>
-    <w:lsdException w:name="Dark List Accent 3" w:uiPriority="70"/>
-    <w:lsdException w:name="Colorful Shading Accent 3" w:uiPriority="71"/>
-    <w:lsdException w:name="Colorful List Accent 3" w:uiPriority="72"/>
-    <w:lsdException w:name="Colorful Grid Accent 3" w:uiPriority="73"/>
-    <w:lsdException w:name="Light Shading Accent 4" w:uiPriority="60"/>
-    <w:lsdException w:name="Light List Accent 4" w:uiPriority="61"/>
-    <w:lsdException w:name="Light Grid Accent 4" w:uiPriority="62"/>
-    <w:lsdException w:name="Medium Shading 1 Accent 4" w:uiPriority="63"/>
-    <w:lsdException w:name="Medium Shading 2 Accent 4" w:uiPriority="64"/>
-    <w:lsdException w:name="Medium List 1 Accent 4" w:uiPriority="65"/>
-    <w:lsdException w:name="Medium List 2 Accent 4" w:uiPriority="66"/>
-    <w:lsdException w:name="Medium Grid 1 Accent 4" w:uiPriority="67"/>
-    <w:lsdException w:name="Medium Grid 2 Accent 4" w:uiPriority="68"/>
-    <w:lsdException w:name="Medium Grid 3 Accent 4" w:uiPriority="69"/>
-    <w:lsdException w:name="Dark List Accent 4" w:uiPriority="70"/>
-    <w:lsdException w:name="Colorful Shading Accent 4" w:uiPriority="71"/>
-    <w:lsdException w:name="Colorful List Accent 4" w:uiPriority="72"/>
-    <w:lsdException w:name="Colorful Grid Accent 4" w:uiPriority="73"/>
-    <w:lsdException w:name="Light Shading Accent 5" w:uiPriority="60"/>
-    <w:lsdException w:name="Light List Accent 5" w:uiPriority="61"/>
-    <w:lsdException w:name="Light Grid Accent 5" w:uiPriority="62"/>
-    <w:lsdException w:name="Medium Shading 1 Accent 5" w:uiPriority="63"/>
-    <w:lsdException w:name="Medium Shading 2 Accent 5" w:uiPriority="64"/>
-    <w:lsdException w:name="Medium List 1 Accent 5" w:uiPriority="65"/>
-    <w:lsdException w:name="Medium List 2 Accent 5" w:uiPriority="66"/>
-    <w:lsdException w:name="Medium Grid 1 Accent 5" w:uiPriority="67"/>
-    <w:lsdException w:name="Medium Grid 2 Accent 5" w:uiPriority="68"/>
-    <w:lsdException w:name="Medium Grid 3 Accent 5" w:uiPriority="69"/>
-    <w:lsdException w:name="Dark List Accent 5" w:uiPriority="70"/>
-    <w:lsdException w:name="Colorful Shading Accent 5" w:uiPriority="71"/>
-    <w:lsdException w:name="Colorful List Accent 5" w:uiPriority="72"/>
-    <w:lsdException w:name="Colorful Grid Accent 5" w:uiPriority="73"/>
-    <w:lsdException w:name="Light Shading Accent 6" w:uiPriority="60"/>
-    <w:lsdException w:name="Light List Accent 6" w:uiPriority="61"/>
-    <w:lsdException w:name="Light Grid Accent 6" w:uiPriority="62"/>
-    <w:lsdException w:name="Medium Shading 1 Accent 6" w:uiPriority="63"/>
-    <w:lsdException w:name="Medium Shading 2 Accent 6" w:uiPriority="64"/>
-    <w:lsdException w:name="Medium List 1 Accent 6" w:uiPriority="65"/>
-    <w:lsdException w:name="Medium List 2 Accent 6" w:uiPriority="66"/>
-    <w:lsdException w:name="Medium Grid 1 Accent 6" w:uiPriority="67"/>
-    <w:lsdException w:name="Medium Grid 2 Accent 6" w:uiPriority="68"/>
-    <w:lsdException w:name="Medium Grid 3 Accent 6" w:uiPriority="69"/>
-    <w:lsdException w:name="Dark List Accent 6" w:uiPriority="70"/>
-    <w:lsdException w:name="Colorful Shading Accent 6" w:uiPriority="71"/>
-    <w:lsdException w:name="Colorful List Accent 6" w:uiPriority="72"/>
-    <w:lsdException w:name="Colorful Grid Accent 6" w:uiPriority="73"/>
+    <w:lsdException w:name="Light Shading"/>
+    <w:lsdException w:name="Light List"/>
+    <w:lsdException w:name="Light Grid"/>
+    <w:lsdException w:name="Medium Shading 1"/>
+    <w:lsdException w:name="Medium Shading 2"/>
+    <w:lsdException w:name="Medium List 1"/>
+    <w:lsdException w:name="Medium List 2"/>
+    <w:lsdException w:name="Medium Grid 1"/>
+    <w:lsdException w:name="Medium Grid 2"/>
+    <w:lsdException w:name="Medium Grid 3"/>
+    <w:lsdException w:name="Dark List"/>
+    <w:lsdException w:name="Colorful Shading"/>
+    <w:lsdException w:name="Colorful List"/>
+    <w:lsdException w:name="Colorful Grid"/>
+    <w:lsdException w:name="Light Shading Accent 1"/>
+    <w:lsdException w:name="Light List Accent 1"/>
+    <w:lsdException w:name="Light Grid Accent 1"/>
+    <w:lsdException w:name="Medium Shading 1 Accent 1"/>
+    <w:lsdException w:name="Medium Shading 2 Accent 1"/>
+    <w:lsdException w:name="Medium List 1 Accent 1"/>
+    <w:lsdException w:name="Revision" w:semiHidden="1" w:unhideWhenUsed="1"/>
+    <w:lsdException w:name="List Paragraph" w:semiHidden="1" w:unhideWhenUsed="1"/>
+    <w:lsdException w:name="Quote" w:semiHidden="1" w:unhideWhenUsed="1"/>
+    <w:lsdException w:name="Intense Quote" w:semiHidden="1" w:unhideWhenUsed="1"/>
+    <w:lsdException w:name="Medium List 2 Accent 1"/>
+    <w:lsdException w:name="Medium Grid 1 Accent 1"/>
+    <w:lsdException w:name="Medium Grid 2 Accent 1"/>
+    <w:lsdException w:name="Medium Grid 3 Accent 1"/>
+    <w:lsdException w:name="Dark List Accent 1"/>
+    <w:lsdException w:name="Colorful Shading Accent 1"/>
+    <w:lsdException w:name="Colorful List Accent 1"/>
+    <w:lsdException w:name="Colorful Grid Accent 1"/>
+    <w:lsdException w:name="Light Shading Accent 2"/>
+    <w:lsdException w:name="Light List Accent 2"/>
+    <w:lsdException w:name="Light Grid Accent 2"/>
+    <w:lsdException w:name="Medium Shading 1 Accent 2"/>
+    <w:lsdException w:name="Medium Shading 2 Accent 2"/>
+    <w:lsdException w:name="Medium List 1 Accent 2"/>
+    <w:lsdException w:name="Medium List 2 Accent 2"/>
+    <w:lsdException w:name="Medium Grid 1 Accent 2"/>
+    <w:lsdException w:name="Medium Grid 2 Accent 2"/>
+    <w:lsdException w:name="Medium Grid 3 Accent 2"/>
+    <w:lsdException w:name="Dark List Accent 2"/>
+    <w:lsdException w:name="Colorful Shading Accent 2"/>
+    <w:lsdException w:name="Colorful List Accent 2"/>
+    <w:lsdException w:name="Colorful Grid Accent 2"/>
+    <w:lsdException w:name="Light Shading Accent 3"/>
+    <w:lsdException w:name="Light List Accent 3"/>
+    <w:lsdException w:name="Light Grid Accent 3"/>
+    <w:lsdException w:name="Medium Shading 1 Accent 3"/>
+    <w:lsdException w:name="Medium Shading 2 Accent 3"/>
+    <w:lsdException w:name="Medium List 1 Accent 3"/>
+    <w:lsdException w:name="Medium List 2 Accent 3"/>
+    <w:lsdException w:name="Medium Grid 1 Accent 3"/>
+    <w:lsdException w:name="Medium Grid 2 Accent 3"/>
+    <w:lsdException w:name="Medium Grid 3 Accent 3"/>
+    <w:lsdException w:name="Dark List Accent 3"/>
+    <w:lsdException w:name="Colorful Shading Accent 3"/>
+    <w:lsdException w:name="Colorful List Accent 3"/>
+    <w:lsdException w:name="Colorful Grid Accent 3"/>
+    <w:lsdException w:name="Light Shading Accent 4"/>
+    <w:lsdException w:name="Light List Accent 4"/>
+    <w:lsdException w:name="Light Grid Accent 4"/>
+    <w:lsdException w:name="Medium Shading 1 Accent 4"/>
+    <w:lsdException w:name="Medium Shading 2 Accent 4"/>
+    <w:lsdException w:name="Medium List 1 Accent 4"/>
+    <w:lsdException w:name="Medium List 2 Accent 4"/>
+    <w:lsdException w:name="Medium Grid 1 Accent 4"/>
+    <w:lsdException w:name="Medium Grid 2 Accent 4"/>
+    <w:lsdException w:name="Medium Grid 3 Accent 4"/>
+    <w:lsdException w:name="Dark List Accent 4"/>
+    <w:lsdException w:name="Colorful Shading Accent 4"/>
+    <w:lsdException w:name="Colorful List Accent 4"/>
+    <w:lsdException w:name="Colorful Grid Accent 4"/>
+    <w:lsdException w:name="Light Shading Accent 5"/>
+    <w:lsdException w:name="Light List Accent 5"/>
+    <w:lsdException w:name="Light Grid Accent 5"/>
+    <w:lsdException w:name="Medium Shading 1 Accent 5"/>
+    <w:lsdException w:name="Medium Shading 2 Accent 5"/>
+    <w:lsdException w:name="Medium List 1 Accent 5"/>
+    <w:lsdException w:name="Medium List 2 Accent 5"/>
+    <w:lsdException w:name="Medium Grid 1 Accent 5"/>
+    <w:lsdException w:name="Medium Grid 2 Accent 5"/>
+    <w:lsdException w:name="Medium Grid 3 Accent 5"/>
+    <w:lsdException w:name="Dark List Accent 5"/>
+    <w:lsdException w:name="Colorful Shading Accent 5"/>
+    <w:lsdException w:name="Colorful List Accent 5"/>
+    <w:lsdException w:name="Colorful Grid Accent 5"/>
+    <w:lsdException w:name="Light Shading Accent 6"/>
+    <w:lsdException w:name="Light List Accent 6"/>
+    <w:lsdException w:name="Light Grid Accent 6"/>
+    <w:lsdException w:name="Medium Shading 1 Accent 6"/>
+    <w:lsdException w:name="Medium Shading 2 Accent 6"/>
+    <w:lsdException w:name="Medium List 1 Accent 6"/>
+    <w:lsdException w:name="Medium List 2 Accent 6"/>
+    <w:lsdException w:name="Medium Grid 1 Accent 6"/>
+    <w:lsdException w:name="Medium Grid 2 Accent 6"/>
+    <w:lsdException w:name="Medium Grid 3 Accent 6"/>
+    <w:lsdException w:name="Dark List Accent 6"/>
+    <w:lsdException w:name="Colorful Shading Accent 6"/>
+    <w:lsdException w:name="Colorful List Accent 6"/>
+    <w:lsdException w:name="Colorful Grid Accent 6"/>
     <w:lsdException w:name="Subtle Emphasis" w:uiPriority="19" w:qFormat="1"/>
     <w:lsdException w:name="Intense Emphasis" w:uiPriority="21" w:qFormat="1"/>
     <w:lsdException w:name="Subtle Reference" w:uiPriority="31" w:qFormat="1"/>
@@ -1449,9 +4050,14 @@
   <w:style w:type="paragraph" w:default="1" w:styleId="Normal">
     <w:name w:val="Normal"/>
     <w:qFormat/>
-    <w:rsid w:val="00D75182"/>
+    <w:pPr>
+      <w:spacing w:after="160" w:line="259" w:lineRule="auto"/>
+    </w:pPr>
     <w:rPr>
       <w:rFonts w:eastAsia="MS Mincho"/>
+      <w:sz w:val="22"/>
+      <w:szCs w:val="22"/>
+      <w:lang w:val="es-GT" w:eastAsia="en-US"/>
     </w:rPr>
   </w:style>
   <w:style w:type="character" w:default="1" w:styleId="Fuentedeprrafopredeter">
@@ -1481,54 +4087,25 @@
     <w:semiHidden/>
     <w:unhideWhenUsed/>
   </w:style>
-  <w:style w:type="paragraph" w:styleId="Sinespaciado">
-    <w:name w:val="No Spacing"/>
-    <w:uiPriority w:val="1"/>
-    <w:qFormat/>
-    <w:rsid w:val="007B480D"/>
-    <w:pPr>
-      <w:spacing w:after="0" w:line="240" w:lineRule="auto"/>
-    </w:pPr>
-  </w:style>
   <w:style w:type="character" w:styleId="Refdecomentario">
     <w:name w:val="annotation reference"/>
     <w:basedOn w:val="Fuentedeprrafopredeter"/>
     <w:uiPriority w:val="99"/>
     <w:semiHidden/>
     <w:unhideWhenUsed/>
-    <w:rsid w:val="00EB52AC"/>
     <w:rPr>
       <w:sz w:val="16"/>
       <w:szCs w:val="16"/>
     </w:rPr>
   </w:style>
-  <w:style w:type="paragraph" w:styleId="Textocomentario">
-    <w:name w:val="annotation text"/>
-    <w:basedOn w:val="Normal"/>
-    <w:link w:val="TextocomentarioCar"/>
-    <w:uiPriority w:val="99"/>
-    <w:semiHidden/>
-    <w:unhideWhenUsed/>
-    <w:rsid w:val="00EB52AC"/>
-    <w:pPr>
-      <w:spacing w:line="240" w:lineRule="auto"/>
-    </w:pPr>
+  <w:style w:type="character" w:styleId="Textoennegrita">
+    <w:name w:val="Strong"/>
+    <w:basedOn w:val="Fuentedeprrafopredeter"/>
+    <w:uiPriority w:val="22"/>
+    <w:qFormat/>
     <w:rPr>
-      <w:sz w:val="20"/>
-      <w:szCs w:val="20"/>
-    </w:rPr>
-  </w:style>
-  <w:style w:type="character" w:customStyle="1" w:styleId="TextocomentarioCar">
-    <w:name w:val="Texto comentario Car"/>
-    <w:basedOn w:val="Fuentedeprrafopredeter"/>
-    <w:link w:val="Textocomentario"/>
-    <w:uiPriority w:val="99"/>
-    <w:semiHidden/>
-    <w:rsid w:val="00EB52AC"/>
-    <w:rPr>
-      <w:rFonts w:eastAsia="MS Mincho"/>
-      <w:sz w:val="20"/>
-      <w:szCs w:val="20"/>
+      <w:b/>
+      <w:bCs/>
     </w:rPr>
   </w:style>
   <w:style w:type="paragraph" w:styleId="Asuntodelcomentario">
@@ -1539,23 +4116,24 @@
     <w:uiPriority w:val="99"/>
     <w:semiHidden/>
     <w:unhideWhenUsed/>
-    <w:rsid w:val="00EB52AC"/>
+    <w:qFormat/>
     <w:rPr>
       <w:b/>
       <w:bCs/>
     </w:rPr>
   </w:style>
-  <w:style w:type="character" w:customStyle="1" w:styleId="AsuntodelcomentarioCar">
-    <w:name w:val="Asunto del comentario Car"/>
-    <w:basedOn w:val="TextocomentarioCar"/>
-    <w:link w:val="Asuntodelcomentario"/>
+  <w:style w:type="paragraph" w:styleId="Textocomentario">
+    <w:name w:val="annotation text"/>
+    <w:basedOn w:val="Normal"/>
+    <w:link w:val="TextocomentarioCar"/>
     <w:uiPriority w:val="99"/>
     <w:semiHidden/>
-    <w:rsid w:val="00EB52AC"/>
+    <w:unhideWhenUsed/>
+    <w:qFormat/>
+    <w:pPr>
+      <w:spacing w:line="240" w:lineRule="auto"/>
+    </w:pPr>
     <w:rPr>
-      <w:rFonts w:eastAsia="MS Mincho"/>
-      <w:b/>
-      <w:bCs/>
       <w:sz w:val="20"/>
       <w:szCs w:val="20"/>
     </w:rPr>
@@ -1567,7 +4145,7 @@
     <w:uiPriority w:val="99"/>
     <w:semiHidden/>
     <w:unhideWhenUsed/>
-    <w:rsid w:val="0005271C"/>
+    <w:qFormat/>
     <w:pPr>
       <w:spacing w:after="0" w:line="240" w:lineRule="auto"/>
     </w:pPr>
@@ -1577,32 +4155,28 @@
       <w:szCs w:val="18"/>
     </w:rPr>
   </w:style>
-  <w:style w:type="character" w:customStyle="1" w:styleId="TextodegloboCar">
-    <w:name w:val="Texto de globo Car"/>
-    <w:basedOn w:val="Fuentedeprrafopredeter"/>
-    <w:link w:val="Textodeglobo"/>
+  <w:style w:type="paragraph" w:styleId="NormalWeb">
+    <w:name w:val="Normal (Web)"/>
+    <w:basedOn w:val="Normal"/>
     <w:uiPriority w:val="99"/>
     <w:semiHidden/>
-    <w:rsid w:val="0005271C"/>
+    <w:unhideWhenUsed/>
+    <w:qFormat/>
+    <w:pPr>
+      <w:spacing w:before="100" w:beforeAutospacing="1" w:after="100" w:afterAutospacing="1" w:line="240" w:lineRule="auto"/>
+    </w:pPr>
     <w:rPr>
-      <w:rFonts w:ascii="Segoe UI" w:eastAsia="MS Mincho" w:hAnsi="Segoe UI" w:cs="Segoe UI"/>
-      <w:sz w:val="18"/>
-      <w:szCs w:val="18"/>
+      <w:rFonts w:ascii="Times New Roman" w:eastAsia="Times New Roman" w:hAnsi="Times New Roman" w:cs="Times New Roman"/>
+      <w:sz w:val="24"/>
+      <w:szCs w:val="24"/>
+      <w:lang w:eastAsia="es-GT"/>
     </w:rPr>
-  </w:style>
-  <w:style w:type="character" w:customStyle="1" w:styleId="oypena">
-    <w:name w:val="oypena"/>
-    <w:basedOn w:val="Fuentedeprrafopredeter"/>
-    <w:rsid w:val="003F5629"/>
   </w:style>
   <w:style w:type="table" w:styleId="Tablaconcuadrcula">
     <w:name w:val="Table Grid"/>
     <w:basedOn w:val="Tablanormal"/>
     <w:uiPriority w:val="39"/>
-    <w:rsid w:val="00C251FB"/>
-    <w:pPr>
-      <w:spacing w:after="0" w:line="240" w:lineRule="auto"/>
-    </w:pPr>
+    <w:qFormat/>
     <w:tblPr>
       <w:tblBorders>
         <w:top w:val="single" w:sz="4" w:space="0" w:color="auto"/>
@@ -1614,10 +4188,66 @@
       </w:tblBorders>
     </w:tblPr>
   </w:style>
+  <w:style w:type="paragraph" w:styleId="Sinespaciado">
+    <w:name w:val="No Spacing"/>
+    <w:uiPriority w:val="1"/>
+    <w:qFormat/>
+    <w:rPr>
+      <w:sz w:val="22"/>
+      <w:szCs w:val="22"/>
+      <w:lang w:val="es-GT" w:eastAsia="en-US"/>
+    </w:rPr>
+  </w:style>
+  <w:style w:type="character" w:customStyle="1" w:styleId="TextocomentarioCar">
+    <w:name w:val="Texto comentario Car"/>
+    <w:basedOn w:val="Fuentedeprrafopredeter"/>
+    <w:link w:val="Textocomentario"/>
+    <w:uiPriority w:val="99"/>
+    <w:semiHidden/>
+    <w:qFormat/>
+    <w:rPr>
+      <w:rFonts w:eastAsia="MS Mincho"/>
+      <w:sz w:val="20"/>
+      <w:szCs w:val="20"/>
+    </w:rPr>
+  </w:style>
+  <w:style w:type="character" w:customStyle="1" w:styleId="AsuntodelcomentarioCar">
+    <w:name w:val="Asunto del comentario Car"/>
+    <w:basedOn w:val="TextocomentarioCar"/>
+    <w:link w:val="Asuntodelcomentario"/>
+    <w:uiPriority w:val="99"/>
+    <w:semiHidden/>
+    <w:qFormat/>
+    <w:rPr>
+      <w:rFonts w:eastAsia="MS Mincho"/>
+      <w:b/>
+      <w:bCs/>
+      <w:sz w:val="20"/>
+      <w:szCs w:val="20"/>
+    </w:rPr>
+  </w:style>
+  <w:style w:type="character" w:customStyle="1" w:styleId="TextodegloboCar">
+    <w:name w:val="Texto de globo Car"/>
+    <w:basedOn w:val="Fuentedeprrafopredeter"/>
+    <w:link w:val="Textodeglobo"/>
+    <w:uiPriority w:val="99"/>
+    <w:semiHidden/>
+    <w:qFormat/>
+    <w:rPr>
+      <w:rFonts w:ascii="Segoe UI" w:eastAsia="MS Mincho" w:hAnsi="Segoe UI" w:cs="Segoe UI"/>
+      <w:sz w:val="18"/>
+      <w:szCs w:val="18"/>
+    </w:rPr>
+  </w:style>
+  <w:style w:type="character" w:customStyle="1" w:styleId="oypena">
+    <w:name w:val="oypena"/>
+    <w:basedOn w:val="Fuentedeprrafopredeter"/>
+    <w:qFormat/>
+  </w:style>
   <w:style w:type="paragraph" w:customStyle="1" w:styleId="paragraph">
     <w:name w:val="paragraph"/>
     <w:basedOn w:val="Normal"/>
-    <w:rsid w:val="006E1988"/>
+    <w:qFormat/>
     <w:pPr>
       <w:spacing w:before="100" w:beforeAutospacing="1" w:after="100" w:afterAutospacing="1" w:line="240" w:lineRule="auto"/>
     </w:pPr>
@@ -1631,49 +4261,21 @@
   <w:style w:type="character" w:customStyle="1" w:styleId="normaltextrun">
     <w:name w:val="normaltextrun"/>
     <w:basedOn w:val="Fuentedeprrafopredeter"/>
-    <w:rsid w:val="006E1988"/>
+    <w:qFormat/>
   </w:style>
   <w:style w:type="character" w:customStyle="1" w:styleId="eop">
     <w:name w:val="eop"/>
     <w:basedOn w:val="Fuentedeprrafopredeter"/>
-    <w:rsid w:val="006E1988"/>
-  </w:style>
-  <w:style w:type="paragraph" w:styleId="NormalWeb">
-    <w:name w:val="Normal (Web)"/>
-    <w:basedOn w:val="Normal"/>
-    <w:uiPriority w:val="99"/>
-    <w:semiHidden/>
-    <w:unhideWhenUsed/>
-    <w:rsid w:val="00B952EC"/>
-    <w:pPr>
-      <w:spacing w:before="100" w:beforeAutospacing="1" w:after="100" w:afterAutospacing="1" w:line="240" w:lineRule="auto"/>
-    </w:pPr>
-    <w:rPr>
-      <w:rFonts w:ascii="Times New Roman" w:eastAsia="Times New Roman" w:hAnsi="Times New Roman" w:cs="Times New Roman"/>
-      <w:sz w:val="24"/>
-      <w:szCs w:val="24"/>
-      <w:lang w:eastAsia="es-GT"/>
-    </w:rPr>
+    <w:qFormat/>
   </w:style>
   <w:style w:type="character" w:customStyle="1" w:styleId="cf01">
     <w:name w:val="cf01"/>
     <w:basedOn w:val="Fuentedeprrafopredeter"/>
-    <w:rsid w:val="00B952EC"/>
+    <w:qFormat/>
     <w:rPr>
       <w:rFonts w:ascii="Consolas" w:hAnsi="Consolas" w:hint="default"/>
       <w:sz w:val="22"/>
       <w:szCs w:val="22"/>
-    </w:rPr>
-  </w:style>
-  <w:style w:type="character" w:styleId="Textoennegrita">
-    <w:name w:val="Strong"/>
-    <w:basedOn w:val="Fuentedeprrafopredeter"/>
-    <w:uiPriority w:val="22"/>
-    <w:qFormat/>
-    <w:rsid w:val="0078207B"/>
-    <w:rPr>
-      <w:b/>
-      <w:bCs/>
     </w:rPr>
   </w:style>
 </w:styles>
@@ -1722,7 +4324,7 @@
     </a:clrScheme>
     <a:fontScheme name="Office">
       <a:majorFont>
-        <a:latin typeface="Calibri Light" panose="020F0302020204030204"/>
+        <a:latin typeface="Calibri Light"/>
         <a:ea typeface=""/>
         <a:cs typeface=""/>
         <a:font script="Jpan" typeface="游ゴシック Light"/>
@@ -1755,26 +4357,9 @@
         <a:font script="Viet" typeface="Times New Roman"/>
         <a:font script="Uigh" typeface="Microsoft Uighur"/>
         <a:font script="Geor" typeface="Sylfaen"/>
-        <a:font script="Armn" typeface="Arial"/>
-        <a:font script="Bugi" typeface="Leelawadee UI"/>
-        <a:font script="Bopo" typeface="Microsoft JhengHei"/>
-        <a:font script="Java" typeface="Javanese Text"/>
-        <a:font script="Lisu" typeface="Segoe UI"/>
-        <a:font script="Mymr" typeface="Myanmar Text"/>
-        <a:font script="Nkoo" typeface="Ebrima"/>
-        <a:font script="Olck" typeface="Nirmala UI"/>
-        <a:font script="Osma" typeface="Ebrima"/>
-        <a:font script="Phag" typeface="Phagspa"/>
-        <a:font script="Syrn" typeface="Estrangelo Edessa"/>
-        <a:font script="Syrj" typeface="Estrangelo Edessa"/>
-        <a:font script="Syre" typeface="Estrangelo Edessa"/>
-        <a:font script="Sora" typeface="Nirmala UI"/>
-        <a:font script="Tale" typeface="Microsoft Tai Le"/>
-        <a:font script="Talu" typeface="Microsoft New Tai Lue"/>
-        <a:font script="Tfng" typeface="Ebrima"/>
       </a:majorFont>
       <a:minorFont>
-        <a:latin typeface="Calibri" panose="020F0502020204030204"/>
+        <a:latin typeface="Calibri"/>
         <a:ea typeface=""/>
         <a:cs typeface=""/>
         <a:font script="Jpan" typeface="游明朝"/>
@@ -1807,23 +4392,6 @@
         <a:font script="Viet" typeface="Arial"/>
         <a:font script="Uigh" typeface="Microsoft Uighur"/>
         <a:font script="Geor" typeface="Sylfaen"/>
-        <a:font script="Armn" typeface="Arial"/>
-        <a:font script="Bugi" typeface="Leelawadee UI"/>
-        <a:font script="Bopo" typeface="Microsoft JhengHei"/>
-        <a:font script="Java" typeface="Javanese Text"/>
-        <a:font script="Lisu" typeface="Segoe UI"/>
-        <a:font script="Mymr" typeface="Myanmar Text"/>
-        <a:font script="Nkoo" typeface="Ebrima"/>
-        <a:font script="Olck" typeface="Nirmala UI"/>
-        <a:font script="Osma" typeface="Ebrima"/>
-        <a:font script="Phag" typeface="Phagspa"/>
-        <a:font script="Syrn" typeface="Estrangelo Edessa"/>
-        <a:font script="Syrj" typeface="Estrangelo Edessa"/>
-        <a:font script="Syre" typeface="Estrangelo Edessa"/>
-        <a:font script="Sora" typeface="Nirmala UI"/>
-        <a:font script="Tale" typeface="Microsoft Tai Le"/>
-        <a:font script="Talu" typeface="Microsoft New Tai Lue"/>
-        <a:font script="Tfng" typeface="Ebrima"/>
       </a:minorFont>
     </a:fontScheme>
     <a:fmtScheme name="Office">
@@ -1966,10 +4534,5 @@
   </a:themeElements>
   <a:objectDefaults/>
   <a:extraClrSchemeLst/>
-  <a:extLst>
-    <a:ext uri="{05A4C25C-085E-4340-85A3-A5531E510DB2}">
-      <thm15:themeFamily xmlns:thm15="http://schemas.microsoft.com/office/thememl/2012/main" name="Office Theme" id="{62F939B6-93AF-4DB8-9C6B-D6C7DFDC589F}" vid="{4A3C46E8-61CC-4603-A589-7422A47A8E4A}"/>
-    </a:ext>
-  </a:extLst>
 </a:theme>
 </file>
</xml_diff>

<commit_message>
add: Se agrego historia de usuario HUKC-002 dentro del documento Peaceathome.docx en la rama kcuyuch-2024177
</commit_message>
<xml_diff>
--- a/Peaceathome.docx
+++ b/Peaceathome.docx
@@ -1373,8 +1373,6 @@
           <w:szCs w:val="44"/>
         </w:rPr>
       </w:pPr>
-      <w:bookmarkStart w:id="0" w:name="_GoBack"/>
-      <w:bookmarkEnd w:id="0"/>
     </w:p>
     <w:p>
       <w:pPr>
@@ -1531,286 +1529,406 @@
         <w:spacing w:before="100" w:beforeAutospacing="1" w:after="100" w:afterAutospacing="1" w:line="240" w:lineRule="auto"/>
         <w:rPr>
           <w:rFonts w:ascii="Arial" w:eastAsia="Times New Roman" w:hAnsi="Arial" w:cs="Arial"/>
-          <w:sz w:val="24"/>
-          <w:szCs w:val="24"/>
-          <w:lang w:eastAsia="es-GT"/>
-        </w:rPr>
-      </w:pPr>
-    </w:p>
-    <w:p>
-      <w:pPr>
-        <w:spacing w:before="100" w:beforeAutospacing="1" w:after="100" w:afterAutospacing="1" w:line="240" w:lineRule="auto"/>
-        <w:rPr>
-          <w:rFonts w:ascii="Arial" w:eastAsia="Times New Roman" w:hAnsi="Arial" w:cs="Arial"/>
-          <w:sz w:val="24"/>
-          <w:szCs w:val="24"/>
-          <w:lang w:eastAsia="es-GT"/>
-        </w:rPr>
-      </w:pPr>
-    </w:p>
-    <w:p>
-      <w:pPr>
-        <w:spacing w:before="100" w:beforeAutospacing="1" w:after="100" w:afterAutospacing="1" w:line="240" w:lineRule="auto"/>
-        <w:rPr>
-          <w:rFonts w:ascii="Arial" w:eastAsia="Times New Roman" w:hAnsi="Arial" w:cs="Arial"/>
-          <w:sz w:val="24"/>
-          <w:szCs w:val="24"/>
-          <w:lang w:eastAsia="es-GT"/>
-        </w:rPr>
-      </w:pPr>
-    </w:p>
-    <w:p>
-      <w:pPr>
-        <w:spacing w:before="100" w:beforeAutospacing="1" w:after="100" w:afterAutospacing="1" w:line="240" w:lineRule="auto"/>
-        <w:rPr>
-          <w:rFonts w:ascii="Arial" w:eastAsia="Times New Roman" w:hAnsi="Arial" w:cs="Arial"/>
-          <w:sz w:val="24"/>
-          <w:szCs w:val="24"/>
-          <w:lang w:eastAsia="es-GT"/>
-        </w:rPr>
-      </w:pPr>
-    </w:p>
-    <w:p>
-      <w:pPr>
-        <w:spacing w:before="100" w:beforeAutospacing="1" w:after="100" w:afterAutospacing="1" w:line="240" w:lineRule="auto"/>
-        <w:rPr>
-          <w:rFonts w:ascii="Arial" w:eastAsia="Times New Roman" w:hAnsi="Arial" w:cs="Arial"/>
-          <w:sz w:val="24"/>
-          <w:szCs w:val="24"/>
-          <w:lang w:eastAsia="es-GT"/>
-        </w:rPr>
-      </w:pPr>
-    </w:p>
-    <w:p>
-      <w:pPr>
-        <w:spacing w:before="100" w:beforeAutospacing="1" w:after="100" w:afterAutospacing="1" w:line="240" w:lineRule="auto"/>
-        <w:rPr>
-          <w:rFonts w:ascii="Arial" w:eastAsia="Times New Roman" w:hAnsi="Arial" w:cs="Arial"/>
-          <w:sz w:val="24"/>
-          <w:szCs w:val="24"/>
-          <w:lang w:eastAsia="es-GT"/>
-        </w:rPr>
-      </w:pPr>
-    </w:p>
-    <w:p>
-      <w:pPr>
-        <w:spacing w:before="100" w:beforeAutospacing="1" w:after="100" w:afterAutospacing="1" w:line="240" w:lineRule="auto"/>
-        <w:rPr>
-          <w:rFonts w:ascii="Arial" w:eastAsia="Times New Roman" w:hAnsi="Arial" w:cs="Arial"/>
-          <w:sz w:val="24"/>
-          <w:szCs w:val="24"/>
-          <w:lang w:eastAsia="es-GT"/>
-        </w:rPr>
-      </w:pPr>
-    </w:p>
-    <w:p>
-      <w:pPr>
-        <w:spacing w:before="100" w:beforeAutospacing="1" w:after="100" w:afterAutospacing="1" w:line="240" w:lineRule="auto"/>
-        <w:rPr>
-          <w:rFonts w:ascii="Arial" w:eastAsia="Times New Roman" w:hAnsi="Arial" w:cs="Arial"/>
-          <w:sz w:val="24"/>
-          <w:szCs w:val="24"/>
-          <w:lang w:eastAsia="es-GT"/>
-        </w:rPr>
-      </w:pPr>
-    </w:p>
-    <w:p>
-      <w:pPr>
-        <w:spacing w:before="100" w:beforeAutospacing="1" w:after="100" w:afterAutospacing="1" w:line="240" w:lineRule="auto"/>
-        <w:rPr>
-          <w:rFonts w:ascii="Arial" w:eastAsia="Times New Roman" w:hAnsi="Arial" w:cs="Arial"/>
-          <w:sz w:val="24"/>
-          <w:szCs w:val="24"/>
-          <w:lang w:eastAsia="es-GT"/>
-        </w:rPr>
-      </w:pPr>
-    </w:p>
-    <w:p>
-      <w:pPr>
-        <w:spacing w:before="100" w:beforeAutospacing="1" w:after="100" w:afterAutospacing="1" w:line="240" w:lineRule="auto"/>
-        <w:rPr>
-          <w:rFonts w:ascii="Arial" w:eastAsia="Times New Roman" w:hAnsi="Arial" w:cs="Arial"/>
-          <w:sz w:val="24"/>
-          <w:szCs w:val="24"/>
-          <w:lang w:eastAsia="es-GT"/>
-        </w:rPr>
-      </w:pPr>
-    </w:p>
-    <w:p>
-      <w:pPr>
-        <w:spacing w:before="100" w:beforeAutospacing="1" w:after="100" w:afterAutospacing="1" w:line="240" w:lineRule="auto"/>
-        <w:rPr>
-          <w:rFonts w:ascii="Arial" w:eastAsia="Times New Roman" w:hAnsi="Arial" w:cs="Arial"/>
-          <w:sz w:val="24"/>
-          <w:szCs w:val="24"/>
-          <w:lang w:eastAsia="es-GT"/>
-        </w:rPr>
-      </w:pPr>
-    </w:p>
-    <w:p>
-      <w:pPr>
-        <w:spacing w:before="100" w:beforeAutospacing="1" w:after="100" w:afterAutospacing="1" w:line="240" w:lineRule="auto"/>
-        <w:rPr>
-          <w:rFonts w:ascii="Arial" w:eastAsia="Times New Roman" w:hAnsi="Arial" w:cs="Arial"/>
-          <w:sz w:val="24"/>
-          <w:szCs w:val="24"/>
-          <w:lang w:eastAsia="es-GT"/>
-        </w:rPr>
-      </w:pPr>
-    </w:p>
-    <w:p>
-      <w:pPr>
-        <w:spacing w:before="100" w:beforeAutospacing="1" w:after="100" w:afterAutospacing="1" w:line="240" w:lineRule="auto"/>
-        <w:rPr>
-          <w:rFonts w:ascii="Arial" w:eastAsia="Times New Roman" w:hAnsi="Arial" w:cs="Arial"/>
-          <w:sz w:val="24"/>
-          <w:szCs w:val="24"/>
-          <w:lang w:eastAsia="es-GT"/>
-        </w:rPr>
-      </w:pPr>
-    </w:p>
-    <w:p>
-      <w:pPr>
-        <w:spacing w:before="100" w:beforeAutospacing="1" w:after="100" w:afterAutospacing="1" w:line="240" w:lineRule="auto"/>
-        <w:rPr>
-          <w:rFonts w:ascii="Arial" w:eastAsia="Times New Roman" w:hAnsi="Arial" w:cs="Arial"/>
-          <w:sz w:val="24"/>
-          <w:szCs w:val="24"/>
-          <w:lang w:eastAsia="es-GT"/>
-        </w:rPr>
-      </w:pPr>
-    </w:p>
-    <w:p>
-      <w:pPr>
-        <w:spacing w:before="100" w:beforeAutospacing="1" w:after="100" w:afterAutospacing="1" w:line="240" w:lineRule="auto"/>
-        <w:rPr>
-          <w:rFonts w:ascii="Arial" w:eastAsia="Times New Roman" w:hAnsi="Arial" w:cs="Arial"/>
-          <w:sz w:val="24"/>
-          <w:szCs w:val="24"/>
-          <w:lang w:eastAsia="es-GT"/>
-        </w:rPr>
-      </w:pPr>
-    </w:p>
-    <w:p>
-      <w:pPr>
-        <w:spacing w:before="100" w:beforeAutospacing="1" w:after="100" w:afterAutospacing="1" w:line="240" w:lineRule="auto"/>
-        <w:rPr>
-          <w:rFonts w:ascii="Arial" w:eastAsia="Times New Roman" w:hAnsi="Arial" w:cs="Arial"/>
-          <w:sz w:val="24"/>
-          <w:szCs w:val="24"/>
-          <w:lang w:eastAsia="es-GT"/>
-        </w:rPr>
-      </w:pPr>
-    </w:p>
-    <w:p>
-      <w:pPr>
-        <w:spacing w:before="100" w:beforeAutospacing="1" w:after="100" w:afterAutospacing="1" w:line="240" w:lineRule="auto"/>
-        <w:rPr>
-          <w:rFonts w:ascii="Arial" w:eastAsia="Times New Roman" w:hAnsi="Arial" w:cs="Arial"/>
-          <w:sz w:val="24"/>
-          <w:szCs w:val="24"/>
-          <w:lang w:eastAsia="es-GT"/>
-        </w:rPr>
-      </w:pPr>
-    </w:p>
-    <w:p>
-      <w:pPr>
-        <w:spacing w:before="100" w:beforeAutospacing="1" w:after="100" w:afterAutospacing="1" w:line="240" w:lineRule="auto"/>
-        <w:rPr>
-          <w:rFonts w:ascii="Arial" w:eastAsia="Times New Roman" w:hAnsi="Arial" w:cs="Arial"/>
-          <w:sz w:val="24"/>
-          <w:szCs w:val="24"/>
-          <w:lang w:eastAsia="es-GT"/>
-        </w:rPr>
-      </w:pPr>
-    </w:p>
-    <w:p>
-      <w:pPr>
-        <w:spacing w:before="100" w:beforeAutospacing="1" w:after="100" w:afterAutospacing="1" w:line="240" w:lineRule="auto"/>
-        <w:rPr>
-          <w:rFonts w:ascii="Arial" w:eastAsia="Times New Roman" w:hAnsi="Arial" w:cs="Arial"/>
-          <w:sz w:val="24"/>
-          <w:szCs w:val="24"/>
-          <w:lang w:eastAsia="es-GT"/>
-        </w:rPr>
-      </w:pPr>
-    </w:p>
-    <w:p>
-      <w:pPr>
-        <w:spacing w:before="100" w:beforeAutospacing="1" w:after="100" w:afterAutospacing="1" w:line="240" w:lineRule="auto"/>
-        <w:rPr>
-          <w:rFonts w:ascii="Arial" w:eastAsia="Times New Roman" w:hAnsi="Arial" w:cs="Arial"/>
-          <w:sz w:val="24"/>
-          <w:szCs w:val="24"/>
-          <w:lang w:eastAsia="es-GT"/>
-        </w:rPr>
-      </w:pPr>
-    </w:p>
-    <w:p>
-      <w:pPr>
-        <w:spacing w:before="100" w:beforeAutospacing="1" w:after="100" w:afterAutospacing="1" w:line="240" w:lineRule="auto"/>
-        <w:rPr>
-          <w:rFonts w:ascii="Arial" w:eastAsia="Times New Roman" w:hAnsi="Arial" w:cs="Arial"/>
-          <w:sz w:val="24"/>
-          <w:szCs w:val="24"/>
-          <w:lang w:eastAsia="es-GT"/>
-        </w:rPr>
-      </w:pPr>
-    </w:p>
-    <w:p>
-      <w:pPr>
-        <w:spacing w:before="100" w:beforeAutospacing="1" w:after="100" w:afterAutospacing="1" w:line="240" w:lineRule="auto"/>
-        <w:rPr>
-          <w:rFonts w:ascii="Arial" w:eastAsia="Times New Roman" w:hAnsi="Arial" w:cs="Arial"/>
-          <w:sz w:val="24"/>
-          <w:szCs w:val="24"/>
-          <w:lang w:eastAsia="es-GT"/>
-        </w:rPr>
-      </w:pPr>
-    </w:p>
-    <w:p>
-      <w:pPr>
-        <w:spacing w:before="100" w:beforeAutospacing="1" w:after="100" w:afterAutospacing="1" w:line="240" w:lineRule="auto"/>
-        <w:rPr>
-          <w:rFonts w:ascii="Arial" w:eastAsia="Times New Roman" w:hAnsi="Arial" w:cs="Arial"/>
-          <w:sz w:val="24"/>
-          <w:szCs w:val="24"/>
-          <w:lang w:eastAsia="es-GT"/>
-        </w:rPr>
-      </w:pPr>
-    </w:p>
-    <w:p>
-      <w:pPr>
-        <w:spacing w:before="100" w:beforeAutospacing="1" w:after="100" w:afterAutospacing="1" w:line="240" w:lineRule="auto"/>
-        <w:rPr>
-          <w:rFonts w:ascii="Arial" w:eastAsia="Times New Roman" w:hAnsi="Arial" w:cs="Arial"/>
-          <w:sz w:val="24"/>
-          <w:szCs w:val="24"/>
-          <w:lang w:eastAsia="es-GT"/>
-        </w:rPr>
-      </w:pPr>
-    </w:p>
-    <w:p>
-      <w:pPr>
-        <w:spacing w:before="100" w:beforeAutospacing="1" w:after="100" w:afterAutospacing="1" w:line="240" w:lineRule="auto"/>
-        <w:rPr>
-          <w:rFonts w:ascii="Arial" w:eastAsia="Times New Roman" w:hAnsi="Arial" w:cs="Arial"/>
-          <w:sz w:val="24"/>
-          <w:szCs w:val="24"/>
-          <w:lang w:eastAsia="es-GT"/>
-        </w:rPr>
-      </w:pPr>
-    </w:p>
-    <w:p>
-      <w:pPr>
-        <w:spacing w:before="100" w:beforeAutospacing="1" w:after="100" w:afterAutospacing="1" w:line="240" w:lineRule="auto"/>
-        <w:rPr>
-          <w:rFonts w:ascii="Arial" w:eastAsia="Times New Roman" w:hAnsi="Arial" w:cs="Arial"/>
-          <w:sz w:val="24"/>
-          <w:szCs w:val="24"/>
-          <w:lang w:eastAsia="es-GT"/>
-        </w:rPr>
-      </w:pPr>
+          <w:szCs w:val="24"/>
+          <w:lang w:eastAsia="es-GT"/>
+        </w:rPr>
+      </w:pPr>
+      <w:r>
+        <w:rPr>
+          <w:rFonts w:ascii="Arial" w:eastAsia="Times New Roman" w:hAnsi="Arial" w:cs="Arial"/>
+          <w:szCs w:val="24"/>
+          <w:lang w:eastAsia="es-GT"/>
+        </w:rPr>
+        <w:t>HUKC-002</w:t>
+      </w:r>
+      <w:r>
+        <w:rPr>
+          <w:rFonts w:ascii="Arial" w:eastAsia="Times New Roman" w:hAnsi="Arial" w:cs="Arial"/>
+          <w:b/>
+          <w:bCs/>
+          <w:szCs w:val="24"/>
+          <w:lang w:eastAsia="es-GT"/>
+        </w:rPr>
+        <w:t xml:space="preserve"> Edición de Perfil de Usuario</w:t>
+      </w:r>
+    </w:p>
+    <w:p>
+      <w:pPr>
+        <w:spacing w:before="100" w:beforeAutospacing="1" w:after="100" w:afterAutospacing="1" w:line="240" w:lineRule="auto"/>
+        <w:rPr>
+          <w:rFonts w:ascii="Arial" w:eastAsia="Times New Roman" w:hAnsi="Arial" w:cs="Arial"/>
+          <w:szCs w:val="24"/>
+          <w:lang w:eastAsia="es-GT"/>
+        </w:rPr>
+      </w:pPr>
+      <w:r>
+        <w:rPr>
+          <w:rFonts w:ascii="Arial" w:eastAsia="Times New Roman" w:hAnsi="Arial" w:cs="Arial"/>
+          <w:b/>
+          <w:szCs w:val="24"/>
+          <w:lang w:eastAsia="es-GT"/>
+        </w:rPr>
+        <w:t>Como</w:t>
+      </w:r>
+      <w:r>
+        <w:rPr>
+          <w:rFonts w:ascii="Arial" w:eastAsia="Times New Roman" w:hAnsi="Arial" w:cs="Arial"/>
+          <w:szCs w:val="24"/>
+          <w:lang w:eastAsia="es-GT"/>
+        </w:rPr>
+        <w:t>: Un usuario registrado</w:t>
+      </w:r>
+    </w:p>
+    <w:p>
+      <w:pPr>
+        <w:spacing w:before="100" w:beforeAutospacing="1" w:after="100" w:afterAutospacing="1" w:line="240" w:lineRule="auto"/>
+        <w:rPr>
+          <w:rFonts w:ascii="Arial" w:eastAsia="Times New Roman" w:hAnsi="Arial" w:cs="Arial"/>
+          <w:szCs w:val="24"/>
+          <w:lang w:eastAsia="es-GT"/>
+        </w:rPr>
+      </w:pPr>
+      <w:r>
+        <w:rPr>
+          <w:rFonts w:ascii="Arial" w:eastAsia="Times New Roman" w:hAnsi="Arial" w:cs="Arial"/>
+          <w:szCs w:val="24"/>
+          <w:lang w:eastAsia="es-GT"/>
+        </w:rPr>
+        <w:t xml:space="preserve"> </w:t>
+      </w:r>
+      <w:r>
+        <w:rPr>
+          <w:rFonts w:ascii="Arial" w:eastAsia="Times New Roman" w:hAnsi="Arial" w:cs="Arial"/>
+          <w:b/>
+          <w:szCs w:val="24"/>
+          <w:lang w:eastAsia="es-GT"/>
+        </w:rPr>
+        <w:t>Quiero</w:t>
+      </w:r>
+      <w:r>
+        <w:rPr>
+          <w:rFonts w:ascii="Arial" w:eastAsia="Times New Roman" w:hAnsi="Arial" w:cs="Arial"/>
+          <w:szCs w:val="24"/>
+          <w:lang w:eastAsia="es-GT"/>
+        </w:rPr>
+        <w:t xml:space="preserve">: Poder editar mi nombre, correo, teléfono, fecha de nacimiento, tipo de usuario y subir imágenes a mi perfil </w:t>
+      </w:r>
+    </w:p>
+    <w:p>
+      <w:pPr>
+        <w:spacing w:before="100" w:beforeAutospacing="1" w:after="100" w:afterAutospacing="1" w:line="240" w:lineRule="auto"/>
+        <w:rPr>
+          <w:rFonts w:ascii="Arial" w:eastAsia="Times New Roman" w:hAnsi="Arial" w:cs="Arial"/>
+          <w:szCs w:val="24"/>
+          <w:lang w:eastAsia="es-GT"/>
+        </w:rPr>
+      </w:pPr>
+      <w:r>
+        <w:rPr>
+          <w:rFonts w:ascii="Arial" w:eastAsia="Times New Roman" w:hAnsi="Arial" w:cs="Arial"/>
+          <w:b/>
+          <w:szCs w:val="24"/>
+          <w:lang w:eastAsia="es-GT"/>
+        </w:rPr>
+        <w:t>Para</w:t>
+      </w:r>
+      <w:r>
+        <w:rPr>
+          <w:rFonts w:ascii="Arial" w:eastAsia="Times New Roman" w:hAnsi="Arial" w:cs="Arial"/>
+          <w:szCs w:val="24"/>
+          <w:lang w:eastAsia="es-GT"/>
+        </w:rPr>
+        <w:t>: Mantener mi información actualizada y personalizada en la plataforma.</w:t>
+      </w:r>
+    </w:p>
+    <w:p>
+      <w:pPr>
+        <w:spacing w:before="100" w:beforeAutospacing="1" w:after="100" w:afterAutospacing="1" w:line="240" w:lineRule="auto"/>
+        <w:ind w:left="708" w:hanging="708"/>
+        <w:rPr>
+          <w:rFonts w:ascii="Arial" w:eastAsia="Times New Roman" w:hAnsi="Arial" w:cs="Arial"/>
+          <w:sz w:val="24"/>
+          <w:szCs w:val="24"/>
+          <w:lang w:eastAsia="es-GT"/>
+        </w:rPr>
+      </w:pPr>
+    </w:p>
+    <w:p>
+      <w:pPr>
+        <w:spacing w:before="100" w:beforeAutospacing="1" w:after="100" w:afterAutospacing="1" w:line="240" w:lineRule="auto"/>
+        <w:rPr>
+          <w:rFonts w:ascii="Arial" w:eastAsia="Times New Roman" w:hAnsi="Arial" w:cs="Arial"/>
+          <w:sz w:val="24"/>
+          <w:szCs w:val="24"/>
+          <w:lang w:eastAsia="es-GT"/>
+        </w:rPr>
+      </w:pPr>
+    </w:p>
+    <w:p>
+      <w:pPr>
+        <w:spacing w:before="100" w:beforeAutospacing="1" w:after="100" w:afterAutospacing="1" w:line="240" w:lineRule="auto"/>
+        <w:rPr>
+          <w:rFonts w:ascii="Arial" w:eastAsia="Times New Roman" w:hAnsi="Arial" w:cs="Arial"/>
+          <w:sz w:val="24"/>
+          <w:szCs w:val="24"/>
+          <w:lang w:eastAsia="es-GT"/>
+        </w:rPr>
+      </w:pPr>
+    </w:p>
+    <w:p>
+      <w:pPr>
+        <w:spacing w:before="100" w:beforeAutospacing="1" w:after="100" w:afterAutospacing="1" w:line="240" w:lineRule="auto"/>
+        <w:rPr>
+          <w:rFonts w:ascii="Arial" w:eastAsia="Times New Roman" w:hAnsi="Arial" w:cs="Arial"/>
+          <w:sz w:val="24"/>
+          <w:szCs w:val="24"/>
+          <w:lang w:eastAsia="es-GT"/>
+        </w:rPr>
+      </w:pPr>
+    </w:p>
+    <w:p>
+      <w:pPr>
+        <w:spacing w:before="100" w:beforeAutospacing="1" w:after="100" w:afterAutospacing="1" w:line="240" w:lineRule="auto"/>
+        <w:rPr>
+          <w:rFonts w:ascii="Arial" w:eastAsia="Times New Roman" w:hAnsi="Arial" w:cs="Arial"/>
+          <w:sz w:val="24"/>
+          <w:szCs w:val="24"/>
+          <w:lang w:eastAsia="es-GT"/>
+        </w:rPr>
+      </w:pPr>
+    </w:p>
+    <w:p>
+      <w:pPr>
+        <w:spacing w:before="100" w:beforeAutospacing="1" w:after="100" w:afterAutospacing="1" w:line="240" w:lineRule="auto"/>
+        <w:rPr>
+          <w:rFonts w:ascii="Arial" w:eastAsia="Times New Roman" w:hAnsi="Arial" w:cs="Arial"/>
+          <w:sz w:val="24"/>
+          <w:szCs w:val="24"/>
+          <w:lang w:eastAsia="es-GT"/>
+        </w:rPr>
+      </w:pPr>
+    </w:p>
+    <w:p>
+      <w:pPr>
+        <w:spacing w:before="100" w:beforeAutospacing="1" w:after="100" w:afterAutospacing="1" w:line="240" w:lineRule="auto"/>
+        <w:rPr>
+          <w:rFonts w:ascii="Arial" w:eastAsia="Times New Roman" w:hAnsi="Arial" w:cs="Arial"/>
+          <w:sz w:val="24"/>
+          <w:szCs w:val="24"/>
+          <w:lang w:eastAsia="es-GT"/>
+        </w:rPr>
+      </w:pPr>
+    </w:p>
+    <w:p>
+      <w:pPr>
+        <w:spacing w:before="100" w:beforeAutospacing="1" w:after="100" w:afterAutospacing="1" w:line="240" w:lineRule="auto"/>
+        <w:rPr>
+          <w:rFonts w:ascii="Arial" w:eastAsia="Times New Roman" w:hAnsi="Arial" w:cs="Arial"/>
+          <w:sz w:val="24"/>
+          <w:szCs w:val="24"/>
+          <w:lang w:eastAsia="es-GT"/>
+        </w:rPr>
+      </w:pPr>
+    </w:p>
+    <w:p>
+      <w:pPr>
+        <w:spacing w:before="100" w:beforeAutospacing="1" w:after="100" w:afterAutospacing="1" w:line="240" w:lineRule="auto"/>
+        <w:rPr>
+          <w:rFonts w:ascii="Arial" w:eastAsia="Times New Roman" w:hAnsi="Arial" w:cs="Arial"/>
+          <w:sz w:val="24"/>
+          <w:szCs w:val="24"/>
+          <w:lang w:eastAsia="es-GT"/>
+        </w:rPr>
+      </w:pPr>
+    </w:p>
+    <w:p>
+      <w:pPr>
+        <w:spacing w:before="100" w:beforeAutospacing="1" w:after="100" w:afterAutospacing="1" w:line="240" w:lineRule="auto"/>
+        <w:rPr>
+          <w:rFonts w:ascii="Arial" w:eastAsia="Times New Roman" w:hAnsi="Arial" w:cs="Arial"/>
+          <w:sz w:val="24"/>
+          <w:szCs w:val="24"/>
+          <w:lang w:eastAsia="es-GT"/>
+        </w:rPr>
+      </w:pPr>
+    </w:p>
+    <w:p>
+      <w:pPr>
+        <w:spacing w:before="100" w:beforeAutospacing="1" w:after="100" w:afterAutospacing="1" w:line="240" w:lineRule="auto"/>
+        <w:rPr>
+          <w:rFonts w:ascii="Arial" w:eastAsia="Times New Roman" w:hAnsi="Arial" w:cs="Arial"/>
+          <w:sz w:val="24"/>
+          <w:szCs w:val="24"/>
+          <w:lang w:eastAsia="es-GT"/>
+        </w:rPr>
+      </w:pPr>
+    </w:p>
+    <w:p>
+      <w:pPr>
+        <w:spacing w:before="100" w:beforeAutospacing="1" w:after="100" w:afterAutospacing="1" w:line="240" w:lineRule="auto"/>
+        <w:rPr>
+          <w:rFonts w:ascii="Arial" w:eastAsia="Times New Roman" w:hAnsi="Arial" w:cs="Arial"/>
+          <w:sz w:val="24"/>
+          <w:szCs w:val="24"/>
+          <w:lang w:eastAsia="es-GT"/>
+        </w:rPr>
+      </w:pPr>
+    </w:p>
+    <w:p>
+      <w:pPr>
+        <w:spacing w:before="100" w:beforeAutospacing="1" w:after="100" w:afterAutospacing="1" w:line="240" w:lineRule="auto"/>
+        <w:rPr>
+          <w:rFonts w:ascii="Arial" w:eastAsia="Times New Roman" w:hAnsi="Arial" w:cs="Arial"/>
+          <w:sz w:val="24"/>
+          <w:szCs w:val="24"/>
+          <w:lang w:eastAsia="es-GT"/>
+        </w:rPr>
+      </w:pPr>
+    </w:p>
+    <w:p>
+      <w:pPr>
+        <w:spacing w:before="100" w:beforeAutospacing="1" w:after="100" w:afterAutospacing="1" w:line="240" w:lineRule="auto"/>
+        <w:rPr>
+          <w:rFonts w:ascii="Arial" w:eastAsia="Times New Roman" w:hAnsi="Arial" w:cs="Arial"/>
+          <w:sz w:val="24"/>
+          <w:szCs w:val="24"/>
+          <w:lang w:eastAsia="es-GT"/>
+        </w:rPr>
+      </w:pPr>
+    </w:p>
+    <w:p>
+      <w:pPr>
+        <w:spacing w:before="100" w:beforeAutospacing="1" w:after="100" w:afterAutospacing="1" w:line="240" w:lineRule="auto"/>
+        <w:rPr>
+          <w:rFonts w:ascii="Arial" w:eastAsia="Times New Roman" w:hAnsi="Arial" w:cs="Arial"/>
+          <w:sz w:val="24"/>
+          <w:szCs w:val="24"/>
+          <w:lang w:eastAsia="es-GT"/>
+        </w:rPr>
+      </w:pPr>
+    </w:p>
+    <w:p>
+      <w:pPr>
+        <w:spacing w:before="100" w:beforeAutospacing="1" w:after="100" w:afterAutospacing="1" w:line="240" w:lineRule="auto"/>
+        <w:rPr>
+          <w:rFonts w:ascii="Arial" w:eastAsia="Times New Roman" w:hAnsi="Arial" w:cs="Arial"/>
+          <w:sz w:val="24"/>
+          <w:szCs w:val="24"/>
+          <w:lang w:eastAsia="es-GT"/>
+        </w:rPr>
+      </w:pPr>
+    </w:p>
+    <w:p>
+      <w:pPr>
+        <w:spacing w:before="100" w:beforeAutospacing="1" w:after="100" w:afterAutospacing="1" w:line="240" w:lineRule="auto"/>
+        <w:rPr>
+          <w:rFonts w:ascii="Arial" w:eastAsia="Times New Roman" w:hAnsi="Arial" w:cs="Arial"/>
+          <w:sz w:val="24"/>
+          <w:szCs w:val="24"/>
+          <w:lang w:eastAsia="es-GT"/>
+        </w:rPr>
+      </w:pPr>
+    </w:p>
+    <w:p>
+      <w:pPr>
+        <w:spacing w:before="100" w:beforeAutospacing="1" w:after="100" w:afterAutospacing="1" w:line="240" w:lineRule="auto"/>
+        <w:rPr>
+          <w:rFonts w:ascii="Arial" w:eastAsia="Times New Roman" w:hAnsi="Arial" w:cs="Arial"/>
+          <w:sz w:val="24"/>
+          <w:szCs w:val="24"/>
+          <w:lang w:eastAsia="es-GT"/>
+        </w:rPr>
+      </w:pPr>
+    </w:p>
+    <w:p>
+      <w:pPr>
+        <w:spacing w:before="100" w:beforeAutospacing="1" w:after="100" w:afterAutospacing="1" w:line="240" w:lineRule="auto"/>
+        <w:rPr>
+          <w:rFonts w:ascii="Arial" w:eastAsia="Times New Roman" w:hAnsi="Arial" w:cs="Arial"/>
+          <w:sz w:val="24"/>
+          <w:szCs w:val="24"/>
+          <w:lang w:eastAsia="es-GT"/>
+        </w:rPr>
+      </w:pPr>
+    </w:p>
+    <w:p>
+      <w:pPr>
+        <w:spacing w:before="100" w:beforeAutospacing="1" w:after="100" w:afterAutospacing="1" w:line="240" w:lineRule="auto"/>
+        <w:rPr>
+          <w:rFonts w:ascii="Arial" w:eastAsia="Times New Roman" w:hAnsi="Arial" w:cs="Arial"/>
+          <w:sz w:val="24"/>
+          <w:szCs w:val="24"/>
+          <w:lang w:eastAsia="es-GT"/>
+        </w:rPr>
+      </w:pPr>
+    </w:p>
+    <w:p>
+      <w:pPr>
+        <w:spacing w:before="100" w:beforeAutospacing="1" w:after="100" w:afterAutospacing="1" w:line="240" w:lineRule="auto"/>
+        <w:rPr>
+          <w:rFonts w:ascii="Arial" w:eastAsia="Times New Roman" w:hAnsi="Arial" w:cs="Arial"/>
+          <w:sz w:val="24"/>
+          <w:szCs w:val="24"/>
+          <w:lang w:eastAsia="es-GT"/>
+        </w:rPr>
+      </w:pPr>
+    </w:p>
+    <w:p>
+      <w:pPr>
+        <w:spacing w:before="100" w:beforeAutospacing="1" w:after="100" w:afterAutospacing="1" w:line="240" w:lineRule="auto"/>
+        <w:rPr>
+          <w:rFonts w:ascii="Arial" w:eastAsia="Times New Roman" w:hAnsi="Arial" w:cs="Arial"/>
+          <w:sz w:val="24"/>
+          <w:szCs w:val="24"/>
+          <w:lang w:eastAsia="es-GT"/>
+        </w:rPr>
+      </w:pPr>
+    </w:p>
+    <w:p>
+      <w:pPr>
+        <w:spacing w:before="100" w:beforeAutospacing="1" w:after="100" w:afterAutospacing="1" w:line="240" w:lineRule="auto"/>
+        <w:rPr>
+          <w:rFonts w:ascii="Arial" w:eastAsia="Times New Roman" w:hAnsi="Arial" w:cs="Arial"/>
+          <w:sz w:val="24"/>
+          <w:szCs w:val="24"/>
+          <w:lang w:eastAsia="es-GT"/>
+        </w:rPr>
+      </w:pPr>
+    </w:p>
+    <w:p>
+      <w:pPr>
+        <w:spacing w:before="100" w:beforeAutospacing="1" w:after="100" w:afterAutospacing="1" w:line="240" w:lineRule="auto"/>
+        <w:rPr>
+          <w:rFonts w:ascii="Arial" w:eastAsia="Times New Roman" w:hAnsi="Arial" w:cs="Arial"/>
+          <w:sz w:val="24"/>
+          <w:szCs w:val="24"/>
+          <w:lang w:eastAsia="es-GT"/>
+        </w:rPr>
+      </w:pPr>
+    </w:p>
+    <w:p>
+      <w:pPr>
+        <w:spacing w:before="100" w:beforeAutospacing="1" w:after="100" w:afterAutospacing="1" w:line="240" w:lineRule="auto"/>
+        <w:rPr>
+          <w:rFonts w:ascii="Arial" w:eastAsia="Times New Roman" w:hAnsi="Arial" w:cs="Arial"/>
+          <w:sz w:val="24"/>
+          <w:szCs w:val="24"/>
+          <w:lang w:eastAsia="es-GT"/>
+        </w:rPr>
+      </w:pPr>
+    </w:p>
+    <w:p>
+      <w:pPr>
+        <w:spacing w:before="100" w:beforeAutospacing="1" w:after="100" w:afterAutospacing="1" w:line="240" w:lineRule="auto"/>
+        <w:rPr>
+          <w:rFonts w:ascii="Arial" w:eastAsia="Times New Roman" w:hAnsi="Arial" w:cs="Arial"/>
+          <w:sz w:val="24"/>
+          <w:szCs w:val="24"/>
+          <w:lang w:eastAsia="es-GT"/>
+        </w:rPr>
+      </w:pPr>
+      <w:bookmarkStart w:id="0" w:name="_GoBack"/>
+      <w:bookmarkEnd w:id="0"/>
     </w:p>
     <w:p>
       <w:pPr>

</xml_diff>

<commit_message>
add: Se agrego historia de usuario HUKC-003 dentro del documento Peaceathome.docx en la rama kcuyuch-2024177
</commit_message>
<xml_diff>
--- a/Peaceathome.docx
+++ b/Peaceathome.docx
@@ -1652,283 +1652,408 @@
           <w:lang w:eastAsia="es-GT"/>
         </w:rPr>
       </w:pPr>
-    </w:p>
-    <w:p>
-      <w:pPr>
-        <w:spacing w:before="100" w:beforeAutospacing="1" w:after="100" w:afterAutospacing="1" w:line="240" w:lineRule="auto"/>
-        <w:rPr>
-          <w:rFonts w:ascii="Arial" w:eastAsia="Times New Roman" w:hAnsi="Arial" w:cs="Arial"/>
-          <w:sz w:val="24"/>
-          <w:szCs w:val="24"/>
-          <w:lang w:eastAsia="es-GT"/>
-        </w:rPr>
-      </w:pPr>
-    </w:p>
-    <w:p>
-      <w:pPr>
-        <w:spacing w:before="100" w:beforeAutospacing="1" w:after="100" w:afterAutospacing="1" w:line="240" w:lineRule="auto"/>
-        <w:rPr>
-          <w:rFonts w:ascii="Arial" w:eastAsia="Times New Roman" w:hAnsi="Arial" w:cs="Arial"/>
-          <w:sz w:val="24"/>
-          <w:szCs w:val="24"/>
-          <w:lang w:eastAsia="es-GT"/>
-        </w:rPr>
-      </w:pPr>
-    </w:p>
-    <w:p>
-      <w:pPr>
-        <w:spacing w:before="100" w:beforeAutospacing="1" w:after="100" w:afterAutospacing="1" w:line="240" w:lineRule="auto"/>
-        <w:rPr>
-          <w:rFonts w:ascii="Arial" w:eastAsia="Times New Roman" w:hAnsi="Arial" w:cs="Arial"/>
-          <w:sz w:val="24"/>
-          <w:szCs w:val="24"/>
-          <w:lang w:eastAsia="es-GT"/>
-        </w:rPr>
-      </w:pPr>
-    </w:p>
-    <w:p>
-      <w:pPr>
-        <w:spacing w:before="100" w:beforeAutospacing="1" w:after="100" w:afterAutospacing="1" w:line="240" w:lineRule="auto"/>
-        <w:rPr>
-          <w:rFonts w:ascii="Arial" w:eastAsia="Times New Roman" w:hAnsi="Arial" w:cs="Arial"/>
-          <w:sz w:val="24"/>
-          <w:szCs w:val="24"/>
-          <w:lang w:eastAsia="es-GT"/>
-        </w:rPr>
-      </w:pPr>
-    </w:p>
-    <w:p>
-      <w:pPr>
-        <w:spacing w:before="100" w:beforeAutospacing="1" w:after="100" w:afterAutospacing="1" w:line="240" w:lineRule="auto"/>
-        <w:rPr>
-          <w:rFonts w:ascii="Arial" w:eastAsia="Times New Roman" w:hAnsi="Arial" w:cs="Arial"/>
-          <w:sz w:val="24"/>
-          <w:szCs w:val="24"/>
-          <w:lang w:eastAsia="es-GT"/>
-        </w:rPr>
-      </w:pPr>
-    </w:p>
-    <w:p>
-      <w:pPr>
-        <w:spacing w:before="100" w:beforeAutospacing="1" w:after="100" w:afterAutospacing="1" w:line="240" w:lineRule="auto"/>
-        <w:rPr>
-          <w:rFonts w:ascii="Arial" w:eastAsia="Times New Roman" w:hAnsi="Arial" w:cs="Arial"/>
-          <w:sz w:val="24"/>
-          <w:szCs w:val="24"/>
-          <w:lang w:eastAsia="es-GT"/>
-        </w:rPr>
-      </w:pPr>
-    </w:p>
-    <w:p>
-      <w:pPr>
-        <w:spacing w:before="100" w:beforeAutospacing="1" w:after="100" w:afterAutospacing="1" w:line="240" w:lineRule="auto"/>
-        <w:rPr>
-          <w:rFonts w:ascii="Arial" w:eastAsia="Times New Roman" w:hAnsi="Arial" w:cs="Arial"/>
-          <w:sz w:val="24"/>
-          <w:szCs w:val="24"/>
-          <w:lang w:eastAsia="es-GT"/>
-        </w:rPr>
-      </w:pPr>
-    </w:p>
-    <w:p>
-      <w:pPr>
-        <w:spacing w:before="100" w:beforeAutospacing="1" w:after="100" w:afterAutospacing="1" w:line="240" w:lineRule="auto"/>
-        <w:rPr>
-          <w:rFonts w:ascii="Arial" w:eastAsia="Times New Roman" w:hAnsi="Arial" w:cs="Arial"/>
-          <w:sz w:val="24"/>
-          <w:szCs w:val="24"/>
-          <w:lang w:eastAsia="es-GT"/>
-        </w:rPr>
-      </w:pPr>
-    </w:p>
-    <w:p>
-      <w:pPr>
-        <w:spacing w:before="100" w:beforeAutospacing="1" w:after="100" w:afterAutospacing="1" w:line="240" w:lineRule="auto"/>
-        <w:rPr>
-          <w:rFonts w:ascii="Arial" w:eastAsia="Times New Roman" w:hAnsi="Arial" w:cs="Arial"/>
-          <w:sz w:val="24"/>
-          <w:szCs w:val="24"/>
-          <w:lang w:eastAsia="es-GT"/>
-        </w:rPr>
-      </w:pPr>
-    </w:p>
-    <w:p>
-      <w:pPr>
-        <w:spacing w:before="100" w:beforeAutospacing="1" w:after="100" w:afterAutospacing="1" w:line="240" w:lineRule="auto"/>
-        <w:rPr>
-          <w:rFonts w:ascii="Arial" w:eastAsia="Times New Roman" w:hAnsi="Arial" w:cs="Arial"/>
-          <w:sz w:val="24"/>
-          <w:szCs w:val="24"/>
-          <w:lang w:eastAsia="es-GT"/>
-        </w:rPr>
-      </w:pPr>
-    </w:p>
-    <w:p>
-      <w:pPr>
-        <w:spacing w:before="100" w:beforeAutospacing="1" w:after="100" w:afterAutospacing="1" w:line="240" w:lineRule="auto"/>
-        <w:rPr>
-          <w:rFonts w:ascii="Arial" w:eastAsia="Times New Roman" w:hAnsi="Arial" w:cs="Arial"/>
-          <w:sz w:val="24"/>
-          <w:szCs w:val="24"/>
-          <w:lang w:eastAsia="es-GT"/>
-        </w:rPr>
-      </w:pPr>
-    </w:p>
-    <w:p>
-      <w:pPr>
-        <w:spacing w:before="100" w:beforeAutospacing="1" w:after="100" w:afterAutospacing="1" w:line="240" w:lineRule="auto"/>
-        <w:rPr>
-          <w:rFonts w:ascii="Arial" w:eastAsia="Times New Roman" w:hAnsi="Arial" w:cs="Arial"/>
-          <w:sz w:val="24"/>
-          <w:szCs w:val="24"/>
-          <w:lang w:eastAsia="es-GT"/>
-        </w:rPr>
-      </w:pPr>
-    </w:p>
-    <w:p>
-      <w:pPr>
-        <w:spacing w:before="100" w:beforeAutospacing="1" w:after="100" w:afterAutospacing="1" w:line="240" w:lineRule="auto"/>
-        <w:rPr>
-          <w:rFonts w:ascii="Arial" w:eastAsia="Times New Roman" w:hAnsi="Arial" w:cs="Arial"/>
-          <w:sz w:val="24"/>
-          <w:szCs w:val="24"/>
-          <w:lang w:eastAsia="es-GT"/>
-        </w:rPr>
-      </w:pPr>
-    </w:p>
-    <w:p>
-      <w:pPr>
-        <w:spacing w:before="100" w:beforeAutospacing="1" w:after="100" w:afterAutospacing="1" w:line="240" w:lineRule="auto"/>
-        <w:rPr>
-          <w:rFonts w:ascii="Arial" w:eastAsia="Times New Roman" w:hAnsi="Arial" w:cs="Arial"/>
-          <w:sz w:val="24"/>
-          <w:szCs w:val="24"/>
-          <w:lang w:eastAsia="es-GT"/>
-        </w:rPr>
-      </w:pPr>
-    </w:p>
-    <w:p>
-      <w:pPr>
-        <w:spacing w:before="100" w:beforeAutospacing="1" w:after="100" w:afterAutospacing="1" w:line="240" w:lineRule="auto"/>
-        <w:rPr>
-          <w:rFonts w:ascii="Arial" w:eastAsia="Times New Roman" w:hAnsi="Arial" w:cs="Arial"/>
-          <w:sz w:val="24"/>
-          <w:szCs w:val="24"/>
-          <w:lang w:eastAsia="es-GT"/>
-        </w:rPr>
-      </w:pPr>
-    </w:p>
-    <w:p>
-      <w:pPr>
-        <w:spacing w:before="100" w:beforeAutospacing="1" w:after="100" w:afterAutospacing="1" w:line="240" w:lineRule="auto"/>
-        <w:rPr>
-          <w:rFonts w:ascii="Arial" w:eastAsia="Times New Roman" w:hAnsi="Arial" w:cs="Arial"/>
-          <w:sz w:val="24"/>
-          <w:szCs w:val="24"/>
-          <w:lang w:eastAsia="es-GT"/>
-        </w:rPr>
-      </w:pPr>
-    </w:p>
-    <w:p>
-      <w:pPr>
-        <w:spacing w:before="100" w:beforeAutospacing="1" w:after="100" w:afterAutospacing="1" w:line="240" w:lineRule="auto"/>
-        <w:rPr>
-          <w:rFonts w:ascii="Arial" w:eastAsia="Times New Roman" w:hAnsi="Arial" w:cs="Arial"/>
-          <w:sz w:val="24"/>
-          <w:szCs w:val="24"/>
-          <w:lang w:eastAsia="es-GT"/>
-        </w:rPr>
-      </w:pPr>
-    </w:p>
-    <w:p>
-      <w:pPr>
-        <w:spacing w:before="100" w:beforeAutospacing="1" w:after="100" w:afterAutospacing="1" w:line="240" w:lineRule="auto"/>
-        <w:rPr>
-          <w:rFonts w:ascii="Arial" w:eastAsia="Times New Roman" w:hAnsi="Arial" w:cs="Arial"/>
-          <w:sz w:val="24"/>
-          <w:szCs w:val="24"/>
-          <w:lang w:eastAsia="es-GT"/>
-        </w:rPr>
-      </w:pPr>
-    </w:p>
-    <w:p>
-      <w:pPr>
-        <w:spacing w:before="100" w:beforeAutospacing="1" w:after="100" w:afterAutospacing="1" w:line="240" w:lineRule="auto"/>
-        <w:rPr>
-          <w:rFonts w:ascii="Arial" w:eastAsia="Times New Roman" w:hAnsi="Arial" w:cs="Arial"/>
-          <w:sz w:val="24"/>
-          <w:szCs w:val="24"/>
-          <w:lang w:eastAsia="es-GT"/>
-        </w:rPr>
-      </w:pPr>
-    </w:p>
-    <w:p>
-      <w:pPr>
-        <w:spacing w:before="100" w:beforeAutospacing="1" w:after="100" w:afterAutospacing="1" w:line="240" w:lineRule="auto"/>
-        <w:rPr>
-          <w:rFonts w:ascii="Arial" w:eastAsia="Times New Roman" w:hAnsi="Arial" w:cs="Arial"/>
-          <w:sz w:val="24"/>
-          <w:szCs w:val="24"/>
-          <w:lang w:eastAsia="es-GT"/>
-        </w:rPr>
-      </w:pPr>
-    </w:p>
-    <w:p>
-      <w:pPr>
-        <w:spacing w:before="100" w:beforeAutospacing="1" w:after="100" w:afterAutospacing="1" w:line="240" w:lineRule="auto"/>
-        <w:rPr>
-          <w:rFonts w:ascii="Arial" w:eastAsia="Times New Roman" w:hAnsi="Arial" w:cs="Arial"/>
-          <w:sz w:val="24"/>
-          <w:szCs w:val="24"/>
-          <w:lang w:eastAsia="es-GT"/>
-        </w:rPr>
-      </w:pPr>
-    </w:p>
-    <w:p>
-      <w:pPr>
-        <w:spacing w:before="100" w:beforeAutospacing="1" w:after="100" w:afterAutospacing="1" w:line="240" w:lineRule="auto"/>
-        <w:rPr>
-          <w:rFonts w:ascii="Arial" w:eastAsia="Times New Roman" w:hAnsi="Arial" w:cs="Arial"/>
-          <w:sz w:val="24"/>
-          <w:szCs w:val="24"/>
-          <w:lang w:eastAsia="es-GT"/>
-        </w:rPr>
-      </w:pPr>
-    </w:p>
-    <w:p>
-      <w:pPr>
-        <w:spacing w:before="100" w:beforeAutospacing="1" w:after="100" w:afterAutospacing="1" w:line="240" w:lineRule="auto"/>
-        <w:rPr>
-          <w:rFonts w:ascii="Arial" w:eastAsia="Times New Roman" w:hAnsi="Arial" w:cs="Arial"/>
-          <w:sz w:val="24"/>
-          <w:szCs w:val="24"/>
-          <w:lang w:eastAsia="es-GT"/>
-        </w:rPr>
-      </w:pPr>
-    </w:p>
-    <w:p>
-      <w:pPr>
-        <w:spacing w:before="100" w:beforeAutospacing="1" w:after="100" w:afterAutospacing="1" w:line="240" w:lineRule="auto"/>
-        <w:rPr>
-          <w:rFonts w:ascii="Arial" w:eastAsia="Times New Roman" w:hAnsi="Arial" w:cs="Arial"/>
-          <w:sz w:val="24"/>
-          <w:szCs w:val="24"/>
-          <w:lang w:eastAsia="es-GT"/>
-        </w:rPr>
-      </w:pPr>
-    </w:p>
-    <w:p>
-      <w:pPr>
-        <w:spacing w:before="100" w:beforeAutospacing="1" w:after="100" w:afterAutospacing="1" w:line="240" w:lineRule="auto"/>
-        <w:rPr>
-          <w:rFonts w:ascii="Arial" w:eastAsia="Times New Roman" w:hAnsi="Arial" w:cs="Arial"/>
-          <w:sz w:val="24"/>
-          <w:szCs w:val="24"/>
-          <w:lang w:eastAsia="es-GT"/>
-        </w:rPr>
-      </w:pPr>
       <w:bookmarkStart w:id="0" w:name="_GoBack"/>
       <w:bookmarkEnd w:id="0"/>
+    </w:p>
+    <w:p>
+      <w:pPr>
+        <w:spacing w:before="100" w:beforeAutospacing="1" w:after="100" w:afterAutospacing="1" w:line="240" w:lineRule="auto"/>
+        <w:rPr>
+          <w:rFonts w:ascii="Arial" w:eastAsia="Times New Roman" w:hAnsi="Arial" w:cs="Arial"/>
+          <w:szCs w:val="24"/>
+          <w:lang w:eastAsia="es-GT"/>
+        </w:rPr>
+      </w:pPr>
+      <w:r>
+        <w:rPr>
+          <w:rFonts w:ascii="Arial" w:eastAsia="Times New Roman" w:hAnsi="Arial" w:cs="Arial"/>
+          <w:szCs w:val="24"/>
+          <w:lang w:eastAsia="es-GT"/>
+        </w:rPr>
+        <w:t>HUKC-003</w:t>
+      </w:r>
+      <w:r>
+        <w:rPr>
+          <w:rFonts w:ascii="Arial" w:eastAsia="Times New Roman" w:hAnsi="Arial" w:cs="Arial"/>
+          <w:b/>
+          <w:bCs/>
+          <w:szCs w:val="24"/>
+          <w:lang w:eastAsia="es-GT"/>
+        </w:rPr>
+        <w:t xml:space="preserve"> Visualización de Perfil de Usuario</w:t>
+      </w:r>
+    </w:p>
+    <w:p>
+      <w:pPr>
+        <w:spacing w:before="100" w:beforeAutospacing="1" w:after="100" w:afterAutospacing="1" w:line="240" w:lineRule="auto"/>
+        <w:rPr>
+          <w:rFonts w:ascii="Arial" w:eastAsia="Times New Roman" w:hAnsi="Arial" w:cs="Arial"/>
+          <w:szCs w:val="24"/>
+          <w:lang w:eastAsia="es-GT"/>
+        </w:rPr>
+      </w:pPr>
+      <w:r>
+        <w:rPr>
+          <w:rFonts w:ascii="Arial" w:eastAsia="Times New Roman" w:hAnsi="Arial" w:cs="Arial"/>
+          <w:b/>
+          <w:szCs w:val="24"/>
+          <w:lang w:eastAsia="es-GT"/>
+        </w:rPr>
+        <w:t>Como</w:t>
+      </w:r>
+      <w:r>
+        <w:rPr>
+          <w:rFonts w:ascii="Arial" w:eastAsia="Times New Roman" w:hAnsi="Arial" w:cs="Arial"/>
+          <w:szCs w:val="24"/>
+          <w:lang w:eastAsia="es-GT"/>
+        </w:rPr>
+        <w:t>: Un usuario (o un empleado del área con permisos)</w:t>
+      </w:r>
+    </w:p>
+    <w:p>
+      <w:pPr>
+        <w:spacing w:before="100" w:beforeAutospacing="1" w:after="100" w:afterAutospacing="1" w:line="240" w:lineRule="auto"/>
+        <w:rPr>
+          <w:rFonts w:ascii="Arial" w:eastAsia="Times New Roman" w:hAnsi="Arial" w:cs="Arial"/>
+          <w:szCs w:val="24"/>
+          <w:lang w:eastAsia="es-GT"/>
+        </w:rPr>
+      </w:pPr>
+      <w:r>
+        <w:rPr>
+          <w:rFonts w:ascii="Arial" w:eastAsia="Times New Roman" w:hAnsi="Arial" w:cs="Arial"/>
+          <w:szCs w:val="24"/>
+          <w:lang w:eastAsia="es-GT"/>
+        </w:rPr>
+        <w:t xml:space="preserve"> </w:t>
+      </w:r>
+      <w:r>
+        <w:rPr>
+          <w:rFonts w:ascii="Arial" w:eastAsia="Times New Roman" w:hAnsi="Arial" w:cs="Arial"/>
+          <w:b/>
+          <w:szCs w:val="24"/>
+          <w:lang w:eastAsia="es-GT"/>
+        </w:rPr>
+        <w:t>Quiero</w:t>
+      </w:r>
+      <w:r>
+        <w:rPr>
+          <w:rFonts w:ascii="Arial" w:eastAsia="Times New Roman" w:hAnsi="Arial" w:cs="Arial"/>
+          <w:szCs w:val="24"/>
+          <w:lang w:eastAsia="es-GT"/>
+        </w:rPr>
+        <w:t>: Poder ver el perfil de un usuario, incluyendo su nombre, correo, teléfono, fecha de nacimiento, tipo de usuario y sus imágenes</w:t>
+      </w:r>
+    </w:p>
+    <w:p>
+      <w:pPr>
+        <w:spacing w:before="100" w:beforeAutospacing="1" w:after="100" w:afterAutospacing="1" w:line="240" w:lineRule="auto"/>
+        <w:rPr>
+          <w:rFonts w:ascii="Arial" w:eastAsia="Times New Roman" w:hAnsi="Arial" w:cs="Arial"/>
+          <w:szCs w:val="24"/>
+          <w:lang w:eastAsia="es-GT"/>
+        </w:rPr>
+      </w:pPr>
+      <w:r>
+        <w:rPr>
+          <w:rFonts w:ascii="Arial" w:eastAsia="Times New Roman" w:hAnsi="Arial" w:cs="Arial"/>
+          <w:szCs w:val="24"/>
+          <w:lang w:eastAsia="es-GT"/>
+        </w:rPr>
+        <w:t xml:space="preserve"> </w:t>
+      </w:r>
+      <w:r>
+        <w:rPr>
+          <w:rFonts w:ascii="Arial" w:eastAsia="Times New Roman" w:hAnsi="Arial" w:cs="Arial"/>
+          <w:b/>
+          <w:szCs w:val="24"/>
+          <w:lang w:eastAsia="es-GT"/>
+        </w:rPr>
+        <w:t>Para</w:t>
+      </w:r>
+      <w:r>
+        <w:rPr>
+          <w:rFonts w:ascii="Arial" w:eastAsia="Times New Roman" w:hAnsi="Arial" w:cs="Arial"/>
+          <w:szCs w:val="24"/>
+          <w:lang w:eastAsia="es-GT"/>
+        </w:rPr>
+        <w:t>: Obtener información relevante sobre un usuario específico en la plataforma.</w:t>
+      </w:r>
+    </w:p>
+    <w:p>
+      <w:pPr>
+        <w:spacing w:before="100" w:beforeAutospacing="1" w:after="100" w:afterAutospacing="1" w:line="240" w:lineRule="auto"/>
+        <w:rPr>
+          <w:rFonts w:ascii="Arial" w:eastAsia="Times New Roman" w:hAnsi="Arial" w:cs="Arial"/>
+          <w:sz w:val="24"/>
+          <w:szCs w:val="24"/>
+          <w:lang w:eastAsia="es-GT"/>
+        </w:rPr>
+      </w:pPr>
+    </w:p>
+    <w:p>
+      <w:pPr>
+        <w:spacing w:before="100" w:beforeAutospacing="1" w:after="100" w:afterAutospacing="1" w:line="240" w:lineRule="auto"/>
+        <w:rPr>
+          <w:rFonts w:ascii="Arial" w:eastAsia="Times New Roman" w:hAnsi="Arial" w:cs="Arial"/>
+          <w:sz w:val="24"/>
+          <w:szCs w:val="24"/>
+          <w:lang w:eastAsia="es-GT"/>
+        </w:rPr>
+      </w:pPr>
+    </w:p>
+    <w:p>
+      <w:pPr>
+        <w:spacing w:before="100" w:beforeAutospacing="1" w:after="100" w:afterAutospacing="1" w:line="240" w:lineRule="auto"/>
+        <w:rPr>
+          <w:rFonts w:ascii="Arial" w:eastAsia="Times New Roman" w:hAnsi="Arial" w:cs="Arial"/>
+          <w:sz w:val="24"/>
+          <w:szCs w:val="24"/>
+          <w:lang w:eastAsia="es-GT"/>
+        </w:rPr>
+      </w:pPr>
+    </w:p>
+    <w:p>
+      <w:pPr>
+        <w:spacing w:before="100" w:beforeAutospacing="1" w:after="100" w:afterAutospacing="1" w:line="240" w:lineRule="auto"/>
+        <w:rPr>
+          <w:rFonts w:ascii="Arial" w:eastAsia="Times New Roman" w:hAnsi="Arial" w:cs="Arial"/>
+          <w:sz w:val="24"/>
+          <w:szCs w:val="24"/>
+          <w:lang w:eastAsia="es-GT"/>
+        </w:rPr>
+      </w:pPr>
+    </w:p>
+    <w:p>
+      <w:pPr>
+        <w:spacing w:before="100" w:beforeAutospacing="1" w:after="100" w:afterAutospacing="1" w:line="240" w:lineRule="auto"/>
+        <w:rPr>
+          <w:rFonts w:ascii="Arial" w:eastAsia="Times New Roman" w:hAnsi="Arial" w:cs="Arial"/>
+          <w:sz w:val="24"/>
+          <w:szCs w:val="24"/>
+          <w:lang w:eastAsia="es-GT"/>
+        </w:rPr>
+      </w:pPr>
+    </w:p>
+    <w:p>
+      <w:pPr>
+        <w:spacing w:before="100" w:beforeAutospacing="1" w:after="100" w:afterAutospacing="1" w:line="240" w:lineRule="auto"/>
+        <w:rPr>
+          <w:rFonts w:ascii="Arial" w:eastAsia="Times New Roman" w:hAnsi="Arial" w:cs="Arial"/>
+          <w:sz w:val="24"/>
+          <w:szCs w:val="24"/>
+          <w:lang w:eastAsia="es-GT"/>
+        </w:rPr>
+      </w:pPr>
+    </w:p>
+    <w:p>
+      <w:pPr>
+        <w:spacing w:before="100" w:beforeAutospacing="1" w:after="100" w:afterAutospacing="1" w:line="240" w:lineRule="auto"/>
+        <w:rPr>
+          <w:rFonts w:ascii="Arial" w:eastAsia="Times New Roman" w:hAnsi="Arial" w:cs="Arial"/>
+          <w:sz w:val="24"/>
+          <w:szCs w:val="24"/>
+          <w:lang w:eastAsia="es-GT"/>
+        </w:rPr>
+      </w:pPr>
+    </w:p>
+    <w:p>
+      <w:pPr>
+        <w:spacing w:before="100" w:beforeAutospacing="1" w:after="100" w:afterAutospacing="1" w:line="240" w:lineRule="auto"/>
+        <w:rPr>
+          <w:rFonts w:ascii="Arial" w:eastAsia="Times New Roman" w:hAnsi="Arial" w:cs="Arial"/>
+          <w:sz w:val="24"/>
+          <w:szCs w:val="24"/>
+          <w:lang w:eastAsia="es-GT"/>
+        </w:rPr>
+      </w:pPr>
+    </w:p>
+    <w:p>
+      <w:pPr>
+        <w:spacing w:before="100" w:beforeAutospacing="1" w:after="100" w:afterAutospacing="1" w:line="240" w:lineRule="auto"/>
+        <w:rPr>
+          <w:rFonts w:ascii="Arial" w:eastAsia="Times New Roman" w:hAnsi="Arial" w:cs="Arial"/>
+          <w:sz w:val="24"/>
+          <w:szCs w:val="24"/>
+          <w:lang w:eastAsia="es-GT"/>
+        </w:rPr>
+      </w:pPr>
+    </w:p>
+    <w:p>
+      <w:pPr>
+        <w:spacing w:before="100" w:beforeAutospacing="1" w:after="100" w:afterAutospacing="1" w:line="240" w:lineRule="auto"/>
+        <w:rPr>
+          <w:rFonts w:ascii="Arial" w:eastAsia="Times New Roman" w:hAnsi="Arial" w:cs="Arial"/>
+          <w:sz w:val="24"/>
+          <w:szCs w:val="24"/>
+          <w:lang w:eastAsia="es-GT"/>
+        </w:rPr>
+      </w:pPr>
+    </w:p>
+    <w:p>
+      <w:pPr>
+        <w:spacing w:before="100" w:beforeAutospacing="1" w:after="100" w:afterAutospacing="1" w:line="240" w:lineRule="auto"/>
+        <w:rPr>
+          <w:rFonts w:ascii="Arial" w:eastAsia="Times New Roman" w:hAnsi="Arial" w:cs="Arial"/>
+          <w:sz w:val="24"/>
+          <w:szCs w:val="24"/>
+          <w:lang w:eastAsia="es-GT"/>
+        </w:rPr>
+      </w:pPr>
+    </w:p>
+    <w:p>
+      <w:pPr>
+        <w:spacing w:before="100" w:beforeAutospacing="1" w:after="100" w:afterAutospacing="1" w:line="240" w:lineRule="auto"/>
+        <w:rPr>
+          <w:rFonts w:ascii="Arial" w:eastAsia="Times New Roman" w:hAnsi="Arial" w:cs="Arial"/>
+          <w:sz w:val="24"/>
+          <w:szCs w:val="24"/>
+          <w:lang w:eastAsia="es-GT"/>
+        </w:rPr>
+      </w:pPr>
+    </w:p>
+    <w:p>
+      <w:pPr>
+        <w:spacing w:before="100" w:beforeAutospacing="1" w:after="100" w:afterAutospacing="1" w:line="240" w:lineRule="auto"/>
+        <w:rPr>
+          <w:rFonts w:ascii="Arial" w:eastAsia="Times New Roman" w:hAnsi="Arial" w:cs="Arial"/>
+          <w:sz w:val="24"/>
+          <w:szCs w:val="24"/>
+          <w:lang w:eastAsia="es-GT"/>
+        </w:rPr>
+      </w:pPr>
+    </w:p>
+    <w:p>
+      <w:pPr>
+        <w:spacing w:before="100" w:beforeAutospacing="1" w:after="100" w:afterAutospacing="1" w:line="240" w:lineRule="auto"/>
+        <w:rPr>
+          <w:rFonts w:ascii="Arial" w:eastAsia="Times New Roman" w:hAnsi="Arial" w:cs="Arial"/>
+          <w:sz w:val="24"/>
+          <w:szCs w:val="24"/>
+          <w:lang w:eastAsia="es-GT"/>
+        </w:rPr>
+      </w:pPr>
+    </w:p>
+    <w:p>
+      <w:pPr>
+        <w:spacing w:before="100" w:beforeAutospacing="1" w:after="100" w:afterAutospacing="1" w:line="240" w:lineRule="auto"/>
+        <w:rPr>
+          <w:rFonts w:ascii="Arial" w:eastAsia="Times New Roman" w:hAnsi="Arial" w:cs="Arial"/>
+          <w:sz w:val="24"/>
+          <w:szCs w:val="24"/>
+          <w:lang w:eastAsia="es-GT"/>
+        </w:rPr>
+      </w:pPr>
+    </w:p>
+    <w:p>
+      <w:pPr>
+        <w:spacing w:before="100" w:beforeAutospacing="1" w:after="100" w:afterAutospacing="1" w:line="240" w:lineRule="auto"/>
+        <w:rPr>
+          <w:rFonts w:ascii="Arial" w:eastAsia="Times New Roman" w:hAnsi="Arial" w:cs="Arial"/>
+          <w:sz w:val="24"/>
+          <w:szCs w:val="24"/>
+          <w:lang w:eastAsia="es-GT"/>
+        </w:rPr>
+      </w:pPr>
+    </w:p>
+    <w:p>
+      <w:pPr>
+        <w:spacing w:before="100" w:beforeAutospacing="1" w:after="100" w:afterAutospacing="1" w:line="240" w:lineRule="auto"/>
+        <w:rPr>
+          <w:rFonts w:ascii="Arial" w:eastAsia="Times New Roman" w:hAnsi="Arial" w:cs="Arial"/>
+          <w:sz w:val="24"/>
+          <w:szCs w:val="24"/>
+          <w:lang w:eastAsia="es-GT"/>
+        </w:rPr>
+      </w:pPr>
+    </w:p>
+    <w:p>
+      <w:pPr>
+        <w:spacing w:before="100" w:beforeAutospacing="1" w:after="100" w:afterAutospacing="1" w:line="240" w:lineRule="auto"/>
+        <w:rPr>
+          <w:rFonts w:ascii="Arial" w:eastAsia="Times New Roman" w:hAnsi="Arial" w:cs="Arial"/>
+          <w:sz w:val="24"/>
+          <w:szCs w:val="24"/>
+          <w:lang w:eastAsia="es-GT"/>
+        </w:rPr>
+      </w:pPr>
+    </w:p>
+    <w:p>
+      <w:pPr>
+        <w:spacing w:before="100" w:beforeAutospacing="1" w:after="100" w:afterAutospacing="1" w:line="240" w:lineRule="auto"/>
+        <w:rPr>
+          <w:rFonts w:ascii="Arial" w:eastAsia="Times New Roman" w:hAnsi="Arial" w:cs="Arial"/>
+          <w:sz w:val="24"/>
+          <w:szCs w:val="24"/>
+          <w:lang w:eastAsia="es-GT"/>
+        </w:rPr>
+      </w:pPr>
+    </w:p>
+    <w:p>
+      <w:pPr>
+        <w:spacing w:before="100" w:beforeAutospacing="1" w:after="100" w:afterAutospacing="1" w:line="240" w:lineRule="auto"/>
+        <w:rPr>
+          <w:rFonts w:ascii="Arial" w:eastAsia="Times New Roman" w:hAnsi="Arial" w:cs="Arial"/>
+          <w:sz w:val="24"/>
+          <w:szCs w:val="24"/>
+          <w:lang w:eastAsia="es-GT"/>
+        </w:rPr>
+      </w:pPr>
+    </w:p>
+    <w:p>
+      <w:pPr>
+        <w:spacing w:before="100" w:beforeAutospacing="1" w:after="100" w:afterAutospacing="1" w:line="240" w:lineRule="auto"/>
+        <w:rPr>
+          <w:rFonts w:ascii="Arial" w:eastAsia="Times New Roman" w:hAnsi="Arial" w:cs="Arial"/>
+          <w:sz w:val="24"/>
+          <w:szCs w:val="24"/>
+          <w:lang w:eastAsia="es-GT"/>
+        </w:rPr>
+      </w:pPr>
+    </w:p>
+    <w:p>
+      <w:pPr>
+        <w:spacing w:before="100" w:beforeAutospacing="1" w:after="100" w:afterAutospacing="1" w:line="240" w:lineRule="auto"/>
+        <w:rPr>
+          <w:rFonts w:ascii="Arial" w:eastAsia="Times New Roman" w:hAnsi="Arial" w:cs="Arial"/>
+          <w:sz w:val="24"/>
+          <w:szCs w:val="24"/>
+          <w:lang w:eastAsia="es-GT"/>
+        </w:rPr>
+      </w:pPr>
+    </w:p>
+    <w:p>
+      <w:pPr>
+        <w:spacing w:before="100" w:beforeAutospacing="1" w:after="100" w:afterAutospacing="1" w:line="240" w:lineRule="auto"/>
+        <w:rPr>
+          <w:rFonts w:ascii="Arial" w:eastAsia="Times New Roman" w:hAnsi="Arial" w:cs="Arial"/>
+          <w:sz w:val="24"/>
+          <w:szCs w:val="24"/>
+          <w:lang w:eastAsia="es-GT"/>
+        </w:rPr>
+      </w:pPr>
+    </w:p>
+    <w:p>
+      <w:pPr>
+        <w:spacing w:before="100" w:beforeAutospacing="1" w:after="100" w:afterAutospacing="1" w:line="240" w:lineRule="auto"/>
+        <w:rPr>
+          <w:rFonts w:ascii="Arial" w:eastAsia="Times New Roman" w:hAnsi="Arial" w:cs="Arial"/>
+          <w:sz w:val="24"/>
+          <w:szCs w:val="24"/>
+          <w:lang w:eastAsia="es-GT"/>
+        </w:rPr>
+      </w:pPr>
+    </w:p>
+    <w:p>
+      <w:pPr>
+        <w:spacing w:before="100" w:beforeAutospacing="1" w:after="100" w:afterAutospacing="1" w:line="240" w:lineRule="auto"/>
+        <w:rPr>
+          <w:rFonts w:ascii="Arial" w:eastAsia="Times New Roman" w:hAnsi="Arial" w:cs="Arial"/>
+          <w:sz w:val="24"/>
+          <w:szCs w:val="24"/>
+          <w:lang w:eastAsia="es-GT"/>
+        </w:rPr>
+      </w:pPr>
     </w:p>
     <w:p>
       <w:pPr>

</xml_diff>

<commit_message>
add: Se agrego historia de usuario HUJC-004 dentro del documento Peaceathome.docx en la rama jcuc-2024100
</commit_message>
<xml_diff>
--- a/Peaceathome.docx
+++ b/Peaceathome.docx
@@ -19,8 +19,8 @@
           <w:lang w:eastAsia="es-GT"/>
         </w:rPr>
         <w:drawing>
-          <wp:inline distT="0" distB="0" distL="0" distR="0" wp14:anchorId="61DA3BD1" wp14:editId="0C35A376">
-            <wp:extent cx="2249144" cy="847725"/>
+          <wp:inline distT="0" distB="0" distL="0" distR="0" wp14:anchorId="2FEE8166" wp14:editId="6BE70031">
+            <wp:extent cx="2248535" cy="847725"/>
             <wp:effectExtent l="0" t="0" r="0" b="0"/>
             <wp:docPr id="2" name="Imagen 2"/>
             <wp:cNvGraphicFramePr>
@@ -30,13 +30,13 @@
               <a:graphicData uri="http://schemas.openxmlformats.org/drawingml/2006/picture">
                 <pic:pic xmlns:pic="http://schemas.openxmlformats.org/drawingml/2006/picture">
                   <pic:nvPicPr>
-                    <pic:cNvPr id="0" name="Picture 1"/>
+                    <pic:cNvPr id="2" name="Imagen 2"/>
                     <pic:cNvPicPr>
                       <a:picLocks noChangeAspect="1" noChangeArrowheads="1"/>
                     </pic:cNvPicPr>
                   </pic:nvPicPr>
                   <pic:blipFill>
-                    <a:blip r:embed="rId4" cstate="print">
+                    <a:blip r:embed="rId6" cstate="print">
                       <a:extLst>
                         <a:ext uri="{28A0092B-C50C-407E-A947-70E740481C1C}">
                           <a14:useLocalDpi xmlns:a14="http://schemas.microsoft.com/office/drawing/2010/main" val="0"/>
@@ -48,7 +48,7 @@
                       <a:fillRect/>
                     </a:stretch>
                   </pic:blipFill>
-                  <pic:spPr bwMode="auto">
+                  <pic:spPr>
                     <a:xfrm>
                       <a:off x="0" y="0"/>
                       <a:ext cx="2253277" cy="849283"/>
@@ -120,13 +120,7 @@
         <w:rPr>
           <w:rFonts w:ascii="Arial" w:hAnsi="Arial" w:cs="Arial"/>
         </w:rPr>
-        <w:t>5TO. PERITO EN INFORMATICA</w:t>
-      </w:r>
-      <w:r>
-        <w:rPr>
-          <w:rFonts w:ascii="Arial" w:hAnsi="Arial" w:cs="Arial"/>
-        </w:rPr>
-        <w:t xml:space="preserve"> </w:t>
+        <w:t xml:space="preserve">5TO. PERITO EN INFORMATICA </w:t>
       </w:r>
     </w:p>
     <w:p>
@@ -277,7 +271,6 @@
         <w:jc w:val="center"/>
         <w:rPr>
           <w:rFonts w:ascii="Arial" w:hAnsi="Arial" w:cs="Arial"/>
-          <w:lang w:val="en-US"/>
         </w:rPr>
       </w:pPr>
       <w:r>
@@ -286,7 +279,6 @@
           <w:rFonts w:ascii="Arial" w:hAnsi="Arial" w:cs="Arial"/>
           <w:color w:val="000000"/>
           <w:sz w:val="40"/>
-          <w:lang w:val="en-US"/>
         </w:rPr>
         <w:t>Peace at home</w:t>
       </w:r>
@@ -298,7 +290,6 @@
         <w:jc w:val="center"/>
         <w:rPr>
           <w:rFonts w:ascii="Arial" w:hAnsi="Arial" w:cs="Arial"/>
-          <w:lang w:val="en-US"/>
         </w:rPr>
       </w:pPr>
     </w:p>
@@ -309,7 +300,6 @@
         <w:jc w:val="center"/>
         <w:rPr>
           <w:rFonts w:ascii="Arial" w:hAnsi="Arial" w:cs="Arial"/>
-          <w:lang w:val="en-US"/>
         </w:rPr>
       </w:pPr>
     </w:p>
@@ -320,7 +310,6 @@
         <w:jc w:val="center"/>
         <w:rPr>
           <w:rFonts w:ascii="Arial" w:hAnsi="Arial" w:cs="Arial"/>
-          <w:lang w:val="en-US"/>
         </w:rPr>
       </w:pPr>
     </w:p>
@@ -331,7 +320,6 @@
         <w:jc w:val="center"/>
         <w:rPr>
           <w:rFonts w:ascii="Arial" w:hAnsi="Arial" w:cs="Arial"/>
-          <w:lang w:val="en-US"/>
         </w:rPr>
       </w:pPr>
     </w:p>
@@ -342,7 +330,6 @@
         <w:jc w:val="center"/>
         <w:rPr>
           <w:rFonts w:ascii="Arial" w:hAnsi="Arial" w:cs="Arial"/>
-          <w:lang w:val="en-US"/>
         </w:rPr>
       </w:pPr>
     </w:p>
@@ -353,7 +340,6 @@
         <w:jc w:val="center"/>
         <w:rPr>
           <w:rFonts w:ascii="Arial" w:hAnsi="Arial" w:cs="Arial"/>
-          <w:lang w:val="en-US"/>
         </w:rPr>
       </w:pPr>
     </w:p>
@@ -364,7 +350,6 @@
         <w:jc w:val="center"/>
         <w:rPr>
           <w:rFonts w:ascii="Arial" w:hAnsi="Arial" w:cs="Arial"/>
-          <w:lang w:val="en-US"/>
         </w:rPr>
       </w:pPr>
     </w:p>
@@ -375,7 +360,6 @@
         <w:jc w:val="center"/>
         <w:rPr>
           <w:rFonts w:ascii="Arial" w:hAnsi="Arial" w:cs="Arial"/>
-          <w:lang w:val="en-US"/>
         </w:rPr>
       </w:pPr>
     </w:p>
@@ -386,7 +370,6 @@
         <w:jc w:val="center"/>
         <w:rPr>
           <w:rFonts w:ascii="Arial" w:hAnsi="Arial" w:cs="Arial"/>
-          <w:lang w:val="en-US"/>
         </w:rPr>
       </w:pPr>
     </w:p>
@@ -397,7 +380,6 @@
         <w:jc w:val="center"/>
         <w:rPr>
           <w:rFonts w:ascii="Arial" w:hAnsi="Arial" w:cs="Arial"/>
-          <w:lang w:val="en-US"/>
         </w:rPr>
       </w:pPr>
     </w:p>
@@ -408,7 +390,6 @@
         <w:jc w:val="center"/>
         <w:rPr>
           <w:rFonts w:ascii="Arial" w:hAnsi="Arial" w:cs="Arial"/>
-          <w:lang w:val="en-US"/>
         </w:rPr>
       </w:pPr>
     </w:p>
@@ -419,7 +400,6 @@
         <w:jc w:val="center"/>
         <w:rPr>
           <w:rFonts w:ascii="Arial" w:hAnsi="Arial" w:cs="Arial"/>
-          <w:lang w:val="en-US"/>
         </w:rPr>
       </w:pPr>
     </w:p>
@@ -430,7 +410,6 @@
         <w:jc w:val="center"/>
         <w:rPr>
           <w:rFonts w:ascii="Arial" w:hAnsi="Arial" w:cs="Arial"/>
-          <w:lang w:val="en-US"/>
         </w:rPr>
       </w:pPr>
     </w:p>
@@ -441,7 +420,6 @@
         <w:jc w:val="center"/>
         <w:rPr>
           <w:rFonts w:ascii="Arial" w:hAnsi="Arial" w:cs="Arial"/>
-          <w:lang w:val="en-US"/>
         </w:rPr>
       </w:pPr>
     </w:p>
@@ -452,7 +430,6 @@
         <w:jc w:val="center"/>
         <w:rPr>
           <w:rFonts w:ascii="Arial" w:hAnsi="Arial" w:cs="Arial"/>
-          <w:lang w:val="en-US"/>
         </w:rPr>
       </w:pPr>
     </w:p>
@@ -464,7 +441,6 @@
         <w:rPr>
           <w:rFonts w:ascii="Arial" w:hAnsi="Arial" w:cs="Arial"/>
           <w:u w:val="single"/>
-          <w:lang w:val="en-US"/>
         </w:rPr>
       </w:pPr>
     </w:p>
@@ -475,7 +451,6 @@
         <w:jc w:val="center"/>
         <w:rPr>
           <w:rFonts w:ascii="Arial" w:hAnsi="Arial" w:cs="Arial"/>
-          <w:lang w:val="en-US"/>
         </w:rPr>
       </w:pPr>
     </w:p>
@@ -507,56 +482,7 @@
           <w:rFonts w:ascii="Arial" w:hAnsi="Arial" w:cs="Arial"/>
           <w:sz w:val="24"/>
         </w:rPr>
-        <w:t xml:space="preserve">Guatemala, </w:t>
-      </w:r>
-      <w:r>
-        <w:rPr>
-          <w:rFonts w:ascii="Arial" w:hAnsi="Arial" w:cs="Arial"/>
-          <w:sz w:val="24"/>
-        </w:rPr>
-        <w:t xml:space="preserve">15 </w:t>
-      </w:r>
-      <w:r>
-        <w:rPr>
-          <w:rFonts w:ascii="Arial" w:hAnsi="Arial" w:cs="Arial"/>
-          <w:sz w:val="24"/>
-        </w:rPr>
-        <w:t xml:space="preserve">de </w:t>
-      </w:r>
-      <w:r>
-        <w:rPr>
-          <w:rFonts w:ascii="Arial" w:hAnsi="Arial" w:cs="Arial"/>
-          <w:sz w:val="24"/>
-        </w:rPr>
-        <w:t xml:space="preserve">Julio </w:t>
-      </w:r>
-      <w:r>
-        <w:rPr>
-          <w:rFonts w:ascii="Arial" w:hAnsi="Arial" w:cs="Arial"/>
-          <w:sz w:val="24"/>
-        </w:rPr>
-        <w:t>de 20</w:t>
-      </w:r>
-      <w:r>
-        <w:rPr>
-          <w:rFonts w:ascii="Arial" w:hAnsi="Arial" w:cs="Arial"/>
-          <w:sz w:val="24"/>
-        </w:rPr>
-        <w:t>2</w:t>
-      </w:r>
-      <w:r>
-        <w:rPr>
-          <w:rFonts w:ascii="Arial" w:hAnsi="Arial" w:cs="Arial"/>
-          <w:sz w:val="24"/>
-        </w:rPr>
-        <w:t>5</w:t>
-      </w:r>
-      <w:r>
-        <w:rPr>
-          <w:rFonts w:ascii="Arial" w:hAnsi="Arial" w:cs="Arial"/>
-          <w:sz w:val="24"/>
-        </w:rPr>
-        <w:t>.</w:t>
+        <w:t>Guatemala, 15 de Julio de 2025.</w:t>
       </w:r>
     </w:p>
     <w:p>
@@ -573,9 +499,93 @@
         </w:sectPr>
       </w:pPr>
     </w:p>
+    <w:p>
+      <w:pPr>
+        <w:rPr>
+          <w:rFonts w:ascii="Arial" w:eastAsiaTheme="minorHAnsi" w:hAnsi="Arial" w:cs="Arial"/>
+          <w:sz w:val="24"/>
+        </w:rPr>
+      </w:pPr>
+    </w:p>
+    <w:p>
+      <w:pPr>
+        <w:rPr>
+          <w:rFonts w:ascii="Arial" w:eastAsiaTheme="minorHAnsi" w:hAnsi="Arial" w:cs="Arial"/>
+          <w:bCs/>
+        </w:rPr>
+      </w:pPr>
+      <w:r>
+        <w:rPr>
+          <w:rFonts w:ascii="Arial" w:eastAsiaTheme="minorHAnsi" w:hAnsi="Arial" w:cs="Arial"/>
+          <w:bCs/>
+        </w:rPr>
+        <w:t xml:space="preserve">    </w:t>
+      </w:r>
+    </w:p>
+    <w:p>
+      <w:pPr>
+        <w:jc w:val="center"/>
+        <w:rPr>
+          <w:rFonts w:ascii="Arial" w:eastAsiaTheme="minorHAnsi" w:hAnsi="Arial" w:cs="Arial"/>
+          <w:b/>
+          <w:bCs/>
+          <w:sz w:val="44"/>
+        </w:rPr>
+      </w:pPr>
+      <w:r>
+        <w:rPr>
+          <w:rFonts w:ascii="Arial" w:eastAsiaTheme="minorHAnsi" w:hAnsi="Arial" w:cs="Arial"/>
+          <w:b/>
+          <w:bCs/>
+          <w:sz w:val="44"/>
+        </w:rPr>
+        <w:t>Tabla de Integrantes</w:t>
+      </w:r>
+    </w:p>
+    <w:p>
+      <w:pPr>
+        <w:rPr>
+          <w:rFonts w:ascii="Arial" w:eastAsiaTheme="minorHAnsi" w:hAnsi="Arial" w:cs="Arial"/>
+          <w:bCs/>
+        </w:rPr>
+      </w:pPr>
+    </w:p>
+    <w:p>
+      <w:pPr>
+        <w:rPr>
+          <w:rFonts w:ascii="Arial" w:eastAsiaTheme="minorHAnsi" w:hAnsi="Arial" w:cs="Arial"/>
+          <w:bCs/>
+        </w:rPr>
+      </w:pPr>
+    </w:p>
+    <w:p>
+      <w:pPr>
+        <w:rPr>
+          <w:rFonts w:ascii="Arial" w:eastAsiaTheme="minorHAnsi" w:hAnsi="Arial" w:cs="Arial"/>
+          <w:bCs/>
+        </w:rPr>
+      </w:pPr>
+    </w:p>
+    <w:p>
+      <w:pPr>
+        <w:rPr>
+          <w:rFonts w:ascii="Arial" w:eastAsiaTheme="minorHAnsi" w:hAnsi="Arial" w:cs="Arial"/>
+          <w:bCs/>
+        </w:rPr>
+      </w:pPr>
+    </w:p>
+    <w:p>
+      <w:pPr>
+        <w:rPr>
+          <w:rFonts w:ascii="Arial" w:eastAsiaTheme="minorHAnsi" w:hAnsi="Arial" w:cs="Arial"/>
+          <w:bCs/>
+        </w:rPr>
+      </w:pPr>
+    </w:p>
     <w:tbl>
       <w:tblPr>
         <w:tblStyle w:val="Tablaconcuadrcula"/>
+        <w:tblpPr w:leftFromText="141" w:rightFromText="141" w:vertAnchor="page" w:horzAnchor="margin" w:tblpY="4527"/>
         <w:tblW w:w="0" w:type="auto"/>
         <w:tblLook w:val="04A0" w:firstRow="1" w:lastRow="0" w:firstColumn="1" w:lastColumn="0" w:noHBand="0" w:noVBand="1"/>
       </w:tblPr>
@@ -590,6 +600,7 @@
           </w:tcPr>
           <w:p>
             <w:pPr>
+              <w:spacing w:after="0" w:line="240" w:lineRule="auto"/>
               <w:jc w:val="center"/>
               <w:rPr>
                 <w:rFonts w:ascii="Arial" w:eastAsiaTheme="minorHAnsi" w:hAnsi="Arial" w:cs="Arial"/>
@@ -604,7 +615,6 @@
                 <w:b/>
                 <w:sz w:val="24"/>
               </w:rPr>
-              <w:lastRenderedPageBreak/>
               <w:t xml:space="preserve">Nombre </w:t>
             </w:r>
             <w:r>
@@ -624,6 +634,7 @@
           </w:tcPr>
           <w:p>
             <w:pPr>
+              <w:spacing w:after="0" w:line="240" w:lineRule="auto"/>
               <w:jc w:val="center"/>
               <w:rPr>
                 <w:rFonts w:ascii="Arial" w:eastAsiaTheme="minorHAnsi" w:hAnsi="Arial" w:cs="Arial"/>
@@ -649,6 +660,7 @@
           </w:tcPr>
           <w:p>
             <w:pPr>
+              <w:spacing w:after="0" w:line="240" w:lineRule="auto"/>
               <w:jc w:val="center"/>
               <w:rPr>
                 <w:rFonts w:ascii="Arial" w:eastAsiaTheme="minorHAnsi" w:hAnsi="Arial" w:cs="Arial"/>
@@ -656,52 +668,14 @@
                 <w:lang w:val="es-ES"/>
               </w:rPr>
             </w:pPr>
-            <w:proofErr w:type="spellStart"/>
             <w:r>
               <w:rPr>
                 <w:rFonts w:ascii="Arial" w:eastAsiaTheme="minorHAnsi" w:hAnsi="Arial" w:cs="Arial"/>
                 <w:sz w:val="24"/>
                 <w:lang w:val="es-ES"/>
               </w:rPr>
-              <w:t>Kenet</w:t>
+              <w:t>Kenet Efraín Cuyuch Joj</w:t>
             </w:r>
-            <w:proofErr w:type="spellEnd"/>
-            <w:r>
-              <w:rPr>
-                <w:rFonts w:ascii="Arial" w:eastAsiaTheme="minorHAnsi" w:hAnsi="Arial" w:cs="Arial"/>
-                <w:sz w:val="24"/>
-                <w:lang w:val="es-ES"/>
-              </w:rPr>
-              <w:t xml:space="preserve"> Efraín </w:t>
-            </w:r>
-            <w:proofErr w:type="spellStart"/>
-            <w:r>
-              <w:rPr>
-                <w:rFonts w:ascii="Arial" w:eastAsiaTheme="minorHAnsi" w:hAnsi="Arial" w:cs="Arial"/>
-                <w:sz w:val="24"/>
-                <w:lang w:val="es-ES"/>
-              </w:rPr>
-              <w:t>Cuyuch</w:t>
-            </w:r>
-            <w:proofErr w:type="spellEnd"/>
-            <w:r>
-              <w:rPr>
-                <w:rFonts w:ascii="Arial" w:eastAsiaTheme="minorHAnsi" w:hAnsi="Arial" w:cs="Arial"/>
-                <w:sz w:val="24"/>
-                <w:lang w:val="es-ES"/>
-              </w:rPr>
-              <w:t xml:space="preserve"> </w:t>
-            </w:r>
-            <w:proofErr w:type="spellStart"/>
-            <w:r>
-              <w:rPr>
-                <w:rFonts w:ascii="Arial" w:eastAsiaTheme="minorHAnsi" w:hAnsi="Arial" w:cs="Arial"/>
-                <w:sz w:val="24"/>
-                <w:lang w:val="es-ES"/>
-              </w:rPr>
-              <w:t>Joj</w:t>
-            </w:r>
-            <w:proofErr w:type="spellEnd"/>
           </w:p>
         </w:tc>
         <w:tc>
@@ -710,6 +684,7 @@
           </w:tcPr>
           <w:p>
             <w:pPr>
+              <w:spacing w:after="0" w:line="240" w:lineRule="auto"/>
               <w:jc w:val="center"/>
               <w:rPr>
                 <w:rFonts w:ascii="Arial" w:eastAsiaTheme="minorHAnsi" w:hAnsi="Arial" w:cs="Arial"/>
@@ -733,43 +708,19 @@
           </w:tcPr>
           <w:p>
             <w:pPr>
+              <w:spacing w:after="0" w:line="240" w:lineRule="auto"/>
               <w:jc w:val="center"/>
               <w:rPr>
                 <w:rFonts w:ascii="Arial" w:eastAsiaTheme="minorHAnsi" w:hAnsi="Arial" w:cs="Arial"/>
                 <w:sz w:val="24"/>
               </w:rPr>
             </w:pPr>
-            <w:proofErr w:type="spellStart"/>
             <w:r>
               <w:rPr>
                 <w:rFonts w:ascii="Arial" w:eastAsiaTheme="minorHAnsi" w:hAnsi="Arial" w:cs="Arial"/>
                 <w:sz w:val="24"/>
               </w:rPr>
-              <w:t>Angel</w:t>
-            </w:r>
-            <w:proofErr w:type="spellEnd"/>
-            <w:r>
-              <w:rPr>
-                <w:rFonts w:ascii="Arial" w:eastAsiaTheme="minorHAnsi" w:hAnsi="Arial" w:cs="Arial"/>
-                <w:sz w:val="24"/>
-              </w:rPr>
-              <w:t xml:space="preserve"> </w:t>
-            </w:r>
-            <w:proofErr w:type="spellStart"/>
-            <w:r>
-              <w:rPr>
-                <w:rFonts w:ascii="Arial" w:eastAsiaTheme="minorHAnsi" w:hAnsi="Arial" w:cs="Arial"/>
-                <w:sz w:val="24"/>
-              </w:rPr>
-              <w:t>Gahel</w:t>
-            </w:r>
-            <w:proofErr w:type="spellEnd"/>
-            <w:r>
-              <w:rPr>
-                <w:rFonts w:ascii="Arial" w:eastAsiaTheme="minorHAnsi" w:hAnsi="Arial" w:cs="Arial"/>
-                <w:sz w:val="24"/>
-              </w:rPr>
-              <w:t xml:space="preserve"> Padilla Pacheco</w:t>
+              <w:t>Angel Gahel Padilla Pacheco</w:t>
             </w:r>
           </w:p>
         </w:tc>
@@ -779,6 +730,7 @@
           </w:tcPr>
           <w:p>
             <w:pPr>
+              <w:spacing w:after="0" w:line="240" w:lineRule="auto"/>
               <w:jc w:val="center"/>
               <w:rPr>
                 <w:rFonts w:ascii="Arial" w:eastAsiaTheme="minorHAnsi" w:hAnsi="Arial" w:cs="Arial"/>
@@ -803,53 +755,20 @@
           </w:tcPr>
           <w:p>
             <w:pPr>
+              <w:spacing w:after="0" w:line="240" w:lineRule="auto"/>
               <w:jc w:val="center"/>
               <w:rPr>
                 <w:rFonts w:ascii="Arial" w:eastAsiaTheme="minorHAnsi" w:hAnsi="Arial" w:cs="Arial"/>
                 <w:sz w:val="24"/>
               </w:rPr>
             </w:pPr>
-            <w:proofErr w:type="spellStart"/>
             <w:r>
               <w:rPr>
                 <w:rFonts w:ascii="Arial" w:eastAsiaTheme="minorHAnsi" w:hAnsi="Arial" w:cs="Arial"/>
                 <w:sz w:val="24"/>
               </w:rPr>
-              <w:t>Jose</w:t>
+              <w:t>Jose Enrique cuc cutz</w:t>
             </w:r>
-            <w:proofErr w:type="spellEnd"/>
-            <w:r>
-              <w:rPr>
-                <w:rFonts w:ascii="Arial" w:eastAsiaTheme="minorHAnsi" w:hAnsi="Arial" w:cs="Arial"/>
-                <w:sz w:val="24"/>
-              </w:rPr>
-              <w:t xml:space="preserve"> Enrique </w:t>
-            </w:r>
-            <w:proofErr w:type="spellStart"/>
-            <w:r>
-              <w:rPr>
-                <w:rFonts w:ascii="Arial" w:eastAsiaTheme="minorHAnsi" w:hAnsi="Arial" w:cs="Arial"/>
-                <w:sz w:val="24"/>
-              </w:rPr>
-              <w:t>cuc</w:t>
-            </w:r>
-            <w:proofErr w:type="spellEnd"/>
-            <w:r>
-              <w:rPr>
-                <w:rFonts w:ascii="Arial" w:eastAsiaTheme="minorHAnsi" w:hAnsi="Arial" w:cs="Arial"/>
-                <w:sz w:val="24"/>
-              </w:rPr>
-              <w:t xml:space="preserve"> </w:t>
-            </w:r>
-            <w:proofErr w:type="spellStart"/>
-            <w:r>
-              <w:rPr>
-                <w:rFonts w:ascii="Arial" w:eastAsiaTheme="minorHAnsi" w:hAnsi="Arial" w:cs="Arial"/>
-                <w:sz w:val="24"/>
-              </w:rPr>
-              <w:t>cutz</w:t>
-            </w:r>
-            <w:proofErr w:type="spellEnd"/>
           </w:p>
         </w:tc>
         <w:tc>
@@ -858,6 +777,7 @@
           </w:tcPr>
           <w:p>
             <w:pPr>
+              <w:spacing w:after="0" w:line="240" w:lineRule="auto"/>
               <w:jc w:val="center"/>
               <w:rPr>
                 <w:rFonts w:ascii="Arial" w:eastAsiaTheme="minorHAnsi" w:hAnsi="Arial" w:cs="Arial"/>
@@ -881,12 +801,22 @@
           </w:tcPr>
           <w:p>
             <w:pPr>
+              <w:spacing w:after="0" w:line="240" w:lineRule="auto"/>
               <w:jc w:val="center"/>
               <w:rPr>
-                <w:rFonts w:ascii="Arial" w:eastAsiaTheme="minorHAnsi" w:hAnsi="Arial" w:cs="Arial"/>
+                <w:rFonts w:ascii="Arial" w:eastAsiaTheme="minorEastAsia" w:hAnsi="Arial" w:cs="Arial"/>
                 <w:sz w:val="24"/>
+                <w:szCs w:val="24"/>
               </w:rPr>
             </w:pPr>
+            <w:r>
+              <w:rPr>
+                <w:rFonts w:ascii="Arial" w:eastAsiaTheme="minorEastAsia" w:hAnsi="Arial" w:cs="Arial"/>
+                <w:sz w:val="24"/>
+                <w:szCs w:val="24"/>
+              </w:rPr>
+              <w:t>Jeferson Andre Cano Lopez</w:t>
+            </w:r>
           </w:p>
         </w:tc>
         <w:tc>
@@ -895,12 +825,22 @@
           </w:tcPr>
           <w:p>
             <w:pPr>
+              <w:spacing w:after="0" w:line="240" w:lineRule="auto"/>
               <w:jc w:val="center"/>
               <w:rPr>
-                <w:rFonts w:ascii="Arial" w:eastAsiaTheme="minorHAnsi" w:hAnsi="Arial" w:cs="Arial"/>
+                <w:rFonts w:ascii="Arial" w:eastAsiaTheme="minorEastAsia" w:hAnsi="Arial" w:cs="Arial"/>
                 <w:sz w:val="24"/>
+                <w:szCs w:val="24"/>
               </w:rPr>
             </w:pPr>
+            <w:r>
+              <w:rPr>
+                <w:rFonts w:ascii="Arial" w:eastAsiaTheme="minorEastAsia" w:hAnsi="Arial" w:cs="Arial"/>
+                <w:sz w:val="24"/>
+                <w:szCs w:val="24"/>
+              </w:rPr>
+              <w:t>Programador</w:t>
+            </w:r>
           </w:p>
         </w:tc>
       </w:tr>
@@ -911,12 +851,20 @@
           </w:tcPr>
           <w:p>
             <w:pPr>
+              <w:spacing w:after="0" w:line="240" w:lineRule="auto"/>
               <w:jc w:val="center"/>
               <w:rPr>
                 <w:rFonts w:ascii="Arial" w:eastAsiaTheme="minorHAnsi" w:hAnsi="Arial" w:cs="Arial"/>
                 <w:sz w:val="24"/>
               </w:rPr>
             </w:pPr>
+            <w:r>
+              <w:rPr>
+                <w:rFonts w:ascii="Arial" w:eastAsiaTheme="minorHAnsi" w:hAnsi="Arial" w:cs="Arial"/>
+                <w:sz w:val="24"/>
+              </w:rPr>
+              <w:t>Carlos Enrique López Quino</w:t>
+            </w:r>
           </w:p>
         </w:tc>
         <w:tc>
@@ -925,12 +873,20 @@
           </w:tcPr>
           <w:p>
             <w:pPr>
+              <w:spacing w:after="0" w:line="240" w:lineRule="auto"/>
               <w:jc w:val="center"/>
               <w:rPr>
                 <w:rFonts w:ascii="Arial" w:eastAsiaTheme="minorHAnsi" w:hAnsi="Arial" w:cs="Arial"/>
                 <w:sz w:val="24"/>
               </w:rPr>
             </w:pPr>
+            <w:r>
+              <w:rPr>
+                <w:rFonts w:ascii="Arial" w:eastAsiaTheme="minorHAnsi" w:hAnsi="Arial" w:cs="Arial"/>
+                <w:sz w:val="24"/>
+              </w:rPr>
+              <w:t>Programador</w:t>
+            </w:r>
           </w:p>
         </w:tc>
       </w:tr>
@@ -941,12 +897,20 @@
           </w:tcPr>
           <w:p>
             <w:pPr>
+              <w:spacing w:after="0" w:line="240" w:lineRule="auto"/>
               <w:jc w:val="center"/>
               <w:rPr>
                 <w:rFonts w:ascii="Arial" w:eastAsiaTheme="minorHAnsi" w:hAnsi="Arial" w:cs="Arial"/>
                 <w:sz w:val="24"/>
               </w:rPr>
             </w:pPr>
+            <w:r>
+              <w:rPr>
+                <w:rFonts w:ascii="Arial" w:eastAsiaTheme="minorHAnsi" w:hAnsi="Arial" w:cs="Arial"/>
+                <w:sz w:val="24"/>
+              </w:rPr>
+              <w:t>Ricardo Alejandro Hernández Hernández</w:t>
+            </w:r>
           </w:p>
         </w:tc>
         <w:tc>
@@ -955,12 +919,20 @@
           </w:tcPr>
           <w:p>
             <w:pPr>
+              <w:spacing w:after="0" w:line="240" w:lineRule="auto"/>
               <w:jc w:val="center"/>
               <w:rPr>
                 <w:rFonts w:ascii="Arial" w:eastAsiaTheme="minorHAnsi" w:hAnsi="Arial" w:cs="Arial"/>
                 <w:sz w:val="24"/>
               </w:rPr>
             </w:pPr>
+            <w:r>
+              <w:rPr>
+                <w:rFonts w:ascii="Arial" w:eastAsiaTheme="minorHAnsi" w:hAnsi="Arial" w:cs="Arial"/>
+                <w:sz w:val="24"/>
+              </w:rPr>
+              <w:t>Programador</w:t>
+            </w:r>
           </w:p>
         </w:tc>
       </w:tr>
@@ -971,12 +943,20 @@
           </w:tcPr>
           <w:p>
             <w:pPr>
+              <w:spacing w:after="0" w:line="240" w:lineRule="auto"/>
               <w:jc w:val="center"/>
               <w:rPr>
                 <w:rFonts w:ascii="Arial" w:eastAsiaTheme="minorHAnsi" w:hAnsi="Arial" w:cs="Arial"/>
                 <w:sz w:val="24"/>
               </w:rPr>
             </w:pPr>
+            <w:r>
+              <w:rPr>
+                <w:rFonts w:ascii="Arial" w:eastAsiaTheme="minorHAnsi" w:hAnsi="Arial" w:cs="Arial"/>
+                <w:sz w:val="24"/>
+              </w:rPr>
+              <w:t>Osman Emmanuell Veliz Guzmán</w:t>
+            </w:r>
           </w:p>
         </w:tc>
         <w:tc>
@@ -985,12 +965,20 @@
           </w:tcPr>
           <w:p>
             <w:pPr>
+              <w:spacing w:after="0" w:line="240" w:lineRule="auto"/>
               <w:jc w:val="center"/>
               <w:rPr>
                 <w:rFonts w:ascii="Arial" w:eastAsiaTheme="minorHAnsi" w:hAnsi="Arial" w:cs="Arial"/>
                 <w:sz w:val="24"/>
               </w:rPr>
             </w:pPr>
+            <w:r>
+              <w:rPr>
+                <w:rFonts w:ascii="Arial" w:eastAsiaTheme="minorHAnsi" w:hAnsi="Arial" w:cs="Arial"/>
+                <w:sz w:val="24"/>
+              </w:rPr>
+              <w:t>Programador</w:t>
+            </w:r>
           </w:p>
         </w:tc>
       </w:tr>
@@ -1001,12 +989,20 @@
           </w:tcPr>
           <w:p>
             <w:pPr>
+              <w:spacing w:after="0" w:line="240" w:lineRule="auto"/>
               <w:jc w:val="center"/>
               <w:rPr>
                 <w:rFonts w:ascii="Arial" w:eastAsiaTheme="minorHAnsi" w:hAnsi="Arial" w:cs="Arial"/>
                 <w:sz w:val="24"/>
               </w:rPr>
             </w:pPr>
+            <w:r>
+              <w:rPr>
+                <w:rFonts w:ascii="Arial" w:eastAsiaTheme="minorHAnsi" w:hAnsi="Arial" w:cs="Arial"/>
+                <w:sz w:val="24"/>
+              </w:rPr>
+              <w:t>Franklin Stev Paiz Chavez</w:t>
+            </w:r>
           </w:p>
         </w:tc>
         <w:tc>
@@ -1015,12 +1011,20 @@
           </w:tcPr>
           <w:p>
             <w:pPr>
+              <w:spacing w:after="0" w:line="240" w:lineRule="auto"/>
               <w:jc w:val="center"/>
               <w:rPr>
                 <w:rFonts w:ascii="Arial" w:eastAsiaTheme="minorHAnsi" w:hAnsi="Arial" w:cs="Arial"/>
                 <w:sz w:val="24"/>
               </w:rPr>
             </w:pPr>
+            <w:r>
+              <w:rPr>
+                <w:rFonts w:ascii="Arial" w:eastAsiaTheme="minorHAnsi" w:hAnsi="Arial" w:cs="Arial"/>
+                <w:sz w:val="24"/>
+              </w:rPr>
+              <w:t>Programador</w:t>
+            </w:r>
           </w:p>
         </w:tc>
       </w:tr>
@@ -1031,6 +1035,7 @@
           </w:tcPr>
           <w:p>
             <w:pPr>
+              <w:spacing w:after="0" w:line="240" w:lineRule="auto"/>
               <w:jc w:val="center"/>
               <w:rPr>
                 <w:rFonts w:ascii="Arial" w:eastAsiaTheme="minorEastAsia" w:hAnsi="Arial" w:cs="Arial"/>
@@ -1038,6 +1043,14 @@
                 <w:szCs w:val="24"/>
               </w:rPr>
             </w:pPr>
+            <w:r>
+              <w:rPr>
+                <w:rFonts w:ascii="Arial" w:eastAsiaTheme="minorEastAsia" w:hAnsi="Arial" w:cs="Arial"/>
+                <w:sz w:val="24"/>
+                <w:szCs w:val="24"/>
+              </w:rPr>
+              <w:t>Angel Gabriel Ernesto Grijalva Castro</w:t>
+            </w:r>
           </w:p>
         </w:tc>
         <w:tc>
@@ -1046,6 +1059,7 @@
           </w:tcPr>
           <w:p>
             <w:pPr>
+              <w:spacing w:after="0" w:line="240" w:lineRule="auto"/>
               <w:jc w:val="center"/>
               <w:rPr>
                 <w:rFonts w:ascii="Arial" w:eastAsiaTheme="minorEastAsia" w:hAnsi="Arial" w:cs="Arial"/>
@@ -1053,6 +1067,14 @@
                 <w:szCs w:val="24"/>
               </w:rPr>
             </w:pPr>
+            <w:r>
+              <w:rPr>
+                <w:rFonts w:ascii="Arial" w:eastAsiaTheme="minorEastAsia" w:hAnsi="Arial" w:cs="Arial"/>
+                <w:sz w:val="24"/>
+                <w:szCs w:val="24"/>
+              </w:rPr>
+              <w:t>Programador</w:t>
+            </w:r>
           </w:p>
         </w:tc>
       </w:tr>
@@ -1063,12 +1085,20 @@
           </w:tcPr>
           <w:p>
             <w:pPr>
+              <w:spacing w:after="0" w:line="240" w:lineRule="auto"/>
               <w:jc w:val="center"/>
               <w:rPr>
                 <w:rFonts w:ascii="Arial" w:eastAsiaTheme="minorHAnsi" w:hAnsi="Arial" w:cs="Arial"/>
                 <w:sz w:val="24"/>
               </w:rPr>
             </w:pPr>
+            <w:r>
+              <w:rPr>
+                <w:rFonts w:ascii="Arial" w:eastAsiaTheme="minorHAnsi" w:hAnsi="Arial" w:cs="Arial"/>
+                <w:sz w:val="24"/>
+              </w:rPr>
+              <w:t>Benjamin Elí Argueta Caal</w:t>
+            </w:r>
           </w:p>
         </w:tc>
         <w:tc>
@@ -1077,12 +1107,20 @@
           </w:tcPr>
           <w:p>
             <w:pPr>
+              <w:spacing w:after="0" w:line="240" w:lineRule="auto"/>
               <w:jc w:val="center"/>
               <w:rPr>
                 <w:rFonts w:ascii="Arial" w:eastAsiaTheme="minorHAnsi" w:hAnsi="Arial" w:cs="Arial"/>
                 <w:sz w:val="24"/>
               </w:rPr>
             </w:pPr>
+            <w:r>
+              <w:rPr>
+                <w:rFonts w:ascii="Arial" w:eastAsiaTheme="minorHAnsi" w:hAnsi="Arial" w:cs="Arial"/>
+                <w:sz w:val="24"/>
+              </w:rPr>
+              <w:t>Programador</w:t>
+            </w:r>
           </w:p>
         </w:tc>
       </w:tr>
@@ -1093,12 +1131,20 @@
           </w:tcPr>
           <w:p>
             <w:pPr>
+              <w:spacing w:after="0" w:line="240" w:lineRule="auto"/>
               <w:jc w:val="center"/>
               <w:rPr>
                 <w:rFonts w:ascii="Arial" w:eastAsiaTheme="minorHAnsi" w:hAnsi="Arial" w:cs="Arial"/>
                 <w:sz w:val="24"/>
               </w:rPr>
             </w:pPr>
+            <w:r>
+              <w:rPr>
+                <w:rFonts w:ascii="Arial" w:eastAsiaTheme="minorHAnsi" w:hAnsi="Arial" w:cs="Arial"/>
+                <w:sz w:val="24"/>
+              </w:rPr>
+              <w:t>Carlos Alejandro Patal Choc</w:t>
+            </w:r>
           </w:p>
         </w:tc>
         <w:tc>
@@ -1107,42 +1153,21 @@
           </w:tcPr>
           <w:p>
             <w:pPr>
+              <w:spacing w:after="0" w:line="240" w:lineRule="auto"/>
               <w:jc w:val="center"/>
               <w:rPr>
                 <w:rFonts w:ascii="Arial" w:eastAsiaTheme="minorHAnsi" w:hAnsi="Arial" w:cs="Arial"/>
                 <w:sz w:val="24"/>
+                <w:u w:val="single"/>
               </w:rPr>
             </w:pPr>
-          </w:p>
-        </w:tc>
-      </w:tr>
-      <w:tr>
-        <w:tc>
-          <w:tcPr>
-            <w:tcW w:w="5395" w:type="dxa"/>
-          </w:tcPr>
-          <w:p>
-            <w:pPr>
-              <w:jc w:val="center"/>
+            <w:r>
               <w:rPr>
                 <w:rFonts w:ascii="Arial" w:eastAsiaTheme="minorHAnsi" w:hAnsi="Arial" w:cs="Arial"/>
                 <w:sz w:val="24"/>
               </w:rPr>
-            </w:pPr>
-          </w:p>
-        </w:tc>
-        <w:tc>
-          <w:tcPr>
-            <w:tcW w:w="5395" w:type="dxa"/>
-          </w:tcPr>
-          <w:p>
-            <w:pPr>
-              <w:jc w:val="center"/>
-              <w:rPr>
-                <w:rFonts w:ascii="Arial" w:eastAsiaTheme="minorHAnsi" w:hAnsi="Arial" w:cs="Arial"/>
-                <w:sz w:val="24"/>
-              </w:rPr>
-            </w:pPr>
+              <w:t>Programador</w:t>
+            </w:r>
           </w:p>
         </w:tc>
       </w:tr>
@@ -1151,7 +1176,7 @@
       <w:pPr>
         <w:rPr>
           <w:rFonts w:ascii="Arial" w:eastAsiaTheme="minorHAnsi" w:hAnsi="Arial" w:cs="Arial"/>
-          <w:sz w:val="24"/>
+          <w:bCs/>
         </w:rPr>
       </w:pPr>
     </w:p>
@@ -1160,15 +1185,2846 @@
         <w:rPr>
           <w:rFonts w:ascii="Arial" w:eastAsiaTheme="minorHAnsi" w:hAnsi="Arial" w:cs="Arial"/>
           <w:bCs/>
-        </w:rPr>
-      </w:pPr>
-      <w:r>
+          <w:u w:val="single"/>
+        </w:rPr>
+      </w:pPr>
+    </w:p>
+    <w:p>
+      <w:pPr>
         <w:rPr>
           <w:rFonts w:ascii="Arial" w:eastAsiaTheme="minorHAnsi" w:hAnsi="Arial" w:cs="Arial"/>
           <w:bCs/>
-        </w:rPr>
-        <w:t xml:space="preserve">    </w:t>
-      </w:r>
+          <w:u w:val="single"/>
+        </w:rPr>
+      </w:pPr>
+    </w:p>
+    <w:p>
+      <w:pPr>
+        <w:rPr>
+          <w:rFonts w:ascii="Arial" w:eastAsiaTheme="minorHAnsi" w:hAnsi="Arial" w:cs="Arial"/>
+          <w:bCs/>
+          <w:u w:val="single"/>
+        </w:rPr>
+      </w:pPr>
+    </w:p>
+    <w:p>
+      <w:pPr>
+        <w:rPr>
+          <w:rFonts w:ascii="Arial" w:eastAsiaTheme="minorHAnsi" w:hAnsi="Arial" w:cs="Arial"/>
+          <w:bCs/>
+          <w:u w:val="single"/>
+        </w:rPr>
+      </w:pPr>
+    </w:p>
+    <w:p>
+      <w:pPr>
+        <w:rPr>
+          <w:rFonts w:ascii="Arial" w:eastAsiaTheme="minorHAnsi" w:hAnsi="Arial" w:cs="Arial"/>
+          <w:bCs/>
+          <w:u w:val="single"/>
+        </w:rPr>
+      </w:pPr>
+    </w:p>
+    <w:p>
+      <w:pPr>
+        <w:rPr>
+          <w:rFonts w:ascii="Arial" w:eastAsiaTheme="minorHAnsi" w:hAnsi="Arial" w:cs="Arial"/>
+          <w:bCs/>
+          <w:u w:val="single"/>
+        </w:rPr>
+      </w:pPr>
+    </w:p>
+    <w:p>
+      <w:pPr>
+        <w:rPr>
+          <w:rFonts w:ascii="Arial" w:eastAsiaTheme="minorHAnsi" w:hAnsi="Arial" w:cs="Arial"/>
+          <w:bCs/>
+          <w:u w:val="single"/>
+        </w:rPr>
+      </w:pPr>
+    </w:p>
+    <w:p>
+      <w:pPr>
+        <w:rPr>
+          <w:rFonts w:ascii="Arial" w:eastAsiaTheme="minorHAnsi" w:hAnsi="Arial" w:cs="Arial"/>
+          <w:bCs/>
+          <w:u w:val="single"/>
+        </w:rPr>
+      </w:pPr>
+    </w:p>
+    <w:p>
+      <w:pPr>
+        <w:rPr>
+          <w:rFonts w:ascii="Arial" w:eastAsiaTheme="minorHAnsi" w:hAnsi="Arial" w:cs="Arial"/>
+          <w:bCs/>
+          <w:u w:val="single"/>
+        </w:rPr>
+      </w:pPr>
+    </w:p>
+    <w:p>
+      <w:pPr>
+        <w:rPr>
+          <w:rFonts w:ascii="Arial" w:eastAsiaTheme="minorHAnsi" w:hAnsi="Arial" w:cs="Arial"/>
+          <w:bCs/>
+          <w:u w:val="single"/>
+        </w:rPr>
+      </w:pPr>
+    </w:p>
+    <w:p>
+      <w:pPr>
+        <w:rPr>
+          <w:rFonts w:ascii="Arial" w:eastAsiaTheme="minorHAnsi" w:hAnsi="Arial" w:cs="Arial"/>
+          <w:bCs/>
+          <w:u w:val="single"/>
+        </w:rPr>
+      </w:pPr>
+    </w:p>
+    <w:p>
+      <w:pPr>
+        <w:rPr>
+          <w:rFonts w:ascii="Arial" w:eastAsiaTheme="minorHAnsi" w:hAnsi="Arial" w:cs="Arial"/>
+          <w:bCs/>
+          <w:u w:val="single"/>
+        </w:rPr>
+      </w:pPr>
+    </w:p>
+    <w:p>
+      <w:pPr>
+        <w:rPr>
+          <w:rFonts w:ascii="Arial" w:eastAsiaTheme="minorHAnsi" w:hAnsi="Arial" w:cs="Arial"/>
+          <w:bCs/>
+          <w:u w:val="single"/>
+        </w:rPr>
+      </w:pPr>
+    </w:p>
+    <w:p>
+      <w:pPr>
+        <w:rPr>
+          <w:rFonts w:ascii="Arial" w:eastAsiaTheme="minorHAnsi" w:hAnsi="Arial" w:cs="Arial"/>
+          <w:bCs/>
+          <w:u w:val="single"/>
+        </w:rPr>
+      </w:pPr>
+    </w:p>
+    <w:p>
+      <w:pPr>
+        <w:rPr>
+          <w:rFonts w:ascii="Arial" w:eastAsiaTheme="minorHAnsi" w:hAnsi="Arial" w:cs="Arial"/>
+          <w:bCs/>
+          <w:u w:val="single"/>
+        </w:rPr>
+      </w:pPr>
+    </w:p>
+    <w:p>
+      <w:pPr>
+        <w:rPr>
+          <w:rFonts w:ascii="Arial" w:eastAsiaTheme="minorHAnsi" w:hAnsi="Arial" w:cs="Arial"/>
+          <w:bCs/>
+          <w:u w:val="single"/>
+        </w:rPr>
+      </w:pPr>
+    </w:p>
+    <w:p>
+      <w:pPr>
+        <w:jc w:val="center"/>
+        <w:rPr>
+          <w:rFonts w:ascii="Arial" w:eastAsiaTheme="minorHAnsi" w:hAnsi="Arial" w:cs="Arial"/>
+          <w:b/>
+          <w:sz w:val="44"/>
+          <w:szCs w:val="44"/>
+        </w:rPr>
+      </w:pPr>
+      <w:r>
+        <w:rPr>
+          <w:rFonts w:ascii="Arial" w:eastAsiaTheme="minorHAnsi" w:hAnsi="Arial" w:cs="Arial"/>
+          <w:b/>
+          <w:sz w:val="44"/>
+          <w:szCs w:val="44"/>
+        </w:rPr>
+        <w:t>Historias de Usuario</w:t>
+      </w:r>
+    </w:p>
+    <w:p>
+      <w:pPr>
+        <w:jc w:val="center"/>
+        <w:rPr>
+          <w:rFonts w:ascii="Arial" w:eastAsiaTheme="minorHAnsi" w:hAnsi="Arial" w:cs="Arial"/>
+          <w:b/>
+          <w:sz w:val="44"/>
+          <w:szCs w:val="44"/>
+        </w:rPr>
+      </w:pPr>
+    </w:p>
+    <w:p>
+      <w:pPr>
+        <w:jc w:val="center"/>
+        <w:rPr>
+          <w:rFonts w:ascii="Arial" w:eastAsiaTheme="minorHAnsi" w:hAnsi="Arial" w:cs="Arial"/>
+          <w:b/>
+          <w:sz w:val="44"/>
+          <w:szCs w:val="44"/>
+        </w:rPr>
+      </w:pPr>
+    </w:p>
+    <w:p>
+      <w:pPr>
+        <w:rPr>
+          <w:rFonts w:ascii="Arial" w:eastAsiaTheme="minorHAnsi" w:hAnsi="Arial" w:cs="Arial"/>
+          <w:b/>
+          <w:sz w:val="24"/>
+          <w:szCs w:val="20"/>
+        </w:rPr>
+      </w:pPr>
+      <w:r>
+        <w:rPr>
+          <w:rFonts w:ascii="Arial" w:eastAsiaTheme="minorHAnsi" w:hAnsi="Arial" w:cs="Arial"/>
+          <w:b/>
+          <w:sz w:val="24"/>
+          <w:szCs w:val="20"/>
+        </w:rPr>
+        <w:t>Tupla: Usuario</w:t>
+      </w:r>
+    </w:p>
+    <w:p>
+      <w:pPr>
+        <w:spacing w:before="100" w:beforeAutospacing="1" w:after="100" w:afterAutospacing="1" w:line="240" w:lineRule="auto"/>
+        <w:rPr>
+          <w:rFonts w:ascii="Arial" w:eastAsia="Times New Roman" w:hAnsi="Arial" w:cs="Arial"/>
+          <w:szCs w:val="24"/>
+          <w:lang w:eastAsia="es-GT"/>
+        </w:rPr>
+      </w:pPr>
+      <w:r>
+        <w:rPr>
+          <w:rFonts w:ascii="Arial" w:eastAsia="Times New Roman" w:hAnsi="Arial" w:cs="Arial"/>
+          <w:bCs/>
+          <w:szCs w:val="24"/>
+          <w:lang w:eastAsia="es-GT"/>
+        </w:rPr>
+        <w:t>HUKC-001</w:t>
+      </w:r>
+      <w:r>
+        <w:rPr>
+          <w:rFonts w:ascii="Arial" w:eastAsia="Times New Roman" w:hAnsi="Arial" w:cs="Arial"/>
+          <w:b/>
+          <w:bCs/>
+          <w:szCs w:val="24"/>
+          <w:lang w:eastAsia="es-GT"/>
+        </w:rPr>
+        <w:t xml:space="preserve"> Registro de Nuevo Usuario</w:t>
+      </w:r>
+    </w:p>
+    <w:p>
+      <w:pPr>
+        <w:spacing w:before="100" w:beforeAutospacing="1" w:after="100" w:afterAutospacing="1" w:line="240" w:lineRule="auto"/>
+        <w:rPr>
+          <w:rFonts w:ascii="Arial" w:eastAsia="Times New Roman" w:hAnsi="Arial" w:cs="Arial"/>
+          <w:szCs w:val="24"/>
+          <w:lang w:eastAsia="es-GT"/>
+        </w:rPr>
+      </w:pPr>
+      <w:r>
+        <w:rPr>
+          <w:rFonts w:ascii="Arial" w:eastAsia="Times New Roman" w:hAnsi="Arial" w:cs="Arial"/>
+          <w:b/>
+          <w:szCs w:val="24"/>
+          <w:lang w:eastAsia="es-GT"/>
+        </w:rPr>
+        <w:t>Como</w:t>
+      </w:r>
+      <w:r>
+        <w:rPr>
+          <w:rFonts w:ascii="Arial" w:eastAsia="Times New Roman" w:hAnsi="Arial" w:cs="Arial"/>
+          <w:szCs w:val="24"/>
+          <w:lang w:eastAsia="es-GT"/>
+        </w:rPr>
+        <w:t xml:space="preserve">: Un nuevo usuario (anfitrión o invitado) </w:t>
+      </w:r>
+    </w:p>
+    <w:p>
+      <w:pPr>
+        <w:spacing w:before="100" w:beforeAutospacing="1" w:after="100" w:afterAutospacing="1" w:line="240" w:lineRule="auto"/>
+        <w:rPr>
+          <w:rFonts w:ascii="Arial" w:eastAsia="Times New Roman" w:hAnsi="Arial" w:cs="Arial"/>
+          <w:szCs w:val="24"/>
+          <w:lang w:eastAsia="es-GT"/>
+        </w:rPr>
+      </w:pPr>
+      <w:r>
+        <w:rPr>
+          <w:rFonts w:ascii="Arial" w:eastAsia="Times New Roman" w:hAnsi="Arial" w:cs="Arial"/>
+          <w:b/>
+          <w:szCs w:val="24"/>
+          <w:lang w:eastAsia="es-GT"/>
+        </w:rPr>
+        <w:t>Quiero</w:t>
+      </w:r>
+      <w:r>
+        <w:rPr>
+          <w:rFonts w:ascii="Arial" w:eastAsia="Times New Roman" w:hAnsi="Arial" w:cs="Arial"/>
+          <w:szCs w:val="24"/>
+          <w:lang w:eastAsia="es-GT"/>
+        </w:rPr>
+        <w:t xml:space="preserve">: Registrarme en el sistema proporcionando mi nombre, correo, teléfono, fecha de nacimiento y tipo de usuario (anfitrión o invitado) </w:t>
+      </w:r>
+    </w:p>
+    <w:p>
+      <w:pPr>
+        <w:spacing w:before="100" w:beforeAutospacing="1" w:after="100" w:afterAutospacing="1" w:line="240" w:lineRule="auto"/>
+        <w:rPr>
+          <w:rFonts w:ascii="Arial" w:eastAsia="Times New Roman" w:hAnsi="Arial" w:cs="Arial"/>
+          <w:szCs w:val="24"/>
+          <w:lang w:eastAsia="es-GT"/>
+        </w:rPr>
+      </w:pPr>
+      <w:r>
+        <w:rPr>
+          <w:rFonts w:ascii="Arial" w:eastAsia="Times New Roman" w:hAnsi="Arial" w:cs="Arial"/>
+          <w:b/>
+          <w:szCs w:val="24"/>
+          <w:lang w:eastAsia="es-GT"/>
+        </w:rPr>
+        <w:t>Para</w:t>
+      </w:r>
+      <w:r>
+        <w:rPr>
+          <w:rFonts w:ascii="Arial" w:eastAsia="Times New Roman" w:hAnsi="Arial" w:cs="Arial"/>
+          <w:szCs w:val="24"/>
+          <w:lang w:eastAsia="es-GT"/>
+        </w:rPr>
+        <w:t>: Poder utilizar los servicios de la plataforma, ya sea para ofrecer propiedades o para reservarlas.</w:t>
+      </w:r>
+    </w:p>
+    <w:p>
+      <w:pPr>
+        <w:spacing w:before="100" w:beforeAutospacing="1" w:after="100" w:afterAutospacing="1" w:line="240" w:lineRule="auto"/>
+        <w:rPr>
+          <w:rFonts w:ascii="Arial" w:eastAsia="Times New Roman" w:hAnsi="Arial" w:cs="Arial"/>
+          <w:szCs w:val="24"/>
+          <w:lang w:eastAsia="es-GT"/>
+        </w:rPr>
+      </w:pPr>
+    </w:p>
+    <w:p>
+      <w:pPr>
+        <w:spacing w:before="100" w:beforeAutospacing="1" w:after="100" w:afterAutospacing="1" w:line="240" w:lineRule="auto"/>
+        <w:rPr>
+          <w:rFonts w:ascii="Arial" w:eastAsia="Times New Roman" w:hAnsi="Arial" w:cs="Arial"/>
+          <w:szCs w:val="24"/>
+          <w:lang w:eastAsia="es-GT"/>
+        </w:rPr>
+      </w:pPr>
+      <w:r>
+        <w:rPr>
+          <w:rFonts w:ascii="Arial" w:eastAsia="Times New Roman" w:hAnsi="Arial" w:cs="Arial"/>
+          <w:szCs w:val="24"/>
+          <w:lang w:eastAsia="es-GT"/>
+        </w:rPr>
+        <w:t>HUKC-002</w:t>
+      </w:r>
+      <w:r>
+        <w:rPr>
+          <w:rFonts w:ascii="Arial" w:eastAsia="Times New Roman" w:hAnsi="Arial" w:cs="Arial"/>
+          <w:b/>
+          <w:bCs/>
+          <w:szCs w:val="24"/>
+          <w:lang w:eastAsia="es-GT"/>
+        </w:rPr>
+        <w:t xml:space="preserve"> Edición de Perfil de Usuario</w:t>
+      </w:r>
+    </w:p>
+    <w:p>
+      <w:pPr>
+        <w:spacing w:before="100" w:beforeAutospacing="1" w:after="100" w:afterAutospacing="1" w:line="240" w:lineRule="auto"/>
+        <w:rPr>
+          <w:rFonts w:ascii="Arial" w:eastAsia="Times New Roman" w:hAnsi="Arial" w:cs="Arial"/>
+          <w:szCs w:val="24"/>
+          <w:lang w:eastAsia="es-GT"/>
+        </w:rPr>
+      </w:pPr>
+      <w:r>
+        <w:rPr>
+          <w:rFonts w:ascii="Arial" w:eastAsia="Times New Roman" w:hAnsi="Arial" w:cs="Arial"/>
+          <w:b/>
+          <w:szCs w:val="24"/>
+          <w:lang w:eastAsia="es-GT"/>
+        </w:rPr>
+        <w:t>Como</w:t>
+      </w:r>
+      <w:r>
+        <w:rPr>
+          <w:rFonts w:ascii="Arial" w:eastAsia="Times New Roman" w:hAnsi="Arial" w:cs="Arial"/>
+          <w:szCs w:val="24"/>
+          <w:lang w:eastAsia="es-GT"/>
+        </w:rPr>
+        <w:t>: Un usuario registrado</w:t>
+      </w:r>
+    </w:p>
+    <w:p>
+      <w:pPr>
+        <w:spacing w:before="100" w:beforeAutospacing="1" w:after="100" w:afterAutospacing="1" w:line="240" w:lineRule="auto"/>
+        <w:rPr>
+          <w:rFonts w:ascii="Arial" w:eastAsia="Times New Roman" w:hAnsi="Arial" w:cs="Arial"/>
+          <w:szCs w:val="24"/>
+          <w:lang w:eastAsia="es-GT"/>
+        </w:rPr>
+      </w:pPr>
+      <w:r>
+        <w:rPr>
+          <w:rFonts w:ascii="Arial" w:eastAsia="Times New Roman" w:hAnsi="Arial" w:cs="Arial"/>
+          <w:szCs w:val="24"/>
+          <w:lang w:eastAsia="es-GT"/>
+        </w:rPr>
+        <w:t xml:space="preserve"> </w:t>
+      </w:r>
+      <w:r>
+        <w:rPr>
+          <w:rFonts w:ascii="Arial" w:eastAsia="Times New Roman" w:hAnsi="Arial" w:cs="Arial"/>
+          <w:b/>
+          <w:szCs w:val="24"/>
+          <w:lang w:eastAsia="es-GT"/>
+        </w:rPr>
+        <w:t>Quiero</w:t>
+      </w:r>
+      <w:r>
+        <w:rPr>
+          <w:rFonts w:ascii="Arial" w:eastAsia="Times New Roman" w:hAnsi="Arial" w:cs="Arial"/>
+          <w:szCs w:val="24"/>
+          <w:lang w:eastAsia="es-GT"/>
+        </w:rPr>
+        <w:t xml:space="preserve">: Poder editar mi nombre, correo, teléfono, fecha de nacimiento, tipo de usuario y subir imágenes a mi perfil </w:t>
+      </w:r>
+    </w:p>
+    <w:p>
+      <w:pPr>
+        <w:spacing w:before="100" w:beforeAutospacing="1" w:after="100" w:afterAutospacing="1" w:line="240" w:lineRule="auto"/>
+        <w:rPr>
+          <w:rFonts w:ascii="Arial" w:eastAsia="Times New Roman" w:hAnsi="Arial" w:cs="Arial"/>
+          <w:szCs w:val="24"/>
+          <w:lang w:eastAsia="es-GT"/>
+        </w:rPr>
+      </w:pPr>
+      <w:r>
+        <w:rPr>
+          <w:rFonts w:ascii="Arial" w:eastAsia="Times New Roman" w:hAnsi="Arial" w:cs="Arial"/>
+          <w:b/>
+          <w:szCs w:val="24"/>
+          <w:lang w:eastAsia="es-GT"/>
+        </w:rPr>
+        <w:t>Para</w:t>
+      </w:r>
+      <w:r>
+        <w:rPr>
+          <w:rFonts w:ascii="Arial" w:eastAsia="Times New Roman" w:hAnsi="Arial" w:cs="Arial"/>
+          <w:szCs w:val="24"/>
+          <w:lang w:eastAsia="es-GT"/>
+        </w:rPr>
+        <w:t>: Mantener mi información actualizada y personalizada en la plataforma.</w:t>
+      </w:r>
+    </w:p>
+    <w:p>
+      <w:pPr>
+        <w:spacing w:before="100" w:beforeAutospacing="1" w:after="100" w:afterAutospacing="1" w:line="240" w:lineRule="auto"/>
+        <w:ind w:left="708" w:hanging="708"/>
+        <w:rPr>
+          <w:rFonts w:ascii="Arial" w:eastAsia="Times New Roman" w:hAnsi="Arial" w:cs="Arial"/>
+          <w:sz w:val="24"/>
+          <w:szCs w:val="24"/>
+          <w:lang w:eastAsia="es-GT"/>
+        </w:rPr>
+      </w:pPr>
+    </w:p>
+    <w:p>
+      <w:pPr>
+        <w:spacing w:before="100" w:beforeAutospacing="1" w:after="100" w:afterAutospacing="1" w:line="240" w:lineRule="auto"/>
+        <w:rPr>
+          <w:rFonts w:ascii="Arial" w:eastAsia="Times New Roman" w:hAnsi="Arial" w:cs="Arial"/>
+          <w:szCs w:val="24"/>
+          <w:lang w:eastAsia="es-GT"/>
+        </w:rPr>
+      </w:pPr>
+      <w:r>
+        <w:rPr>
+          <w:rFonts w:ascii="Arial" w:eastAsia="Times New Roman" w:hAnsi="Arial" w:cs="Arial"/>
+          <w:szCs w:val="24"/>
+          <w:lang w:eastAsia="es-GT"/>
+        </w:rPr>
+        <w:t>HUKC-003</w:t>
+      </w:r>
+      <w:r>
+        <w:rPr>
+          <w:rFonts w:ascii="Arial" w:eastAsia="Times New Roman" w:hAnsi="Arial" w:cs="Arial"/>
+          <w:b/>
+          <w:bCs/>
+          <w:szCs w:val="24"/>
+          <w:lang w:eastAsia="es-GT"/>
+        </w:rPr>
+        <w:t xml:space="preserve"> Visualización de Perfil de Usuario</w:t>
+      </w:r>
+    </w:p>
+    <w:p>
+      <w:pPr>
+        <w:spacing w:before="100" w:beforeAutospacing="1" w:after="100" w:afterAutospacing="1" w:line="240" w:lineRule="auto"/>
+        <w:rPr>
+          <w:rFonts w:ascii="Arial" w:eastAsia="Times New Roman" w:hAnsi="Arial" w:cs="Arial"/>
+          <w:szCs w:val="24"/>
+          <w:lang w:eastAsia="es-GT"/>
+        </w:rPr>
+      </w:pPr>
+      <w:r>
+        <w:rPr>
+          <w:rFonts w:ascii="Arial" w:eastAsia="Times New Roman" w:hAnsi="Arial" w:cs="Arial"/>
+          <w:b/>
+          <w:szCs w:val="24"/>
+          <w:lang w:eastAsia="es-GT"/>
+        </w:rPr>
+        <w:t>Como</w:t>
+      </w:r>
+      <w:r>
+        <w:rPr>
+          <w:rFonts w:ascii="Arial" w:eastAsia="Times New Roman" w:hAnsi="Arial" w:cs="Arial"/>
+          <w:szCs w:val="24"/>
+          <w:lang w:eastAsia="es-GT"/>
+        </w:rPr>
+        <w:t>: Un usuario (o un empleado del área con permisos)</w:t>
+      </w:r>
+    </w:p>
+    <w:p>
+      <w:pPr>
+        <w:spacing w:before="100" w:beforeAutospacing="1" w:after="100" w:afterAutospacing="1" w:line="240" w:lineRule="auto"/>
+        <w:rPr>
+          <w:rFonts w:ascii="Arial" w:eastAsia="Times New Roman" w:hAnsi="Arial" w:cs="Arial"/>
+          <w:szCs w:val="24"/>
+          <w:lang w:eastAsia="es-GT"/>
+        </w:rPr>
+      </w:pPr>
+      <w:r>
+        <w:rPr>
+          <w:rFonts w:ascii="Arial" w:eastAsia="Times New Roman" w:hAnsi="Arial" w:cs="Arial"/>
+          <w:szCs w:val="24"/>
+          <w:lang w:eastAsia="es-GT"/>
+        </w:rPr>
+        <w:t xml:space="preserve"> </w:t>
+      </w:r>
+      <w:r>
+        <w:rPr>
+          <w:rFonts w:ascii="Arial" w:eastAsia="Times New Roman" w:hAnsi="Arial" w:cs="Arial"/>
+          <w:b/>
+          <w:szCs w:val="24"/>
+          <w:lang w:eastAsia="es-GT"/>
+        </w:rPr>
+        <w:t>Quiero</w:t>
+      </w:r>
+      <w:r>
+        <w:rPr>
+          <w:rFonts w:ascii="Arial" w:eastAsia="Times New Roman" w:hAnsi="Arial" w:cs="Arial"/>
+          <w:szCs w:val="24"/>
+          <w:lang w:eastAsia="es-GT"/>
+        </w:rPr>
+        <w:t>: Poder ver el perfil de un usuario, incluyendo su nombre, correo, teléfono, fecha de nacimiento, tipo de usuario y sus imágenes</w:t>
+      </w:r>
+    </w:p>
+    <w:p>
+      <w:pPr>
+        <w:spacing w:before="100" w:beforeAutospacing="1" w:after="100" w:afterAutospacing="1" w:line="240" w:lineRule="auto"/>
+        <w:rPr>
+          <w:rFonts w:ascii="Arial" w:eastAsia="Times New Roman" w:hAnsi="Arial" w:cs="Arial"/>
+          <w:szCs w:val="24"/>
+          <w:lang w:eastAsia="es-GT"/>
+        </w:rPr>
+      </w:pPr>
+      <w:r>
+        <w:rPr>
+          <w:rFonts w:ascii="Arial" w:eastAsia="Times New Roman" w:hAnsi="Arial" w:cs="Arial"/>
+          <w:szCs w:val="24"/>
+          <w:lang w:eastAsia="es-GT"/>
+        </w:rPr>
+        <w:t xml:space="preserve"> </w:t>
+      </w:r>
+      <w:r>
+        <w:rPr>
+          <w:rFonts w:ascii="Arial" w:eastAsia="Times New Roman" w:hAnsi="Arial" w:cs="Arial"/>
+          <w:b/>
+          <w:szCs w:val="24"/>
+          <w:lang w:eastAsia="es-GT"/>
+        </w:rPr>
+        <w:t>Para</w:t>
+      </w:r>
+      <w:r>
+        <w:rPr>
+          <w:rFonts w:ascii="Arial" w:eastAsia="Times New Roman" w:hAnsi="Arial" w:cs="Arial"/>
+          <w:szCs w:val="24"/>
+          <w:lang w:eastAsia="es-GT"/>
+        </w:rPr>
+        <w:t>: Obtener información relevante sobre un usuario específico en la plataforma.</w:t>
+      </w:r>
+    </w:p>
+    <w:p>
+      <w:pPr>
+        <w:spacing w:before="100" w:beforeAutospacing="1" w:after="100" w:afterAutospacing="1" w:line="240" w:lineRule="auto"/>
+        <w:rPr>
+          <w:rFonts w:ascii="Arial" w:eastAsia="Times New Roman" w:hAnsi="Arial" w:cs="Arial"/>
+          <w:szCs w:val="24"/>
+          <w:lang w:eastAsia="es-GT"/>
+        </w:rPr>
+      </w:pPr>
+    </w:p>
+    <w:p>
+      <w:pPr>
+        <w:rPr>
+          <w:b/>
+        </w:rPr>
+      </w:pPr>
+      <w:r>
+        <w:rPr>
+          <w:b/>
+        </w:rPr>
+        <w:t>TUPLA:Servicios</w:t>
+      </w:r>
+    </w:p>
+    <w:p>
+      <w:pPr>
+        <w:rPr>
+          <w:b/>
+        </w:rPr>
+      </w:pPr>
+      <w:r>
+        <w:t>HUJC-</w:t>
+      </w:r>
+      <w:r>
+        <w:t>0</w:t>
+      </w:r>
+      <w:r>
+        <w:t>0</w:t>
+      </w:r>
+      <w:r>
+        <w:t>4</w:t>
+      </w:r>
+    </w:p>
+    <w:p>
+      <w:pPr>
+        <w:pStyle w:val="paragraph"/>
+        <w:spacing w:before="0" w:beforeAutospacing="0" w:after="0" w:afterAutospacing="0"/>
+        <w:textAlignment w:val="baseline"/>
+        <w:rPr>
+          <w:rStyle w:val="eop"/>
+          <w:rFonts w:ascii="Calibri" w:eastAsia="MS Mincho" w:hAnsi="Calibri" w:cs="Calibri"/>
+          <w:sz w:val="22"/>
+          <w:szCs w:val="22"/>
+        </w:rPr>
+      </w:pPr>
+      <w:r>
+        <w:rPr>
+          <w:rStyle w:val="normaltextrun"/>
+          <w:rFonts w:ascii="Calibri" w:hAnsi="Calibri" w:cs="Calibri"/>
+          <w:sz w:val="22"/>
+          <w:szCs w:val="22"/>
+        </w:rPr>
+        <w:t>Como</w:t>
+      </w:r>
+      <w:r>
+        <w:rPr>
+          <w:rStyle w:val="normaltextrun"/>
+          <w:rFonts w:ascii="Calibri" w:hAnsi="Calibri" w:cs="Calibri"/>
+          <w:sz w:val="22"/>
+          <w:szCs w:val="22"/>
+          <w:lang w:val="es-419"/>
+        </w:rPr>
+        <w:t>:</w:t>
+      </w:r>
+      <w:r>
+        <w:rPr>
+          <w:rStyle w:val="normaltextrun"/>
+          <w:rFonts w:ascii="Calibri" w:hAnsi="Calibri" w:cs="Calibri"/>
+          <w:sz w:val="22"/>
+          <w:szCs w:val="22"/>
+        </w:rPr>
+        <w:t xml:space="preserve"> cliente </w:t>
+      </w:r>
+      <w:r>
+        <w:rPr>
+          <w:rStyle w:val="eop"/>
+          <w:rFonts w:ascii="Calibri" w:eastAsia="MS Mincho" w:hAnsi="Calibri" w:cs="Calibri"/>
+          <w:sz w:val="22"/>
+          <w:szCs w:val="22"/>
+        </w:rPr>
+        <w:t> </w:t>
+      </w:r>
+    </w:p>
+    <w:p>
+      <w:pPr>
+        <w:pStyle w:val="paragraph"/>
+        <w:spacing w:before="0" w:beforeAutospacing="0" w:after="0" w:afterAutospacing="0"/>
+        <w:textAlignment w:val="baseline"/>
+        <w:rPr>
+          <w:rFonts w:ascii="Segoe UI" w:hAnsi="Segoe UI" w:cs="Segoe UI"/>
+          <w:sz w:val="18"/>
+          <w:szCs w:val="18"/>
+        </w:rPr>
+      </w:pPr>
+    </w:p>
+    <w:p>
+      <w:pPr>
+        <w:pStyle w:val="paragraph"/>
+        <w:spacing w:before="0" w:beforeAutospacing="0" w:after="0" w:afterAutospacing="0"/>
+        <w:textAlignment w:val="baseline"/>
+        <w:rPr>
+          <w:rFonts w:ascii="Segoe UI" w:hAnsi="Segoe UI" w:cs="Segoe UI"/>
+          <w:sz w:val="18"/>
+          <w:szCs w:val="18"/>
+        </w:rPr>
+      </w:pPr>
+      <w:r>
+        <w:rPr>
+          <w:rStyle w:val="normaltextrun"/>
+          <w:rFonts w:ascii="Calibri" w:hAnsi="Calibri" w:cs="Calibri"/>
+          <w:sz w:val="22"/>
+          <w:szCs w:val="22"/>
+        </w:rPr>
+        <w:t>Quiero: ver los servicios con su nombre, descripción, horario disponible y costo extra,</w:t>
+      </w:r>
+      <w:r>
+        <w:rPr>
+          <w:rStyle w:val="eop"/>
+          <w:rFonts w:ascii="Calibri" w:eastAsia="MS Mincho" w:hAnsi="Calibri" w:cs="Calibri"/>
+          <w:sz w:val="22"/>
+          <w:szCs w:val="22"/>
+        </w:rPr>
+        <w:t> </w:t>
+      </w:r>
+    </w:p>
+    <w:p>
+      <w:pPr>
+        <w:pStyle w:val="paragraph"/>
+        <w:spacing w:before="0" w:beforeAutospacing="0" w:after="0" w:afterAutospacing="0"/>
+        <w:textAlignment w:val="baseline"/>
+        <w:rPr>
+          <w:rStyle w:val="normaltextrun"/>
+          <w:rFonts w:ascii="Calibri" w:hAnsi="Calibri" w:cs="Calibri"/>
+          <w:sz w:val="22"/>
+          <w:szCs w:val="22"/>
+        </w:rPr>
+      </w:pPr>
+    </w:p>
+    <w:p>
+      <w:pPr>
+        <w:pStyle w:val="paragraph"/>
+        <w:spacing w:before="0" w:beforeAutospacing="0" w:after="0" w:afterAutospacing="0"/>
+        <w:textAlignment w:val="baseline"/>
+        <w:rPr>
+          <w:rStyle w:val="eop"/>
+          <w:rFonts w:ascii="Calibri" w:eastAsia="MS Mincho" w:hAnsi="Calibri" w:cs="Calibri"/>
+          <w:sz w:val="22"/>
+          <w:szCs w:val="22"/>
+        </w:rPr>
+      </w:pPr>
+      <w:r>
+        <w:rPr>
+          <w:rStyle w:val="normaltextrun"/>
+          <w:rFonts w:ascii="Calibri" w:hAnsi="Calibri" w:cs="Calibri"/>
+          <w:sz w:val="22"/>
+          <w:szCs w:val="22"/>
+        </w:rPr>
+        <w:t>Para: poder elegir el servicio que mejor se adapte a mis necesidades y presupuesto.</w:t>
+      </w:r>
+      <w:r>
+        <w:rPr>
+          <w:rStyle w:val="eop"/>
+          <w:rFonts w:ascii="Calibri" w:eastAsia="MS Mincho" w:hAnsi="Calibri" w:cs="Calibri"/>
+          <w:sz w:val="22"/>
+          <w:szCs w:val="22"/>
+        </w:rPr>
+        <w:t> </w:t>
+      </w:r>
+    </w:p>
+    <w:p>
+      <w:pPr>
+        <w:pStyle w:val="paragraph"/>
+        <w:spacing w:before="0" w:beforeAutospacing="0" w:after="0" w:afterAutospacing="0"/>
+        <w:textAlignment w:val="baseline"/>
+        <w:rPr>
+          <w:rStyle w:val="eop"/>
+          <w:rFonts w:ascii="Calibri" w:eastAsia="MS Mincho" w:hAnsi="Calibri" w:cs="Calibri"/>
+          <w:sz w:val="22"/>
+          <w:szCs w:val="22"/>
+        </w:rPr>
+      </w:pPr>
+    </w:p>
+    <w:p>
+      <w:pPr>
+        <w:spacing w:before="100" w:beforeAutospacing="1" w:after="100" w:afterAutospacing="1" w:line="240" w:lineRule="auto"/>
+        <w:rPr>
+          <w:rFonts w:ascii="Arial" w:eastAsia="Times New Roman" w:hAnsi="Arial" w:cs="Arial"/>
+          <w:szCs w:val="24"/>
+          <w:lang w:eastAsia="es-GT"/>
+        </w:rPr>
+      </w:pPr>
+    </w:p>
+    <w:p>
+      <w:pPr>
+        <w:spacing w:before="100" w:beforeAutospacing="1" w:after="100" w:afterAutospacing="1" w:line="240" w:lineRule="auto"/>
+        <w:rPr>
+          <w:rFonts w:ascii="Arial" w:eastAsia="Times New Roman" w:hAnsi="Arial" w:cs="Arial"/>
+          <w:sz w:val="24"/>
+          <w:szCs w:val="24"/>
+          <w:lang w:eastAsia="es-GT"/>
+        </w:rPr>
+      </w:pPr>
+    </w:p>
+    <w:p>
+      <w:pPr>
+        <w:spacing w:before="100" w:beforeAutospacing="1" w:after="100" w:afterAutospacing="1" w:line="240" w:lineRule="auto"/>
+        <w:rPr>
+          <w:rFonts w:ascii="Arial" w:eastAsia="Times New Roman" w:hAnsi="Arial" w:cs="Arial"/>
+          <w:sz w:val="24"/>
+          <w:szCs w:val="24"/>
+          <w:lang w:eastAsia="es-GT"/>
+        </w:rPr>
+      </w:pPr>
+    </w:p>
+    <w:p>
+      <w:pPr>
+        <w:spacing w:before="100" w:beforeAutospacing="1" w:after="100" w:afterAutospacing="1" w:line="240" w:lineRule="auto"/>
+        <w:rPr>
+          <w:rFonts w:ascii="Arial" w:eastAsia="Times New Roman" w:hAnsi="Arial" w:cs="Arial"/>
+          <w:sz w:val="24"/>
+          <w:szCs w:val="24"/>
+          <w:lang w:eastAsia="es-GT"/>
+        </w:rPr>
+      </w:pPr>
+    </w:p>
+    <w:p>
+      <w:pPr>
+        <w:spacing w:before="100" w:beforeAutospacing="1" w:after="100" w:afterAutospacing="1" w:line="240" w:lineRule="auto"/>
+        <w:rPr>
+          <w:rFonts w:ascii="Arial" w:eastAsia="Times New Roman" w:hAnsi="Arial" w:cs="Arial"/>
+          <w:sz w:val="24"/>
+          <w:szCs w:val="24"/>
+          <w:lang w:eastAsia="es-GT"/>
+        </w:rPr>
+      </w:pPr>
+    </w:p>
+    <w:p>
+      <w:pPr>
+        <w:spacing w:before="100" w:beforeAutospacing="1" w:after="100" w:afterAutospacing="1" w:line="240" w:lineRule="auto"/>
+        <w:rPr>
+          <w:rFonts w:ascii="Arial" w:eastAsia="Times New Roman" w:hAnsi="Arial" w:cs="Arial"/>
+          <w:sz w:val="24"/>
+          <w:szCs w:val="24"/>
+          <w:lang w:eastAsia="es-GT"/>
+        </w:rPr>
+      </w:pPr>
+    </w:p>
+    <w:p>
+      <w:pPr>
+        <w:spacing w:before="100" w:beforeAutospacing="1" w:after="100" w:afterAutospacing="1" w:line="240" w:lineRule="auto"/>
+        <w:rPr>
+          <w:rFonts w:ascii="Arial" w:eastAsia="Times New Roman" w:hAnsi="Arial" w:cs="Arial"/>
+          <w:sz w:val="24"/>
+          <w:szCs w:val="24"/>
+          <w:lang w:eastAsia="es-GT"/>
+        </w:rPr>
+      </w:pPr>
+    </w:p>
+    <w:p>
+      <w:pPr>
+        <w:spacing w:before="100" w:beforeAutospacing="1" w:after="100" w:afterAutospacing="1" w:line="240" w:lineRule="auto"/>
+        <w:rPr>
+          <w:rFonts w:ascii="Arial" w:eastAsia="Times New Roman" w:hAnsi="Arial" w:cs="Arial"/>
+          <w:sz w:val="24"/>
+          <w:szCs w:val="24"/>
+          <w:lang w:eastAsia="es-GT"/>
+        </w:rPr>
+      </w:pPr>
+    </w:p>
+    <w:p>
+      <w:pPr>
+        <w:spacing w:before="100" w:beforeAutospacing="1" w:after="100" w:afterAutospacing="1" w:line="240" w:lineRule="auto"/>
+        <w:rPr>
+          <w:rFonts w:ascii="Arial" w:eastAsia="Times New Roman" w:hAnsi="Arial" w:cs="Arial"/>
+          <w:sz w:val="24"/>
+          <w:szCs w:val="24"/>
+          <w:lang w:eastAsia="es-GT"/>
+        </w:rPr>
+      </w:pPr>
+    </w:p>
+    <w:p>
+      <w:pPr>
+        <w:spacing w:before="100" w:beforeAutospacing="1" w:after="100" w:afterAutospacing="1" w:line="240" w:lineRule="auto"/>
+        <w:rPr>
+          <w:rFonts w:ascii="Arial" w:eastAsia="Times New Roman" w:hAnsi="Arial" w:cs="Arial"/>
+          <w:sz w:val="24"/>
+          <w:szCs w:val="24"/>
+          <w:lang w:eastAsia="es-GT"/>
+        </w:rPr>
+      </w:pPr>
+    </w:p>
+    <w:p>
+      <w:pPr>
+        <w:spacing w:before="100" w:beforeAutospacing="1" w:after="100" w:afterAutospacing="1" w:line="240" w:lineRule="auto"/>
+        <w:rPr>
+          <w:rFonts w:ascii="Arial" w:eastAsia="Times New Roman" w:hAnsi="Arial" w:cs="Arial"/>
+          <w:sz w:val="24"/>
+          <w:szCs w:val="24"/>
+          <w:lang w:eastAsia="es-GT"/>
+        </w:rPr>
+      </w:pPr>
+    </w:p>
+    <w:p>
+      <w:pPr>
+        <w:spacing w:before="100" w:beforeAutospacing="1" w:after="100" w:afterAutospacing="1" w:line="240" w:lineRule="auto"/>
+        <w:rPr>
+          <w:rFonts w:ascii="Arial" w:eastAsia="Times New Roman" w:hAnsi="Arial" w:cs="Arial"/>
+          <w:sz w:val="24"/>
+          <w:szCs w:val="24"/>
+          <w:lang w:eastAsia="es-GT"/>
+        </w:rPr>
+      </w:pPr>
+    </w:p>
+    <w:p>
+      <w:pPr>
+        <w:spacing w:before="100" w:beforeAutospacing="1" w:after="100" w:afterAutospacing="1" w:line="240" w:lineRule="auto"/>
+        <w:rPr>
+          <w:rFonts w:ascii="Arial" w:eastAsia="Times New Roman" w:hAnsi="Arial" w:cs="Arial"/>
+          <w:sz w:val="24"/>
+          <w:szCs w:val="24"/>
+          <w:lang w:eastAsia="es-GT"/>
+        </w:rPr>
+      </w:pPr>
+    </w:p>
+    <w:p>
+      <w:pPr>
+        <w:spacing w:before="100" w:beforeAutospacing="1" w:after="100" w:afterAutospacing="1" w:line="240" w:lineRule="auto"/>
+        <w:rPr>
+          <w:rFonts w:ascii="Arial" w:eastAsia="Times New Roman" w:hAnsi="Arial" w:cs="Arial"/>
+          <w:sz w:val="24"/>
+          <w:szCs w:val="24"/>
+          <w:lang w:eastAsia="es-GT"/>
+        </w:rPr>
+      </w:pPr>
+    </w:p>
+    <w:p>
+      <w:pPr>
+        <w:spacing w:before="100" w:beforeAutospacing="1" w:after="100" w:afterAutospacing="1" w:line="240" w:lineRule="auto"/>
+        <w:rPr>
+          <w:rFonts w:ascii="Arial" w:eastAsia="Times New Roman" w:hAnsi="Arial" w:cs="Arial"/>
+          <w:sz w:val="24"/>
+          <w:szCs w:val="24"/>
+          <w:lang w:eastAsia="es-GT"/>
+        </w:rPr>
+      </w:pPr>
+    </w:p>
+    <w:p>
+      <w:pPr>
+        <w:spacing w:before="100" w:beforeAutospacing="1" w:after="100" w:afterAutospacing="1" w:line="240" w:lineRule="auto"/>
+        <w:rPr>
+          <w:rFonts w:ascii="Arial" w:eastAsia="Times New Roman" w:hAnsi="Arial" w:cs="Arial"/>
+          <w:sz w:val="24"/>
+          <w:szCs w:val="24"/>
+          <w:lang w:eastAsia="es-GT"/>
+        </w:rPr>
+      </w:pPr>
+    </w:p>
+    <w:p>
+      <w:pPr>
+        <w:spacing w:before="100" w:beforeAutospacing="1" w:after="100" w:afterAutospacing="1" w:line="240" w:lineRule="auto"/>
+        <w:rPr>
+          <w:rFonts w:ascii="Arial" w:eastAsia="Times New Roman" w:hAnsi="Arial" w:cs="Arial"/>
+          <w:sz w:val="24"/>
+          <w:szCs w:val="24"/>
+          <w:lang w:eastAsia="es-GT"/>
+        </w:rPr>
+      </w:pPr>
+    </w:p>
+    <w:p>
+      <w:pPr>
+        <w:spacing w:before="100" w:beforeAutospacing="1" w:after="100" w:afterAutospacing="1" w:line="240" w:lineRule="auto"/>
+        <w:rPr>
+          <w:rFonts w:ascii="Arial" w:eastAsia="Times New Roman" w:hAnsi="Arial" w:cs="Arial"/>
+          <w:sz w:val="24"/>
+          <w:szCs w:val="24"/>
+          <w:lang w:eastAsia="es-GT"/>
+        </w:rPr>
+      </w:pPr>
+    </w:p>
+    <w:p>
+      <w:pPr>
+        <w:spacing w:before="100" w:beforeAutospacing="1" w:after="100" w:afterAutospacing="1" w:line="240" w:lineRule="auto"/>
+        <w:rPr>
+          <w:rFonts w:ascii="Arial" w:eastAsia="Times New Roman" w:hAnsi="Arial" w:cs="Arial"/>
+          <w:sz w:val="24"/>
+          <w:szCs w:val="24"/>
+          <w:lang w:eastAsia="es-GT"/>
+        </w:rPr>
+      </w:pPr>
+    </w:p>
+    <w:p>
+      <w:pPr>
+        <w:spacing w:before="100" w:beforeAutospacing="1" w:after="100" w:afterAutospacing="1" w:line="240" w:lineRule="auto"/>
+        <w:rPr>
+          <w:rFonts w:ascii="Arial" w:eastAsia="Times New Roman" w:hAnsi="Arial" w:cs="Arial"/>
+          <w:sz w:val="24"/>
+          <w:szCs w:val="24"/>
+          <w:lang w:eastAsia="es-GT"/>
+        </w:rPr>
+      </w:pPr>
+    </w:p>
+    <w:p>
+      <w:pPr>
+        <w:spacing w:before="100" w:beforeAutospacing="1" w:after="100" w:afterAutospacing="1" w:line="240" w:lineRule="auto"/>
+        <w:rPr>
+          <w:rFonts w:ascii="Arial" w:eastAsia="Times New Roman" w:hAnsi="Arial" w:cs="Arial"/>
+          <w:sz w:val="24"/>
+          <w:szCs w:val="24"/>
+          <w:lang w:eastAsia="es-GT"/>
+        </w:rPr>
+      </w:pPr>
+    </w:p>
+    <w:p>
+      <w:pPr>
+        <w:spacing w:before="100" w:beforeAutospacing="1" w:after="100" w:afterAutospacing="1" w:line="240" w:lineRule="auto"/>
+        <w:rPr>
+          <w:rFonts w:ascii="Arial" w:eastAsia="Times New Roman" w:hAnsi="Arial" w:cs="Arial"/>
+          <w:sz w:val="24"/>
+          <w:szCs w:val="24"/>
+          <w:lang w:eastAsia="es-GT"/>
+        </w:rPr>
+      </w:pPr>
+    </w:p>
+    <w:p>
+      <w:pPr>
+        <w:spacing w:before="100" w:beforeAutospacing="1" w:after="100" w:afterAutospacing="1" w:line="240" w:lineRule="auto"/>
+        <w:rPr>
+          <w:rFonts w:ascii="Arial" w:eastAsia="Times New Roman" w:hAnsi="Arial" w:cs="Arial"/>
+          <w:sz w:val="24"/>
+          <w:szCs w:val="24"/>
+          <w:lang w:eastAsia="es-GT"/>
+        </w:rPr>
+      </w:pPr>
+    </w:p>
+    <w:p>
+      <w:pPr>
+        <w:spacing w:before="100" w:beforeAutospacing="1" w:after="100" w:afterAutospacing="1" w:line="240" w:lineRule="auto"/>
+        <w:rPr>
+          <w:rFonts w:ascii="Arial" w:eastAsia="Times New Roman" w:hAnsi="Arial" w:cs="Arial"/>
+          <w:sz w:val="24"/>
+          <w:szCs w:val="24"/>
+          <w:lang w:eastAsia="es-GT"/>
+        </w:rPr>
+      </w:pPr>
+    </w:p>
+    <w:p>
+      <w:pPr>
+        <w:spacing w:before="100" w:beforeAutospacing="1" w:after="100" w:afterAutospacing="1" w:line="240" w:lineRule="auto"/>
+        <w:rPr>
+          <w:rFonts w:ascii="Arial" w:eastAsia="Times New Roman" w:hAnsi="Arial" w:cs="Arial"/>
+          <w:sz w:val="24"/>
+          <w:szCs w:val="24"/>
+          <w:lang w:eastAsia="es-GT"/>
+        </w:rPr>
+      </w:pPr>
+    </w:p>
+    <w:p>
+      <w:pPr>
+        <w:spacing w:before="100" w:beforeAutospacing="1" w:after="100" w:afterAutospacing="1" w:line="240" w:lineRule="auto"/>
+        <w:rPr>
+          <w:rFonts w:ascii="Arial" w:eastAsia="Times New Roman" w:hAnsi="Arial" w:cs="Arial"/>
+          <w:sz w:val="24"/>
+          <w:szCs w:val="24"/>
+          <w:lang w:eastAsia="es-GT"/>
+        </w:rPr>
+      </w:pPr>
+    </w:p>
+    <w:p>
+      <w:pPr>
+        <w:spacing w:before="100" w:beforeAutospacing="1" w:after="100" w:afterAutospacing="1" w:line="240" w:lineRule="auto"/>
+        <w:rPr>
+          <w:rFonts w:ascii="Arial" w:eastAsia="Times New Roman" w:hAnsi="Arial" w:cs="Arial"/>
+          <w:sz w:val="24"/>
+          <w:szCs w:val="24"/>
+          <w:lang w:eastAsia="es-GT"/>
+        </w:rPr>
+      </w:pPr>
+    </w:p>
+    <w:p>
+      <w:pPr>
+        <w:spacing w:before="100" w:beforeAutospacing="1" w:after="100" w:afterAutospacing="1" w:line="240" w:lineRule="auto"/>
+        <w:rPr>
+          <w:rFonts w:ascii="Arial" w:eastAsia="Times New Roman" w:hAnsi="Arial" w:cs="Arial"/>
+          <w:sz w:val="24"/>
+          <w:szCs w:val="24"/>
+          <w:lang w:eastAsia="es-GT"/>
+        </w:rPr>
+      </w:pPr>
+    </w:p>
+    <w:p>
+      <w:pPr>
+        <w:spacing w:before="100" w:beforeAutospacing="1" w:after="100" w:afterAutospacing="1" w:line="240" w:lineRule="auto"/>
+        <w:rPr>
+          <w:rFonts w:ascii="Arial" w:eastAsia="Times New Roman" w:hAnsi="Arial" w:cs="Arial"/>
+          <w:sz w:val="24"/>
+          <w:szCs w:val="24"/>
+          <w:lang w:eastAsia="es-GT"/>
+        </w:rPr>
+      </w:pPr>
+    </w:p>
+    <w:p>
+      <w:pPr>
+        <w:spacing w:before="100" w:beforeAutospacing="1" w:after="100" w:afterAutospacing="1" w:line="240" w:lineRule="auto"/>
+        <w:rPr>
+          <w:rFonts w:ascii="Arial" w:eastAsia="Times New Roman" w:hAnsi="Arial" w:cs="Arial"/>
+          <w:sz w:val="24"/>
+          <w:szCs w:val="24"/>
+          <w:lang w:eastAsia="es-GT"/>
+        </w:rPr>
+      </w:pPr>
+    </w:p>
+    <w:p>
+      <w:pPr>
+        <w:spacing w:before="100" w:beforeAutospacing="1" w:after="100" w:afterAutospacing="1" w:line="240" w:lineRule="auto"/>
+        <w:rPr>
+          <w:rFonts w:ascii="Arial" w:eastAsia="Times New Roman" w:hAnsi="Arial" w:cs="Arial"/>
+          <w:sz w:val="24"/>
+          <w:szCs w:val="24"/>
+          <w:lang w:eastAsia="es-GT"/>
+        </w:rPr>
+      </w:pPr>
+    </w:p>
+    <w:p>
+      <w:pPr>
+        <w:spacing w:before="100" w:beforeAutospacing="1" w:after="100" w:afterAutospacing="1" w:line="240" w:lineRule="auto"/>
+        <w:rPr>
+          <w:rFonts w:ascii="Arial" w:eastAsia="Times New Roman" w:hAnsi="Arial" w:cs="Arial"/>
+          <w:sz w:val="24"/>
+          <w:szCs w:val="24"/>
+          <w:lang w:eastAsia="es-GT"/>
+        </w:rPr>
+      </w:pPr>
+    </w:p>
+    <w:p>
+      <w:pPr>
+        <w:spacing w:before="100" w:beforeAutospacing="1" w:after="100" w:afterAutospacing="1" w:line="240" w:lineRule="auto"/>
+        <w:rPr>
+          <w:rFonts w:ascii="Arial" w:eastAsia="Times New Roman" w:hAnsi="Arial" w:cs="Arial"/>
+          <w:sz w:val="24"/>
+          <w:szCs w:val="24"/>
+          <w:lang w:eastAsia="es-GT"/>
+        </w:rPr>
+      </w:pPr>
+    </w:p>
+    <w:p>
+      <w:pPr>
+        <w:spacing w:before="100" w:beforeAutospacing="1" w:after="100" w:afterAutospacing="1" w:line="240" w:lineRule="auto"/>
+        <w:rPr>
+          <w:rFonts w:ascii="Arial" w:eastAsia="Times New Roman" w:hAnsi="Arial" w:cs="Arial"/>
+          <w:sz w:val="24"/>
+          <w:szCs w:val="24"/>
+          <w:lang w:eastAsia="es-GT"/>
+        </w:rPr>
+      </w:pPr>
+    </w:p>
+    <w:p>
+      <w:pPr>
+        <w:spacing w:before="100" w:beforeAutospacing="1" w:after="100" w:afterAutospacing="1" w:line="240" w:lineRule="auto"/>
+        <w:rPr>
+          <w:rFonts w:ascii="Arial" w:eastAsia="Times New Roman" w:hAnsi="Arial" w:cs="Arial"/>
+          <w:sz w:val="24"/>
+          <w:szCs w:val="24"/>
+          <w:lang w:eastAsia="es-GT"/>
+        </w:rPr>
+      </w:pPr>
+    </w:p>
+    <w:p>
+      <w:pPr>
+        <w:spacing w:before="100" w:beforeAutospacing="1" w:after="100" w:afterAutospacing="1" w:line="240" w:lineRule="auto"/>
+        <w:rPr>
+          <w:rFonts w:ascii="Arial" w:eastAsia="Times New Roman" w:hAnsi="Arial" w:cs="Arial"/>
+          <w:sz w:val="24"/>
+          <w:szCs w:val="24"/>
+          <w:lang w:eastAsia="es-GT"/>
+        </w:rPr>
+      </w:pPr>
+    </w:p>
+    <w:p>
+      <w:pPr>
+        <w:spacing w:before="100" w:beforeAutospacing="1" w:after="100" w:afterAutospacing="1" w:line="240" w:lineRule="auto"/>
+        <w:rPr>
+          <w:rFonts w:ascii="Arial" w:eastAsia="Times New Roman" w:hAnsi="Arial" w:cs="Arial"/>
+          <w:sz w:val="24"/>
+          <w:szCs w:val="24"/>
+          <w:lang w:eastAsia="es-GT"/>
+        </w:rPr>
+      </w:pPr>
+    </w:p>
+    <w:p>
+      <w:pPr>
+        <w:spacing w:before="100" w:beforeAutospacing="1" w:after="100" w:afterAutospacing="1" w:line="240" w:lineRule="auto"/>
+        <w:rPr>
+          <w:rFonts w:ascii="Arial" w:eastAsia="Times New Roman" w:hAnsi="Arial" w:cs="Arial"/>
+          <w:sz w:val="24"/>
+          <w:szCs w:val="24"/>
+          <w:lang w:eastAsia="es-GT"/>
+        </w:rPr>
+      </w:pPr>
+    </w:p>
+    <w:p>
+      <w:pPr>
+        <w:spacing w:before="100" w:beforeAutospacing="1" w:after="100" w:afterAutospacing="1" w:line="240" w:lineRule="auto"/>
+        <w:rPr>
+          <w:rFonts w:ascii="Arial" w:eastAsia="Times New Roman" w:hAnsi="Arial" w:cs="Arial"/>
+          <w:sz w:val="24"/>
+          <w:szCs w:val="24"/>
+          <w:lang w:eastAsia="es-GT"/>
+        </w:rPr>
+      </w:pPr>
+    </w:p>
+    <w:p>
+      <w:pPr>
+        <w:spacing w:before="100" w:beforeAutospacing="1" w:after="100" w:afterAutospacing="1" w:line="240" w:lineRule="auto"/>
+        <w:rPr>
+          <w:rFonts w:ascii="Arial" w:eastAsia="Times New Roman" w:hAnsi="Arial" w:cs="Arial"/>
+          <w:sz w:val="24"/>
+          <w:szCs w:val="24"/>
+          <w:lang w:eastAsia="es-GT"/>
+        </w:rPr>
+      </w:pPr>
+    </w:p>
+    <w:p>
+      <w:pPr>
+        <w:spacing w:before="100" w:beforeAutospacing="1" w:after="100" w:afterAutospacing="1" w:line="240" w:lineRule="auto"/>
+        <w:rPr>
+          <w:rFonts w:ascii="Arial" w:eastAsia="Times New Roman" w:hAnsi="Arial" w:cs="Arial"/>
+          <w:sz w:val="24"/>
+          <w:szCs w:val="24"/>
+          <w:lang w:eastAsia="es-GT"/>
+        </w:rPr>
+      </w:pPr>
+    </w:p>
+    <w:p>
+      <w:pPr>
+        <w:spacing w:before="100" w:beforeAutospacing="1" w:after="100" w:afterAutospacing="1" w:line="240" w:lineRule="auto"/>
+        <w:rPr>
+          <w:rFonts w:ascii="Arial" w:eastAsia="Times New Roman" w:hAnsi="Arial" w:cs="Arial"/>
+          <w:sz w:val="24"/>
+          <w:szCs w:val="24"/>
+          <w:lang w:eastAsia="es-GT"/>
+        </w:rPr>
+      </w:pPr>
+    </w:p>
+    <w:p>
+      <w:pPr>
+        <w:spacing w:before="100" w:beforeAutospacing="1" w:after="100" w:afterAutospacing="1" w:line="240" w:lineRule="auto"/>
+        <w:rPr>
+          <w:rFonts w:ascii="Arial" w:eastAsia="Times New Roman" w:hAnsi="Arial" w:cs="Arial"/>
+          <w:sz w:val="24"/>
+          <w:szCs w:val="24"/>
+          <w:lang w:eastAsia="es-GT"/>
+        </w:rPr>
+      </w:pPr>
+    </w:p>
+    <w:p>
+      <w:pPr>
+        <w:spacing w:before="100" w:beforeAutospacing="1" w:after="100" w:afterAutospacing="1" w:line="240" w:lineRule="auto"/>
+        <w:rPr>
+          <w:rFonts w:ascii="Arial" w:eastAsia="Times New Roman" w:hAnsi="Arial" w:cs="Arial"/>
+          <w:sz w:val="24"/>
+          <w:szCs w:val="24"/>
+          <w:lang w:eastAsia="es-GT"/>
+        </w:rPr>
+      </w:pPr>
+    </w:p>
+    <w:p>
+      <w:pPr>
+        <w:spacing w:before="100" w:beforeAutospacing="1" w:after="100" w:afterAutospacing="1" w:line="240" w:lineRule="auto"/>
+        <w:rPr>
+          <w:rFonts w:ascii="Arial" w:eastAsia="Times New Roman" w:hAnsi="Arial" w:cs="Arial"/>
+          <w:sz w:val="24"/>
+          <w:szCs w:val="24"/>
+          <w:lang w:eastAsia="es-GT"/>
+        </w:rPr>
+      </w:pPr>
+    </w:p>
+    <w:p>
+      <w:pPr>
+        <w:spacing w:before="100" w:beforeAutospacing="1" w:after="100" w:afterAutospacing="1" w:line="240" w:lineRule="auto"/>
+        <w:rPr>
+          <w:rFonts w:ascii="Arial" w:eastAsia="Times New Roman" w:hAnsi="Arial" w:cs="Arial"/>
+          <w:sz w:val="24"/>
+          <w:szCs w:val="24"/>
+          <w:lang w:eastAsia="es-GT"/>
+        </w:rPr>
+      </w:pPr>
+    </w:p>
+    <w:p>
+      <w:pPr>
+        <w:spacing w:before="100" w:beforeAutospacing="1" w:after="100" w:afterAutospacing="1" w:line="240" w:lineRule="auto"/>
+        <w:rPr>
+          <w:rFonts w:ascii="Arial" w:eastAsia="Times New Roman" w:hAnsi="Arial" w:cs="Arial"/>
+          <w:sz w:val="24"/>
+          <w:szCs w:val="24"/>
+          <w:lang w:eastAsia="es-GT"/>
+        </w:rPr>
+      </w:pPr>
+    </w:p>
+    <w:p>
+      <w:pPr>
+        <w:spacing w:before="100" w:beforeAutospacing="1" w:after="100" w:afterAutospacing="1" w:line="240" w:lineRule="auto"/>
+        <w:rPr>
+          <w:rFonts w:ascii="Arial" w:eastAsia="Times New Roman" w:hAnsi="Arial" w:cs="Arial"/>
+          <w:sz w:val="24"/>
+          <w:szCs w:val="24"/>
+          <w:lang w:eastAsia="es-GT"/>
+        </w:rPr>
+      </w:pPr>
+    </w:p>
+    <w:p>
+      <w:pPr>
+        <w:spacing w:before="100" w:beforeAutospacing="1" w:after="100" w:afterAutospacing="1" w:line="240" w:lineRule="auto"/>
+        <w:rPr>
+          <w:rFonts w:ascii="Arial" w:eastAsia="Times New Roman" w:hAnsi="Arial" w:cs="Arial"/>
+          <w:sz w:val="24"/>
+          <w:szCs w:val="24"/>
+          <w:lang w:eastAsia="es-GT"/>
+        </w:rPr>
+      </w:pPr>
+    </w:p>
+    <w:p>
+      <w:pPr>
+        <w:spacing w:before="100" w:beforeAutospacing="1" w:after="100" w:afterAutospacing="1" w:line="240" w:lineRule="auto"/>
+        <w:rPr>
+          <w:rFonts w:ascii="Arial" w:eastAsia="Times New Roman" w:hAnsi="Arial" w:cs="Arial"/>
+          <w:sz w:val="24"/>
+          <w:szCs w:val="24"/>
+          <w:lang w:eastAsia="es-GT"/>
+        </w:rPr>
+      </w:pPr>
+    </w:p>
+    <w:p>
+      <w:pPr>
+        <w:spacing w:before="100" w:beforeAutospacing="1" w:after="100" w:afterAutospacing="1" w:line="240" w:lineRule="auto"/>
+        <w:rPr>
+          <w:rFonts w:ascii="Arial" w:eastAsia="Times New Roman" w:hAnsi="Arial" w:cs="Arial"/>
+          <w:sz w:val="24"/>
+          <w:szCs w:val="24"/>
+          <w:lang w:eastAsia="es-GT"/>
+        </w:rPr>
+      </w:pPr>
+    </w:p>
+    <w:p>
+      <w:pPr>
+        <w:spacing w:before="100" w:beforeAutospacing="1" w:after="100" w:afterAutospacing="1" w:line="240" w:lineRule="auto"/>
+        <w:rPr>
+          <w:rFonts w:ascii="Arial" w:eastAsia="Times New Roman" w:hAnsi="Arial" w:cs="Arial"/>
+          <w:sz w:val="24"/>
+          <w:szCs w:val="24"/>
+          <w:lang w:eastAsia="es-GT"/>
+        </w:rPr>
+      </w:pPr>
+    </w:p>
+    <w:p>
+      <w:pPr>
+        <w:spacing w:before="100" w:beforeAutospacing="1" w:after="100" w:afterAutospacing="1" w:line="240" w:lineRule="auto"/>
+        <w:rPr>
+          <w:rFonts w:ascii="Arial" w:eastAsia="Times New Roman" w:hAnsi="Arial" w:cs="Arial"/>
+          <w:sz w:val="24"/>
+          <w:szCs w:val="24"/>
+          <w:lang w:eastAsia="es-GT"/>
+        </w:rPr>
+      </w:pPr>
+    </w:p>
+    <w:p>
+      <w:pPr>
+        <w:spacing w:before="100" w:beforeAutospacing="1" w:after="100" w:afterAutospacing="1" w:line="240" w:lineRule="auto"/>
+        <w:rPr>
+          <w:rFonts w:ascii="Arial" w:eastAsia="Times New Roman" w:hAnsi="Arial" w:cs="Arial"/>
+          <w:sz w:val="24"/>
+          <w:szCs w:val="24"/>
+          <w:lang w:eastAsia="es-GT"/>
+        </w:rPr>
+      </w:pPr>
+    </w:p>
+    <w:p>
+      <w:pPr>
+        <w:spacing w:before="100" w:beforeAutospacing="1" w:after="100" w:afterAutospacing="1" w:line="240" w:lineRule="auto"/>
+        <w:rPr>
+          <w:rFonts w:ascii="Arial" w:eastAsia="Times New Roman" w:hAnsi="Arial" w:cs="Arial"/>
+          <w:sz w:val="24"/>
+          <w:szCs w:val="24"/>
+          <w:lang w:eastAsia="es-GT"/>
+        </w:rPr>
+      </w:pPr>
+    </w:p>
+    <w:p>
+      <w:pPr>
+        <w:spacing w:before="100" w:beforeAutospacing="1" w:after="100" w:afterAutospacing="1" w:line="240" w:lineRule="auto"/>
+        <w:rPr>
+          <w:rFonts w:ascii="Arial" w:eastAsia="Times New Roman" w:hAnsi="Arial" w:cs="Arial"/>
+          <w:sz w:val="24"/>
+          <w:szCs w:val="24"/>
+          <w:lang w:eastAsia="es-GT"/>
+        </w:rPr>
+      </w:pPr>
+    </w:p>
+    <w:p>
+      <w:pPr>
+        <w:spacing w:before="100" w:beforeAutospacing="1" w:after="100" w:afterAutospacing="1" w:line="240" w:lineRule="auto"/>
+        <w:rPr>
+          <w:rFonts w:ascii="Arial" w:eastAsia="Times New Roman" w:hAnsi="Arial" w:cs="Arial"/>
+          <w:sz w:val="24"/>
+          <w:szCs w:val="24"/>
+          <w:lang w:eastAsia="es-GT"/>
+        </w:rPr>
+      </w:pPr>
+    </w:p>
+    <w:p>
+      <w:pPr>
+        <w:spacing w:before="100" w:beforeAutospacing="1" w:after="100" w:afterAutospacing="1" w:line="240" w:lineRule="auto"/>
+        <w:rPr>
+          <w:rFonts w:ascii="Arial" w:eastAsia="Times New Roman" w:hAnsi="Arial" w:cs="Arial"/>
+          <w:sz w:val="24"/>
+          <w:szCs w:val="24"/>
+          <w:lang w:eastAsia="es-GT"/>
+        </w:rPr>
+      </w:pPr>
+    </w:p>
+    <w:p>
+      <w:pPr>
+        <w:spacing w:before="100" w:beforeAutospacing="1" w:after="100" w:afterAutospacing="1" w:line="240" w:lineRule="auto"/>
+        <w:rPr>
+          <w:rFonts w:ascii="Arial" w:eastAsia="Times New Roman" w:hAnsi="Arial" w:cs="Arial"/>
+          <w:sz w:val="24"/>
+          <w:szCs w:val="24"/>
+          <w:lang w:eastAsia="es-GT"/>
+        </w:rPr>
+      </w:pPr>
+    </w:p>
+    <w:p>
+      <w:pPr>
+        <w:spacing w:before="100" w:beforeAutospacing="1" w:after="100" w:afterAutospacing="1" w:line="240" w:lineRule="auto"/>
+        <w:rPr>
+          <w:rFonts w:ascii="Arial" w:eastAsia="Times New Roman" w:hAnsi="Arial" w:cs="Arial"/>
+          <w:sz w:val="24"/>
+          <w:szCs w:val="24"/>
+          <w:lang w:eastAsia="es-GT"/>
+        </w:rPr>
+      </w:pPr>
+    </w:p>
+    <w:p>
+      <w:pPr>
+        <w:spacing w:before="100" w:beforeAutospacing="1" w:after="100" w:afterAutospacing="1" w:line="240" w:lineRule="auto"/>
+        <w:rPr>
+          <w:rFonts w:ascii="Arial" w:eastAsia="Times New Roman" w:hAnsi="Arial" w:cs="Arial"/>
+          <w:sz w:val="24"/>
+          <w:szCs w:val="24"/>
+          <w:lang w:eastAsia="es-GT"/>
+        </w:rPr>
+      </w:pPr>
+    </w:p>
+    <w:p>
+      <w:pPr>
+        <w:spacing w:before="100" w:beforeAutospacing="1" w:after="100" w:afterAutospacing="1" w:line="240" w:lineRule="auto"/>
+        <w:rPr>
+          <w:rFonts w:ascii="Arial" w:eastAsia="Times New Roman" w:hAnsi="Arial" w:cs="Arial"/>
+          <w:sz w:val="24"/>
+          <w:szCs w:val="24"/>
+          <w:lang w:eastAsia="es-GT"/>
+        </w:rPr>
+      </w:pPr>
+    </w:p>
+    <w:p>
+      <w:pPr>
+        <w:spacing w:before="100" w:beforeAutospacing="1" w:after="100" w:afterAutospacing="1" w:line="240" w:lineRule="auto"/>
+        <w:rPr>
+          <w:rFonts w:ascii="Arial" w:eastAsia="Times New Roman" w:hAnsi="Arial" w:cs="Arial"/>
+          <w:sz w:val="24"/>
+          <w:szCs w:val="24"/>
+          <w:lang w:eastAsia="es-GT"/>
+        </w:rPr>
+      </w:pPr>
+    </w:p>
+    <w:p>
+      <w:pPr>
+        <w:spacing w:before="100" w:beforeAutospacing="1" w:after="100" w:afterAutospacing="1" w:line="240" w:lineRule="auto"/>
+        <w:rPr>
+          <w:rFonts w:ascii="Arial" w:eastAsia="Times New Roman" w:hAnsi="Arial" w:cs="Arial"/>
+          <w:sz w:val="24"/>
+          <w:szCs w:val="24"/>
+          <w:lang w:eastAsia="es-GT"/>
+        </w:rPr>
+      </w:pPr>
+    </w:p>
+    <w:p>
+      <w:pPr>
+        <w:spacing w:before="100" w:beforeAutospacing="1" w:after="100" w:afterAutospacing="1" w:line="240" w:lineRule="auto"/>
+        <w:rPr>
+          <w:rFonts w:ascii="Arial" w:eastAsia="Times New Roman" w:hAnsi="Arial" w:cs="Arial"/>
+          <w:sz w:val="24"/>
+          <w:szCs w:val="24"/>
+          <w:lang w:eastAsia="es-GT"/>
+        </w:rPr>
+      </w:pPr>
+    </w:p>
+    <w:p>
+      <w:pPr>
+        <w:spacing w:before="100" w:beforeAutospacing="1" w:after="100" w:afterAutospacing="1" w:line="240" w:lineRule="auto"/>
+        <w:rPr>
+          <w:rFonts w:ascii="Arial" w:eastAsia="Times New Roman" w:hAnsi="Arial" w:cs="Arial"/>
+          <w:sz w:val="24"/>
+          <w:szCs w:val="24"/>
+          <w:lang w:eastAsia="es-GT"/>
+        </w:rPr>
+      </w:pPr>
+    </w:p>
+    <w:p>
+      <w:pPr>
+        <w:spacing w:before="100" w:beforeAutospacing="1" w:after="100" w:afterAutospacing="1" w:line="240" w:lineRule="auto"/>
+        <w:rPr>
+          <w:rFonts w:ascii="Arial" w:eastAsia="Times New Roman" w:hAnsi="Arial" w:cs="Arial"/>
+          <w:sz w:val="24"/>
+          <w:szCs w:val="24"/>
+          <w:lang w:eastAsia="es-GT"/>
+        </w:rPr>
+      </w:pPr>
+    </w:p>
+    <w:p>
+      <w:pPr>
+        <w:spacing w:before="100" w:beforeAutospacing="1" w:after="100" w:afterAutospacing="1" w:line="240" w:lineRule="auto"/>
+        <w:rPr>
+          <w:rFonts w:ascii="Arial" w:eastAsia="Times New Roman" w:hAnsi="Arial" w:cs="Arial"/>
+          <w:sz w:val="24"/>
+          <w:szCs w:val="24"/>
+          <w:lang w:eastAsia="es-GT"/>
+        </w:rPr>
+      </w:pPr>
+    </w:p>
+    <w:p>
+      <w:pPr>
+        <w:spacing w:before="100" w:beforeAutospacing="1" w:after="100" w:afterAutospacing="1" w:line="240" w:lineRule="auto"/>
+        <w:rPr>
+          <w:rFonts w:ascii="Arial" w:eastAsia="Times New Roman" w:hAnsi="Arial" w:cs="Arial"/>
+          <w:sz w:val="24"/>
+          <w:szCs w:val="24"/>
+          <w:lang w:eastAsia="es-GT"/>
+        </w:rPr>
+      </w:pPr>
+    </w:p>
+    <w:p>
+      <w:pPr>
+        <w:spacing w:before="100" w:beforeAutospacing="1" w:after="100" w:afterAutospacing="1" w:line="240" w:lineRule="auto"/>
+        <w:rPr>
+          <w:rFonts w:ascii="Arial" w:eastAsia="Times New Roman" w:hAnsi="Arial" w:cs="Arial"/>
+          <w:sz w:val="24"/>
+          <w:szCs w:val="24"/>
+          <w:lang w:eastAsia="es-GT"/>
+        </w:rPr>
+      </w:pPr>
+    </w:p>
+    <w:p>
+      <w:pPr>
+        <w:spacing w:before="100" w:beforeAutospacing="1" w:after="100" w:afterAutospacing="1" w:line="240" w:lineRule="auto"/>
+        <w:rPr>
+          <w:rFonts w:ascii="Arial" w:eastAsia="Times New Roman" w:hAnsi="Arial" w:cs="Arial"/>
+          <w:sz w:val="24"/>
+          <w:szCs w:val="24"/>
+          <w:lang w:eastAsia="es-GT"/>
+        </w:rPr>
+      </w:pPr>
+    </w:p>
+    <w:p>
+      <w:pPr>
+        <w:spacing w:before="100" w:beforeAutospacing="1" w:after="100" w:afterAutospacing="1" w:line="240" w:lineRule="auto"/>
+        <w:rPr>
+          <w:rFonts w:ascii="Arial" w:eastAsia="Times New Roman" w:hAnsi="Arial" w:cs="Arial"/>
+          <w:sz w:val="24"/>
+          <w:szCs w:val="24"/>
+          <w:lang w:eastAsia="es-GT"/>
+        </w:rPr>
+      </w:pPr>
+    </w:p>
+    <w:p>
+      <w:pPr>
+        <w:spacing w:before="100" w:beforeAutospacing="1" w:after="100" w:afterAutospacing="1" w:line="240" w:lineRule="auto"/>
+        <w:rPr>
+          <w:rFonts w:ascii="Arial" w:eastAsia="Times New Roman" w:hAnsi="Arial" w:cs="Arial"/>
+          <w:sz w:val="24"/>
+          <w:szCs w:val="24"/>
+          <w:lang w:eastAsia="es-GT"/>
+        </w:rPr>
+      </w:pPr>
+    </w:p>
+    <w:p>
+      <w:pPr>
+        <w:spacing w:before="100" w:beforeAutospacing="1" w:after="100" w:afterAutospacing="1" w:line="240" w:lineRule="auto"/>
+        <w:rPr>
+          <w:rFonts w:ascii="Arial" w:eastAsia="Times New Roman" w:hAnsi="Arial" w:cs="Arial"/>
+          <w:sz w:val="24"/>
+          <w:szCs w:val="24"/>
+          <w:lang w:eastAsia="es-GT"/>
+        </w:rPr>
+      </w:pPr>
+    </w:p>
+    <w:p>
+      <w:pPr>
+        <w:spacing w:before="100" w:beforeAutospacing="1" w:after="100" w:afterAutospacing="1" w:line="240" w:lineRule="auto"/>
+        <w:rPr>
+          <w:rFonts w:ascii="Arial" w:eastAsia="Times New Roman" w:hAnsi="Arial" w:cs="Arial"/>
+          <w:sz w:val="24"/>
+          <w:szCs w:val="24"/>
+          <w:lang w:eastAsia="es-GT"/>
+        </w:rPr>
+      </w:pPr>
+    </w:p>
+    <w:p>
+      <w:pPr>
+        <w:spacing w:before="100" w:beforeAutospacing="1" w:after="100" w:afterAutospacing="1" w:line="240" w:lineRule="auto"/>
+        <w:rPr>
+          <w:rFonts w:ascii="Arial" w:eastAsia="Times New Roman" w:hAnsi="Arial" w:cs="Arial"/>
+          <w:sz w:val="24"/>
+          <w:szCs w:val="24"/>
+          <w:lang w:eastAsia="es-GT"/>
+        </w:rPr>
+      </w:pPr>
+    </w:p>
+    <w:p>
+      <w:pPr>
+        <w:spacing w:before="100" w:beforeAutospacing="1" w:after="100" w:afterAutospacing="1" w:line="240" w:lineRule="auto"/>
+        <w:rPr>
+          <w:rFonts w:ascii="Arial" w:eastAsia="Times New Roman" w:hAnsi="Arial" w:cs="Arial"/>
+          <w:sz w:val="24"/>
+          <w:szCs w:val="24"/>
+          <w:lang w:eastAsia="es-GT"/>
+        </w:rPr>
+      </w:pPr>
+    </w:p>
+    <w:p>
+      <w:pPr>
+        <w:spacing w:before="100" w:beforeAutospacing="1" w:after="100" w:afterAutospacing="1" w:line="240" w:lineRule="auto"/>
+        <w:rPr>
+          <w:rFonts w:ascii="Arial" w:eastAsia="Times New Roman" w:hAnsi="Arial" w:cs="Arial"/>
+          <w:sz w:val="24"/>
+          <w:szCs w:val="24"/>
+          <w:lang w:eastAsia="es-GT"/>
+        </w:rPr>
+      </w:pPr>
+    </w:p>
+    <w:p>
+      <w:pPr>
+        <w:spacing w:before="100" w:beforeAutospacing="1" w:after="100" w:afterAutospacing="1" w:line="240" w:lineRule="auto"/>
+        <w:rPr>
+          <w:rFonts w:ascii="Arial" w:eastAsia="Times New Roman" w:hAnsi="Arial" w:cs="Arial"/>
+          <w:sz w:val="24"/>
+          <w:szCs w:val="24"/>
+          <w:lang w:eastAsia="es-GT"/>
+        </w:rPr>
+      </w:pPr>
+    </w:p>
+    <w:p>
+      <w:pPr>
+        <w:spacing w:before="100" w:beforeAutospacing="1" w:after="100" w:afterAutospacing="1" w:line="240" w:lineRule="auto"/>
+        <w:rPr>
+          <w:rFonts w:ascii="Arial" w:eastAsia="Times New Roman" w:hAnsi="Arial" w:cs="Arial"/>
+          <w:sz w:val="24"/>
+          <w:szCs w:val="24"/>
+          <w:lang w:eastAsia="es-GT"/>
+        </w:rPr>
+      </w:pPr>
+    </w:p>
+    <w:p>
+      <w:pPr>
+        <w:spacing w:before="100" w:beforeAutospacing="1" w:after="100" w:afterAutospacing="1" w:line="240" w:lineRule="auto"/>
+        <w:rPr>
+          <w:rFonts w:ascii="Arial" w:eastAsia="Times New Roman" w:hAnsi="Arial" w:cs="Arial"/>
+          <w:sz w:val="24"/>
+          <w:szCs w:val="24"/>
+          <w:lang w:eastAsia="es-GT"/>
+        </w:rPr>
+      </w:pPr>
+    </w:p>
+    <w:p>
+      <w:pPr>
+        <w:spacing w:before="100" w:beforeAutospacing="1" w:after="100" w:afterAutospacing="1" w:line="240" w:lineRule="auto"/>
+        <w:rPr>
+          <w:rFonts w:ascii="Arial" w:eastAsia="Times New Roman" w:hAnsi="Arial" w:cs="Arial"/>
+          <w:sz w:val="24"/>
+          <w:szCs w:val="24"/>
+          <w:lang w:eastAsia="es-GT"/>
+        </w:rPr>
+      </w:pPr>
+    </w:p>
+    <w:p>
+      <w:pPr>
+        <w:spacing w:before="100" w:beforeAutospacing="1" w:after="100" w:afterAutospacing="1" w:line="240" w:lineRule="auto"/>
+        <w:rPr>
+          <w:rFonts w:ascii="Arial" w:eastAsia="Times New Roman" w:hAnsi="Arial" w:cs="Arial"/>
+          <w:sz w:val="24"/>
+          <w:szCs w:val="24"/>
+          <w:lang w:eastAsia="es-GT"/>
+        </w:rPr>
+      </w:pPr>
+    </w:p>
+    <w:p>
+      <w:pPr>
+        <w:spacing w:before="100" w:beforeAutospacing="1" w:after="100" w:afterAutospacing="1" w:line="240" w:lineRule="auto"/>
+        <w:rPr>
+          <w:rFonts w:ascii="Arial" w:eastAsia="Times New Roman" w:hAnsi="Arial" w:cs="Arial"/>
+          <w:sz w:val="24"/>
+          <w:szCs w:val="24"/>
+          <w:lang w:eastAsia="es-GT"/>
+        </w:rPr>
+      </w:pPr>
+    </w:p>
+    <w:p>
+      <w:pPr>
+        <w:spacing w:before="100" w:beforeAutospacing="1" w:after="100" w:afterAutospacing="1" w:line="240" w:lineRule="auto"/>
+        <w:rPr>
+          <w:rFonts w:ascii="Arial" w:eastAsia="Times New Roman" w:hAnsi="Arial" w:cs="Arial"/>
+          <w:sz w:val="24"/>
+          <w:szCs w:val="24"/>
+          <w:lang w:eastAsia="es-GT"/>
+        </w:rPr>
+      </w:pPr>
+    </w:p>
+    <w:p>
+      <w:pPr>
+        <w:spacing w:before="100" w:beforeAutospacing="1" w:after="100" w:afterAutospacing="1" w:line="240" w:lineRule="auto"/>
+        <w:rPr>
+          <w:rFonts w:ascii="Arial" w:eastAsia="Times New Roman" w:hAnsi="Arial" w:cs="Arial"/>
+          <w:sz w:val="24"/>
+          <w:szCs w:val="24"/>
+          <w:lang w:eastAsia="es-GT"/>
+        </w:rPr>
+      </w:pPr>
+    </w:p>
+    <w:p>
+      <w:pPr>
+        <w:spacing w:before="100" w:beforeAutospacing="1" w:after="100" w:afterAutospacing="1" w:line="240" w:lineRule="auto"/>
+        <w:rPr>
+          <w:rFonts w:ascii="Arial" w:eastAsia="Times New Roman" w:hAnsi="Arial" w:cs="Arial"/>
+          <w:sz w:val="24"/>
+          <w:szCs w:val="24"/>
+          <w:lang w:eastAsia="es-GT"/>
+        </w:rPr>
+      </w:pPr>
+    </w:p>
+    <w:p>
+      <w:pPr>
+        <w:spacing w:before="100" w:beforeAutospacing="1" w:after="100" w:afterAutospacing="1" w:line="240" w:lineRule="auto"/>
+        <w:rPr>
+          <w:rFonts w:ascii="Arial" w:eastAsia="Times New Roman" w:hAnsi="Arial" w:cs="Arial"/>
+          <w:sz w:val="24"/>
+          <w:szCs w:val="24"/>
+          <w:lang w:eastAsia="es-GT"/>
+        </w:rPr>
+      </w:pPr>
+    </w:p>
+    <w:p>
+      <w:pPr>
+        <w:spacing w:before="100" w:beforeAutospacing="1" w:after="100" w:afterAutospacing="1" w:line="240" w:lineRule="auto"/>
+        <w:rPr>
+          <w:rFonts w:ascii="Arial" w:eastAsia="Times New Roman" w:hAnsi="Arial" w:cs="Arial"/>
+          <w:sz w:val="24"/>
+          <w:szCs w:val="24"/>
+          <w:lang w:eastAsia="es-GT"/>
+        </w:rPr>
+      </w:pPr>
+    </w:p>
+    <w:p>
+      <w:pPr>
+        <w:spacing w:before="100" w:beforeAutospacing="1" w:after="100" w:afterAutospacing="1" w:line="240" w:lineRule="auto"/>
+        <w:rPr>
+          <w:rFonts w:ascii="Arial" w:eastAsia="Times New Roman" w:hAnsi="Arial" w:cs="Arial"/>
+          <w:sz w:val="24"/>
+          <w:szCs w:val="24"/>
+          <w:lang w:eastAsia="es-GT"/>
+        </w:rPr>
+      </w:pPr>
+    </w:p>
+    <w:p>
+      <w:pPr>
+        <w:spacing w:before="100" w:beforeAutospacing="1" w:after="100" w:afterAutospacing="1" w:line="240" w:lineRule="auto"/>
+        <w:rPr>
+          <w:rFonts w:ascii="Arial" w:eastAsia="Times New Roman" w:hAnsi="Arial" w:cs="Arial"/>
+          <w:sz w:val="24"/>
+          <w:szCs w:val="24"/>
+          <w:lang w:eastAsia="es-GT"/>
+        </w:rPr>
+      </w:pPr>
+    </w:p>
+    <w:p>
+      <w:pPr>
+        <w:spacing w:before="100" w:beforeAutospacing="1" w:after="100" w:afterAutospacing="1" w:line="240" w:lineRule="auto"/>
+        <w:rPr>
+          <w:rFonts w:ascii="Arial" w:eastAsia="Times New Roman" w:hAnsi="Arial" w:cs="Arial"/>
+          <w:sz w:val="24"/>
+          <w:szCs w:val="24"/>
+          <w:lang w:eastAsia="es-GT"/>
+        </w:rPr>
+      </w:pPr>
+    </w:p>
+    <w:p>
+      <w:pPr>
+        <w:spacing w:before="100" w:beforeAutospacing="1" w:after="100" w:afterAutospacing="1" w:line="240" w:lineRule="auto"/>
+        <w:rPr>
+          <w:rFonts w:ascii="Arial" w:eastAsia="Times New Roman" w:hAnsi="Arial" w:cs="Arial"/>
+          <w:sz w:val="24"/>
+          <w:szCs w:val="24"/>
+          <w:lang w:eastAsia="es-GT"/>
+        </w:rPr>
+      </w:pPr>
+    </w:p>
+    <w:p>
+      <w:pPr>
+        <w:spacing w:before="100" w:beforeAutospacing="1" w:after="100" w:afterAutospacing="1" w:line="240" w:lineRule="auto"/>
+        <w:rPr>
+          <w:rFonts w:ascii="Arial" w:eastAsia="Times New Roman" w:hAnsi="Arial" w:cs="Arial"/>
+          <w:sz w:val="24"/>
+          <w:szCs w:val="24"/>
+          <w:lang w:eastAsia="es-GT"/>
+        </w:rPr>
+      </w:pPr>
+    </w:p>
+    <w:p>
+      <w:pPr>
+        <w:spacing w:before="100" w:beforeAutospacing="1" w:after="100" w:afterAutospacing="1" w:line="240" w:lineRule="auto"/>
+        <w:rPr>
+          <w:rFonts w:ascii="Arial" w:eastAsia="Times New Roman" w:hAnsi="Arial" w:cs="Arial"/>
+          <w:sz w:val="24"/>
+          <w:szCs w:val="24"/>
+          <w:lang w:eastAsia="es-GT"/>
+        </w:rPr>
+      </w:pPr>
+    </w:p>
+    <w:p>
+      <w:pPr>
+        <w:spacing w:before="100" w:beforeAutospacing="1" w:after="100" w:afterAutospacing="1" w:line="240" w:lineRule="auto"/>
+        <w:rPr>
+          <w:rFonts w:ascii="Arial" w:eastAsia="Times New Roman" w:hAnsi="Arial" w:cs="Arial"/>
+          <w:sz w:val="24"/>
+          <w:szCs w:val="24"/>
+          <w:lang w:eastAsia="es-GT"/>
+        </w:rPr>
+      </w:pPr>
+    </w:p>
+    <w:p>
+      <w:pPr>
+        <w:spacing w:before="100" w:beforeAutospacing="1" w:after="100" w:afterAutospacing="1" w:line="240" w:lineRule="auto"/>
+        <w:rPr>
+          <w:rFonts w:ascii="Arial" w:eastAsia="Times New Roman" w:hAnsi="Arial" w:cs="Arial"/>
+          <w:sz w:val="24"/>
+          <w:szCs w:val="24"/>
+          <w:lang w:eastAsia="es-GT"/>
+        </w:rPr>
+      </w:pPr>
+    </w:p>
+    <w:p>
+      <w:pPr>
+        <w:spacing w:before="100" w:beforeAutospacing="1" w:after="100" w:afterAutospacing="1" w:line="240" w:lineRule="auto"/>
+        <w:rPr>
+          <w:rFonts w:ascii="Arial" w:eastAsia="Times New Roman" w:hAnsi="Arial" w:cs="Arial"/>
+          <w:sz w:val="24"/>
+          <w:szCs w:val="24"/>
+          <w:lang w:eastAsia="es-GT"/>
+        </w:rPr>
+      </w:pPr>
+    </w:p>
+    <w:p>
+      <w:pPr>
+        <w:spacing w:before="100" w:beforeAutospacing="1" w:after="100" w:afterAutospacing="1" w:line="240" w:lineRule="auto"/>
+        <w:rPr>
+          <w:rFonts w:ascii="Arial" w:eastAsia="Times New Roman" w:hAnsi="Arial" w:cs="Arial"/>
+          <w:sz w:val="24"/>
+          <w:szCs w:val="24"/>
+          <w:lang w:eastAsia="es-GT"/>
+        </w:rPr>
+      </w:pPr>
+    </w:p>
+    <w:p>
+      <w:pPr>
+        <w:spacing w:before="100" w:beforeAutospacing="1" w:after="100" w:afterAutospacing="1" w:line="240" w:lineRule="auto"/>
+        <w:rPr>
+          <w:rFonts w:ascii="Arial" w:eastAsia="Times New Roman" w:hAnsi="Arial" w:cs="Arial"/>
+          <w:sz w:val="24"/>
+          <w:szCs w:val="24"/>
+          <w:lang w:eastAsia="es-GT"/>
+        </w:rPr>
+      </w:pPr>
+    </w:p>
+    <w:p>
+      <w:pPr>
+        <w:spacing w:before="100" w:beforeAutospacing="1" w:after="100" w:afterAutospacing="1" w:line="240" w:lineRule="auto"/>
+        <w:rPr>
+          <w:rFonts w:ascii="Arial" w:eastAsia="Times New Roman" w:hAnsi="Arial" w:cs="Arial"/>
+          <w:sz w:val="24"/>
+          <w:szCs w:val="24"/>
+          <w:lang w:eastAsia="es-GT"/>
+        </w:rPr>
+      </w:pPr>
+    </w:p>
+    <w:p>
+      <w:pPr>
+        <w:spacing w:before="100" w:beforeAutospacing="1" w:after="100" w:afterAutospacing="1" w:line="240" w:lineRule="auto"/>
+        <w:rPr>
+          <w:rFonts w:ascii="Arial" w:eastAsia="Times New Roman" w:hAnsi="Arial" w:cs="Arial"/>
+          <w:sz w:val="24"/>
+          <w:szCs w:val="24"/>
+          <w:lang w:eastAsia="es-GT"/>
+        </w:rPr>
+      </w:pPr>
+    </w:p>
+    <w:p>
+      <w:pPr>
+        <w:spacing w:before="100" w:beforeAutospacing="1" w:after="100" w:afterAutospacing="1" w:line="240" w:lineRule="auto"/>
+        <w:rPr>
+          <w:rFonts w:ascii="Arial" w:eastAsia="Times New Roman" w:hAnsi="Arial" w:cs="Arial"/>
+          <w:sz w:val="24"/>
+          <w:szCs w:val="24"/>
+          <w:lang w:eastAsia="es-GT"/>
+        </w:rPr>
+      </w:pPr>
+    </w:p>
+    <w:p>
+      <w:pPr>
+        <w:spacing w:before="100" w:beforeAutospacing="1" w:after="100" w:afterAutospacing="1" w:line="240" w:lineRule="auto"/>
+        <w:rPr>
+          <w:rFonts w:ascii="Arial" w:eastAsia="Times New Roman" w:hAnsi="Arial" w:cs="Arial"/>
+          <w:sz w:val="24"/>
+          <w:szCs w:val="24"/>
+          <w:lang w:eastAsia="es-GT"/>
+        </w:rPr>
+      </w:pPr>
+    </w:p>
+    <w:p>
+      <w:pPr>
+        <w:spacing w:before="100" w:beforeAutospacing="1" w:after="100" w:afterAutospacing="1" w:line="240" w:lineRule="auto"/>
+        <w:rPr>
+          <w:rFonts w:ascii="Arial" w:eastAsia="Times New Roman" w:hAnsi="Arial" w:cs="Arial"/>
+          <w:sz w:val="24"/>
+          <w:szCs w:val="24"/>
+          <w:lang w:eastAsia="es-GT"/>
+        </w:rPr>
+      </w:pPr>
+    </w:p>
+    <w:p>
+      <w:pPr>
+        <w:spacing w:before="100" w:beforeAutospacing="1" w:after="100" w:afterAutospacing="1" w:line="240" w:lineRule="auto"/>
+        <w:rPr>
+          <w:rFonts w:ascii="Arial" w:eastAsia="Times New Roman" w:hAnsi="Arial" w:cs="Arial"/>
+          <w:sz w:val="24"/>
+          <w:szCs w:val="24"/>
+          <w:lang w:eastAsia="es-GT"/>
+        </w:rPr>
+      </w:pPr>
+    </w:p>
+    <w:p>
+      <w:pPr>
+        <w:spacing w:before="100" w:beforeAutospacing="1" w:after="100" w:afterAutospacing="1" w:line="240" w:lineRule="auto"/>
+        <w:rPr>
+          <w:rFonts w:ascii="Arial" w:eastAsia="Times New Roman" w:hAnsi="Arial" w:cs="Arial"/>
+          <w:sz w:val="24"/>
+          <w:szCs w:val="24"/>
+          <w:lang w:eastAsia="es-GT"/>
+        </w:rPr>
+      </w:pPr>
+    </w:p>
+    <w:p>
+      <w:pPr>
+        <w:spacing w:before="100" w:beforeAutospacing="1" w:after="100" w:afterAutospacing="1" w:line="240" w:lineRule="auto"/>
+        <w:rPr>
+          <w:rFonts w:ascii="Arial" w:eastAsia="Times New Roman" w:hAnsi="Arial" w:cs="Arial"/>
+          <w:sz w:val="24"/>
+          <w:szCs w:val="24"/>
+          <w:lang w:eastAsia="es-GT"/>
+        </w:rPr>
+      </w:pPr>
+    </w:p>
+    <w:p>
+      <w:pPr>
+        <w:spacing w:before="100" w:beforeAutospacing="1" w:after="100" w:afterAutospacing="1" w:line="240" w:lineRule="auto"/>
+        <w:rPr>
+          <w:rFonts w:ascii="Arial" w:eastAsia="Times New Roman" w:hAnsi="Arial" w:cs="Arial"/>
+          <w:sz w:val="24"/>
+          <w:szCs w:val="24"/>
+          <w:lang w:eastAsia="es-GT"/>
+        </w:rPr>
+      </w:pPr>
+    </w:p>
+    <w:p>
+      <w:pPr>
+        <w:spacing w:before="100" w:beforeAutospacing="1" w:after="100" w:afterAutospacing="1" w:line="240" w:lineRule="auto"/>
+        <w:rPr>
+          <w:rFonts w:ascii="Arial" w:eastAsia="Times New Roman" w:hAnsi="Arial" w:cs="Arial"/>
+          <w:sz w:val="24"/>
+          <w:szCs w:val="24"/>
+          <w:lang w:eastAsia="es-GT"/>
+        </w:rPr>
+      </w:pPr>
+    </w:p>
+    <w:p>
+      <w:pPr>
+        <w:spacing w:before="100" w:beforeAutospacing="1" w:after="100" w:afterAutospacing="1" w:line="240" w:lineRule="auto"/>
+        <w:rPr>
+          <w:rFonts w:ascii="Arial" w:eastAsia="Times New Roman" w:hAnsi="Arial" w:cs="Arial"/>
+          <w:sz w:val="24"/>
+          <w:szCs w:val="24"/>
+          <w:lang w:eastAsia="es-GT"/>
+        </w:rPr>
+      </w:pPr>
+    </w:p>
+    <w:p>
+      <w:pPr>
+        <w:spacing w:before="100" w:beforeAutospacing="1" w:after="100" w:afterAutospacing="1" w:line="240" w:lineRule="auto"/>
+        <w:rPr>
+          <w:rFonts w:ascii="Arial" w:eastAsia="Times New Roman" w:hAnsi="Arial" w:cs="Arial"/>
+          <w:sz w:val="24"/>
+          <w:szCs w:val="24"/>
+          <w:lang w:eastAsia="es-GT"/>
+        </w:rPr>
+      </w:pPr>
+    </w:p>
+    <w:p>
+      <w:pPr>
+        <w:spacing w:before="100" w:beforeAutospacing="1" w:after="100" w:afterAutospacing="1" w:line="240" w:lineRule="auto"/>
+        <w:rPr>
+          <w:rFonts w:ascii="Arial" w:eastAsia="Times New Roman" w:hAnsi="Arial" w:cs="Arial"/>
+          <w:sz w:val="24"/>
+          <w:szCs w:val="24"/>
+          <w:lang w:eastAsia="es-GT"/>
+        </w:rPr>
+      </w:pPr>
+    </w:p>
+    <w:p>
+      <w:pPr>
+        <w:spacing w:before="100" w:beforeAutospacing="1" w:after="100" w:afterAutospacing="1" w:line="240" w:lineRule="auto"/>
+        <w:rPr>
+          <w:rFonts w:ascii="Arial" w:eastAsia="Times New Roman" w:hAnsi="Arial" w:cs="Arial"/>
+          <w:sz w:val="24"/>
+          <w:szCs w:val="24"/>
+          <w:lang w:eastAsia="es-GT"/>
+        </w:rPr>
+      </w:pPr>
+    </w:p>
+    <w:p>
+      <w:pPr>
+        <w:spacing w:before="100" w:beforeAutospacing="1" w:after="100" w:afterAutospacing="1" w:line="240" w:lineRule="auto"/>
+        <w:rPr>
+          <w:rFonts w:ascii="Arial" w:eastAsia="Times New Roman" w:hAnsi="Arial" w:cs="Arial"/>
+          <w:sz w:val="24"/>
+          <w:szCs w:val="24"/>
+          <w:lang w:eastAsia="es-GT"/>
+        </w:rPr>
+      </w:pPr>
+    </w:p>
+    <w:p>
+      <w:pPr>
+        <w:spacing w:before="100" w:beforeAutospacing="1" w:after="100" w:afterAutospacing="1" w:line="240" w:lineRule="auto"/>
+        <w:rPr>
+          <w:rFonts w:ascii="Arial" w:eastAsia="Times New Roman" w:hAnsi="Arial" w:cs="Arial"/>
+          <w:sz w:val="24"/>
+          <w:szCs w:val="24"/>
+          <w:lang w:eastAsia="es-GT"/>
+        </w:rPr>
+      </w:pPr>
+    </w:p>
+    <w:p>
+      <w:pPr>
+        <w:spacing w:before="100" w:beforeAutospacing="1" w:after="100" w:afterAutospacing="1" w:line="240" w:lineRule="auto"/>
+        <w:rPr>
+          <w:rFonts w:ascii="Arial" w:eastAsia="Times New Roman" w:hAnsi="Arial" w:cs="Arial"/>
+          <w:sz w:val="24"/>
+          <w:szCs w:val="24"/>
+          <w:lang w:eastAsia="es-GT"/>
+        </w:rPr>
+      </w:pPr>
+    </w:p>
+    <w:p>
+      <w:pPr>
+        <w:spacing w:before="100" w:beforeAutospacing="1" w:after="100" w:afterAutospacing="1" w:line="240" w:lineRule="auto"/>
+        <w:rPr>
+          <w:rFonts w:ascii="Arial" w:eastAsia="Times New Roman" w:hAnsi="Arial" w:cs="Arial"/>
+          <w:sz w:val="24"/>
+          <w:szCs w:val="24"/>
+          <w:lang w:eastAsia="es-GT"/>
+        </w:rPr>
+      </w:pPr>
+    </w:p>
+    <w:p>
+      <w:pPr>
+        <w:spacing w:before="100" w:beforeAutospacing="1" w:after="100" w:afterAutospacing="1" w:line="240" w:lineRule="auto"/>
+        <w:rPr>
+          <w:rFonts w:ascii="Arial" w:eastAsia="Times New Roman" w:hAnsi="Arial" w:cs="Arial"/>
+          <w:sz w:val="24"/>
+          <w:szCs w:val="24"/>
+          <w:lang w:eastAsia="es-GT"/>
+        </w:rPr>
+      </w:pPr>
+    </w:p>
+    <w:p>
+      <w:pPr>
+        <w:spacing w:before="100" w:beforeAutospacing="1" w:after="100" w:afterAutospacing="1" w:line="240" w:lineRule="auto"/>
+        <w:rPr>
+          <w:rFonts w:ascii="Arial" w:eastAsia="Times New Roman" w:hAnsi="Arial" w:cs="Arial"/>
+          <w:sz w:val="24"/>
+          <w:szCs w:val="24"/>
+          <w:lang w:eastAsia="es-GT"/>
+        </w:rPr>
+      </w:pPr>
+    </w:p>
+    <w:p>
+      <w:pPr>
+        <w:spacing w:before="100" w:beforeAutospacing="1" w:after="100" w:afterAutospacing="1" w:line="240" w:lineRule="auto"/>
+        <w:rPr>
+          <w:rFonts w:ascii="Arial" w:eastAsia="Times New Roman" w:hAnsi="Arial" w:cs="Arial"/>
+          <w:sz w:val="24"/>
+          <w:szCs w:val="24"/>
+          <w:lang w:eastAsia="es-GT"/>
+        </w:rPr>
+      </w:pPr>
+    </w:p>
+    <w:p>
+      <w:pPr>
+        <w:spacing w:before="100" w:beforeAutospacing="1" w:after="100" w:afterAutospacing="1" w:line="240" w:lineRule="auto"/>
+        <w:rPr>
+          <w:rFonts w:ascii="Arial" w:eastAsia="Times New Roman" w:hAnsi="Arial" w:cs="Arial"/>
+          <w:sz w:val="24"/>
+          <w:szCs w:val="24"/>
+          <w:lang w:eastAsia="es-GT"/>
+        </w:rPr>
+      </w:pPr>
+    </w:p>
+    <w:p>
+      <w:pPr>
+        <w:spacing w:before="100" w:beforeAutospacing="1" w:after="100" w:afterAutospacing="1" w:line="240" w:lineRule="auto"/>
+        <w:rPr>
+          <w:rFonts w:ascii="Arial" w:eastAsia="Times New Roman" w:hAnsi="Arial" w:cs="Arial"/>
+          <w:sz w:val="24"/>
+          <w:szCs w:val="24"/>
+          <w:lang w:eastAsia="es-GT"/>
+        </w:rPr>
+      </w:pPr>
+    </w:p>
+    <w:p>
+      <w:pPr>
+        <w:spacing w:before="100" w:beforeAutospacing="1" w:after="100" w:afterAutospacing="1" w:line="240" w:lineRule="auto"/>
+        <w:rPr>
+          <w:rFonts w:ascii="Arial" w:eastAsia="Times New Roman" w:hAnsi="Arial" w:cs="Arial"/>
+          <w:sz w:val="24"/>
+          <w:szCs w:val="24"/>
+          <w:lang w:eastAsia="es-GT"/>
+        </w:rPr>
+      </w:pPr>
+    </w:p>
+    <w:p>
+      <w:pPr>
+        <w:spacing w:before="100" w:beforeAutospacing="1" w:after="100" w:afterAutospacing="1" w:line="240" w:lineRule="auto"/>
+        <w:rPr>
+          <w:rFonts w:ascii="Arial" w:eastAsia="Times New Roman" w:hAnsi="Arial" w:cs="Arial"/>
+          <w:sz w:val="24"/>
+          <w:szCs w:val="24"/>
+          <w:lang w:eastAsia="es-GT"/>
+        </w:rPr>
+      </w:pPr>
+    </w:p>
+    <w:p>
+      <w:pPr>
+        <w:spacing w:before="100" w:beforeAutospacing="1" w:after="100" w:afterAutospacing="1" w:line="240" w:lineRule="auto"/>
+        <w:rPr>
+          <w:rFonts w:ascii="Arial" w:eastAsia="Times New Roman" w:hAnsi="Arial" w:cs="Arial"/>
+          <w:sz w:val="24"/>
+          <w:szCs w:val="24"/>
+          <w:lang w:eastAsia="es-GT"/>
+        </w:rPr>
+      </w:pPr>
+    </w:p>
+    <w:p>
+      <w:pPr>
+        <w:spacing w:before="100" w:beforeAutospacing="1" w:after="100" w:afterAutospacing="1" w:line="240" w:lineRule="auto"/>
+        <w:rPr>
+          <w:rFonts w:ascii="Arial" w:eastAsia="Times New Roman" w:hAnsi="Arial" w:cs="Arial"/>
+          <w:sz w:val="24"/>
+          <w:szCs w:val="24"/>
+          <w:lang w:eastAsia="es-GT"/>
+        </w:rPr>
+      </w:pPr>
+    </w:p>
+    <w:p>
+      <w:pPr>
+        <w:spacing w:before="100" w:beforeAutospacing="1" w:after="100" w:afterAutospacing="1" w:line="240" w:lineRule="auto"/>
+        <w:rPr>
+          <w:rFonts w:ascii="Arial" w:eastAsia="Times New Roman" w:hAnsi="Arial" w:cs="Arial"/>
+          <w:sz w:val="24"/>
+          <w:szCs w:val="24"/>
+          <w:lang w:eastAsia="es-GT"/>
+        </w:rPr>
+      </w:pPr>
+    </w:p>
+    <w:p>
+      <w:pPr>
+        <w:spacing w:before="100" w:beforeAutospacing="1" w:after="100" w:afterAutospacing="1" w:line="240" w:lineRule="auto"/>
+        <w:rPr>
+          <w:rFonts w:ascii="Arial" w:eastAsia="Times New Roman" w:hAnsi="Arial" w:cs="Arial"/>
+          <w:sz w:val="24"/>
+          <w:szCs w:val="24"/>
+          <w:lang w:eastAsia="es-GT"/>
+        </w:rPr>
+      </w:pPr>
+    </w:p>
+    <w:p>
+      <w:pPr>
+        <w:spacing w:before="100" w:beforeAutospacing="1" w:after="100" w:afterAutospacing="1" w:line="240" w:lineRule="auto"/>
+        <w:rPr>
+          <w:rFonts w:ascii="Arial" w:eastAsia="Times New Roman" w:hAnsi="Arial" w:cs="Arial"/>
+          <w:sz w:val="24"/>
+          <w:szCs w:val="24"/>
+          <w:lang w:eastAsia="es-GT"/>
+        </w:rPr>
+      </w:pPr>
+    </w:p>
+    <w:p>
+      <w:pPr>
+        <w:spacing w:before="100" w:beforeAutospacing="1" w:after="100" w:afterAutospacing="1" w:line="240" w:lineRule="auto"/>
+        <w:rPr>
+          <w:rFonts w:ascii="Arial" w:eastAsia="Times New Roman" w:hAnsi="Arial" w:cs="Arial"/>
+          <w:sz w:val="24"/>
+          <w:szCs w:val="24"/>
+          <w:lang w:eastAsia="es-GT"/>
+        </w:rPr>
+      </w:pPr>
+    </w:p>
+    <w:p>
+      <w:pPr>
+        <w:spacing w:before="100" w:beforeAutospacing="1" w:after="100" w:afterAutospacing="1" w:line="240" w:lineRule="auto"/>
+        <w:rPr>
+          <w:rFonts w:ascii="Arial" w:eastAsia="Times New Roman" w:hAnsi="Arial" w:cs="Arial"/>
+          <w:sz w:val="24"/>
+          <w:szCs w:val="24"/>
+          <w:lang w:eastAsia="es-GT"/>
+        </w:rPr>
+      </w:pPr>
+    </w:p>
+    <w:p>
+      <w:pPr>
+        <w:spacing w:before="100" w:beforeAutospacing="1" w:after="100" w:afterAutospacing="1" w:line="240" w:lineRule="auto"/>
+        <w:rPr>
+          <w:rFonts w:ascii="Arial" w:eastAsia="Times New Roman" w:hAnsi="Arial" w:cs="Arial"/>
+          <w:sz w:val="24"/>
+          <w:szCs w:val="24"/>
+          <w:lang w:eastAsia="es-GT"/>
+        </w:rPr>
+      </w:pPr>
+    </w:p>
+    <w:p>
+      <w:pPr>
+        <w:spacing w:before="100" w:beforeAutospacing="1" w:after="100" w:afterAutospacing="1" w:line="240" w:lineRule="auto"/>
+        <w:rPr>
+          <w:rFonts w:ascii="Arial" w:eastAsia="Times New Roman" w:hAnsi="Arial" w:cs="Arial"/>
+          <w:sz w:val="24"/>
+          <w:szCs w:val="24"/>
+          <w:lang w:eastAsia="es-GT"/>
+        </w:rPr>
+      </w:pPr>
+    </w:p>
+    <w:p>
+      <w:pPr>
+        <w:spacing w:before="100" w:beforeAutospacing="1" w:after="100" w:afterAutospacing="1" w:line="240" w:lineRule="auto"/>
+        <w:rPr>
+          <w:rFonts w:ascii="Arial" w:eastAsia="Times New Roman" w:hAnsi="Arial" w:cs="Arial"/>
+          <w:sz w:val="24"/>
+          <w:szCs w:val="24"/>
+          <w:lang w:eastAsia="es-GT"/>
+        </w:rPr>
+      </w:pPr>
+    </w:p>
+    <w:p>
+      <w:pPr>
+        <w:spacing w:before="100" w:beforeAutospacing="1" w:after="100" w:afterAutospacing="1" w:line="240" w:lineRule="auto"/>
+        <w:rPr>
+          <w:rFonts w:ascii="Arial" w:eastAsia="Times New Roman" w:hAnsi="Arial" w:cs="Arial"/>
+          <w:sz w:val="24"/>
+          <w:szCs w:val="24"/>
+          <w:lang w:eastAsia="es-GT"/>
+        </w:rPr>
+      </w:pPr>
+    </w:p>
+    <w:p>
+      <w:pPr>
+        <w:spacing w:before="100" w:beforeAutospacing="1" w:after="100" w:afterAutospacing="1" w:line="240" w:lineRule="auto"/>
+        <w:rPr>
+          <w:rFonts w:ascii="Arial" w:eastAsia="Times New Roman" w:hAnsi="Arial" w:cs="Arial"/>
+          <w:sz w:val="24"/>
+          <w:szCs w:val="24"/>
+          <w:lang w:eastAsia="es-GT"/>
+        </w:rPr>
+      </w:pPr>
+    </w:p>
+    <w:p>
+      <w:pPr>
+        <w:spacing w:before="100" w:beforeAutospacing="1" w:after="100" w:afterAutospacing="1" w:line="240" w:lineRule="auto"/>
+        <w:rPr>
+          <w:rFonts w:ascii="Arial" w:eastAsia="Times New Roman" w:hAnsi="Arial" w:cs="Arial"/>
+          <w:sz w:val="24"/>
+          <w:szCs w:val="24"/>
+          <w:lang w:eastAsia="es-GT"/>
+        </w:rPr>
+      </w:pPr>
+    </w:p>
+    <w:p>
+      <w:pPr>
+        <w:spacing w:before="100" w:beforeAutospacing="1" w:after="100" w:afterAutospacing="1" w:line="240" w:lineRule="auto"/>
+        <w:rPr>
+          <w:rFonts w:ascii="Arial" w:eastAsia="Times New Roman" w:hAnsi="Arial" w:cs="Arial"/>
+          <w:sz w:val="24"/>
+          <w:szCs w:val="24"/>
+          <w:lang w:eastAsia="es-GT"/>
+        </w:rPr>
+      </w:pPr>
+    </w:p>
+    <w:p>
+      <w:pPr>
+        <w:spacing w:before="100" w:beforeAutospacing="1" w:after="100" w:afterAutospacing="1" w:line="240" w:lineRule="auto"/>
+        <w:rPr>
+          <w:rFonts w:ascii="Arial" w:eastAsia="Times New Roman" w:hAnsi="Arial" w:cs="Arial"/>
+          <w:sz w:val="24"/>
+          <w:szCs w:val="24"/>
+          <w:lang w:eastAsia="es-GT"/>
+        </w:rPr>
+      </w:pPr>
+    </w:p>
+    <w:p>
+      <w:pPr>
+        <w:spacing w:before="100" w:beforeAutospacing="1" w:after="100" w:afterAutospacing="1" w:line="240" w:lineRule="auto"/>
+        <w:rPr>
+          <w:rFonts w:ascii="Arial" w:eastAsia="Times New Roman" w:hAnsi="Arial" w:cs="Arial"/>
+          <w:sz w:val="24"/>
+          <w:szCs w:val="24"/>
+          <w:lang w:eastAsia="es-GT"/>
+        </w:rPr>
+      </w:pPr>
+    </w:p>
+    <w:p>
+      <w:pPr>
+        <w:spacing w:before="100" w:beforeAutospacing="1" w:after="100" w:afterAutospacing="1" w:line="240" w:lineRule="auto"/>
+        <w:rPr>
+          <w:rFonts w:ascii="Arial" w:eastAsia="Times New Roman" w:hAnsi="Arial" w:cs="Arial"/>
+          <w:sz w:val="24"/>
+          <w:szCs w:val="24"/>
+          <w:lang w:eastAsia="es-GT"/>
+        </w:rPr>
+      </w:pPr>
+    </w:p>
+    <w:p>
+      <w:pPr>
+        <w:spacing w:before="100" w:beforeAutospacing="1" w:after="100" w:afterAutospacing="1" w:line="240" w:lineRule="auto"/>
+        <w:rPr>
+          <w:rFonts w:ascii="Arial" w:eastAsia="Times New Roman" w:hAnsi="Arial" w:cs="Arial"/>
+          <w:sz w:val="24"/>
+          <w:szCs w:val="24"/>
+          <w:lang w:eastAsia="es-GT"/>
+        </w:rPr>
+      </w:pPr>
+    </w:p>
+    <w:p>
+      <w:pPr>
+        <w:spacing w:before="100" w:beforeAutospacing="1" w:after="100" w:afterAutospacing="1" w:line="240" w:lineRule="auto"/>
+        <w:rPr>
+          <w:rFonts w:ascii="Arial" w:eastAsia="Times New Roman" w:hAnsi="Arial" w:cs="Arial"/>
+          <w:sz w:val="24"/>
+          <w:szCs w:val="24"/>
+          <w:lang w:eastAsia="es-GT"/>
+        </w:rPr>
+      </w:pPr>
+    </w:p>
+    <w:p>
+      <w:pPr>
+        <w:spacing w:before="100" w:beforeAutospacing="1" w:after="100" w:afterAutospacing="1" w:line="240" w:lineRule="auto"/>
+        <w:rPr>
+          <w:rFonts w:ascii="Arial" w:eastAsia="Times New Roman" w:hAnsi="Arial" w:cs="Arial"/>
+          <w:sz w:val="24"/>
+          <w:szCs w:val="24"/>
+          <w:lang w:eastAsia="es-GT"/>
+        </w:rPr>
+      </w:pPr>
+    </w:p>
+    <w:p>
+      <w:pPr>
+        <w:spacing w:before="100" w:beforeAutospacing="1" w:after="100" w:afterAutospacing="1" w:line="240" w:lineRule="auto"/>
+        <w:rPr>
+          <w:rFonts w:ascii="Arial" w:eastAsia="Times New Roman" w:hAnsi="Arial" w:cs="Arial"/>
+          <w:sz w:val="24"/>
+          <w:szCs w:val="24"/>
+          <w:lang w:eastAsia="es-GT"/>
+        </w:rPr>
+      </w:pPr>
+    </w:p>
+    <w:p>
+      <w:pPr>
+        <w:spacing w:before="100" w:beforeAutospacing="1" w:after="100" w:afterAutospacing="1" w:line="240" w:lineRule="auto"/>
+        <w:rPr>
+          <w:rFonts w:ascii="Arial" w:eastAsia="Times New Roman" w:hAnsi="Arial" w:cs="Arial"/>
+          <w:sz w:val="24"/>
+          <w:szCs w:val="24"/>
+          <w:lang w:eastAsia="es-GT"/>
+        </w:rPr>
+      </w:pPr>
+    </w:p>
+    <w:p>
+      <w:pPr>
+        <w:spacing w:before="100" w:beforeAutospacing="1" w:after="100" w:afterAutospacing="1" w:line="240" w:lineRule="auto"/>
+        <w:rPr>
+          <w:rFonts w:ascii="Arial" w:eastAsia="Times New Roman" w:hAnsi="Arial" w:cs="Arial"/>
+          <w:sz w:val="24"/>
+          <w:szCs w:val="24"/>
+          <w:lang w:eastAsia="es-GT"/>
+        </w:rPr>
+      </w:pPr>
+    </w:p>
+    <w:p>
+      <w:pPr>
+        <w:spacing w:before="100" w:beforeAutospacing="1" w:after="100" w:afterAutospacing="1" w:line="240" w:lineRule="auto"/>
+        <w:rPr>
+          <w:rFonts w:ascii="Arial" w:eastAsia="Times New Roman" w:hAnsi="Arial" w:cs="Arial"/>
+          <w:sz w:val="24"/>
+          <w:szCs w:val="24"/>
+          <w:lang w:eastAsia="es-GT"/>
+        </w:rPr>
+      </w:pPr>
+    </w:p>
+    <w:p>
+      <w:pPr>
+        <w:spacing w:before="100" w:beforeAutospacing="1" w:after="100" w:afterAutospacing="1" w:line="240" w:lineRule="auto"/>
+        <w:rPr>
+          <w:rFonts w:ascii="Arial" w:eastAsia="Times New Roman" w:hAnsi="Arial" w:cs="Arial"/>
+          <w:sz w:val="24"/>
+          <w:szCs w:val="24"/>
+          <w:lang w:eastAsia="es-GT"/>
+        </w:rPr>
+      </w:pPr>
+    </w:p>
+    <w:p>
+      <w:pPr>
+        <w:spacing w:before="100" w:beforeAutospacing="1" w:after="100" w:afterAutospacing="1" w:line="240" w:lineRule="auto"/>
+        <w:rPr>
+          <w:rFonts w:ascii="Arial" w:eastAsia="Times New Roman" w:hAnsi="Arial" w:cs="Arial"/>
+          <w:sz w:val="24"/>
+          <w:szCs w:val="24"/>
+          <w:lang w:eastAsia="es-GT"/>
+        </w:rPr>
+      </w:pPr>
+    </w:p>
+    <w:p>
+      <w:pPr>
+        <w:spacing w:before="100" w:beforeAutospacing="1" w:after="100" w:afterAutospacing="1" w:line="240" w:lineRule="auto"/>
+        <w:rPr>
+          <w:rFonts w:ascii="Arial" w:eastAsia="Times New Roman" w:hAnsi="Arial" w:cs="Arial"/>
+          <w:sz w:val="24"/>
+          <w:szCs w:val="24"/>
+          <w:lang w:eastAsia="es-GT"/>
+        </w:rPr>
+      </w:pPr>
+    </w:p>
+    <w:p>
+      <w:pPr>
+        <w:spacing w:before="100" w:beforeAutospacing="1" w:after="100" w:afterAutospacing="1" w:line="240" w:lineRule="auto"/>
+        <w:rPr>
+          <w:rFonts w:ascii="Arial" w:eastAsia="Times New Roman" w:hAnsi="Arial" w:cs="Arial"/>
+          <w:sz w:val="24"/>
+          <w:szCs w:val="24"/>
+          <w:lang w:eastAsia="es-GT"/>
+        </w:rPr>
+      </w:pPr>
+    </w:p>
+    <w:p>
+      <w:pPr>
+        <w:spacing w:before="100" w:beforeAutospacing="1" w:after="100" w:afterAutospacing="1" w:line="240" w:lineRule="auto"/>
+        <w:rPr>
+          <w:rFonts w:ascii="Arial" w:eastAsia="Times New Roman" w:hAnsi="Arial" w:cs="Arial"/>
+          <w:sz w:val="24"/>
+          <w:szCs w:val="24"/>
+          <w:lang w:eastAsia="es-GT"/>
+        </w:rPr>
+      </w:pPr>
+    </w:p>
+    <w:p>
+      <w:pPr>
+        <w:spacing w:before="100" w:beforeAutospacing="1" w:after="100" w:afterAutospacing="1" w:line="240" w:lineRule="auto"/>
+        <w:rPr>
+          <w:rFonts w:ascii="Arial" w:eastAsia="Times New Roman" w:hAnsi="Arial" w:cs="Arial"/>
+          <w:sz w:val="24"/>
+          <w:szCs w:val="24"/>
+          <w:lang w:eastAsia="es-GT"/>
+        </w:rPr>
+      </w:pPr>
+    </w:p>
+    <w:p>
+      <w:pPr>
+        <w:spacing w:before="100" w:beforeAutospacing="1" w:after="100" w:afterAutospacing="1" w:line="240" w:lineRule="auto"/>
+        <w:rPr>
+          <w:rFonts w:ascii="Arial" w:eastAsia="Times New Roman" w:hAnsi="Arial" w:cs="Arial"/>
+          <w:sz w:val="24"/>
+          <w:szCs w:val="24"/>
+          <w:lang w:eastAsia="es-GT"/>
+        </w:rPr>
+      </w:pPr>
+    </w:p>
+    <w:p>
+      <w:pPr>
+        <w:spacing w:before="100" w:beforeAutospacing="1" w:after="100" w:afterAutospacing="1" w:line="240" w:lineRule="auto"/>
+        <w:rPr>
+          <w:rFonts w:ascii="Arial" w:eastAsia="Times New Roman" w:hAnsi="Arial" w:cs="Arial"/>
+          <w:sz w:val="24"/>
+          <w:szCs w:val="24"/>
+          <w:lang w:eastAsia="es-GT"/>
+        </w:rPr>
+      </w:pPr>
+    </w:p>
+    <w:p>
+      <w:pPr>
+        <w:spacing w:before="100" w:beforeAutospacing="1" w:after="100" w:afterAutospacing="1" w:line="240" w:lineRule="auto"/>
+        <w:rPr>
+          <w:rFonts w:ascii="Arial" w:eastAsia="Times New Roman" w:hAnsi="Arial" w:cs="Arial"/>
+          <w:sz w:val="24"/>
+          <w:szCs w:val="24"/>
+          <w:lang w:eastAsia="es-GT"/>
+        </w:rPr>
+      </w:pPr>
+    </w:p>
+    <w:p>
+      <w:pPr>
+        <w:spacing w:before="100" w:beforeAutospacing="1" w:after="100" w:afterAutospacing="1" w:line="240" w:lineRule="auto"/>
+        <w:rPr>
+          <w:rFonts w:ascii="Arial" w:eastAsia="Times New Roman" w:hAnsi="Arial" w:cs="Arial"/>
+          <w:sz w:val="24"/>
+          <w:szCs w:val="24"/>
+          <w:lang w:eastAsia="es-GT"/>
+        </w:rPr>
+      </w:pPr>
+    </w:p>
+    <w:p>
+      <w:pPr>
+        <w:spacing w:before="100" w:beforeAutospacing="1" w:after="100" w:afterAutospacing="1" w:line="240" w:lineRule="auto"/>
+        <w:rPr>
+          <w:rFonts w:ascii="Arial" w:eastAsia="Times New Roman" w:hAnsi="Arial" w:cs="Arial"/>
+          <w:sz w:val="24"/>
+          <w:szCs w:val="24"/>
+          <w:lang w:eastAsia="es-GT"/>
+        </w:rPr>
+      </w:pPr>
+    </w:p>
+    <w:p>
+      <w:pPr>
+        <w:spacing w:before="100" w:beforeAutospacing="1" w:after="100" w:afterAutospacing="1" w:line="240" w:lineRule="auto"/>
+        <w:rPr>
+          <w:rFonts w:ascii="Arial" w:eastAsia="Times New Roman" w:hAnsi="Arial" w:cs="Arial"/>
+          <w:sz w:val="24"/>
+          <w:szCs w:val="24"/>
+          <w:lang w:eastAsia="es-GT"/>
+        </w:rPr>
+      </w:pPr>
+    </w:p>
+    <w:p>
+      <w:pPr>
+        <w:spacing w:before="100" w:beforeAutospacing="1" w:after="100" w:afterAutospacing="1" w:line="240" w:lineRule="auto"/>
+        <w:rPr>
+          <w:rFonts w:ascii="Arial" w:eastAsia="Times New Roman" w:hAnsi="Arial" w:cs="Arial"/>
+          <w:sz w:val="24"/>
+          <w:szCs w:val="24"/>
+          <w:lang w:eastAsia="es-GT"/>
+        </w:rPr>
+      </w:pPr>
+    </w:p>
+    <w:p>
+      <w:pPr>
+        <w:spacing w:before="100" w:beforeAutospacing="1" w:after="100" w:afterAutospacing="1" w:line="240" w:lineRule="auto"/>
+        <w:rPr>
+          <w:rFonts w:ascii="Arial" w:eastAsia="Times New Roman" w:hAnsi="Arial" w:cs="Arial"/>
+          <w:sz w:val="24"/>
+          <w:szCs w:val="24"/>
+          <w:lang w:eastAsia="es-GT"/>
+        </w:rPr>
+      </w:pPr>
+    </w:p>
+    <w:p>
+      <w:pPr>
+        <w:spacing w:before="100" w:beforeAutospacing="1" w:after="100" w:afterAutospacing="1" w:line="240" w:lineRule="auto"/>
+        <w:rPr>
+          <w:rFonts w:ascii="Arial" w:eastAsia="Times New Roman" w:hAnsi="Arial" w:cs="Arial"/>
+          <w:sz w:val="24"/>
+          <w:szCs w:val="24"/>
+          <w:lang w:eastAsia="es-GT"/>
+        </w:rPr>
+      </w:pPr>
+    </w:p>
+    <w:p>
+      <w:pPr>
+        <w:spacing w:before="100" w:beforeAutospacing="1" w:after="100" w:afterAutospacing="1" w:line="240" w:lineRule="auto"/>
+        <w:rPr>
+          <w:rFonts w:ascii="Arial" w:eastAsia="Times New Roman" w:hAnsi="Arial" w:cs="Arial"/>
+          <w:sz w:val="24"/>
+          <w:szCs w:val="24"/>
+          <w:lang w:eastAsia="es-GT"/>
+        </w:rPr>
+      </w:pPr>
+    </w:p>
+    <w:p>
+      <w:pPr>
+        <w:spacing w:before="100" w:beforeAutospacing="1" w:after="100" w:afterAutospacing="1" w:line="240" w:lineRule="auto"/>
+        <w:rPr>
+          <w:rFonts w:ascii="Arial" w:eastAsia="Times New Roman" w:hAnsi="Arial" w:cs="Arial"/>
+          <w:sz w:val="24"/>
+          <w:szCs w:val="24"/>
+          <w:lang w:eastAsia="es-GT"/>
+        </w:rPr>
+      </w:pPr>
+    </w:p>
+    <w:p>
+      <w:pPr>
+        <w:spacing w:before="100" w:beforeAutospacing="1" w:after="100" w:afterAutospacing="1" w:line="240" w:lineRule="auto"/>
+        <w:rPr>
+          <w:rFonts w:ascii="Arial" w:eastAsia="Times New Roman" w:hAnsi="Arial" w:cs="Arial"/>
+          <w:sz w:val="24"/>
+          <w:szCs w:val="24"/>
+          <w:lang w:eastAsia="es-GT"/>
+        </w:rPr>
+      </w:pPr>
+    </w:p>
+    <w:p>
+      <w:pPr>
+        <w:spacing w:before="100" w:beforeAutospacing="1" w:after="100" w:afterAutospacing="1" w:line="240" w:lineRule="auto"/>
+        <w:rPr>
+          <w:rFonts w:ascii="Arial" w:eastAsia="Times New Roman" w:hAnsi="Arial" w:cs="Arial"/>
+          <w:sz w:val="24"/>
+          <w:szCs w:val="24"/>
+          <w:lang w:eastAsia="es-GT"/>
+        </w:rPr>
+      </w:pPr>
+    </w:p>
+    <w:p>
+      <w:pPr>
+        <w:spacing w:before="100" w:beforeAutospacing="1" w:after="100" w:afterAutospacing="1" w:line="240" w:lineRule="auto"/>
+        <w:rPr>
+          <w:rFonts w:ascii="Arial" w:eastAsia="Times New Roman" w:hAnsi="Arial" w:cs="Arial"/>
+          <w:sz w:val="24"/>
+          <w:szCs w:val="24"/>
+          <w:lang w:eastAsia="es-GT"/>
+        </w:rPr>
+      </w:pPr>
+    </w:p>
+    <w:p>
+      <w:pPr>
+        <w:spacing w:before="100" w:beforeAutospacing="1" w:after="100" w:afterAutospacing="1" w:line="240" w:lineRule="auto"/>
+        <w:rPr>
+          <w:rFonts w:ascii="Arial" w:eastAsia="Times New Roman" w:hAnsi="Arial" w:cs="Arial"/>
+          <w:sz w:val="24"/>
+          <w:szCs w:val="24"/>
+          <w:lang w:eastAsia="es-GT"/>
+        </w:rPr>
+      </w:pPr>
+    </w:p>
+    <w:p>
+      <w:pPr>
+        <w:spacing w:before="100" w:beforeAutospacing="1" w:after="100" w:afterAutospacing="1" w:line="240" w:lineRule="auto"/>
+        <w:rPr>
+          <w:rFonts w:ascii="Arial" w:eastAsia="Times New Roman" w:hAnsi="Arial" w:cs="Arial"/>
+          <w:sz w:val="24"/>
+          <w:szCs w:val="24"/>
+          <w:lang w:eastAsia="es-GT"/>
+        </w:rPr>
+      </w:pPr>
+    </w:p>
+    <w:p>
+      <w:pPr>
+        <w:spacing w:before="100" w:beforeAutospacing="1" w:after="100" w:afterAutospacing="1" w:line="240" w:lineRule="auto"/>
+        <w:rPr>
+          <w:rFonts w:ascii="Arial" w:eastAsia="Times New Roman" w:hAnsi="Arial" w:cs="Arial"/>
+          <w:sz w:val="24"/>
+          <w:szCs w:val="24"/>
+          <w:lang w:eastAsia="es-GT"/>
+        </w:rPr>
+      </w:pPr>
+    </w:p>
+    <w:p>
+      <w:pPr>
+        <w:spacing w:before="100" w:beforeAutospacing="1" w:after="100" w:afterAutospacing="1" w:line="240" w:lineRule="auto"/>
+        <w:rPr>
+          <w:rFonts w:ascii="Arial" w:eastAsia="Times New Roman" w:hAnsi="Arial" w:cs="Arial"/>
+          <w:sz w:val="24"/>
+          <w:szCs w:val="24"/>
+          <w:lang w:eastAsia="es-GT"/>
+        </w:rPr>
+      </w:pPr>
+    </w:p>
+    <w:p>
+      <w:pPr>
+        <w:spacing w:before="100" w:beforeAutospacing="1" w:after="100" w:afterAutospacing="1" w:line="240" w:lineRule="auto"/>
+        <w:rPr>
+          <w:rFonts w:ascii="Arial" w:eastAsia="Times New Roman" w:hAnsi="Arial" w:cs="Arial"/>
+          <w:sz w:val="24"/>
+          <w:szCs w:val="24"/>
+          <w:lang w:eastAsia="es-GT"/>
+        </w:rPr>
+      </w:pPr>
+    </w:p>
+    <w:p>
+      <w:pPr>
+        <w:spacing w:before="100" w:beforeAutospacing="1" w:after="100" w:afterAutospacing="1" w:line="240" w:lineRule="auto"/>
+        <w:rPr>
+          <w:rFonts w:ascii="Arial" w:eastAsia="Times New Roman" w:hAnsi="Arial" w:cs="Arial"/>
+          <w:sz w:val="24"/>
+          <w:szCs w:val="24"/>
+          <w:lang w:eastAsia="es-GT"/>
+        </w:rPr>
+      </w:pPr>
+    </w:p>
+    <w:p>
+      <w:pPr>
+        <w:spacing w:before="100" w:beforeAutospacing="1" w:after="100" w:afterAutospacing="1" w:line="240" w:lineRule="auto"/>
+        <w:rPr>
+          <w:rFonts w:ascii="Arial" w:eastAsia="Times New Roman" w:hAnsi="Arial" w:cs="Arial"/>
+          <w:sz w:val="24"/>
+          <w:szCs w:val="24"/>
+          <w:lang w:eastAsia="es-GT"/>
+        </w:rPr>
+      </w:pPr>
+    </w:p>
+    <w:p>
+      <w:pPr>
+        <w:spacing w:before="100" w:beforeAutospacing="1" w:after="100" w:afterAutospacing="1" w:line="240" w:lineRule="auto"/>
+        <w:rPr>
+          <w:rFonts w:ascii="Arial" w:eastAsia="Times New Roman" w:hAnsi="Arial" w:cs="Arial"/>
+          <w:sz w:val="24"/>
+          <w:szCs w:val="24"/>
+          <w:lang w:eastAsia="es-GT"/>
+        </w:rPr>
+      </w:pPr>
+    </w:p>
+    <w:p>
+      <w:pPr>
+        <w:spacing w:before="100" w:beforeAutospacing="1" w:after="100" w:afterAutospacing="1" w:line="240" w:lineRule="auto"/>
+        <w:rPr>
+          <w:rFonts w:ascii="Arial" w:eastAsia="Times New Roman" w:hAnsi="Arial" w:cs="Arial"/>
+          <w:sz w:val="24"/>
+          <w:szCs w:val="24"/>
+          <w:lang w:eastAsia="es-GT"/>
+        </w:rPr>
+      </w:pPr>
+    </w:p>
+    <w:p>
+      <w:pPr>
+        <w:spacing w:before="100" w:beforeAutospacing="1" w:after="100" w:afterAutospacing="1" w:line="240" w:lineRule="auto"/>
+        <w:rPr>
+          <w:rFonts w:ascii="Arial" w:eastAsia="Times New Roman" w:hAnsi="Arial" w:cs="Arial"/>
+          <w:sz w:val="24"/>
+          <w:szCs w:val="24"/>
+          <w:lang w:eastAsia="es-GT"/>
+        </w:rPr>
+      </w:pPr>
+    </w:p>
+    <w:p>
+      <w:pPr>
+        <w:spacing w:before="100" w:beforeAutospacing="1" w:after="100" w:afterAutospacing="1" w:line="240" w:lineRule="auto"/>
+        <w:rPr>
+          <w:rFonts w:ascii="Arial" w:eastAsia="Times New Roman" w:hAnsi="Arial" w:cs="Arial"/>
+          <w:sz w:val="24"/>
+          <w:szCs w:val="24"/>
+          <w:lang w:eastAsia="es-GT"/>
+        </w:rPr>
+      </w:pPr>
+    </w:p>
+    <w:p>
+      <w:pPr>
+        <w:spacing w:before="100" w:beforeAutospacing="1" w:after="100" w:afterAutospacing="1" w:line="240" w:lineRule="auto"/>
+        <w:rPr>
+          <w:rFonts w:ascii="Arial" w:eastAsia="Times New Roman" w:hAnsi="Arial" w:cs="Arial"/>
+          <w:sz w:val="24"/>
+          <w:szCs w:val="24"/>
+          <w:lang w:eastAsia="es-GT"/>
+        </w:rPr>
+      </w:pPr>
+    </w:p>
+    <w:p>
+      <w:pPr>
+        <w:spacing w:before="100" w:beforeAutospacing="1" w:after="100" w:afterAutospacing="1" w:line="240" w:lineRule="auto"/>
+        <w:rPr>
+          <w:rFonts w:ascii="Arial" w:eastAsia="Times New Roman" w:hAnsi="Arial" w:cs="Arial"/>
+          <w:sz w:val="24"/>
+          <w:szCs w:val="24"/>
+          <w:lang w:eastAsia="es-GT"/>
+        </w:rPr>
+      </w:pPr>
+    </w:p>
+    <w:p>
+      <w:pPr>
+        <w:spacing w:before="100" w:beforeAutospacing="1" w:after="100" w:afterAutospacing="1" w:line="240" w:lineRule="auto"/>
+        <w:rPr>
+          <w:rFonts w:ascii="Arial" w:eastAsia="Times New Roman" w:hAnsi="Arial" w:cs="Arial"/>
+          <w:sz w:val="24"/>
+          <w:szCs w:val="24"/>
+          <w:lang w:eastAsia="es-GT"/>
+        </w:rPr>
+      </w:pPr>
+    </w:p>
+    <w:p>
+      <w:pPr>
+        <w:spacing w:before="100" w:beforeAutospacing="1" w:after="100" w:afterAutospacing="1" w:line="240" w:lineRule="auto"/>
+        <w:rPr>
+          <w:rFonts w:ascii="Arial" w:eastAsia="Times New Roman" w:hAnsi="Arial" w:cs="Arial"/>
+          <w:sz w:val="24"/>
+          <w:szCs w:val="24"/>
+          <w:lang w:eastAsia="es-GT"/>
+        </w:rPr>
+      </w:pPr>
+    </w:p>
+    <w:p>
+      <w:pPr>
+        <w:spacing w:before="100" w:beforeAutospacing="1" w:after="100" w:afterAutospacing="1" w:line="240" w:lineRule="auto"/>
+        <w:rPr>
+          <w:rFonts w:ascii="Arial" w:eastAsia="Times New Roman" w:hAnsi="Arial" w:cs="Arial"/>
+          <w:sz w:val="24"/>
+          <w:szCs w:val="24"/>
+          <w:lang w:eastAsia="es-GT"/>
+        </w:rPr>
+      </w:pPr>
+    </w:p>
+    <w:p>
+      <w:pPr>
+        <w:spacing w:before="100" w:beforeAutospacing="1" w:after="100" w:afterAutospacing="1" w:line="240" w:lineRule="auto"/>
+        <w:rPr>
+          <w:rFonts w:ascii="Arial" w:eastAsia="Times New Roman" w:hAnsi="Arial" w:cs="Arial"/>
+          <w:sz w:val="24"/>
+          <w:szCs w:val="24"/>
+          <w:lang w:eastAsia="es-GT"/>
+        </w:rPr>
+      </w:pPr>
+    </w:p>
+    <w:p>
+      <w:pPr>
+        <w:spacing w:before="100" w:beforeAutospacing="1" w:after="100" w:afterAutospacing="1" w:line="240" w:lineRule="auto"/>
+        <w:rPr>
+          <w:rFonts w:ascii="Arial" w:eastAsia="Times New Roman" w:hAnsi="Arial" w:cs="Arial"/>
+          <w:sz w:val="24"/>
+          <w:szCs w:val="24"/>
+          <w:lang w:eastAsia="es-GT"/>
+        </w:rPr>
+      </w:pPr>
+    </w:p>
+    <w:p>
+      <w:pPr>
+        <w:spacing w:before="100" w:beforeAutospacing="1" w:after="100" w:afterAutospacing="1" w:line="240" w:lineRule="auto"/>
+        <w:rPr>
+          <w:rFonts w:ascii="Arial" w:eastAsia="Times New Roman" w:hAnsi="Arial" w:cs="Arial"/>
+          <w:sz w:val="24"/>
+          <w:szCs w:val="24"/>
+          <w:lang w:eastAsia="es-GT"/>
+        </w:rPr>
+      </w:pPr>
+    </w:p>
+    <w:p>
+      <w:pPr>
+        <w:rPr>
+          <w:rFonts w:ascii="Arial" w:eastAsiaTheme="minorHAnsi" w:hAnsi="Arial" w:cs="Arial"/>
+          <w:bCs/>
+          <w:u w:val="single"/>
+        </w:rPr>
+      </w:pPr>
     </w:p>
     <w:sectPr>
       <w:pgSz w:w="12240" w:h="15840"/>
@@ -1180,22 +4036,66 @@
 </w:document>
 </file>
 
+<file path=word/endnotes.xml><?xml version="1.0" encoding="utf-8"?>
+<w:endnotes xmlns:wpc="http://schemas.microsoft.com/office/word/2010/wordprocessingCanvas" xmlns:cx="http://schemas.microsoft.com/office/drawing/2014/chartex" xmlns:cx1="http://schemas.microsoft.com/office/drawing/2015/9/8/chartex" xmlns:cx2="http://schemas.microsoft.com/office/drawing/2015/10/21/chartex" xmlns:cx3="http://schemas.microsoft.com/office/drawing/2016/5/9/chartex" xmlns:cx4="http://schemas.microsoft.com/office/drawing/2016/5/10/chartex" xmlns:cx5="http://schemas.microsoft.com/office/drawing/2016/5/11/chartex" xmlns:cx6="http://schemas.microsoft.com/office/drawing/2016/5/12/chartex" xmlns:cx7="http://schemas.microsoft.com/office/drawing/2016/5/13/chartex" xmlns:cx8="http://schemas.microsoft.com/office/drawing/2016/5/14/chartex" xmlns:mc="http://schemas.openxmlformats.org/markup-compatibility/2006" xmlns:aink="http://schemas.microsoft.com/office/drawing/2016/ink" xmlns:am3d="http://schemas.microsoft.com/office/drawing/2017/model3d" xmlns:o="urn:schemas-microsoft-com:office:office" xmlns:oel="http://schemas.microsoft.com/office/2019/extlst" xmlns:r="http://schemas.openxmlformats.org/officeDocument/2006/relationships" xmlns:m="http://schemas.openxmlformats.org/officeDocument/2006/math" xmlns:v="urn:schemas-microsoft-com:vml" xmlns:wp14="http://schemas.microsoft.com/office/word/2010/wordprocessingDrawing" xmlns:wp="http://schemas.openxmlformats.org/drawingml/2006/wordprocessingDrawing" xmlns:w10="urn:schemas-microsoft-com:office:word" xmlns:w="http://schemas.openxmlformats.org/wordprocessingml/2006/main" xmlns:w14="http://schemas.microsoft.com/office/word/2010/wordml" xmlns:w15="http://schemas.microsoft.com/office/word/2012/wordml" xmlns:w16cex="http://schemas.microsoft.com/office/word/2018/wordml/cex" xmlns:w16cid="http://schemas.microsoft.com/office/word/2016/wordml/cid" xmlns:w16="http://schemas.microsoft.com/office/word/2018/wordml" xmlns:w16du="http://schemas.microsoft.com/office/word/2023/wordml/word16du" xmlns:w16sdtdh="http://schemas.microsoft.com/office/word/2020/wordml/sdtdatahash" xmlns:w16sdtfl="http://schemas.microsoft.com/office/word/2024/wordml/sdtformatlock" xmlns:w16se="http://schemas.microsoft.com/office/word/2015/wordml/symex" xmlns:wpg="http://schemas.microsoft.com/office/word/2010/wordprocessingGroup" xmlns:wpi="http://schemas.microsoft.com/office/word/2010/wordprocessingInk" xmlns:wne="http://schemas.microsoft.com/office/word/2006/wordml" xmlns:wps="http://schemas.microsoft.com/office/word/2010/wordprocessingShape" mc:Ignorable="w14 w15 w16se w16cid w16 w16cex w16sdtdh w16sdtfl w16du wp14">
+  <w:endnote w:type="separator" w:id="-1">
+    <w:p>
+      <w:pPr>
+        <w:spacing w:line="240" w:lineRule="auto"/>
+      </w:pPr>
+      <w:r>
+        <w:separator/>
+      </w:r>
+    </w:p>
+  </w:endnote>
+  <w:endnote w:type="continuationSeparator" w:id="0">
+    <w:p>
+      <w:pPr>
+        <w:spacing w:line="240" w:lineRule="auto"/>
+      </w:pPr>
+      <w:r>
+        <w:continuationSeparator/>
+      </w:r>
+    </w:p>
+  </w:endnote>
+</w:endnotes>
+</file>
+
+<file path=word/footnotes.xml><?xml version="1.0" encoding="utf-8"?>
+<w:footnotes xmlns:wpc="http://schemas.microsoft.com/office/word/2010/wordprocessingCanvas" xmlns:cx="http://schemas.microsoft.com/office/drawing/2014/chartex" xmlns:cx1="http://schemas.microsoft.com/office/drawing/2015/9/8/chartex" xmlns:cx2="http://schemas.microsoft.com/office/drawing/2015/10/21/chartex" xmlns:cx3="http://schemas.microsoft.com/office/drawing/2016/5/9/chartex" xmlns:cx4="http://schemas.microsoft.com/office/drawing/2016/5/10/chartex" xmlns:cx5="http://schemas.microsoft.com/office/drawing/2016/5/11/chartex" xmlns:cx6="http://schemas.microsoft.com/office/drawing/2016/5/12/chartex" xmlns:cx7="http://schemas.microsoft.com/office/drawing/2016/5/13/chartex" xmlns:cx8="http://schemas.microsoft.com/office/drawing/2016/5/14/chartex" xmlns:mc="http://schemas.openxmlformats.org/markup-compatibility/2006" xmlns:aink="http://schemas.microsoft.com/office/drawing/2016/ink" xmlns:am3d="http://schemas.microsoft.com/office/drawing/2017/model3d" xmlns:o="urn:schemas-microsoft-com:office:office" xmlns:oel="http://schemas.microsoft.com/office/2019/extlst" xmlns:r="http://schemas.openxmlformats.org/officeDocument/2006/relationships" xmlns:m="http://schemas.openxmlformats.org/officeDocument/2006/math" xmlns:v="urn:schemas-microsoft-com:vml" xmlns:wp14="http://schemas.microsoft.com/office/word/2010/wordprocessingDrawing" xmlns:wp="http://schemas.openxmlformats.org/drawingml/2006/wordprocessingDrawing" xmlns:w10="urn:schemas-microsoft-com:office:word" xmlns:w="http://schemas.openxmlformats.org/wordprocessingml/2006/main" xmlns:w14="http://schemas.microsoft.com/office/word/2010/wordml" xmlns:w15="http://schemas.microsoft.com/office/word/2012/wordml" xmlns:w16cex="http://schemas.microsoft.com/office/word/2018/wordml/cex" xmlns:w16cid="http://schemas.microsoft.com/office/word/2016/wordml/cid" xmlns:w16="http://schemas.microsoft.com/office/word/2018/wordml" xmlns:w16du="http://schemas.microsoft.com/office/word/2023/wordml/word16du" xmlns:w16sdtdh="http://schemas.microsoft.com/office/word/2020/wordml/sdtdatahash" xmlns:w16sdtfl="http://schemas.microsoft.com/office/word/2024/wordml/sdtformatlock" xmlns:w16se="http://schemas.microsoft.com/office/word/2015/wordml/symex" xmlns:wpg="http://schemas.microsoft.com/office/word/2010/wordprocessingGroup" xmlns:wpi="http://schemas.microsoft.com/office/word/2010/wordprocessingInk" xmlns:wne="http://schemas.microsoft.com/office/word/2006/wordml" xmlns:wps="http://schemas.microsoft.com/office/word/2010/wordprocessingShape" mc:Ignorable="w14 w15 w16se w16cid w16 w16cex w16sdtdh w16sdtfl w16du wp14">
+  <w:footnote w:type="separator" w:id="-1">
+    <w:p>
+      <w:pPr>
+        <w:spacing w:after="0"/>
+      </w:pPr>
+      <w:r>
+        <w:separator/>
+      </w:r>
+    </w:p>
+  </w:footnote>
+  <w:footnote w:type="continuationSeparator" w:id="0">
+    <w:p>
+      <w:pPr>
+        <w:spacing w:after="0"/>
+      </w:pPr>
+      <w:r>
+        <w:continuationSeparator/>
+      </w:r>
+    </w:p>
+  </w:footnote>
+</w:footnotes>
+</file>
+
 <file path=word/styles.xml><?xml version="1.0" encoding="utf-8"?>
 <w:styles xmlns:mc="http://schemas.openxmlformats.org/markup-compatibility/2006" xmlns:r="http://schemas.openxmlformats.org/officeDocument/2006/relationships" xmlns:w="http://schemas.openxmlformats.org/wordprocessingml/2006/main" xmlns:w14="http://schemas.microsoft.com/office/word/2010/wordml" xmlns:w15="http://schemas.microsoft.com/office/word/2012/wordml" xmlns:w16cex="http://schemas.microsoft.com/office/word/2018/wordml/cex" xmlns:w16cid="http://schemas.microsoft.com/office/word/2016/wordml/cid" xmlns:w16="http://schemas.microsoft.com/office/word/2018/wordml" xmlns:w16du="http://schemas.microsoft.com/office/word/2023/wordml/word16du" xmlns:w16sdtdh="http://schemas.microsoft.com/office/word/2020/wordml/sdtdatahash" xmlns:w16sdtfl="http://schemas.microsoft.com/office/word/2024/wordml/sdtformatlock" xmlns:w16se="http://schemas.microsoft.com/office/word/2015/wordml/symex" mc:Ignorable="w14 w15 w16se w16cid w16 w16cex w16sdtdh w16sdtfl w16du">
   <w:docDefaults>
     <w:rPrDefault>
       <w:rPr>
         <w:rFonts w:asciiTheme="minorHAnsi" w:eastAsiaTheme="minorHAnsi" w:hAnsiTheme="minorHAnsi" w:cstheme="minorBidi"/>
-        <w:sz w:val="22"/>
-        <w:szCs w:val="22"/>
-        <w:lang w:val="es-GT" w:eastAsia="en-US" w:bidi="ar-SA"/>
+        <w:lang w:val="es-MX" w:eastAsia="es-MX" w:bidi="ar-SA"/>
       </w:rPr>
     </w:rPrDefault>
-    <w:pPrDefault>
-      <w:pPr>
-        <w:spacing w:after="160" w:line="259" w:lineRule="auto"/>
-      </w:pPr>
-    </w:pPrDefault>
+    <w:pPrDefault/>
   </w:docDefaults>
   <w:latentStyles w:defLockedState="0" w:defUIPriority="99" w:defSemiHidden="0" w:defUnhideWhenUsed="0" w:defQFormat="0" w:count="376">
     <w:lsdException w:name="Normal" w:uiPriority="0" w:qFormat="1"/>
@@ -1228,7 +4128,7 @@
     <w:lsdException w:name="toc 9" w:semiHidden="1" w:uiPriority="39" w:unhideWhenUsed="1"/>
     <w:lsdException w:name="Normal Indent" w:semiHidden="1" w:unhideWhenUsed="1"/>
     <w:lsdException w:name="footnote text" w:semiHidden="1" w:unhideWhenUsed="1"/>
-    <w:lsdException w:name="annotation text" w:semiHidden="1" w:unhideWhenUsed="1"/>
+    <w:lsdException w:name="annotation text" w:semiHidden="1" w:unhideWhenUsed="1" w:qFormat="1"/>
     <w:lsdException w:name="header" w:semiHidden="1" w:unhideWhenUsed="1"/>
     <w:lsdException w:name="footer" w:semiHidden="1" w:unhideWhenUsed="1"/>
     <w:lsdException w:name="index heading" w:semiHidden="1" w:unhideWhenUsed="1"/>
@@ -1292,7 +4192,7 @@
     <w:lsdException w:name="E-mail Signature" w:semiHidden="1" w:unhideWhenUsed="1"/>
     <w:lsdException w:name="HTML Top of Form" w:semiHidden="1" w:unhideWhenUsed="1"/>
     <w:lsdException w:name="HTML Bottom of Form" w:semiHidden="1" w:unhideWhenUsed="1"/>
-    <w:lsdException w:name="Normal (Web)" w:semiHidden="1" w:unhideWhenUsed="1"/>
+    <w:lsdException w:name="Normal (Web)" w:semiHidden="1" w:unhideWhenUsed="1" w:qFormat="1"/>
     <w:lsdException w:name="HTML Acronym" w:semiHidden="1" w:unhideWhenUsed="1"/>
     <w:lsdException w:name="HTML Address" w:semiHidden="1" w:unhideWhenUsed="1"/>
     <w:lsdException w:name="HTML Cite" w:semiHidden="1" w:unhideWhenUsed="1"/>
@@ -1303,8 +4203,8 @@
     <w:lsdException w:name="HTML Sample" w:semiHidden="1" w:unhideWhenUsed="1"/>
     <w:lsdException w:name="HTML Typewriter" w:semiHidden="1" w:unhideWhenUsed="1"/>
     <w:lsdException w:name="HTML Variable" w:semiHidden="1" w:unhideWhenUsed="1"/>
-    <w:lsdException w:name="Normal Table" w:semiHidden="1" w:unhideWhenUsed="1"/>
-    <w:lsdException w:name="annotation subject" w:semiHidden="1" w:unhideWhenUsed="1"/>
+    <w:lsdException w:name="Normal Table" w:semiHidden="1" w:unhideWhenUsed="1" w:qFormat="1"/>
+    <w:lsdException w:name="annotation subject" w:semiHidden="1" w:unhideWhenUsed="1" w:qFormat="1"/>
     <w:lsdException w:name="No List" w:semiHidden="1" w:unhideWhenUsed="1"/>
     <w:lsdException w:name="Outline List 1" w:semiHidden="1" w:unhideWhenUsed="1"/>
     <w:lsdException w:name="Outline List 2" w:semiHidden="1" w:unhideWhenUsed="1"/>
@@ -1351,113 +4251,113 @@
     <w:lsdException w:name="Table Web 1" w:semiHidden="1" w:unhideWhenUsed="1"/>
     <w:lsdException w:name="Table Web 2" w:semiHidden="1" w:unhideWhenUsed="1"/>
     <w:lsdException w:name="Table Web 3" w:semiHidden="1" w:unhideWhenUsed="1"/>
-    <w:lsdException w:name="Balloon Text" w:semiHidden="1" w:unhideWhenUsed="1"/>
-    <w:lsdException w:name="Table Grid" w:uiPriority="39"/>
+    <w:lsdException w:name="Balloon Text" w:semiHidden="1" w:unhideWhenUsed="1" w:qFormat="1"/>
+    <w:lsdException w:name="Table Grid" w:uiPriority="39" w:qFormat="1"/>
     <w:lsdException w:name="Table Theme" w:semiHidden="1" w:unhideWhenUsed="1"/>
-    <w:lsdException w:name="Placeholder Text" w:semiHidden="1"/>
+    <w:lsdException w:name="Placeholder Text" w:semiHidden="1" w:unhideWhenUsed="1"/>
     <w:lsdException w:name="No Spacing" w:uiPriority="1" w:qFormat="1"/>
-    <w:lsdException w:name="Light Shading" w:uiPriority="60"/>
-    <w:lsdException w:name="Light List" w:uiPriority="61"/>
-    <w:lsdException w:name="Light Grid" w:uiPriority="62"/>
-    <w:lsdException w:name="Medium Shading 1" w:uiPriority="63"/>
-    <w:lsdException w:name="Medium Shading 2" w:uiPriority="64"/>
-    <w:lsdException w:name="Medium List 1" w:uiPriority="65"/>
-    <w:lsdException w:name="Medium List 2" w:uiPriority="66"/>
-    <w:lsdException w:name="Medium Grid 1" w:uiPriority="67"/>
-    <w:lsdException w:name="Medium Grid 2" w:uiPriority="68"/>
-    <w:lsdException w:name="Medium Grid 3" w:uiPriority="69"/>
-    <w:lsdException w:name="Dark List" w:uiPriority="70"/>
-    <w:lsdException w:name="Colorful Shading" w:uiPriority="71"/>
-    <w:lsdException w:name="Colorful List" w:uiPriority="72"/>
-    <w:lsdException w:name="Colorful Grid" w:uiPriority="73"/>
-    <w:lsdException w:name="Light Shading Accent 1" w:uiPriority="60"/>
-    <w:lsdException w:name="Light List Accent 1" w:uiPriority="61"/>
-    <w:lsdException w:name="Light Grid Accent 1" w:uiPriority="62"/>
-    <w:lsdException w:name="Medium Shading 1 Accent 1" w:uiPriority="63"/>
-    <w:lsdException w:name="Medium Shading 2 Accent 1" w:uiPriority="64"/>
-    <w:lsdException w:name="Medium List 1 Accent 1" w:uiPriority="65"/>
-    <w:lsdException w:name="Revision" w:semiHidden="1"/>
-    <w:lsdException w:name="List Paragraph" w:uiPriority="34" w:qFormat="1"/>
-    <w:lsdException w:name="Quote" w:uiPriority="29" w:qFormat="1"/>
-    <w:lsdException w:name="Intense Quote" w:uiPriority="30" w:qFormat="1"/>
-    <w:lsdException w:name="Medium List 2 Accent 1" w:uiPriority="66"/>
-    <w:lsdException w:name="Medium Grid 1 Accent 1" w:uiPriority="67"/>
-    <w:lsdException w:name="Medium Grid 2 Accent 1" w:uiPriority="68"/>
-    <w:lsdException w:name="Medium Grid 3 Accent 1" w:uiPriority="69"/>
-    <w:lsdException w:name="Dark List Accent 1" w:uiPriority="70"/>
-    <w:lsdException w:name="Colorful Shading Accent 1" w:uiPriority="71"/>
-    <w:lsdException w:name="Colorful List Accent 1" w:uiPriority="72"/>
-    <w:lsdException w:name="Colorful Grid Accent 1" w:uiPriority="73"/>
-    <w:lsdException w:name="Light Shading Accent 2" w:uiPriority="60"/>
-    <w:lsdException w:name="Light List Accent 2" w:uiPriority="61"/>
-    <w:lsdException w:name="Light Grid Accent 2" w:uiPriority="62"/>
-    <w:lsdException w:name="Medium Shading 1 Accent 2" w:uiPriority="63"/>
-    <w:lsdException w:name="Medium Shading 2 Accent 2" w:uiPriority="64"/>
-    <w:lsdException w:name="Medium List 1 Accent 2" w:uiPriority="65"/>
-    <w:lsdException w:name="Medium List 2 Accent 2" w:uiPriority="66"/>
-    <w:lsdException w:name="Medium Grid 1 Accent 2" w:uiPriority="67"/>
-    <w:lsdException w:name="Medium Grid 2 Accent 2" w:uiPriority="68"/>
-    <w:lsdException w:name="Medium Grid 3 Accent 2" w:uiPriority="69"/>
-    <w:lsdException w:name="Dark List Accent 2" w:uiPriority="70"/>
-    <w:lsdException w:name="Colorful Shading Accent 2" w:uiPriority="71"/>
-    <w:lsdException w:name="Colorful List Accent 2" w:uiPriority="72"/>
-    <w:lsdException w:name="Colorful Grid Accent 2" w:uiPriority="73"/>
-    <w:lsdException w:name="Light Shading Accent 3" w:uiPriority="60"/>
-    <w:lsdException w:name="Light List Accent 3" w:uiPriority="61"/>
-    <w:lsdException w:name="Light Grid Accent 3" w:uiPriority="62"/>
-    <w:lsdException w:name="Medium Shading 1 Accent 3" w:uiPriority="63"/>
-    <w:lsdException w:name="Medium Shading 2 Accent 3" w:uiPriority="64"/>
-    <w:lsdException w:name="Medium List 1 Accent 3" w:uiPriority="65"/>
-    <w:lsdException w:name="Medium List 2 Accent 3" w:uiPriority="66"/>
-    <w:lsdException w:name="Medium Grid 1 Accent 3" w:uiPriority="67"/>
-    <w:lsdException w:name="Medium Grid 2 Accent 3" w:uiPriority="68"/>
-    <w:lsdException w:name="Medium Grid 3 Accent 3" w:uiPriority="69"/>
-    <w:lsdException w:name="Dark List Accent 3" w:uiPriority="70"/>
-    <w:lsdException w:name="Colorful Shading Accent 3" w:uiPriority="71"/>
-    <w:lsdException w:name="Colorful List Accent 3" w:uiPriority="72"/>
-    <w:lsdException w:name="Colorful Grid Accent 3" w:uiPriority="73"/>
-    <w:lsdException w:name="Light Shading Accent 4" w:uiPriority="60"/>
-    <w:lsdException w:name="Light List Accent 4" w:uiPriority="61"/>
-    <w:lsdException w:name="Light Grid Accent 4" w:uiPriority="62"/>
-    <w:lsdException w:name="Medium Shading 1 Accent 4" w:uiPriority="63"/>
-    <w:lsdException w:name="Medium Shading 2 Accent 4" w:uiPriority="64"/>
-    <w:lsdException w:name="Medium List 1 Accent 4" w:uiPriority="65"/>
-    <w:lsdException w:name="Medium List 2 Accent 4" w:uiPriority="66"/>
-    <w:lsdException w:name="Medium Grid 1 Accent 4" w:uiPriority="67"/>
-    <w:lsdException w:name="Medium Grid 2 Accent 4" w:uiPriority="68"/>
-    <w:lsdException w:name="Medium Grid 3 Accent 4" w:uiPriority="69"/>
-    <w:lsdException w:name="Dark List Accent 4" w:uiPriority="70"/>
-    <w:lsdException w:name="Colorful Shading Accent 4" w:uiPriority="71"/>
-    <w:lsdException w:name="Colorful List Accent 4" w:uiPriority="72"/>
-    <w:lsdException w:name="Colorful Grid Accent 4" w:uiPriority="73"/>
-    <w:lsdException w:name="Light Shading Accent 5" w:uiPriority="60"/>
-    <w:lsdException w:name="Light List Accent 5" w:uiPriority="61"/>
-    <w:lsdException w:name="Light Grid Accent 5" w:uiPriority="62"/>
-    <w:lsdException w:name="Medium Shading 1 Accent 5" w:uiPriority="63"/>
-    <w:lsdException w:name="Medium Shading 2 Accent 5" w:uiPriority="64"/>
-    <w:lsdException w:name="Medium List 1 Accent 5" w:uiPriority="65"/>
-    <w:lsdException w:name="Medium List 2 Accent 5" w:uiPriority="66"/>
-    <w:lsdException w:name="Medium Grid 1 Accent 5" w:uiPriority="67"/>
-    <w:lsdException w:name="Medium Grid 2 Accent 5" w:uiPriority="68"/>
-    <w:lsdException w:name="Medium Grid 3 Accent 5" w:uiPriority="69"/>
-    <w:lsdException w:name="Dark List Accent 5" w:uiPriority="70"/>
-    <w:lsdException w:name="Colorful Shading Accent 5" w:uiPriority="71"/>
-    <w:lsdException w:name="Colorful List Accent 5" w:uiPriority="72"/>
-    <w:lsdException w:name="Colorful Grid Accent 5" w:uiPriority="73"/>
-    <w:lsdException w:name="Light Shading Accent 6" w:uiPriority="60"/>
-    <w:lsdException w:name="Light List Accent 6" w:uiPriority="61"/>
-    <w:lsdException w:name="Light Grid Accent 6" w:uiPriority="62"/>
-    <w:lsdException w:name="Medium Shading 1 Accent 6" w:uiPriority="63"/>
-    <w:lsdException w:name="Medium Shading 2 Accent 6" w:uiPriority="64"/>
-    <w:lsdException w:name="Medium List 1 Accent 6" w:uiPriority="65"/>
-    <w:lsdException w:name="Medium List 2 Accent 6" w:uiPriority="66"/>
-    <w:lsdException w:name="Medium Grid 1 Accent 6" w:uiPriority="67"/>
-    <w:lsdException w:name="Medium Grid 2 Accent 6" w:uiPriority="68"/>
-    <w:lsdException w:name="Medium Grid 3 Accent 6" w:uiPriority="69"/>
-    <w:lsdException w:name="Dark List Accent 6" w:uiPriority="70"/>
-    <w:lsdException w:name="Colorful Shading Accent 6" w:uiPriority="71"/>
-    <w:lsdException w:name="Colorful List Accent 6" w:uiPriority="72"/>
-    <w:lsdException w:name="Colorful Grid Accent 6" w:uiPriority="73"/>
+    <w:lsdException w:name="Light Shading"/>
+    <w:lsdException w:name="Light List"/>
+    <w:lsdException w:name="Light Grid"/>
+    <w:lsdException w:name="Medium Shading 1"/>
+    <w:lsdException w:name="Medium Shading 2"/>
+    <w:lsdException w:name="Medium List 1"/>
+    <w:lsdException w:name="Medium List 2"/>
+    <w:lsdException w:name="Medium Grid 1"/>
+    <w:lsdException w:name="Medium Grid 2"/>
+    <w:lsdException w:name="Medium Grid 3"/>
+    <w:lsdException w:name="Dark List"/>
+    <w:lsdException w:name="Colorful Shading"/>
+    <w:lsdException w:name="Colorful List"/>
+    <w:lsdException w:name="Colorful Grid"/>
+    <w:lsdException w:name="Light Shading Accent 1"/>
+    <w:lsdException w:name="Light List Accent 1"/>
+    <w:lsdException w:name="Light Grid Accent 1"/>
+    <w:lsdException w:name="Medium Shading 1 Accent 1"/>
+    <w:lsdException w:name="Medium Shading 2 Accent 1"/>
+    <w:lsdException w:name="Medium List 1 Accent 1"/>
+    <w:lsdException w:name="Revision" w:semiHidden="1" w:unhideWhenUsed="1"/>
+    <w:lsdException w:name="List Paragraph" w:semiHidden="1" w:unhideWhenUsed="1"/>
+    <w:lsdException w:name="Quote" w:semiHidden="1" w:unhideWhenUsed="1"/>
+    <w:lsdException w:name="Intense Quote" w:semiHidden="1" w:unhideWhenUsed="1"/>
+    <w:lsdException w:name="Medium List 2 Accent 1"/>
+    <w:lsdException w:name="Medium Grid 1 Accent 1"/>
+    <w:lsdException w:name="Medium Grid 2 Accent 1"/>
+    <w:lsdException w:name="Medium Grid 3 Accent 1"/>
+    <w:lsdException w:name="Dark List Accent 1"/>
+    <w:lsdException w:name="Colorful Shading Accent 1"/>
+    <w:lsdException w:name="Colorful List Accent 1"/>
+    <w:lsdException w:name="Colorful Grid Accent 1"/>
+    <w:lsdException w:name="Light Shading Accent 2"/>
+    <w:lsdException w:name="Light List Accent 2"/>
+    <w:lsdException w:name="Light Grid Accent 2"/>
+    <w:lsdException w:name="Medium Shading 1 Accent 2"/>
+    <w:lsdException w:name="Medium Shading 2 Accent 2"/>
+    <w:lsdException w:name="Medium List 1 Accent 2"/>
+    <w:lsdException w:name="Medium List 2 Accent 2"/>
+    <w:lsdException w:name="Medium Grid 1 Accent 2"/>
+    <w:lsdException w:name="Medium Grid 2 Accent 2"/>
+    <w:lsdException w:name="Medium Grid 3 Accent 2"/>
+    <w:lsdException w:name="Dark List Accent 2"/>
+    <w:lsdException w:name="Colorful Shading Accent 2"/>
+    <w:lsdException w:name="Colorful List Accent 2"/>
+    <w:lsdException w:name="Colorful Grid Accent 2"/>
+    <w:lsdException w:name="Light Shading Accent 3"/>
+    <w:lsdException w:name="Light List Accent 3"/>
+    <w:lsdException w:name="Light Grid Accent 3"/>
+    <w:lsdException w:name="Medium Shading 1 Accent 3"/>
+    <w:lsdException w:name="Medium Shading 2 Accent 3"/>
+    <w:lsdException w:name="Medium List 1 Accent 3"/>
+    <w:lsdException w:name="Medium List 2 Accent 3"/>
+    <w:lsdException w:name="Medium Grid 1 Accent 3"/>
+    <w:lsdException w:name="Medium Grid 2 Accent 3"/>
+    <w:lsdException w:name="Medium Grid 3 Accent 3"/>
+    <w:lsdException w:name="Dark List Accent 3"/>
+    <w:lsdException w:name="Colorful Shading Accent 3"/>
+    <w:lsdException w:name="Colorful List Accent 3"/>
+    <w:lsdException w:name="Colorful Grid Accent 3"/>
+    <w:lsdException w:name="Light Shading Accent 4"/>
+    <w:lsdException w:name="Light List Accent 4"/>
+    <w:lsdException w:name="Light Grid Accent 4"/>
+    <w:lsdException w:name="Medium Shading 1 Accent 4"/>
+    <w:lsdException w:name="Medium Shading 2 Accent 4"/>
+    <w:lsdException w:name="Medium List 1 Accent 4"/>
+    <w:lsdException w:name="Medium List 2 Accent 4"/>
+    <w:lsdException w:name="Medium Grid 1 Accent 4"/>
+    <w:lsdException w:name="Medium Grid 2 Accent 4"/>
+    <w:lsdException w:name="Medium Grid 3 Accent 4"/>
+    <w:lsdException w:name="Dark List Accent 4"/>
+    <w:lsdException w:name="Colorful Shading Accent 4"/>
+    <w:lsdException w:name="Colorful List Accent 4"/>
+    <w:lsdException w:name="Colorful Grid Accent 4"/>
+    <w:lsdException w:name="Light Shading Accent 5"/>
+    <w:lsdException w:name="Light List Accent 5"/>
+    <w:lsdException w:name="Light Grid Accent 5"/>
+    <w:lsdException w:name="Medium Shading 1 Accent 5"/>
+    <w:lsdException w:name="Medium Shading 2 Accent 5"/>
+    <w:lsdException w:name="Medium List 1 Accent 5"/>
+    <w:lsdException w:name="Medium List 2 Accent 5"/>
+    <w:lsdException w:name="Medium Grid 1 Accent 5"/>
+    <w:lsdException w:name="Medium Grid 2 Accent 5"/>
+    <w:lsdException w:name="Medium Grid 3 Accent 5"/>
+    <w:lsdException w:name="Dark List Accent 5"/>
+    <w:lsdException w:name="Colorful Shading Accent 5"/>
+    <w:lsdException w:name="Colorful List Accent 5"/>
+    <w:lsdException w:name="Colorful Grid Accent 5"/>
+    <w:lsdException w:name="Light Shading Accent 6"/>
+    <w:lsdException w:name="Light List Accent 6"/>
+    <w:lsdException w:name="Light Grid Accent 6"/>
+    <w:lsdException w:name="Medium Shading 1 Accent 6"/>
+    <w:lsdException w:name="Medium Shading 2 Accent 6"/>
+    <w:lsdException w:name="Medium List 1 Accent 6"/>
+    <w:lsdException w:name="Medium List 2 Accent 6"/>
+    <w:lsdException w:name="Medium Grid 1 Accent 6"/>
+    <w:lsdException w:name="Medium Grid 2 Accent 6"/>
+    <w:lsdException w:name="Medium Grid 3 Accent 6"/>
+    <w:lsdException w:name="Dark List Accent 6"/>
+    <w:lsdException w:name="Colorful Shading Accent 6"/>
+    <w:lsdException w:name="Colorful List Accent 6"/>
+    <w:lsdException w:name="Colorful Grid Accent 6"/>
     <w:lsdException w:name="Subtle Emphasis" w:uiPriority="19" w:qFormat="1"/>
     <w:lsdException w:name="Intense Emphasis" w:uiPriority="21" w:qFormat="1"/>
     <w:lsdException w:name="Subtle Reference" w:uiPriority="31" w:qFormat="1"/>
@@ -1578,9 +4478,14 @@
   <w:style w:type="paragraph" w:default="1" w:styleId="Normal">
     <w:name w:val="Normal"/>
     <w:qFormat/>
-    <w:rsid w:val="00D75182"/>
+    <w:pPr>
+      <w:spacing w:after="160" w:line="259" w:lineRule="auto"/>
+    </w:pPr>
     <w:rPr>
       <w:rFonts w:eastAsia="MS Mincho"/>
+      <w:sz w:val="22"/>
+      <w:szCs w:val="22"/>
+      <w:lang w:val="es-GT" w:eastAsia="en-US"/>
     </w:rPr>
   </w:style>
   <w:style w:type="character" w:default="1" w:styleId="Fuentedeprrafopredeter">
@@ -1610,54 +4515,25 @@
     <w:semiHidden/>
     <w:unhideWhenUsed/>
   </w:style>
-  <w:style w:type="paragraph" w:styleId="Sinespaciado">
-    <w:name w:val="No Spacing"/>
-    <w:uiPriority w:val="1"/>
-    <w:qFormat/>
-    <w:rsid w:val="007B480D"/>
-    <w:pPr>
-      <w:spacing w:after="0" w:line="240" w:lineRule="auto"/>
-    </w:pPr>
-  </w:style>
   <w:style w:type="character" w:styleId="Refdecomentario">
     <w:name w:val="annotation reference"/>
     <w:basedOn w:val="Fuentedeprrafopredeter"/>
     <w:uiPriority w:val="99"/>
     <w:semiHidden/>
     <w:unhideWhenUsed/>
-    <w:rsid w:val="00EB52AC"/>
     <w:rPr>
       <w:sz w:val="16"/>
       <w:szCs w:val="16"/>
     </w:rPr>
   </w:style>
-  <w:style w:type="paragraph" w:styleId="Textocomentario">
-    <w:name w:val="annotation text"/>
-    <w:basedOn w:val="Normal"/>
-    <w:link w:val="TextocomentarioCar"/>
-    <w:uiPriority w:val="99"/>
-    <w:semiHidden/>
-    <w:unhideWhenUsed/>
-    <w:rsid w:val="00EB52AC"/>
-    <w:pPr>
-      <w:spacing w:line="240" w:lineRule="auto"/>
-    </w:pPr>
+  <w:style w:type="character" w:styleId="Textoennegrita">
+    <w:name w:val="Strong"/>
+    <w:basedOn w:val="Fuentedeprrafopredeter"/>
+    <w:uiPriority w:val="22"/>
+    <w:qFormat/>
     <w:rPr>
-      <w:sz w:val="20"/>
-      <w:szCs w:val="20"/>
-    </w:rPr>
-  </w:style>
-  <w:style w:type="character" w:customStyle="1" w:styleId="TextocomentarioCar">
-    <w:name w:val="Texto comentario Car"/>
-    <w:basedOn w:val="Fuentedeprrafopredeter"/>
-    <w:link w:val="Textocomentario"/>
-    <w:uiPriority w:val="99"/>
-    <w:semiHidden/>
-    <w:rsid w:val="00EB52AC"/>
-    <w:rPr>
-      <w:rFonts w:eastAsia="MS Mincho"/>
-      <w:sz w:val="20"/>
-      <w:szCs w:val="20"/>
+      <w:b/>
+      <w:bCs/>
     </w:rPr>
   </w:style>
   <w:style w:type="paragraph" w:styleId="Asuntodelcomentario">
@@ -1668,23 +4544,24 @@
     <w:uiPriority w:val="99"/>
     <w:semiHidden/>
     <w:unhideWhenUsed/>
-    <w:rsid w:val="00EB52AC"/>
+    <w:qFormat/>
     <w:rPr>
       <w:b/>
       <w:bCs/>
     </w:rPr>
   </w:style>
-  <w:style w:type="character" w:customStyle="1" w:styleId="AsuntodelcomentarioCar">
-    <w:name w:val="Asunto del comentario Car"/>
-    <w:basedOn w:val="TextocomentarioCar"/>
-    <w:link w:val="Asuntodelcomentario"/>
+  <w:style w:type="paragraph" w:styleId="Textocomentario">
+    <w:name w:val="annotation text"/>
+    <w:basedOn w:val="Normal"/>
+    <w:link w:val="TextocomentarioCar"/>
     <w:uiPriority w:val="99"/>
     <w:semiHidden/>
-    <w:rsid w:val="00EB52AC"/>
+    <w:unhideWhenUsed/>
+    <w:qFormat/>
+    <w:pPr>
+      <w:spacing w:line="240" w:lineRule="auto"/>
+    </w:pPr>
     <w:rPr>
-      <w:rFonts w:eastAsia="MS Mincho"/>
-      <w:b/>
-      <w:bCs/>
       <w:sz w:val="20"/>
       <w:szCs w:val="20"/>
     </w:rPr>
@@ -1696,7 +4573,7 @@
     <w:uiPriority w:val="99"/>
     <w:semiHidden/>
     <w:unhideWhenUsed/>
-    <w:rsid w:val="0005271C"/>
+    <w:qFormat/>
     <w:pPr>
       <w:spacing w:after="0" w:line="240" w:lineRule="auto"/>
     </w:pPr>
@@ -1706,32 +4583,28 @@
       <w:szCs w:val="18"/>
     </w:rPr>
   </w:style>
-  <w:style w:type="character" w:customStyle="1" w:styleId="TextodegloboCar">
-    <w:name w:val="Texto de globo Car"/>
-    <w:basedOn w:val="Fuentedeprrafopredeter"/>
-    <w:link w:val="Textodeglobo"/>
+  <w:style w:type="paragraph" w:styleId="NormalWeb">
+    <w:name w:val="Normal (Web)"/>
+    <w:basedOn w:val="Normal"/>
     <w:uiPriority w:val="99"/>
     <w:semiHidden/>
-    <w:rsid w:val="0005271C"/>
+    <w:unhideWhenUsed/>
+    <w:qFormat/>
+    <w:pPr>
+      <w:spacing w:before="100" w:beforeAutospacing="1" w:after="100" w:afterAutospacing="1" w:line="240" w:lineRule="auto"/>
+    </w:pPr>
     <w:rPr>
-      <w:rFonts w:ascii="Segoe UI" w:eastAsia="MS Mincho" w:hAnsi="Segoe UI" w:cs="Segoe UI"/>
-      <w:sz w:val="18"/>
-      <w:szCs w:val="18"/>
+      <w:rFonts w:ascii="Times New Roman" w:eastAsia="Times New Roman" w:hAnsi="Times New Roman" w:cs="Times New Roman"/>
+      <w:sz w:val="24"/>
+      <w:szCs w:val="24"/>
+      <w:lang w:eastAsia="es-GT"/>
     </w:rPr>
-  </w:style>
-  <w:style w:type="character" w:customStyle="1" w:styleId="oypena">
-    <w:name w:val="oypena"/>
-    <w:basedOn w:val="Fuentedeprrafopredeter"/>
-    <w:rsid w:val="003F5629"/>
   </w:style>
   <w:style w:type="table" w:styleId="Tablaconcuadrcula">
     <w:name w:val="Table Grid"/>
     <w:basedOn w:val="Tablanormal"/>
     <w:uiPriority w:val="39"/>
-    <w:rsid w:val="00C251FB"/>
-    <w:pPr>
-      <w:spacing w:after="0" w:line="240" w:lineRule="auto"/>
-    </w:pPr>
+    <w:qFormat/>
     <w:tblPr>
       <w:tblBorders>
         <w:top w:val="single" w:sz="4" w:space="0" w:color="auto"/>
@@ -1743,10 +4616,66 @@
       </w:tblBorders>
     </w:tblPr>
   </w:style>
+  <w:style w:type="paragraph" w:styleId="Sinespaciado">
+    <w:name w:val="No Spacing"/>
+    <w:uiPriority w:val="1"/>
+    <w:qFormat/>
+    <w:rPr>
+      <w:sz w:val="22"/>
+      <w:szCs w:val="22"/>
+      <w:lang w:val="es-GT" w:eastAsia="en-US"/>
+    </w:rPr>
+  </w:style>
+  <w:style w:type="character" w:customStyle="1" w:styleId="TextocomentarioCar">
+    <w:name w:val="Texto comentario Car"/>
+    <w:basedOn w:val="Fuentedeprrafopredeter"/>
+    <w:link w:val="Textocomentario"/>
+    <w:uiPriority w:val="99"/>
+    <w:semiHidden/>
+    <w:qFormat/>
+    <w:rPr>
+      <w:rFonts w:eastAsia="MS Mincho"/>
+      <w:sz w:val="20"/>
+      <w:szCs w:val="20"/>
+    </w:rPr>
+  </w:style>
+  <w:style w:type="character" w:customStyle="1" w:styleId="AsuntodelcomentarioCar">
+    <w:name w:val="Asunto del comentario Car"/>
+    <w:basedOn w:val="TextocomentarioCar"/>
+    <w:link w:val="Asuntodelcomentario"/>
+    <w:uiPriority w:val="99"/>
+    <w:semiHidden/>
+    <w:qFormat/>
+    <w:rPr>
+      <w:rFonts w:eastAsia="MS Mincho"/>
+      <w:b/>
+      <w:bCs/>
+      <w:sz w:val="20"/>
+      <w:szCs w:val="20"/>
+    </w:rPr>
+  </w:style>
+  <w:style w:type="character" w:customStyle="1" w:styleId="TextodegloboCar">
+    <w:name w:val="Texto de globo Car"/>
+    <w:basedOn w:val="Fuentedeprrafopredeter"/>
+    <w:link w:val="Textodeglobo"/>
+    <w:uiPriority w:val="99"/>
+    <w:semiHidden/>
+    <w:qFormat/>
+    <w:rPr>
+      <w:rFonts w:ascii="Segoe UI" w:eastAsia="MS Mincho" w:hAnsi="Segoe UI" w:cs="Segoe UI"/>
+      <w:sz w:val="18"/>
+      <w:szCs w:val="18"/>
+    </w:rPr>
+  </w:style>
+  <w:style w:type="character" w:customStyle="1" w:styleId="oypena">
+    <w:name w:val="oypena"/>
+    <w:basedOn w:val="Fuentedeprrafopredeter"/>
+    <w:qFormat/>
+  </w:style>
   <w:style w:type="paragraph" w:customStyle="1" w:styleId="paragraph">
     <w:name w:val="paragraph"/>
     <w:basedOn w:val="Normal"/>
-    <w:rsid w:val="006E1988"/>
+    <w:qFormat/>
     <w:pPr>
       <w:spacing w:before="100" w:beforeAutospacing="1" w:after="100" w:afterAutospacing="1" w:line="240" w:lineRule="auto"/>
     </w:pPr>
@@ -1760,49 +4689,21 @@
   <w:style w:type="character" w:customStyle="1" w:styleId="normaltextrun">
     <w:name w:val="normaltextrun"/>
     <w:basedOn w:val="Fuentedeprrafopredeter"/>
-    <w:rsid w:val="006E1988"/>
+    <w:qFormat/>
   </w:style>
   <w:style w:type="character" w:customStyle="1" w:styleId="eop">
     <w:name w:val="eop"/>
     <w:basedOn w:val="Fuentedeprrafopredeter"/>
-    <w:rsid w:val="006E1988"/>
-  </w:style>
-  <w:style w:type="paragraph" w:styleId="NormalWeb">
-    <w:name w:val="Normal (Web)"/>
-    <w:basedOn w:val="Normal"/>
-    <w:uiPriority w:val="99"/>
-    <w:semiHidden/>
-    <w:unhideWhenUsed/>
-    <w:rsid w:val="00B952EC"/>
-    <w:pPr>
-      <w:spacing w:before="100" w:beforeAutospacing="1" w:after="100" w:afterAutospacing="1" w:line="240" w:lineRule="auto"/>
-    </w:pPr>
-    <w:rPr>
-      <w:rFonts w:ascii="Times New Roman" w:eastAsia="Times New Roman" w:hAnsi="Times New Roman" w:cs="Times New Roman"/>
-      <w:sz w:val="24"/>
-      <w:szCs w:val="24"/>
-      <w:lang w:eastAsia="es-GT"/>
-    </w:rPr>
+    <w:qFormat/>
   </w:style>
   <w:style w:type="character" w:customStyle="1" w:styleId="cf01">
     <w:name w:val="cf01"/>
     <w:basedOn w:val="Fuentedeprrafopredeter"/>
-    <w:rsid w:val="00B952EC"/>
+    <w:qFormat/>
     <w:rPr>
       <w:rFonts w:ascii="Consolas" w:hAnsi="Consolas" w:hint="default"/>
       <w:sz w:val="22"/>
       <w:szCs w:val="22"/>
-    </w:rPr>
-  </w:style>
-  <w:style w:type="character" w:styleId="Textoennegrita">
-    <w:name w:val="Strong"/>
-    <w:basedOn w:val="Fuentedeprrafopredeter"/>
-    <w:uiPriority w:val="22"/>
-    <w:qFormat/>
-    <w:rsid w:val="0078207B"/>
-    <w:rPr>
-      <w:b/>
-      <w:bCs/>
     </w:rPr>
   </w:style>
 </w:styles>
@@ -1851,7 +4752,7 @@
     </a:clrScheme>
     <a:fontScheme name="Office">
       <a:majorFont>
-        <a:latin typeface="Calibri Light" panose="020F0302020204030204"/>
+        <a:latin typeface="Calibri Light"/>
         <a:ea typeface=""/>
         <a:cs typeface=""/>
         <a:font script="Jpan" typeface="游ゴシック Light"/>
@@ -1884,26 +4785,9 @@
         <a:font script="Viet" typeface="Times New Roman"/>
         <a:font script="Uigh" typeface="Microsoft Uighur"/>
         <a:font script="Geor" typeface="Sylfaen"/>
-        <a:font script="Armn" typeface="Arial"/>
-        <a:font script="Bugi" typeface="Leelawadee UI"/>
-        <a:font script="Bopo" typeface="Microsoft JhengHei"/>
-        <a:font script="Java" typeface="Javanese Text"/>
-        <a:font script="Lisu" typeface="Segoe UI"/>
-        <a:font script="Mymr" typeface="Myanmar Text"/>
-        <a:font script="Nkoo" typeface="Ebrima"/>
-        <a:font script="Olck" typeface="Nirmala UI"/>
-        <a:font script="Osma" typeface="Ebrima"/>
-        <a:font script="Phag" typeface="Phagspa"/>
-        <a:font script="Syrn" typeface="Estrangelo Edessa"/>
-        <a:font script="Syrj" typeface="Estrangelo Edessa"/>
-        <a:font script="Syre" typeface="Estrangelo Edessa"/>
-        <a:font script="Sora" typeface="Nirmala UI"/>
-        <a:font script="Tale" typeface="Microsoft Tai Le"/>
-        <a:font script="Talu" typeface="Microsoft New Tai Lue"/>
-        <a:font script="Tfng" typeface="Ebrima"/>
       </a:majorFont>
       <a:minorFont>
-        <a:latin typeface="Calibri" panose="020F0502020204030204"/>
+        <a:latin typeface="Calibri"/>
         <a:ea typeface=""/>
         <a:cs typeface=""/>
         <a:font script="Jpan" typeface="游明朝"/>
@@ -1936,23 +4820,6 @@
         <a:font script="Viet" typeface="Arial"/>
         <a:font script="Uigh" typeface="Microsoft Uighur"/>
         <a:font script="Geor" typeface="Sylfaen"/>
-        <a:font script="Armn" typeface="Arial"/>
-        <a:font script="Bugi" typeface="Leelawadee UI"/>
-        <a:font script="Bopo" typeface="Microsoft JhengHei"/>
-        <a:font script="Java" typeface="Javanese Text"/>
-        <a:font script="Lisu" typeface="Segoe UI"/>
-        <a:font script="Mymr" typeface="Myanmar Text"/>
-        <a:font script="Nkoo" typeface="Ebrima"/>
-        <a:font script="Olck" typeface="Nirmala UI"/>
-        <a:font script="Osma" typeface="Ebrima"/>
-        <a:font script="Phag" typeface="Phagspa"/>
-        <a:font script="Syrn" typeface="Estrangelo Edessa"/>
-        <a:font script="Syrj" typeface="Estrangelo Edessa"/>
-        <a:font script="Syre" typeface="Estrangelo Edessa"/>
-        <a:font script="Sora" typeface="Nirmala UI"/>
-        <a:font script="Tale" typeface="Microsoft Tai Le"/>
-        <a:font script="Talu" typeface="Microsoft New Tai Lue"/>
-        <a:font script="Tfng" typeface="Ebrima"/>
       </a:minorFont>
     </a:fontScheme>
     <a:fmtScheme name="Office">
@@ -2095,10 +4962,5 @@
   </a:themeElements>
   <a:objectDefaults/>
   <a:extraClrSchemeLst/>
-  <a:extLst>
-    <a:ext uri="{05A4C25C-085E-4340-85A3-A5531E510DB2}">
-      <thm15:themeFamily xmlns:thm15="http://schemas.microsoft.com/office/thememl/2012/main" name="Office Theme" id="{62F939B6-93AF-4DB8-9C6B-D6C7DFDC589F}" vid="{4A3C46E8-61CC-4603-A589-7422A47A8E4A}"/>
-    </a:ext>
-  </a:extLst>
 </a:theme>
 </file>
</xml_diff>

<commit_message>
add: Se agrego historia de usuario HUJC-005 dentro del documento Peaceathome.docx en la rama jcuc-2024100
</commit_message>
<xml_diff>
--- a/Peaceathome.docx
+++ b/Peaceathome.docx
@@ -1926,6 +1926,163 @@
           <w:szCs w:val="22"/>
         </w:rPr>
         <w:t>Para: poder elegir el servicio que mejor se adapte a mis necesidades y presupuesto.</w:t>
+      </w:r>
+      <w:r>
+        <w:rPr>
+          <w:rStyle w:val="eop"/>
+          <w:rFonts w:ascii="Calibri" w:eastAsia="MS Mincho" w:hAnsi="Calibri" w:cs="Calibri"/>
+          <w:sz w:val="22"/>
+          <w:szCs w:val="22"/>
+        </w:rPr>
+        <w:t> </w:t>
+      </w:r>
+    </w:p>
+    <w:p>
+      <w:pPr>
+        <w:pStyle w:val="paragraph"/>
+        <w:spacing w:before="0" w:beforeAutospacing="0" w:after="0" w:afterAutospacing="0"/>
+        <w:textAlignment w:val="baseline"/>
+        <w:rPr>
+          <w:rStyle w:val="eop"/>
+          <w:rFonts w:ascii="Calibri" w:eastAsia="MS Mincho" w:hAnsi="Calibri" w:cs="Calibri"/>
+          <w:sz w:val="22"/>
+          <w:szCs w:val="22"/>
+        </w:rPr>
+      </w:pPr>
+    </w:p>
+    <w:p>
+      <w:pPr>
+        <w:pStyle w:val="paragraph"/>
+        <w:spacing w:before="0" w:beforeAutospacing="0" w:after="0" w:afterAutospacing="0"/>
+        <w:textAlignment w:val="baseline"/>
+        <w:rPr>
+          <w:rStyle w:val="eop"/>
+          <w:rFonts w:ascii="Calibri" w:eastAsia="MS Mincho" w:hAnsi="Calibri" w:cs="Calibri"/>
+          <w:sz w:val="22"/>
+          <w:szCs w:val="22"/>
+        </w:rPr>
+      </w:pPr>
+    </w:p>
+    <w:p>
+      <w:pPr>
+        <w:rPr>
+          <w:rStyle w:val="eop"/>
+          <w:b/>
+        </w:rPr>
+      </w:pPr>
+      <w:r>
+        <w:t>HUJC-0</w:t>
+      </w:r>
+      <w:r>
+        <w:t>05</w:t>
+      </w:r>
+    </w:p>
+    <w:p>
+      <w:pPr>
+        <w:pStyle w:val="paragraph"/>
+        <w:spacing w:before="0" w:beforeAutospacing="0" w:after="0" w:afterAutospacing="0"/>
+        <w:textAlignment w:val="baseline"/>
+        <w:rPr>
+          <w:rFonts w:ascii="Segoe UI" w:hAnsi="Segoe UI" w:cs="Segoe UI"/>
+          <w:sz w:val="18"/>
+          <w:szCs w:val="18"/>
+        </w:rPr>
+      </w:pPr>
+      <w:r>
+        <w:rPr>
+          <w:rStyle w:val="normaltextrun"/>
+          <w:rFonts w:ascii="Calibri" w:hAnsi="Calibri" w:cs="Calibri"/>
+          <w:sz w:val="22"/>
+          <w:szCs w:val="22"/>
+        </w:rPr>
+        <w:t>Como: administrador </w:t>
+      </w:r>
+      <w:r>
+        <w:rPr>
+          <w:rStyle w:val="eop"/>
+          <w:rFonts w:ascii="Calibri" w:eastAsia="MS Mincho" w:hAnsi="Calibri" w:cs="Calibri"/>
+          <w:sz w:val="22"/>
+          <w:szCs w:val="22"/>
+        </w:rPr>
+        <w:t> </w:t>
+      </w:r>
+    </w:p>
+    <w:p>
+      <w:pPr>
+        <w:pStyle w:val="paragraph"/>
+        <w:spacing w:before="0" w:beforeAutospacing="0" w:after="0" w:afterAutospacing="0"/>
+        <w:textAlignment w:val="baseline"/>
+        <w:rPr>
+          <w:rStyle w:val="normaltextrun"/>
+          <w:rFonts w:ascii="Calibri" w:hAnsi="Calibri" w:cs="Calibri"/>
+          <w:sz w:val="22"/>
+          <w:szCs w:val="22"/>
+        </w:rPr>
+      </w:pPr>
+    </w:p>
+    <w:p>
+      <w:pPr>
+        <w:pStyle w:val="paragraph"/>
+        <w:spacing w:before="0" w:beforeAutospacing="0" w:after="0" w:afterAutospacing="0"/>
+        <w:textAlignment w:val="baseline"/>
+        <w:rPr>
+          <w:rFonts w:ascii="Segoe UI" w:hAnsi="Segoe UI" w:cs="Segoe UI"/>
+          <w:sz w:val="18"/>
+          <w:szCs w:val="18"/>
+        </w:rPr>
+      </w:pPr>
+      <w:r>
+        <w:rPr>
+          <w:rStyle w:val="normaltextrun"/>
+          <w:rFonts w:ascii="Calibri" w:hAnsi="Calibri" w:cs="Calibri"/>
+          <w:sz w:val="22"/>
+          <w:szCs w:val="22"/>
+        </w:rPr>
+        <w:t>Quiero: poder activar, desactivar y modificar los datos de un servicio (nombre, descripción, horario, costo extra y tipo de servicio),</w:t>
+      </w:r>
+      <w:r>
+        <w:rPr>
+          <w:rStyle w:val="eop"/>
+          <w:rFonts w:ascii="Calibri" w:eastAsia="MS Mincho" w:hAnsi="Calibri" w:cs="Calibri"/>
+          <w:sz w:val="22"/>
+          <w:szCs w:val="22"/>
+        </w:rPr>
+        <w:t> </w:t>
+      </w:r>
+    </w:p>
+    <w:p>
+      <w:pPr>
+        <w:pStyle w:val="paragraph"/>
+        <w:spacing w:before="0" w:beforeAutospacing="0" w:after="0" w:afterAutospacing="0"/>
+        <w:textAlignment w:val="baseline"/>
+        <w:rPr>
+          <w:rStyle w:val="normaltextrun"/>
+          <w:rFonts w:ascii="Calibri" w:hAnsi="Calibri" w:cs="Calibri"/>
+          <w:sz w:val="22"/>
+          <w:szCs w:val="22"/>
+        </w:rPr>
+      </w:pPr>
+    </w:p>
+    <w:p>
+      <w:pPr>
+        <w:pStyle w:val="paragraph"/>
+        <w:spacing w:before="0" w:beforeAutospacing="0" w:after="0" w:afterAutospacing="0"/>
+        <w:textAlignment w:val="baseline"/>
+        <w:rPr>
+          <w:rStyle w:val="eop"/>
+          <w:rFonts w:ascii="Calibri" w:eastAsia="MS Mincho" w:hAnsi="Calibri" w:cs="Calibri"/>
+          <w:sz w:val="22"/>
+          <w:szCs w:val="22"/>
+        </w:rPr>
+      </w:pPr>
+      <w:r>
+        <w:rPr>
+          <w:rStyle w:val="normaltextrun"/>
+          <w:rFonts w:ascii="Calibri" w:hAnsi="Calibri" w:cs="Calibri"/>
+          <w:sz w:val="22"/>
+          <w:szCs w:val="22"/>
+        </w:rPr>
+        <w:t>Para: mantener la información actualizada y ofrecer servicios vigentes a los clientes.</w:t>
       </w:r>
       <w:r>
         <w:rPr>

</xml_diff>

<commit_message>
add: Se agrego historia de usuario HUJC-006 dentro del documento Peaceathome.docx en la rama jcuc-2024100
</commit_message>
<xml_diff>
--- a/Peaceathome.docx
+++ b/Peaceathome.docx
@@ -273,6 +273,7 @@
           <w:rFonts w:ascii="Arial" w:hAnsi="Arial" w:cs="Arial"/>
         </w:rPr>
       </w:pPr>
+      <w:proofErr w:type="spellStart"/>
       <w:r>
         <w:rPr>
           <w:rStyle w:val="oypena"/>
@@ -280,7 +281,17 @@
           <w:color w:val="000000"/>
           <w:sz w:val="40"/>
         </w:rPr>
-        <w:t>Peace at home</w:t>
+        <w:t>Peace</w:t>
+      </w:r>
+      <w:proofErr w:type="spellEnd"/>
+      <w:r>
+        <w:rPr>
+          <w:rStyle w:val="oypena"/>
+          <w:rFonts w:ascii="Arial" w:hAnsi="Arial" w:cs="Arial"/>
+          <w:color w:val="000000"/>
+          <w:sz w:val="40"/>
+        </w:rPr>
+        <w:t xml:space="preserve"> at home</w:t>
       </w:r>
     </w:p>
     <w:p>
@@ -668,14 +679,52 @@
                 <w:lang w:val="es-ES"/>
               </w:rPr>
             </w:pPr>
+            <w:proofErr w:type="spellStart"/>
             <w:r>
               <w:rPr>
                 <w:rFonts w:ascii="Arial" w:eastAsiaTheme="minorHAnsi" w:hAnsi="Arial" w:cs="Arial"/>
                 <w:sz w:val="24"/>
                 <w:lang w:val="es-ES"/>
               </w:rPr>
-              <w:t>Kenet Efraín Cuyuch Joj</w:t>
+              <w:t>Kenet</w:t>
             </w:r>
+            <w:proofErr w:type="spellEnd"/>
+            <w:r>
+              <w:rPr>
+                <w:rFonts w:ascii="Arial" w:eastAsiaTheme="minorHAnsi" w:hAnsi="Arial" w:cs="Arial"/>
+                <w:sz w:val="24"/>
+                <w:lang w:val="es-ES"/>
+              </w:rPr>
+              <w:t xml:space="preserve"> Efraín </w:t>
+            </w:r>
+            <w:proofErr w:type="spellStart"/>
+            <w:r>
+              <w:rPr>
+                <w:rFonts w:ascii="Arial" w:eastAsiaTheme="minorHAnsi" w:hAnsi="Arial" w:cs="Arial"/>
+                <w:sz w:val="24"/>
+                <w:lang w:val="es-ES"/>
+              </w:rPr>
+              <w:t>Cuyuch</w:t>
+            </w:r>
+            <w:proofErr w:type="spellEnd"/>
+            <w:r>
+              <w:rPr>
+                <w:rFonts w:ascii="Arial" w:eastAsiaTheme="minorHAnsi" w:hAnsi="Arial" w:cs="Arial"/>
+                <w:sz w:val="24"/>
+                <w:lang w:val="es-ES"/>
+              </w:rPr>
+              <w:t xml:space="preserve"> </w:t>
+            </w:r>
+            <w:proofErr w:type="spellStart"/>
+            <w:r>
+              <w:rPr>
+                <w:rFonts w:ascii="Arial" w:eastAsiaTheme="minorHAnsi" w:hAnsi="Arial" w:cs="Arial"/>
+                <w:sz w:val="24"/>
+                <w:lang w:val="es-ES"/>
+              </w:rPr>
+              <w:t>Joj</w:t>
+            </w:r>
+            <w:proofErr w:type="spellEnd"/>
           </w:p>
         </w:tc>
         <w:tc>
@@ -715,12 +764,37 @@
                 <w:sz w:val="24"/>
               </w:rPr>
             </w:pPr>
+            <w:proofErr w:type="spellStart"/>
             <w:r>
               <w:rPr>
                 <w:rFonts w:ascii="Arial" w:eastAsiaTheme="minorHAnsi" w:hAnsi="Arial" w:cs="Arial"/>
                 <w:sz w:val="24"/>
               </w:rPr>
-              <w:t>Angel Gahel Padilla Pacheco</w:t>
+              <w:t>Angel</w:t>
+            </w:r>
+            <w:proofErr w:type="spellEnd"/>
+            <w:r>
+              <w:rPr>
+                <w:rFonts w:ascii="Arial" w:eastAsiaTheme="minorHAnsi" w:hAnsi="Arial" w:cs="Arial"/>
+                <w:sz w:val="24"/>
+              </w:rPr>
+              <w:t xml:space="preserve"> </w:t>
+            </w:r>
+            <w:proofErr w:type="spellStart"/>
+            <w:r>
+              <w:rPr>
+                <w:rFonts w:ascii="Arial" w:eastAsiaTheme="minorHAnsi" w:hAnsi="Arial" w:cs="Arial"/>
+                <w:sz w:val="24"/>
+              </w:rPr>
+              <w:t>Gahel</w:t>
+            </w:r>
+            <w:proofErr w:type="spellEnd"/>
+            <w:r>
+              <w:rPr>
+                <w:rFonts w:ascii="Arial" w:eastAsiaTheme="minorHAnsi" w:hAnsi="Arial" w:cs="Arial"/>
+                <w:sz w:val="24"/>
+              </w:rPr>
+              <w:t xml:space="preserve"> Padilla Pacheco</w:t>
             </w:r>
           </w:p>
         </w:tc>
@@ -762,13 +836,47 @@
                 <w:sz w:val="24"/>
               </w:rPr>
             </w:pPr>
+            <w:proofErr w:type="spellStart"/>
             <w:r>
               <w:rPr>
                 <w:rFonts w:ascii="Arial" w:eastAsiaTheme="minorHAnsi" w:hAnsi="Arial" w:cs="Arial"/>
                 <w:sz w:val="24"/>
               </w:rPr>
-              <w:t>Jose Enrique cuc cutz</w:t>
+              <w:t>Jose</w:t>
             </w:r>
+            <w:proofErr w:type="spellEnd"/>
+            <w:r>
+              <w:rPr>
+                <w:rFonts w:ascii="Arial" w:eastAsiaTheme="minorHAnsi" w:hAnsi="Arial" w:cs="Arial"/>
+                <w:sz w:val="24"/>
+              </w:rPr>
+              <w:t xml:space="preserve"> Enrique </w:t>
+            </w:r>
+            <w:proofErr w:type="spellStart"/>
+            <w:r>
+              <w:rPr>
+                <w:rFonts w:ascii="Arial" w:eastAsiaTheme="minorHAnsi" w:hAnsi="Arial" w:cs="Arial"/>
+                <w:sz w:val="24"/>
+              </w:rPr>
+              <w:t>cuc</w:t>
+            </w:r>
+            <w:proofErr w:type="spellEnd"/>
+            <w:r>
+              <w:rPr>
+                <w:rFonts w:ascii="Arial" w:eastAsiaTheme="minorHAnsi" w:hAnsi="Arial" w:cs="Arial"/>
+                <w:sz w:val="24"/>
+              </w:rPr>
+              <w:t xml:space="preserve"> </w:t>
+            </w:r>
+            <w:proofErr w:type="spellStart"/>
+            <w:r>
+              <w:rPr>
+                <w:rFonts w:ascii="Arial" w:eastAsiaTheme="minorHAnsi" w:hAnsi="Arial" w:cs="Arial"/>
+                <w:sz w:val="24"/>
+              </w:rPr>
+              <w:t>cutz</w:t>
+            </w:r>
+            <w:proofErr w:type="spellEnd"/>
           </w:p>
         </w:tc>
         <w:tc>
@@ -809,14 +917,52 @@
                 <w:szCs w:val="24"/>
               </w:rPr>
             </w:pPr>
+            <w:proofErr w:type="spellStart"/>
             <w:r>
               <w:rPr>
                 <w:rFonts w:ascii="Arial" w:eastAsiaTheme="minorEastAsia" w:hAnsi="Arial" w:cs="Arial"/>
                 <w:sz w:val="24"/>
                 <w:szCs w:val="24"/>
               </w:rPr>
-              <w:t>Jeferson Andre Cano Lopez</w:t>
+              <w:t>Jeferson</w:t>
             </w:r>
+            <w:proofErr w:type="spellEnd"/>
+            <w:r>
+              <w:rPr>
+                <w:rFonts w:ascii="Arial" w:eastAsiaTheme="minorEastAsia" w:hAnsi="Arial" w:cs="Arial"/>
+                <w:sz w:val="24"/>
+                <w:szCs w:val="24"/>
+              </w:rPr>
+              <w:t xml:space="preserve"> </w:t>
+            </w:r>
+            <w:proofErr w:type="spellStart"/>
+            <w:r>
+              <w:rPr>
+                <w:rFonts w:ascii="Arial" w:eastAsiaTheme="minorEastAsia" w:hAnsi="Arial" w:cs="Arial"/>
+                <w:sz w:val="24"/>
+                <w:szCs w:val="24"/>
+              </w:rPr>
+              <w:t>Andre</w:t>
+            </w:r>
+            <w:proofErr w:type="spellEnd"/>
+            <w:r>
+              <w:rPr>
+                <w:rFonts w:ascii="Arial" w:eastAsiaTheme="minorEastAsia" w:hAnsi="Arial" w:cs="Arial"/>
+                <w:sz w:val="24"/>
+                <w:szCs w:val="24"/>
+              </w:rPr>
+              <w:t xml:space="preserve"> Cano </w:t>
+            </w:r>
+            <w:proofErr w:type="spellStart"/>
+            <w:r>
+              <w:rPr>
+                <w:rFonts w:ascii="Arial" w:eastAsiaTheme="minorEastAsia" w:hAnsi="Arial" w:cs="Arial"/>
+                <w:sz w:val="24"/>
+                <w:szCs w:val="24"/>
+              </w:rPr>
+              <w:t>Lopez</w:t>
+            </w:r>
+            <w:proofErr w:type="spellEnd"/>
           </w:p>
         </w:tc>
         <w:tc>
@@ -909,8 +1055,17 @@
                 <w:rFonts w:ascii="Arial" w:eastAsiaTheme="minorHAnsi" w:hAnsi="Arial" w:cs="Arial"/>
                 <w:sz w:val="24"/>
               </w:rPr>
-              <w:t>Ricardo Alejandro Hernández Hernández</w:t>
+              <w:t xml:space="preserve">Ricardo Alejandro Hernández </w:t>
             </w:r>
+            <w:proofErr w:type="spellStart"/>
+            <w:r>
+              <w:rPr>
+                <w:rFonts w:ascii="Arial" w:eastAsiaTheme="minorHAnsi" w:hAnsi="Arial" w:cs="Arial"/>
+                <w:sz w:val="24"/>
+              </w:rPr>
+              <w:t>Hernández</w:t>
+            </w:r>
+            <w:proofErr w:type="spellEnd"/>
           </w:p>
         </w:tc>
         <w:tc>
@@ -955,7 +1110,23 @@
                 <w:rFonts w:ascii="Arial" w:eastAsiaTheme="minorHAnsi" w:hAnsi="Arial" w:cs="Arial"/>
                 <w:sz w:val="24"/>
               </w:rPr>
-              <w:t>Osman Emmanuell Veliz Guzmán</w:t>
+              <w:t xml:space="preserve">Osman </w:t>
+            </w:r>
+            <w:proofErr w:type="spellStart"/>
+            <w:r>
+              <w:rPr>
+                <w:rFonts w:ascii="Arial" w:eastAsiaTheme="minorHAnsi" w:hAnsi="Arial" w:cs="Arial"/>
+                <w:sz w:val="24"/>
+              </w:rPr>
+              <w:t>Emmanuell</w:t>
+            </w:r>
+            <w:proofErr w:type="spellEnd"/>
+            <w:r>
+              <w:rPr>
+                <w:rFonts w:ascii="Arial" w:eastAsiaTheme="minorHAnsi" w:hAnsi="Arial" w:cs="Arial"/>
+                <w:sz w:val="24"/>
+              </w:rPr>
+              <w:t xml:space="preserve"> Veliz Guzmán</w:t>
             </w:r>
           </w:p>
         </w:tc>
@@ -1001,8 +1172,33 @@
                 <w:rFonts w:ascii="Arial" w:eastAsiaTheme="minorHAnsi" w:hAnsi="Arial" w:cs="Arial"/>
                 <w:sz w:val="24"/>
               </w:rPr>
-              <w:t>Franklin Stev Paiz Chavez</w:t>
+              <w:t xml:space="preserve">Franklin </w:t>
             </w:r>
+            <w:proofErr w:type="spellStart"/>
+            <w:r>
+              <w:rPr>
+                <w:rFonts w:ascii="Arial" w:eastAsiaTheme="minorHAnsi" w:hAnsi="Arial" w:cs="Arial"/>
+                <w:sz w:val="24"/>
+              </w:rPr>
+              <w:t>Stev</w:t>
+            </w:r>
+            <w:proofErr w:type="spellEnd"/>
+            <w:r>
+              <w:rPr>
+                <w:rFonts w:ascii="Arial" w:eastAsiaTheme="minorHAnsi" w:hAnsi="Arial" w:cs="Arial"/>
+                <w:sz w:val="24"/>
+              </w:rPr>
+              <w:t xml:space="preserve"> Paiz </w:t>
+            </w:r>
+            <w:proofErr w:type="spellStart"/>
+            <w:r>
+              <w:rPr>
+                <w:rFonts w:ascii="Arial" w:eastAsiaTheme="minorHAnsi" w:hAnsi="Arial" w:cs="Arial"/>
+                <w:sz w:val="24"/>
+              </w:rPr>
+              <w:t>Chavez</w:t>
+            </w:r>
+            <w:proofErr w:type="spellEnd"/>
           </w:p>
         </w:tc>
         <w:tc>
@@ -1043,13 +1239,23 @@
                 <w:szCs w:val="24"/>
               </w:rPr>
             </w:pPr>
+            <w:proofErr w:type="spellStart"/>
             <w:r>
               <w:rPr>
                 <w:rFonts w:ascii="Arial" w:eastAsiaTheme="minorEastAsia" w:hAnsi="Arial" w:cs="Arial"/>
                 <w:sz w:val="24"/>
                 <w:szCs w:val="24"/>
               </w:rPr>
-              <w:t>Angel Gabriel Ernesto Grijalva Castro</w:t>
+              <w:t>Angel</w:t>
+            </w:r>
+            <w:proofErr w:type="spellEnd"/>
+            <w:r>
+              <w:rPr>
+                <w:rFonts w:ascii="Arial" w:eastAsiaTheme="minorEastAsia" w:hAnsi="Arial" w:cs="Arial"/>
+                <w:sz w:val="24"/>
+                <w:szCs w:val="24"/>
+              </w:rPr>
+              <w:t xml:space="preserve"> Gabriel Ernesto Grijalva Castro</w:t>
             </w:r>
           </w:p>
         </w:tc>
@@ -1092,13 +1298,31 @@
                 <w:sz w:val="24"/>
               </w:rPr>
             </w:pPr>
+            <w:proofErr w:type="spellStart"/>
             <w:r>
               <w:rPr>
                 <w:rFonts w:ascii="Arial" w:eastAsiaTheme="minorHAnsi" w:hAnsi="Arial" w:cs="Arial"/>
                 <w:sz w:val="24"/>
               </w:rPr>
-              <w:t>Benjamin Elí Argueta Caal</w:t>
+              <w:t>Benjamin</w:t>
             </w:r>
+            <w:proofErr w:type="spellEnd"/>
+            <w:r>
+              <w:rPr>
+                <w:rFonts w:ascii="Arial" w:eastAsiaTheme="minorHAnsi" w:hAnsi="Arial" w:cs="Arial"/>
+                <w:sz w:val="24"/>
+              </w:rPr>
+              <w:t xml:space="preserve"> Elí Argueta </w:t>
+            </w:r>
+            <w:proofErr w:type="spellStart"/>
+            <w:r>
+              <w:rPr>
+                <w:rFonts w:ascii="Arial" w:eastAsiaTheme="minorHAnsi" w:hAnsi="Arial" w:cs="Arial"/>
+                <w:sz w:val="24"/>
+              </w:rPr>
+              <w:t>Caal</w:t>
+            </w:r>
+            <w:proofErr w:type="spellEnd"/>
           </w:p>
         </w:tc>
         <w:tc>
@@ -1143,8 +1367,33 @@
                 <w:rFonts w:ascii="Arial" w:eastAsiaTheme="minorHAnsi" w:hAnsi="Arial" w:cs="Arial"/>
                 <w:sz w:val="24"/>
               </w:rPr>
-              <w:t>Carlos Alejandro Patal Choc</w:t>
+              <w:t xml:space="preserve">Carlos Alejandro </w:t>
             </w:r>
+            <w:proofErr w:type="spellStart"/>
+            <w:r>
+              <w:rPr>
+                <w:rFonts w:ascii="Arial" w:eastAsiaTheme="minorHAnsi" w:hAnsi="Arial" w:cs="Arial"/>
+                <w:sz w:val="24"/>
+              </w:rPr>
+              <w:t>Patal</w:t>
+            </w:r>
+            <w:proofErr w:type="spellEnd"/>
+            <w:r>
+              <w:rPr>
+                <w:rFonts w:ascii="Arial" w:eastAsiaTheme="minorHAnsi" w:hAnsi="Arial" w:cs="Arial"/>
+                <w:sz w:val="24"/>
+              </w:rPr>
+              <w:t xml:space="preserve"> </w:t>
+            </w:r>
+            <w:proofErr w:type="spellStart"/>
+            <w:r>
+              <w:rPr>
+                <w:rFonts w:ascii="Arial" w:eastAsiaTheme="minorHAnsi" w:hAnsi="Arial" w:cs="Arial"/>
+                <w:sz w:val="24"/>
+              </w:rPr>
+              <w:t>Choc</w:t>
+            </w:r>
+            <w:proofErr w:type="spellEnd"/>
           </w:p>
         </w:tc>
         <w:tc>
@@ -1775,12 +2024,16 @@
           <w:b/>
         </w:rPr>
       </w:pPr>
+      <w:proofErr w:type="spellStart"/>
+      <w:proofErr w:type="gramStart"/>
       <w:r>
         <w:rPr>
           <w:b/>
         </w:rPr>
         <w:t>TUPLA:Servicios</w:t>
       </w:r>
+      <w:proofErr w:type="spellEnd"/>
+      <w:proofErr w:type="gramEnd"/>
     </w:p>
     <w:p>
       <w:pPr>
@@ -1971,10 +2224,7 @@
         </w:rPr>
       </w:pPr>
       <w:r>
-        <w:t>HUJC-0</w:t>
-      </w:r>
-      <w:r>
-        <w:t>05</w:t>
+        <w:t>HUJC-005</w:t>
       </w:r>
     </w:p>
     <w:p>
@@ -2093,6 +2343,163 @@
         </w:rPr>
         <w:t> </w:t>
       </w:r>
+    </w:p>
+    <w:p>
+      <w:pPr>
+        <w:pStyle w:val="paragraph"/>
+        <w:spacing w:before="0" w:beforeAutospacing="0" w:after="0" w:afterAutospacing="0"/>
+        <w:textAlignment w:val="baseline"/>
+        <w:rPr>
+          <w:rStyle w:val="eop"/>
+          <w:rFonts w:ascii="Calibri" w:eastAsia="MS Mincho" w:hAnsi="Calibri" w:cs="Calibri"/>
+          <w:sz w:val="22"/>
+          <w:szCs w:val="22"/>
+        </w:rPr>
+      </w:pPr>
+    </w:p>
+    <w:p>
+      <w:pPr>
+        <w:rPr>
+          <w:rStyle w:val="normaltextrun"/>
+          <w:b/>
+        </w:rPr>
+      </w:pPr>
+      <w:r>
+        <w:t>HUJC-0</w:t>
+      </w:r>
+      <w:r>
+        <w:t>06</w:t>
+      </w:r>
+    </w:p>
+    <w:p>
+      <w:pPr>
+        <w:pStyle w:val="paragraph"/>
+        <w:spacing w:before="0" w:beforeAutospacing="0" w:after="0" w:afterAutospacing="0"/>
+        <w:textAlignment w:val="baseline"/>
+        <w:rPr>
+          <w:rFonts w:ascii="Segoe UI" w:hAnsi="Segoe UI" w:cs="Segoe UI"/>
+          <w:sz w:val="18"/>
+          <w:szCs w:val="18"/>
+        </w:rPr>
+      </w:pPr>
+      <w:r>
+        <w:rPr>
+          <w:rStyle w:val="normaltextrun"/>
+          <w:rFonts w:ascii="Calibri" w:hAnsi="Calibri" w:cs="Calibri"/>
+          <w:sz w:val="22"/>
+          <w:szCs w:val="22"/>
+        </w:rPr>
+        <w:t>Como: usuario del sistema (empleado),</w:t>
+      </w:r>
+      <w:r>
+        <w:rPr>
+          <w:rStyle w:val="eop"/>
+          <w:rFonts w:ascii="Calibri" w:eastAsia="MS Mincho" w:hAnsi="Calibri" w:cs="Calibri"/>
+          <w:sz w:val="22"/>
+          <w:szCs w:val="22"/>
+        </w:rPr>
+        <w:t> </w:t>
+      </w:r>
+    </w:p>
+    <w:p>
+      <w:pPr>
+        <w:pStyle w:val="paragraph"/>
+        <w:spacing w:before="0" w:beforeAutospacing="0" w:after="0" w:afterAutospacing="0"/>
+        <w:textAlignment w:val="baseline"/>
+        <w:rPr>
+          <w:rStyle w:val="normaltextrun"/>
+          <w:rFonts w:ascii="Calibri" w:hAnsi="Calibri" w:cs="Calibri"/>
+          <w:sz w:val="22"/>
+          <w:szCs w:val="22"/>
+        </w:rPr>
+      </w:pPr>
+    </w:p>
+    <w:p>
+      <w:pPr>
+        <w:pStyle w:val="paragraph"/>
+        <w:spacing w:before="0" w:beforeAutospacing="0" w:after="0" w:afterAutospacing="0"/>
+        <w:textAlignment w:val="baseline"/>
+        <w:rPr>
+          <w:rFonts w:ascii="Segoe UI" w:hAnsi="Segoe UI" w:cs="Segoe UI"/>
+          <w:sz w:val="18"/>
+          <w:szCs w:val="18"/>
+        </w:rPr>
+      </w:pPr>
+      <w:r>
+        <w:rPr>
+          <w:rStyle w:val="normaltextrun"/>
+          <w:rFonts w:ascii="Calibri" w:hAnsi="Calibri" w:cs="Calibri"/>
+          <w:sz w:val="22"/>
+          <w:szCs w:val="22"/>
+        </w:rPr>
+        <w:t>Quiero: consultar el tipo de servicio y su horario disponible,</w:t>
+      </w:r>
+      <w:r>
+        <w:rPr>
+          <w:rStyle w:val="eop"/>
+          <w:rFonts w:ascii="Calibri" w:eastAsia="MS Mincho" w:hAnsi="Calibri" w:cs="Calibri"/>
+          <w:sz w:val="22"/>
+          <w:szCs w:val="22"/>
+        </w:rPr>
+        <w:t> </w:t>
+      </w:r>
+    </w:p>
+    <w:p>
+      <w:pPr>
+        <w:pStyle w:val="paragraph"/>
+        <w:spacing w:before="0" w:beforeAutospacing="0" w:after="0" w:afterAutospacing="0"/>
+        <w:textAlignment w:val="baseline"/>
+        <w:rPr>
+          <w:rStyle w:val="normaltextrun"/>
+          <w:rFonts w:ascii="Calibri" w:hAnsi="Calibri" w:cs="Calibri"/>
+          <w:sz w:val="22"/>
+          <w:szCs w:val="22"/>
+        </w:rPr>
+      </w:pPr>
+    </w:p>
+    <w:p>
+      <w:pPr>
+        <w:pStyle w:val="paragraph"/>
+        <w:spacing w:before="0" w:beforeAutospacing="0" w:after="0" w:afterAutospacing="0"/>
+        <w:textAlignment w:val="baseline"/>
+        <w:rPr>
+          <w:rStyle w:val="eop"/>
+          <w:rFonts w:ascii="Calibri" w:eastAsia="MS Mincho" w:hAnsi="Calibri" w:cs="Calibri"/>
+          <w:sz w:val="22"/>
+          <w:szCs w:val="22"/>
+        </w:rPr>
+      </w:pPr>
+      <w:r>
+        <w:rPr>
+          <w:rStyle w:val="normaltextrun"/>
+          <w:rFonts w:ascii="Calibri" w:hAnsi="Calibri" w:cs="Calibri"/>
+          <w:sz w:val="22"/>
+          <w:szCs w:val="22"/>
+        </w:rPr>
+        <w:t>Para: poder informar correctamente a los clientes sobre la disponibilidad y características de cada servicio.</w:t>
+      </w:r>
+      <w:r>
+        <w:rPr>
+          <w:rStyle w:val="eop"/>
+          <w:rFonts w:ascii="Calibri" w:eastAsia="MS Mincho" w:hAnsi="Calibri" w:cs="Calibri"/>
+          <w:sz w:val="22"/>
+          <w:szCs w:val="22"/>
+        </w:rPr>
+        <w:t> </w:t>
+      </w:r>
+    </w:p>
+    <w:p>
+      <w:pPr>
+        <w:pStyle w:val="paragraph"/>
+        <w:spacing w:before="0" w:beforeAutospacing="0" w:after="0" w:afterAutospacing="0"/>
+        <w:textAlignment w:val="baseline"/>
+        <w:rPr>
+          <w:rStyle w:val="eop"/>
+          <w:rFonts w:ascii="Calibri" w:eastAsia="MS Mincho" w:hAnsi="Calibri" w:cs="Calibri"/>
+          <w:sz w:val="22"/>
+          <w:szCs w:val="22"/>
+        </w:rPr>
+      </w:pPr>
     </w:p>
     <w:p>
       <w:pPr>

</xml_diff>

<commit_message>
add: Se agrego historia de usuario HUJC-009 dentro del documento Peaceathome.docx en la rama jcano-2024386
</commit_message>
<xml_diff>
--- a/Peaceathome.docx
+++ b/Peaceathome.docx
@@ -2630,8 +2630,6 @@
         </w:rPr>
         <w:t>08</w:t>
       </w:r>
-      <w:bookmarkStart w:id="0" w:name="_GoBack"/>
-      <w:bookmarkEnd w:id="0"/>
     </w:p>
     <w:p>
       <w:pPr>
@@ -2692,6 +2690,125 @@
         </w:rPr>
         <w:t>Para: Que los nuevos huéspedes sepan de las comodidades y ventajas de esta propiedad en especifico</w:t>
       </w:r>
+    </w:p>
+    <w:p>
+      <w:pPr>
+        <w:pStyle w:val="16"/>
+        <w:spacing w:before="0" w:beforeAutospacing="0" w:after="0" w:afterAutospacing="0"/>
+        <w:textAlignment w:val="baseline"/>
+        <w:rPr>
+          <w:rFonts w:ascii="Segoe UI" w:hAnsi="Segoe UI" w:cs="Segoe UI"/>
+          <w:sz w:val="22"/>
+          <w:szCs w:val="22"/>
+        </w:rPr>
+      </w:pPr>
+    </w:p>
+    <w:p>
+      <w:pPr>
+        <w:pStyle w:val="16"/>
+        <w:spacing w:after="0"/>
+        <w:textAlignment w:val="baseline"/>
+        <w:rPr>
+          <w:rFonts w:hint="default" w:ascii="Segoe UI" w:hAnsi="Segoe UI" w:cs="Segoe UI"/>
+          <w:b/>
+          <w:sz w:val="22"/>
+          <w:szCs w:val="22"/>
+          <w:lang w:val="es-GT"/>
+        </w:rPr>
+      </w:pPr>
+      <w:r>
+        <w:rPr>
+          <w:rFonts w:ascii="Segoe UI" w:hAnsi="Segoe UI" w:cs="Segoe UI"/>
+          <w:b/>
+          <w:sz w:val="22"/>
+          <w:szCs w:val="22"/>
+        </w:rPr>
+        <w:t>HUJC-0</w:t>
+      </w:r>
+      <w:r>
+        <w:rPr>
+          <w:rFonts w:hint="default" w:ascii="Segoe UI" w:hAnsi="Segoe UI" w:cs="Segoe UI"/>
+          <w:b/>
+          <w:sz w:val="22"/>
+          <w:szCs w:val="22"/>
+          <w:lang w:val="es-GT"/>
+        </w:rPr>
+        <w:t>09</w:t>
+      </w:r>
+      <w:bookmarkStart w:id="0" w:name="_GoBack"/>
+      <w:bookmarkEnd w:id="0"/>
+    </w:p>
+    <w:p>
+      <w:pPr>
+        <w:pStyle w:val="16"/>
+        <w:spacing w:after="0"/>
+        <w:textAlignment w:val="baseline"/>
+        <w:rPr>
+          <w:rFonts w:ascii="Segoe UI" w:hAnsi="Segoe UI" w:cs="Segoe UI"/>
+          <w:sz w:val="22"/>
+          <w:szCs w:val="22"/>
+        </w:rPr>
+      </w:pPr>
+      <w:r>
+        <w:rPr>
+          <w:rFonts w:ascii="Segoe UI" w:hAnsi="Segoe UI" w:cs="Segoe UI"/>
+          <w:sz w:val="22"/>
+          <w:szCs w:val="22"/>
+        </w:rPr>
+        <w:t>Como: Arrendador</w:t>
+      </w:r>
+    </w:p>
+    <w:p>
+      <w:pPr>
+        <w:pStyle w:val="16"/>
+        <w:spacing w:after="0"/>
+        <w:textAlignment w:val="baseline"/>
+        <w:rPr>
+          <w:rFonts w:ascii="Segoe UI" w:hAnsi="Segoe UI" w:cs="Segoe UI"/>
+          <w:sz w:val="22"/>
+          <w:szCs w:val="22"/>
+        </w:rPr>
+      </w:pPr>
+      <w:r>
+        <w:rPr>
+          <w:rFonts w:ascii="Segoe UI" w:hAnsi="Segoe UI" w:cs="Segoe UI"/>
+          <w:sz w:val="22"/>
+          <w:szCs w:val="22"/>
+        </w:rPr>
+        <w:t>Quiero: Registrar una reseña sobre los huéspedes que ocupan mi propiedad de Peace At Home</w:t>
+      </w:r>
+    </w:p>
+    <w:p>
+      <w:pPr>
+        <w:pStyle w:val="16"/>
+        <w:spacing w:before="0" w:beforeAutospacing="0" w:after="0" w:afterAutospacing="0"/>
+        <w:textAlignment w:val="baseline"/>
+        <w:rPr>
+          <w:rFonts w:ascii="Segoe UI" w:hAnsi="Segoe UI" w:cs="Segoe UI"/>
+          <w:sz w:val="22"/>
+          <w:szCs w:val="22"/>
+        </w:rPr>
+      </w:pPr>
+      <w:r>
+        <w:rPr>
+          <w:rFonts w:ascii="Segoe UI" w:hAnsi="Segoe UI" w:cs="Segoe UI"/>
+          <w:sz w:val="22"/>
+          <w:szCs w:val="22"/>
+        </w:rPr>
+        <w:t>Para: Llevar un registro de cosas que pueden mejorarse en la propiedad para otorgarles una mejor comodidad</w:t>
+      </w:r>
+    </w:p>
+    <w:p>
+      <w:pPr>
+        <w:pStyle w:val="16"/>
+        <w:spacing w:before="0" w:beforeAutospacing="0" w:after="0" w:afterAutospacing="0"/>
+        <w:textAlignment w:val="baseline"/>
+        <w:rPr>
+          <w:rFonts w:ascii="Segoe UI" w:hAnsi="Segoe UI" w:cs="Segoe UI"/>
+          <w:sz w:val="22"/>
+          <w:szCs w:val="22"/>
+        </w:rPr>
+      </w:pPr>
     </w:p>
     <w:p>
       <w:pPr>

</xml_diff>

<commit_message>
add: Se agrego historia de usuario HURH-0010 dentro del documento Peaceathome.docx en la rama rhernandez-2024310
</commit_message>
<xml_diff>
--- a/Peaceathome.docx
+++ b/Peaceathome.docx
@@ -19,7 +19,7 @@
           <w:lang w:val="en-US"/>
         </w:rPr>
         <w:drawing>
-          <wp:inline distT="0" distB="0" distL="0" distR="0" wp14:anchorId="2FEE8166" wp14:editId="6BE70031">
+          <wp:inline distT="0" distB="0" distL="0" distR="0">
             <wp:extent cx="2248535" cy="847725"/>
             <wp:effectExtent l="0" t="0" r="0" b="0"/>
             <wp:docPr id="2" name="Imagen 2"/>
@@ -271,7 +271,6 @@
         <w:jc w:val="center"/>
         <w:rPr>
           <w:rFonts w:ascii="Arial" w:hAnsi="Arial" w:cs="Arial"/>
-          <w:lang w:val="en-US"/>
         </w:rPr>
       </w:pPr>
       <w:r>
@@ -280,7 +279,6 @@
           <w:rFonts w:ascii="Arial" w:hAnsi="Arial" w:cs="Arial"/>
           <w:color w:val="000000"/>
           <w:sz w:val="40"/>
-          <w:lang w:val="en-US"/>
         </w:rPr>
         <w:t>Peace at home</w:t>
       </w:r>
@@ -292,7 +290,6 @@
         <w:jc w:val="center"/>
         <w:rPr>
           <w:rFonts w:ascii="Arial" w:hAnsi="Arial" w:cs="Arial"/>
-          <w:lang w:val="en-US"/>
         </w:rPr>
       </w:pPr>
     </w:p>
@@ -303,7 +300,6 @@
         <w:jc w:val="center"/>
         <w:rPr>
           <w:rFonts w:ascii="Arial" w:hAnsi="Arial" w:cs="Arial"/>
-          <w:lang w:val="en-US"/>
         </w:rPr>
       </w:pPr>
     </w:p>
@@ -314,7 +310,6 @@
         <w:jc w:val="center"/>
         <w:rPr>
           <w:rFonts w:ascii="Arial" w:hAnsi="Arial" w:cs="Arial"/>
-          <w:lang w:val="en-US"/>
         </w:rPr>
       </w:pPr>
     </w:p>
@@ -325,7 +320,6 @@
         <w:jc w:val="center"/>
         <w:rPr>
           <w:rFonts w:ascii="Arial" w:hAnsi="Arial" w:cs="Arial"/>
-          <w:lang w:val="en-US"/>
         </w:rPr>
       </w:pPr>
     </w:p>
@@ -336,7 +330,6 @@
         <w:jc w:val="center"/>
         <w:rPr>
           <w:rFonts w:ascii="Arial" w:hAnsi="Arial" w:cs="Arial"/>
-          <w:lang w:val="en-US"/>
         </w:rPr>
       </w:pPr>
     </w:p>
@@ -347,7 +340,6 @@
         <w:jc w:val="center"/>
         <w:rPr>
           <w:rFonts w:ascii="Arial" w:hAnsi="Arial" w:cs="Arial"/>
-          <w:lang w:val="en-US"/>
         </w:rPr>
       </w:pPr>
     </w:p>
@@ -358,7 +350,6 @@
         <w:jc w:val="center"/>
         <w:rPr>
           <w:rFonts w:ascii="Arial" w:hAnsi="Arial" w:cs="Arial"/>
-          <w:lang w:val="en-US"/>
         </w:rPr>
       </w:pPr>
     </w:p>
@@ -369,7 +360,6 @@
         <w:jc w:val="center"/>
         <w:rPr>
           <w:rFonts w:ascii="Arial" w:hAnsi="Arial" w:cs="Arial"/>
-          <w:lang w:val="en-US"/>
         </w:rPr>
       </w:pPr>
     </w:p>
@@ -380,7 +370,6 @@
         <w:jc w:val="center"/>
         <w:rPr>
           <w:rFonts w:ascii="Arial" w:hAnsi="Arial" w:cs="Arial"/>
-          <w:lang w:val="en-US"/>
         </w:rPr>
       </w:pPr>
     </w:p>
@@ -391,7 +380,6 @@
         <w:jc w:val="center"/>
         <w:rPr>
           <w:rFonts w:ascii="Arial" w:hAnsi="Arial" w:cs="Arial"/>
-          <w:lang w:val="en-US"/>
         </w:rPr>
       </w:pPr>
     </w:p>
@@ -402,7 +390,6 @@
         <w:jc w:val="center"/>
         <w:rPr>
           <w:rFonts w:ascii="Arial" w:hAnsi="Arial" w:cs="Arial"/>
-          <w:lang w:val="en-US"/>
         </w:rPr>
       </w:pPr>
     </w:p>
@@ -413,7 +400,6 @@
         <w:jc w:val="center"/>
         <w:rPr>
           <w:rFonts w:ascii="Arial" w:hAnsi="Arial" w:cs="Arial"/>
-          <w:lang w:val="en-US"/>
         </w:rPr>
       </w:pPr>
     </w:p>
@@ -424,7 +410,6 @@
         <w:jc w:val="center"/>
         <w:rPr>
           <w:rFonts w:ascii="Arial" w:hAnsi="Arial" w:cs="Arial"/>
-          <w:lang w:val="en-US"/>
         </w:rPr>
       </w:pPr>
     </w:p>
@@ -435,7 +420,6 @@
         <w:jc w:val="center"/>
         <w:rPr>
           <w:rFonts w:ascii="Arial" w:hAnsi="Arial" w:cs="Arial"/>
-          <w:lang w:val="en-US"/>
         </w:rPr>
       </w:pPr>
     </w:p>
@@ -446,7 +430,6 @@
         <w:jc w:val="center"/>
         <w:rPr>
           <w:rFonts w:ascii="Arial" w:hAnsi="Arial" w:cs="Arial"/>
-          <w:lang w:val="en-US"/>
         </w:rPr>
       </w:pPr>
     </w:p>
@@ -458,7 +441,6 @@
         <w:rPr>
           <w:rFonts w:ascii="Arial" w:hAnsi="Arial" w:cs="Arial"/>
           <w:u w:val="single"/>
-          <w:lang w:val="en-US"/>
         </w:rPr>
       </w:pPr>
     </w:p>
@@ -469,7 +451,6 @@
         <w:jc w:val="center"/>
         <w:rPr>
           <w:rFonts w:ascii="Arial" w:hAnsi="Arial" w:cs="Arial"/>
-          <w:lang w:val="en-US"/>
         </w:rPr>
       </w:pPr>
     </w:p>
@@ -518,9 +499,93 @@
         </w:sectPr>
       </w:pPr>
     </w:p>
+    <w:p>
+      <w:pPr>
+        <w:rPr>
+          <w:rFonts w:ascii="Arial" w:eastAsiaTheme="minorHAnsi" w:hAnsi="Arial" w:cs="Arial"/>
+          <w:sz w:val="24"/>
+        </w:rPr>
+      </w:pPr>
+    </w:p>
+    <w:p>
+      <w:pPr>
+        <w:rPr>
+          <w:rFonts w:ascii="Arial" w:eastAsiaTheme="minorHAnsi" w:hAnsi="Arial" w:cs="Arial"/>
+          <w:bCs/>
+        </w:rPr>
+      </w:pPr>
+      <w:r>
+        <w:rPr>
+          <w:rFonts w:ascii="Arial" w:eastAsiaTheme="minorHAnsi" w:hAnsi="Arial" w:cs="Arial"/>
+          <w:bCs/>
+        </w:rPr>
+        <w:t xml:space="preserve">    </w:t>
+      </w:r>
+    </w:p>
+    <w:p>
+      <w:pPr>
+        <w:jc w:val="center"/>
+        <w:rPr>
+          <w:rFonts w:ascii="Arial" w:eastAsiaTheme="minorHAnsi" w:hAnsi="Arial" w:cs="Arial"/>
+          <w:b/>
+          <w:bCs/>
+          <w:sz w:val="44"/>
+        </w:rPr>
+      </w:pPr>
+      <w:r>
+        <w:rPr>
+          <w:rFonts w:ascii="Arial" w:eastAsiaTheme="minorHAnsi" w:hAnsi="Arial" w:cs="Arial"/>
+          <w:b/>
+          <w:bCs/>
+          <w:sz w:val="44"/>
+        </w:rPr>
+        <w:t>Tabla de Integrantes</w:t>
+      </w:r>
+    </w:p>
+    <w:p>
+      <w:pPr>
+        <w:rPr>
+          <w:rFonts w:ascii="Arial" w:eastAsiaTheme="minorHAnsi" w:hAnsi="Arial" w:cs="Arial"/>
+          <w:bCs/>
+        </w:rPr>
+      </w:pPr>
+    </w:p>
+    <w:p>
+      <w:pPr>
+        <w:rPr>
+          <w:rFonts w:ascii="Arial" w:eastAsiaTheme="minorHAnsi" w:hAnsi="Arial" w:cs="Arial"/>
+          <w:bCs/>
+        </w:rPr>
+      </w:pPr>
+    </w:p>
+    <w:p>
+      <w:pPr>
+        <w:rPr>
+          <w:rFonts w:ascii="Arial" w:eastAsiaTheme="minorHAnsi" w:hAnsi="Arial" w:cs="Arial"/>
+          <w:bCs/>
+        </w:rPr>
+      </w:pPr>
+    </w:p>
+    <w:p>
+      <w:pPr>
+        <w:rPr>
+          <w:rFonts w:ascii="Arial" w:eastAsiaTheme="minorHAnsi" w:hAnsi="Arial" w:cs="Arial"/>
+          <w:bCs/>
+        </w:rPr>
+      </w:pPr>
+    </w:p>
+    <w:p>
+      <w:pPr>
+        <w:rPr>
+          <w:rFonts w:ascii="Arial" w:eastAsiaTheme="minorHAnsi" w:hAnsi="Arial" w:cs="Arial"/>
+          <w:bCs/>
+        </w:rPr>
+      </w:pPr>
+    </w:p>
     <w:tbl>
       <w:tblPr>
         <w:tblStyle w:val="Tablaconcuadrcula"/>
+        <w:tblpPr w:leftFromText="141" w:rightFromText="141" w:vertAnchor="page" w:horzAnchor="margin" w:tblpY="4527"/>
         <w:tblW w:w="0" w:type="auto"/>
         <w:tblLook w:val="04A0" w:firstRow="1" w:lastRow="0" w:firstColumn="1" w:lastColumn="0" w:noHBand="0" w:noVBand="1"/>
       </w:tblPr>
@@ -550,7 +615,6 @@
                 <w:b/>
                 <w:sz w:val="24"/>
               </w:rPr>
-              <w:lastRenderedPageBreak/>
               <w:t xml:space="preserve">Nombre </w:t>
             </w:r>
             <w:r>
@@ -632,7 +696,14 @@
                 <w:rFonts w:ascii="Arial" w:eastAsiaTheme="minorHAnsi" w:hAnsi="Arial" w:cs="Arial"/>
                 <w:sz w:val="24"/>
               </w:rPr>
-              <w:t>Scrum Master</w:t>
+              <w:t xml:space="preserve">Scrum </w:t>
+            </w:r>
+            <w:r>
+              <w:rPr>
+                <w:rFonts w:ascii="Arial" w:eastAsiaTheme="minorHAnsi" w:hAnsi="Arial" w:cs="Arial"/>
+                <w:sz w:val="24"/>
+              </w:rPr>
+              <w:t>Master</w:t>
             </w:r>
           </w:p>
         </w:tc>
@@ -656,14 +727,7 @@
                 <w:rFonts w:ascii="Arial" w:eastAsiaTheme="minorHAnsi" w:hAnsi="Arial" w:cs="Arial"/>
                 <w:sz w:val="24"/>
               </w:rPr>
-              <w:t>Angel Gahel</w:t>
-            </w:r>
-            <w:r>
-              <w:rPr>
-                <w:rFonts w:ascii="Arial" w:eastAsiaTheme="minorHAnsi" w:hAnsi="Arial" w:cs="Arial"/>
-                <w:sz w:val="24"/>
-              </w:rPr>
-              <w:t xml:space="preserve"> Padilla Pacheco</w:t>
+              <w:t>Angel Gahel Padilla Pacheco</w:t>
             </w:r>
           </w:p>
         </w:tc>
@@ -893,6 +957,13 @@
                 <w:sz w:val="24"/>
               </w:rPr>
             </w:pPr>
+            <w:r>
+              <w:rPr>
+                <w:rFonts w:ascii="Arial" w:eastAsiaTheme="minorHAnsi" w:hAnsi="Arial" w:cs="Arial"/>
+                <w:sz w:val="24"/>
+              </w:rPr>
+              <w:t>Osman Emmanuell Veliz Guzmán</w:t>
+            </w:r>
           </w:p>
         </w:tc>
         <w:tc>
@@ -908,6 +979,13 @@
                 <w:sz w:val="24"/>
               </w:rPr>
             </w:pPr>
+            <w:r>
+              <w:rPr>
+                <w:rFonts w:ascii="Arial" w:eastAsiaTheme="minorHAnsi" w:hAnsi="Arial" w:cs="Arial"/>
+                <w:sz w:val="24"/>
+              </w:rPr>
+              <w:t>Programador</w:t>
+            </w:r>
           </w:p>
         </w:tc>
       </w:tr>
@@ -925,6 +1003,13 @@
                 <w:sz w:val="24"/>
               </w:rPr>
             </w:pPr>
+            <w:r>
+              <w:rPr>
+                <w:rFonts w:ascii="Arial" w:eastAsiaTheme="minorHAnsi" w:hAnsi="Arial" w:cs="Arial"/>
+                <w:sz w:val="24"/>
+              </w:rPr>
+              <w:t>Franklin Stev Paiz Chavez</w:t>
+            </w:r>
           </w:p>
         </w:tc>
         <w:tc>
@@ -940,6 +1025,13 @@
                 <w:sz w:val="24"/>
               </w:rPr>
             </w:pPr>
+            <w:r>
+              <w:rPr>
+                <w:rFonts w:ascii="Arial" w:eastAsiaTheme="minorHAnsi" w:hAnsi="Arial" w:cs="Arial"/>
+                <w:sz w:val="24"/>
+              </w:rPr>
+              <w:t>Programador</w:t>
+            </w:r>
           </w:p>
         </w:tc>
       </w:tr>
@@ -958,6 +1050,14 @@
                 <w:szCs w:val="24"/>
               </w:rPr>
             </w:pPr>
+            <w:r>
+              <w:rPr>
+                <w:rFonts w:ascii="Arial" w:eastAsiaTheme="minorEastAsia" w:hAnsi="Arial" w:cs="Arial"/>
+                <w:sz w:val="24"/>
+                <w:szCs w:val="24"/>
+              </w:rPr>
+              <w:t>Angel Gabriel Ernesto Grijalva Castro</w:t>
+            </w:r>
           </w:p>
         </w:tc>
         <w:tc>
@@ -974,6 +1074,14 @@
                 <w:szCs w:val="24"/>
               </w:rPr>
             </w:pPr>
+            <w:r>
+              <w:rPr>
+                <w:rFonts w:ascii="Arial" w:eastAsiaTheme="minorEastAsia" w:hAnsi="Arial" w:cs="Arial"/>
+                <w:sz w:val="24"/>
+                <w:szCs w:val="24"/>
+              </w:rPr>
+              <w:t>Programador</w:t>
+            </w:r>
           </w:p>
         </w:tc>
       </w:tr>
@@ -991,6 +1099,13 @@
                 <w:sz w:val="24"/>
               </w:rPr>
             </w:pPr>
+            <w:r>
+              <w:rPr>
+                <w:rFonts w:ascii="Arial" w:eastAsiaTheme="minorHAnsi" w:hAnsi="Arial" w:cs="Arial"/>
+                <w:sz w:val="24"/>
+              </w:rPr>
+              <w:t>Benjamin Elí Argueta Caal</w:t>
+            </w:r>
           </w:p>
         </w:tc>
         <w:tc>
@@ -1006,6 +1121,13 @@
                 <w:sz w:val="24"/>
               </w:rPr>
             </w:pPr>
+            <w:r>
+              <w:rPr>
+                <w:rFonts w:ascii="Arial" w:eastAsiaTheme="minorHAnsi" w:hAnsi="Arial" w:cs="Arial"/>
+                <w:sz w:val="24"/>
+              </w:rPr>
+              <w:t>Programador</w:t>
+            </w:r>
           </w:p>
         </w:tc>
       </w:tr>
@@ -1023,6 +1145,13 @@
                 <w:sz w:val="24"/>
               </w:rPr>
             </w:pPr>
+            <w:r>
+              <w:rPr>
+                <w:rFonts w:ascii="Arial" w:eastAsiaTheme="minorHAnsi" w:hAnsi="Arial" w:cs="Arial"/>
+                <w:sz w:val="24"/>
+              </w:rPr>
+              <w:t>Carlos Alejandro Patal Choc</w:t>
+            </w:r>
           </w:p>
         </w:tc>
         <w:tc>
@@ -1036,40 +1165,16 @@
               <w:rPr>
                 <w:rFonts w:ascii="Arial" w:eastAsiaTheme="minorHAnsi" w:hAnsi="Arial" w:cs="Arial"/>
                 <w:sz w:val="24"/>
+                <w:u w:val="single"/>
               </w:rPr>
             </w:pPr>
-          </w:p>
-        </w:tc>
-      </w:tr>
-      <w:tr>
-        <w:tc>
-          <w:tcPr>
-            <w:tcW w:w="5395" w:type="dxa"/>
-          </w:tcPr>
-          <w:p>
-            <w:pPr>
-              <w:spacing w:after="0" w:line="240" w:lineRule="auto"/>
-              <w:jc w:val="center"/>
+            <w:r>
               <w:rPr>
                 <w:rFonts w:ascii="Arial" w:eastAsiaTheme="minorHAnsi" w:hAnsi="Arial" w:cs="Arial"/>
                 <w:sz w:val="24"/>
               </w:rPr>
-            </w:pPr>
-          </w:p>
-        </w:tc>
-        <w:tc>
-          <w:tcPr>
-            <w:tcW w:w="5395" w:type="dxa"/>
-          </w:tcPr>
-          <w:p>
-            <w:pPr>
-              <w:spacing w:after="0" w:line="240" w:lineRule="auto"/>
-              <w:jc w:val="center"/>
-              <w:rPr>
-                <w:rFonts w:ascii="Arial" w:eastAsiaTheme="minorHAnsi" w:hAnsi="Arial" w:cs="Arial"/>
-                <w:sz w:val="24"/>
-              </w:rPr>
-            </w:pPr>
+              <w:t>Programador</w:t>
+            </w:r>
           </w:p>
         </w:tc>
       </w:tr>
@@ -1078,7 +1183,7 @@
       <w:pPr>
         <w:rPr>
           <w:rFonts w:ascii="Arial" w:eastAsiaTheme="minorHAnsi" w:hAnsi="Arial" w:cs="Arial"/>
-          <w:sz w:val="24"/>
+          <w:bCs/>
         </w:rPr>
       </w:pPr>
     </w:p>
@@ -1087,17 +1192,3649 @@
         <w:rPr>
           <w:rFonts w:ascii="Arial" w:eastAsiaTheme="minorHAnsi" w:hAnsi="Arial" w:cs="Arial"/>
           <w:bCs/>
-        </w:rPr>
-      </w:pPr>
-      <w:r>
+          <w:u w:val="single"/>
+        </w:rPr>
+      </w:pPr>
+    </w:p>
+    <w:p>
+      <w:pPr>
         <w:rPr>
           <w:rFonts w:ascii="Arial" w:eastAsiaTheme="minorHAnsi" w:hAnsi="Arial" w:cs="Arial"/>
           <w:bCs/>
-        </w:rPr>
-        <w:t xml:space="preserve">    </w:t>
+          <w:u w:val="single"/>
+        </w:rPr>
+      </w:pPr>
+    </w:p>
+    <w:p>
+      <w:pPr>
+        <w:rPr>
+          <w:rFonts w:ascii="Arial" w:eastAsiaTheme="minorHAnsi" w:hAnsi="Arial" w:cs="Arial"/>
+          <w:bCs/>
+          <w:u w:val="single"/>
+        </w:rPr>
+      </w:pPr>
+    </w:p>
+    <w:p>
+      <w:pPr>
+        <w:rPr>
+          <w:rFonts w:ascii="Arial" w:eastAsiaTheme="minorHAnsi" w:hAnsi="Arial" w:cs="Arial"/>
+          <w:bCs/>
+          <w:u w:val="single"/>
+        </w:rPr>
+      </w:pPr>
+    </w:p>
+    <w:p>
+      <w:pPr>
+        <w:rPr>
+          <w:rFonts w:ascii="Arial" w:eastAsiaTheme="minorHAnsi" w:hAnsi="Arial" w:cs="Arial"/>
+          <w:bCs/>
+          <w:u w:val="single"/>
+        </w:rPr>
+      </w:pPr>
+    </w:p>
+    <w:p>
+      <w:pPr>
+        <w:rPr>
+          <w:rFonts w:ascii="Arial" w:eastAsiaTheme="minorHAnsi" w:hAnsi="Arial" w:cs="Arial"/>
+          <w:bCs/>
+          <w:u w:val="single"/>
+        </w:rPr>
+      </w:pPr>
+    </w:p>
+    <w:p>
+      <w:pPr>
+        <w:rPr>
+          <w:rFonts w:ascii="Arial" w:eastAsiaTheme="minorHAnsi" w:hAnsi="Arial" w:cs="Arial"/>
+          <w:bCs/>
+          <w:u w:val="single"/>
+        </w:rPr>
+      </w:pPr>
+    </w:p>
+    <w:p>
+      <w:pPr>
+        <w:rPr>
+          <w:rFonts w:ascii="Arial" w:eastAsiaTheme="minorHAnsi" w:hAnsi="Arial" w:cs="Arial"/>
+          <w:bCs/>
+          <w:u w:val="single"/>
+        </w:rPr>
+      </w:pPr>
+    </w:p>
+    <w:p>
+      <w:pPr>
+        <w:rPr>
+          <w:rFonts w:ascii="Arial" w:eastAsiaTheme="minorHAnsi" w:hAnsi="Arial" w:cs="Arial"/>
+          <w:bCs/>
+          <w:u w:val="single"/>
+        </w:rPr>
+      </w:pPr>
+    </w:p>
+    <w:p>
+      <w:pPr>
+        <w:rPr>
+          <w:rFonts w:ascii="Arial" w:eastAsiaTheme="minorHAnsi" w:hAnsi="Arial" w:cs="Arial"/>
+          <w:bCs/>
+          <w:u w:val="single"/>
+        </w:rPr>
+      </w:pPr>
+    </w:p>
+    <w:p>
+      <w:pPr>
+        <w:rPr>
+          <w:rFonts w:ascii="Arial" w:eastAsiaTheme="minorHAnsi" w:hAnsi="Arial" w:cs="Arial"/>
+          <w:bCs/>
+          <w:u w:val="single"/>
+        </w:rPr>
+      </w:pPr>
+    </w:p>
+    <w:p>
+      <w:pPr>
+        <w:rPr>
+          <w:rFonts w:ascii="Arial" w:eastAsiaTheme="minorHAnsi" w:hAnsi="Arial" w:cs="Arial"/>
+          <w:bCs/>
+          <w:u w:val="single"/>
+        </w:rPr>
+      </w:pPr>
+    </w:p>
+    <w:p>
+      <w:pPr>
+        <w:rPr>
+          <w:rFonts w:ascii="Arial" w:eastAsiaTheme="minorHAnsi" w:hAnsi="Arial" w:cs="Arial"/>
+          <w:bCs/>
+          <w:u w:val="single"/>
+        </w:rPr>
+      </w:pPr>
+    </w:p>
+    <w:p>
+      <w:pPr>
+        <w:rPr>
+          <w:rFonts w:ascii="Arial" w:eastAsiaTheme="minorHAnsi" w:hAnsi="Arial" w:cs="Arial"/>
+          <w:bCs/>
+          <w:u w:val="single"/>
+        </w:rPr>
+      </w:pPr>
+    </w:p>
+    <w:p>
+      <w:pPr>
+        <w:rPr>
+          <w:rFonts w:ascii="Arial" w:eastAsiaTheme="minorHAnsi" w:hAnsi="Arial" w:cs="Arial"/>
+          <w:bCs/>
+          <w:u w:val="single"/>
+        </w:rPr>
+      </w:pPr>
+    </w:p>
+    <w:p>
+      <w:pPr>
+        <w:rPr>
+          <w:rFonts w:ascii="Arial" w:eastAsiaTheme="minorHAnsi" w:hAnsi="Arial" w:cs="Arial"/>
+          <w:bCs/>
+          <w:u w:val="single"/>
+        </w:rPr>
+      </w:pPr>
+    </w:p>
+    <w:p>
+      <w:pPr>
+        <w:jc w:val="center"/>
+        <w:rPr>
+          <w:rFonts w:ascii="Arial" w:eastAsiaTheme="minorHAnsi" w:hAnsi="Arial" w:cs="Arial"/>
+          <w:b/>
+          <w:sz w:val="44"/>
+          <w:szCs w:val="44"/>
+        </w:rPr>
+      </w:pPr>
+      <w:r>
+        <w:rPr>
+          <w:rFonts w:ascii="Arial" w:eastAsiaTheme="minorHAnsi" w:hAnsi="Arial" w:cs="Arial"/>
+          <w:b/>
+          <w:sz w:val="44"/>
+          <w:szCs w:val="44"/>
+        </w:rPr>
+        <w:t>Historias de Usuario</w:t>
+      </w:r>
+    </w:p>
+    <w:p>
+      <w:pPr>
+        <w:jc w:val="center"/>
+        <w:rPr>
+          <w:rFonts w:ascii="Arial" w:eastAsiaTheme="minorHAnsi" w:hAnsi="Arial" w:cs="Arial"/>
+          <w:b/>
+          <w:sz w:val="44"/>
+          <w:szCs w:val="44"/>
+        </w:rPr>
+      </w:pPr>
+    </w:p>
+    <w:p>
+      <w:pPr>
+        <w:jc w:val="center"/>
+        <w:rPr>
+          <w:rFonts w:ascii="Arial" w:eastAsiaTheme="minorHAnsi" w:hAnsi="Arial" w:cs="Arial"/>
+          <w:b/>
+          <w:sz w:val="44"/>
+          <w:szCs w:val="44"/>
+        </w:rPr>
+      </w:pPr>
+    </w:p>
+    <w:p>
+      <w:pPr>
+        <w:rPr>
+          <w:rFonts w:ascii="Arial" w:eastAsiaTheme="minorHAnsi" w:hAnsi="Arial" w:cs="Arial"/>
+          <w:b/>
+          <w:sz w:val="24"/>
+          <w:szCs w:val="20"/>
+        </w:rPr>
+      </w:pPr>
+      <w:r>
+        <w:rPr>
+          <w:rFonts w:ascii="Arial" w:eastAsiaTheme="minorHAnsi" w:hAnsi="Arial" w:cs="Arial"/>
+          <w:b/>
+          <w:sz w:val="24"/>
+          <w:szCs w:val="20"/>
+        </w:rPr>
+        <w:t>Tupla: Usuario</w:t>
+      </w:r>
+    </w:p>
+    <w:p>
+      <w:pPr>
+        <w:spacing w:before="100" w:beforeAutospacing="1" w:after="100" w:afterAutospacing="1" w:line="240" w:lineRule="auto"/>
+        <w:rPr>
+          <w:rFonts w:ascii="Arial" w:eastAsia="Times New Roman" w:hAnsi="Arial" w:cs="Arial"/>
+          <w:szCs w:val="24"/>
+          <w:lang w:eastAsia="es-GT"/>
+        </w:rPr>
+      </w:pPr>
+      <w:r>
+        <w:rPr>
+          <w:rFonts w:ascii="Arial" w:eastAsia="Times New Roman" w:hAnsi="Arial" w:cs="Arial"/>
+          <w:bCs/>
+          <w:szCs w:val="24"/>
+          <w:lang w:eastAsia="es-GT"/>
+        </w:rPr>
+        <w:t>HUKC-001</w:t>
+      </w:r>
+      <w:r>
+        <w:rPr>
+          <w:rFonts w:ascii="Arial" w:eastAsia="Times New Roman" w:hAnsi="Arial" w:cs="Arial"/>
+          <w:b/>
+          <w:bCs/>
+          <w:szCs w:val="24"/>
+          <w:lang w:eastAsia="es-GT"/>
+        </w:rPr>
+        <w:t xml:space="preserve"> Registro de Nuevo Usuario</w:t>
+      </w:r>
+    </w:p>
+    <w:p>
+      <w:pPr>
+        <w:spacing w:before="100" w:beforeAutospacing="1" w:after="100" w:afterAutospacing="1" w:line="240" w:lineRule="auto"/>
+        <w:rPr>
+          <w:rFonts w:ascii="Arial" w:eastAsia="Times New Roman" w:hAnsi="Arial" w:cs="Arial"/>
+          <w:szCs w:val="24"/>
+          <w:lang w:eastAsia="es-GT"/>
+        </w:rPr>
+      </w:pPr>
+      <w:r>
+        <w:rPr>
+          <w:rFonts w:ascii="Arial" w:eastAsia="Times New Roman" w:hAnsi="Arial" w:cs="Arial"/>
+          <w:b/>
+          <w:szCs w:val="24"/>
+          <w:lang w:eastAsia="es-GT"/>
+        </w:rPr>
+        <w:t>Como</w:t>
+      </w:r>
+      <w:r>
+        <w:rPr>
+          <w:rFonts w:ascii="Arial" w:eastAsia="Times New Roman" w:hAnsi="Arial" w:cs="Arial"/>
+          <w:szCs w:val="24"/>
+          <w:lang w:eastAsia="es-GT"/>
+        </w:rPr>
+        <w:t xml:space="preserve">: Un nuevo usuario (anfitrión o invitado) </w:t>
+      </w:r>
+    </w:p>
+    <w:p>
+      <w:pPr>
+        <w:spacing w:before="100" w:beforeAutospacing="1" w:after="100" w:afterAutospacing="1" w:line="240" w:lineRule="auto"/>
+        <w:rPr>
+          <w:rFonts w:ascii="Arial" w:eastAsia="Times New Roman" w:hAnsi="Arial" w:cs="Arial"/>
+          <w:szCs w:val="24"/>
+          <w:lang w:eastAsia="es-GT"/>
+        </w:rPr>
+      </w:pPr>
+      <w:r>
+        <w:rPr>
+          <w:rFonts w:ascii="Arial" w:eastAsia="Times New Roman" w:hAnsi="Arial" w:cs="Arial"/>
+          <w:b/>
+          <w:szCs w:val="24"/>
+          <w:lang w:eastAsia="es-GT"/>
+        </w:rPr>
+        <w:t>Quiero</w:t>
+      </w:r>
+      <w:r>
+        <w:rPr>
+          <w:rFonts w:ascii="Arial" w:eastAsia="Times New Roman" w:hAnsi="Arial" w:cs="Arial"/>
+          <w:szCs w:val="24"/>
+          <w:lang w:eastAsia="es-GT"/>
+        </w:rPr>
+        <w:t xml:space="preserve">: Registrarme en el sistema proporcionando mi nombre, correo, teléfono, fecha de nacimiento y tipo de usuario (anfitrión o invitado) </w:t>
+      </w:r>
+    </w:p>
+    <w:p>
+      <w:pPr>
+        <w:spacing w:before="100" w:beforeAutospacing="1" w:after="100" w:afterAutospacing="1" w:line="240" w:lineRule="auto"/>
+        <w:rPr>
+          <w:rFonts w:ascii="Arial" w:eastAsia="Times New Roman" w:hAnsi="Arial" w:cs="Arial"/>
+          <w:szCs w:val="24"/>
+          <w:lang w:eastAsia="es-GT"/>
+        </w:rPr>
+      </w:pPr>
+      <w:r>
+        <w:rPr>
+          <w:rFonts w:ascii="Arial" w:eastAsia="Times New Roman" w:hAnsi="Arial" w:cs="Arial"/>
+          <w:b/>
+          <w:szCs w:val="24"/>
+          <w:lang w:eastAsia="es-GT"/>
+        </w:rPr>
+        <w:t>Para</w:t>
+      </w:r>
+      <w:r>
+        <w:rPr>
+          <w:rFonts w:ascii="Arial" w:eastAsia="Times New Roman" w:hAnsi="Arial" w:cs="Arial"/>
+          <w:szCs w:val="24"/>
+          <w:lang w:eastAsia="es-GT"/>
+        </w:rPr>
+        <w:t>: Poder utilizar los servicios de la p</w:t>
+      </w:r>
+      <w:r>
+        <w:rPr>
+          <w:rFonts w:ascii="Arial" w:eastAsia="Times New Roman" w:hAnsi="Arial" w:cs="Arial"/>
+          <w:szCs w:val="24"/>
+          <w:lang w:eastAsia="es-GT"/>
+        </w:rPr>
+        <w:t>lataforma, ya sea para ofrecer propiedades o para reservarlas.</w:t>
+      </w:r>
+    </w:p>
+    <w:p>
+      <w:pPr>
+        <w:spacing w:before="100" w:beforeAutospacing="1" w:after="100" w:afterAutospacing="1" w:line="240" w:lineRule="auto"/>
+        <w:rPr>
+          <w:rFonts w:ascii="Arial" w:eastAsia="Times New Roman" w:hAnsi="Arial" w:cs="Arial"/>
+          <w:szCs w:val="24"/>
+          <w:lang w:eastAsia="es-GT"/>
+        </w:rPr>
+      </w:pPr>
+    </w:p>
+    <w:p>
+      <w:pPr>
+        <w:spacing w:before="100" w:beforeAutospacing="1" w:after="100" w:afterAutospacing="1" w:line="240" w:lineRule="auto"/>
+        <w:rPr>
+          <w:rFonts w:ascii="Arial" w:eastAsia="Times New Roman" w:hAnsi="Arial" w:cs="Arial"/>
+          <w:szCs w:val="24"/>
+          <w:lang w:eastAsia="es-GT"/>
+        </w:rPr>
+      </w:pPr>
+      <w:r>
+        <w:rPr>
+          <w:rFonts w:ascii="Arial" w:eastAsia="Times New Roman" w:hAnsi="Arial" w:cs="Arial"/>
+          <w:szCs w:val="24"/>
+          <w:lang w:eastAsia="es-GT"/>
+        </w:rPr>
+        <w:t>HUKC-002</w:t>
+      </w:r>
+      <w:r>
+        <w:rPr>
+          <w:rFonts w:ascii="Arial" w:eastAsia="Times New Roman" w:hAnsi="Arial" w:cs="Arial"/>
+          <w:b/>
+          <w:bCs/>
+          <w:szCs w:val="24"/>
+          <w:lang w:eastAsia="es-GT"/>
+        </w:rPr>
+        <w:t xml:space="preserve"> Edición de Perfil de Usuario</w:t>
+      </w:r>
+    </w:p>
+    <w:p>
+      <w:pPr>
+        <w:spacing w:before="100" w:beforeAutospacing="1" w:after="100" w:afterAutospacing="1" w:line="240" w:lineRule="auto"/>
+        <w:rPr>
+          <w:rFonts w:ascii="Arial" w:eastAsia="Times New Roman" w:hAnsi="Arial" w:cs="Arial"/>
+          <w:szCs w:val="24"/>
+          <w:lang w:eastAsia="es-GT"/>
+        </w:rPr>
+      </w:pPr>
+      <w:r>
+        <w:rPr>
+          <w:rFonts w:ascii="Arial" w:eastAsia="Times New Roman" w:hAnsi="Arial" w:cs="Arial"/>
+          <w:b/>
+          <w:szCs w:val="24"/>
+          <w:lang w:eastAsia="es-GT"/>
+        </w:rPr>
+        <w:t>Como</w:t>
+      </w:r>
+      <w:r>
+        <w:rPr>
+          <w:rFonts w:ascii="Arial" w:eastAsia="Times New Roman" w:hAnsi="Arial" w:cs="Arial"/>
+          <w:szCs w:val="24"/>
+          <w:lang w:eastAsia="es-GT"/>
+        </w:rPr>
+        <w:t>: Un usuario registrado</w:t>
+      </w:r>
+    </w:p>
+    <w:p>
+      <w:pPr>
+        <w:spacing w:before="100" w:beforeAutospacing="1" w:after="100" w:afterAutospacing="1" w:line="240" w:lineRule="auto"/>
+        <w:rPr>
+          <w:rFonts w:ascii="Arial" w:eastAsia="Times New Roman" w:hAnsi="Arial" w:cs="Arial"/>
+          <w:szCs w:val="24"/>
+          <w:lang w:eastAsia="es-GT"/>
+        </w:rPr>
+      </w:pPr>
+      <w:r>
+        <w:rPr>
+          <w:rFonts w:ascii="Arial" w:eastAsia="Times New Roman" w:hAnsi="Arial" w:cs="Arial"/>
+          <w:szCs w:val="24"/>
+          <w:lang w:eastAsia="es-GT"/>
+        </w:rPr>
+        <w:t xml:space="preserve"> </w:t>
+      </w:r>
+      <w:r>
+        <w:rPr>
+          <w:rFonts w:ascii="Arial" w:eastAsia="Times New Roman" w:hAnsi="Arial" w:cs="Arial"/>
+          <w:b/>
+          <w:szCs w:val="24"/>
+          <w:lang w:eastAsia="es-GT"/>
+        </w:rPr>
+        <w:t>Quiero</w:t>
+      </w:r>
+      <w:r>
+        <w:rPr>
+          <w:rFonts w:ascii="Arial" w:eastAsia="Times New Roman" w:hAnsi="Arial" w:cs="Arial"/>
+          <w:szCs w:val="24"/>
+          <w:lang w:eastAsia="es-GT"/>
+        </w:rPr>
+        <w:t xml:space="preserve">: Poder editar mi nombre, correo, teléfono, fecha de nacimiento, tipo de usuario y subir imágenes a mi perfil </w:t>
+      </w:r>
+    </w:p>
+    <w:p>
+      <w:pPr>
+        <w:spacing w:before="100" w:beforeAutospacing="1" w:after="100" w:afterAutospacing="1" w:line="240" w:lineRule="auto"/>
+        <w:rPr>
+          <w:rFonts w:ascii="Arial" w:eastAsia="Times New Roman" w:hAnsi="Arial" w:cs="Arial"/>
+          <w:szCs w:val="24"/>
+          <w:lang w:eastAsia="es-GT"/>
+        </w:rPr>
+      </w:pPr>
+      <w:r>
+        <w:rPr>
+          <w:rFonts w:ascii="Arial" w:eastAsia="Times New Roman" w:hAnsi="Arial" w:cs="Arial"/>
+          <w:b/>
+          <w:szCs w:val="24"/>
+          <w:lang w:eastAsia="es-GT"/>
+        </w:rPr>
+        <w:t>Para</w:t>
+      </w:r>
+      <w:r>
+        <w:rPr>
+          <w:rFonts w:ascii="Arial" w:eastAsia="Times New Roman" w:hAnsi="Arial" w:cs="Arial"/>
+          <w:szCs w:val="24"/>
+          <w:lang w:eastAsia="es-GT"/>
+        </w:rPr>
+        <w:t>: Ma</w:t>
+      </w:r>
+      <w:r>
+        <w:rPr>
+          <w:rFonts w:ascii="Arial" w:eastAsia="Times New Roman" w:hAnsi="Arial" w:cs="Arial"/>
+          <w:szCs w:val="24"/>
+          <w:lang w:eastAsia="es-GT"/>
+        </w:rPr>
+        <w:t>ntener mi información actualizada y personalizada en la plataforma.</w:t>
+      </w:r>
+    </w:p>
+    <w:p>
+      <w:pPr>
+        <w:spacing w:before="100" w:beforeAutospacing="1" w:after="100" w:afterAutospacing="1" w:line="240" w:lineRule="auto"/>
+        <w:ind w:left="708" w:hanging="708"/>
+        <w:rPr>
+          <w:rFonts w:ascii="Arial" w:eastAsia="Times New Roman" w:hAnsi="Arial" w:cs="Arial"/>
+          <w:sz w:val="24"/>
+          <w:szCs w:val="24"/>
+          <w:lang w:eastAsia="es-GT"/>
+        </w:rPr>
+      </w:pPr>
+    </w:p>
+    <w:p>
+      <w:pPr>
+        <w:spacing w:before="100" w:beforeAutospacing="1" w:after="100" w:afterAutospacing="1" w:line="240" w:lineRule="auto"/>
+        <w:rPr>
+          <w:rFonts w:ascii="Arial" w:eastAsia="Times New Roman" w:hAnsi="Arial" w:cs="Arial"/>
+          <w:szCs w:val="24"/>
+          <w:lang w:eastAsia="es-GT"/>
+        </w:rPr>
+      </w:pPr>
+      <w:r>
+        <w:rPr>
+          <w:rFonts w:ascii="Arial" w:eastAsia="Times New Roman" w:hAnsi="Arial" w:cs="Arial"/>
+          <w:szCs w:val="24"/>
+          <w:lang w:eastAsia="es-GT"/>
+        </w:rPr>
+        <w:t>HUKC-003</w:t>
+      </w:r>
+      <w:r>
+        <w:rPr>
+          <w:rFonts w:ascii="Arial" w:eastAsia="Times New Roman" w:hAnsi="Arial" w:cs="Arial"/>
+          <w:b/>
+          <w:bCs/>
+          <w:szCs w:val="24"/>
+          <w:lang w:eastAsia="es-GT"/>
+        </w:rPr>
+        <w:t xml:space="preserve"> Visualización de Perfil de Usuario</w:t>
+      </w:r>
+    </w:p>
+    <w:p>
+      <w:pPr>
+        <w:spacing w:before="100" w:beforeAutospacing="1" w:after="100" w:afterAutospacing="1" w:line="240" w:lineRule="auto"/>
+        <w:rPr>
+          <w:rFonts w:ascii="Arial" w:eastAsia="Times New Roman" w:hAnsi="Arial" w:cs="Arial"/>
+          <w:szCs w:val="24"/>
+          <w:lang w:eastAsia="es-GT"/>
+        </w:rPr>
+      </w:pPr>
+      <w:r>
+        <w:rPr>
+          <w:rFonts w:ascii="Arial" w:eastAsia="Times New Roman" w:hAnsi="Arial" w:cs="Arial"/>
+          <w:b/>
+          <w:szCs w:val="24"/>
+          <w:lang w:eastAsia="es-GT"/>
+        </w:rPr>
+        <w:t>Como</w:t>
+      </w:r>
+      <w:r>
+        <w:rPr>
+          <w:rFonts w:ascii="Arial" w:eastAsia="Times New Roman" w:hAnsi="Arial" w:cs="Arial"/>
+          <w:szCs w:val="24"/>
+          <w:lang w:eastAsia="es-GT"/>
+        </w:rPr>
+        <w:t>: Un usuario (o un empleado del área con permisos)</w:t>
+      </w:r>
+    </w:p>
+    <w:p>
+      <w:pPr>
+        <w:spacing w:before="100" w:beforeAutospacing="1" w:after="100" w:afterAutospacing="1" w:line="240" w:lineRule="auto"/>
+        <w:rPr>
+          <w:rFonts w:ascii="Arial" w:eastAsia="Times New Roman" w:hAnsi="Arial" w:cs="Arial"/>
+          <w:szCs w:val="24"/>
+          <w:lang w:eastAsia="es-GT"/>
+        </w:rPr>
+      </w:pPr>
+      <w:r>
+        <w:rPr>
+          <w:rFonts w:ascii="Arial" w:eastAsia="Times New Roman" w:hAnsi="Arial" w:cs="Arial"/>
+          <w:szCs w:val="24"/>
+          <w:lang w:eastAsia="es-GT"/>
+        </w:rPr>
+        <w:t xml:space="preserve"> </w:t>
+      </w:r>
+      <w:r>
+        <w:rPr>
+          <w:rFonts w:ascii="Arial" w:eastAsia="Times New Roman" w:hAnsi="Arial" w:cs="Arial"/>
+          <w:b/>
+          <w:szCs w:val="24"/>
+          <w:lang w:eastAsia="es-GT"/>
+        </w:rPr>
+        <w:t>Quiero</w:t>
+      </w:r>
+      <w:r>
+        <w:rPr>
+          <w:rFonts w:ascii="Arial" w:eastAsia="Times New Roman" w:hAnsi="Arial" w:cs="Arial"/>
+          <w:szCs w:val="24"/>
+          <w:lang w:eastAsia="es-GT"/>
+        </w:rPr>
+        <w:t>: Poder ver el perfil de un usuario, incluyendo su nombre, correo, teléfono, fech</w:t>
+      </w:r>
+      <w:r>
+        <w:rPr>
+          <w:rFonts w:ascii="Arial" w:eastAsia="Times New Roman" w:hAnsi="Arial" w:cs="Arial"/>
+          <w:szCs w:val="24"/>
+          <w:lang w:eastAsia="es-GT"/>
+        </w:rPr>
+        <w:t>a de nacimiento, tipo de usuario y sus imágenes</w:t>
+      </w:r>
+    </w:p>
+    <w:p>
+      <w:pPr>
+        <w:spacing w:before="100" w:beforeAutospacing="1" w:after="100" w:afterAutospacing="1" w:line="240" w:lineRule="auto"/>
+        <w:rPr>
+          <w:rFonts w:ascii="Arial" w:eastAsia="Times New Roman" w:hAnsi="Arial" w:cs="Arial"/>
+          <w:szCs w:val="24"/>
+          <w:lang w:eastAsia="es-GT"/>
+        </w:rPr>
+      </w:pPr>
+      <w:r>
+        <w:rPr>
+          <w:rFonts w:ascii="Arial" w:eastAsia="Times New Roman" w:hAnsi="Arial" w:cs="Arial"/>
+          <w:szCs w:val="24"/>
+          <w:lang w:eastAsia="es-GT"/>
+        </w:rPr>
+        <w:t xml:space="preserve"> </w:t>
+      </w:r>
+      <w:r>
+        <w:rPr>
+          <w:rFonts w:ascii="Arial" w:eastAsia="Times New Roman" w:hAnsi="Arial" w:cs="Arial"/>
+          <w:b/>
+          <w:szCs w:val="24"/>
+          <w:lang w:eastAsia="es-GT"/>
+        </w:rPr>
+        <w:t>Para</w:t>
+      </w:r>
+      <w:r>
+        <w:rPr>
+          <w:rFonts w:ascii="Arial" w:eastAsia="Times New Roman" w:hAnsi="Arial" w:cs="Arial"/>
+          <w:szCs w:val="24"/>
+          <w:lang w:eastAsia="es-GT"/>
+        </w:rPr>
+        <w:t>: Obtener información relevante sobre un usuario específico en la plataforma.</w:t>
+      </w:r>
+    </w:p>
+    <w:p>
+      <w:pPr>
+        <w:spacing w:before="100" w:beforeAutospacing="1" w:after="100" w:afterAutospacing="1" w:line="240" w:lineRule="auto"/>
+        <w:rPr>
+          <w:rFonts w:ascii="Arial" w:eastAsia="Times New Roman" w:hAnsi="Arial" w:cs="Arial"/>
+          <w:szCs w:val="24"/>
+          <w:lang w:eastAsia="es-GT"/>
+        </w:rPr>
+      </w:pPr>
+    </w:p>
+    <w:p>
+      <w:pPr>
+        <w:rPr>
+          <w:b/>
+        </w:rPr>
+      </w:pPr>
+      <w:r>
+        <w:rPr>
+          <w:b/>
+        </w:rPr>
+        <w:t>TUPLA:Servicios</w:t>
+      </w:r>
+    </w:p>
+    <w:p>
+      <w:pPr>
+        <w:rPr>
+          <w:b/>
+        </w:rPr>
+      </w:pPr>
+      <w:r>
+        <w:t>HUJC-004</w:t>
+      </w:r>
+    </w:p>
+    <w:p>
+      <w:pPr>
+        <w:pStyle w:val="paragraph"/>
+        <w:spacing w:before="0" w:beforeAutospacing="0" w:after="0" w:afterAutospacing="0"/>
+        <w:textAlignment w:val="baseline"/>
+        <w:rPr>
+          <w:rStyle w:val="eop"/>
+          <w:rFonts w:ascii="Calibri" w:eastAsia="MS Mincho" w:hAnsi="Calibri" w:cs="Calibri"/>
+          <w:sz w:val="22"/>
+          <w:szCs w:val="22"/>
+        </w:rPr>
+      </w:pPr>
+      <w:r>
+        <w:rPr>
+          <w:rStyle w:val="normaltextrun"/>
+          <w:rFonts w:ascii="Calibri" w:hAnsi="Calibri" w:cs="Calibri"/>
+          <w:sz w:val="22"/>
+          <w:szCs w:val="22"/>
+        </w:rPr>
+        <w:t>Como</w:t>
+      </w:r>
+      <w:r>
+        <w:rPr>
+          <w:rStyle w:val="normaltextrun"/>
+          <w:rFonts w:ascii="Calibri" w:hAnsi="Calibri" w:cs="Calibri"/>
+          <w:sz w:val="22"/>
+          <w:szCs w:val="22"/>
+          <w:lang w:val="zh-CN"/>
+        </w:rPr>
+        <w:t>:</w:t>
+      </w:r>
+      <w:r>
+        <w:rPr>
+          <w:rStyle w:val="normaltextrun"/>
+          <w:rFonts w:ascii="Calibri" w:hAnsi="Calibri" w:cs="Calibri"/>
+          <w:sz w:val="22"/>
+          <w:szCs w:val="22"/>
+        </w:rPr>
+        <w:t xml:space="preserve"> cliente </w:t>
+      </w:r>
+      <w:r>
+        <w:rPr>
+          <w:rStyle w:val="eop"/>
+          <w:rFonts w:ascii="Calibri" w:eastAsia="MS Mincho" w:hAnsi="Calibri" w:cs="Calibri"/>
+          <w:sz w:val="22"/>
+          <w:szCs w:val="22"/>
+        </w:rPr>
+        <w:t> </w:t>
+      </w:r>
+    </w:p>
+    <w:p>
+      <w:pPr>
+        <w:pStyle w:val="paragraph"/>
+        <w:spacing w:before="0" w:beforeAutospacing="0" w:after="0" w:afterAutospacing="0"/>
+        <w:textAlignment w:val="baseline"/>
+        <w:rPr>
+          <w:rFonts w:ascii="Segoe UI" w:hAnsi="Segoe UI" w:cs="Segoe UI"/>
+          <w:sz w:val="18"/>
+          <w:szCs w:val="18"/>
+        </w:rPr>
+      </w:pPr>
+    </w:p>
+    <w:p>
+      <w:pPr>
+        <w:pStyle w:val="paragraph"/>
+        <w:spacing w:before="0" w:beforeAutospacing="0" w:after="0" w:afterAutospacing="0"/>
+        <w:textAlignment w:val="baseline"/>
+        <w:rPr>
+          <w:rFonts w:ascii="Segoe UI" w:hAnsi="Segoe UI" w:cs="Segoe UI"/>
+          <w:sz w:val="18"/>
+          <w:szCs w:val="18"/>
+        </w:rPr>
+      </w:pPr>
+      <w:r>
+        <w:rPr>
+          <w:rStyle w:val="normaltextrun"/>
+          <w:rFonts w:ascii="Calibri" w:hAnsi="Calibri" w:cs="Calibri"/>
+          <w:sz w:val="22"/>
+          <w:szCs w:val="22"/>
+        </w:rPr>
+        <w:t xml:space="preserve">Quiero: ver los servicios con su nombre, descripción, horario disponible y costo </w:t>
+      </w:r>
+      <w:r>
+        <w:rPr>
+          <w:rStyle w:val="normaltextrun"/>
+          <w:rFonts w:ascii="Calibri" w:hAnsi="Calibri" w:cs="Calibri"/>
+          <w:sz w:val="22"/>
+          <w:szCs w:val="22"/>
+        </w:rPr>
+        <w:t>extra,</w:t>
+      </w:r>
+      <w:r>
+        <w:rPr>
+          <w:rStyle w:val="eop"/>
+          <w:rFonts w:ascii="Calibri" w:eastAsia="MS Mincho" w:hAnsi="Calibri" w:cs="Calibri"/>
+          <w:sz w:val="22"/>
+          <w:szCs w:val="22"/>
+        </w:rPr>
+        <w:t> </w:t>
+      </w:r>
+    </w:p>
+    <w:p>
+      <w:pPr>
+        <w:pStyle w:val="paragraph"/>
+        <w:spacing w:before="0" w:beforeAutospacing="0" w:after="0" w:afterAutospacing="0"/>
+        <w:textAlignment w:val="baseline"/>
+        <w:rPr>
+          <w:rStyle w:val="normaltextrun"/>
+          <w:rFonts w:ascii="Calibri" w:hAnsi="Calibri" w:cs="Calibri"/>
+          <w:sz w:val="22"/>
+          <w:szCs w:val="22"/>
+        </w:rPr>
+      </w:pPr>
+    </w:p>
+    <w:p>
+      <w:pPr>
+        <w:pStyle w:val="paragraph"/>
+        <w:spacing w:before="0" w:beforeAutospacing="0" w:after="0" w:afterAutospacing="0"/>
+        <w:textAlignment w:val="baseline"/>
+        <w:rPr>
+          <w:rStyle w:val="eop"/>
+          <w:rFonts w:ascii="Calibri" w:eastAsia="MS Mincho" w:hAnsi="Calibri" w:cs="Calibri"/>
+          <w:sz w:val="22"/>
+          <w:szCs w:val="22"/>
+        </w:rPr>
+      </w:pPr>
+      <w:r>
+        <w:rPr>
+          <w:rStyle w:val="normaltextrun"/>
+          <w:rFonts w:ascii="Calibri" w:hAnsi="Calibri" w:cs="Calibri"/>
+          <w:sz w:val="22"/>
+          <w:szCs w:val="22"/>
+        </w:rPr>
+        <w:t>Para: poder elegir el servicio que mejor se adapte a mis necesidades y presupuesto.</w:t>
+      </w:r>
+      <w:r>
+        <w:rPr>
+          <w:rStyle w:val="eop"/>
+          <w:rFonts w:ascii="Calibri" w:eastAsia="MS Mincho" w:hAnsi="Calibri" w:cs="Calibri"/>
+          <w:sz w:val="22"/>
+          <w:szCs w:val="22"/>
+        </w:rPr>
+        <w:t> </w:t>
+      </w:r>
+    </w:p>
+    <w:p>
+      <w:pPr>
+        <w:pStyle w:val="paragraph"/>
+        <w:spacing w:before="0" w:beforeAutospacing="0" w:after="0" w:afterAutospacing="0"/>
+        <w:textAlignment w:val="baseline"/>
+        <w:rPr>
+          <w:rStyle w:val="eop"/>
+          <w:rFonts w:ascii="Calibri" w:eastAsia="MS Mincho" w:hAnsi="Calibri" w:cs="Calibri"/>
+          <w:sz w:val="22"/>
+          <w:szCs w:val="22"/>
+        </w:rPr>
+      </w:pPr>
+    </w:p>
+    <w:p>
+      <w:pPr>
+        <w:pStyle w:val="paragraph"/>
+        <w:spacing w:before="0" w:beforeAutospacing="0" w:after="0" w:afterAutospacing="0"/>
+        <w:textAlignment w:val="baseline"/>
+        <w:rPr>
+          <w:rStyle w:val="eop"/>
+          <w:rFonts w:ascii="Calibri" w:eastAsia="MS Mincho" w:hAnsi="Calibri" w:cs="Calibri"/>
+          <w:sz w:val="22"/>
+          <w:szCs w:val="22"/>
+        </w:rPr>
+      </w:pPr>
+    </w:p>
+    <w:p>
+      <w:pPr>
+        <w:rPr>
+          <w:rStyle w:val="eop"/>
+          <w:b/>
+        </w:rPr>
+      </w:pPr>
+      <w:r>
+        <w:t>HUJC-005</w:t>
+      </w:r>
+    </w:p>
+    <w:p>
+      <w:pPr>
+        <w:pStyle w:val="paragraph"/>
+        <w:spacing w:before="0" w:beforeAutospacing="0" w:after="0" w:afterAutospacing="0"/>
+        <w:textAlignment w:val="baseline"/>
+        <w:rPr>
+          <w:rFonts w:ascii="Segoe UI" w:hAnsi="Segoe UI" w:cs="Segoe UI"/>
+          <w:sz w:val="18"/>
+          <w:szCs w:val="18"/>
+        </w:rPr>
+      </w:pPr>
+      <w:r>
+        <w:rPr>
+          <w:rStyle w:val="normaltextrun"/>
+          <w:rFonts w:ascii="Calibri" w:hAnsi="Calibri" w:cs="Calibri"/>
+          <w:sz w:val="22"/>
+          <w:szCs w:val="22"/>
+        </w:rPr>
+        <w:t>Como: administrador </w:t>
+      </w:r>
+      <w:r>
+        <w:rPr>
+          <w:rStyle w:val="eop"/>
+          <w:rFonts w:ascii="Calibri" w:eastAsia="MS Mincho" w:hAnsi="Calibri" w:cs="Calibri"/>
+          <w:sz w:val="22"/>
+          <w:szCs w:val="22"/>
+        </w:rPr>
+        <w:t> </w:t>
+      </w:r>
+    </w:p>
+    <w:p>
+      <w:pPr>
+        <w:pStyle w:val="paragraph"/>
+        <w:spacing w:before="0" w:beforeAutospacing="0" w:after="0" w:afterAutospacing="0"/>
+        <w:textAlignment w:val="baseline"/>
+        <w:rPr>
+          <w:rStyle w:val="normaltextrun"/>
+          <w:rFonts w:ascii="Calibri" w:hAnsi="Calibri" w:cs="Calibri"/>
+          <w:sz w:val="22"/>
+          <w:szCs w:val="22"/>
+        </w:rPr>
+      </w:pPr>
+    </w:p>
+    <w:p>
+      <w:pPr>
+        <w:pStyle w:val="paragraph"/>
+        <w:spacing w:before="0" w:beforeAutospacing="0" w:after="0" w:afterAutospacing="0"/>
+        <w:textAlignment w:val="baseline"/>
+        <w:rPr>
+          <w:rFonts w:ascii="Segoe UI" w:hAnsi="Segoe UI" w:cs="Segoe UI"/>
+          <w:sz w:val="18"/>
+          <w:szCs w:val="18"/>
+        </w:rPr>
+      </w:pPr>
+      <w:r>
+        <w:rPr>
+          <w:rStyle w:val="normaltextrun"/>
+          <w:rFonts w:ascii="Calibri" w:hAnsi="Calibri" w:cs="Calibri"/>
+          <w:sz w:val="22"/>
+          <w:szCs w:val="22"/>
+        </w:rPr>
+        <w:t>Quiero: poder activar, desactivar y modificar los datos de un servicio (nombre, descripción, horario, costo extra y tipo de serv</w:t>
+      </w:r>
+      <w:r>
+        <w:rPr>
+          <w:rStyle w:val="normaltextrun"/>
+          <w:rFonts w:ascii="Calibri" w:hAnsi="Calibri" w:cs="Calibri"/>
+          <w:sz w:val="22"/>
+          <w:szCs w:val="22"/>
+        </w:rPr>
+        <w:t>icio),</w:t>
+      </w:r>
+      <w:r>
+        <w:rPr>
+          <w:rStyle w:val="eop"/>
+          <w:rFonts w:ascii="Calibri" w:eastAsia="MS Mincho" w:hAnsi="Calibri" w:cs="Calibri"/>
+          <w:sz w:val="22"/>
+          <w:szCs w:val="22"/>
+        </w:rPr>
+        <w:t> </w:t>
+      </w:r>
+    </w:p>
+    <w:p>
+      <w:pPr>
+        <w:pStyle w:val="paragraph"/>
+        <w:spacing w:before="0" w:beforeAutospacing="0" w:after="0" w:afterAutospacing="0"/>
+        <w:textAlignment w:val="baseline"/>
+        <w:rPr>
+          <w:rStyle w:val="normaltextrun"/>
+          <w:rFonts w:ascii="Calibri" w:hAnsi="Calibri" w:cs="Calibri"/>
+          <w:sz w:val="22"/>
+          <w:szCs w:val="22"/>
+        </w:rPr>
+      </w:pPr>
+    </w:p>
+    <w:p>
+      <w:pPr>
+        <w:pStyle w:val="paragraph"/>
+        <w:spacing w:before="0" w:beforeAutospacing="0" w:after="0" w:afterAutospacing="0"/>
+        <w:textAlignment w:val="baseline"/>
+        <w:rPr>
+          <w:rStyle w:val="eop"/>
+          <w:rFonts w:ascii="Calibri" w:eastAsia="MS Mincho" w:hAnsi="Calibri" w:cs="Calibri"/>
+          <w:sz w:val="22"/>
+          <w:szCs w:val="22"/>
+        </w:rPr>
+      </w:pPr>
+      <w:r>
+        <w:rPr>
+          <w:rStyle w:val="normaltextrun"/>
+          <w:rFonts w:ascii="Calibri" w:hAnsi="Calibri" w:cs="Calibri"/>
+          <w:sz w:val="22"/>
+          <w:szCs w:val="22"/>
+        </w:rPr>
+        <w:t>Para: mantener la información actualizada y ofrecer servicios vigentes a los clientes.</w:t>
+      </w:r>
+      <w:r>
+        <w:rPr>
+          <w:rStyle w:val="eop"/>
+          <w:rFonts w:ascii="Calibri" w:eastAsia="MS Mincho" w:hAnsi="Calibri" w:cs="Calibri"/>
+          <w:sz w:val="22"/>
+          <w:szCs w:val="22"/>
+        </w:rPr>
+        <w:t> </w:t>
+      </w:r>
+    </w:p>
+    <w:p>
+      <w:pPr>
+        <w:pStyle w:val="paragraph"/>
+        <w:spacing w:before="0" w:beforeAutospacing="0" w:after="0" w:afterAutospacing="0"/>
+        <w:textAlignment w:val="baseline"/>
+        <w:rPr>
+          <w:rStyle w:val="eop"/>
+          <w:rFonts w:ascii="Calibri" w:eastAsia="MS Mincho" w:hAnsi="Calibri" w:cs="Calibri"/>
+          <w:sz w:val="22"/>
+          <w:szCs w:val="22"/>
+        </w:rPr>
+      </w:pPr>
+    </w:p>
+    <w:p>
+      <w:pPr>
+        <w:rPr>
+          <w:rStyle w:val="normaltextrun"/>
+          <w:b/>
+        </w:rPr>
+      </w:pPr>
+      <w:r>
+        <w:t>HUJC-006</w:t>
+      </w:r>
+    </w:p>
+    <w:p>
+      <w:pPr>
+        <w:pStyle w:val="paragraph"/>
+        <w:spacing w:before="0" w:beforeAutospacing="0" w:after="0" w:afterAutospacing="0"/>
+        <w:textAlignment w:val="baseline"/>
+        <w:rPr>
+          <w:rFonts w:ascii="Segoe UI" w:hAnsi="Segoe UI" w:cs="Segoe UI"/>
+          <w:sz w:val="18"/>
+          <w:szCs w:val="18"/>
+        </w:rPr>
+      </w:pPr>
+      <w:r>
+        <w:rPr>
+          <w:rStyle w:val="normaltextrun"/>
+          <w:rFonts w:ascii="Calibri" w:hAnsi="Calibri" w:cs="Calibri"/>
+          <w:sz w:val="22"/>
+          <w:szCs w:val="22"/>
+        </w:rPr>
+        <w:t>Como: usuario del sistema (empleado),</w:t>
+      </w:r>
+      <w:r>
+        <w:rPr>
+          <w:rStyle w:val="eop"/>
+          <w:rFonts w:ascii="Calibri" w:eastAsia="MS Mincho" w:hAnsi="Calibri" w:cs="Calibri"/>
+          <w:sz w:val="22"/>
+          <w:szCs w:val="22"/>
+        </w:rPr>
+        <w:t> </w:t>
+      </w:r>
+    </w:p>
+    <w:p>
+      <w:pPr>
+        <w:pStyle w:val="paragraph"/>
+        <w:spacing w:before="0" w:beforeAutospacing="0" w:after="0" w:afterAutospacing="0"/>
+        <w:textAlignment w:val="baseline"/>
+        <w:rPr>
+          <w:rStyle w:val="normaltextrun"/>
+          <w:rFonts w:ascii="Calibri" w:hAnsi="Calibri" w:cs="Calibri"/>
+          <w:sz w:val="22"/>
+          <w:szCs w:val="22"/>
+        </w:rPr>
+      </w:pPr>
+    </w:p>
+    <w:p>
+      <w:pPr>
+        <w:pStyle w:val="paragraph"/>
+        <w:spacing w:before="0" w:beforeAutospacing="0" w:after="0" w:afterAutospacing="0"/>
+        <w:textAlignment w:val="baseline"/>
+        <w:rPr>
+          <w:rFonts w:ascii="Segoe UI" w:hAnsi="Segoe UI" w:cs="Segoe UI"/>
+          <w:sz w:val="18"/>
+          <w:szCs w:val="18"/>
+        </w:rPr>
+      </w:pPr>
+      <w:r>
+        <w:rPr>
+          <w:rStyle w:val="normaltextrun"/>
+          <w:rFonts w:ascii="Calibri" w:hAnsi="Calibri" w:cs="Calibri"/>
+          <w:sz w:val="22"/>
+          <w:szCs w:val="22"/>
+        </w:rPr>
+        <w:t>Quiero: consultar el tipo de servicio y su horario disponible,</w:t>
+      </w:r>
+      <w:r>
+        <w:rPr>
+          <w:rStyle w:val="eop"/>
+          <w:rFonts w:ascii="Calibri" w:eastAsia="MS Mincho" w:hAnsi="Calibri" w:cs="Calibri"/>
+          <w:sz w:val="22"/>
+          <w:szCs w:val="22"/>
+        </w:rPr>
+        <w:t> </w:t>
+      </w:r>
+    </w:p>
+    <w:p>
+      <w:pPr>
+        <w:pStyle w:val="paragraph"/>
+        <w:spacing w:before="0" w:beforeAutospacing="0" w:after="0" w:afterAutospacing="0"/>
+        <w:textAlignment w:val="baseline"/>
+        <w:rPr>
+          <w:rStyle w:val="normaltextrun"/>
+          <w:rFonts w:ascii="Calibri" w:hAnsi="Calibri" w:cs="Calibri"/>
+          <w:sz w:val="22"/>
+          <w:szCs w:val="22"/>
+        </w:rPr>
+      </w:pPr>
+    </w:p>
+    <w:p>
+      <w:pPr>
+        <w:pStyle w:val="paragraph"/>
+        <w:spacing w:before="0" w:beforeAutospacing="0" w:after="0" w:afterAutospacing="0"/>
+        <w:textAlignment w:val="baseline"/>
+        <w:rPr>
+          <w:rStyle w:val="eop"/>
+          <w:rFonts w:ascii="Calibri" w:eastAsia="MS Mincho" w:hAnsi="Calibri" w:cs="Calibri"/>
+          <w:sz w:val="22"/>
+          <w:szCs w:val="22"/>
+        </w:rPr>
+      </w:pPr>
+      <w:r>
+        <w:rPr>
+          <w:rStyle w:val="normaltextrun"/>
+          <w:rFonts w:ascii="Calibri" w:hAnsi="Calibri" w:cs="Calibri"/>
+          <w:sz w:val="22"/>
+          <w:szCs w:val="22"/>
+        </w:rPr>
+        <w:t>Para: poder informar correctamente a los cli</w:t>
+      </w:r>
+      <w:r>
+        <w:rPr>
+          <w:rStyle w:val="normaltextrun"/>
+          <w:rFonts w:ascii="Calibri" w:hAnsi="Calibri" w:cs="Calibri"/>
+          <w:sz w:val="22"/>
+          <w:szCs w:val="22"/>
+        </w:rPr>
+        <w:t>entes sobre la disponibilidad y características de cada servicio.</w:t>
+      </w:r>
+      <w:r>
+        <w:rPr>
+          <w:rStyle w:val="eop"/>
+          <w:rFonts w:ascii="Calibri" w:eastAsia="MS Mincho" w:hAnsi="Calibri" w:cs="Calibri"/>
+          <w:sz w:val="22"/>
+          <w:szCs w:val="22"/>
+        </w:rPr>
+        <w:t> </w:t>
+      </w:r>
+    </w:p>
+    <w:p>
+      <w:pPr>
+        <w:pStyle w:val="paragraph"/>
+        <w:spacing w:before="0" w:beforeAutospacing="0" w:after="0" w:afterAutospacing="0"/>
+        <w:textAlignment w:val="baseline"/>
+        <w:rPr>
+          <w:rStyle w:val="eop"/>
+          <w:rFonts w:ascii="Calibri" w:eastAsia="MS Mincho" w:hAnsi="Calibri" w:cs="Calibri"/>
+          <w:sz w:val="22"/>
+          <w:szCs w:val="22"/>
+        </w:rPr>
+      </w:pPr>
+    </w:p>
+    <w:p>
+      <w:pPr>
+        <w:pStyle w:val="paragraph"/>
+        <w:spacing w:before="0" w:beforeAutospacing="0" w:after="0" w:afterAutospacing="0"/>
+        <w:textAlignment w:val="baseline"/>
+        <w:rPr>
+          <w:rFonts w:ascii="Segoe UI" w:hAnsi="Segoe UI" w:cs="Segoe UI"/>
+          <w:b/>
+          <w:sz w:val="18"/>
+          <w:szCs w:val="18"/>
+          <w:lang w:val="es-MX"/>
+        </w:rPr>
+      </w:pPr>
+      <w:r>
+        <w:rPr>
+          <w:rFonts w:ascii="Segoe UI" w:hAnsi="Segoe UI" w:cs="Segoe UI"/>
+          <w:b/>
+          <w:sz w:val="18"/>
+          <w:szCs w:val="18"/>
+        </w:rPr>
+        <w:t>Tupla: Rese</w:t>
+      </w:r>
+      <w:r>
+        <w:rPr>
+          <w:rFonts w:ascii="Segoe UI" w:hAnsi="Segoe UI" w:cs="Segoe UI"/>
+          <w:b/>
+          <w:sz w:val="18"/>
+          <w:szCs w:val="18"/>
+          <w:lang w:val="es-MX"/>
+        </w:rPr>
+        <w:t>ñas</w:t>
+      </w:r>
+    </w:p>
+    <w:p>
+      <w:pPr>
+        <w:pStyle w:val="paragraph"/>
+        <w:spacing w:before="0" w:beforeAutospacing="0" w:after="0" w:afterAutospacing="0"/>
+        <w:textAlignment w:val="baseline"/>
+        <w:rPr>
+          <w:rFonts w:ascii="Segoe UI" w:hAnsi="Segoe UI" w:cs="Segoe UI"/>
+          <w:b/>
+          <w:sz w:val="18"/>
+          <w:szCs w:val="18"/>
+          <w:lang w:val="es-MX"/>
+        </w:rPr>
+      </w:pPr>
+    </w:p>
+    <w:p>
+      <w:pPr>
+        <w:pStyle w:val="paragraph"/>
+        <w:spacing w:after="0"/>
+        <w:textAlignment w:val="baseline"/>
+        <w:rPr>
+          <w:rFonts w:ascii="Segoe UI" w:hAnsi="Segoe UI" w:cs="Segoe UI"/>
+          <w:sz w:val="22"/>
+          <w:szCs w:val="22"/>
+        </w:rPr>
+      </w:pPr>
+      <w:r>
+        <w:rPr>
+          <w:rFonts w:ascii="Segoe UI" w:hAnsi="Segoe UI" w:cs="Segoe UI"/>
+          <w:sz w:val="22"/>
+          <w:szCs w:val="22"/>
+        </w:rPr>
+        <w:t>HUJC-0</w:t>
+      </w:r>
+      <w:r>
+        <w:rPr>
+          <w:rFonts w:ascii="Segoe UI" w:hAnsi="Segoe UI" w:cs="Segoe UI"/>
+          <w:sz w:val="22"/>
+          <w:szCs w:val="22"/>
+        </w:rPr>
+        <w:t>07</w:t>
+      </w:r>
+      <w:r>
+        <w:rPr>
+          <w:rFonts w:ascii="Segoe UI" w:hAnsi="Segoe UI" w:cs="Segoe UI"/>
+          <w:sz w:val="22"/>
+          <w:szCs w:val="22"/>
+        </w:rPr>
+        <w:t>: Registo de nueva reseña</w:t>
+      </w:r>
+    </w:p>
+    <w:p>
+      <w:pPr>
+        <w:pStyle w:val="paragraph"/>
+        <w:spacing w:after="0"/>
+        <w:textAlignment w:val="baseline"/>
+        <w:rPr>
+          <w:rFonts w:ascii="Segoe UI" w:hAnsi="Segoe UI" w:cs="Segoe UI"/>
+          <w:sz w:val="22"/>
+          <w:szCs w:val="22"/>
+        </w:rPr>
+      </w:pPr>
+      <w:r>
+        <w:rPr>
+          <w:rFonts w:ascii="Segoe UI" w:hAnsi="Segoe UI" w:cs="Segoe UI"/>
+          <w:sz w:val="22"/>
+          <w:szCs w:val="22"/>
+        </w:rPr>
+        <w:t>Como: Huesped</w:t>
+      </w:r>
+    </w:p>
+    <w:p>
+      <w:pPr>
+        <w:pStyle w:val="paragraph"/>
+        <w:spacing w:after="0"/>
+        <w:textAlignment w:val="baseline"/>
+        <w:rPr>
+          <w:rFonts w:ascii="Segoe UI" w:hAnsi="Segoe UI" w:cs="Segoe UI"/>
+          <w:sz w:val="22"/>
+          <w:szCs w:val="22"/>
+        </w:rPr>
+      </w:pPr>
+      <w:r>
+        <w:rPr>
+          <w:rFonts w:ascii="Segoe UI" w:hAnsi="Segoe UI" w:cs="Segoe UI"/>
+          <w:sz w:val="22"/>
+          <w:szCs w:val="22"/>
+        </w:rPr>
+        <w:t>Quiero: Registar una reseña sobre los servicios del cuarto de baño</w:t>
+      </w:r>
+    </w:p>
+    <w:p>
+      <w:pPr>
+        <w:pStyle w:val="paragraph"/>
+        <w:spacing w:before="0" w:beforeAutospacing="0" w:after="0" w:afterAutospacing="0"/>
+        <w:textAlignment w:val="baseline"/>
+        <w:rPr>
+          <w:rFonts w:ascii="Segoe UI" w:hAnsi="Segoe UI" w:cs="Segoe UI"/>
+          <w:sz w:val="22"/>
+          <w:szCs w:val="22"/>
+        </w:rPr>
+      </w:pPr>
+      <w:r>
+        <w:rPr>
+          <w:rFonts w:ascii="Segoe UI" w:hAnsi="Segoe UI" w:cs="Segoe UI"/>
+          <w:sz w:val="22"/>
+          <w:szCs w:val="22"/>
+        </w:rPr>
+        <w:t xml:space="preserve">Para: Que lleven un registro de las mejoras que necesita </w:t>
+      </w:r>
+      <w:r>
+        <w:rPr>
+          <w:rFonts w:ascii="Segoe UI" w:hAnsi="Segoe UI" w:cs="Segoe UI"/>
+          <w:sz w:val="22"/>
+          <w:szCs w:val="22"/>
+        </w:rPr>
+        <w:t>o faltan en el baño</w:t>
+      </w:r>
+    </w:p>
+    <w:p>
+      <w:pPr>
+        <w:pStyle w:val="paragraph"/>
+        <w:spacing w:before="0" w:beforeAutospacing="0" w:after="0" w:afterAutospacing="0"/>
+        <w:textAlignment w:val="baseline"/>
+        <w:rPr>
+          <w:rFonts w:ascii="Segoe UI" w:hAnsi="Segoe UI" w:cs="Segoe UI"/>
+          <w:sz w:val="22"/>
+          <w:szCs w:val="22"/>
+        </w:rPr>
+      </w:pPr>
+    </w:p>
+    <w:p>
+      <w:pPr>
+        <w:pStyle w:val="paragraph"/>
+        <w:spacing w:after="0"/>
+        <w:textAlignment w:val="baseline"/>
+        <w:rPr>
+          <w:rFonts w:ascii="Segoe UI" w:hAnsi="Segoe UI" w:cs="Segoe UI"/>
+          <w:b/>
+          <w:sz w:val="22"/>
+          <w:szCs w:val="22"/>
+        </w:rPr>
+      </w:pPr>
+      <w:r>
+        <w:rPr>
+          <w:rFonts w:ascii="Segoe UI" w:hAnsi="Segoe UI" w:cs="Segoe UI"/>
+          <w:b/>
+          <w:sz w:val="22"/>
+          <w:szCs w:val="22"/>
+        </w:rPr>
+        <w:t>HUJC-0</w:t>
+      </w:r>
+      <w:r>
+        <w:rPr>
+          <w:rFonts w:ascii="Segoe UI" w:hAnsi="Segoe UI" w:cs="Segoe UI"/>
+          <w:b/>
+          <w:sz w:val="22"/>
+          <w:szCs w:val="22"/>
+        </w:rPr>
+        <w:t>08</w:t>
+      </w:r>
+    </w:p>
+    <w:p>
+      <w:pPr>
+        <w:pStyle w:val="paragraph"/>
+        <w:spacing w:after="0"/>
+        <w:textAlignment w:val="baseline"/>
+        <w:rPr>
+          <w:rFonts w:ascii="Segoe UI" w:hAnsi="Segoe UI" w:cs="Segoe UI"/>
+          <w:sz w:val="22"/>
+          <w:szCs w:val="22"/>
+        </w:rPr>
+      </w:pPr>
+      <w:r>
+        <w:rPr>
+          <w:rFonts w:ascii="Segoe UI" w:hAnsi="Segoe UI" w:cs="Segoe UI"/>
+          <w:sz w:val="22"/>
+          <w:szCs w:val="22"/>
+        </w:rPr>
+        <w:t>Como: Empresario</w:t>
+      </w:r>
+    </w:p>
+    <w:p>
+      <w:pPr>
+        <w:pStyle w:val="paragraph"/>
+        <w:spacing w:after="0"/>
+        <w:textAlignment w:val="baseline"/>
+        <w:rPr>
+          <w:rFonts w:ascii="Segoe UI" w:hAnsi="Segoe UI" w:cs="Segoe UI"/>
+          <w:sz w:val="22"/>
+          <w:szCs w:val="22"/>
+        </w:rPr>
+      </w:pPr>
+      <w:r>
+        <w:rPr>
+          <w:rFonts w:ascii="Segoe UI" w:hAnsi="Segoe UI" w:cs="Segoe UI"/>
+          <w:sz w:val="22"/>
+          <w:szCs w:val="22"/>
+        </w:rPr>
+        <w:t>Quiero: Registrar una reseña sobre la propiedad que me fue otorgada en Peace At Home</w:t>
+      </w:r>
+    </w:p>
+    <w:p>
+      <w:pPr>
+        <w:pStyle w:val="paragraph"/>
+        <w:spacing w:before="0" w:beforeAutospacing="0" w:after="0" w:afterAutospacing="0"/>
+        <w:textAlignment w:val="baseline"/>
+        <w:rPr>
+          <w:rFonts w:ascii="Segoe UI" w:hAnsi="Segoe UI" w:cs="Segoe UI"/>
+          <w:sz w:val="22"/>
+          <w:szCs w:val="22"/>
+        </w:rPr>
+      </w:pPr>
+      <w:r>
+        <w:rPr>
+          <w:rFonts w:ascii="Segoe UI" w:hAnsi="Segoe UI" w:cs="Segoe UI"/>
+          <w:sz w:val="22"/>
+          <w:szCs w:val="22"/>
+        </w:rPr>
+        <w:t>Para: Que los nuevos huéspedes sepan de las comodidades y ventajas de esta propiedad en especifico</w:t>
+      </w:r>
+    </w:p>
+    <w:p>
+      <w:pPr>
+        <w:pStyle w:val="paragraph"/>
+        <w:spacing w:before="0" w:beforeAutospacing="0" w:after="0" w:afterAutospacing="0"/>
+        <w:textAlignment w:val="baseline"/>
+        <w:rPr>
+          <w:rFonts w:ascii="Segoe UI" w:hAnsi="Segoe UI" w:cs="Segoe UI"/>
+          <w:sz w:val="22"/>
+          <w:szCs w:val="22"/>
+        </w:rPr>
+      </w:pPr>
+    </w:p>
+    <w:p>
+      <w:pPr>
+        <w:pStyle w:val="paragraph"/>
+        <w:spacing w:after="0"/>
+        <w:textAlignment w:val="baseline"/>
+        <w:rPr>
+          <w:rFonts w:ascii="Segoe UI" w:hAnsi="Segoe UI" w:cs="Segoe UI"/>
+          <w:b/>
+          <w:sz w:val="22"/>
+          <w:szCs w:val="22"/>
+        </w:rPr>
+      </w:pPr>
+      <w:r>
+        <w:rPr>
+          <w:rFonts w:ascii="Segoe UI" w:hAnsi="Segoe UI" w:cs="Segoe UI"/>
+          <w:b/>
+          <w:sz w:val="22"/>
+          <w:szCs w:val="22"/>
+        </w:rPr>
+        <w:t>HUJC-0</w:t>
+      </w:r>
+      <w:r>
+        <w:rPr>
+          <w:rFonts w:ascii="Segoe UI" w:hAnsi="Segoe UI" w:cs="Segoe UI"/>
+          <w:b/>
+          <w:sz w:val="22"/>
+          <w:szCs w:val="22"/>
+        </w:rPr>
+        <w:t>09</w:t>
+      </w:r>
+    </w:p>
+    <w:p>
+      <w:pPr>
+        <w:pStyle w:val="paragraph"/>
+        <w:spacing w:after="0"/>
+        <w:textAlignment w:val="baseline"/>
+        <w:rPr>
+          <w:rFonts w:ascii="Segoe UI" w:hAnsi="Segoe UI" w:cs="Segoe UI"/>
+          <w:sz w:val="22"/>
+          <w:szCs w:val="22"/>
+        </w:rPr>
+      </w:pPr>
+      <w:r>
+        <w:rPr>
+          <w:rFonts w:ascii="Segoe UI" w:hAnsi="Segoe UI" w:cs="Segoe UI"/>
+          <w:sz w:val="22"/>
+          <w:szCs w:val="22"/>
+        </w:rPr>
+        <w:t>Como: Arrendado</w:t>
+      </w:r>
+      <w:r>
+        <w:rPr>
+          <w:rFonts w:ascii="Segoe UI" w:hAnsi="Segoe UI" w:cs="Segoe UI"/>
+          <w:sz w:val="22"/>
+          <w:szCs w:val="22"/>
+        </w:rPr>
+        <w:t>r</w:t>
+      </w:r>
+    </w:p>
+    <w:p>
+      <w:pPr>
+        <w:pStyle w:val="paragraph"/>
+        <w:spacing w:after="0"/>
+        <w:textAlignment w:val="baseline"/>
+        <w:rPr>
+          <w:rFonts w:ascii="Segoe UI" w:hAnsi="Segoe UI" w:cs="Segoe UI"/>
+          <w:sz w:val="22"/>
+          <w:szCs w:val="22"/>
+        </w:rPr>
+      </w:pPr>
+      <w:r>
+        <w:rPr>
+          <w:rFonts w:ascii="Segoe UI" w:hAnsi="Segoe UI" w:cs="Segoe UI"/>
+          <w:sz w:val="22"/>
+          <w:szCs w:val="22"/>
+        </w:rPr>
+        <w:t>Quiero: Registrar una reseña sobre los huéspedes que ocupan mi propiedad de Peace At Home</w:t>
+      </w:r>
+    </w:p>
+    <w:p>
+      <w:pPr>
+        <w:pStyle w:val="paragraph"/>
+        <w:spacing w:before="0" w:beforeAutospacing="0" w:after="0" w:afterAutospacing="0"/>
+        <w:textAlignment w:val="baseline"/>
+        <w:rPr>
+          <w:rFonts w:ascii="Segoe UI" w:hAnsi="Segoe UI" w:cs="Segoe UI"/>
+          <w:sz w:val="22"/>
+          <w:szCs w:val="22"/>
+        </w:rPr>
+      </w:pPr>
+      <w:r>
+        <w:rPr>
+          <w:rFonts w:ascii="Segoe UI" w:hAnsi="Segoe UI" w:cs="Segoe UI"/>
+          <w:sz w:val="22"/>
+          <w:szCs w:val="22"/>
+        </w:rPr>
+        <w:t>Para: Llevar un registro de cosas que pueden mejorarse en la propiedad para otorgarles una mejor comodidad</w:t>
+      </w:r>
+    </w:p>
+    <w:p>
+      <w:pPr>
+        <w:pStyle w:val="paragraph"/>
+        <w:spacing w:before="0" w:beforeAutospacing="0" w:after="0" w:afterAutospacing="0"/>
+        <w:textAlignment w:val="baseline"/>
+        <w:rPr>
+          <w:rFonts w:ascii="Segoe UI" w:hAnsi="Segoe UI" w:cs="Segoe UI"/>
+          <w:sz w:val="22"/>
+          <w:szCs w:val="22"/>
+        </w:rPr>
+      </w:pPr>
+    </w:p>
+    <w:p>
+      <w:pPr>
+        <w:pStyle w:val="paragraph"/>
+        <w:spacing w:before="0" w:beforeAutospacing="0" w:after="0" w:afterAutospacing="0"/>
+        <w:textAlignment w:val="baseline"/>
+        <w:rPr>
+          <w:rFonts w:ascii="Segoe UI" w:hAnsi="Segoe UI" w:cs="Segoe UI"/>
+          <w:sz w:val="22"/>
+          <w:szCs w:val="22"/>
+        </w:rPr>
+      </w:pPr>
+    </w:p>
+    <w:p>
+      <w:pPr>
+        <w:pStyle w:val="paragraph"/>
+        <w:spacing w:before="0" w:beforeAutospacing="0" w:after="0" w:afterAutospacing="0"/>
+        <w:textAlignment w:val="baseline"/>
+        <w:rPr>
+          <w:rStyle w:val="eop"/>
+          <w:rFonts w:ascii="Calibri" w:eastAsia="MS Mincho" w:hAnsi="Calibri" w:cs="Calibri"/>
+          <w:sz w:val="22"/>
+          <w:szCs w:val="22"/>
+        </w:rPr>
+      </w:pPr>
+    </w:p>
+    <w:p>
+      <w:pPr>
+        <w:pStyle w:val="paragraph"/>
+        <w:spacing w:before="0" w:beforeAutospacing="0" w:after="0" w:afterAutospacing="0"/>
+        <w:textAlignment w:val="baseline"/>
+        <w:rPr>
+          <w:rStyle w:val="eop"/>
+          <w:rFonts w:ascii="Calibri" w:eastAsia="MS Mincho" w:hAnsi="Calibri" w:cs="Calibri"/>
+          <w:sz w:val="22"/>
+          <w:szCs w:val="22"/>
+        </w:rPr>
+      </w:pPr>
+    </w:p>
+    <w:p>
+      <w:pPr>
+        <w:pStyle w:val="paragraph"/>
+        <w:spacing w:before="0" w:beforeAutospacing="0" w:after="0" w:afterAutospacing="0"/>
+        <w:textAlignment w:val="baseline"/>
+        <w:rPr>
+          <w:rStyle w:val="eop"/>
+          <w:rFonts w:ascii="Calibri" w:eastAsia="MS Mincho" w:hAnsi="Calibri" w:cs="Calibri"/>
+          <w:sz w:val="22"/>
+          <w:szCs w:val="22"/>
+        </w:rPr>
+      </w:pPr>
+    </w:p>
+    <w:p>
+      <w:pPr>
+        <w:spacing w:before="100" w:beforeAutospacing="1" w:after="100" w:afterAutospacing="1" w:line="240" w:lineRule="auto"/>
+        <w:rPr>
+          <w:rFonts w:ascii="Arial" w:eastAsia="Times New Roman" w:hAnsi="Arial" w:cs="Arial"/>
+          <w:szCs w:val="24"/>
+          <w:lang w:eastAsia="es-GT"/>
+        </w:rPr>
+      </w:pPr>
+    </w:p>
+    <w:p>
+      <w:pPr>
+        <w:spacing w:before="100" w:beforeAutospacing="1" w:after="100" w:afterAutospacing="1" w:line="240" w:lineRule="auto"/>
+        <w:rPr>
+          <w:rFonts w:ascii="Arial" w:eastAsia="Times New Roman" w:hAnsi="Arial" w:cs="Arial"/>
+          <w:sz w:val="24"/>
+          <w:szCs w:val="24"/>
+          <w:lang w:eastAsia="es-GT"/>
+        </w:rPr>
+      </w:pPr>
+    </w:p>
+    <w:p>
+      <w:pPr>
+        <w:rPr>
+          <w:b/>
+        </w:rPr>
+      </w:pPr>
+      <w:r>
+        <w:rPr>
+          <w:b/>
+        </w:rPr>
+        <w:t>Tupla: Pago</w:t>
+      </w:r>
+    </w:p>
+    <w:p>
+      <w:r>
+        <w:t>HURH-0010</w:t>
+      </w:r>
+      <w:r>
+        <w:t xml:space="preserve"> Registro de pago:</w:t>
+      </w:r>
+    </w:p>
+    <w:p>
+      <w:r>
+        <w:t>1. Como un registro de pagos</w:t>
       </w:r>
       <w:bookmarkStart w:id="0" w:name="_GoBack"/>
       <w:bookmarkEnd w:id="0"/>
+    </w:p>
+    <w:p>
+      <w:r>
+        <w:t>2. Quiero que registre los datos del monto</w:t>
+      </w:r>
+    </w:p>
+    <w:p>
+      <w:r>
+        <w:t>3. Para poder confirmar que los datos del monto estén registrados</w:t>
+      </w:r>
+    </w:p>
+    <w:p>
+      <w:pPr>
+        <w:spacing w:before="100" w:beforeAutospacing="1" w:after="100" w:afterAutospacing="1" w:line="240" w:lineRule="auto"/>
+        <w:rPr>
+          <w:rFonts w:ascii="Arial" w:eastAsia="Times New Roman" w:hAnsi="Arial" w:cs="Arial"/>
+          <w:sz w:val="24"/>
+          <w:szCs w:val="24"/>
+          <w:lang w:eastAsia="es-GT"/>
+        </w:rPr>
+      </w:pPr>
+    </w:p>
+    <w:p>
+      <w:pPr>
+        <w:spacing w:before="100" w:beforeAutospacing="1" w:after="100" w:afterAutospacing="1" w:line="240" w:lineRule="auto"/>
+        <w:rPr>
+          <w:rFonts w:ascii="Arial" w:eastAsia="Times New Roman" w:hAnsi="Arial" w:cs="Arial"/>
+          <w:sz w:val="24"/>
+          <w:szCs w:val="24"/>
+          <w:lang w:eastAsia="es-GT"/>
+        </w:rPr>
+      </w:pPr>
+    </w:p>
+    <w:p>
+      <w:pPr>
+        <w:spacing w:before="100" w:beforeAutospacing="1" w:after="100" w:afterAutospacing="1" w:line="240" w:lineRule="auto"/>
+        <w:rPr>
+          <w:rFonts w:ascii="Arial" w:eastAsia="Times New Roman" w:hAnsi="Arial" w:cs="Arial"/>
+          <w:sz w:val="24"/>
+          <w:szCs w:val="24"/>
+          <w:lang w:eastAsia="es-GT"/>
+        </w:rPr>
+      </w:pPr>
+    </w:p>
+    <w:p>
+      <w:pPr>
+        <w:spacing w:before="100" w:beforeAutospacing="1" w:after="100" w:afterAutospacing="1" w:line="240" w:lineRule="auto"/>
+        <w:rPr>
+          <w:rFonts w:ascii="Arial" w:eastAsia="Times New Roman" w:hAnsi="Arial" w:cs="Arial"/>
+          <w:sz w:val="24"/>
+          <w:szCs w:val="24"/>
+          <w:lang w:eastAsia="es-GT"/>
+        </w:rPr>
+      </w:pPr>
+    </w:p>
+    <w:p>
+      <w:pPr>
+        <w:spacing w:before="100" w:beforeAutospacing="1" w:after="100" w:afterAutospacing="1" w:line="240" w:lineRule="auto"/>
+        <w:rPr>
+          <w:rFonts w:ascii="Arial" w:eastAsia="Times New Roman" w:hAnsi="Arial" w:cs="Arial"/>
+          <w:sz w:val="24"/>
+          <w:szCs w:val="24"/>
+          <w:lang w:eastAsia="es-GT"/>
+        </w:rPr>
+      </w:pPr>
+    </w:p>
+    <w:p>
+      <w:pPr>
+        <w:spacing w:before="100" w:beforeAutospacing="1" w:after="100" w:afterAutospacing="1" w:line="240" w:lineRule="auto"/>
+        <w:rPr>
+          <w:rFonts w:ascii="Arial" w:eastAsia="Times New Roman" w:hAnsi="Arial" w:cs="Arial"/>
+          <w:sz w:val="24"/>
+          <w:szCs w:val="24"/>
+          <w:lang w:eastAsia="es-GT"/>
+        </w:rPr>
+      </w:pPr>
+    </w:p>
+    <w:p>
+      <w:pPr>
+        <w:spacing w:before="100" w:beforeAutospacing="1" w:after="100" w:afterAutospacing="1" w:line="240" w:lineRule="auto"/>
+        <w:rPr>
+          <w:rFonts w:ascii="Arial" w:eastAsia="Times New Roman" w:hAnsi="Arial" w:cs="Arial"/>
+          <w:sz w:val="24"/>
+          <w:szCs w:val="24"/>
+          <w:lang w:eastAsia="es-GT"/>
+        </w:rPr>
+      </w:pPr>
+    </w:p>
+    <w:p>
+      <w:pPr>
+        <w:spacing w:before="100" w:beforeAutospacing="1" w:after="100" w:afterAutospacing="1" w:line="240" w:lineRule="auto"/>
+        <w:rPr>
+          <w:rFonts w:ascii="Arial" w:eastAsia="Times New Roman" w:hAnsi="Arial" w:cs="Arial"/>
+          <w:sz w:val="24"/>
+          <w:szCs w:val="24"/>
+          <w:lang w:eastAsia="es-GT"/>
+        </w:rPr>
+      </w:pPr>
+    </w:p>
+    <w:p>
+      <w:pPr>
+        <w:spacing w:before="100" w:beforeAutospacing="1" w:after="100" w:afterAutospacing="1" w:line="240" w:lineRule="auto"/>
+        <w:rPr>
+          <w:rFonts w:ascii="Arial" w:eastAsia="Times New Roman" w:hAnsi="Arial" w:cs="Arial"/>
+          <w:sz w:val="24"/>
+          <w:szCs w:val="24"/>
+          <w:lang w:eastAsia="es-GT"/>
+        </w:rPr>
+      </w:pPr>
+    </w:p>
+    <w:p>
+      <w:pPr>
+        <w:spacing w:before="100" w:beforeAutospacing="1" w:after="100" w:afterAutospacing="1" w:line="240" w:lineRule="auto"/>
+        <w:rPr>
+          <w:rFonts w:ascii="Arial" w:eastAsia="Times New Roman" w:hAnsi="Arial" w:cs="Arial"/>
+          <w:sz w:val="24"/>
+          <w:szCs w:val="24"/>
+          <w:lang w:eastAsia="es-GT"/>
+        </w:rPr>
+      </w:pPr>
+    </w:p>
+    <w:p>
+      <w:pPr>
+        <w:spacing w:before="100" w:beforeAutospacing="1" w:after="100" w:afterAutospacing="1" w:line="240" w:lineRule="auto"/>
+        <w:rPr>
+          <w:rFonts w:ascii="Arial" w:eastAsia="Times New Roman" w:hAnsi="Arial" w:cs="Arial"/>
+          <w:sz w:val="24"/>
+          <w:szCs w:val="24"/>
+          <w:lang w:eastAsia="es-GT"/>
+        </w:rPr>
+      </w:pPr>
+    </w:p>
+    <w:p>
+      <w:pPr>
+        <w:spacing w:before="100" w:beforeAutospacing="1" w:after="100" w:afterAutospacing="1" w:line="240" w:lineRule="auto"/>
+        <w:rPr>
+          <w:rFonts w:ascii="Arial" w:eastAsia="Times New Roman" w:hAnsi="Arial" w:cs="Arial"/>
+          <w:sz w:val="24"/>
+          <w:szCs w:val="24"/>
+          <w:lang w:eastAsia="es-GT"/>
+        </w:rPr>
+      </w:pPr>
+    </w:p>
+    <w:p>
+      <w:pPr>
+        <w:spacing w:before="100" w:beforeAutospacing="1" w:after="100" w:afterAutospacing="1" w:line="240" w:lineRule="auto"/>
+        <w:rPr>
+          <w:rFonts w:ascii="Arial" w:eastAsia="Times New Roman" w:hAnsi="Arial" w:cs="Arial"/>
+          <w:sz w:val="24"/>
+          <w:szCs w:val="24"/>
+          <w:lang w:eastAsia="es-GT"/>
+        </w:rPr>
+      </w:pPr>
+    </w:p>
+    <w:p>
+      <w:pPr>
+        <w:spacing w:before="100" w:beforeAutospacing="1" w:after="100" w:afterAutospacing="1" w:line="240" w:lineRule="auto"/>
+        <w:rPr>
+          <w:rFonts w:ascii="Arial" w:eastAsia="Times New Roman" w:hAnsi="Arial" w:cs="Arial"/>
+          <w:sz w:val="24"/>
+          <w:szCs w:val="24"/>
+          <w:lang w:eastAsia="es-GT"/>
+        </w:rPr>
+      </w:pPr>
+    </w:p>
+    <w:p>
+      <w:pPr>
+        <w:spacing w:before="100" w:beforeAutospacing="1" w:after="100" w:afterAutospacing="1" w:line="240" w:lineRule="auto"/>
+        <w:rPr>
+          <w:rFonts w:ascii="Arial" w:eastAsia="Times New Roman" w:hAnsi="Arial" w:cs="Arial"/>
+          <w:sz w:val="24"/>
+          <w:szCs w:val="24"/>
+          <w:lang w:eastAsia="es-GT"/>
+        </w:rPr>
+      </w:pPr>
+    </w:p>
+    <w:p>
+      <w:pPr>
+        <w:spacing w:before="100" w:beforeAutospacing="1" w:after="100" w:afterAutospacing="1" w:line="240" w:lineRule="auto"/>
+        <w:rPr>
+          <w:rFonts w:ascii="Arial" w:eastAsia="Times New Roman" w:hAnsi="Arial" w:cs="Arial"/>
+          <w:sz w:val="24"/>
+          <w:szCs w:val="24"/>
+          <w:lang w:eastAsia="es-GT"/>
+        </w:rPr>
+      </w:pPr>
+    </w:p>
+    <w:p>
+      <w:pPr>
+        <w:spacing w:before="100" w:beforeAutospacing="1" w:after="100" w:afterAutospacing="1" w:line="240" w:lineRule="auto"/>
+        <w:rPr>
+          <w:rFonts w:ascii="Arial" w:eastAsia="Times New Roman" w:hAnsi="Arial" w:cs="Arial"/>
+          <w:sz w:val="24"/>
+          <w:szCs w:val="24"/>
+          <w:lang w:eastAsia="es-GT"/>
+        </w:rPr>
+      </w:pPr>
+    </w:p>
+    <w:p>
+      <w:pPr>
+        <w:spacing w:before="100" w:beforeAutospacing="1" w:after="100" w:afterAutospacing="1" w:line="240" w:lineRule="auto"/>
+        <w:rPr>
+          <w:rFonts w:ascii="Arial" w:eastAsia="Times New Roman" w:hAnsi="Arial" w:cs="Arial"/>
+          <w:sz w:val="24"/>
+          <w:szCs w:val="24"/>
+          <w:lang w:eastAsia="es-GT"/>
+        </w:rPr>
+      </w:pPr>
+    </w:p>
+    <w:p>
+      <w:pPr>
+        <w:spacing w:before="100" w:beforeAutospacing="1" w:after="100" w:afterAutospacing="1" w:line="240" w:lineRule="auto"/>
+        <w:rPr>
+          <w:rFonts w:ascii="Arial" w:eastAsia="Times New Roman" w:hAnsi="Arial" w:cs="Arial"/>
+          <w:sz w:val="24"/>
+          <w:szCs w:val="24"/>
+          <w:lang w:eastAsia="es-GT"/>
+        </w:rPr>
+      </w:pPr>
+    </w:p>
+    <w:p>
+      <w:pPr>
+        <w:spacing w:before="100" w:beforeAutospacing="1" w:after="100" w:afterAutospacing="1" w:line="240" w:lineRule="auto"/>
+        <w:rPr>
+          <w:rFonts w:ascii="Arial" w:eastAsia="Times New Roman" w:hAnsi="Arial" w:cs="Arial"/>
+          <w:sz w:val="24"/>
+          <w:szCs w:val="24"/>
+          <w:lang w:eastAsia="es-GT"/>
+        </w:rPr>
+      </w:pPr>
+    </w:p>
+    <w:p>
+      <w:pPr>
+        <w:spacing w:before="100" w:beforeAutospacing="1" w:after="100" w:afterAutospacing="1" w:line="240" w:lineRule="auto"/>
+        <w:rPr>
+          <w:rFonts w:ascii="Arial" w:eastAsia="Times New Roman" w:hAnsi="Arial" w:cs="Arial"/>
+          <w:sz w:val="24"/>
+          <w:szCs w:val="24"/>
+          <w:lang w:eastAsia="es-GT"/>
+        </w:rPr>
+      </w:pPr>
+    </w:p>
+    <w:p>
+      <w:pPr>
+        <w:spacing w:before="100" w:beforeAutospacing="1" w:after="100" w:afterAutospacing="1" w:line="240" w:lineRule="auto"/>
+        <w:rPr>
+          <w:rFonts w:ascii="Arial" w:eastAsia="Times New Roman" w:hAnsi="Arial" w:cs="Arial"/>
+          <w:sz w:val="24"/>
+          <w:szCs w:val="24"/>
+          <w:lang w:eastAsia="es-GT"/>
+        </w:rPr>
+      </w:pPr>
+    </w:p>
+    <w:p>
+      <w:pPr>
+        <w:spacing w:before="100" w:beforeAutospacing="1" w:after="100" w:afterAutospacing="1" w:line="240" w:lineRule="auto"/>
+        <w:rPr>
+          <w:rFonts w:ascii="Arial" w:eastAsia="Times New Roman" w:hAnsi="Arial" w:cs="Arial"/>
+          <w:sz w:val="24"/>
+          <w:szCs w:val="24"/>
+          <w:lang w:eastAsia="es-GT"/>
+        </w:rPr>
+      </w:pPr>
+    </w:p>
+    <w:p>
+      <w:pPr>
+        <w:spacing w:before="100" w:beforeAutospacing="1" w:after="100" w:afterAutospacing="1" w:line="240" w:lineRule="auto"/>
+        <w:rPr>
+          <w:rFonts w:ascii="Arial" w:eastAsia="Times New Roman" w:hAnsi="Arial" w:cs="Arial"/>
+          <w:sz w:val="24"/>
+          <w:szCs w:val="24"/>
+          <w:lang w:eastAsia="es-GT"/>
+        </w:rPr>
+      </w:pPr>
+    </w:p>
+    <w:p>
+      <w:pPr>
+        <w:spacing w:before="100" w:beforeAutospacing="1" w:after="100" w:afterAutospacing="1" w:line="240" w:lineRule="auto"/>
+        <w:rPr>
+          <w:rFonts w:ascii="Arial" w:eastAsia="Times New Roman" w:hAnsi="Arial" w:cs="Arial"/>
+          <w:sz w:val="24"/>
+          <w:szCs w:val="24"/>
+          <w:lang w:eastAsia="es-GT"/>
+        </w:rPr>
+      </w:pPr>
+    </w:p>
+    <w:p>
+      <w:pPr>
+        <w:spacing w:before="100" w:beforeAutospacing="1" w:after="100" w:afterAutospacing="1" w:line="240" w:lineRule="auto"/>
+        <w:rPr>
+          <w:rFonts w:ascii="Arial" w:eastAsia="Times New Roman" w:hAnsi="Arial" w:cs="Arial"/>
+          <w:sz w:val="24"/>
+          <w:szCs w:val="24"/>
+          <w:lang w:eastAsia="es-GT"/>
+        </w:rPr>
+      </w:pPr>
+    </w:p>
+    <w:p>
+      <w:pPr>
+        <w:spacing w:before="100" w:beforeAutospacing="1" w:after="100" w:afterAutospacing="1" w:line="240" w:lineRule="auto"/>
+        <w:rPr>
+          <w:rFonts w:ascii="Arial" w:eastAsia="Times New Roman" w:hAnsi="Arial" w:cs="Arial"/>
+          <w:sz w:val="24"/>
+          <w:szCs w:val="24"/>
+          <w:lang w:eastAsia="es-GT"/>
+        </w:rPr>
+      </w:pPr>
+    </w:p>
+    <w:p>
+      <w:pPr>
+        <w:spacing w:before="100" w:beforeAutospacing="1" w:after="100" w:afterAutospacing="1" w:line="240" w:lineRule="auto"/>
+        <w:rPr>
+          <w:rFonts w:ascii="Arial" w:eastAsia="Times New Roman" w:hAnsi="Arial" w:cs="Arial"/>
+          <w:sz w:val="24"/>
+          <w:szCs w:val="24"/>
+          <w:lang w:eastAsia="es-GT"/>
+        </w:rPr>
+      </w:pPr>
+    </w:p>
+    <w:p>
+      <w:pPr>
+        <w:spacing w:before="100" w:beforeAutospacing="1" w:after="100" w:afterAutospacing="1" w:line="240" w:lineRule="auto"/>
+        <w:rPr>
+          <w:rFonts w:ascii="Arial" w:eastAsia="Times New Roman" w:hAnsi="Arial" w:cs="Arial"/>
+          <w:sz w:val="24"/>
+          <w:szCs w:val="24"/>
+          <w:lang w:eastAsia="es-GT"/>
+        </w:rPr>
+      </w:pPr>
+    </w:p>
+    <w:p>
+      <w:pPr>
+        <w:spacing w:before="100" w:beforeAutospacing="1" w:after="100" w:afterAutospacing="1" w:line="240" w:lineRule="auto"/>
+        <w:rPr>
+          <w:rFonts w:ascii="Arial" w:eastAsia="Times New Roman" w:hAnsi="Arial" w:cs="Arial"/>
+          <w:sz w:val="24"/>
+          <w:szCs w:val="24"/>
+          <w:lang w:eastAsia="es-GT"/>
+        </w:rPr>
+      </w:pPr>
+    </w:p>
+    <w:p>
+      <w:pPr>
+        <w:spacing w:before="100" w:beforeAutospacing="1" w:after="100" w:afterAutospacing="1" w:line="240" w:lineRule="auto"/>
+        <w:rPr>
+          <w:rFonts w:ascii="Arial" w:eastAsia="Times New Roman" w:hAnsi="Arial" w:cs="Arial"/>
+          <w:sz w:val="24"/>
+          <w:szCs w:val="24"/>
+          <w:lang w:eastAsia="es-GT"/>
+        </w:rPr>
+      </w:pPr>
+    </w:p>
+    <w:p>
+      <w:pPr>
+        <w:spacing w:before="100" w:beforeAutospacing="1" w:after="100" w:afterAutospacing="1" w:line="240" w:lineRule="auto"/>
+        <w:rPr>
+          <w:rFonts w:ascii="Arial" w:eastAsia="Times New Roman" w:hAnsi="Arial" w:cs="Arial"/>
+          <w:sz w:val="24"/>
+          <w:szCs w:val="24"/>
+          <w:lang w:eastAsia="es-GT"/>
+        </w:rPr>
+      </w:pPr>
+    </w:p>
+    <w:p>
+      <w:pPr>
+        <w:spacing w:before="100" w:beforeAutospacing="1" w:after="100" w:afterAutospacing="1" w:line="240" w:lineRule="auto"/>
+        <w:rPr>
+          <w:rFonts w:ascii="Arial" w:eastAsia="Times New Roman" w:hAnsi="Arial" w:cs="Arial"/>
+          <w:sz w:val="24"/>
+          <w:szCs w:val="24"/>
+          <w:lang w:eastAsia="es-GT"/>
+        </w:rPr>
+      </w:pPr>
+    </w:p>
+    <w:p>
+      <w:pPr>
+        <w:spacing w:before="100" w:beforeAutospacing="1" w:after="100" w:afterAutospacing="1" w:line="240" w:lineRule="auto"/>
+        <w:rPr>
+          <w:rFonts w:ascii="Arial" w:eastAsia="Times New Roman" w:hAnsi="Arial" w:cs="Arial"/>
+          <w:sz w:val="24"/>
+          <w:szCs w:val="24"/>
+          <w:lang w:eastAsia="es-GT"/>
+        </w:rPr>
+      </w:pPr>
+    </w:p>
+    <w:p>
+      <w:pPr>
+        <w:spacing w:before="100" w:beforeAutospacing="1" w:after="100" w:afterAutospacing="1" w:line="240" w:lineRule="auto"/>
+        <w:rPr>
+          <w:rFonts w:ascii="Arial" w:eastAsia="Times New Roman" w:hAnsi="Arial" w:cs="Arial"/>
+          <w:sz w:val="24"/>
+          <w:szCs w:val="24"/>
+          <w:lang w:eastAsia="es-GT"/>
+        </w:rPr>
+      </w:pPr>
+    </w:p>
+    <w:p>
+      <w:pPr>
+        <w:spacing w:before="100" w:beforeAutospacing="1" w:after="100" w:afterAutospacing="1" w:line="240" w:lineRule="auto"/>
+        <w:rPr>
+          <w:rFonts w:ascii="Arial" w:eastAsia="Times New Roman" w:hAnsi="Arial" w:cs="Arial"/>
+          <w:sz w:val="24"/>
+          <w:szCs w:val="24"/>
+          <w:lang w:eastAsia="es-GT"/>
+        </w:rPr>
+      </w:pPr>
+    </w:p>
+    <w:p>
+      <w:pPr>
+        <w:spacing w:before="100" w:beforeAutospacing="1" w:after="100" w:afterAutospacing="1" w:line="240" w:lineRule="auto"/>
+        <w:rPr>
+          <w:rFonts w:ascii="Arial" w:eastAsia="Times New Roman" w:hAnsi="Arial" w:cs="Arial"/>
+          <w:sz w:val="24"/>
+          <w:szCs w:val="24"/>
+          <w:lang w:eastAsia="es-GT"/>
+        </w:rPr>
+      </w:pPr>
+    </w:p>
+    <w:p>
+      <w:pPr>
+        <w:spacing w:before="100" w:beforeAutospacing="1" w:after="100" w:afterAutospacing="1" w:line="240" w:lineRule="auto"/>
+        <w:rPr>
+          <w:rFonts w:ascii="Arial" w:eastAsia="Times New Roman" w:hAnsi="Arial" w:cs="Arial"/>
+          <w:sz w:val="24"/>
+          <w:szCs w:val="24"/>
+          <w:lang w:eastAsia="es-GT"/>
+        </w:rPr>
+      </w:pPr>
+    </w:p>
+    <w:p>
+      <w:pPr>
+        <w:spacing w:before="100" w:beforeAutospacing="1" w:after="100" w:afterAutospacing="1" w:line="240" w:lineRule="auto"/>
+        <w:rPr>
+          <w:rFonts w:ascii="Arial" w:eastAsia="Times New Roman" w:hAnsi="Arial" w:cs="Arial"/>
+          <w:sz w:val="24"/>
+          <w:szCs w:val="24"/>
+          <w:lang w:eastAsia="es-GT"/>
+        </w:rPr>
+      </w:pPr>
+    </w:p>
+    <w:p>
+      <w:pPr>
+        <w:spacing w:before="100" w:beforeAutospacing="1" w:after="100" w:afterAutospacing="1" w:line="240" w:lineRule="auto"/>
+        <w:rPr>
+          <w:rFonts w:ascii="Arial" w:eastAsia="Times New Roman" w:hAnsi="Arial" w:cs="Arial"/>
+          <w:sz w:val="24"/>
+          <w:szCs w:val="24"/>
+          <w:lang w:eastAsia="es-GT"/>
+        </w:rPr>
+      </w:pPr>
+    </w:p>
+    <w:p>
+      <w:pPr>
+        <w:spacing w:before="100" w:beforeAutospacing="1" w:after="100" w:afterAutospacing="1" w:line="240" w:lineRule="auto"/>
+        <w:rPr>
+          <w:rFonts w:ascii="Arial" w:eastAsia="Times New Roman" w:hAnsi="Arial" w:cs="Arial"/>
+          <w:sz w:val="24"/>
+          <w:szCs w:val="24"/>
+          <w:lang w:eastAsia="es-GT"/>
+        </w:rPr>
+      </w:pPr>
+    </w:p>
+    <w:p>
+      <w:pPr>
+        <w:spacing w:before="100" w:beforeAutospacing="1" w:after="100" w:afterAutospacing="1" w:line="240" w:lineRule="auto"/>
+        <w:rPr>
+          <w:rFonts w:ascii="Arial" w:eastAsia="Times New Roman" w:hAnsi="Arial" w:cs="Arial"/>
+          <w:sz w:val="24"/>
+          <w:szCs w:val="24"/>
+          <w:lang w:eastAsia="es-GT"/>
+        </w:rPr>
+      </w:pPr>
+    </w:p>
+    <w:p>
+      <w:pPr>
+        <w:spacing w:before="100" w:beforeAutospacing="1" w:after="100" w:afterAutospacing="1" w:line="240" w:lineRule="auto"/>
+        <w:rPr>
+          <w:rFonts w:ascii="Arial" w:eastAsia="Times New Roman" w:hAnsi="Arial" w:cs="Arial"/>
+          <w:sz w:val="24"/>
+          <w:szCs w:val="24"/>
+          <w:lang w:eastAsia="es-GT"/>
+        </w:rPr>
+      </w:pPr>
+    </w:p>
+    <w:p>
+      <w:pPr>
+        <w:spacing w:before="100" w:beforeAutospacing="1" w:after="100" w:afterAutospacing="1" w:line="240" w:lineRule="auto"/>
+        <w:rPr>
+          <w:rFonts w:ascii="Arial" w:eastAsia="Times New Roman" w:hAnsi="Arial" w:cs="Arial"/>
+          <w:sz w:val="24"/>
+          <w:szCs w:val="24"/>
+          <w:lang w:eastAsia="es-GT"/>
+        </w:rPr>
+      </w:pPr>
+    </w:p>
+    <w:p>
+      <w:pPr>
+        <w:spacing w:before="100" w:beforeAutospacing="1" w:after="100" w:afterAutospacing="1" w:line="240" w:lineRule="auto"/>
+        <w:rPr>
+          <w:rFonts w:ascii="Arial" w:eastAsia="Times New Roman" w:hAnsi="Arial" w:cs="Arial"/>
+          <w:sz w:val="24"/>
+          <w:szCs w:val="24"/>
+          <w:lang w:eastAsia="es-GT"/>
+        </w:rPr>
+      </w:pPr>
+    </w:p>
+    <w:p>
+      <w:pPr>
+        <w:spacing w:before="100" w:beforeAutospacing="1" w:after="100" w:afterAutospacing="1" w:line="240" w:lineRule="auto"/>
+        <w:rPr>
+          <w:rFonts w:ascii="Arial" w:eastAsia="Times New Roman" w:hAnsi="Arial" w:cs="Arial"/>
+          <w:sz w:val="24"/>
+          <w:szCs w:val="24"/>
+          <w:lang w:eastAsia="es-GT"/>
+        </w:rPr>
+      </w:pPr>
+    </w:p>
+    <w:p>
+      <w:pPr>
+        <w:spacing w:before="100" w:beforeAutospacing="1" w:after="100" w:afterAutospacing="1" w:line="240" w:lineRule="auto"/>
+        <w:rPr>
+          <w:rFonts w:ascii="Arial" w:eastAsia="Times New Roman" w:hAnsi="Arial" w:cs="Arial"/>
+          <w:sz w:val="24"/>
+          <w:szCs w:val="24"/>
+          <w:lang w:eastAsia="es-GT"/>
+        </w:rPr>
+      </w:pPr>
+    </w:p>
+    <w:p>
+      <w:pPr>
+        <w:spacing w:before="100" w:beforeAutospacing="1" w:after="100" w:afterAutospacing="1" w:line="240" w:lineRule="auto"/>
+        <w:rPr>
+          <w:rFonts w:ascii="Arial" w:eastAsia="Times New Roman" w:hAnsi="Arial" w:cs="Arial"/>
+          <w:sz w:val="24"/>
+          <w:szCs w:val="24"/>
+          <w:lang w:eastAsia="es-GT"/>
+        </w:rPr>
+      </w:pPr>
+    </w:p>
+    <w:p>
+      <w:pPr>
+        <w:spacing w:before="100" w:beforeAutospacing="1" w:after="100" w:afterAutospacing="1" w:line="240" w:lineRule="auto"/>
+        <w:rPr>
+          <w:rFonts w:ascii="Arial" w:eastAsia="Times New Roman" w:hAnsi="Arial" w:cs="Arial"/>
+          <w:sz w:val="24"/>
+          <w:szCs w:val="24"/>
+          <w:lang w:eastAsia="es-GT"/>
+        </w:rPr>
+      </w:pPr>
+    </w:p>
+    <w:p>
+      <w:pPr>
+        <w:spacing w:before="100" w:beforeAutospacing="1" w:after="100" w:afterAutospacing="1" w:line="240" w:lineRule="auto"/>
+        <w:rPr>
+          <w:rFonts w:ascii="Arial" w:eastAsia="Times New Roman" w:hAnsi="Arial" w:cs="Arial"/>
+          <w:sz w:val="24"/>
+          <w:szCs w:val="24"/>
+          <w:lang w:eastAsia="es-GT"/>
+        </w:rPr>
+      </w:pPr>
+    </w:p>
+    <w:p>
+      <w:pPr>
+        <w:spacing w:before="100" w:beforeAutospacing="1" w:after="100" w:afterAutospacing="1" w:line="240" w:lineRule="auto"/>
+        <w:rPr>
+          <w:rFonts w:ascii="Arial" w:eastAsia="Times New Roman" w:hAnsi="Arial" w:cs="Arial"/>
+          <w:sz w:val="24"/>
+          <w:szCs w:val="24"/>
+          <w:lang w:eastAsia="es-GT"/>
+        </w:rPr>
+      </w:pPr>
+    </w:p>
+    <w:p>
+      <w:pPr>
+        <w:spacing w:before="100" w:beforeAutospacing="1" w:after="100" w:afterAutospacing="1" w:line="240" w:lineRule="auto"/>
+        <w:rPr>
+          <w:rFonts w:ascii="Arial" w:eastAsia="Times New Roman" w:hAnsi="Arial" w:cs="Arial"/>
+          <w:sz w:val="24"/>
+          <w:szCs w:val="24"/>
+          <w:lang w:eastAsia="es-GT"/>
+        </w:rPr>
+      </w:pPr>
+    </w:p>
+    <w:p>
+      <w:pPr>
+        <w:spacing w:before="100" w:beforeAutospacing="1" w:after="100" w:afterAutospacing="1" w:line="240" w:lineRule="auto"/>
+        <w:rPr>
+          <w:rFonts w:ascii="Arial" w:eastAsia="Times New Roman" w:hAnsi="Arial" w:cs="Arial"/>
+          <w:sz w:val="24"/>
+          <w:szCs w:val="24"/>
+          <w:lang w:eastAsia="es-GT"/>
+        </w:rPr>
+      </w:pPr>
+    </w:p>
+    <w:p>
+      <w:pPr>
+        <w:spacing w:before="100" w:beforeAutospacing="1" w:after="100" w:afterAutospacing="1" w:line="240" w:lineRule="auto"/>
+        <w:rPr>
+          <w:rFonts w:ascii="Arial" w:eastAsia="Times New Roman" w:hAnsi="Arial" w:cs="Arial"/>
+          <w:sz w:val="24"/>
+          <w:szCs w:val="24"/>
+          <w:lang w:eastAsia="es-GT"/>
+        </w:rPr>
+      </w:pPr>
+    </w:p>
+    <w:p>
+      <w:pPr>
+        <w:spacing w:before="100" w:beforeAutospacing="1" w:after="100" w:afterAutospacing="1" w:line="240" w:lineRule="auto"/>
+        <w:rPr>
+          <w:rFonts w:ascii="Arial" w:eastAsia="Times New Roman" w:hAnsi="Arial" w:cs="Arial"/>
+          <w:sz w:val="24"/>
+          <w:szCs w:val="24"/>
+          <w:lang w:eastAsia="es-GT"/>
+        </w:rPr>
+      </w:pPr>
+    </w:p>
+    <w:p>
+      <w:pPr>
+        <w:spacing w:before="100" w:beforeAutospacing="1" w:after="100" w:afterAutospacing="1" w:line="240" w:lineRule="auto"/>
+        <w:rPr>
+          <w:rFonts w:ascii="Arial" w:eastAsia="Times New Roman" w:hAnsi="Arial" w:cs="Arial"/>
+          <w:sz w:val="24"/>
+          <w:szCs w:val="24"/>
+          <w:lang w:eastAsia="es-GT"/>
+        </w:rPr>
+      </w:pPr>
+    </w:p>
+    <w:p>
+      <w:pPr>
+        <w:spacing w:before="100" w:beforeAutospacing="1" w:after="100" w:afterAutospacing="1" w:line="240" w:lineRule="auto"/>
+        <w:rPr>
+          <w:rFonts w:ascii="Arial" w:eastAsia="Times New Roman" w:hAnsi="Arial" w:cs="Arial"/>
+          <w:sz w:val="24"/>
+          <w:szCs w:val="24"/>
+          <w:lang w:eastAsia="es-GT"/>
+        </w:rPr>
+      </w:pPr>
+    </w:p>
+    <w:p>
+      <w:pPr>
+        <w:spacing w:before="100" w:beforeAutospacing="1" w:after="100" w:afterAutospacing="1" w:line="240" w:lineRule="auto"/>
+        <w:rPr>
+          <w:rFonts w:ascii="Arial" w:eastAsia="Times New Roman" w:hAnsi="Arial" w:cs="Arial"/>
+          <w:sz w:val="24"/>
+          <w:szCs w:val="24"/>
+          <w:lang w:eastAsia="es-GT"/>
+        </w:rPr>
+      </w:pPr>
+    </w:p>
+    <w:p>
+      <w:pPr>
+        <w:spacing w:before="100" w:beforeAutospacing="1" w:after="100" w:afterAutospacing="1" w:line="240" w:lineRule="auto"/>
+        <w:rPr>
+          <w:rFonts w:ascii="Arial" w:eastAsia="Times New Roman" w:hAnsi="Arial" w:cs="Arial"/>
+          <w:sz w:val="24"/>
+          <w:szCs w:val="24"/>
+          <w:lang w:eastAsia="es-GT"/>
+        </w:rPr>
+      </w:pPr>
+    </w:p>
+    <w:p>
+      <w:pPr>
+        <w:spacing w:before="100" w:beforeAutospacing="1" w:after="100" w:afterAutospacing="1" w:line="240" w:lineRule="auto"/>
+        <w:rPr>
+          <w:rFonts w:ascii="Arial" w:eastAsia="Times New Roman" w:hAnsi="Arial" w:cs="Arial"/>
+          <w:sz w:val="24"/>
+          <w:szCs w:val="24"/>
+          <w:lang w:eastAsia="es-GT"/>
+        </w:rPr>
+      </w:pPr>
+    </w:p>
+    <w:p>
+      <w:pPr>
+        <w:spacing w:before="100" w:beforeAutospacing="1" w:after="100" w:afterAutospacing="1" w:line="240" w:lineRule="auto"/>
+        <w:rPr>
+          <w:rFonts w:ascii="Arial" w:eastAsia="Times New Roman" w:hAnsi="Arial" w:cs="Arial"/>
+          <w:sz w:val="24"/>
+          <w:szCs w:val="24"/>
+          <w:lang w:eastAsia="es-GT"/>
+        </w:rPr>
+      </w:pPr>
+    </w:p>
+    <w:p>
+      <w:pPr>
+        <w:spacing w:before="100" w:beforeAutospacing="1" w:after="100" w:afterAutospacing="1" w:line="240" w:lineRule="auto"/>
+        <w:rPr>
+          <w:rFonts w:ascii="Arial" w:eastAsia="Times New Roman" w:hAnsi="Arial" w:cs="Arial"/>
+          <w:sz w:val="24"/>
+          <w:szCs w:val="24"/>
+          <w:lang w:eastAsia="es-GT"/>
+        </w:rPr>
+      </w:pPr>
+    </w:p>
+    <w:p>
+      <w:pPr>
+        <w:spacing w:before="100" w:beforeAutospacing="1" w:after="100" w:afterAutospacing="1" w:line="240" w:lineRule="auto"/>
+        <w:rPr>
+          <w:rFonts w:ascii="Arial" w:eastAsia="Times New Roman" w:hAnsi="Arial" w:cs="Arial"/>
+          <w:sz w:val="24"/>
+          <w:szCs w:val="24"/>
+          <w:lang w:eastAsia="es-GT"/>
+        </w:rPr>
+      </w:pPr>
+    </w:p>
+    <w:p>
+      <w:pPr>
+        <w:spacing w:before="100" w:beforeAutospacing="1" w:after="100" w:afterAutospacing="1" w:line="240" w:lineRule="auto"/>
+        <w:rPr>
+          <w:rFonts w:ascii="Arial" w:eastAsia="Times New Roman" w:hAnsi="Arial" w:cs="Arial"/>
+          <w:sz w:val="24"/>
+          <w:szCs w:val="24"/>
+          <w:lang w:eastAsia="es-GT"/>
+        </w:rPr>
+      </w:pPr>
+    </w:p>
+    <w:p>
+      <w:pPr>
+        <w:spacing w:before="100" w:beforeAutospacing="1" w:after="100" w:afterAutospacing="1" w:line="240" w:lineRule="auto"/>
+        <w:rPr>
+          <w:rFonts w:ascii="Arial" w:eastAsia="Times New Roman" w:hAnsi="Arial" w:cs="Arial"/>
+          <w:sz w:val="24"/>
+          <w:szCs w:val="24"/>
+          <w:lang w:eastAsia="es-GT"/>
+        </w:rPr>
+      </w:pPr>
+    </w:p>
+    <w:p>
+      <w:pPr>
+        <w:spacing w:before="100" w:beforeAutospacing="1" w:after="100" w:afterAutospacing="1" w:line="240" w:lineRule="auto"/>
+        <w:rPr>
+          <w:rFonts w:ascii="Arial" w:eastAsia="Times New Roman" w:hAnsi="Arial" w:cs="Arial"/>
+          <w:sz w:val="24"/>
+          <w:szCs w:val="24"/>
+          <w:lang w:eastAsia="es-GT"/>
+        </w:rPr>
+      </w:pPr>
+    </w:p>
+    <w:p>
+      <w:pPr>
+        <w:spacing w:before="100" w:beforeAutospacing="1" w:after="100" w:afterAutospacing="1" w:line="240" w:lineRule="auto"/>
+        <w:rPr>
+          <w:rFonts w:ascii="Arial" w:eastAsia="Times New Roman" w:hAnsi="Arial" w:cs="Arial"/>
+          <w:sz w:val="24"/>
+          <w:szCs w:val="24"/>
+          <w:lang w:eastAsia="es-GT"/>
+        </w:rPr>
+      </w:pPr>
+    </w:p>
+    <w:p>
+      <w:pPr>
+        <w:spacing w:before="100" w:beforeAutospacing="1" w:after="100" w:afterAutospacing="1" w:line="240" w:lineRule="auto"/>
+        <w:rPr>
+          <w:rFonts w:ascii="Arial" w:eastAsia="Times New Roman" w:hAnsi="Arial" w:cs="Arial"/>
+          <w:sz w:val="24"/>
+          <w:szCs w:val="24"/>
+          <w:lang w:eastAsia="es-GT"/>
+        </w:rPr>
+      </w:pPr>
+    </w:p>
+    <w:p>
+      <w:pPr>
+        <w:spacing w:before="100" w:beforeAutospacing="1" w:after="100" w:afterAutospacing="1" w:line="240" w:lineRule="auto"/>
+        <w:rPr>
+          <w:rFonts w:ascii="Arial" w:eastAsia="Times New Roman" w:hAnsi="Arial" w:cs="Arial"/>
+          <w:sz w:val="24"/>
+          <w:szCs w:val="24"/>
+          <w:lang w:eastAsia="es-GT"/>
+        </w:rPr>
+      </w:pPr>
+    </w:p>
+    <w:p>
+      <w:pPr>
+        <w:spacing w:before="100" w:beforeAutospacing="1" w:after="100" w:afterAutospacing="1" w:line="240" w:lineRule="auto"/>
+        <w:rPr>
+          <w:rFonts w:ascii="Arial" w:eastAsia="Times New Roman" w:hAnsi="Arial" w:cs="Arial"/>
+          <w:sz w:val="24"/>
+          <w:szCs w:val="24"/>
+          <w:lang w:eastAsia="es-GT"/>
+        </w:rPr>
+      </w:pPr>
+    </w:p>
+    <w:p>
+      <w:pPr>
+        <w:spacing w:before="100" w:beforeAutospacing="1" w:after="100" w:afterAutospacing="1" w:line="240" w:lineRule="auto"/>
+        <w:rPr>
+          <w:rFonts w:ascii="Arial" w:eastAsia="Times New Roman" w:hAnsi="Arial" w:cs="Arial"/>
+          <w:sz w:val="24"/>
+          <w:szCs w:val="24"/>
+          <w:lang w:eastAsia="es-GT"/>
+        </w:rPr>
+      </w:pPr>
+    </w:p>
+    <w:p>
+      <w:pPr>
+        <w:spacing w:before="100" w:beforeAutospacing="1" w:after="100" w:afterAutospacing="1" w:line="240" w:lineRule="auto"/>
+        <w:rPr>
+          <w:rFonts w:ascii="Arial" w:eastAsia="Times New Roman" w:hAnsi="Arial" w:cs="Arial"/>
+          <w:sz w:val="24"/>
+          <w:szCs w:val="24"/>
+          <w:lang w:eastAsia="es-GT"/>
+        </w:rPr>
+      </w:pPr>
+    </w:p>
+    <w:p>
+      <w:pPr>
+        <w:spacing w:before="100" w:beforeAutospacing="1" w:after="100" w:afterAutospacing="1" w:line="240" w:lineRule="auto"/>
+        <w:rPr>
+          <w:rFonts w:ascii="Arial" w:eastAsia="Times New Roman" w:hAnsi="Arial" w:cs="Arial"/>
+          <w:sz w:val="24"/>
+          <w:szCs w:val="24"/>
+          <w:lang w:eastAsia="es-GT"/>
+        </w:rPr>
+      </w:pPr>
+    </w:p>
+    <w:p>
+      <w:pPr>
+        <w:spacing w:before="100" w:beforeAutospacing="1" w:after="100" w:afterAutospacing="1" w:line="240" w:lineRule="auto"/>
+        <w:rPr>
+          <w:rFonts w:ascii="Arial" w:eastAsia="Times New Roman" w:hAnsi="Arial" w:cs="Arial"/>
+          <w:sz w:val="24"/>
+          <w:szCs w:val="24"/>
+          <w:lang w:eastAsia="es-GT"/>
+        </w:rPr>
+      </w:pPr>
+    </w:p>
+    <w:p>
+      <w:pPr>
+        <w:spacing w:before="100" w:beforeAutospacing="1" w:after="100" w:afterAutospacing="1" w:line="240" w:lineRule="auto"/>
+        <w:rPr>
+          <w:rFonts w:ascii="Arial" w:eastAsia="Times New Roman" w:hAnsi="Arial" w:cs="Arial"/>
+          <w:sz w:val="24"/>
+          <w:szCs w:val="24"/>
+          <w:lang w:eastAsia="es-GT"/>
+        </w:rPr>
+      </w:pPr>
+    </w:p>
+    <w:p>
+      <w:pPr>
+        <w:spacing w:before="100" w:beforeAutospacing="1" w:after="100" w:afterAutospacing="1" w:line="240" w:lineRule="auto"/>
+        <w:rPr>
+          <w:rFonts w:ascii="Arial" w:eastAsia="Times New Roman" w:hAnsi="Arial" w:cs="Arial"/>
+          <w:sz w:val="24"/>
+          <w:szCs w:val="24"/>
+          <w:lang w:eastAsia="es-GT"/>
+        </w:rPr>
+      </w:pPr>
+    </w:p>
+    <w:p>
+      <w:pPr>
+        <w:spacing w:before="100" w:beforeAutospacing="1" w:after="100" w:afterAutospacing="1" w:line="240" w:lineRule="auto"/>
+        <w:rPr>
+          <w:rFonts w:ascii="Arial" w:eastAsia="Times New Roman" w:hAnsi="Arial" w:cs="Arial"/>
+          <w:sz w:val="24"/>
+          <w:szCs w:val="24"/>
+          <w:lang w:eastAsia="es-GT"/>
+        </w:rPr>
+      </w:pPr>
+    </w:p>
+    <w:p>
+      <w:pPr>
+        <w:spacing w:before="100" w:beforeAutospacing="1" w:after="100" w:afterAutospacing="1" w:line="240" w:lineRule="auto"/>
+        <w:rPr>
+          <w:rFonts w:ascii="Arial" w:eastAsia="Times New Roman" w:hAnsi="Arial" w:cs="Arial"/>
+          <w:sz w:val="24"/>
+          <w:szCs w:val="24"/>
+          <w:lang w:eastAsia="es-GT"/>
+        </w:rPr>
+      </w:pPr>
+    </w:p>
+    <w:p>
+      <w:pPr>
+        <w:spacing w:before="100" w:beforeAutospacing="1" w:after="100" w:afterAutospacing="1" w:line="240" w:lineRule="auto"/>
+        <w:rPr>
+          <w:rFonts w:ascii="Arial" w:eastAsia="Times New Roman" w:hAnsi="Arial" w:cs="Arial"/>
+          <w:sz w:val="24"/>
+          <w:szCs w:val="24"/>
+          <w:lang w:eastAsia="es-GT"/>
+        </w:rPr>
+      </w:pPr>
+    </w:p>
+    <w:p>
+      <w:pPr>
+        <w:spacing w:before="100" w:beforeAutospacing="1" w:after="100" w:afterAutospacing="1" w:line="240" w:lineRule="auto"/>
+        <w:rPr>
+          <w:rFonts w:ascii="Arial" w:eastAsia="Times New Roman" w:hAnsi="Arial" w:cs="Arial"/>
+          <w:sz w:val="24"/>
+          <w:szCs w:val="24"/>
+          <w:lang w:eastAsia="es-GT"/>
+        </w:rPr>
+      </w:pPr>
+    </w:p>
+    <w:p>
+      <w:pPr>
+        <w:spacing w:before="100" w:beforeAutospacing="1" w:after="100" w:afterAutospacing="1" w:line="240" w:lineRule="auto"/>
+        <w:rPr>
+          <w:rFonts w:ascii="Arial" w:eastAsia="Times New Roman" w:hAnsi="Arial" w:cs="Arial"/>
+          <w:sz w:val="24"/>
+          <w:szCs w:val="24"/>
+          <w:lang w:eastAsia="es-GT"/>
+        </w:rPr>
+      </w:pPr>
+    </w:p>
+    <w:p>
+      <w:pPr>
+        <w:spacing w:before="100" w:beforeAutospacing="1" w:after="100" w:afterAutospacing="1" w:line="240" w:lineRule="auto"/>
+        <w:rPr>
+          <w:rFonts w:ascii="Arial" w:eastAsia="Times New Roman" w:hAnsi="Arial" w:cs="Arial"/>
+          <w:sz w:val="24"/>
+          <w:szCs w:val="24"/>
+          <w:lang w:eastAsia="es-GT"/>
+        </w:rPr>
+      </w:pPr>
+    </w:p>
+    <w:p>
+      <w:pPr>
+        <w:spacing w:before="100" w:beforeAutospacing="1" w:after="100" w:afterAutospacing="1" w:line="240" w:lineRule="auto"/>
+        <w:rPr>
+          <w:rFonts w:ascii="Arial" w:eastAsia="Times New Roman" w:hAnsi="Arial" w:cs="Arial"/>
+          <w:sz w:val="24"/>
+          <w:szCs w:val="24"/>
+          <w:lang w:eastAsia="es-GT"/>
+        </w:rPr>
+      </w:pPr>
+    </w:p>
+    <w:p>
+      <w:pPr>
+        <w:spacing w:before="100" w:beforeAutospacing="1" w:after="100" w:afterAutospacing="1" w:line="240" w:lineRule="auto"/>
+        <w:rPr>
+          <w:rFonts w:ascii="Arial" w:eastAsia="Times New Roman" w:hAnsi="Arial" w:cs="Arial"/>
+          <w:sz w:val="24"/>
+          <w:szCs w:val="24"/>
+          <w:lang w:eastAsia="es-GT"/>
+        </w:rPr>
+      </w:pPr>
+    </w:p>
+    <w:p>
+      <w:pPr>
+        <w:spacing w:before="100" w:beforeAutospacing="1" w:after="100" w:afterAutospacing="1" w:line="240" w:lineRule="auto"/>
+        <w:rPr>
+          <w:rFonts w:ascii="Arial" w:eastAsia="Times New Roman" w:hAnsi="Arial" w:cs="Arial"/>
+          <w:sz w:val="24"/>
+          <w:szCs w:val="24"/>
+          <w:lang w:eastAsia="es-GT"/>
+        </w:rPr>
+      </w:pPr>
+    </w:p>
+    <w:p>
+      <w:pPr>
+        <w:spacing w:before="100" w:beforeAutospacing="1" w:after="100" w:afterAutospacing="1" w:line="240" w:lineRule="auto"/>
+        <w:rPr>
+          <w:rFonts w:ascii="Arial" w:eastAsia="Times New Roman" w:hAnsi="Arial" w:cs="Arial"/>
+          <w:sz w:val="24"/>
+          <w:szCs w:val="24"/>
+          <w:lang w:eastAsia="es-GT"/>
+        </w:rPr>
+      </w:pPr>
+    </w:p>
+    <w:p>
+      <w:pPr>
+        <w:spacing w:before="100" w:beforeAutospacing="1" w:after="100" w:afterAutospacing="1" w:line="240" w:lineRule="auto"/>
+        <w:rPr>
+          <w:rFonts w:ascii="Arial" w:eastAsia="Times New Roman" w:hAnsi="Arial" w:cs="Arial"/>
+          <w:sz w:val="24"/>
+          <w:szCs w:val="24"/>
+          <w:lang w:eastAsia="es-GT"/>
+        </w:rPr>
+      </w:pPr>
+    </w:p>
+    <w:p>
+      <w:pPr>
+        <w:spacing w:before="100" w:beforeAutospacing="1" w:after="100" w:afterAutospacing="1" w:line="240" w:lineRule="auto"/>
+        <w:rPr>
+          <w:rFonts w:ascii="Arial" w:eastAsia="Times New Roman" w:hAnsi="Arial" w:cs="Arial"/>
+          <w:sz w:val="24"/>
+          <w:szCs w:val="24"/>
+          <w:lang w:eastAsia="es-GT"/>
+        </w:rPr>
+      </w:pPr>
+    </w:p>
+    <w:p>
+      <w:pPr>
+        <w:spacing w:before="100" w:beforeAutospacing="1" w:after="100" w:afterAutospacing="1" w:line="240" w:lineRule="auto"/>
+        <w:rPr>
+          <w:rFonts w:ascii="Arial" w:eastAsia="Times New Roman" w:hAnsi="Arial" w:cs="Arial"/>
+          <w:sz w:val="24"/>
+          <w:szCs w:val="24"/>
+          <w:lang w:eastAsia="es-GT"/>
+        </w:rPr>
+      </w:pPr>
+    </w:p>
+    <w:p>
+      <w:pPr>
+        <w:spacing w:before="100" w:beforeAutospacing="1" w:after="100" w:afterAutospacing="1" w:line="240" w:lineRule="auto"/>
+        <w:rPr>
+          <w:rFonts w:ascii="Arial" w:eastAsia="Times New Roman" w:hAnsi="Arial" w:cs="Arial"/>
+          <w:sz w:val="24"/>
+          <w:szCs w:val="24"/>
+          <w:lang w:eastAsia="es-GT"/>
+        </w:rPr>
+      </w:pPr>
+    </w:p>
+    <w:p>
+      <w:pPr>
+        <w:spacing w:before="100" w:beforeAutospacing="1" w:after="100" w:afterAutospacing="1" w:line="240" w:lineRule="auto"/>
+        <w:rPr>
+          <w:rFonts w:ascii="Arial" w:eastAsia="Times New Roman" w:hAnsi="Arial" w:cs="Arial"/>
+          <w:sz w:val="24"/>
+          <w:szCs w:val="24"/>
+          <w:lang w:eastAsia="es-GT"/>
+        </w:rPr>
+      </w:pPr>
+    </w:p>
+    <w:p>
+      <w:pPr>
+        <w:spacing w:before="100" w:beforeAutospacing="1" w:after="100" w:afterAutospacing="1" w:line="240" w:lineRule="auto"/>
+        <w:rPr>
+          <w:rFonts w:ascii="Arial" w:eastAsia="Times New Roman" w:hAnsi="Arial" w:cs="Arial"/>
+          <w:sz w:val="24"/>
+          <w:szCs w:val="24"/>
+          <w:lang w:eastAsia="es-GT"/>
+        </w:rPr>
+      </w:pPr>
+    </w:p>
+    <w:p>
+      <w:pPr>
+        <w:spacing w:before="100" w:beforeAutospacing="1" w:after="100" w:afterAutospacing="1" w:line="240" w:lineRule="auto"/>
+        <w:rPr>
+          <w:rFonts w:ascii="Arial" w:eastAsia="Times New Roman" w:hAnsi="Arial" w:cs="Arial"/>
+          <w:sz w:val="24"/>
+          <w:szCs w:val="24"/>
+          <w:lang w:eastAsia="es-GT"/>
+        </w:rPr>
+      </w:pPr>
+    </w:p>
+    <w:p>
+      <w:pPr>
+        <w:spacing w:before="100" w:beforeAutospacing="1" w:after="100" w:afterAutospacing="1" w:line="240" w:lineRule="auto"/>
+        <w:rPr>
+          <w:rFonts w:ascii="Arial" w:eastAsia="Times New Roman" w:hAnsi="Arial" w:cs="Arial"/>
+          <w:sz w:val="24"/>
+          <w:szCs w:val="24"/>
+          <w:lang w:eastAsia="es-GT"/>
+        </w:rPr>
+      </w:pPr>
+    </w:p>
+    <w:p>
+      <w:pPr>
+        <w:spacing w:before="100" w:beforeAutospacing="1" w:after="100" w:afterAutospacing="1" w:line="240" w:lineRule="auto"/>
+        <w:rPr>
+          <w:rFonts w:ascii="Arial" w:eastAsia="Times New Roman" w:hAnsi="Arial" w:cs="Arial"/>
+          <w:sz w:val="24"/>
+          <w:szCs w:val="24"/>
+          <w:lang w:eastAsia="es-GT"/>
+        </w:rPr>
+      </w:pPr>
+    </w:p>
+    <w:p>
+      <w:pPr>
+        <w:spacing w:before="100" w:beforeAutospacing="1" w:after="100" w:afterAutospacing="1" w:line="240" w:lineRule="auto"/>
+        <w:rPr>
+          <w:rFonts w:ascii="Arial" w:eastAsia="Times New Roman" w:hAnsi="Arial" w:cs="Arial"/>
+          <w:sz w:val="24"/>
+          <w:szCs w:val="24"/>
+          <w:lang w:eastAsia="es-GT"/>
+        </w:rPr>
+      </w:pPr>
+    </w:p>
+    <w:p>
+      <w:pPr>
+        <w:spacing w:before="100" w:beforeAutospacing="1" w:after="100" w:afterAutospacing="1" w:line="240" w:lineRule="auto"/>
+        <w:rPr>
+          <w:rFonts w:ascii="Arial" w:eastAsia="Times New Roman" w:hAnsi="Arial" w:cs="Arial"/>
+          <w:sz w:val="24"/>
+          <w:szCs w:val="24"/>
+          <w:lang w:eastAsia="es-GT"/>
+        </w:rPr>
+      </w:pPr>
+    </w:p>
+    <w:p>
+      <w:pPr>
+        <w:spacing w:before="100" w:beforeAutospacing="1" w:after="100" w:afterAutospacing="1" w:line="240" w:lineRule="auto"/>
+        <w:rPr>
+          <w:rFonts w:ascii="Arial" w:eastAsia="Times New Roman" w:hAnsi="Arial" w:cs="Arial"/>
+          <w:sz w:val="24"/>
+          <w:szCs w:val="24"/>
+          <w:lang w:eastAsia="es-GT"/>
+        </w:rPr>
+      </w:pPr>
+    </w:p>
+    <w:p>
+      <w:pPr>
+        <w:spacing w:before="100" w:beforeAutospacing="1" w:after="100" w:afterAutospacing="1" w:line="240" w:lineRule="auto"/>
+        <w:rPr>
+          <w:rFonts w:ascii="Arial" w:eastAsia="Times New Roman" w:hAnsi="Arial" w:cs="Arial"/>
+          <w:sz w:val="24"/>
+          <w:szCs w:val="24"/>
+          <w:lang w:eastAsia="es-GT"/>
+        </w:rPr>
+      </w:pPr>
+    </w:p>
+    <w:p>
+      <w:pPr>
+        <w:spacing w:before="100" w:beforeAutospacing="1" w:after="100" w:afterAutospacing="1" w:line="240" w:lineRule="auto"/>
+        <w:rPr>
+          <w:rFonts w:ascii="Arial" w:eastAsia="Times New Roman" w:hAnsi="Arial" w:cs="Arial"/>
+          <w:sz w:val="24"/>
+          <w:szCs w:val="24"/>
+          <w:lang w:eastAsia="es-GT"/>
+        </w:rPr>
+      </w:pPr>
+    </w:p>
+    <w:p>
+      <w:pPr>
+        <w:spacing w:before="100" w:beforeAutospacing="1" w:after="100" w:afterAutospacing="1" w:line="240" w:lineRule="auto"/>
+        <w:rPr>
+          <w:rFonts w:ascii="Arial" w:eastAsia="Times New Roman" w:hAnsi="Arial" w:cs="Arial"/>
+          <w:sz w:val="24"/>
+          <w:szCs w:val="24"/>
+          <w:lang w:eastAsia="es-GT"/>
+        </w:rPr>
+      </w:pPr>
+    </w:p>
+    <w:p>
+      <w:pPr>
+        <w:spacing w:before="100" w:beforeAutospacing="1" w:after="100" w:afterAutospacing="1" w:line="240" w:lineRule="auto"/>
+        <w:rPr>
+          <w:rFonts w:ascii="Arial" w:eastAsia="Times New Roman" w:hAnsi="Arial" w:cs="Arial"/>
+          <w:sz w:val="24"/>
+          <w:szCs w:val="24"/>
+          <w:lang w:eastAsia="es-GT"/>
+        </w:rPr>
+      </w:pPr>
+    </w:p>
+    <w:p>
+      <w:pPr>
+        <w:spacing w:before="100" w:beforeAutospacing="1" w:after="100" w:afterAutospacing="1" w:line="240" w:lineRule="auto"/>
+        <w:rPr>
+          <w:rFonts w:ascii="Arial" w:eastAsia="Times New Roman" w:hAnsi="Arial" w:cs="Arial"/>
+          <w:sz w:val="24"/>
+          <w:szCs w:val="24"/>
+          <w:lang w:eastAsia="es-GT"/>
+        </w:rPr>
+      </w:pPr>
+    </w:p>
+    <w:p>
+      <w:pPr>
+        <w:spacing w:before="100" w:beforeAutospacing="1" w:after="100" w:afterAutospacing="1" w:line="240" w:lineRule="auto"/>
+        <w:rPr>
+          <w:rFonts w:ascii="Arial" w:eastAsia="Times New Roman" w:hAnsi="Arial" w:cs="Arial"/>
+          <w:sz w:val="24"/>
+          <w:szCs w:val="24"/>
+          <w:lang w:eastAsia="es-GT"/>
+        </w:rPr>
+      </w:pPr>
+    </w:p>
+    <w:p>
+      <w:pPr>
+        <w:spacing w:before="100" w:beforeAutospacing="1" w:after="100" w:afterAutospacing="1" w:line="240" w:lineRule="auto"/>
+        <w:rPr>
+          <w:rFonts w:ascii="Arial" w:eastAsia="Times New Roman" w:hAnsi="Arial" w:cs="Arial"/>
+          <w:sz w:val="24"/>
+          <w:szCs w:val="24"/>
+          <w:lang w:eastAsia="es-GT"/>
+        </w:rPr>
+      </w:pPr>
+    </w:p>
+    <w:p>
+      <w:pPr>
+        <w:spacing w:before="100" w:beforeAutospacing="1" w:after="100" w:afterAutospacing="1" w:line="240" w:lineRule="auto"/>
+        <w:rPr>
+          <w:rFonts w:ascii="Arial" w:eastAsia="Times New Roman" w:hAnsi="Arial" w:cs="Arial"/>
+          <w:sz w:val="24"/>
+          <w:szCs w:val="24"/>
+          <w:lang w:eastAsia="es-GT"/>
+        </w:rPr>
+      </w:pPr>
+    </w:p>
+    <w:p>
+      <w:pPr>
+        <w:spacing w:before="100" w:beforeAutospacing="1" w:after="100" w:afterAutospacing="1" w:line="240" w:lineRule="auto"/>
+        <w:rPr>
+          <w:rFonts w:ascii="Arial" w:eastAsia="Times New Roman" w:hAnsi="Arial" w:cs="Arial"/>
+          <w:sz w:val="24"/>
+          <w:szCs w:val="24"/>
+          <w:lang w:eastAsia="es-GT"/>
+        </w:rPr>
+      </w:pPr>
+    </w:p>
+    <w:p>
+      <w:pPr>
+        <w:spacing w:before="100" w:beforeAutospacing="1" w:after="100" w:afterAutospacing="1" w:line="240" w:lineRule="auto"/>
+        <w:rPr>
+          <w:rFonts w:ascii="Arial" w:eastAsia="Times New Roman" w:hAnsi="Arial" w:cs="Arial"/>
+          <w:sz w:val="24"/>
+          <w:szCs w:val="24"/>
+          <w:lang w:eastAsia="es-GT"/>
+        </w:rPr>
+      </w:pPr>
+    </w:p>
+    <w:p>
+      <w:pPr>
+        <w:spacing w:before="100" w:beforeAutospacing="1" w:after="100" w:afterAutospacing="1" w:line="240" w:lineRule="auto"/>
+        <w:rPr>
+          <w:rFonts w:ascii="Arial" w:eastAsia="Times New Roman" w:hAnsi="Arial" w:cs="Arial"/>
+          <w:sz w:val="24"/>
+          <w:szCs w:val="24"/>
+          <w:lang w:eastAsia="es-GT"/>
+        </w:rPr>
+      </w:pPr>
+    </w:p>
+    <w:p>
+      <w:pPr>
+        <w:spacing w:before="100" w:beforeAutospacing="1" w:after="100" w:afterAutospacing="1" w:line="240" w:lineRule="auto"/>
+        <w:rPr>
+          <w:rFonts w:ascii="Arial" w:eastAsia="Times New Roman" w:hAnsi="Arial" w:cs="Arial"/>
+          <w:sz w:val="24"/>
+          <w:szCs w:val="24"/>
+          <w:lang w:eastAsia="es-GT"/>
+        </w:rPr>
+      </w:pPr>
+    </w:p>
+    <w:p>
+      <w:pPr>
+        <w:spacing w:before="100" w:beforeAutospacing="1" w:after="100" w:afterAutospacing="1" w:line="240" w:lineRule="auto"/>
+        <w:rPr>
+          <w:rFonts w:ascii="Arial" w:eastAsia="Times New Roman" w:hAnsi="Arial" w:cs="Arial"/>
+          <w:sz w:val="24"/>
+          <w:szCs w:val="24"/>
+          <w:lang w:eastAsia="es-GT"/>
+        </w:rPr>
+      </w:pPr>
+    </w:p>
+    <w:p>
+      <w:pPr>
+        <w:spacing w:before="100" w:beforeAutospacing="1" w:after="100" w:afterAutospacing="1" w:line="240" w:lineRule="auto"/>
+        <w:rPr>
+          <w:rFonts w:ascii="Arial" w:eastAsia="Times New Roman" w:hAnsi="Arial" w:cs="Arial"/>
+          <w:sz w:val="24"/>
+          <w:szCs w:val="24"/>
+          <w:lang w:eastAsia="es-GT"/>
+        </w:rPr>
+      </w:pPr>
+    </w:p>
+    <w:p>
+      <w:pPr>
+        <w:spacing w:before="100" w:beforeAutospacing="1" w:after="100" w:afterAutospacing="1" w:line="240" w:lineRule="auto"/>
+        <w:rPr>
+          <w:rFonts w:ascii="Arial" w:eastAsia="Times New Roman" w:hAnsi="Arial" w:cs="Arial"/>
+          <w:sz w:val="24"/>
+          <w:szCs w:val="24"/>
+          <w:lang w:eastAsia="es-GT"/>
+        </w:rPr>
+      </w:pPr>
+    </w:p>
+    <w:p>
+      <w:pPr>
+        <w:spacing w:before="100" w:beforeAutospacing="1" w:after="100" w:afterAutospacing="1" w:line="240" w:lineRule="auto"/>
+        <w:rPr>
+          <w:rFonts w:ascii="Arial" w:eastAsia="Times New Roman" w:hAnsi="Arial" w:cs="Arial"/>
+          <w:sz w:val="24"/>
+          <w:szCs w:val="24"/>
+          <w:lang w:eastAsia="es-GT"/>
+        </w:rPr>
+      </w:pPr>
+    </w:p>
+    <w:p>
+      <w:pPr>
+        <w:spacing w:before="100" w:beforeAutospacing="1" w:after="100" w:afterAutospacing="1" w:line="240" w:lineRule="auto"/>
+        <w:rPr>
+          <w:rFonts w:ascii="Arial" w:eastAsia="Times New Roman" w:hAnsi="Arial" w:cs="Arial"/>
+          <w:sz w:val="24"/>
+          <w:szCs w:val="24"/>
+          <w:lang w:eastAsia="es-GT"/>
+        </w:rPr>
+      </w:pPr>
+    </w:p>
+    <w:p>
+      <w:pPr>
+        <w:spacing w:before="100" w:beforeAutospacing="1" w:after="100" w:afterAutospacing="1" w:line="240" w:lineRule="auto"/>
+        <w:rPr>
+          <w:rFonts w:ascii="Arial" w:eastAsia="Times New Roman" w:hAnsi="Arial" w:cs="Arial"/>
+          <w:sz w:val="24"/>
+          <w:szCs w:val="24"/>
+          <w:lang w:eastAsia="es-GT"/>
+        </w:rPr>
+      </w:pPr>
+    </w:p>
+    <w:p>
+      <w:pPr>
+        <w:spacing w:before="100" w:beforeAutospacing="1" w:after="100" w:afterAutospacing="1" w:line="240" w:lineRule="auto"/>
+        <w:rPr>
+          <w:rFonts w:ascii="Arial" w:eastAsia="Times New Roman" w:hAnsi="Arial" w:cs="Arial"/>
+          <w:sz w:val="24"/>
+          <w:szCs w:val="24"/>
+          <w:lang w:eastAsia="es-GT"/>
+        </w:rPr>
+      </w:pPr>
+    </w:p>
+    <w:p>
+      <w:pPr>
+        <w:spacing w:before="100" w:beforeAutospacing="1" w:after="100" w:afterAutospacing="1" w:line="240" w:lineRule="auto"/>
+        <w:rPr>
+          <w:rFonts w:ascii="Arial" w:eastAsia="Times New Roman" w:hAnsi="Arial" w:cs="Arial"/>
+          <w:sz w:val="24"/>
+          <w:szCs w:val="24"/>
+          <w:lang w:eastAsia="es-GT"/>
+        </w:rPr>
+      </w:pPr>
+    </w:p>
+    <w:p>
+      <w:pPr>
+        <w:spacing w:before="100" w:beforeAutospacing="1" w:after="100" w:afterAutospacing="1" w:line="240" w:lineRule="auto"/>
+        <w:rPr>
+          <w:rFonts w:ascii="Arial" w:eastAsia="Times New Roman" w:hAnsi="Arial" w:cs="Arial"/>
+          <w:sz w:val="24"/>
+          <w:szCs w:val="24"/>
+          <w:lang w:eastAsia="es-GT"/>
+        </w:rPr>
+      </w:pPr>
+    </w:p>
+    <w:p>
+      <w:pPr>
+        <w:spacing w:before="100" w:beforeAutospacing="1" w:after="100" w:afterAutospacing="1" w:line="240" w:lineRule="auto"/>
+        <w:rPr>
+          <w:rFonts w:ascii="Arial" w:eastAsia="Times New Roman" w:hAnsi="Arial" w:cs="Arial"/>
+          <w:sz w:val="24"/>
+          <w:szCs w:val="24"/>
+          <w:lang w:eastAsia="es-GT"/>
+        </w:rPr>
+      </w:pPr>
+    </w:p>
+    <w:p>
+      <w:pPr>
+        <w:spacing w:before="100" w:beforeAutospacing="1" w:after="100" w:afterAutospacing="1" w:line="240" w:lineRule="auto"/>
+        <w:rPr>
+          <w:rFonts w:ascii="Arial" w:eastAsia="Times New Roman" w:hAnsi="Arial" w:cs="Arial"/>
+          <w:sz w:val="24"/>
+          <w:szCs w:val="24"/>
+          <w:lang w:eastAsia="es-GT"/>
+        </w:rPr>
+      </w:pPr>
+    </w:p>
+    <w:p>
+      <w:pPr>
+        <w:spacing w:before="100" w:beforeAutospacing="1" w:after="100" w:afterAutospacing="1" w:line="240" w:lineRule="auto"/>
+        <w:rPr>
+          <w:rFonts w:ascii="Arial" w:eastAsia="Times New Roman" w:hAnsi="Arial" w:cs="Arial"/>
+          <w:sz w:val="24"/>
+          <w:szCs w:val="24"/>
+          <w:lang w:eastAsia="es-GT"/>
+        </w:rPr>
+      </w:pPr>
+    </w:p>
+    <w:p>
+      <w:pPr>
+        <w:spacing w:before="100" w:beforeAutospacing="1" w:after="100" w:afterAutospacing="1" w:line="240" w:lineRule="auto"/>
+        <w:rPr>
+          <w:rFonts w:ascii="Arial" w:eastAsia="Times New Roman" w:hAnsi="Arial" w:cs="Arial"/>
+          <w:sz w:val="24"/>
+          <w:szCs w:val="24"/>
+          <w:lang w:eastAsia="es-GT"/>
+        </w:rPr>
+      </w:pPr>
+    </w:p>
+    <w:p>
+      <w:pPr>
+        <w:spacing w:before="100" w:beforeAutospacing="1" w:after="100" w:afterAutospacing="1" w:line="240" w:lineRule="auto"/>
+        <w:rPr>
+          <w:rFonts w:ascii="Arial" w:eastAsia="Times New Roman" w:hAnsi="Arial" w:cs="Arial"/>
+          <w:sz w:val="24"/>
+          <w:szCs w:val="24"/>
+          <w:lang w:eastAsia="es-GT"/>
+        </w:rPr>
+      </w:pPr>
+    </w:p>
+    <w:p>
+      <w:pPr>
+        <w:spacing w:before="100" w:beforeAutospacing="1" w:after="100" w:afterAutospacing="1" w:line="240" w:lineRule="auto"/>
+        <w:rPr>
+          <w:rFonts w:ascii="Arial" w:eastAsia="Times New Roman" w:hAnsi="Arial" w:cs="Arial"/>
+          <w:sz w:val="24"/>
+          <w:szCs w:val="24"/>
+          <w:lang w:eastAsia="es-GT"/>
+        </w:rPr>
+      </w:pPr>
+    </w:p>
+    <w:p>
+      <w:pPr>
+        <w:spacing w:before="100" w:beforeAutospacing="1" w:after="100" w:afterAutospacing="1" w:line="240" w:lineRule="auto"/>
+        <w:rPr>
+          <w:rFonts w:ascii="Arial" w:eastAsia="Times New Roman" w:hAnsi="Arial" w:cs="Arial"/>
+          <w:sz w:val="24"/>
+          <w:szCs w:val="24"/>
+          <w:lang w:eastAsia="es-GT"/>
+        </w:rPr>
+      </w:pPr>
+    </w:p>
+    <w:p>
+      <w:pPr>
+        <w:spacing w:before="100" w:beforeAutospacing="1" w:after="100" w:afterAutospacing="1" w:line="240" w:lineRule="auto"/>
+        <w:rPr>
+          <w:rFonts w:ascii="Arial" w:eastAsia="Times New Roman" w:hAnsi="Arial" w:cs="Arial"/>
+          <w:sz w:val="24"/>
+          <w:szCs w:val="24"/>
+          <w:lang w:eastAsia="es-GT"/>
+        </w:rPr>
+      </w:pPr>
+    </w:p>
+    <w:p>
+      <w:pPr>
+        <w:spacing w:before="100" w:beforeAutospacing="1" w:after="100" w:afterAutospacing="1" w:line="240" w:lineRule="auto"/>
+        <w:rPr>
+          <w:rFonts w:ascii="Arial" w:eastAsia="Times New Roman" w:hAnsi="Arial" w:cs="Arial"/>
+          <w:sz w:val="24"/>
+          <w:szCs w:val="24"/>
+          <w:lang w:eastAsia="es-GT"/>
+        </w:rPr>
+      </w:pPr>
+    </w:p>
+    <w:p>
+      <w:pPr>
+        <w:spacing w:before="100" w:beforeAutospacing="1" w:after="100" w:afterAutospacing="1" w:line="240" w:lineRule="auto"/>
+        <w:rPr>
+          <w:rFonts w:ascii="Arial" w:eastAsia="Times New Roman" w:hAnsi="Arial" w:cs="Arial"/>
+          <w:sz w:val="24"/>
+          <w:szCs w:val="24"/>
+          <w:lang w:eastAsia="es-GT"/>
+        </w:rPr>
+      </w:pPr>
+    </w:p>
+    <w:p>
+      <w:pPr>
+        <w:spacing w:before="100" w:beforeAutospacing="1" w:after="100" w:afterAutospacing="1" w:line="240" w:lineRule="auto"/>
+        <w:rPr>
+          <w:rFonts w:ascii="Arial" w:eastAsia="Times New Roman" w:hAnsi="Arial" w:cs="Arial"/>
+          <w:sz w:val="24"/>
+          <w:szCs w:val="24"/>
+          <w:lang w:eastAsia="es-GT"/>
+        </w:rPr>
+      </w:pPr>
+    </w:p>
+    <w:p>
+      <w:pPr>
+        <w:spacing w:before="100" w:beforeAutospacing="1" w:after="100" w:afterAutospacing="1" w:line="240" w:lineRule="auto"/>
+        <w:rPr>
+          <w:rFonts w:ascii="Arial" w:eastAsia="Times New Roman" w:hAnsi="Arial" w:cs="Arial"/>
+          <w:sz w:val="24"/>
+          <w:szCs w:val="24"/>
+          <w:lang w:eastAsia="es-GT"/>
+        </w:rPr>
+      </w:pPr>
+    </w:p>
+    <w:p>
+      <w:pPr>
+        <w:spacing w:before="100" w:beforeAutospacing="1" w:after="100" w:afterAutospacing="1" w:line="240" w:lineRule="auto"/>
+        <w:rPr>
+          <w:rFonts w:ascii="Arial" w:eastAsia="Times New Roman" w:hAnsi="Arial" w:cs="Arial"/>
+          <w:sz w:val="24"/>
+          <w:szCs w:val="24"/>
+          <w:lang w:eastAsia="es-GT"/>
+        </w:rPr>
+      </w:pPr>
+    </w:p>
+    <w:p>
+      <w:pPr>
+        <w:spacing w:before="100" w:beforeAutospacing="1" w:after="100" w:afterAutospacing="1" w:line="240" w:lineRule="auto"/>
+        <w:rPr>
+          <w:rFonts w:ascii="Arial" w:eastAsia="Times New Roman" w:hAnsi="Arial" w:cs="Arial"/>
+          <w:sz w:val="24"/>
+          <w:szCs w:val="24"/>
+          <w:lang w:eastAsia="es-GT"/>
+        </w:rPr>
+      </w:pPr>
+    </w:p>
+    <w:p>
+      <w:pPr>
+        <w:spacing w:before="100" w:beforeAutospacing="1" w:after="100" w:afterAutospacing="1" w:line="240" w:lineRule="auto"/>
+        <w:rPr>
+          <w:rFonts w:ascii="Arial" w:eastAsia="Times New Roman" w:hAnsi="Arial" w:cs="Arial"/>
+          <w:sz w:val="24"/>
+          <w:szCs w:val="24"/>
+          <w:lang w:eastAsia="es-GT"/>
+        </w:rPr>
+      </w:pPr>
+    </w:p>
+    <w:p>
+      <w:pPr>
+        <w:spacing w:before="100" w:beforeAutospacing="1" w:after="100" w:afterAutospacing="1" w:line="240" w:lineRule="auto"/>
+        <w:rPr>
+          <w:rFonts w:ascii="Arial" w:eastAsia="Times New Roman" w:hAnsi="Arial" w:cs="Arial"/>
+          <w:sz w:val="24"/>
+          <w:szCs w:val="24"/>
+          <w:lang w:eastAsia="es-GT"/>
+        </w:rPr>
+      </w:pPr>
+    </w:p>
+    <w:p>
+      <w:pPr>
+        <w:spacing w:before="100" w:beforeAutospacing="1" w:after="100" w:afterAutospacing="1" w:line="240" w:lineRule="auto"/>
+        <w:rPr>
+          <w:rFonts w:ascii="Arial" w:eastAsia="Times New Roman" w:hAnsi="Arial" w:cs="Arial"/>
+          <w:sz w:val="24"/>
+          <w:szCs w:val="24"/>
+          <w:lang w:eastAsia="es-GT"/>
+        </w:rPr>
+      </w:pPr>
+    </w:p>
+    <w:p>
+      <w:pPr>
+        <w:spacing w:before="100" w:beforeAutospacing="1" w:after="100" w:afterAutospacing="1" w:line="240" w:lineRule="auto"/>
+        <w:rPr>
+          <w:rFonts w:ascii="Arial" w:eastAsia="Times New Roman" w:hAnsi="Arial" w:cs="Arial"/>
+          <w:sz w:val="24"/>
+          <w:szCs w:val="24"/>
+          <w:lang w:eastAsia="es-GT"/>
+        </w:rPr>
+      </w:pPr>
+    </w:p>
+    <w:p>
+      <w:pPr>
+        <w:spacing w:before="100" w:beforeAutospacing="1" w:after="100" w:afterAutospacing="1" w:line="240" w:lineRule="auto"/>
+        <w:rPr>
+          <w:rFonts w:ascii="Arial" w:eastAsia="Times New Roman" w:hAnsi="Arial" w:cs="Arial"/>
+          <w:sz w:val="24"/>
+          <w:szCs w:val="24"/>
+          <w:lang w:eastAsia="es-GT"/>
+        </w:rPr>
+      </w:pPr>
+    </w:p>
+    <w:p>
+      <w:pPr>
+        <w:spacing w:before="100" w:beforeAutospacing="1" w:after="100" w:afterAutospacing="1" w:line="240" w:lineRule="auto"/>
+        <w:rPr>
+          <w:rFonts w:ascii="Arial" w:eastAsia="Times New Roman" w:hAnsi="Arial" w:cs="Arial"/>
+          <w:sz w:val="24"/>
+          <w:szCs w:val="24"/>
+          <w:lang w:eastAsia="es-GT"/>
+        </w:rPr>
+      </w:pPr>
+    </w:p>
+    <w:p>
+      <w:pPr>
+        <w:spacing w:before="100" w:beforeAutospacing="1" w:after="100" w:afterAutospacing="1" w:line="240" w:lineRule="auto"/>
+        <w:rPr>
+          <w:rFonts w:ascii="Arial" w:eastAsia="Times New Roman" w:hAnsi="Arial" w:cs="Arial"/>
+          <w:sz w:val="24"/>
+          <w:szCs w:val="24"/>
+          <w:lang w:eastAsia="es-GT"/>
+        </w:rPr>
+      </w:pPr>
+    </w:p>
+    <w:p>
+      <w:pPr>
+        <w:spacing w:before="100" w:beforeAutospacing="1" w:after="100" w:afterAutospacing="1" w:line="240" w:lineRule="auto"/>
+        <w:rPr>
+          <w:rFonts w:ascii="Arial" w:eastAsia="Times New Roman" w:hAnsi="Arial" w:cs="Arial"/>
+          <w:sz w:val="24"/>
+          <w:szCs w:val="24"/>
+          <w:lang w:eastAsia="es-GT"/>
+        </w:rPr>
+      </w:pPr>
+    </w:p>
+    <w:p>
+      <w:pPr>
+        <w:spacing w:before="100" w:beforeAutospacing="1" w:after="100" w:afterAutospacing="1" w:line="240" w:lineRule="auto"/>
+        <w:rPr>
+          <w:rFonts w:ascii="Arial" w:eastAsia="Times New Roman" w:hAnsi="Arial" w:cs="Arial"/>
+          <w:sz w:val="24"/>
+          <w:szCs w:val="24"/>
+          <w:lang w:eastAsia="es-GT"/>
+        </w:rPr>
+      </w:pPr>
+    </w:p>
+    <w:p>
+      <w:pPr>
+        <w:spacing w:before="100" w:beforeAutospacing="1" w:after="100" w:afterAutospacing="1" w:line="240" w:lineRule="auto"/>
+        <w:rPr>
+          <w:rFonts w:ascii="Arial" w:eastAsia="Times New Roman" w:hAnsi="Arial" w:cs="Arial"/>
+          <w:sz w:val="24"/>
+          <w:szCs w:val="24"/>
+          <w:lang w:eastAsia="es-GT"/>
+        </w:rPr>
+      </w:pPr>
+    </w:p>
+    <w:p>
+      <w:pPr>
+        <w:spacing w:before="100" w:beforeAutospacing="1" w:after="100" w:afterAutospacing="1" w:line="240" w:lineRule="auto"/>
+        <w:rPr>
+          <w:rFonts w:ascii="Arial" w:eastAsia="Times New Roman" w:hAnsi="Arial" w:cs="Arial"/>
+          <w:sz w:val="24"/>
+          <w:szCs w:val="24"/>
+          <w:lang w:eastAsia="es-GT"/>
+        </w:rPr>
+      </w:pPr>
+    </w:p>
+    <w:p>
+      <w:pPr>
+        <w:spacing w:before="100" w:beforeAutospacing="1" w:after="100" w:afterAutospacing="1" w:line="240" w:lineRule="auto"/>
+        <w:rPr>
+          <w:rFonts w:ascii="Arial" w:eastAsia="Times New Roman" w:hAnsi="Arial" w:cs="Arial"/>
+          <w:sz w:val="24"/>
+          <w:szCs w:val="24"/>
+          <w:lang w:eastAsia="es-GT"/>
+        </w:rPr>
+      </w:pPr>
+    </w:p>
+    <w:p>
+      <w:pPr>
+        <w:spacing w:before="100" w:beforeAutospacing="1" w:after="100" w:afterAutospacing="1" w:line="240" w:lineRule="auto"/>
+        <w:rPr>
+          <w:rFonts w:ascii="Arial" w:eastAsia="Times New Roman" w:hAnsi="Arial" w:cs="Arial"/>
+          <w:sz w:val="24"/>
+          <w:szCs w:val="24"/>
+          <w:lang w:eastAsia="es-GT"/>
+        </w:rPr>
+      </w:pPr>
+    </w:p>
+    <w:p>
+      <w:pPr>
+        <w:spacing w:before="100" w:beforeAutospacing="1" w:after="100" w:afterAutospacing="1" w:line="240" w:lineRule="auto"/>
+        <w:rPr>
+          <w:rFonts w:ascii="Arial" w:eastAsia="Times New Roman" w:hAnsi="Arial" w:cs="Arial"/>
+          <w:sz w:val="24"/>
+          <w:szCs w:val="24"/>
+          <w:lang w:eastAsia="es-GT"/>
+        </w:rPr>
+      </w:pPr>
+    </w:p>
+    <w:p>
+      <w:pPr>
+        <w:spacing w:before="100" w:beforeAutospacing="1" w:after="100" w:afterAutospacing="1" w:line="240" w:lineRule="auto"/>
+        <w:rPr>
+          <w:rFonts w:ascii="Arial" w:eastAsia="Times New Roman" w:hAnsi="Arial" w:cs="Arial"/>
+          <w:sz w:val="24"/>
+          <w:szCs w:val="24"/>
+          <w:lang w:eastAsia="es-GT"/>
+        </w:rPr>
+      </w:pPr>
+    </w:p>
+    <w:p>
+      <w:pPr>
+        <w:spacing w:before="100" w:beforeAutospacing="1" w:after="100" w:afterAutospacing="1" w:line="240" w:lineRule="auto"/>
+        <w:rPr>
+          <w:rFonts w:ascii="Arial" w:eastAsia="Times New Roman" w:hAnsi="Arial" w:cs="Arial"/>
+          <w:sz w:val="24"/>
+          <w:szCs w:val="24"/>
+          <w:lang w:eastAsia="es-GT"/>
+        </w:rPr>
+      </w:pPr>
+    </w:p>
+    <w:p>
+      <w:pPr>
+        <w:spacing w:before="100" w:beforeAutospacing="1" w:after="100" w:afterAutospacing="1" w:line="240" w:lineRule="auto"/>
+        <w:rPr>
+          <w:rFonts w:ascii="Arial" w:eastAsia="Times New Roman" w:hAnsi="Arial" w:cs="Arial"/>
+          <w:sz w:val="24"/>
+          <w:szCs w:val="24"/>
+          <w:lang w:eastAsia="es-GT"/>
+        </w:rPr>
+      </w:pPr>
+    </w:p>
+    <w:p>
+      <w:pPr>
+        <w:spacing w:before="100" w:beforeAutospacing="1" w:after="100" w:afterAutospacing="1" w:line="240" w:lineRule="auto"/>
+        <w:rPr>
+          <w:rFonts w:ascii="Arial" w:eastAsia="Times New Roman" w:hAnsi="Arial" w:cs="Arial"/>
+          <w:sz w:val="24"/>
+          <w:szCs w:val="24"/>
+          <w:lang w:eastAsia="es-GT"/>
+        </w:rPr>
+      </w:pPr>
+    </w:p>
+    <w:p>
+      <w:pPr>
+        <w:spacing w:before="100" w:beforeAutospacing="1" w:after="100" w:afterAutospacing="1" w:line="240" w:lineRule="auto"/>
+        <w:rPr>
+          <w:rFonts w:ascii="Arial" w:eastAsia="Times New Roman" w:hAnsi="Arial" w:cs="Arial"/>
+          <w:sz w:val="24"/>
+          <w:szCs w:val="24"/>
+          <w:lang w:eastAsia="es-GT"/>
+        </w:rPr>
+      </w:pPr>
+    </w:p>
+    <w:p>
+      <w:pPr>
+        <w:spacing w:before="100" w:beforeAutospacing="1" w:after="100" w:afterAutospacing="1" w:line="240" w:lineRule="auto"/>
+        <w:rPr>
+          <w:rFonts w:ascii="Arial" w:eastAsia="Times New Roman" w:hAnsi="Arial" w:cs="Arial"/>
+          <w:sz w:val="24"/>
+          <w:szCs w:val="24"/>
+          <w:lang w:eastAsia="es-GT"/>
+        </w:rPr>
+      </w:pPr>
+    </w:p>
+    <w:p>
+      <w:pPr>
+        <w:spacing w:before="100" w:beforeAutospacing="1" w:after="100" w:afterAutospacing="1" w:line="240" w:lineRule="auto"/>
+        <w:rPr>
+          <w:rFonts w:ascii="Arial" w:eastAsia="Times New Roman" w:hAnsi="Arial" w:cs="Arial"/>
+          <w:sz w:val="24"/>
+          <w:szCs w:val="24"/>
+          <w:lang w:eastAsia="es-GT"/>
+        </w:rPr>
+      </w:pPr>
+    </w:p>
+    <w:p>
+      <w:pPr>
+        <w:spacing w:before="100" w:beforeAutospacing="1" w:after="100" w:afterAutospacing="1" w:line="240" w:lineRule="auto"/>
+        <w:rPr>
+          <w:rFonts w:ascii="Arial" w:eastAsia="Times New Roman" w:hAnsi="Arial" w:cs="Arial"/>
+          <w:sz w:val="24"/>
+          <w:szCs w:val="24"/>
+          <w:lang w:eastAsia="es-GT"/>
+        </w:rPr>
+      </w:pPr>
+    </w:p>
+    <w:p>
+      <w:pPr>
+        <w:spacing w:before="100" w:beforeAutospacing="1" w:after="100" w:afterAutospacing="1" w:line="240" w:lineRule="auto"/>
+        <w:rPr>
+          <w:rFonts w:ascii="Arial" w:eastAsia="Times New Roman" w:hAnsi="Arial" w:cs="Arial"/>
+          <w:sz w:val="24"/>
+          <w:szCs w:val="24"/>
+          <w:lang w:eastAsia="es-GT"/>
+        </w:rPr>
+      </w:pPr>
+    </w:p>
+    <w:p>
+      <w:pPr>
+        <w:spacing w:before="100" w:beforeAutospacing="1" w:after="100" w:afterAutospacing="1" w:line="240" w:lineRule="auto"/>
+        <w:rPr>
+          <w:rFonts w:ascii="Arial" w:eastAsia="Times New Roman" w:hAnsi="Arial" w:cs="Arial"/>
+          <w:sz w:val="24"/>
+          <w:szCs w:val="24"/>
+          <w:lang w:eastAsia="es-GT"/>
+        </w:rPr>
+      </w:pPr>
+    </w:p>
+    <w:p>
+      <w:pPr>
+        <w:spacing w:before="100" w:beforeAutospacing="1" w:after="100" w:afterAutospacing="1" w:line="240" w:lineRule="auto"/>
+        <w:rPr>
+          <w:rFonts w:ascii="Arial" w:eastAsia="Times New Roman" w:hAnsi="Arial" w:cs="Arial"/>
+          <w:sz w:val="24"/>
+          <w:szCs w:val="24"/>
+          <w:lang w:eastAsia="es-GT"/>
+        </w:rPr>
+      </w:pPr>
+    </w:p>
+    <w:p>
+      <w:pPr>
+        <w:spacing w:before="100" w:beforeAutospacing="1" w:after="100" w:afterAutospacing="1" w:line="240" w:lineRule="auto"/>
+        <w:rPr>
+          <w:rFonts w:ascii="Arial" w:eastAsia="Times New Roman" w:hAnsi="Arial" w:cs="Arial"/>
+          <w:sz w:val="24"/>
+          <w:szCs w:val="24"/>
+          <w:lang w:eastAsia="es-GT"/>
+        </w:rPr>
+      </w:pPr>
+    </w:p>
+    <w:p>
+      <w:pPr>
+        <w:spacing w:before="100" w:beforeAutospacing="1" w:after="100" w:afterAutospacing="1" w:line="240" w:lineRule="auto"/>
+        <w:rPr>
+          <w:rFonts w:ascii="Arial" w:eastAsia="Times New Roman" w:hAnsi="Arial" w:cs="Arial"/>
+          <w:sz w:val="24"/>
+          <w:szCs w:val="24"/>
+          <w:lang w:eastAsia="es-GT"/>
+        </w:rPr>
+      </w:pPr>
+    </w:p>
+    <w:p>
+      <w:pPr>
+        <w:spacing w:before="100" w:beforeAutospacing="1" w:after="100" w:afterAutospacing="1" w:line="240" w:lineRule="auto"/>
+        <w:rPr>
+          <w:rFonts w:ascii="Arial" w:eastAsia="Times New Roman" w:hAnsi="Arial" w:cs="Arial"/>
+          <w:sz w:val="24"/>
+          <w:szCs w:val="24"/>
+          <w:lang w:eastAsia="es-GT"/>
+        </w:rPr>
+      </w:pPr>
+    </w:p>
+    <w:p>
+      <w:pPr>
+        <w:spacing w:before="100" w:beforeAutospacing="1" w:after="100" w:afterAutospacing="1" w:line="240" w:lineRule="auto"/>
+        <w:rPr>
+          <w:rFonts w:ascii="Arial" w:eastAsia="Times New Roman" w:hAnsi="Arial" w:cs="Arial"/>
+          <w:sz w:val="24"/>
+          <w:szCs w:val="24"/>
+          <w:lang w:eastAsia="es-GT"/>
+        </w:rPr>
+      </w:pPr>
+    </w:p>
+    <w:p>
+      <w:pPr>
+        <w:spacing w:before="100" w:beforeAutospacing="1" w:after="100" w:afterAutospacing="1" w:line="240" w:lineRule="auto"/>
+        <w:rPr>
+          <w:rFonts w:ascii="Arial" w:eastAsia="Times New Roman" w:hAnsi="Arial" w:cs="Arial"/>
+          <w:sz w:val="24"/>
+          <w:szCs w:val="24"/>
+          <w:lang w:eastAsia="es-GT"/>
+        </w:rPr>
+      </w:pPr>
+    </w:p>
+    <w:p>
+      <w:pPr>
+        <w:spacing w:before="100" w:beforeAutospacing="1" w:after="100" w:afterAutospacing="1" w:line="240" w:lineRule="auto"/>
+        <w:rPr>
+          <w:rFonts w:ascii="Arial" w:eastAsia="Times New Roman" w:hAnsi="Arial" w:cs="Arial"/>
+          <w:sz w:val="24"/>
+          <w:szCs w:val="24"/>
+          <w:lang w:eastAsia="es-GT"/>
+        </w:rPr>
+      </w:pPr>
+    </w:p>
+    <w:p>
+      <w:pPr>
+        <w:spacing w:before="100" w:beforeAutospacing="1" w:after="100" w:afterAutospacing="1" w:line="240" w:lineRule="auto"/>
+        <w:rPr>
+          <w:rFonts w:ascii="Arial" w:eastAsia="Times New Roman" w:hAnsi="Arial" w:cs="Arial"/>
+          <w:sz w:val="24"/>
+          <w:szCs w:val="24"/>
+          <w:lang w:eastAsia="es-GT"/>
+        </w:rPr>
+      </w:pPr>
+    </w:p>
+    <w:p>
+      <w:pPr>
+        <w:spacing w:before="100" w:beforeAutospacing="1" w:after="100" w:afterAutospacing="1" w:line="240" w:lineRule="auto"/>
+        <w:rPr>
+          <w:rFonts w:ascii="Arial" w:eastAsia="Times New Roman" w:hAnsi="Arial" w:cs="Arial"/>
+          <w:sz w:val="24"/>
+          <w:szCs w:val="24"/>
+          <w:lang w:eastAsia="es-GT"/>
+        </w:rPr>
+      </w:pPr>
+    </w:p>
+    <w:p>
+      <w:pPr>
+        <w:spacing w:before="100" w:beforeAutospacing="1" w:after="100" w:afterAutospacing="1" w:line="240" w:lineRule="auto"/>
+        <w:rPr>
+          <w:rFonts w:ascii="Arial" w:eastAsia="Times New Roman" w:hAnsi="Arial" w:cs="Arial"/>
+          <w:sz w:val="24"/>
+          <w:szCs w:val="24"/>
+          <w:lang w:eastAsia="es-GT"/>
+        </w:rPr>
+      </w:pPr>
+    </w:p>
+    <w:p>
+      <w:pPr>
+        <w:spacing w:before="100" w:beforeAutospacing="1" w:after="100" w:afterAutospacing="1" w:line="240" w:lineRule="auto"/>
+        <w:rPr>
+          <w:rFonts w:ascii="Arial" w:eastAsia="Times New Roman" w:hAnsi="Arial" w:cs="Arial"/>
+          <w:sz w:val="24"/>
+          <w:szCs w:val="24"/>
+          <w:lang w:eastAsia="es-GT"/>
+        </w:rPr>
+      </w:pPr>
+    </w:p>
+    <w:p>
+      <w:pPr>
+        <w:spacing w:before="100" w:beforeAutospacing="1" w:after="100" w:afterAutospacing="1" w:line="240" w:lineRule="auto"/>
+        <w:rPr>
+          <w:rFonts w:ascii="Arial" w:eastAsia="Times New Roman" w:hAnsi="Arial" w:cs="Arial"/>
+          <w:sz w:val="24"/>
+          <w:szCs w:val="24"/>
+          <w:lang w:eastAsia="es-GT"/>
+        </w:rPr>
+      </w:pPr>
+    </w:p>
+    <w:p>
+      <w:pPr>
+        <w:spacing w:before="100" w:beforeAutospacing="1" w:after="100" w:afterAutospacing="1" w:line="240" w:lineRule="auto"/>
+        <w:rPr>
+          <w:rFonts w:ascii="Arial" w:eastAsia="Times New Roman" w:hAnsi="Arial" w:cs="Arial"/>
+          <w:sz w:val="24"/>
+          <w:szCs w:val="24"/>
+          <w:lang w:eastAsia="es-GT"/>
+        </w:rPr>
+      </w:pPr>
+    </w:p>
+    <w:p>
+      <w:pPr>
+        <w:spacing w:before="100" w:beforeAutospacing="1" w:after="100" w:afterAutospacing="1" w:line="240" w:lineRule="auto"/>
+        <w:rPr>
+          <w:rFonts w:ascii="Arial" w:eastAsia="Times New Roman" w:hAnsi="Arial" w:cs="Arial"/>
+          <w:sz w:val="24"/>
+          <w:szCs w:val="24"/>
+          <w:lang w:eastAsia="es-GT"/>
+        </w:rPr>
+      </w:pPr>
+    </w:p>
+    <w:p>
+      <w:pPr>
+        <w:spacing w:before="100" w:beforeAutospacing="1" w:after="100" w:afterAutospacing="1" w:line="240" w:lineRule="auto"/>
+        <w:rPr>
+          <w:rFonts w:ascii="Arial" w:eastAsia="Times New Roman" w:hAnsi="Arial" w:cs="Arial"/>
+          <w:sz w:val="24"/>
+          <w:szCs w:val="24"/>
+          <w:lang w:eastAsia="es-GT"/>
+        </w:rPr>
+      </w:pPr>
+    </w:p>
+    <w:p>
+      <w:pPr>
+        <w:spacing w:before="100" w:beforeAutospacing="1" w:after="100" w:afterAutospacing="1" w:line="240" w:lineRule="auto"/>
+        <w:rPr>
+          <w:rFonts w:ascii="Arial" w:eastAsia="Times New Roman" w:hAnsi="Arial" w:cs="Arial"/>
+          <w:sz w:val="24"/>
+          <w:szCs w:val="24"/>
+          <w:lang w:eastAsia="es-GT"/>
+        </w:rPr>
+      </w:pPr>
+    </w:p>
+    <w:p>
+      <w:pPr>
+        <w:spacing w:before="100" w:beforeAutospacing="1" w:after="100" w:afterAutospacing="1" w:line="240" w:lineRule="auto"/>
+        <w:rPr>
+          <w:rFonts w:ascii="Arial" w:eastAsia="Times New Roman" w:hAnsi="Arial" w:cs="Arial"/>
+          <w:sz w:val="24"/>
+          <w:szCs w:val="24"/>
+          <w:lang w:eastAsia="es-GT"/>
+        </w:rPr>
+      </w:pPr>
+    </w:p>
+    <w:p>
+      <w:pPr>
+        <w:spacing w:before="100" w:beforeAutospacing="1" w:after="100" w:afterAutospacing="1" w:line="240" w:lineRule="auto"/>
+        <w:rPr>
+          <w:rFonts w:ascii="Arial" w:eastAsia="Times New Roman" w:hAnsi="Arial" w:cs="Arial"/>
+          <w:sz w:val="24"/>
+          <w:szCs w:val="24"/>
+          <w:lang w:eastAsia="es-GT"/>
+        </w:rPr>
+      </w:pPr>
+    </w:p>
+    <w:p>
+      <w:pPr>
+        <w:spacing w:before="100" w:beforeAutospacing="1" w:after="100" w:afterAutospacing="1" w:line="240" w:lineRule="auto"/>
+        <w:rPr>
+          <w:rFonts w:ascii="Arial" w:eastAsia="Times New Roman" w:hAnsi="Arial" w:cs="Arial"/>
+          <w:sz w:val="24"/>
+          <w:szCs w:val="24"/>
+          <w:lang w:eastAsia="es-GT"/>
+        </w:rPr>
+      </w:pPr>
+    </w:p>
+    <w:p>
+      <w:pPr>
+        <w:spacing w:before="100" w:beforeAutospacing="1" w:after="100" w:afterAutospacing="1" w:line="240" w:lineRule="auto"/>
+        <w:rPr>
+          <w:rFonts w:ascii="Arial" w:eastAsia="Times New Roman" w:hAnsi="Arial" w:cs="Arial"/>
+          <w:sz w:val="24"/>
+          <w:szCs w:val="24"/>
+          <w:lang w:eastAsia="es-GT"/>
+        </w:rPr>
+      </w:pPr>
+    </w:p>
+    <w:p>
+      <w:pPr>
+        <w:spacing w:before="100" w:beforeAutospacing="1" w:after="100" w:afterAutospacing="1" w:line="240" w:lineRule="auto"/>
+        <w:rPr>
+          <w:rFonts w:ascii="Arial" w:eastAsia="Times New Roman" w:hAnsi="Arial" w:cs="Arial"/>
+          <w:sz w:val="24"/>
+          <w:szCs w:val="24"/>
+          <w:lang w:eastAsia="es-GT"/>
+        </w:rPr>
+      </w:pPr>
+    </w:p>
+    <w:p>
+      <w:pPr>
+        <w:spacing w:before="100" w:beforeAutospacing="1" w:after="100" w:afterAutospacing="1" w:line="240" w:lineRule="auto"/>
+        <w:rPr>
+          <w:rFonts w:ascii="Arial" w:eastAsia="Times New Roman" w:hAnsi="Arial" w:cs="Arial"/>
+          <w:sz w:val="24"/>
+          <w:szCs w:val="24"/>
+          <w:lang w:eastAsia="es-GT"/>
+        </w:rPr>
+      </w:pPr>
+    </w:p>
+    <w:p>
+      <w:pPr>
+        <w:spacing w:before="100" w:beforeAutospacing="1" w:after="100" w:afterAutospacing="1" w:line="240" w:lineRule="auto"/>
+        <w:rPr>
+          <w:rFonts w:ascii="Arial" w:eastAsia="Times New Roman" w:hAnsi="Arial" w:cs="Arial"/>
+          <w:sz w:val="24"/>
+          <w:szCs w:val="24"/>
+          <w:lang w:eastAsia="es-GT"/>
+        </w:rPr>
+      </w:pPr>
+    </w:p>
+    <w:p>
+      <w:pPr>
+        <w:spacing w:before="100" w:beforeAutospacing="1" w:after="100" w:afterAutospacing="1" w:line="240" w:lineRule="auto"/>
+        <w:rPr>
+          <w:rFonts w:ascii="Arial" w:eastAsia="Times New Roman" w:hAnsi="Arial" w:cs="Arial"/>
+          <w:sz w:val="24"/>
+          <w:szCs w:val="24"/>
+          <w:lang w:eastAsia="es-GT"/>
+        </w:rPr>
+      </w:pPr>
+    </w:p>
+    <w:p>
+      <w:pPr>
+        <w:spacing w:before="100" w:beforeAutospacing="1" w:after="100" w:afterAutospacing="1" w:line="240" w:lineRule="auto"/>
+        <w:rPr>
+          <w:rFonts w:ascii="Arial" w:eastAsia="Times New Roman" w:hAnsi="Arial" w:cs="Arial"/>
+          <w:sz w:val="24"/>
+          <w:szCs w:val="24"/>
+          <w:lang w:eastAsia="es-GT"/>
+        </w:rPr>
+      </w:pPr>
+    </w:p>
+    <w:p>
+      <w:pPr>
+        <w:spacing w:before="100" w:beforeAutospacing="1" w:after="100" w:afterAutospacing="1" w:line="240" w:lineRule="auto"/>
+        <w:rPr>
+          <w:rFonts w:ascii="Arial" w:eastAsia="Times New Roman" w:hAnsi="Arial" w:cs="Arial"/>
+          <w:sz w:val="24"/>
+          <w:szCs w:val="24"/>
+          <w:lang w:eastAsia="es-GT"/>
+        </w:rPr>
+      </w:pPr>
+    </w:p>
+    <w:p>
+      <w:pPr>
+        <w:spacing w:before="100" w:beforeAutospacing="1" w:after="100" w:afterAutospacing="1" w:line="240" w:lineRule="auto"/>
+        <w:rPr>
+          <w:rFonts w:ascii="Arial" w:eastAsia="Times New Roman" w:hAnsi="Arial" w:cs="Arial"/>
+          <w:sz w:val="24"/>
+          <w:szCs w:val="24"/>
+          <w:lang w:eastAsia="es-GT"/>
+        </w:rPr>
+      </w:pPr>
+    </w:p>
+    <w:p>
+      <w:pPr>
+        <w:spacing w:before="100" w:beforeAutospacing="1" w:after="100" w:afterAutospacing="1" w:line="240" w:lineRule="auto"/>
+        <w:rPr>
+          <w:rFonts w:ascii="Arial" w:eastAsia="Times New Roman" w:hAnsi="Arial" w:cs="Arial"/>
+          <w:sz w:val="24"/>
+          <w:szCs w:val="24"/>
+          <w:lang w:eastAsia="es-GT"/>
+        </w:rPr>
+      </w:pPr>
+    </w:p>
+    <w:p>
+      <w:pPr>
+        <w:spacing w:before="100" w:beforeAutospacing="1" w:after="100" w:afterAutospacing="1" w:line="240" w:lineRule="auto"/>
+        <w:rPr>
+          <w:rFonts w:ascii="Arial" w:eastAsia="Times New Roman" w:hAnsi="Arial" w:cs="Arial"/>
+          <w:sz w:val="24"/>
+          <w:szCs w:val="24"/>
+          <w:lang w:eastAsia="es-GT"/>
+        </w:rPr>
+      </w:pPr>
+    </w:p>
+    <w:p>
+      <w:pPr>
+        <w:rPr>
+          <w:rFonts w:ascii="Arial" w:eastAsiaTheme="minorHAnsi" w:hAnsi="Arial" w:cs="Arial"/>
+          <w:bCs/>
+          <w:u w:val="single"/>
+        </w:rPr>
+      </w:pPr>
     </w:p>
     <w:sectPr>
       <w:pgSz w:w="12240" w:h="15840"/>
@@ -1165,7 +4902,7 @@
     <w:rPrDefault>
       <w:rPr>
         <w:rFonts w:asciiTheme="minorHAnsi" w:eastAsiaTheme="minorHAnsi" w:hAnsiTheme="minorHAnsi" w:cstheme="minorBidi"/>
-        <w:lang w:val="es-MX" w:eastAsia="es-MX" w:bidi="ar-SA"/>
+        <w:lang w:val="en-US" w:eastAsia="en-US" w:bidi="ar-SA"/>
       </w:rPr>
     </w:rPrDefault>
     <w:pPrDefault/>
@@ -1325,9 +5062,9 @@
     <w:lsdException w:name="Table Web 2" w:semiHidden="1" w:unhideWhenUsed="1"/>
     <w:lsdException w:name="Table Web 3" w:semiHidden="1" w:unhideWhenUsed="1"/>
     <w:lsdException w:name="Balloon Text" w:semiHidden="1" w:unhideWhenUsed="1" w:qFormat="1"/>
-    <w:lsdException w:name="Table Grid" w:uiPriority="39" w:qFormat="1"/>
+    <w:lsdException w:name="Table Grid" w:semiHidden="1" w:uiPriority="39" w:unhideWhenUsed="1" w:qFormat="1"/>
     <w:lsdException w:name="Table Theme" w:semiHidden="1" w:unhideWhenUsed="1"/>
-    <w:lsdException w:name="Placeholder Text" w:semiHidden="1" w:unhideWhenUsed="1"/>
+    <w:lsdException w:name="Placeholder Text" w:semiHidden="1"/>
     <w:lsdException w:name="No Spacing" w:uiPriority="1" w:qFormat="1"/>
     <w:lsdException w:name="Light Shading"/>
     <w:lsdException w:name="Light List"/>
@@ -1349,10 +5086,7 @@
     <w:lsdException w:name="Medium Shading 1 Accent 1"/>
     <w:lsdException w:name="Medium Shading 2 Accent 1"/>
     <w:lsdException w:name="Medium List 1 Accent 1"/>
-    <w:lsdException w:name="Revision" w:semiHidden="1" w:unhideWhenUsed="1"/>
-    <w:lsdException w:name="List Paragraph" w:semiHidden="1" w:unhideWhenUsed="1"/>
-    <w:lsdException w:name="Quote" w:semiHidden="1" w:unhideWhenUsed="1"/>
-    <w:lsdException w:name="Intense Quote" w:semiHidden="1" w:unhideWhenUsed="1"/>
+    <w:lsdException w:name="Revision" w:semiHidden="1"/>
     <w:lsdException w:name="Medium List 2 Accent 1"/>
     <w:lsdException w:name="Medium Grid 1 Accent 1"/>
     <w:lsdException w:name="Medium Grid 2 Accent 1"/>
@@ -1553,7 +5287,7 @@
       <w:rFonts w:eastAsia="MS Mincho"/>
       <w:sz w:val="22"/>
       <w:szCs w:val="22"/>
-      <w:lang w:val="es-GT" w:eastAsia="en-US"/>
+      <w:lang w:val="es-GT"/>
     </w:rPr>
   </w:style>
   <w:style w:type="character" w:default="1" w:styleId="Fuentedeprrafopredeter">
@@ -1691,7 +5425,7 @@
     <w:rPr>
       <w:sz w:val="22"/>
       <w:szCs w:val="22"/>
-      <w:lang w:val="es-GT" w:eastAsia="en-US"/>
+      <w:lang w:val="es-GT"/>
     </w:rPr>
   </w:style>
   <w:style w:type="character" w:customStyle="1" w:styleId="TextocomentarioCar">

</xml_diff>

<commit_message>
add: Se agrego historia de usuario HURH-0011 dentro del documento Peaceathome.docx en la rama rhernandez-2024310
</commit_message>
<xml_diff>
--- a/Peaceathome.docx
+++ b/Peaceathome.docx
@@ -2768,17 +2768,41 @@
       <w:r>
         <w:t>1. Como un registro de pagos</w:t>
       </w:r>
+    </w:p>
+    <w:p>
+      <w:r>
+        <w:t>2. Quiero que registre los datos del monto</w:t>
+      </w:r>
+    </w:p>
+    <w:p>
+      <w:r>
+        <w:t>3. Para poder confirmar que los datos del monto estén registrados</w:t>
+      </w:r>
+    </w:p>
+    <w:p/>
+    <w:p>
+      <w:r>
+        <w:t>HURH-0011</w:t>
+      </w:r>
       <w:bookmarkStart w:id="0" w:name="_GoBack"/>
       <w:bookmarkEnd w:id="0"/>
-    </w:p>
-    <w:p>
-      <w:r>
-        <w:t>2. Quiero que registre los datos del monto</w:t>
-      </w:r>
-    </w:p>
-    <w:p>
-      <w:r>
-        <w:t>3. Para poder confirmar que los datos del monto estén registrados</w:t>
+      <w:r>
+        <w:t xml:space="preserve"> Validación de monto máximo</w:t>
+      </w:r>
+    </w:p>
+    <w:p>
+      <w:r>
+        <w:t xml:space="preserve">1. Como método de pago </w:t>
+      </w:r>
+    </w:p>
+    <w:p>
+      <w:r>
+        <w:t>2. Quiero que el monto sea en efectivo o en tarjeta</w:t>
+      </w:r>
+    </w:p>
+    <w:p>
+      <w:r>
+        <w:t>3. Para verificar si el monto de pago es valido</w:t>
       </w:r>
     </w:p>
     <w:p>

</xml_diff>

<commit_message>
add: Se agrego historia de usuario HURH-0012 dentro del documento Peaceathome.docx en la rama rhernandez-2024310
</commit_message>
<xml_diff>
--- a/Peaceathome.docx
+++ b/Peaceathome.docx
@@ -2784,37 +2784,63 @@
       <w:r>
         <w:t>HURH-0011</w:t>
       </w:r>
+      <w:r>
+        <w:t xml:space="preserve"> Validación de monto máximo</w:t>
+      </w:r>
+    </w:p>
+    <w:p>
+      <w:r>
+        <w:t xml:space="preserve">1. Como método de pago </w:t>
+      </w:r>
+    </w:p>
+    <w:p>
+      <w:r>
+        <w:t>2. Quiero que el monto sea en efectivo o en tarjeta</w:t>
+      </w:r>
+    </w:p>
+    <w:p>
+      <w:r>
+        <w:t>3. Para verificar si el monto de pago es valido</w:t>
+      </w:r>
+    </w:p>
+    <w:p>
       <w:bookmarkStart w:id="0" w:name="_GoBack"/>
       <w:bookmarkEnd w:id="0"/>
-      <w:r>
-        <w:t xml:space="preserve"> Validación de monto máximo</w:t>
-      </w:r>
-    </w:p>
-    <w:p>
-      <w:r>
-        <w:t xml:space="preserve">1. Como método de pago </w:t>
-      </w:r>
-    </w:p>
-    <w:p>
-      <w:r>
-        <w:t>2. Quiero que el monto sea en efectivo o en tarjeta</w:t>
-      </w:r>
-    </w:p>
-    <w:p>
-      <w:r>
-        <w:t>3. Para verificar si el monto de pago es valido</w:t>
-      </w:r>
-    </w:p>
-    <w:p>
-      <w:pPr>
-        <w:spacing w:before="100" w:beforeAutospacing="1" w:after="100" w:afterAutospacing="1" w:line="240" w:lineRule="auto"/>
-        <w:rPr>
-          <w:rFonts w:ascii="Arial" w:eastAsia="Times New Roman" w:hAnsi="Arial" w:cs="Arial"/>
-          <w:sz w:val="24"/>
-          <w:szCs w:val="24"/>
-          <w:lang w:eastAsia="es-GT"/>
-        </w:rPr>
-      </w:pPr>
+    </w:p>
+    <w:p>
+      <w:r>
+        <w:t>HURH</w:t>
+      </w:r>
+      <w:r>
+        <w:t>-0012</w:t>
+      </w:r>
+      <w:r>
+        <w:t xml:space="preserve"> Generación de recibo de pago</w:t>
+      </w:r>
+    </w:p>
+    <w:p>
+      <w:r>
+        <w:t xml:space="preserve">1. Como registro de pago recibido </w:t>
+      </w:r>
+    </w:p>
+    <w:p>
+      <w:r>
+        <w:t>2. Quiero que me den la información del monto de pago</w:t>
+      </w:r>
+    </w:p>
+    <w:p>
+      <w:pPr>
+        <w:spacing w:before="100" w:beforeAutospacing="1" w:after="100" w:afterAutospacing="1" w:line="240" w:lineRule="auto"/>
+        <w:rPr>
+          <w:rFonts w:ascii="Arial" w:eastAsia="Times New Roman" w:hAnsi="Arial" w:cs="Arial"/>
+          <w:sz w:val="24"/>
+          <w:szCs w:val="24"/>
+          <w:lang w:eastAsia="es-GT"/>
+        </w:rPr>
+      </w:pPr>
+      <w:r>
+        <w:t>3. Para que registre el recibo y se almacene en el sistema</w:t>
+      </w:r>
     </w:p>
     <w:p>
       <w:pPr>

</xml_diff>

<commit_message>
add: Se agrego historia de usuario HUOV-013 dentro del documento Peaceathome.docx en la rama oveliz-2024369
</commit_message>
<xml_diff>
--- a/Peaceathome.docx
+++ b/Peaceathome.docx
@@ -19,7 +19,7 @@
           <w:lang w:val="en-US"/>
         </w:rPr>
         <w:drawing>
-          <wp:inline distT="0" distB="0" distL="0" distR="0" wp14:anchorId="2FEE8166" wp14:editId="6BE70031">
+          <wp:inline distT="0" distB="0" distL="0" distR="0" wp14:anchorId="5959B8BE" wp14:editId="62113B58">
             <wp:extent cx="2248535" cy="847725"/>
             <wp:effectExtent l="0" t="0" r="0" b="0"/>
             <wp:docPr id="2" name="Imagen 2"/>
@@ -271,7 +271,6 @@
         <w:jc w:val="center"/>
         <w:rPr>
           <w:rFonts w:ascii="Arial" w:hAnsi="Arial" w:cs="Arial"/>
-          <w:lang w:val="en-US"/>
         </w:rPr>
       </w:pPr>
       <w:r>
@@ -280,7 +279,6 @@
           <w:rFonts w:ascii="Arial" w:hAnsi="Arial" w:cs="Arial"/>
           <w:color w:val="000000"/>
           <w:sz w:val="40"/>
-          <w:lang w:val="en-US"/>
         </w:rPr>
         <w:t>Peace at home</w:t>
       </w:r>
@@ -292,7 +290,6 @@
         <w:jc w:val="center"/>
         <w:rPr>
           <w:rFonts w:ascii="Arial" w:hAnsi="Arial" w:cs="Arial"/>
-          <w:lang w:val="en-US"/>
         </w:rPr>
       </w:pPr>
     </w:p>
@@ -303,7 +300,6 @@
         <w:jc w:val="center"/>
         <w:rPr>
           <w:rFonts w:ascii="Arial" w:hAnsi="Arial" w:cs="Arial"/>
-          <w:lang w:val="en-US"/>
         </w:rPr>
       </w:pPr>
     </w:p>
@@ -314,7 +310,6 @@
         <w:jc w:val="center"/>
         <w:rPr>
           <w:rFonts w:ascii="Arial" w:hAnsi="Arial" w:cs="Arial"/>
-          <w:lang w:val="en-US"/>
         </w:rPr>
       </w:pPr>
     </w:p>
@@ -325,7 +320,6 @@
         <w:jc w:val="center"/>
         <w:rPr>
           <w:rFonts w:ascii="Arial" w:hAnsi="Arial" w:cs="Arial"/>
-          <w:lang w:val="en-US"/>
         </w:rPr>
       </w:pPr>
     </w:p>
@@ -336,7 +330,6 @@
         <w:jc w:val="center"/>
         <w:rPr>
           <w:rFonts w:ascii="Arial" w:hAnsi="Arial" w:cs="Arial"/>
-          <w:lang w:val="en-US"/>
         </w:rPr>
       </w:pPr>
     </w:p>
@@ -347,7 +340,6 @@
         <w:jc w:val="center"/>
         <w:rPr>
           <w:rFonts w:ascii="Arial" w:hAnsi="Arial" w:cs="Arial"/>
-          <w:lang w:val="en-US"/>
         </w:rPr>
       </w:pPr>
     </w:p>
@@ -358,7 +350,6 @@
         <w:jc w:val="center"/>
         <w:rPr>
           <w:rFonts w:ascii="Arial" w:hAnsi="Arial" w:cs="Arial"/>
-          <w:lang w:val="en-US"/>
         </w:rPr>
       </w:pPr>
     </w:p>
@@ -369,7 +360,6 @@
         <w:jc w:val="center"/>
         <w:rPr>
           <w:rFonts w:ascii="Arial" w:hAnsi="Arial" w:cs="Arial"/>
-          <w:lang w:val="en-US"/>
         </w:rPr>
       </w:pPr>
     </w:p>
@@ -380,7 +370,6 @@
         <w:jc w:val="center"/>
         <w:rPr>
           <w:rFonts w:ascii="Arial" w:hAnsi="Arial" w:cs="Arial"/>
-          <w:lang w:val="en-US"/>
         </w:rPr>
       </w:pPr>
     </w:p>
@@ -391,7 +380,6 @@
         <w:jc w:val="center"/>
         <w:rPr>
           <w:rFonts w:ascii="Arial" w:hAnsi="Arial" w:cs="Arial"/>
-          <w:lang w:val="en-US"/>
         </w:rPr>
       </w:pPr>
     </w:p>
@@ -402,7 +390,6 @@
         <w:jc w:val="center"/>
         <w:rPr>
           <w:rFonts w:ascii="Arial" w:hAnsi="Arial" w:cs="Arial"/>
-          <w:lang w:val="en-US"/>
         </w:rPr>
       </w:pPr>
     </w:p>
@@ -413,7 +400,6 @@
         <w:jc w:val="center"/>
         <w:rPr>
           <w:rFonts w:ascii="Arial" w:hAnsi="Arial" w:cs="Arial"/>
-          <w:lang w:val="en-US"/>
         </w:rPr>
       </w:pPr>
     </w:p>
@@ -424,7 +410,6 @@
         <w:jc w:val="center"/>
         <w:rPr>
           <w:rFonts w:ascii="Arial" w:hAnsi="Arial" w:cs="Arial"/>
-          <w:lang w:val="en-US"/>
         </w:rPr>
       </w:pPr>
     </w:p>
@@ -435,7 +420,6 @@
         <w:jc w:val="center"/>
         <w:rPr>
           <w:rFonts w:ascii="Arial" w:hAnsi="Arial" w:cs="Arial"/>
-          <w:lang w:val="en-US"/>
         </w:rPr>
       </w:pPr>
     </w:p>
@@ -446,7 +430,6 @@
         <w:jc w:val="center"/>
         <w:rPr>
           <w:rFonts w:ascii="Arial" w:hAnsi="Arial" w:cs="Arial"/>
-          <w:lang w:val="en-US"/>
         </w:rPr>
       </w:pPr>
     </w:p>
@@ -458,7 +441,6 @@
         <w:rPr>
           <w:rFonts w:ascii="Arial" w:hAnsi="Arial" w:cs="Arial"/>
           <w:u w:val="single"/>
-          <w:lang w:val="en-US"/>
         </w:rPr>
       </w:pPr>
     </w:p>
@@ -469,7 +451,6 @@
         <w:jc w:val="center"/>
         <w:rPr>
           <w:rFonts w:ascii="Arial" w:hAnsi="Arial" w:cs="Arial"/>
-          <w:lang w:val="en-US"/>
         </w:rPr>
       </w:pPr>
     </w:p>
@@ -518,9 +499,93 @@
         </w:sectPr>
       </w:pPr>
     </w:p>
+    <w:p>
+      <w:pPr>
+        <w:rPr>
+          <w:rFonts w:ascii="Arial" w:eastAsiaTheme="minorHAnsi" w:hAnsi="Arial" w:cs="Arial"/>
+          <w:sz w:val="24"/>
+        </w:rPr>
+      </w:pPr>
+    </w:p>
+    <w:p>
+      <w:pPr>
+        <w:rPr>
+          <w:rFonts w:ascii="Arial" w:eastAsiaTheme="minorHAnsi" w:hAnsi="Arial" w:cs="Arial"/>
+          <w:bCs/>
+        </w:rPr>
+      </w:pPr>
+      <w:r>
+        <w:rPr>
+          <w:rFonts w:ascii="Arial" w:eastAsiaTheme="minorHAnsi" w:hAnsi="Arial" w:cs="Arial"/>
+          <w:bCs/>
+        </w:rPr>
+        <w:t xml:space="preserve">    </w:t>
+      </w:r>
+    </w:p>
+    <w:p>
+      <w:pPr>
+        <w:jc w:val="center"/>
+        <w:rPr>
+          <w:rFonts w:ascii="Arial" w:eastAsiaTheme="minorHAnsi" w:hAnsi="Arial" w:cs="Arial"/>
+          <w:b/>
+          <w:bCs/>
+          <w:sz w:val="44"/>
+        </w:rPr>
+      </w:pPr>
+      <w:r>
+        <w:rPr>
+          <w:rFonts w:ascii="Arial" w:eastAsiaTheme="minorHAnsi" w:hAnsi="Arial" w:cs="Arial"/>
+          <w:b/>
+          <w:bCs/>
+          <w:sz w:val="44"/>
+        </w:rPr>
+        <w:t>Tabla de Integrantes</w:t>
+      </w:r>
+    </w:p>
+    <w:p>
+      <w:pPr>
+        <w:rPr>
+          <w:rFonts w:ascii="Arial" w:eastAsiaTheme="minorHAnsi" w:hAnsi="Arial" w:cs="Arial"/>
+          <w:bCs/>
+        </w:rPr>
+      </w:pPr>
+    </w:p>
+    <w:p>
+      <w:pPr>
+        <w:rPr>
+          <w:rFonts w:ascii="Arial" w:eastAsiaTheme="minorHAnsi" w:hAnsi="Arial" w:cs="Arial"/>
+          <w:bCs/>
+        </w:rPr>
+      </w:pPr>
+    </w:p>
+    <w:p>
+      <w:pPr>
+        <w:rPr>
+          <w:rFonts w:ascii="Arial" w:eastAsiaTheme="minorHAnsi" w:hAnsi="Arial" w:cs="Arial"/>
+          <w:bCs/>
+        </w:rPr>
+      </w:pPr>
+    </w:p>
+    <w:p>
+      <w:pPr>
+        <w:rPr>
+          <w:rFonts w:ascii="Arial" w:eastAsiaTheme="minorHAnsi" w:hAnsi="Arial" w:cs="Arial"/>
+          <w:bCs/>
+        </w:rPr>
+      </w:pPr>
+    </w:p>
+    <w:p>
+      <w:pPr>
+        <w:rPr>
+          <w:rFonts w:ascii="Arial" w:eastAsiaTheme="minorHAnsi" w:hAnsi="Arial" w:cs="Arial"/>
+          <w:bCs/>
+        </w:rPr>
+      </w:pPr>
+    </w:p>
     <w:tbl>
       <w:tblPr>
         <w:tblStyle w:val="Tablaconcuadrcula"/>
+        <w:tblpPr w:leftFromText="141" w:rightFromText="141" w:vertAnchor="page" w:horzAnchor="margin" w:tblpY="4527"/>
         <w:tblW w:w="0" w:type="auto"/>
         <w:tblLook w:val="04A0" w:firstRow="1" w:lastRow="0" w:firstColumn="1" w:lastColumn="0" w:noHBand="0" w:noVBand="1"/>
       </w:tblPr>
@@ -550,7 +615,6 @@
                 <w:b/>
                 <w:sz w:val="24"/>
               </w:rPr>
-              <w:lastRenderedPageBreak/>
               <w:t xml:space="preserve">Nombre </w:t>
             </w:r>
             <w:r>
@@ -932,6 +996,13 @@
                 <w:sz w:val="24"/>
               </w:rPr>
             </w:pPr>
+            <w:r>
+              <w:rPr>
+                <w:rFonts w:ascii="Arial" w:eastAsiaTheme="minorHAnsi" w:hAnsi="Arial" w:cs="Arial"/>
+                <w:sz w:val="24"/>
+              </w:rPr>
+              <w:t>Franklin Stev Paiz Chavez</w:t>
+            </w:r>
           </w:p>
         </w:tc>
         <w:tc>
@@ -947,6 +1018,13 @@
                 <w:sz w:val="24"/>
               </w:rPr>
             </w:pPr>
+            <w:r>
+              <w:rPr>
+                <w:rFonts w:ascii="Arial" w:eastAsiaTheme="minorHAnsi" w:hAnsi="Arial" w:cs="Arial"/>
+                <w:sz w:val="24"/>
+              </w:rPr>
+              <w:t>Programador</w:t>
+            </w:r>
           </w:p>
         </w:tc>
       </w:tr>
@@ -965,6 +1043,14 @@
                 <w:szCs w:val="24"/>
               </w:rPr>
             </w:pPr>
+            <w:r>
+              <w:rPr>
+                <w:rFonts w:ascii="Arial" w:eastAsiaTheme="minorEastAsia" w:hAnsi="Arial" w:cs="Arial"/>
+                <w:sz w:val="24"/>
+                <w:szCs w:val="24"/>
+              </w:rPr>
+              <w:t>Angel Gabriel Ernesto Grijalva Castro</w:t>
+            </w:r>
           </w:p>
         </w:tc>
         <w:tc>
@@ -981,6 +1067,14 @@
                 <w:szCs w:val="24"/>
               </w:rPr>
             </w:pPr>
+            <w:r>
+              <w:rPr>
+                <w:rFonts w:ascii="Arial" w:eastAsiaTheme="minorEastAsia" w:hAnsi="Arial" w:cs="Arial"/>
+                <w:sz w:val="24"/>
+                <w:szCs w:val="24"/>
+              </w:rPr>
+              <w:t>Programador</w:t>
+            </w:r>
           </w:p>
         </w:tc>
       </w:tr>
@@ -998,6 +1092,13 @@
                 <w:sz w:val="24"/>
               </w:rPr>
             </w:pPr>
+            <w:r>
+              <w:rPr>
+                <w:rFonts w:ascii="Arial" w:eastAsiaTheme="minorHAnsi" w:hAnsi="Arial" w:cs="Arial"/>
+                <w:sz w:val="24"/>
+              </w:rPr>
+              <w:t>Benjamin Elí Argueta Caal</w:t>
+            </w:r>
           </w:p>
         </w:tc>
         <w:tc>
@@ -1013,6 +1114,13 @@
                 <w:sz w:val="24"/>
               </w:rPr>
             </w:pPr>
+            <w:r>
+              <w:rPr>
+                <w:rFonts w:ascii="Arial" w:eastAsiaTheme="minorHAnsi" w:hAnsi="Arial" w:cs="Arial"/>
+                <w:sz w:val="24"/>
+              </w:rPr>
+              <w:t>Programador</w:t>
+            </w:r>
           </w:p>
         </w:tc>
       </w:tr>
@@ -1030,6 +1138,13 @@
                 <w:sz w:val="24"/>
               </w:rPr>
             </w:pPr>
+            <w:r>
+              <w:rPr>
+                <w:rFonts w:ascii="Arial" w:eastAsiaTheme="minorHAnsi" w:hAnsi="Arial" w:cs="Arial"/>
+                <w:sz w:val="24"/>
+              </w:rPr>
+              <w:t>Carlos Alejandro Patal Choc</w:t>
+            </w:r>
           </w:p>
         </w:tc>
         <w:tc>
@@ -1043,40 +1158,16 @@
               <w:rPr>
                 <w:rFonts w:ascii="Arial" w:eastAsiaTheme="minorHAnsi" w:hAnsi="Arial" w:cs="Arial"/>
                 <w:sz w:val="24"/>
+                <w:u w:val="single"/>
               </w:rPr>
             </w:pPr>
-          </w:p>
-        </w:tc>
-      </w:tr>
-      <w:tr>
-        <w:tc>
-          <w:tcPr>
-            <w:tcW w:w="5395" w:type="dxa"/>
-          </w:tcPr>
-          <w:p>
-            <w:pPr>
-              <w:spacing w:after="0" w:line="240" w:lineRule="auto"/>
-              <w:jc w:val="center"/>
+            <w:r>
               <w:rPr>
                 <w:rFonts w:ascii="Arial" w:eastAsiaTheme="minorHAnsi" w:hAnsi="Arial" w:cs="Arial"/>
                 <w:sz w:val="24"/>
               </w:rPr>
-            </w:pPr>
-          </w:p>
-        </w:tc>
-        <w:tc>
-          <w:tcPr>
-            <w:tcW w:w="5395" w:type="dxa"/>
-          </w:tcPr>
-          <w:p>
-            <w:pPr>
-              <w:spacing w:after="0" w:line="240" w:lineRule="auto"/>
-              <w:jc w:val="center"/>
-              <w:rPr>
-                <w:rFonts w:ascii="Arial" w:eastAsiaTheme="minorHAnsi" w:hAnsi="Arial" w:cs="Arial"/>
-                <w:sz w:val="24"/>
-              </w:rPr>
-            </w:pPr>
+              <w:t>Programador</w:t>
+            </w:r>
           </w:p>
         </w:tc>
       </w:tr>
@@ -1085,7 +1176,7 @@
       <w:pPr>
         <w:rPr>
           <w:rFonts w:ascii="Arial" w:eastAsiaTheme="minorHAnsi" w:hAnsi="Arial" w:cs="Arial"/>
-          <w:sz w:val="24"/>
+          <w:bCs/>
         </w:rPr>
       </w:pPr>
     </w:p>
@@ -1094,15 +1185,3711 @@
         <w:rPr>
           <w:rFonts w:ascii="Arial" w:eastAsiaTheme="minorHAnsi" w:hAnsi="Arial" w:cs="Arial"/>
           <w:bCs/>
-        </w:rPr>
-      </w:pPr>
-      <w:r>
+          <w:u w:val="single"/>
+        </w:rPr>
+      </w:pPr>
+    </w:p>
+    <w:p>
+      <w:pPr>
         <w:rPr>
           <w:rFonts w:ascii="Arial" w:eastAsiaTheme="minorHAnsi" w:hAnsi="Arial" w:cs="Arial"/>
           <w:bCs/>
-        </w:rPr>
-        <w:t xml:space="preserve">    </w:t>
-      </w:r>
+          <w:u w:val="single"/>
+        </w:rPr>
+      </w:pPr>
+    </w:p>
+    <w:p>
+      <w:pPr>
+        <w:rPr>
+          <w:rFonts w:ascii="Arial" w:eastAsiaTheme="minorHAnsi" w:hAnsi="Arial" w:cs="Arial"/>
+          <w:bCs/>
+          <w:u w:val="single"/>
+        </w:rPr>
+      </w:pPr>
+    </w:p>
+    <w:p>
+      <w:pPr>
+        <w:rPr>
+          <w:rFonts w:ascii="Arial" w:eastAsiaTheme="minorHAnsi" w:hAnsi="Arial" w:cs="Arial"/>
+          <w:bCs/>
+          <w:u w:val="single"/>
+        </w:rPr>
+      </w:pPr>
+    </w:p>
+    <w:p>
+      <w:pPr>
+        <w:rPr>
+          <w:rFonts w:ascii="Arial" w:eastAsiaTheme="minorHAnsi" w:hAnsi="Arial" w:cs="Arial"/>
+          <w:bCs/>
+          <w:u w:val="single"/>
+        </w:rPr>
+      </w:pPr>
+    </w:p>
+    <w:p>
+      <w:pPr>
+        <w:rPr>
+          <w:rFonts w:ascii="Arial" w:eastAsiaTheme="minorHAnsi" w:hAnsi="Arial" w:cs="Arial"/>
+          <w:bCs/>
+          <w:u w:val="single"/>
+        </w:rPr>
+      </w:pPr>
+    </w:p>
+    <w:p>
+      <w:pPr>
+        <w:rPr>
+          <w:rFonts w:ascii="Arial" w:eastAsiaTheme="minorHAnsi" w:hAnsi="Arial" w:cs="Arial"/>
+          <w:bCs/>
+          <w:u w:val="single"/>
+        </w:rPr>
+      </w:pPr>
+    </w:p>
+    <w:p>
+      <w:pPr>
+        <w:rPr>
+          <w:rFonts w:ascii="Arial" w:eastAsiaTheme="minorHAnsi" w:hAnsi="Arial" w:cs="Arial"/>
+          <w:bCs/>
+          <w:u w:val="single"/>
+        </w:rPr>
+      </w:pPr>
+    </w:p>
+    <w:p>
+      <w:pPr>
+        <w:rPr>
+          <w:rFonts w:ascii="Arial" w:eastAsiaTheme="minorHAnsi" w:hAnsi="Arial" w:cs="Arial"/>
+          <w:bCs/>
+          <w:u w:val="single"/>
+        </w:rPr>
+      </w:pPr>
+    </w:p>
+    <w:p>
+      <w:pPr>
+        <w:rPr>
+          <w:rFonts w:ascii="Arial" w:eastAsiaTheme="minorHAnsi" w:hAnsi="Arial" w:cs="Arial"/>
+          <w:bCs/>
+          <w:u w:val="single"/>
+        </w:rPr>
+      </w:pPr>
+    </w:p>
+    <w:p>
+      <w:pPr>
+        <w:rPr>
+          <w:rFonts w:ascii="Arial" w:eastAsiaTheme="minorHAnsi" w:hAnsi="Arial" w:cs="Arial"/>
+          <w:bCs/>
+          <w:u w:val="single"/>
+        </w:rPr>
+      </w:pPr>
+    </w:p>
+    <w:p>
+      <w:pPr>
+        <w:rPr>
+          <w:rFonts w:ascii="Arial" w:eastAsiaTheme="minorHAnsi" w:hAnsi="Arial" w:cs="Arial"/>
+          <w:bCs/>
+          <w:u w:val="single"/>
+        </w:rPr>
+      </w:pPr>
+    </w:p>
+    <w:p>
+      <w:pPr>
+        <w:rPr>
+          <w:rFonts w:ascii="Arial" w:eastAsiaTheme="minorHAnsi" w:hAnsi="Arial" w:cs="Arial"/>
+          <w:bCs/>
+          <w:u w:val="single"/>
+        </w:rPr>
+      </w:pPr>
+    </w:p>
+    <w:p>
+      <w:pPr>
+        <w:rPr>
+          <w:rFonts w:ascii="Arial" w:eastAsiaTheme="minorHAnsi" w:hAnsi="Arial" w:cs="Arial"/>
+          <w:bCs/>
+          <w:u w:val="single"/>
+        </w:rPr>
+      </w:pPr>
+    </w:p>
+    <w:p>
+      <w:pPr>
+        <w:rPr>
+          <w:rFonts w:ascii="Arial" w:eastAsiaTheme="minorHAnsi" w:hAnsi="Arial" w:cs="Arial"/>
+          <w:bCs/>
+          <w:u w:val="single"/>
+        </w:rPr>
+      </w:pPr>
+    </w:p>
+    <w:p>
+      <w:pPr>
+        <w:rPr>
+          <w:rFonts w:ascii="Arial" w:eastAsiaTheme="minorHAnsi" w:hAnsi="Arial" w:cs="Arial"/>
+          <w:bCs/>
+          <w:u w:val="single"/>
+        </w:rPr>
+      </w:pPr>
+    </w:p>
+    <w:p>
+      <w:pPr>
+        <w:jc w:val="center"/>
+        <w:rPr>
+          <w:rFonts w:ascii="Arial" w:eastAsiaTheme="minorHAnsi" w:hAnsi="Arial" w:cs="Arial"/>
+          <w:b/>
+          <w:sz w:val="44"/>
+          <w:szCs w:val="44"/>
+        </w:rPr>
+      </w:pPr>
+      <w:r>
+        <w:rPr>
+          <w:rFonts w:ascii="Arial" w:eastAsiaTheme="minorHAnsi" w:hAnsi="Arial" w:cs="Arial"/>
+          <w:b/>
+          <w:sz w:val="44"/>
+          <w:szCs w:val="44"/>
+        </w:rPr>
+        <w:t>Historias de Usuario</w:t>
+      </w:r>
+    </w:p>
+    <w:p>
+      <w:pPr>
+        <w:jc w:val="center"/>
+        <w:rPr>
+          <w:rFonts w:ascii="Arial" w:eastAsiaTheme="minorHAnsi" w:hAnsi="Arial" w:cs="Arial"/>
+          <w:b/>
+          <w:sz w:val="44"/>
+          <w:szCs w:val="44"/>
+        </w:rPr>
+      </w:pPr>
+    </w:p>
+    <w:p>
+      <w:pPr>
+        <w:jc w:val="center"/>
+        <w:rPr>
+          <w:rFonts w:ascii="Arial" w:eastAsiaTheme="minorHAnsi" w:hAnsi="Arial" w:cs="Arial"/>
+          <w:b/>
+          <w:sz w:val="44"/>
+          <w:szCs w:val="44"/>
+        </w:rPr>
+      </w:pPr>
+    </w:p>
+    <w:p>
+      <w:pPr>
+        <w:rPr>
+          <w:rFonts w:ascii="Arial" w:eastAsiaTheme="minorHAnsi" w:hAnsi="Arial" w:cs="Arial"/>
+          <w:b/>
+          <w:sz w:val="24"/>
+          <w:szCs w:val="20"/>
+        </w:rPr>
+      </w:pPr>
+      <w:r>
+        <w:rPr>
+          <w:rFonts w:ascii="Arial" w:eastAsiaTheme="minorHAnsi" w:hAnsi="Arial" w:cs="Arial"/>
+          <w:b/>
+          <w:sz w:val="24"/>
+          <w:szCs w:val="20"/>
+        </w:rPr>
+        <w:t>Tupla: Usuario</w:t>
+      </w:r>
+    </w:p>
+    <w:p>
+      <w:pPr>
+        <w:spacing w:before="100" w:beforeAutospacing="1" w:after="100" w:afterAutospacing="1" w:line="240" w:lineRule="auto"/>
+        <w:rPr>
+          <w:rFonts w:ascii="Arial" w:eastAsia="Times New Roman" w:hAnsi="Arial" w:cs="Arial"/>
+          <w:szCs w:val="24"/>
+          <w:lang w:eastAsia="es-GT"/>
+        </w:rPr>
+      </w:pPr>
+      <w:r>
+        <w:rPr>
+          <w:rFonts w:ascii="Arial" w:eastAsia="Times New Roman" w:hAnsi="Arial" w:cs="Arial"/>
+          <w:bCs/>
+          <w:szCs w:val="24"/>
+          <w:lang w:eastAsia="es-GT"/>
+        </w:rPr>
+        <w:t>HUKC-001</w:t>
+      </w:r>
+      <w:r>
+        <w:rPr>
+          <w:rFonts w:ascii="Arial" w:eastAsia="Times New Roman" w:hAnsi="Arial" w:cs="Arial"/>
+          <w:b/>
+          <w:bCs/>
+          <w:szCs w:val="24"/>
+          <w:lang w:eastAsia="es-GT"/>
+        </w:rPr>
+        <w:t xml:space="preserve"> Registro de Nuevo Usuario</w:t>
+      </w:r>
+    </w:p>
+    <w:p>
+      <w:pPr>
+        <w:spacing w:before="100" w:beforeAutospacing="1" w:after="100" w:afterAutospacing="1" w:line="240" w:lineRule="auto"/>
+        <w:rPr>
+          <w:rFonts w:ascii="Arial" w:eastAsia="Times New Roman" w:hAnsi="Arial" w:cs="Arial"/>
+          <w:szCs w:val="24"/>
+          <w:lang w:eastAsia="es-GT"/>
+        </w:rPr>
+      </w:pPr>
+      <w:r>
+        <w:rPr>
+          <w:rFonts w:ascii="Arial" w:eastAsia="Times New Roman" w:hAnsi="Arial" w:cs="Arial"/>
+          <w:b/>
+          <w:szCs w:val="24"/>
+          <w:lang w:eastAsia="es-GT"/>
+        </w:rPr>
+        <w:t>Como</w:t>
+      </w:r>
+      <w:r>
+        <w:rPr>
+          <w:rFonts w:ascii="Arial" w:eastAsia="Times New Roman" w:hAnsi="Arial" w:cs="Arial"/>
+          <w:szCs w:val="24"/>
+          <w:lang w:eastAsia="es-GT"/>
+        </w:rPr>
+        <w:t xml:space="preserve">: Un nuevo usuario (anfitrión o invitado) </w:t>
+      </w:r>
+    </w:p>
+    <w:p>
+      <w:pPr>
+        <w:spacing w:before="100" w:beforeAutospacing="1" w:after="100" w:afterAutospacing="1" w:line="240" w:lineRule="auto"/>
+        <w:rPr>
+          <w:rFonts w:ascii="Arial" w:eastAsia="Times New Roman" w:hAnsi="Arial" w:cs="Arial"/>
+          <w:szCs w:val="24"/>
+          <w:lang w:eastAsia="es-GT"/>
+        </w:rPr>
+      </w:pPr>
+      <w:r>
+        <w:rPr>
+          <w:rFonts w:ascii="Arial" w:eastAsia="Times New Roman" w:hAnsi="Arial" w:cs="Arial"/>
+          <w:b/>
+          <w:szCs w:val="24"/>
+          <w:lang w:eastAsia="es-GT"/>
+        </w:rPr>
+        <w:t>Quiero</w:t>
+      </w:r>
+      <w:r>
+        <w:rPr>
+          <w:rFonts w:ascii="Arial" w:eastAsia="Times New Roman" w:hAnsi="Arial" w:cs="Arial"/>
+          <w:szCs w:val="24"/>
+          <w:lang w:eastAsia="es-GT"/>
+        </w:rPr>
+        <w:t xml:space="preserve">: Registrarme en el sistema proporcionando mi nombre, correo, teléfono, fecha de nacimiento y tipo de usuario (anfitrión o invitado) </w:t>
+      </w:r>
+    </w:p>
+    <w:p>
+      <w:pPr>
+        <w:spacing w:before="100" w:beforeAutospacing="1" w:after="100" w:afterAutospacing="1" w:line="240" w:lineRule="auto"/>
+        <w:rPr>
+          <w:rFonts w:ascii="Arial" w:eastAsia="Times New Roman" w:hAnsi="Arial" w:cs="Arial"/>
+          <w:szCs w:val="24"/>
+          <w:lang w:eastAsia="es-GT"/>
+        </w:rPr>
+      </w:pPr>
+      <w:r>
+        <w:rPr>
+          <w:rFonts w:ascii="Arial" w:eastAsia="Times New Roman" w:hAnsi="Arial" w:cs="Arial"/>
+          <w:b/>
+          <w:szCs w:val="24"/>
+          <w:lang w:eastAsia="es-GT"/>
+        </w:rPr>
+        <w:t>Para</w:t>
+      </w:r>
+      <w:r>
+        <w:rPr>
+          <w:rFonts w:ascii="Arial" w:eastAsia="Times New Roman" w:hAnsi="Arial" w:cs="Arial"/>
+          <w:szCs w:val="24"/>
+          <w:lang w:eastAsia="es-GT"/>
+        </w:rPr>
+        <w:t>: Poder utilizar los servicios de la plataforma, ya sea para ofrecer propiedades o para reservarlas.</w:t>
+      </w:r>
+    </w:p>
+    <w:p>
+      <w:pPr>
+        <w:spacing w:before="100" w:beforeAutospacing="1" w:after="100" w:afterAutospacing="1" w:line="240" w:lineRule="auto"/>
+        <w:rPr>
+          <w:rFonts w:ascii="Arial" w:eastAsia="Times New Roman" w:hAnsi="Arial" w:cs="Arial"/>
+          <w:szCs w:val="24"/>
+          <w:lang w:eastAsia="es-GT"/>
+        </w:rPr>
+      </w:pPr>
+    </w:p>
+    <w:p>
+      <w:pPr>
+        <w:spacing w:before="100" w:beforeAutospacing="1" w:after="100" w:afterAutospacing="1" w:line="240" w:lineRule="auto"/>
+        <w:rPr>
+          <w:rFonts w:ascii="Arial" w:eastAsia="Times New Roman" w:hAnsi="Arial" w:cs="Arial"/>
+          <w:szCs w:val="24"/>
+          <w:lang w:eastAsia="es-GT"/>
+        </w:rPr>
+      </w:pPr>
+      <w:r>
+        <w:rPr>
+          <w:rFonts w:ascii="Arial" w:eastAsia="Times New Roman" w:hAnsi="Arial" w:cs="Arial"/>
+          <w:szCs w:val="24"/>
+          <w:lang w:eastAsia="es-GT"/>
+        </w:rPr>
+        <w:t>HUKC-002</w:t>
+      </w:r>
+      <w:r>
+        <w:rPr>
+          <w:rFonts w:ascii="Arial" w:eastAsia="Times New Roman" w:hAnsi="Arial" w:cs="Arial"/>
+          <w:b/>
+          <w:bCs/>
+          <w:szCs w:val="24"/>
+          <w:lang w:eastAsia="es-GT"/>
+        </w:rPr>
+        <w:t xml:space="preserve"> Edición de Perfil de Usuario</w:t>
+      </w:r>
+    </w:p>
+    <w:p>
+      <w:pPr>
+        <w:spacing w:before="100" w:beforeAutospacing="1" w:after="100" w:afterAutospacing="1" w:line="240" w:lineRule="auto"/>
+        <w:rPr>
+          <w:rFonts w:ascii="Arial" w:eastAsia="Times New Roman" w:hAnsi="Arial" w:cs="Arial"/>
+          <w:szCs w:val="24"/>
+          <w:lang w:eastAsia="es-GT"/>
+        </w:rPr>
+      </w:pPr>
+      <w:r>
+        <w:rPr>
+          <w:rFonts w:ascii="Arial" w:eastAsia="Times New Roman" w:hAnsi="Arial" w:cs="Arial"/>
+          <w:b/>
+          <w:szCs w:val="24"/>
+          <w:lang w:eastAsia="es-GT"/>
+        </w:rPr>
+        <w:t>Como</w:t>
+      </w:r>
+      <w:r>
+        <w:rPr>
+          <w:rFonts w:ascii="Arial" w:eastAsia="Times New Roman" w:hAnsi="Arial" w:cs="Arial"/>
+          <w:szCs w:val="24"/>
+          <w:lang w:eastAsia="es-GT"/>
+        </w:rPr>
+        <w:t>: Un usuario registrado</w:t>
+      </w:r>
+    </w:p>
+    <w:p>
+      <w:pPr>
+        <w:spacing w:before="100" w:beforeAutospacing="1" w:after="100" w:afterAutospacing="1" w:line="240" w:lineRule="auto"/>
+        <w:rPr>
+          <w:rFonts w:ascii="Arial" w:eastAsia="Times New Roman" w:hAnsi="Arial" w:cs="Arial"/>
+          <w:szCs w:val="24"/>
+          <w:lang w:eastAsia="es-GT"/>
+        </w:rPr>
+      </w:pPr>
+      <w:r>
+        <w:rPr>
+          <w:rFonts w:ascii="Arial" w:eastAsia="Times New Roman" w:hAnsi="Arial" w:cs="Arial"/>
+          <w:szCs w:val="24"/>
+          <w:lang w:eastAsia="es-GT"/>
+        </w:rPr>
+        <w:t xml:space="preserve"> </w:t>
+      </w:r>
+      <w:r>
+        <w:rPr>
+          <w:rFonts w:ascii="Arial" w:eastAsia="Times New Roman" w:hAnsi="Arial" w:cs="Arial"/>
+          <w:b/>
+          <w:szCs w:val="24"/>
+          <w:lang w:eastAsia="es-GT"/>
+        </w:rPr>
+        <w:t>Quiero</w:t>
+      </w:r>
+      <w:r>
+        <w:rPr>
+          <w:rFonts w:ascii="Arial" w:eastAsia="Times New Roman" w:hAnsi="Arial" w:cs="Arial"/>
+          <w:szCs w:val="24"/>
+          <w:lang w:eastAsia="es-GT"/>
+        </w:rPr>
+        <w:t xml:space="preserve">: Poder editar mi nombre, correo, teléfono, fecha de nacimiento, tipo de usuario y subir imágenes a mi perfil </w:t>
+      </w:r>
+    </w:p>
+    <w:p>
+      <w:pPr>
+        <w:spacing w:before="100" w:beforeAutospacing="1" w:after="100" w:afterAutospacing="1" w:line="240" w:lineRule="auto"/>
+        <w:rPr>
+          <w:rFonts w:ascii="Arial" w:eastAsia="Times New Roman" w:hAnsi="Arial" w:cs="Arial"/>
+          <w:szCs w:val="24"/>
+          <w:lang w:eastAsia="es-GT"/>
+        </w:rPr>
+      </w:pPr>
+      <w:r>
+        <w:rPr>
+          <w:rFonts w:ascii="Arial" w:eastAsia="Times New Roman" w:hAnsi="Arial" w:cs="Arial"/>
+          <w:b/>
+          <w:szCs w:val="24"/>
+          <w:lang w:eastAsia="es-GT"/>
+        </w:rPr>
+        <w:t>Para</w:t>
+      </w:r>
+      <w:r>
+        <w:rPr>
+          <w:rFonts w:ascii="Arial" w:eastAsia="Times New Roman" w:hAnsi="Arial" w:cs="Arial"/>
+          <w:szCs w:val="24"/>
+          <w:lang w:eastAsia="es-GT"/>
+        </w:rPr>
+        <w:t>: Mantener mi información actualizada y personalizada en la plataforma.</w:t>
+      </w:r>
+    </w:p>
+    <w:p>
+      <w:pPr>
+        <w:spacing w:before="100" w:beforeAutospacing="1" w:after="100" w:afterAutospacing="1" w:line="240" w:lineRule="auto"/>
+        <w:ind w:left="708" w:hanging="708"/>
+        <w:rPr>
+          <w:rFonts w:ascii="Arial" w:eastAsia="Times New Roman" w:hAnsi="Arial" w:cs="Arial"/>
+          <w:sz w:val="24"/>
+          <w:szCs w:val="24"/>
+          <w:lang w:eastAsia="es-GT"/>
+        </w:rPr>
+      </w:pPr>
+    </w:p>
+    <w:p>
+      <w:pPr>
+        <w:spacing w:before="100" w:beforeAutospacing="1" w:after="100" w:afterAutospacing="1" w:line="240" w:lineRule="auto"/>
+        <w:rPr>
+          <w:rFonts w:ascii="Arial" w:eastAsia="Times New Roman" w:hAnsi="Arial" w:cs="Arial"/>
+          <w:szCs w:val="24"/>
+          <w:lang w:eastAsia="es-GT"/>
+        </w:rPr>
+      </w:pPr>
+      <w:r>
+        <w:rPr>
+          <w:rFonts w:ascii="Arial" w:eastAsia="Times New Roman" w:hAnsi="Arial" w:cs="Arial"/>
+          <w:szCs w:val="24"/>
+          <w:lang w:eastAsia="es-GT"/>
+        </w:rPr>
+        <w:t>HUKC-003</w:t>
+      </w:r>
+      <w:r>
+        <w:rPr>
+          <w:rFonts w:ascii="Arial" w:eastAsia="Times New Roman" w:hAnsi="Arial" w:cs="Arial"/>
+          <w:b/>
+          <w:bCs/>
+          <w:szCs w:val="24"/>
+          <w:lang w:eastAsia="es-GT"/>
+        </w:rPr>
+        <w:t xml:space="preserve"> Visualización de Perfil de Usuario</w:t>
+      </w:r>
+    </w:p>
+    <w:p>
+      <w:pPr>
+        <w:spacing w:before="100" w:beforeAutospacing="1" w:after="100" w:afterAutospacing="1" w:line="240" w:lineRule="auto"/>
+        <w:rPr>
+          <w:rFonts w:ascii="Arial" w:eastAsia="Times New Roman" w:hAnsi="Arial" w:cs="Arial"/>
+          <w:szCs w:val="24"/>
+          <w:lang w:eastAsia="es-GT"/>
+        </w:rPr>
+      </w:pPr>
+      <w:r>
+        <w:rPr>
+          <w:rFonts w:ascii="Arial" w:eastAsia="Times New Roman" w:hAnsi="Arial" w:cs="Arial"/>
+          <w:b/>
+          <w:szCs w:val="24"/>
+          <w:lang w:eastAsia="es-GT"/>
+        </w:rPr>
+        <w:t>Como</w:t>
+      </w:r>
+      <w:r>
+        <w:rPr>
+          <w:rFonts w:ascii="Arial" w:eastAsia="Times New Roman" w:hAnsi="Arial" w:cs="Arial"/>
+          <w:szCs w:val="24"/>
+          <w:lang w:eastAsia="es-GT"/>
+        </w:rPr>
+        <w:t>: Un usuario (o un empleado del área con permisos)</w:t>
+      </w:r>
+    </w:p>
+    <w:p>
+      <w:pPr>
+        <w:spacing w:before="100" w:beforeAutospacing="1" w:after="100" w:afterAutospacing="1" w:line="240" w:lineRule="auto"/>
+        <w:rPr>
+          <w:rFonts w:ascii="Arial" w:eastAsia="Times New Roman" w:hAnsi="Arial" w:cs="Arial"/>
+          <w:szCs w:val="24"/>
+          <w:lang w:eastAsia="es-GT"/>
+        </w:rPr>
+      </w:pPr>
+      <w:r>
+        <w:rPr>
+          <w:rFonts w:ascii="Arial" w:eastAsia="Times New Roman" w:hAnsi="Arial" w:cs="Arial"/>
+          <w:szCs w:val="24"/>
+          <w:lang w:eastAsia="es-GT"/>
+        </w:rPr>
+        <w:t xml:space="preserve"> </w:t>
+      </w:r>
+      <w:r>
+        <w:rPr>
+          <w:rFonts w:ascii="Arial" w:eastAsia="Times New Roman" w:hAnsi="Arial" w:cs="Arial"/>
+          <w:b/>
+          <w:szCs w:val="24"/>
+          <w:lang w:eastAsia="es-GT"/>
+        </w:rPr>
+        <w:t>Quiero</w:t>
+      </w:r>
+      <w:r>
+        <w:rPr>
+          <w:rFonts w:ascii="Arial" w:eastAsia="Times New Roman" w:hAnsi="Arial" w:cs="Arial"/>
+          <w:szCs w:val="24"/>
+          <w:lang w:eastAsia="es-GT"/>
+        </w:rPr>
+        <w:t>: Poder ver el perfil de un usuario, incluyendo su nombre, correo, teléfono, fecha de nacimiento, tipo de usuario y sus imágenes</w:t>
+      </w:r>
+    </w:p>
+    <w:p>
+      <w:pPr>
+        <w:spacing w:before="100" w:beforeAutospacing="1" w:after="100" w:afterAutospacing="1" w:line="240" w:lineRule="auto"/>
+        <w:rPr>
+          <w:rFonts w:ascii="Arial" w:eastAsia="Times New Roman" w:hAnsi="Arial" w:cs="Arial"/>
+          <w:szCs w:val="24"/>
+          <w:lang w:eastAsia="es-GT"/>
+        </w:rPr>
+      </w:pPr>
+      <w:r>
+        <w:rPr>
+          <w:rFonts w:ascii="Arial" w:eastAsia="Times New Roman" w:hAnsi="Arial" w:cs="Arial"/>
+          <w:szCs w:val="24"/>
+          <w:lang w:eastAsia="es-GT"/>
+        </w:rPr>
+        <w:t xml:space="preserve"> </w:t>
+      </w:r>
+      <w:r>
+        <w:rPr>
+          <w:rFonts w:ascii="Arial" w:eastAsia="Times New Roman" w:hAnsi="Arial" w:cs="Arial"/>
+          <w:b/>
+          <w:szCs w:val="24"/>
+          <w:lang w:eastAsia="es-GT"/>
+        </w:rPr>
+        <w:t>Para</w:t>
+      </w:r>
+      <w:r>
+        <w:rPr>
+          <w:rFonts w:ascii="Arial" w:eastAsia="Times New Roman" w:hAnsi="Arial" w:cs="Arial"/>
+          <w:szCs w:val="24"/>
+          <w:lang w:eastAsia="es-GT"/>
+        </w:rPr>
+        <w:t>: Obtener información relevante sobre un usuario específico en la plataforma.</w:t>
+      </w:r>
+    </w:p>
+    <w:p>
+      <w:pPr>
+        <w:spacing w:before="100" w:beforeAutospacing="1" w:after="100" w:afterAutospacing="1" w:line="240" w:lineRule="auto"/>
+        <w:rPr>
+          <w:rFonts w:ascii="Arial" w:eastAsia="Times New Roman" w:hAnsi="Arial" w:cs="Arial"/>
+          <w:szCs w:val="24"/>
+          <w:lang w:eastAsia="es-GT"/>
+        </w:rPr>
+      </w:pPr>
+    </w:p>
+    <w:p>
+      <w:pPr>
+        <w:rPr>
+          <w:b/>
+        </w:rPr>
+      </w:pPr>
+      <w:r>
+        <w:rPr>
+          <w:b/>
+        </w:rPr>
+        <w:t>TUPLA:Servicios</w:t>
+      </w:r>
+    </w:p>
+    <w:p>
+      <w:pPr>
+        <w:rPr>
+          <w:b/>
+        </w:rPr>
+      </w:pPr>
+      <w:r>
+        <w:t>HUJC-004</w:t>
+      </w:r>
+    </w:p>
+    <w:p>
+      <w:pPr>
+        <w:pStyle w:val="paragraph"/>
+        <w:spacing w:before="0" w:beforeAutospacing="0" w:after="0" w:afterAutospacing="0"/>
+        <w:textAlignment w:val="baseline"/>
+        <w:rPr>
+          <w:rStyle w:val="eop"/>
+          <w:rFonts w:ascii="Calibri" w:eastAsia="MS Mincho" w:hAnsi="Calibri" w:cs="Calibri"/>
+          <w:sz w:val="22"/>
+          <w:szCs w:val="22"/>
+        </w:rPr>
+      </w:pPr>
+      <w:r>
+        <w:rPr>
+          <w:rStyle w:val="normaltextrun"/>
+          <w:rFonts w:ascii="Calibri" w:hAnsi="Calibri" w:cs="Calibri"/>
+          <w:sz w:val="22"/>
+          <w:szCs w:val="22"/>
+        </w:rPr>
+        <w:t>Como</w:t>
+      </w:r>
+      <w:r>
+        <w:rPr>
+          <w:rStyle w:val="normaltextrun"/>
+          <w:rFonts w:ascii="Calibri" w:hAnsi="Calibri" w:cs="Calibri"/>
+          <w:sz w:val="22"/>
+          <w:szCs w:val="22"/>
+          <w:lang w:val="zh-CN"/>
+        </w:rPr>
+        <w:t>:</w:t>
+      </w:r>
+      <w:r>
+        <w:rPr>
+          <w:rStyle w:val="normaltextrun"/>
+          <w:rFonts w:ascii="Calibri" w:hAnsi="Calibri" w:cs="Calibri"/>
+          <w:sz w:val="22"/>
+          <w:szCs w:val="22"/>
+        </w:rPr>
+        <w:t xml:space="preserve"> cliente </w:t>
+      </w:r>
+      <w:r>
+        <w:rPr>
+          <w:rStyle w:val="eop"/>
+          <w:rFonts w:ascii="Calibri" w:eastAsia="MS Mincho" w:hAnsi="Calibri" w:cs="Calibri"/>
+          <w:sz w:val="22"/>
+          <w:szCs w:val="22"/>
+        </w:rPr>
+        <w:t> </w:t>
+      </w:r>
+    </w:p>
+    <w:p>
+      <w:pPr>
+        <w:pStyle w:val="paragraph"/>
+        <w:spacing w:before="0" w:beforeAutospacing="0" w:after="0" w:afterAutospacing="0"/>
+        <w:textAlignment w:val="baseline"/>
+        <w:rPr>
+          <w:rFonts w:ascii="Segoe UI" w:hAnsi="Segoe UI" w:cs="Segoe UI"/>
+          <w:sz w:val="18"/>
+          <w:szCs w:val="18"/>
+        </w:rPr>
+      </w:pPr>
+    </w:p>
+    <w:p>
+      <w:pPr>
+        <w:pStyle w:val="paragraph"/>
+        <w:spacing w:before="0" w:beforeAutospacing="0" w:after="0" w:afterAutospacing="0"/>
+        <w:textAlignment w:val="baseline"/>
+        <w:rPr>
+          <w:rFonts w:ascii="Segoe UI" w:hAnsi="Segoe UI" w:cs="Segoe UI"/>
+          <w:sz w:val="18"/>
+          <w:szCs w:val="18"/>
+        </w:rPr>
+      </w:pPr>
+      <w:r>
+        <w:rPr>
+          <w:rStyle w:val="normaltextrun"/>
+          <w:rFonts w:ascii="Calibri" w:hAnsi="Calibri" w:cs="Calibri"/>
+          <w:sz w:val="22"/>
+          <w:szCs w:val="22"/>
+        </w:rPr>
+        <w:t>Quiero: ver los servicios con su nombre, descripción, horario disponible y costo extra,</w:t>
+      </w:r>
+      <w:r>
+        <w:rPr>
+          <w:rStyle w:val="eop"/>
+          <w:rFonts w:ascii="Calibri" w:eastAsia="MS Mincho" w:hAnsi="Calibri" w:cs="Calibri"/>
+          <w:sz w:val="22"/>
+          <w:szCs w:val="22"/>
+        </w:rPr>
+        <w:t> </w:t>
+      </w:r>
+    </w:p>
+    <w:p>
+      <w:pPr>
+        <w:pStyle w:val="paragraph"/>
+        <w:spacing w:before="0" w:beforeAutospacing="0" w:after="0" w:afterAutospacing="0"/>
+        <w:textAlignment w:val="baseline"/>
+        <w:rPr>
+          <w:rStyle w:val="normaltextrun"/>
+          <w:rFonts w:ascii="Calibri" w:hAnsi="Calibri" w:cs="Calibri"/>
+          <w:sz w:val="22"/>
+          <w:szCs w:val="22"/>
+        </w:rPr>
+      </w:pPr>
+    </w:p>
+    <w:p>
+      <w:pPr>
+        <w:pStyle w:val="paragraph"/>
+        <w:spacing w:before="0" w:beforeAutospacing="0" w:after="0" w:afterAutospacing="0"/>
+        <w:textAlignment w:val="baseline"/>
+        <w:rPr>
+          <w:rStyle w:val="eop"/>
+          <w:rFonts w:ascii="Calibri" w:eastAsia="MS Mincho" w:hAnsi="Calibri" w:cs="Calibri"/>
+          <w:sz w:val="22"/>
+          <w:szCs w:val="22"/>
+        </w:rPr>
+      </w:pPr>
+      <w:r>
+        <w:rPr>
+          <w:rStyle w:val="normaltextrun"/>
+          <w:rFonts w:ascii="Calibri" w:hAnsi="Calibri" w:cs="Calibri"/>
+          <w:sz w:val="22"/>
+          <w:szCs w:val="22"/>
+        </w:rPr>
+        <w:t>Para: poder elegir el servicio que mejor se adapte a mis necesidades y presupuesto.</w:t>
+      </w:r>
+      <w:r>
+        <w:rPr>
+          <w:rStyle w:val="eop"/>
+          <w:rFonts w:ascii="Calibri" w:eastAsia="MS Mincho" w:hAnsi="Calibri" w:cs="Calibri"/>
+          <w:sz w:val="22"/>
+          <w:szCs w:val="22"/>
+        </w:rPr>
+        <w:t> </w:t>
+      </w:r>
+    </w:p>
+    <w:p>
+      <w:pPr>
+        <w:pStyle w:val="paragraph"/>
+        <w:spacing w:before="0" w:beforeAutospacing="0" w:after="0" w:afterAutospacing="0"/>
+        <w:textAlignment w:val="baseline"/>
+        <w:rPr>
+          <w:rStyle w:val="eop"/>
+          <w:rFonts w:ascii="Calibri" w:eastAsia="MS Mincho" w:hAnsi="Calibri" w:cs="Calibri"/>
+          <w:sz w:val="22"/>
+          <w:szCs w:val="22"/>
+        </w:rPr>
+      </w:pPr>
+    </w:p>
+    <w:p>
+      <w:pPr>
+        <w:pStyle w:val="paragraph"/>
+        <w:spacing w:before="0" w:beforeAutospacing="0" w:after="0" w:afterAutospacing="0"/>
+        <w:textAlignment w:val="baseline"/>
+        <w:rPr>
+          <w:rStyle w:val="eop"/>
+          <w:rFonts w:ascii="Calibri" w:eastAsia="MS Mincho" w:hAnsi="Calibri" w:cs="Calibri"/>
+          <w:sz w:val="22"/>
+          <w:szCs w:val="22"/>
+        </w:rPr>
+      </w:pPr>
+    </w:p>
+    <w:p>
+      <w:pPr>
+        <w:rPr>
+          <w:rStyle w:val="eop"/>
+          <w:b/>
+        </w:rPr>
+      </w:pPr>
+      <w:r>
+        <w:t>HUJC-005</w:t>
+      </w:r>
+    </w:p>
+    <w:p>
+      <w:pPr>
+        <w:pStyle w:val="paragraph"/>
+        <w:spacing w:before="0" w:beforeAutospacing="0" w:after="0" w:afterAutospacing="0"/>
+        <w:textAlignment w:val="baseline"/>
+        <w:rPr>
+          <w:rFonts w:ascii="Segoe UI" w:hAnsi="Segoe UI" w:cs="Segoe UI"/>
+          <w:sz w:val="18"/>
+          <w:szCs w:val="18"/>
+        </w:rPr>
+      </w:pPr>
+      <w:r>
+        <w:rPr>
+          <w:rStyle w:val="normaltextrun"/>
+          <w:rFonts w:ascii="Calibri" w:hAnsi="Calibri" w:cs="Calibri"/>
+          <w:sz w:val="22"/>
+          <w:szCs w:val="22"/>
+        </w:rPr>
+        <w:t>Como: administrador </w:t>
+      </w:r>
+      <w:r>
+        <w:rPr>
+          <w:rStyle w:val="eop"/>
+          <w:rFonts w:ascii="Calibri" w:eastAsia="MS Mincho" w:hAnsi="Calibri" w:cs="Calibri"/>
+          <w:sz w:val="22"/>
+          <w:szCs w:val="22"/>
+        </w:rPr>
+        <w:t> </w:t>
+      </w:r>
+    </w:p>
+    <w:p>
+      <w:pPr>
+        <w:pStyle w:val="paragraph"/>
+        <w:spacing w:before="0" w:beforeAutospacing="0" w:after="0" w:afterAutospacing="0"/>
+        <w:textAlignment w:val="baseline"/>
+        <w:rPr>
+          <w:rStyle w:val="normaltextrun"/>
+          <w:rFonts w:ascii="Calibri" w:hAnsi="Calibri" w:cs="Calibri"/>
+          <w:sz w:val="22"/>
+          <w:szCs w:val="22"/>
+        </w:rPr>
+      </w:pPr>
+    </w:p>
+    <w:p>
+      <w:pPr>
+        <w:pStyle w:val="paragraph"/>
+        <w:spacing w:before="0" w:beforeAutospacing="0" w:after="0" w:afterAutospacing="0"/>
+        <w:textAlignment w:val="baseline"/>
+        <w:rPr>
+          <w:rFonts w:ascii="Segoe UI" w:hAnsi="Segoe UI" w:cs="Segoe UI"/>
+          <w:sz w:val="18"/>
+          <w:szCs w:val="18"/>
+        </w:rPr>
+      </w:pPr>
+      <w:r>
+        <w:rPr>
+          <w:rStyle w:val="normaltextrun"/>
+          <w:rFonts w:ascii="Calibri" w:hAnsi="Calibri" w:cs="Calibri"/>
+          <w:sz w:val="22"/>
+          <w:szCs w:val="22"/>
+        </w:rPr>
+        <w:t>Quiero: poder activar, desactivar y modificar los datos de un servicio (nombre, descripción, horario, costo extra y tipo de servicio),</w:t>
+      </w:r>
+      <w:r>
+        <w:rPr>
+          <w:rStyle w:val="eop"/>
+          <w:rFonts w:ascii="Calibri" w:eastAsia="MS Mincho" w:hAnsi="Calibri" w:cs="Calibri"/>
+          <w:sz w:val="22"/>
+          <w:szCs w:val="22"/>
+        </w:rPr>
+        <w:t> </w:t>
+      </w:r>
+    </w:p>
+    <w:p>
+      <w:pPr>
+        <w:pStyle w:val="paragraph"/>
+        <w:spacing w:before="0" w:beforeAutospacing="0" w:after="0" w:afterAutospacing="0"/>
+        <w:textAlignment w:val="baseline"/>
+        <w:rPr>
+          <w:rStyle w:val="normaltextrun"/>
+          <w:rFonts w:ascii="Calibri" w:hAnsi="Calibri" w:cs="Calibri"/>
+          <w:sz w:val="22"/>
+          <w:szCs w:val="22"/>
+        </w:rPr>
+      </w:pPr>
+    </w:p>
+    <w:p>
+      <w:pPr>
+        <w:pStyle w:val="paragraph"/>
+        <w:spacing w:before="0" w:beforeAutospacing="0" w:after="0" w:afterAutospacing="0"/>
+        <w:textAlignment w:val="baseline"/>
+        <w:rPr>
+          <w:rStyle w:val="eop"/>
+          <w:rFonts w:ascii="Calibri" w:eastAsia="MS Mincho" w:hAnsi="Calibri" w:cs="Calibri"/>
+          <w:sz w:val="22"/>
+          <w:szCs w:val="22"/>
+        </w:rPr>
+      </w:pPr>
+      <w:r>
+        <w:rPr>
+          <w:rStyle w:val="normaltextrun"/>
+          <w:rFonts w:ascii="Calibri" w:hAnsi="Calibri" w:cs="Calibri"/>
+          <w:sz w:val="22"/>
+          <w:szCs w:val="22"/>
+        </w:rPr>
+        <w:t>Para: mantener la información actualizada y ofrecer servicios vigentes a los clientes.</w:t>
+      </w:r>
+      <w:r>
+        <w:rPr>
+          <w:rStyle w:val="eop"/>
+          <w:rFonts w:ascii="Calibri" w:eastAsia="MS Mincho" w:hAnsi="Calibri" w:cs="Calibri"/>
+          <w:sz w:val="22"/>
+          <w:szCs w:val="22"/>
+        </w:rPr>
+        <w:t> </w:t>
+      </w:r>
+    </w:p>
+    <w:p>
+      <w:pPr>
+        <w:pStyle w:val="paragraph"/>
+        <w:spacing w:before="0" w:beforeAutospacing="0" w:after="0" w:afterAutospacing="0"/>
+        <w:textAlignment w:val="baseline"/>
+        <w:rPr>
+          <w:rStyle w:val="eop"/>
+          <w:rFonts w:ascii="Calibri" w:eastAsia="MS Mincho" w:hAnsi="Calibri" w:cs="Calibri"/>
+          <w:sz w:val="22"/>
+          <w:szCs w:val="22"/>
+        </w:rPr>
+      </w:pPr>
+    </w:p>
+    <w:p>
+      <w:pPr>
+        <w:rPr>
+          <w:rStyle w:val="normaltextrun"/>
+          <w:b/>
+        </w:rPr>
+      </w:pPr>
+      <w:r>
+        <w:t>HUJC-006</w:t>
+      </w:r>
+    </w:p>
+    <w:p>
+      <w:pPr>
+        <w:pStyle w:val="paragraph"/>
+        <w:spacing w:before="0" w:beforeAutospacing="0" w:after="0" w:afterAutospacing="0"/>
+        <w:textAlignment w:val="baseline"/>
+        <w:rPr>
+          <w:rFonts w:ascii="Segoe UI" w:hAnsi="Segoe UI" w:cs="Segoe UI"/>
+          <w:sz w:val="18"/>
+          <w:szCs w:val="18"/>
+        </w:rPr>
+      </w:pPr>
+      <w:r>
+        <w:rPr>
+          <w:rStyle w:val="normaltextrun"/>
+          <w:rFonts w:ascii="Calibri" w:hAnsi="Calibri" w:cs="Calibri"/>
+          <w:sz w:val="22"/>
+          <w:szCs w:val="22"/>
+        </w:rPr>
+        <w:t>Como: usuario del sistema (empleado),</w:t>
+      </w:r>
+      <w:r>
+        <w:rPr>
+          <w:rStyle w:val="eop"/>
+          <w:rFonts w:ascii="Calibri" w:eastAsia="MS Mincho" w:hAnsi="Calibri" w:cs="Calibri"/>
+          <w:sz w:val="22"/>
+          <w:szCs w:val="22"/>
+        </w:rPr>
+        <w:t> </w:t>
+      </w:r>
+    </w:p>
+    <w:p>
+      <w:pPr>
+        <w:pStyle w:val="paragraph"/>
+        <w:spacing w:before="0" w:beforeAutospacing="0" w:after="0" w:afterAutospacing="0"/>
+        <w:textAlignment w:val="baseline"/>
+        <w:rPr>
+          <w:rStyle w:val="normaltextrun"/>
+          <w:rFonts w:ascii="Calibri" w:hAnsi="Calibri" w:cs="Calibri"/>
+          <w:sz w:val="22"/>
+          <w:szCs w:val="22"/>
+        </w:rPr>
+      </w:pPr>
+    </w:p>
+    <w:p>
+      <w:pPr>
+        <w:pStyle w:val="paragraph"/>
+        <w:spacing w:before="0" w:beforeAutospacing="0" w:after="0" w:afterAutospacing="0"/>
+        <w:textAlignment w:val="baseline"/>
+        <w:rPr>
+          <w:rFonts w:ascii="Segoe UI" w:hAnsi="Segoe UI" w:cs="Segoe UI"/>
+          <w:sz w:val="18"/>
+          <w:szCs w:val="18"/>
+        </w:rPr>
+      </w:pPr>
+      <w:r>
+        <w:rPr>
+          <w:rStyle w:val="normaltextrun"/>
+          <w:rFonts w:ascii="Calibri" w:hAnsi="Calibri" w:cs="Calibri"/>
+          <w:sz w:val="22"/>
+          <w:szCs w:val="22"/>
+        </w:rPr>
+        <w:t>Quiero: consultar el tipo de servicio y su horario disponible,</w:t>
+      </w:r>
+      <w:r>
+        <w:rPr>
+          <w:rStyle w:val="eop"/>
+          <w:rFonts w:ascii="Calibri" w:eastAsia="MS Mincho" w:hAnsi="Calibri" w:cs="Calibri"/>
+          <w:sz w:val="22"/>
+          <w:szCs w:val="22"/>
+        </w:rPr>
+        <w:t> </w:t>
+      </w:r>
+    </w:p>
+    <w:p>
+      <w:pPr>
+        <w:pStyle w:val="paragraph"/>
+        <w:spacing w:before="0" w:beforeAutospacing="0" w:after="0" w:afterAutospacing="0"/>
+        <w:textAlignment w:val="baseline"/>
+        <w:rPr>
+          <w:rStyle w:val="normaltextrun"/>
+          <w:rFonts w:ascii="Calibri" w:hAnsi="Calibri" w:cs="Calibri"/>
+          <w:sz w:val="22"/>
+          <w:szCs w:val="22"/>
+        </w:rPr>
+      </w:pPr>
+    </w:p>
+    <w:p>
+      <w:pPr>
+        <w:pStyle w:val="paragraph"/>
+        <w:spacing w:before="0" w:beforeAutospacing="0" w:after="0" w:afterAutospacing="0"/>
+        <w:textAlignment w:val="baseline"/>
+        <w:rPr>
+          <w:rStyle w:val="eop"/>
+          <w:rFonts w:ascii="Calibri" w:eastAsia="MS Mincho" w:hAnsi="Calibri" w:cs="Calibri"/>
+          <w:sz w:val="22"/>
+          <w:szCs w:val="22"/>
+        </w:rPr>
+      </w:pPr>
+      <w:r>
+        <w:rPr>
+          <w:rStyle w:val="normaltextrun"/>
+          <w:rFonts w:ascii="Calibri" w:hAnsi="Calibri" w:cs="Calibri"/>
+          <w:sz w:val="22"/>
+          <w:szCs w:val="22"/>
+        </w:rPr>
+        <w:t>Para: poder informar correctamente a los clientes sobre la disponibilidad y características de cada servicio.</w:t>
+      </w:r>
+      <w:r>
+        <w:rPr>
+          <w:rStyle w:val="eop"/>
+          <w:rFonts w:ascii="Calibri" w:eastAsia="MS Mincho" w:hAnsi="Calibri" w:cs="Calibri"/>
+          <w:sz w:val="22"/>
+          <w:szCs w:val="22"/>
+        </w:rPr>
+        <w:t> </w:t>
+      </w:r>
+    </w:p>
+    <w:p>
+      <w:pPr>
+        <w:pStyle w:val="paragraph"/>
+        <w:spacing w:before="0" w:beforeAutospacing="0" w:after="0" w:afterAutospacing="0"/>
+        <w:textAlignment w:val="baseline"/>
+        <w:rPr>
+          <w:rStyle w:val="eop"/>
+          <w:rFonts w:ascii="Calibri" w:eastAsia="MS Mincho" w:hAnsi="Calibri" w:cs="Calibri"/>
+          <w:sz w:val="22"/>
+          <w:szCs w:val="22"/>
+        </w:rPr>
+      </w:pPr>
+    </w:p>
+    <w:p>
+      <w:pPr>
+        <w:pStyle w:val="paragraph"/>
+        <w:spacing w:before="0" w:beforeAutospacing="0" w:after="0" w:afterAutospacing="0"/>
+        <w:textAlignment w:val="baseline"/>
+        <w:rPr>
+          <w:rFonts w:ascii="Segoe UI" w:hAnsi="Segoe UI" w:cs="Segoe UI"/>
+          <w:b/>
+          <w:sz w:val="18"/>
+          <w:szCs w:val="18"/>
+          <w:lang w:val="es-MX"/>
+        </w:rPr>
+      </w:pPr>
+      <w:r>
+        <w:rPr>
+          <w:rFonts w:ascii="Segoe UI" w:hAnsi="Segoe UI" w:cs="Segoe UI"/>
+          <w:b/>
+          <w:sz w:val="18"/>
+          <w:szCs w:val="18"/>
+        </w:rPr>
+        <w:t>Tupla: Rese</w:t>
+      </w:r>
+      <w:r>
+        <w:rPr>
+          <w:rFonts w:ascii="Segoe UI" w:hAnsi="Segoe UI" w:cs="Segoe UI"/>
+          <w:b/>
+          <w:sz w:val="18"/>
+          <w:szCs w:val="18"/>
+          <w:lang w:val="es-MX"/>
+        </w:rPr>
+        <w:t>ñas</w:t>
+      </w:r>
+    </w:p>
+    <w:p>
+      <w:pPr>
+        <w:pStyle w:val="paragraph"/>
+        <w:spacing w:before="0" w:beforeAutospacing="0" w:after="0" w:afterAutospacing="0"/>
+        <w:textAlignment w:val="baseline"/>
+        <w:rPr>
+          <w:rFonts w:ascii="Segoe UI" w:hAnsi="Segoe UI" w:cs="Segoe UI"/>
+          <w:b/>
+          <w:sz w:val="18"/>
+          <w:szCs w:val="18"/>
+          <w:lang w:val="es-MX"/>
+        </w:rPr>
+      </w:pPr>
+    </w:p>
+    <w:p>
+      <w:pPr>
+        <w:pStyle w:val="paragraph"/>
+        <w:spacing w:after="0"/>
+        <w:textAlignment w:val="baseline"/>
+        <w:rPr>
+          <w:rFonts w:ascii="Segoe UI" w:hAnsi="Segoe UI" w:cs="Segoe UI"/>
+          <w:sz w:val="22"/>
+          <w:szCs w:val="22"/>
+        </w:rPr>
+      </w:pPr>
+      <w:r>
+        <w:rPr>
+          <w:rFonts w:ascii="Segoe UI" w:hAnsi="Segoe UI" w:cs="Segoe UI"/>
+          <w:sz w:val="22"/>
+          <w:szCs w:val="22"/>
+        </w:rPr>
+        <w:t>HUJC-007: Registo de nueva reseña</w:t>
+      </w:r>
+    </w:p>
+    <w:p>
+      <w:pPr>
+        <w:pStyle w:val="paragraph"/>
+        <w:spacing w:after="0"/>
+        <w:textAlignment w:val="baseline"/>
+        <w:rPr>
+          <w:rFonts w:ascii="Segoe UI" w:hAnsi="Segoe UI" w:cs="Segoe UI"/>
+          <w:sz w:val="22"/>
+          <w:szCs w:val="22"/>
+        </w:rPr>
+      </w:pPr>
+      <w:r>
+        <w:rPr>
+          <w:rFonts w:ascii="Segoe UI" w:hAnsi="Segoe UI" w:cs="Segoe UI"/>
+          <w:sz w:val="22"/>
+          <w:szCs w:val="22"/>
+        </w:rPr>
+        <w:t>Como: Huesped</w:t>
+      </w:r>
+    </w:p>
+    <w:p>
+      <w:pPr>
+        <w:pStyle w:val="paragraph"/>
+        <w:spacing w:after="0"/>
+        <w:textAlignment w:val="baseline"/>
+        <w:rPr>
+          <w:rFonts w:ascii="Segoe UI" w:hAnsi="Segoe UI" w:cs="Segoe UI"/>
+          <w:sz w:val="22"/>
+          <w:szCs w:val="22"/>
+        </w:rPr>
+      </w:pPr>
+      <w:r>
+        <w:rPr>
+          <w:rFonts w:ascii="Segoe UI" w:hAnsi="Segoe UI" w:cs="Segoe UI"/>
+          <w:sz w:val="22"/>
+          <w:szCs w:val="22"/>
+        </w:rPr>
+        <w:t>Quiero: Registar una reseña sobre los servicios del cuarto de baño</w:t>
+      </w:r>
+    </w:p>
+    <w:p>
+      <w:pPr>
+        <w:pStyle w:val="paragraph"/>
+        <w:spacing w:before="0" w:beforeAutospacing="0" w:after="0" w:afterAutospacing="0"/>
+        <w:textAlignment w:val="baseline"/>
+        <w:rPr>
+          <w:rFonts w:ascii="Segoe UI" w:hAnsi="Segoe UI" w:cs="Segoe UI"/>
+          <w:sz w:val="22"/>
+          <w:szCs w:val="22"/>
+        </w:rPr>
+      </w:pPr>
+      <w:r>
+        <w:rPr>
+          <w:rFonts w:ascii="Segoe UI" w:hAnsi="Segoe UI" w:cs="Segoe UI"/>
+          <w:sz w:val="22"/>
+          <w:szCs w:val="22"/>
+        </w:rPr>
+        <w:t>Para: Que lleven un registro de las mejoras que necesita o faltan en el baño</w:t>
+      </w:r>
+    </w:p>
+    <w:p>
+      <w:pPr>
+        <w:pStyle w:val="paragraph"/>
+        <w:spacing w:before="0" w:beforeAutospacing="0" w:after="0" w:afterAutospacing="0"/>
+        <w:textAlignment w:val="baseline"/>
+        <w:rPr>
+          <w:rFonts w:ascii="Segoe UI" w:hAnsi="Segoe UI" w:cs="Segoe UI"/>
+          <w:sz w:val="22"/>
+          <w:szCs w:val="22"/>
+        </w:rPr>
+      </w:pPr>
+    </w:p>
+    <w:p>
+      <w:pPr>
+        <w:pStyle w:val="paragraph"/>
+        <w:spacing w:after="0"/>
+        <w:textAlignment w:val="baseline"/>
+        <w:rPr>
+          <w:rFonts w:ascii="Segoe UI" w:hAnsi="Segoe UI" w:cs="Segoe UI"/>
+          <w:b/>
+          <w:sz w:val="22"/>
+          <w:szCs w:val="22"/>
+        </w:rPr>
+      </w:pPr>
+      <w:r>
+        <w:rPr>
+          <w:rFonts w:ascii="Segoe UI" w:hAnsi="Segoe UI" w:cs="Segoe UI"/>
+          <w:b/>
+          <w:sz w:val="22"/>
+          <w:szCs w:val="22"/>
+        </w:rPr>
+        <w:t>HUJC-008</w:t>
+      </w:r>
+    </w:p>
+    <w:p>
+      <w:pPr>
+        <w:pStyle w:val="paragraph"/>
+        <w:spacing w:after="0"/>
+        <w:textAlignment w:val="baseline"/>
+        <w:rPr>
+          <w:rFonts w:ascii="Segoe UI" w:hAnsi="Segoe UI" w:cs="Segoe UI"/>
+          <w:sz w:val="22"/>
+          <w:szCs w:val="22"/>
+        </w:rPr>
+      </w:pPr>
+      <w:r>
+        <w:rPr>
+          <w:rFonts w:ascii="Segoe UI" w:hAnsi="Segoe UI" w:cs="Segoe UI"/>
+          <w:sz w:val="22"/>
+          <w:szCs w:val="22"/>
+        </w:rPr>
+        <w:t>Como: Empresario</w:t>
+      </w:r>
+    </w:p>
+    <w:p>
+      <w:pPr>
+        <w:pStyle w:val="paragraph"/>
+        <w:spacing w:after="0"/>
+        <w:textAlignment w:val="baseline"/>
+        <w:rPr>
+          <w:rFonts w:ascii="Segoe UI" w:hAnsi="Segoe UI" w:cs="Segoe UI"/>
+          <w:sz w:val="22"/>
+          <w:szCs w:val="22"/>
+        </w:rPr>
+      </w:pPr>
+      <w:r>
+        <w:rPr>
+          <w:rFonts w:ascii="Segoe UI" w:hAnsi="Segoe UI" w:cs="Segoe UI"/>
+          <w:sz w:val="22"/>
+          <w:szCs w:val="22"/>
+        </w:rPr>
+        <w:t>Quiero: Registrar una reseña sobre la propiedad que me fue otorgada en Peace At Home</w:t>
+      </w:r>
+    </w:p>
+    <w:p>
+      <w:pPr>
+        <w:pStyle w:val="paragraph"/>
+        <w:spacing w:before="0" w:beforeAutospacing="0" w:after="0" w:afterAutospacing="0"/>
+        <w:textAlignment w:val="baseline"/>
+        <w:rPr>
+          <w:rFonts w:ascii="Segoe UI" w:hAnsi="Segoe UI" w:cs="Segoe UI"/>
+          <w:sz w:val="22"/>
+          <w:szCs w:val="22"/>
+        </w:rPr>
+      </w:pPr>
+      <w:r>
+        <w:rPr>
+          <w:rFonts w:ascii="Segoe UI" w:hAnsi="Segoe UI" w:cs="Segoe UI"/>
+          <w:sz w:val="22"/>
+          <w:szCs w:val="22"/>
+        </w:rPr>
+        <w:t>Para: Que los nuevos huéspedes sepan de las comodidades y ventajas de esta propiedad en especifico</w:t>
+      </w:r>
+    </w:p>
+    <w:p>
+      <w:pPr>
+        <w:pStyle w:val="paragraph"/>
+        <w:spacing w:before="0" w:beforeAutospacing="0" w:after="0" w:afterAutospacing="0"/>
+        <w:textAlignment w:val="baseline"/>
+        <w:rPr>
+          <w:rFonts w:ascii="Segoe UI" w:hAnsi="Segoe UI" w:cs="Segoe UI"/>
+          <w:sz w:val="22"/>
+          <w:szCs w:val="22"/>
+        </w:rPr>
+      </w:pPr>
+    </w:p>
+    <w:p>
+      <w:pPr>
+        <w:pStyle w:val="paragraph"/>
+        <w:spacing w:after="0"/>
+        <w:textAlignment w:val="baseline"/>
+        <w:rPr>
+          <w:rFonts w:ascii="Segoe UI" w:hAnsi="Segoe UI" w:cs="Segoe UI"/>
+          <w:b/>
+          <w:sz w:val="22"/>
+          <w:szCs w:val="22"/>
+        </w:rPr>
+      </w:pPr>
+      <w:r>
+        <w:rPr>
+          <w:rFonts w:ascii="Segoe UI" w:hAnsi="Segoe UI" w:cs="Segoe UI"/>
+          <w:b/>
+          <w:sz w:val="22"/>
+          <w:szCs w:val="22"/>
+        </w:rPr>
+        <w:t>HUJC-009</w:t>
+      </w:r>
+    </w:p>
+    <w:p>
+      <w:pPr>
+        <w:pStyle w:val="paragraph"/>
+        <w:spacing w:after="0"/>
+        <w:textAlignment w:val="baseline"/>
+        <w:rPr>
+          <w:rFonts w:ascii="Segoe UI" w:hAnsi="Segoe UI" w:cs="Segoe UI"/>
+          <w:sz w:val="22"/>
+          <w:szCs w:val="22"/>
+        </w:rPr>
+      </w:pPr>
+      <w:r>
+        <w:rPr>
+          <w:rFonts w:ascii="Segoe UI" w:hAnsi="Segoe UI" w:cs="Segoe UI"/>
+          <w:sz w:val="22"/>
+          <w:szCs w:val="22"/>
+        </w:rPr>
+        <w:t>Como: Arrendador</w:t>
+      </w:r>
+    </w:p>
+    <w:p>
+      <w:pPr>
+        <w:pStyle w:val="paragraph"/>
+        <w:spacing w:after="0"/>
+        <w:textAlignment w:val="baseline"/>
+        <w:rPr>
+          <w:rFonts w:ascii="Segoe UI" w:hAnsi="Segoe UI" w:cs="Segoe UI"/>
+          <w:sz w:val="22"/>
+          <w:szCs w:val="22"/>
+        </w:rPr>
+      </w:pPr>
+      <w:r>
+        <w:rPr>
+          <w:rFonts w:ascii="Segoe UI" w:hAnsi="Segoe UI" w:cs="Segoe UI"/>
+          <w:sz w:val="22"/>
+          <w:szCs w:val="22"/>
+        </w:rPr>
+        <w:t>Quiero: Registrar una reseña sobre los huéspedes que ocupan mi propiedad de Peace At Home</w:t>
+      </w:r>
+    </w:p>
+    <w:p>
+      <w:pPr>
+        <w:pStyle w:val="paragraph"/>
+        <w:spacing w:before="0" w:beforeAutospacing="0" w:after="0" w:afterAutospacing="0"/>
+        <w:textAlignment w:val="baseline"/>
+        <w:rPr>
+          <w:rFonts w:ascii="Segoe UI" w:hAnsi="Segoe UI" w:cs="Segoe UI"/>
+          <w:sz w:val="22"/>
+          <w:szCs w:val="22"/>
+        </w:rPr>
+      </w:pPr>
+      <w:r>
+        <w:rPr>
+          <w:rFonts w:ascii="Segoe UI" w:hAnsi="Segoe UI" w:cs="Segoe UI"/>
+          <w:sz w:val="22"/>
+          <w:szCs w:val="22"/>
+        </w:rPr>
+        <w:t>Para: Llevar un registro de cosas que pueden mejorarse en la propiedad para otorgarles una mejor comodidad</w:t>
+      </w:r>
+    </w:p>
+    <w:p>
+      <w:pPr>
+        <w:pStyle w:val="paragraph"/>
+        <w:spacing w:before="0" w:beforeAutospacing="0" w:after="0" w:afterAutospacing="0"/>
+        <w:textAlignment w:val="baseline"/>
+        <w:rPr>
+          <w:rFonts w:ascii="Segoe UI" w:hAnsi="Segoe UI" w:cs="Segoe UI"/>
+          <w:sz w:val="22"/>
+          <w:szCs w:val="22"/>
+        </w:rPr>
+      </w:pPr>
+    </w:p>
+    <w:p>
+      <w:pPr>
+        <w:pStyle w:val="paragraph"/>
+        <w:spacing w:before="0" w:beforeAutospacing="0" w:after="0" w:afterAutospacing="0"/>
+        <w:textAlignment w:val="baseline"/>
+        <w:rPr>
+          <w:rFonts w:ascii="Segoe UI" w:hAnsi="Segoe UI" w:cs="Segoe UI"/>
+          <w:sz w:val="22"/>
+          <w:szCs w:val="22"/>
+        </w:rPr>
+      </w:pPr>
+    </w:p>
+    <w:p>
+      <w:pPr>
+        <w:pStyle w:val="paragraph"/>
+        <w:spacing w:before="0" w:beforeAutospacing="0" w:after="0" w:afterAutospacing="0"/>
+        <w:textAlignment w:val="baseline"/>
+        <w:rPr>
+          <w:rStyle w:val="eop"/>
+          <w:rFonts w:ascii="Calibri" w:eastAsia="MS Mincho" w:hAnsi="Calibri" w:cs="Calibri"/>
+          <w:sz w:val="22"/>
+          <w:szCs w:val="22"/>
+        </w:rPr>
+      </w:pPr>
+    </w:p>
+    <w:p>
+      <w:pPr>
+        <w:pStyle w:val="paragraph"/>
+        <w:spacing w:before="0" w:beforeAutospacing="0" w:after="0" w:afterAutospacing="0"/>
+        <w:textAlignment w:val="baseline"/>
+        <w:rPr>
+          <w:rStyle w:val="eop"/>
+          <w:rFonts w:ascii="Calibri" w:eastAsia="MS Mincho" w:hAnsi="Calibri" w:cs="Calibri"/>
+          <w:sz w:val="22"/>
+          <w:szCs w:val="22"/>
+        </w:rPr>
+      </w:pPr>
+    </w:p>
+    <w:p>
+      <w:pPr>
+        <w:pStyle w:val="paragraph"/>
+        <w:spacing w:before="0" w:beforeAutospacing="0" w:after="0" w:afterAutospacing="0"/>
+        <w:textAlignment w:val="baseline"/>
+        <w:rPr>
+          <w:rStyle w:val="eop"/>
+          <w:rFonts w:ascii="Calibri" w:eastAsia="MS Mincho" w:hAnsi="Calibri" w:cs="Calibri"/>
+          <w:sz w:val="22"/>
+          <w:szCs w:val="22"/>
+        </w:rPr>
+      </w:pPr>
+    </w:p>
+    <w:p>
+      <w:pPr>
+        <w:spacing w:before="100" w:beforeAutospacing="1" w:after="100" w:afterAutospacing="1" w:line="240" w:lineRule="auto"/>
+        <w:rPr>
+          <w:rFonts w:ascii="Arial" w:eastAsia="Times New Roman" w:hAnsi="Arial" w:cs="Arial"/>
+          <w:szCs w:val="24"/>
+          <w:lang w:eastAsia="es-GT"/>
+        </w:rPr>
+      </w:pPr>
+    </w:p>
+    <w:p>
+      <w:pPr>
+        <w:spacing w:before="100" w:beforeAutospacing="1" w:after="100" w:afterAutospacing="1" w:line="240" w:lineRule="auto"/>
+        <w:rPr>
+          <w:rFonts w:ascii="Arial" w:eastAsia="Times New Roman" w:hAnsi="Arial" w:cs="Arial"/>
+          <w:sz w:val="24"/>
+          <w:szCs w:val="24"/>
+          <w:lang w:eastAsia="es-GT"/>
+        </w:rPr>
+      </w:pPr>
+    </w:p>
+    <w:p>
+      <w:pPr>
+        <w:rPr>
+          <w:b/>
+        </w:rPr>
+      </w:pPr>
+      <w:r>
+        <w:rPr>
+          <w:b/>
+        </w:rPr>
+        <w:t>Tupla: Pago</w:t>
+      </w:r>
+    </w:p>
+    <w:p>
+      <w:r>
+        <w:t>HURH-0010 Registro de pago:</w:t>
+      </w:r>
+    </w:p>
+    <w:p>
+      <w:r>
+        <w:t>1. Como un registro de pagos</w:t>
+      </w:r>
+    </w:p>
+    <w:p>
+      <w:r>
+        <w:t>2. Quiero que registre los datos del monto</w:t>
+      </w:r>
+    </w:p>
+    <w:p>
+      <w:r>
+        <w:t>3. Para poder confirmar que los datos del monto estén registrados</w:t>
+      </w:r>
+    </w:p>
+    <w:p/>
+    <w:p>
+      <w:r>
+        <w:t>HURH-0011 Validación de monto máximo</w:t>
+      </w:r>
+    </w:p>
+    <w:p>
+      <w:r>
+        <w:t xml:space="preserve">1. Como método de pago </w:t>
+      </w:r>
+    </w:p>
+    <w:p>
+      <w:r>
+        <w:t>2. Quiero que el monto sea en efectivo o en tarjeta</w:t>
+      </w:r>
+    </w:p>
+    <w:p>
+      <w:r>
+        <w:t>3. Para verificar si el monto de pago es valido</w:t>
+      </w:r>
+    </w:p>
+    <w:p/>
+    <w:p>
+      <w:r>
+        <w:t>HURH-0012 Generación de recibo de pago</w:t>
+      </w:r>
+    </w:p>
+    <w:p>
+      <w:r>
+        <w:t xml:space="preserve">1. Como registro de pago recibido </w:t>
+      </w:r>
+    </w:p>
+    <w:p>
+      <w:r>
+        <w:t>2. Quiero que me den la información del monto de pago</w:t>
+      </w:r>
+    </w:p>
+    <w:p>
+      <w:pPr>
+        <w:spacing w:before="100" w:beforeAutospacing="1" w:after="100" w:afterAutospacing="1" w:line="240" w:lineRule="auto"/>
+        <w:rPr>
+          <w:rFonts w:ascii="Arial" w:eastAsia="Times New Roman" w:hAnsi="Arial" w:cs="Arial"/>
+          <w:sz w:val="24"/>
+          <w:szCs w:val="24"/>
+          <w:lang w:eastAsia="es-GT"/>
+        </w:rPr>
+      </w:pPr>
+      <w:r>
+        <w:t>3. Para que registre el recibo y se almacene en el sistema</w:t>
+      </w:r>
+    </w:p>
+    <w:p>
+      <w:pPr>
+        <w:spacing w:before="100" w:beforeAutospacing="1" w:after="100" w:afterAutospacing="1" w:line="240" w:lineRule="auto"/>
+        <w:rPr>
+          <w:rFonts w:ascii="Arial" w:eastAsia="Times New Roman" w:hAnsi="Arial" w:cs="Arial"/>
+          <w:sz w:val="24"/>
+          <w:szCs w:val="24"/>
+          <w:lang w:eastAsia="es-GT"/>
+        </w:rPr>
+      </w:pPr>
+    </w:p>
+    <w:p>
+      <w:pPr>
+        <w:spacing w:before="100" w:beforeAutospacing="1" w:after="100" w:afterAutospacing="1" w:line="240" w:lineRule="auto"/>
+        <w:rPr>
+          <w:rFonts w:ascii="Arial" w:eastAsia="Times New Roman" w:hAnsi="Arial" w:cs="Arial"/>
+          <w:sz w:val="24"/>
+          <w:szCs w:val="24"/>
+          <w:lang w:eastAsia="es-GT"/>
+        </w:rPr>
+      </w:pPr>
+      <w:r>
+        <w:rPr>
+          <w:rFonts w:ascii="Arial" w:eastAsia="Times New Roman" w:hAnsi="Arial" w:cs="Arial"/>
+          <w:sz w:val="24"/>
+          <w:szCs w:val="24"/>
+          <w:lang w:eastAsia="es-GT"/>
+        </w:rPr>
+        <w:t xml:space="preserve">Tupla: Reembolso </w:t>
+      </w:r>
+    </w:p>
+    <w:p>
+      <w:pPr>
+        <w:spacing w:before="100" w:beforeAutospacing="1" w:after="100" w:afterAutospacing="1" w:line="240" w:lineRule="auto"/>
+        <w:rPr>
+          <w:rFonts w:ascii="Arial" w:eastAsia="Times New Roman" w:hAnsi="Arial" w:cs="Arial"/>
+          <w:sz w:val="24"/>
+          <w:szCs w:val="24"/>
+          <w:u w:val="single"/>
+          <w:lang w:eastAsia="es-GT"/>
+        </w:rPr>
+      </w:pPr>
+      <w:r>
+        <w:rPr>
+          <w:rFonts w:ascii="Arial" w:eastAsia="Times New Roman" w:hAnsi="Arial" w:cs="Arial"/>
+          <w:sz w:val="24"/>
+          <w:szCs w:val="24"/>
+          <w:lang w:eastAsia="es-GT"/>
+        </w:rPr>
+        <w:t>HUOV-0</w:t>
+      </w:r>
+      <w:r>
+        <w:rPr>
+          <w:rFonts w:ascii="Arial" w:eastAsia="Times New Roman" w:hAnsi="Arial" w:cs="Arial"/>
+          <w:sz w:val="24"/>
+          <w:szCs w:val="24"/>
+          <w:lang w:eastAsia="es-GT"/>
+        </w:rPr>
+        <w:t>13</w:t>
+      </w:r>
+    </w:p>
+    <w:p>
+      <w:pPr>
+        <w:spacing w:before="100" w:beforeAutospacing="1" w:after="100" w:afterAutospacing="1" w:line="240" w:lineRule="auto"/>
+        <w:rPr>
+          <w:rFonts w:ascii="Arial" w:eastAsia="Times New Roman" w:hAnsi="Arial" w:cs="Arial"/>
+          <w:sz w:val="24"/>
+          <w:szCs w:val="24"/>
+          <w:lang w:eastAsia="es-GT"/>
+        </w:rPr>
+      </w:pPr>
+      <w:r>
+        <w:rPr>
+          <w:rFonts w:ascii="Arial" w:eastAsia="Times New Roman" w:hAnsi="Arial" w:cs="Arial"/>
+          <w:sz w:val="24"/>
+          <w:szCs w:val="24"/>
+          <w:lang w:eastAsia="es-GT"/>
+        </w:rPr>
+        <w:t>Como: empleado</w:t>
+      </w:r>
+    </w:p>
+    <w:p>
+      <w:pPr>
+        <w:spacing w:before="100" w:beforeAutospacing="1" w:after="100" w:afterAutospacing="1" w:line="240" w:lineRule="auto"/>
+        <w:rPr>
+          <w:rFonts w:ascii="Arial" w:eastAsia="Times New Roman" w:hAnsi="Arial" w:cs="Arial"/>
+          <w:sz w:val="24"/>
+          <w:szCs w:val="24"/>
+          <w:lang w:eastAsia="es-GT"/>
+        </w:rPr>
+      </w:pPr>
+      <w:r>
+        <w:rPr>
+          <w:rFonts w:ascii="Arial" w:eastAsia="Times New Roman" w:hAnsi="Arial" w:cs="Arial"/>
+          <w:sz w:val="24"/>
+          <w:szCs w:val="24"/>
+          <w:lang w:eastAsia="es-GT"/>
+        </w:rPr>
+        <w:t xml:space="preserve">Quiero: Poder enviar una solicitud de reembolso cargando recibos y completando un formulario, </w:t>
+      </w:r>
+    </w:p>
+    <w:p>
+      <w:pPr>
+        <w:spacing w:before="100" w:beforeAutospacing="1" w:after="100" w:afterAutospacing="1" w:line="240" w:lineRule="auto"/>
+        <w:rPr>
+          <w:rFonts w:ascii="Arial" w:eastAsia="Times New Roman" w:hAnsi="Arial" w:cs="Arial"/>
+          <w:sz w:val="24"/>
+          <w:szCs w:val="24"/>
+          <w:lang w:eastAsia="es-GT"/>
+        </w:rPr>
+      </w:pPr>
+      <w:r>
+        <w:rPr>
+          <w:rFonts w:ascii="Arial" w:eastAsia="Times New Roman" w:hAnsi="Arial" w:cs="Arial"/>
+          <w:sz w:val="24"/>
+          <w:szCs w:val="24"/>
+          <w:lang w:eastAsia="es-GT"/>
+        </w:rPr>
+        <w:t>para que la administración pueda revisar y aprobar el reembolso de los gastos.</w:t>
+      </w:r>
+    </w:p>
+    <w:p>
+      <w:pPr>
+        <w:spacing w:before="100" w:beforeAutospacing="1" w:after="100" w:afterAutospacing="1" w:line="240" w:lineRule="auto"/>
+        <w:rPr>
+          <w:rFonts w:ascii="Arial" w:eastAsia="Times New Roman" w:hAnsi="Arial" w:cs="Arial"/>
+          <w:sz w:val="24"/>
+          <w:szCs w:val="24"/>
+          <w:lang w:eastAsia="es-GT"/>
+        </w:rPr>
+      </w:pPr>
+      <w:r>
+        <w:rPr>
+          <w:rFonts w:ascii="Arial" w:eastAsia="Times New Roman" w:hAnsi="Arial" w:cs="Arial"/>
+          <w:sz w:val="24"/>
+          <w:szCs w:val="24"/>
+          <w:lang w:eastAsia="es-GT"/>
+        </w:rPr>
+        <w:t>Para: Para ofrecer un rembolso cada que lo necesite un cliente.</w:t>
+      </w:r>
+      <w:r>
+        <w:rPr>
+          <w:rFonts w:ascii="Arial" w:eastAsia="Times New Roman" w:hAnsi="Arial" w:cs="Arial"/>
+          <w:sz w:val="24"/>
+          <w:szCs w:val="24"/>
+          <w:lang w:eastAsia="es-GT"/>
+        </w:rPr>
+        <w:t xml:space="preserve"> </w:t>
+      </w:r>
+    </w:p>
+    <w:p>
+      <w:pPr>
+        <w:spacing w:before="100" w:beforeAutospacing="1" w:after="100" w:afterAutospacing="1" w:line="240" w:lineRule="auto"/>
+        <w:rPr>
+          <w:rFonts w:ascii="Arial" w:eastAsia="Times New Roman" w:hAnsi="Arial" w:cs="Arial"/>
+          <w:sz w:val="24"/>
+          <w:szCs w:val="24"/>
+          <w:lang w:eastAsia="es-GT"/>
+        </w:rPr>
+      </w:pPr>
+    </w:p>
+    <w:p>
+      <w:pPr>
+        <w:spacing w:before="100" w:beforeAutospacing="1" w:after="100" w:afterAutospacing="1" w:line="240" w:lineRule="auto"/>
+        <w:rPr>
+          <w:rFonts w:ascii="Arial" w:eastAsia="Times New Roman" w:hAnsi="Arial" w:cs="Arial"/>
+          <w:sz w:val="24"/>
+          <w:szCs w:val="24"/>
+          <w:lang w:eastAsia="es-GT"/>
+        </w:rPr>
+      </w:pPr>
+    </w:p>
+    <w:p>
+      <w:pPr>
+        <w:spacing w:before="100" w:beforeAutospacing="1" w:after="100" w:afterAutospacing="1" w:line="240" w:lineRule="auto"/>
+        <w:rPr>
+          <w:rFonts w:ascii="Arial" w:eastAsia="Times New Roman" w:hAnsi="Arial" w:cs="Arial"/>
+          <w:sz w:val="24"/>
+          <w:szCs w:val="24"/>
+          <w:lang w:eastAsia="es-GT"/>
+        </w:rPr>
+      </w:pPr>
+    </w:p>
+    <w:p>
+      <w:pPr>
+        <w:spacing w:before="100" w:beforeAutospacing="1" w:after="100" w:afterAutospacing="1" w:line="240" w:lineRule="auto"/>
+        <w:rPr>
+          <w:rFonts w:ascii="Arial" w:eastAsia="Times New Roman" w:hAnsi="Arial" w:cs="Arial"/>
+          <w:sz w:val="24"/>
+          <w:szCs w:val="24"/>
+          <w:lang w:eastAsia="es-GT"/>
+        </w:rPr>
+      </w:pPr>
+    </w:p>
+    <w:p>
+      <w:pPr>
+        <w:spacing w:before="100" w:beforeAutospacing="1" w:after="100" w:afterAutospacing="1" w:line="240" w:lineRule="auto"/>
+        <w:rPr>
+          <w:rFonts w:ascii="Arial" w:eastAsia="Times New Roman" w:hAnsi="Arial" w:cs="Arial"/>
+          <w:sz w:val="24"/>
+          <w:szCs w:val="24"/>
+          <w:lang w:eastAsia="es-GT"/>
+        </w:rPr>
+      </w:pPr>
+    </w:p>
+    <w:p>
+      <w:pPr>
+        <w:spacing w:before="100" w:beforeAutospacing="1" w:after="100" w:afterAutospacing="1" w:line="240" w:lineRule="auto"/>
+        <w:rPr>
+          <w:rFonts w:ascii="Arial" w:eastAsia="Times New Roman" w:hAnsi="Arial" w:cs="Arial"/>
+          <w:sz w:val="24"/>
+          <w:szCs w:val="24"/>
+          <w:lang w:eastAsia="es-GT"/>
+        </w:rPr>
+      </w:pPr>
+    </w:p>
+    <w:p>
+      <w:pPr>
+        <w:spacing w:before="100" w:beforeAutospacing="1" w:after="100" w:afterAutospacing="1" w:line="240" w:lineRule="auto"/>
+        <w:rPr>
+          <w:rFonts w:ascii="Arial" w:eastAsia="Times New Roman" w:hAnsi="Arial" w:cs="Arial"/>
+          <w:sz w:val="24"/>
+          <w:szCs w:val="24"/>
+          <w:lang w:eastAsia="es-GT"/>
+        </w:rPr>
+      </w:pPr>
+    </w:p>
+    <w:p>
+      <w:pPr>
+        <w:spacing w:before="100" w:beforeAutospacing="1" w:after="100" w:afterAutospacing="1" w:line="240" w:lineRule="auto"/>
+        <w:rPr>
+          <w:rFonts w:ascii="Arial" w:eastAsia="Times New Roman" w:hAnsi="Arial" w:cs="Arial"/>
+          <w:sz w:val="24"/>
+          <w:szCs w:val="24"/>
+          <w:lang w:eastAsia="es-GT"/>
+        </w:rPr>
+      </w:pPr>
+    </w:p>
+    <w:p>
+      <w:pPr>
+        <w:spacing w:before="100" w:beforeAutospacing="1" w:after="100" w:afterAutospacing="1" w:line="240" w:lineRule="auto"/>
+        <w:rPr>
+          <w:rFonts w:ascii="Arial" w:eastAsia="Times New Roman" w:hAnsi="Arial" w:cs="Arial"/>
+          <w:sz w:val="24"/>
+          <w:szCs w:val="24"/>
+          <w:lang w:eastAsia="es-GT"/>
+        </w:rPr>
+      </w:pPr>
+    </w:p>
+    <w:p>
+      <w:pPr>
+        <w:spacing w:before="100" w:beforeAutospacing="1" w:after="100" w:afterAutospacing="1" w:line="240" w:lineRule="auto"/>
+        <w:rPr>
+          <w:rFonts w:ascii="Arial" w:eastAsia="Times New Roman" w:hAnsi="Arial" w:cs="Arial"/>
+          <w:sz w:val="24"/>
+          <w:szCs w:val="24"/>
+          <w:lang w:eastAsia="es-GT"/>
+        </w:rPr>
+      </w:pPr>
+    </w:p>
+    <w:p>
+      <w:pPr>
+        <w:spacing w:before="100" w:beforeAutospacing="1" w:after="100" w:afterAutospacing="1" w:line="240" w:lineRule="auto"/>
+        <w:rPr>
+          <w:rFonts w:ascii="Arial" w:eastAsia="Times New Roman" w:hAnsi="Arial" w:cs="Arial"/>
+          <w:sz w:val="24"/>
+          <w:szCs w:val="24"/>
+          <w:lang w:eastAsia="es-GT"/>
+        </w:rPr>
+      </w:pPr>
+    </w:p>
+    <w:p>
+      <w:pPr>
+        <w:spacing w:before="100" w:beforeAutospacing="1" w:after="100" w:afterAutospacing="1" w:line="240" w:lineRule="auto"/>
+        <w:rPr>
+          <w:rFonts w:ascii="Arial" w:eastAsia="Times New Roman" w:hAnsi="Arial" w:cs="Arial"/>
+          <w:sz w:val="24"/>
+          <w:szCs w:val="24"/>
+          <w:lang w:eastAsia="es-GT"/>
+        </w:rPr>
+      </w:pPr>
+    </w:p>
+    <w:p>
+      <w:pPr>
+        <w:spacing w:before="100" w:beforeAutospacing="1" w:after="100" w:afterAutospacing="1" w:line="240" w:lineRule="auto"/>
+        <w:rPr>
+          <w:rFonts w:ascii="Arial" w:eastAsia="Times New Roman" w:hAnsi="Arial" w:cs="Arial"/>
+          <w:sz w:val="24"/>
+          <w:szCs w:val="24"/>
+          <w:lang w:eastAsia="es-GT"/>
+        </w:rPr>
+      </w:pPr>
+    </w:p>
+    <w:p>
+      <w:pPr>
+        <w:spacing w:before="100" w:beforeAutospacing="1" w:after="100" w:afterAutospacing="1" w:line="240" w:lineRule="auto"/>
+        <w:rPr>
+          <w:rFonts w:ascii="Arial" w:eastAsia="Times New Roman" w:hAnsi="Arial" w:cs="Arial"/>
+          <w:sz w:val="24"/>
+          <w:szCs w:val="24"/>
+          <w:lang w:eastAsia="es-GT"/>
+        </w:rPr>
+      </w:pPr>
+    </w:p>
+    <w:p>
+      <w:pPr>
+        <w:spacing w:before="100" w:beforeAutospacing="1" w:after="100" w:afterAutospacing="1" w:line="240" w:lineRule="auto"/>
+        <w:rPr>
+          <w:rFonts w:ascii="Arial" w:eastAsia="Times New Roman" w:hAnsi="Arial" w:cs="Arial"/>
+          <w:sz w:val="24"/>
+          <w:szCs w:val="24"/>
+          <w:lang w:eastAsia="es-GT"/>
+        </w:rPr>
+      </w:pPr>
+    </w:p>
+    <w:p>
+      <w:pPr>
+        <w:spacing w:before="100" w:beforeAutospacing="1" w:after="100" w:afterAutospacing="1" w:line="240" w:lineRule="auto"/>
+        <w:rPr>
+          <w:rFonts w:ascii="Arial" w:eastAsia="Times New Roman" w:hAnsi="Arial" w:cs="Arial"/>
+          <w:sz w:val="24"/>
+          <w:szCs w:val="24"/>
+          <w:lang w:eastAsia="es-GT"/>
+        </w:rPr>
+      </w:pPr>
+    </w:p>
+    <w:p>
+      <w:pPr>
+        <w:spacing w:before="100" w:beforeAutospacing="1" w:after="100" w:afterAutospacing="1" w:line="240" w:lineRule="auto"/>
+        <w:rPr>
+          <w:rFonts w:ascii="Arial" w:eastAsia="Times New Roman" w:hAnsi="Arial" w:cs="Arial"/>
+          <w:sz w:val="24"/>
+          <w:szCs w:val="24"/>
+          <w:lang w:eastAsia="es-GT"/>
+        </w:rPr>
+      </w:pPr>
+    </w:p>
+    <w:p>
+      <w:pPr>
+        <w:spacing w:before="100" w:beforeAutospacing="1" w:after="100" w:afterAutospacing="1" w:line="240" w:lineRule="auto"/>
+        <w:rPr>
+          <w:rFonts w:ascii="Arial" w:eastAsia="Times New Roman" w:hAnsi="Arial" w:cs="Arial"/>
+          <w:sz w:val="24"/>
+          <w:szCs w:val="24"/>
+          <w:lang w:eastAsia="es-GT"/>
+        </w:rPr>
+      </w:pPr>
+    </w:p>
+    <w:p>
+      <w:pPr>
+        <w:spacing w:before="100" w:beforeAutospacing="1" w:after="100" w:afterAutospacing="1" w:line="240" w:lineRule="auto"/>
+        <w:rPr>
+          <w:rFonts w:ascii="Arial" w:eastAsia="Times New Roman" w:hAnsi="Arial" w:cs="Arial"/>
+          <w:sz w:val="24"/>
+          <w:szCs w:val="24"/>
+          <w:lang w:eastAsia="es-GT"/>
+        </w:rPr>
+      </w:pPr>
+    </w:p>
+    <w:p>
+      <w:pPr>
+        <w:spacing w:before="100" w:beforeAutospacing="1" w:after="100" w:afterAutospacing="1" w:line="240" w:lineRule="auto"/>
+        <w:rPr>
+          <w:rFonts w:ascii="Arial" w:eastAsia="Times New Roman" w:hAnsi="Arial" w:cs="Arial"/>
+          <w:sz w:val="24"/>
+          <w:szCs w:val="24"/>
+          <w:lang w:eastAsia="es-GT"/>
+        </w:rPr>
+      </w:pPr>
+    </w:p>
+    <w:p>
+      <w:pPr>
+        <w:spacing w:before="100" w:beforeAutospacing="1" w:after="100" w:afterAutospacing="1" w:line="240" w:lineRule="auto"/>
+        <w:rPr>
+          <w:rFonts w:ascii="Arial" w:eastAsia="Times New Roman" w:hAnsi="Arial" w:cs="Arial"/>
+          <w:sz w:val="24"/>
+          <w:szCs w:val="24"/>
+          <w:lang w:eastAsia="es-GT"/>
+        </w:rPr>
+      </w:pPr>
+    </w:p>
+    <w:p>
+      <w:pPr>
+        <w:spacing w:before="100" w:beforeAutospacing="1" w:after="100" w:afterAutospacing="1" w:line="240" w:lineRule="auto"/>
+        <w:rPr>
+          <w:rFonts w:ascii="Arial" w:eastAsia="Times New Roman" w:hAnsi="Arial" w:cs="Arial"/>
+          <w:sz w:val="24"/>
+          <w:szCs w:val="24"/>
+          <w:lang w:eastAsia="es-GT"/>
+        </w:rPr>
+      </w:pPr>
+    </w:p>
+    <w:p>
+      <w:pPr>
+        <w:spacing w:before="100" w:beforeAutospacing="1" w:after="100" w:afterAutospacing="1" w:line="240" w:lineRule="auto"/>
+        <w:rPr>
+          <w:rFonts w:ascii="Arial" w:eastAsia="Times New Roman" w:hAnsi="Arial" w:cs="Arial"/>
+          <w:sz w:val="24"/>
+          <w:szCs w:val="24"/>
+          <w:lang w:eastAsia="es-GT"/>
+        </w:rPr>
+      </w:pPr>
+    </w:p>
+    <w:p>
+      <w:pPr>
+        <w:spacing w:before="100" w:beforeAutospacing="1" w:after="100" w:afterAutospacing="1" w:line="240" w:lineRule="auto"/>
+        <w:rPr>
+          <w:rFonts w:ascii="Arial" w:eastAsia="Times New Roman" w:hAnsi="Arial" w:cs="Arial"/>
+          <w:sz w:val="24"/>
+          <w:szCs w:val="24"/>
+          <w:lang w:eastAsia="es-GT"/>
+        </w:rPr>
+      </w:pPr>
+    </w:p>
+    <w:p>
+      <w:pPr>
+        <w:spacing w:before="100" w:beforeAutospacing="1" w:after="100" w:afterAutospacing="1" w:line="240" w:lineRule="auto"/>
+        <w:rPr>
+          <w:rFonts w:ascii="Arial" w:eastAsia="Times New Roman" w:hAnsi="Arial" w:cs="Arial"/>
+          <w:sz w:val="24"/>
+          <w:szCs w:val="24"/>
+          <w:lang w:eastAsia="es-GT"/>
+        </w:rPr>
+      </w:pPr>
+    </w:p>
+    <w:p>
+      <w:pPr>
+        <w:spacing w:before="100" w:beforeAutospacing="1" w:after="100" w:afterAutospacing="1" w:line="240" w:lineRule="auto"/>
+        <w:rPr>
+          <w:rFonts w:ascii="Arial" w:eastAsia="Times New Roman" w:hAnsi="Arial" w:cs="Arial"/>
+          <w:sz w:val="24"/>
+          <w:szCs w:val="24"/>
+          <w:lang w:eastAsia="es-GT"/>
+        </w:rPr>
+      </w:pPr>
+    </w:p>
+    <w:p>
+      <w:pPr>
+        <w:spacing w:before="100" w:beforeAutospacing="1" w:after="100" w:afterAutospacing="1" w:line="240" w:lineRule="auto"/>
+        <w:rPr>
+          <w:rFonts w:ascii="Arial" w:eastAsia="Times New Roman" w:hAnsi="Arial" w:cs="Arial"/>
+          <w:sz w:val="24"/>
+          <w:szCs w:val="24"/>
+          <w:lang w:eastAsia="es-GT"/>
+        </w:rPr>
+      </w:pPr>
+    </w:p>
+    <w:p>
+      <w:pPr>
+        <w:spacing w:before="100" w:beforeAutospacing="1" w:after="100" w:afterAutospacing="1" w:line="240" w:lineRule="auto"/>
+        <w:rPr>
+          <w:rFonts w:ascii="Arial" w:eastAsia="Times New Roman" w:hAnsi="Arial" w:cs="Arial"/>
+          <w:sz w:val="24"/>
+          <w:szCs w:val="24"/>
+          <w:lang w:eastAsia="es-GT"/>
+        </w:rPr>
+      </w:pPr>
+    </w:p>
+    <w:p>
+      <w:pPr>
+        <w:spacing w:before="100" w:beforeAutospacing="1" w:after="100" w:afterAutospacing="1" w:line="240" w:lineRule="auto"/>
+        <w:rPr>
+          <w:rFonts w:ascii="Arial" w:eastAsia="Times New Roman" w:hAnsi="Arial" w:cs="Arial"/>
+          <w:sz w:val="24"/>
+          <w:szCs w:val="24"/>
+          <w:lang w:eastAsia="es-GT"/>
+        </w:rPr>
+      </w:pPr>
+    </w:p>
+    <w:p>
+      <w:pPr>
+        <w:spacing w:before="100" w:beforeAutospacing="1" w:after="100" w:afterAutospacing="1" w:line="240" w:lineRule="auto"/>
+        <w:rPr>
+          <w:rFonts w:ascii="Arial" w:eastAsia="Times New Roman" w:hAnsi="Arial" w:cs="Arial"/>
+          <w:sz w:val="24"/>
+          <w:szCs w:val="24"/>
+          <w:lang w:eastAsia="es-GT"/>
+        </w:rPr>
+      </w:pPr>
+    </w:p>
+    <w:p>
+      <w:pPr>
+        <w:spacing w:before="100" w:beforeAutospacing="1" w:after="100" w:afterAutospacing="1" w:line="240" w:lineRule="auto"/>
+        <w:rPr>
+          <w:rFonts w:ascii="Arial" w:eastAsia="Times New Roman" w:hAnsi="Arial" w:cs="Arial"/>
+          <w:sz w:val="24"/>
+          <w:szCs w:val="24"/>
+          <w:lang w:eastAsia="es-GT"/>
+        </w:rPr>
+      </w:pPr>
+    </w:p>
+    <w:p>
+      <w:pPr>
+        <w:spacing w:before="100" w:beforeAutospacing="1" w:after="100" w:afterAutospacing="1" w:line="240" w:lineRule="auto"/>
+        <w:rPr>
+          <w:rFonts w:ascii="Arial" w:eastAsia="Times New Roman" w:hAnsi="Arial" w:cs="Arial"/>
+          <w:sz w:val="24"/>
+          <w:szCs w:val="24"/>
+          <w:lang w:eastAsia="es-GT"/>
+        </w:rPr>
+      </w:pPr>
+    </w:p>
+    <w:p>
+      <w:pPr>
+        <w:spacing w:before="100" w:beforeAutospacing="1" w:after="100" w:afterAutospacing="1" w:line="240" w:lineRule="auto"/>
+        <w:rPr>
+          <w:rFonts w:ascii="Arial" w:eastAsia="Times New Roman" w:hAnsi="Arial" w:cs="Arial"/>
+          <w:sz w:val="24"/>
+          <w:szCs w:val="24"/>
+          <w:lang w:eastAsia="es-GT"/>
+        </w:rPr>
+      </w:pPr>
+    </w:p>
+    <w:p>
+      <w:pPr>
+        <w:spacing w:before="100" w:beforeAutospacing="1" w:after="100" w:afterAutospacing="1" w:line="240" w:lineRule="auto"/>
+        <w:rPr>
+          <w:rFonts w:ascii="Arial" w:eastAsia="Times New Roman" w:hAnsi="Arial" w:cs="Arial"/>
+          <w:sz w:val="24"/>
+          <w:szCs w:val="24"/>
+          <w:lang w:eastAsia="es-GT"/>
+        </w:rPr>
+      </w:pPr>
+    </w:p>
+    <w:p>
+      <w:pPr>
+        <w:spacing w:before="100" w:beforeAutospacing="1" w:after="100" w:afterAutospacing="1" w:line="240" w:lineRule="auto"/>
+        <w:rPr>
+          <w:rFonts w:ascii="Arial" w:eastAsia="Times New Roman" w:hAnsi="Arial" w:cs="Arial"/>
+          <w:sz w:val="24"/>
+          <w:szCs w:val="24"/>
+          <w:lang w:eastAsia="es-GT"/>
+        </w:rPr>
+      </w:pPr>
+    </w:p>
+    <w:p>
+      <w:pPr>
+        <w:spacing w:before="100" w:beforeAutospacing="1" w:after="100" w:afterAutospacing="1" w:line="240" w:lineRule="auto"/>
+        <w:rPr>
+          <w:rFonts w:ascii="Arial" w:eastAsia="Times New Roman" w:hAnsi="Arial" w:cs="Arial"/>
+          <w:sz w:val="24"/>
+          <w:szCs w:val="24"/>
+          <w:lang w:eastAsia="es-GT"/>
+        </w:rPr>
+      </w:pPr>
+    </w:p>
+    <w:p>
+      <w:pPr>
+        <w:spacing w:before="100" w:beforeAutospacing="1" w:after="100" w:afterAutospacing="1" w:line="240" w:lineRule="auto"/>
+        <w:rPr>
+          <w:rFonts w:ascii="Arial" w:eastAsia="Times New Roman" w:hAnsi="Arial" w:cs="Arial"/>
+          <w:sz w:val="24"/>
+          <w:szCs w:val="24"/>
+          <w:lang w:eastAsia="es-GT"/>
+        </w:rPr>
+      </w:pPr>
+    </w:p>
+    <w:p>
+      <w:pPr>
+        <w:spacing w:before="100" w:beforeAutospacing="1" w:after="100" w:afterAutospacing="1" w:line="240" w:lineRule="auto"/>
+        <w:rPr>
+          <w:rFonts w:ascii="Arial" w:eastAsia="Times New Roman" w:hAnsi="Arial" w:cs="Arial"/>
+          <w:sz w:val="24"/>
+          <w:szCs w:val="24"/>
+          <w:lang w:eastAsia="es-GT"/>
+        </w:rPr>
+      </w:pPr>
+    </w:p>
+    <w:p>
+      <w:pPr>
+        <w:spacing w:before="100" w:beforeAutospacing="1" w:after="100" w:afterAutospacing="1" w:line="240" w:lineRule="auto"/>
+        <w:rPr>
+          <w:rFonts w:ascii="Arial" w:eastAsia="Times New Roman" w:hAnsi="Arial" w:cs="Arial"/>
+          <w:sz w:val="24"/>
+          <w:szCs w:val="24"/>
+          <w:lang w:eastAsia="es-GT"/>
+        </w:rPr>
+      </w:pPr>
+    </w:p>
+    <w:p>
+      <w:pPr>
+        <w:spacing w:before="100" w:beforeAutospacing="1" w:after="100" w:afterAutospacing="1" w:line="240" w:lineRule="auto"/>
+        <w:rPr>
+          <w:rFonts w:ascii="Arial" w:eastAsia="Times New Roman" w:hAnsi="Arial" w:cs="Arial"/>
+          <w:sz w:val="24"/>
+          <w:szCs w:val="24"/>
+          <w:lang w:eastAsia="es-GT"/>
+        </w:rPr>
+      </w:pPr>
+    </w:p>
+    <w:p>
+      <w:pPr>
+        <w:spacing w:before="100" w:beforeAutospacing="1" w:after="100" w:afterAutospacing="1" w:line="240" w:lineRule="auto"/>
+        <w:rPr>
+          <w:rFonts w:ascii="Arial" w:eastAsia="Times New Roman" w:hAnsi="Arial" w:cs="Arial"/>
+          <w:sz w:val="24"/>
+          <w:szCs w:val="24"/>
+          <w:lang w:eastAsia="es-GT"/>
+        </w:rPr>
+      </w:pPr>
+    </w:p>
+    <w:p>
+      <w:pPr>
+        <w:spacing w:before="100" w:beforeAutospacing="1" w:after="100" w:afterAutospacing="1" w:line="240" w:lineRule="auto"/>
+        <w:rPr>
+          <w:rFonts w:ascii="Arial" w:eastAsia="Times New Roman" w:hAnsi="Arial" w:cs="Arial"/>
+          <w:sz w:val="24"/>
+          <w:szCs w:val="24"/>
+          <w:lang w:eastAsia="es-GT"/>
+        </w:rPr>
+      </w:pPr>
+    </w:p>
+    <w:p>
+      <w:pPr>
+        <w:spacing w:before="100" w:beforeAutospacing="1" w:after="100" w:afterAutospacing="1" w:line="240" w:lineRule="auto"/>
+        <w:rPr>
+          <w:rFonts w:ascii="Arial" w:eastAsia="Times New Roman" w:hAnsi="Arial" w:cs="Arial"/>
+          <w:sz w:val="24"/>
+          <w:szCs w:val="24"/>
+          <w:lang w:eastAsia="es-GT"/>
+        </w:rPr>
+      </w:pPr>
+    </w:p>
+    <w:p>
+      <w:pPr>
+        <w:spacing w:before="100" w:beforeAutospacing="1" w:after="100" w:afterAutospacing="1" w:line="240" w:lineRule="auto"/>
+        <w:rPr>
+          <w:rFonts w:ascii="Arial" w:eastAsia="Times New Roman" w:hAnsi="Arial" w:cs="Arial"/>
+          <w:sz w:val="24"/>
+          <w:szCs w:val="24"/>
+          <w:lang w:eastAsia="es-GT"/>
+        </w:rPr>
+      </w:pPr>
+    </w:p>
+    <w:p>
+      <w:pPr>
+        <w:spacing w:before="100" w:beforeAutospacing="1" w:after="100" w:afterAutospacing="1" w:line="240" w:lineRule="auto"/>
+        <w:rPr>
+          <w:rFonts w:ascii="Arial" w:eastAsia="Times New Roman" w:hAnsi="Arial" w:cs="Arial"/>
+          <w:sz w:val="24"/>
+          <w:szCs w:val="24"/>
+          <w:lang w:eastAsia="es-GT"/>
+        </w:rPr>
+      </w:pPr>
+    </w:p>
+    <w:p>
+      <w:pPr>
+        <w:spacing w:before="100" w:beforeAutospacing="1" w:after="100" w:afterAutospacing="1" w:line="240" w:lineRule="auto"/>
+        <w:rPr>
+          <w:rFonts w:ascii="Arial" w:eastAsia="Times New Roman" w:hAnsi="Arial" w:cs="Arial"/>
+          <w:sz w:val="24"/>
+          <w:szCs w:val="24"/>
+          <w:lang w:eastAsia="es-GT"/>
+        </w:rPr>
+      </w:pPr>
+    </w:p>
+    <w:p>
+      <w:pPr>
+        <w:spacing w:before="100" w:beforeAutospacing="1" w:after="100" w:afterAutospacing="1" w:line="240" w:lineRule="auto"/>
+        <w:rPr>
+          <w:rFonts w:ascii="Arial" w:eastAsia="Times New Roman" w:hAnsi="Arial" w:cs="Arial"/>
+          <w:sz w:val="24"/>
+          <w:szCs w:val="24"/>
+          <w:lang w:eastAsia="es-GT"/>
+        </w:rPr>
+      </w:pPr>
+    </w:p>
+    <w:p>
+      <w:pPr>
+        <w:spacing w:before="100" w:beforeAutospacing="1" w:after="100" w:afterAutospacing="1" w:line="240" w:lineRule="auto"/>
+        <w:rPr>
+          <w:rFonts w:ascii="Arial" w:eastAsia="Times New Roman" w:hAnsi="Arial" w:cs="Arial"/>
+          <w:sz w:val="24"/>
+          <w:szCs w:val="24"/>
+          <w:lang w:eastAsia="es-GT"/>
+        </w:rPr>
+      </w:pPr>
+    </w:p>
+    <w:p>
+      <w:pPr>
+        <w:spacing w:before="100" w:beforeAutospacing="1" w:after="100" w:afterAutospacing="1" w:line="240" w:lineRule="auto"/>
+        <w:rPr>
+          <w:rFonts w:ascii="Arial" w:eastAsia="Times New Roman" w:hAnsi="Arial" w:cs="Arial"/>
+          <w:sz w:val="24"/>
+          <w:szCs w:val="24"/>
+          <w:lang w:eastAsia="es-GT"/>
+        </w:rPr>
+      </w:pPr>
+    </w:p>
+    <w:p>
+      <w:pPr>
+        <w:spacing w:before="100" w:beforeAutospacing="1" w:after="100" w:afterAutospacing="1" w:line="240" w:lineRule="auto"/>
+        <w:rPr>
+          <w:rFonts w:ascii="Arial" w:eastAsia="Times New Roman" w:hAnsi="Arial" w:cs="Arial"/>
+          <w:sz w:val="24"/>
+          <w:szCs w:val="24"/>
+          <w:lang w:eastAsia="es-GT"/>
+        </w:rPr>
+      </w:pPr>
+    </w:p>
+    <w:p>
+      <w:pPr>
+        <w:spacing w:before="100" w:beforeAutospacing="1" w:after="100" w:afterAutospacing="1" w:line="240" w:lineRule="auto"/>
+        <w:rPr>
+          <w:rFonts w:ascii="Arial" w:eastAsia="Times New Roman" w:hAnsi="Arial" w:cs="Arial"/>
+          <w:sz w:val="24"/>
+          <w:szCs w:val="24"/>
+          <w:lang w:eastAsia="es-GT"/>
+        </w:rPr>
+      </w:pPr>
+    </w:p>
+    <w:p>
+      <w:pPr>
+        <w:spacing w:before="100" w:beforeAutospacing="1" w:after="100" w:afterAutospacing="1" w:line="240" w:lineRule="auto"/>
+        <w:rPr>
+          <w:rFonts w:ascii="Arial" w:eastAsia="Times New Roman" w:hAnsi="Arial" w:cs="Arial"/>
+          <w:sz w:val="24"/>
+          <w:szCs w:val="24"/>
+          <w:lang w:eastAsia="es-GT"/>
+        </w:rPr>
+      </w:pPr>
+    </w:p>
+    <w:p>
+      <w:pPr>
+        <w:spacing w:before="100" w:beforeAutospacing="1" w:after="100" w:afterAutospacing="1" w:line="240" w:lineRule="auto"/>
+        <w:rPr>
+          <w:rFonts w:ascii="Arial" w:eastAsia="Times New Roman" w:hAnsi="Arial" w:cs="Arial"/>
+          <w:sz w:val="24"/>
+          <w:szCs w:val="24"/>
+          <w:lang w:eastAsia="es-GT"/>
+        </w:rPr>
+      </w:pPr>
+    </w:p>
+    <w:p>
+      <w:pPr>
+        <w:spacing w:before="100" w:beforeAutospacing="1" w:after="100" w:afterAutospacing="1" w:line="240" w:lineRule="auto"/>
+        <w:rPr>
+          <w:rFonts w:ascii="Arial" w:eastAsia="Times New Roman" w:hAnsi="Arial" w:cs="Arial"/>
+          <w:sz w:val="24"/>
+          <w:szCs w:val="24"/>
+          <w:lang w:eastAsia="es-GT"/>
+        </w:rPr>
+      </w:pPr>
+    </w:p>
+    <w:p>
+      <w:pPr>
+        <w:spacing w:before="100" w:beforeAutospacing="1" w:after="100" w:afterAutospacing="1" w:line="240" w:lineRule="auto"/>
+        <w:rPr>
+          <w:rFonts w:ascii="Arial" w:eastAsia="Times New Roman" w:hAnsi="Arial" w:cs="Arial"/>
+          <w:sz w:val="24"/>
+          <w:szCs w:val="24"/>
+          <w:lang w:eastAsia="es-GT"/>
+        </w:rPr>
+      </w:pPr>
+    </w:p>
+    <w:p>
+      <w:pPr>
+        <w:spacing w:before="100" w:beforeAutospacing="1" w:after="100" w:afterAutospacing="1" w:line="240" w:lineRule="auto"/>
+        <w:rPr>
+          <w:rFonts w:ascii="Arial" w:eastAsia="Times New Roman" w:hAnsi="Arial" w:cs="Arial"/>
+          <w:sz w:val="24"/>
+          <w:szCs w:val="24"/>
+          <w:lang w:eastAsia="es-GT"/>
+        </w:rPr>
+      </w:pPr>
+    </w:p>
+    <w:p>
+      <w:pPr>
+        <w:spacing w:before="100" w:beforeAutospacing="1" w:after="100" w:afterAutospacing="1" w:line="240" w:lineRule="auto"/>
+        <w:rPr>
+          <w:rFonts w:ascii="Arial" w:eastAsia="Times New Roman" w:hAnsi="Arial" w:cs="Arial"/>
+          <w:sz w:val="24"/>
+          <w:szCs w:val="24"/>
+          <w:lang w:eastAsia="es-GT"/>
+        </w:rPr>
+      </w:pPr>
+    </w:p>
+    <w:p>
+      <w:pPr>
+        <w:spacing w:before="100" w:beforeAutospacing="1" w:after="100" w:afterAutospacing="1" w:line="240" w:lineRule="auto"/>
+        <w:rPr>
+          <w:rFonts w:ascii="Arial" w:eastAsia="Times New Roman" w:hAnsi="Arial" w:cs="Arial"/>
+          <w:sz w:val="24"/>
+          <w:szCs w:val="24"/>
+          <w:lang w:eastAsia="es-GT"/>
+        </w:rPr>
+      </w:pPr>
+    </w:p>
+    <w:p>
+      <w:pPr>
+        <w:spacing w:before="100" w:beforeAutospacing="1" w:after="100" w:afterAutospacing="1" w:line="240" w:lineRule="auto"/>
+        <w:rPr>
+          <w:rFonts w:ascii="Arial" w:eastAsia="Times New Roman" w:hAnsi="Arial" w:cs="Arial"/>
+          <w:sz w:val="24"/>
+          <w:szCs w:val="24"/>
+          <w:lang w:eastAsia="es-GT"/>
+        </w:rPr>
+      </w:pPr>
+    </w:p>
+    <w:p>
+      <w:pPr>
+        <w:spacing w:before="100" w:beforeAutospacing="1" w:after="100" w:afterAutospacing="1" w:line="240" w:lineRule="auto"/>
+        <w:rPr>
+          <w:rFonts w:ascii="Arial" w:eastAsia="Times New Roman" w:hAnsi="Arial" w:cs="Arial"/>
+          <w:sz w:val="24"/>
+          <w:szCs w:val="24"/>
+          <w:lang w:eastAsia="es-GT"/>
+        </w:rPr>
+      </w:pPr>
+    </w:p>
+    <w:p>
+      <w:pPr>
+        <w:spacing w:before="100" w:beforeAutospacing="1" w:after="100" w:afterAutospacing="1" w:line="240" w:lineRule="auto"/>
+        <w:rPr>
+          <w:rFonts w:ascii="Arial" w:eastAsia="Times New Roman" w:hAnsi="Arial" w:cs="Arial"/>
+          <w:sz w:val="24"/>
+          <w:szCs w:val="24"/>
+          <w:lang w:eastAsia="es-GT"/>
+        </w:rPr>
+      </w:pPr>
+    </w:p>
+    <w:p>
+      <w:pPr>
+        <w:spacing w:before="100" w:beforeAutospacing="1" w:after="100" w:afterAutospacing="1" w:line="240" w:lineRule="auto"/>
+        <w:rPr>
+          <w:rFonts w:ascii="Arial" w:eastAsia="Times New Roman" w:hAnsi="Arial" w:cs="Arial"/>
+          <w:sz w:val="24"/>
+          <w:szCs w:val="24"/>
+          <w:lang w:eastAsia="es-GT"/>
+        </w:rPr>
+      </w:pPr>
+    </w:p>
+    <w:p>
+      <w:pPr>
+        <w:spacing w:before="100" w:beforeAutospacing="1" w:after="100" w:afterAutospacing="1" w:line="240" w:lineRule="auto"/>
+        <w:rPr>
+          <w:rFonts w:ascii="Arial" w:eastAsia="Times New Roman" w:hAnsi="Arial" w:cs="Arial"/>
+          <w:sz w:val="24"/>
+          <w:szCs w:val="24"/>
+          <w:lang w:eastAsia="es-GT"/>
+        </w:rPr>
+      </w:pPr>
+    </w:p>
+    <w:p>
+      <w:pPr>
+        <w:spacing w:before="100" w:beforeAutospacing="1" w:after="100" w:afterAutospacing="1" w:line="240" w:lineRule="auto"/>
+        <w:rPr>
+          <w:rFonts w:ascii="Arial" w:eastAsia="Times New Roman" w:hAnsi="Arial" w:cs="Arial"/>
+          <w:sz w:val="24"/>
+          <w:szCs w:val="24"/>
+          <w:lang w:eastAsia="es-GT"/>
+        </w:rPr>
+      </w:pPr>
+    </w:p>
+    <w:p>
+      <w:pPr>
+        <w:spacing w:before="100" w:beforeAutospacing="1" w:after="100" w:afterAutospacing="1" w:line="240" w:lineRule="auto"/>
+        <w:rPr>
+          <w:rFonts w:ascii="Arial" w:eastAsia="Times New Roman" w:hAnsi="Arial" w:cs="Arial"/>
+          <w:sz w:val="24"/>
+          <w:szCs w:val="24"/>
+          <w:lang w:eastAsia="es-GT"/>
+        </w:rPr>
+      </w:pPr>
+    </w:p>
+    <w:p>
+      <w:pPr>
+        <w:spacing w:before="100" w:beforeAutospacing="1" w:after="100" w:afterAutospacing="1" w:line="240" w:lineRule="auto"/>
+        <w:rPr>
+          <w:rFonts w:ascii="Arial" w:eastAsia="Times New Roman" w:hAnsi="Arial" w:cs="Arial"/>
+          <w:sz w:val="24"/>
+          <w:szCs w:val="24"/>
+          <w:lang w:eastAsia="es-GT"/>
+        </w:rPr>
+      </w:pPr>
+    </w:p>
+    <w:p>
+      <w:pPr>
+        <w:spacing w:before="100" w:beforeAutospacing="1" w:after="100" w:afterAutospacing="1" w:line="240" w:lineRule="auto"/>
+        <w:rPr>
+          <w:rFonts w:ascii="Arial" w:eastAsia="Times New Roman" w:hAnsi="Arial" w:cs="Arial"/>
+          <w:sz w:val="24"/>
+          <w:szCs w:val="24"/>
+          <w:lang w:eastAsia="es-GT"/>
+        </w:rPr>
+      </w:pPr>
+    </w:p>
+    <w:p>
+      <w:pPr>
+        <w:spacing w:before="100" w:beforeAutospacing="1" w:after="100" w:afterAutospacing="1" w:line="240" w:lineRule="auto"/>
+        <w:rPr>
+          <w:rFonts w:ascii="Arial" w:eastAsia="Times New Roman" w:hAnsi="Arial" w:cs="Arial"/>
+          <w:sz w:val="24"/>
+          <w:szCs w:val="24"/>
+          <w:lang w:eastAsia="es-GT"/>
+        </w:rPr>
+      </w:pPr>
+    </w:p>
+    <w:p>
+      <w:pPr>
+        <w:spacing w:before="100" w:beforeAutospacing="1" w:after="100" w:afterAutospacing="1" w:line="240" w:lineRule="auto"/>
+        <w:rPr>
+          <w:rFonts w:ascii="Arial" w:eastAsia="Times New Roman" w:hAnsi="Arial" w:cs="Arial"/>
+          <w:sz w:val="24"/>
+          <w:szCs w:val="24"/>
+          <w:lang w:eastAsia="es-GT"/>
+        </w:rPr>
+      </w:pPr>
+    </w:p>
+    <w:p>
+      <w:pPr>
+        <w:spacing w:before="100" w:beforeAutospacing="1" w:after="100" w:afterAutospacing="1" w:line="240" w:lineRule="auto"/>
+        <w:rPr>
+          <w:rFonts w:ascii="Arial" w:eastAsia="Times New Roman" w:hAnsi="Arial" w:cs="Arial"/>
+          <w:sz w:val="24"/>
+          <w:szCs w:val="24"/>
+          <w:lang w:eastAsia="es-GT"/>
+        </w:rPr>
+      </w:pPr>
+    </w:p>
+    <w:p>
+      <w:pPr>
+        <w:spacing w:before="100" w:beforeAutospacing="1" w:after="100" w:afterAutospacing="1" w:line="240" w:lineRule="auto"/>
+        <w:rPr>
+          <w:rFonts w:ascii="Arial" w:eastAsia="Times New Roman" w:hAnsi="Arial" w:cs="Arial"/>
+          <w:sz w:val="24"/>
+          <w:szCs w:val="24"/>
+          <w:lang w:eastAsia="es-GT"/>
+        </w:rPr>
+      </w:pPr>
+    </w:p>
+    <w:p>
+      <w:pPr>
+        <w:spacing w:before="100" w:beforeAutospacing="1" w:after="100" w:afterAutospacing="1" w:line="240" w:lineRule="auto"/>
+        <w:rPr>
+          <w:rFonts w:ascii="Arial" w:eastAsia="Times New Roman" w:hAnsi="Arial" w:cs="Arial"/>
+          <w:sz w:val="24"/>
+          <w:szCs w:val="24"/>
+          <w:lang w:eastAsia="es-GT"/>
+        </w:rPr>
+      </w:pPr>
+    </w:p>
+    <w:p>
+      <w:pPr>
+        <w:spacing w:before="100" w:beforeAutospacing="1" w:after="100" w:afterAutospacing="1" w:line="240" w:lineRule="auto"/>
+        <w:rPr>
+          <w:rFonts w:ascii="Arial" w:eastAsia="Times New Roman" w:hAnsi="Arial" w:cs="Arial"/>
+          <w:sz w:val="24"/>
+          <w:szCs w:val="24"/>
+          <w:lang w:eastAsia="es-GT"/>
+        </w:rPr>
+      </w:pPr>
+    </w:p>
+    <w:p>
+      <w:pPr>
+        <w:spacing w:before="100" w:beforeAutospacing="1" w:after="100" w:afterAutospacing="1" w:line="240" w:lineRule="auto"/>
+        <w:rPr>
+          <w:rFonts w:ascii="Arial" w:eastAsia="Times New Roman" w:hAnsi="Arial" w:cs="Arial"/>
+          <w:sz w:val="24"/>
+          <w:szCs w:val="24"/>
+          <w:lang w:eastAsia="es-GT"/>
+        </w:rPr>
+      </w:pPr>
+    </w:p>
+    <w:p>
+      <w:pPr>
+        <w:spacing w:before="100" w:beforeAutospacing="1" w:after="100" w:afterAutospacing="1" w:line="240" w:lineRule="auto"/>
+        <w:rPr>
+          <w:rFonts w:ascii="Arial" w:eastAsia="Times New Roman" w:hAnsi="Arial" w:cs="Arial"/>
+          <w:sz w:val="24"/>
+          <w:szCs w:val="24"/>
+          <w:lang w:eastAsia="es-GT"/>
+        </w:rPr>
+      </w:pPr>
+    </w:p>
+    <w:p>
+      <w:pPr>
+        <w:spacing w:before="100" w:beforeAutospacing="1" w:after="100" w:afterAutospacing="1" w:line="240" w:lineRule="auto"/>
+        <w:rPr>
+          <w:rFonts w:ascii="Arial" w:eastAsia="Times New Roman" w:hAnsi="Arial" w:cs="Arial"/>
+          <w:sz w:val="24"/>
+          <w:szCs w:val="24"/>
+          <w:lang w:eastAsia="es-GT"/>
+        </w:rPr>
+      </w:pPr>
+    </w:p>
+    <w:p>
+      <w:pPr>
+        <w:spacing w:before="100" w:beforeAutospacing="1" w:after="100" w:afterAutospacing="1" w:line="240" w:lineRule="auto"/>
+        <w:rPr>
+          <w:rFonts w:ascii="Arial" w:eastAsia="Times New Roman" w:hAnsi="Arial" w:cs="Arial"/>
+          <w:sz w:val="24"/>
+          <w:szCs w:val="24"/>
+          <w:lang w:eastAsia="es-GT"/>
+        </w:rPr>
+      </w:pPr>
+    </w:p>
+    <w:p>
+      <w:pPr>
+        <w:spacing w:before="100" w:beforeAutospacing="1" w:after="100" w:afterAutospacing="1" w:line="240" w:lineRule="auto"/>
+        <w:rPr>
+          <w:rFonts w:ascii="Arial" w:eastAsia="Times New Roman" w:hAnsi="Arial" w:cs="Arial"/>
+          <w:sz w:val="24"/>
+          <w:szCs w:val="24"/>
+          <w:lang w:eastAsia="es-GT"/>
+        </w:rPr>
+      </w:pPr>
+    </w:p>
+    <w:p>
+      <w:pPr>
+        <w:spacing w:before="100" w:beforeAutospacing="1" w:after="100" w:afterAutospacing="1" w:line="240" w:lineRule="auto"/>
+        <w:rPr>
+          <w:rFonts w:ascii="Arial" w:eastAsia="Times New Roman" w:hAnsi="Arial" w:cs="Arial"/>
+          <w:sz w:val="24"/>
+          <w:szCs w:val="24"/>
+          <w:lang w:eastAsia="es-GT"/>
+        </w:rPr>
+      </w:pPr>
+    </w:p>
+    <w:p>
+      <w:pPr>
+        <w:spacing w:before="100" w:beforeAutospacing="1" w:after="100" w:afterAutospacing="1" w:line="240" w:lineRule="auto"/>
+        <w:rPr>
+          <w:rFonts w:ascii="Arial" w:eastAsia="Times New Roman" w:hAnsi="Arial" w:cs="Arial"/>
+          <w:sz w:val="24"/>
+          <w:szCs w:val="24"/>
+          <w:lang w:eastAsia="es-GT"/>
+        </w:rPr>
+      </w:pPr>
+    </w:p>
+    <w:p>
+      <w:pPr>
+        <w:spacing w:before="100" w:beforeAutospacing="1" w:after="100" w:afterAutospacing="1" w:line="240" w:lineRule="auto"/>
+        <w:rPr>
+          <w:rFonts w:ascii="Arial" w:eastAsia="Times New Roman" w:hAnsi="Arial" w:cs="Arial"/>
+          <w:sz w:val="24"/>
+          <w:szCs w:val="24"/>
+          <w:lang w:eastAsia="es-GT"/>
+        </w:rPr>
+      </w:pPr>
+    </w:p>
+    <w:p>
+      <w:pPr>
+        <w:spacing w:before="100" w:beforeAutospacing="1" w:after="100" w:afterAutospacing="1" w:line="240" w:lineRule="auto"/>
+        <w:rPr>
+          <w:rFonts w:ascii="Arial" w:eastAsia="Times New Roman" w:hAnsi="Arial" w:cs="Arial"/>
+          <w:sz w:val="24"/>
+          <w:szCs w:val="24"/>
+          <w:lang w:eastAsia="es-GT"/>
+        </w:rPr>
+      </w:pPr>
+    </w:p>
+    <w:p>
+      <w:pPr>
+        <w:spacing w:before="100" w:beforeAutospacing="1" w:after="100" w:afterAutospacing="1" w:line="240" w:lineRule="auto"/>
+        <w:rPr>
+          <w:rFonts w:ascii="Arial" w:eastAsia="Times New Roman" w:hAnsi="Arial" w:cs="Arial"/>
+          <w:sz w:val="24"/>
+          <w:szCs w:val="24"/>
+          <w:lang w:eastAsia="es-GT"/>
+        </w:rPr>
+      </w:pPr>
+    </w:p>
+    <w:p>
+      <w:pPr>
+        <w:spacing w:before="100" w:beforeAutospacing="1" w:after="100" w:afterAutospacing="1" w:line="240" w:lineRule="auto"/>
+        <w:rPr>
+          <w:rFonts w:ascii="Arial" w:eastAsia="Times New Roman" w:hAnsi="Arial" w:cs="Arial"/>
+          <w:sz w:val="24"/>
+          <w:szCs w:val="24"/>
+          <w:lang w:eastAsia="es-GT"/>
+        </w:rPr>
+      </w:pPr>
+    </w:p>
+    <w:p>
+      <w:pPr>
+        <w:spacing w:before="100" w:beforeAutospacing="1" w:after="100" w:afterAutospacing="1" w:line="240" w:lineRule="auto"/>
+        <w:rPr>
+          <w:rFonts w:ascii="Arial" w:eastAsia="Times New Roman" w:hAnsi="Arial" w:cs="Arial"/>
+          <w:sz w:val="24"/>
+          <w:szCs w:val="24"/>
+          <w:lang w:eastAsia="es-GT"/>
+        </w:rPr>
+      </w:pPr>
+    </w:p>
+    <w:p>
+      <w:pPr>
+        <w:spacing w:before="100" w:beforeAutospacing="1" w:after="100" w:afterAutospacing="1" w:line="240" w:lineRule="auto"/>
+        <w:rPr>
+          <w:rFonts w:ascii="Arial" w:eastAsia="Times New Roman" w:hAnsi="Arial" w:cs="Arial"/>
+          <w:sz w:val="24"/>
+          <w:szCs w:val="24"/>
+          <w:lang w:eastAsia="es-GT"/>
+        </w:rPr>
+      </w:pPr>
+    </w:p>
+    <w:p>
+      <w:pPr>
+        <w:spacing w:before="100" w:beforeAutospacing="1" w:after="100" w:afterAutospacing="1" w:line="240" w:lineRule="auto"/>
+        <w:rPr>
+          <w:rFonts w:ascii="Arial" w:eastAsia="Times New Roman" w:hAnsi="Arial" w:cs="Arial"/>
+          <w:sz w:val="24"/>
+          <w:szCs w:val="24"/>
+          <w:lang w:eastAsia="es-GT"/>
+        </w:rPr>
+      </w:pPr>
+    </w:p>
+    <w:p>
+      <w:pPr>
+        <w:spacing w:before="100" w:beforeAutospacing="1" w:after="100" w:afterAutospacing="1" w:line="240" w:lineRule="auto"/>
+        <w:rPr>
+          <w:rFonts w:ascii="Arial" w:eastAsia="Times New Roman" w:hAnsi="Arial" w:cs="Arial"/>
+          <w:sz w:val="24"/>
+          <w:szCs w:val="24"/>
+          <w:lang w:eastAsia="es-GT"/>
+        </w:rPr>
+      </w:pPr>
+    </w:p>
+    <w:p>
+      <w:pPr>
+        <w:spacing w:before="100" w:beforeAutospacing="1" w:after="100" w:afterAutospacing="1" w:line="240" w:lineRule="auto"/>
+        <w:rPr>
+          <w:rFonts w:ascii="Arial" w:eastAsia="Times New Roman" w:hAnsi="Arial" w:cs="Arial"/>
+          <w:sz w:val="24"/>
+          <w:szCs w:val="24"/>
+          <w:lang w:eastAsia="es-GT"/>
+        </w:rPr>
+      </w:pPr>
+    </w:p>
+    <w:p>
+      <w:pPr>
+        <w:spacing w:before="100" w:beforeAutospacing="1" w:after="100" w:afterAutospacing="1" w:line="240" w:lineRule="auto"/>
+        <w:rPr>
+          <w:rFonts w:ascii="Arial" w:eastAsia="Times New Roman" w:hAnsi="Arial" w:cs="Arial"/>
+          <w:sz w:val="24"/>
+          <w:szCs w:val="24"/>
+          <w:lang w:eastAsia="es-GT"/>
+        </w:rPr>
+      </w:pPr>
+    </w:p>
+    <w:p>
+      <w:pPr>
+        <w:spacing w:before="100" w:beforeAutospacing="1" w:after="100" w:afterAutospacing="1" w:line="240" w:lineRule="auto"/>
+        <w:rPr>
+          <w:rFonts w:ascii="Arial" w:eastAsia="Times New Roman" w:hAnsi="Arial" w:cs="Arial"/>
+          <w:sz w:val="24"/>
+          <w:szCs w:val="24"/>
+          <w:lang w:eastAsia="es-GT"/>
+        </w:rPr>
+      </w:pPr>
+    </w:p>
+    <w:p>
+      <w:pPr>
+        <w:spacing w:before="100" w:beforeAutospacing="1" w:after="100" w:afterAutospacing="1" w:line="240" w:lineRule="auto"/>
+        <w:rPr>
+          <w:rFonts w:ascii="Arial" w:eastAsia="Times New Roman" w:hAnsi="Arial" w:cs="Arial"/>
+          <w:sz w:val="24"/>
+          <w:szCs w:val="24"/>
+          <w:lang w:eastAsia="es-GT"/>
+        </w:rPr>
+      </w:pPr>
+    </w:p>
+    <w:p>
+      <w:pPr>
+        <w:spacing w:before="100" w:beforeAutospacing="1" w:after="100" w:afterAutospacing="1" w:line="240" w:lineRule="auto"/>
+        <w:rPr>
+          <w:rFonts w:ascii="Arial" w:eastAsia="Times New Roman" w:hAnsi="Arial" w:cs="Arial"/>
+          <w:sz w:val="24"/>
+          <w:szCs w:val="24"/>
+          <w:lang w:eastAsia="es-GT"/>
+        </w:rPr>
+      </w:pPr>
+    </w:p>
+    <w:p>
+      <w:pPr>
+        <w:spacing w:before="100" w:beforeAutospacing="1" w:after="100" w:afterAutospacing="1" w:line="240" w:lineRule="auto"/>
+        <w:rPr>
+          <w:rFonts w:ascii="Arial" w:eastAsia="Times New Roman" w:hAnsi="Arial" w:cs="Arial"/>
+          <w:sz w:val="24"/>
+          <w:szCs w:val="24"/>
+          <w:lang w:eastAsia="es-GT"/>
+        </w:rPr>
+      </w:pPr>
+    </w:p>
+    <w:p>
+      <w:pPr>
+        <w:spacing w:before="100" w:beforeAutospacing="1" w:after="100" w:afterAutospacing="1" w:line="240" w:lineRule="auto"/>
+        <w:rPr>
+          <w:rFonts w:ascii="Arial" w:eastAsia="Times New Roman" w:hAnsi="Arial" w:cs="Arial"/>
+          <w:sz w:val="24"/>
+          <w:szCs w:val="24"/>
+          <w:lang w:eastAsia="es-GT"/>
+        </w:rPr>
+      </w:pPr>
+    </w:p>
+    <w:p>
+      <w:pPr>
+        <w:spacing w:before="100" w:beforeAutospacing="1" w:after="100" w:afterAutospacing="1" w:line="240" w:lineRule="auto"/>
+        <w:rPr>
+          <w:rFonts w:ascii="Arial" w:eastAsia="Times New Roman" w:hAnsi="Arial" w:cs="Arial"/>
+          <w:sz w:val="24"/>
+          <w:szCs w:val="24"/>
+          <w:lang w:eastAsia="es-GT"/>
+        </w:rPr>
+      </w:pPr>
+    </w:p>
+    <w:p>
+      <w:pPr>
+        <w:spacing w:before="100" w:beforeAutospacing="1" w:after="100" w:afterAutospacing="1" w:line="240" w:lineRule="auto"/>
+        <w:rPr>
+          <w:rFonts w:ascii="Arial" w:eastAsia="Times New Roman" w:hAnsi="Arial" w:cs="Arial"/>
+          <w:sz w:val="24"/>
+          <w:szCs w:val="24"/>
+          <w:lang w:eastAsia="es-GT"/>
+        </w:rPr>
+      </w:pPr>
+    </w:p>
+    <w:p>
+      <w:pPr>
+        <w:spacing w:before="100" w:beforeAutospacing="1" w:after="100" w:afterAutospacing="1" w:line="240" w:lineRule="auto"/>
+        <w:rPr>
+          <w:rFonts w:ascii="Arial" w:eastAsia="Times New Roman" w:hAnsi="Arial" w:cs="Arial"/>
+          <w:sz w:val="24"/>
+          <w:szCs w:val="24"/>
+          <w:lang w:eastAsia="es-GT"/>
+        </w:rPr>
+      </w:pPr>
+    </w:p>
+    <w:p>
+      <w:pPr>
+        <w:spacing w:before="100" w:beforeAutospacing="1" w:after="100" w:afterAutospacing="1" w:line="240" w:lineRule="auto"/>
+        <w:rPr>
+          <w:rFonts w:ascii="Arial" w:eastAsia="Times New Roman" w:hAnsi="Arial" w:cs="Arial"/>
+          <w:sz w:val="24"/>
+          <w:szCs w:val="24"/>
+          <w:lang w:eastAsia="es-GT"/>
+        </w:rPr>
+      </w:pPr>
+    </w:p>
+    <w:p>
+      <w:pPr>
+        <w:spacing w:before="100" w:beforeAutospacing="1" w:after="100" w:afterAutospacing="1" w:line="240" w:lineRule="auto"/>
+        <w:rPr>
+          <w:rFonts w:ascii="Arial" w:eastAsia="Times New Roman" w:hAnsi="Arial" w:cs="Arial"/>
+          <w:sz w:val="24"/>
+          <w:szCs w:val="24"/>
+          <w:lang w:eastAsia="es-GT"/>
+        </w:rPr>
+      </w:pPr>
+    </w:p>
+    <w:p>
+      <w:pPr>
+        <w:spacing w:before="100" w:beforeAutospacing="1" w:after="100" w:afterAutospacing="1" w:line="240" w:lineRule="auto"/>
+        <w:rPr>
+          <w:rFonts w:ascii="Arial" w:eastAsia="Times New Roman" w:hAnsi="Arial" w:cs="Arial"/>
+          <w:sz w:val="24"/>
+          <w:szCs w:val="24"/>
+          <w:lang w:eastAsia="es-GT"/>
+        </w:rPr>
+      </w:pPr>
+    </w:p>
+    <w:p>
+      <w:pPr>
+        <w:spacing w:before="100" w:beforeAutospacing="1" w:after="100" w:afterAutospacing="1" w:line="240" w:lineRule="auto"/>
+        <w:rPr>
+          <w:rFonts w:ascii="Arial" w:eastAsia="Times New Roman" w:hAnsi="Arial" w:cs="Arial"/>
+          <w:sz w:val="24"/>
+          <w:szCs w:val="24"/>
+          <w:lang w:eastAsia="es-GT"/>
+        </w:rPr>
+      </w:pPr>
+    </w:p>
+    <w:p>
+      <w:pPr>
+        <w:spacing w:before="100" w:beforeAutospacing="1" w:after="100" w:afterAutospacing="1" w:line="240" w:lineRule="auto"/>
+        <w:rPr>
+          <w:rFonts w:ascii="Arial" w:eastAsia="Times New Roman" w:hAnsi="Arial" w:cs="Arial"/>
+          <w:sz w:val="24"/>
+          <w:szCs w:val="24"/>
+          <w:lang w:eastAsia="es-GT"/>
+        </w:rPr>
+      </w:pPr>
+    </w:p>
+    <w:p>
+      <w:pPr>
+        <w:spacing w:before="100" w:beforeAutospacing="1" w:after="100" w:afterAutospacing="1" w:line="240" w:lineRule="auto"/>
+        <w:rPr>
+          <w:rFonts w:ascii="Arial" w:eastAsia="Times New Roman" w:hAnsi="Arial" w:cs="Arial"/>
+          <w:sz w:val="24"/>
+          <w:szCs w:val="24"/>
+          <w:lang w:eastAsia="es-GT"/>
+        </w:rPr>
+      </w:pPr>
+    </w:p>
+    <w:p>
+      <w:pPr>
+        <w:spacing w:before="100" w:beforeAutospacing="1" w:after="100" w:afterAutospacing="1" w:line="240" w:lineRule="auto"/>
+        <w:rPr>
+          <w:rFonts w:ascii="Arial" w:eastAsia="Times New Roman" w:hAnsi="Arial" w:cs="Arial"/>
+          <w:sz w:val="24"/>
+          <w:szCs w:val="24"/>
+          <w:lang w:eastAsia="es-GT"/>
+        </w:rPr>
+      </w:pPr>
+    </w:p>
+    <w:p>
+      <w:pPr>
+        <w:spacing w:before="100" w:beforeAutospacing="1" w:after="100" w:afterAutospacing="1" w:line="240" w:lineRule="auto"/>
+        <w:rPr>
+          <w:rFonts w:ascii="Arial" w:eastAsia="Times New Roman" w:hAnsi="Arial" w:cs="Arial"/>
+          <w:sz w:val="24"/>
+          <w:szCs w:val="24"/>
+          <w:lang w:eastAsia="es-GT"/>
+        </w:rPr>
+      </w:pPr>
+    </w:p>
+    <w:p>
+      <w:pPr>
+        <w:spacing w:before="100" w:beforeAutospacing="1" w:after="100" w:afterAutospacing="1" w:line="240" w:lineRule="auto"/>
+        <w:rPr>
+          <w:rFonts w:ascii="Arial" w:eastAsia="Times New Roman" w:hAnsi="Arial" w:cs="Arial"/>
+          <w:sz w:val="24"/>
+          <w:szCs w:val="24"/>
+          <w:lang w:eastAsia="es-GT"/>
+        </w:rPr>
+      </w:pPr>
+    </w:p>
+    <w:p>
+      <w:pPr>
+        <w:spacing w:before="100" w:beforeAutospacing="1" w:after="100" w:afterAutospacing="1" w:line="240" w:lineRule="auto"/>
+        <w:rPr>
+          <w:rFonts w:ascii="Arial" w:eastAsia="Times New Roman" w:hAnsi="Arial" w:cs="Arial"/>
+          <w:sz w:val="24"/>
+          <w:szCs w:val="24"/>
+          <w:lang w:eastAsia="es-GT"/>
+        </w:rPr>
+      </w:pPr>
+    </w:p>
+    <w:p>
+      <w:pPr>
+        <w:spacing w:before="100" w:beforeAutospacing="1" w:after="100" w:afterAutospacing="1" w:line="240" w:lineRule="auto"/>
+        <w:rPr>
+          <w:rFonts w:ascii="Arial" w:eastAsia="Times New Roman" w:hAnsi="Arial" w:cs="Arial"/>
+          <w:sz w:val="24"/>
+          <w:szCs w:val="24"/>
+          <w:lang w:eastAsia="es-GT"/>
+        </w:rPr>
+      </w:pPr>
+    </w:p>
+    <w:p>
+      <w:pPr>
+        <w:spacing w:before="100" w:beforeAutospacing="1" w:after="100" w:afterAutospacing="1" w:line="240" w:lineRule="auto"/>
+        <w:rPr>
+          <w:rFonts w:ascii="Arial" w:eastAsia="Times New Roman" w:hAnsi="Arial" w:cs="Arial"/>
+          <w:sz w:val="24"/>
+          <w:szCs w:val="24"/>
+          <w:lang w:eastAsia="es-GT"/>
+        </w:rPr>
+      </w:pPr>
+    </w:p>
+    <w:p>
+      <w:pPr>
+        <w:spacing w:before="100" w:beforeAutospacing="1" w:after="100" w:afterAutospacing="1" w:line="240" w:lineRule="auto"/>
+        <w:rPr>
+          <w:rFonts w:ascii="Arial" w:eastAsia="Times New Roman" w:hAnsi="Arial" w:cs="Arial"/>
+          <w:sz w:val="24"/>
+          <w:szCs w:val="24"/>
+          <w:lang w:eastAsia="es-GT"/>
+        </w:rPr>
+      </w:pPr>
+    </w:p>
+    <w:p>
+      <w:pPr>
+        <w:spacing w:before="100" w:beforeAutospacing="1" w:after="100" w:afterAutospacing="1" w:line="240" w:lineRule="auto"/>
+        <w:rPr>
+          <w:rFonts w:ascii="Arial" w:eastAsia="Times New Roman" w:hAnsi="Arial" w:cs="Arial"/>
+          <w:sz w:val="24"/>
+          <w:szCs w:val="24"/>
+          <w:lang w:eastAsia="es-GT"/>
+        </w:rPr>
+      </w:pPr>
+    </w:p>
+    <w:p>
+      <w:pPr>
+        <w:spacing w:before="100" w:beforeAutospacing="1" w:after="100" w:afterAutospacing="1" w:line="240" w:lineRule="auto"/>
+        <w:rPr>
+          <w:rFonts w:ascii="Arial" w:eastAsia="Times New Roman" w:hAnsi="Arial" w:cs="Arial"/>
+          <w:sz w:val="24"/>
+          <w:szCs w:val="24"/>
+          <w:lang w:eastAsia="es-GT"/>
+        </w:rPr>
+      </w:pPr>
+    </w:p>
+    <w:p>
+      <w:pPr>
+        <w:spacing w:before="100" w:beforeAutospacing="1" w:after="100" w:afterAutospacing="1" w:line="240" w:lineRule="auto"/>
+        <w:rPr>
+          <w:rFonts w:ascii="Arial" w:eastAsia="Times New Roman" w:hAnsi="Arial" w:cs="Arial"/>
+          <w:sz w:val="24"/>
+          <w:szCs w:val="24"/>
+          <w:lang w:eastAsia="es-GT"/>
+        </w:rPr>
+      </w:pPr>
+    </w:p>
+    <w:p>
+      <w:pPr>
+        <w:spacing w:before="100" w:beforeAutospacing="1" w:after="100" w:afterAutospacing="1" w:line="240" w:lineRule="auto"/>
+        <w:rPr>
+          <w:rFonts w:ascii="Arial" w:eastAsia="Times New Roman" w:hAnsi="Arial" w:cs="Arial"/>
+          <w:sz w:val="24"/>
+          <w:szCs w:val="24"/>
+          <w:lang w:eastAsia="es-GT"/>
+        </w:rPr>
+      </w:pPr>
+    </w:p>
+    <w:p>
+      <w:pPr>
+        <w:spacing w:before="100" w:beforeAutospacing="1" w:after="100" w:afterAutospacing="1" w:line="240" w:lineRule="auto"/>
+        <w:rPr>
+          <w:rFonts w:ascii="Arial" w:eastAsia="Times New Roman" w:hAnsi="Arial" w:cs="Arial"/>
+          <w:sz w:val="24"/>
+          <w:szCs w:val="24"/>
+          <w:lang w:eastAsia="es-GT"/>
+        </w:rPr>
+      </w:pPr>
+    </w:p>
+    <w:p>
+      <w:pPr>
+        <w:spacing w:before="100" w:beforeAutospacing="1" w:after="100" w:afterAutospacing="1" w:line="240" w:lineRule="auto"/>
+        <w:rPr>
+          <w:rFonts w:ascii="Arial" w:eastAsia="Times New Roman" w:hAnsi="Arial" w:cs="Arial"/>
+          <w:sz w:val="24"/>
+          <w:szCs w:val="24"/>
+          <w:lang w:eastAsia="es-GT"/>
+        </w:rPr>
+      </w:pPr>
+    </w:p>
+    <w:p>
+      <w:pPr>
+        <w:spacing w:before="100" w:beforeAutospacing="1" w:after="100" w:afterAutospacing="1" w:line="240" w:lineRule="auto"/>
+        <w:rPr>
+          <w:rFonts w:ascii="Arial" w:eastAsia="Times New Roman" w:hAnsi="Arial" w:cs="Arial"/>
+          <w:sz w:val="24"/>
+          <w:szCs w:val="24"/>
+          <w:lang w:eastAsia="es-GT"/>
+        </w:rPr>
+      </w:pPr>
+    </w:p>
+    <w:p>
+      <w:pPr>
+        <w:spacing w:before="100" w:beforeAutospacing="1" w:after="100" w:afterAutospacing="1" w:line="240" w:lineRule="auto"/>
+        <w:rPr>
+          <w:rFonts w:ascii="Arial" w:eastAsia="Times New Roman" w:hAnsi="Arial" w:cs="Arial"/>
+          <w:sz w:val="24"/>
+          <w:szCs w:val="24"/>
+          <w:lang w:eastAsia="es-GT"/>
+        </w:rPr>
+      </w:pPr>
+    </w:p>
+    <w:p>
+      <w:pPr>
+        <w:spacing w:before="100" w:beforeAutospacing="1" w:after="100" w:afterAutospacing="1" w:line="240" w:lineRule="auto"/>
+        <w:rPr>
+          <w:rFonts w:ascii="Arial" w:eastAsia="Times New Roman" w:hAnsi="Arial" w:cs="Arial"/>
+          <w:sz w:val="24"/>
+          <w:szCs w:val="24"/>
+          <w:lang w:eastAsia="es-GT"/>
+        </w:rPr>
+      </w:pPr>
+    </w:p>
+    <w:p>
+      <w:pPr>
+        <w:spacing w:before="100" w:beforeAutospacing="1" w:after="100" w:afterAutospacing="1" w:line="240" w:lineRule="auto"/>
+        <w:rPr>
+          <w:rFonts w:ascii="Arial" w:eastAsia="Times New Roman" w:hAnsi="Arial" w:cs="Arial"/>
+          <w:sz w:val="24"/>
+          <w:szCs w:val="24"/>
+          <w:lang w:eastAsia="es-GT"/>
+        </w:rPr>
+      </w:pPr>
+    </w:p>
+    <w:p>
+      <w:pPr>
+        <w:spacing w:before="100" w:beforeAutospacing="1" w:after="100" w:afterAutospacing="1" w:line="240" w:lineRule="auto"/>
+        <w:rPr>
+          <w:rFonts w:ascii="Arial" w:eastAsia="Times New Roman" w:hAnsi="Arial" w:cs="Arial"/>
+          <w:sz w:val="24"/>
+          <w:szCs w:val="24"/>
+          <w:lang w:eastAsia="es-GT"/>
+        </w:rPr>
+      </w:pPr>
+    </w:p>
+    <w:p>
+      <w:pPr>
+        <w:spacing w:before="100" w:beforeAutospacing="1" w:after="100" w:afterAutospacing="1" w:line="240" w:lineRule="auto"/>
+        <w:rPr>
+          <w:rFonts w:ascii="Arial" w:eastAsia="Times New Roman" w:hAnsi="Arial" w:cs="Arial"/>
+          <w:sz w:val="24"/>
+          <w:szCs w:val="24"/>
+          <w:lang w:eastAsia="es-GT"/>
+        </w:rPr>
+      </w:pPr>
+    </w:p>
+    <w:p>
+      <w:pPr>
+        <w:spacing w:before="100" w:beforeAutospacing="1" w:after="100" w:afterAutospacing="1" w:line="240" w:lineRule="auto"/>
+        <w:rPr>
+          <w:rFonts w:ascii="Arial" w:eastAsia="Times New Roman" w:hAnsi="Arial" w:cs="Arial"/>
+          <w:sz w:val="24"/>
+          <w:szCs w:val="24"/>
+          <w:lang w:eastAsia="es-GT"/>
+        </w:rPr>
+      </w:pPr>
+    </w:p>
+    <w:p>
+      <w:pPr>
+        <w:spacing w:before="100" w:beforeAutospacing="1" w:after="100" w:afterAutospacing="1" w:line="240" w:lineRule="auto"/>
+        <w:rPr>
+          <w:rFonts w:ascii="Arial" w:eastAsia="Times New Roman" w:hAnsi="Arial" w:cs="Arial"/>
+          <w:sz w:val="24"/>
+          <w:szCs w:val="24"/>
+          <w:lang w:eastAsia="es-GT"/>
+        </w:rPr>
+      </w:pPr>
+    </w:p>
+    <w:p>
+      <w:pPr>
+        <w:spacing w:before="100" w:beforeAutospacing="1" w:after="100" w:afterAutospacing="1" w:line="240" w:lineRule="auto"/>
+        <w:rPr>
+          <w:rFonts w:ascii="Arial" w:eastAsia="Times New Roman" w:hAnsi="Arial" w:cs="Arial"/>
+          <w:sz w:val="24"/>
+          <w:szCs w:val="24"/>
+          <w:lang w:eastAsia="es-GT"/>
+        </w:rPr>
+      </w:pPr>
+    </w:p>
+    <w:p>
+      <w:pPr>
+        <w:spacing w:before="100" w:beforeAutospacing="1" w:after="100" w:afterAutospacing="1" w:line="240" w:lineRule="auto"/>
+        <w:rPr>
+          <w:rFonts w:ascii="Arial" w:eastAsia="Times New Roman" w:hAnsi="Arial" w:cs="Arial"/>
+          <w:sz w:val="24"/>
+          <w:szCs w:val="24"/>
+          <w:lang w:eastAsia="es-GT"/>
+        </w:rPr>
+      </w:pPr>
+    </w:p>
+    <w:p>
+      <w:pPr>
+        <w:spacing w:before="100" w:beforeAutospacing="1" w:after="100" w:afterAutospacing="1" w:line="240" w:lineRule="auto"/>
+        <w:rPr>
+          <w:rFonts w:ascii="Arial" w:eastAsia="Times New Roman" w:hAnsi="Arial" w:cs="Arial"/>
+          <w:sz w:val="24"/>
+          <w:szCs w:val="24"/>
+          <w:lang w:eastAsia="es-GT"/>
+        </w:rPr>
+      </w:pPr>
+    </w:p>
+    <w:p>
+      <w:pPr>
+        <w:spacing w:before="100" w:beforeAutospacing="1" w:after="100" w:afterAutospacing="1" w:line="240" w:lineRule="auto"/>
+        <w:rPr>
+          <w:rFonts w:ascii="Arial" w:eastAsia="Times New Roman" w:hAnsi="Arial" w:cs="Arial"/>
+          <w:sz w:val="24"/>
+          <w:szCs w:val="24"/>
+          <w:lang w:eastAsia="es-GT"/>
+        </w:rPr>
+      </w:pPr>
+    </w:p>
+    <w:p>
+      <w:pPr>
+        <w:spacing w:before="100" w:beforeAutospacing="1" w:after="100" w:afterAutospacing="1" w:line="240" w:lineRule="auto"/>
+        <w:rPr>
+          <w:rFonts w:ascii="Arial" w:eastAsia="Times New Roman" w:hAnsi="Arial" w:cs="Arial"/>
+          <w:sz w:val="24"/>
+          <w:szCs w:val="24"/>
+          <w:lang w:eastAsia="es-GT"/>
+        </w:rPr>
+      </w:pPr>
+    </w:p>
+    <w:p>
+      <w:pPr>
+        <w:spacing w:before="100" w:beforeAutospacing="1" w:after="100" w:afterAutospacing="1" w:line="240" w:lineRule="auto"/>
+        <w:rPr>
+          <w:rFonts w:ascii="Arial" w:eastAsia="Times New Roman" w:hAnsi="Arial" w:cs="Arial"/>
+          <w:sz w:val="24"/>
+          <w:szCs w:val="24"/>
+          <w:lang w:eastAsia="es-GT"/>
+        </w:rPr>
+      </w:pPr>
+    </w:p>
+    <w:p>
+      <w:pPr>
+        <w:spacing w:before="100" w:beforeAutospacing="1" w:after="100" w:afterAutospacing="1" w:line="240" w:lineRule="auto"/>
+        <w:rPr>
+          <w:rFonts w:ascii="Arial" w:eastAsia="Times New Roman" w:hAnsi="Arial" w:cs="Arial"/>
+          <w:sz w:val="24"/>
+          <w:szCs w:val="24"/>
+          <w:lang w:eastAsia="es-GT"/>
+        </w:rPr>
+      </w:pPr>
+    </w:p>
+    <w:p>
+      <w:pPr>
+        <w:spacing w:before="100" w:beforeAutospacing="1" w:after="100" w:afterAutospacing="1" w:line="240" w:lineRule="auto"/>
+        <w:rPr>
+          <w:rFonts w:ascii="Arial" w:eastAsia="Times New Roman" w:hAnsi="Arial" w:cs="Arial"/>
+          <w:sz w:val="24"/>
+          <w:szCs w:val="24"/>
+          <w:lang w:eastAsia="es-GT"/>
+        </w:rPr>
+      </w:pPr>
+    </w:p>
+    <w:p>
+      <w:pPr>
+        <w:spacing w:before="100" w:beforeAutospacing="1" w:after="100" w:afterAutospacing="1" w:line="240" w:lineRule="auto"/>
+        <w:rPr>
+          <w:rFonts w:ascii="Arial" w:eastAsia="Times New Roman" w:hAnsi="Arial" w:cs="Arial"/>
+          <w:sz w:val="24"/>
+          <w:szCs w:val="24"/>
+          <w:lang w:eastAsia="es-GT"/>
+        </w:rPr>
+      </w:pPr>
+    </w:p>
+    <w:p>
+      <w:pPr>
+        <w:spacing w:before="100" w:beforeAutospacing="1" w:after="100" w:afterAutospacing="1" w:line="240" w:lineRule="auto"/>
+        <w:rPr>
+          <w:rFonts w:ascii="Arial" w:eastAsia="Times New Roman" w:hAnsi="Arial" w:cs="Arial"/>
+          <w:sz w:val="24"/>
+          <w:szCs w:val="24"/>
+          <w:lang w:eastAsia="es-GT"/>
+        </w:rPr>
+      </w:pPr>
+    </w:p>
+    <w:p>
+      <w:pPr>
+        <w:spacing w:before="100" w:beforeAutospacing="1" w:after="100" w:afterAutospacing="1" w:line="240" w:lineRule="auto"/>
+        <w:rPr>
+          <w:rFonts w:ascii="Arial" w:eastAsia="Times New Roman" w:hAnsi="Arial" w:cs="Arial"/>
+          <w:sz w:val="24"/>
+          <w:szCs w:val="24"/>
+          <w:lang w:eastAsia="es-GT"/>
+        </w:rPr>
+      </w:pPr>
+    </w:p>
+    <w:p>
+      <w:pPr>
+        <w:spacing w:before="100" w:beforeAutospacing="1" w:after="100" w:afterAutospacing="1" w:line="240" w:lineRule="auto"/>
+        <w:rPr>
+          <w:rFonts w:ascii="Arial" w:eastAsia="Times New Roman" w:hAnsi="Arial" w:cs="Arial"/>
+          <w:sz w:val="24"/>
+          <w:szCs w:val="24"/>
+          <w:lang w:eastAsia="es-GT"/>
+        </w:rPr>
+      </w:pPr>
+    </w:p>
+    <w:p>
+      <w:pPr>
+        <w:spacing w:before="100" w:beforeAutospacing="1" w:after="100" w:afterAutospacing="1" w:line="240" w:lineRule="auto"/>
+        <w:rPr>
+          <w:rFonts w:ascii="Arial" w:eastAsia="Times New Roman" w:hAnsi="Arial" w:cs="Arial"/>
+          <w:sz w:val="24"/>
+          <w:szCs w:val="24"/>
+          <w:lang w:eastAsia="es-GT"/>
+        </w:rPr>
+      </w:pPr>
+    </w:p>
+    <w:p>
+      <w:pPr>
+        <w:spacing w:before="100" w:beforeAutospacing="1" w:after="100" w:afterAutospacing="1" w:line="240" w:lineRule="auto"/>
+        <w:rPr>
+          <w:rFonts w:ascii="Arial" w:eastAsia="Times New Roman" w:hAnsi="Arial" w:cs="Arial"/>
+          <w:sz w:val="24"/>
+          <w:szCs w:val="24"/>
+          <w:lang w:eastAsia="es-GT"/>
+        </w:rPr>
+      </w:pPr>
+    </w:p>
+    <w:p>
+      <w:pPr>
+        <w:spacing w:before="100" w:beforeAutospacing="1" w:after="100" w:afterAutospacing="1" w:line="240" w:lineRule="auto"/>
+        <w:rPr>
+          <w:rFonts w:ascii="Arial" w:eastAsia="Times New Roman" w:hAnsi="Arial" w:cs="Arial"/>
+          <w:sz w:val="24"/>
+          <w:szCs w:val="24"/>
+          <w:lang w:eastAsia="es-GT"/>
+        </w:rPr>
+      </w:pPr>
+    </w:p>
+    <w:p>
+      <w:pPr>
+        <w:spacing w:before="100" w:beforeAutospacing="1" w:after="100" w:afterAutospacing="1" w:line="240" w:lineRule="auto"/>
+        <w:rPr>
+          <w:rFonts w:ascii="Arial" w:eastAsia="Times New Roman" w:hAnsi="Arial" w:cs="Arial"/>
+          <w:sz w:val="24"/>
+          <w:szCs w:val="24"/>
+          <w:lang w:eastAsia="es-GT"/>
+        </w:rPr>
+      </w:pPr>
+    </w:p>
+    <w:p>
+      <w:pPr>
+        <w:spacing w:before="100" w:beforeAutospacing="1" w:after="100" w:afterAutospacing="1" w:line="240" w:lineRule="auto"/>
+        <w:rPr>
+          <w:rFonts w:ascii="Arial" w:eastAsia="Times New Roman" w:hAnsi="Arial" w:cs="Arial"/>
+          <w:sz w:val="24"/>
+          <w:szCs w:val="24"/>
+          <w:lang w:eastAsia="es-GT"/>
+        </w:rPr>
+      </w:pPr>
+    </w:p>
+    <w:p>
+      <w:pPr>
+        <w:spacing w:before="100" w:beforeAutospacing="1" w:after="100" w:afterAutospacing="1" w:line="240" w:lineRule="auto"/>
+        <w:rPr>
+          <w:rFonts w:ascii="Arial" w:eastAsia="Times New Roman" w:hAnsi="Arial" w:cs="Arial"/>
+          <w:sz w:val="24"/>
+          <w:szCs w:val="24"/>
+          <w:lang w:eastAsia="es-GT"/>
+        </w:rPr>
+      </w:pPr>
+    </w:p>
+    <w:p>
+      <w:pPr>
+        <w:spacing w:before="100" w:beforeAutospacing="1" w:after="100" w:afterAutospacing="1" w:line="240" w:lineRule="auto"/>
+        <w:rPr>
+          <w:rFonts w:ascii="Arial" w:eastAsia="Times New Roman" w:hAnsi="Arial" w:cs="Arial"/>
+          <w:sz w:val="24"/>
+          <w:szCs w:val="24"/>
+          <w:lang w:eastAsia="es-GT"/>
+        </w:rPr>
+      </w:pPr>
+    </w:p>
+    <w:p>
+      <w:pPr>
+        <w:spacing w:before="100" w:beforeAutospacing="1" w:after="100" w:afterAutospacing="1" w:line="240" w:lineRule="auto"/>
+        <w:rPr>
+          <w:rFonts w:ascii="Arial" w:eastAsia="Times New Roman" w:hAnsi="Arial" w:cs="Arial"/>
+          <w:sz w:val="24"/>
+          <w:szCs w:val="24"/>
+          <w:lang w:eastAsia="es-GT"/>
+        </w:rPr>
+      </w:pPr>
+    </w:p>
+    <w:p>
+      <w:pPr>
+        <w:spacing w:before="100" w:beforeAutospacing="1" w:after="100" w:afterAutospacing="1" w:line="240" w:lineRule="auto"/>
+        <w:rPr>
+          <w:rFonts w:ascii="Arial" w:eastAsia="Times New Roman" w:hAnsi="Arial" w:cs="Arial"/>
+          <w:sz w:val="24"/>
+          <w:szCs w:val="24"/>
+          <w:lang w:eastAsia="es-GT"/>
+        </w:rPr>
+      </w:pPr>
+    </w:p>
+    <w:p>
+      <w:pPr>
+        <w:spacing w:before="100" w:beforeAutospacing="1" w:after="100" w:afterAutospacing="1" w:line="240" w:lineRule="auto"/>
+        <w:rPr>
+          <w:rFonts w:ascii="Arial" w:eastAsia="Times New Roman" w:hAnsi="Arial" w:cs="Arial"/>
+          <w:sz w:val="24"/>
+          <w:szCs w:val="24"/>
+          <w:lang w:eastAsia="es-GT"/>
+        </w:rPr>
+      </w:pPr>
+    </w:p>
+    <w:p>
+      <w:pPr>
+        <w:spacing w:before="100" w:beforeAutospacing="1" w:after="100" w:afterAutospacing="1" w:line="240" w:lineRule="auto"/>
+        <w:rPr>
+          <w:rFonts w:ascii="Arial" w:eastAsia="Times New Roman" w:hAnsi="Arial" w:cs="Arial"/>
+          <w:sz w:val="24"/>
+          <w:szCs w:val="24"/>
+          <w:lang w:eastAsia="es-GT"/>
+        </w:rPr>
+      </w:pPr>
+    </w:p>
+    <w:p>
+      <w:pPr>
+        <w:spacing w:before="100" w:beforeAutospacing="1" w:after="100" w:afterAutospacing="1" w:line="240" w:lineRule="auto"/>
+        <w:rPr>
+          <w:rFonts w:ascii="Arial" w:eastAsia="Times New Roman" w:hAnsi="Arial" w:cs="Arial"/>
+          <w:sz w:val="24"/>
+          <w:szCs w:val="24"/>
+          <w:lang w:eastAsia="es-GT"/>
+        </w:rPr>
+      </w:pPr>
+    </w:p>
+    <w:p>
+      <w:pPr>
+        <w:spacing w:before="100" w:beforeAutospacing="1" w:after="100" w:afterAutospacing="1" w:line="240" w:lineRule="auto"/>
+        <w:rPr>
+          <w:rFonts w:ascii="Arial" w:eastAsia="Times New Roman" w:hAnsi="Arial" w:cs="Arial"/>
+          <w:sz w:val="24"/>
+          <w:szCs w:val="24"/>
+          <w:lang w:eastAsia="es-GT"/>
+        </w:rPr>
+      </w:pPr>
+    </w:p>
+    <w:p>
+      <w:pPr>
+        <w:spacing w:before="100" w:beforeAutospacing="1" w:after="100" w:afterAutospacing="1" w:line="240" w:lineRule="auto"/>
+        <w:rPr>
+          <w:rFonts w:ascii="Arial" w:eastAsia="Times New Roman" w:hAnsi="Arial" w:cs="Arial"/>
+          <w:sz w:val="24"/>
+          <w:szCs w:val="24"/>
+          <w:lang w:eastAsia="es-GT"/>
+        </w:rPr>
+      </w:pPr>
+    </w:p>
+    <w:p>
+      <w:pPr>
+        <w:spacing w:before="100" w:beforeAutospacing="1" w:after="100" w:afterAutospacing="1" w:line="240" w:lineRule="auto"/>
+        <w:rPr>
+          <w:rFonts w:ascii="Arial" w:eastAsia="Times New Roman" w:hAnsi="Arial" w:cs="Arial"/>
+          <w:sz w:val="24"/>
+          <w:szCs w:val="24"/>
+          <w:lang w:eastAsia="es-GT"/>
+        </w:rPr>
+      </w:pPr>
+    </w:p>
+    <w:p>
+      <w:pPr>
+        <w:spacing w:before="100" w:beforeAutospacing="1" w:after="100" w:afterAutospacing="1" w:line="240" w:lineRule="auto"/>
+        <w:rPr>
+          <w:rFonts w:ascii="Arial" w:eastAsia="Times New Roman" w:hAnsi="Arial" w:cs="Arial"/>
+          <w:sz w:val="24"/>
+          <w:szCs w:val="24"/>
+          <w:lang w:eastAsia="es-GT"/>
+        </w:rPr>
+      </w:pPr>
+    </w:p>
+    <w:p>
+      <w:pPr>
+        <w:spacing w:before="100" w:beforeAutospacing="1" w:after="100" w:afterAutospacing="1" w:line="240" w:lineRule="auto"/>
+        <w:rPr>
+          <w:rFonts w:ascii="Arial" w:eastAsia="Times New Roman" w:hAnsi="Arial" w:cs="Arial"/>
+          <w:sz w:val="24"/>
+          <w:szCs w:val="24"/>
+          <w:lang w:eastAsia="es-GT"/>
+        </w:rPr>
+      </w:pPr>
+    </w:p>
+    <w:p>
+      <w:pPr>
+        <w:spacing w:before="100" w:beforeAutospacing="1" w:after="100" w:afterAutospacing="1" w:line="240" w:lineRule="auto"/>
+        <w:rPr>
+          <w:rFonts w:ascii="Arial" w:eastAsia="Times New Roman" w:hAnsi="Arial" w:cs="Arial"/>
+          <w:sz w:val="24"/>
+          <w:szCs w:val="24"/>
+          <w:lang w:eastAsia="es-GT"/>
+        </w:rPr>
+      </w:pPr>
+    </w:p>
+    <w:p>
+      <w:pPr>
+        <w:spacing w:before="100" w:beforeAutospacing="1" w:after="100" w:afterAutospacing="1" w:line="240" w:lineRule="auto"/>
+        <w:rPr>
+          <w:rFonts w:ascii="Arial" w:eastAsia="Times New Roman" w:hAnsi="Arial" w:cs="Arial"/>
+          <w:sz w:val="24"/>
+          <w:szCs w:val="24"/>
+          <w:lang w:eastAsia="es-GT"/>
+        </w:rPr>
+      </w:pPr>
+    </w:p>
+    <w:p>
+      <w:pPr>
+        <w:spacing w:before="100" w:beforeAutospacing="1" w:after="100" w:afterAutospacing="1" w:line="240" w:lineRule="auto"/>
+        <w:rPr>
+          <w:rFonts w:ascii="Arial" w:eastAsia="Times New Roman" w:hAnsi="Arial" w:cs="Arial"/>
+          <w:sz w:val="24"/>
+          <w:szCs w:val="24"/>
+          <w:lang w:eastAsia="es-GT"/>
+        </w:rPr>
+      </w:pPr>
+    </w:p>
+    <w:p>
+      <w:pPr>
+        <w:spacing w:before="100" w:beforeAutospacing="1" w:after="100" w:afterAutospacing="1" w:line="240" w:lineRule="auto"/>
+        <w:rPr>
+          <w:rFonts w:ascii="Arial" w:eastAsia="Times New Roman" w:hAnsi="Arial" w:cs="Arial"/>
+          <w:sz w:val="24"/>
+          <w:szCs w:val="24"/>
+          <w:lang w:eastAsia="es-GT"/>
+        </w:rPr>
+      </w:pPr>
+    </w:p>
+    <w:p>
+      <w:pPr>
+        <w:spacing w:before="100" w:beforeAutospacing="1" w:after="100" w:afterAutospacing="1" w:line="240" w:lineRule="auto"/>
+        <w:rPr>
+          <w:rFonts w:ascii="Arial" w:eastAsia="Times New Roman" w:hAnsi="Arial" w:cs="Arial"/>
+          <w:sz w:val="24"/>
+          <w:szCs w:val="24"/>
+          <w:lang w:eastAsia="es-GT"/>
+        </w:rPr>
+      </w:pPr>
+    </w:p>
+    <w:p>
+      <w:pPr>
+        <w:spacing w:before="100" w:beforeAutospacing="1" w:after="100" w:afterAutospacing="1" w:line="240" w:lineRule="auto"/>
+        <w:rPr>
+          <w:rFonts w:ascii="Arial" w:eastAsia="Times New Roman" w:hAnsi="Arial" w:cs="Arial"/>
+          <w:sz w:val="24"/>
+          <w:szCs w:val="24"/>
+          <w:lang w:eastAsia="es-GT"/>
+        </w:rPr>
+      </w:pPr>
+    </w:p>
+    <w:p>
+      <w:pPr>
+        <w:spacing w:before="100" w:beforeAutospacing="1" w:after="100" w:afterAutospacing="1" w:line="240" w:lineRule="auto"/>
+        <w:rPr>
+          <w:rFonts w:ascii="Arial" w:eastAsia="Times New Roman" w:hAnsi="Arial" w:cs="Arial"/>
+          <w:sz w:val="24"/>
+          <w:szCs w:val="24"/>
+          <w:lang w:eastAsia="es-GT"/>
+        </w:rPr>
+      </w:pPr>
+    </w:p>
+    <w:p>
+      <w:pPr>
+        <w:spacing w:before="100" w:beforeAutospacing="1" w:after="100" w:afterAutospacing="1" w:line="240" w:lineRule="auto"/>
+        <w:rPr>
+          <w:rFonts w:ascii="Arial" w:eastAsia="Times New Roman" w:hAnsi="Arial" w:cs="Arial"/>
+          <w:sz w:val="24"/>
+          <w:szCs w:val="24"/>
+          <w:lang w:eastAsia="es-GT"/>
+        </w:rPr>
+      </w:pPr>
+    </w:p>
+    <w:p>
+      <w:pPr>
+        <w:spacing w:before="100" w:beforeAutospacing="1" w:after="100" w:afterAutospacing="1" w:line="240" w:lineRule="auto"/>
+        <w:rPr>
+          <w:rFonts w:ascii="Arial" w:eastAsia="Times New Roman" w:hAnsi="Arial" w:cs="Arial"/>
+          <w:sz w:val="24"/>
+          <w:szCs w:val="24"/>
+          <w:lang w:eastAsia="es-GT"/>
+        </w:rPr>
+      </w:pPr>
+    </w:p>
+    <w:p>
+      <w:pPr>
+        <w:spacing w:before="100" w:beforeAutospacing="1" w:after="100" w:afterAutospacing="1" w:line="240" w:lineRule="auto"/>
+        <w:rPr>
+          <w:rFonts w:ascii="Arial" w:eastAsia="Times New Roman" w:hAnsi="Arial" w:cs="Arial"/>
+          <w:sz w:val="24"/>
+          <w:szCs w:val="24"/>
+          <w:lang w:eastAsia="es-GT"/>
+        </w:rPr>
+      </w:pPr>
+    </w:p>
+    <w:p>
+      <w:pPr>
+        <w:spacing w:before="100" w:beforeAutospacing="1" w:after="100" w:afterAutospacing="1" w:line="240" w:lineRule="auto"/>
+        <w:rPr>
+          <w:rFonts w:ascii="Arial" w:eastAsia="Times New Roman" w:hAnsi="Arial" w:cs="Arial"/>
+          <w:sz w:val="24"/>
+          <w:szCs w:val="24"/>
+          <w:lang w:eastAsia="es-GT"/>
+        </w:rPr>
+      </w:pPr>
+    </w:p>
+    <w:p>
+      <w:pPr>
+        <w:spacing w:before="100" w:beforeAutospacing="1" w:after="100" w:afterAutospacing="1" w:line="240" w:lineRule="auto"/>
+        <w:rPr>
+          <w:rFonts w:ascii="Arial" w:eastAsia="Times New Roman" w:hAnsi="Arial" w:cs="Arial"/>
+          <w:sz w:val="24"/>
+          <w:szCs w:val="24"/>
+          <w:lang w:eastAsia="es-GT"/>
+        </w:rPr>
+      </w:pPr>
+    </w:p>
+    <w:p>
+      <w:pPr>
+        <w:spacing w:before="100" w:beforeAutospacing="1" w:after="100" w:afterAutospacing="1" w:line="240" w:lineRule="auto"/>
+        <w:rPr>
+          <w:rFonts w:ascii="Arial" w:eastAsia="Times New Roman" w:hAnsi="Arial" w:cs="Arial"/>
+          <w:sz w:val="24"/>
+          <w:szCs w:val="24"/>
+          <w:lang w:eastAsia="es-GT"/>
+        </w:rPr>
+      </w:pPr>
+    </w:p>
+    <w:p>
+      <w:pPr>
+        <w:spacing w:before="100" w:beforeAutospacing="1" w:after="100" w:afterAutospacing="1" w:line="240" w:lineRule="auto"/>
+        <w:rPr>
+          <w:rFonts w:ascii="Arial" w:eastAsia="Times New Roman" w:hAnsi="Arial" w:cs="Arial"/>
+          <w:sz w:val="24"/>
+          <w:szCs w:val="24"/>
+          <w:lang w:eastAsia="es-GT"/>
+        </w:rPr>
+      </w:pPr>
+    </w:p>
+    <w:p>
+      <w:pPr>
+        <w:spacing w:before="100" w:beforeAutospacing="1" w:after="100" w:afterAutospacing="1" w:line="240" w:lineRule="auto"/>
+        <w:rPr>
+          <w:rFonts w:ascii="Arial" w:eastAsia="Times New Roman" w:hAnsi="Arial" w:cs="Arial"/>
+          <w:sz w:val="24"/>
+          <w:szCs w:val="24"/>
+          <w:lang w:eastAsia="es-GT"/>
+        </w:rPr>
+      </w:pPr>
+    </w:p>
+    <w:p>
+      <w:pPr>
+        <w:spacing w:before="100" w:beforeAutospacing="1" w:after="100" w:afterAutospacing="1" w:line="240" w:lineRule="auto"/>
+        <w:rPr>
+          <w:rFonts w:ascii="Arial" w:eastAsia="Times New Roman" w:hAnsi="Arial" w:cs="Arial"/>
+          <w:sz w:val="24"/>
+          <w:szCs w:val="24"/>
+          <w:lang w:eastAsia="es-GT"/>
+        </w:rPr>
+      </w:pPr>
+    </w:p>
+    <w:p>
+      <w:pPr>
+        <w:spacing w:before="100" w:beforeAutospacing="1" w:after="100" w:afterAutospacing="1" w:line="240" w:lineRule="auto"/>
+        <w:rPr>
+          <w:rFonts w:ascii="Arial" w:eastAsia="Times New Roman" w:hAnsi="Arial" w:cs="Arial"/>
+          <w:sz w:val="24"/>
+          <w:szCs w:val="24"/>
+          <w:lang w:eastAsia="es-GT"/>
+        </w:rPr>
+      </w:pPr>
+    </w:p>
+    <w:p>
+      <w:pPr>
+        <w:spacing w:before="100" w:beforeAutospacing="1" w:after="100" w:afterAutospacing="1" w:line="240" w:lineRule="auto"/>
+        <w:rPr>
+          <w:rFonts w:ascii="Arial" w:eastAsia="Times New Roman" w:hAnsi="Arial" w:cs="Arial"/>
+          <w:sz w:val="24"/>
+          <w:szCs w:val="24"/>
+          <w:lang w:eastAsia="es-GT"/>
+        </w:rPr>
+      </w:pPr>
+    </w:p>
+    <w:p>
+      <w:pPr>
+        <w:spacing w:before="100" w:beforeAutospacing="1" w:after="100" w:afterAutospacing="1" w:line="240" w:lineRule="auto"/>
+        <w:rPr>
+          <w:rFonts w:ascii="Arial" w:eastAsia="Times New Roman" w:hAnsi="Arial" w:cs="Arial"/>
+          <w:sz w:val="24"/>
+          <w:szCs w:val="24"/>
+          <w:lang w:eastAsia="es-GT"/>
+        </w:rPr>
+      </w:pPr>
+    </w:p>
+    <w:p>
+      <w:pPr>
+        <w:spacing w:before="100" w:beforeAutospacing="1" w:after="100" w:afterAutospacing="1" w:line="240" w:lineRule="auto"/>
+        <w:rPr>
+          <w:rFonts w:ascii="Arial" w:eastAsia="Times New Roman" w:hAnsi="Arial" w:cs="Arial"/>
+          <w:sz w:val="24"/>
+          <w:szCs w:val="24"/>
+          <w:lang w:eastAsia="es-GT"/>
+        </w:rPr>
+      </w:pPr>
+    </w:p>
+    <w:p>
+      <w:pPr>
+        <w:spacing w:before="100" w:beforeAutospacing="1" w:after="100" w:afterAutospacing="1" w:line="240" w:lineRule="auto"/>
+        <w:rPr>
+          <w:rFonts w:ascii="Arial" w:eastAsia="Times New Roman" w:hAnsi="Arial" w:cs="Arial"/>
+          <w:sz w:val="24"/>
+          <w:szCs w:val="24"/>
+          <w:lang w:eastAsia="es-GT"/>
+        </w:rPr>
+      </w:pPr>
+    </w:p>
+    <w:p>
+      <w:pPr>
+        <w:spacing w:before="100" w:beforeAutospacing="1" w:after="100" w:afterAutospacing="1" w:line="240" w:lineRule="auto"/>
+        <w:rPr>
+          <w:rFonts w:ascii="Arial" w:eastAsia="Times New Roman" w:hAnsi="Arial" w:cs="Arial"/>
+          <w:sz w:val="24"/>
+          <w:szCs w:val="24"/>
+          <w:lang w:eastAsia="es-GT"/>
+        </w:rPr>
+      </w:pPr>
+    </w:p>
+    <w:p>
+      <w:pPr>
+        <w:spacing w:before="100" w:beforeAutospacing="1" w:after="100" w:afterAutospacing="1" w:line="240" w:lineRule="auto"/>
+        <w:rPr>
+          <w:rFonts w:ascii="Arial" w:eastAsia="Times New Roman" w:hAnsi="Arial" w:cs="Arial"/>
+          <w:sz w:val="24"/>
+          <w:szCs w:val="24"/>
+          <w:lang w:eastAsia="es-GT"/>
+        </w:rPr>
+      </w:pPr>
+    </w:p>
+    <w:p>
+      <w:pPr>
+        <w:spacing w:before="100" w:beforeAutospacing="1" w:after="100" w:afterAutospacing="1" w:line="240" w:lineRule="auto"/>
+        <w:rPr>
+          <w:rFonts w:ascii="Arial" w:eastAsia="Times New Roman" w:hAnsi="Arial" w:cs="Arial"/>
+          <w:sz w:val="24"/>
+          <w:szCs w:val="24"/>
+          <w:lang w:eastAsia="es-GT"/>
+        </w:rPr>
+      </w:pPr>
+    </w:p>
+    <w:p>
+      <w:pPr>
+        <w:spacing w:before="100" w:beforeAutospacing="1" w:after="100" w:afterAutospacing="1" w:line="240" w:lineRule="auto"/>
+        <w:rPr>
+          <w:rFonts w:ascii="Arial" w:eastAsia="Times New Roman" w:hAnsi="Arial" w:cs="Arial"/>
+          <w:sz w:val="24"/>
+          <w:szCs w:val="24"/>
+          <w:lang w:eastAsia="es-GT"/>
+        </w:rPr>
+      </w:pPr>
+    </w:p>
+    <w:p>
+      <w:pPr>
+        <w:spacing w:before="100" w:beforeAutospacing="1" w:after="100" w:afterAutospacing="1" w:line="240" w:lineRule="auto"/>
+        <w:rPr>
+          <w:rFonts w:ascii="Arial" w:eastAsia="Times New Roman" w:hAnsi="Arial" w:cs="Arial"/>
+          <w:sz w:val="24"/>
+          <w:szCs w:val="24"/>
+          <w:lang w:eastAsia="es-GT"/>
+        </w:rPr>
+      </w:pPr>
+    </w:p>
+    <w:p>
+      <w:pPr>
+        <w:spacing w:before="100" w:beforeAutospacing="1" w:after="100" w:afterAutospacing="1" w:line="240" w:lineRule="auto"/>
+        <w:rPr>
+          <w:rFonts w:ascii="Arial" w:eastAsia="Times New Roman" w:hAnsi="Arial" w:cs="Arial"/>
+          <w:sz w:val="24"/>
+          <w:szCs w:val="24"/>
+          <w:lang w:eastAsia="es-GT"/>
+        </w:rPr>
+      </w:pPr>
+    </w:p>
+    <w:p>
+      <w:pPr>
+        <w:spacing w:before="100" w:beforeAutospacing="1" w:after="100" w:afterAutospacing="1" w:line="240" w:lineRule="auto"/>
+        <w:rPr>
+          <w:rFonts w:ascii="Arial" w:eastAsia="Times New Roman" w:hAnsi="Arial" w:cs="Arial"/>
+          <w:sz w:val="24"/>
+          <w:szCs w:val="24"/>
+          <w:lang w:eastAsia="es-GT"/>
+        </w:rPr>
+      </w:pPr>
+    </w:p>
+    <w:p>
+      <w:pPr>
+        <w:spacing w:before="100" w:beforeAutospacing="1" w:after="100" w:afterAutospacing="1" w:line="240" w:lineRule="auto"/>
+        <w:rPr>
+          <w:rFonts w:ascii="Arial" w:eastAsia="Times New Roman" w:hAnsi="Arial" w:cs="Arial"/>
+          <w:sz w:val="24"/>
+          <w:szCs w:val="24"/>
+          <w:lang w:eastAsia="es-GT"/>
+        </w:rPr>
+      </w:pPr>
+    </w:p>
+    <w:p>
+      <w:pPr>
+        <w:rPr>
+          <w:rFonts w:ascii="Arial" w:eastAsiaTheme="minorHAnsi" w:hAnsi="Arial" w:cs="Arial"/>
+          <w:bCs/>
+          <w:u w:val="single"/>
+        </w:rPr>
+      </w:pPr>
     </w:p>
     <w:sectPr>
       <w:pgSz w:w="12240" w:h="15840"/>
@@ -1170,7 +4957,7 @@
     <w:rPrDefault>
       <w:rPr>
         <w:rFonts w:asciiTheme="minorHAnsi" w:eastAsiaTheme="minorHAnsi" w:hAnsiTheme="minorHAnsi" w:cstheme="minorBidi"/>
-        <w:lang w:val="es-MX" w:eastAsia="es-MX" w:bidi="ar-SA"/>
+        <w:lang w:val="en-US" w:eastAsia="en-US" w:bidi="ar-SA"/>
       </w:rPr>
     </w:rPrDefault>
     <w:pPrDefault/>
@@ -1332,7 +5119,7 @@
     <w:lsdException w:name="Balloon Text" w:semiHidden="1" w:unhideWhenUsed="1" w:qFormat="1"/>
     <w:lsdException w:name="Table Grid" w:uiPriority="39" w:qFormat="1"/>
     <w:lsdException w:name="Table Theme" w:semiHidden="1" w:unhideWhenUsed="1"/>
-    <w:lsdException w:name="Placeholder Text" w:semiHidden="1" w:unhideWhenUsed="1"/>
+    <w:lsdException w:name="Placeholder Text" w:semiHidden="1"/>
     <w:lsdException w:name="No Spacing" w:uiPriority="1" w:qFormat="1"/>
     <w:lsdException w:name="Light Shading"/>
     <w:lsdException w:name="Light List"/>
@@ -1354,10 +5141,7 @@
     <w:lsdException w:name="Medium Shading 1 Accent 1"/>
     <w:lsdException w:name="Medium Shading 2 Accent 1"/>
     <w:lsdException w:name="Medium List 1 Accent 1"/>
-    <w:lsdException w:name="Revision" w:semiHidden="1" w:unhideWhenUsed="1"/>
-    <w:lsdException w:name="List Paragraph" w:semiHidden="1" w:unhideWhenUsed="1"/>
-    <w:lsdException w:name="Quote" w:semiHidden="1" w:unhideWhenUsed="1"/>
-    <w:lsdException w:name="Intense Quote" w:semiHidden="1" w:unhideWhenUsed="1"/>
+    <w:lsdException w:name="Revision" w:semiHidden="1"/>
     <w:lsdException w:name="Medium List 2 Accent 1"/>
     <w:lsdException w:name="Medium Grid 1 Accent 1"/>
     <w:lsdException w:name="Medium Grid 2 Accent 1"/>
@@ -1563,7 +5347,7 @@
       <w:rFonts w:eastAsia="MS Mincho"/>
       <w:sz w:val="22"/>
       <w:szCs w:val="22"/>
-      <w:lang w:val="es-GT" w:eastAsia="en-US"/>
+      <w:lang w:val="es-GT"/>
     </w:rPr>
   </w:style>
   <w:style w:type="character" w:default="1" w:styleId="Fuentedeprrafopredeter">
@@ -1701,7 +5485,7 @@
     <w:rPr>
       <w:sz w:val="22"/>
       <w:szCs w:val="22"/>
-      <w:lang w:val="es-GT" w:eastAsia="en-US"/>
+      <w:lang w:val="es-GT"/>
     </w:rPr>
   </w:style>
   <w:style w:type="character" w:customStyle="1" w:styleId="TextocomentarioCar">

</xml_diff>

<commit_message>
add: Se agrego historia de usuario HUOV-014 dentro del documento Peaceathome.docx en la rama oveliz-2024369
</commit_message>
<xml_diff>
--- a/Peaceathome.docx
+++ b/Peaceathome.docx
@@ -273,6 +273,7 @@
           <w:rFonts w:ascii="Arial" w:hAnsi="Arial" w:cs="Arial"/>
         </w:rPr>
       </w:pPr>
+      <w:proofErr w:type="spellStart"/>
       <w:r>
         <w:rPr>
           <w:rStyle w:val="oypena"/>
@@ -280,7 +281,17 @@
           <w:color w:val="000000"/>
           <w:sz w:val="40"/>
         </w:rPr>
-        <w:t>Peace at home</w:t>
+        <w:t>Peace</w:t>
+      </w:r>
+      <w:proofErr w:type="spellEnd"/>
+      <w:r>
+        <w:rPr>
+          <w:rStyle w:val="oypena"/>
+          <w:rFonts w:ascii="Arial" w:hAnsi="Arial" w:cs="Arial"/>
+          <w:color w:val="000000"/>
+          <w:sz w:val="40"/>
+        </w:rPr>
+        <w:t xml:space="preserve"> at home</w:t>
       </w:r>
     </w:p>
     <w:p>
@@ -668,14 +679,52 @@
                 <w:lang w:val="es-ES"/>
               </w:rPr>
             </w:pPr>
+            <w:proofErr w:type="spellStart"/>
             <w:r>
               <w:rPr>
                 <w:rFonts w:ascii="Arial" w:eastAsiaTheme="minorHAnsi" w:hAnsi="Arial" w:cs="Arial"/>
                 <w:sz w:val="24"/>
                 <w:lang w:val="es-ES"/>
               </w:rPr>
-              <w:t>Kenet Efraín Cuyuch Joj</w:t>
+              <w:t>Kenet</w:t>
             </w:r>
+            <w:proofErr w:type="spellEnd"/>
+            <w:r>
+              <w:rPr>
+                <w:rFonts w:ascii="Arial" w:eastAsiaTheme="minorHAnsi" w:hAnsi="Arial" w:cs="Arial"/>
+                <w:sz w:val="24"/>
+                <w:lang w:val="es-ES"/>
+              </w:rPr>
+              <w:t xml:space="preserve"> Efraín </w:t>
+            </w:r>
+            <w:proofErr w:type="spellStart"/>
+            <w:r>
+              <w:rPr>
+                <w:rFonts w:ascii="Arial" w:eastAsiaTheme="minorHAnsi" w:hAnsi="Arial" w:cs="Arial"/>
+                <w:sz w:val="24"/>
+                <w:lang w:val="es-ES"/>
+              </w:rPr>
+              <w:t>Cuyuch</w:t>
+            </w:r>
+            <w:proofErr w:type="spellEnd"/>
+            <w:r>
+              <w:rPr>
+                <w:rFonts w:ascii="Arial" w:eastAsiaTheme="minorHAnsi" w:hAnsi="Arial" w:cs="Arial"/>
+                <w:sz w:val="24"/>
+                <w:lang w:val="es-ES"/>
+              </w:rPr>
+              <w:t xml:space="preserve"> </w:t>
+            </w:r>
+            <w:proofErr w:type="spellStart"/>
+            <w:r>
+              <w:rPr>
+                <w:rFonts w:ascii="Arial" w:eastAsiaTheme="minorHAnsi" w:hAnsi="Arial" w:cs="Arial"/>
+                <w:sz w:val="24"/>
+                <w:lang w:val="es-ES"/>
+              </w:rPr>
+              <w:t>Joj</w:t>
+            </w:r>
+            <w:proofErr w:type="spellEnd"/>
           </w:p>
         </w:tc>
         <w:tc>
@@ -696,8 +745,17 @@
                 <w:rFonts w:ascii="Arial" w:eastAsiaTheme="minorHAnsi" w:hAnsi="Arial" w:cs="Arial"/>
                 <w:sz w:val="24"/>
               </w:rPr>
-              <w:t>Scrum Master</w:t>
+              <w:t xml:space="preserve">Scrum </w:t>
             </w:r>
+            <w:proofErr w:type="gramStart"/>
+            <w:r>
+              <w:rPr>
+                <w:rFonts w:ascii="Arial" w:eastAsiaTheme="minorHAnsi" w:hAnsi="Arial" w:cs="Arial"/>
+                <w:sz w:val="24"/>
+              </w:rPr>
+              <w:t>Master</w:t>
+            </w:r>
+            <w:proofErr w:type="gramEnd"/>
           </w:p>
         </w:tc>
       </w:tr>
@@ -715,12 +773,37 @@
                 <w:sz w:val="24"/>
               </w:rPr>
             </w:pPr>
+            <w:proofErr w:type="spellStart"/>
             <w:r>
               <w:rPr>
                 <w:rFonts w:ascii="Arial" w:eastAsiaTheme="minorHAnsi" w:hAnsi="Arial" w:cs="Arial"/>
                 <w:sz w:val="24"/>
               </w:rPr>
-              <w:t>Angel Gahel Padilla Pacheco</w:t>
+              <w:t>Angel</w:t>
+            </w:r>
+            <w:proofErr w:type="spellEnd"/>
+            <w:r>
+              <w:rPr>
+                <w:rFonts w:ascii="Arial" w:eastAsiaTheme="minorHAnsi" w:hAnsi="Arial" w:cs="Arial"/>
+                <w:sz w:val="24"/>
+              </w:rPr>
+              <w:t xml:space="preserve"> </w:t>
+            </w:r>
+            <w:proofErr w:type="spellStart"/>
+            <w:r>
+              <w:rPr>
+                <w:rFonts w:ascii="Arial" w:eastAsiaTheme="minorHAnsi" w:hAnsi="Arial" w:cs="Arial"/>
+                <w:sz w:val="24"/>
+              </w:rPr>
+              <w:t>Gahel</w:t>
+            </w:r>
+            <w:proofErr w:type="spellEnd"/>
+            <w:r>
+              <w:rPr>
+                <w:rFonts w:ascii="Arial" w:eastAsiaTheme="minorHAnsi" w:hAnsi="Arial" w:cs="Arial"/>
+                <w:sz w:val="24"/>
+              </w:rPr>
+              <w:t xml:space="preserve"> Padilla Pacheco</w:t>
             </w:r>
           </w:p>
         </w:tc>
@@ -762,13 +845,47 @@
                 <w:sz w:val="24"/>
               </w:rPr>
             </w:pPr>
+            <w:proofErr w:type="spellStart"/>
             <w:r>
               <w:rPr>
                 <w:rFonts w:ascii="Arial" w:eastAsiaTheme="minorHAnsi" w:hAnsi="Arial" w:cs="Arial"/>
                 <w:sz w:val="24"/>
               </w:rPr>
-              <w:t>Jose Enrique cuc cutz</w:t>
+              <w:t>Jose</w:t>
             </w:r>
+            <w:proofErr w:type="spellEnd"/>
+            <w:r>
+              <w:rPr>
+                <w:rFonts w:ascii="Arial" w:eastAsiaTheme="minorHAnsi" w:hAnsi="Arial" w:cs="Arial"/>
+                <w:sz w:val="24"/>
+              </w:rPr>
+              <w:t xml:space="preserve"> Enrique </w:t>
+            </w:r>
+            <w:proofErr w:type="spellStart"/>
+            <w:r>
+              <w:rPr>
+                <w:rFonts w:ascii="Arial" w:eastAsiaTheme="minorHAnsi" w:hAnsi="Arial" w:cs="Arial"/>
+                <w:sz w:val="24"/>
+              </w:rPr>
+              <w:t>cuc</w:t>
+            </w:r>
+            <w:proofErr w:type="spellEnd"/>
+            <w:r>
+              <w:rPr>
+                <w:rFonts w:ascii="Arial" w:eastAsiaTheme="minorHAnsi" w:hAnsi="Arial" w:cs="Arial"/>
+                <w:sz w:val="24"/>
+              </w:rPr>
+              <w:t xml:space="preserve"> </w:t>
+            </w:r>
+            <w:proofErr w:type="spellStart"/>
+            <w:r>
+              <w:rPr>
+                <w:rFonts w:ascii="Arial" w:eastAsiaTheme="minorHAnsi" w:hAnsi="Arial" w:cs="Arial"/>
+                <w:sz w:val="24"/>
+              </w:rPr>
+              <w:t>cutz</w:t>
+            </w:r>
+            <w:proofErr w:type="spellEnd"/>
           </w:p>
         </w:tc>
         <w:tc>
@@ -809,14 +926,52 @@
                 <w:szCs w:val="24"/>
               </w:rPr>
             </w:pPr>
+            <w:proofErr w:type="spellStart"/>
             <w:r>
               <w:rPr>
                 <w:rFonts w:ascii="Arial" w:eastAsiaTheme="minorEastAsia" w:hAnsi="Arial" w:cs="Arial"/>
                 <w:sz w:val="24"/>
                 <w:szCs w:val="24"/>
               </w:rPr>
-              <w:t>Jeferson Andre Cano Lopez</w:t>
+              <w:t>Jeferson</w:t>
             </w:r>
+            <w:proofErr w:type="spellEnd"/>
+            <w:r>
+              <w:rPr>
+                <w:rFonts w:ascii="Arial" w:eastAsiaTheme="minorEastAsia" w:hAnsi="Arial" w:cs="Arial"/>
+                <w:sz w:val="24"/>
+                <w:szCs w:val="24"/>
+              </w:rPr>
+              <w:t xml:space="preserve"> </w:t>
+            </w:r>
+            <w:proofErr w:type="spellStart"/>
+            <w:r>
+              <w:rPr>
+                <w:rFonts w:ascii="Arial" w:eastAsiaTheme="minorEastAsia" w:hAnsi="Arial" w:cs="Arial"/>
+                <w:sz w:val="24"/>
+                <w:szCs w:val="24"/>
+              </w:rPr>
+              <w:t>Andre</w:t>
+            </w:r>
+            <w:proofErr w:type="spellEnd"/>
+            <w:r>
+              <w:rPr>
+                <w:rFonts w:ascii="Arial" w:eastAsiaTheme="minorEastAsia" w:hAnsi="Arial" w:cs="Arial"/>
+                <w:sz w:val="24"/>
+                <w:szCs w:val="24"/>
+              </w:rPr>
+              <w:t xml:space="preserve"> Cano </w:t>
+            </w:r>
+            <w:proofErr w:type="spellStart"/>
+            <w:r>
+              <w:rPr>
+                <w:rFonts w:ascii="Arial" w:eastAsiaTheme="minorEastAsia" w:hAnsi="Arial" w:cs="Arial"/>
+                <w:sz w:val="24"/>
+                <w:szCs w:val="24"/>
+              </w:rPr>
+              <w:t>Lopez</w:t>
+            </w:r>
+            <w:proofErr w:type="spellEnd"/>
           </w:p>
         </w:tc>
         <w:tc>
@@ -909,8 +1064,17 @@
                 <w:rFonts w:ascii="Arial" w:eastAsiaTheme="minorHAnsi" w:hAnsi="Arial" w:cs="Arial"/>
                 <w:sz w:val="24"/>
               </w:rPr>
-              <w:t>Ricardo Alejandro Hernández Hernández</w:t>
+              <w:t xml:space="preserve">Ricardo Alejandro Hernández </w:t>
             </w:r>
+            <w:proofErr w:type="spellStart"/>
+            <w:r>
+              <w:rPr>
+                <w:rFonts w:ascii="Arial" w:eastAsiaTheme="minorHAnsi" w:hAnsi="Arial" w:cs="Arial"/>
+                <w:sz w:val="24"/>
+              </w:rPr>
+              <w:t>Hernández</w:t>
+            </w:r>
+            <w:proofErr w:type="spellEnd"/>
           </w:p>
         </w:tc>
         <w:tc>
@@ -1001,8 +1165,33 @@
                 <w:rFonts w:ascii="Arial" w:eastAsiaTheme="minorHAnsi" w:hAnsi="Arial" w:cs="Arial"/>
                 <w:sz w:val="24"/>
               </w:rPr>
-              <w:t>Franklin Stev Paiz Chavez</w:t>
+              <w:t xml:space="preserve">Franklin </w:t>
             </w:r>
+            <w:proofErr w:type="spellStart"/>
+            <w:r>
+              <w:rPr>
+                <w:rFonts w:ascii="Arial" w:eastAsiaTheme="minorHAnsi" w:hAnsi="Arial" w:cs="Arial"/>
+                <w:sz w:val="24"/>
+              </w:rPr>
+              <w:t>Stev</w:t>
+            </w:r>
+            <w:proofErr w:type="spellEnd"/>
+            <w:r>
+              <w:rPr>
+                <w:rFonts w:ascii="Arial" w:eastAsiaTheme="minorHAnsi" w:hAnsi="Arial" w:cs="Arial"/>
+                <w:sz w:val="24"/>
+              </w:rPr>
+              <w:t xml:space="preserve"> Paiz </w:t>
+            </w:r>
+            <w:proofErr w:type="spellStart"/>
+            <w:r>
+              <w:rPr>
+                <w:rFonts w:ascii="Arial" w:eastAsiaTheme="minorHAnsi" w:hAnsi="Arial" w:cs="Arial"/>
+                <w:sz w:val="24"/>
+              </w:rPr>
+              <w:t>Chavez</w:t>
+            </w:r>
+            <w:proofErr w:type="spellEnd"/>
           </w:p>
         </w:tc>
         <w:tc>
@@ -1043,13 +1232,23 @@
                 <w:szCs w:val="24"/>
               </w:rPr>
             </w:pPr>
+            <w:proofErr w:type="spellStart"/>
             <w:r>
               <w:rPr>
                 <w:rFonts w:ascii="Arial" w:eastAsiaTheme="minorEastAsia" w:hAnsi="Arial" w:cs="Arial"/>
                 <w:sz w:val="24"/>
                 <w:szCs w:val="24"/>
               </w:rPr>
-              <w:t>Angel Gabriel Ernesto Grijalva Castro</w:t>
+              <w:t>Angel</w:t>
+            </w:r>
+            <w:proofErr w:type="spellEnd"/>
+            <w:r>
+              <w:rPr>
+                <w:rFonts w:ascii="Arial" w:eastAsiaTheme="minorEastAsia" w:hAnsi="Arial" w:cs="Arial"/>
+                <w:sz w:val="24"/>
+                <w:szCs w:val="24"/>
+              </w:rPr>
+              <w:t xml:space="preserve"> Gabriel Ernesto Grijalva Castro</w:t>
             </w:r>
           </w:p>
         </w:tc>
@@ -1092,13 +1291,31 @@
                 <w:sz w:val="24"/>
               </w:rPr>
             </w:pPr>
+            <w:proofErr w:type="spellStart"/>
             <w:r>
               <w:rPr>
                 <w:rFonts w:ascii="Arial" w:eastAsiaTheme="minorHAnsi" w:hAnsi="Arial" w:cs="Arial"/>
                 <w:sz w:val="24"/>
               </w:rPr>
-              <w:t>Benjamin Elí Argueta Caal</w:t>
+              <w:t>Benjamin</w:t>
             </w:r>
+            <w:proofErr w:type="spellEnd"/>
+            <w:r>
+              <w:rPr>
+                <w:rFonts w:ascii="Arial" w:eastAsiaTheme="minorHAnsi" w:hAnsi="Arial" w:cs="Arial"/>
+                <w:sz w:val="24"/>
+              </w:rPr>
+              <w:t xml:space="preserve"> Elí Argueta </w:t>
+            </w:r>
+            <w:proofErr w:type="spellStart"/>
+            <w:r>
+              <w:rPr>
+                <w:rFonts w:ascii="Arial" w:eastAsiaTheme="minorHAnsi" w:hAnsi="Arial" w:cs="Arial"/>
+                <w:sz w:val="24"/>
+              </w:rPr>
+              <w:t>Caal</w:t>
+            </w:r>
+            <w:proofErr w:type="spellEnd"/>
           </w:p>
         </w:tc>
         <w:tc>
@@ -1143,8 +1360,33 @@
                 <w:rFonts w:ascii="Arial" w:eastAsiaTheme="minorHAnsi" w:hAnsi="Arial" w:cs="Arial"/>
                 <w:sz w:val="24"/>
               </w:rPr>
-              <w:t>Carlos Alejandro Patal Choc</w:t>
+              <w:t xml:space="preserve">Carlos Alejandro </w:t>
             </w:r>
+            <w:proofErr w:type="spellStart"/>
+            <w:r>
+              <w:rPr>
+                <w:rFonts w:ascii="Arial" w:eastAsiaTheme="minorHAnsi" w:hAnsi="Arial" w:cs="Arial"/>
+                <w:sz w:val="24"/>
+              </w:rPr>
+              <w:t>Patal</w:t>
+            </w:r>
+            <w:proofErr w:type="spellEnd"/>
+            <w:r>
+              <w:rPr>
+                <w:rFonts w:ascii="Arial" w:eastAsiaTheme="minorHAnsi" w:hAnsi="Arial" w:cs="Arial"/>
+                <w:sz w:val="24"/>
+              </w:rPr>
+              <w:t xml:space="preserve"> </w:t>
+            </w:r>
+            <w:proofErr w:type="spellStart"/>
+            <w:r>
+              <w:rPr>
+                <w:rFonts w:ascii="Arial" w:eastAsiaTheme="minorHAnsi" w:hAnsi="Arial" w:cs="Arial"/>
+                <w:sz w:val="24"/>
+              </w:rPr>
+              <w:t>Choc</w:t>
+            </w:r>
+            <w:proofErr w:type="spellEnd"/>
           </w:p>
         </w:tc>
         <w:tc>
@@ -1775,12 +2017,16 @@
           <w:b/>
         </w:rPr>
       </w:pPr>
+      <w:proofErr w:type="spellStart"/>
+      <w:proofErr w:type="gramStart"/>
       <w:r>
         <w:rPr>
           <w:b/>
         </w:rPr>
         <w:t>TUPLA:Servicios</w:t>
       </w:r>
+      <w:proofErr w:type="spellEnd"/>
+      <w:proofErr w:type="gramEnd"/>
     </w:p>
     <w:p>
       <w:pPr>
@@ -2256,7 +2502,17 @@
           <w:sz w:val="18"/>
           <w:szCs w:val="18"/>
         </w:rPr>
-        <w:t>Tupla: Rese</w:t>
+        <w:t xml:space="preserve">Tupla: </w:t>
+      </w:r>
+      <w:proofErr w:type="spellStart"/>
+      <w:r>
+        <w:rPr>
+          <w:rFonts w:ascii="Segoe UI" w:hAnsi="Segoe UI" w:cs="Segoe UI"/>
+          <w:b/>
+          <w:sz w:val="18"/>
+          <w:szCs w:val="18"/>
+        </w:rPr>
+        <w:t>Rese</w:t>
       </w:r>
       <w:r>
         <w:rPr>
@@ -2268,6 +2524,7 @@
         </w:rPr>
         <w:t>ñas</w:t>
       </w:r>
+      <w:proofErr w:type="spellEnd"/>
     </w:p>
     <w:p>
       <w:pPr>
@@ -2300,7 +2557,25 @@
           <w:sz w:val="22"/>
           <w:szCs w:val="22"/>
         </w:rPr>
-        <w:t>HUJC-007: Registo de nueva reseña</w:t>
+        <w:t xml:space="preserve">HUJC-007: </w:t>
+      </w:r>
+      <w:proofErr w:type="spellStart"/>
+      <w:r>
+        <w:rPr>
+          <w:rFonts w:ascii="Segoe UI" w:hAnsi="Segoe UI" w:cs="Segoe UI"/>
+          <w:sz w:val="22"/>
+          <w:szCs w:val="22"/>
+        </w:rPr>
+        <w:t>Registo</w:t>
+      </w:r>
+      <w:proofErr w:type="spellEnd"/>
+      <w:r>
+        <w:rPr>
+          <w:rFonts w:ascii="Segoe UI" w:hAnsi="Segoe UI" w:cs="Segoe UI"/>
+          <w:sz w:val="22"/>
+          <w:szCs w:val="22"/>
+        </w:rPr>
+        <w:t xml:space="preserve"> de nueva reseña</w:t>
       </w:r>
     </w:p>
     <w:p>
@@ -2320,8 +2595,18 @@
           <w:sz w:val="22"/>
           <w:szCs w:val="22"/>
         </w:rPr>
-        <w:t>Como: Huesped</w:t>
-      </w:r>
+        <w:t xml:space="preserve">Como: </w:t>
+      </w:r>
+      <w:proofErr w:type="spellStart"/>
+      <w:r>
+        <w:rPr>
+          <w:rFonts w:ascii="Segoe UI" w:hAnsi="Segoe UI" w:cs="Segoe UI"/>
+          <w:sz w:val="22"/>
+          <w:szCs w:val="22"/>
+        </w:rPr>
+        <w:t>Huesped</w:t>
+      </w:r>
+      <w:proofErr w:type="spellEnd"/>
     </w:p>
     <w:p>
       <w:pPr>
@@ -2340,7 +2625,25 @@
           <w:sz w:val="22"/>
           <w:szCs w:val="22"/>
         </w:rPr>
-        <w:t>Quiero: Registar una reseña sobre los servicios del cuarto de baño</w:t>
+        <w:t xml:space="preserve">Quiero: </w:t>
+      </w:r>
+      <w:proofErr w:type="spellStart"/>
+      <w:r>
+        <w:rPr>
+          <w:rFonts w:ascii="Segoe UI" w:hAnsi="Segoe UI" w:cs="Segoe UI"/>
+          <w:sz w:val="22"/>
+          <w:szCs w:val="22"/>
+        </w:rPr>
+        <w:t>Registar</w:t>
+      </w:r>
+      <w:proofErr w:type="spellEnd"/>
+      <w:r>
+        <w:rPr>
+          <w:rFonts w:ascii="Segoe UI" w:hAnsi="Segoe UI" w:cs="Segoe UI"/>
+          <w:sz w:val="22"/>
+          <w:szCs w:val="22"/>
+        </w:rPr>
+        <w:t xml:space="preserve"> una reseña sobre los servicios del cuarto de baño</w:t>
       </w:r>
     </w:p>
     <w:p>
@@ -2434,7 +2737,25 @@
           <w:sz w:val="22"/>
           <w:szCs w:val="22"/>
         </w:rPr>
-        <w:t>Quiero: Registrar una reseña sobre la propiedad que me fue otorgada en Peace At Home</w:t>
+        <w:t xml:space="preserve">Quiero: Registrar una reseña sobre la propiedad que me fue otorgada en </w:t>
+      </w:r>
+      <w:proofErr w:type="spellStart"/>
+      <w:r>
+        <w:rPr>
+          <w:rFonts w:ascii="Segoe UI" w:hAnsi="Segoe UI" w:cs="Segoe UI"/>
+          <w:sz w:val="22"/>
+          <w:szCs w:val="22"/>
+        </w:rPr>
+        <w:t>Peace</w:t>
+      </w:r>
+      <w:proofErr w:type="spellEnd"/>
+      <w:r>
+        <w:rPr>
+          <w:rFonts w:ascii="Segoe UI" w:hAnsi="Segoe UI" w:cs="Segoe UI"/>
+          <w:sz w:val="22"/>
+          <w:szCs w:val="22"/>
+        </w:rPr>
+        <w:t xml:space="preserve"> At Home</w:t>
       </w:r>
     </w:p>
     <w:p>
@@ -2528,7 +2849,25 @@
           <w:sz w:val="22"/>
           <w:szCs w:val="22"/>
         </w:rPr>
-        <w:t>Quiero: Registrar una reseña sobre los huéspedes que ocupan mi propiedad de Peace At Home</w:t>
+        <w:t xml:space="preserve">Quiero: Registrar una reseña sobre los huéspedes que ocupan mi propiedad de </w:t>
+      </w:r>
+      <w:proofErr w:type="spellStart"/>
+      <w:r>
+        <w:rPr>
+          <w:rFonts w:ascii="Segoe UI" w:hAnsi="Segoe UI" w:cs="Segoe UI"/>
+          <w:sz w:val="22"/>
+          <w:szCs w:val="22"/>
+        </w:rPr>
+        <w:t>Peace</w:t>
+      </w:r>
+      <w:proofErr w:type="spellEnd"/>
+      <w:r>
+        <w:rPr>
+          <w:rFonts w:ascii="Segoe UI" w:hAnsi="Segoe UI" w:cs="Segoe UI"/>
+          <w:sz w:val="22"/>
+          <w:szCs w:val="22"/>
+        </w:rPr>
+        <w:t xml:space="preserve"> At Home</w:t>
       </w:r>
     </w:p>
     <w:p>
@@ -2867,6 +3206,116 @@
           <w:lang w:eastAsia="es-GT"/>
         </w:rPr>
         <w:t xml:space="preserve"> </w:t>
+      </w:r>
+    </w:p>
+    <w:p>
+      <w:pPr>
+        <w:spacing w:before="100" w:beforeAutospacing="1" w:after="100" w:afterAutospacing="1" w:line="240" w:lineRule="auto"/>
+        <w:rPr>
+          <w:rFonts w:ascii="Arial" w:eastAsia="Times New Roman" w:hAnsi="Arial" w:cs="Arial"/>
+          <w:sz w:val="24"/>
+          <w:szCs w:val="24"/>
+          <w:lang w:eastAsia="es-GT"/>
+        </w:rPr>
+      </w:pPr>
+      <w:r>
+        <w:rPr>
+          <w:rFonts w:ascii="Arial" w:eastAsia="Times New Roman" w:hAnsi="Arial" w:cs="Arial"/>
+          <w:sz w:val="24"/>
+          <w:szCs w:val="24"/>
+          <w:lang w:eastAsia="es-GT"/>
+        </w:rPr>
+        <w:t>HUOV-0</w:t>
+      </w:r>
+      <w:r>
+        <w:rPr>
+          <w:rFonts w:ascii="Arial" w:eastAsia="Times New Roman" w:hAnsi="Arial" w:cs="Arial"/>
+          <w:sz w:val="24"/>
+          <w:szCs w:val="24"/>
+          <w:lang w:eastAsia="es-GT"/>
+        </w:rPr>
+        <w:t>14</w:t>
+      </w:r>
+    </w:p>
+    <w:p>
+      <w:pPr>
+        <w:spacing w:before="100" w:beforeAutospacing="1" w:after="100" w:afterAutospacing="1" w:line="240" w:lineRule="auto"/>
+        <w:rPr>
+          <w:rFonts w:ascii="Arial" w:eastAsia="Times New Roman" w:hAnsi="Arial" w:cs="Arial"/>
+          <w:sz w:val="24"/>
+          <w:szCs w:val="24"/>
+          <w:lang w:eastAsia="es-GT"/>
+        </w:rPr>
+      </w:pPr>
+      <w:r>
+        <w:rPr>
+          <w:rFonts w:ascii="Arial" w:eastAsia="Times New Roman" w:hAnsi="Arial" w:cs="Arial"/>
+          <w:sz w:val="24"/>
+          <w:szCs w:val="24"/>
+          <w:lang w:eastAsia="es-GT"/>
+        </w:rPr>
+        <w:t xml:space="preserve">Como: Administrador financiero </w:t>
+      </w:r>
+    </w:p>
+    <w:p>
+      <w:pPr>
+        <w:spacing w:before="100" w:beforeAutospacing="1" w:after="100" w:afterAutospacing="1" w:line="240" w:lineRule="auto"/>
+        <w:rPr>
+          <w:rFonts w:ascii="Arial" w:eastAsia="Times New Roman" w:hAnsi="Arial" w:cs="Arial"/>
+          <w:sz w:val="24"/>
+          <w:szCs w:val="24"/>
+          <w:lang w:eastAsia="es-GT"/>
+        </w:rPr>
+      </w:pPr>
+      <w:r>
+        <w:rPr>
+          <w:rFonts w:ascii="Arial" w:eastAsia="Times New Roman" w:hAnsi="Arial" w:cs="Arial"/>
+          <w:sz w:val="24"/>
+          <w:szCs w:val="24"/>
+          <w:lang w:eastAsia="es-GT"/>
+        </w:rPr>
+        <w:t xml:space="preserve">Quiero: Acceder a todas las solicitudes de rembolso recibidas y poder aprobarlas o rechazarlas </w:t>
+      </w:r>
+    </w:p>
+    <w:p>
+      <w:pPr>
+        <w:spacing w:before="100" w:beforeAutospacing="1" w:after="100" w:afterAutospacing="1" w:line="240" w:lineRule="auto"/>
+        <w:rPr>
+          <w:rFonts w:ascii="Arial" w:eastAsia="Times New Roman" w:hAnsi="Arial" w:cs="Arial"/>
+          <w:sz w:val="24"/>
+          <w:szCs w:val="24"/>
+          <w:lang w:eastAsia="es-GT"/>
+        </w:rPr>
+      </w:pPr>
+      <w:r>
+        <w:rPr>
+          <w:rFonts w:ascii="Arial" w:eastAsia="Times New Roman" w:hAnsi="Arial" w:cs="Arial"/>
+          <w:sz w:val="24"/>
+          <w:szCs w:val="24"/>
+          <w:lang w:eastAsia="es-GT"/>
+        </w:rPr>
+        <w:t>o hasta incluso pedir más información sobre la solicitud de rembolso.</w:t>
+      </w:r>
+    </w:p>
+    <w:p>
+      <w:pPr>
+        <w:spacing w:before="100" w:beforeAutospacing="1" w:after="100" w:afterAutospacing="1" w:line="240" w:lineRule="auto"/>
+        <w:rPr>
+          <w:rFonts w:ascii="Arial" w:eastAsia="Times New Roman" w:hAnsi="Arial" w:cs="Arial"/>
+          <w:sz w:val="24"/>
+          <w:szCs w:val="24"/>
+          <w:lang w:eastAsia="es-GT"/>
+        </w:rPr>
+      </w:pPr>
+      <w:r>
+        <w:rPr>
+          <w:rFonts w:ascii="Arial" w:eastAsia="Times New Roman" w:hAnsi="Arial" w:cs="Arial"/>
+          <w:sz w:val="24"/>
+          <w:szCs w:val="24"/>
+          <w:lang w:eastAsia="es-GT"/>
+        </w:rPr>
+        <w:lastRenderedPageBreak/>
+        <w:t>Para: Tener un registro de cada acción tomada con fecha y el usuario responsable.</w:t>
       </w:r>
     </w:p>
     <w:p>

</xml_diff>

<commit_message>
add: Se agrego historia de usuario HUOV-015 dentro del documento Peaceathome.docx en la rama oveliz-2024369
</commit_message>
<xml_diff>
--- a/Peaceathome.docx
+++ b/Peaceathome.docx
@@ -273,7 +273,6 @@
           <w:rFonts w:ascii="Arial" w:hAnsi="Arial" w:cs="Arial"/>
         </w:rPr>
       </w:pPr>
-      <w:proofErr w:type="spellStart"/>
       <w:r>
         <w:rPr>
           <w:rStyle w:val="oypena"/>
@@ -281,17 +280,7 @@
           <w:color w:val="000000"/>
           <w:sz w:val="40"/>
         </w:rPr>
-        <w:t>Peace</w:t>
-      </w:r>
-      <w:proofErr w:type="spellEnd"/>
-      <w:r>
-        <w:rPr>
-          <w:rStyle w:val="oypena"/>
-          <w:rFonts w:ascii="Arial" w:hAnsi="Arial" w:cs="Arial"/>
-          <w:color w:val="000000"/>
-          <w:sz w:val="40"/>
-        </w:rPr>
-        <w:t xml:space="preserve"> at home</w:t>
+        <w:t>Peace at home</w:t>
       </w:r>
     </w:p>
     <w:p>
@@ -679,52 +668,14 @@
                 <w:lang w:val="es-ES"/>
               </w:rPr>
             </w:pPr>
-            <w:proofErr w:type="spellStart"/>
             <w:r>
               <w:rPr>
                 <w:rFonts w:ascii="Arial" w:eastAsiaTheme="minorHAnsi" w:hAnsi="Arial" w:cs="Arial"/>
                 <w:sz w:val="24"/>
                 <w:lang w:val="es-ES"/>
               </w:rPr>
-              <w:t>Kenet</w:t>
+              <w:t>Kenet Efraín Cuyuch Joj</w:t>
             </w:r>
-            <w:proofErr w:type="spellEnd"/>
-            <w:r>
-              <w:rPr>
-                <w:rFonts w:ascii="Arial" w:eastAsiaTheme="minorHAnsi" w:hAnsi="Arial" w:cs="Arial"/>
-                <w:sz w:val="24"/>
-                <w:lang w:val="es-ES"/>
-              </w:rPr>
-              <w:t xml:space="preserve"> Efraín </w:t>
-            </w:r>
-            <w:proofErr w:type="spellStart"/>
-            <w:r>
-              <w:rPr>
-                <w:rFonts w:ascii="Arial" w:eastAsiaTheme="minorHAnsi" w:hAnsi="Arial" w:cs="Arial"/>
-                <w:sz w:val="24"/>
-                <w:lang w:val="es-ES"/>
-              </w:rPr>
-              <w:t>Cuyuch</w:t>
-            </w:r>
-            <w:proofErr w:type="spellEnd"/>
-            <w:r>
-              <w:rPr>
-                <w:rFonts w:ascii="Arial" w:eastAsiaTheme="minorHAnsi" w:hAnsi="Arial" w:cs="Arial"/>
-                <w:sz w:val="24"/>
-                <w:lang w:val="es-ES"/>
-              </w:rPr>
-              <w:t xml:space="preserve"> </w:t>
-            </w:r>
-            <w:proofErr w:type="spellStart"/>
-            <w:r>
-              <w:rPr>
-                <w:rFonts w:ascii="Arial" w:eastAsiaTheme="minorHAnsi" w:hAnsi="Arial" w:cs="Arial"/>
-                <w:sz w:val="24"/>
-                <w:lang w:val="es-ES"/>
-              </w:rPr>
-              <w:t>Joj</w:t>
-            </w:r>
-            <w:proofErr w:type="spellEnd"/>
           </w:p>
         </w:tc>
         <w:tc>
@@ -745,17 +696,8 @@
                 <w:rFonts w:ascii="Arial" w:eastAsiaTheme="minorHAnsi" w:hAnsi="Arial" w:cs="Arial"/>
                 <w:sz w:val="24"/>
               </w:rPr>
-              <w:t xml:space="preserve">Scrum </w:t>
+              <w:t>Scrum Master</w:t>
             </w:r>
-            <w:proofErr w:type="gramStart"/>
-            <w:r>
-              <w:rPr>
-                <w:rFonts w:ascii="Arial" w:eastAsiaTheme="minorHAnsi" w:hAnsi="Arial" w:cs="Arial"/>
-                <w:sz w:val="24"/>
-              </w:rPr>
-              <w:t>Master</w:t>
-            </w:r>
-            <w:proofErr w:type="gramEnd"/>
           </w:p>
         </w:tc>
       </w:tr>
@@ -773,37 +715,12 @@
                 <w:sz w:val="24"/>
               </w:rPr>
             </w:pPr>
-            <w:proofErr w:type="spellStart"/>
             <w:r>
               <w:rPr>
                 <w:rFonts w:ascii="Arial" w:eastAsiaTheme="minorHAnsi" w:hAnsi="Arial" w:cs="Arial"/>
                 <w:sz w:val="24"/>
               </w:rPr>
-              <w:t>Angel</w:t>
-            </w:r>
-            <w:proofErr w:type="spellEnd"/>
-            <w:r>
-              <w:rPr>
-                <w:rFonts w:ascii="Arial" w:eastAsiaTheme="minorHAnsi" w:hAnsi="Arial" w:cs="Arial"/>
-                <w:sz w:val="24"/>
-              </w:rPr>
-              <w:t xml:space="preserve"> </w:t>
-            </w:r>
-            <w:proofErr w:type="spellStart"/>
-            <w:r>
-              <w:rPr>
-                <w:rFonts w:ascii="Arial" w:eastAsiaTheme="minorHAnsi" w:hAnsi="Arial" w:cs="Arial"/>
-                <w:sz w:val="24"/>
-              </w:rPr>
-              <w:t>Gahel</w:t>
-            </w:r>
-            <w:proofErr w:type="spellEnd"/>
-            <w:r>
-              <w:rPr>
-                <w:rFonts w:ascii="Arial" w:eastAsiaTheme="minorHAnsi" w:hAnsi="Arial" w:cs="Arial"/>
-                <w:sz w:val="24"/>
-              </w:rPr>
-              <w:t xml:space="preserve"> Padilla Pacheco</w:t>
+              <w:t>Angel Gahel Padilla Pacheco</w:t>
             </w:r>
           </w:p>
         </w:tc>
@@ -845,47 +762,13 @@
                 <w:sz w:val="24"/>
               </w:rPr>
             </w:pPr>
-            <w:proofErr w:type="spellStart"/>
             <w:r>
               <w:rPr>
                 <w:rFonts w:ascii="Arial" w:eastAsiaTheme="minorHAnsi" w:hAnsi="Arial" w:cs="Arial"/>
                 <w:sz w:val="24"/>
               </w:rPr>
-              <w:t>Jose</w:t>
+              <w:t>Jose Enrique cuc cutz</w:t>
             </w:r>
-            <w:proofErr w:type="spellEnd"/>
-            <w:r>
-              <w:rPr>
-                <w:rFonts w:ascii="Arial" w:eastAsiaTheme="minorHAnsi" w:hAnsi="Arial" w:cs="Arial"/>
-                <w:sz w:val="24"/>
-              </w:rPr>
-              <w:t xml:space="preserve"> Enrique </w:t>
-            </w:r>
-            <w:proofErr w:type="spellStart"/>
-            <w:r>
-              <w:rPr>
-                <w:rFonts w:ascii="Arial" w:eastAsiaTheme="minorHAnsi" w:hAnsi="Arial" w:cs="Arial"/>
-                <w:sz w:val="24"/>
-              </w:rPr>
-              <w:t>cuc</w:t>
-            </w:r>
-            <w:proofErr w:type="spellEnd"/>
-            <w:r>
-              <w:rPr>
-                <w:rFonts w:ascii="Arial" w:eastAsiaTheme="minorHAnsi" w:hAnsi="Arial" w:cs="Arial"/>
-                <w:sz w:val="24"/>
-              </w:rPr>
-              <w:t xml:space="preserve"> </w:t>
-            </w:r>
-            <w:proofErr w:type="spellStart"/>
-            <w:r>
-              <w:rPr>
-                <w:rFonts w:ascii="Arial" w:eastAsiaTheme="minorHAnsi" w:hAnsi="Arial" w:cs="Arial"/>
-                <w:sz w:val="24"/>
-              </w:rPr>
-              <w:t>cutz</w:t>
-            </w:r>
-            <w:proofErr w:type="spellEnd"/>
           </w:p>
         </w:tc>
         <w:tc>
@@ -926,52 +809,14 @@
                 <w:szCs w:val="24"/>
               </w:rPr>
             </w:pPr>
-            <w:proofErr w:type="spellStart"/>
             <w:r>
               <w:rPr>
                 <w:rFonts w:ascii="Arial" w:eastAsiaTheme="minorEastAsia" w:hAnsi="Arial" w:cs="Arial"/>
                 <w:sz w:val="24"/>
                 <w:szCs w:val="24"/>
               </w:rPr>
-              <w:t>Jeferson</w:t>
+              <w:t>Jeferson Andre Cano Lopez</w:t>
             </w:r>
-            <w:proofErr w:type="spellEnd"/>
-            <w:r>
-              <w:rPr>
-                <w:rFonts w:ascii="Arial" w:eastAsiaTheme="minorEastAsia" w:hAnsi="Arial" w:cs="Arial"/>
-                <w:sz w:val="24"/>
-                <w:szCs w:val="24"/>
-              </w:rPr>
-              <w:t xml:space="preserve"> </w:t>
-            </w:r>
-            <w:proofErr w:type="spellStart"/>
-            <w:r>
-              <w:rPr>
-                <w:rFonts w:ascii="Arial" w:eastAsiaTheme="minorEastAsia" w:hAnsi="Arial" w:cs="Arial"/>
-                <w:sz w:val="24"/>
-                <w:szCs w:val="24"/>
-              </w:rPr>
-              <w:t>Andre</w:t>
-            </w:r>
-            <w:proofErr w:type="spellEnd"/>
-            <w:r>
-              <w:rPr>
-                <w:rFonts w:ascii="Arial" w:eastAsiaTheme="minorEastAsia" w:hAnsi="Arial" w:cs="Arial"/>
-                <w:sz w:val="24"/>
-                <w:szCs w:val="24"/>
-              </w:rPr>
-              <w:t xml:space="preserve"> Cano </w:t>
-            </w:r>
-            <w:proofErr w:type="spellStart"/>
-            <w:r>
-              <w:rPr>
-                <w:rFonts w:ascii="Arial" w:eastAsiaTheme="minorEastAsia" w:hAnsi="Arial" w:cs="Arial"/>
-                <w:sz w:val="24"/>
-                <w:szCs w:val="24"/>
-              </w:rPr>
-              <w:t>Lopez</w:t>
-            </w:r>
-            <w:proofErr w:type="spellEnd"/>
           </w:p>
         </w:tc>
         <w:tc>
@@ -1064,17 +909,8 @@
                 <w:rFonts w:ascii="Arial" w:eastAsiaTheme="minorHAnsi" w:hAnsi="Arial" w:cs="Arial"/>
                 <w:sz w:val="24"/>
               </w:rPr>
-              <w:t xml:space="preserve">Ricardo Alejandro Hernández </w:t>
+              <w:t>Ricardo Alejandro Hernández Hernández</w:t>
             </w:r>
-            <w:proofErr w:type="spellStart"/>
-            <w:r>
-              <w:rPr>
-                <w:rFonts w:ascii="Arial" w:eastAsiaTheme="minorHAnsi" w:hAnsi="Arial" w:cs="Arial"/>
-                <w:sz w:val="24"/>
-              </w:rPr>
-              <w:t>Hernández</w:t>
-            </w:r>
-            <w:proofErr w:type="spellEnd"/>
           </w:p>
         </w:tc>
         <w:tc>
@@ -1165,33 +1001,8 @@
                 <w:rFonts w:ascii="Arial" w:eastAsiaTheme="minorHAnsi" w:hAnsi="Arial" w:cs="Arial"/>
                 <w:sz w:val="24"/>
               </w:rPr>
-              <w:t xml:space="preserve">Franklin </w:t>
+              <w:t>Franklin Stev Paiz Chavez</w:t>
             </w:r>
-            <w:proofErr w:type="spellStart"/>
-            <w:r>
-              <w:rPr>
-                <w:rFonts w:ascii="Arial" w:eastAsiaTheme="minorHAnsi" w:hAnsi="Arial" w:cs="Arial"/>
-                <w:sz w:val="24"/>
-              </w:rPr>
-              <w:t>Stev</w:t>
-            </w:r>
-            <w:proofErr w:type="spellEnd"/>
-            <w:r>
-              <w:rPr>
-                <w:rFonts w:ascii="Arial" w:eastAsiaTheme="minorHAnsi" w:hAnsi="Arial" w:cs="Arial"/>
-                <w:sz w:val="24"/>
-              </w:rPr>
-              <w:t xml:space="preserve"> Paiz </w:t>
-            </w:r>
-            <w:proofErr w:type="spellStart"/>
-            <w:r>
-              <w:rPr>
-                <w:rFonts w:ascii="Arial" w:eastAsiaTheme="minorHAnsi" w:hAnsi="Arial" w:cs="Arial"/>
-                <w:sz w:val="24"/>
-              </w:rPr>
-              <w:t>Chavez</w:t>
-            </w:r>
-            <w:proofErr w:type="spellEnd"/>
           </w:p>
         </w:tc>
         <w:tc>
@@ -1232,23 +1043,13 @@
                 <w:szCs w:val="24"/>
               </w:rPr>
             </w:pPr>
-            <w:proofErr w:type="spellStart"/>
             <w:r>
               <w:rPr>
                 <w:rFonts w:ascii="Arial" w:eastAsiaTheme="minorEastAsia" w:hAnsi="Arial" w:cs="Arial"/>
                 <w:sz w:val="24"/>
                 <w:szCs w:val="24"/>
               </w:rPr>
-              <w:t>Angel</w:t>
-            </w:r>
-            <w:proofErr w:type="spellEnd"/>
-            <w:r>
-              <w:rPr>
-                <w:rFonts w:ascii="Arial" w:eastAsiaTheme="minorEastAsia" w:hAnsi="Arial" w:cs="Arial"/>
-                <w:sz w:val="24"/>
-                <w:szCs w:val="24"/>
-              </w:rPr>
-              <w:t xml:space="preserve"> Gabriel Ernesto Grijalva Castro</w:t>
+              <w:t>Angel Gabriel Ernesto Grijalva Castro</w:t>
             </w:r>
           </w:p>
         </w:tc>
@@ -1291,31 +1092,13 @@
                 <w:sz w:val="24"/>
               </w:rPr>
             </w:pPr>
-            <w:proofErr w:type="spellStart"/>
             <w:r>
               <w:rPr>
                 <w:rFonts w:ascii="Arial" w:eastAsiaTheme="minorHAnsi" w:hAnsi="Arial" w:cs="Arial"/>
                 <w:sz w:val="24"/>
               </w:rPr>
-              <w:t>Benjamin</w:t>
+              <w:t>Benjamin Elí Argueta Caal</w:t>
             </w:r>
-            <w:proofErr w:type="spellEnd"/>
-            <w:r>
-              <w:rPr>
-                <w:rFonts w:ascii="Arial" w:eastAsiaTheme="minorHAnsi" w:hAnsi="Arial" w:cs="Arial"/>
-                <w:sz w:val="24"/>
-              </w:rPr>
-              <w:t xml:space="preserve"> Elí Argueta </w:t>
-            </w:r>
-            <w:proofErr w:type="spellStart"/>
-            <w:r>
-              <w:rPr>
-                <w:rFonts w:ascii="Arial" w:eastAsiaTheme="minorHAnsi" w:hAnsi="Arial" w:cs="Arial"/>
-                <w:sz w:val="24"/>
-              </w:rPr>
-              <w:t>Caal</w:t>
-            </w:r>
-            <w:proofErr w:type="spellEnd"/>
           </w:p>
         </w:tc>
         <w:tc>
@@ -1360,33 +1143,8 @@
                 <w:rFonts w:ascii="Arial" w:eastAsiaTheme="minorHAnsi" w:hAnsi="Arial" w:cs="Arial"/>
                 <w:sz w:val="24"/>
               </w:rPr>
-              <w:t xml:space="preserve">Carlos Alejandro </w:t>
+              <w:t>Carlos Alejandro Patal Choc</w:t>
             </w:r>
-            <w:proofErr w:type="spellStart"/>
-            <w:r>
-              <w:rPr>
-                <w:rFonts w:ascii="Arial" w:eastAsiaTheme="minorHAnsi" w:hAnsi="Arial" w:cs="Arial"/>
-                <w:sz w:val="24"/>
-              </w:rPr>
-              <w:t>Patal</w:t>
-            </w:r>
-            <w:proofErr w:type="spellEnd"/>
-            <w:r>
-              <w:rPr>
-                <w:rFonts w:ascii="Arial" w:eastAsiaTheme="minorHAnsi" w:hAnsi="Arial" w:cs="Arial"/>
-                <w:sz w:val="24"/>
-              </w:rPr>
-              <w:t xml:space="preserve"> </w:t>
-            </w:r>
-            <w:proofErr w:type="spellStart"/>
-            <w:r>
-              <w:rPr>
-                <w:rFonts w:ascii="Arial" w:eastAsiaTheme="minorHAnsi" w:hAnsi="Arial" w:cs="Arial"/>
-                <w:sz w:val="24"/>
-              </w:rPr>
-              <w:t>Choc</w:t>
-            </w:r>
-            <w:proofErr w:type="spellEnd"/>
           </w:p>
         </w:tc>
         <w:tc>
@@ -2017,16 +1775,12 @@
           <w:b/>
         </w:rPr>
       </w:pPr>
-      <w:proofErr w:type="spellStart"/>
-      <w:proofErr w:type="gramStart"/>
       <w:r>
         <w:rPr>
           <w:b/>
         </w:rPr>
         <w:t>TUPLA:Servicios</w:t>
       </w:r>
-      <w:proofErr w:type="spellEnd"/>
-      <w:proofErr w:type="gramEnd"/>
     </w:p>
     <w:p>
       <w:pPr>
@@ -2502,17 +2256,7 @@
           <w:sz w:val="18"/>
           <w:szCs w:val="18"/>
         </w:rPr>
-        <w:t xml:space="preserve">Tupla: </w:t>
-      </w:r>
-      <w:proofErr w:type="spellStart"/>
-      <w:r>
-        <w:rPr>
-          <w:rFonts w:ascii="Segoe UI" w:hAnsi="Segoe UI" w:cs="Segoe UI"/>
-          <w:b/>
-          <w:sz w:val="18"/>
-          <w:szCs w:val="18"/>
-        </w:rPr>
-        <w:t>Rese</w:t>
+        <w:t>Tupla: Rese</w:t>
       </w:r>
       <w:r>
         <w:rPr>
@@ -2524,7 +2268,6 @@
         </w:rPr>
         <w:t>ñas</w:t>
       </w:r>
-      <w:proofErr w:type="spellEnd"/>
     </w:p>
     <w:p>
       <w:pPr>
@@ -2557,25 +2300,7 @@
           <w:sz w:val="22"/>
           <w:szCs w:val="22"/>
         </w:rPr>
-        <w:t xml:space="preserve">HUJC-007: </w:t>
-      </w:r>
-      <w:proofErr w:type="spellStart"/>
-      <w:r>
-        <w:rPr>
-          <w:rFonts w:ascii="Segoe UI" w:hAnsi="Segoe UI" w:cs="Segoe UI"/>
-          <w:sz w:val="22"/>
-          <w:szCs w:val="22"/>
-        </w:rPr>
-        <w:t>Registo</w:t>
-      </w:r>
-      <w:proofErr w:type="spellEnd"/>
-      <w:r>
-        <w:rPr>
-          <w:rFonts w:ascii="Segoe UI" w:hAnsi="Segoe UI" w:cs="Segoe UI"/>
-          <w:sz w:val="22"/>
-          <w:szCs w:val="22"/>
-        </w:rPr>
-        <w:t xml:space="preserve"> de nueva reseña</w:t>
+        <w:t>HUJC-007: Registo de nueva reseña</w:t>
       </w:r>
     </w:p>
     <w:p>
@@ -2595,18 +2320,8 @@
           <w:sz w:val="22"/>
           <w:szCs w:val="22"/>
         </w:rPr>
-        <w:t xml:space="preserve">Como: </w:t>
-      </w:r>
-      <w:proofErr w:type="spellStart"/>
-      <w:r>
-        <w:rPr>
-          <w:rFonts w:ascii="Segoe UI" w:hAnsi="Segoe UI" w:cs="Segoe UI"/>
-          <w:sz w:val="22"/>
-          <w:szCs w:val="22"/>
-        </w:rPr>
-        <w:t>Huesped</w:t>
-      </w:r>
-      <w:proofErr w:type="spellEnd"/>
+        <w:t>Como: Huesped</w:t>
+      </w:r>
     </w:p>
     <w:p>
       <w:pPr>
@@ -2625,25 +2340,7 @@
           <w:sz w:val="22"/>
           <w:szCs w:val="22"/>
         </w:rPr>
-        <w:t xml:space="preserve">Quiero: </w:t>
-      </w:r>
-      <w:proofErr w:type="spellStart"/>
-      <w:r>
-        <w:rPr>
-          <w:rFonts w:ascii="Segoe UI" w:hAnsi="Segoe UI" w:cs="Segoe UI"/>
-          <w:sz w:val="22"/>
-          <w:szCs w:val="22"/>
-        </w:rPr>
-        <w:t>Registar</w:t>
-      </w:r>
-      <w:proofErr w:type="spellEnd"/>
-      <w:r>
-        <w:rPr>
-          <w:rFonts w:ascii="Segoe UI" w:hAnsi="Segoe UI" w:cs="Segoe UI"/>
-          <w:sz w:val="22"/>
-          <w:szCs w:val="22"/>
-        </w:rPr>
-        <w:t xml:space="preserve"> una reseña sobre los servicios del cuarto de baño</w:t>
+        <w:t>Quiero: Registar una reseña sobre los servicios del cuarto de baño</w:t>
       </w:r>
     </w:p>
     <w:p>
@@ -2737,25 +2434,7 @@
           <w:sz w:val="22"/>
           <w:szCs w:val="22"/>
         </w:rPr>
-        <w:t xml:space="preserve">Quiero: Registrar una reseña sobre la propiedad que me fue otorgada en </w:t>
-      </w:r>
-      <w:proofErr w:type="spellStart"/>
-      <w:r>
-        <w:rPr>
-          <w:rFonts w:ascii="Segoe UI" w:hAnsi="Segoe UI" w:cs="Segoe UI"/>
-          <w:sz w:val="22"/>
-          <w:szCs w:val="22"/>
-        </w:rPr>
-        <w:t>Peace</w:t>
-      </w:r>
-      <w:proofErr w:type="spellEnd"/>
-      <w:r>
-        <w:rPr>
-          <w:rFonts w:ascii="Segoe UI" w:hAnsi="Segoe UI" w:cs="Segoe UI"/>
-          <w:sz w:val="22"/>
-          <w:szCs w:val="22"/>
-        </w:rPr>
-        <w:t xml:space="preserve"> At Home</w:t>
+        <w:t>Quiero: Registrar una reseña sobre la propiedad que me fue otorgada en Peace At Home</w:t>
       </w:r>
     </w:p>
     <w:p>
@@ -2849,25 +2528,7 @@
           <w:sz w:val="22"/>
           <w:szCs w:val="22"/>
         </w:rPr>
-        <w:t xml:space="preserve">Quiero: Registrar una reseña sobre los huéspedes que ocupan mi propiedad de </w:t>
-      </w:r>
-      <w:proofErr w:type="spellStart"/>
-      <w:r>
-        <w:rPr>
-          <w:rFonts w:ascii="Segoe UI" w:hAnsi="Segoe UI" w:cs="Segoe UI"/>
-          <w:sz w:val="22"/>
-          <w:szCs w:val="22"/>
-        </w:rPr>
-        <w:t>Peace</w:t>
-      </w:r>
-      <w:proofErr w:type="spellEnd"/>
-      <w:r>
-        <w:rPr>
-          <w:rFonts w:ascii="Segoe UI" w:hAnsi="Segoe UI" w:cs="Segoe UI"/>
-          <w:sz w:val="22"/>
-          <w:szCs w:val="22"/>
-        </w:rPr>
-        <w:t xml:space="preserve"> At Home</w:t>
+        <w:t>Quiero: Registrar una reseña sobre los huéspedes que ocupan mi propiedad de Peace At Home</w:t>
       </w:r>
     </w:p>
     <w:p>
@@ -3339,6 +3000,115 @@
           <w:lang w:eastAsia="es-GT"/>
         </w:rPr>
       </w:pPr>
+    </w:p>
+    <w:p>
+      <w:pPr>
+        <w:spacing w:before="100" w:beforeAutospacing="1" w:after="100" w:afterAutospacing="1" w:line="240" w:lineRule="auto"/>
+        <w:rPr>
+          <w:rFonts w:ascii="Arial" w:eastAsia="Times New Roman" w:hAnsi="Arial" w:cs="Arial"/>
+          <w:sz w:val="24"/>
+          <w:szCs w:val="24"/>
+          <w:lang w:eastAsia="es-GT"/>
+        </w:rPr>
+      </w:pPr>
+      <w:r>
+        <w:rPr>
+          <w:rFonts w:ascii="Arial" w:eastAsia="Times New Roman" w:hAnsi="Arial" w:cs="Arial"/>
+          <w:sz w:val="24"/>
+          <w:szCs w:val="24"/>
+          <w:lang w:eastAsia="es-GT"/>
+        </w:rPr>
+        <w:t>HUOV-0</w:t>
+      </w:r>
+      <w:r>
+        <w:rPr>
+          <w:rFonts w:ascii="Arial" w:eastAsia="Times New Roman" w:hAnsi="Arial" w:cs="Arial"/>
+          <w:sz w:val="24"/>
+          <w:szCs w:val="24"/>
+          <w:lang w:eastAsia="es-GT"/>
+        </w:rPr>
+        <w:t>15</w:t>
+      </w:r>
+    </w:p>
+    <w:p>
+      <w:pPr>
+        <w:spacing w:before="100" w:beforeAutospacing="1" w:after="100" w:afterAutospacing="1" w:line="240" w:lineRule="auto"/>
+        <w:rPr>
+          <w:rFonts w:ascii="Arial" w:eastAsia="Times New Roman" w:hAnsi="Arial" w:cs="Arial"/>
+          <w:sz w:val="24"/>
+          <w:szCs w:val="24"/>
+          <w:lang w:eastAsia="es-GT"/>
+        </w:rPr>
+      </w:pPr>
+      <w:r>
+        <w:rPr>
+          <w:rFonts w:ascii="Arial" w:eastAsia="Times New Roman" w:hAnsi="Arial" w:cs="Arial"/>
+          <w:sz w:val="24"/>
+          <w:szCs w:val="24"/>
+          <w:lang w:eastAsia="es-GT"/>
+        </w:rPr>
+        <w:t xml:space="preserve">Como: Cliente </w:t>
+      </w:r>
+    </w:p>
+    <w:p>
+      <w:pPr>
+        <w:spacing w:before="100" w:beforeAutospacing="1" w:after="100" w:afterAutospacing="1" w:line="240" w:lineRule="auto"/>
+        <w:rPr>
+          <w:rFonts w:ascii="Arial" w:eastAsia="Times New Roman" w:hAnsi="Arial" w:cs="Arial"/>
+          <w:sz w:val="24"/>
+          <w:szCs w:val="24"/>
+          <w:lang w:eastAsia="es-GT"/>
+        </w:rPr>
+      </w:pPr>
+      <w:r>
+        <w:rPr>
+          <w:rFonts w:ascii="Arial" w:eastAsia="Times New Roman" w:hAnsi="Arial" w:cs="Arial"/>
+          <w:sz w:val="24"/>
+          <w:szCs w:val="24"/>
+          <w:lang w:eastAsia="es-GT"/>
+        </w:rPr>
+        <w:t xml:space="preserve">Quiero: Recibir notificaciones cada vez que cambie el estado de mi solicitud de reembolso, </w:t>
+      </w:r>
+    </w:p>
+    <w:p>
+      <w:pPr>
+        <w:spacing w:before="100" w:beforeAutospacing="1" w:after="100" w:afterAutospacing="1" w:line="240" w:lineRule="auto"/>
+        <w:rPr>
+          <w:rFonts w:ascii="Arial" w:eastAsia="Times New Roman" w:hAnsi="Arial" w:cs="Arial"/>
+          <w:sz w:val="24"/>
+          <w:szCs w:val="24"/>
+          <w:lang w:eastAsia="es-GT"/>
+        </w:rPr>
+      </w:pPr>
+      <w:r>
+        <w:rPr>
+          <w:rFonts w:ascii="Arial" w:eastAsia="Times New Roman" w:hAnsi="Arial" w:cs="Arial"/>
+          <w:sz w:val="24"/>
+          <w:szCs w:val="24"/>
+          <w:lang w:eastAsia="es-GT"/>
+        </w:rPr>
+        <w:t>para mantenerme informado sobre el avance y resultado de mi trámite.</w:t>
+      </w:r>
+    </w:p>
+    <w:p>
+      <w:pPr>
+        <w:spacing w:before="100" w:beforeAutospacing="1" w:after="100" w:afterAutospacing="1" w:line="240" w:lineRule="auto"/>
+        <w:rPr>
+          <w:rFonts w:ascii="Arial" w:eastAsia="Times New Roman" w:hAnsi="Arial" w:cs="Arial"/>
+          <w:sz w:val="24"/>
+          <w:szCs w:val="24"/>
+          <w:lang w:eastAsia="es-GT"/>
+        </w:rPr>
+      </w:pPr>
+      <w:r>
+        <w:rPr>
+          <w:rFonts w:ascii="Arial" w:eastAsia="Times New Roman" w:hAnsi="Arial" w:cs="Arial"/>
+          <w:sz w:val="24"/>
+          <w:szCs w:val="24"/>
+          <w:lang w:eastAsia="es-GT"/>
+        </w:rPr>
+        <w:t>Para: Tener un envio automático de notificaciones por correo electrónico y dentro del sistema.</w:t>
+      </w:r>
     </w:p>
     <w:p>
       <w:pPr>

</xml_diff>

<commit_message>
add: Se agrego historia de usuario HUBA-016 dentro del documento Peaceathome.docx en la rama bargueta-2024358
</commit_message>
<xml_diff>
--- a/Peaceathome.docx
+++ b/Peaceathome.docx
@@ -19,7 +19,7 @@
           <w:lang w:val="en-US"/>
         </w:rPr>
         <w:drawing>
-          <wp:inline distT="0" distB="0" distL="0" distR="0" wp14:anchorId="2FEE8166" wp14:editId="6BE70031">
+          <wp:inline distT="0" distB="0" distL="0" distR="0" wp14:anchorId="5959B8BE" wp14:editId="62113B58">
             <wp:extent cx="2248535" cy="847725"/>
             <wp:effectExtent l="0" t="0" r="0" b="0"/>
             <wp:docPr id="2" name="Imagen 2"/>
@@ -271,7 +271,6 @@
         <w:jc w:val="center"/>
         <w:rPr>
           <w:rFonts w:ascii="Arial" w:hAnsi="Arial" w:cs="Arial"/>
-          <w:lang w:val="en-US"/>
         </w:rPr>
       </w:pPr>
       <w:r>
@@ -280,7 +279,6 @@
           <w:rFonts w:ascii="Arial" w:hAnsi="Arial" w:cs="Arial"/>
           <w:color w:val="000000"/>
           <w:sz w:val="40"/>
-          <w:lang w:val="en-US"/>
         </w:rPr>
         <w:t>Peace at home</w:t>
       </w:r>
@@ -292,7 +290,6 @@
         <w:jc w:val="center"/>
         <w:rPr>
           <w:rFonts w:ascii="Arial" w:hAnsi="Arial" w:cs="Arial"/>
-          <w:lang w:val="en-US"/>
         </w:rPr>
       </w:pPr>
     </w:p>
@@ -303,7 +300,6 @@
         <w:jc w:val="center"/>
         <w:rPr>
           <w:rFonts w:ascii="Arial" w:hAnsi="Arial" w:cs="Arial"/>
-          <w:lang w:val="en-US"/>
         </w:rPr>
       </w:pPr>
     </w:p>
@@ -314,7 +310,6 @@
         <w:jc w:val="center"/>
         <w:rPr>
           <w:rFonts w:ascii="Arial" w:hAnsi="Arial" w:cs="Arial"/>
-          <w:lang w:val="en-US"/>
         </w:rPr>
       </w:pPr>
     </w:p>
@@ -325,7 +320,6 @@
         <w:jc w:val="center"/>
         <w:rPr>
           <w:rFonts w:ascii="Arial" w:hAnsi="Arial" w:cs="Arial"/>
-          <w:lang w:val="en-US"/>
         </w:rPr>
       </w:pPr>
     </w:p>
@@ -336,7 +330,6 @@
         <w:jc w:val="center"/>
         <w:rPr>
           <w:rFonts w:ascii="Arial" w:hAnsi="Arial" w:cs="Arial"/>
-          <w:lang w:val="en-US"/>
         </w:rPr>
       </w:pPr>
     </w:p>
@@ -347,7 +340,6 @@
         <w:jc w:val="center"/>
         <w:rPr>
           <w:rFonts w:ascii="Arial" w:hAnsi="Arial" w:cs="Arial"/>
-          <w:lang w:val="en-US"/>
         </w:rPr>
       </w:pPr>
     </w:p>
@@ -358,7 +350,6 @@
         <w:jc w:val="center"/>
         <w:rPr>
           <w:rFonts w:ascii="Arial" w:hAnsi="Arial" w:cs="Arial"/>
-          <w:lang w:val="en-US"/>
         </w:rPr>
       </w:pPr>
     </w:p>
@@ -369,7 +360,6 @@
         <w:jc w:val="center"/>
         <w:rPr>
           <w:rFonts w:ascii="Arial" w:hAnsi="Arial" w:cs="Arial"/>
-          <w:lang w:val="en-US"/>
         </w:rPr>
       </w:pPr>
     </w:p>
@@ -380,7 +370,6 @@
         <w:jc w:val="center"/>
         <w:rPr>
           <w:rFonts w:ascii="Arial" w:hAnsi="Arial" w:cs="Arial"/>
-          <w:lang w:val="en-US"/>
         </w:rPr>
       </w:pPr>
     </w:p>
@@ -391,7 +380,6 @@
         <w:jc w:val="center"/>
         <w:rPr>
           <w:rFonts w:ascii="Arial" w:hAnsi="Arial" w:cs="Arial"/>
-          <w:lang w:val="en-US"/>
         </w:rPr>
       </w:pPr>
     </w:p>
@@ -402,7 +390,6 @@
         <w:jc w:val="center"/>
         <w:rPr>
           <w:rFonts w:ascii="Arial" w:hAnsi="Arial" w:cs="Arial"/>
-          <w:lang w:val="en-US"/>
         </w:rPr>
       </w:pPr>
     </w:p>
@@ -413,7 +400,6 @@
         <w:jc w:val="center"/>
         <w:rPr>
           <w:rFonts w:ascii="Arial" w:hAnsi="Arial" w:cs="Arial"/>
-          <w:lang w:val="en-US"/>
         </w:rPr>
       </w:pPr>
     </w:p>
@@ -424,7 +410,6 @@
         <w:jc w:val="center"/>
         <w:rPr>
           <w:rFonts w:ascii="Arial" w:hAnsi="Arial" w:cs="Arial"/>
-          <w:lang w:val="en-US"/>
         </w:rPr>
       </w:pPr>
     </w:p>
@@ -435,7 +420,6 @@
         <w:jc w:val="center"/>
         <w:rPr>
           <w:rFonts w:ascii="Arial" w:hAnsi="Arial" w:cs="Arial"/>
-          <w:lang w:val="en-US"/>
         </w:rPr>
       </w:pPr>
     </w:p>
@@ -446,7 +430,6 @@
         <w:jc w:val="center"/>
         <w:rPr>
           <w:rFonts w:ascii="Arial" w:hAnsi="Arial" w:cs="Arial"/>
-          <w:lang w:val="en-US"/>
         </w:rPr>
       </w:pPr>
     </w:p>
@@ -458,7 +441,6 @@
         <w:rPr>
           <w:rFonts w:ascii="Arial" w:hAnsi="Arial" w:cs="Arial"/>
           <w:u w:val="single"/>
-          <w:lang w:val="en-US"/>
         </w:rPr>
       </w:pPr>
     </w:p>
@@ -469,7 +451,6 @@
         <w:jc w:val="center"/>
         <w:rPr>
           <w:rFonts w:ascii="Arial" w:hAnsi="Arial" w:cs="Arial"/>
-          <w:lang w:val="en-US"/>
         </w:rPr>
       </w:pPr>
     </w:p>
@@ -518,9 +499,93 @@
         </w:sectPr>
       </w:pPr>
     </w:p>
+    <w:p>
+      <w:pPr>
+        <w:rPr>
+          <w:rFonts w:ascii="Arial" w:eastAsiaTheme="minorHAnsi" w:hAnsi="Arial" w:cs="Arial"/>
+          <w:sz w:val="24"/>
+        </w:rPr>
+      </w:pPr>
+    </w:p>
+    <w:p>
+      <w:pPr>
+        <w:rPr>
+          <w:rFonts w:ascii="Arial" w:eastAsiaTheme="minorHAnsi" w:hAnsi="Arial" w:cs="Arial"/>
+          <w:bCs/>
+        </w:rPr>
+      </w:pPr>
+      <w:r>
+        <w:rPr>
+          <w:rFonts w:ascii="Arial" w:eastAsiaTheme="minorHAnsi" w:hAnsi="Arial" w:cs="Arial"/>
+          <w:bCs/>
+        </w:rPr>
+        <w:t xml:space="preserve">    </w:t>
+      </w:r>
+    </w:p>
+    <w:p>
+      <w:pPr>
+        <w:jc w:val="center"/>
+        <w:rPr>
+          <w:rFonts w:ascii="Arial" w:eastAsiaTheme="minorHAnsi" w:hAnsi="Arial" w:cs="Arial"/>
+          <w:b/>
+          <w:bCs/>
+          <w:sz w:val="44"/>
+        </w:rPr>
+      </w:pPr>
+      <w:r>
+        <w:rPr>
+          <w:rFonts w:ascii="Arial" w:eastAsiaTheme="minorHAnsi" w:hAnsi="Arial" w:cs="Arial"/>
+          <w:b/>
+          <w:bCs/>
+          <w:sz w:val="44"/>
+        </w:rPr>
+        <w:t>Tabla de Integrantes</w:t>
+      </w:r>
+    </w:p>
+    <w:p>
+      <w:pPr>
+        <w:rPr>
+          <w:rFonts w:ascii="Arial" w:eastAsiaTheme="minorHAnsi" w:hAnsi="Arial" w:cs="Arial"/>
+          <w:bCs/>
+        </w:rPr>
+      </w:pPr>
+    </w:p>
+    <w:p>
+      <w:pPr>
+        <w:rPr>
+          <w:rFonts w:ascii="Arial" w:eastAsiaTheme="minorHAnsi" w:hAnsi="Arial" w:cs="Arial"/>
+          <w:bCs/>
+        </w:rPr>
+      </w:pPr>
+    </w:p>
+    <w:p>
+      <w:pPr>
+        <w:rPr>
+          <w:rFonts w:ascii="Arial" w:eastAsiaTheme="minorHAnsi" w:hAnsi="Arial" w:cs="Arial"/>
+          <w:bCs/>
+        </w:rPr>
+      </w:pPr>
+    </w:p>
+    <w:p>
+      <w:pPr>
+        <w:rPr>
+          <w:rFonts w:ascii="Arial" w:eastAsiaTheme="minorHAnsi" w:hAnsi="Arial" w:cs="Arial"/>
+          <w:bCs/>
+        </w:rPr>
+      </w:pPr>
+    </w:p>
+    <w:p>
+      <w:pPr>
+        <w:rPr>
+          <w:rFonts w:ascii="Arial" w:eastAsiaTheme="minorHAnsi" w:hAnsi="Arial" w:cs="Arial"/>
+          <w:bCs/>
+        </w:rPr>
+      </w:pPr>
+    </w:p>
     <w:tbl>
       <w:tblPr>
         <w:tblStyle w:val="Tablaconcuadrcula"/>
+        <w:tblpPr w:leftFromText="141" w:rightFromText="141" w:vertAnchor="page" w:horzAnchor="margin" w:tblpY="4527"/>
         <w:tblW w:w="0" w:type="auto"/>
         <w:tblLook w:val="04A0" w:firstRow="1" w:lastRow="0" w:firstColumn="1" w:lastColumn="0" w:noHBand="0" w:noVBand="1"/>
       </w:tblPr>
@@ -550,7 +615,6 @@
                 <w:b/>
                 <w:sz w:val="24"/>
               </w:rPr>
-              <w:lastRenderedPageBreak/>
               <w:t xml:space="preserve">Nombre </w:t>
             </w:r>
             <w:r>
@@ -604,52 +668,14 @@
                 <w:lang w:val="es-ES"/>
               </w:rPr>
             </w:pPr>
-            <w:proofErr w:type="spellStart"/>
             <w:r>
               <w:rPr>
                 <w:rFonts w:ascii="Arial" w:eastAsiaTheme="minorHAnsi" w:hAnsi="Arial" w:cs="Arial"/>
                 <w:sz w:val="24"/>
                 <w:lang w:val="es-ES"/>
               </w:rPr>
-              <w:t>Kenet</w:t>
+              <w:t>Kenet Efraín Cuyuch Joj</w:t>
             </w:r>
-            <w:proofErr w:type="spellEnd"/>
-            <w:r>
-              <w:rPr>
-                <w:rFonts w:ascii="Arial" w:eastAsiaTheme="minorHAnsi" w:hAnsi="Arial" w:cs="Arial"/>
-                <w:sz w:val="24"/>
-                <w:lang w:val="es-ES"/>
-              </w:rPr>
-              <w:t xml:space="preserve"> Efraín </w:t>
-            </w:r>
-            <w:proofErr w:type="spellStart"/>
-            <w:r>
-              <w:rPr>
-                <w:rFonts w:ascii="Arial" w:eastAsiaTheme="minorHAnsi" w:hAnsi="Arial" w:cs="Arial"/>
-                <w:sz w:val="24"/>
-                <w:lang w:val="es-ES"/>
-              </w:rPr>
-              <w:t>Cuyuch</w:t>
-            </w:r>
-            <w:proofErr w:type="spellEnd"/>
-            <w:r>
-              <w:rPr>
-                <w:rFonts w:ascii="Arial" w:eastAsiaTheme="minorHAnsi" w:hAnsi="Arial" w:cs="Arial"/>
-                <w:sz w:val="24"/>
-                <w:lang w:val="es-ES"/>
-              </w:rPr>
-              <w:t xml:space="preserve"> </w:t>
-            </w:r>
-            <w:proofErr w:type="spellStart"/>
-            <w:r>
-              <w:rPr>
-                <w:rFonts w:ascii="Arial" w:eastAsiaTheme="minorHAnsi" w:hAnsi="Arial" w:cs="Arial"/>
-                <w:sz w:val="24"/>
-                <w:lang w:val="es-ES"/>
-              </w:rPr>
-              <w:t>Joj</w:t>
-            </w:r>
-            <w:proofErr w:type="spellEnd"/>
           </w:p>
         </w:tc>
         <w:tc>
@@ -689,37 +715,12 @@
                 <w:sz w:val="24"/>
               </w:rPr>
             </w:pPr>
-            <w:proofErr w:type="spellStart"/>
             <w:r>
               <w:rPr>
                 <w:rFonts w:ascii="Arial" w:eastAsiaTheme="minorHAnsi" w:hAnsi="Arial" w:cs="Arial"/>
                 <w:sz w:val="24"/>
               </w:rPr>
-              <w:t>Angel</w:t>
-            </w:r>
-            <w:proofErr w:type="spellEnd"/>
-            <w:r>
-              <w:rPr>
-                <w:rFonts w:ascii="Arial" w:eastAsiaTheme="minorHAnsi" w:hAnsi="Arial" w:cs="Arial"/>
-                <w:sz w:val="24"/>
-              </w:rPr>
-              <w:t xml:space="preserve"> </w:t>
-            </w:r>
-            <w:proofErr w:type="spellStart"/>
-            <w:r>
-              <w:rPr>
-                <w:rFonts w:ascii="Arial" w:eastAsiaTheme="minorHAnsi" w:hAnsi="Arial" w:cs="Arial"/>
-                <w:sz w:val="24"/>
-              </w:rPr>
-              <w:t>Gahel</w:t>
-            </w:r>
-            <w:proofErr w:type="spellEnd"/>
-            <w:r>
-              <w:rPr>
-                <w:rFonts w:ascii="Arial" w:eastAsiaTheme="minorHAnsi" w:hAnsi="Arial" w:cs="Arial"/>
-                <w:sz w:val="24"/>
-              </w:rPr>
-              <w:t xml:space="preserve"> Padilla Pacheco</w:t>
+              <w:t>Angel Gahel Padilla Pacheco</w:t>
             </w:r>
           </w:p>
         </w:tc>
@@ -761,47 +762,13 @@
                 <w:sz w:val="24"/>
               </w:rPr>
             </w:pPr>
-            <w:proofErr w:type="spellStart"/>
             <w:r>
               <w:rPr>
                 <w:rFonts w:ascii="Arial" w:eastAsiaTheme="minorHAnsi" w:hAnsi="Arial" w:cs="Arial"/>
                 <w:sz w:val="24"/>
               </w:rPr>
-              <w:t>Jose</w:t>
+              <w:t>Jose Enrique cuc cutz</w:t>
             </w:r>
-            <w:proofErr w:type="spellEnd"/>
-            <w:r>
-              <w:rPr>
-                <w:rFonts w:ascii="Arial" w:eastAsiaTheme="minorHAnsi" w:hAnsi="Arial" w:cs="Arial"/>
-                <w:sz w:val="24"/>
-              </w:rPr>
-              <w:t xml:space="preserve"> Enrique </w:t>
-            </w:r>
-            <w:proofErr w:type="spellStart"/>
-            <w:r>
-              <w:rPr>
-                <w:rFonts w:ascii="Arial" w:eastAsiaTheme="minorHAnsi" w:hAnsi="Arial" w:cs="Arial"/>
-                <w:sz w:val="24"/>
-              </w:rPr>
-              <w:t>cuc</w:t>
-            </w:r>
-            <w:proofErr w:type="spellEnd"/>
-            <w:r>
-              <w:rPr>
-                <w:rFonts w:ascii="Arial" w:eastAsiaTheme="minorHAnsi" w:hAnsi="Arial" w:cs="Arial"/>
-                <w:sz w:val="24"/>
-              </w:rPr>
-              <w:t xml:space="preserve"> </w:t>
-            </w:r>
-            <w:proofErr w:type="spellStart"/>
-            <w:r>
-              <w:rPr>
-                <w:rFonts w:ascii="Arial" w:eastAsiaTheme="minorHAnsi" w:hAnsi="Arial" w:cs="Arial"/>
-                <w:sz w:val="24"/>
-              </w:rPr>
-              <w:t>cutz</w:t>
-            </w:r>
-            <w:proofErr w:type="spellEnd"/>
           </w:p>
         </w:tc>
         <w:tc>
@@ -842,52 +809,14 @@
                 <w:szCs w:val="24"/>
               </w:rPr>
             </w:pPr>
-            <w:proofErr w:type="spellStart"/>
             <w:r>
               <w:rPr>
                 <w:rFonts w:ascii="Arial" w:eastAsiaTheme="minorEastAsia" w:hAnsi="Arial" w:cs="Arial"/>
                 <w:sz w:val="24"/>
                 <w:szCs w:val="24"/>
               </w:rPr>
-              <w:t>Jeferson</w:t>
+              <w:t>Jeferson Andre Cano Lopez</w:t>
             </w:r>
-            <w:proofErr w:type="spellEnd"/>
-            <w:r>
-              <w:rPr>
-                <w:rFonts w:ascii="Arial" w:eastAsiaTheme="minorEastAsia" w:hAnsi="Arial" w:cs="Arial"/>
-                <w:sz w:val="24"/>
-                <w:szCs w:val="24"/>
-              </w:rPr>
-              <w:t xml:space="preserve"> </w:t>
-            </w:r>
-            <w:proofErr w:type="spellStart"/>
-            <w:r>
-              <w:rPr>
-                <w:rFonts w:ascii="Arial" w:eastAsiaTheme="minorEastAsia" w:hAnsi="Arial" w:cs="Arial"/>
-                <w:sz w:val="24"/>
-                <w:szCs w:val="24"/>
-              </w:rPr>
-              <w:t>Andre</w:t>
-            </w:r>
-            <w:proofErr w:type="spellEnd"/>
-            <w:r>
-              <w:rPr>
-                <w:rFonts w:ascii="Arial" w:eastAsiaTheme="minorEastAsia" w:hAnsi="Arial" w:cs="Arial"/>
-                <w:sz w:val="24"/>
-                <w:szCs w:val="24"/>
-              </w:rPr>
-              <w:t xml:space="preserve"> Cano </w:t>
-            </w:r>
-            <w:proofErr w:type="spellStart"/>
-            <w:r>
-              <w:rPr>
-                <w:rFonts w:ascii="Arial" w:eastAsiaTheme="minorEastAsia" w:hAnsi="Arial" w:cs="Arial"/>
-                <w:sz w:val="24"/>
-                <w:szCs w:val="24"/>
-              </w:rPr>
-              <w:t>Lopez</w:t>
-            </w:r>
-            <w:proofErr w:type="spellEnd"/>
           </w:p>
         </w:tc>
         <w:tc>
@@ -980,17 +909,8 @@
                 <w:rFonts w:ascii="Arial" w:eastAsiaTheme="minorHAnsi" w:hAnsi="Arial" w:cs="Arial"/>
                 <w:sz w:val="24"/>
               </w:rPr>
-              <w:t xml:space="preserve">Ricardo Alejandro Hernández </w:t>
+              <w:t>Ricardo Alejandro Hernández Hernández</w:t>
             </w:r>
-            <w:proofErr w:type="spellStart"/>
-            <w:r>
-              <w:rPr>
-                <w:rFonts w:ascii="Arial" w:eastAsiaTheme="minorHAnsi" w:hAnsi="Arial" w:cs="Arial"/>
-                <w:sz w:val="24"/>
-              </w:rPr>
-              <w:t>Hernández</w:t>
-            </w:r>
-            <w:proofErr w:type="spellEnd"/>
           </w:p>
         </w:tc>
         <w:tc>
@@ -1035,23 +955,7 @@
                 <w:rFonts w:ascii="Arial" w:eastAsiaTheme="minorHAnsi" w:hAnsi="Arial" w:cs="Arial"/>
                 <w:sz w:val="24"/>
               </w:rPr>
-              <w:t xml:space="preserve">Osman </w:t>
-            </w:r>
-            <w:proofErr w:type="spellStart"/>
-            <w:r>
-              <w:rPr>
-                <w:rFonts w:ascii="Arial" w:eastAsiaTheme="minorHAnsi" w:hAnsi="Arial" w:cs="Arial"/>
-                <w:sz w:val="24"/>
-              </w:rPr>
-              <w:t>Emmanuell</w:t>
-            </w:r>
-            <w:proofErr w:type="spellEnd"/>
-            <w:r>
-              <w:rPr>
-                <w:rFonts w:ascii="Arial" w:eastAsiaTheme="minorHAnsi" w:hAnsi="Arial" w:cs="Arial"/>
-                <w:sz w:val="24"/>
-              </w:rPr>
-              <w:t xml:space="preserve"> Veliz Guzmán</w:t>
+              <w:t>Osman Emmanuell Veliz Guzmán</w:t>
             </w:r>
           </w:p>
         </w:tc>
@@ -1139,23 +1043,13 @@
                 <w:szCs w:val="24"/>
               </w:rPr>
             </w:pPr>
-            <w:proofErr w:type="spellStart"/>
             <w:r>
               <w:rPr>
                 <w:rFonts w:ascii="Arial" w:eastAsiaTheme="minorEastAsia" w:hAnsi="Arial" w:cs="Arial"/>
                 <w:sz w:val="24"/>
                 <w:szCs w:val="24"/>
               </w:rPr>
-              <w:t>Angel</w:t>
-            </w:r>
-            <w:proofErr w:type="spellEnd"/>
-            <w:r>
-              <w:rPr>
-                <w:rFonts w:ascii="Arial" w:eastAsiaTheme="minorEastAsia" w:hAnsi="Arial" w:cs="Arial"/>
-                <w:sz w:val="24"/>
-                <w:szCs w:val="24"/>
-              </w:rPr>
-              <w:t xml:space="preserve"> Gabriel Ernesto Grijalva Castro</w:t>
+              <w:t>Angel Gabriel Ernesto Grijalva Castro</w:t>
             </w:r>
           </w:p>
         </w:tc>
@@ -1244,6 +1138,13 @@
                 <w:sz w:val="24"/>
               </w:rPr>
             </w:pPr>
+            <w:r>
+              <w:rPr>
+                <w:rFonts w:ascii="Arial" w:eastAsiaTheme="minorHAnsi" w:hAnsi="Arial" w:cs="Arial"/>
+                <w:sz w:val="24"/>
+              </w:rPr>
+              <w:t>Carlos Alejandro Patal Choc</w:t>
+            </w:r>
           </w:p>
         </w:tc>
         <w:tc>
@@ -1257,40 +1158,16 @@
               <w:rPr>
                 <w:rFonts w:ascii="Arial" w:eastAsiaTheme="minorHAnsi" w:hAnsi="Arial" w:cs="Arial"/>
                 <w:sz w:val="24"/>
+                <w:u w:val="single"/>
               </w:rPr>
             </w:pPr>
-          </w:p>
-        </w:tc>
-      </w:tr>
-      <w:tr>
-        <w:tc>
-          <w:tcPr>
-            <w:tcW w:w="5395" w:type="dxa"/>
-          </w:tcPr>
-          <w:p>
-            <w:pPr>
-              <w:spacing w:after="0" w:line="240" w:lineRule="auto"/>
-              <w:jc w:val="center"/>
+            <w:r>
               <w:rPr>
                 <w:rFonts w:ascii="Arial" w:eastAsiaTheme="minorHAnsi" w:hAnsi="Arial" w:cs="Arial"/>
                 <w:sz w:val="24"/>
               </w:rPr>
-            </w:pPr>
-          </w:p>
-        </w:tc>
-        <w:tc>
-          <w:tcPr>
-            <w:tcW w:w="5395" w:type="dxa"/>
-          </w:tcPr>
-          <w:p>
-            <w:pPr>
-              <w:spacing w:after="0" w:line="240" w:lineRule="auto"/>
-              <w:jc w:val="center"/>
-              <w:rPr>
-                <w:rFonts w:ascii="Arial" w:eastAsiaTheme="minorHAnsi" w:hAnsi="Arial" w:cs="Arial"/>
-                <w:sz w:val="24"/>
-              </w:rPr>
-            </w:pPr>
+              <w:t>Programador</w:t>
+            </w:r>
           </w:p>
         </w:tc>
       </w:tr>
@@ -1299,7 +1176,7 @@
       <w:pPr>
         <w:rPr>
           <w:rFonts w:ascii="Arial" w:eastAsiaTheme="minorHAnsi" w:hAnsi="Arial" w:cs="Arial"/>
-          <w:sz w:val="24"/>
+          <w:bCs/>
         </w:rPr>
       </w:pPr>
     </w:p>
@@ -1311,13 +1188,4059 @@
           <w:u w:val="single"/>
         </w:rPr>
       </w:pPr>
-      <w:r>
+    </w:p>
+    <w:p>
+      <w:pPr>
         <w:rPr>
           <w:rFonts w:ascii="Arial" w:eastAsiaTheme="minorHAnsi" w:hAnsi="Arial" w:cs="Arial"/>
           <w:bCs/>
-        </w:rPr>
-        <w:t xml:space="preserve">    </w:t>
-      </w:r>
+          <w:u w:val="single"/>
+        </w:rPr>
+      </w:pPr>
+    </w:p>
+    <w:p>
+      <w:pPr>
+        <w:rPr>
+          <w:rFonts w:ascii="Arial" w:eastAsiaTheme="minorHAnsi" w:hAnsi="Arial" w:cs="Arial"/>
+          <w:bCs/>
+          <w:u w:val="single"/>
+        </w:rPr>
+      </w:pPr>
+    </w:p>
+    <w:p>
+      <w:pPr>
+        <w:rPr>
+          <w:rFonts w:ascii="Arial" w:eastAsiaTheme="minorHAnsi" w:hAnsi="Arial" w:cs="Arial"/>
+          <w:bCs/>
+          <w:u w:val="single"/>
+        </w:rPr>
+      </w:pPr>
+    </w:p>
+    <w:p>
+      <w:pPr>
+        <w:rPr>
+          <w:rFonts w:ascii="Arial" w:eastAsiaTheme="minorHAnsi" w:hAnsi="Arial" w:cs="Arial"/>
+          <w:bCs/>
+          <w:u w:val="single"/>
+        </w:rPr>
+      </w:pPr>
+    </w:p>
+    <w:p>
+      <w:pPr>
+        <w:rPr>
+          <w:rFonts w:ascii="Arial" w:eastAsiaTheme="minorHAnsi" w:hAnsi="Arial" w:cs="Arial"/>
+          <w:bCs/>
+          <w:u w:val="single"/>
+        </w:rPr>
+      </w:pPr>
+    </w:p>
+    <w:p>
+      <w:pPr>
+        <w:rPr>
+          <w:rFonts w:ascii="Arial" w:eastAsiaTheme="minorHAnsi" w:hAnsi="Arial" w:cs="Arial"/>
+          <w:bCs/>
+          <w:u w:val="single"/>
+        </w:rPr>
+      </w:pPr>
+    </w:p>
+    <w:p>
+      <w:pPr>
+        <w:rPr>
+          <w:rFonts w:ascii="Arial" w:eastAsiaTheme="minorHAnsi" w:hAnsi="Arial" w:cs="Arial"/>
+          <w:bCs/>
+          <w:u w:val="single"/>
+        </w:rPr>
+      </w:pPr>
+    </w:p>
+    <w:p>
+      <w:pPr>
+        <w:rPr>
+          <w:rFonts w:ascii="Arial" w:eastAsiaTheme="minorHAnsi" w:hAnsi="Arial" w:cs="Arial"/>
+          <w:bCs/>
+          <w:u w:val="single"/>
+        </w:rPr>
+      </w:pPr>
+    </w:p>
+    <w:p>
+      <w:pPr>
+        <w:rPr>
+          <w:rFonts w:ascii="Arial" w:eastAsiaTheme="minorHAnsi" w:hAnsi="Arial" w:cs="Arial"/>
+          <w:bCs/>
+          <w:u w:val="single"/>
+        </w:rPr>
+      </w:pPr>
+    </w:p>
+    <w:p>
+      <w:pPr>
+        <w:rPr>
+          <w:rFonts w:ascii="Arial" w:eastAsiaTheme="minorHAnsi" w:hAnsi="Arial" w:cs="Arial"/>
+          <w:bCs/>
+          <w:u w:val="single"/>
+        </w:rPr>
+      </w:pPr>
+    </w:p>
+    <w:p>
+      <w:pPr>
+        <w:rPr>
+          <w:rFonts w:ascii="Arial" w:eastAsiaTheme="minorHAnsi" w:hAnsi="Arial" w:cs="Arial"/>
+          <w:bCs/>
+          <w:u w:val="single"/>
+        </w:rPr>
+      </w:pPr>
+    </w:p>
+    <w:p>
+      <w:pPr>
+        <w:rPr>
+          <w:rFonts w:ascii="Arial" w:eastAsiaTheme="minorHAnsi" w:hAnsi="Arial" w:cs="Arial"/>
+          <w:bCs/>
+          <w:u w:val="single"/>
+        </w:rPr>
+      </w:pPr>
+    </w:p>
+    <w:p>
+      <w:pPr>
+        <w:rPr>
+          <w:rFonts w:ascii="Arial" w:eastAsiaTheme="minorHAnsi" w:hAnsi="Arial" w:cs="Arial"/>
+          <w:bCs/>
+          <w:u w:val="single"/>
+        </w:rPr>
+      </w:pPr>
+    </w:p>
+    <w:p>
+      <w:pPr>
+        <w:rPr>
+          <w:rFonts w:ascii="Arial" w:eastAsiaTheme="minorHAnsi" w:hAnsi="Arial" w:cs="Arial"/>
+          <w:bCs/>
+          <w:u w:val="single"/>
+        </w:rPr>
+      </w:pPr>
+    </w:p>
+    <w:p>
+      <w:pPr>
+        <w:rPr>
+          <w:rFonts w:ascii="Arial" w:eastAsiaTheme="minorHAnsi" w:hAnsi="Arial" w:cs="Arial"/>
+          <w:bCs/>
+          <w:u w:val="single"/>
+        </w:rPr>
+      </w:pPr>
+    </w:p>
+    <w:p>
+      <w:pPr>
+        <w:jc w:val="center"/>
+        <w:rPr>
+          <w:rFonts w:ascii="Arial" w:eastAsiaTheme="minorHAnsi" w:hAnsi="Arial" w:cs="Arial"/>
+          <w:b/>
+          <w:sz w:val="44"/>
+          <w:szCs w:val="44"/>
+        </w:rPr>
+      </w:pPr>
+      <w:r>
+        <w:rPr>
+          <w:rFonts w:ascii="Arial" w:eastAsiaTheme="minorHAnsi" w:hAnsi="Arial" w:cs="Arial"/>
+          <w:b/>
+          <w:sz w:val="44"/>
+          <w:szCs w:val="44"/>
+        </w:rPr>
+        <w:t>Historias de Usuario</w:t>
+      </w:r>
+    </w:p>
+    <w:p>
+      <w:pPr>
+        <w:jc w:val="center"/>
+        <w:rPr>
+          <w:rFonts w:ascii="Arial" w:eastAsiaTheme="minorHAnsi" w:hAnsi="Arial" w:cs="Arial"/>
+          <w:b/>
+          <w:sz w:val="44"/>
+          <w:szCs w:val="44"/>
+        </w:rPr>
+      </w:pPr>
+    </w:p>
+    <w:p>
+      <w:pPr>
+        <w:jc w:val="center"/>
+        <w:rPr>
+          <w:rFonts w:ascii="Arial" w:eastAsiaTheme="minorHAnsi" w:hAnsi="Arial" w:cs="Arial"/>
+          <w:b/>
+          <w:sz w:val="44"/>
+          <w:szCs w:val="44"/>
+        </w:rPr>
+      </w:pPr>
+    </w:p>
+    <w:p>
+      <w:pPr>
+        <w:rPr>
+          <w:rFonts w:ascii="Arial" w:eastAsiaTheme="minorHAnsi" w:hAnsi="Arial" w:cs="Arial"/>
+          <w:b/>
+          <w:sz w:val="24"/>
+          <w:szCs w:val="20"/>
+        </w:rPr>
+      </w:pPr>
+      <w:r>
+        <w:rPr>
+          <w:rFonts w:ascii="Arial" w:eastAsiaTheme="minorHAnsi" w:hAnsi="Arial" w:cs="Arial"/>
+          <w:b/>
+          <w:sz w:val="24"/>
+          <w:szCs w:val="20"/>
+        </w:rPr>
+        <w:t>Tupla: Usuario</w:t>
+      </w:r>
+    </w:p>
+    <w:p>
+      <w:pPr>
+        <w:spacing w:before="100" w:beforeAutospacing="1" w:after="100" w:afterAutospacing="1" w:line="240" w:lineRule="auto"/>
+        <w:rPr>
+          <w:rFonts w:ascii="Arial" w:eastAsia="Times New Roman" w:hAnsi="Arial" w:cs="Arial"/>
+          <w:szCs w:val="24"/>
+          <w:lang w:eastAsia="es-GT"/>
+        </w:rPr>
+      </w:pPr>
+      <w:r>
+        <w:rPr>
+          <w:rFonts w:ascii="Arial" w:eastAsia="Times New Roman" w:hAnsi="Arial" w:cs="Arial"/>
+          <w:bCs/>
+          <w:szCs w:val="24"/>
+          <w:lang w:eastAsia="es-GT"/>
+        </w:rPr>
+        <w:t>HUKC-001</w:t>
+      </w:r>
+      <w:r>
+        <w:rPr>
+          <w:rFonts w:ascii="Arial" w:eastAsia="Times New Roman" w:hAnsi="Arial" w:cs="Arial"/>
+          <w:b/>
+          <w:bCs/>
+          <w:szCs w:val="24"/>
+          <w:lang w:eastAsia="es-GT"/>
+        </w:rPr>
+        <w:t xml:space="preserve"> Registro de Nuevo Usuario</w:t>
+      </w:r>
+    </w:p>
+    <w:p>
+      <w:pPr>
+        <w:spacing w:before="100" w:beforeAutospacing="1" w:after="100" w:afterAutospacing="1" w:line="240" w:lineRule="auto"/>
+        <w:rPr>
+          <w:rFonts w:ascii="Arial" w:eastAsia="Times New Roman" w:hAnsi="Arial" w:cs="Arial"/>
+          <w:szCs w:val="24"/>
+          <w:lang w:eastAsia="es-GT"/>
+        </w:rPr>
+      </w:pPr>
+      <w:r>
+        <w:rPr>
+          <w:rFonts w:ascii="Arial" w:eastAsia="Times New Roman" w:hAnsi="Arial" w:cs="Arial"/>
+          <w:b/>
+          <w:szCs w:val="24"/>
+          <w:lang w:eastAsia="es-GT"/>
+        </w:rPr>
+        <w:t>Como</w:t>
+      </w:r>
+      <w:r>
+        <w:rPr>
+          <w:rFonts w:ascii="Arial" w:eastAsia="Times New Roman" w:hAnsi="Arial" w:cs="Arial"/>
+          <w:szCs w:val="24"/>
+          <w:lang w:eastAsia="es-GT"/>
+        </w:rPr>
+        <w:t xml:space="preserve">: Un nuevo usuario (anfitrión o invitado) </w:t>
+      </w:r>
+    </w:p>
+    <w:p>
+      <w:pPr>
+        <w:spacing w:before="100" w:beforeAutospacing="1" w:after="100" w:afterAutospacing="1" w:line="240" w:lineRule="auto"/>
+        <w:rPr>
+          <w:rFonts w:ascii="Arial" w:eastAsia="Times New Roman" w:hAnsi="Arial" w:cs="Arial"/>
+          <w:szCs w:val="24"/>
+          <w:lang w:eastAsia="es-GT"/>
+        </w:rPr>
+      </w:pPr>
+      <w:r>
+        <w:rPr>
+          <w:rFonts w:ascii="Arial" w:eastAsia="Times New Roman" w:hAnsi="Arial" w:cs="Arial"/>
+          <w:b/>
+          <w:szCs w:val="24"/>
+          <w:lang w:eastAsia="es-GT"/>
+        </w:rPr>
+        <w:t>Quiero</w:t>
+      </w:r>
+      <w:r>
+        <w:rPr>
+          <w:rFonts w:ascii="Arial" w:eastAsia="Times New Roman" w:hAnsi="Arial" w:cs="Arial"/>
+          <w:szCs w:val="24"/>
+          <w:lang w:eastAsia="es-GT"/>
+        </w:rPr>
+        <w:t xml:space="preserve">: Registrarme en el sistema proporcionando mi nombre, correo, teléfono, fecha de nacimiento y tipo de usuario (anfitrión o invitado) </w:t>
+      </w:r>
+    </w:p>
+    <w:p>
+      <w:pPr>
+        <w:spacing w:before="100" w:beforeAutospacing="1" w:after="100" w:afterAutospacing="1" w:line="240" w:lineRule="auto"/>
+        <w:rPr>
+          <w:rFonts w:ascii="Arial" w:eastAsia="Times New Roman" w:hAnsi="Arial" w:cs="Arial"/>
+          <w:szCs w:val="24"/>
+          <w:lang w:eastAsia="es-GT"/>
+        </w:rPr>
+      </w:pPr>
+      <w:r>
+        <w:rPr>
+          <w:rFonts w:ascii="Arial" w:eastAsia="Times New Roman" w:hAnsi="Arial" w:cs="Arial"/>
+          <w:b/>
+          <w:szCs w:val="24"/>
+          <w:lang w:eastAsia="es-GT"/>
+        </w:rPr>
+        <w:t>Para</w:t>
+      </w:r>
+      <w:r>
+        <w:rPr>
+          <w:rFonts w:ascii="Arial" w:eastAsia="Times New Roman" w:hAnsi="Arial" w:cs="Arial"/>
+          <w:szCs w:val="24"/>
+          <w:lang w:eastAsia="es-GT"/>
+        </w:rPr>
+        <w:t>: Poder utilizar los servicios de la plataforma, ya sea para ofrecer propiedades o para reservarlas.</w:t>
+      </w:r>
+    </w:p>
+    <w:p>
+      <w:pPr>
+        <w:spacing w:before="100" w:beforeAutospacing="1" w:after="100" w:afterAutospacing="1" w:line="240" w:lineRule="auto"/>
+        <w:rPr>
+          <w:rFonts w:ascii="Arial" w:eastAsia="Times New Roman" w:hAnsi="Arial" w:cs="Arial"/>
+          <w:szCs w:val="24"/>
+          <w:lang w:eastAsia="es-GT"/>
+        </w:rPr>
+      </w:pPr>
+    </w:p>
+    <w:p>
+      <w:pPr>
+        <w:spacing w:before="100" w:beforeAutospacing="1" w:after="100" w:afterAutospacing="1" w:line="240" w:lineRule="auto"/>
+        <w:rPr>
+          <w:rFonts w:ascii="Arial" w:eastAsia="Times New Roman" w:hAnsi="Arial" w:cs="Arial"/>
+          <w:szCs w:val="24"/>
+          <w:lang w:eastAsia="es-GT"/>
+        </w:rPr>
+      </w:pPr>
+      <w:r>
+        <w:rPr>
+          <w:rFonts w:ascii="Arial" w:eastAsia="Times New Roman" w:hAnsi="Arial" w:cs="Arial"/>
+          <w:szCs w:val="24"/>
+          <w:lang w:eastAsia="es-GT"/>
+        </w:rPr>
+        <w:t>HUKC-002</w:t>
+      </w:r>
+      <w:r>
+        <w:rPr>
+          <w:rFonts w:ascii="Arial" w:eastAsia="Times New Roman" w:hAnsi="Arial" w:cs="Arial"/>
+          <w:b/>
+          <w:bCs/>
+          <w:szCs w:val="24"/>
+          <w:lang w:eastAsia="es-GT"/>
+        </w:rPr>
+        <w:t xml:space="preserve"> Edición de Perfil de Usuario</w:t>
+      </w:r>
+    </w:p>
+    <w:p>
+      <w:pPr>
+        <w:spacing w:before="100" w:beforeAutospacing="1" w:after="100" w:afterAutospacing="1" w:line="240" w:lineRule="auto"/>
+        <w:rPr>
+          <w:rFonts w:ascii="Arial" w:eastAsia="Times New Roman" w:hAnsi="Arial" w:cs="Arial"/>
+          <w:szCs w:val="24"/>
+          <w:lang w:eastAsia="es-GT"/>
+        </w:rPr>
+      </w:pPr>
+      <w:r>
+        <w:rPr>
+          <w:rFonts w:ascii="Arial" w:eastAsia="Times New Roman" w:hAnsi="Arial" w:cs="Arial"/>
+          <w:b/>
+          <w:szCs w:val="24"/>
+          <w:lang w:eastAsia="es-GT"/>
+        </w:rPr>
+        <w:t>Como</w:t>
+      </w:r>
+      <w:r>
+        <w:rPr>
+          <w:rFonts w:ascii="Arial" w:eastAsia="Times New Roman" w:hAnsi="Arial" w:cs="Arial"/>
+          <w:szCs w:val="24"/>
+          <w:lang w:eastAsia="es-GT"/>
+        </w:rPr>
+        <w:t>: Un usuario registrado</w:t>
+      </w:r>
+    </w:p>
+    <w:p>
+      <w:pPr>
+        <w:spacing w:before="100" w:beforeAutospacing="1" w:after="100" w:afterAutospacing="1" w:line="240" w:lineRule="auto"/>
+        <w:rPr>
+          <w:rFonts w:ascii="Arial" w:eastAsia="Times New Roman" w:hAnsi="Arial" w:cs="Arial"/>
+          <w:szCs w:val="24"/>
+          <w:lang w:eastAsia="es-GT"/>
+        </w:rPr>
+      </w:pPr>
+      <w:r>
+        <w:rPr>
+          <w:rFonts w:ascii="Arial" w:eastAsia="Times New Roman" w:hAnsi="Arial" w:cs="Arial"/>
+          <w:szCs w:val="24"/>
+          <w:lang w:eastAsia="es-GT"/>
+        </w:rPr>
+        <w:t xml:space="preserve"> </w:t>
+      </w:r>
+      <w:r>
+        <w:rPr>
+          <w:rFonts w:ascii="Arial" w:eastAsia="Times New Roman" w:hAnsi="Arial" w:cs="Arial"/>
+          <w:b/>
+          <w:szCs w:val="24"/>
+          <w:lang w:eastAsia="es-GT"/>
+        </w:rPr>
+        <w:t>Quiero</w:t>
+      </w:r>
+      <w:r>
+        <w:rPr>
+          <w:rFonts w:ascii="Arial" w:eastAsia="Times New Roman" w:hAnsi="Arial" w:cs="Arial"/>
+          <w:szCs w:val="24"/>
+          <w:lang w:eastAsia="es-GT"/>
+        </w:rPr>
+        <w:t xml:space="preserve">: Poder editar mi nombre, correo, teléfono, fecha de nacimiento, tipo de usuario y subir imágenes a mi perfil </w:t>
+      </w:r>
+    </w:p>
+    <w:p>
+      <w:pPr>
+        <w:spacing w:before="100" w:beforeAutospacing="1" w:after="100" w:afterAutospacing="1" w:line="240" w:lineRule="auto"/>
+        <w:rPr>
+          <w:rFonts w:ascii="Arial" w:eastAsia="Times New Roman" w:hAnsi="Arial" w:cs="Arial"/>
+          <w:szCs w:val="24"/>
+          <w:lang w:eastAsia="es-GT"/>
+        </w:rPr>
+      </w:pPr>
+      <w:r>
+        <w:rPr>
+          <w:rFonts w:ascii="Arial" w:eastAsia="Times New Roman" w:hAnsi="Arial" w:cs="Arial"/>
+          <w:b/>
+          <w:szCs w:val="24"/>
+          <w:lang w:eastAsia="es-GT"/>
+        </w:rPr>
+        <w:t>Para</w:t>
+      </w:r>
+      <w:r>
+        <w:rPr>
+          <w:rFonts w:ascii="Arial" w:eastAsia="Times New Roman" w:hAnsi="Arial" w:cs="Arial"/>
+          <w:szCs w:val="24"/>
+          <w:lang w:eastAsia="es-GT"/>
+        </w:rPr>
+        <w:t>: Mantener mi información actualizada y personalizada en la plataforma.</w:t>
+      </w:r>
+    </w:p>
+    <w:p>
+      <w:pPr>
+        <w:spacing w:before="100" w:beforeAutospacing="1" w:after="100" w:afterAutospacing="1" w:line="240" w:lineRule="auto"/>
+        <w:ind w:left="708" w:hanging="708"/>
+        <w:rPr>
+          <w:rFonts w:ascii="Arial" w:eastAsia="Times New Roman" w:hAnsi="Arial" w:cs="Arial"/>
+          <w:sz w:val="24"/>
+          <w:szCs w:val="24"/>
+          <w:lang w:eastAsia="es-GT"/>
+        </w:rPr>
+      </w:pPr>
+    </w:p>
+    <w:p>
+      <w:pPr>
+        <w:spacing w:before="100" w:beforeAutospacing="1" w:after="100" w:afterAutospacing="1" w:line="240" w:lineRule="auto"/>
+        <w:rPr>
+          <w:rFonts w:ascii="Arial" w:eastAsia="Times New Roman" w:hAnsi="Arial" w:cs="Arial"/>
+          <w:szCs w:val="24"/>
+          <w:lang w:eastAsia="es-GT"/>
+        </w:rPr>
+      </w:pPr>
+      <w:r>
+        <w:rPr>
+          <w:rFonts w:ascii="Arial" w:eastAsia="Times New Roman" w:hAnsi="Arial" w:cs="Arial"/>
+          <w:szCs w:val="24"/>
+          <w:lang w:eastAsia="es-GT"/>
+        </w:rPr>
+        <w:t>HUKC-003</w:t>
+      </w:r>
+      <w:r>
+        <w:rPr>
+          <w:rFonts w:ascii="Arial" w:eastAsia="Times New Roman" w:hAnsi="Arial" w:cs="Arial"/>
+          <w:b/>
+          <w:bCs/>
+          <w:szCs w:val="24"/>
+          <w:lang w:eastAsia="es-GT"/>
+        </w:rPr>
+        <w:t xml:space="preserve"> Visualización de Perfil de Usuario</w:t>
+      </w:r>
+    </w:p>
+    <w:p>
+      <w:pPr>
+        <w:spacing w:before="100" w:beforeAutospacing="1" w:after="100" w:afterAutospacing="1" w:line="240" w:lineRule="auto"/>
+        <w:rPr>
+          <w:rFonts w:ascii="Arial" w:eastAsia="Times New Roman" w:hAnsi="Arial" w:cs="Arial"/>
+          <w:szCs w:val="24"/>
+          <w:lang w:eastAsia="es-GT"/>
+        </w:rPr>
+      </w:pPr>
+      <w:r>
+        <w:rPr>
+          <w:rFonts w:ascii="Arial" w:eastAsia="Times New Roman" w:hAnsi="Arial" w:cs="Arial"/>
+          <w:b/>
+          <w:szCs w:val="24"/>
+          <w:lang w:eastAsia="es-GT"/>
+        </w:rPr>
+        <w:t>Como</w:t>
+      </w:r>
+      <w:r>
+        <w:rPr>
+          <w:rFonts w:ascii="Arial" w:eastAsia="Times New Roman" w:hAnsi="Arial" w:cs="Arial"/>
+          <w:szCs w:val="24"/>
+          <w:lang w:eastAsia="es-GT"/>
+        </w:rPr>
+        <w:t>: Un usuario (o un empleado del área con permisos)</w:t>
+      </w:r>
+    </w:p>
+    <w:p>
+      <w:pPr>
+        <w:spacing w:before="100" w:beforeAutospacing="1" w:after="100" w:afterAutospacing="1" w:line="240" w:lineRule="auto"/>
+        <w:rPr>
+          <w:rFonts w:ascii="Arial" w:eastAsia="Times New Roman" w:hAnsi="Arial" w:cs="Arial"/>
+          <w:szCs w:val="24"/>
+          <w:lang w:eastAsia="es-GT"/>
+        </w:rPr>
+      </w:pPr>
+      <w:r>
+        <w:rPr>
+          <w:rFonts w:ascii="Arial" w:eastAsia="Times New Roman" w:hAnsi="Arial" w:cs="Arial"/>
+          <w:szCs w:val="24"/>
+          <w:lang w:eastAsia="es-GT"/>
+        </w:rPr>
+        <w:t xml:space="preserve"> </w:t>
+      </w:r>
+      <w:r>
+        <w:rPr>
+          <w:rFonts w:ascii="Arial" w:eastAsia="Times New Roman" w:hAnsi="Arial" w:cs="Arial"/>
+          <w:b/>
+          <w:szCs w:val="24"/>
+          <w:lang w:eastAsia="es-GT"/>
+        </w:rPr>
+        <w:t>Quiero</w:t>
+      </w:r>
+      <w:r>
+        <w:rPr>
+          <w:rFonts w:ascii="Arial" w:eastAsia="Times New Roman" w:hAnsi="Arial" w:cs="Arial"/>
+          <w:szCs w:val="24"/>
+          <w:lang w:eastAsia="es-GT"/>
+        </w:rPr>
+        <w:t>: Poder ver el perfil de un usuario, incluyendo su nombre, correo, teléfono, fecha de nacimiento, tipo de usuario y sus imágenes</w:t>
+      </w:r>
+    </w:p>
+    <w:p>
+      <w:pPr>
+        <w:spacing w:before="100" w:beforeAutospacing="1" w:after="100" w:afterAutospacing="1" w:line="240" w:lineRule="auto"/>
+        <w:rPr>
+          <w:rFonts w:ascii="Arial" w:eastAsia="Times New Roman" w:hAnsi="Arial" w:cs="Arial"/>
+          <w:szCs w:val="24"/>
+          <w:lang w:eastAsia="es-GT"/>
+        </w:rPr>
+      </w:pPr>
+      <w:r>
+        <w:rPr>
+          <w:rFonts w:ascii="Arial" w:eastAsia="Times New Roman" w:hAnsi="Arial" w:cs="Arial"/>
+          <w:szCs w:val="24"/>
+          <w:lang w:eastAsia="es-GT"/>
+        </w:rPr>
+        <w:t xml:space="preserve"> </w:t>
+      </w:r>
+      <w:r>
+        <w:rPr>
+          <w:rFonts w:ascii="Arial" w:eastAsia="Times New Roman" w:hAnsi="Arial" w:cs="Arial"/>
+          <w:b/>
+          <w:szCs w:val="24"/>
+          <w:lang w:eastAsia="es-GT"/>
+        </w:rPr>
+        <w:t>Para</w:t>
+      </w:r>
+      <w:r>
+        <w:rPr>
+          <w:rFonts w:ascii="Arial" w:eastAsia="Times New Roman" w:hAnsi="Arial" w:cs="Arial"/>
+          <w:szCs w:val="24"/>
+          <w:lang w:eastAsia="es-GT"/>
+        </w:rPr>
+        <w:t>: Obtener información relevante sobre un usuario específico en la plataforma.</w:t>
+      </w:r>
+    </w:p>
+    <w:p>
+      <w:pPr>
+        <w:spacing w:before="100" w:beforeAutospacing="1" w:after="100" w:afterAutospacing="1" w:line="240" w:lineRule="auto"/>
+        <w:rPr>
+          <w:rFonts w:ascii="Arial" w:eastAsia="Times New Roman" w:hAnsi="Arial" w:cs="Arial"/>
+          <w:szCs w:val="24"/>
+          <w:lang w:eastAsia="es-GT"/>
+        </w:rPr>
+      </w:pPr>
+    </w:p>
+    <w:p>
+      <w:pPr>
+        <w:rPr>
+          <w:b/>
+        </w:rPr>
+      </w:pPr>
+      <w:r>
+        <w:rPr>
+          <w:b/>
+        </w:rPr>
+        <w:t>TUPLA:Servicios</w:t>
+      </w:r>
+    </w:p>
+    <w:p>
+      <w:pPr>
+        <w:rPr>
+          <w:b/>
+        </w:rPr>
+      </w:pPr>
+      <w:r>
+        <w:t>HUJC-004</w:t>
+      </w:r>
+    </w:p>
+    <w:p>
+      <w:pPr>
+        <w:pStyle w:val="paragraph"/>
+        <w:spacing w:before="0" w:beforeAutospacing="0" w:after="0" w:afterAutospacing="0"/>
+        <w:textAlignment w:val="baseline"/>
+        <w:rPr>
+          <w:rStyle w:val="eop"/>
+          <w:rFonts w:ascii="Calibri" w:eastAsia="MS Mincho" w:hAnsi="Calibri" w:cs="Calibri"/>
+          <w:sz w:val="22"/>
+          <w:szCs w:val="22"/>
+        </w:rPr>
+      </w:pPr>
+      <w:r>
+        <w:rPr>
+          <w:rStyle w:val="normaltextrun"/>
+          <w:rFonts w:ascii="Calibri" w:hAnsi="Calibri" w:cs="Calibri"/>
+          <w:sz w:val="22"/>
+          <w:szCs w:val="22"/>
+        </w:rPr>
+        <w:t>Como</w:t>
+      </w:r>
+      <w:r>
+        <w:rPr>
+          <w:rStyle w:val="normaltextrun"/>
+          <w:rFonts w:ascii="Calibri" w:hAnsi="Calibri" w:cs="Calibri"/>
+          <w:sz w:val="22"/>
+          <w:szCs w:val="22"/>
+          <w:lang w:val="zh-CN"/>
+        </w:rPr>
+        <w:t>:</w:t>
+      </w:r>
+      <w:r>
+        <w:rPr>
+          <w:rStyle w:val="normaltextrun"/>
+          <w:rFonts w:ascii="Calibri" w:hAnsi="Calibri" w:cs="Calibri"/>
+          <w:sz w:val="22"/>
+          <w:szCs w:val="22"/>
+        </w:rPr>
+        <w:t xml:space="preserve"> cliente </w:t>
+      </w:r>
+      <w:r>
+        <w:rPr>
+          <w:rStyle w:val="eop"/>
+          <w:rFonts w:ascii="Calibri" w:eastAsia="MS Mincho" w:hAnsi="Calibri" w:cs="Calibri"/>
+          <w:sz w:val="22"/>
+          <w:szCs w:val="22"/>
+        </w:rPr>
+        <w:t> </w:t>
+      </w:r>
+    </w:p>
+    <w:p>
+      <w:pPr>
+        <w:pStyle w:val="paragraph"/>
+        <w:spacing w:before="0" w:beforeAutospacing="0" w:after="0" w:afterAutospacing="0"/>
+        <w:textAlignment w:val="baseline"/>
+        <w:rPr>
+          <w:rFonts w:ascii="Segoe UI" w:hAnsi="Segoe UI" w:cs="Segoe UI"/>
+          <w:sz w:val="18"/>
+          <w:szCs w:val="18"/>
+        </w:rPr>
+      </w:pPr>
+    </w:p>
+    <w:p>
+      <w:pPr>
+        <w:pStyle w:val="paragraph"/>
+        <w:spacing w:before="0" w:beforeAutospacing="0" w:after="0" w:afterAutospacing="0"/>
+        <w:textAlignment w:val="baseline"/>
+        <w:rPr>
+          <w:rFonts w:ascii="Segoe UI" w:hAnsi="Segoe UI" w:cs="Segoe UI"/>
+          <w:sz w:val="18"/>
+          <w:szCs w:val="18"/>
+        </w:rPr>
+      </w:pPr>
+      <w:r>
+        <w:rPr>
+          <w:rStyle w:val="normaltextrun"/>
+          <w:rFonts w:ascii="Calibri" w:hAnsi="Calibri" w:cs="Calibri"/>
+          <w:sz w:val="22"/>
+          <w:szCs w:val="22"/>
+        </w:rPr>
+        <w:t>Quiero: ver los servicios con su nombre, descripción, horario disponible y costo extra,</w:t>
+      </w:r>
+      <w:r>
+        <w:rPr>
+          <w:rStyle w:val="eop"/>
+          <w:rFonts w:ascii="Calibri" w:eastAsia="MS Mincho" w:hAnsi="Calibri" w:cs="Calibri"/>
+          <w:sz w:val="22"/>
+          <w:szCs w:val="22"/>
+        </w:rPr>
+        <w:t> </w:t>
+      </w:r>
+    </w:p>
+    <w:p>
+      <w:pPr>
+        <w:pStyle w:val="paragraph"/>
+        <w:spacing w:before="0" w:beforeAutospacing="0" w:after="0" w:afterAutospacing="0"/>
+        <w:textAlignment w:val="baseline"/>
+        <w:rPr>
+          <w:rStyle w:val="normaltextrun"/>
+          <w:rFonts w:ascii="Calibri" w:hAnsi="Calibri" w:cs="Calibri"/>
+          <w:sz w:val="22"/>
+          <w:szCs w:val="22"/>
+        </w:rPr>
+      </w:pPr>
+    </w:p>
+    <w:p>
+      <w:pPr>
+        <w:pStyle w:val="paragraph"/>
+        <w:spacing w:before="0" w:beforeAutospacing="0" w:after="0" w:afterAutospacing="0"/>
+        <w:textAlignment w:val="baseline"/>
+        <w:rPr>
+          <w:rStyle w:val="eop"/>
+          <w:rFonts w:ascii="Calibri" w:eastAsia="MS Mincho" w:hAnsi="Calibri" w:cs="Calibri"/>
+          <w:sz w:val="22"/>
+          <w:szCs w:val="22"/>
+        </w:rPr>
+      </w:pPr>
+      <w:r>
+        <w:rPr>
+          <w:rStyle w:val="normaltextrun"/>
+          <w:rFonts w:ascii="Calibri" w:hAnsi="Calibri" w:cs="Calibri"/>
+          <w:sz w:val="22"/>
+          <w:szCs w:val="22"/>
+        </w:rPr>
+        <w:t>Para: poder elegir el servicio que mejor se adapte a mis necesidades y presupuesto.</w:t>
+      </w:r>
+      <w:r>
+        <w:rPr>
+          <w:rStyle w:val="eop"/>
+          <w:rFonts w:ascii="Calibri" w:eastAsia="MS Mincho" w:hAnsi="Calibri" w:cs="Calibri"/>
+          <w:sz w:val="22"/>
+          <w:szCs w:val="22"/>
+        </w:rPr>
+        <w:t> </w:t>
+      </w:r>
+    </w:p>
+    <w:p>
+      <w:pPr>
+        <w:pStyle w:val="paragraph"/>
+        <w:spacing w:before="0" w:beforeAutospacing="0" w:after="0" w:afterAutospacing="0"/>
+        <w:textAlignment w:val="baseline"/>
+        <w:rPr>
+          <w:rStyle w:val="eop"/>
+          <w:rFonts w:ascii="Calibri" w:eastAsia="MS Mincho" w:hAnsi="Calibri" w:cs="Calibri"/>
+          <w:sz w:val="22"/>
+          <w:szCs w:val="22"/>
+        </w:rPr>
+      </w:pPr>
+    </w:p>
+    <w:p>
+      <w:pPr>
+        <w:pStyle w:val="paragraph"/>
+        <w:spacing w:before="0" w:beforeAutospacing="0" w:after="0" w:afterAutospacing="0"/>
+        <w:textAlignment w:val="baseline"/>
+        <w:rPr>
+          <w:rStyle w:val="eop"/>
+          <w:rFonts w:ascii="Calibri" w:eastAsia="MS Mincho" w:hAnsi="Calibri" w:cs="Calibri"/>
+          <w:sz w:val="22"/>
+          <w:szCs w:val="22"/>
+        </w:rPr>
+      </w:pPr>
+    </w:p>
+    <w:p>
+      <w:pPr>
+        <w:rPr>
+          <w:rStyle w:val="eop"/>
+          <w:b/>
+        </w:rPr>
+      </w:pPr>
+      <w:r>
+        <w:t>HUJC-005</w:t>
+      </w:r>
+    </w:p>
+    <w:p>
+      <w:pPr>
+        <w:pStyle w:val="paragraph"/>
+        <w:spacing w:before="0" w:beforeAutospacing="0" w:after="0" w:afterAutospacing="0"/>
+        <w:textAlignment w:val="baseline"/>
+        <w:rPr>
+          <w:rFonts w:ascii="Segoe UI" w:hAnsi="Segoe UI" w:cs="Segoe UI"/>
+          <w:sz w:val="18"/>
+          <w:szCs w:val="18"/>
+        </w:rPr>
+      </w:pPr>
+      <w:r>
+        <w:rPr>
+          <w:rStyle w:val="normaltextrun"/>
+          <w:rFonts w:ascii="Calibri" w:hAnsi="Calibri" w:cs="Calibri"/>
+          <w:sz w:val="22"/>
+          <w:szCs w:val="22"/>
+        </w:rPr>
+        <w:t>Como: administrador </w:t>
+      </w:r>
+      <w:r>
+        <w:rPr>
+          <w:rStyle w:val="eop"/>
+          <w:rFonts w:ascii="Calibri" w:eastAsia="MS Mincho" w:hAnsi="Calibri" w:cs="Calibri"/>
+          <w:sz w:val="22"/>
+          <w:szCs w:val="22"/>
+        </w:rPr>
+        <w:t> </w:t>
+      </w:r>
+    </w:p>
+    <w:p>
+      <w:pPr>
+        <w:pStyle w:val="paragraph"/>
+        <w:spacing w:before="0" w:beforeAutospacing="0" w:after="0" w:afterAutospacing="0"/>
+        <w:textAlignment w:val="baseline"/>
+        <w:rPr>
+          <w:rStyle w:val="normaltextrun"/>
+          <w:rFonts w:ascii="Calibri" w:hAnsi="Calibri" w:cs="Calibri"/>
+          <w:sz w:val="22"/>
+          <w:szCs w:val="22"/>
+        </w:rPr>
+      </w:pPr>
+    </w:p>
+    <w:p>
+      <w:pPr>
+        <w:pStyle w:val="paragraph"/>
+        <w:spacing w:before="0" w:beforeAutospacing="0" w:after="0" w:afterAutospacing="0"/>
+        <w:textAlignment w:val="baseline"/>
+        <w:rPr>
+          <w:rFonts w:ascii="Segoe UI" w:hAnsi="Segoe UI" w:cs="Segoe UI"/>
+          <w:sz w:val="18"/>
+          <w:szCs w:val="18"/>
+        </w:rPr>
+      </w:pPr>
+      <w:r>
+        <w:rPr>
+          <w:rStyle w:val="normaltextrun"/>
+          <w:rFonts w:ascii="Calibri" w:hAnsi="Calibri" w:cs="Calibri"/>
+          <w:sz w:val="22"/>
+          <w:szCs w:val="22"/>
+        </w:rPr>
+        <w:t>Quiero: poder activar, desactivar y modificar los datos de un servicio (nombre, descripción, horario, costo extra y tipo de servicio),</w:t>
+      </w:r>
+      <w:r>
+        <w:rPr>
+          <w:rStyle w:val="eop"/>
+          <w:rFonts w:ascii="Calibri" w:eastAsia="MS Mincho" w:hAnsi="Calibri" w:cs="Calibri"/>
+          <w:sz w:val="22"/>
+          <w:szCs w:val="22"/>
+        </w:rPr>
+        <w:t> </w:t>
+      </w:r>
+    </w:p>
+    <w:p>
+      <w:pPr>
+        <w:pStyle w:val="paragraph"/>
+        <w:spacing w:before="0" w:beforeAutospacing="0" w:after="0" w:afterAutospacing="0"/>
+        <w:textAlignment w:val="baseline"/>
+        <w:rPr>
+          <w:rStyle w:val="normaltextrun"/>
+          <w:rFonts w:ascii="Calibri" w:hAnsi="Calibri" w:cs="Calibri"/>
+          <w:sz w:val="22"/>
+          <w:szCs w:val="22"/>
+        </w:rPr>
+      </w:pPr>
+    </w:p>
+    <w:p>
+      <w:pPr>
+        <w:pStyle w:val="paragraph"/>
+        <w:spacing w:before="0" w:beforeAutospacing="0" w:after="0" w:afterAutospacing="0"/>
+        <w:textAlignment w:val="baseline"/>
+        <w:rPr>
+          <w:rStyle w:val="eop"/>
+          <w:rFonts w:ascii="Calibri" w:eastAsia="MS Mincho" w:hAnsi="Calibri" w:cs="Calibri"/>
+          <w:sz w:val="22"/>
+          <w:szCs w:val="22"/>
+        </w:rPr>
+      </w:pPr>
+      <w:r>
+        <w:rPr>
+          <w:rStyle w:val="normaltextrun"/>
+          <w:rFonts w:ascii="Calibri" w:hAnsi="Calibri" w:cs="Calibri"/>
+          <w:sz w:val="22"/>
+          <w:szCs w:val="22"/>
+        </w:rPr>
+        <w:t>Para: mantener la información actualizada y ofrecer servicios vigentes a los clientes.</w:t>
+      </w:r>
+      <w:r>
+        <w:rPr>
+          <w:rStyle w:val="eop"/>
+          <w:rFonts w:ascii="Calibri" w:eastAsia="MS Mincho" w:hAnsi="Calibri" w:cs="Calibri"/>
+          <w:sz w:val="22"/>
+          <w:szCs w:val="22"/>
+        </w:rPr>
+        <w:t> </w:t>
+      </w:r>
+    </w:p>
+    <w:p>
+      <w:pPr>
+        <w:pStyle w:val="paragraph"/>
+        <w:spacing w:before="0" w:beforeAutospacing="0" w:after="0" w:afterAutospacing="0"/>
+        <w:textAlignment w:val="baseline"/>
+        <w:rPr>
+          <w:rStyle w:val="eop"/>
+          <w:rFonts w:ascii="Calibri" w:eastAsia="MS Mincho" w:hAnsi="Calibri" w:cs="Calibri"/>
+          <w:sz w:val="22"/>
+          <w:szCs w:val="22"/>
+        </w:rPr>
+      </w:pPr>
+    </w:p>
+    <w:p>
+      <w:pPr>
+        <w:rPr>
+          <w:rStyle w:val="normaltextrun"/>
+          <w:b/>
+        </w:rPr>
+      </w:pPr>
+      <w:r>
+        <w:t>HUJC-006</w:t>
+      </w:r>
+    </w:p>
+    <w:p>
+      <w:pPr>
+        <w:pStyle w:val="paragraph"/>
+        <w:spacing w:before="0" w:beforeAutospacing="0" w:after="0" w:afterAutospacing="0"/>
+        <w:textAlignment w:val="baseline"/>
+        <w:rPr>
+          <w:rFonts w:ascii="Segoe UI" w:hAnsi="Segoe UI" w:cs="Segoe UI"/>
+          <w:sz w:val="18"/>
+          <w:szCs w:val="18"/>
+        </w:rPr>
+      </w:pPr>
+      <w:r>
+        <w:rPr>
+          <w:rStyle w:val="normaltextrun"/>
+          <w:rFonts w:ascii="Calibri" w:hAnsi="Calibri" w:cs="Calibri"/>
+          <w:sz w:val="22"/>
+          <w:szCs w:val="22"/>
+        </w:rPr>
+        <w:t>Como: usuario del sistema (empleado),</w:t>
+      </w:r>
+      <w:r>
+        <w:rPr>
+          <w:rStyle w:val="eop"/>
+          <w:rFonts w:ascii="Calibri" w:eastAsia="MS Mincho" w:hAnsi="Calibri" w:cs="Calibri"/>
+          <w:sz w:val="22"/>
+          <w:szCs w:val="22"/>
+        </w:rPr>
+        <w:t> </w:t>
+      </w:r>
+    </w:p>
+    <w:p>
+      <w:pPr>
+        <w:pStyle w:val="paragraph"/>
+        <w:spacing w:before="0" w:beforeAutospacing="0" w:after="0" w:afterAutospacing="0"/>
+        <w:textAlignment w:val="baseline"/>
+        <w:rPr>
+          <w:rStyle w:val="normaltextrun"/>
+          <w:rFonts w:ascii="Calibri" w:hAnsi="Calibri" w:cs="Calibri"/>
+          <w:sz w:val="22"/>
+          <w:szCs w:val="22"/>
+        </w:rPr>
+      </w:pPr>
+    </w:p>
+    <w:p>
+      <w:pPr>
+        <w:pStyle w:val="paragraph"/>
+        <w:spacing w:before="0" w:beforeAutospacing="0" w:after="0" w:afterAutospacing="0"/>
+        <w:textAlignment w:val="baseline"/>
+        <w:rPr>
+          <w:rFonts w:ascii="Segoe UI" w:hAnsi="Segoe UI" w:cs="Segoe UI"/>
+          <w:sz w:val="18"/>
+          <w:szCs w:val="18"/>
+        </w:rPr>
+      </w:pPr>
+      <w:r>
+        <w:rPr>
+          <w:rStyle w:val="normaltextrun"/>
+          <w:rFonts w:ascii="Calibri" w:hAnsi="Calibri" w:cs="Calibri"/>
+          <w:sz w:val="22"/>
+          <w:szCs w:val="22"/>
+        </w:rPr>
+        <w:t>Quiero: consultar el tipo de servicio y su horario disponible,</w:t>
+      </w:r>
+      <w:r>
+        <w:rPr>
+          <w:rStyle w:val="eop"/>
+          <w:rFonts w:ascii="Calibri" w:eastAsia="MS Mincho" w:hAnsi="Calibri" w:cs="Calibri"/>
+          <w:sz w:val="22"/>
+          <w:szCs w:val="22"/>
+        </w:rPr>
+        <w:t> </w:t>
+      </w:r>
+    </w:p>
+    <w:p>
+      <w:pPr>
+        <w:pStyle w:val="paragraph"/>
+        <w:spacing w:before="0" w:beforeAutospacing="0" w:after="0" w:afterAutospacing="0"/>
+        <w:textAlignment w:val="baseline"/>
+        <w:rPr>
+          <w:rStyle w:val="normaltextrun"/>
+          <w:rFonts w:ascii="Calibri" w:hAnsi="Calibri" w:cs="Calibri"/>
+          <w:sz w:val="22"/>
+          <w:szCs w:val="22"/>
+        </w:rPr>
+      </w:pPr>
+    </w:p>
+    <w:p>
+      <w:pPr>
+        <w:pStyle w:val="paragraph"/>
+        <w:spacing w:before="0" w:beforeAutospacing="0" w:after="0" w:afterAutospacing="0"/>
+        <w:textAlignment w:val="baseline"/>
+        <w:rPr>
+          <w:rStyle w:val="eop"/>
+          <w:rFonts w:ascii="Calibri" w:eastAsia="MS Mincho" w:hAnsi="Calibri" w:cs="Calibri"/>
+          <w:sz w:val="22"/>
+          <w:szCs w:val="22"/>
+        </w:rPr>
+      </w:pPr>
+      <w:r>
+        <w:rPr>
+          <w:rStyle w:val="normaltextrun"/>
+          <w:rFonts w:ascii="Calibri" w:hAnsi="Calibri" w:cs="Calibri"/>
+          <w:sz w:val="22"/>
+          <w:szCs w:val="22"/>
+        </w:rPr>
+        <w:t>Para: poder informar correctamente a los clientes sobre la disponibilidad y características de cada servicio.</w:t>
+      </w:r>
+      <w:r>
+        <w:rPr>
+          <w:rStyle w:val="eop"/>
+          <w:rFonts w:ascii="Calibri" w:eastAsia="MS Mincho" w:hAnsi="Calibri" w:cs="Calibri"/>
+          <w:sz w:val="22"/>
+          <w:szCs w:val="22"/>
+        </w:rPr>
+        <w:t> </w:t>
+      </w:r>
+    </w:p>
+    <w:p>
+      <w:pPr>
+        <w:pStyle w:val="paragraph"/>
+        <w:spacing w:before="0" w:beforeAutospacing="0" w:after="0" w:afterAutospacing="0"/>
+        <w:textAlignment w:val="baseline"/>
+        <w:rPr>
+          <w:rStyle w:val="eop"/>
+          <w:rFonts w:ascii="Calibri" w:eastAsia="MS Mincho" w:hAnsi="Calibri" w:cs="Calibri"/>
+          <w:sz w:val="22"/>
+          <w:szCs w:val="22"/>
+        </w:rPr>
+      </w:pPr>
+    </w:p>
+    <w:p>
+      <w:pPr>
+        <w:pStyle w:val="paragraph"/>
+        <w:spacing w:before="0" w:beforeAutospacing="0" w:after="0" w:afterAutospacing="0"/>
+        <w:textAlignment w:val="baseline"/>
+        <w:rPr>
+          <w:rFonts w:ascii="Segoe UI" w:hAnsi="Segoe UI" w:cs="Segoe UI"/>
+          <w:b/>
+          <w:sz w:val="18"/>
+          <w:szCs w:val="18"/>
+          <w:lang w:val="es-MX"/>
+        </w:rPr>
+      </w:pPr>
+      <w:r>
+        <w:rPr>
+          <w:rFonts w:ascii="Segoe UI" w:hAnsi="Segoe UI" w:cs="Segoe UI"/>
+          <w:b/>
+          <w:sz w:val="18"/>
+          <w:szCs w:val="18"/>
+        </w:rPr>
+        <w:t>Tupla: Rese</w:t>
+      </w:r>
+      <w:r>
+        <w:rPr>
+          <w:rFonts w:ascii="Segoe UI" w:hAnsi="Segoe UI" w:cs="Segoe UI"/>
+          <w:b/>
+          <w:sz w:val="18"/>
+          <w:szCs w:val="18"/>
+          <w:lang w:val="es-MX"/>
+        </w:rPr>
+        <w:t>ñas</w:t>
+      </w:r>
+    </w:p>
+    <w:p>
+      <w:pPr>
+        <w:pStyle w:val="paragraph"/>
+        <w:spacing w:before="0" w:beforeAutospacing="0" w:after="0" w:afterAutospacing="0"/>
+        <w:textAlignment w:val="baseline"/>
+        <w:rPr>
+          <w:rFonts w:ascii="Segoe UI" w:hAnsi="Segoe UI" w:cs="Segoe UI"/>
+          <w:b/>
+          <w:sz w:val="18"/>
+          <w:szCs w:val="18"/>
+          <w:lang w:val="es-MX"/>
+        </w:rPr>
+      </w:pPr>
+    </w:p>
+    <w:p>
+      <w:pPr>
+        <w:pStyle w:val="paragraph"/>
+        <w:spacing w:after="0"/>
+        <w:textAlignment w:val="baseline"/>
+        <w:rPr>
+          <w:rFonts w:ascii="Segoe UI" w:hAnsi="Segoe UI" w:cs="Segoe UI"/>
+          <w:sz w:val="22"/>
+          <w:szCs w:val="22"/>
+        </w:rPr>
+      </w:pPr>
+      <w:r>
+        <w:rPr>
+          <w:rFonts w:ascii="Segoe UI" w:hAnsi="Segoe UI" w:cs="Segoe UI"/>
+          <w:sz w:val="22"/>
+          <w:szCs w:val="22"/>
+        </w:rPr>
+        <w:t>HUJC-007: Registo de nueva reseña</w:t>
+      </w:r>
+    </w:p>
+    <w:p>
+      <w:pPr>
+        <w:pStyle w:val="paragraph"/>
+        <w:spacing w:after="0"/>
+        <w:textAlignment w:val="baseline"/>
+        <w:rPr>
+          <w:rFonts w:ascii="Segoe UI" w:hAnsi="Segoe UI" w:cs="Segoe UI"/>
+          <w:sz w:val="22"/>
+          <w:szCs w:val="22"/>
+        </w:rPr>
+      </w:pPr>
+      <w:r>
+        <w:rPr>
+          <w:rFonts w:ascii="Segoe UI" w:hAnsi="Segoe UI" w:cs="Segoe UI"/>
+          <w:sz w:val="22"/>
+          <w:szCs w:val="22"/>
+        </w:rPr>
+        <w:t>Como: Huesped</w:t>
+      </w:r>
+    </w:p>
+    <w:p>
+      <w:pPr>
+        <w:pStyle w:val="paragraph"/>
+        <w:spacing w:after="0"/>
+        <w:textAlignment w:val="baseline"/>
+        <w:rPr>
+          <w:rFonts w:ascii="Segoe UI" w:hAnsi="Segoe UI" w:cs="Segoe UI"/>
+          <w:sz w:val="22"/>
+          <w:szCs w:val="22"/>
+        </w:rPr>
+      </w:pPr>
+      <w:r>
+        <w:rPr>
+          <w:rFonts w:ascii="Segoe UI" w:hAnsi="Segoe UI" w:cs="Segoe UI"/>
+          <w:sz w:val="22"/>
+          <w:szCs w:val="22"/>
+        </w:rPr>
+        <w:t>Quiero: Registar una reseña sobre los servicios del cuarto de baño</w:t>
+      </w:r>
+    </w:p>
+    <w:p>
+      <w:pPr>
+        <w:pStyle w:val="paragraph"/>
+        <w:spacing w:before="0" w:beforeAutospacing="0" w:after="0" w:afterAutospacing="0"/>
+        <w:textAlignment w:val="baseline"/>
+        <w:rPr>
+          <w:rFonts w:ascii="Segoe UI" w:hAnsi="Segoe UI" w:cs="Segoe UI"/>
+          <w:sz w:val="22"/>
+          <w:szCs w:val="22"/>
+        </w:rPr>
+      </w:pPr>
+      <w:r>
+        <w:rPr>
+          <w:rFonts w:ascii="Segoe UI" w:hAnsi="Segoe UI" w:cs="Segoe UI"/>
+          <w:sz w:val="22"/>
+          <w:szCs w:val="22"/>
+        </w:rPr>
+        <w:t>Para: Que lleven un registro de las mejoras que necesita o faltan en el baño</w:t>
+      </w:r>
+    </w:p>
+    <w:p>
+      <w:pPr>
+        <w:pStyle w:val="paragraph"/>
+        <w:spacing w:before="0" w:beforeAutospacing="0" w:after="0" w:afterAutospacing="0"/>
+        <w:textAlignment w:val="baseline"/>
+        <w:rPr>
+          <w:rFonts w:ascii="Segoe UI" w:hAnsi="Segoe UI" w:cs="Segoe UI"/>
+          <w:sz w:val="22"/>
+          <w:szCs w:val="22"/>
+        </w:rPr>
+      </w:pPr>
+    </w:p>
+    <w:p>
+      <w:pPr>
+        <w:pStyle w:val="paragraph"/>
+        <w:spacing w:after="0"/>
+        <w:textAlignment w:val="baseline"/>
+        <w:rPr>
+          <w:rFonts w:ascii="Segoe UI" w:hAnsi="Segoe UI" w:cs="Segoe UI"/>
+          <w:b/>
+          <w:sz w:val="22"/>
+          <w:szCs w:val="22"/>
+        </w:rPr>
+      </w:pPr>
+      <w:r>
+        <w:rPr>
+          <w:rFonts w:ascii="Segoe UI" w:hAnsi="Segoe UI" w:cs="Segoe UI"/>
+          <w:b/>
+          <w:sz w:val="22"/>
+          <w:szCs w:val="22"/>
+        </w:rPr>
+        <w:t>HUJC-008</w:t>
+      </w:r>
+    </w:p>
+    <w:p>
+      <w:pPr>
+        <w:pStyle w:val="paragraph"/>
+        <w:spacing w:after="0"/>
+        <w:textAlignment w:val="baseline"/>
+        <w:rPr>
+          <w:rFonts w:ascii="Segoe UI" w:hAnsi="Segoe UI" w:cs="Segoe UI"/>
+          <w:sz w:val="22"/>
+          <w:szCs w:val="22"/>
+        </w:rPr>
+      </w:pPr>
+      <w:r>
+        <w:rPr>
+          <w:rFonts w:ascii="Segoe UI" w:hAnsi="Segoe UI" w:cs="Segoe UI"/>
+          <w:sz w:val="22"/>
+          <w:szCs w:val="22"/>
+        </w:rPr>
+        <w:t>Como: Empresario</w:t>
+      </w:r>
+    </w:p>
+    <w:p>
+      <w:pPr>
+        <w:pStyle w:val="paragraph"/>
+        <w:spacing w:after="0"/>
+        <w:textAlignment w:val="baseline"/>
+        <w:rPr>
+          <w:rFonts w:ascii="Segoe UI" w:hAnsi="Segoe UI" w:cs="Segoe UI"/>
+          <w:sz w:val="22"/>
+          <w:szCs w:val="22"/>
+        </w:rPr>
+      </w:pPr>
+      <w:r>
+        <w:rPr>
+          <w:rFonts w:ascii="Segoe UI" w:hAnsi="Segoe UI" w:cs="Segoe UI"/>
+          <w:sz w:val="22"/>
+          <w:szCs w:val="22"/>
+        </w:rPr>
+        <w:t>Quiero: Registrar una reseña sobre la propiedad que me fue otorgada en Peace At Home</w:t>
+      </w:r>
+    </w:p>
+    <w:p>
+      <w:pPr>
+        <w:pStyle w:val="paragraph"/>
+        <w:spacing w:before="0" w:beforeAutospacing="0" w:after="0" w:afterAutospacing="0"/>
+        <w:textAlignment w:val="baseline"/>
+        <w:rPr>
+          <w:rFonts w:ascii="Segoe UI" w:hAnsi="Segoe UI" w:cs="Segoe UI"/>
+          <w:sz w:val="22"/>
+          <w:szCs w:val="22"/>
+        </w:rPr>
+      </w:pPr>
+      <w:r>
+        <w:rPr>
+          <w:rFonts w:ascii="Segoe UI" w:hAnsi="Segoe UI" w:cs="Segoe UI"/>
+          <w:sz w:val="22"/>
+          <w:szCs w:val="22"/>
+        </w:rPr>
+        <w:t>Para: Que los nuevos huéspedes sepan de las comodidades y ventajas de esta propiedad en especifico</w:t>
+      </w:r>
+    </w:p>
+    <w:p>
+      <w:pPr>
+        <w:pStyle w:val="paragraph"/>
+        <w:spacing w:before="0" w:beforeAutospacing="0" w:after="0" w:afterAutospacing="0"/>
+        <w:textAlignment w:val="baseline"/>
+        <w:rPr>
+          <w:rFonts w:ascii="Segoe UI" w:hAnsi="Segoe UI" w:cs="Segoe UI"/>
+          <w:sz w:val="22"/>
+          <w:szCs w:val="22"/>
+        </w:rPr>
+      </w:pPr>
+    </w:p>
+    <w:p>
+      <w:pPr>
+        <w:pStyle w:val="paragraph"/>
+        <w:spacing w:after="0"/>
+        <w:textAlignment w:val="baseline"/>
+        <w:rPr>
+          <w:rFonts w:ascii="Segoe UI" w:hAnsi="Segoe UI" w:cs="Segoe UI"/>
+          <w:b/>
+          <w:sz w:val="22"/>
+          <w:szCs w:val="22"/>
+        </w:rPr>
+      </w:pPr>
+      <w:r>
+        <w:rPr>
+          <w:rFonts w:ascii="Segoe UI" w:hAnsi="Segoe UI" w:cs="Segoe UI"/>
+          <w:b/>
+          <w:sz w:val="22"/>
+          <w:szCs w:val="22"/>
+        </w:rPr>
+        <w:t>HUJC-009</w:t>
+      </w:r>
+    </w:p>
+    <w:p>
+      <w:pPr>
+        <w:pStyle w:val="paragraph"/>
+        <w:spacing w:after="0"/>
+        <w:textAlignment w:val="baseline"/>
+        <w:rPr>
+          <w:rFonts w:ascii="Segoe UI" w:hAnsi="Segoe UI" w:cs="Segoe UI"/>
+          <w:sz w:val="22"/>
+          <w:szCs w:val="22"/>
+        </w:rPr>
+      </w:pPr>
+      <w:r>
+        <w:rPr>
+          <w:rFonts w:ascii="Segoe UI" w:hAnsi="Segoe UI" w:cs="Segoe UI"/>
+          <w:sz w:val="22"/>
+          <w:szCs w:val="22"/>
+        </w:rPr>
+        <w:t>Como: Arrendador</w:t>
+      </w:r>
+    </w:p>
+    <w:p>
+      <w:pPr>
+        <w:pStyle w:val="paragraph"/>
+        <w:spacing w:after="0"/>
+        <w:textAlignment w:val="baseline"/>
+        <w:rPr>
+          <w:rFonts w:ascii="Segoe UI" w:hAnsi="Segoe UI" w:cs="Segoe UI"/>
+          <w:sz w:val="22"/>
+          <w:szCs w:val="22"/>
+        </w:rPr>
+      </w:pPr>
+      <w:r>
+        <w:rPr>
+          <w:rFonts w:ascii="Segoe UI" w:hAnsi="Segoe UI" w:cs="Segoe UI"/>
+          <w:sz w:val="22"/>
+          <w:szCs w:val="22"/>
+        </w:rPr>
+        <w:t>Quiero: Registrar una reseña sobre los huéspedes que ocupan mi propiedad de Peace At Home</w:t>
+      </w:r>
+    </w:p>
+    <w:p>
+      <w:pPr>
+        <w:pStyle w:val="paragraph"/>
+        <w:spacing w:before="0" w:beforeAutospacing="0" w:after="0" w:afterAutospacing="0"/>
+        <w:textAlignment w:val="baseline"/>
+        <w:rPr>
+          <w:rFonts w:ascii="Segoe UI" w:hAnsi="Segoe UI" w:cs="Segoe UI"/>
+          <w:sz w:val="22"/>
+          <w:szCs w:val="22"/>
+        </w:rPr>
+      </w:pPr>
+      <w:r>
+        <w:rPr>
+          <w:rFonts w:ascii="Segoe UI" w:hAnsi="Segoe UI" w:cs="Segoe UI"/>
+          <w:sz w:val="22"/>
+          <w:szCs w:val="22"/>
+        </w:rPr>
+        <w:t>Para: Llevar un registro de cosas que pueden mejorarse en la propiedad para otorgarles una mejor comodidad</w:t>
+      </w:r>
+    </w:p>
+    <w:p>
+      <w:pPr>
+        <w:pStyle w:val="paragraph"/>
+        <w:spacing w:before="0" w:beforeAutospacing="0" w:after="0" w:afterAutospacing="0"/>
+        <w:textAlignment w:val="baseline"/>
+        <w:rPr>
+          <w:rFonts w:ascii="Segoe UI" w:hAnsi="Segoe UI" w:cs="Segoe UI"/>
+          <w:sz w:val="22"/>
+          <w:szCs w:val="22"/>
+        </w:rPr>
+      </w:pPr>
+    </w:p>
+    <w:p>
+      <w:pPr>
+        <w:pStyle w:val="paragraph"/>
+        <w:spacing w:before="0" w:beforeAutospacing="0" w:after="0" w:afterAutospacing="0"/>
+        <w:textAlignment w:val="baseline"/>
+        <w:rPr>
+          <w:rFonts w:ascii="Segoe UI" w:hAnsi="Segoe UI" w:cs="Segoe UI"/>
+          <w:sz w:val="22"/>
+          <w:szCs w:val="22"/>
+        </w:rPr>
+      </w:pPr>
+    </w:p>
+    <w:p>
+      <w:pPr>
+        <w:pStyle w:val="paragraph"/>
+        <w:spacing w:before="0" w:beforeAutospacing="0" w:after="0" w:afterAutospacing="0"/>
+        <w:textAlignment w:val="baseline"/>
+        <w:rPr>
+          <w:rStyle w:val="eop"/>
+          <w:rFonts w:ascii="Calibri" w:eastAsia="MS Mincho" w:hAnsi="Calibri" w:cs="Calibri"/>
+          <w:sz w:val="22"/>
+          <w:szCs w:val="22"/>
+        </w:rPr>
+      </w:pPr>
+    </w:p>
+    <w:p>
+      <w:pPr>
+        <w:pStyle w:val="paragraph"/>
+        <w:spacing w:before="0" w:beforeAutospacing="0" w:after="0" w:afterAutospacing="0"/>
+        <w:textAlignment w:val="baseline"/>
+        <w:rPr>
+          <w:rStyle w:val="eop"/>
+          <w:rFonts w:ascii="Calibri" w:eastAsia="MS Mincho" w:hAnsi="Calibri" w:cs="Calibri"/>
+          <w:sz w:val="22"/>
+          <w:szCs w:val="22"/>
+        </w:rPr>
+      </w:pPr>
+    </w:p>
+    <w:p>
+      <w:pPr>
+        <w:pStyle w:val="paragraph"/>
+        <w:spacing w:before="0" w:beforeAutospacing="0" w:after="0" w:afterAutospacing="0"/>
+        <w:textAlignment w:val="baseline"/>
+        <w:rPr>
+          <w:rStyle w:val="eop"/>
+          <w:rFonts w:ascii="Calibri" w:eastAsia="MS Mincho" w:hAnsi="Calibri" w:cs="Calibri"/>
+          <w:sz w:val="22"/>
+          <w:szCs w:val="22"/>
+        </w:rPr>
+      </w:pPr>
+    </w:p>
+    <w:p>
+      <w:pPr>
+        <w:spacing w:before="100" w:beforeAutospacing="1" w:after="100" w:afterAutospacing="1" w:line="240" w:lineRule="auto"/>
+        <w:rPr>
+          <w:rFonts w:ascii="Arial" w:eastAsia="Times New Roman" w:hAnsi="Arial" w:cs="Arial"/>
+          <w:szCs w:val="24"/>
+          <w:lang w:eastAsia="es-GT"/>
+        </w:rPr>
+      </w:pPr>
+    </w:p>
+    <w:p>
+      <w:pPr>
+        <w:spacing w:before="100" w:beforeAutospacing="1" w:after="100" w:afterAutospacing="1" w:line="240" w:lineRule="auto"/>
+        <w:rPr>
+          <w:rFonts w:ascii="Arial" w:eastAsia="Times New Roman" w:hAnsi="Arial" w:cs="Arial"/>
+          <w:sz w:val="24"/>
+          <w:szCs w:val="24"/>
+          <w:lang w:eastAsia="es-GT"/>
+        </w:rPr>
+      </w:pPr>
+    </w:p>
+    <w:p>
+      <w:pPr>
+        <w:rPr>
+          <w:b/>
+        </w:rPr>
+      </w:pPr>
+      <w:r>
+        <w:rPr>
+          <w:b/>
+        </w:rPr>
+        <w:t>Tupla: Pago</w:t>
+      </w:r>
+    </w:p>
+    <w:p>
+      <w:r>
+        <w:t>HURH-0010 Registro de pago:</w:t>
+      </w:r>
+    </w:p>
+    <w:p>
+      <w:r>
+        <w:t>1. Como un registro de pagos</w:t>
+      </w:r>
+    </w:p>
+    <w:p>
+      <w:r>
+        <w:t>2. Quiero que registre los datos del monto</w:t>
+      </w:r>
+    </w:p>
+    <w:p>
+      <w:r>
+        <w:t>3. Para poder confirmar que los datos del monto estén registrados</w:t>
+      </w:r>
+    </w:p>
+    <w:p/>
+    <w:p>
+      <w:r>
+        <w:t>HURH-0011 Validación de monto máximo</w:t>
+      </w:r>
+    </w:p>
+    <w:p>
+      <w:r>
+        <w:t xml:space="preserve">1. Como método de pago </w:t>
+      </w:r>
+    </w:p>
+    <w:p>
+      <w:r>
+        <w:t>2. Quiero que el monto sea en efectivo o en tarjeta</w:t>
+      </w:r>
+    </w:p>
+    <w:p>
+      <w:r>
+        <w:t>3. Para verificar si el monto de pago es valido</w:t>
+      </w:r>
+    </w:p>
+    <w:p/>
+    <w:p>
+      <w:r>
+        <w:t>HURH-0012 Generación de recibo de pago</w:t>
+      </w:r>
+    </w:p>
+    <w:p>
+      <w:r>
+        <w:t xml:space="preserve">1. Como registro de pago recibido </w:t>
+      </w:r>
+    </w:p>
+    <w:p>
+      <w:r>
+        <w:t>2. Quiero que me den la información del monto de pago</w:t>
+      </w:r>
+    </w:p>
+    <w:p>
+      <w:pPr>
+        <w:spacing w:before="100" w:beforeAutospacing="1" w:after="100" w:afterAutospacing="1" w:line="240" w:lineRule="auto"/>
+        <w:rPr>
+          <w:rFonts w:ascii="Arial" w:eastAsia="Times New Roman" w:hAnsi="Arial" w:cs="Arial"/>
+          <w:sz w:val="24"/>
+          <w:szCs w:val="24"/>
+          <w:lang w:eastAsia="es-GT"/>
+        </w:rPr>
+      </w:pPr>
+      <w:r>
+        <w:t>3. Para que registre el recibo y se almacene en el sistema</w:t>
+      </w:r>
+    </w:p>
+    <w:p>
+      <w:pPr>
+        <w:spacing w:before="100" w:beforeAutospacing="1" w:after="100" w:afterAutospacing="1" w:line="240" w:lineRule="auto"/>
+        <w:rPr>
+          <w:rFonts w:ascii="Arial" w:eastAsia="Times New Roman" w:hAnsi="Arial" w:cs="Arial"/>
+          <w:sz w:val="24"/>
+          <w:szCs w:val="24"/>
+          <w:lang w:eastAsia="es-GT"/>
+        </w:rPr>
+      </w:pPr>
+    </w:p>
+    <w:p>
+      <w:pPr>
+        <w:spacing w:before="100" w:beforeAutospacing="1" w:after="100" w:afterAutospacing="1" w:line="240" w:lineRule="auto"/>
+        <w:rPr>
+          <w:rFonts w:ascii="Arial" w:eastAsia="Times New Roman" w:hAnsi="Arial" w:cs="Arial"/>
+          <w:sz w:val="24"/>
+          <w:szCs w:val="24"/>
+          <w:lang w:eastAsia="es-GT"/>
+        </w:rPr>
+      </w:pPr>
+      <w:r>
+        <w:rPr>
+          <w:rFonts w:ascii="Arial" w:eastAsia="Times New Roman" w:hAnsi="Arial" w:cs="Arial"/>
+          <w:sz w:val="24"/>
+          <w:szCs w:val="24"/>
+          <w:lang w:eastAsia="es-GT"/>
+        </w:rPr>
+        <w:t xml:space="preserve">Tupla: Reembolso </w:t>
+      </w:r>
+    </w:p>
+    <w:p>
+      <w:pPr>
+        <w:spacing w:before="100" w:beforeAutospacing="1" w:after="100" w:afterAutospacing="1" w:line="240" w:lineRule="auto"/>
+        <w:rPr>
+          <w:rFonts w:ascii="Arial" w:eastAsia="Times New Roman" w:hAnsi="Arial" w:cs="Arial"/>
+          <w:sz w:val="24"/>
+          <w:szCs w:val="24"/>
+          <w:u w:val="single"/>
+          <w:lang w:eastAsia="es-GT"/>
+        </w:rPr>
+      </w:pPr>
+      <w:r>
+        <w:rPr>
+          <w:rFonts w:ascii="Arial" w:eastAsia="Times New Roman" w:hAnsi="Arial" w:cs="Arial"/>
+          <w:sz w:val="24"/>
+          <w:szCs w:val="24"/>
+          <w:lang w:eastAsia="es-GT"/>
+        </w:rPr>
+        <w:t>HUOV-0</w:t>
+      </w:r>
+      <w:r>
+        <w:rPr>
+          <w:rFonts w:ascii="Arial" w:eastAsia="Times New Roman" w:hAnsi="Arial" w:cs="Arial"/>
+          <w:sz w:val="24"/>
+          <w:szCs w:val="24"/>
+          <w:lang w:eastAsia="es-GT"/>
+        </w:rPr>
+        <w:t>13</w:t>
+      </w:r>
+    </w:p>
+    <w:p>
+      <w:pPr>
+        <w:spacing w:before="100" w:beforeAutospacing="1" w:after="100" w:afterAutospacing="1" w:line="240" w:lineRule="auto"/>
+        <w:rPr>
+          <w:rFonts w:ascii="Arial" w:eastAsia="Times New Roman" w:hAnsi="Arial" w:cs="Arial"/>
+          <w:sz w:val="24"/>
+          <w:szCs w:val="24"/>
+          <w:lang w:eastAsia="es-GT"/>
+        </w:rPr>
+      </w:pPr>
+      <w:r>
+        <w:rPr>
+          <w:rFonts w:ascii="Arial" w:eastAsia="Times New Roman" w:hAnsi="Arial" w:cs="Arial"/>
+          <w:sz w:val="24"/>
+          <w:szCs w:val="24"/>
+          <w:lang w:eastAsia="es-GT"/>
+        </w:rPr>
+        <w:t>Como: empleado</w:t>
+      </w:r>
+    </w:p>
+    <w:p>
+      <w:pPr>
+        <w:spacing w:before="100" w:beforeAutospacing="1" w:after="100" w:afterAutospacing="1" w:line="240" w:lineRule="auto"/>
+        <w:rPr>
+          <w:rFonts w:ascii="Arial" w:eastAsia="Times New Roman" w:hAnsi="Arial" w:cs="Arial"/>
+          <w:sz w:val="24"/>
+          <w:szCs w:val="24"/>
+          <w:lang w:eastAsia="es-GT"/>
+        </w:rPr>
+      </w:pPr>
+      <w:r>
+        <w:rPr>
+          <w:rFonts w:ascii="Arial" w:eastAsia="Times New Roman" w:hAnsi="Arial" w:cs="Arial"/>
+          <w:sz w:val="24"/>
+          <w:szCs w:val="24"/>
+          <w:lang w:eastAsia="es-GT"/>
+        </w:rPr>
+        <w:t xml:space="preserve">Quiero: Poder enviar una solicitud de reembolso cargando recibos y completando un formulario, </w:t>
+      </w:r>
+    </w:p>
+    <w:p>
+      <w:pPr>
+        <w:spacing w:before="100" w:beforeAutospacing="1" w:after="100" w:afterAutospacing="1" w:line="240" w:lineRule="auto"/>
+        <w:rPr>
+          <w:rFonts w:ascii="Arial" w:eastAsia="Times New Roman" w:hAnsi="Arial" w:cs="Arial"/>
+          <w:sz w:val="24"/>
+          <w:szCs w:val="24"/>
+          <w:lang w:eastAsia="es-GT"/>
+        </w:rPr>
+      </w:pPr>
+      <w:r>
+        <w:rPr>
+          <w:rFonts w:ascii="Arial" w:eastAsia="Times New Roman" w:hAnsi="Arial" w:cs="Arial"/>
+          <w:sz w:val="24"/>
+          <w:szCs w:val="24"/>
+          <w:lang w:eastAsia="es-GT"/>
+        </w:rPr>
+        <w:t>para que la administración pueda revisar y aprobar el reembolso de los gastos.</w:t>
+      </w:r>
+    </w:p>
+    <w:p>
+      <w:pPr>
+        <w:spacing w:before="100" w:beforeAutospacing="1" w:after="100" w:afterAutospacing="1" w:line="240" w:lineRule="auto"/>
+        <w:rPr>
+          <w:rFonts w:ascii="Arial" w:eastAsia="Times New Roman" w:hAnsi="Arial" w:cs="Arial"/>
+          <w:sz w:val="24"/>
+          <w:szCs w:val="24"/>
+          <w:lang w:eastAsia="es-GT"/>
+        </w:rPr>
+      </w:pPr>
+      <w:r>
+        <w:rPr>
+          <w:rFonts w:ascii="Arial" w:eastAsia="Times New Roman" w:hAnsi="Arial" w:cs="Arial"/>
+          <w:sz w:val="24"/>
+          <w:szCs w:val="24"/>
+          <w:lang w:eastAsia="es-GT"/>
+        </w:rPr>
+        <w:t>Para: Para ofrecer un rembolso cada que lo necesite un cliente.</w:t>
+      </w:r>
+      <w:r>
+        <w:rPr>
+          <w:rFonts w:ascii="Arial" w:eastAsia="Times New Roman" w:hAnsi="Arial" w:cs="Arial"/>
+          <w:sz w:val="24"/>
+          <w:szCs w:val="24"/>
+          <w:lang w:eastAsia="es-GT"/>
+        </w:rPr>
+        <w:t xml:space="preserve"> </w:t>
+      </w:r>
+    </w:p>
+    <w:p>
+      <w:pPr>
+        <w:spacing w:before="100" w:beforeAutospacing="1" w:after="100" w:afterAutospacing="1" w:line="240" w:lineRule="auto"/>
+        <w:rPr>
+          <w:rFonts w:ascii="Arial" w:eastAsia="Times New Roman" w:hAnsi="Arial" w:cs="Arial"/>
+          <w:sz w:val="24"/>
+          <w:szCs w:val="24"/>
+          <w:lang w:eastAsia="es-GT"/>
+        </w:rPr>
+      </w:pPr>
+      <w:r>
+        <w:rPr>
+          <w:rFonts w:ascii="Arial" w:eastAsia="Times New Roman" w:hAnsi="Arial" w:cs="Arial"/>
+          <w:sz w:val="24"/>
+          <w:szCs w:val="24"/>
+          <w:lang w:eastAsia="es-GT"/>
+        </w:rPr>
+        <w:t>HUOV-0</w:t>
+      </w:r>
+      <w:r>
+        <w:rPr>
+          <w:rFonts w:ascii="Arial" w:eastAsia="Times New Roman" w:hAnsi="Arial" w:cs="Arial"/>
+          <w:sz w:val="24"/>
+          <w:szCs w:val="24"/>
+          <w:lang w:eastAsia="es-GT"/>
+        </w:rPr>
+        <w:t>14</w:t>
+      </w:r>
+    </w:p>
+    <w:p>
+      <w:pPr>
+        <w:spacing w:before="100" w:beforeAutospacing="1" w:after="100" w:afterAutospacing="1" w:line="240" w:lineRule="auto"/>
+        <w:rPr>
+          <w:rFonts w:ascii="Arial" w:eastAsia="Times New Roman" w:hAnsi="Arial" w:cs="Arial"/>
+          <w:sz w:val="24"/>
+          <w:szCs w:val="24"/>
+          <w:lang w:eastAsia="es-GT"/>
+        </w:rPr>
+      </w:pPr>
+      <w:r>
+        <w:rPr>
+          <w:rFonts w:ascii="Arial" w:eastAsia="Times New Roman" w:hAnsi="Arial" w:cs="Arial"/>
+          <w:sz w:val="24"/>
+          <w:szCs w:val="24"/>
+          <w:lang w:eastAsia="es-GT"/>
+        </w:rPr>
+        <w:t xml:space="preserve">Como: Administrador financiero </w:t>
+      </w:r>
+    </w:p>
+    <w:p>
+      <w:pPr>
+        <w:spacing w:before="100" w:beforeAutospacing="1" w:after="100" w:afterAutospacing="1" w:line="240" w:lineRule="auto"/>
+        <w:rPr>
+          <w:rFonts w:ascii="Arial" w:eastAsia="Times New Roman" w:hAnsi="Arial" w:cs="Arial"/>
+          <w:sz w:val="24"/>
+          <w:szCs w:val="24"/>
+          <w:lang w:eastAsia="es-GT"/>
+        </w:rPr>
+      </w:pPr>
+      <w:r>
+        <w:rPr>
+          <w:rFonts w:ascii="Arial" w:eastAsia="Times New Roman" w:hAnsi="Arial" w:cs="Arial"/>
+          <w:sz w:val="24"/>
+          <w:szCs w:val="24"/>
+          <w:lang w:eastAsia="es-GT"/>
+        </w:rPr>
+        <w:t xml:space="preserve">Quiero: Acceder a todas las solicitudes de rembolso recibidas y poder aprobarlas o rechazarlas </w:t>
+      </w:r>
+    </w:p>
+    <w:p>
+      <w:pPr>
+        <w:spacing w:before="100" w:beforeAutospacing="1" w:after="100" w:afterAutospacing="1" w:line="240" w:lineRule="auto"/>
+        <w:rPr>
+          <w:rFonts w:ascii="Arial" w:eastAsia="Times New Roman" w:hAnsi="Arial" w:cs="Arial"/>
+          <w:sz w:val="24"/>
+          <w:szCs w:val="24"/>
+          <w:lang w:eastAsia="es-GT"/>
+        </w:rPr>
+      </w:pPr>
+      <w:r>
+        <w:rPr>
+          <w:rFonts w:ascii="Arial" w:eastAsia="Times New Roman" w:hAnsi="Arial" w:cs="Arial"/>
+          <w:sz w:val="24"/>
+          <w:szCs w:val="24"/>
+          <w:lang w:eastAsia="es-GT"/>
+        </w:rPr>
+        <w:t>o hasta incluso pedir más información sobre la solicitud de rembolso.</w:t>
+      </w:r>
+    </w:p>
+    <w:p>
+      <w:pPr>
+        <w:spacing w:before="100" w:beforeAutospacing="1" w:after="100" w:afterAutospacing="1" w:line="240" w:lineRule="auto"/>
+        <w:rPr>
+          <w:rFonts w:ascii="Arial" w:eastAsia="Times New Roman" w:hAnsi="Arial" w:cs="Arial"/>
+          <w:sz w:val="24"/>
+          <w:szCs w:val="24"/>
+          <w:lang w:eastAsia="es-GT"/>
+        </w:rPr>
+      </w:pPr>
+      <w:r>
+        <w:rPr>
+          <w:rFonts w:ascii="Arial" w:eastAsia="Times New Roman" w:hAnsi="Arial" w:cs="Arial"/>
+          <w:sz w:val="24"/>
+          <w:szCs w:val="24"/>
+          <w:lang w:eastAsia="es-GT"/>
+        </w:rPr>
+        <w:lastRenderedPageBreak/>
+        <w:t>Para: Tener un registro de cada acción tomada con fecha y el usuario responsable.</w:t>
+      </w:r>
+    </w:p>
+    <w:p>
+      <w:pPr>
+        <w:spacing w:before="100" w:beforeAutospacing="1" w:after="100" w:afterAutospacing="1" w:line="240" w:lineRule="auto"/>
+        <w:rPr>
+          <w:rFonts w:ascii="Arial" w:eastAsia="Times New Roman" w:hAnsi="Arial" w:cs="Arial"/>
+          <w:sz w:val="24"/>
+          <w:szCs w:val="24"/>
+          <w:lang w:eastAsia="es-GT"/>
+        </w:rPr>
+      </w:pPr>
+    </w:p>
+    <w:p>
+      <w:pPr>
+        <w:spacing w:before="100" w:beforeAutospacing="1" w:after="100" w:afterAutospacing="1" w:line="240" w:lineRule="auto"/>
+        <w:rPr>
+          <w:rFonts w:ascii="Arial" w:eastAsia="Times New Roman" w:hAnsi="Arial" w:cs="Arial"/>
+          <w:sz w:val="24"/>
+          <w:szCs w:val="24"/>
+          <w:lang w:eastAsia="es-GT"/>
+        </w:rPr>
+      </w:pPr>
+    </w:p>
+    <w:p>
+      <w:pPr>
+        <w:spacing w:before="100" w:beforeAutospacing="1" w:after="100" w:afterAutospacing="1" w:line="240" w:lineRule="auto"/>
+        <w:rPr>
+          <w:rFonts w:ascii="Arial" w:eastAsia="Times New Roman" w:hAnsi="Arial" w:cs="Arial"/>
+          <w:sz w:val="24"/>
+          <w:szCs w:val="24"/>
+          <w:lang w:eastAsia="es-GT"/>
+        </w:rPr>
+      </w:pPr>
+      <w:r>
+        <w:rPr>
+          <w:rFonts w:ascii="Arial" w:eastAsia="Times New Roman" w:hAnsi="Arial" w:cs="Arial"/>
+          <w:sz w:val="24"/>
+          <w:szCs w:val="24"/>
+          <w:lang w:eastAsia="es-GT"/>
+        </w:rPr>
+        <w:t>HUOV-0</w:t>
+      </w:r>
+      <w:r>
+        <w:rPr>
+          <w:rFonts w:ascii="Arial" w:eastAsia="Times New Roman" w:hAnsi="Arial" w:cs="Arial"/>
+          <w:sz w:val="24"/>
+          <w:szCs w:val="24"/>
+          <w:lang w:eastAsia="es-GT"/>
+        </w:rPr>
+        <w:t>15</w:t>
+      </w:r>
+    </w:p>
+    <w:p>
+      <w:pPr>
+        <w:spacing w:before="100" w:beforeAutospacing="1" w:after="100" w:afterAutospacing="1" w:line="240" w:lineRule="auto"/>
+        <w:rPr>
+          <w:rFonts w:ascii="Arial" w:eastAsia="Times New Roman" w:hAnsi="Arial" w:cs="Arial"/>
+          <w:sz w:val="24"/>
+          <w:szCs w:val="24"/>
+          <w:lang w:eastAsia="es-GT"/>
+        </w:rPr>
+      </w:pPr>
+      <w:r>
+        <w:rPr>
+          <w:rFonts w:ascii="Arial" w:eastAsia="Times New Roman" w:hAnsi="Arial" w:cs="Arial"/>
+          <w:sz w:val="24"/>
+          <w:szCs w:val="24"/>
+          <w:lang w:eastAsia="es-GT"/>
+        </w:rPr>
+        <w:t xml:space="preserve">Como: Cliente </w:t>
+      </w:r>
+    </w:p>
+    <w:p>
+      <w:pPr>
+        <w:spacing w:before="100" w:beforeAutospacing="1" w:after="100" w:afterAutospacing="1" w:line="240" w:lineRule="auto"/>
+        <w:rPr>
+          <w:rFonts w:ascii="Arial" w:eastAsia="Times New Roman" w:hAnsi="Arial" w:cs="Arial"/>
+          <w:sz w:val="24"/>
+          <w:szCs w:val="24"/>
+          <w:lang w:eastAsia="es-GT"/>
+        </w:rPr>
+      </w:pPr>
+      <w:r>
+        <w:rPr>
+          <w:rFonts w:ascii="Arial" w:eastAsia="Times New Roman" w:hAnsi="Arial" w:cs="Arial"/>
+          <w:sz w:val="24"/>
+          <w:szCs w:val="24"/>
+          <w:lang w:eastAsia="es-GT"/>
+        </w:rPr>
+        <w:t xml:space="preserve">Quiero: Recibir notificaciones cada vez que cambie el estado de mi solicitud de reembolso, </w:t>
+      </w:r>
+    </w:p>
+    <w:p>
+      <w:pPr>
+        <w:spacing w:before="100" w:beforeAutospacing="1" w:after="100" w:afterAutospacing="1" w:line="240" w:lineRule="auto"/>
+        <w:rPr>
+          <w:rFonts w:ascii="Arial" w:eastAsia="Times New Roman" w:hAnsi="Arial" w:cs="Arial"/>
+          <w:sz w:val="24"/>
+          <w:szCs w:val="24"/>
+          <w:lang w:eastAsia="es-GT"/>
+        </w:rPr>
+      </w:pPr>
+      <w:r>
+        <w:rPr>
+          <w:rFonts w:ascii="Arial" w:eastAsia="Times New Roman" w:hAnsi="Arial" w:cs="Arial"/>
+          <w:sz w:val="24"/>
+          <w:szCs w:val="24"/>
+          <w:lang w:eastAsia="es-GT"/>
+        </w:rPr>
+        <w:t>para mantenerme informado sobre el avance y resultado de mi trámite.</w:t>
+      </w:r>
+    </w:p>
+    <w:p>
+      <w:pPr>
+        <w:spacing w:before="100" w:beforeAutospacing="1" w:after="100" w:afterAutospacing="1" w:line="240" w:lineRule="auto"/>
+        <w:rPr>
+          <w:rFonts w:ascii="Arial" w:eastAsia="Times New Roman" w:hAnsi="Arial" w:cs="Arial"/>
+          <w:sz w:val="24"/>
+          <w:szCs w:val="24"/>
+          <w:lang w:eastAsia="es-GT"/>
+        </w:rPr>
+      </w:pPr>
+      <w:r>
+        <w:rPr>
+          <w:rFonts w:ascii="Arial" w:eastAsia="Times New Roman" w:hAnsi="Arial" w:cs="Arial"/>
+          <w:sz w:val="24"/>
+          <w:szCs w:val="24"/>
+          <w:lang w:eastAsia="es-GT"/>
+        </w:rPr>
+        <w:t>Para: Tener un envio automático de notificaciones por correo electrónico y dentro del sistema.</w:t>
+      </w:r>
+    </w:p>
+    <w:p>
+      <w:pPr>
+        <w:spacing w:before="100" w:beforeAutospacing="1" w:after="100" w:afterAutospacing="1" w:line="240" w:lineRule="auto"/>
+        <w:rPr>
+          <w:rFonts w:ascii="Arial" w:eastAsia="Times New Roman" w:hAnsi="Arial" w:cs="Arial"/>
+          <w:sz w:val="24"/>
+          <w:szCs w:val="24"/>
+          <w:lang w:eastAsia="es-GT"/>
+        </w:rPr>
+      </w:pPr>
+    </w:p>
+    <w:p>
+      <w:pPr>
+        <w:pStyle w:val="NormalWeb"/>
+        <w:rPr>
+          <w:rStyle w:val="cf01"/>
+          <w:rFonts w:cs="Arial"/>
+          <w:b/>
+          <w:sz w:val="24"/>
+          <w:szCs w:val="24"/>
+        </w:rPr>
+      </w:pPr>
+      <w:r>
+        <w:rPr>
+          <w:rStyle w:val="cf01"/>
+          <w:rFonts w:cs="Arial"/>
+          <w:b/>
+          <w:sz w:val="24"/>
+          <w:szCs w:val="24"/>
+        </w:rPr>
+        <w:t>Tupla: Comodidades</w:t>
+      </w:r>
+    </w:p>
+    <w:p>
+      <w:pPr>
+        <w:pStyle w:val="NormalWeb"/>
+        <w:rPr>
+          <w:rFonts w:ascii="Arial" w:hAnsi="Arial" w:cs="Arial"/>
+          <w:sz w:val="22"/>
+          <w:szCs w:val="22"/>
+        </w:rPr>
+      </w:pPr>
+      <w:r>
+        <w:rPr>
+          <w:rFonts w:ascii="Arial" w:hAnsi="Arial" w:cs="Arial"/>
+          <w:sz w:val="22"/>
+          <w:szCs w:val="22"/>
+        </w:rPr>
+        <w:t>HUBA-0</w:t>
+      </w:r>
+      <w:r>
+        <w:rPr>
+          <w:rFonts w:ascii="Arial" w:hAnsi="Arial" w:cs="Arial"/>
+          <w:sz w:val="22"/>
+          <w:szCs w:val="22"/>
+        </w:rPr>
+        <w:t>16</w:t>
+      </w:r>
+      <w:r>
+        <w:rPr>
+          <w:rFonts w:ascii="Arial" w:hAnsi="Arial" w:cs="Arial"/>
+          <w:sz w:val="22"/>
+          <w:szCs w:val="22"/>
+        </w:rPr>
+        <w:t>: Visualización Detallada de Comodidades Disponibles</w:t>
+      </w:r>
+    </w:p>
+    <w:p>
+      <w:pPr>
+        <w:pStyle w:val="NormalWeb"/>
+        <w:rPr>
+          <w:rFonts w:ascii="Arial" w:hAnsi="Arial" w:cs="Arial"/>
+          <w:sz w:val="22"/>
+          <w:szCs w:val="22"/>
+        </w:rPr>
+      </w:pPr>
+      <w:r>
+        <w:rPr>
+          <w:rFonts w:ascii="Arial" w:hAnsi="Arial" w:cs="Arial"/>
+          <w:sz w:val="22"/>
+          <w:szCs w:val="22"/>
+        </w:rPr>
+        <w:t>Como: Comodidades</w:t>
+      </w:r>
+    </w:p>
+    <w:p>
+      <w:pPr>
+        <w:pStyle w:val="NormalWeb"/>
+        <w:rPr>
+          <w:rFonts w:ascii="Arial" w:hAnsi="Arial" w:cs="Arial"/>
+          <w:sz w:val="22"/>
+          <w:szCs w:val="22"/>
+        </w:rPr>
+      </w:pPr>
+      <w:r>
+        <w:rPr>
+          <w:rFonts w:ascii="Arial" w:hAnsi="Arial" w:cs="Arial"/>
+          <w:sz w:val="22"/>
+          <w:szCs w:val="22"/>
+        </w:rPr>
+        <w:t>Quiero: poder ver una descripción completa y detallada de todas las comodidades disponibles en la propiedad</w:t>
+      </w:r>
+    </w:p>
+    <w:p>
+      <w:pPr>
+        <w:pStyle w:val="NormalWeb"/>
+        <w:rPr>
+          <w:rFonts w:ascii="Arial" w:hAnsi="Arial" w:cs="Arial"/>
+          <w:sz w:val="22"/>
+          <w:szCs w:val="22"/>
+        </w:rPr>
+      </w:pPr>
+      <w:r>
+        <w:rPr>
+          <w:rFonts w:ascii="Arial" w:hAnsi="Arial" w:cs="Arial"/>
+          <w:sz w:val="22"/>
+          <w:szCs w:val="22"/>
+        </w:rPr>
+        <w:t>Para: ofrecer información precisa y enriquecedora que mejore significativamente la experiencia de búsqueda del usuario, permitiéndole tomar decisiones informadas.</w:t>
+      </w:r>
+    </w:p>
+    <w:p>
+      <w:pPr>
+        <w:spacing w:before="100" w:beforeAutospacing="1" w:after="100" w:afterAutospacing="1" w:line="240" w:lineRule="auto"/>
+        <w:rPr>
+          <w:rFonts w:ascii="Arial" w:eastAsia="Times New Roman" w:hAnsi="Arial" w:cs="Arial"/>
+          <w:sz w:val="24"/>
+          <w:szCs w:val="24"/>
+          <w:lang w:eastAsia="es-GT"/>
+        </w:rPr>
+      </w:pPr>
+    </w:p>
+    <w:p>
+      <w:pPr>
+        <w:spacing w:before="100" w:beforeAutospacing="1" w:after="100" w:afterAutospacing="1" w:line="240" w:lineRule="auto"/>
+        <w:rPr>
+          <w:rFonts w:ascii="Arial" w:eastAsia="Times New Roman" w:hAnsi="Arial" w:cs="Arial"/>
+          <w:sz w:val="24"/>
+          <w:szCs w:val="24"/>
+          <w:lang w:eastAsia="es-GT"/>
+        </w:rPr>
+      </w:pPr>
+    </w:p>
+    <w:p>
+      <w:pPr>
+        <w:spacing w:before="100" w:beforeAutospacing="1" w:after="100" w:afterAutospacing="1" w:line="240" w:lineRule="auto"/>
+        <w:rPr>
+          <w:rFonts w:ascii="Arial" w:eastAsia="Times New Roman" w:hAnsi="Arial" w:cs="Arial"/>
+          <w:sz w:val="24"/>
+          <w:szCs w:val="24"/>
+          <w:lang w:eastAsia="es-GT"/>
+        </w:rPr>
+      </w:pPr>
+    </w:p>
+    <w:p>
+      <w:pPr>
+        <w:spacing w:before="100" w:beforeAutospacing="1" w:after="100" w:afterAutospacing="1" w:line="240" w:lineRule="auto"/>
+        <w:rPr>
+          <w:rFonts w:ascii="Arial" w:eastAsia="Times New Roman" w:hAnsi="Arial" w:cs="Arial"/>
+          <w:sz w:val="24"/>
+          <w:szCs w:val="24"/>
+          <w:lang w:eastAsia="es-GT"/>
+        </w:rPr>
+      </w:pPr>
+    </w:p>
+    <w:p>
+      <w:pPr>
+        <w:spacing w:before="100" w:beforeAutospacing="1" w:after="100" w:afterAutospacing="1" w:line="240" w:lineRule="auto"/>
+        <w:rPr>
+          <w:rFonts w:ascii="Arial" w:eastAsia="Times New Roman" w:hAnsi="Arial" w:cs="Arial"/>
+          <w:sz w:val="24"/>
+          <w:szCs w:val="24"/>
+          <w:lang w:eastAsia="es-GT"/>
+        </w:rPr>
+      </w:pPr>
+    </w:p>
+    <w:p>
+      <w:pPr>
+        <w:spacing w:before="100" w:beforeAutospacing="1" w:after="100" w:afterAutospacing="1" w:line="240" w:lineRule="auto"/>
+        <w:rPr>
+          <w:rFonts w:ascii="Arial" w:eastAsia="Times New Roman" w:hAnsi="Arial" w:cs="Arial"/>
+          <w:sz w:val="24"/>
+          <w:szCs w:val="24"/>
+          <w:lang w:eastAsia="es-GT"/>
+        </w:rPr>
+      </w:pPr>
+    </w:p>
+    <w:p>
+      <w:pPr>
+        <w:spacing w:before="100" w:beforeAutospacing="1" w:after="100" w:afterAutospacing="1" w:line="240" w:lineRule="auto"/>
+        <w:rPr>
+          <w:rFonts w:ascii="Arial" w:eastAsia="Times New Roman" w:hAnsi="Arial" w:cs="Arial"/>
+          <w:sz w:val="24"/>
+          <w:szCs w:val="24"/>
+          <w:lang w:eastAsia="es-GT"/>
+        </w:rPr>
+      </w:pPr>
+    </w:p>
+    <w:p>
+      <w:pPr>
+        <w:spacing w:before="100" w:beforeAutospacing="1" w:after="100" w:afterAutospacing="1" w:line="240" w:lineRule="auto"/>
+        <w:rPr>
+          <w:rFonts w:ascii="Arial" w:eastAsia="Times New Roman" w:hAnsi="Arial" w:cs="Arial"/>
+          <w:sz w:val="24"/>
+          <w:szCs w:val="24"/>
+          <w:lang w:eastAsia="es-GT"/>
+        </w:rPr>
+      </w:pPr>
+    </w:p>
+    <w:p>
+      <w:pPr>
+        <w:spacing w:before="100" w:beforeAutospacing="1" w:after="100" w:afterAutospacing="1" w:line="240" w:lineRule="auto"/>
+        <w:rPr>
+          <w:rFonts w:ascii="Arial" w:eastAsia="Times New Roman" w:hAnsi="Arial" w:cs="Arial"/>
+          <w:sz w:val="24"/>
+          <w:szCs w:val="24"/>
+          <w:lang w:eastAsia="es-GT"/>
+        </w:rPr>
+      </w:pPr>
+    </w:p>
+    <w:p>
+      <w:pPr>
+        <w:spacing w:before="100" w:beforeAutospacing="1" w:after="100" w:afterAutospacing="1" w:line="240" w:lineRule="auto"/>
+        <w:rPr>
+          <w:rFonts w:ascii="Arial" w:eastAsia="Times New Roman" w:hAnsi="Arial" w:cs="Arial"/>
+          <w:sz w:val="24"/>
+          <w:szCs w:val="24"/>
+          <w:lang w:eastAsia="es-GT"/>
+        </w:rPr>
+      </w:pPr>
+    </w:p>
+    <w:p>
+      <w:pPr>
+        <w:spacing w:before="100" w:beforeAutospacing="1" w:after="100" w:afterAutospacing="1" w:line="240" w:lineRule="auto"/>
+        <w:rPr>
+          <w:rFonts w:ascii="Arial" w:eastAsia="Times New Roman" w:hAnsi="Arial" w:cs="Arial"/>
+          <w:sz w:val="24"/>
+          <w:szCs w:val="24"/>
+          <w:lang w:eastAsia="es-GT"/>
+        </w:rPr>
+      </w:pPr>
+    </w:p>
+    <w:p>
+      <w:pPr>
+        <w:spacing w:before="100" w:beforeAutospacing="1" w:after="100" w:afterAutospacing="1" w:line="240" w:lineRule="auto"/>
+        <w:rPr>
+          <w:rFonts w:ascii="Arial" w:eastAsia="Times New Roman" w:hAnsi="Arial" w:cs="Arial"/>
+          <w:sz w:val="24"/>
+          <w:szCs w:val="24"/>
+          <w:lang w:eastAsia="es-GT"/>
+        </w:rPr>
+      </w:pPr>
+    </w:p>
+    <w:p>
+      <w:pPr>
+        <w:spacing w:before="100" w:beforeAutospacing="1" w:after="100" w:afterAutospacing="1" w:line="240" w:lineRule="auto"/>
+        <w:rPr>
+          <w:rFonts w:ascii="Arial" w:eastAsia="Times New Roman" w:hAnsi="Arial" w:cs="Arial"/>
+          <w:sz w:val="24"/>
+          <w:szCs w:val="24"/>
+          <w:lang w:eastAsia="es-GT"/>
+        </w:rPr>
+      </w:pPr>
+    </w:p>
+    <w:p>
+      <w:pPr>
+        <w:spacing w:before="100" w:beforeAutospacing="1" w:after="100" w:afterAutospacing="1" w:line="240" w:lineRule="auto"/>
+        <w:rPr>
+          <w:rFonts w:ascii="Arial" w:eastAsia="Times New Roman" w:hAnsi="Arial" w:cs="Arial"/>
+          <w:sz w:val="24"/>
+          <w:szCs w:val="24"/>
+          <w:lang w:eastAsia="es-GT"/>
+        </w:rPr>
+      </w:pPr>
+    </w:p>
+    <w:p>
+      <w:pPr>
+        <w:spacing w:before="100" w:beforeAutospacing="1" w:after="100" w:afterAutospacing="1" w:line="240" w:lineRule="auto"/>
+        <w:rPr>
+          <w:rFonts w:ascii="Arial" w:eastAsia="Times New Roman" w:hAnsi="Arial" w:cs="Arial"/>
+          <w:sz w:val="24"/>
+          <w:szCs w:val="24"/>
+          <w:lang w:eastAsia="es-GT"/>
+        </w:rPr>
+      </w:pPr>
+    </w:p>
+    <w:p>
+      <w:pPr>
+        <w:spacing w:before="100" w:beforeAutospacing="1" w:after="100" w:afterAutospacing="1" w:line="240" w:lineRule="auto"/>
+        <w:rPr>
+          <w:rFonts w:ascii="Arial" w:eastAsia="Times New Roman" w:hAnsi="Arial" w:cs="Arial"/>
+          <w:sz w:val="24"/>
+          <w:szCs w:val="24"/>
+          <w:lang w:eastAsia="es-GT"/>
+        </w:rPr>
+      </w:pPr>
+    </w:p>
+    <w:p>
+      <w:pPr>
+        <w:spacing w:before="100" w:beforeAutospacing="1" w:after="100" w:afterAutospacing="1" w:line="240" w:lineRule="auto"/>
+        <w:rPr>
+          <w:rFonts w:ascii="Arial" w:eastAsia="Times New Roman" w:hAnsi="Arial" w:cs="Arial"/>
+          <w:sz w:val="24"/>
+          <w:szCs w:val="24"/>
+          <w:lang w:eastAsia="es-GT"/>
+        </w:rPr>
+      </w:pPr>
+    </w:p>
+    <w:p>
+      <w:pPr>
+        <w:spacing w:before="100" w:beforeAutospacing="1" w:after="100" w:afterAutospacing="1" w:line="240" w:lineRule="auto"/>
+        <w:rPr>
+          <w:rFonts w:ascii="Arial" w:eastAsia="Times New Roman" w:hAnsi="Arial" w:cs="Arial"/>
+          <w:sz w:val="24"/>
+          <w:szCs w:val="24"/>
+          <w:lang w:eastAsia="es-GT"/>
+        </w:rPr>
+      </w:pPr>
+    </w:p>
+    <w:p>
+      <w:pPr>
+        <w:spacing w:before="100" w:beforeAutospacing="1" w:after="100" w:afterAutospacing="1" w:line="240" w:lineRule="auto"/>
+        <w:rPr>
+          <w:rFonts w:ascii="Arial" w:eastAsia="Times New Roman" w:hAnsi="Arial" w:cs="Arial"/>
+          <w:sz w:val="24"/>
+          <w:szCs w:val="24"/>
+          <w:lang w:eastAsia="es-GT"/>
+        </w:rPr>
+      </w:pPr>
+    </w:p>
+    <w:p>
+      <w:pPr>
+        <w:spacing w:before="100" w:beforeAutospacing="1" w:after="100" w:afterAutospacing="1" w:line="240" w:lineRule="auto"/>
+        <w:rPr>
+          <w:rFonts w:ascii="Arial" w:eastAsia="Times New Roman" w:hAnsi="Arial" w:cs="Arial"/>
+          <w:sz w:val="24"/>
+          <w:szCs w:val="24"/>
+          <w:lang w:eastAsia="es-GT"/>
+        </w:rPr>
+      </w:pPr>
+    </w:p>
+    <w:p>
+      <w:pPr>
+        <w:spacing w:before="100" w:beforeAutospacing="1" w:after="100" w:afterAutospacing="1" w:line="240" w:lineRule="auto"/>
+        <w:rPr>
+          <w:rFonts w:ascii="Arial" w:eastAsia="Times New Roman" w:hAnsi="Arial" w:cs="Arial"/>
+          <w:sz w:val="24"/>
+          <w:szCs w:val="24"/>
+          <w:lang w:eastAsia="es-GT"/>
+        </w:rPr>
+      </w:pPr>
+    </w:p>
+    <w:p>
+      <w:pPr>
+        <w:spacing w:before="100" w:beforeAutospacing="1" w:after="100" w:afterAutospacing="1" w:line="240" w:lineRule="auto"/>
+        <w:rPr>
+          <w:rFonts w:ascii="Arial" w:eastAsia="Times New Roman" w:hAnsi="Arial" w:cs="Arial"/>
+          <w:sz w:val="24"/>
+          <w:szCs w:val="24"/>
+          <w:lang w:eastAsia="es-GT"/>
+        </w:rPr>
+      </w:pPr>
+    </w:p>
+    <w:p>
+      <w:pPr>
+        <w:spacing w:before="100" w:beforeAutospacing="1" w:after="100" w:afterAutospacing="1" w:line="240" w:lineRule="auto"/>
+        <w:rPr>
+          <w:rFonts w:ascii="Arial" w:eastAsia="Times New Roman" w:hAnsi="Arial" w:cs="Arial"/>
+          <w:sz w:val="24"/>
+          <w:szCs w:val="24"/>
+          <w:lang w:eastAsia="es-GT"/>
+        </w:rPr>
+      </w:pPr>
+    </w:p>
+    <w:p>
+      <w:pPr>
+        <w:spacing w:before="100" w:beforeAutospacing="1" w:after="100" w:afterAutospacing="1" w:line="240" w:lineRule="auto"/>
+        <w:rPr>
+          <w:rFonts w:ascii="Arial" w:eastAsia="Times New Roman" w:hAnsi="Arial" w:cs="Arial"/>
+          <w:sz w:val="24"/>
+          <w:szCs w:val="24"/>
+          <w:lang w:eastAsia="es-GT"/>
+        </w:rPr>
+      </w:pPr>
+    </w:p>
+    <w:p>
+      <w:pPr>
+        <w:spacing w:before="100" w:beforeAutospacing="1" w:after="100" w:afterAutospacing="1" w:line="240" w:lineRule="auto"/>
+        <w:rPr>
+          <w:rFonts w:ascii="Arial" w:eastAsia="Times New Roman" w:hAnsi="Arial" w:cs="Arial"/>
+          <w:sz w:val="24"/>
+          <w:szCs w:val="24"/>
+          <w:lang w:eastAsia="es-GT"/>
+        </w:rPr>
+      </w:pPr>
+    </w:p>
+    <w:p>
+      <w:pPr>
+        <w:spacing w:before="100" w:beforeAutospacing="1" w:after="100" w:afterAutospacing="1" w:line="240" w:lineRule="auto"/>
+        <w:rPr>
+          <w:rFonts w:ascii="Arial" w:eastAsia="Times New Roman" w:hAnsi="Arial" w:cs="Arial"/>
+          <w:sz w:val="24"/>
+          <w:szCs w:val="24"/>
+          <w:lang w:eastAsia="es-GT"/>
+        </w:rPr>
+      </w:pPr>
+    </w:p>
+    <w:p>
+      <w:pPr>
+        <w:spacing w:before="100" w:beforeAutospacing="1" w:after="100" w:afterAutospacing="1" w:line="240" w:lineRule="auto"/>
+        <w:rPr>
+          <w:rFonts w:ascii="Arial" w:eastAsia="Times New Roman" w:hAnsi="Arial" w:cs="Arial"/>
+          <w:sz w:val="24"/>
+          <w:szCs w:val="24"/>
+          <w:lang w:eastAsia="es-GT"/>
+        </w:rPr>
+      </w:pPr>
+    </w:p>
+    <w:p>
+      <w:pPr>
+        <w:spacing w:before="100" w:beforeAutospacing="1" w:after="100" w:afterAutospacing="1" w:line="240" w:lineRule="auto"/>
+        <w:rPr>
+          <w:rFonts w:ascii="Arial" w:eastAsia="Times New Roman" w:hAnsi="Arial" w:cs="Arial"/>
+          <w:sz w:val="24"/>
+          <w:szCs w:val="24"/>
+          <w:lang w:eastAsia="es-GT"/>
+        </w:rPr>
+      </w:pPr>
+    </w:p>
+    <w:p>
+      <w:pPr>
+        <w:spacing w:before="100" w:beforeAutospacing="1" w:after="100" w:afterAutospacing="1" w:line="240" w:lineRule="auto"/>
+        <w:rPr>
+          <w:rFonts w:ascii="Arial" w:eastAsia="Times New Roman" w:hAnsi="Arial" w:cs="Arial"/>
+          <w:sz w:val="24"/>
+          <w:szCs w:val="24"/>
+          <w:lang w:eastAsia="es-GT"/>
+        </w:rPr>
+      </w:pPr>
+    </w:p>
+    <w:p>
+      <w:pPr>
+        <w:spacing w:before="100" w:beforeAutospacing="1" w:after="100" w:afterAutospacing="1" w:line="240" w:lineRule="auto"/>
+        <w:rPr>
+          <w:rFonts w:ascii="Arial" w:eastAsia="Times New Roman" w:hAnsi="Arial" w:cs="Arial"/>
+          <w:sz w:val="24"/>
+          <w:szCs w:val="24"/>
+          <w:lang w:eastAsia="es-GT"/>
+        </w:rPr>
+      </w:pPr>
+    </w:p>
+    <w:p>
+      <w:pPr>
+        <w:spacing w:before="100" w:beforeAutospacing="1" w:after="100" w:afterAutospacing="1" w:line="240" w:lineRule="auto"/>
+        <w:rPr>
+          <w:rFonts w:ascii="Arial" w:eastAsia="Times New Roman" w:hAnsi="Arial" w:cs="Arial"/>
+          <w:sz w:val="24"/>
+          <w:szCs w:val="24"/>
+          <w:lang w:eastAsia="es-GT"/>
+        </w:rPr>
+      </w:pPr>
+    </w:p>
+    <w:p>
+      <w:pPr>
+        <w:spacing w:before="100" w:beforeAutospacing="1" w:after="100" w:afterAutospacing="1" w:line="240" w:lineRule="auto"/>
+        <w:rPr>
+          <w:rFonts w:ascii="Arial" w:eastAsia="Times New Roman" w:hAnsi="Arial" w:cs="Arial"/>
+          <w:sz w:val="24"/>
+          <w:szCs w:val="24"/>
+          <w:lang w:eastAsia="es-GT"/>
+        </w:rPr>
+      </w:pPr>
+    </w:p>
+    <w:p>
+      <w:pPr>
+        <w:spacing w:before="100" w:beforeAutospacing="1" w:after="100" w:afterAutospacing="1" w:line="240" w:lineRule="auto"/>
+        <w:rPr>
+          <w:rFonts w:ascii="Arial" w:eastAsia="Times New Roman" w:hAnsi="Arial" w:cs="Arial"/>
+          <w:sz w:val="24"/>
+          <w:szCs w:val="24"/>
+          <w:lang w:eastAsia="es-GT"/>
+        </w:rPr>
+      </w:pPr>
+    </w:p>
+    <w:p>
+      <w:pPr>
+        <w:spacing w:before="100" w:beforeAutospacing="1" w:after="100" w:afterAutospacing="1" w:line="240" w:lineRule="auto"/>
+        <w:rPr>
+          <w:rFonts w:ascii="Arial" w:eastAsia="Times New Roman" w:hAnsi="Arial" w:cs="Arial"/>
+          <w:sz w:val="24"/>
+          <w:szCs w:val="24"/>
+          <w:lang w:eastAsia="es-GT"/>
+        </w:rPr>
+      </w:pPr>
+    </w:p>
+    <w:p>
+      <w:pPr>
+        <w:spacing w:before="100" w:beforeAutospacing="1" w:after="100" w:afterAutospacing="1" w:line="240" w:lineRule="auto"/>
+        <w:rPr>
+          <w:rFonts w:ascii="Arial" w:eastAsia="Times New Roman" w:hAnsi="Arial" w:cs="Arial"/>
+          <w:sz w:val="24"/>
+          <w:szCs w:val="24"/>
+          <w:lang w:eastAsia="es-GT"/>
+        </w:rPr>
+      </w:pPr>
+    </w:p>
+    <w:p>
+      <w:pPr>
+        <w:spacing w:before="100" w:beforeAutospacing="1" w:after="100" w:afterAutospacing="1" w:line="240" w:lineRule="auto"/>
+        <w:rPr>
+          <w:rFonts w:ascii="Arial" w:eastAsia="Times New Roman" w:hAnsi="Arial" w:cs="Arial"/>
+          <w:sz w:val="24"/>
+          <w:szCs w:val="24"/>
+          <w:lang w:eastAsia="es-GT"/>
+        </w:rPr>
+      </w:pPr>
+    </w:p>
+    <w:p>
+      <w:pPr>
+        <w:spacing w:before="100" w:beforeAutospacing="1" w:after="100" w:afterAutospacing="1" w:line="240" w:lineRule="auto"/>
+        <w:rPr>
+          <w:rFonts w:ascii="Arial" w:eastAsia="Times New Roman" w:hAnsi="Arial" w:cs="Arial"/>
+          <w:sz w:val="24"/>
+          <w:szCs w:val="24"/>
+          <w:lang w:eastAsia="es-GT"/>
+        </w:rPr>
+      </w:pPr>
+    </w:p>
+    <w:p>
+      <w:pPr>
+        <w:spacing w:before="100" w:beforeAutospacing="1" w:after="100" w:afterAutospacing="1" w:line="240" w:lineRule="auto"/>
+        <w:rPr>
+          <w:rFonts w:ascii="Arial" w:eastAsia="Times New Roman" w:hAnsi="Arial" w:cs="Arial"/>
+          <w:sz w:val="24"/>
+          <w:szCs w:val="24"/>
+          <w:lang w:eastAsia="es-GT"/>
+        </w:rPr>
+      </w:pPr>
+    </w:p>
+    <w:p>
+      <w:pPr>
+        <w:spacing w:before="100" w:beforeAutospacing="1" w:after="100" w:afterAutospacing="1" w:line="240" w:lineRule="auto"/>
+        <w:rPr>
+          <w:rFonts w:ascii="Arial" w:eastAsia="Times New Roman" w:hAnsi="Arial" w:cs="Arial"/>
+          <w:sz w:val="24"/>
+          <w:szCs w:val="24"/>
+          <w:lang w:eastAsia="es-GT"/>
+        </w:rPr>
+      </w:pPr>
+    </w:p>
+    <w:p>
+      <w:pPr>
+        <w:spacing w:before="100" w:beforeAutospacing="1" w:after="100" w:afterAutospacing="1" w:line="240" w:lineRule="auto"/>
+        <w:rPr>
+          <w:rFonts w:ascii="Arial" w:eastAsia="Times New Roman" w:hAnsi="Arial" w:cs="Arial"/>
+          <w:sz w:val="24"/>
+          <w:szCs w:val="24"/>
+          <w:lang w:eastAsia="es-GT"/>
+        </w:rPr>
+      </w:pPr>
+    </w:p>
+    <w:p>
+      <w:pPr>
+        <w:spacing w:before="100" w:beforeAutospacing="1" w:after="100" w:afterAutospacing="1" w:line="240" w:lineRule="auto"/>
+        <w:rPr>
+          <w:rFonts w:ascii="Arial" w:eastAsia="Times New Roman" w:hAnsi="Arial" w:cs="Arial"/>
+          <w:sz w:val="24"/>
+          <w:szCs w:val="24"/>
+          <w:lang w:eastAsia="es-GT"/>
+        </w:rPr>
+      </w:pPr>
+    </w:p>
+    <w:p>
+      <w:pPr>
+        <w:spacing w:before="100" w:beforeAutospacing="1" w:after="100" w:afterAutospacing="1" w:line="240" w:lineRule="auto"/>
+        <w:rPr>
+          <w:rFonts w:ascii="Arial" w:eastAsia="Times New Roman" w:hAnsi="Arial" w:cs="Arial"/>
+          <w:sz w:val="24"/>
+          <w:szCs w:val="24"/>
+          <w:lang w:eastAsia="es-GT"/>
+        </w:rPr>
+      </w:pPr>
+    </w:p>
+    <w:p>
+      <w:pPr>
+        <w:spacing w:before="100" w:beforeAutospacing="1" w:after="100" w:afterAutospacing="1" w:line="240" w:lineRule="auto"/>
+        <w:rPr>
+          <w:rFonts w:ascii="Arial" w:eastAsia="Times New Roman" w:hAnsi="Arial" w:cs="Arial"/>
+          <w:sz w:val="24"/>
+          <w:szCs w:val="24"/>
+          <w:lang w:eastAsia="es-GT"/>
+        </w:rPr>
+      </w:pPr>
+    </w:p>
+    <w:p>
+      <w:pPr>
+        <w:spacing w:before="100" w:beforeAutospacing="1" w:after="100" w:afterAutospacing="1" w:line="240" w:lineRule="auto"/>
+        <w:rPr>
+          <w:rFonts w:ascii="Arial" w:eastAsia="Times New Roman" w:hAnsi="Arial" w:cs="Arial"/>
+          <w:sz w:val="24"/>
+          <w:szCs w:val="24"/>
+          <w:lang w:eastAsia="es-GT"/>
+        </w:rPr>
+      </w:pPr>
+    </w:p>
+    <w:p>
+      <w:pPr>
+        <w:spacing w:before="100" w:beforeAutospacing="1" w:after="100" w:afterAutospacing="1" w:line="240" w:lineRule="auto"/>
+        <w:rPr>
+          <w:rFonts w:ascii="Arial" w:eastAsia="Times New Roman" w:hAnsi="Arial" w:cs="Arial"/>
+          <w:sz w:val="24"/>
+          <w:szCs w:val="24"/>
+          <w:lang w:eastAsia="es-GT"/>
+        </w:rPr>
+      </w:pPr>
+    </w:p>
+    <w:p>
+      <w:pPr>
+        <w:spacing w:before="100" w:beforeAutospacing="1" w:after="100" w:afterAutospacing="1" w:line="240" w:lineRule="auto"/>
+        <w:rPr>
+          <w:rFonts w:ascii="Arial" w:eastAsia="Times New Roman" w:hAnsi="Arial" w:cs="Arial"/>
+          <w:sz w:val="24"/>
+          <w:szCs w:val="24"/>
+          <w:lang w:eastAsia="es-GT"/>
+        </w:rPr>
+      </w:pPr>
+    </w:p>
+    <w:p>
+      <w:pPr>
+        <w:spacing w:before="100" w:beforeAutospacing="1" w:after="100" w:afterAutospacing="1" w:line="240" w:lineRule="auto"/>
+        <w:rPr>
+          <w:rFonts w:ascii="Arial" w:eastAsia="Times New Roman" w:hAnsi="Arial" w:cs="Arial"/>
+          <w:sz w:val="24"/>
+          <w:szCs w:val="24"/>
+          <w:lang w:eastAsia="es-GT"/>
+        </w:rPr>
+      </w:pPr>
+    </w:p>
+    <w:p>
+      <w:pPr>
+        <w:spacing w:before="100" w:beforeAutospacing="1" w:after="100" w:afterAutospacing="1" w:line="240" w:lineRule="auto"/>
+        <w:rPr>
+          <w:rFonts w:ascii="Arial" w:eastAsia="Times New Roman" w:hAnsi="Arial" w:cs="Arial"/>
+          <w:sz w:val="24"/>
+          <w:szCs w:val="24"/>
+          <w:lang w:eastAsia="es-GT"/>
+        </w:rPr>
+      </w:pPr>
+    </w:p>
+    <w:p>
+      <w:pPr>
+        <w:spacing w:before="100" w:beforeAutospacing="1" w:after="100" w:afterAutospacing="1" w:line="240" w:lineRule="auto"/>
+        <w:rPr>
+          <w:rFonts w:ascii="Arial" w:eastAsia="Times New Roman" w:hAnsi="Arial" w:cs="Arial"/>
+          <w:sz w:val="24"/>
+          <w:szCs w:val="24"/>
+          <w:lang w:eastAsia="es-GT"/>
+        </w:rPr>
+      </w:pPr>
+    </w:p>
+    <w:p>
+      <w:pPr>
+        <w:spacing w:before="100" w:beforeAutospacing="1" w:after="100" w:afterAutospacing="1" w:line="240" w:lineRule="auto"/>
+        <w:rPr>
+          <w:rFonts w:ascii="Arial" w:eastAsia="Times New Roman" w:hAnsi="Arial" w:cs="Arial"/>
+          <w:sz w:val="24"/>
+          <w:szCs w:val="24"/>
+          <w:lang w:eastAsia="es-GT"/>
+        </w:rPr>
+      </w:pPr>
+    </w:p>
+    <w:p>
+      <w:pPr>
+        <w:spacing w:before="100" w:beforeAutospacing="1" w:after="100" w:afterAutospacing="1" w:line="240" w:lineRule="auto"/>
+        <w:rPr>
+          <w:rFonts w:ascii="Arial" w:eastAsia="Times New Roman" w:hAnsi="Arial" w:cs="Arial"/>
+          <w:sz w:val="24"/>
+          <w:szCs w:val="24"/>
+          <w:lang w:eastAsia="es-GT"/>
+        </w:rPr>
+      </w:pPr>
+    </w:p>
+    <w:p>
+      <w:pPr>
+        <w:spacing w:before="100" w:beforeAutospacing="1" w:after="100" w:afterAutospacing="1" w:line="240" w:lineRule="auto"/>
+        <w:rPr>
+          <w:rFonts w:ascii="Arial" w:eastAsia="Times New Roman" w:hAnsi="Arial" w:cs="Arial"/>
+          <w:sz w:val="24"/>
+          <w:szCs w:val="24"/>
+          <w:lang w:eastAsia="es-GT"/>
+        </w:rPr>
+      </w:pPr>
+    </w:p>
+    <w:p>
+      <w:pPr>
+        <w:spacing w:before="100" w:beforeAutospacing="1" w:after="100" w:afterAutospacing="1" w:line="240" w:lineRule="auto"/>
+        <w:rPr>
+          <w:rFonts w:ascii="Arial" w:eastAsia="Times New Roman" w:hAnsi="Arial" w:cs="Arial"/>
+          <w:sz w:val="24"/>
+          <w:szCs w:val="24"/>
+          <w:lang w:eastAsia="es-GT"/>
+        </w:rPr>
+      </w:pPr>
+    </w:p>
+    <w:p>
+      <w:pPr>
+        <w:spacing w:before="100" w:beforeAutospacing="1" w:after="100" w:afterAutospacing="1" w:line="240" w:lineRule="auto"/>
+        <w:rPr>
+          <w:rFonts w:ascii="Arial" w:eastAsia="Times New Roman" w:hAnsi="Arial" w:cs="Arial"/>
+          <w:sz w:val="24"/>
+          <w:szCs w:val="24"/>
+          <w:lang w:eastAsia="es-GT"/>
+        </w:rPr>
+      </w:pPr>
+    </w:p>
+    <w:p>
+      <w:pPr>
+        <w:spacing w:before="100" w:beforeAutospacing="1" w:after="100" w:afterAutospacing="1" w:line="240" w:lineRule="auto"/>
+        <w:rPr>
+          <w:rFonts w:ascii="Arial" w:eastAsia="Times New Roman" w:hAnsi="Arial" w:cs="Arial"/>
+          <w:sz w:val="24"/>
+          <w:szCs w:val="24"/>
+          <w:lang w:eastAsia="es-GT"/>
+        </w:rPr>
+      </w:pPr>
+    </w:p>
+    <w:p>
+      <w:pPr>
+        <w:spacing w:before="100" w:beforeAutospacing="1" w:after="100" w:afterAutospacing="1" w:line="240" w:lineRule="auto"/>
+        <w:rPr>
+          <w:rFonts w:ascii="Arial" w:eastAsia="Times New Roman" w:hAnsi="Arial" w:cs="Arial"/>
+          <w:sz w:val="24"/>
+          <w:szCs w:val="24"/>
+          <w:lang w:eastAsia="es-GT"/>
+        </w:rPr>
+      </w:pPr>
+    </w:p>
+    <w:p>
+      <w:pPr>
+        <w:spacing w:before="100" w:beforeAutospacing="1" w:after="100" w:afterAutospacing="1" w:line="240" w:lineRule="auto"/>
+        <w:rPr>
+          <w:rFonts w:ascii="Arial" w:eastAsia="Times New Roman" w:hAnsi="Arial" w:cs="Arial"/>
+          <w:sz w:val="24"/>
+          <w:szCs w:val="24"/>
+          <w:lang w:eastAsia="es-GT"/>
+        </w:rPr>
+      </w:pPr>
+    </w:p>
+    <w:p>
+      <w:pPr>
+        <w:spacing w:before="100" w:beforeAutospacing="1" w:after="100" w:afterAutospacing="1" w:line="240" w:lineRule="auto"/>
+        <w:rPr>
+          <w:rFonts w:ascii="Arial" w:eastAsia="Times New Roman" w:hAnsi="Arial" w:cs="Arial"/>
+          <w:sz w:val="24"/>
+          <w:szCs w:val="24"/>
+          <w:lang w:eastAsia="es-GT"/>
+        </w:rPr>
+      </w:pPr>
+    </w:p>
+    <w:p>
+      <w:pPr>
+        <w:spacing w:before="100" w:beforeAutospacing="1" w:after="100" w:afterAutospacing="1" w:line="240" w:lineRule="auto"/>
+        <w:rPr>
+          <w:rFonts w:ascii="Arial" w:eastAsia="Times New Roman" w:hAnsi="Arial" w:cs="Arial"/>
+          <w:sz w:val="24"/>
+          <w:szCs w:val="24"/>
+          <w:lang w:eastAsia="es-GT"/>
+        </w:rPr>
+      </w:pPr>
+    </w:p>
+    <w:p>
+      <w:pPr>
+        <w:spacing w:before="100" w:beforeAutospacing="1" w:after="100" w:afterAutospacing="1" w:line="240" w:lineRule="auto"/>
+        <w:rPr>
+          <w:rFonts w:ascii="Arial" w:eastAsia="Times New Roman" w:hAnsi="Arial" w:cs="Arial"/>
+          <w:sz w:val="24"/>
+          <w:szCs w:val="24"/>
+          <w:lang w:eastAsia="es-GT"/>
+        </w:rPr>
+      </w:pPr>
+    </w:p>
+    <w:p>
+      <w:pPr>
+        <w:spacing w:before="100" w:beforeAutospacing="1" w:after="100" w:afterAutospacing="1" w:line="240" w:lineRule="auto"/>
+        <w:rPr>
+          <w:rFonts w:ascii="Arial" w:eastAsia="Times New Roman" w:hAnsi="Arial" w:cs="Arial"/>
+          <w:sz w:val="24"/>
+          <w:szCs w:val="24"/>
+          <w:lang w:eastAsia="es-GT"/>
+        </w:rPr>
+      </w:pPr>
+    </w:p>
+    <w:p>
+      <w:pPr>
+        <w:spacing w:before="100" w:beforeAutospacing="1" w:after="100" w:afterAutospacing="1" w:line="240" w:lineRule="auto"/>
+        <w:rPr>
+          <w:rFonts w:ascii="Arial" w:eastAsia="Times New Roman" w:hAnsi="Arial" w:cs="Arial"/>
+          <w:sz w:val="24"/>
+          <w:szCs w:val="24"/>
+          <w:lang w:eastAsia="es-GT"/>
+        </w:rPr>
+      </w:pPr>
+    </w:p>
+    <w:p>
+      <w:pPr>
+        <w:spacing w:before="100" w:beforeAutospacing="1" w:after="100" w:afterAutospacing="1" w:line="240" w:lineRule="auto"/>
+        <w:rPr>
+          <w:rFonts w:ascii="Arial" w:eastAsia="Times New Roman" w:hAnsi="Arial" w:cs="Arial"/>
+          <w:sz w:val="24"/>
+          <w:szCs w:val="24"/>
+          <w:lang w:eastAsia="es-GT"/>
+        </w:rPr>
+      </w:pPr>
+    </w:p>
+    <w:p>
+      <w:pPr>
+        <w:spacing w:before="100" w:beforeAutospacing="1" w:after="100" w:afterAutospacing="1" w:line="240" w:lineRule="auto"/>
+        <w:rPr>
+          <w:rFonts w:ascii="Arial" w:eastAsia="Times New Roman" w:hAnsi="Arial" w:cs="Arial"/>
+          <w:sz w:val="24"/>
+          <w:szCs w:val="24"/>
+          <w:lang w:eastAsia="es-GT"/>
+        </w:rPr>
+      </w:pPr>
+    </w:p>
+    <w:p>
+      <w:pPr>
+        <w:spacing w:before="100" w:beforeAutospacing="1" w:after="100" w:afterAutospacing="1" w:line="240" w:lineRule="auto"/>
+        <w:rPr>
+          <w:rFonts w:ascii="Arial" w:eastAsia="Times New Roman" w:hAnsi="Arial" w:cs="Arial"/>
+          <w:sz w:val="24"/>
+          <w:szCs w:val="24"/>
+          <w:lang w:eastAsia="es-GT"/>
+        </w:rPr>
+      </w:pPr>
+    </w:p>
+    <w:p>
+      <w:pPr>
+        <w:spacing w:before="100" w:beforeAutospacing="1" w:after="100" w:afterAutospacing="1" w:line="240" w:lineRule="auto"/>
+        <w:rPr>
+          <w:rFonts w:ascii="Arial" w:eastAsia="Times New Roman" w:hAnsi="Arial" w:cs="Arial"/>
+          <w:sz w:val="24"/>
+          <w:szCs w:val="24"/>
+          <w:lang w:eastAsia="es-GT"/>
+        </w:rPr>
+      </w:pPr>
+    </w:p>
+    <w:p>
+      <w:pPr>
+        <w:spacing w:before="100" w:beforeAutospacing="1" w:after="100" w:afterAutospacing="1" w:line="240" w:lineRule="auto"/>
+        <w:rPr>
+          <w:rFonts w:ascii="Arial" w:eastAsia="Times New Roman" w:hAnsi="Arial" w:cs="Arial"/>
+          <w:sz w:val="24"/>
+          <w:szCs w:val="24"/>
+          <w:lang w:eastAsia="es-GT"/>
+        </w:rPr>
+      </w:pPr>
+    </w:p>
+    <w:p>
+      <w:pPr>
+        <w:spacing w:before="100" w:beforeAutospacing="1" w:after="100" w:afterAutospacing="1" w:line="240" w:lineRule="auto"/>
+        <w:rPr>
+          <w:rFonts w:ascii="Arial" w:eastAsia="Times New Roman" w:hAnsi="Arial" w:cs="Arial"/>
+          <w:sz w:val="24"/>
+          <w:szCs w:val="24"/>
+          <w:lang w:eastAsia="es-GT"/>
+        </w:rPr>
+      </w:pPr>
+    </w:p>
+    <w:p>
+      <w:pPr>
+        <w:spacing w:before="100" w:beforeAutospacing="1" w:after="100" w:afterAutospacing="1" w:line="240" w:lineRule="auto"/>
+        <w:rPr>
+          <w:rFonts w:ascii="Arial" w:eastAsia="Times New Roman" w:hAnsi="Arial" w:cs="Arial"/>
+          <w:sz w:val="24"/>
+          <w:szCs w:val="24"/>
+          <w:lang w:eastAsia="es-GT"/>
+        </w:rPr>
+      </w:pPr>
+    </w:p>
+    <w:p>
+      <w:pPr>
+        <w:spacing w:before="100" w:beforeAutospacing="1" w:after="100" w:afterAutospacing="1" w:line="240" w:lineRule="auto"/>
+        <w:rPr>
+          <w:rFonts w:ascii="Arial" w:eastAsia="Times New Roman" w:hAnsi="Arial" w:cs="Arial"/>
+          <w:sz w:val="24"/>
+          <w:szCs w:val="24"/>
+          <w:lang w:eastAsia="es-GT"/>
+        </w:rPr>
+      </w:pPr>
+    </w:p>
+    <w:p>
+      <w:pPr>
+        <w:spacing w:before="100" w:beforeAutospacing="1" w:after="100" w:afterAutospacing="1" w:line="240" w:lineRule="auto"/>
+        <w:rPr>
+          <w:rFonts w:ascii="Arial" w:eastAsia="Times New Roman" w:hAnsi="Arial" w:cs="Arial"/>
+          <w:sz w:val="24"/>
+          <w:szCs w:val="24"/>
+          <w:lang w:eastAsia="es-GT"/>
+        </w:rPr>
+      </w:pPr>
+    </w:p>
+    <w:p>
+      <w:pPr>
+        <w:spacing w:before="100" w:beforeAutospacing="1" w:after="100" w:afterAutospacing="1" w:line="240" w:lineRule="auto"/>
+        <w:rPr>
+          <w:rFonts w:ascii="Arial" w:eastAsia="Times New Roman" w:hAnsi="Arial" w:cs="Arial"/>
+          <w:sz w:val="24"/>
+          <w:szCs w:val="24"/>
+          <w:lang w:eastAsia="es-GT"/>
+        </w:rPr>
+      </w:pPr>
+    </w:p>
+    <w:p>
+      <w:pPr>
+        <w:spacing w:before="100" w:beforeAutospacing="1" w:after="100" w:afterAutospacing="1" w:line="240" w:lineRule="auto"/>
+        <w:rPr>
+          <w:rFonts w:ascii="Arial" w:eastAsia="Times New Roman" w:hAnsi="Arial" w:cs="Arial"/>
+          <w:sz w:val="24"/>
+          <w:szCs w:val="24"/>
+          <w:lang w:eastAsia="es-GT"/>
+        </w:rPr>
+      </w:pPr>
+    </w:p>
+    <w:p>
+      <w:pPr>
+        <w:spacing w:before="100" w:beforeAutospacing="1" w:after="100" w:afterAutospacing="1" w:line="240" w:lineRule="auto"/>
+        <w:rPr>
+          <w:rFonts w:ascii="Arial" w:eastAsia="Times New Roman" w:hAnsi="Arial" w:cs="Arial"/>
+          <w:sz w:val="24"/>
+          <w:szCs w:val="24"/>
+          <w:lang w:eastAsia="es-GT"/>
+        </w:rPr>
+      </w:pPr>
+    </w:p>
+    <w:p>
+      <w:pPr>
+        <w:spacing w:before="100" w:beforeAutospacing="1" w:after="100" w:afterAutospacing="1" w:line="240" w:lineRule="auto"/>
+        <w:rPr>
+          <w:rFonts w:ascii="Arial" w:eastAsia="Times New Roman" w:hAnsi="Arial" w:cs="Arial"/>
+          <w:sz w:val="24"/>
+          <w:szCs w:val="24"/>
+          <w:lang w:eastAsia="es-GT"/>
+        </w:rPr>
+      </w:pPr>
+    </w:p>
+    <w:p>
+      <w:pPr>
+        <w:spacing w:before="100" w:beforeAutospacing="1" w:after="100" w:afterAutospacing="1" w:line="240" w:lineRule="auto"/>
+        <w:rPr>
+          <w:rFonts w:ascii="Arial" w:eastAsia="Times New Roman" w:hAnsi="Arial" w:cs="Arial"/>
+          <w:sz w:val="24"/>
+          <w:szCs w:val="24"/>
+          <w:lang w:eastAsia="es-GT"/>
+        </w:rPr>
+      </w:pPr>
+    </w:p>
+    <w:p>
+      <w:pPr>
+        <w:spacing w:before="100" w:beforeAutospacing="1" w:after="100" w:afterAutospacing="1" w:line="240" w:lineRule="auto"/>
+        <w:rPr>
+          <w:rFonts w:ascii="Arial" w:eastAsia="Times New Roman" w:hAnsi="Arial" w:cs="Arial"/>
+          <w:sz w:val="24"/>
+          <w:szCs w:val="24"/>
+          <w:lang w:eastAsia="es-GT"/>
+        </w:rPr>
+      </w:pPr>
+    </w:p>
+    <w:p>
+      <w:pPr>
+        <w:spacing w:before="100" w:beforeAutospacing="1" w:after="100" w:afterAutospacing="1" w:line="240" w:lineRule="auto"/>
+        <w:rPr>
+          <w:rFonts w:ascii="Arial" w:eastAsia="Times New Roman" w:hAnsi="Arial" w:cs="Arial"/>
+          <w:sz w:val="24"/>
+          <w:szCs w:val="24"/>
+          <w:lang w:eastAsia="es-GT"/>
+        </w:rPr>
+      </w:pPr>
+    </w:p>
+    <w:p>
+      <w:pPr>
+        <w:spacing w:before="100" w:beforeAutospacing="1" w:after="100" w:afterAutospacing="1" w:line="240" w:lineRule="auto"/>
+        <w:rPr>
+          <w:rFonts w:ascii="Arial" w:eastAsia="Times New Roman" w:hAnsi="Arial" w:cs="Arial"/>
+          <w:sz w:val="24"/>
+          <w:szCs w:val="24"/>
+          <w:lang w:eastAsia="es-GT"/>
+        </w:rPr>
+      </w:pPr>
+    </w:p>
+    <w:p>
+      <w:pPr>
+        <w:spacing w:before="100" w:beforeAutospacing="1" w:after="100" w:afterAutospacing="1" w:line="240" w:lineRule="auto"/>
+        <w:rPr>
+          <w:rFonts w:ascii="Arial" w:eastAsia="Times New Roman" w:hAnsi="Arial" w:cs="Arial"/>
+          <w:sz w:val="24"/>
+          <w:szCs w:val="24"/>
+          <w:lang w:eastAsia="es-GT"/>
+        </w:rPr>
+      </w:pPr>
+    </w:p>
+    <w:p>
+      <w:pPr>
+        <w:spacing w:before="100" w:beforeAutospacing="1" w:after="100" w:afterAutospacing="1" w:line="240" w:lineRule="auto"/>
+        <w:rPr>
+          <w:rFonts w:ascii="Arial" w:eastAsia="Times New Roman" w:hAnsi="Arial" w:cs="Arial"/>
+          <w:sz w:val="24"/>
+          <w:szCs w:val="24"/>
+          <w:lang w:eastAsia="es-GT"/>
+        </w:rPr>
+      </w:pPr>
+    </w:p>
+    <w:p>
+      <w:pPr>
+        <w:spacing w:before="100" w:beforeAutospacing="1" w:after="100" w:afterAutospacing="1" w:line="240" w:lineRule="auto"/>
+        <w:rPr>
+          <w:rFonts w:ascii="Arial" w:eastAsia="Times New Roman" w:hAnsi="Arial" w:cs="Arial"/>
+          <w:sz w:val="24"/>
+          <w:szCs w:val="24"/>
+          <w:lang w:eastAsia="es-GT"/>
+        </w:rPr>
+      </w:pPr>
+    </w:p>
+    <w:p>
+      <w:pPr>
+        <w:spacing w:before="100" w:beforeAutospacing="1" w:after="100" w:afterAutospacing="1" w:line="240" w:lineRule="auto"/>
+        <w:rPr>
+          <w:rFonts w:ascii="Arial" w:eastAsia="Times New Roman" w:hAnsi="Arial" w:cs="Arial"/>
+          <w:sz w:val="24"/>
+          <w:szCs w:val="24"/>
+          <w:lang w:eastAsia="es-GT"/>
+        </w:rPr>
+      </w:pPr>
+    </w:p>
+    <w:p>
+      <w:pPr>
+        <w:spacing w:before="100" w:beforeAutospacing="1" w:after="100" w:afterAutospacing="1" w:line="240" w:lineRule="auto"/>
+        <w:rPr>
+          <w:rFonts w:ascii="Arial" w:eastAsia="Times New Roman" w:hAnsi="Arial" w:cs="Arial"/>
+          <w:sz w:val="24"/>
+          <w:szCs w:val="24"/>
+          <w:lang w:eastAsia="es-GT"/>
+        </w:rPr>
+      </w:pPr>
+    </w:p>
+    <w:p>
+      <w:pPr>
+        <w:spacing w:before="100" w:beforeAutospacing="1" w:after="100" w:afterAutospacing="1" w:line="240" w:lineRule="auto"/>
+        <w:rPr>
+          <w:rFonts w:ascii="Arial" w:eastAsia="Times New Roman" w:hAnsi="Arial" w:cs="Arial"/>
+          <w:sz w:val="24"/>
+          <w:szCs w:val="24"/>
+          <w:lang w:eastAsia="es-GT"/>
+        </w:rPr>
+      </w:pPr>
+    </w:p>
+    <w:p>
+      <w:pPr>
+        <w:spacing w:before="100" w:beforeAutospacing="1" w:after="100" w:afterAutospacing="1" w:line="240" w:lineRule="auto"/>
+        <w:rPr>
+          <w:rFonts w:ascii="Arial" w:eastAsia="Times New Roman" w:hAnsi="Arial" w:cs="Arial"/>
+          <w:sz w:val="24"/>
+          <w:szCs w:val="24"/>
+          <w:lang w:eastAsia="es-GT"/>
+        </w:rPr>
+      </w:pPr>
+    </w:p>
+    <w:p>
+      <w:pPr>
+        <w:spacing w:before="100" w:beforeAutospacing="1" w:after="100" w:afterAutospacing="1" w:line="240" w:lineRule="auto"/>
+        <w:rPr>
+          <w:rFonts w:ascii="Arial" w:eastAsia="Times New Roman" w:hAnsi="Arial" w:cs="Arial"/>
+          <w:sz w:val="24"/>
+          <w:szCs w:val="24"/>
+          <w:lang w:eastAsia="es-GT"/>
+        </w:rPr>
+      </w:pPr>
+    </w:p>
+    <w:p>
+      <w:pPr>
+        <w:spacing w:before="100" w:beforeAutospacing="1" w:after="100" w:afterAutospacing="1" w:line="240" w:lineRule="auto"/>
+        <w:rPr>
+          <w:rFonts w:ascii="Arial" w:eastAsia="Times New Roman" w:hAnsi="Arial" w:cs="Arial"/>
+          <w:sz w:val="24"/>
+          <w:szCs w:val="24"/>
+          <w:lang w:eastAsia="es-GT"/>
+        </w:rPr>
+      </w:pPr>
+    </w:p>
+    <w:p>
+      <w:pPr>
+        <w:spacing w:before="100" w:beforeAutospacing="1" w:after="100" w:afterAutospacing="1" w:line="240" w:lineRule="auto"/>
+        <w:rPr>
+          <w:rFonts w:ascii="Arial" w:eastAsia="Times New Roman" w:hAnsi="Arial" w:cs="Arial"/>
+          <w:sz w:val="24"/>
+          <w:szCs w:val="24"/>
+          <w:lang w:eastAsia="es-GT"/>
+        </w:rPr>
+      </w:pPr>
+    </w:p>
+    <w:p>
+      <w:pPr>
+        <w:spacing w:before="100" w:beforeAutospacing="1" w:after="100" w:afterAutospacing="1" w:line="240" w:lineRule="auto"/>
+        <w:rPr>
+          <w:rFonts w:ascii="Arial" w:eastAsia="Times New Roman" w:hAnsi="Arial" w:cs="Arial"/>
+          <w:sz w:val="24"/>
+          <w:szCs w:val="24"/>
+          <w:lang w:eastAsia="es-GT"/>
+        </w:rPr>
+      </w:pPr>
+    </w:p>
+    <w:p>
+      <w:pPr>
+        <w:spacing w:before="100" w:beforeAutospacing="1" w:after="100" w:afterAutospacing="1" w:line="240" w:lineRule="auto"/>
+        <w:rPr>
+          <w:rFonts w:ascii="Arial" w:eastAsia="Times New Roman" w:hAnsi="Arial" w:cs="Arial"/>
+          <w:sz w:val="24"/>
+          <w:szCs w:val="24"/>
+          <w:lang w:eastAsia="es-GT"/>
+        </w:rPr>
+      </w:pPr>
+    </w:p>
+    <w:p>
+      <w:pPr>
+        <w:spacing w:before="100" w:beforeAutospacing="1" w:after="100" w:afterAutospacing="1" w:line="240" w:lineRule="auto"/>
+        <w:rPr>
+          <w:rFonts w:ascii="Arial" w:eastAsia="Times New Roman" w:hAnsi="Arial" w:cs="Arial"/>
+          <w:sz w:val="24"/>
+          <w:szCs w:val="24"/>
+          <w:lang w:eastAsia="es-GT"/>
+        </w:rPr>
+      </w:pPr>
+    </w:p>
+    <w:p>
+      <w:pPr>
+        <w:spacing w:before="100" w:beforeAutospacing="1" w:after="100" w:afterAutospacing="1" w:line="240" w:lineRule="auto"/>
+        <w:rPr>
+          <w:rFonts w:ascii="Arial" w:eastAsia="Times New Roman" w:hAnsi="Arial" w:cs="Arial"/>
+          <w:sz w:val="24"/>
+          <w:szCs w:val="24"/>
+          <w:lang w:eastAsia="es-GT"/>
+        </w:rPr>
+      </w:pPr>
+    </w:p>
+    <w:p>
+      <w:pPr>
+        <w:spacing w:before="100" w:beforeAutospacing="1" w:after="100" w:afterAutospacing="1" w:line="240" w:lineRule="auto"/>
+        <w:rPr>
+          <w:rFonts w:ascii="Arial" w:eastAsia="Times New Roman" w:hAnsi="Arial" w:cs="Arial"/>
+          <w:sz w:val="24"/>
+          <w:szCs w:val="24"/>
+          <w:lang w:eastAsia="es-GT"/>
+        </w:rPr>
+      </w:pPr>
+    </w:p>
+    <w:p>
+      <w:pPr>
+        <w:spacing w:before="100" w:beforeAutospacing="1" w:after="100" w:afterAutospacing="1" w:line="240" w:lineRule="auto"/>
+        <w:rPr>
+          <w:rFonts w:ascii="Arial" w:eastAsia="Times New Roman" w:hAnsi="Arial" w:cs="Arial"/>
+          <w:sz w:val="24"/>
+          <w:szCs w:val="24"/>
+          <w:lang w:eastAsia="es-GT"/>
+        </w:rPr>
+      </w:pPr>
+    </w:p>
+    <w:p>
+      <w:pPr>
+        <w:spacing w:before="100" w:beforeAutospacing="1" w:after="100" w:afterAutospacing="1" w:line="240" w:lineRule="auto"/>
+        <w:rPr>
+          <w:rFonts w:ascii="Arial" w:eastAsia="Times New Roman" w:hAnsi="Arial" w:cs="Arial"/>
+          <w:sz w:val="24"/>
+          <w:szCs w:val="24"/>
+          <w:lang w:eastAsia="es-GT"/>
+        </w:rPr>
+      </w:pPr>
+    </w:p>
+    <w:p>
+      <w:pPr>
+        <w:spacing w:before="100" w:beforeAutospacing="1" w:after="100" w:afterAutospacing="1" w:line="240" w:lineRule="auto"/>
+        <w:rPr>
+          <w:rFonts w:ascii="Arial" w:eastAsia="Times New Roman" w:hAnsi="Arial" w:cs="Arial"/>
+          <w:sz w:val="24"/>
+          <w:szCs w:val="24"/>
+          <w:lang w:eastAsia="es-GT"/>
+        </w:rPr>
+      </w:pPr>
+    </w:p>
+    <w:p>
+      <w:pPr>
+        <w:spacing w:before="100" w:beforeAutospacing="1" w:after="100" w:afterAutospacing="1" w:line="240" w:lineRule="auto"/>
+        <w:rPr>
+          <w:rFonts w:ascii="Arial" w:eastAsia="Times New Roman" w:hAnsi="Arial" w:cs="Arial"/>
+          <w:sz w:val="24"/>
+          <w:szCs w:val="24"/>
+          <w:lang w:eastAsia="es-GT"/>
+        </w:rPr>
+      </w:pPr>
+    </w:p>
+    <w:p>
+      <w:pPr>
+        <w:spacing w:before="100" w:beforeAutospacing="1" w:after="100" w:afterAutospacing="1" w:line="240" w:lineRule="auto"/>
+        <w:rPr>
+          <w:rFonts w:ascii="Arial" w:eastAsia="Times New Roman" w:hAnsi="Arial" w:cs="Arial"/>
+          <w:sz w:val="24"/>
+          <w:szCs w:val="24"/>
+          <w:lang w:eastAsia="es-GT"/>
+        </w:rPr>
+      </w:pPr>
+    </w:p>
+    <w:p>
+      <w:pPr>
+        <w:spacing w:before="100" w:beforeAutospacing="1" w:after="100" w:afterAutospacing="1" w:line="240" w:lineRule="auto"/>
+        <w:rPr>
+          <w:rFonts w:ascii="Arial" w:eastAsia="Times New Roman" w:hAnsi="Arial" w:cs="Arial"/>
+          <w:sz w:val="24"/>
+          <w:szCs w:val="24"/>
+          <w:lang w:eastAsia="es-GT"/>
+        </w:rPr>
+      </w:pPr>
+    </w:p>
+    <w:p>
+      <w:pPr>
+        <w:spacing w:before="100" w:beforeAutospacing="1" w:after="100" w:afterAutospacing="1" w:line="240" w:lineRule="auto"/>
+        <w:rPr>
+          <w:rFonts w:ascii="Arial" w:eastAsia="Times New Roman" w:hAnsi="Arial" w:cs="Arial"/>
+          <w:sz w:val="24"/>
+          <w:szCs w:val="24"/>
+          <w:lang w:eastAsia="es-GT"/>
+        </w:rPr>
+      </w:pPr>
+    </w:p>
+    <w:p>
+      <w:pPr>
+        <w:spacing w:before="100" w:beforeAutospacing="1" w:after="100" w:afterAutospacing="1" w:line="240" w:lineRule="auto"/>
+        <w:rPr>
+          <w:rFonts w:ascii="Arial" w:eastAsia="Times New Roman" w:hAnsi="Arial" w:cs="Arial"/>
+          <w:sz w:val="24"/>
+          <w:szCs w:val="24"/>
+          <w:lang w:eastAsia="es-GT"/>
+        </w:rPr>
+      </w:pPr>
+    </w:p>
+    <w:p>
+      <w:pPr>
+        <w:spacing w:before="100" w:beforeAutospacing="1" w:after="100" w:afterAutospacing="1" w:line="240" w:lineRule="auto"/>
+        <w:rPr>
+          <w:rFonts w:ascii="Arial" w:eastAsia="Times New Roman" w:hAnsi="Arial" w:cs="Arial"/>
+          <w:sz w:val="24"/>
+          <w:szCs w:val="24"/>
+          <w:lang w:eastAsia="es-GT"/>
+        </w:rPr>
+      </w:pPr>
+    </w:p>
+    <w:p>
+      <w:pPr>
+        <w:spacing w:before="100" w:beforeAutospacing="1" w:after="100" w:afterAutospacing="1" w:line="240" w:lineRule="auto"/>
+        <w:rPr>
+          <w:rFonts w:ascii="Arial" w:eastAsia="Times New Roman" w:hAnsi="Arial" w:cs="Arial"/>
+          <w:sz w:val="24"/>
+          <w:szCs w:val="24"/>
+          <w:lang w:eastAsia="es-GT"/>
+        </w:rPr>
+      </w:pPr>
+    </w:p>
+    <w:p>
+      <w:pPr>
+        <w:spacing w:before="100" w:beforeAutospacing="1" w:after="100" w:afterAutospacing="1" w:line="240" w:lineRule="auto"/>
+        <w:rPr>
+          <w:rFonts w:ascii="Arial" w:eastAsia="Times New Roman" w:hAnsi="Arial" w:cs="Arial"/>
+          <w:sz w:val="24"/>
+          <w:szCs w:val="24"/>
+          <w:lang w:eastAsia="es-GT"/>
+        </w:rPr>
+      </w:pPr>
+    </w:p>
+    <w:p>
+      <w:pPr>
+        <w:spacing w:before="100" w:beforeAutospacing="1" w:after="100" w:afterAutospacing="1" w:line="240" w:lineRule="auto"/>
+        <w:rPr>
+          <w:rFonts w:ascii="Arial" w:eastAsia="Times New Roman" w:hAnsi="Arial" w:cs="Arial"/>
+          <w:sz w:val="24"/>
+          <w:szCs w:val="24"/>
+          <w:lang w:eastAsia="es-GT"/>
+        </w:rPr>
+      </w:pPr>
+    </w:p>
+    <w:p>
+      <w:pPr>
+        <w:spacing w:before="100" w:beforeAutospacing="1" w:after="100" w:afterAutospacing="1" w:line="240" w:lineRule="auto"/>
+        <w:rPr>
+          <w:rFonts w:ascii="Arial" w:eastAsia="Times New Roman" w:hAnsi="Arial" w:cs="Arial"/>
+          <w:sz w:val="24"/>
+          <w:szCs w:val="24"/>
+          <w:lang w:eastAsia="es-GT"/>
+        </w:rPr>
+      </w:pPr>
+    </w:p>
+    <w:p>
+      <w:pPr>
+        <w:spacing w:before="100" w:beforeAutospacing="1" w:after="100" w:afterAutospacing="1" w:line="240" w:lineRule="auto"/>
+        <w:rPr>
+          <w:rFonts w:ascii="Arial" w:eastAsia="Times New Roman" w:hAnsi="Arial" w:cs="Arial"/>
+          <w:sz w:val="24"/>
+          <w:szCs w:val="24"/>
+          <w:lang w:eastAsia="es-GT"/>
+        </w:rPr>
+      </w:pPr>
+    </w:p>
+    <w:p>
+      <w:pPr>
+        <w:spacing w:before="100" w:beforeAutospacing="1" w:after="100" w:afterAutospacing="1" w:line="240" w:lineRule="auto"/>
+        <w:rPr>
+          <w:rFonts w:ascii="Arial" w:eastAsia="Times New Roman" w:hAnsi="Arial" w:cs="Arial"/>
+          <w:sz w:val="24"/>
+          <w:szCs w:val="24"/>
+          <w:lang w:eastAsia="es-GT"/>
+        </w:rPr>
+      </w:pPr>
+    </w:p>
+    <w:p>
+      <w:pPr>
+        <w:spacing w:before="100" w:beforeAutospacing="1" w:after="100" w:afterAutospacing="1" w:line="240" w:lineRule="auto"/>
+        <w:rPr>
+          <w:rFonts w:ascii="Arial" w:eastAsia="Times New Roman" w:hAnsi="Arial" w:cs="Arial"/>
+          <w:sz w:val="24"/>
+          <w:szCs w:val="24"/>
+          <w:lang w:eastAsia="es-GT"/>
+        </w:rPr>
+      </w:pPr>
+    </w:p>
+    <w:p>
+      <w:pPr>
+        <w:spacing w:before="100" w:beforeAutospacing="1" w:after="100" w:afterAutospacing="1" w:line="240" w:lineRule="auto"/>
+        <w:rPr>
+          <w:rFonts w:ascii="Arial" w:eastAsia="Times New Roman" w:hAnsi="Arial" w:cs="Arial"/>
+          <w:sz w:val="24"/>
+          <w:szCs w:val="24"/>
+          <w:lang w:eastAsia="es-GT"/>
+        </w:rPr>
+      </w:pPr>
+    </w:p>
+    <w:p>
+      <w:pPr>
+        <w:spacing w:before="100" w:beforeAutospacing="1" w:after="100" w:afterAutospacing="1" w:line="240" w:lineRule="auto"/>
+        <w:rPr>
+          <w:rFonts w:ascii="Arial" w:eastAsia="Times New Roman" w:hAnsi="Arial" w:cs="Arial"/>
+          <w:sz w:val="24"/>
+          <w:szCs w:val="24"/>
+          <w:lang w:eastAsia="es-GT"/>
+        </w:rPr>
+      </w:pPr>
+    </w:p>
+    <w:p>
+      <w:pPr>
+        <w:spacing w:before="100" w:beforeAutospacing="1" w:after="100" w:afterAutospacing="1" w:line="240" w:lineRule="auto"/>
+        <w:rPr>
+          <w:rFonts w:ascii="Arial" w:eastAsia="Times New Roman" w:hAnsi="Arial" w:cs="Arial"/>
+          <w:sz w:val="24"/>
+          <w:szCs w:val="24"/>
+          <w:lang w:eastAsia="es-GT"/>
+        </w:rPr>
+      </w:pPr>
+    </w:p>
+    <w:p>
+      <w:pPr>
+        <w:spacing w:before="100" w:beforeAutospacing="1" w:after="100" w:afterAutospacing="1" w:line="240" w:lineRule="auto"/>
+        <w:rPr>
+          <w:rFonts w:ascii="Arial" w:eastAsia="Times New Roman" w:hAnsi="Arial" w:cs="Arial"/>
+          <w:sz w:val="24"/>
+          <w:szCs w:val="24"/>
+          <w:lang w:eastAsia="es-GT"/>
+        </w:rPr>
+      </w:pPr>
+    </w:p>
+    <w:p>
+      <w:pPr>
+        <w:spacing w:before="100" w:beforeAutospacing="1" w:after="100" w:afterAutospacing="1" w:line="240" w:lineRule="auto"/>
+        <w:rPr>
+          <w:rFonts w:ascii="Arial" w:eastAsia="Times New Roman" w:hAnsi="Arial" w:cs="Arial"/>
+          <w:sz w:val="24"/>
+          <w:szCs w:val="24"/>
+          <w:lang w:eastAsia="es-GT"/>
+        </w:rPr>
+      </w:pPr>
+    </w:p>
+    <w:p>
+      <w:pPr>
+        <w:spacing w:before="100" w:beforeAutospacing="1" w:after="100" w:afterAutospacing="1" w:line="240" w:lineRule="auto"/>
+        <w:rPr>
+          <w:rFonts w:ascii="Arial" w:eastAsia="Times New Roman" w:hAnsi="Arial" w:cs="Arial"/>
+          <w:sz w:val="24"/>
+          <w:szCs w:val="24"/>
+          <w:lang w:eastAsia="es-GT"/>
+        </w:rPr>
+      </w:pPr>
+    </w:p>
+    <w:p>
+      <w:pPr>
+        <w:spacing w:before="100" w:beforeAutospacing="1" w:after="100" w:afterAutospacing="1" w:line="240" w:lineRule="auto"/>
+        <w:rPr>
+          <w:rFonts w:ascii="Arial" w:eastAsia="Times New Roman" w:hAnsi="Arial" w:cs="Arial"/>
+          <w:sz w:val="24"/>
+          <w:szCs w:val="24"/>
+          <w:lang w:eastAsia="es-GT"/>
+        </w:rPr>
+      </w:pPr>
+    </w:p>
+    <w:p>
+      <w:pPr>
+        <w:spacing w:before="100" w:beforeAutospacing="1" w:after="100" w:afterAutospacing="1" w:line="240" w:lineRule="auto"/>
+        <w:rPr>
+          <w:rFonts w:ascii="Arial" w:eastAsia="Times New Roman" w:hAnsi="Arial" w:cs="Arial"/>
+          <w:sz w:val="24"/>
+          <w:szCs w:val="24"/>
+          <w:lang w:eastAsia="es-GT"/>
+        </w:rPr>
+      </w:pPr>
+    </w:p>
+    <w:p>
+      <w:pPr>
+        <w:spacing w:before="100" w:beforeAutospacing="1" w:after="100" w:afterAutospacing="1" w:line="240" w:lineRule="auto"/>
+        <w:rPr>
+          <w:rFonts w:ascii="Arial" w:eastAsia="Times New Roman" w:hAnsi="Arial" w:cs="Arial"/>
+          <w:sz w:val="24"/>
+          <w:szCs w:val="24"/>
+          <w:lang w:eastAsia="es-GT"/>
+        </w:rPr>
+      </w:pPr>
+    </w:p>
+    <w:p>
+      <w:pPr>
+        <w:spacing w:before="100" w:beforeAutospacing="1" w:after="100" w:afterAutospacing="1" w:line="240" w:lineRule="auto"/>
+        <w:rPr>
+          <w:rFonts w:ascii="Arial" w:eastAsia="Times New Roman" w:hAnsi="Arial" w:cs="Arial"/>
+          <w:sz w:val="24"/>
+          <w:szCs w:val="24"/>
+          <w:lang w:eastAsia="es-GT"/>
+        </w:rPr>
+      </w:pPr>
+    </w:p>
+    <w:p>
+      <w:pPr>
+        <w:spacing w:before="100" w:beforeAutospacing="1" w:after="100" w:afterAutospacing="1" w:line="240" w:lineRule="auto"/>
+        <w:rPr>
+          <w:rFonts w:ascii="Arial" w:eastAsia="Times New Roman" w:hAnsi="Arial" w:cs="Arial"/>
+          <w:sz w:val="24"/>
+          <w:szCs w:val="24"/>
+          <w:lang w:eastAsia="es-GT"/>
+        </w:rPr>
+      </w:pPr>
+    </w:p>
+    <w:p>
+      <w:pPr>
+        <w:spacing w:before="100" w:beforeAutospacing="1" w:after="100" w:afterAutospacing="1" w:line="240" w:lineRule="auto"/>
+        <w:rPr>
+          <w:rFonts w:ascii="Arial" w:eastAsia="Times New Roman" w:hAnsi="Arial" w:cs="Arial"/>
+          <w:sz w:val="24"/>
+          <w:szCs w:val="24"/>
+          <w:lang w:eastAsia="es-GT"/>
+        </w:rPr>
+      </w:pPr>
+    </w:p>
+    <w:p>
+      <w:pPr>
+        <w:spacing w:before="100" w:beforeAutospacing="1" w:after="100" w:afterAutospacing="1" w:line="240" w:lineRule="auto"/>
+        <w:rPr>
+          <w:rFonts w:ascii="Arial" w:eastAsia="Times New Roman" w:hAnsi="Arial" w:cs="Arial"/>
+          <w:sz w:val="24"/>
+          <w:szCs w:val="24"/>
+          <w:lang w:eastAsia="es-GT"/>
+        </w:rPr>
+      </w:pPr>
+    </w:p>
+    <w:p>
+      <w:pPr>
+        <w:spacing w:before="100" w:beforeAutospacing="1" w:after="100" w:afterAutospacing="1" w:line="240" w:lineRule="auto"/>
+        <w:rPr>
+          <w:rFonts w:ascii="Arial" w:eastAsia="Times New Roman" w:hAnsi="Arial" w:cs="Arial"/>
+          <w:sz w:val="24"/>
+          <w:szCs w:val="24"/>
+          <w:lang w:eastAsia="es-GT"/>
+        </w:rPr>
+      </w:pPr>
+    </w:p>
+    <w:p>
+      <w:pPr>
+        <w:spacing w:before="100" w:beforeAutospacing="1" w:after="100" w:afterAutospacing="1" w:line="240" w:lineRule="auto"/>
+        <w:rPr>
+          <w:rFonts w:ascii="Arial" w:eastAsia="Times New Roman" w:hAnsi="Arial" w:cs="Arial"/>
+          <w:sz w:val="24"/>
+          <w:szCs w:val="24"/>
+          <w:lang w:eastAsia="es-GT"/>
+        </w:rPr>
+      </w:pPr>
+    </w:p>
+    <w:p>
+      <w:pPr>
+        <w:spacing w:before="100" w:beforeAutospacing="1" w:after="100" w:afterAutospacing="1" w:line="240" w:lineRule="auto"/>
+        <w:rPr>
+          <w:rFonts w:ascii="Arial" w:eastAsia="Times New Roman" w:hAnsi="Arial" w:cs="Arial"/>
+          <w:sz w:val="24"/>
+          <w:szCs w:val="24"/>
+          <w:lang w:eastAsia="es-GT"/>
+        </w:rPr>
+      </w:pPr>
+    </w:p>
+    <w:p>
+      <w:pPr>
+        <w:spacing w:before="100" w:beforeAutospacing="1" w:after="100" w:afterAutospacing="1" w:line="240" w:lineRule="auto"/>
+        <w:rPr>
+          <w:rFonts w:ascii="Arial" w:eastAsia="Times New Roman" w:hAnsi="Arial" w:cs="Arial"/>
+          <w:sz w:val="24"/>
+          <w:szCs w:val="24"/>
+          <w:lang w:eastAsia="es-GT"/>
+        </w:rPr>
+      </w:pPr>
+    </w:p>
+    <w:p>
+      <w:pPr>
+        <w:spacing w:before="100" w:beforeAutospacing="1" w:after="100" w:afterAutospacing="1" w:line="240" w:lineRule="auto"/>
+        <w:rPr>
+          <w:rFonts w:ascii="Arial" w:eastAsia="Times New Roman" w:hAnsi="Arial" w:cs="Arial"/>
+          <w:sz w:val="24"/>
+          <w:szCs w:val="24"/>
+          <w:lang w:eastAsia="es-GT"/>
+        </w:rPr>
+      </w:pPr>
+    </w:p>
+    <w:p>
+      <w:pPr>
+        <w:spacing w:before="100" w:beforeAutospacing="1" w:after="100" w:afterAutospacing="1" w:line="240" w:lineRule="auto"/>
+        <w:rPr>
+          <w:rFonts w:ascii="Arial" w:eastAsia="Times New Roman" w:hAnsi="Arial" w:cs="Arial"/>
+          <w:sz w:val="24"/>
+          <w:szCs w:val="24"/>
+          <w:lang w:eastAsia="es-GT"/>
+        </w:rPr>
+      </w:pPr>
+    </w:p>
+    <w:p>
+      <w:pPr>
+        <w:spacing w:before="100" w:beforeAutospacing="1" w:after="100" w:afterAutospacing="1" w:line="240" w:lineRule="auto"/>
+        <w:rPr>
+          <w:rFonts w:ascii="Arial" w:eastAsia="Times New Roman" w:hAnsi="Arial" w:cs="Arial"/>
+          <w:sz w:val="24"/>
+          <w:szCs w:val="24"/>
+          <w:lang w:eastAsia="es-GT"/>
+        </w:rPr>
+      </w:pPr>
+    </w:p>
+    <w:p>
+      <w:pPr>
+        <w:spacing w:before="100" w:beforeAutospacing="1" w:after="100" w:afterAutospacing="1" w:line="240" w:lineRule="auto"/>
+        <w:rPr>
+          <w:rFonts w:ascii="Arial" w:eastAsia="Times New Roman" w:hAnsi="Arial" w:cs="Arial"/>
+          <w:sz w:val="24"/>
+          <w:szCs w:val="24"/>
+          <w:lang w:eastAsia="es-GT"/>
+        </w:rPr>
+      </w:pPr>
+    </w:p>
+    <w:p>
+      <w:pPr>
+        <w:spacing w:before="100" w:beforeAutospacing="1" w:after="100" w:afterAutospacing="1" w:line="240" w:lineRule="auto"/>
+        <w:rPr>
+          <w:rFonts w:ascii="Arial" w:eastAsia="Times New Roman" w:hAnsi="Arial" w:cs="Arial"/>
+          <w:sz w:val="24"/>
+          <w:szCs w:val="24"/>
+          <w:lang w:eastAsia="es-GT"/>
+        </w:rPr>
+      </w:pPr>
+    </w:p>
+    <w:p>
+      <w:pPr>
+        <w:spacing w:before="100" w:beforeAutospacing="1" w:after="100" w:afterAutospacing="1" w:line="240" w:lineRule="auto"/>
+        <w:rPr>
+          <w:rFonts w:ascii="Arial" w:eastAsia="Times New Roman" w:hAnsi="Arial" w:cs="Arial"/>
+          <w:sz w:val="24"/>
+          <w:szCs w:val="24"/>
+          <w:lang w:eastAsia="es-GT"/>
+        </w:rPr>
+      </w:pPr>
+    </w:p>
+    <w:p>
+      <w:pPr>
+        <w:spacing w:before="100" w:beforeAutospacing="1" w:after="100" w:afterAutospacing="1" w:line="240" w:lineRule="auto"/>
+        <w:rPr>
+          <w:rFonts w:ascii="Arial" w:eastAsia="Times New Roman" w:hAnsi="Arial" w:cs="Arial"/>
+          <w:sz w:val="24"/>
+          <w:szCs w:val="24"/>
+          <w:lang w:eastAsia="es-GT"/>
+        </w:rPr>
+      </w:pPr>
+    </w:p>
+    <w:p>
+      <w:pPr>
+        <w:spacing w:before="100" w:beforeAutospacing="1" w:after="100" w:afterAutospacing="1" w:line="240" w:lineRule="auto"/>
+        <w:rPr>
+          <w:rFonts w:ascii="Arial" w:eastAsia="Times New Roman" w:hAnsi="Arial" w:cs="Arial"/>
+          <w:sz w:val="24"/>
+          <w:szCs w:val="24"/>
+          <w:lang w:eastAsia="es-GT"/>
+        </w:rPr>
+      </w:pPr>
+    </w:p>
+    <w:p>
+      <w:pPr>
+        <w:spacing w:before="100" w:beforeAutospacing="1" w:after="100" w:afterAutospacing="1" w:line="240" w:lineRule="auto"/>
+        <w:rPr>
+          <w:rFonts w:ascii="Arial" w:eastAsia="Times New Roman" w:hAnsi="Arial" w:cs="Arial"/>
+          <w:sz w:val="24"/>
+          <w:szCs w:val="24"/>
+          <w:lang w:eastAsia="es-GT"/>
+        </w:rPr>
+      </w:pPr>
+    </w:p>
+    <w:p>
+      <w:pPr>
+        <w:spacing w:before="100" w:beforeAutospacing="1" w:after="100" w:afterAutospacing="1" w:line="240" w:lineRule="auto"/>
+        <w:rPr>
+          <w:rFonts w:ascii="Arial" w:eastAsia="Times New Roman" w:hAnsi="Arial" w:cs="Arial"/>
+          <w:sz w:val="24"/>
+          <w:szCs w:val="24"/>
+          <w:lang w:eastAsia="es-GT"/>
+        </w:rPr>
+      </w:pPr>
+    </w:p>
+    <w:p>
+      <w:pPr>
+        <w:spacing w:before="100" w:beforeAutospacing="1" w:after="100" w:afterAutospacing="1" w:line="240" w:lineRule="auto"/>
+        <w:rPr>
+          <w:rFonts w:ascii="Arial" w:eastAsia="Times New Roman" w:hAnsi="Arial" w:cs="Arial"/>
+          <w:sz w:val="24"/>
+          <w:szCs w:val="24"/>
+          <w:lang w:eastAsia="es-GT"/>
+        </w:rPr>
+      </w:pPr>
+    </w:p>
+    <w:p>
+      <w:pPr>
+        <w:spacing w:before="100" w:beforeAutospacing="1" w:after="100" w:afterAutospacing="1" w:line="240" w:lineRule="auto"/>
+        <w:rPr>
+          <w:rFonts w:ascii="Arial" w:eastAsia="Times New Roman" w:hAnsi="Arial" w:cs="Arial"/>
+          <w:sz w:val="24"/>
+          <w:szCs w:val="24"/>
+          <w:lang w:eastAsia="es-GT"/>
+        </w:rPr>
+      </w:pPr>
+    </w:p>
+    <w:p>
+      <w:pPr>
+        <w:spacing w:before="100" w:beforeAutospacing="1" w:after="100" w:afterAutospacing="1" w:line="240" w:lineRule="auto"/>
+        <w:rPr>
+          <w:rFonts w:ascii="Arial" w:eastAsia="Times New Roman" w:hAnsi="Arial" w:cs="Arial"/>
+          <w:sz w:val="24"/>
+          <w:szCs w:val="24"/>
+          <w:lang w:eastAsia="es-GT"/>
+        </w:rPr>
+      </w:pPr>
+    </w:p>
+    <w:p>
+      <w:pPr>
+        <w:spacing w:before="100" w:beforeAutospacing="1" w:after="100" w:afterAutospacing="1" w:line="240" w:lineRule="auto"/>
+        <w:rPr>
+          <w:rFonts w:ascii="Arial" w:eastAsia="Times New Roman" w:hAnsi="Arial" w:cs="Arial"/>
+          <w:sz w:val="24"/>
+          <w:szCs w:val="24"/>
+          <w:lang w:eastAsia="es-GT"/>
+        </w:rPr>
+      </w:pPr>
+    </w:p>
+    <w:p>
+      <w:pPr>
+        <w:spacing w:before="100" w:beforeAutospacing="1" w:after="100" w:afterAutospacing="1" w:line="240" w:lineRule="auto"/>
+        <w:rPr>
+          <w:rFonts w:ascii="Arial" w:eastAsia="Times New Roman" w:hAnsi="Arial" w:cs="Arial"/>
+          <w:sz w:val="24"/>
+          <w:szCs w:val="24"/>
+          <w:lang w:eastAsia="es-GT"/>
+        </w:rPr>
+      </w:pPr>
+    </w:p>
+    <w:p>
+      <w:pPr>
+        <w:spacing w:before="100" w:beforeAutospacing="1" w:after="100" w:afterAutospacing="1" w:line="240" w:lineRule="auto"/>
+        <w:rPr>
+          <w:rFonts w:ascii="Arial" w:eastAsia="Times New Roman" w:hAnsi="Arial" w:cs="Arial"/>
+          <w:sz w:val="24"/>
+          <w:szCs w:val="24"/>
+          <w:lang w:eastAsia="es-GT"/>
+        </w:rPr>
+      </w:pPr>
+    </w:p>
+    <w:p>
+      <w:pPr>
+        <w:spacing w:before="100" w:beforeAutospacing="1" w:after="100" w:afterAutospacing="1" w:line="240" w:lineRule="auto"/>
+        <w:rPr>
+          <w:rFonts w:ascii="Arial" w:eastAsia="Times New Roman" w:hAnsi="Arial" w:cs="Arial"/>
+          <w:sz w:val="24"/>
+          <w:szCs w:val="24"/>
+          <w:lang w:eastAsia="es-GT"/>
+        </w:rPr>
+      </w:pPr>
+    </w:p>
+    <w:p>
+      <w:pPr>
+        <w:spacing w:before="100" w:beforeAutospacing="1" w:after="100" w:afterAutospacing="1" w:line="240" w:lineRule="auto"/>
+        <w:rPr>
+          <w:rFonts w:ascii="Arial" w:eastAsia="Times New Roman" w:hAnsi="Arial" w:cs="Arial"/>
+          <w:sz w:val="24"/>
+          <w:szCs w:val="24"/>
+          <w:lang w:eastAsia="es-GT"/>
+        </w:rPr>
+      </w:pPr>
+    </w:p>
+    <w:p>
+      <w:pPr>
+        <w:spacing w:before="100" w:beforeAutospacing="1" w:after="100" w:afterAutospacing="1" w:line="240" w:lineRule="auto"/>
+        <w:rPr>
+          <w:rFonts w:ascii="Arial" w:eastAsia="Times New Roman" w:hAnsi="Arial" w:cs="Arial"/>
+          <w:sz w:val="24"/>
+          <w:szCs w:val="24"/>
+          <w:lang w:eastAsia="es-GT"/>
+        </w:rPr>
+      </w:pPr>
+    </w:p>
+    <w:p>
+      <w:pPr>
+        <w:spacing w:before="100" w:beforeAutospacing="1" w:after="100" w:afterAutospacing="1" w:line="240" w:lineRule="auto"/>
+        <w:rPr>
+          <w:rFonts w:ascii="Arial" w:eastAsia="Times New Roman" w:hAnsi="Arial" w:cs="Arial"/>
+          <w:sz w:val="24"/>
+          <w:szCs w:val="24"/>
+          <w:lang w:eastAsia="es-GT"/>
+        </w:rPr>
+      </w:pPr>
+    </w:p>
+    <w:p>
+      <w:pPr>
+        <w:spacing w:before="100" w:beforeAutospacing="1" w:after="100" w:afterAutospacing="1" w:line="240" w:lineRule="auto"/>
+        <w:rPr>
+          <w:rFonts w:ascii="Arial" w:eastAsia="Times New Roman" w:hAnsi="Arial" w:cs="Arial"/>
+          <w:sz w:val="24"/>
+          <w:szCs w:val="24"/>
+          <w:lang w:eastAsia="es-GT"/>
+        </w:rPr>
+      </w:pPr>
+    </w:p>
+    <w:p>
+      <w:pPr>
+        <w:spacing w:before="100" w:beforeAutospacing="1" w:after="100" w:afterAutospacing="1" w:line="240" w:lineRule="auto"/>
+        <w:rPr>
+          <w:rFonts w:ascii="Arial" w:eastAsia="Times New Roman" w:hAnsi="Arial" w:cs="Arial"/>
+          <w:sz w:val="24"/>
+          <w:szCs w:val="24"/>
+          <w:lang w:eastAsia="es-GT"/>
+        </w:rPr>
+      </w:pPr>
+    </w:p>
+    <w:p>
+      <w:pPr>
+        <w:spacing w:before="100" w:beforeAutospacing="1" w:after="100" w:afterAutospacing="1" w:line="240" w:lineRule="auto"/>
+        <w:rPr>
+          <w:rFonts w:ascii="Arial" w:eastAsia="Times New Roman" w:hAnsi="Arial" w:cs="Arial"/>
+          <w:sz w:val="24"/>
+          <w:szCs w:val="24"/>
+          <w:lang w:eastAsia="es-GT"/>
+        </w:rPr>
+      </w:pPr>
+    </w:p>
+    <w:p>
+      <w:pPr>
+        <w:spacing w:before="100" w:beforeAutospacing="1" w:after="100" w:afterAutospacing="1" w:line="240" w:lineRule="auto"/>
+        <w:rPr>
+          <w:rFonts w:ascii="Arial" w:eastAsia="Times New Roman" w:hAnsi="Arial" w:cs="Arial"/>
+          <w:sz w:val="24"/>
+          <w:szCs w:val="24"/>
+          <w:lang w:eastAsia="es-GT"/>
+        </w:rPr>
+      </w:pPr>
+    </w:p>
+    <w:p>
+      <w:pPr>
+        <w:spacing w:before="100" w:beforeAutospacing="1" w:after="100" w:afterAutospacing="1" w:line="240" w:lineRule="auto"/>
+        <w:rPr>
+          <w:rFonts w:ascii="Arial" w:eastAsia="Times New Roman" w:hAnsi="Arial" w:cs="Arial"/>
+          <w:sz w:val="24"/>
+          <w:szCs w:val="24"/>
+          <w:lang w:eastAsia="es-GT"/>
+        </w:rPr>
+      </w:pPr>
+    </w:p>
+    <w:p>
+      <w:pPr>
+        <w:spacing w:before="100" w:beforeAutospacing="1" w:after="100" w:afterAutospacing="1" w:line="240" w:lineRule="auto"/>
+        <w:rPr>
+          <w:rFonts w:ascii="Arial" w:eastAsia="Times New Roman" w:hAnsi="Arial" w:cs="Arial"/>
+          <w:sz w:val="24"/>
+          <w:szCs w:val="24"/>
+          <w:lang w:eastAsia="es-GT"/>
+        </w:rPr>
+      </w:pPr>
+    </w:p>
+    <w:p>
+      <w:pPr>
+        <w:spacing w:before="100" w:beforeAutospacing="1" w:after="100" w:afterAutospacing="1" w:line="240" w:lineRule="auto"/>
+        <w:rPr>
+          <w:rFonts w:ascii="Arial" w:eastAsia="Times New Roman" w:hAnsi="Arial" w:cs="Arial"/>
+          <w:sz w:val="24"/>
+          <w:szCs w:val="24"/>
+          <w:lang w:eastAsia="es-GT"/>
+        </w:rPr>
+      </w:pPr>
+    </w:p>
+    <w:p>
+      <w:pPr>
+        <w:spacing w:before="100" w:beforeAutospacing="1" w:after="100" w:afterAutospacing="1" w:line="240" w:lineRule="auto"/>
+        <w:rPr>
+          <w:rFonts w:ascii="Arial" w:eastAsia="Times New Roman" w:hAnsi="Arial" w:cs="Arial"/>
+          <w:sz w:val="24"/>
+          <w:szCs w:val="24"/>
+          <w:lang w:eastAsia="es-GT"/>
+        </w:rPr>
+      </w:pPr>
+    </w:p>
+    <w:p>
+      <w:pPr>
+        <w:spacing w:before="100" w:beforeAutospacing="1" w:after="100" w:afterAutospacing="1" w:line="240" w:lineRule="auto"/>
+        <w:rPr>
+          <w:rFonts w:ascii="Arial" w:eastAsia="Times New Roman" w:hAnsi="Arial" w:cs="Arial"/>
+          <w:sz w:val="24"/>
+          <w:szCs w:val="24"/>
+          <w:lang w:eastAsia="es-GT"/>
+        </w:rPr>
+      </w:pPr>
+    </w:p>
+    <w:p>
+      <w:pPr>
+        <w:spacing w:before="100" w:beforeAutospacing="1" w:after="100" w:afterAutospacing="1" w:line="240" w:lineRule="auto"/>
+        <w:rPr>
+          <w:rFonts w:ascii="Arial" w:eastAsia="Times New Roman" w:hAnsi="Arial" w:cs="Arial"/>
+          <w:sz w:val="24"/>
+          <w:szCs w:val="24"/>
+          <w:lang w:eastAsia="es-GT"/>
+        </w:rPr>
+      </w:pPr>
+    </w:p>
+    <w:p>
+      <w:pPr>
+        <w:spacing w:before="100" w:beforeAutospacing="1" w:after="100" w:afterAutospacing="1" w:line="240" w:lineRule="auto"/>
+        <w:rPr>
+          <w:rFonts w:ascii="Arial" w:eastAsia="Times New Roman" w:hAnsi="Arial" w:cs="Arial"/>
+          <w:sz w:val="24"/>
+          <w:szCs w:val="24"/>
+          <w:lang w:eastAsia="es-GT"/>
+        </w:rPr>
+      </w:pPr>
+    </w:p>
+    <w:p>
+      <w:pPr>
+        <w:spacing w:before="100" w:beforeAutospacing="1" w:after="100" w:afterAutospacing="1" w:line="240" w:lineRule="auto"/>
+        <w:rPr>
+          <w:rFonts w:ascii="Arial" w:eastAsia="Times New Roman" w:hAnsi="Arial" w:cs="Arial"/>
+          <w:sz w:val="24"/>
+          <w:szCs w:val="24"/>
+          <w:lang w:eastAsia="es-GT"/>
+        </w:rPr>
+      </w:pPr>
+    </w:p>
+    <w:p>
+      <w:pPr>
+        <w:spacing w:before="100" w:beforeAutospacing="1" w:after="100" w:afterAutospacing="1" w:line="240" w:lineRule="auto"/>
+        <w:rPr>
+          <w:rFonts w:ascii="Arial" w:eastAsia="Times New Roman" w:hAnsi="Arial" w:cs="Arial"/>
+          <w:sz w:val="24"/>
+          <w:szCs w:val="24"/>
+          <w:lang w:eastAsia="es-GT"/>
+        </w:rPr>
+      </w:pPr>
+    </w:p>
+    <w:p>
+      <w:pPr>
+        <w:spacing w:before="100" w:beforeAutospacing="1" w:after="100" w:afterAutospacing="1" w:line="240" w:lineRule="auto"/>
+        <w:rPr>
+          <w:rFonts w:ascii="Arial" w:eastAsia="Times New Roman" w:hAnsi="Arial" w:cs="Arial"/>
+          <w:sz w:val="24"/>
+          <w:szCs w:val="24"/>
+          <w:lang w:eastAsia="es-GT"/>
+        </w:rPr>
+      </w:pPr>
+    </w:p>
+    <w:p>
+      <w:pPr>
+        <w:spacing w:before="100" w:beforeAutospacing="1" w:after="100" w:afterAutospacing="1" w:line="240" w:lineRule="auto"/>
+        <w:rPr>
+          <w:rFonts w:ascii="Arial" w:eastAsia="Times New Roman" w:hAnsi="Arial" w:cs="Arial"/>
+          <w:sz w:val="24"/>
+          <w:szCs w:val="24"/>
+          <w:lang w:eastAsia="es-GT"/>
+        </w:rPr>
+      </w:pPr>
+    </w:p>
+    <w:p>
+      <w:pPr>
+        <w:spacing w:before="100" w:beforeAutospacing="1" w:after="100" w:afterAutospacing="1" w:line="240" w:lineRule="auto"/>
+        <w:rPr>
+          <w:rFonts w:ascii="Arial" w:eastAsia="Times New Roman" w:hAnsi="Arial" w:cs="Arial"/>
+          <w:sz w:val="24"/>
+          <w:szCs w:val="24"/>
+          <w:lang w:eastAsia="es-GT"/>
+        </w:rPr>
+      </w:pPr>
+    </w:p>
+    <w:p>
+      <w:pPr>
+        <w:spacing w:before="100" w:beforeAutospacing="1" w:after="100" w:afterAutospacing="1" w:line="240" w:lineRule="auto"/>
+        <w:rPr>
+          <w:rFonts w:ascii="Arial" w:eastAsia="Times New Roman" w:hAnsi="Arial" w:cs="Arial"/>
+          <w:sz w:val="24"/>
+          <w:szCs w:val="24"/>
+          <w:lang w:eastAsia="es-GT"/>
+        </w:rPr>
+      </w:pPr>
+    </w:p>
+    <w:p>
+      <w:pPr>
+        <w:spacing w:before="100" w:beforeAutospacing="1" w:after="100" w:afterAutospacing="1" w:line="240" w:lineRule="auto"/>
+        <w:rPr>
+          <w:rFonts w:ascii="Arial" w:eastAsia="Times New Roman" w:hAnsi="Arial" w:cs="Arial"/>
+          <w:sz w:val="24"/>
+          <w:szCs w:val="24"/>
+          <w:lang w:eastAsia="es-GT"/>
+        </w:rPr>
+      </w:pPr>
+    </w:p>
+    <w:p>
+      <w:pPr>
+        <w:spacing w:before="100" w:beforeAutospacing="1" w:after="100" w:afterAutospacing="1" w:line="240" w:lineRule="auto"/>
+        <w:rPr>
+          <w:rFonts w:ascii="Arial" w:eastAsia="Times New Roman" w:hAnsi="Arial" w:cs="Arial"/>
+          <w:sz w:val="24"/>
+          <w:szCs w:val="24"/>
+          <w:lang w:eastAsia="es-GT"/>
+        </w:rPr>
+      </w:pPr>
+    </w:p>
+    <w:p>
+      <w:pPr>
+        <w:spacing w:before="100" w:beforeAutospacing="1" w:after="100" w:afterAutospacing="1" w:line="240" w:lineRule="auto"/>
+        <w:rPr>
+          <w:rFonts w:ascii="Arial" w:eastAsia="Times New Roman" w:hAnsi="Arial" w:cs="Arial"/>
+          <w:sz w:val="24"/>
+          <w:szCs w:val="24"/>
+          <w:lang w:eastAsia="es-GT"/>
+        </w:rPr>
+      </w:pPr>
+    </w:p>
+    <w:p>
+      <w:pPr>
+        <w:spacing w:before="100" w:beforeAutospacing="1" w:after="100" w:afterAutospacing="1" w:line="240" w:lineRule="auto"/>
+        <w:rPr>
+          <w:rFonts w:ascii="Arial" w:eastAsia="Times New Roman" w:hAnsi="Arial" w:cs="Arial"/>
+          <w:sz w:val="24"/>
+          <w:szCs w:val="24"/>
+          <w:lang w:eastAsia="es-GT"/>
+        </w:rPr>
+      </w:pPr>
+    </w:p>
+    <w:p>
+      <w:pPr>
+        <w:spacing w:before="100" w:beforeAutospacing="1" w:after="100" w:afterAutospacing="1" w:line="240" w:lineRule="auto"/>
+        <w:rPr>
+          <w:rFonts w:ascii="Arial" w:eastAsia="Times New Roman" w:hAnsi="Arial" w:cs="Arial"/>
+          <w:sz w:val="24"/>
+          <w:szCs w:val="24"/>
+          <w:lang w:eastAsia="es-GT"/>
+        </w:rPr>
+      </w:pPr>
+    </w:p>
+    <w:p>
+      <w:pPr>
+        <w:spacing w:before="100" w:beforeAutospacing="1" w:after="100" w:afterAutospacing="1" w:line="240" w:lineRule="auto"/>
+        <w:rPr>
+          <w:rFonts w:ascii="Arial" w:eastAsia="Times New Roman" w:hAnsi="Arial" w:cs="Arial"/>
+          <w:sz w:val="24"/>
+          <w:szCs w:val="24"/>
+          <w:lang w:eastAsia="es-GT"/>
+        </w:rPr>
+      </w:pPr>
+    </w:p>
+    <w:p>
+      <w:pPr>
+        <w:spacing w:before="100" w:beforeAutospacing="1" w:after="100" w:afterAutospacing="1" w:line="240" w:lineRule="auto"/>
+        <w:rPr>
+          <w:rFonts w:ascii="Arial" w:eastAsia="Times New Roman" w:hAnsi="Arial" w:cs="Arial"/>
+          <w:sz w:val="24"/>
+          <w:szCs w:val="24"/>
+          <w:lang w:eastAsia="es-GT"/>
+        </w:rPr>
+      </w:pPr>
+    </w:p>
+    <w:p>
+      <w:pPr>
+        <w:spacing w:before="100" w:beforeAutospacing="1" w:after="100" w:afterAutospacing="1" w:line="240" w:lineRule="auto"/>
+        <w:rPr>
+          <w:rFonts w:ascii="Arial" w:eastAsia="Times New Roman" w:hAnsi="Arial" w:cs="Arial"/>
+          <w:sz w:val="24"/>
+          <w:szCs w:val="24"/>
+          <w:lang w:eastAsia="es-GT"/>
+        </w:rPr>
+      </w:pPr>
+    </w:p>
+    <w:p>
+      <w:pPr>
+        <w:spacing w:before="100" w:beforeAutospacing="1" w:after="100" w:afterAutospacing="1" w:line="240" w:lineRule="auto"/>
+        <w:rPr>
+          <w:rFonts w:ascii="Arial" w:eastAsia="Times New Roman" w:hAnsi="Arial" w:cs="Arial"/>
+          <w:sz w:val="24"/>
+          <w:szCs w:val="24"/>
+          <w:lang w:eastAsia="es-GT"/>
+        </w:rPr>
+      </w:pPr>
+    </w:p>
+    <w:p>
+      <w:pPr>
+        <w:spacing w:before="100" w:beforeAutospacing="1" w:after="100" w:afterAutospacing="1" w:line="240" w:lineRule="auto"/>
+        <w:rPr>
+          <w:rFonts w:ascii="Arial" w:eastAsia="Times New Roman" w:hAnsi="Arial" w:cs="Arial"/>
+          <w:sz w:val="24"/>
+          <w:szCs w:val="24"/>
+          <w:lang w:eastAsia="es-GT"/>
+        </w:rPr>
+      </w:pPr>
+    </w:p>
+    <w:p>
+      <w:pPr>
+        <w:spacing w:before="100" w:beforeAutospacing="1" w:after="100" w:afterAutospacing="1" w:line="240" w:lineRule="auto"/>
+        <w:rPr>
+          <w:rFonts w:ascii="Arial" w:eastAsia="Times New Roman" w:hAnsi="Arial" w:cs="Arial"/>
+          <w:sz w:val="24"/>
+          <w:szCs w:val="24"/>
+          <w:lang w:eastAsia="es-GT"/>
+        </w:rPr>
+      </w:pPr>
+    </w:p>
+    <w:p>
+      <w:pPr>
+        <w:spacing w:before="100" w:beforeAutospacing="1" w:after="100" w:afterAutospacing="1" w:line="240" w:lineRule="auto"/>
+        <w:rPr>
+          <w:rFonts w:ascii="Arial" w:eastAsia="Times New Roman" w:hAnsi="Arial" w:cs="Arial"/>
+          <w:sz w:val="24"/>
+          <w:szCs w:val="24"/>
+          <w:lang w:eastAsia="es-GT"/>
+        </w:rPr>
+      </w:pPr>
+    </w:p>
+    <w:p>
+      <w:pPr>
+        <w:spacing w:before="100" w:beforeAutospacing="1" w:after="100" w:afterAutospacing="1" w:line="240" w:lineRule="auto"/>
+        <w:rPr>
+          <w:rFonts w:ascii="Arial" w:eastAsia="Times New Roman" w:hAnsi="Arial" w:cs="Arial"/>
+          <w:sz w:val="24"/>
+          <w:szCs w:val="24"/>
+          <w:lang w:eastAsia="es-GT"/>
+        </w:rPr>
+      </w:pPr>
+    </w:p>
+    <w:p>
+      <w:pPr>
+        <w:spacing w:before="100" w:beforeAutospacing="1" w:after="100" w:afterAutospacing="1" w:line="240" w:lineRule="auto"/>
+        <w:rPr>
+          <w:rFonts w:ascii="Arial" w:eastAsia="Times New Roman" w:hAnsi="Arial" w:cs="Arial"/>
+          <w:sz w:val="24"/>
+          <w:szCs w:val="24"/>
+          <w:lang w:eastAsia="es-GT"/>
+        </w:rPr>
+      </w:pPr>
+    </w:p>
+    <w:p>
+      <w:pPr>
+        <w:spacing w:before="100" w:beforeAutospacing="1" w:after="100" w:afterAutospacing="1" w:line="240" w:lineRule="auto"/>
+        <w:rPr>
+          <w:rFonts w:ascii="Arial" w:eastAsia="Times New Roman" w:hAnsi="Arial" w:cs="Arial"/>
+          <w:sz w:val="24"/>
+          <w:szCs w:val="24"/>
+          <w:lang w:eastAsia="es-GT"/>
+        </w:rPr>
+      </w:pPr>
+    </w:p>
+    <w:p>
+      <w:pPr>
+        <w:spacing w:before="100" w:beforeAutospacing="1" w:after="100" w:afterAutospacing="1" w:line="240" w:lineRule="auto"/>
+        <w:rPr>
+          <w:rFonts w:ascii="Arial" w:eastAsia="Times New Roman" w:hAnsi="Arial" w:cs="Arial"/>
+          <w:sz w:val="24"/>
+          <w:szCs w:val="24"/>
+          <w:lang w:eastAsia="es-GT"/>
+        </w:rPr>
+      </w:pPr>
+    </w:p>
+    <w:p>
+      <w:pPr>
+        <w:spacing w:before="100" w:beforeAutospacing="1" w:after="100" w:afterAutospacing="1" w:line="240" w:lineRule="auto"/>
+        <w:rPr>
+          <w:rFonts w:ascii="Arial" w:eastAsia="Times New Roman" w:hAnsi="Arial" w:cs="Arial"/>
+          <w:sz w:val="24"/>
+          <w:szCs w:val="24"/>
+          <w:lang w:eastAsia="es-GT"/>
+        </w:rPr>
+      </w:pPr>
+    </w:p>
+    <w:p>
+      <w:pPr>
+        <w:spacing w:before="100" w:beforeAutospacing="1" w:after="100" w:afterAutospacing="1" w:line="240" w:lineRule="auto"/>
+        <w:rPr>
+          <w:rFonts w:ascii="Arial" w:eastAsia="Times New Roman" w:hAnsi="Arial" w:cs="Arial"/>
+          <w:sz w:val="24"/>
+          <w:szCs w:val="24"/>
+          <w:lang w:eastAsia="es-GT"/>
+        </w:rPr>
+      </w:pPr>
+    </w:p>
+    <w:p>
+      <w:pPr>
+        <w:rPr>
+          <w:rFonts w:ascii="Arial" w:eastAsiaTheme="minorHAnsi" w:hAnsi="Arial" w:cs="Arial"/>
+          <w:bCs/>
+          <w:u w:val="single"/>
+        </w:rPr>
+      </w:pPr>
     </w:p>
     <w:sectPr>
       <w:pgSz w:w="12240" w:h="15840"/>
@@ -1385,7 +5308,7 @@
     <w:rPrDefault>
       <w:rPr>
         <w:rFonts w:asciiTheme="minorHAnsi" w:eastAsiaTheme="minorHAnsi" w:hAnsiTheme="minorHAnsi" w:cstheme="minorBidi"/>
-        <w:lang w:val="es-MX" w:eastAsia="es-MX" w:bidi="ar-SA"/>
+        <w:lang w:val="en-US" w:eastAsia="en-US" w:bidi="ar-SA"/>
       </w:rPr>
     </w:rPrDefault>
     <w:pPrDefault/>
@@ -1547,7 +5470,7 @@
     <w:lsdException w:name="Balloon Text" w:semiHidden="1" w:unhideWhenUsed="1" w:qFormat="1"/>
     <w:lsdException w:name="Table Grid" w:uiPriority="39" w:qFormat="1"/>
     <w:lsdException w:name="Table Theme" w:semiHidden="1" w:unhideWhenUsed="1"/>
-    <w:lsdException w:name="Placeholder Text" w:semiHidden="1" w:unhideWhenUsed="1"/>
+    <w:lsdException w:name="Placeholder Text" w:semiHidden="1"/>
     <w:lsdException w:name="No Spacing" w:uiPriority="1" w:qFormat="1"/>
     <w:lsdException w:name="Light Shading"/>
     <w:lsdException w:name="Light List"/>
@@ -1569,10 +5492,7 @@
     <w:lsdException w:name="Medium Shading 1 Accent 1"/>
     <w:lsdException w:name="Medium Shading 2 Accent 1"/>
     <w:lsdException w:name="Medium List 1 Accent 1"/>
-    <w:lsdException w:name="Revision" w:semiHidden="1" w:unhideWhenUsed="1"/>
-    <w:lsdException w:name="List Paragraph" w:semiHidden="1" w:unhideWhenUsed="1"/>
-    <w:lsdException w:name="Quote" w:semiHidden="1" w:unhideWhenUsed="1"/>
-    <w:lsdException w:name="Intense Quote" w:semiHidden="1" w:unhideWhenUsed="1"/>
+    <w:lsdException w:name="Revision" w:semiHidden="1"/>
     <w:lsdException w:name="Medium List 2 Accent 1"/>
     <w:lsdException w:name="Medium Grid 1 Accent 1"/>
     <w:lsdException w:name="Medium Grid 2 Accent 1"/>
@@ -1778,7 +5698,7 @@
       <w:rFonts w:eastAsia="MS Mincho"/>
       <w:sz w:val="22"/>
       <w:szCs w:val="22"/>
-      <w:lang w:val="es-GT" w:eastAsia="en-US"/>
+      <w:lang w:val="es-GT"/>
     </w:rPr>
   </w:style>
   <w:style w:type="character" w:default="1" w:styleId="Fuentedeprrafopredeter">
@@ -1916,7 +5836,7 @@
     <w:rPr>
       <w:sz w:val="22"/>
       <w:szCs w:val="22"/>
-      <w:lang w:val="es-GT" w:eastAsia="en-US"/>
+      <w:lang w:val="es-GT"/>
     </w:rPr>
   </w:style>
   <w:style w:type="character" w:customStyle="1" w:styleId="TextocomentarioCar">

</xml_diff>

<commit_message>
add: Se agrego historia de usuario HUBA-017 dentro del documento Peaceathome.docx en la rama bargueta-2024358
</commit_message>
<xml_diff>
--- a/Peaceathome.docx
+++ b/Peaceathome.docx
@@ -273,6 +273,7 @@
           <w:rFonts w:ascii="Arial" w:hAnsi="Arial" w:cs="Arial"/>
         </w:rPr>
       </w:pPr>
+      <w:proofErr w:type="spellStart"/>
       <w:r>
         <w:rPr>
           <w:rStyle w:val="oypena"/>
@@ -280,7 +281,17 @@
           <w:color w:val="000000"/>
           <w:sz w:val="40"/>
         </w:rPr>
-        <w:t>Peace at home</w:t>
+        <w:t>Peace</w:t>
+      </w:r>
+      <w:proofErr w:type="spellEnd"/>
+      <w:r>
+        <w:rPr>
+          <w:rStyle w:val="oypena"/>
+          <w:rFonts w:ascii="Arial" w:hAnsi="Arial" w:cs="Arial"/>
+          <w:color w:val="000000"/>
+          <w:sz w:val="40"/>
+        </w:rPr>
+        <w:t xml:space="preserve"> at home</w:t>
       </w:r>
     </w:p>
     <w:p>
@@ -668,14 +679,52 @@
                 <w:lang w:val="es-ES"/>
               </w:rPr>
             </w:pPr>
+            <w:proofErr w:type="spellStart"/>
             <w:r>
               <w:rPr>
                 <w:rFonts w:ascii="Arial" w:eastAsiaTheme="minorHAnsi" w:hAnsi="Arial" w:cs="Arial"/>
                 <w:sz w:val="24"/>
                 <w:lang w:val="es-ES"/>
               </w:rPr>
-              <w:t>Kenet Efraín Cuyuch Joj</w:t>
+              <w:t>Kenet</w:t>
             </w:r>
+            <w:proofErr w:type="spellEnd"/>
+            <w:r>
+              <w:rPr>
+                <w:rFonts w:ascii="Arial" w:eastAsiaTheme="minorHAnsi" w:hAnsi="Arial" w:cs="Arial"/>
+                <w:sz w:val="24"/>
+                <w:lang w:val="es-ES"/>
+              </w:rPr>
+              <w:t xml:space="preserve"> Efraín </w:t>
+            </w:r>
+            <w:proofErr w:type="spellStart"/>
+            <w:r>
+              <w:rPr>
+                <w:rFonts w:ascii="Arial" w:eastAsiaTheme="minorHAnsi" w:hAnsi="Arial" w:cs="Arial"/>
+                <w:sz w:val="24"/>
+                <w:lang w:val="es-ES"/>
+              </w:rPr>
+              <w:t>Cuyuch</w:t>
+            </w:r>
+            <w:proofErr w:type="spellEnd"/>
+            <w:r>
+              <w:rPr>
+                <w:rFonts w:ascii="Arial" w:eastAsiaTheme="minorHAnsi" w:hAnsi="Arial" w:cs="Arial"/>
+                <w:sz w:val="24"/>
+                <w:lang w:val="es-ES"/>
+              </w:rPr>
+              <w:t xml:space="preserve"> </w:t>
+            </w:r>
+            <w:proofErr w:type="spellStart"/>
+            <w:r>
+              <w:rPr>
+                <w:rFonts w:ascii="Arial" w:eastAsiaTheme="minorHAnsi" w:hAnsi="Arial" w:cs="Arial"/>
+                <w:sz w:val="24"/>
+                <w:lang w:val="es-ES"/>
+              </w:rPr>
+              <w:t>Joj</w:t>
+            </w:r>
+            <w:proofErr w:type="spellEnd"/>
           </w:p>
         </w:tc>
         <w:tc>
@@ -715,12 +764,37 @@
                 <w:sz w:val="24"/>
               </w:rPr>
             </w:pPr>
+            <w:proofErr w:type="spellStart"/>
             <w:r>
               <w:rPr>
                 <w:rFonts w:ascii="Arial" w:eastAsiaTheme="minorHAnsi" w:hAnsi="Arial" w:cs="Arial"/>
                 <w:sz w:val="24"/>
               </w:rPr>
-              <w:t>Angel Gahel Padilla Pacheco</w:t>
+              <w:t>Angel</w:t>
+            </w:r>
+            <w:proofErr w:type="spellEnd"/>
+            <w:r>
+              <w:rPr>
+                <w:rFonts w:ascii="Arial" w:eastAsiaTheme="minorHAnsi" w:hAnsi="Arial" w:cs="Arial"/>
+                <w:sz w:val="24"/>
+              </w:rPr>
+              <w:t xml:space="preserve"> </w:t>
+            </w:r>
+            <w:proofErr w:type="spellStart"/>
+            <w:r>
+              <w:rPr>
+                <w:rFonts w:ascii="Arial" w:eastAsiaTheme="minorHAnsi" w:hAnsi="Arial" w:cs="Arial"/>
+                <w:sz w:val="24"/>
+              </w:rPr>
+              <w:t>Gahel</w:t>
+            </w:r>
+            <w:proofErr w:type="spellEnd"/>
+            <w:r>
+              <w:rPr>
+                <w:rFonts w:ascii="Arial" w:eastAsiaTheme="minorHAnsi" w:hAnsi="Arial" w:cs="Arial"/>
+                <w:sz w:val="24"/>
+              </w:rPr>
+              <w:t xml:space="preserve"> Padilla Pacheco</w:t>
             </w:r>
           </w:p>
         </w:tc>
@@ -762,13 +836,47 @@
                 <w:sz w:val="24"/>
               </w:rPr>
             </w:pPr>
+            <w:proofErr w:type="spellStart"/>
             <w:r>
               <w:rPr>
                 <w:rFonts w:ascii="Arial" w:eastAsiaTheme="minorHAnsi" w:hAnsi="Arial" w:cs="Arial"/>
                 <w:sz w:val="24"/>
               </w:rPr>
-              <w:t>Jose Enrique cuc cutz</w:t>
+              <w:t>Jose</w:t>
             </w:r>
+            <w:proofErr w:type="spellEnd"/>
+            <w:r>
+              <w:rPr>
+                <w:rFonts w:ascii="Arial" w:eastAsiaTheme="minorHAnsi" w:hAnsi="Arial" w:cs="Arial"/>
+                <w:sz w:val="24"/>
+              </w:rPr>
+              <w:t xml:space="preserve"> Enrique </w:t>
+            </w:r>
+            <w:proofErr w:type="spellStart"/>
+            <w:r>
+              <w:rPr>
+                <w:rFonts w:ascii="Arial" w:eastAsiaTheme="minorHAnsi" w:hAnsi="Arial" w:cs="Arial"/>
+                <w:sz w:val="24"/>
+              </w:rPr>
+              <w:t>cuc</w:t>
+            </w:r>
+            <w:proofErr w:type="spellEnd"/>
+            <w:r>
+              <w:rPr>
+                <w:rFonts w:ascii="Arial" w:eastAsiaTheme="minorHAnsi" w:hAnsi="Arial" w:cs="Arial"/>
+                <w:sz w:val="24"/>
+              </w:rPr>
+              <w:t xml:space="preserve"> </w:t>
+            </w:r>
+            <w:proofErr w:type="spellStart"/>
+            <w:r>
+              <w:rPr>
+                <w:rFonts w:ascii="Arial" w:eastAsiaTheme="minorHAnsi" w:hAnsi="Arial" w:cs="Arial"/>
+                <w:sz w:val="24"/>
+              </w:rPr>
+              <w:t>cutz</w:t>
+            </w:r>
+            <w:proofErr w:type="spellEnd"/>
           </w:p>
         </w:tc>
         <w:tc>
@@ -809,14 +917,52 @@
                 <w:szCs w:val="24"/>
               </w:rPr>
             </w:pPr>
+            <w:proofErr w:type="spellStart"/>
             <w:r>
               <w:rPr>
                 <w:rFonts w:ascii="Arial" w:eastAsiaTheme="minorEastAsia" w:hAnsi="Arial" w:cs="Arial"/>
                 <w:sz w:val="24"/>
                 <w:szCs w:val="24"/>
               </w:rPr>
-              <w:t>Jeferson Andre Cano Lopez</w:t>
+              <w:t>Jeferson</w:t>
             </w:r>
+            <w:proofErr w:type="spellEnd"/>
+            <w:r>
+              <w:rPr>
+                <w:rFonts w:ascii="Arial" w:eastAsiaTheme="minorEastAsia" w:hAnsi="Arial" w:cs="Arial"/>
+                <w:sz w:val="24"/>
+                <w:szCs w:val="24"/>
+              </w:rPr>
+              <w:t xml:space="preserve"> </w:t>
+            </w:r>
+            <w:proofErr w:type="spellStart"/>
+            <w:r>
+              <w:rPr>
+                <w:rFonts w:ascii="Arial" w:eastAsiaTheme="minorEastAsia" w:hAnsi="Arial" w:cs="Arial"/>
+                <w:sz w:val="24"/>
+                <w:szCs w:val="24"/>
+              </w:rPr>
+              <w:t>Andre</w:t>
+            </w:r>
+            <w:proofErr w:type="spellEnd"/>
+            <w:r>
+              <w:rPr>
+                <w:rFonts w:ascii="Arial" w:eastAsiaTheme="minorEastAsia" w:hAnsi="Arial" w:cs="Arial"/>
+                <w:sz w:val="24"/>
+                <w:szCs w:val="24"/>
+              </w:rPr>
+              <w:t xml:space="preserve"> Cano </w:t>
+            </w:r>
+            <w:proofErr w:type="spellStart"/>
+            <w:r>
+              <w:rPr>
+                <w:rFonts w:ascii="Arial" w:eastAsiaTheme="minorEastAsia" w:hAnsi="Arial" w:cs="Arial"/>
+                <w:sz w:val="24"/>
+                <w:szCs w:val="24"/>
+              </w:rPr>
+              <w:t>Lopez</w:t>
+            </w:r>
+            <w:proofErr w:type="spellEnd"/>
           </w:p>
         </w:tc>
         <w:tc>
@@ -909,8 +1055,17 @@
                 <w:rFonts w:ascii="Arial" w:eastAsiaTheme="minorHAnsi" w:hAnsi="Arial" w:cs="Arial"/>
                 <w:sz w:val="24"/>
               </w:rPr>
-              <w:t>Ricardo Alejandro Hernández Hernández</w:t>
+              <w:t xml:space="preserve">Ricardo Alejandro Hernández </w:t>
             </w:r>
+            <w:proofErr w:type="spellStart"/>
+            <w:r>
+              <w:rPr>
+                <w:rFonts w:ascii="Arial" w:eastAsiaTheme="minorHAnsi" w:hAnsi="Arial" w:cs="Arial"/>
+                <w:sz w:val="24"/>
+              </w:rPr>
+              <w:t>Hernández</w:t>
+            </w:r>
+            <w:proofErr w:type="spellEnd"/>
           </w:p>
         </w:tc>
         <w:tc>
@@ -955,7 +1110,23 @@
                 <w:rFonts w:ascii="Arial" w:eastAsiaTheme="minorHAnsi" w:hAnsi="Arial" w:cs="Arial"/>
                 <w:sz w:val="24"/>
               </w:rPr>
-              <w:t>Osman Emmanuell Veliz Guzmán</w:t>
+              <w:t xml:space="preserve">Osman </w:t>
+            </w:r>
+            <w:proofErr w:type="spellStart"/>
+            <w:r>
+              <w:rPr>
+                <w:rFonts w:ascii="Arial" w:eastAsiaTheme="minorHAnsi" w:hAnsi="Arial" w:cs="Arial"/>
+                <w:sz w:val="24"/>
+              </w:rPr>
+              <w:t>Emmanuell</w:t>
+            </w:r>
+            <w:proofErr w:type="spellEnd"/>
+            <w:r>
+              <w:rPr>
+                <w:rFonts w:ascii="Arial" w:eastAsiaTheme="minorHAnsi" w:hAnsi="Arial" w:cs="Arial"/>
+                <w:sz w:val="24"/>
+              </w:rPr>
+              <w:t xml:space="preserve"> Veliz Guzmán</w:t>
             </w:r>
           </w:p>
         </w:tc>
@@ -1001,8 +1172,33 @@
                 <w:rFonts w:ascii="Arial" w:eastAsiaTheme="minorHAnsi" w:hAnsi="Arial" w:cs="Arial"/>
                 <w:sz w:val="24"/>
               </w:rPr>
-              <w:t>Franklin Stev Paiz Chavez</w:t>
+              <w:t xml:space="preserve">Franklin </w:t>
             </w:r>
+            <w:proofErr w:type="spellStart"/>
+            <w:r>
+              <w:rPr>
+                <w:rFonts w:ascii="Arial" w:eastAsiaTheme="minorHAnsi" w:hAnsi="Arial" w:cs="Arial"/>
+                <w:sz w:val="24"/>
+              </w:rPr>
+              <w:t>Stev</w:t>
+            </w:r>
+            <w:proofErr w:type="spellEnd"/>
+            <w:r>
+              <w:rPr>
+                <w:rFonts w:ascii="Arial" w:eastAsiaTheme="minorHAnsi" w:hAnsi="Arial" w:cs="Arial"/>
+                <w:sz w:val="24"/>
+              </w:rPr>
+              <w:t xml:space="preserve"> Paiz </w:t>
+            </w:r>
+            <w:proofErr w:type="spellStart"/>
+            <w:r>
+              <w:rPr>
+                <w:rFonts w:ascii="Arial" w:eastAsiaTheme="minorHAnsi" w:hAnsi="Arial" w:cs="Arial"/>
+                <w:sz w:val="24"/>
+              </w:rPr>
+              <w:t>Chavez</w:t>
+            </w:r>
+            <w:proofErr w:type="spellEnd"/>
           </w:p>
         </w:tc>
         <w:tc>
@@ -1043,13 +1239,23 @@
                 <w:szCs w:val="24"/>
               </w:rPr>
             </w:pPr>
+            <w:proofErr w:type="spellStart"/>
             <w:r>
               <w:rPr>
                 <w:rFonts w:ascii="Arial" w:eastAsiaTheme="minorEastAsia" w:hAnsi="Arial" w:cs="Arial"/>
                 <w:sz w:val="24"/>
                 <w:szCs w:val="24"/>
               </w:rPr>
-              <w:t>Angel Gabriel Ernesto Grijalva Castro</w:t>
+              <w:t>Angel</w:t>
+            </w:r>
+            <w:proofErr w:type="spellEnd"/>
+            <w:r>
+              <w:rPr>
+                <w:rFonts w:ascii="Arial" w:eastAsiaTheme="minorEastAsia" w:hAnsi="Arial" w:cs="Arial"/>
+                <w:sz w:val="24"/>
+                <w:szCs w:val="24"/>
+              </w:rPr>
+              <w:t xml:space="preserve"> Gabriel Ernesto Grijalva Castro</w:t>
             </w:r>
           </w:p>
         </w:tc>
@@ -1143,8 +1349,33 @@
                 <w:rFonts w:ascii="Arial" w:eastAsiaTheme="minorHAnsi" w:hAnsi="Arial" w:cs="Arial"/>
                 <w:sz w:val="24"/>
               </w:rPr>
-              <w:t>Carlos Alejandro Patal Choc</w:t>
+              <w:t xml:space="preserve">Carlos Alejandro </w:t>
             </w:r>
+            <w:proofErr w:type="spellStart"/>
+            <w:r>
+              <w:rPr>
+                <w:rFonts w:ascii="Arial" w:eastAsiaTheme="minorHAnsi" w:hAnsi="Arial" w:cs="Arial"/>
+                <w:sz w:val="24"/>
+              </w:rPr>
+              <w:t>Patal</w:t>
+            </w:r>
+            <w:proofErr w:type="spellEnd"/>
+            <w:r>
+              <w:rPr>
+                <w:rFonts w:ascii="Arial" w:eastAsiaTheme="minorHAnsi" w:hAnsi="Arial" w:cs="Arial"/>
+                <w:sz w:val="24"/>
+              </w:rPr>
+              <w:t xml:space="preserve"> </w:t>
+            </w:r>
+            <w:proofErr w:type="spellStart"/>
+            <w:r>
+              <w:rPr>
+                <w:rFonts w:ascii="Arial" w:eastAsiaTheme="minorHAnsi" w:hAnsi="Arial" w:cs="Arial"/>
+                <w:sz w:val="24"/>
+              </w:rPr>
+              <w:t>Choc</w:t>
+            </w:r>
+            <w:proofErr w:type="spellEnd"/>
           </w:p>
         </w:tc>
         <w:tc>
@@ -1775,12 +2006,16 @@
           <w:b/>
         </w:rPr>
       </w:pPr>
+      <w:proofErr w:type="spellStart"/>
+      <w:proofErr w:type="gramStart"/>
       <w:r>
         <w:rPr>
           <w:b/>
         </w:rPr>
         <w:t>TUPLA:Servicios</w:t>
       </w:r>
+      <w:proofErr w:type="spellEnd"/>
+      <w:proofErr w:type="gramEnd"/>
     </w:p>
     <w:p>
       <w:pPr>
@@ -2256,7 +2491,17 @@
           <w:sz w:val="18"/>
           <w:szCs w:val="18"/>
         </w:rPr>
-        <w:t>Tupla: Rese</w:t>
+        <w:t xml:space="preserve">Tupla: </w:t>
+      </w:r>
+      <w:proofErr w:type="spellStart"/>
+      <w:r>
+        <w:rPr>
+          <w:rFonts w:ascii="Segoe UI" w:hAnsi="Segoe UI" w:cs="Segoe UI"/>
+          <w:b/>
+          <w:sz w:val="18"/>
+          <w:szCs w:val="18"/>
+        </w:rPr>
+        <w:t>Rese</w:t>
       </w:r>
       <w:r>
         <w:rPr>
@@ -2268,6 +2513,7 @@
         </w:rPr>
         <w:t>ñas</w:t>
       </w:r>
+      <w:proofErr w:type="spellEnd"/>
     </w:p>
     <w:p>
       <w:pPr>
@@ -2300,7 +2546,25 @@
           <w:sz w:val="22"/>
           <w:szCs w:val="22"/>
         </w:rPr>
-        <w:t>HUJC-007: Registo de nueva reseña</w:t>
+        <w:t xml:space="preserve">HUJC-007: </w:t>
+      </w:r>
+      <w:proofErr w:type="spellStart"/>
+      <w:r>
+        <w:rPr>
+          <w:rFonts w:ascii="Segoe UI" w:hAnsi="Segoe UI" w:cs="Segoe UI"/>
+          <w:sz w:val="22"/>
+          <w:szCs w:val="22"/>
+        </w:rPr>
+        <w:t>Registo</w:t>
+      </w:r>
+      <w:proofErr w:type="spellEnd"/>
+      <w:r>
+        <w:rPr>
+          <w:rFonts w:ascii="Segoe UI" w:hAnsi="Segoe UI" w:cs="Segoe UI"/>
+          <w:sz w:val="22"/>
+          <w:szCs w:val="22"/>
+        </w:rPr>
+        <w:t xml:space="preserve"> de nueva reseña</w:t>
       </w:r>
     </w:p>
     <w:p>
@@ -2320,8 +2584,18 @@
           <w:sz w:val="22"/>
           <w:szCs w:val="22"/>
         </w:rPr>
-        <w:t>Como: Huesped</w:t>
-      </w:r>
+        <w:t xml:space="preserve">Como: </w:t>
+      </w:r>
+      <w:proofErr w:type="spellStart"/>
+      <w:r>
+        <w:rPr>
+          <w:rFonts w:ascii="Segoe UI" w:hAnsi="Segoe UI" w:cs="Segoe UI"/>
+          <w:sz w:val="22"/>
+          <w:szCs w:val="22"/>
+        </w:rPr>
+        <w:t>Huesped</w:t>
+      </w:r>
+      <w:proofErr w:type="spellEnd"/>
     </w:p>
     <w:p>
       <w:pPr>
@@ -2340,7 +2614,25 @@
           <w:sz w:val="22"/>
           <w:szCs w:val="22"/>
         </w:rPr>
-        <w:t>Quiero: Registar una reseña sobre los servicios del cuarto de baño</w:t>
+        <w:t xml:space="preserve">Quiero: </w:t>
+      </w:r>
+      <w:proofErr w:type="spellStart"/>
+      <w:r>
+        <w:rPr>
+          <w:rFonts w:ascii="Segoe UI" w:hAnsi="Segoe UI" w:cs="Segoe UI"/>
+          <w:sz w:val="22"/>
+          <w:szCs w:val="22"/>
+        </w:rPr>
+        <w:t>Registar</w:t>
+      </w:r>
+      <w:proofErr w:type="spellEnd"/>
+      <w:r>
+        <w:rPr>
+          <w:rFonts w:ascii="Segoe UI" w:hAnsi="Segoe UI" w:cs="Segoe UI"/>
+          <w:sz w:val="22"/>
+          <w:szCs w:val="22"/>
+        </w:rPr>
+        <w:t xml:space="preserve"> una reseña sobre los servicios del cuarto de baño</w:t>
       </w:r>
     </w:p>
     <w:p>
@@ -2434,7 +2726,25 @@
           <w:sz w:val="22"/>
           <w:szCs w:val="22"/>
         </w:rPr>
-        <w:t>Quiero: Registrar una reseña sobre la propiedad que me fue otorgada en Peace At Home</w:t>
+        <w:t xml:space="preserve">Quiero: Registrar una reseña sobre la propiedad que me fue otorgada en </w:t>
+      </w:r>
+      <w:proofErr w:type="spellStart"/>
+      <w:r>
+        <w:rPr>
+          <w:rFonts w:ascii="Segoe UI" w:hAnsi="Segoe UI" w:cs="Segoe UI"/>
+          <w:sz w:val="22"/>
+          <w:szCs w:val="22"/>
+        </w:rPr>
+        <w:t>Peace</w:t>
+      </w:r>
+      <w:proofErr w:type="spellEnd"/>
+      <w:r>
+        <w:rPr>
+          <w:rFonts w:ascii="Segoe UI" w:hAnsi="Segoe UI" w:cs="Segoe UI"/>
+          <w:sz w:val="22"/>
+          <w:szCs w:val="22"/>
+        </w:rPr>
+        <w:t xml:space="preserve"> At Home</w:t>
       </w:r>
     </w:p>
     <w:p>
@@ -2528,7 +2838,25 @@
           <w:sz w:val="22"/>
           <w:szCs w:val="22"/>
         </w:rPr>
-        <w:t>Quiero: Registrar una reseña sobre los huéspedes que ocupan mi propiedad de Peace At Home</w:t>
+        <w:t xml:space="preserve">Quiero: Registrar una reseña sobre los huéspedes que ocupan mi propiedad de </w:t>
+      </w:r>
+      <w:proofErr w:type="spellStart"/>
+      <w:r>
+        <w:rPr>
+          <w:rFonts w:ascii="Segoe UI" w:hAnsi="Segoe UI" w:cs="Segoe UI"/>
+          <w:sz w:val="22"/>
+          <w:szCs w:val="22"/>
+        </w:rPr>
+        <w:t>Peace</w:t>
+      </w:r>
+      <w:proofErr w:type="spellEnd"/>
+      <w:r>
+        <w:rPr>
+          <w:rFonts w:ascii="Segoe UI" w:hAnsi="Segoe UI" w:cs="Segoe UI"/>
+          <w:sz w:val="22"/>
+          <w:szCs w:val="22"/>
+        </w:rPr>
+        <w:t xml:space="preserve"> At Home</w:t>
       </w:r>
     </w:p>
     <w:p>
@@ -3107,7 +3435,27 @@
           <w:szCs w:val="24"/>
           <w:lang w:eastAsia="es-GT"/>
         </w:rPr>
-        <w:t>Para: Tener un envio automático de notificaciones por correo electrónico y dentro del sistema.</w:t>
+        <w:t xml:space="preserve">Para: Tener un </w:t>
+      </w:r>
+      <w:proofErr w:type="spellStart"/>
+      <w:r>
+        <w:rPr>
+          <w:rFonts w:ascii="Arial" w:eastAsia="Times New Roman" w:hAnsi="Arial" w:cs="Arial"/>
+          <w:sz w:val="24"/>
+          <w:szCs w:val="24"/>
+          <w:lang w:eastAsia="es-GT"/>
+        </w:rPr>
+        <w:t>envio</w:t>
+      </w:r>
+      <w:proofErr w:type="spellEnd"/>
+      <w:r>
+        <w:rPr>
+          <w:rFonts w:ascii="Arial" w:eastAsia="Times New Roman" w:hAnsi="Arial" w:cs="Arial"/>
+          <w:sz w:val="24"/>
+          <w:szCs w:val="24"/>
+          <w:lang w:eastAsia="es-GT"/>
+        </w:rPr>
+        <w:t xml:space="preserve"> automático de notificaciones por correo electrónico y dentro del sistema.</w:t>
       </w:r>
     </w:p>
     <w:p>
@@ -3230,6 +3578,78 @@
         </w:rPr>
         <w:t>Para: ofrecer información precisa y enriquecedora que mejore significativamente la experiencia de búsqueda del usuario, permitiéndole tomar decisiones informadas.</w:t>
       </w:r>
+    </w:p>
+    <w:p>
+      <w:pPr>
+        <w:pStyle w:val="NormalWeb"/>
+        <w:rPr>
+          <w:rFonts w:ascii="Arial" w:hAnsi="Arial" w:cs="Arial"/>
+          <w:sz w:val="22"/>
+          <w:szCs w:val="22"/>
+        </w:rPr>
+      </w:pPr>
+    </w:p>
+    <w:p>
+      <w:pPr>
+        <w:rPr>
+          <w:rFonts w:ascii="Arial" w:eastAsiaTheme="minorHAnsi" w:hAnsi="Arial" w:cs="Arial"/>
+        </w:rPr>
+      </w:pPr>
+      <w:r>
+        <w:rPr>
+          <w:rFonts w:ascii="Arial" w:eastAsiaTheme="minorHAnsi" w:hAnsi="Arial" w:cs="Arial"/>
+        </w:rPr>
+        <w:t>HUBA-026: Identificación Clara de Comodidades No Disponibles</w:t>
+      </w:r>
+    </w:p>
+    <w:p>
+      <w:pPr>
+        <w:rPr>
+          <w:rFonts w:ascii="Arial" w:eastAsiaTheme="minorHAnsi" w:hAnsi="Arial" w:cs="Arial"/>
+        </w:rPr>
+      </w:pPr>
+      <w:r>
+        <w:rPr>
+          <w:rFonts w:ascii="Arial" w:eastAsiaTheme="minorHAnsi" w:hAnsi="Arial" w:cs="Arial"/>
+        </w:rPr>
+        <w:t>Como: Comodidades</w:t>
+      </w:r>
+    </w:p>
+    <w:p>
+      <w:pPr>
+        <w:rPr>
+          <w:rFonts w:ascii="Arial" w:eastAsiaTheme="minorHAnsi" w:hAnsi="Arial" w:cs="Arial"/>
+        </w:rPr>
+      </w:pPr>
+      <w:r>
+        <w:rPr>
+          <w:rFonts w:ascii="Arial" w:eastAsiaTheme="minorHAnsi" w:hAnsi="Arial" w:cs="Arial"/>
+        </w:rPr>
+        <w:t>Quiero: que el sistema muestre de forma clara las comodidades con las que la propiedad no cuenta,</w:t>
+      </w:r>
+    </w:p>
+    <w:p>
+      <w:pPr>
+        <w:rPr>
+          <w:rFonts w:ascii="Arial" w:eastAsiaTheme="minorHAnsi" w:hAnsi="Arial" w:cs="Arial"/>
+        </w:rPr>
+      </w:pPr>
+      <w:r>
+        <w:rPr>
+          <w:rFonts w:ascii="Arial" w:eastAsiaTheme="minorHAnsi" w:hAnsi="Arial" w:cs="Arial"/>
+        </w:rPr>
+        <w:t>Para: evitar cualquier expectativa errónea o inconveniente al momento de mi estancia, asegurando una total transparencia.</w:t>
+      </w:r>
+    </w:p>
+    <w:p>
+      <w:pPr>
+        <w:pStyle w:val="NormalWeb"/>
+        <w:rPr>
+          <w:rFonts w:ascii="Arial" w:hAnsi="Arial" w:cs="Arial"/>
+          <w:sz w:val="22"/>
+          <w:szCs w:val="22"/>
+        </w:rPr>
+      </w:pPr>
     </w:p>
     <w:p>
       <w:pPr>

</xml_diff>

<commit_message>
add: Se agrego historia de usuario HUCL-020 dentro del documento Peaceathome.docx en la rama clopez-2024242
</commit_message>
<xml_diff>
--- a/Peaceathome.docx
+++ b/Peaceathome.docx
@@ -3926,25 +3926,109 @@
     </w:p>
     <w:p>
       <w:pPr>
-        <w:spacing w:before="100" w:beforeAutospacing="1" w:after="100" w:afterAutospacing="1" w:line="240" w:lineRule="auto"/>
-        <w:rPr>
-          <w:rFonts w:ascii="Arial" w:eastAsia="Times New Roman" w:hAnsi="Arial" w:cs="Arial"/>
-          <w:sz w:val="24"/>
-          <w:szCs w:val="24"/>
-          <w:lang w:eastAsia="es-GT"/>
-        </w:rPr>
-      </w:pPr>
-    </w:p>
-    <w:p>
-      <w:pPr>
-        <w:spacing w:before="100" w:beforeAutospacing="1" w:after="100" w:afterAutospacing="1" w:line="240" w:lineRule="auto"/>
-        <w:rPr>
-          <w:rFonts w:ascii="Arial" w:eastAsia="Times New Roman" w:hAnsi="Arial" w:cs="Arial"/>
-          <w:sz w:val="24"/>
-          <w:szCs w:val="24"/>
-          <w:lang w:eastAsia="es-GT"/>
-        </w:rPr>
-      </w:pPr>
+        <w:rPr>
+          <w:rFonts w:ascii="Arial" w:eastAsiaTheme="minorHAnsi" w:hAnsi="Arial" w:cs="Arial"/>
+          <w:sz w:val="20"/>
+          <w:szCs w:val="20"/>
+          <w:lang w:val="es-MX"/>
+        </w:rPr>
+      </w:pPr>
+    </w:p>
+    <w:p>
+      <w:pPr>
+        <w:rPr>
+          <w:rFonts w:ascii="Arial" w:eastAsiaTheme="minorHAnsi" w:hAnsi="Arial" w:cs="Arial"/>
+          <w:b/>
+          <w:bCs/>
+          <w:lang w:val="es-MX"/>
+        </w:rPr>
+      </w:pPr>
+      <w:r>
+        <w:rPr>
+          <w:rFonts w:ascii="Arial" w:eastAsiaTheme="minorHAnsi" w:hAnsi="Arial" w:cs="Arial"/>
+          <w:b/>
+          <w:bCs/>
+          <w:lang w:val="es-MX"/>
+        </w:rPr>
+        <w:t>HUCL-020: Registro de Nueva Propiedad</w:t>
+      </w:r>
+    </w:p>
+    <w:p>
+      <w:pPr>
+        <w:rPr>
+          <w:rFonts w:ascii="Arial" w:eastAsiaTheme="minorHAnsi" w:hAnsi="Arial" w:cs="Arial"/>
+          <w:sz w:val="20"/>
+          <w:szCs w:val="20"/>
+          <w:lang w:val="es-MX"/>
+        </w:rPr>
+      </w:pPr>
+      <w:r>
+        <w:rPr>
+          <w:rFonts w:ascii="Arial" w:eastAsiaTheme="minorHAnsi" w:hAnsi="Arial" w:cs="Arial"/>
+          <w:sz w:val="20"/>
+          <w:szCs w:val="20"/>
+          <w:lang w:val="es-MX"/>
+        </w:rPr>
+        <w:t>Como: Arrendador</w:t>
+      </w:r>
+    </w:p>
+    <w:p>
+      <w:pPr>
+        <w:rPr>
+          <w:rFonts w:ascii="Arial" w:eastAsiaTheme="minorHAnsi" w:hAnsi="Arial" w:cs="Arial"/>
+          <w:sz w:val="20"/>
+          <w:szCs w:val="20"/>
+          <w:lang w:val="es-MX"/>
+        </w:rPr>
+      </w:pPr>
+      <w:r>
+        <w:rPr>
+          <w:rFonts w:ascii="Arial" w:eastAsiaTheme="minorHAnsi" w:hAnsi="Arial" w:cs="Arial"/>
+          <w:sz w:val="20"/>
+          <w:szCs w:val="20"/>
+          <w:lang w:val="es-MX"/>
+        </w:rPr>
+        <w:t xml:space="preserve">Quiero: Registrar una nueva propiedad en </w:t>
+      </w:r>
+      <w:proofErr w:type="spellStart"/>
+      <w:r>
+        <w:rPr>
+          <w:rFonts w:ascii="Arial" w:eastAsiaTheme="minorHAnsi" w:hAnsi="Arial" w:cs="Arial"/>
+          <w:sz w:val="20"/>
+          <w:szCs w:val="20"/>
+          <w:lang w:val="es-MX"/>
+        </w:rPr>
+        <w:t>Peace</w:t>
+      </w:r>
+      <w:proofErr w:type="spellEnd"/>
+      <w:r>
+        <w:rPr>
+          <w:rFonts w:ascii="Arial" w:eastAsiaTheme="minorHAnsi" w:hAnsi="Arial" w:cs="Arial"/>
+          <w:sz w:val="20"/>
+          <w:szCs w:val="20"/>
+          <w:lang w:val="es-MX"/>
+        </w:rPr>
+        <w:t xml:space="preserve"> at Home</w:t>
+      </w:r>
+    </w:p>
+    <w:p>
+      <w:pPr>
+        <w:rPr>
+          <w:rFonts w:ascii="Arial" w:eastAsiaTheme="minorHAnsi" w:hAnsi="Arial" w:cs="Arial"/>
+          <w:sz w:val="20"/>
+          <w:szCs w:val="20"/>
+          <w:lang w:val="es-MX"/>
+        </w:rPr>
+      </w:pPr>
+      <w:r>
+        <w:rPr>
+          <w:rFonts w:ascii="Arial" w:eastAsiaTheme="minorHAnsi" w:hAnsi="Arial" w:cs="Arial"/>
+          <w:sz w:val="20"/>
+          <w:szCs w:val="20"/>
+          <w:lang w:val="es-MX"/>
+        </w:rPr>
+        <w:t>Para: Brindar una experiencia cómoda y agradable a los huéspedes que renten la propiedad</w:t>
+      </w:r>
     </w:p>
     <w:p>
       <w:pPr>

</xml_diff>

<commit_message>
add: Se agrego historia de usuario HUCL-021 dentro del documento Peaceathome.docx en la rama clopez-2024242
</commit_message>
<xml_diff>
--- a/Peaceathome.docx
+++ b/Peaceathome.docx
@@ -745,17 +745,8 @@
                 <w:rFonts w:ascii="Arial" w:eastAsiaTheme="minorHAnsi" w:hAnsi="Arial" w:cs="Arial"/>
                 <w:sz w:val="24"/>
               </w:rPr>
-              <w:t xml:space="preserve">Scrum </w:t>
+              <w:t>Scrum Master</w:t>
             </w:r>
-            <w:proofErr w:type="gramStart"/>
-            <w:r>
-              <w:rPr>
-                <w:rFonts w:ascii="Arial" w:eastAsiaTheme="minorHAnsi" w:hAnsi="Arial" w:cs="Arial"/>
-                <w:sz w:val="24"/>
-              </w:rPr>
-              <w:t>Master</w:t>
-            </w:r>
-            <w:proofErr w:type="gramEnd"/>
           </w:p>
         </w:tc>
       </w:tr>
@@ -2034,7 +2025,6 @@
         </w:rPr>
       </w:pPr>
       <w:proofErr w:type="spellStart"/>
-      <w:proofErr w:type="gramStart"/>
       <w:r>
         <w:rPr>
           <w:b/>
@@ -2042,7 +2032,6 @@
         <w:t>TUPLA:Servicios</w:t>
       </w:r>
       <w:proofErr w:type="spellEnd"/>
-      <w:proofErr w:type="gramEnd"/>
     </w:p>
     <w:p>
       <w:pPr>
@@ -3882,9 +3871,8 @@
           <w:szCs w:val="20"/>
           <w:lang w:val="es-MX"/>
         </w:rPr>
-        <w:t xml:space="preserve">edades registradas al nombre de </w:t>
-      </w:r>
-      <w:proofErr w:type="gramStart"/>
+        <w:t xml:space="preserve">edades registradas al nombre de algún </w:t>
+      </w:r>
       <w:r>
         <w:rPr>
           <w:rFonts w:ascii="Arial" w:eastAsiaTheme="minorHAnsi" w:hAnsi="Arial" w:cs="Arial"/>
@@ -3892,36 +3880,55 @@
           <w:szCs w:val="20"/>
           <w:lang w:val="es-MX"/>
         </w:rPr>
-        <w:t xml:space="preserve">algún </w:t>
-      </w:r>
-      <w:r>
+        <w:t xml:space="preserve"> usuario</w:t>
+      </w:r>
+    </w:p>
+    <w:p>
+      <w:pPr>
         <w:rPr>
           <w:rFonts w:ascii="Arial" w:eastAsiaTheme="minorHAnsi" w:hAnsi="Arial" w:cs="Arial"/>
           <w:sz w:val="20"/>
           <w:szCs w:val="20"/>
           <w:lang w:val="es-MX"/>
         </w:rPr>
-        <w:t xml:space="preserve"> usuario</w:t>
-      </w:r>
-      <w:proofErr w:type="gramEnd"/>
-    </w:p>
-    <w:p>
-      <w:pPr>
+      </w:pPr>
+      <w:r>
         <w:rPr>
           <w:rFonts w:ascii="Arial" w:eastAsiaTheme="minorHAnsi" w:hAnsi="Arial" w:cs="Arial"/>
           <w:sz w:val="20"/>
           <w:szCs w:val="20"/>
           <w:lang w:val="es-MX"/>
         </w:rPr>
-      </w:pPr>
-      <w:r>
+        <w:t>Para: Poder llevar un registro de sus facturas y remodelaciones</w:t>
+      </w:r>
+    </w:p>
+    <w:p>
+      <w:pPr>
         <w:rPr>
           <w:rFonts w:ascii="Arial" w:eastAsiaTheme="minorHAnsi" w:hAnsi="Arial" w:cs="Arial"/>
           <w:sz w:val="20"/>
           <w:szCs w:val="20"/>
           <w:lang w:val="es-MX"/>
         </w:rPr>
-        <w:t>Para: Poder llevar un registro de sus facturas y remodelaciones</w:t>
+      </w:pPr>
+    </w:p>
+    <w:p>
+      <w:pPr>
+        <w:rPr>
+          <w:rFonts w:ascii="Arial" w:eastAsiaTheme="minorHAnsi" w:hAnsi="Arial" w:cs="Arial"/>
+          <w:b/>
+          <w:bCs/>
+          <w:lang w:val="es-MX"/>
+        </w:rPr>
+      </w:pPr>
+      <w:r>
+        <w:rPr>
+          <w:rFonts w:ascii="Arial" w:eastAsiaTheme="minorHAnsi" w:hAnsi="Arial" w:cs="Arial"/>
+          <w:b/>
+          <w:bCs/>
+          <w:lang w:val="es-MX"/>
+        </w:rPr>
+        <w:t>HUCL-020: Registro de Nueva Propiedad</w:t>
       </w:r>
     </w:p>
     <w:p>
@@ -3933,16 +3940,120 @@
           <w:lang w:val="es-MX"/>
         </w:rPr>
       </w:pPr>
-    </w:p>
-    <w:p>
-      <w:pPr>
+      <w:r>
+        <w:rPr>
+          <w:rFonts w:ascii="Arial" w:eastAsiaTheme="minorHAnsi" w:hAnsi="Arial" w:cs="Arial"/>
+          <w:sz w:val="20"/>
+          <w:szCs w:val="20"/>
+          <w:lang w:val="es-MX"/>
+        </w:rPr>
+        <w:t>Como: Arrendador</w:t>
+      </w:r>
+    </w:p>
+    <w:p>
+      <w:pPr>
+        <w:rPr>
+          <w:rFonts w:ascii="Arial" w:eastAsiaTheme="minorHAnsi" w:hAnsi="Arial" w:cs="Arial"/>
+          <w:sz w:val="20"/>
+          <w:szCs w:val="20"/>
+          <w:lang w:val="es-MX"/>
+        </w:rPr>
+      </w:pPr>
+      <w:r>
+        <w:rPr>
+          <w:rFonts w:ascii="Arial" w:eastAsiaTheme="minorHAnsi" w:hAnsi="Arial" w:cs="Arial"/>
+          <w:sz w:val="20"/>
+          <w:szCs w:val="20"/>
+          <w:lang w:val="es-MX"/>
+        </w:rPr>
+        <w:t xml:space="preserve">Quiero: Registrar una nueva propiedad en </w:t>
+      </w:r>
+      <w:proofErr w:type="spellStart"/>
+      <w:r>
+        <w:rPr>
+          <w:rFonts w:ascii="Arial" w:eastAsiaTheme="minorHAnsi" w:hAnsi="Arial" w:cs="Arial"/>
+          <w:sz w:val="20"/>
+          <w:szCs w:val="20"/>
+          <w:lang w:val="es-MX"/>
+        </w:rPr>
+        <w:t>Peace</w:t>
+      </w:r>
+      <w:proofErr w:type="spellEnd"/>
+      <w:r>
+        <w:rPr>
+          <w:rFonts w:ascii="Arial" w:eastAsiaTheme="minorHAnsi" w:hAnsi="Arial" w:cs="Arial"/>
+          <w:sz w:val="20"/>
+          <w:szCs w:val="20"/>
+          <w:lang w:val="es-MX"/>
+        </w:rPr>
+        <w:t xml:space="preserve"> at Home</w:t>
+      </w:r>
+    </w:p>
+    <w:p>
+      <w:pPr>
+        <w:rPr>
+          <w:rFonts w:ascii="Arial" w:eastAsiaTheme="minorHAnsi" w:hAnsi="Arial" w:cs="Arial"/>
+          <w:sz w:val="20"/>
+          <w:szCs w:val="20"/>
+          <w:lang w:val="es-MX"/>
+        </w:rPr>
+      </w:pPr>
+      <w:r>
+        <w:rPr>
+          <w:rFonts w:ascii="Arial" w:eastAsiaTheme="minorHAnsi" w:hAnsi="Arial" w:cs="Arial"/>
+          <w:sz w:val="20"/>
+          <w:szCs w:val="20"/>
+          <w:lang w:val="es-MX"/>
+        </w:rPr>
+        <w:t>Para: Brindar una experiencia cómoda y agradable a los huéspedes que renten la propiedad</w:t>
+      </w:r>
+    </w:p>
+    <w:p>
+      <w:pPr>
+        <w:rPr>
+          <w:rFonts w:ascii="Arial" w:eastAsiaTheme="minorHAnsi" w:hAnsi="Arial" w:cs="Arial"/>
+          <w:sz w:val="20"/>
+          <w:szCs w:val="20"/>
+          <w:lang w:val="es-MX"/>
+        </w:rPr>
+      </w:pPr>
+    </w:p>
+    <w:p>
+      <w:pPr>
+        <w:rPr>
+          <w:rFonts w:ascii="Arial" w:eastAsiaTheme="minorHAnsi" w:hAnsi="Arial" w:cs="Arial"/>
+          <w:sz w:val="20"/>
+          <w:szCs w:val="20"/>
+          <w:lang w:val="es-MX"/>
+        </w:rPr>
+      </w:pPr>
+      <w:r>
         <w:rPr>
           <w:rFonts w:ascii="Arial" w:eastAsiaTheme="minorHAnsi" w:hAnsi="Arial" w:cs="Arial"/>
           <w:b/>
           <w:bCs/>
           <w:lang w:val="es-MX"/>
         </w:rPr>
-      </w:pPr>
+        <w:t>HUCL-021:</w:t>
+      </w:r>
+      <w:r>
+        <w:rPr>
+          <w:rFonts w:ascii="Arial" w:eastAsiaTheme="minorHAnsi" w:hAnsi="Arial" w:cs="Arial"/>
+          <w:sz w:val="20"/>
+          <w:szCs w:val="20"/>
+          <w:lang w:val="es-MX"/>
+        </w:rPr>
+        <w:t xml:space="preserve"> </w:t>
+      </w:r>
+      <w:r>
+        <w:rPr>
+          <w:rFonts w:ascii="Arial" w:eastAsiaTheme="minorHAnsi" w:hAnsi="Arial" w:cs="Arial"/>
+          <w:sz w:val="20"/>
+          <w:szCs w:val="20"/>
+          <w:lang w:val="es-MX"/>
+        </w:rPr>
+        <w:t xml:space="preserve"> </w:t>
+      </w:r>
       <w:r>
         <w:rPr>
           <w:rFonts w:ascii="Arial" w:eastAsiaTheme="minorHAnsi" w:hAnsi="Arial" w:cs="Arial"/>
@@ -3950,7 +4061,7 @@
           <w:bCs/>
           <w:lang w:val="es-MX"/>
         </w:rPr>
-        <w:t>HUCL-020: Registro de Nueva Propiedad</w:t>
+        <w:t>descripción de propiedades</w:t>
       </w:r>
     </w:p>
     <w:p>
@@ -3969,7 +4080,7 @@
           <w:szCs w:val="20"/>
           <w:lang w:val="es-MX"/>
         </w:rPr>
-        <w:t>Como: Arrendador</w:t>
+        <w:t>Como: Administrador</w:t>
       </w:r>
     </w:p>
     <w:p>
@@ -3988,19 +4099,18 @@
           <w:szCs w:val="20"/>
           <w:lang w:val="es-MX"/>
         </w:rPr>
-        <w:t xml:space="preserve">Quiero: Registrar una nueva propiedad en </w:t>
-      </w:r>
-      <w:proofErr w:type="spellStart"/>
-      <w:r>
+        <w:t>Quiero: Poder editar los estados y descripciones de las propiedades que se encuentren en remodelaciones o con atracciones nuevas</w:t>
+      </w:r>
+    </w:p>
+    <w:p>
+      <w:pPr>
         <w:rPr>
           <w:rFonts w:ascii="Arial" w:eastAsiaTheme="minorHAnsi" w:hAnsi="Arial" w:cs="Arial"/>
           <w:sz w:val="20"/>
           <w:szCs w:val="20"/>
           <w:lang w:val="es-MX"/>
         </w:rPr>
-        <w:t>Peace</w:t>
-      </w:r>
-      <w:proofErr w:type="spellEnd"/>
+      </w:pPr>
       <w:r>
         <w:rPr>
           <w:rFonts w:ascii="Arial" w:eastAsiaTheme="minorHAnsi" w:hAnsi="Arial" w:cs="Arial"/>
@@ -4008,38 +4118,8 @@
           <w:szCs w:val="20"/>
           <w:lang w:val="es-MX"/>
         </w:rPr>
-        <w:t xml:space="preserve"> at Home</w:t>
-      </w:r>
-    </w:p>
-    <w:p>
-      <w:pPr>
-        <w:rPr>
-          <w:rFonts w:ascii="Arial" w:eastAsiaTheme="minorHAnsi" w:hAnsi="Arial" w:cs="Arial"/>
-          <w:sz w:val="20"/>
-          <w:szCs w:val="20"/>
-          <w:lang w:val="es-MX"/>
-        </w:rPr>
-      </w:pPr>
-      <w:r>
-        <w:rPr>
-          <w:rFonts w:ascii="Arial" w:eastAsiaTheme="minorHAnsi" w:hAnsi="Arial" w:cs="Arial"/>
-          <w:sz w:val="20"/>
-          <w:szCs w:val="20"/>
-          <w:lang w:val="es-MX"/>
-        </w:rPr>
-        <w:t>Para: Brindar una experiencia cómoda y agradable a los huéspedes que renten la propiedad</w:t>
-      </w:r>
-    </w:p>
-    <w:p>
-      <w:pPr>
-        <w:spacing w:before="100" w:beforeAutospacing="1" w:after="100" w:afterAutospacing="1" w:line="240" w:lineRule="auto"/>
-        <w:rPr>
-          <w:rFonts w:ascii="Arial" w:eastAsia="Times New Roman" w:hAnsi="Arial" w:cs="Arial"/>
-          <w:sz w:val="24"/>
-          <w:szCs w:val="24"/>
-          <w:lang w:eastAsia="es-GT"/>
-        </w:rPr>
-      </w:pPr>
+        <w:t>Para: Que los nuevos usuarios sepan de las nuevas características que poseen las propiedades</w:t>
+      </w:r>
     </w:p>
     <w:p>
       <w:pPr>

</xml_diff>

<commit_message>
add: Se agrego historia de usuario HUAP-023 dentro del documento Peaceathome.docx en la rama apadilla-2024102
</commit_message>
<xml_diff>
--- a/Peaceathome.docx
+++ b/Peaceathome.docx
@@ -3862,6 +3862,114 @@
           <w:lang w:val="es-MX"/>
         </w:rPr>
         <w:t>Para: Mantener mi información actualizada y brindar datos correctos a los huéspedes</w:t>
+      </w:r>
+    </w:p>
+    <w:p>
+      <w:pPr>
+        <w:spacing w:before="100" w:beforeAutospacing="1" w:after="100" w:afterAutospacing="1" w:line="240" w:lineRule="auto"/>
+        <w:rPr>
+          <w:rFonts w:ascii="Arial" w:eastAsiaTheme="minorHAnsi" w:hAnsi="Arial" w:cs="Arial"/>
+          <w:sz w:val="20"/>
+          <w:szCs w:val="20"/>
+          <w:lang w:val="es-MX"/>
+        </w:rPr>
+      </w:pPr>
+    </w:p>
+    <w:p>
+      <w:pPr>
+        <w:rPr>
+          <w:rFonts w:ascii="Arial" w:eastAsiaTheme="minorHAnsi" w:hAnsi="Arial" w:cs="Arial"/>
+          <w:b/>
+          <w:bCs/>
+          <w:lang w:val="es-MX"/>
+        </w:rPr>
+      </w:pPr>
+      <w:r>
+        <w:rPr>
+          <w:rFonts w:ascii="Arial" w:eastAsiaTheme="minorHAnsi" w:hAnsi="Arial" w:cs="Arial"/>
+          <w:b/>
+          <w:bCs/>
+          <w:lang w:val="es-MX"/>
+        </w:rPr>
+        <w:t>HUAP-02</w:t>
+      </w:r>
+      <w:r>
+        <w:rPr>
+          <w:rFonts w:ascii="Arial" w:eastAsiaTheme="minorHAnsi" w:hAnsi="Arial" w:cs="Arial"/>
+          <w:b/>
+          <w:bCs/>
+          <w:lang w:val="es-MX"/>
+        </w:rPr>
+        <w:t>3</w:t>
+      </w:r>
+      <w:r>
+        <w:rPr>
+          <w:rFonts w:ascii="Arial" w:eastAsiaTheme="minorHAnsi" w:hAnsi="Arial" w:cs="Arial"/>
+          <w:b/>
+          <w:bCs/>
+          <w:lang w:val="es-MX"/>
+        </w:rPr>
+        <w:t xml:space="preserve"> - Ver historial de reservas</w:t>
+      </w:r>
+    </w:p>
+    <w:p>
+      <w:pPr>
+        <w:spacing w:before="100" w:beforeAutospacing="1" w:after="100" w:afterAutospacing="1" w:line="240" w:lineRule="auto"/>
+        <w:rPr>
+          <w:rFonts w:ascii="Arial" w:eastAsiaTheme="minorHAnsi" w:hAnsi="Arial" w:cs="Arial"/>
+          <w:sz w:val="20"/>
+          <w:szCs w:val="20"/>
+          <w:lang w:val="es-MX"/>
+        </w:rPr>
+      </w:pPr>
+      <w:r>
+        <w:rPr>
+          <w:rFonts w:ascii="Arial" w:eastAsiaTheme="minorHAnsi" w:hAnsi="Arial" w:cs="Arial"/>
+          <w:sz w:val="20"/>
+          <w:szCs w:val="20"/>
+          <w:lang w:val="es-MX"/>
+        </w:rPr>
+        <w:t>Cómo: Locación</w:t>
+      </w:r>
+    </w:p>
+    <w:p>
+      <w:pPr>
+        <w:spacing w:before="100" w:beforeAutospacing="1" w:after="100" w:afterAutospacing="1" w:line="240" w:lineRule="auto"/>
+        <w:rPr>
+          <w:rFonts w:ascii="Arial" w:eastAsiaTheme="minorHAnsi" w:hAnsi="Arial" w:cs="Arial"/>
+          <w:sz w:val="20"/>
+          <w:szCs w:val="20"/>
+          <w:lang w:val="es-MX"/>
+        </w:rPr>
+      </w:pPr>
+      <w:r>
+        <w:rPr>
+          <w:rFonts w:ascii="Arial" w:eastAsiaTheme="minorHAnsi" w:hAnsi="Arial" w:cs="Arial"/>
+          <w:sz w:val="20"/>
+          <w:szCs w:val="20"/>
+          <w:lang w:val="es-MX"/>
+        </w:rPr>
+        <w:t>Quiero: Consultar las reservas que se han realizado en mi espacio</w:t>
+      </w:r>
+    </w:p>
+    <w:p>
+      <w:pPr>
+        <w:spacing w:before="100" w:beforeAutospacing="1" w:after="100" w:afterAutospacing="1" w:line="240" w:lineRule="auto"/>
+        <w:rPr>
+          <w:rFonts w:ascii="Arial" w:eastAsiaTheme="minorHAnsi" w:hAnsi="Arial" w:cs="Arial"/>
+          <w:sz w:val="20"/>
+          <w:szCs w:val="20"/>
+          <w:lang w:val="es-MX"/>
+        </w:rPr>
+      </w:pPr>
+      <w:r>
+        <w:rPr>
+          <w:rFonts w:ascii="Arial" w:eastAsiaTheme="minorHAnsi" w:hAnsi="Arial" w:cs="Arial"/>
+          <w:sz w:val="20"/>
+          <w:szCs w:val="20"/>
+          <w:lang w:val="es-MX"/>
+        </w:rPr>
+        <w:t>Para: Llevar un control de los huéspedes que me han visitado</w:t>
       </w:r>
     </w:p>
     <w:p>

</xml_diff>

<commit_message>
add: Se agrego historia de usuario HUAP-024 dentro del documento Peaceathome.docx en la rama apadilla-2024102
</commit_message>
<xml_diff>
--- a/Peaceathome.docx
+++ b/Peaceathome.docx
@@ -3970,6 +3970,116 @@
           <w:lang w:val="es-MX"/>
         </w:rPr>
         <w:t>Para: Llevar un control de los huéspedes que me han visitado</w:t>
+      </w:r>
+    </w:p>
+    <w:p>
+      <w:pPr>
+        <w:spacing w:before="100" w:beforeAutospacing="1" w:after="100" w:afterAutospacing="1" w:line="240" w:lineRule="auto"/>
+        <w:rPr>
+          <w:rFonts w:ascii="Arial" w:eastAsiaTheme="minorHAnsi" w:hAnsi="Arial" w:cs="Arial"/>
+          <w:sz w:val="20"/>
+          <w:szCs w:val="20"/>
+          <w:lang w:val="es-MX"/>
+        </w:rPr>
+      </w:pPr>
+    </w:p>
+    <w:p>
+      <w:pPr>
+        <w:spacing w:before="100" w:beforeAutospacing="1" w:after="100" w:afterAutospacing="1" w:line="240" w:lineRule="auto"/>
+        <w:rPr>
+          <w:rFonts w:ascii="Arial" w:eastAsiaTheme="minorHAnsi" w:hAnsi="Arial" w:cs="Arial"/>
+          <w:sz w:val="20"/>
+          <w:szCs w:val="20"/>
+          <w:lang w:val="es-MX"/>
+        </w:rPr>
+      </w:pPr>
+      <w:r>
+        <w:rPr>
+          <w:rFonts w:ascii="Arial" w:eastAsiaTheme="minorHAnsi" w:hAnsi="Arial" w:cs="Arial"/>
+          <w:b/>
+          <w:bCs/>
+          <w:lang w:val="es-MX"/>
+        </w:rPr>
+        <w:t>HUJM-0</w:t>
+      </w:r>
+      <w:r>
+        <w:rPr>
+          <w:rFonts w:ascii="Arial" w:eastAsiaTheme="minorHAnsi" w:hAnsi="Arial" w:cs="Arial"/>
+          <w:b/>
+          <w:bCs/>
+          <w:lang w:val="es-MX"/>
+        </w:rPr>
+        <w:t>24</w:t>
+      </w:r>
+      <w:r>
+        <w:rPr>
+          <w:rFonts w:ascii="Arial" w:eastAsiaTheme="minorHAnsi" w:hAnsi="Arial" w:cs="Arial"/>
+          <w:b/>
+          <w:bCs/>
+          <w:lang w:val="es-MX"/>
+        </w:rPr>
+        <w:t xml:space="preserve"> - Establecer horario de check-in y del check-out</w:t>
+      </w:r>
+    </w:p>
+    <w:p>
+      <w:pPr>
+        <w:spacing w:before="100" w:beforeAutospacing="1" w:after="100" w:afterAutospacing="1" w:line="240" w:lineRule="auto"/>
+        <w:rPr>
+          <w:rFonts w:ascii="Arial" w:eastAsiaTheme="minorHAnsi" w:hAnsi="Arial" w:cs="Arial"/>
+          <w:sz w:val="20"/>
+          <w:szCs w:val="20"/>
+          <w:lang w:val="es-MX"/>
+        </w:rPr>
+      </w:pPr>
+      <w:r>
+        <w:rPr>
+          <w:rFonts w:ascii="Arial" w:eastAsiaTheme="minorHAnsi" w:hAnsi="Arial" w:cs="Arial"/>
+          <w:sz w:val="20"/>
+          <w:szCs w:val="20"/>
+          <w:lang w:val="es-MX"/>
+        </w:rPr>
+        <w:t>Cómo: Locación</w:t>
+      </w:r>
+    </w:p>
+    <w:p>
+      <w:pPr>
+        <w:spacing w:before="100" w:beforeAutospacing="1" w:after="100" w:afterAutospacing="1" w:line="240" w:lineRule="auto"/>
+        <w:rPr>
+          <w:rFonts w:ascii="Arial" w:eastAsiaTheme="minorHAnsi" w:hAnsi="Arial" w:cs="Arial"/>
+          <w:sz w:val="20"/>
+          <w:szCs w:val="20"/>
+          <w:lang w:val="es-MX"/>
+        </w:rPr>
+      </w:pPr>
+      <w:r>
+        <w:rPr>
+          <w:rFonts w:ascii="Arial" w:eastAsiaTheme="minorHAnsi" w:hAnsi="Arial" w:cs="Arial"/>
+          <w:sz w:val="20"/>
+          <w:szCs w:val="20"/>
+          <w:lang w:val="es-MX"/>
+        </w:rPr>
+        <w:t>Quiero: Definir un horario disponible para la llegada y salida de los huéspedes</w:t>
+      </w:r>
+    </w:p>
+    <w:p>
+      <w:pPr>
+        <w:spacing w:before="100" w:beforeAutospacing="1" w:after="100" w:afterAutospacing="1" w:line="240" w:lineRule="auto"/>
+        <w:rPr>
+          <w:rFonts w:ascii="Arial" w:eastAsiaTheme="minorHAnsi" w:hAnsi="Arial" w:cs="Arial"/>
+          <w:sz w:val="20"/>
+          <w:szCs w:val="20"/>
+          <w:lang w:val="es-MX"/>
+        </w:rPr>
+      </w:pPr>
+      <w:r>
+        <w:rPr>
+          <w:rFonts w:ascii="Arial" w:eastAsiaTheme="minorHAnsi" w:hAnsi="Arial" w:cs="Arial"/>
+          <w:sz w:val="20"/>
+          <w:szCs w:val="20"/>
+          <w:lang w:val="es-MX"/>
+        </w:rPr>
+        <w:lastRenderedPageBreak/>
+        <w:t>Para: Asegurar que las estancias se organicen de forma eficiente y sin conflictos</w:t>
       </w:r>
     </w:p>
     <w:p>

</xml_diff>

<commit_message>
add: Se agrego historia de usuario HUAG-026 dentro del documento Peaceathome.docx en la rama agrijalva-2024377
</commit_message>
<xml_diff>
--- a/Peaceathome.docx
+++ b/Peaceathome.docx
@@ -4202,6 +4202,127 @@
         </w:rPr>
         <w:t>para poder resolver problemas técnicos como errores de reserva, pagos fallidos o problemas con mi cuenta de forma eficiente.</w:t>
       </w:r>
+    </w:p>
+    <w:p>
+      <w:pPr>
+        <w:pStyle w:val="paragraph"/>
+        <w:spacing w:before="0" w:beforeAutospacing="0" w:after="0" w:afterAutospacing="0"/>
+        <w:textAlignment w:val="baseline"/>
+        <w:rPr>
+          <w:rFonts w:ascii="Segoe UI" w:hAnsi="Segoe UI" w:cs="Segoe UI"/>
+          <w:sz w:val="18"/>
+          <w:szCs w:val="18"/>
+        </w:rPr>
+      </w:pPr>
+    </w:p>
+    <w:p>
+      <w:pPr>
+        <w:pStyle w:val="paragraph"/>
+        <w:textAlignment w:val="baseline"/>
+        <w:rPr>
+          <w:rFonts w:ascii="Segoe UI" w:hAnsi="Segoe UI" w:cs="Segoe UI"/>
+          <w:b/>
+          <w:sz w:val="18"/>
+          <w:szCs w:val="18"/>
+        </w:rPr>
+      </w:pPr>
+      <w:r>
+        <w:rPr>
+          <w:rFonts w:ascii="Segoe UI" w:hAnsi="Segoe UI" w:cs="Segoe UI"/>
+          <w:b/>
+          <w:sz w:val="18"/>
+          <w:szCs w:val="18"/>
+        </w:rPr>
+        <w:t>HUAG-0</w:t>
+      </w:r>
+      <w:r>
+        <w:rPr>
+          <w:rFonts w:ascii="Segoe UI" w:hAnsi="Segoe UI" w:cs="Segoe UI"/>
+          <w:b/>
+          <w:sz w:val="18"/>
+          <w:szCs w:val="18"/>
+        </w:rPr>
+        <w:t>26</w:t>
+      </w:r>
+      <w:r>
+        <w:rPr>
+          <w:rFonts w:ascii="Segoe UI" w:hAnsi="Segoe UI" w:cs="Segoe UI"/>
+          <w:b/>
+          <w:sz w:val="18"/>
+          <w:szCs w:val="18"/>
+        </w:rPr>
+        <w:t>:</w:t>
+      </w:r>
+    </w:p>
+    <w:p>
+      <w:pPr>
+        <w:pStyle w:val="paragraph"/>
+        <w:textAlignment w:val="baseline"/>
+        <w:rPr>
+          <w:rFonts w:ascii="Segoe UI" w:hAnsi="Segoe UI" w:cs="Segoe UI"/>
+          <w:sz w:val="18"/>
+          <w:szCs w:val="18"/>
+        </w:rPr>
+      </w:pPr>
+      <w:r>
+        <w:rPr>
+          <w:rFonts w:ascii="Segoe UI" w:hAnsi="Segoe UI" w:cs="Segoe UI"/>
+          <w:sz w:val="18"/>
+          <w:szCs w:val="18"/>
+        </w:rPr>
+        <w:t>Como técnico de soporte,</w:t>
+      </w:r>
+    </w:p>
+    <w:p>
+      <w:pPr>
+        <w:pStyle w:val="paragraph"/>
+        <w:textAlignment w:val="baseline"/>
+        <w:rPr>
+          <w:rFonts w:ascii="Segoe UI" w:hAnsi="Segoe UI" w:cs="Segoe UI"/>
+          <w:sz w:val="18"/>
+          <w:szCs w:val="18"/>
+        </w:rPr>
+      </w:pPr>
+      <w:r>
+        <w:rPr>
+          <w:rFonts w:ascii="Segoe UI" w:hAnsi="Segoe UI" w:cs="Segoe UI"/>
+          <w:sz w:val="18"/>
+          <w:szCs w:val="18"/>
+        </w:rPr>
+        <w:t>quiero ver una lista de tickets pendientes y asignarme uno,</w:t>
+      </w:r>
+    </w:p>
+    <w:p>
+      <w:pPr>
+        <w:pStyle w:val="paragraph"/>
+        <w:spacing w:before="0" w:beforeAutospacing="0" w:after="0" w:afterAutospacing="0"/>
+        <w:textAlignment w:val="baseline"/>
+        <w:rPr>
+          <w:rFonts w:ascii="Segoe UI" w:hAnsi="Segoe UI" w:cs="Segoe UI"/>
+          <w:sz w:val="18"/>
+          <w:szCs w:val="18"/>
+        </w:rPr>
+      </w:pPr>
+      <w:r>
+        <w:rPr>
+          <w:rFonts w:ascii="Segoe UI" w:hAnsi="Segoe UI" w:cs="Segoe UI"/>
+          <w:sz w:val="18"/>
+          <w:szCs w:val="18"/>
+        </w:rPr>
+        <w:t>para poder empezar a resolverlo de forma organizada.</w:t>
+      </w:r>
+    </w:p>
+    <w:p>
+      <w:pPr>
+        <w:pStyle w:val="paragraph"/>
+        <w:spacing w:before="0" w:beforeAutospacing="0" w:after="0" w:afterAutospacing="0"/>
+        <w:textAlignment w:val="baseline"/>
+        <w:rPr>
+          <w:rFonts w:ascii="Segoe UI" w:hAnsi="Segoe UI" w:cs="Segoe UI"/>
+          <w:sz w:val="18"/>
+          <w:szCs w:val="18"/>
+        </w:rPr>
+      </w:pPr>
     </w:p>
     <w:p>
       <w:pPr>

</xml_diff>

<commit_message>
add: Se agrego historia de usuario HUAG-027 dentro del documento Peaceathome.docx en la rama agrijalva-2024377
</commit_message>
<xml_diff>
--- a/Peaceathome.docx
+++ b/Peaceathome.docx
@@ -4310,6 +4310,115 @@
           <w:szCs w:val="18"/>
         </w:rPr>
         <w:t>para poder empezar a resolverlo de forma organizada.</w:t>
+      </w:r>
+    </w:p>
+    <w:p>
+      <w:pPr>
+        <w:pStyle w:val="paragraph"/>
+        <w:spacing w:before="0" w:beforeAutospacing="0" w:after="0" w:afterAutospacing="0"/>
+        <w:textAlignment w:val="baseline"/>
+        <w:rPr>
+          <w:rFonts w:ascii="Segoe UI" w:hAnsi="Segoe UI" w:cs="Segoe UI"/>
+          <w:sz w:val="18"/>
+          <w:szCs w:val="18"/>
+        </w:rPr>
+      </w:pPr>
+    </w:p>
+    <w:p>
+      <w:pPr>
+        <w:pStyle w:val="paragraph"/>
+        <w:textAlignment w:val="baseline"/>
+        <w:rPr>
+          <w:rFonts w:ascii="Segoe UI" w:hAnsi="Segoe UI" w:cs="Segoe UI"/>
+          <w:b/>
+          <w:sz w:val="18"/>
+          <w:szCs w:val="18"/>
+        </w:rPr>
+      </w:pPr>
+      <w:r>
+        <w:rPr>
+          <w:rFonts w:ascii="Segoe UI" w:hAnsi="Segoe UI" w:cs="Segoe UI"/>
+          <w:b/>
+          <w:sz w:val="18"/>
+          <w:szCs w:val="18"/>
+        </w:rPr>
+        <w:t>HUAG-0</w:t>
+      </w:r>
+      <w:r>
+        <w:rPr>
+          <w:rFonts w:ascii="Segoe UI" w:hAnsi="Segoe UI" w:cs="Segoe UI"/>
+          <w:b/>
+          <w:sz w:val="18"/>
+          <w:szCs w:val="18"/>
+        </w:rPr>
+        <w:t>27</w:t>
+      </w:r>
+      <w:r>
+        <w:rPr>
+          <w:rFonts w:ascii="Segoe UI" w:hAnsi="Segoe UI" w:cs="Segoe UI"/>
+          <w:b/>
+          <w:sz w:val="18"/>
+          <w:szCs w:val="18"/>
+        </w:rPr>
+        <w:t>:</w:t>
+      </w:r>
+    </w:p>
+    <w:p>
+      <w:pPr>
+        <w:pStyle w:val="paragraph"/>
+        <w:textAlignment w:val="baseline"/>
+        <w:rPr>
+          <w:rFonts w:ascii="Segoe UI" w:hAnsi="Segoe UI" w:cs="Segoe UI"/>
+          <w:sz w:val="18"/>
+          <w:szCs w:val="18"/>
+        </w:rPr>
+      </w:pPr>
+      <w:r>
+        <w:rPr>
+          <w:rFonts w:ascii="Segoe UI" w:hAnsi="Segoe UI" w:cs="Segoe UI"/>
+          <w:sz w:val="18"/>
+          <w:szCs w:val="18"/>
+        </w:rPr>
+        <w:t>Como administrador de soporte,</w:t>
+      </w:r>
+    </w:p>
+    <w:p>
+      <w:pPr>
+        <w:pStyle w:val="paragraph"/>
+        <w:textAlignment w:val="baseline"/>
+        <w:rPr>
+          <w:rFonts w:ascii="Segoe UI" w:hAnsi="Segoe UI" w:cs="Segoe UI"/>
+          <w:sz w:val="18"/>
+          <w:szCs w:val="18"/>
+        </w:rPr>
+      </w:pPr>
+      <w:r>
+        <w:rPr>
+          <w:rFonts w:ascii="Segoe UI" w:hAnsi="Segoe UI" w:cs="Segoe UI"/>
+          <w:sz w:val="18"/>
+          <w:szCs w:val="18"/>
+        </w:rPr>
+        <w:t>quiero poder hacer seguimiento al estado de cada ticket (pendiente, en proceso, resuelto),</w:t>
+      </w:r>
+    </w:p>
+    <w:p>
+      <w:pPr>
+        <w:pStyle w:val="paragraph"/>
+        <w:spacing w:before="0" w:beforeAutospacing="0" w:after="0" w:afterAutospacing="0"/>
+        <w:textAlignment w:val="baseline"/>
+        <w:rPr>
+          <w:rFonts w:ascii="Segoe UI" w:hAnsi="Segoe UI" w:cs="Segoe UI"/>
+          <w:sz w:val="18"/>
+          <w:szCs w:val="18"/>
+        </w:rPr>
+      </w:pPr>
+      <w:r>
+        <w:rPr>
+          <w:rFonts w:ascii="Segoe UI" w:hAnsi="Segoe UI" w:cs="Segoe UI"/>
+          <w:sz w:val="18"/>
+          <w:szCs w:val="18"/>
+        </w:rPr>
+        <w:t>para asegurarme de que los problemas se están resolviendo eficientemente.</w:t>
       </w:r>
     </w:p>
     <w:p>

</xml_diff>

<commit_message>
add: Se agrego historia de usuario HUFP-029 dentro del documento Peaceathome.docx en la rama fpaiz-2024264
</commit_message>
<xml_diff>
--- a/Peaceathome.docx
+++ b/Peaceathome.docx
@@ -745,17 +745,8 @@
                 <w:rFonts w:ascii="Arial" w:eastAsiaTheme="minorHAnsi" w:hAnsi="Arial" w:cs="Arial"/>
                 <w:sz w:val="24"/>
               </w:rPr>
-              <w:t xml:space="preserve">Scrum </w:t>
+              <w:t>Scrum Master</w:t>
             </w:r>
-            <w:proofErr w:type="gramStart"/>
-            <w:r>
-              <w:rPr>
-                <w:rFonts w:ascii="Arial" w:eastAsiaTheme="minorHAnsi" w:hAnsi="Arial" w:cs="Arial"/>
-                <w:sz w:val="24"/>
-              </w:rPr>
-              <w:t>Master</w:t>
-            </w:r>
-            <w:proofErr w:type="gramEnd"/>
           </w:p>
         </w:tc>
       </w:tr>
@@ -2009,7 +2000,6 @@
         </w:rPr>
       </w:pPr>
       <w:proofErr w:type="spellStart"/>
-      <w:proofErr w:type="gramStart"/>
       <w:r>
         <w:rPr>
           <w:b/>
@@ -2017,7 +2007,6 @@
         <w:t>TUPLA:Servicios</w:t>
       </w:r>
       <w:proofErr w:type="spellEnd"/>
-      <w:proofErr w:type="gramEnd"/>
     </w:p>
     <w:p>
       <w:pPr>
@@ -3857,9 +3846,8 @@
           <w:szCs w:val="20"/>
           <w:lang w:val="es-MX"/>
         </w:rPr>
-        <w:t xml:space="preserve">edades registradas al nombre de </w:t>
-      </w:r>
-      <w:proofErr w:type="gramStart"/>
+        <w:t xml:space="preserve">edades registradas al nombre de algún </w:t>
+      </w:r>
       <w:r>
         <w:rPr>
           <w:rFonts w:ascii="Arial" w:eastAsiaTheme="minorHAnsi" w:hAnsi="Arial" w:cs="Arial"/>
@@ -3867,36 +3855,55 @@
           <w:szCs w:val="20"/>
           <w:lang w:val="es-MX"/>
         </w:rPr>
-        <w:t xml:space="preserve">algún </w:t>
-      </w:r>
-      <w:r>
+        <w:t xml:space="preserve"> usuario</w:t>
+      </w:r>
+    </w:p>
+    <w:p>
+      <w:pPr>
         <w:rPr>
           <w:rFonts w:ascii="Arial" w:eastAsiaTheme="minorHAnsi" w:hAnsi="Arial" w:cs="Arial"/>
           <w:sz w:val="20"/>
           <w:szCs w:val="20"/>
           <w:lang w:val="es-MX"/>
         </w:rPr>
-        <w:t xml:space="preserve"> usuario</w:t>
-      </w:r>
-      <w:proofErr w:type="gramEnd"/>
-    </w:p>
-    <w:p>
-      <w:pPr>
+      </w:pPr>
+      <w:r>
         <w:rPr>
           <w:rFonts w:ascii="Arial" w:eastAsiaTheme="minorHAnsi" w:hAnsi="Arial" w:cs="Arial"/>
           <w:sz w:val="20"/>
           <w:szCs w:val="20"/>
           <w:lang w:val="es-MX"/>
         </w:rPr>
-      </w:pPr>
-      <w:r>
+        <w:t>Para: Poder llevar un registro de sus facturas y remodelaciones</w:t>
+      </w:r>
+    </w:p>
+    <w:p>
+      <w:pPr>
         <w:rPr>
           <w:rFonts w:ascii="Arial" w:eastAsiaTheme="minorHAnsi" w:hAnsi="Arial" w:cs="Arial"/>
           <w:sz w:val="20"/>
           <w:szCs w:val="20"/>
           <w:lang w:val="es-MX"/>
         </w:rPr>
-        <w:t>Para: Poder llevar un registro de sus facturas y remodelaciones</w:t>
+      </w:pPr>
+    </w:p>
+    <w:p>
+      <w:pPr>
+        <w:rPr>
+          <w:rFonts w:ascii="Arial" w:eastAsiaTheme="minorHAnsi" w:hAnsi="Arial" w:cs="Arial"/>
+          <w:b/>
+          <w:bCs/>
+          <w:lang w:val="es-MX"/>
+        </w:rPr>
+      </w:pPr>
+      <w:r>
+        <w:rPr>
+          <w:rFonts w:ascii="Arial" w:eastAsiaTheme="minorHAnsi" w:hAnsi="Arial" w:cs="Arial"/>
+          <w:b/>
+          <w:bCs/>
+          <w:lang w:val="es-MX"/>
+        </w:rPr>
+        <w:t>HUCL-020: Registro de Nueva Propiedad</w:t>
       </w:r>
     </w:p>
     <w:p>
@@ -3908,54 +3915,35 @@
           <w:lang w:val="es-MX"/>
         </w:rPr>
       </w:pPr>
-    </w:p>
-    <w:p>
-      <w:pPr>
-        <w:rPr>
-          <w:rFonts w:ascii="Arial" w:eastAsiaTheme="minorHAnsi" w:hAnsi="Arial" w:cs="Arial"/>
-          <w:b/>
-          <w:bCs/>
-          <w:lang w:val="es-MX"/>
-        </w:rPr>
-      </w:pPr>
-      <w:r>
-        <w:rPr>
-          <w:rFonts w:ascii="Arial" w:eastAsiaTheme="minorHAnsi" w:hAnsi="Arial" w:cs="Arial"/>
-          <w:b/>
-          <w:bCs/>
-          <w:lang w:val="es-MX"/>
-        </w:rPr>
-        <w:t>HUCL-020: Registro de Nueva Propiedad</w:t>
-      </w:r>
-    </w:p>
-    <w:p>
-      <w:pPr>
+      <w:r>
         <w:rPr>
           <w:rFonts w:ascii="Arial" w:eastAsiaTheme="minorHAnsi" w:hAnsi="Arial" w:cs="Arial"/>
           <w:sz w:val="20"/>
           <w:szCs w:val="20"/>
           <w:lang w:val="es-MX"/>
         </w:rPr>
-      </w:pPr>
-      <w:r>
+        <w:t>Como: Arrendador</w:t>
+      </w:r>
+    </w:p>
+    <w:p>
+      <w:pPr>
         <w:rPr>
           <w:rFonts w:ascii="Arial" w:eastAsiaTheme="minorHAnsi" w:hAnsi="Arial" w:cs="Arial"/>
           <w:sz w:val="20"/>
           <w:szCs w:val="20"/>
           <w:lang w:val="es-MX"/>
         </w:rPr>
-        <w:t>Como: Arrendador</w:t>
-      </w:r>
-    </w:p>
-    <w:p>
-      <w:pPr>
+      </w:pPr>
+      <w:r>
         <w:rPr>
           <w:rFonts w:ascii="Arial" w:eastAsiaTheme="minorHAnsi" w:hAnsi="Arial" w:cs="Arial"/>
           <w:sz w:val="20"/>
           <w:szCs w:val="20"/>
           <w:lang w:val="es-MX"/>
         </w:rPr>
-      </w:pPr>
+        <w:t xml:space="preserve">Quiero: Registrar una nueva propiedad en </w:t>
+      </w:r>
+      <w:proofErr w:type="spellStart"/>
       <w:r>
         <w:rPr>
           <w:rFonts w:ascii="Arial" w:eastAsiaTheme="minorHAnsi" w:hAnsi="Arial" w:cs="Arial"/>
@@ -3963,9 +3951,9 @@
           <w:szCs w:val="20"/>
           <w:lang w:val="es-MX"/>
         </w:rPr>
-        <w:t xml:space="preserve">Quiero: Registrar una nueva propiedad en </w:t>
-      </w:r>
-      <w:proofErr w:type="spellStart"/>
+        <w:t>Peace</w:t>
+      </w:r>
+      <w:proofErr w:type="spellEnd"/>
       <w:r>
         <w:rPr>
           <w:rFonts w:ascii="Arial" w:eastAsiaTheme="minorHAnsi" w:hAnsi="Arial" w:cs="Arial"/>
@@ -3973,37 +3961,37 @@
           <w:szCs w:val="20"/>
           <w:lang w:val="es-MX"/>
         </w:rPr>
-        <w:t>Peace</w:t>
-      </w:r>
-      <w:proofErr w:type="spellEnd"/>
-      <w:r>
+        <w:t xml:space="preserve"> at Home</w:t>
+      </w:r>
+    </w:p>
+    <w:p>
+      <w:pPr>
         <w:rPr>
           <w:rFonts w:ascii="Arial" w:eastAsiaTheme="minorHAnsi" w:hAnsi="Arial" w:cs="Arial"/>
           <w:sz w:val="20"/>
           <w:szCs w:val="20"/>
           <w:lang w:val="es-MX"/>
         </w:rPr>
-        <w:t xml:space="preserve"> at Home</w:t>
-      </w:r>
-    </w:p>
-    <w:p>
-      <w:pPr>
+      </w:pPr>
+      <w:r>
         <w:rPr>
           <w:rFonts w:ascii="Arial" w:eastAsiaTheme="minorHAnsi" w:hAnsi="Arial" w:cs="Arial"/>
           <w:sz w:val="20"/>
           <w:szCs w:val="20"/>
           <w:lang w:val="es-MX"/>
         </w:rPr>
-      </w:pPr>
-      <w:r>
+        <w:t>Para: Brindar una experiencia cómoda y agradable a los huéspedes que renten la propiedad</w:t>
+      </w:r>
+    </w:p>
+    <w:p>
+      <w:pPr>
         <w:rPr>
           <w:rFonts w:ascii="Arial" w:eastAsiaTheme="minorHAnsi" w:hAnsi="Arial" w:cs="Arial"/>
           <w:sz w:val="20"/>
           <w:szCs w:val="20"/>
           <w:lang w:val="es-MX"/>
         </w:rPr>
-        <w:t>Para: Brindar una experiencia cómoda y agradable a los huéspedes que renten la propiedad</w:t>
-      </w:r>
+      </w:pPr>
     </w:p>
     <w:p>
       <w:pPr>
@@ -4014,24 +4002,23 @@
           <w:lang w:val="es-MX"/>
         </w:rPr>
       </w:pPr>
-    </w:p>
-    <w:p>
-      <w:pPr>
+      <w:r>
+        <w:rPr>
+          <w:rFonts w:ascii="Arial" w:eastAsiaTheme="minorHAnsi" w:hAnsi="Arial" w:cs="Arial"/>
+          <w:b/>
+          <w:bCs/>
+          <w:lang w:val="es-MX"/>
+        </w:rPr>
+        <w:t>HUCL-021:</w:t>
+      </w:r>
+      <w:r>
         <w:rPr>
           <w:rFonts w:ascii="Arial" w:eastAsiaTheme="minorHAnsi" w:hAnsi="Arial" w:cs="Arial"/>
           <w:sz w:val="20"/>
           <w:szCs w:val="20"/>
           <w:lang w:val="es-MX"/>
         </w:rPr>
-      </w:pPr>
-      <w:r>
-        <w:rPr>
-          <w:rFonts w:ascii="Arial" w:eastAsiaTheme="minorHAnsi" w:hAnsi="Arial" w:cs="Arial"/>
-          <w:b/>
-          <w:bCs/>
-          <w:lang w:val="es-MX"/>
-        </w:rPr>
-        <w:t>HUCL-021:</w:t>
+        <w:t xml:space="preserve"> </w:t>
       </w:r>
       <w:r>
         <w:rPr>
@@ -4045,204 +4032,243 @@
       <w:r>
         <w:rPr>
           <w:rFonts w:ascii="Arial" w:eastAsiaTheme="minorHAnsi" w:hAnsi="Arial" w:cs="Arial"/>
+          <w:b/>
+          <w:bCs/>
+          <w:lang w:val="es-MX"/>
+        </w:rPr>
+        <w:t>descripción de propiedades</w:t>
+      </w:r>
+    </w:p>
+    <w:p>
+      <w:pPr>
+        <w:rPr>
+          <w:rFonts w:ascii="Arial" w:eastAsiaTheme="minorHAnsi" w:hAnsi="Arial" w:cs="Arial"/>
           <w:sz w:val="20"/>
           <w:szCs w:val="20"/>
           <w:lang w:val="es-MX"/>
         </w:rPr>
-        <w:t xml:space="preserve"> </w:t>
-      </w:r>
-      <w:r>
-        <w:rPr>
-          <w:rFonts w:ascii="Arial" w:eastAsiaTheme="minorHAnsi" w:hAnsi="Arial" w:cs="Arial"/>
-          <w:b/>
-          <w:bCs/>
-          <w:lang w:val="es-MX"/>
-        </w:rPr>
-        <w:t>descripción de propiedades</w:t>
-      </w:r>
-    </w:p>
-    <w:p>
-      <w:pPr>
+      </w:pPr>
+      <w:r>
         <w:rPr>
           <w:rFonts w:ascii="Arial" w:eastAsiaTheme="minorHAnsi" w:hAnsi="Arial" w:cs="Arial"/>
           <w:sz w:val="20"/>
           <w:szCs w:val="20"/>
           <w:lang w:val="es-MX"/>
         </w:rPr>
-      </w:pPr>
-      <w:r>
+        <w:t>Como: Administrador</w:t>
+      </w:r>
+    </w:p>
+    <w:p>
+      <w:pPr>
         <w:rPr>
           <w:rFonts w:ascii="Arial" w:eastAsiaTheme="minorHAnsi" w:hAnsi="Arial" w:cs="Arial"/>
           <w:sz w:val="20"/>
           <w:szCs w:val="20"/>
           <w:lang w:val="es-MX"/>
         </w:rPr>
-        <w:t>Como: Administrador</w:t>
-      </w:r>
-    </w:p>
-    <w:p>
-      <w:pPr>
+      </w:pPr>
+      <w:r>
         <w:rPr>
           <w:rFonts w:ascii="Arial" w:eastAsiaTheme="minorHAnsi" w:hAnsi="Arial" w:cs="Arial"/>
           <w:sz w:val="20"/>
           <w:szCs w:val="20"/>
           <w:lang w:val="es-MX"/>
         </w:rPr>
-      </w:pPr>
-      <w:r>
+        <w:t>Quiero: Poder editar los estados y descripciones de las propiedades que se encuentren en remodelaciones o con atracciones nuevas</w:t>
+      </w:r>
+    </w:p>
+    <w:p>
+      <w:pPr>
         <w:rPr>
           <w:rFonts w:ascii="Arial" w:eastAsiaTheme="minorHAnsi" w:hAnsi="Arial" w:cs="Arial"/>
           <w:sz w:val="20"/>
           <w:szCs w:val="20"/>
           <w:lang w:val="es-MX"/>
         </w:rPr>
-        <w:t>Quiero: Poder editar los estados y descripciones de las propiedades que se encuentren en remodelaciones o con atracciones nuevas</w:t>
-      </w:r>
-    </w:p>
-    <w:p>
-      <w:pPr>
+      </w:pPr>
+      <w:r>
         <w:rPr>
           <w:rFonts w:ascii="Arial" w:eastAsiaTheme="minorHAnsi" w:hAnsi="Arial" w:cs="Arial"/>
           <w:sz w:val="20"/>
           <w:szCs w:val="20"/>
           <w:lang w:val="es-MX"/>
         </w:rPr>
-      </w:pPr>
-      <w:r>
+        <w:t>Para: Que los nuevos usuarios sepan de las nuevas características que poseen las propiedades</w:t>
+      </w:r>
+    </w:p>
+    <w:p>
+      <w:pPr>
+        <w:spacing w:before="100" w:beforeAutospacing="1" w:after="100" w:afterAutospacing="1" w:line="240" w:lineRule="auto"/>
+        <w:rPr>
+          <w:rFonts w:ascii="Arial" w:eastAsia="Times New Roman" w:hAnsi="Arial" w:cs="Arial"/>
+          <w:sz w:val="24"/>
+          <w:szCs w:val="24"/>
+          <w:lang w:eastAsia="es-GT"/>
+        </w:rPr>
+      </w:pPr>
+    </w:p>
+    <w:p>
+      <w:pPr>
+        <w:rPr>
+          <w:rFonts w:ascii="Arial" w:eastAsiaTheme="minorHAnsi" w:hAnsi="Arial" w:cs="Arial"/>
+          <w:b/>
+          <w:bCs/>
+          <w:lang w:val="es-MX"/>
+        </w:rPr>
+      </w:pPr>
+      <w:r>
+        <w:rPr>
+          <w:rFonts w:ascii="Arial" w:eastAsiaTheme="minorHAnsi" w:hAnsi="Arial" w:cs="Arial"/>
+          <w:b/>
+          <w:bCs/>
+          <w:lang w:val="es-MX"/>
+        </w:rPr>
+        <w:t>Tupla: Locación</w:t>
+      </w:r>
+    </w:p>
+    <w:p>
+      <w:pPr>
+        <w:rPr>
+          <w:rFonts w:ascii="Arial" w:eastAsiaTheme="minorHAnsi" w:hAnsi="Arial" w:cs="Arial"/>
+          <w:b/>
+          <w:bCs/>
+          <w:lang w:val="es-MX"/>
+        </w:rPr>
+      </w:pPr>
+      <w:r>
+        <w:rPr>
+          <w:rFonts w:ascii="Arial" w:eastAsiaTheme="minorHAnsi" w:hAnsi="Arial" w:cs="Arial"/>
+          <w:b/>
+          <w:bCs/>
+          <w:lang w:val="es-MX"/>
+        </w:rPr>
+        <w:t>HUAP-02</w:t>
+      </w:r>
+      <w:r>
+        <w:rPr>
+          <w:rFonts w:ascii="Arial" w:eastAsiaTheme="minorHAnsi" w:hAnsi="Arial" w:cs="Arial"/>
+          <w:b/>
+          <w:bCs/>
+          <w:lang w:val="es-MX"/>
+        </w:rPr>
+        <w:t>2</w:t>
+      </w:r>
+      <w:r>
+        <w:rPr>
+          <w:rFonts w:ascii="Arial" w:eastAsiaTheme="minorHAnsi" w:hAnsi="Arial" w:cs="Arial"/>
+          <w:b/>
+          <w:bCs/>
+          <w:lang w:val="es-MX"/>
+        </w:rPr>
+        <w:t xml:space="preserve"> - Actualizar información de la locación</w:t>
+      </w:r>
+    </w:p>
+    <w:p>
+      <w:pPr>
+        <w:spacing w:before="100" w:beforeAutospacing="1" w:after="100" w:afterAutospacing="1" w:line="240" w:lineRule="auto"/>
         <w:rPr>
           <w:rFonts w:ascii="Arial" w:eastAsiaTheme="minorHAnsi" w:hAnsi="Arial" w:cs="Arial"/>
           <w:sz w:val="20"/>
           <w:szCs w:val="20"/>
           <w:lang w:val="es-MX"/>
         </w:rPr>
-        <w:t>Para: Que los nuevos usuarios sepan de las nuevas características que poseen las propiedades</w:t>
-      </w:r>
-    </w:p>
-    <w:p>
-      <w:pPr>
-        <w:spacing w:before="100" w:beforeAutospacing="1" w:after="100" w:afterAutospacing="1" w:line="240" w:lineRule="auto"/>
-        <w:rPr>
-          <w:rFonts w:ascii="Arial" w:eastAsia="Times New Roman" w:hAnsi="Arial" w:cs="Arial"/>
-          <w:sz w:val="24"/>
-          <w:szCs w:val="24"/>
-          <w:lang w:eastAsia="es-GT"/>
-        </w:rPr>
-      </w:pPr>
-    </w:p>
-    <w:p>
-      <w:pPr>
-        <w:rPr>
-          <w:rFonts w:ascii="Arial" w:eastAsiaTheme="minorHAnsi" w:hAnsi="Arial" w:cs="Arial"/>
-          <w:b/>
-          <w:bCs/>
-          <w:lang w:val="es-MX"/>
-        </w:rPr>
-      </w:pPr>
-      <w:r>
-        <w:rPr>
-          <w:rFonts w:ascii="Arial" w:eastAsiaTheme="minorHAnsi" w:hAnsi="Arial" w:cs="Arial"/>
-          <w:b/>
-          <w:bCs/>
-          <w:lang w:val="es-MX"/>
-        </w:rPr>
-        <w:t>Tupla: Locación</w:t>
-      </w:r>
-    </w:p>
-    <w:p>
-      <w:pPr>
-        <w:rPr>
-          <w:rFonts w:ascii="Arial" w:eastAsiaTheme="minorHAnsi" w:hAnsi="Arial" w:cs="Arial"/>
-          <w:b/>
-          <w:bCs/>
-          <w:lang w:val="es-MX"/>
-        </w:rPr>
-      </w:pPr>
-      <w:r>
-        <w:rPr>
-          <w:rFonts w:ascii="Arial" w:eastAsiaTheme="minorHAnsi" w:hAnsi="Arial" w:cs="Arial"/>
-          <w:b/>
-          <w:bCs/>
-          <w:lang w:val="es-MX"/>
-        </w:rPr>
-        <w:t>HUAP-02</w:t>
-      </w:r>
-      <w:r>
-        <w:rPr>
-          <w:rFonts w:ascii="Arial" w:eastAsiaTheme="minorHAnsi" w:hAnsi="Arial" w:cs="Arial"/>
-          <w:b/>
-          <w:bCs/>
-          <w:lang w:val="es-MX"/>
-        </w:rPr>
-        <w:t>2</w:t>
-      </w:r>
-      <w:r>
-        <w:rPr>
-          <w:rFonts w:ascii="Arial" w:eastAsiaTheme="minorHAnsi" w:hAnsi="Arial" w:cs="Arial"/>
-          <w:b/>
-          <w:bCs/>
-          <w:lang w:val="es-MX"/>
-        </w:rPr>
-        <w:t xml:space="preserve"> - Actualizar información de la locación</w:t>
-      </w:r>
-    </w:p>
-    <w:p>
-      <w:pPr>
-        <w:spacing w:before="100" w:beforeAutospacing="1" w:after="100" w:afterAutospacing="1" w:line="240" w:lineRule="auto"/>
+      </w:pPr>
+      <w:r>
         <w:rPr>
           <w:rFonts w:ascii="Arial" w:eastAsiaTheme="minorHAnsi" w:hAnsi="Arial" w:cs="Arial"/>
           <w:sz w:val="20"/>
           <w:szCs w:val="20"/>
           <w:lang w:val="es-MX"/>
         </w:rPr>
-      </w:pPr>
-      <w:r>
+        <w:t>Cómo: Locación</w:t>
+      </w:r>
+    </w:p>
+    <w:p>
+      <w:pPr>
+        <w:spacing w:before="100" w:beforeAutospacing="1" w:after="100" w:afterAutospacing="1" w:line="240" w:lineRule="auto"/>
         <w:rPr>
           <w:rFonts w:ascii="Arial" w:eastAsiaTheme="minorHAnsi" w:hAnsi="Arial" w:cs="Arial"/>
           <w:sz w:val="20"/>
           <w:szCs w:val="20"/>
           <w:lang w:val="es-MX"/>
         </w:rPr>
-        <w:t>Cómo: Locación</w:t>
-      </w:r>
-    </w:p>
-    <w:p>
-      <w:pPr>
-        <w:spacing w:before="100" w:beforeAutospacing="1" w:after="100" w:afterAutospacing="1" w:line="240" w:lineRule="auto"/>
+      </w:pPr>
+      <w:r>
         <w:rPr>
           <w:rFonts w:ascii="Arial" w:eastAsiaTheme="minorHAnsi" w:hAnsi="Arial" w:cs="Arial"/>
           <w:sz w:val="20"/>
           <w:szCs w:val="20"/>
           <w:lang w:val="es-MX"/>
         </w:rPr>
-      </w:pPr>
-      <w:r>
+        <w:t>Quiero: Editar mis datos como dirección, descripción, y contacto</w:t>
+      </w:r>
+    </w:p>
+    <w:p>
+      <w:pPr>
+        <w:spacing w:before="100" w:beforeAutospacing="1" w:after="100" w:afterAutospacing="1" w:line="240" w:lineRule="auto"/>
         <w:rPr>
           <w:rFonts w:ascii="Arial" w:eastAsiaTheme="minorHAnsi" w:hAnsi="Arial" w:cs="Arial"/>
           <w:sz w:val="20"/>
           <w:szCs w:val="20"/>
           <w:lang w:val="es-MX"/>
         </w:rPr>
-        <w:t>Quiero: Editar mis datos como dirección, descripción, y contacto</w:t>
-      </w:r>
-    </w:p>
-    <w:p>
-      <w:pPr>
-        <w:spacing w:before="100" w:beforeAutospacing="1" w:after="100" w:afterAutospacing="1" w:line="240" w:lineRule="auto"/>
+      </w:pPr>
+      <w:r>
         <w:rPr>
           <w:rFonts w:ascii="Arial" w:eastAsiaTheme="minorHAnsi" w:hAnsi="Arial" w:cs="Arial"/>
           <w:sz w:val="20"/>
           <w:szCs w:val="20"/>
           <w:lang w:val="es-MX"/>
         </w:rPr>
-      </w:pPr>
-      <w:r>
+        <w:t>Para: Mantener mi información actualizada y brindar datos correctos a los huéspedes</w:t>
+      </w:r>
+    </w:p>
+    <w:p>
+      <w:pPr>
+        <w:spacing w:before="100" w:beforeAutospacing="1" w:after="100" w:afterAutospacing="1" w:line="240" w:lineRule="auto"/>
         <w:rPr>
           <w:rFonts w:ascii="Arial" w:eastAsiaTheme="minorHAnsi" w:hAnsi="Arial" w:cs="Arial"/>
           <w:sz w:val="20"/>
           <w:szCs w:val="20"/>
           <w:lang w:val="es-MX"/>
         </w:rPr>
-        <w:t>Para: Mantener mi información actualizada y brindar datos correctos a los huéspedes</w:t>
+      </w:pPr>
+    </w:p>
+    <w:p>
+      <w:pPr>
+        <w:rPr>
+          <w:rFonts w:ascii="Arial" w:eastAsiaTheme="minorHAnsi" w:hAnsi="Arial" w:cs="Arial"/>
+          <w:b/>
+          <w:bCs/>
+          <w:lang w:val="es-MX"/>
+        </w:rPr>
+      </w:pPr>
+      <w:r>
+        <w:rPr>
+          <w:rFonts w:ascii="Arial" w:eastAsiaTheme="minorHAnsi" w:hAnsi="Arial" w:cs="Arial"/>
+          <w:b/>
+          <w:bCs/>
+          <w:lang w:val="es-MX"/>
+        </w:rPr>
+        <w:t>HUAP-02</w:t>
+      </w:r>
+      <w:r>
+        <w:rPr>
+          <w:rFonts w:ascii="Arial" w:eastAsiaTheme="minorHAnsi" w:hAnsi="Arial" w:cs="Arial"/>
+          <w:b/>
+          <w:bCs/>
+          <w:lang w:val="es-MX"/>
+        </w:rPr>
+        <w:t>3</w:t>
+      </w:r>
+      <w:r>
+        <w:rPr>
+          <w:rFonts w:ascii="Arial" w:eastAsiaTheme="minorHAnsi" w:hAnsi="Arial" w:cs="Arial"/>
+          <w:b/>
+          <w:bCs/>
+          <w:lang w:val="es-MX"/>
+        </w:rPr>
+        <w:t xml:space="preserve"> - Ver historial de reservas</w:t>
       </w:r>
     </w:p>
     <w:p>
@@ -4255,103 +4281,66 @@
           <w:lang w:val="es-MX"/>
         </w:rPr>
       </w:pPr>
-    </w:p>
-    <w:p>
-      <w:pPr>
-        <w:rPr>
-          <w:rFonts w:ascii="Arial" w:eastAsiaTheme="minorHAnsi" w:hAnsi="Arial" w:cs="Arial"/>
-          <w:b/>
-          <w:bCs/>
-          <w:lang w:val="es-MX"/>
-        </w:rPr>
-      </w:pPr>
-      <w:r>
-        <w:rPr>
-          <w:rFonts w:ascii="Arial" w:eastAsiaTheme="minorHAnsi" w:hAnsi="Arial" w:cs="Arial"/>
-          <w:b/>
-          <w:bCs/>
-          <w:lang w:val="es-MX"/>
-        </w:rPr>
-        <w:t>HUAP-02</w:t>
-      </w:r>
-      <w:r>
-        <w:rPr>
-          <w:rFonts w:ascii="Arial" w:eastAsiaTheme="minorHAnsi" w:hAnsi="Arial" w:cs="Arial"/>
-          <w:b/>
-          <w:bCs/>
-          <w:lang w:val="es-MX"/>
-        </w:rPr>
-        <w:t>3</w:t>
-      </w:r>
-      <w:r>
-        <w:rPr>
-          <w:rFonts w:ascii="Arial" w:eastAsiaTheme="minorHAnsi" w:hAnsi="Arial" w:cs="Arial"/>
-          <w:b/>
-          <w:bCs/>
-          <w:lang w:val="es-MX"/>
-        </w:rPr>
-        <w:t xml:space="preserve"> - Ver historial de reservas</w:t>
-      </w:r>
-    </w:p>
-    <w:p>
-      <w:pPr>
-        <w:spacing w:before="100" w:beforeAutospacing="1" w:after="100" w:afterAutospacing="1" w:line="240" w:lineRule="auto"/>
+      <w:r>
         <w:rPr>
           <w:rFonts w:ascii="Arial" w:eastAsiaTheme="minorHAnsi" w:hAnsi="Arial" w:cs="Arial"/>
           <w:sz w:val="20"/>
           <w:szCs w:val="20"/>
           <w:lang w:val="es-MX"/>
         </w:rPr>
-      </w:pPr>
-      <w:r>
+        <w:t>Cómo: Locación</w:t>
+      </w:r>
+    </w:p>
+    <w:p>
+      <w:pPr>
+        <w:spacing w:before="100" w:beforeAutospacing="1" w:after="100" w:afterAutospacing="1" w:line="240" w:lineRule="auto"/>
         <w:rPr>
           <w:rFonts w:ascii="Arial" w:eastAsiaTheme="minorHAnsi" w:hAnsi="Arial" w:cs="Arial"/>
           <w:sz w:val="20"/>
           <w:szCs w:val="20"/>
           <w:lang w:val="es-MX"/>
         </w:rPr>
-        <w:t>Cómo: Locación</w:t>
-      </w:r>
-    </w:p>
-    <w:p>
-      <w:pPr>
-        <w:spacing w:before="100" w:beforeAutospacing="1" w:after="100" w:afterAutospacing="1" w:line="240" w:lineRule="auto"/>
+      </w:pPr>
+      <w:r>
         <w:rPr>
           <w:rFonts w:ascii="Arial" w:eastAsiaTheme="minorHAnsi" w:hAnsi="Arial" w:cs="Arial"/>
           <w:sz w:val="20"/>
           <w:szCs w:val="20"/>
           <w:lang w:val="es-MX"/>
         </w:rPr>
-      </w:pPr>
-      <w:r>
+        <w:t>Quiero: Consultar las reservas que se han realizado en mi espacio</w:t>
+      </w:r>
+    </w:p>
+    <w:p>
+      <w:pPr>
+        <w:spacing w:before="100" w:beforeAutospacing="1" w:after="100" w:afterAutospacing="1" w:line="240" w:lineRule="auto"/>
         <w:rPr>
           <w:rFonts w:ascii="Arial" w:eastAsiaTheme="minorHAnsi" w:hAnsi="Arial" w:cs="Arial"/>
           <w:sz w:val="20"/>
           <w:szCs w:val="20"/>
           <w:lang w:val="es-MX"/>
         </w:rPr>
-        <w:t>Quiero: Consultar las reservas que se han realizado en mi espacio</w:t>
-      </w:r>
-    </w:p>
-    <w:p>
-      <w:pPr>
-        <w:spacing w:before="100" w:beforeAutospacing="1" w:after="100" w:afterAutospacing="1" w:line="240" w:lineRule="auto"/>
+      </w:pPr>
+      <w:r>
         <w:rPr>
           <w:rFonts w:ascii="Arial" w:eastAsiaTheme="minorHAnsi" w:hAnsi="Arial" w:cs="Arial"/>
           <w:sz w:val="20"/>
           <w:szCs w:val="20"/>
           <w:lang w:val="es-MX"/>
         </w:rPr>
-      </w:pPr>
-      <w:r>
+        <w:t>Para: Llevar un control de los huéspedes que me han visitado</w:t>
+      </w:r>
+    </w:p>
+    <w:p>
+      <w:pPr>
+        <w:spacing w:before="100" w:beforeAutospacing="1" w:after="100" w:afterAutospacing="1" w:line="240" w:lineRule="auto"/>
         <w:rPr>
           <w:rFonts w:ascii="Arial" w:eastAsiaTheme="minorHAnsi" w:hAnsi="Arial" w:cs="Arial"/>
           <w:sz w:val="20"/>
           <w:szCs w:val="20"/>
           <w:lang w:val="es-MX"/>
         </w:rPr>
-        <w:t>Para: Llevar un control de los huéspedes que me han visitado</w:t>
-      </w:r>
+      </w:pPr>
     </w:p>
     <w:p>
       <w:pPr>
@@ -4363,17 +4352,6 @@
           <w:lang w:val="es-MX"/>
         </w:rPr>
       </w:pPr>
-    </w:p>
-    <w:p>
-      <w:pPr>
-        <w:spacing w:before="100" w:beforeAutospacing="1" w:after="100" w:afterAutospacing="1" w:line="240" w:lineRule="auto"/>
-        <w:rPr>
-          <w:rFonts w:ascii="Arial" w:eastAsiaTheme="minorHAnsi" w:hAnsi="Arial" w:cs="Arial"/>
-          <w:sz w:val="20"/>
-          <w:szCs w:val="20"/>
-          <w:lang w:val="es-MX"/>
-        </w:rPr>
-      </w:pPr>
       <w:r>
         <w:rPr>
           <w:rFonts w:ascii="Arial" w:eastAsiaTheme="minorHAnsi" w:hAnsi="Arial" w:cs="Arial"/>
@@ -4399,9 +4377,9 @@
           <w:bCs/>
           <w:lang w:val="es-MX"/>
         </w:rPr>
-        <w:t xml:space="preserve"> - Establecer horario </w:t>
-      </w:r>
-      <w:proofErr w:type="gramStart"/>
+        <w:t xml:space="preserve"> - Establecer horario de </w:t>
+      </w:r>
+      <w:proofErr w:type="spellStart"/>
       <w:r>
         <w:rPr>
           <w:rFonts w:ascii="Arial" w:eastAsiaTheme="minorHAnsi" w:hAnsi="Arial" w:cs="Arial"/>
@@ -4409,9 +4387,9 @@
           <w:bCs/>
           <w:lang w:val="es-MX"/>
         </w:rPr>
-        <w:t xml:space="preserve">de </w:t>
-      </w:r>
-      <w:proofErr w:type="spellStart"/>
+        <w:t>check</w:t>
+      </w:r>
+      <w:proofErr w:type="spellEnd"/>
       <w:r>
         <w:rPr>
           <w:rFonts w:ascii="Arial" w:eastAsiaTheme="minorHAnsi" w:hAnsi="Arial" w:cs="Arial"/>
@@ -4419,27 +4397,7 @@
           <w:bCs/>
           <w:lang w:val="es-MX"/>
         </w:rPr>
-        <w:t>check</w:t>
-      </w:r>
-      <w:proofErr w:type="spellEnd"/>
-      <w:r>
-        <w:rPr>
-          <w:rFonts w:ascii="Arial" w:eastAsiaTheme="minorHAnsi" w:hAnsi="Arial" w:cs="Arial"/>
-          <w:b/>
-          <w:bCs/>
-          <w:lang w:val="es-MX"/>
-        </w:rPr>
-        <w:t>-in</w:t>
-      </w:r>
-      <w:proofErr w:type="gramEnd"/>
-      <w:r>
-        <w:rPr>
-          <w:rFonts w:ascii="Arial" w:eastAsiaTheme="minorHAnsi" w:hAnsi="Arial" w:cs="Arial"/>
-          <w:b/>
-          <w:bCs/>
-          <w:lang w:val="es-MX"/>
-        </w:rPr>
-        <w:t xml:space="preserve"> y del </w:t>
+        <w:t xml:space="preserve">-in y del </w:t>
       </w:r>
       <w:proofErr w:type="spellStart"/>
       <w:r>
@@ -4685,25 +4643,7 @@
           <w:sz w:val="18"/>
           <w:szCs w:val="18"/>
         </w:rPr>
-        <w:t xml:space="preserve">quiero ver una lista de </w:t>
-      </w:r>
-      <w:proofErr w:type="gramStart"/>
-      <w:r>
-        <w:rPr>
-          <w:rFonts w:ascii="Segoe UI" w:hAnsi="Segoe UI" w:cs="Segoe UI"/>
-          <w:sz w:val="18"/>
-          <w:szCs w:val="18"/>
-        </w:rPr>
-        <w:t>tickets</w:t>
-      </w:r>
-      <w:proofErr w:type="gramEnd"/>
-      <w:r>
-        <w:rPr>
-          <w:rFonts w:ascii="Segoe UI" w:hAnsi="Segoe UI" w:cs="Segoe UI"/>
-          <w:sz w:val="18"/>
-          <w:szCs w:val="18"/>
-        </w:rPr>
-        <w:t xml:space="preserve"> pendientes y asignarme uno,</w:t>
+        <w:t>quiero ver una lista de tickets pendientes y asignarme uno,</w:t>
       </w:r>
     </w:p>
     <w:p>
@@ -4794,25 +4734,7 @@
           <w:sz w:val="18"/>
           <w:szCs w:val="18"/>
         </w:rPr>
-        <w:t xml:space="preserve">quiero poder hacer seguimiento al estado de cada </w:t>
-      </w:r>
-      <w:proofErr w:type="gramStart"/>
-      <w:r>
-        <w:rPr>
-          <w:rFonts w:ascii="Segoe UI" w:hAnsi="Segoe UI" w:cs="Segoe UI"/>
-          <w:sz w:val="18"/>
-          <w:szCs w:val="18"/>
-        </w:rPr>
-        <w:t>ticket</w:t>
-      </w:r>
-      <w:proofErr w:type="gramEnd"/>
-      <w:r>
-        <w:rPr>
-          <w:rFonts w:ascii="Segoe UI" w:hAnsi="Segoe UI" w:cs="Segoe UI"/>
-          <w:sz w:val="18"/>
-          <w:szCs w:val="18"/>
-        </w:rPr>
-        <w:t xml:space="preserve"> (pendiente, en proceso, resuelto),</w:t>
+        <w:t>quiero poder hacer seguimiento al estado de cada ticket (pendiente, en proceso, resuelto),</w:t>
       </w:r>
     </w:p>
     <w:p>
@@ -5003,6 +4925,110 @@
           <w:szCs w:val="18"/>
         </w:rPr>
         <w:t>Para: Poder gestionar de manera eficiente los recursos y asegurarme de que solo los empleados vigentes están siendo considerados en los procesos internos.</w:t>
+      </w:r>
+    </w:p>
+    <w:p>
+      <w:pPr>
+        <w:pStyle w:val="paragraph"/>
+        <w:spacing w:before="0" w:beforeAutospacing="0" w:after="0" w:afterAutospacing="0" w:line="480" w:lineRule="auto"/>
+        <w:textAlignment w:val="baseline"/>
+        <w:rPr>
+          <w:rFonts w:ascii="Segoe UI" w:hAnsi="Segoe UI" w:cs="Segoe UI"/>
+          <w:b/>
+          <w:bCs/>
+          <w:sz w:val="18"/>
+          <w:szCs w:val="18"/>
+        </w:rPr>
+      </w:pPr>
+      <w:r>
+        <w:rPr>
+          <w:rFonts w:ascii="Segoe UI" w:hAnsi="Segoe UI" w:cs="Segoe UI"/>
+          <w:b/>
+          <w:bCs/>
+          <w:sz w:val="18"/>
+          <w:szCs w:val="18"/>
+        </w:rPr>
+        <w:t>HUFP-0</w:t>
+      </w:r>
+      <w:r>
+        <w:rPr>
+          <w:rFonts w:ascii="Segoe UI" w:hAnsi="Segoe UI" w:cs="Segoe UI"/>
+          <w:b/>
+          <w:bCs/>
+          <w:sz w:val="18"/>
+          <w:szCs w:val="18"/>
+        </w:rPr>
+        <w:t>29</w:t>
+      </w:r>
+      <w:r>
+        <w:rPr>
+          <w:rFonts w:ascii="Segoe UI" w:hAnsi="Segoe UI" w:cs="Segoe UI"/>
+          <w:b/>
+          <w:bCs/>
+          <w:sz w:val="18"/>
+          <w:szCs w:val="18"/>
+        </w:rPr>
+        <w:t xml:space="preserve">: Registro de nuevos empleados </w:t>
+      </w:r>
+    </w:p>
+    <w:p>
+      <w:pPr>
+        <w:pStyle w:val="paragraph"/>
+        <w:spacing w:before="0" w:beforeAutospacing="0" w:after="0" w:afterAutospacing="0" w:line="480" w:lineRule="auto"/>
+        <w:textAlignment w:val="baseline"/>
+        <w:rPr>
+          <w:rFonts w:ascii="Segoe UI" w:hAnsi="Segoe UI" w:cs="Segoe UI"/>
+          <w:sz w:val="18"/>
+          <w:szCs w:val="18"/>
+        </w:rPr>
+      </w:pPr>
+      <w:r>
+        <w:rPr>
+          <w:rFonts w:ascii="Segoe UI" w:hAnsi="Segoe UI" w:cs="Segoe UI"/>
+          <w:sz w:val="18"/>
+          <w:szCs w:val="18"/>
+        </w:rPr>
+        <w:t xml:space="preserve">Como: Responsable de contratación </w:t>
+      </w:r>
+    </w:p>
+    <w:p>
+      <w:pPr>
+        <w:pStyle w:val="paragraph"/>
+        <w:spacing w:before="0" w:beforeAutospacing="0" w:after="0" w:afterAutospacing="0" w:line="480" w:lineRule="auto"/>
+        <w:textAlignment w:val="baseline"/>
+        <w:rPr>
+          <w:rFonts w:ascii="Segoe UI" w:hAnsi="Segoe UI" w:cs="Segoe UI"/>
+          <w:sz w:val="18"/>
+          <w:szCs w:val="18"/>
+        </w:rPr>
+      </w:pPr>
+      <w:r>
+        <w:rPr>
+          <w:rFonts w:ascii="Segoe UI" w:hAnsi="Segoe UI" w:cs="Segoe UI"/>
+          <w:sz w:val="18"/>
+          <w:szCs w:val="18"/>
+        </w:rPr>
+        <w:t xml:space="preserve">Quiero: Poder agregar nuevos empleados con su información (nombre, apellido, correo, teléfono, cargo, fecha de contratación) </w:t>
+      </w:r>
+    </w:p>
+    <w:p>
+      <w:pPr>
+        <w:pStyle w:val="paragraph"/>
+        <w:spacing w:before="0" w:beforeAutospacing="0" w:after="0" w:afterAutospacing="0" w:line="480" w:lineRule="auto"/>
+        <w:textAlignment w:val="baseline"/>
+        <w:rPr>
+          <w:rFonts w:ascii="Segoe UI" w:hAnsi="Segoe UI" w:cs="Segoe UI"/>
+          <w:sz w:val="18"/>
+          <w:szCs w:val="18"/>
+        </w:rPr>
+      </w:pPr>
+      <w:r>
+        <w:rPr>
+          <w:rFonts w:ascii="Segoe UI" w:hAnsi="Segoe UI" w:cs="Segoe UI"/>
+          <w:sz w:val="18"/>
+          <w:szCs w:val="18"/>
+        </w:rPr>
+        <w:t>Para: Mantener la base de datos actualizada y asegurarme de que se realice un registro adecuado y completo de todos los empleados nuevos.</w:t>
       </w:r>
     </w:p>
     <w:p>

</xml_diff>

<commit_message>
add: Se agrego historia de usuario HUFP-030 dentro del documento Peaceathome.docx en la rama fpaiz-2024264
</commit_message>
<xml_diff>
--- a/Peaceathome.docx
+++ b/Peaceathome.docx
@@ -745,8 +745,17 @@
                 <w:rFonts w:ascii="Arial" w:eastAsiaTheme="minorHAnsi" w:hAnsi="Arial" w:cs="Arial"/>
                 <w:sz w:val="24"/>
               </w:rPr>
-              <w:t>Scrum Master</w:t>
+              <w:t xml:space="preserve">Scrum </w:t>
             </w:r>
+            <w:proofErr w:type="gramStart"/>
+            <w:r>
+              <w:rPr>
+                <w:rFonts w:ascii="Arial" w:eastAsiaTheme="minorHAnsi" w:hAnsi="Arial" w:cs="Arial"/>
+                <w:sz w:val="24"/>
+              </w:rPr>
+              <w:t>Master</w:t>
+            </w:r>
+            <w:proofErr w:type="gramEnd"/>
           </w:p>
         </w:tc>
       </w:tr>
@@ -2000,6 +2009,7 @@
         </w:rPr>
       </w:pPr>
       <w:proofErr w:type="spellStart"/>
+      <w:proofErr w:type="gramStart"/>
       <w:r>
         <w:rPr>
           <w:b/>
@@ -2007,6 +2017,7 @@
         <w:t>TUPLA:Servicios</w:t>
       </w:r>
       <w:proofErr w:type="spellEnd"/>
+      <w:proofErr w:type="gramEnd"/>
     </w:p>
     <w:p>
       <w:pPr>
@@ -3846,8 +3857,9 @@
           <w:szCs w:val="20"/>
           <w:lang w:val="es-MX"/>
         </w:rPr>
-        <w:t xml:space="preserve">edades registradas al nombre de algún </w:t>
-      </w:r>
+        <w:t xml:space="preserve">edades registradas al nombre de </w:t>
+      </w:r>
+      <w:proofErr w:type="gramStart"/>
       <w:r>
         <w:rPr>
           <w:rFonts w:ascii="Arial" w:eastAsiaTheme="minorHAnsi" w:hAnsi="Arial" w:cs="Arial"/>
@@ -3855,55 +3867,36 @@
           <w:szCs w:val="20"/>
           <w:lang w:val="es-MX"/>
         </w:rPr>
-        <w:t xml:space="preserve"> usuario</w:t>
-      </w:r>
-    </w:p>
-    <w:p>
-      <w:pPr>
+        <w:t xml:space="preserve">algún </w:t>
+      </w:r>
+      <w:r>
         <w:rPr>
           <w:rFonts w:ascii="Arial" w:eastAsiaTheme="minorHAnsi" w:hAnsi="Arial" w:cs="Arial"/>
           <w:sz w:val="20"/>
           <w:szCs w:val="20"/>
           <w:lang w:val="es-MX"/>
         </w:rPr>
-      </w:pPr>
-      <w:r>
+        <w:t xml:space="preserve"> usuario</w:t>
+      </w:r>
+      <w:proofErr w:type="gramEnd"/>
+    </w:p>
+    <w:p>
+      <w:pPr>
         <w:rPr>
           <w:rFonts w:ascii="Arial" w:eastAsiaTheme="minorHAnsi" w:hAnsi="Arial" w:cs="Arial"/>
           <w:sz w:val="20"/>
           <w:szCs w:val="20"/>
           <w:lang w:val="es-MX"/>
         </w:rPr>
-        <w:t>Para: Poder llevar un registro de sus facturas y remodelaciones</w:t>
-      </w:r>
-    </w:p>
-    <w:p>
-      <w:pPr>
+      </w:pPr>
+      <w:r>
         <w:rPr>
           <w:rFonts w:ascii="Arial" w:eastAsiaTheme="minorHAnsi" w:hAnsi="Arial" w:cs="Arial"/>
           <w:sz w:val="20"/>
           <w:szCs w:val="20"/>
           <w:lang w:val="es-MX"/>
         </w:rPr>
-      </w:pPr>
-    </w:p>
-    <w:p>
-      <w:pPr>
-        <w:rPr>
-          <w:rFonts w:ascii="Arial" w:eastAsiaTheme="minorHAnsi" w:hAnsi="Arial" w:cs="Arial"/>
-          <w:b/>
-          <w:bCs/>
-          <w:lang w:val="es-MX"/>
-        </w:rPr>
-      </w:pPr>
-      <w:r>
-        <w:rPr>
-          <w:rFonts w:ascii="Arial" w:eastAsiaTheme="minorHAnsi" w:hAnsi="Arial" w:cs="Arial"/>
-          <w:b/>
-          <w:bCs/>
-          <w:lang w:val="es-MX"/>
-        </w:rPr>
-        <w:t>HUCL-020: Registro de Nueva Propiedad</w:t>
+        <w:t>Para: Poder llevar un registro de sus facturas y remodelaciones</w:t>
       </w:r>
     </w:p>
     <w:p>
@@ -3915,35 +3908,54 @@
           <w:lang w:val="es-MX"/>
         </w:rPr>
       </w:pPr>
-      <w:r>
+    </w:p>
+    <w:p>
+      <w:pPr>
+        <w:rPr>
+          <w:rFonts w:ascii="Arial" w:eastAsiaTheme="minorHAnsi" w:hAnsi="Arial" w:cs="Arial"/>
+          <w:b/>
+          <w:bCs/>
+          <w:lang w:val="es-MX"/>
+        </w:rPr>
+      </w:pPr>
+      <w:r>
+        <w:rPr>
+          <w:rFonts w:ascii="Arial" w:eastAsiaTheme="minorHAnsi" w:hAnsi="Arial" w:cs="Arial"/>
+          <w:b/>
+          <w:bCs/>
+          <w:lang w:val="es-MX"/>
+        </w:rPr>
+        <w:t>HUCL-020: Registro de Nueva Propiedad</w:t>
+      </w:r>
+    </w:p>
+    <w:p>
+      <w:pPr>
         <w:rPr>
           <w:rFonts w:ascii="Arial" w:eastAsiaTheme="minorHAnsi" w:hAnsi="Arial" w:cs="Arial"/>
           <w:sz w:val="20"/>
           <w:szCs w:val="20"/>
           <w:lang w:val="es-MX"/>
         </w:rPr>
-        <w:t>Como: Arrendador</w:t>
-      </w:r>
-    </w:p>
-    <w:p>
-      <w:pPr>
+      </w:pPr>
+      <w:r>
         <w:rPr>
           <w:rFonts w:ascii="Arial" w:eastAsiaTheme="minorHAnsi" w:hAnsi="Arial" w:cs="Arial"/>
           <w:sz w:val="20"/>
           <w:szCs w:val="20"/>
           <w:lang w:val="es-MX"/>
         </w:rPr>
-      </w:pPr>
-      <w:r>
+        <w:t>Como: Arrendador</w:t>
+      </w:r>
+    </w:p>
+    <w:p>
+      <w:pPr>
         <w:rPr>
           <w:rFonts w:ascii="Arial" w:eastAsiaTheme="minorHAnsi" w:hAnsi="Arial" w:cs="Arial"/>
           <w:sz w:val="20"/>
           <w:szCs w:val="20"/>
           <w:lang w:val="es-MX"/>
         </w:rPr>
-        <w:t xml:space="preserve">Quiero: Registrar una nueva propiedad en </w:t>
-      </w:r>
-      <w:proofErr w:type="spellStart"/>
+      </w:pPr>
       <w:r>
         <w:rPr>
           <w:rFonts w:ascii="Arial" w:eastAsiaTheme="minorHAnsi" w:hAnsi="Arial" w:cs="Arial"/>
@@ -3951,9 +3963,9 @@
           <w:szCs w:val="20"/>
           <w:lang w:val="es-MX"/>
         </w:rPr>
-        <w:t>Peace</w:t>
-      </w:r>
-      <w:proofErr w:type="spellEnd"/>
+        <w:t xml:space="preserve">Quiero: Registrar una nueva propiedad en </w:t>
+      </w:r>
+      <w:proofErr w:type="spellStart"/>
       <w:r>
         <w:rPr>
           <w:rFonts w:ascii="Arial" w:eastAsiaTheme="minorHAnsi" w:hAnsi="Arial" w:cs="Arial"/>
@@ -3961,37 +3973,37 @@
           <w:szCs w:val="20"/>
           <w:lang w:val="es-MX"/>
         </w:rPr>
-        <w:t xml:space="preserve"> at Home</w:t>
-      </w:r>
-    </w:p>
-    <w:p>
-      <w:pPr>
+        <w:t>Peace</w:t>
+      </w:r>
+      <w:proofErr w:type="spellEnd"/>
+      <w:r>
         <w:rPr>
           <w:rFonts w:ascii="Arial" w:eastAsiaTheme="minorHAnsi" w:hAnsi="Arial" w:cs="Arial"/>
           <w:sz w:val="20"/>
           <w:szCs w:val="20"/>
           <w:lang w:val="es-MX"/>
         </w:rPr>
-      </w:pPr>
-      <w:r>
+        <w:t xml:space="preserve"> at Home</w:t>
+      </w:r>
+    </w:p>
+    <w:p>
+      <w:pPr>
         <w:rPr>
           <w:rFonts w:ascii="Arial" w:eastAsiaTheme="minorHAnsi" w:hAnsi="Arial" w:cs="Arial"/>
           <w:sz w:val="20"/>
           <w:szCs w:val="20"/>
           <w:lang w:val="es-MX"/>
         </w:rPr>
-        <w:t>Para: Brindar una experiencia cómoda y agradable a los huéspedes que renten la propiedad</w:t>
-      </w:r>
-    </w:p>
-    <w:p>
-      <w:pPr>
+      </w:pPr>
+      <w:r>
         <w:rPr>
           <w:rFonts w:ascii="Arial" w:eastAsiaTheme="minorHAnsi" w:hAnsi="Arial" w:cs="Arial"/>
           <w:sz w:val="20"/>
           <w:szCs w:val="20"/>
           <w:lang w:val="es-MX"/>
         </w:rPr>
-      </w:pPr>
+        <w:t>Para: Brindar una experiencia cómoda y agradable a los huéspedes que renten la propiedad</w:t>
+      </w:r>
     </w:p>
     <w:p>
       <w:pPr>
@@ -4002,23 +4014,24 @@
           <w:lang w:val="es-MX"/>
         </w:rPr>
       </w:pPr>
-      <w:r>
-        <w:rPr>
-          <w:rFonts w:ascii="Arial" w:eastAsiaTheme="minorHAnsi" w:hAnsi="Arial" w:cs="Arial"/>
-          <w:b/>
-          <w:bCs/>
-          <w:lang w:val="es-MX"/>
-        </w:rPr>
-        <w:t>HUCL-021:</w:t>
-      </w:r>
-      <w:r>
+    </w:p>
+    <w:p>
+      <w:pPr>
         <w:rPr>
           <w:rFonts w:ascii="Arial" w:eastAsiaTheme="minorHAnsi" w:hAnsi="Arial" w:cs="Arial"/>
           <w:sz w:val="20"/>
           <w:szCs w:val="20"/>
           <w:lang w:val="es-MX"/>
         </w:rPr>
-        <w:t xml:space="preserve"> </w:t>
+      </w:pPr>
+      <w:r>
+        <w:rPr>
+          <w:rFonts w:ascii="Arial" w:eastAsiaTheme="minorHAnsi" w:hAnsi="Arial" w:cs="Arial"/>
+          <w:b/>
+          <w:bCs/>
+          <w:lang w:val="es-MX"/>
+        </w:rPr>
+        <w:t>HUCL-021:</w:t>
       </w:r>
       <w:r>
         <w:rPr>
@@ -4032,243 +4045,204 @@
       <w:r>
         <w:rPr>
           <w:rFonts w:ascii="Arial" w:eastAsiaTheme="minorHAnsi" w:hAnsi="Arial" w:cs="Arial"/>
-          <w:b/>
-          <w:bCs/>
-          <w:lang w:val="es-MX"/>
-        </w:rPr>
-        <w:t>descripción de propiedades</w:t>
-      </w:r>
-    </w:p>
-    <w:p>
-      <w:pPr>
-        <w:rPr>
-          <w:rFonts w:ascii="Arial" w:eastAsiaTheme="minorHAnsi" w:hAnsi="Arial" w:cs="Arial"/>
           <w:sz w:val="20"/>
           <w:szCs w:val="20"/>
           <w:lang w:val="es-MX"/>
         </w:rPr>
-      </w:pPr>
-      <w:r>
+        <w:t xml:space="preserve"> </w:t>
+      </w:r>
+      <w:r>
+        <w:rPr>
+          <w:rFonts w:ascii="Arial" w:eastAsiaTheme="minorHAnsi" w:hAnsi="Arial" w:cs="Arial"/>
+          <w:b/>
+          <w:bCs/>
+          <w:lang w:val="es-MX"/>
+        </w:rPr>
+        <w:t>descripción de propiedades</w:t>
+      </w:r>
+    </w:p>
+    <w:p>
+      <w:pPr>
         <w:rPr>
           <w:rFonts w:ascii="Arial" w:eastAsiaTheme="minorHAnsi" w:hAnsi="Arial" w:cs="Arial"/>
           <w:sz w:val="20"/>
           <w:szCs w:val="20"/>
           <w:lang w:val="es-MX"/>
         </w:rPr>
-        <w:t>Como: Administrador</w:t>
-      </w:r>
-    </w:p>
-    <w:p>
-      <w:pPr>
+      </w:pPr>
+      <w:r>
         <w:rPr>
           <w:rFonts w:ascii="Arial" w:eastAsiaTheme="minorHAnsi" w:hAnsi="Arial" w:cs="Arial"/>
           <w:sz w:val="20"/>
           <w:szCs w:val="20"/>
           <w:lang w:val="es-MX"/>
         </w:rPr>
-      </w:pPr>
-      <w:r>
+        <w:t>Como: Administrador</w:t>
+      </w:r>
+    </w:p>
+    <w:p>
+      <w:pPr>
         <w:rPr>
           <w:rFonts w:ascii="Arial" w:eastAsiaTheme="minorHAnsi" w:hAnsi="Arial" w:cs="Arial"/>
           <w:sz w:val="20"/>
           <w:szCs w:val="20"/>
           <w:lang w:val="es-MX"/>
         </w:rPr>
-        <w:t>Quiero: Poder editar los estados y descripciones de las propiedades que se encuentren en remodelaciones o con atracciones nuevas</w:t>
-      </w:r>
-    </w:p>
-    <w:p>
-      <w:pPr>
+      </w:pPr>
+      <w:r>
         <w:rPr>
           <w:rFonts w:ascii="Arial" w:eastAsiaTheme="minorHAnsi" w:hAnsi="Arial" w:cs="Arial"/>
           <w:sz w:val="20"/>
           <w:szCs w:val="20"/>
           <w:lang w:val="es-MX"/>
         </w:rPr>
-      </w:pPr>
-      <w:r>
+        <w:t>Quiero: Poder editar los estados y descripciones de las propiedades que se encuentren en remodelaciones o con atracciones nuevas</w:t>
+      </w:r>
+    </w:p>
+    <w:p>
+      <w:pPr>
         <w:rPr>
           <w:rFonts w:ascii="Arial" w:eastAsiaTheme="minorHAnsi" w:hAnsi="Arial" w:cs="Arial"/>
           <w:sz w:val="20"/>
           <w:szCs w:val="20"/>
           <w:lang w:val="es-MX"/>
         </w:rPr>
-        <w:t>Para: Que los nuevos usuarios sepan de las nuevas características que poseen las propiedades</w:t>
-      </w:r>
-    </w:p>
-    <w:p>
-      <w:pPr>
-        <w:spacing w:before="100" w:beforeAutospacing="1" w:after="100" w:afterAutospacing="1" w:line="240" w:lineRule="auto"/>
-        <w:rPr>
-          <w:rFonts w:ascii="Arial" w:eastAsia="Times New Roman" w:hAnsi="Arial" w:cs="Arial"/>
-          <w:sz w:val="24"/>
-          <w:szCs w:val="24"/>
-          <w:lang w:eastAsia="es-GT"/>
-        </w:rPr>
-      </w:pPr>
-    </w:p>
-    <w:p>
-      <w:pPr>
-        <w:rPr>
-          <w:rFonts w:ascii="Arial" w:eastAsiaTheme="minorHAnsi" w:hAnsi="Arial" w:cs="Arial"/>
-          <w:b/>
-          <w:bCs/>
-          <w:lang w:val="es-MX"/>
-        </w:rPr>
-      </w:pPr>
-      <w:r>
-        <w:rPr>
-          <w:rFonts w:ascii="Arial" w:eastAsiaTheme="minorHAnsi" w:hAnsi="Arial" w:cs="Arial"/>
-          <w:b/>
-          <w:bCs/>
-          <w:lang w:val="es-MX"/>
-        </w:rPr>
-        <w:t>Tupla: Locación</w:t>
-      </w:r>
-    </w:p>
-    <w:p>
-      <w:pPr>
-        <w:rPr>
-          <w:rFonts w:ascii="Arial" w:eastAsiaTheme="minorHAnsi" w:hAnsi="Arial" w:cs="Arial"/>
-          <w:b/>
-          <w:bCs/>
-          <w:lang w:val="es-MX"/>
-        </w:rPr>
-      </w:pPr>
-      <w:r>
-        <w:rPr>
-          <w:rFonts w:ascii="Arial" w:eastAsiaTheme="minorHAnsi" w:hAnsi="Arial" w:cs="Arial"/>
-          <w:b/>
-          <w:bCs/>
-          <w:lang w:val="es-MX"/>
-        </w:rPr>
-        <w:t>HUAP-02</w:t>
-      </w:r>
-      <w:r>
-        <w:rPr>
-          <w:rFonts w:ascii="Arial" w:eastAsiaTheme="minorHAnsi" w:hAnsi="Arial" w:cs="Arial"/>
-          <w:b/>
-          <w:bCs/>
-          <w:lang w:val="es-MX"/>
-        </w:rPr>
-        <w:t>2</w:t>
-      </w:r>
-      <w:r>
-        <w:rPr>
-          <w:rFonts w:ascii="Arial" w:eastAsiaTheme="minorHAnsi" w:hAnsi="Arial" w:cs="Arial"/>
-          <w:b/>
-          <w:bCs/>
-          <w:lang w:val="es-MX"/>
-        </w:rPr>
-        <w:t xml:space="preserve"> - Actualizar información de la locación</w:t>
-      </w:r>
-    </w:p>
-    <w:p>
-      <w:pPr>
-        <w:spacing w:before="100" w:beforeAutospacing="1" w:after="100" w:afterAutospacing="1" w:line="240" w:lineRule="auto"/>
+      </w:pPr>
+      <w:r>
         <w:rPr>
           <w:rFonts w:ascii="Arial" w:eastAsiaTheme="minorHAnsi" w:hAnsi="Arial" w:cs="Arial"/>
           <w:sz w:val="20"/>
           <w:szCs w:val="20"/>
           <w:lang w:val="es-MX"/>
         </w:rPr>
-      </w:pPr>
-      <w:r>
+        <w:t>Para: Que los nuevos usuarios sepan de las nuevas características que poseen las propiedades</w:t>
+      </w:r>
+    </w:p>
+    <w:p>
+      <w:pPr>
+        <w:spacing w:before="100" w:beforeAutospacing="1" w:after="100" w:afterAutospacing="1" w:line="240" w:lineRule="auto"/>
+        <w:rPr>
+          <w:rFonts w:ascii="Arial" w:eastAsia="Times New Roman" w:hAnsi="Arial" w:cs="Arial"/>
+          <w:sz w:val="24"/>
+          <w:szCs w:val="24"/>
+          <w:lang w:eastAsia="es-GT"/>
+        </w:rPr>
+      </w:pPr>
+    </w:p>
+    <w:p>
+      <w:pPr>
+        <w:rPr>
+          <w:rFonts w:ascii="Arial" w:eastAsiaTheme="minorHAnsi" w:hAnsi="Arial" w:cs="Arial"/>
+          <w:b/>
+          <w:bCs/>
+          <w:lang w:val="es-MX"/>
+        </w:rPr>
+      </w:pPr>
+      <w:r>
+        <w:rPr>
+          <w:rFonts w:ascii="Arial" w:eastAsiaTheme="minorHAnsi" w:hAnsi="Arial" w:cs="Arial"/>
+          <w:b/>
+          <w:bCs/>
+          <w:lang w:val="es-MX"/>
+        </w:rPr>
+        <w:t>Tupla: Locación</w:t>
+      </w:r>
+    </w:p>
+    <w:p>
+      <w:pPr>
+        <w:rPr>
+          <w:rFonts w:ascii="Arial" w:eastAsiaTheme="minorHAnsi" w:hAnsi="Arial" w:cs="Arial"/>
+          <w:b/>
+          <w:bCs/>
+          <w:lang w:val="es-MX"/>
+        </w:rPr>
+      </w:pPr>
+      <w:r>
+        <w:rPr>
+          <w:rFonts w:ascii="Arial" w:eastAsiaTheme="minorHAnsi" w:hAnsi="Arial" w:cs="Arial"/>
+          <w:b/>
+          <w:bCs/>
+          <w:lang w:val="es-MX"/>
+        </w:rPr>
+        <w:t>HUAP-02</w:t>
+      </w:r>
+      <w:r>
+        <w:rPr>
+          <w:rFonts w:ascii="Arial" w:eastAsiaTheme="minorHAnsi" w:hAnsi="Arial" w:cs="Arial"/>
+          <w:b/>
+          <w:bCs/>
+          <w:lang w:val="es-MX"/>
+        </w:rPr>
+        <w:t>2</w:t>
+      </w:r>
+      <w:r>
+        <w:rPr>
+          <w:rFonts w:ascii="Arial" w:eastAsiaTheme="minorHAnsi" w:hAnsi="Arial" w:cs="Arial"/>
+          <w:b/>
+          <w:bCs/>
+          <w:lang w:val="es-MX"/>
+        </w:rPr>
+        <w:t xml:space="preserve"> - Actualizar información de la locación</w:t>
+      </w:r>
+    </w:p>
+    <w:p>
+      <w:pPr>
+        <w:spacing w:before="100" w:beforeAutospacing="1" w:after="100" w:afterAutospacing="1" w:line="240" w:lineRule="auto"/>
         <w:rPr>
           <w:rFonts w:ascii="Arial" w:eastAsiaTheme="minorHAnsi" w:hAnsi="Arial" w:cs="Arial"/>
           <w:sz w:val="20"/>
           <w:szCs w:val="20"/>
           <w:lang w:val="es-MX"/>
         </w:rPr>
-        <w:t>Cómo: Locación</w:t>
-      </w:r>
-    </w:p>
-    <w:p>
-      <w:pPr>
-        <w:spacing w:before="100" w:beforeAutospacing="1" w:after="100" w:afterAutospacing="1" w:line="240" w:lineRule="auto"/>
+      </w:pPr>
+      <w:r>
         <w:rPr>
           <w:rFonts w:ascii="Arial" w:eastAsiaTheme="minorHAnsi" w:hAnsi="Arial" w:cs="Arial"/>
           <w:sz w:val="20"/>
           <w:szCs w:val="20"/>
           <w:lang w:val="es-MX"/>
         </w:rPr>
-      </w:pPr>
-      <w:r>
+        <w:t>Cómo: Locación</w:t>
+      </w:r>
+    </w:p>
+    <w:p>
+      <w:pPr>
+        <w:spacing w:before="100" w:beforeAutospacing="1" w:after="100" w:afterAutospacing="1" w:line="240" w:lineRule="auto"/>
         <w:rPr>
           <w:rFonts w:ascii="Arial" w:eastAsiaTheme="minorHAnsi" w:hAnsi="Arial" w:cs="Arial"/>
           <w:sz w:val="20"/>
           <w:szCs w:val="20"/>
           <w:lang w:val="es-MX"/>
         </w:rPr>
-        <w:t>Quiero: Editar mis datos como dirección, descripción, y contacto</w:t>
-      </w:r>
-    </w:p>
-    <w:p>
-      <w:pPr>
-        <w:spacing w:before="100" w:beforeAutospacing="1" w:after="100" w:afterAutospacing="1" w:line="240" w:lineRule="auto"/>
+      </w:pPr>
+      <w:r>
         <w:rPr>
           <w:rFonts w:ascii="Arial" w:eastAsiaTheme="minorHAnsi" w:hAnsi="Arial" w:cs="Arial"/>
           <w:sz w:val="20"/>
           <w:szCs w:val="20"/>
           <w:lang w:val="es-MX"/>
         </w:rPr>
-      </w:pPr>
-      <w:r>
+        <w:t>Quiero: Editar mis datos como dirección, descripción, y contacto</w:t>
+      </w:r>
+    </w:p>
+    <w:p>
+      <w:pPr>
+        <w:spacing w:before="100" w:beforeAutospacing="1" w:after="100" w:afterAutospacing="1" w:line="240" w:lineRule="auto"/>
         <w:rPr>
           <w:rFonts w:ascii="Arial" w:eastAsiaTheme="minorHAnsi" w:hAnsi="Arial" w:cs="Arial"/>
           <w:sz w:val="20"/>
           <w:szCs w:val="20"/>
           <w:lang w:val="es-MX"/>
         </w:rPr>
-        <w:t>Para: Mantener mi información actualizada y brindar datos correctos a los huéspedes</w:t>
-      </w:r>
-    </w:p>
-    <w:p>
-      <w:pPr>
-        <w:spacing w:before="100" w:beforeAutospacing="1" w:after="100" w:afterAutospacing="1" w:line="240" w:lineRule="auto"/>
+      </w:pPr>
+      <w:r>
         <w:rPr>
           <w:rFonts w:ascii="Arial" w:eastAsiaTheme="minorHAnsi" w:hAnsi="Arial" w:cs="Arial"/>
           <w:sz w:val="20"/>
           <w:szCs w:val="20"/>
           <w:lang w:val="es-MX"/>
         </w:rPr>
-      </w:pPr>
-    </w:p>
-    <w:p>
-      <w:pPr>
-        <w:rPr>
-          <w:rFonts w:ascii="Arial" w:eastAsiaTheme="minorHAnsi" w:hAnsi="Arial" w:cs="Arial"/>
-          <w:b/>
-          <w:bCs/>
-          <w:lang w:val="es-MX"/>
-        </w:rPr>
-      </w:pPr>
-      <w:r>
-        <w:rPr>
-          <w:rFonts w:ascii="Arial" w:eastAsiaTheme="minorHAnsi" w:hAnsi="Arial" w:cs="Arial"/>
-          <w:b/>
-          <w:bCs/>
-          <w:lang w:val="es-MX"/>
-        </w:rPr>
-        <w:t>HUAP-02</w:t>
-      </w:r>
-      <w:r>
-        <w:rPr>
-          <w:rFonts w:ascii="Arial" w:eastAsiaTheme="minorHAnsi" w:hAnsi="Arial" w:cs="Arial"/>
-          <w:b/>
-          <w:bCs/>
-          <w:lang w:val="es-MX"/>
-        </w:rPr>
-        <w:t>3</w:t>
-      </w:r>
-      <w:r>
-        <w:rPr>
-          <w:rFonts w:ascii="Arial" w:eastAsiaTheme="minorHAnsi" w:hAnsi="Arial" w:cs="Arial"/>
-          <w:b/>
-          <w:bCs/>
-          <w:lang w:val="es-MX"/>
-        </w:rPr>
-        <w:t xml:space="preserve"> - Ver historial de reservas</w:t>
+        <w:t>Para: Mantener mi información actualizada y brindar datos correctos a los huéspedes</w:t>
       </w:r>
     </w:p>
     <w:p>
@@ -4281,66 +4255,103 @@
           <w:lang w:val="es-MX"/>
         </w:rPr>
       </w:pPr>
-      <w:r>
+    </w:p>
+    <w:p>
+      <w:pPr>
+        <w:rPr>
+          <w:rFonts w:ascii="Arial" w:eastAsiaTheme="minorHAnsi" w:hAnsi="Arial" w:cs="Arial"/>
+          <w:b/>
+          <w:bCs/>
+          <w:lang w:val="es-MX"/>
+        </w:rPr>
+      </w:pPr>
+      <w:r>
+        <w:rPr>
+          <w:rFonts w:ascii="Arial" w:eastAsiaTheme="minorHAnsi" w:hAnsi="Arial" w:cs="Arial"/>
+          <w:b/>
+          <w:bCs/>
+          <w:lang w:val="es-MX"/>
+        </w:rPr>
+        <w:t>HUAP-02</w:t>
+      </w:r>
+      <w:r>
+        <w:rPr>
+          <w:rFonts w:ascii="Arial" w:eastAsiaTheme="minorHAnsi" w:hAnsi="Arial" w:cs="Arial"/>
+          <w:b/>
+          <w:bCs/>
+          <w:lang w:val="es-MX"/>
+        </w:rPr>
+        <w:t>3</w:t>
+      </w:r>
+      <w:r>
+        <w:rPr>
+          <w:rFonts w:ascii="Arial" w:eastAsiaTheme="minorHAnsi" w:hAnsi="Arial" w:cs="Arial"/>
+          <w:b/>
+          <w:bCs/>
+          <w:lang w:val="es-MX"/>
+        </w:rPr>
+        <w:t xml:space="preserve"> - Ver historial de reservas</w:t>
+      </w:r>
+    </w:p>
+    <w:p>
+      <w:pPr>
+        <w:spacing w:before="100" w:beforeAutospacing="1" w:after="100" w:afterAutospacing="1" w:line="240" w:lineRule="auto"/>
         <w:rPr>
           <w:rFonts w:ascii="Arial" w:eastAsiaTheme="minorHAnsi" w:hAnsi="Arial" w:cs="Arial"/>
           <w:sz w:val="20"/>
           <w:szCs w:val="20"/>
           <w:lang w:val="es-MX"/>
         </w:rPr>
-        <w:t>Cómo: Locación</w:t>
-      </w:r>
-    </w:p>
-    <w:p>
-      <w:pPr>
-        <w:spacing w:before="100" w:beforeAutospacing="1" w:after="100" w:afterAutospacing="1" w:line="240" w:lineRule="auto"/>
+      </w:pPr>
+      <w:r>
         <w:rPr>
           <w:rFonts w:ascii="Arial" w:eastAsiaTheme="minorHAnsi" w:hAnsi="Arial" w:cs="Arial"/>
           <w:sz w:val="20"/>
           <w:szCs w:val="20"/>
           <w:lang w:val="es-MX"/>
         </w:rPr>
-      </w:pPr>
-      <w:r>
+        <w:t>Cómo: Locación</w:t>
+      </w:r>
+    </w:p>
+    <w:p>
+      <w:pPr>
+        <w:spacing w:before="100" w:beforeAutospacing="1" w:after="100" w:afterAutospacing="1" w:line="240" w:lineRule="auto"/>
         <w:rPr>
           <w:rFonts w:ascii="Arial" w:eastAsiaTheme="minorHAnsi" w:hAnsi="Arial" w:cs="Arial"/>
           <w:sz w:val="20"/>
           <w:szCs w:val="20"/>
           <w:lang w:val="es-MX"/>
         </w:rPr>
-        <w:t>Quiero: Consultar las reservas que se han realizado en mi espacio</w:t>
-      </w:r>
-    </w:p>
-    <w:p>
-      <w:pPr>
-        <w:spacing w:before="100" w:beforeAutospacing="1" w:after="100" w:afterAutospacing="1" w:line="240" w:lineRule="auto"/>
+      </w:pPr>
+      <w:r>
         <w:rPr>
           <w:rFonts w:ascii="Arial" w:eastAsiaTheme="minorHAnsi" w:hAnsi="Arial" w:cs="Arial"/>
           <w:sz w:val="20"/>
           <w:szCs w:val="20"/>
           <w:lang w:val="es-MX"/>
         </w:rPr>
-      </w:pPr>
-      <w:r>
+        <w:t>Quiero: Consultar las reservas que se han realizado en mi espacio</w:t>
+      </w:r>
+    </w:p>
+    <w:p>
+      <w:pPr>
+        <w:spacing w:before="100" w:beforeAutospacing="1" w:after="100" w:afterAutospacing="1" w:line="240" w:lineRule="auto"/>
         <w:rPr>
           <w:rFonts w:ascii="Arial" w:eastAsiaTheme="minorHAnsi" w:hAnsi="Arial" w:cs="Arial"/>
           <w:sz w:val="20"/>
           <w:szCs w:val="20"/>
           <w:lang w:val="es-MX"/>
         </w:rPr>
-        <w:t>Para: Llevar un control de los huéspedes que me han visitado</w:t>
-      </w:r>
-    </w:p>
-    <w:p>
-      <w:pPr>
-        <w:spacing w:before="100" w:beforeAutospacing="1" w:after="100" w:afterAutospacing="1" w:line="240" w:lineRule="auto"/>
+      </w:pPr>
+      <w:r>
         <w:rPr>
           <w:rFonts w:ascii="Arial" w:eastAsiaTheme="minorHAnsi" w:hAnsi="Arial" w:cs="Arial"/>
           <w:sz w:val="20"/>
           <w:szCs w:val="20"/>
           <w:lang w:val="es-MX"/>
         </w:rPr>
-      </w:pPr>
+        <w:t>Para: Llevar un control de los huéspedes que me han visitado</w:t>
+      </w:r>
     </w:p>
     <w:p>
       <w:pPr>
@@ -4352,6 +4363,17 @@
           <w:lang w:val="es-MX"/>
         </w:rPr>
       </w:pPr>
+    </w:p>
+    <w:p>
+      <w:pPr>
+        <w:spacing w:before="100" w:beforeAutospacing="1" w:after="100" w:afterAutospacing="1" w:line="240" w:lineRule="auto"/>
+        <w:rPr>
+          <w:rFonts w:ascii="Arial" w:eastAsiaTheme="minorHAnsi" w:hAnsi="Arial" w:cs="Arial"/>
+          <w:sz w:val="20"/>
+          <w:szCs w:val="20"/>
+          <w:lang w:val="es-MX"/>
+        </w:rPr>
+      </w:pPr>
       <w:r>
         <w:rPr>
           <w:rFonts w:ascii="Arial" w:eastAsiaTheme="minorHAnsi" w:hAnsi="Arial" w:cs="Arial"/>
@@ -4377,9 +4399,9 @@
           <w:bCs/>
           <w:lang w:val="es-MX"/>
         </w:rPr>
-        <w:t xml:space="preserve"> - Establecer horario de </w:t>
-      </w:r>
-      <w:proofErr w:type="spellStart"/>
+        <w:t xml:space="preserve"> - Establecer horario </w:t>
+      </w:r>
+      <w:proofErr w:type="gramStart"/>
       <w:r>
         <w:rPr>
           <w:rFonts w:ascii="Arial" w:eastAsiaTheme="minorHAnsi" w:hAnsi="Arial" w:cs="Arial"/>
@@ -4387,9 +4409,9 @@
           <w:bCs/>
           <w:lang w:val="es-MX"/>
         </w:rPr>
-        <w:t>check</w:t>
-      </w:r>
-      <w:proofErr w:type="spellEnd"/>
+        <w:t xml:space="preserve">de </w:t>
+      </w:r>
+      <w:proofErr w:type="spellStart"/>
       <w:r>
         <w:rPr>
           <w:rFonts w:ascii="Arial" w:eastAsiaTheme="minorHAnsi" w:hAnsi="Arial" w:cs="Arial"/>
@@ -4397,7 +4419,27 @@
           <w:bCs/>
           <w:lang w:val="es-MX"/>
         </w:rPr>
-        <w:t xml:space="preserve">-in y del </w:t>
+        <w:t>check</w:t>
+      </w:r>
+      <w:proofErr w:type="spellEnd"/>
+      <w:r>
+        <w:rPr>
+          <w:rFonts w:ascii="Arial" w:eastAsiaTheme="minorHAnsi" w:hAnsi="Arial" w:cs="Arial"/>
+          <w:b/>
+          <w:bCs/>
+          <w:lang w:val="es-MX"/>
+        </w:rPr>
+        <w:t>-in</w:t>
+      </w:r>
+      <w:proofErr w:type="gramEnd"/>
+      <w:r>
+        <w:rPr>
+          <w:rFonts w:ascii="Arial" w:eastAsiaTheme="minorHAnsi" w:hAnsi="Arial" w:cs="Arial"/>
+          <w:b/>
+          <w:bCs/>
+          <w:lang w:val="es-MX"/>
+        </w:rPr>
+        <w:t xml:space="preserve"> y del </w:t>
       </w:r>
       <w:proofErr w:type="spellStart"/>
       <w:r>
@@ -4643,7 +4685,25 @@
           <w:sz w:val="18"/>
           <w:szCs w:val="18"/>
         </w:rPr>
-        <w:t>quiero ver una lista de tickets pendientes y asignarme uno,</w:t>
+        <w:t xml:space="preserve">quiero ver una lista de </w:t>
+      </w:r>
+      <w:proofErr w:type="gramStart"/>
+      <w:r>
+        <w:rPr>
+          <w:rFonts w:ascii="Segoe UI" w:hAnsi="Segoe UI" w:cs="Segoe UI"/>
+          <w:sz w:val="18"/>
+          <w:szCs w:val="18"/>
+        </w:rPr>
+        <w:t>tickets</w:t>
+      </w:r>
+      <w:proofErr w:type="gramEnd"/>
+      <w:r>
+        <w:rPr>
+          <w:rFonts w:ascii="Segoe UI" w:hAnsi="Segoe UI" w:cs="Segoe UI"/>
+          <w:sz w:val="18"/>
+          <w:szCs w:val="18"/>
+        </w:rPr>
+        <w:t xml:space="preserve"> pendientes y asignarme uno,</w:t>
       </w:r>
     </w:p>
     <w:p>
@@ -4734,7 +4794,25 @@
           <w:sz w:val="18"/>
           <w:szCs w:val="18"/>
         </w:rPr>
-        <w:t>quiero poder hacer seguimiento al estado de cada ticket (pendiente, en proceso, resuelto),</w:t>
+        <w:t xml:space="preserve">quiero poder hacer seguimiento al estado de cada </w:t>
+      </w:r>
+      <w:proofErr w:type="gramStart"/>
+      <w:r>
+        <w:rPr>
+          <w:rFonts w:ascii="Segoe UI" w:hAnsi="Segoe UI" w:cs="Segoe UI"/>
+          <w:sz w:val="18"/>
+          <w:szCs w:val="18"/>
+        </w:rPr>
+        <w:t>ticket</w:t>
+      </w:r>
+      <w:proofErr w:type="gramEnd"/>
+      <w:r>
+        <w:rPr>
+          <w:rFonts w:ascii="Segoe UI" w:hAnsi="Segoe UI" w:cs="Segoe UI"/>
+          <w:sz w:val="18"/>
+          <w:szCs w:val="18"/>
+        </w:rPr>
+        <w:t xml:space="preserve"> (pendiente, en proceso, resuelto),</w:t>
       </w:r>
     </w:p>
     <w:p>
@@ -5029,6 +5107,111 @@
           <w:szCs w:val="18"/>
         </w:rPr>
         <w:t>Para: Mantener la base de datos actualizada y asegurarme de que se realice un registro adecuado y completo de todos los empleados nuevos.</w:t>
+      </w:r>
+    </w:p>
+    <w:p>
+      <w:pPr>
+        <w:pStyle w:val="paragraph"/>
+        <w:spacing w:before="0" w:beforeAutospacing="0" w:after="0" w:afterAutospacing="0" w:line="480" w:lineRule="auto"/>
+        <w:textAlignment w:val="baseline"/>
+        <w:rPr>
+          <w:rFonts w:ascii="Segoe UI" w:hAnsi="Segoe UI" w:cs="Segoe UI"/>
+          <w:b/>
+          <w:bCs/>
+          <w:sz w:val="20"/>
+          <w:szCs w:val="20"/>
+        </w:rPr>
+      </w:pPr>
+      <w:r>
+        <w:rPr>
+          <w:rFonts w:ascii="Segoe UI" w:hAnsi="Segoe UI" w:cs="Segoe UI"/>
+          <w:b/>
+          <w:bCs/>
+          <w:sz w:val="20"/>
+          <w:szCs w:val="20"/>
+        </w:rPr>
+        <w:t>HUFP-0</w:t>
+      </w:r>
+      <w:r>
+        <w:rPr>
+          <w:rFonts w:ascii="Segoe UI" w:hAnsi="Segoe UI" w:cs="Segoe UI"/>
+          <w:b/>
+          <w:bCs/>
+          <w:sz w:val="20"/>
+          <w:szCs w:val="20"/>
+        </w:rPr>
+        <w:t>30</w:t>
+      </w:r>
+      <w:r>
+        <w:rPr>
+          <w:rFonts w:ascii="Segoe UI" w:hAnsi="Segoe UI" w:cs="Segoe UI"/>
+          <w:b/>
+          <w:bCs/>
+          <w:sz w:val="20"/>
+          <w:szCs w:val="20"/>
+        </w:rPr>
+        <w:t xml:space="preserve">: Actualización de la información del empleado </w:t>
+      </w:r>
+    </w:p>
+    <w:p>
+      <w:pPr>
+        <w:pStyle w:val="paragraph"/>
+        <w:spacing w:before="0" w:beforeAutospacing="0" w:after="0" w:afterAutospacing="0" w:line="480" w:lineRule="auto"/>
+        <w:textAlignment w:val="baseline"/>
+        <w:rPr>
+          <w:rFonts w:ascii="Segoe UI" w:hAnsi="Segoe UI" w:cs="Segoe UI"/>
+          <w:sz w:val="18"/>
+          <w:szCs w:val="18"/>
+        </w:rPr>
+      </w:pPr>
+      <w:r>
+        <w:rPr>
+          <w:rFonts w:ascii="Segoe UI" w:hAnsi="Segoe UI" w:cs="Segoe UI"/>
+          <w:sz w:val="18"/>
+          <w:szCs w:val="18"/>
+        </w:rPr>
+        <w:t xml:space="preserve">Como: Gerente de departamento </w:t>
+      </w:r>
+    </w:p>
+    <w:p>
+      <w:pPr>
+        <w:pStyle w:val="paragraph"/>
+        <w:spacing w:before="0" w:beforeAutospacing="0" w:after="0" w:afterAutospacing="0" w:line="480" w:lineRule="auto"/>
+        <w:textAlignment w:val="baseline"/>
+        <w:rPr>
+          <w:rFonts w:ascii="Segoe UI" w:hAnsi="Segoe UI" w:cs="Segoe UI"/>
+          <w:sz w:val="18"/>
+          <w:szCs w:val="18"/>
+        </w:rPr>
+      </w:pPr>
+      <w:r>
+        <w:rPr>
+          <w:rFonts w:ascii="Segoe UI" w:hAnsi="Segoe UI" w:cs="Segoe UI"/>
+          <w:sz w:val="18"/>
+          <w:szCs w:val="18"/>
+        </w:rPr>
+        <w:lastRenderedPageBreak/>
+        <w:t xml:space="preserve">Quiero: Poder actualizar la información de los empleados (cargo, teléfono, correo) </w:t>
+      </w:r>
+    </w:p>
+    <w:p>
+      <w:pPr>
+        <w:pStyle w:val="paragraph"/>
+        <w:spacing w:before="0" w:beforeAutospacing="0" w:after="0" w:afterAutospacing="0" w:line="480" w:lineRule="auto"/>
+        <w:textAlignment w:val="baseline"/>
+        <w:rPr>
+          <w:rFonts w:ascii="Segoe UI" w:hAnsi="Segoe UI" w:cs="Segoe UI"/>
+          <w:sz w:val="18"/>
+          <w:szCs w:val="18"/>
+        </w:rPr>
+      </w:pPr>
+      <w:r>
+        <w:rPr>
+          <w:rFonts w:ascii="Segoe UI" w:hAnsi="Segoe UI" w:cs="Segoe UI"/>
+          <w:sz w:val="18"/>
+          <w:szCs w:val="18"/>
+        </w:rPr>
+        <w:t>Para: Asegurarme de que la base de datos siempre refleje la información más actual y optimizar la comunicación dentro del equipo.</w:t>
       </w:r>
     </w:p>
     <w:p>

</xml_diff>

<commit_message>
add: Se agrego historia de usuario HUCP-032 dentro del documento Peaceathome.docx en la rama cpatal-2024136
</commit_message>
<xml_diff>
--- a/Peaceathome.docx
+++ b/Peaceathome.docx
@@ -4846,38 +4846,132 @@
           <w:szCs w:val="20"/>
           <w:lang w:val="es-MX"/>
         </w:rPr>
-        <w:t>Quiero: Seleccionar una propiedad, elegir mis fechas de inicio y fin, y confirmar una rese</w:t>
-      </w:r>
+        <w:t>Quiero: Seleccionar una propiedad, elegir mis fechas de inicio y fin, y confirmar una reserva</w:t>
+      </w:r>
+    </w:p>
+    <w:p>
+      <w:pPr>
+        <w:spacing w:before="100" w:beforeAutospacing="1" w:after="100" w:afterAutospacing="1" w:line="240" w:lineRule="auto"/>
+        <w:rPr>
+          <w:rFonts w:ascii="Arial" w:eastAsiaTheme="minorHAnsi" w:hAnsi="Arial" w:cs="Arial"/>
+          <w:sz w:val="20"/>
+          <w:szCs w:val="20"/>
+          <w:lang w:val="es-MX"/>
+        </w:rPr>
+      </w:pPr>
+      <w:r>
+        <w:rPr>
+          <w:rFonts w:ascii="Arial" w:eastAsiaTheme="minorHAnsi" w:hAnsi="Arial" w:cs="Arial"/>
+          <w:sz w:val="20"/>
+          <w:szCs w:val="20"/>
+          <w:lang w:val="es-MX"/>
+        </w:rPr>
+        <w:t>Para: Asegurar mi estancia en la propiedad deseada.</w:t>
+      </w:r>
+    </w:p>
+    <w:p>
+      <w:pPr>
+        <w:spacing w:before="100" w:beforeAutospacing="1" w:after="100" w:afterAutospacing="1" w:line="240" w:lineRule="auto"/>
+        <w:rPr>
+          <w:rFonts w:ascii="Arial" w:eastAsiaTheme="minorHAnsi" w:hAnsi="Arial" w:cs="Arial"/>
+          <w:sz w:val="20"/>
+          <w:szCs w:val="20"/>
+          <w:lang w:val="es-MX"/>
+        </w:rPr>
+      </w:pPr>
+    </w:p>
+    <w:p>
+      <w:pPr>
+        <w:spacing w:before="100" w:beforeAutospacing="1" w:after="100" w:afterAutospacing="1" w:line="240" w:lineRule="auto"/>
+        <w:rPr>
+          <w:rFonts w:ascii="Arial" w:eastAsiaTheme="minorHAnsi" w:hAnsi="Arial" w:cs="Arial"/>
+          <w:b/>
+          <w:sz w:val="20"/>
+          <w:szCs w:val="20"/>
+          <w:lang w:val="es-MX"/>
+        </w:rPr>
+      </w:pPr>
       <w:bookmarkStart w:id="0" w:name="_GoBack"/>
-      <w:bookmarkEnd w:id="0"/>
-      <w:r>
-        <w:rPr>
-          <w:rFonts w:ascii="Arial" w:eastAsiaTheme="minorHAnsi" w:hAnsi="Arial" w:cs="Arial"/>
-          <w:sz w:val="20"/>
-          <w:szCs w:val="20"/>
-          <w:lang w:val="es-MX"/>
-        </w:rPr>
-        <w:t>rva</w:t>
-      </w:r>
-    </w:p>
-    <w:p>
-      <w:pPr>
-        <w:spacing w:before="100" w:beforeAutospacing="1" w:after="100" w:afterAutospacing="1" w:line="240" w:lineRule="auto"/>
-        <w:rPr>
-          <w:rFonts w:ascii="Arial" w:eastAsiaTheme="minorHAnsi" w:hAnsi="Arial" w:cs="Arial"/>
-          <w:sz w:val="20"/>
-          <w:szCs w:val="20"/>
-          <w:lang w:val="es-MX"/>
-        </w:rPr>
-      </w:pPr>
-      <w:r>
-        <w:rPr>
-          <w:rFonts w:ascii="Arial" w:eastAsiaTheme="minorHAnsi" w:hAnsi="Arial" w:cs="Arial"/>
-          <w:sz w:val="20"/>
-          <w:szCs w:val="20"/>
-          <w:lang w:val="es-MX"/>
-        </w:rPr>
-        <w:t>Para: Asegurar mi estancia en la propiedad deseada.</w:t>
+      <w:r>
+        <w:rPr>
+          <w:rFonts w:ascii="Arial" w:eastAsiaTheme="minorHAnsi" w:hAnsi="Arial" w:cs="Arial"/>
+          <w:b/>
+          <w:sz w:val="20"/>
+          <w:szCs w:val="20"/>
+          <w:lang w:val="es-MX"/>
+        </w:rPr>
+        <w:t>HUCP-03</w:t>
+      </w:r>
+      <w:r>
+        <w:rPr>
+          <w:rFonts w:ascii="Arial" w:eastAsiaTheme="minorHAnsi" w:hAnsi="Arial" w:cs="Arial"/>
+          <w:b/>
+          <w:sz w:val="20"/>
+          <w:szCs w:val="20"/>
+          <w:lang w:val="es-MX"/>
+        </w:rPr>
+        <w:t>2 Gestionar Mis Reservas</w:t>
+      </w:r>
+    </w:p>
+    <w:bookmarkEnd w:id="0"/>
+    <w:p>
+      <w:pPr>
+        <w:spacing w:before="100" w:beforeAutospacing="1" w:after="100" w:afterAutospacing="1" w:line="240" w:lineRule="auto"/>
+        <w:rPr>
+          <w:rFonts w:ascii="Arial" w:eastAsiaTheme="minorHAnsi" w:hAnsi="Arial" w:cs="Arial"/>
+          <w:sz w:val="20"/>
+          <w:szCs w:val="20"/>
+          <w:lang w:val="es-MX"/>
+        </w:rPr>
+      </w:pPr>
+      <w:r>
+        <w:rPr>
+          <w:rFonts w:ascii="Arial" w:eastAsiaTheme="minorHAnsi" w:hAnsi="Arial" w:cs="Arial"/>
+          <w:sz w:val="20"/>
+          <w:szCs w:val="20"/>
+          <w:lang w:val="es-MX"/>
+        </w:rPr>
+        <w:t>Como: Un invitado o un anfitrión</w:t>
+      </w:r>
+    </w:p>
+    <w:p>
+      <w:pPr>
+        <w:spacing w:before="100" w:beforeAutospacing="1" w:after="100" w:afterAutospacing="1" w:line="240" w:lineRule="auto"/>
+        <w:rPr>
+          <w:rFonts w:ascii="Arial" w:eastAsiaTheme="minorHAnsi" w:hAnsi="Arial" w:cs="Arial"/>
+          <w:sz w:val="20"/>
+          <w:szCs w:val="20"/>
+          <w:lang w:val="es-MX"/>
+        </w:rPr>
+      </w:pPr>
+      <w:r>
+        <w:rPr>
+          <w:rFonts w:ascii="Arial" w:eastAsiaTheme="minorHAnsi" w:hAnsi="Arial" w:cs="Arial"/>
+          <w:sz w:val="20"/>
+          <w:szCs w:val="20"/>
+          <w:lang w:val="es-MX"/>
+        </w:rPr>
+        <w:t>Quiero: Ver el estado de mis reservas (confirmado, cancelado, completado) y tener la opción de modificar o cancelar una reserva si es necesario</w:t>
+      </w:r>
+    </w:p>
+    <w:p>
+      <w:pPr>
+        <w:spacing w:before="100" w:beforeAutospacing="1" w:after="100" w:afterAutospacing="1" w:line="240" w:lineRule="auto"/>
+        <w:rPr>
+          <w:rFonts w:ascii="Arial" w:eastAsiaTheme="minorHAnsi" w:hAnsi="Arial" w:cs="Arial"/>
+          <w:sz w:val="20"/>
+          <w:szCs w:val="20"/>
+          <w:lang w:val="es-MX"/>
+        </w:rPr>
+      </w:pPr>
+      <w:r>
+        <w:rPr>
+          <w:rFonts w:ascii="Arial" w:eastAsiaTheme="minorHAnsi" w:hAnsi="Arial" w:cs="Arial"/>
+          <w:sz w:val="20"/>
+          <w:szCs w:val="20"/>
+          <w:lang w:val="es-MX"/>
+        </w:rPr>
+        <w:t>Para: Tener control y visibilidad sobre mis estancias o la ocupación de mi propiedad.</w:t>
       </w:r>
     </w:p>
     <w:p>

</xml_diff>

<commit_message>
add: Se agrego historia de usuario HUCP-033 dentro del documento Peaceathome.docx en la rama cpatal-2024136
</commit_message>
<xml_diff>
--- a/Peaceathome.docx
+++ b/Peaceathome.docx
@@ -4891,87 +4891,189 @@
           <w:lang w:val="es-MX"/>
         </w:rPr>
       </w:pPr>
+      <w:r>
+        <w:rPr>
+          <w:rFonts w:ascii="Arial" w:eastAsiaTheme="minorHAnsi" w:hAnsi="Arial" w:cs="Arial"/>
+          <w:b/>
+          <w:sz w:val="20"/>
+          <w:szCs w:val="20"/>
+          <w:lang w:val="es-MX"/>
+        </w:rPr>
+        <w:t>HUCP-03</w:t>
+      </w:r>
+      <w:r>
+        <w:rPr>
+          <w:rFonts w:ascii="Arial" w:eastAsiaTheme="minorHAnsi" w:hAnsi="Arial" w:cs="Arial"/>
+          <w:b/>
+          <w:sz w:val="20"/>
+          <w:szCs w:val="20"/>
+          <w:lang w:val="es-MX"/>
+        </w:rPr>
+        <w:t>2 Gestionar Mis Reservas</w:t>
+      </w:r>
+    </w:p>
+    <w:p>
+      <w:pPr>
+        <w:spacing w:before="100" w:beforeAutospacing="1" w:after="100" w:afterAutospacing="1" w:line="240" w:lineRule="auto"/>
+        <w:rPr>
+          <w:rFonts w:ascii="Arial" w:eastAsiaTheme="minorHAnsi" w:hAnsi="Arial" w:cs="Arial"/>
+          <w:sz w:val="20"/>
+          <w:szCs w:val="20"/>
+          <w:lang w:val="es-MX"/>
+        </w:rPr>
+      </w:pPr>
+      <w:r>
+        <w:rPr>
+          <w:rFonts w:ascii="Arial" w:eastAsiaTheme="minorHAnsi" w:hAnsi="Arial" w:cs="Arial"/>
+          <w:sz w:val="20"/>
+          <w:szCs w:val="20"/>
+          <w:lang w:val="es-MX"/>
+        </w:rPr>
+        <w:t>Como: Un invitado o un anfitrión</w:t>
+      </w:r>
+    </w:p>
+    <w:p>
+      <w:pPr>
+        <w:spacing w:before="100" w:beforeAutospacing="1" w:after="100" w:afterAutospacing="1" w:line="240" w:lineRule="auto"/>
+        <w:rPr>
+          <w:rFonts w:ascii="Arial" w:eastAsiaTheme="minorHAnsi" w:hAnsi="Arial" w:cs="Arial"/>
+          <w:sz w:val="20"/>
+          <w:szCs w:val="20"/>
+          <w:lang w:val="es-MX"/>
+        </w:rPr>
+      </w:pPr>
+      <w:r>
+        <w:rPr>
+          <w:rFonts w:ascii="Arial" w:eastAsiaTheme="minorHAnsi" w:hAnsi="Arial" w:cs="Arial"/>
+          <w:sz w:val="20"/>
+          <w:szCs w:val="20"/>
+          <w:lang w:val="es-MX"/>
+        </w:rPr>
+        <w:t>Quiero: Ver el estado de mis reservas (confirmado, cancelado, completado) y tener la opción de modificar o cancelar una reserva si es necesario</w:t>
+      </w:r>
+    </w:p>
+    <w:p>
+      <w:pPr>
+        <w:spacing w:before="100" w:beforeAutospacing="1" w:after="100" w:afterAutospacing="1" w:line="240" w:lineRule="auto"/>
+        <w:rPr>
+          <w:rFonts w:ascii="Arial" w:eastAsiaTheme="minorHAnsi" w:hAnsi="Arial" w:cs="Arial"/>
+          <w:sz w:val="20"/>
+          <w:szCs w:val="20"/>
+          <w:lang w:val="es-MX"/>
+        </w:rPr>
+      </w:pPr>
+      <w:r>
+        <w:rPr>
+          <w:rFonts w:ascii="Arial" w:eastAsiaTheme="minorHAnsi" w:hAnsi="Arial" w:cs="Arial"/>
+          <w:sz w:val="20"/>
+          <w:szCs w:val="20"/>
+          <w:lang w:val="es-MX"/>
+        </w:rPr>
+        <w:t>Para: Tener control y visibilidad sobre mis estancias o la ocupación de mi propiedad.</w:t>
+      </w:r>
+    </w:p>
+    <w:p>
+      <w:pPr>
+        <w:spacing w:before="100" w:beforeAutospacing="1" w:after="100" w:afterAutospacing="1" w:line="240" w:lineRule="auto"/>
+        <w:rPr>
+          <w:rFonts w:ascii="Arial" w:eastAsiaTheme="minorHAnsi" w:hAnsi="Arial" w:cs="Arial"/>
+          <w:sz w:val="20"/>
+          <w:szCs w:val="20"/>
+          <w:lang w:val="es-MX"/>
+        </w:rPr>
+      </w:pPr>
+    </w:p>
+    <w:p>
+      <w:pPr>
+        <w:spacing w:before="100" w:beforeAutospacing="1" w:after="100" w:afterAutospacing="1" w:line="240" w:lineRule="auto"/>
+        <w:rPr>
+          <w:rFonts w:ascii="Arial" w:eastAsiaTheme="minorHAnsi" w:hAnsi="Arial" w:cs="Arial"/>
+          <w:b/>
+          <w:sz w:val="20"/>
+          <w:szCs w:val="20"/>
+          <w:lang w:val="es-MX"/>
+        </w:rPr>
+      </w:pPr>
+      <w:r>
+        <w:rPr>
+          <w:rFonts w:ascii="Arial" w:eastAsiaTheme="minorHAnsi" w:hAnsi="Arial" w:cs="Arial"/>
+          <w:b/>
+          <w:sz w:val="20"/>
+          <w:szCs w:val="20"/>
+          <w:lang w:val="es-MX"/>
+        </w:rPr>
+        <w:t>HUCP-003 Consultar Disponibilidad y Precios de Propiedades</w:t>
+      </w:r>
+    </w:p>
+    <w:p>
+      <w:pPr>
+        <w:spacing w:before="100" w:beforeAutospacing="1" w:after="100" w:afterAutospacing="1" w:line="240" w:lineRule="auto"/>
+        <w:rPr>
+          <w:rFonts w:ascii="Arial" w:eastAsiaTheme="minorHAnsi" w:hAnsi="Arial" w:cs="Arial"/>
+          <w:sz w:val="20"/>
+          <w:szCs w:val="20"/>
+          <w:lang w:val="es-MX"/>
+        </w:rPr>
+      </w:pPr>
+      <w:r>
+        <w:rPr>
+          <w:rFonts w:ascii="Arial" w:eastAsiaTheme="minorHAnsi" w:hAnsi="Arial" w:cs="Arial"/>
+          <w:sz w:val="20"/>
+          <w:szCs w:val="20"/>
+          <w:lang w:val="es-MX"/>
+        </w:rPr>
+        <w:t>Como: Un invitado</w:t>
+      </w:r>
+    </w:p>
+    <w:p>
+      <w:pPr>
+        <w:spacing w:before="100" w:beforeAutospacing="1" w:after="100" w:afterAutospacing="1" w:line="240" w:lineRule="auto"/>
+        <w:rPr>
+          <w:rFonts w:ascii="Arial" w:eastAsiaTheme="minorHAnsi" w:hAnsi="Arial" w:cs="Arial"/>
+          <w:sz w:val="20"/>
+          <w:szCs w:val="20"/>
+          <w:lang w:val="es-MX"/>
+        </w:rPr>
+      </w:pPr>
+      <w:r>
+        <w:rPr>
+          <w:rFonts w:ascii="Arial" w:eastAsiaTheme="minorHAnsi" w:hAnsi="Arial" w:cs="Arial"/>
+          <w:sz w:val="20"/>
+          <w:szCs w:val="20"/>
+          <w:lang w:val="es-MX"/>
+        </w:rPr>
+        <w:t>Quiero: Buscar propiedades y ver su precio por día y disponibilidad en un rango de fechas</w:t>
+      </w:r>
+    </w:p>
+    <w:p>
+      <w:pPr>
+        <w:spacing w:before="100" w:beforeAutospacing="1" w:after="100" w:afterAutospacing="1" w:line="240" w:lineRule="auto"/>
+        <w:rPr>
+          <w:rFonts w:ascii="Arial" w:eastAsiaTheme="minorHAnsi" w:hAnsi="Arial" w:cs="Arial"/>
+          <w:sz w:val="20"/>
+          <w:szCs w:val="20"/>
+          <w:lang w:val="es-MX"/>
+        </w:rPr>
+      </w:pPr>
+      <w:r>
+        <w:rPr>
+          <w:rFonts w:ascii="Arial" w:eastAsiaTheme="minorHAnsi" w:hAnsi="Arial" w:cs="Arial"/>
+          <w:sz w:val="20"/>
+          <w:szCs w:val="20"/>
+          <w:lang w:val="es-MX"/>
+        </w:rPr>
+        <w:t>Para: Encontrar la propiedad que mejor se adapte a mis necesidades y p</w:t>
+      </w:r>
       <w:bookmarkStart w:id="0" w:name="_GoBack"/>
-      <w:r>
-        <w:rPr>
-          <w:rFonts w:ascii="Arial" w:eastAsiaTheme="minorHAnsi" w:hAnsi="Arial" w:cs="Arial"/>
-          <w:b/>
-          <w:sz w:val="20"/>
-          <w:szCs w:val="20"/>
-          <w:lang w:val="es-MX"/>
-        </w:rPr>
-        <w:t>HUCP-03</w:t>
-      </w:r>
-      <w:r>
-        <w:rPr>
-          <w:rFonts w:ascii="Arial" w:eastAsiaTheme="minorHAnsi" w:hAnsi="Arial" w:cs="Arial"/>
-          <w:b/>
-          <w:sz w:val="20"/>
-          <w:szCs w:val="20"/>
-          <w:lang w:val="es-MX"/>
-        </w:rPr>
-        <w:t>2 Gestionar Mis Reservas</w:t>
-      </w:r>
-    </w:p>
-    <w:bookmarkEnd w:id="0"/>
-    <w:p>
-      <w:pPr>
-        <w:spacing w:before="100" w:beforeAutospacing="1" w:after="100" w:afterAutospacing="1" w:line="240" w:lineRule="auto"/>
-        <w:rPr>
-          <w:rFonts w:ascii="Arial" w:eastAsiaTheme="minorHAnsi" w:hAnsi="Arial" w:cs="Arial"/>
-          <w:sz w:val="20"/>
-          <w:szCs w:val="20"/>
-          <w:lang w:val="es-MX"/>
-        </w:rPr>
-      </w:pPr>
-      <w:r>
-        <w:rPr>
-          <w:rFonts w:ascii="Arial" w:eastAsiaTheme="minorHAnsi" w:hAnsi="Arial" w:cs="Arial"/>
-          <w:sz w:val="20"/>
-          <w:szCs w:val="20"/>
-          <w:lang w:val="es-MX"/>
-        </w:rPr>
-        <w:t>Como: Un invitado o un anfitrión</w:t>
-      </w:r>
-    </w:p>
-    <w:p>
-      <w:pPr>
-        <w:spacing w:before="100" w:beforeAutospacing="1" w:after="100" w:afterAutospacing="1" w:line="240" w:lineRule="auto"/>
-        <w:rPr>
-          <w:rFonts w:ascii="Arial" w:eastAsiaTheme="minorHAnsi" w:hAnsi="Arial" w:cs="Arial"/>
-          <w:sz w:val="20"/>
-          <w:szCs w:val="20"/>
-          <w:lang w:val="es-MX"/>
-        </w:rPr>
-      </w:pPr>
-      <w:r>
-        <w:rPr>
-          <w:rFonts w:ascii="Arial" w:eastAsiaTheme="minorHAnsi" w:hAnsi="Arial" w:cs="Arial"/>
-          <w:sz w:val="20"/>
-          <w:szCs w:val="20"/>
-          <w:lang w:val="es-MX"/>
-        </w:rPr>
-        <w:t>Quiero: Ver el estado de mis reservas (confirmado, cancelado, completado) y tener la opción de modificar o cancelar una reserva si es necesario</w:t>
-      </w:r>
-    </w:p>
-    <w:p>
-      <w:pPr>
-        <w:spacing w:before="100" w:beforeAutospacing="1" w:after="100" w:afterAutospacing="1" w:line="240" w:lineRule="auto"/>
-        <w:rPr>
-          <w:rFonts w:ascii="Arial" w:eastAsiaTheme="minorHAnsi" w:hAnsi="Arial" w:cs="Arial"/>
-          <w:sz w:val="20"/>
-          <w:szCs w:val="20"/>
-          <w:lang w:val="es-MX"/>
-        </w:rPr>
-      </w:pPr>
-      <w:r>
-        <w:rPr>
-          <w:rFonts w:ascii="Arial" w:eastAsiaTheme="minorHAnsi" w:hAnsi="Arial" w:cs="Arial"/>
-          <w:sz w:val="20"/>
-          <w:szCs w:val="20"/>
-          <w:lang w:val="es-MX"/>
-        </w:rPr>
-        <w:t>Para: Tener control y visibilidad sobre mis estancias o la ocupación de mi propiedad.</w:t>
+      <w:bookmarkEnd w:id="0"/>
+      <w:r>
+        <w:rPr>
+          <w:rFonts w:ascii="Arial" w:eastAsiaTheme="minorHAnsi" w:hAnsi="Arial" w:cs="Arial"/>
+          <w:sz w:val="20"/>
+          <w:szCs w:val="20"/>
+          <w:lang w:val="es-MX"/>
+        </w:rPr>
+        <w:t>resupuesto para mis fechas de viaje</w:t>
       </w:r>
     </w:p>
     <w:p>

</xml_diff>

<commit_message>
add: Se agrego modelo de entidades al documento Peaceathome.docx en la rama jcuc-2024100
</commit_message>
<xml_diff>
--- a/Peaceathome.docx
+++ b/Peaceathome.docx
@@ -16,10 +16,10 @@
           <w:rFonts w:ascii="Arial" w:hAnsi="Arial" w:cs="Arial"/>
           <w:b/>
           <w:noProof/>
-          <w:lang w:eastAsia="es-GT"/>
+          <w:lang w:val="es-MX" w:eastAsia="es-MX"/>
         </w:rPr>
         <w:drawing>
-          <wp:inline distT="0" distB="0" distL="0" distR="0" wp14:anchorId="2FEE8166" wp14:editId="6BE70031">
+          <wp:inline distT="0" distB="0" distL="0" distR="0" wp14:anchorId="5959B8BE" wp14:editId="62113B58">
             <wp:extent cx="2248535" cy="847725"/>
             <wp:effectExtent l="0" t="0" r="0" b="0"/>
             <wp:docPr id="2" name="Imagen 2"/>
@@ -273,7 +273,6 @@
           <w:rFonts w:ascii="Arial" w:hAnsi="Arial" w:cs="Arial"/>
         </w:rPr>
       </w:pPr>
-      <w:proofErr w:type="spellStart"/>
       <w:r>
         <w:rPr>
           <w:rStyle w:val="oypena"/>
@@ -281,17 +280,7 @@
           <w:color w:val="000000"/>
           <w:sz w:val="40"/>
         </w:rPr>
-        <w:t>Peace</w:t>
-      </w:r>
-      <w:proofErr w:type="spellEnd"/>
-      <w:r>
-        <w:rPr>
-          <w:rStyle w:val="oypena"/>
-          <w:rFonts w:ascii="Arial" w:hAnsi="Arial" w:cs="Arial"/>
-          <w:color w:val="000000"/>
-          <w:sz w:val="40"/>
-        </w:rPr>
-        <w:t xml:space="preserve"> at home</w:t>
+        <w:t>Peace at home</w:t>
       </w:r>
     </w:p>
     <w:p>
@@ -679,52 +668,14 @@
                 <w:lang w:val="es-ES"/>
               </w:rPr>
             </w:pPr>
-            <w:proofErr w:type="spellStart"/>
             <w:r>
               <w:rPr>
                 <w:rFonts w:ascii="Arial" w:eastAsiaTheme="minorHAnsi" w:hAnsi="Arial" w:cs="Arial"/>
                 <w:sz w:val="24"/>
                 <w:lang w:val="es-ES"/>
               </w:rPr>
-              <w:t>Kenet</w:t>
+              <w:t>Kenet Efraín Cuyuch Joj</w:t>
             </w:r>
-            <w:proofErr w:type="spellEnd"/>
-            <w:r>
-              <w:rPr>
-                <w:rFonts w:ascii="Arial" w:eastAsiaTheme="minorHAnsi" w:hAnsi="Arial" w:cs="Arial"/>
-                <w:sz w:val="24"/>
-                <w:lang w:val="es-ES"/>
-              </w:rPr>
-              <w:t xml:space="preserve"> Efraín </w:t>
-            </w:r>
-            <w:proofErr w:type="spellStart"/>
-            <w:r>
-              <w:rPr>
-                <w:rFonts w:ascii="Arial" w:eastAsiaTheme="minorHAnsi" w:hAnsi="Arial" w:cs="Arial"/>
-                <w:sz w:val="24"/>
-                <w:lang w:val="es-ES"/>
-              </w:rPr>
-              <w:t>Cuyuch</w:t>
-            </w:r>
-            <w:proofErr w:type="spellEnd"/>
-            <w:r>
-              <w:rPr>
-                <w:rFonts w:ascii="Arial" w:eastAsiaTheme="minorHAnsi" w:hAnsi="Arial" w:cs="Arial"/>
-                <w:sz w:val="24"/>
-                <w:lang w:val="es-ES"/>
-              </w:rPr>
-              <w:t xml:space="preserve"> </w:t>
-            </w:r>
-            <w:proofErr w:type="spellStart"/>
-            <w:r>
-              <w:rPr>
-                <w:rFonts w:ascii="Arial" w:eastAsiaTheme="minorHAnsi" w:hAnsi="Arial" w:cs="Arial"/>
-                <w:sz w:val="24"/>
-                <w:lang w:val="es-ES"/>
-              </w:rPr>
-              <w:t>Joj</w:t>
-            </w:r>
-            <w:proofErr w:type="spellEnd"/>
           </w:p>
         </w:tc>
         <w:tc>
@@ -764,37 +715,12 @@
                 <w:sz w:val="24"/>
               </w:rPr>
             </w:pPr>
-            <w:proofErr w:type="spellStart"/>
             <w:r>
               <w:rPr>
                 <w:rFonts w:ascii="Arial" w:eastAsiaTheme="minorHAnsi" w:hAnsi="Arial" w:cs="Arial"/>
                 <w:sz w:val="24"/>
               </w:rPr>
-              <w:t>Angel</w:t>
-            </w:r>
-            <w:proofErr w:type="spellEnd"/>
-            <w:r>
-              <w:rPr>
-                <w:rFonts w:ascii="Arial" w:eastAsiaTheme="minorHAnsi" w:hAnsi="Arial" w:cs="Arial"/>
-                <w:sz w:val="24"/>
-              </w:rPr>
-              <w:t xml:space="preserve"> </w:t>
-            </w:r>
-            <w:proofErr w:type="spellStart"/>
-            <w:r>
-              <w:rPr>
-                <w:rFonts w:ascii="Arial" w:eastAsiaTheme="minorHAnsi" w:hAnsi="Arial" w:cs="Arial"/>
-                <w:sz w:val="24"/>
-              </w:rPr>
-              <w:t>Gahel</w:t>
-            </w:r>
-            <w:proofErr w:type="spellEnd"/>
-            <w:r>
-              <w:rPr>
-                <w:rFonts w:ascii="Arial" w:eastAsiaTheme="minorHAnsi" w:hAnsi="Arial" w:cs="Arial"/>
-                <w:sz w:val="24"/>
-              </w:rPr>
-              <w:t xml:space="preserve"> Padilla Pacheco</w:t>
+              <w:t>Angel Gahel Padilla Pacheco</w:t>
             </w:r>
           </w:p>
         </w:tc>
@@ -836,47 +762,13 @@
                 <w:sz w:val="24"/>
               </w:rPr>
             </w:pPr>
-            <w:proofErr w:type="spellStart"/>
             <w:r>
               <w:rPr>
                 <w:rFonts w:ascii="Arial" w:eastAsiaTheme="minorHAnsi" w:hAnsi="Arial" w:cs="Arial"/>
                 <w:sz w:val="24"/>
               </w:rPr>
-              <w:t>Jose</w:t>
+              <w:t>Jose Enrique cuc cutz</w:t>
             </w:r>
-            <w:proofErr w:type="spellEnd"/>
-            <w:r>
-              <w:rPr>
-                <w:rFonts w:ascii="Arial" w:eastAsiaTheme="minorHAnsi" w:hAnsi="Arial" w:cs="Arial"/>
-                <w:sz w:val="24"/>
-              </w:rPr>
-              <w:t xml:space="preserve"> Enrique </w:t>
-            </w:r>
-            <w:proofErr w:type="spellStart"/>
-            <w:r>
-              <w:rPr>
-                <w:rFonts w:ascii="Arial" w:eastAsiaTheme="minorHAnsi" w:hAnsi="Arial" w:cs="Arial"/>
-                <w:sz w:val="24"/>
-              </w:rPr>
-              <w:t>cuc</w:t>
-            </w:r>
-            <w:proofErr w:type="spellEnd"/>
-            <w:r>
-              <w:rPr>
-                <w:rFonts w:ascii="Arial" w:eastAsiaTheme="minorHAnsi" w:hAnsi="Arial" w:cs="Arial"/>
-                <w:sz w:val="24"/>
-              </w:rPr>
-              <w:t xml:space="preserve"> </w:t>
-            </w:r>
-            <w:proofErr w:type="spellStart"/>
-            <w:r>
-              <w:rPr>
-                <w:rFonts w:ascii="Arial" w:eastAsiaTheme="minorHAnsi" w:hAnsi="Arial" w:cs="Arial"/>
-                <w:sz w:val="24"/>
-              </w:rPr>
-              <w:t>cutz</w:t>
-            </w:r>
-            <w:proofErr w:type="spellEnd"/>
           </w:p>
         </w:tc>
         <w:tc>
@@ -917,52 +809,14 @@
                 <w:szCs w:val="24"/>
               </w:rPr>
             </w:pPr>
-            <w:proofErr w:type="spellStart"/>
             <w:r>
               <w:rPr>
                 <w:rFonts w:ascii="Arial" w:eastAsiaTheme="minorEastAsia" w:hAnsi="Arial" w:cs="Arial"/>
                 <w:sz w:val="24"/>
                 <w:szCs w:val="24"/>
               </w:rPr>
-              <w:t>Jeferson</w:t>
+              <w:t>Jeferson Andre Cano Lopez</w:t>
             </w:r>
-            <w:proofErr w:type="spellEnd"/>
-            <w:r>
-              <w:rPr>
-                <w:rFonts w:ascii="Arial" w:eastAsiaTheme="minorEastAsia" w:hAnsi="Arial" w:cs="Arial"/>
-                <w:sz w:val="24"/>
-                <w:szCs w:val="24"/>
-              </w:rPr>
-              <w:t xml:space="preserve"> </w:t>
-            </w:r>
-            <w:proofErr w:type="spellStart"/>
-            <w:r>
-              <w:rPr>
-                <w:rFonts w:ascii="Arial" w:eastAsiaTheme="minorEastAsia" w:hAnsi="Arial" w:cs="Arial"/>
-                <w:sz w:val="24"/>
-                <w:szCs w:val="24"/>
-              </w:rPr>
-              <w:t>Andre</w:t>
-            </w:r>
-            <w:proofErr w:type="spellEnd"/>
-            <w:r>
-              <w:rPr>
-                <w:rFonts w:ascii="Arial" w:eastAsiaTheme="minorEastAsia" w:hAnsi="Arial" w:cs="Arial"/>
-                <w:sz w:val="24"/>
-                <w:szCs w:val="24"/>
-              </w:rPr>
-              <w:t xml:space="preserve"> Cano </w:t>
-            </w:r>
-            <w:proofErr w:type="spellStart"/>
-            <w:r>
-              <w:rPr>
-                <w:rFonts w:ascii="Arial" w:eastAsiaTheme="minorEastAsia" w:hAnsi="Arial" w:cs="Arial"/>
-                <w:sz w:val="24"/>
-                <w:szCs w:val="24"/>
-              </w:rPr>
-              <w:t>Lopez</w:t>
-            </w:r>
-            <w:proofErr w:type="spellEnd"/>
           </w:p>
         </w:tc>
         <w:tc>
@@ -1055,78 +909,7 @@
                 <w:rFonts w:ascii="Arial" w:eastAsiaTheme="minorHAnsi" w:hAnsi="Arial" w:cs="Arial"/>
                 <w:sz w:val="24"/>
               </w:rPr>
-              <w:t xml:space="preserve">Ricardo Alejandro Hernández </w:t>
-            </w:r>
-            <w:proofErr w:type="spellStart"/>
-            <w:r>
-              <w:rPr>
-                <w:rFonts w:ascii="Arial" w:eastAsiaTheme="minorHAnsi" w:hAnsi="Arial" w:cs="Arial"/>
-                <w:sz w:val="24"/>
-              </w:rPr>
-              <w:t>Hernández</w:t>
-            </w:r>
-            <w:proofErr w:type="spellEnd"/>
-          </w:p>
-        </w:tc>
-        <w:tc>
-          <w:tcPr>
-            <w:tcW w:w="5395" w:type="dxa"/>
-          </w:tcPr>
-          <w:p>
-            <w:pPr>
-              <w:spacing w:after="0" w:line="240" w:lineRule="auto"/>
-              <w:jc w:val="center"/>
-              <w:rPr>
-                <w:rFonts w:ascii="Arial" w:eastAsiaTheme="minorHAnsi" w:hAnsi="Arial" w:cs="Arial"/>
-                <w:sz w:val="24"/>
-              </w:rPr>
-            </w:pPr>
-            <w:r>
-              <w:rPr>
-                <w:rFonts w:ascii="Arial" w:eastAsiaTheme="minorHAnsi" w:hAnsi="Arial" w:cs="Arial"/>
-                <w:sz w:val="24"/>
-              </w:rPr>
-              <w:t>Programador</w:t>
-            </w:r>
-          </w:p>
-        </w:tc>
-      </w:tr>
-      <w:tr>
-        <w:tc>
-          <w:tcPr>
-            <w:tcW w:w="5395" w:type="dxa"/>
-          </w:tcPr>
-          <w:p>
-            <w:pPr>
-              <w:spacing w:after="0" w:line="240" w:lineRule="auto"/>
-              <w:jc w:val="center"/>
-              <w:rPr>
-                <w:rFonts w:ascii="Arial" w:eastAsiaTheme="minorHAnsi" w:hAnsi="Arial" w:cs="Arial"/>
-                <w:sz w:val="24"/>
-              </w:rPr>
-            </w:pPr>
-            <w:r>
-              <w:rPr>
-                <w:rFonts w:ascii="Arial" w:eastAsiaTheme="minorHAnsi" w:hAnsi="Arial" w:cs="Arial"/>
-                <w:sz w:val="24"/>
-              </w:rPr>
-              <w:t xml:space="preserve">Osman </w:t>
-            </w:r>
-            <w:proofErr w:type="spellStart"/>
-            <w:r>
-              <w:rPr>
-                <w:rFonts w:ascii="Arial" w:eastAsiaTheme="minorHAnsi" w:hAnsi="Arial" w:cs="Arial"/>
-                <w:sz w:val="24"/>
-              </w:rPr>
-              <w:t>Emmanuell</w:t>
-            </w:r>
-            <w:proofErr w:type="spellEnd"/>
-            <w:r>
-              <w:rPr>
-                <w:rFonts w:ascii="Arial" w:eastAsiaTheme="minorHAnsi" w:hAnsi="Arial" w:cs="Arial"/>
-                <w:sz w:val="24"/>
-              </w:rPr>
-              <w:t xml:space="preserve"> Veliz Guzmán</w:t>
+              <w:t>Ricardo Alejandro Hernández Hernández</w:t>
             </w:r>
           </w:p>
         </w:tc>
@@ -1172,157 +955,8 @@
                 <w:rFonts w:ascii="Arial" w:eastAsiaTheme="minorHAnsi" w:hAnsi="Arial" w:cs="Arial"/>
                 <w:sz w:val="24"/>
               </w:rPr>
-              <w:t xml:space="preserve">Franklin </w:t>
+              <w:t>Osman Emmanuell Veliz Guzmán</w:t>
             </w:r>
-            <w:proofErr w:type="spellStart"/>
-            <w:r>
-              <w:rPr>
-                <w:rFonts w:ascii="Arial" w:eastAsiaTheme="minorHAnsi" w:hAnsi="Arial" w:cs="Arial"/>
-                <w:sz w:val="24"/>
-              </w:rPr>
-              <w:t>Stev</w:t>
-            </w:r>
-            <w:proofErr w:type="spellEnd"/>
-            <w:r>
-              <w:rPr>
-                <w:rFonts w:ascii="Arial" w:eastAsiaTheme="minorHAnsi" w:hAnsi="Arial" w:cs="Arial"/>
-                <w:sz w:val="24"/>
-              </w:rPr>
-              <w:t xml:space="preserve"> Paiz </w:t>
-            </w:r>
-            <w:proofErr w:type="spellStart"/>
-            <w:r>
-              <w:rPr>
-                <w:rFonts w:ascii="Arial" w:eastAsiaTheme="minorHAnsi" w:hAnsi="Arial" w:cs="Arial"/>
-                <w:sz w:val="24"/>
-              </w:rPr>
-              <w:t>Chavez</w:t>
-            </w:r>
-            <w:proofErr w:type="spellEnd"/>
-          </w:p>
-        </w:tc>
-        <w:tc>
-          <w:tcPr>
-            <w:tcW w:w="5395" w:type="dxa"/>
-          </w:tcPr>
-          <w:p>
-            <w:pPr>
-              <w:spacing w:after="0" w:line="240" w:lineRule="auto"/>
-              <w:jc w:val="center"/>
-              <w:rPr>
-                <w:rFonts w:ascii="Arial" w:eastAsiaTheme="minorHAnsi" w:hAnsi="Arial" w:cs="Arial"/>
-                <w:sz w:val="24"/>
-              </w:rPr>
-            </w:pPr>
-            <w:r>
-              <w:rPr>
-                <w:rFonts w:ascii="Arial" w:eastAsiaTheme="minorHAnsi" w:hAnsi="Arial" w:cs="Arial"/>
-                <w:sz w:val="24"/>
-              </w:rPr>
-              <w:t>Programador</w:t>
-            </w:r>
-          </w:p>
-        </w:tc>
-      </w:tr>
-      <w:tr>
-        <w:tc>
-          <w:tcPr>
-            <w:tcW w:w="5395" w:type="dxa"/>
-          </w:tcPr>
-          <w:p>
-            <w:pPr>
-              <w:spacing w:after="0" w:line="240" w:lineRule="auto"/>
-              <w:jc w:val="center"/>
-              <w:rPr>
-                <w:rFonts w:ascii="Arial" w:eastAsiaTheme="minorEastAsia" w:hAnsi="Arial" w:cs="Arial"/>
-                <w:sz w:val="24"/>
-                <w:szCs w:val="24"/>
-              </w:rPr>
-            </w:pPr>
-            <w:proofErr w:type="spellStart"/>
-            <w:r>
-              <w:rPr>
-                <w:rFonts w:ascii="Arial" w:eastAsiaTheme="minorEastAsia" w:hAnsi="Arial" w:cs="Arial"/>
-                <w:sz w:val="24"/>
-                <w:szCs w:val="24"/>
-              </w:rPr>
-              <w:t>Angel</w:t>
-            </w:r>
-            <w:proofErr w:type="spellEnd"/>
-            <w:r>
-              <w:rPr>
-                <w:rFonts w:ascii="Arial" w:eastAsiaTheme="minorEastAsia" w:hAnsi="Arial" w:cs="Arial"/>
-                <w:sz w:val="24"/>
-                <w:szCs w:val="24"/>
-              </w:rPr>
-              <w:t xml:space="preserve"> Gabriel Ernesto Grijalva Castro</w:t>
-            </w:r>
-          </w:p>
-        </w:tc>
-        <w:tc>
-          <w:tcPr>
-            <w:tcW w:w="5395" w:type="dxa"/>
-          </w:tcPr>
-          <w:p>
-            <w:pPr>
-              <w:spacing w:after="0" w:line="240" w:lineRule="auto"/>
-              <w:jc w:val="center"/>
-              <w:rPr>
-                <w:rFonts w:ascii="Arial" w:eastAsiaTheme="minorEastAsia" w:hAnsi="Arial" w:cs="Arial"/>
-                <w:sz w:val="24"/>
-                <w:szCs w:val="24"/>
-              </w:rPr>
-            </w:pPr>
-            <w:r>
-              <w:rPr>
-                <w:rFonts w:ascii="Arial" w:eastAsiaTheme="minorEastAsia" w:hAnsi="Arial" w:cs="Arial"/>
-                <w:sz w:val="24"/>
-                <w:szCs w:val="24"/>
-              </w:rPr>
-              <w:t>Programador</w:t>
-            </w:r>
-          </w:p>
-        </w:tc>
-      </w:tr>
-      <w:tr>
-        <w:tc>
-          <w:tcPr>
-            <w:tcW w:w="5395" w:type="dxa"/>
-          </w:tcPr>
-          <w:p>
-            <w:pPr>
-              <w:spacing w:after="0" w:line="240" w:lineRule="auto"/>
-              <w:jc w:val="center"/>
-              <w:rPr>
-                <w:rFonts w:ascii="Arial" w:eastAsiaTheme="minorHAnsi" w:hAnsi="Arial" w:cs="Arial"/>
-                <w:sz w:val="24"/>
-              </w:rPr>
-            </w:pPr>
-            <w:proofErr w:type="spellStart"/>
-            <w:r>
-              <w:rPr>
-                <w:rFonts w:ascii="Arial" w:eastAsiaTheme="minorHAnsi" w:hAnsi="Arial" w:cs="Arial"/>
-                <w:sz w:val="24"/>
-              </w:rPr>
-              <w:t>Benjamin</w:t>
-            </w:r>
-            <w:proofErr w:type="spellEnd"/>
-            <w:r>
-              <w:rPr>
-                <w:rFonts w:ascii="Arial" w:eastAsiaTheme="minorHAnsi" w:hAnsi="Arial" w:cs="Arial"/>
-                <w:sz w:val="24"/>
-              </w:rPr>
-              <w:t xml:space="preserve"> Elí Argueta </w:t>
-            </w:r>
-            <w:proofErr w:type="spellStart"/>
-            <w:r>
-              <w:rPr>
-                <w:rFonts w:ascii="Arial" w:eastAsiaTheme="minorHAnsi" w:hAnsi="Arial" w:cs="Arial"/>
-                <w:sz w:val="24"/>
-              </w:rPr>
-              <w:t>Caal</w:t>
-            </w:r>
-            <w:proofErr w:type="spellEnd"/>
           </w:p>
         </w:tc>
         <w:tc>
@@ -1367,33 +1001,150 @@
                 <w:rFonts w:ascii="Arial" w:eastAsiaTheme="minorHAnsi" w:hAnsi="Arial" w:cs="Arial"/>
                 <w:sz w:val="24"/>
               </w:rPr>
-              <w:t xml:space="preserve">Carlos Alejandro </w:t>
+              <w:t>Franklin Stev Paiz Chavez</w:t>
             </w:r>
-            <w:proofErr w:type="spellStart"/>
+          </w:p>
+        </w:tc>
+        <w:tc>
+          <w:tcPr>
+            <w:tcW w:w="5395" w:type="dxa"/>
+          </w:tcPr>
+          <w:p>
+            <w:pPr>
+              <w:spacing w:after="0" w:line="240" w:lineRule="auto"/>
+              <w:jc w:val="center"/>
+              <w:rPr>
+                <w:rFonts w:ascii="Arial" w:eastAsiaTheme="minorHAnsi" w:hAnsi="Arial" w:cs="Arial"/>
+                <w:sz w:val="24"/>
+              </w:rPr>
+            </w:pPr>
             <w:r>
               <w:rPr>
                 <w:rFonts w:ascii="Arial" w:eastAsiaTheme="minorHAnsi" w:hAnsi="Arial" w:cs="Arial"/>
                 <w:sz w:val="24"/>
               </w:rPr>
-              <w:t>Patal</w:t>
+              <w:t>Programador</w:t>
             </w:r>
-            <w:proofErr w:type="spellEnd"/>
+          </w:p>
+        </w:tc>
+      </w:tr>
+      <w:tr>
+        <w:tc>
+          <w:tcPr>
+            <w:tcW w:w="5395" w:type="dxa"/>
+          </w:tcPr>
+          <w:p>
+            <w:pPr>
+              <w:spacing w:after="0" w:line="240" w:lineRule="auto"/>
+              <w:jc w:val="center"/>
+              <w:rPr>
+                <w:rFonts w:ascii="Arial" w:eastAsiaTheme="minorEastAsia" w:hAnsi="Arial" w:cs="Arial"/>
+                <w:sz w:val="24"/>
+                <w:szCs w:val="24"/>
+              </w:rPr>
+            </w:pPr>
+            <w:r>
+              <w:rPr>
+                <w:rFonts w:ascii="Arial" w:eastAsiaTheme="minorEastAsia" w:hAnsi="Arial" w:cs="Arial"/>
+                <w:sz w:val="24"/>
+                <w:szCs w:val="24"/>
+              </w:rPr>
+              <w:t>Angel Gabriel Ernesto Grijalva Castro</w:t>
+            </w:r>
+          </w:p>
+        </w:tc>
+        <w:tc>
+          <w:tcPr>
+            <w:tcW w:w="5395" w:type="dxa"/>
+          </w:tcPr>
+          <w:p>
+            <w:pPr>
+              <w:spacing w:after="0" w:line="240" w:lineRule="auto"/>
+              <w:jc w:val="center"/>
+              <w:rPr>
+                <w:rFonts w:ascii="Arial" w:eastAsiaTheme="minorEastAsia" w:hAnsi="Arial" w:cs="Arial"/>
+                <w:sz w:val="24"/>
+                <w:szCs w:val="24"/>
+              </w:rPr>
+            </w:pPr>
+            <w:r>
+              <w:rPr>
+                <w:rFonts w:ascii="Arial" w:eastAsiaTheme="minorEastAsia" w:hAnsi="Arial" w:cs="Arial"/>
+                <w:sz w:val="24"/>
+                <w:szCs w:val="24"/>
+              </w:rPr>
+              <w:t>Programador</w:t>
+            </w:r>
+          </w:p>
+        </w:tc>
+      </w:tr>
+      <w:tr>
+        <w:tc>
+          <w:tcPr>
+            <w:tcW w:w="5395" w:type="dxa"/>
+          </w:tcPr>
+          <w:p>
+            <w:pPr>
+              <w:spacing w:after="0" w:line="240" w:lineRule="auto"/>
+              <w:jc w:val="center"/>
+              <w:rPr>
+                <w:rFonts w:ascii="Arial" w:eastAsiaTheme="minorHAnsi" w:hAnsi="Arial" w:cs="Arial"/>
+                <w:sz w:val="24"/>
+              </w:rPr>
+            </w:pPr>
             <w:r>
               <w:rPr>
                 <w:rFonts w:ascii="Arial" w:eastAsiaTheme="minorHAnsi" w:hAnsi="Arial" w:cs="Arial"/>
                 <w:sz w:val="24"/>
               </w:rPr>
-              <w:t xml:space="preserve"> </w:t>
+              <w:t>Benjamin Elí Argueta Caal</w:t>
             </w:r>
-            <w:proofErr w:type="spellStart"/>
+          </w:p>
+        </w:tc>
+        <w:tc>
+          <w:tcPr>
+            <w:tcW w:w="5395" w:type="dxa"/>
+          </w:tcPr>
+          <w:p>
+            <w:pPr>
+              <w:spacing w:after="0" w:line="240" w:lineRule="auto"/>
+              <w:jc w:val="center"/>
+              <w:rPr>
+                <w:rFonts w:ascii="Arial" w:eastAsiaTheme="minorHAnsi" w:hAnsi="Arial" w:cs="Arial"/>
+                <w:sz w:val="24"/>
+              </w:rPr>
+            </w:pPr>
             <w:r>
               <w:rPr>
                 <w:rFonts w:ascii="Arial" w:eastAsiaTheme="minorHAnsi" w:hAnsi="Arial" w:cs="Arial"/>
                 <w:sz w:val="24"/>
               </w:rPr>
-              <w:t>Choc</w:t>
+              <w:t>Programador</w:t>
             </w:r>
-            <w:proofErr w:type="spellEnd"/>
+          </w:p>
+        </w:tc>
+      </w:tr>
+      <w:tr>
+        <w:tc>
+          <w:tcPr>
+            <w:tcW w:w="5395" w:type="dxa"/>
+          </w:tcPr>
+          <w:p>
+            <w:pPr>
+              <w:spacing w:after="0" w:line="240" w:lineRule="auto"/>
+              <w:jc w:val="center"/>
+              <w:rPr>
+                <w:rFonts w:ascii="Arial" w:eastAsiaTheme="minorHAnsi" w:hAnsi="Arial" w:cs="Arial"/>
+                <w:sz w:val="24"/>
+              </w:rPr>
+            </w:pPr>
+            <w:r>
+              <w:rPr>
+                <w:rFonts w:ascii="Arial" w:eastAsiaTheme="minorHAnsi" w:hAnsi="Arial" w:cs="Arial"/>
+                <w:sz w:val="24"/>
+              </w:rPr>
+              <w:t>Carlos Alejandro Patal Choc</w:t>
+            </w:r>
           </w:p>
         </w:tc>
         <w:tc>
@@ -2024,34 +1775,21 @@
           <w:b/>
         </w:rPr>
       </w:pPr>
-      <w:proofErr w:type="spellStart"/>
-      <w:proofErr w:type="gramStart"/>
       <w:r>
         <w:rPr>
           <w:b/>
         </w:rPr>
         <w:t>TUPLA:Servicios</w:t>
       </w:r>
-      <w:proofErr w:type="spellEnd"/>
-      <w:proofErr w:type="gramEnd"/>
-    </w:p>
-    <w:p>
-      <w:pPr>
-        <w:rPr>
-          <w:b/>
-        </w:rPr>
-      </w:pPr>
-      <w:r>
-        <w:t>HUJC-</w:t>
-      </w:r>
-      <w:r>
-        <w:t>0</w:t>
-      </w:r>
-      <w:r>
-        <w:t>0</w:t>
-      </w:r>
-      <w:r>
-        <w:t>4</w:t>
+    </w:p>
+    <w:p>
+      <w:pPr>
+        <w:rPr>
+          <w:b/>
+        </w:rPr>
+      </w:pPr>
+      <w:r>
+        <w:t>HUJC-004</w:t>
       </w:r>
     </w:p>
     <w:p>
@@ -2081,7 +1819,7 @@
           <w:rFonts w:ascii="Calibri" w:hAnsi="Calibri" w:cs="Calibri"/>
           <w:sz w:val="22"/>
           <w:szCs w:val="22"/>
-          <w:lang w:val="es-419"/>
+          <w:lang w:val="zh-CN"/>
         </w:rPr>
         <w:t>:</w:t>
       </w:r>
@@ -2365,10 +2103,7 @@
         </w:rPr>
       </w:pPr>
       <w:r>
-        <w:t>HUJC-0</w:t>
-      </w:r>
-      <w:r>
-        <w:t>06</w:t>
+        <w:t>HUJC-006</w:t>
       </w:r>
     </w:p>
     <w:p>
@@ -2507,6 +2242,345 @@
         <w:spacing w:before="0" w:beforeAutospacing="0" w:after="0" w:afterAutospacing="0"/>
         <w:textAlignment w:val="baseline"/>
         <w:rPr>
+          <w:rFonts w:ascii="Segoe UI" w:hAnsi="Segoe UI" w:cs="Segoe UI"/>
+          <w:b/>
+          <w:sz w:val="18"/>
+          <w:szCs w:val="18"/>
+          <w:lang w:val="es-MX"/>
+        </w:rPr>
+      </w:pPr>
+      <w:r>
+        <w:rPr>
+          <w:rFonts w:ascii="Segoe UI" w:hAnsi="Segoe UI" w:cs="Segoe UI"/>
+          <w:b/>
+          <w:sz w:val="18"/>
+          <w:szCs w:val="18"/>
+        </w:rPr>
+        <w:t>Tupla: Rese</w:t>
+      </w:r>
+      <w:r>
+        <w:rPr>
+          <w:rFonts w:ascii="Segoe UI" w:hAnsi="Segoe UI" w:cs="Segoe UI"/>
+          <w:b/>
+          <w:sz w:val="18"/>
+          <w:szCs w:val="18"/>
+          <w:lang w:val="es-MX"/>
+        </w:rPr>
+        <w:t>ñas</w:t>
+      </w:r>
+    </w:p>
+    <w:p>
+      <w:pPr>
+        <w:pStyle w:val="paragraph"/>
+        <w:spacing w:before="0" w:beforeAutospacing="0" w:after="0" w:afterAutospacing="0"/>
+        <w:textAlignment w:val="baseline"/>
+        <w:rPr>
+          <w:rFonts w:ascii="Segoe UI" w:hAnsi="Segoe UI" w:cs="Segoe UI"/>
+          <w:b/>
+          <w:sz w:val="18"/>
+          <w:szCs w:val="18"/>
+          <w:lang w:val="es-MX"/>
+        </w:rPr>
+      </w:pPr>
+    </w:p>
+    <w:p>
+      <w:pPr>
+        <w:pStyle w:val="paragraph"/>
+        <w:spacing w:after="0"/>
+        <w:textAlignment w:val="baseline"/>
+        <w:rPr>
+          <w:rFonts w:ascii="Segoe UI" w:hAnsi="Segoe UI" w:cs="Segoe UI"/>
+          <w:sz w:val="22"/>
+          <w:szCs w:val="22"/>
+        </w:rPr>
+      </w:pPr>
+      <w:r>
+        <w:rPr>
+          <w:rFonts w:ascii="Segoe UI" w:hAnsi="Segoe UI" w:cs="Segoe UI"/>
+          <w:sz w:val="22"/>
+          <w:szCs w:val="22"/>
+        </w:rPr>
+        <w:t>HUJC-007: Registo de nueva reseña</w:t>
+      </w:r>
+    </w:p>
+    <w:p>
+      <w:pPr>
+        <w:pStyle w:val="paragraph"/>
+        <w:spacing w:after="0"/>
+        <w:textAlignment w:val="baseline"/>
+        <w:rPr>
+          <w:rFonts w:ascii="Segoe UI" w:hAnsi="Segoe UI" w:cs="Segoe UI"/>
+          <w:sz w:val="22"/>
+          <w:szCs w:val="22"/>
+        </w:rPr>
+      </w:pPr>
+      <w:r>
+        <w:rPr>
+          <w:rFonts w:ascii="Segoe UI" w:hAnsi="Segoe UI" w:cs="Segoe UI"/>
+          <w:sz w:val="22"/>
+          <w:szCs w:val="22"/>
+        </w:rPr>
+        <w:t>Como: Huesped</w:t>
+      </w:r>
+    </w:p>
+    <w:p>
+      <w:pPr>
+        <w:pStyle w:val="paragraph"/>
+        <w:spacing w:after="0"/>
+        <w:textAlignment w:val="baseline"/>
+        <w:rPr>
+          <w:rFonts w:ascii="Segoe UI" w:hAnsi="Segoe UI" w:cs="Segoe UI"/>
+          <w:sz w:val="22"/>
+          <w:szCs w:val="22"/>
+        </w:rPr>
+      </w:pPr>
+      <w:r>
+        <w:rPr>
+          <w:rFonts w:ascii="Segoe UI" w:hAnsi="Segoe UI" w:cs="Segoe UI"/>
+          <w:sz w:val="22"/>
+          <w:szCs w:val="22"/>
+        </w:rPr>
+        <w:t>Quiero: Registar una reseña sobre los servicios del cuarto de baño</w:t>
+      </w:r>
+    </w:p>
+    <w:p>
+      <w:pPr>
+        <w:pStyle w:val="paragraph"/>
+        <w:spacing w:before="0" w:beforeAutospacing="0" w:after="0" w:afterAutospacing="0"/>
+        <w:textAlignment w:val="baseline"/>
+        <w:rPr>
+          <w:rFonts w:ascii="Segoe UI" w:hAnsi="Segoe UI" w:cs="Segoe UI"/>
+          <w:sz w:val="22"/>
+          <w:szCs w:val="22"/>
+        </w:rPr>
+      </w:pPr>
+      <w:r>
+        <w:rPr>
+          <w:rFonts w:ascii="Segoe UI" w:hAnsi="Segoe UI" w:cs="Segoe UI"/>
+          <w:sz w:val="22"/>
+          <w:szCs w:val="22"/>
+        </w:rPr>
+        <w:t>Para: Que lleven un registro de las mejoras que necesita o faltan en el baño</w:t>
+      </w:r>
+    </w:p>
+    <w:p>
+      <w:pPr>
+        <w:pStyle w:val="paragraph"/>
+        <w:spacing w:before="0" w:beforeAutospacing="0" w:after="0" w:afterAutospacing="0"/>
+        <w:textAlignment w:val="baseline"/>
+        <w:rPr>
+          <w:rFonts w:ascii="Segoe UI" w:hAnsi="Segoe UI" w:cs="Segoe UI"/>
+          <w:sz w:val="22"/>
+          <w:szCs w:val="22"/>
+        </w:rPr>
+      </w:pPr>
+    </w:p>
+    <w:p>
+      <w:pPr>
+        <w:pStyle w:val="paragraph"/>
+        <w:spacing w:after="0"/>
+        <w:textAlignment w:val="baseline"/>
+        <w:rPr>
+          <w:rFonts w:ascii="Segoe UI" w:hAnsi="Segoe UI" w:cs="Segoe UI"/>
+          <w:b/>
+          <w:sz w:val="22"/>
+          <w:szCs w:val="22"/>
+        </w:rPr>
+      </w:pPr>
+      <w:r>
+        <w:rPr>
+          <w:rFonts w:ascii="Segoe UI" w:hAnsi="Segoe UI" w:cs="Segoe UI"/>
+          <w:b/>
+          <w:sz w:val="22"/>
+          <w:szCs w:val="22"/>
+        </w:rPr>
+        <w:t>HUJC-008</w:t>
+      </w:r>
+    </w:p>
+    <w:p>
+      <w:pPr>
+        <w:pStyle w:val="paragraph"/>
+        <w:spacing w:after="0"/>
+        <w:textAlignment w:val="baseline"/>
+        <w:rPr>
+          <w:rFonts w:ascii="Segoe UI" w:hAnsi="Segoe UI" w:cs="Segoe UI"/>
+          <w:sz w:val="22"/>
+          <w:szCs w:val="22"/>
+        </w:rPr>
+      </w:pPr>
+      <w:r>
+        <w:rPr>
+          <w:rFonts w:ascii="Segoe UI" w:hAnsi="Segoe UI" w:cs="Segoe UI"/>
+          <w:sz w:val="22"/>
+          <w:szCs w:val="22"/>
+        </w:rPr>
+        <w:t>Como: Empresario</w:t>
+      </w:r>
+    </w:p>
+    <w:p>
+      <w:pPr>
+        <w:pStyle w:val="paragraph"/>
+        <w:spacing w:after="0"/>
+        <w:textAlignment w:val="baseline"/>
+        <w:rPr>
+          <w:rFonts w:ascii="Segoe UI" w:hAnsi="Segoe UI" w:cs="Segoe UI"/>
+          <w:sz w:val="22"/>
+          <w:szCs w:val="22"/>
+        </w:rPr>
+      </w:pPr>
+      <w:r>
+        <w:rPr>
+          <w:rFonts w:ascii="Segoe UI" w:hAnsi="Segoe UI" w:cs="Segoe UI"/>
+          <w:sz w:val="22"/>
+          <w:szCs w:val="22"/>
+        </w:rPr>
+        <w:t>Quiero: Registrar una reseña sobre la propiedad que me fue otorgada en Peace At Home</w:t>
+      </w:r>
+    </w:p>
+    <w:p>
+      <w:pPr>
+        <w:pStyle w:val="paragraph"/>
+        <w:spacing w:before="0" w:beforeAutospacing="0" w:after="0" w:afterAutospacing="0"/>
+        <w:textAlignment w:val="baseline"/>
+        <w:rPr>
+          <w:rFonts w:ascii="Segoe UI" w:hAnsi="Segoe UI" w:cs="Segoe UI"/>
+          <w:sz w:val="22"/>
+          <w:szCs w:val="22"/>
+        </w:rPr>
+      </w:pPr>
+      <w:r>
+        <w:rPr>
+          <w:rFonts w:ascii="Segoe UI" w:hAnsi="Segoe UI" w:cs="Segoe UI"/>
+          <w:sz w:val="22"/>
+          <w:szCs w:val="22"/>
+        </w:rPr>
+        <w:t>Para: Que los nuevos huéspedes sepan de las comodidades y ventajas de esta propiedad en especifico</w:t>
+      </w:r>
+    </w:p>
+    <w:p>
+      <w:pPr>
+        <w:pStyle w:val="paragraph"/>
+        <w:spacing w:before="0" w:beforeAutospacing="0" w:after="0" w:afterAutospacing="0"/>
+        <w:textAlignment w:val="baseline"/>
+        <w:rPr>
+          <w:rFonts w:ascii="Segoe UI" w:hAnsi="Segoe UI" w:cs="Segoe UI"/>
+          <w:sz w:val="22"/>
+          <w:szCs w:val="22"/>
+        </w:rPr>
+      </w:pPr>
+    </w:p>
+    <w:p>
+      <w:pPr>
+        <w:pStyle w:val="paragraph"/>
+        <w:spacing w:after="0"/>
+        <w:textAlignment w:val="baseline"/>
+        <w:rPr>
+          <w:rFonts w:ascii="Segoe UI" w:hAnsi="Segoe UI" w:cs="Segoe UI"/>
+          <w:b/>
+          <w:sz w:val="22"/>
+          <w:szCs w:val="22"/>
+        </w:rPr>
+      </w:pPr>
+      <w:r>
+        <w:rPr>
+          <w:rFonts w:ascii="Segoe UI" w:hAnsi="Segoe UI" w:cs="Segoe UI"/>
+          <w:b/>
+          <w:sz w:val="22"/>
+          <w:szCs w:val="22"/>
+        </w:rPr>
+        <w:t>HUJC-009</w:t>
+      </w:r>
+    </w:p>
+    <w:p>
+      <w:pPr>
+        <w:pStyle w:val="paragraph"/>
+        <w:spacing w:after="0"/>
+        <w:textAlignment w:val="baseline"/>
+        <w:rPr>
+          <w:rFonts w:ascii="Segoe UI" w:hAnsi="Segoe UI" w:cs="Segoe UI"/>
+          <w:sz w:val="22"/>
+          <w:szCs w:val="22"/>
+        </w:rPr>
+      </w:pPr>
+      <w:r>
+        <w:rPr>
+          <w:rFonts w:ascii="Segoe UI" w:hAnsi="Segoe UI" w:cs="Segoe UI"/>
+          <w:sz w:val="22"/>
+          <w:szCs w:val="22"/>
+        </w:rPr>
+        <w:t>Como: Arrendador</w:t>
+      </w:r>
+    </w:p>
+    <w:p>
+      <w:pPr>
+        <w:pStyle w:val="paragraph"/>
+        <w:spacing w:after="0"/>
+        <w:textAlignment w:val="baseline"/>
+        <w:rPr>
+          <w:rFonts w:ascii="Segoe UI" w:hAnsi="Segoe UI" w:cs="Segoe UI"/>
+          <w:sz w:val="22"/>
+          <w:szCs w:val="22"/>
+        </w:rPr>
+      </w:pPr>
+      <w:r>
+        <w:rPr>
+          <w:rFonts w:ascii="Segoe UI" w:hAnsi="Segoe UI" w:cs="Segoe UI"/>
+          <w:sz w:val="22"/>
+          <w:szCs w:val="22"/>
+        </w:rPr>
+        <w:t>Quiero: Registrar una reseña sobre los huéspedes que ocupan mi propiedad de Peace At Home</w:t>
+      </w:r>
+    </w:p>
+    <w:p>
+      <w:pPr>
+        <w:pStyle w:val="paragraph"/>
+        <w:spacing w:before="0" w:beforeAutospacing="0" w:after="0" w:afterAutospacing="0"/>
+        <w:textAlignment w:val="baseline"/>
+        <w:rPr>
+          <w:rFonts w:ascii="Segoe UI" w:hAnsi="Segoe UI" w:cs="Segoe UI"/>
+          <w:sz w:val="22"/>
+          <w:szCs w:val="22"/>
+        </w:rPr>
+      </w:pPr>
+      <w:r>
+        <w:rPr>
+          <w:rFonts w:ascii="Segoe UI" w:hAnsi="Segoe UI" w:cs="Segoe UI"/>
+          <w:sz w:val="22"/>
+          <w:szCs w:val="22"/>
+        </w:rPr>
+        <w:t>Para: Llevar un registro de cosas que pueden mejorarse en la propiedad para otorgarles una mejor comodidad</w:t>
+      </w:r>
+    </w:p>
+    <w:p>
+      <w:pPr>
+        <w:pStyle w:val="paragraph"/>
+        <w:spacing w:before="0" w:beforeAutospacing="0" w:after="0" w:afterAutospacing="0"/>
+        <w:textAlignment w:val="baseline"/>
+        <w:rPr>
+          <w:rFonts w:ascii="Segoe UI" w:hAnsi="Segoe UI" w:cs="Segoe UI"/>
+          <w:sz w:val="22"/>
+          <w:szCs w:val="22"/>
+        </w:rPr>
+      </w:pPr>
+    </w:p>
+    <w:p>
+      <w:pPr>
+        <w:pStyle w:val="paragraph"/>
+        <w:spacing w:before="0" w:beforeAutospacing="0" w:after="0" w:afterAutospacing="0"/>
+        <w:textAlignment w:val="baseline"/>
+        <w:rPr>
+          <w:rFonts w:ascii="Segoe UI" w:hAnsi="Segoe UI" w:cs="Segoe UI"/>
+          <w:sz w:val="22"/>
+          <w:szCs w:val="22"/>
+        </w:rPr>
+      </w:pPr>
+    </w:p>
+    <w:p>
+      <w:pPr>
+        <w:pStyle w:val="paragraph"/>
+        <w:spacing w:before="0" w:beforeAutospacing="0" w:after="0" w:afterAutospacing="0"/>
+        <w:textAlignment w:val="baseline"/>
+        <w:rPr>
           <w:rStyle w:val="eop"/>
           <w:rFonts w:ascii="Calibri" w:eastAsia="MS Mincho" w:hAnsi="Calibri" w:cs="Calibri"/>
           <w:sz w:val="22"/>
@@ -2516,299 +2590,2694 @@
     </w:p>
     <w:p>
       <w:pPr>
-        <w:spacing w:before="100" w:beforeAutospacing="1" w:after="100" w:afterAutospacing="1" w:line="240" w:lineRule="auto"/>
-        <w:rPr>
-          <w:rFonts w:ascii="Arial" w:eastAsia="Times New Roman" w:hAnsi="Arial" w:cs="Arial"/>
-          <w:szCs w:val="24"/>
-          <w:lang w:eastAsia="es-GT"/>
-        </w:rPr>
-      </w:pPr>
-    </w:p>
-    <w:p>
-      <w:pPr>
-        <w:spacing w:before="100" w:beforeAutospacing="1" w:after="100" w:afterAutospacing="1" w:line="240" w:lineRule="auto"/>
-        <w:rPr>
-          <w:rFonts w:ascii="Arial" w:eastAsia="Times New Roman" w:hAnsi="Arial" w:cs="Arial"/>
-          <w:sz w:val="24"/>
-          <w:szCs w:val="24"/>
-          <w:lang w:eastAsia="es-GT"/>
-        </w:rPr>
-      </w:pPr>
-    </w:p>
-    <w:p>
-      <w:pPr>
-        <w:spacing w:before="100" w:beforeAutospacing="1" w:after="100" w:afterAutospacing="1" w:line="240" w:lineRule="auto"/>
-        <w:rPr>
-          <w:rFonts w:ascii="Arial" w:eastAsia="Times New Roman" w:hAnsi="Arial" w:cs="Arial"/>
-          <w:sz w:val="24"/>
-          <w:szCs w:val="24"/>
-          <w:lang w:eastAsia="es-GT"/>
-        </w:rPr>
-      </w:pPr>
-    </w:p>
-    <w:p>
-      <w:pPr>
-        <w:spacing w:before="100" w:beforeAutospacing="1" w:after="100" w:afterAutospacing="1" w:line="240" w:lineRule="auto"/>
-        <w:rPr>
-          <w:rFonts w:ascii="Arial" w:eastAsia="Times New Roman" w:hAnsi="Arial" w:cs="Arial"/>
-          <w:sz w:val="24"/>
-          <w:szCs w:val="24"/>
-          <w:lang w:eastAsia="es-GT"/>
-        </w:rPr>
-      </w:pPr>
-    </w:p>
-    <w:p>
-      <w:pPr>
-        <w:spacing w:before="100" w:beforeAutospacing="1" w:after="100" w:afterAutospacing="1" w:line="240" w:lineRule="auto"/>
-        <w:rPr>
-          <w:rFonts w:ascii="Arial" w:eastAsia="Times New Roman" w:hAnsi="Arial" w:cs="Arial"/>
-          <w:sz w:val="24"/>
-          <w:szCs w:val="24"/>
-          <w:lang w:eastAsia="es-GT"/>
-        </w:rPr>
-      </w:pPr>
-    </w:p>
-    <w:p>
-      <w:pPr>
-        <w:spacing w:before="100" w:beforeAutospacing="1" w:after="100" w:afterAutospacing="1" w:line="240" w:lineRule="auto"/>
-        <w:rPr>
-          <w:rFonts w:ascii="Arial" w:eastAsia="Times New Roman" w:hAnsi="Arial" w:cs="Arial"/>
-          <w:sz w:val="24"/>
-          <w:szCs w:val="24"/>
-          <w:lang w:eastAsia="es-GT"/>
-        </w:rPr>
-      </w:pPr>
-    </w:p>
-    <w:p>
-      <w:pPr>
-        <w:spacing w:before="100" w:beforeAutospacing="1" w:after="100" w:afterAutospacing="1" w:line="240" w:lineRule="auto"/>
-        <w:rPr>
-          <w:rFonts w:ascii="Arial" w:eastAsia="Times New Roman" w:hAnsi="Arial" w:cs="Arial"/>
-          <w:sz w:val="24"/>
-          <w:szCs w:val="24"/>
-          <w:lang w:eastAsia="es-GT"/>
-        </w:rPr>
-      </w:pPr>
-    </w:p>
-    <w:p>
-      <w:pPr>
-        <w:spacing w:before="100" w:beforeAutospacing="1" w:after="100" w:afterAutospacing="1" w:line="240" w:lineRule="auto"/>
-        <w:rPr>
-          <w:rFonts w:ascii="Arial" w:eastAsia="Times New Roman" w:hAnsi="Arial" w:cs="Arial"/>
-          <w:sz w:val="24"/>
-          <w:szCs w:val="24"/>
-          <w:lang w:eastAsia="es-GT"/>
-        </w:rPr>
-      </w:pPr>
-    </w:p>
-    <w:p>
-      <w:pPr>
-        <w:spacing w:before="100" w:beforeAutospacing="1" w:after="100" w:afterAutospacing="1" w:line="240" w:lineRule="auto"/>
-        <w:rPr>
-          <w:rFonts w:ascii="Arial" w:eastAsia="Times New Roman" w:hAnsi="Arial" w:cs="Arial"/>
-          <w:sz w:val="24"/>
-          <w:szCs w:val="24"/>
-          <w:lang w:eastAsia="es-GT"/>
-        </w:rPr>
-      </w:pPr>
-    </w:p>
-    <w:p>
-      <w:pPr>
-        <w:spacing w:before="100" w:beforeAutospacing="1" w:after="100" w:afterAutospacing="1" w:line="240" w:lineRule="auto"/>
-        <w:rPr>
-          <w:rFonts w:ascii="Arial" w:eastAsia="Times New Roman" w:hAnsi="Arial" w:cs="Arial"/>
-          <w:sz w:val="24"/>
-          <w:szCs w:val="24"/>
-          <w:lang w:eastAsia="es-GT"/>
-        </w:rPr>
-      </w:pPr>
-    </w:p>
-    <w:p>
-      <w:pPr>
-        <w:spacing w:before="100" w:beforeAutospacing="1" w:after="100" w:afterAutospacing="1" w:line="240" w:lineRule="auto"/>
-        <w:rPr>
-          <w:rFonts w:ascii="Arial" w:eastAsia="Times New Roman" w:hAnsi="Arial" w:cs="Arial"/>
-          <w:sz w:val="24"/>
-          <w:szCs w:val="24"/>
-          <w:lang w:eastAsia="es-GT"/>
-        </w:rPr>
-      </w:pPr>
-    </w:p>
-    <w:p>
-      <w:pPr>
-        <w:spacing w:before="100" w:beforeAutospacing="1" w:after="100" w:afterAutospacing="1" w:line="240" w:lineRule="auto"/>
-        <w:rPr>
-          <w:rFonts w:ascii="Arial" w:eastAsia="Times New Roman" w:hAnsi="Arial" w:cs="Arial"/>
-          <w:sz w:val="24"/>
-          <w:szCs w:val="24"/>
-          <w:lang w:eastAsia="es-GT"/>
-        </w:rPr>
-      </w:pPr>
-    </w:p>
-    <w:p>
-      <w:pPr>
-        <w:spacing w:before="100" w:beforeAutospacing="1" w:after="100" w:afterAutospacing="1" w:line="240" w:lineRule="auto"/>
-        <w:rPr>
-          <w:rFonts w:ascii="Arial" w:eastAsia="Times New Roman" w:hAnsi="Arial" w:cs="Arial"/>
-          <w:sz w:val="24"/>
-          <w:szCs w:val="24"/>
-          <w:lang w:eastAsia="es-GT"/>
-        </w:rPr>
-      </w:pPr>
-    </w:p>
-    <w:p>
-      <w:pPr>
-        <w:spacing w:before="100" w:beforeAutospacing="1" w:after="100" w:afterAutospacing="1" w:line="240" w:lineRule="auto"/>
-        <w:rPr>
-          <w:rFonts w:ascii="Arial" w:eastAsia="Times New Roman" w:hAnsi="Arial" w:cs="Arial"/>
-          <w:sz w:val="24"/>
-          <w:szCs w:val="24"/>
-          <w:lang w:eastAsia="es-GT"/>
-        </w:rPr>
-      </w:pPr>
-    </w:p>
-    <w:p>
-      <w:pPr>
-        <w:spacing w:before="100" w:beforeAutospacing="1" w:after="100" w:afterAutospacing="1" w:line="240" w:lineRule="auto"/>
-        <w:rPr>
-          <w:rFonts w:ascii="Arial" w:eastAsia="Times New Roman" w:hAnsi="Arial" w:cs="Arial"/>
-          <w:sz w:val="24"/>
-          <w:szCs w:val="24"/>
-          <w:lang w:eastAsia="es-GT"/>
-        </w:rPr>
-      </w:pPr>
-    </w:p>
-    <w:p>
-      <w:pPr>
-        <w:spacing w:before="100" w:beforeAutospacing="1" w:after="100" w:afterAutospacing="1" w:line="240" w:lineRule="auto"/>
-        <w:rPr>
-          <w:rFonts w:ascii="Arial" w:eastAsia="Times New Roman" w:hAnsi="Arial" w:cs="Arial"/>
-          <w:sz w:val="24"/>
-          <w:szCs w:val="24"/>
-          <w:lang w:eastAsia="es-GT"/>
-        </w:rPr>
-      </w:pPr>
-    </w:p>
-    <w:p>
-      <w:pPr>
-        <w:spacing w:before="100" w:beforeAutospacing="1" w:after="100" w:afterAutospacing="1" w:line="240" w:lineRule="auto"/>
-        <w:rPr>
-          <w:rFonts w:ascii="Arial" w:eastAsia="Times New Roman" w:hAnsi="Arial" w:cs="Arial"/>
-          <w:sz w:val="24"/>
-          <w:szCs w:val="24"/>
-          <w:lang w:eastAsia="es-GT"/>
-        </w:rPr>
-      </w:pPr>
-    </w:p>
-    <w:p>
-      <w:pPr>
-        <w:spacing w:before="100" w:beforeAutospacing="1" w:after="100" w:afterAutospacing="1" w:line="240" w:lineRule="auto"/>
-        <w:rPr>
-          <w:rFonts w:ascii="Arial" w:eastAsia="Times New Roman" w:hAnsi="Arial" w:cs="Arial"/>
-          <w:sz w:val="24"/>
-          <w:szCs w:val="24"/>
-          <w:lang w:eastAsia="es-GT"/>
-        </w:rPr>
-      </w:pPr>
-    </w:p>
-    <w:p>
-      <w:pPr>
-        <w:spacing w:before="100" w:beforeAutospacing="1" w:after="100" w:afterAutospacing="1" w:line="240" w:lineRule="auto"/>
-        <w:rPr>
-          <w:rFonts w:ascii="Arial" w:eastAsia="Times New Roman" w:hAnsi="Arial" w:cs="Arial"/>
-          <w:sz w:val="24"/>
-          <w:szCs w:val="24"/>
-          <w:lang w:eastAsia="es-GT"/>
-        </w:rPr>
-      </w:pPr>
-    </w:p>
-    <w:p>
-      <w:pPr>
-        <w:spacing w:before="100" w:beforeAutospacing="1" w:after="100" w:afterAutospacing="1" w:line="240" w:lineRule="auto"/>
-        <w:rPr>
-          <w:rFonts w:ascii="Arial" w:eastAsia="Times New Roman" w:hAnsi="Arial" w:cs="Arial"/>
-          <w:sz w:val="24"/>
-          <w:szCs w:val="24"/>
-          <w:lang w:eastAsia="es-GT"/>
-        </w:rPr>
-      </w:pPr>
-    </w:p>
-    <w:p>
-      <w:pPr>
-        <w:spacing w:before="100" w:beforeAutospacing="1" w:after="100" w:afterAutospacing="1" w:line="240" w:lineRule="auto"/>
-        <w:rPr>
-          <w:rFonts w:ascii="Arial" w:eastAsia="Times New Roman" w:hAnsi="Arial" w:cs="Arial"/>
-          <w:sz w:val="24"/>
-          <w:szCs w:val="24"/>
-          <w:lang w:eastAsia="es-GT"/>
-        </w:rPr>
-      </w:pPr>
-    </w:p>
-    <w:p>
-      <w:pPr>
-        <w:spacing w:before="100" w:beforeAutospacing="1" w:after="100" w:afterAutospacing="1" w:line="240" w:lineRule="auto"/>
-        <w:rPr>
-          <w:rFonts w:ascii="Arial" w:eastAsia="Times New Roman" w:hAnsi="Arial" w:cs="Arial"/>
-          <w:sz w:val="24"/>
-          <w:szCs w:val="24"/>
-          <w:lang w:eastAsia="es-GT"/>
-        </w:rPr>
-      </w:pPr>
-    </w:p>
-    <w:p>
-      <w:pPr>
-        <w:spacing w:before="100" w:beforeAutospacing="1" w:after="100" w:afterAutospacing="1" w:line="240" w:lineRule="auto"/>
-        <w:rPr>
-          <w:rFonts w:ascii="Arial" w:eastAsia="Times New Roman" w:hAnsi="Arial" w:cs="Arial"/>
-          <w:sz w:val="24"/>
-          <w:szCs w:val="24"/>
-          <w:lang w:eastAsia="es-GT"/>
-        </w:rPr>
-      </w:pPr>
-    </w:p>
-    <w:p>
-      <w:pPr>
-        <w:spacing w:before="100" w:beforeAutospacing="1" w:after="100" w:afterAutospacing="1" w:line="240" w:lineRule="auto"/>
-        <w:rPr>
-          <w:rFonts w:ascii="Arial" w:eastAsia="Times New Roman" w:hAnsi="Arial" w:cs="Arial"/>
-          <w:sz w:val="24"/>
-          <w:szCs w:val="24"/>
-          <w:lang w:eastAsia="es-GT"/>
-        </w:rPr>
-      </w:pPr>
-    </w:p>
-    <w:p>
-      <w:pPr>
-        <w:spacing w:before="100" w:beforeAutospacing="1" w:after="100" w:afterAutospacing="1" w:line="240" w:lineRule="auto"/>
-        <w:rPr>
-          <w:rFonts w:ascii="Arial" w:eastAsia="Times New Roman" w:hAnsi="Arial" w:cs="Arial"/>
-          <w:sz w:val="24"/>
-          <w:szCs w:val="24"/>
-          <w:lang w:eastAsia="es-GT"/>
-        </w:rPr>
-      </w:pPr>
-    </w:p>
-    <w:p>
-      <w:pPr>
-        <w:spacing w:before="100" w:beforeAutospacing="1" w:after="100" w:afterAutospacing="1" w:line="240" w:lineRule="auto"/>
-        <w:rPr>
-          <w:rFonts w:ascii="Arial" w:eastAsia="Times New Roman" w:hAnsi="Arial" w:cs="Arial"/>
-          <w:sz w:val="24"/>
-          <w:szCs w:val="24"/>
-          <w:lang w:eastAsia="es-GT"/>
-        </w:rPr>
-      </w:pPr>
-    </w:p>
-    <w:p>
-      <w:pPr>
-        <w:spacing w:before="100" w:beforeAutospacing="1" w:after="100" w:afterAutospacing="1" w:line="240" w:lineRule="auto"/>
-        <w:rPr>
-          <w:rFonts w:ascii="Arial" w:eastAsia="Times New Roman" w:hAnsi="Arial" w:cs="Arial"/>
-          <w:sz w:val="24"/>
-          <w:szCs w:val="24"/>
-          <w:lang w:eastAsia="es-GT"/>
-        </w:rPr>
-      </w:pPr>
+        <w:pStyle w:val="paragraph"/>
+        <w:spacing w:before="0" w:beforeAutospacing="0" w:after="0" w:afterAutospacing="0"/>
+        <w:textAlignment w:val="baseline"/>
+        <w:rPr>
+          <w:rStyle w:val="eop"/>
+          <w:rFonts w:ascii="Calibri" w:eastAsia="MS Mincho" w:hAnsi="Calibri" w:cs="Calibri"/>
+          <w:sz w:val="22"/>
+          <w:szCs w:val="22"/>
+        </w:rPr>
+      </w:pPr>
+    </w:p>
+    <w:p>
+      <w:pPr>
+        <w:pStyle w:val="paragraph"/>
+        <w:spacing w:before="0" w:beforeAutospacing="0" w:after="0" w:afterAutospacing="0"/>
+        <w:textAlignment w:val="baseline"/>
+        <w:rPr>
+          <w:rStyle w:val="eop"/>
+          <w:rFonts w:ascii="Calibri" w:eastAsia="MS Mincho" w:hAnsi="Calibri" w:cs="Calibri"/>
+          <w:sz w:val="22"/>
+          <w:szCs w:val="22"/>
+        </w:rPr>
+      </w:pPr>
+    </w:p>
+    <w:p>
+      <w:pPr>
+        <w:spacing w:before="100" w:beforeAutospacing="1" w:after="100" w:afterAutospacing="1" w:line="240" w:lineRule="auto"/>
+        <w:rPr>
+          <w:rFonts w:ascii="Arial" w:eastAsia="Times New Roman" w:hAnsi="Arial" w:cs="Arial"/>
+          <w:szCs w:val="24"/>
+          <w:lang w:eastAsia="es-GT"/>
+        </w:rPr>
+      </w:pPr>
+    </w:p>
+    <w:p>
+      <w:pPr>
+        <w:spacing w:before="100" w:beforeAutospacing="1" w:after="100" w:afterAutospacing="1" w:line="240" w:lineRule="auto"/>
+        <w:rPr>
+          <w:rFonts w:ascii="Arial" w:eastAsia="Times New Roman" w:hAnsi="Arial" w:cs="Arial"/>
+          <w:sz w:val="24"/>
+          <w:szCs w:val="24"/>
+          <w:lang w:eastAsia="es-GT"/>
+        </w:rPr>
+      </w:pPr>
+    </w:p>
+    <w:p>
+      <w:pPr>
+        <w:rPr>
+          <w:b/>
+        </w:rPr>
+      </w:pPr>
+      <w:r>
+        <w:rPr>
+          <w:b/>
+        </w:rPr>
+        <w:t>Tupla: Pago</w:t>
+      </w:r>
+    </w:p>
+    <w:p>
+      <w:r>
+        <w:t>HURH-0010 Registro de pago:</w:t>
+      </w:r>
+    </w:p>
+    <w:p>
+      <w:r>
+        <w:t>1. Como un registro de pagos</w:t>
+      </w:r>
+    </w:p>
+    <w:p>
+      <w:r>
+        <w:t>2. Quiero que registre los datos del monto</w:t>
+      </w:r>
+    </w:p>
+    <w:p>
+      <w:r>
+        <w:t>3. Para poder confirmar que los datos del monto estén registrados</w:t>
+      </w:r>
+    </w:p>
+    <w:p/>
+    <w:p>
+      <w:r>
+        <w:t>HURH-0011 Validación de monto máximo</w:t>
+      </w:r>
+    </w:p>
+    <w:p>
+      <w:r>
+        <w:t xml:space="preserve">1. Como método de pago </w:t>
+      </w:r>
+    </w:p>
+    <w:p>
+      <w:r>
+        <w:t>2. Quiero que el monto sea en efectivo o en tarjeta</w:t>
+      </w:r>
+    </w:p>
+    <w:p>
+      <w:r>
+        <w:t>3. Para verificar si el monto de pago es valido</w:t>
+      </w:r>
+    </w:p>
+    <w:p/>
+    <w:p>
+      <w:r>
+        <w:t>HURH-0012 Generación de recibo de pago</w:t>
+      </w:r>
+    </w:p>
+    <w:p>
+      <w:r>
+        <w:t xml:space="preserve">1. Como registro de pago recibido </w:t>
+      </w:r>
+    </w:p>
+    <w:p>
+      <w:r>
+        <w:t>2. Quiero que me den la información del monto de pago</w:t>
+      </w:r>
+    </w:p>
+    <w:p>
+      <w:pPr>
+        <w:spacing w:before="100" w:beforeAutospacing="1" w:after="100" w:afterAutospacing="1" w:line="240" w:lineRule="auto"/>
+        <w:rPr>
+          <w:rFonts w:ascii="Arial" w:eastAsia="Times New Roman" w:hAnsi="Arial" w:cs="Arial"/>
+          <w:sz w:val="24"/>
+          <w:szCs w:val="24"/>
+          <w:lang w:eastAsia="es-GT"/>
+        </w:rPr>
+      </w:pPr>
+      <w:r>
+        <w:t>3. Para que registre el recibo y se almacene en el sistema</w:t>
+      </w:r>
+    </w:p>
+    <w:p>
+      <w:pPr>
+        <w:spacing w:before="100" w:beforeAutospacing="1" w:after="100" w:afterAutospacing="1" w:line="240" w:lineRule="auto"/>
+        <w:rPr>
+          <w:rFonts w:ascii="Arial" w:eastAsia="Times New Roman" w:hAnsi="Arial" w:cs="Arial"/>
+          <w:sz w:val="24"/>
+          <w:szCs w:val="24"/>
+          <w:lang w:eastAsia="es-GT"/>
+        </w:rPr>
+      </w:pPr>
+    </w:p>
+    <w:p>
+      <w:pPr>
+        <w:spacing w:before="100" w:beforeAutospacing="1" w:after="100" w:afterAutospacing="1" w:line="240" w:lineRule="auto"/>
+        <w:rPr>
+          <w:rFonts w:ascii="Arial" w:eastAsia="Times New Roman" w:hAnsi="Arial" w:cs="Arial"/>
+          <w:sz w:val="24"/>
+          <w:szCs w:val="24"/>
+          <w:lang w:eastAsia="es-GT"/>
+        </w:rPr>
+      </w:pPr>
+      <w:r>
+        <w:rPr>
+          <w:rFonts w:ascii="Arial" w:eastAsia="Times New Roman" w:hAnsi="Arial" w:cs="Arial"/>
+          <w:sz w:val="24"/>
+          <w:szCs w:val="24"/>
+          <w:lang w:eastAsia="es-GT"/>
+        </w:rPr>
+        <w:t xml:space="preserve">Tupla: Reembolso </w:t>
+      </w:r>
+    </w:p>
+    <w:p>
+      <w:pPr>
+        <w:spacing w:before="100" w:beforeAutospacing="1" w:after="100" w:afterAutospacing="1" w:line="240" w:lineRule="auto"/>
+        <w:rPr>
+          <w:rFonts w:ascii="Arial" w:eastAsia="Times New Roman" w:hAnsi="Arial" w:cs="Arial"/>
+          <w:sz w:val="24"/>
+          <w:szCs w:val="24"/>
+          <w:u w:val="single"/>
+          <w:lang w:eastAsia="es-GT"/>
+        </w:rPr>
+      </w:pPr>
+      <w:r>
+        <w:rPr>
+          <w:rFonts w:ascii="Arial" w:eastAsia="Times New Roman" w:hAnsi="Arial" w:cs="Arial"/>
+          <w:sz w:val="24"/>
+          <w:szCs w:val="24"/>
+          <w:lang w:eastAsia="es-GT"/>
+        </w:rPr>
+        <w:t>HUOV-0</w:t>
+      </w:r>
+      <w:r>
+        <w:rPr>
+          <w:rFonts w:ascii="Arial" w:eastAsia="Times New Roman" w:hAnsi="Arial" w:cs="Arial"/>
+          <w:sz w:val="24"/>
+          <w:szCs w:val="24"/>
+          <w:lang w:eastAsia="es-GT"/>
+        </w:rPr>
+        <w:t>13</w:t>
+      </w:r>
+    </w:p>
+    <w:p>
+      <w:pPr>
+        <w:spacing w:before="100" w:beforeAutospacing="1" w:after="100" w:afterAutospacing="1" w:line="240" w:lineRule="auto"/>
+        <w:rPr>
+          <w:rFonts w:ascii="Arial" w:eastAsia="Times New Roman" w:hAnsi="Arial" w:cs="Arial"/>
+          <w:sz w:val="24"/>
+          <w:szCs w:val="24"/>
+          <w:lang w:eastAsia="es-GT"/>
+        </w:rPr>
+      </w:pPr>
+      <w:r>
+        <w:rPr>
+          <w:rFonts w:ascii="Arial" w:eastAsia="Times New Roman" w:hAnsi="Arial" w:cs="Arial"/>
+          <w:sz w:val="24"/>
+          <w:szCs w:val="24"/>
+          <w:lang w:eastAsia="es-GT"/>
+        </w:rPr>
+        <w:t>Como: empleado</w:t>
+      </w:r>
+    </w:p>
+    <w:p>
+      <w:pPr>
+        <w:spacing w:before="100" w:beforeAutospacing="1" w:after="100" w:afterAutospacing="1" w:line="240" w:lineRule="auto"/>
+        <w:rPr>
+          <w:rFonts w:ascii="Arial" w:eastAsia="Times New Roman" w:hAnsi="Arial" w:cs="Arial"/>
+          <w:sz w:val="24"/>
+          <w:szCs w:val="24"/>
+          <w:lang w:eastAsia="es-GT"/>
+        </w:rPr>
+      </w:pPr>
+      <w:r>
+        <w:rPr>
+          <w:rFonts w:ascii="Arial" w:eastAsia="Times New Roman" w:hAnsi="Arial" w:cs="Arial"/>
+          <w:sz w:val="24"/>
+          <w:szCs w:val="24"/>
+          <w:lang w:eastAsia="es-GT"/>
+        </w:rPr>
+        <w:t xml:space="preserve">Quiero: Poder enviar una solicitud de reembolso cargando recibos y completando un formulario, </w:t>
+      </w:r>
+    </w:p>
+    <w:p>
+      <w:pPr>
+        <w:spacing w:before="100" w:beforeAutospacing="1" w:after="100" w:afterAutospacing="1" w:line="240" w:lineRule="auto"/>
+        <w:rPr>
+          <w:rFonts w:ascii="Arial" w:eastAsia="Times New Roman" w:hAnsi="Arial" w:cs="Arial"/>
+          <w:sz w:val="24"/>
+          <w:szCs w:val="24"/>
+          <w:lang w:eastAsia="es-GT"/>
+        </w:rPr>
+      </w:pPr>
+      <w:r>
+        <w:rPr>
+          <w:rFonts w:ascii="Arial" w:eastAsia="Times New Roman" w:hAnsi="Arial" w:cs="Arial"/>
+          <w:sz w:val="24"/>
+          <w:szCs w:val="24"/>
+          <w:lang w:eastAsia="es-GT"/>
+        </w:rPr>
+        <w:t>para que la administración pueda revisar y aprobar el reembolso de los gastos.</w:t>
+      </w:r>
+    </w:p>
+    <w:p>
+      <w:pPr>
+        <w:spacing w:before="100" w:beforeAutospacing="1" w:after="100" w:afterAutospacing="1" w:line="240" w:lineRule="auto"/>
+        <w:rPr>
+          <w:rFonts w:ascii="Arial" w:eastAsia="Times New Roman" w:hAnsi="Arial" w:cs="Arial"/>
+          <w:sz w:val="24"/>
+          <w:szCs w:val="24"/>
+          <w:lang w:eastAsia="es-GT"/>
+        </w:rPr>
+      </w:pPr>
+      <w:r>
+        <w:rPr>
+          <w:rFonts w:ascii="Arial" w:eastAsia="Times New Roman" w:hAnsi="Arial" w:cs="Arial"/>
+          <w:sz w:val="24"/>
+          <w:szCs w:val="24"/>
+          <w:lang w:eastAsia="es-GT"/>
+        </w:rPr>
+        <w:t>Para: Para ofrecer un rembolso cada que lo necesite un cliente.</w:t>
+      </w:r>
+      <w:r>
+        <w:rPr>
+          <w:rFonts w:ascii="Arial" w:eastAsia="Times New Roman" w:hAnsi="Arial" w:cs="Arial"/>
+          <w:sz w:val="24"/>
+          <w:szCs w:val="24"/>
+          <w:lang w:eastAsia="es-GT"/>
+        </w:rPr>
+        <w:t xml:space="preserve"> </w:t>
+      </w:r>
+    </w:p>
+    <w:p>
+      <w:pPr>
+        <w:spacing w:before="100" w:beforeAutospacing="1" w:after="100" w:afterAutospacing="1" w:line="240" w:lineRule="auto"/>
+        <w:rPr>
+          <w:rFonts w:ascii="Arial" w:eastAsia="Times New Roman" w:hAnsi="Arial" w:cs="Arial"/>
+          <w:sz w:val="24"/>
+          <w:szCs w:val="24"/>
+          <w:lang w:eastAsia="es-GT"/>
+        </w:rPr>
+      </w:pPr>
+      <w:r>
+        <w:rPr>
+          <w:rFonts w:ascii="Arial" w:eastAsia="Times New Roman" w:hAnsi="Arial" w:cs="Arial"/>
+          <w:sz w:val="24"/>
+          <w:szCs w:val="24"/>
+          <w:lang w:eastAsia="es-GT"/>
+        </w:rPr>
+        <w:t>HUOV-0</w:t>
+      </w:r>
+      <w:r>
+        <w:rPr>
+          <w:rFonts w:ascii="Arial" w:eastAsia="Times New Roman" w:hAnsi="Arial" w:cs="Arial"/>
+          <w:sz w:val="24"/>
+          <w:szCs w:val="24"/>
+          <w:lang w:eastAsia="es-GT"/>
+        </w:rPr>
+        <w:t>14</w:t>
+      </w:r>
+    </w:p>
+    <w:p>
+      <w:pPr>
+        <w:spacing w:before="100" w:beforeAutospacing="1" w:after="100" w:afterAutospacing="1" w:line="240" w:lineRule="auto"/>
+        <w:rPr>
+          <w:rFonts w:ascii="Arial" w:eastAsia="Times New Roman" w:hAnsi="Arial" w:cs="Arial"/>
+          <w:sz w:val="24"/>
+          <w:szCs w:val="24"/>
+          <w:lang w:eastAsia="es-GT"/>
+        </w:rPr>
+      </w:pPr>
+      <w:r>
+        <w:rPr>
+          <w:rFonts w:ascii="Arial" w:eastAsia="Times New Roman" w:hAnsi="Arial" w:cs="Arial"/>
+          <w:sz w:val="24"/>
+          <w:szCs w:val="24"/>
+          <w:lang w:eastAsia="es-GT"/>
+        </w:rPr>
+        <w:t xml:space="preserve">Como: Administrador financiero </w:t>
+      </w:r>
+    </w:p>
+    <w:p>
+      <w:pPr>
+        <w:spacing w:before="100" w:beforeAutospacing="1" w:after="100" w:afterAutospacing="1" w:line="240" w:lineRule="auto"/>
+        <w:rPr>
+          <w:rFonts w:ascii="Arial" w:eastAsia="Times New Roman" w:hAnsi="Arial" w:cs="Arial"/>
+          <w:sz w:val="24"/>
+          <w:szCs w:val="24"/>
+          <w:lang w:eastAsia="es-GT"/>
+        </w:rPr>
+      </w:pPr>
+      <w:r>
+        <w:rPr>
+          <w:rFonts w:ascii="Arial" w:eastAsia="Times New Roman" w:hAnsi="Arial" w:cs="Arial"/>
+          <w:sz w:val="24"/>
+          <w:szCs w:val="24"/>
+          <w:lang w:eastAsia="es-GT"/>
+        </w:rPr>
+        <w:t xml:space="preserve">Quiero: Acceder a todas las solicitudes de rembolso recibidas y poder aprobarlas o rechazarlas </w:t>
+      </w:r>
+    </w:p>
+    <w:p>
+      <w:pPr>
+        <w:spacing w:before="100" w:beforeAutospacing="1" w:after="100" w:afterAutospacing="1" w:line="240" w:lineRule="auto"/>
+        <w:rPr>
+          <w:rFonts w:ascii="Arial" w:eastAsia="Times New Roman" w:hAnsi="Arial" w:cs="Arial"/>
+          <w:sz w:val="24"/>
+          <w:szCs w:val="24"/>
+          <w:lang w:eastAsia="es-GT"/>
+        </w:rPr>
+      </w:pPr>
+      <w:r>
+        <w:rPr>
+          <w:rFonts w:ascii="Arial" w:eastAsia="Times New Roman" w:hAnsi="Arial" w:cs="Arial"/>
+          <w:sz w:val="24"/>
+          <w:szCs w:val="24"/>
+          <w:lang w:eastAsia="es-GT"/>
+        </w:rPr>
+        <w:t>o hasta incluso pedir más información sobre la solicitud de rembolso.</w:t>
+      </w:r>
+    </w:p>
+    <w:p>
+      <w:pPr>
+        <w:spacing w:before="100" w:beforeAutospacing="1" w:after="100" w:afterAutospacing="1" w:line="240" w:lineRule="auto"/>
+        <w:rPr>
+          <w:rFonts w:ascii="Arial" w:eastAsia="Times New Roman" w:hAnsi="Arial" w:cs="Arial"/>
+          <w:sz w:val="24"/>
+          <w:szCs w:val="24"/>
+          <w:lang w:eastAsia="es-GT"/>
+        </w:rPr>
+      </w:pPr>
+      <w:r>
+        <w:rPr>
+          <w:rFonts w:ascii="Arial" w:eastAsia="Times New Roman" w:hAnsi="Arial" w:cs="Arial"/>
+          <w:sz w:val="24"/>
+          <w:szCs w:val="24"/>
+          <w:lang w:eastAsia="es-GT"/>
+        </w:rPr>
+        <w:lastRenderedPageBreak/>
+        <w:t>Para: Tener un registro de cada acción tomada con fecha y el usuario responsable.</w:t>
+      </w:r>
+    </w:p>
+    <w:p>
+      <w:pPr>
+        <w:spacing w:before="100" w:beforeAutospacing="1" w:after="100" w:afterAutospacing="1" w:line="240" w:lineRule="auto"/>
+        <w:rPr>
+          <w:rFonts w:ascii="Arial" w:eastAsia="Times New Roman" w:hAnsi="Arial" w:cs="Arial"/>
+          <w:sz w:val="24"/>
+          <w:szCs w:val="24"/>
+          <w:lang w:eastAsia="es-GT"/>
+        </w:rPr>
+      </w:pPr>
+    </w:p>
+    <w:p>
+      <w:pPr>
+        <w:spacing w:before="100" w:beforeAutospacing="1" w:after="100" w:afterAutospacing="1" w:line="240" w:lineRule="auto"/>
+        <w:rPr>
+          <w:rFonts w:ascii="Arial" w:eastAsia="Times New Roman" w:hAnsi="Arial" w:cs="Arial"/>
+          <w:sz w:val="24"/>
+          <w:szCs w:val="24"/>
+          <w:lang w:eastAsia="es-GT"/>
+        </w:rPr>
+      </w:pPr>
+    </w:p>
+    <w:p>
+      <w:pPr>
+        <w:spacing w:before="100" w:beforeAutospacing="1" w:after="100" w:afterAutospacing="1" w:line="240" w:lineRule="auto"/>
+        <w:rPr>
+          <w:rFonts w:ascii="Arial" w:eastAsia="Times New Roman" w:hAnsi="Arial" w:cs="Arial"/>
+          <w:sz w:val="24"/>
+          <w:szCs w:val="24"/>
+          <w:lang w:eastAsia="es-GT"/>
+        </w:rPr>
+      </w:pPr>
+      <w:r>
+        <w:rPr>
+          <w:rFonts w:ascii="Arial" w:eastAsia="Times New Roman" w:hAnsi="Arial" w:cs="Arial"/>
+          <w:sz w:val="24"/>
+          <w:szCs w:val="24"/>
+          <w:lang w:eastAsia="es-GT"/>
+        </w:rPr>
+        <w:t>HUOV-0</w:t>
+      </w:r>
+      <w:r>
+        <w:rPr>
+          <w:rFonts w:ascii="Arial" w:eastAsia="Times New Roman" w:hAnsi="Arial" w:cs="Arial"/>
+          <w:sz w:val="24"/>
+          <w:szCs w:val="24"/>
+          <w:lang w:eastAsia="es-GT"/>
+        </w:rPr>
+        <w:t>15</w:t>
+      </w:r>
+    </w:p>
+    <w:p>
+      <w:pPr>
+        <w:spacing w:before="100" w:beforeAutospacing="1" w:after="100" w:afterAutospacing="1" w:line="240" w:lineRule="auto"/>
+        <w:rPr>
+          <w:rFonts w:ascii="Arial" w:eastAsia="Times New Roman" w:hAnsi="Arial" w:cs="Arial"/>
+          <w:sz w:val="24"/>
+          <w:szCs w:val="24"/>
+          <w:lang w:eastAsia="es-GT"/>
+        </w:rPr>
+      </w:pPr>
+      <w:r>
+        <w:rPr>
+          <w:rFonts w:ascii="Arial" w:eastAsia="Times New Roman" w:hAnsi="Arial" w:cs="Arial"/>
+          <w:sz w:val="24"/>
+          <w:szCs w:val="24"/>
+          <w:lang w:eastAsia="es-GT"/>
+        </w:rPr>
+        <w:t xml:space="preserve">Como: Cliente </w:t>
+      </w:r>
+    </w:p>
+    <w:p>
+      <w:pPr>
+        <w:spacing w:before="100" w:beforeAutospacing="1" w:after="100" w:afterAutospacing="1" w:line="240" w:lineRule="auto"/>
+        <w:rPr>
+          <w:rFonts w:ascii="Arial" w:eastAsia="Times New Roman" w:hAnsi="Arial" w:cs="Arial"/>
+          <w:sz w:val="24"/>
+          <w:szCs w:val="24"/>
+          <w:lang w:eastAsia="es-GT"/>
+        </w:rPr>
+      </w:pPr>
+      <w:r>
+        <w:rPr>
+          <w:rFonts w:ascii="Arial" w:eastAsia="Times New Roman" w:hAnsi="Arial" w:cs="Arial"/>
+          <w:sz w:val="24"/>
+          <w:szCs w:val="24"/>
+          <w:lang w:eastAsia="es-GT"/>
+        </w:rPr>
+        <w:t xml:space="preserve">Quiero: Recibir notificaciones cada vez que cambie el estado de mi solicitud de reembolso, </w:t>
+      </w:r>
+    </w:p>
+    <w:p>
+      <w:pPr>
+        <w:spacing w:before="100" w:beforeAutospacing="1" w:after="100" w:afterAutospacing="1" w:line="240" w:lineRule="auto"/>
+        <w:rPr>
+          <w:rFonts w:ascii="Arial" w:eastAsia="Times New Roman" w:hAnsi="Arial" w:cs="Arial"/>
+          <w:sz w:val="24"/>
+          <w:szCs w:val="24"/>
+          <w:lang w:eastAsia="es-GT"/>
+        </w:rPr>
+      </w:pPr>
+      <w:r>
+        <w:rPr>
+          <w:rFonts w:ascii="Arial" w:eastAsia="Times New Roman" w:hAnsi="Arial" w:cs="Arial"/>
+          <w:sz w:val="24"/>
+          <w:szCs w:val="24"/>
+          <w:lang w:eastAsia="es-GT"/>
+        </w:rPr>
+        <w:t>para mantenerme informado sobre el avance y resultado de mi trámite.</w:t>
+      </w:r>
+    </w:p>
+    <w:p>
+      <w:pPr>
+        <w:spacing w:before="100" w:beforeAutospacing="1" w:after="100" w:afterAutospacing="1" w:line="240" w:lineRule="auto"/>
+        <w:rPr>
+          <w:rFonts w:ascii="Arial" w:eastAsia="Times New Roman" w:hAnsi="Arial" w:cs="Arial"/>
+          <w:sz w:val="24"/>
+          <w:szCs w:val="24"/>
+          <w:lang w:eastAsia="es-GT"/>
+        </w:rPr>
+      </w:pPr>
+      <w:r>
+        <w:rPr>
+          <w:rFonts w:ascii="Arial" w:eastAsia="Times New Roman" w:hAnsi="Arial" w:cs="Arial"/>
+          <w:sz w:val="24"/>
+          <w:szCs w:val="24"/>
+          <w:lang w:eastAsia="es-GT"/>
+        </w:rPr>
+        <w:t>Para: Tener un envio automático de notificaciones por correo electrónico y dentro del sistema.</w:t>
+      </w:r>
+    </w:p>
+    <w:p>
+      <w:pPr>
+        <w:spacing w:before="100" w:beforeAutospacing="1" w:after="100" w:afterAutospacing="1" w:line="240" w:lineRule="auto"/>
+        <w:rPr>
+          <w:rFonts w:ascii="Arial" w:eastAsia="Times New Roman" w:hAnsi="Arial" w:cs="Arial"/>
+          <w:sz w:val="24"/>
+          <w:szCs w:val="24"/>
+          <w:lang w:eastAsia="es-GT"/>
+        </w:rPr>
+      </w:pPr>
+    </w:p>
+    <w:p>
+      <w:pPr>
+        <w:pStyle w:val="NormalWeb"/>
+        <w:rPr>
+          <w:rStyle w:val="cf01"/>
+          <w:rFonts w:cs="Arial"/>
+          <w:b/>
+          <w:sz w:val="24"/>
+          <w:szCs w:val="24"/>
+        </w:rPr>
+      </w:pPr>
+      <w:r>
+        <w:rPr>
+          <w:rStyle w:val="cf01"/>
+          <w:rFonts w:cs="Arial"/>
+          <w:b/>
+          <w:sz w:val="24"/>
+          <w:szCs w:val="24"/>
+        </w:rPr>
+        <w:t>Tupla: Comodidades</w:t>
+      </w:r>
+    </w:p>
+    <w:p>
+      <w:pPr>
+        <w:pStyle w:val="NormalWeb"/>
+        <w:rPr>
+          <w:rFonts w:ascii="Arial" w:hAnsi="Arial" w:cs="Arial"/>
+          <w:sz w:val="22"/>
+          <w:szCs w:val="22"/>
+        </w:rPr>
+      </w:pPr>
+      <w:r>
+        <w:rPr>
+          <w:rFonts w:ascii="Arial" w:hAnsi="Arial" w:cs="Arial"/>
+          <w:sz w:val="22"/>
+          <w:szCs w:val="22"/>
+        </w:rPr>
+        <w:t>HUBA-0</w:t>
+      </w:r>
+      <w:r>
+        <w:rPr>
+          <w:rFonts w:ascii="Arial" w:hAnsi="Arial" w:cs="Arial"/>
+          <w:sz w:val="22"/>
+          <w:szCs w:val="22"/>
+        </w:rPr>
+        <w:t>16</w:t>
+      </w:r>
+      <w:r>
+        <w:rPr>
+          <w:rFonts w:ascii="Arial" w:hAnsi="Arial" w:cs="Arial"/>
+          <w:sz w:val="22"/>
+          <w:szCs w:val="22"/>
+        </w:rPr>
+        <w:t>: Visualización Detallada de Comodidades Disponibles</w:t>
+      </w:r>
+    </w:p>
+    <w:p>
+      <w:pPr>
+        <w:pStyle w:val="NormalWeb"/>
+        <w:rPr>
+          <w:rFonts w:ascii="Arial" w:hAnsi="Arial" w:cs="Arial"/>
+          <w:sz w:val="22"/>
+          <w:szCs w:val="22"/>
+        </w:rPr>
+      </w:pPr>
+      <w:r>
+        <w:rPr>
+          <w:rFonts w:ascii="Arial" w:hAnsi="Arial" w:cs="Arial"/>
+          <w:sz w:val="22"/>
+          <w:szCs w:val="22"/>
+        </w:rPr>
+        <w:t>Como: Comodidades</w:t>
+      </w:r>
+    </w:p>
+    <w:p>
+      <w:pPr>
+        <w:pStyle w:val="NormalWeb"/>
+        <w:rPr>
+          <w:rFonts w:ascii="Arial" w:hAnsi="Arial" w:cs="Arial"/>
+          <w:sz w:val="22"/>
+          <w:szCs w:val="22"/>
+        </w:rPr>
+      </w:pPr>
+      <w:r>
+        <w:rPr>
+          <w:rFonts w:ascii="Arial" w:hAnsi="Arial" w:cs="Arial"/>
+          <w:sz w:val="22"/>
+          <w:szCs w:val="22"/>
+        </w:rPr>
+        <w:t>Quiero: poder ver una descripción completa y detallada de todas las comodidades disponibles en la propiedad</w:t>
+      </w:r>
+    </w:p>
+    <w:p>
+      <w:pPr>
+        <w:pStyle w:val="NormalWeb"/>
+        <w:rPr>
+          <w:rFonts w:ascii="Arial" w:hAnsi="Arial" w:cs="Arial"/>
+          <w:sz w:val="22"/>
+          <w:szCs w:val="22"/>
+        </w:rPr>
+      </w:pPr>
+      <w:r>
+        <w:rPr>
+          <w:rFonts w:ascii="Arial" w:hAnsi="Arial" w:cs="Arial"/>
+          <w:sz w:val="22"/>
+          <w:szCs w:val="22"/>
+        </w:rPr>
+        <w:t>Para: ofrecer información precisa y enriquecedora que mejore significativamente la experiencia de búsqueda del usuario, permitiéndole tomar decisiones informadas.</w:t>
+      </w:r>
+    </w:p>
+    <w:p>
+      <w:pPr>
+        <w:pStyle w:val="NormalWeb"/>
+        <w:rPr>
+          <w:rFonts w:ascii="Arial" w:hAnsi="Arial" w:cs="Arial"/>
+          <w:sz w:val="22"/>
+          <w:szCs w:val="22"/>
+        </w:rPr>
+      </w:pPr>
+    </w:p>
+    <w:p>
+      <w:pPr>
+        <w:rPr>
+          <w:rFonts w:ascii="Arial" w:eastAsiaTheme="minorHAnsi" w:hAnsi="Arial" w:cs="Arial"/>
+        </w:rPr>
+      </w:pPr>
+      <w:r>
+        <w:rPr>
+          <w:rFonts w:ascii="Arial" w:eastAsiaTheme="minorHAnsi" w:hAnsi="Arial" w:cs="Arial"/>
+        </w:rPr>
+        <w:t>HUBA-0</w:t>
+      </w:r>
+      <w:r>
+        <w:rPr>
+          <w:rFonts w:ascii="Arial" w:eastAsiaTheme="minorHAnsi" w:hAnsi="Arial" w:cs="Arial"/>
+        </w:rPr>
+        <w:t>17</w:t>
+      </w:r>
+      <w:r>
+        <w:rPr>
+          <w:rFonts w:ascii="Arial" w:eastAsiaTheme="minorHAnsi" w:hAnsi="Arial" w:cs="Arial"/>
+        </w:rPr>
+        <w:t>: Identificación Clara de Comodidades No Disponibles</w:t>
+      </w:r>
+    </w:p>
+    <w:p>
+      <w:pPr>
+        <w:rPr>
+          <w:rFonts w:ascii="Arial" w:eastAsiaTheme="minorHAnsi" w:hAnsi="Arial" w:cs="Arial"/>
+        </w:rPr>
+      </w:pPr>
+      <w:r>
+        <w:rPr>
+          <w:rFonts w:ascii="Arial" w:eastAsiaTheme="minorHAnsi" w:hAnsi="Arial" w:cs="Arial"/>
+        </w:rPr>
+        <w:t>Como: Comodidades</w:t>
+      </w:r>
+    </w:p>
+    <w:p>
+      <w:pPr>
+        <w:rPr>
+          <w:rFonts w:ascii="Arial" w:eastAsiaTheme="minorHAnsi" w:hAnsi="Arial" w:cs="Arial"/>
+        </w:rPr>
+      </w:pPr>
+      <w:r>
+        <w:rPr>
+          <w:rFonts w:ascii="Arial" w:eastAsiaTheme="minorHAnsi" w:hAnsi="Arial" w:cs="Arial"/>
+        </w:rPr>
+        <w:t>Quiero: que el sistema muestre de forma clara las comodidades con las que la propiedad no cuenta,</w:t>
+      </w:r>
+    </w:p>
+    <w:p>
+      <w:pPr>
+        <w:rPr>
+          <w:rFonts w:ascii="Arial" w:eastAsiaTheme="minorHAnsi" w:hAnsi="Arial" w:cs="Arial"/>
+        </w:rPr>
+      </w:pPr>
+      <w:r>
+        <w:rPr>
+          <w:rFonts w:ascii="Arial" w:eastAsiaTheme="minorHAnsi" w:hAnsi="Arial" w:cs="Arial"/>
+        </w:rPr>
+        <w:t>Para: evitar cualquier expectativa errónea o inconveniente al momento de mi estancia, asegurando una total transparencia.</w:t>
+      </w:r>
+    </w:p>
+    <w:p>
+      <w:pPr>
+        <w:rPr>
+          <w:rFonts w:ascii="Arial" w:eastAsiaTheme="minorHAnsi" w:hAnsi="Arial" w:cs="Arial"/>
+        </w:rPr>
+      </w:pPr>
+    </w:p>
+    <w:p>
+      <w:pPr>
+        <w:rPr>
+          <w:rFonts w:ascii="Arial" w:eastAsiaTheme="minorHAnsi" w:hAnsi="Arial" w:cs="Arial"/>
+          <w:sz w:val="20"/>
+          <w:szCs w:val="20"/>
+        </w:rPr>
+      </w:pPr>
+      <w:r>
+        <w:rPr>
+          <w:rFonts w:ascii="Arial" w:eastAsiaTheme="minorHAnsi" w:hAnsi="Arial" w:cs="Arial"/>
+          <w:sz w:val="20"/>
+          <w:szCs w:val="20"/>
+        </w:rPr>
+        <w:t>HUBA-018</w:t>
+      </w:r>
+      <w:r>
+        <w:rPr>
+          <w:rFonts w:ascii="Arial" w:eastAsiaTheme="minorHAnsi" w:hAnsi="Arial" w:cs="Arial"/>
+          <w:sz w:val="20"/>
+          <w:szCs w:val="20"/>
+        </w:rPr>
+        <w:t xml:space="preserve">: Administración Integral de Comodidades </w:t>
+      </w:r>
+      <w:r>
+        <w:rPr>
+          <w:rFonts w:ascii="Arial" w:eastAsiaTheme="minorHAnsi" w:hAnsi="Arial" w:cs="Arial"/>
+          <w:sz w:val="20"/>
+          <w:szCs w:val="20"/>
+        </w:rPr>
+        <w:t>de la Propiedad</w:t>
+      </w:r>
+    </w:p>
+    <w:p>
+      <w:pPr>
+        <w:rPr>
+          <w:rFonts w:ascii="Arial" w:eastAsiaTheme="minorHAnsi" w:hAnsi="Arial" w:cs="Arial"/>
+          <w:sz w:val="20"/>
+          <w:szCs w:val="20"/>
+        </w:rPr>
+      </w:pPr>
+      <w:r>
+        <w:rPr>
+          <w:rFonts w:ascii="Arial" w:eastAsiaTheme="minorHAnsi" w:hAnsi="Arial" w:cs="Arial"/>
+          <w:sz w:val="20"/>
+          <w:szCs w:val="20"/>
+        </w:rPr>
+        <w:t>Como: Comodidades</w:t>
+      </w:r>
+    </w:p>
+    <w:p>
+      <w:pPr>
+        <w:rPr>
+          <w:rFonts w:ascii="Arial" w:eastAsiaTheme="minorHAnsi" w:hAnsi="Arial" w:cs="Arial"/>
+          <w:sz w:val="20"/>
+          <w:szCs w:val="20"/>
+        </w:rPr>
+      </w:pPr>
+      <w:r>
+        <w:rPr>
+          <w:rFonts w:ascii="Arial" w:eastAsiaTheme="minorHAnsi" w:hAnsi="Arial" w:cs="Arial"/>
+          <w:sz w:val="20"/>
+          <w:szCs w:val="20"/>
+        </w:rPr>
+        <w:t>Quiero: tener la capacidad de añadir nuevas comodidades, eliminar las existentes o actualizar la información de estas,</w:t>
+      </w:r>
+    </w:p>
+    <w:p>
+      <w:pPr>
+        <w:rPr>
+          <w:rFonts w:ascii="Arial" w:eastAsiaTheme="minorHAnsi" w:hAnsi="Arial" w:cs="Arial"/>
+          <w:sz w:val="20"/>
+          <w:szCs w:val="20"/>
+        </w:rPr>
+      </w:pPr>
+      <w:r>
+        <w:rPr>
+          <w:rFonts w:ascii="Arial" w:eastAsiaTheme="minorHAnsi" w:hAnsi="Arial" w:cs="Arial"/>
+          <w:sz w:val="20"/>
+          <w:szCs w:val="20"/>
+        </w:rPr>
+        <w:t>Para: mantener la lista de servicios siempre al día y así garantizar que los usuarios accedan a la información más precisa y relevante, mejorando constantemente la calidad de nuestro servicio.</w:t>
+      </w:r>
+    </w:p>
+    <w:p>
+      <w:pPr>
+        <w:rPr>
+          <w:rFonts w:ascii="Arial" w:eastAsiaTheme="minorHAnsi" w:hAnsi="Arial" w:cs="Arial"/>
+        </w:rPr>
+      </w:pPr>
+    </w:p>
+    <w:p>
+      <w:pPr>
+        <w:pStyle w:val="NormalWeb"/>
+        <w:rPr>
+          <w:rFonts w:ascii="Arial" w:hAnsi="Arial" w:cs="Arial"/>
+          <w:sz w:val="22"/>
+          <w:szCs w:val="22"/>
+        </w:rPr>
+      </w:pPr>
+    </w:p>
+    <w:p>
+      <w:pPr>
+        <w:spacing w:before="100" w:beforeAutospacing="1" w:after="100" w:afterAutospacing="1" w:line="240" w:lineRule="auto"/>
+        <w:rPr>
+          <w:rFonts w:ascii="Arial" w:eastAsia="Times New Roman" w:hAnsi="Arial" w:cs="Arial"/>
+          <w:sz w:val="24"/>
+          <w:szCs w:val="24"/>
+          <w:lang w:eastAsia="es-GT"/>
+        </w:rPr>
+      </w:pPr>
+    </w:p>
+    <w:p>
+      <w:pPr>
+        <w:rPr>
+          <w:rFonts w:ascii="Arial" w:eastAsiaTheme="minorHAnsi" w:hAnsi="Arial" w:cs="Arial"/>
+          <w:b/>
+          <w:u w:val="single"/>
+          <w:lang w:val="es-MX"/>
+        </w:rPr>
+      </w:pPr>
+      <w:r>
+        <w:rPr>
+          <w:rFonts w:ascii="Arial" w:eastAsiaTheme="minorHAnsi" w:hAnsi="Arial" w:cs="Arial"/>
+          <w:b/>
+          <w:u w:val="single"/>
+          <w:lang w:val="es-MX"/>
+        </w:rPr>
+        <w:lastRenderedPageBreak/>
+        <w:t>Tupla: Propiedades</w:t>
+      </w:r>
+    </w:p>
+    <w:p>
+      <w:pPr>
+        <w:rPr>
+          <w:rFonts w:ascii="Arial" w:eastAsiaTheme="minorHAnsi" w:hAnsi="Arial" w:cs="Arial"/>
+          <w:b/>
+          <w:bCs/>
+          <w:lang w:val="es-MX"/>
+        </w:rPr>
+      </w:pPr>
+      <w:r>
+        <w:rPr>
+          <w:rFonts w:ascii="Arial" w:eastAsiaTheme="minorHAnsi" w:hAnsi="Arial" w:cs="Arial"/>
+          <w:b/>
+          <w:bCs/>
+          <w:lang w:val="es-MX"/>
+        </w:rPr>
+        <w:t>HUCL-019: Registro de Propiedades</w:t>
+      </w:r>
+    </w:p>
+    <w:p>
+      <w:pPr>
+        <w:rPr>
+          <w:rFonts w:ascii="Arial" w:eastAsiaTheme="minorHAnsi" w:hAnsi="Arial" w:cs="Arial"/>
+          <w:sz w:val="20"/>
+          <w:szCs w:val="20"/>
+          <w:lang w:val="es-MX"/>
+        </w:rPr>
+      </w:pPr>
+      <w:r>
+        <w:rPr>
+          <w:rFonts w:ascii="Arial" w:eastAsiaTheme="minorHAnsi" w:hAnsi="Arial" w:cs="Arial"/>
+          <w:sz w:val="20"/>
+          <w:szCs w:val="20"/>
+          <w:lang w:val="es-MX"/>
+        </w:rPr>
+        <w:t xml:space="preserve">Como: Agente Inmobiliario </w:t>
+      </w:r>
+    </w:p>
+    <w:p>
+      <w:pPr>
+        <w:rPr>
+          <w:rFonts w:ascii="Arial" w:eastAsiaTheme="minorHAnsi" w:hAnsi="Arial" w:cs="Arial"/>
+          <w:sz w:val="20"/>
+          <w:szCs w:val="20"/>
+          <w:lang w:val="es-MX"/>
+        </w:rPr>
+      </w:pPr>
+      <w:r>
+        <w:rPr>
+          <w:rFonts w:ascii="Arial" w:eastAsiaTheme="minorHAnsi" w:hAnsi="Arial" w:cs="Arial"/>
+          <w:sz w:val="20"/>
+          <w:szCs w:val="20"/>
+          <w:lang w:val="es-MX"/>
+        </w:rPr>
+        <w:t>Quiero: Poder visualizar todas las propi</w:t>
+      </w:r>
+      <w:r>
+        <w:rPr>
+          <w:rFonts w:ascii="Arial" w:eastAsiaTheme="minorHAnsi" w:hAnsi="Arial" w:cs="Arial"/>
+          <w:sz w:val="20"/>
+          <w:szCs w:val="20"/>
+          <w:lang w:val="es-MX"/>
+        </w:rPr>
+        <w:t xml:space="preserve">edades registradas al nombre de algún </w:t>
+      </w:r>
+      <w:r>
+        <w:rPr>
+          <w:rFonts w:ascii="Arial" w:eastAsiaTheme="minorHAnsi" w:hAnsi="Arial" w:cs="Arial"/>
+          <w:sz w:val="20"/>
+          <w:szCs w:val="20"/>
+          <w:lang w:val="es-MX"/>
+        </w:rPr>
+        <w:t xml:space="preserve"> usuario</w:t>
+      </w:r>
+    </w:p>
+    <w:p>
+      <w:pPr>
+        <w:rPr>
+          <w:rFonts w:ascii="Arial" w:eastAsiaTheme="minorHAnsi" w:hAnsi="Arial" w:cs="Arial"/>
+          <w:sz w:val="20"/>
+          <w:szCs w:val="20"/>
+          <w:lang w:val="es-MX"/>
+        </w:rPr>
+      </w:pPr>
+      <w:r>
+        <w:rPr>
+          <w:rFonts w:ascii="Arial" w:eastAsiaTheme="minorHAnsi" w:hAnsi="Arial" w:cs="Arial"/>
+          <w:sz w:val="20"/>
+          <w:szCs w:val="20"/>
+          <w:lang w:val="es-MX"/>
+        </w:rPr>
+        <w:t>Para: Poder llevar un registro de sus facturas y remodelaciones</w:t>
+      </w:r>
+    </w:p>
+    <w:p>
+      <w:pPr>
+        <w:rPr>
+          <w:rFonts w:ascii="Arial" w:eastAsiaTheme="minorHAnsi" w:hAnsi="Arial" w:cs="Arial"/>
+          <w:sz w:val="20"/>
+          <w:szCs w:val="20"/>
+          <w:lang w:val="es-MX"/>
+        </w:rPr>
+      </w:pPr>
+    </w:p>
+    <w:p>
+      <w:pPr>
+        <w:rPr>
+          <w:rFonts w:ascii="Arial" w:eastAsiaTheme="minorHAnsi" w:hAnsi="Arial" w:cs="Arial"/>
+          <w:b/>
+          <w:bCs/>
+          <w:lang w:val="es-MX"/>
+        </w:rPr>
+      </w:pPr>
+      <w:r>
+        <w:rPr>
+          <w:rFonts w:ascii="Arial" w:eastAsiaTheme="minorHAnsi" w:hAnsi="Arial" w:cs="Arial"/>
+          <w:b/>
+          <w:bCs/>
+          <w:lang w:val="es-MX"/>
+        </w:rPr>
+        <w:t>HUCL-020: Registro de Nueva Propiedad</w:t>
+      </w:r>
+    </w:p>
+    <w:p>
+      <w:pPr>
+        <w:rPr>
+          <w:rFonts w:ascii="Arial" w:eastAsiaTheme="minorHAnsi" w:hAnsi="Arial" w:cs="Arial"/>
+          <w:sz w:val="20"/>
+          <w:szCs w:val="20"/>
+          <w:lang w:val="es-MX"/>
+        </w:rPr>
+      </w:pPr>
+      <w:r>
+        <w:rPr>
+          <w:rFonts w:ascii="Arial" w:eastAsiaTheme="minorHAnsi" w:hAnsi="Arial" w:cs="Arial"/>
+          <w:sz w:val="20"/>
+          <w:szCs w:val="20"/>
+          <w:lang w:val="es-MX"/>
+        </w:rPr>
+        <w:t>Como: Arrendador</w:t>
+      </w:r>
+    </w:p>
+    <w:p>
+      <w:pPr>
+        <w:rPr>
+          <w:rFonts w:ascii="Arial" w:eastAsiaTheme="minorHAnsi" w:hAnsi="Arial" w:cs="Arial"/>
+          <w:sz w:val="20"/>
+          <w:szCs w:val="20"/>
+          <w:lang w:val="es-MX"/>
+        </w:rPr>
+      </w:pPr>
+      <w:r>
+        <w:rPr>
+          <w:rFonts w:ascii="Arial" w:eastAsiaTheme="minorHAnsi" w:hAnsi="Arial" w:cs="Arial"/>
+          <w:sz w:val="20"/>
+          <w:szCs w:val="20"/>
+          <w:lang w:val="es-MX"/>
+        </w:rPr>
+        <w:t>Quiero: Registrar una nueva propiedad en Peace at Home</w:t>
+      </w:r>
+    </w:p>
+    <w:p>
+      <w:pPr>
+        <w:rPr>
+          <w:rFonts w:ascii="Arial" w:eastAsiaTheme="minorHAnsi" w:hAnsi="Arial" w:cs="Arial"/>
+          <w:sz w:val="20"/>
+          <w:szCs w:val="20"/>
+          <w:lang w:val="es-MX"/>
+        </w:rPr>
+      </w:pPr>
+      <w:r>
+        <w:rPr>
+          <w:rFonts w:ascii="Arial" w:eastAsiaTheme="minorHAnsi" w:hAnsi="Arial" w:cs="Arial"/>
+          <w:sz w:val="20"/>
+          <w:szCs w:val="20"/>
+          <w:lang w:val="es-MX"/>
+        </w:rPr>
+        <w:t>Para: Brindar una experiencia cómoda y agradable a los huéspedes que renten la propiedad</w:t>
+      </w:r>
+    </w:p>
+    <w:p>
+      <w:pPr>
+        <w:rPr>
+          <w:rFonts w:ascii="Arial" w:eastAsiaTheme="minorHAnsi" w:hAnsi="Arial" w:cs="Arial"/>
+          <w:sz w:val="20"/>
+          <w:szCs w:val="20"/>
+          <w:lang w:val="es-MX"/>
+        </w:rPr>
+      </w:pPr>
+    </w:p>
+    <w:p>
+      <w:pPr>
+        <w:rPr>
+          <w:rFonts w:ascii="Arial" w:eastAsiaTheme="minorHAnsi" w:hAnsi="Arial" w:cs="Arial"/>
+          <w:sz w:val="20"/>
+          <w:szCs w:val="20"/>
+          <w:lang w:val="es-MX"/>
+        </w:rPr>
+      </w:pPr>
+      <w:r>
+        <w:rPr>
+          <w:rFonts w:ascii="Arial" w:eastAsiaTheme="minorHAnsi" w:hAnsi="Arial" w:cs="Arial"/>
+          <w:b/>
+          <w:bCs/>
+          <w:lang w:val="es-MX"/>
+        </w:rPr>
+        <w:t>HUCL-021:</w:t>
+      </w:r>
+      <w:r>
+        <w:rPr>
+          <w:rFonts w:ascii="Arial" w:eastAsiaTheme="minorHAnsi" w:hAnsi="Arial" w:cs="Arial"/>
+          <w:sz w:val="20"/>
+          <w:szCs w:val="20"/>
+          <w:lang w:val="es-MX"/>
+        </w:rPr>
+        <w:t xml:space="preserve"> </w:t>
+      </w:r>
+      <w:r>
+        <w:rPr>
+          <w:rFonts w:ascii="Arial" w:eastAsiaTheme="minorHAnsi" w:hAnsi="Arial" w:cs="Arial"/>
+          <w:sz w:val="20"/>
+          <w:szCs w:val="20"/>
+          <w:lang w:val="es-MX"/>
+        </w:rPr>
+        <w:t xml:space="preserve"> </w:t>
+      </w:r>
+      <w:r>
+        <w:rPr>
+          <w:rFonts w:ascii="Arial" w:eastAsiaTheme="minorHAnsi" w:hAnsi="Arial" w:cs="Arial"/>
+          <w:b/>
+          <w:bCs/>
+          <w:lang w:val="es-MX"/>
+        </w:rPr>
+        <w:t>descripción de propiedades</w:t>
+      </w:r>
+    </w:p>
+    <w:p>
+      <w:pPr>
+        <w:rPr>
+          <w:rFonts w:ascii="Arial" w:eastAsiaTheme="minorHAnsi" w:hAnsi="Arial" w:cs="Arial"/>
+          <w:sz w:val="20"/>
+          <w:szCs w:val="20"/>
+          <w:lang w:val="es-MX"/>
+        </w:rPr>
+      </w:pPr>
+      <w:r>
+        <w:rPr>
+          <w:rFonts w:ascii="Arial" w:eastAsiaTheme="minorHAnsi" w:hAnsi="Arial" w:cs="Arial"/>
+          <w:sz w:val="20"/>
+          <w:szCs w:val="20"/>
+          <w:lang w:val="es-MX"/>
+        </w:rPr>
+        <w:t>Como: Administrador</w:t>
+      </w:r>
+    </w:p>
+    <w:p>
+      <w:pPr>
+        <w:rPr>
+          <w:rFonts w:ascii="Arial" w:eastAsiaTheme="minorHAnsi" w:hAnsi="Arial" w:cs="Arial"/>
+          <w:sz w:val="20"/>
+          <w:szCs w:val="20"/>
+          <w:lang w:val="es-MX"/>
+        </w:rPr>
+      </w:pPr>
+      <w:r>
+        <w:rPr>
+          <w:rFonts w:ascii="Arial" w:eastAsiaTheme="minorHAnsi" w:hAnsi="Arial" w:cs="Arial"/>
+          <w:sz w:val="20"/>
+          <w:szCs w:val="20"/>
+          <w:lang w:val="es-MX"/>
+        </w:rPr>
+        <w:t>Quiero: Poder editar los estados y descripciones de las propiedades que se encuentren en remodelaciones o con atracciones nuevas</w:t>
+      </w:r>
+    </w:p>
+    <w:p>
+      <w:pPr>
+        <w:rPr>
+          <w:rFonts w:ascii="Arial" w:eastAsiaTheme="minorHAnsi" w:hAnsi="Arial" w:cs="Arial"/>
+          <w:sz w:val="20"/>
+          <w:szCs w:val="20"/>
+          <w:lang w:val="es-MX"/>
+        </w:rPr>
+      </w:pPr>
+      <w:r>
+        <w:rPr>
+          <w:rFonts w:ascii="Arial" w:eastAsiaTheme="minorHAnsi" w:hAnsi="Arial" w:cs="Arial"/>
+          <w:sz w:val="20"/>
+          <w:szCs w:val="20"/>
+          <w:lang w:val="es-MX"/>
+        </w:rPr>
+        <w:t>Para: Que los nuevos usuarios sepan de las nuevas características que poseen las propiedades</w:t>
+      </w:r>
+    </w:p>
+    <w:p>
+      <w:pPr>
+        <w:spacing w:before="100" w:beforeAutospacing="1" w:after="100" w:afterAutospacing="1" w:line="240" w:lineRule="auto"/>
+        <w:rPr>
+          <w:rFonts w:ascii="Arial" w:eastAsia="Times New Roman" w:hAnsi="Arial" w:cs="Arial"/>
+          <w:sz w:val="24"/>
+          <w:szCs w:val="24"/>
+          <w:lang w:eastAsia="es-GT"/>
+        </w:rPr>
+      </w:pPr>
+    </w:p>
+    <w:p>
+      <w:pPr>
+        <w:rPr>
+          <w:rFonts w:ascii="Arial" w:eastAsiaTheme="minorHAnsi" w:hAnsi="Arial" w:cs="Arial"/>
+          <w:b/>
+          <w:bCs/>
+          <w:lang w:val="es-MX"/>
+        </w:rPr>
+      </w:pPr>
+      <w:r>
+        <w:rPr>
+          <w:rFonts w:ascii="Arial" w:eastAsiaTheme="minorHAnsi" w:hAnsi="Arial" w:cs="Arial"/>
+          <w:b/>
+          <w:bCs/>
+          <w:lang w:val="es-MX"/>
+        </w:rPr>
+        <w:t>Tupla: Locación</w:t>
+      </w:r>
+    </w:p>
+    <w:p>
+      <w:pPr>
+        <w:rPr>
+          <w:rFonts w:ascii="Arial" w:eastAsiaTheme="minorHAnsi" w:hAnsi="Arial" w:cs="Arial"/>
+          <w:b/>
+          <w:bCs/>
+          <w:lang w:val="es-MX"/>
+        </w:rPr>
+      </w:pPr>
+      <w:r>
+        <w:rPr>
+          <w:rFonts w:ascii="Arial" w:eastAsiaTheme="minorHAnsi" w:hAnsi="Arial" w:cs="Arial"/>
+          <w:b/>
+          <w:bCs/>
+          <w:lang w:val="es-MX"/>
+        </w:rPr>
+        <w:t>HUAP-02</w:t>
+      </w:r>
+      <w:r>
+        <w:rPr>
+          <w:rFonts w:ascii="Arial" w:eastAsiaTheme="minorHAnsi" w:hAnsi="Arial" w:cs="Arial"/>
+          <w:b/>
+          <w:bCs/>
+          <w:lang w:val="es-MX"/>
+        </w:rPr>
+        <w:t>2</w:t>
+      </w:r>
+      <w:r>
+        <w:rPr>
+          <w:rFonts w:ascii="Arial" w:eastAsiaTheme="minorHAnsi" w:hAnsi="Arial" w:cs="Arial"/>
+          <w:b/>
+          <w:bCs/>
+          <w:lang w:val="es-MX"/>
+        </w:rPr>
+        <w:t xml:space="preserve"> - Actualizar información de la locación</w:t>
+      </w:r>
+    </w:p>
+    <w:p>
+      <w:pPr>
+        <w:spacing w:before="100" w:beforeAutospacing="1" w:after="100" w:afterAutospacing="1" w:line="240" w:lineRule="auto"/>
+        <w:rPr>
+          <w:rFonts w:ascii="Arial" w:eastAsiaTheme="minorHAnsi" w:hAnsi="Arial" w:cs="Arial"/>
+          <w:sz w:val="20"/>
+          <w:szCs w:val="20"/>
+          <w:lang w:val="es-MX"/>
+        </w:rPr>
+      </w:pPr>
+      <w:r>
+        <w:rPr>
+          <w:rFonts w:ascii="Arial" w:eastAsiaTheme="minorHAnsi" w:hAnsi="Arial" w:cs="Arial"/>
+          <w:sz w:val="20"/>
+          <w:szCs w:val="20"/>
+          <w:lang w:val="es-MX"/>
+        </w:rPr>
+        <w:t>Cómo: Locación</w:t>
+      </w:r>
+    </w:p>
+    <w:p>
+      <w:pPr>
+        <w:spacing w:before="100" w:beforeAutospacing="1" w:after="100" w:afterAutospacing="1" w:line="240" w:lineRule="auto"/>
+        <w:rPr>
+          <w:rFonts w:ascii="Arial" w:eastAsiaTheme="minorHAnsi" w:hAnsi="Arial" w:cs="Arial"/>
+          <w:sz w:val="20"/>
+          <w:szCs w:val="20"/>
+          <w:lang w:val="es-MX"/>
+        </w:rPr>
+      </w:pPr>
+      <w:r>
+        <w:rPr>
+          <w:rFonts w:ascii="Arial" w:eastAsiaTheme="minorHAnsi" w:hAnsi="Arial" w:cs="Arial"/>
+          <w:sz w:val="20"/>
+          <w:szCs w:val="20"/>
+          <w:lang w:val="es-MX"/>
+        </w:rPr>
+        <w:t>Quiero: Editar mis datos como dirección, descripción, y contacto</w:t>
+      </w:r>
+    </w:p>
+    <w:p>
+      <w:pPr>
+        <w:spacing w:before="100" w:beforeAutospacing="1" w:after="100" w:afterAutospacing="1" w:line="240" w:lineRule="auto"/>
+        <w:rPr>
+          <w:rFonts w:ascii="Arial" w:eastAsiaTheme="minorHAnsi" w:hAnsi="Arial" w:cs="Arial"/>
+          <w:sz w:val="20"/>
+          <w:szCs w:val="20"/>
+          <w:lang w:val="es-MX"/>
+        </w:rPr>
+      </w:pPr>
+      <w:r>
+        <w:rPr>
+          <w:rFonts w:ascii="Arial" w:eastAsiaTheme="minorHAnsi" w:hAnsi="Arial" w:cs="Arial"/>
+          <w:sz w:val="20"/>
+          <w:szCs w:val="20"/>
+          <w:lang w:val="es-MX"/>
+        </w:rPr>
+        <w:t>Para: Mantener mi información actualizada y brindar datos correctos a los huéspedes</w:t>
+      </w:r>
+    </w:p>
+    <w:p>
+      <w:pPr>
+        <w:spacing w:before="100" w:beforeAutospacing="1" w:after="100" w:afterAutospacing="1" w:line="240" w:lineRule="auto"/>
+        <w:rPr>
+          <w:rFonts w:ascii="Arial" w:eastAsiaTheme="minorHAnsi" w:hAnsi="Arial" w:cs="Arial"/>
+          <w:sz w:val="20"/>
+          <w:szCs w:val="20"/>
+          <w:lang w:val="es-MX"/>
+        </w:rPr>
+      </w:pPr>
+    </w:p>
+    <w:p>
+      <w:pPr>
+        <w:rPr>
+          <w:rFonts w:ascii="Arial" w:eastAsiaTheme="minorHAnsi" w:hAnsi="Arial" w:cs="Arial"/>
+          <w:b/>
+          <w:bCs/>
+          <w:lang w:val="es-MX"/>
+        </w:rPr>
+      </w:pPr>
+      <w:r>
+        <w:rPr>
+          <w:rFonts w:ascii="Arial" w:eastAsiaTheme="minorHAnsi" w:hAnsi="Arial" w:cs="Arial"/>
+          <w:b/>
+          <w:bCs/>
+          <w:lang w:val="es-MX"/>
+        </w:rPr>
+        <w:t>HUAP-02</w:t>
+      </w:r>
+      <w:r>
+        <w:rPr>
+          <w:rFonts w:ascii="Arial" w:eastAsiaTheme="minorHAnsi" w:hAnsi="Arial" w:cs="Arial"/>
+          <w:b/>
+          <w:bCs/>
+          <w:lang w:val="es-MX"/>
+        </w:rPr>
+        <w:t>3</w:t>
+      </w:r>
+      <w:r>
+        <w:rPr>
+          <w:rFonts w:ascii="Arial" w:eastAsiaTheme="minorHAnsi" w:hAnsi="Arial" w:cs="Arial"/>
+          <w:b/>
+          <w:bCs/>
+          <w:lang w:val="es-MX"/>
+        </w:rPr>
+        <w:t xml:space="preserve"> - Ver historial de reservas</w:t>
+      </w:r>
+    </w:p>
+    <w:p>
+      <w:pPr>
+        <w:spacing w:before="100" w:beforeAutospacing="1" w:after="100" w:afterAutospacing="1" w:line="240" w:lineRule="auto"/>
+        <w:rPr>
+          <w:rFonts w:ascii="Arial" w:eastAsiaTheme="minorHAnsi" w:hAnsi="Arial" w:cs="Arial"/>
+          <w:sz w:val="20"/>
+          <w:szCs w:val="20"/>
+          <w:lang w:val="es-MX"/>
+        </w:rPr>
+      </w:pPr>
+      <w:r>
+        <w:rPr>
+          <w:rFonts w:ascii="Arial" w:eastAsiaTheme="minorHAnsi" w:hAnsi="Arial" w:cs="Arial"/>
+          <w:sz w:val="20"/>
+          <w:szCs w:val="20"/>
+          <w:lang w:val="es-MX"/>
+        </w:rPr>
+        <w:t>Cómo: Locación</w:t>
+      </w:r>
+    </w:p>
+    <w:p>
+      <w:pPr>
+        <w:spacing w:before="100" w:beforeAutospacing="1" w:after="100" w:afterAutospacing="1" w:line="240" w:lineRule="auto"/>
+        <w:rPr>
+          <w:rFonts w:ascii="Arial" w:eastAsiaTheme="minorHAnsi" w:hAnsi="Arial" w:cs="Arial"/>
+          <w:sz w:val="20"/>
+          <w:szCs w:val="20"/>
+          <w:lang w:val="es-MX"/>
+        </w:rPr>
+      </w:pPr>
+      <w:r>
+        <w:rPr>
+          <w:rFonts w:ascii="Arial" w:eastAsiaTheme="minorHAnsi" w:hAnsi="Arial" w:cs="Arial"/>
+          <w:sz w:val="20"/>
+          <w:szCs w:val="20"/>
+          <w:lang w:val="es-MX"/>
+        </w:rPr>
+        <w:t>Quiero: Consultar las reservas que se han realizado en mi espacio</w:t>
+      </w:r>
+    </w:p>
+    <w:p>
+      <w:pPr>
+        <w:spacing w:before="100" w:beforeAutospacing="1" w:after="100" w:afterAutospacing="1" w:line="240" w:lineRule="auto"/>
+        <w:rPr>
+          <w:rFonts w:ascii="Arial" w:eastAsiaTheme="minorHAnsi" w:hAnsi="Arial" w:cs="Arial"/>
+          <w:sz w:val="20"/>
+          <w:szCs w:val="20"/>
+          <w:lang w:val="es-MX"/>
+        </w:rPr>
+      </w:pPr>
+      <w:r>
+        <w:rPr>
+          <w:rFonts w:ascii="Arial" w:eastAsiaTheme="minorHAnsi" w:hAnsi="Arial" w:cs="Arial"/>
+          <w:sz w:val="20"/>
+          <w:szCs w:val="20"/>
+          <w:lang w:val="es-MX"/>
+        </w:rPr>
+        <w:t>Para: Llevar un control de los huéspedes que me han visitado</w:t>
+      </w:r>
+    </w:p>
+    <w:p>
+      <w:pPr>
+        <w:spacing w:before="100" w:beforeAutospacing="1" w:after="100" w:afterAutospacing="1" w:line="240" w:lineRule="auto"/>
+        <w:rPr>
+          <w:rFonts w:ascii="Arial" w:eastAsiaTheme="minorHAnsi" w:hAnsi="Arial" w:cs="Arial"/>
+          <w:sz w:val="20"/>
+          <w:szCs w:val="20"/>
+          <w:lang w:val="es-MX"/>
+        </w:rPr>
+      </w:pPr>
+    </w:p>
+    <w:p>
+      <w:pPr>
+        <w:spacing w:before="100" w:beforeAutospacing="1" w:after="100" w:afterAutospacing="1" w:line="240" w:lineRule="auto"/>
+        <w:rPr>
+          <w:rFonts w:ascii="Arial" w:eastAsiaTheme="minorHAnsi" w:hAnsi="Arial" w:cs="Arial"/>
+          <w:sz w:val="20"/>
+          <w:szCs w:val="20"/>
+          <w:lang w:val="es-MX"/>
+        </w:rPr>
+      </w:pPr>
+      <w:r>
+        <w:rPr>
+          <w:rFonts w:ascii="Arial" w:eastAsiaTheme="minorHAnsi" w:hAnsi="Arial" w:cs="Arial"/>
+          <w:b/>
+          <w:bCs/>
+          <w:lang w:val="es-MX"/>
+        </w:rPr>
+        <w:t>HUJM-0</w:t>
+      </w:r>
+      <w:r>
+        <w:rPr>
+          <w:rFonts w:ascii="Arial" w:eastAsiaTheme="minorHAnsi" w:hAnsi="Arial" w:cs="Arial"/>
+          <w:b/>
+          <w:bCs/>
+          <w:lang w:val="es-MX"/>
+        </w:rPr>
+        <w:t>24</w:t>
+      </w:r>
+      <w:r>
+        <w:rPr>
+          <w:rFonts w:ascii="Arial" w:eastAsiaTheme="minorHAnsi" w:hAnsi="Arial" w:cs="Arial"/>
+          <w:b/>
+          <w:bCs/>
+          <w:lang w:val="es-MX"/>
+        </w:rPr>
+        <w:t xml:space="preserve"> - Establecer horario de check-in y del check-out</w:t>
+      </w:r>
+    </w:p>
+    <w:p>
+      <w:pPr>
+        <w:spacing w:before="100" w:beforeAutospacing="1" w:after="100" w:afterAutospacing="1" w:line="240" w:lineRule="auto"/>
+        <w:rPr>
+          <w:rFonts w:ascii="Arial" w:eastAsiaTheme="minorHAnsi" w:hAnsi="Arial" w:cs="Arial"/>
+          <w:sz w:val="20"/>
+          <w:szCs w:val="20"/>
+          <w:lang w:val="es-MX"/>
+        </w:rPr>
+      </w:pPr>
+      <w:r>
+        <w:rPr>
+          <w:rFonts w:ascii="Arial" w:eastAsiaTheme="minorHAnsi" w:hAnsi="Arial" w:cs="Arial"/>
+          <w:sz w:val="20"/>
+          <w:szCs w:val="20"/>
+          <w:lang w:val="es-MX"/>
+        </w:rPr>
+        <w:t>Cómo: Locación</w:t>
+      </w:r>
+    </w:p>
+    <w:p>
+      <w:pPr>
+        <w:spacing w:before="100" w:beforeAutospacing="1" w:after="100" w:afterAutospacing="1" w:line="240" w:lineRule="auto"/>
+        <w:rPr>
+          <w:rFonts w:ascii="Arial" w:eastAsiaTheme="minorHAnsi" w:hAnsi="Arial" w:cs="Arial"/>
+          <w:sz w:val="20"/>
+          <w:szCs w:val="20"/>
+          <w:lang w:val="es-MX"/>
+        </w:rPr>
+      </w:pPr>
+      <w:r>
+        <w:rPr>
+          <w:rFonts w:ascii="Arial" w:eastAsiaTheme="minorHAnsi" w:hAnsi="Arial" w:cs="Arial"/>
+          <w:sz w:val="20"/>
+          <w:szCs w:val="20"/>
+          <w:lang w:val="es-MX"/>
+        </w:rPr>
+        <w:t>Quiero: Definir un horario disponible para la llegada y salida de los huéspedes</w:t>
+      </w:r>
+    </w:p>
+    <w:p>
+      <w:pPr>
+        <w:spacing w:before="100" w:beforeAutospacing="1" w:after="100" w:afterAutospacing="1" w:line="240" w:lineRule="auto"/>
+        <w:rPr>
+          <w:rFonts w:ascii="Arial" w:eastAsiaTheme="minorHAnsi" w:hAnsi="Arial" w:cs="Arial"/>
+          <w:sz w:val="20"/>
+          <w:szCs w:val="20"/>
+          <w:lang w:val="es-MX"/>
+        </w:rPr>
+      </w:pPr>
+      <w:r>
+        <w:rPr>
+          <w:rFonts w:ascii="Arial" w:eastAsiaTheme="minorHAnsi" w:hAnsi="Arial" w:cs="Arial"/>
+          <w:sz w:val="20"/>
+          <w:szCs w:val="20"/>
+          <w:lang w:val="es-MX"/>
+        </w:rPr>
+        <w:lastRenderedPageBreak/>
+        <w:t>Para: Asegurar que las estancias se organicen de forma eficiente y sin conflictos</w:t>
+      </w:r>
+    </w:p>
+    <w:p>
+      <w:pPr>
+        <w:spacing w:before="100" w:beforeAutospacing="1" w:after="100" w:afterAutospacing="1" w:line="240" w:lineRule="auto"/>
+        <w:rPr>
+          <w:rFonts w:ascii="Arial" w:eastAsiaTheme="minorHAnsi" w:hAnsi="Arial" w:cs="Arial"/>
+          <w:b/>
+          <w:bCs/>
+          <w:sz w:val="20"/>
+          <w:szCs w:val="20"/>
+          <w:lang w:val="es-MX"/>
+        </w:rPr>
+      </w:pPr>
+      <w:r>
+        <w:rPr>
+          <w:rFonts w:ascii="Arial" w:eastAsiaTheme="minorHAnsi" w:hAnsi="Arial" w:cs="Arial"/>
+          <w:b/>
+          <w:bCs/>
+          <w:sz w:val="20"/>
+          <w:szCs w:val="20"/>
+          <w:lang w:val="es-MX"/>
+        </w:rPr>
+        <w:t>Tupla: Soporte Técnico</w:t>
+      </w:r>
+    </w:p>
+    <w:p>
+      <w:pPr>
+        <w:pStyle w:val="paragraph"/>
+        <w:textAlignment w:val="baseline"/>
+        <w:rPr>
+          <w:rFonts w:ascii="Segoe UI" w:hAnsi="Segoe UI" w:cs="Segoe UI"/>
+          <w:b/>
+          <w:sz w:val="18"/>
+          <w:szCs w:val="18"/>
+        </w:rPr>
+      </w:pPr>
+      <w:r>
+        <w:rPr>
+          <w:rFonts w:ascii="Segoe UI" w:hAnsi="Segoe UI" w:cs="Segoe UI"/>
+          <w:b/>
+          <w:sz w:val="18"/>
+          <w:szCs w:val="18"/>
+        </w:rPr>
+        <w:t xml:space="preserve">HUAG-025: </w:t>
+      </w:r>
+    </w:p>
+    <w:p>
+      <w:pPr>
+        <w:pStyle w:val="paragraph"/>
+        <w:textAlignment w:val="baseline"/>
+        <w:rPr>
+          <w:rFonts w:ascii="Segoe UI" w:hAnsi="Segoe UI" w:cs="Segoe UI"/>
+          <w:sz w:val="18"/>
+          <w:szCs w:val="18"/>
+        </w:rPr>
+      </w:pPr>
+      <w:r>
+        <w:rPr>
+          <w:rFonts w:ascii="Segoe UI" w:hAnsi="Segoe UI" w:cs="Segoe UI"/>
+          <w:sz w:val="18"/>
+          <w:szCs w:val="18"/>
+        </w:rPr>
+        <w:t>Como huésped o anfitrión de Airbnb,</w:t>
+      </w:r>
+    </w:p>
+    <w:p>
+      <w:pPr>
+        <w:pStyle w:val="paragraph"/>
+        <w:textAlignment w:val="baseline"/>
+        <w:rPr>
+          <w:rFonts w:ascii="Segoe UI" w:hAnsi="Segoe UI" w:cs="Segoe UI"/>
+          <w:sz w:val="18"/>
+          <w:szCs w:val="18"/>
+        </w:rPr>
+      </w:pPr>
+      <w:r>
+        <w:rPr>
+          <w:rFonts w:ascii="Segoe UI" w:hAnsi="Segoe UI" w:cs="Segoe UI"/>
+          <w:sz w:val="18"/>
+          <w:szCs w:val="18"/>
+        </w:rPr>
+        <w:t>quiero poder contactar al soporte técnico rápidamente a través de un chat en la plataforma,</w:t>
+      </w:r>
+    </w:p>
+    <w:p>
+      <w:pPr>
+        <w:pStyle w:val="paragraph"/>
+        <w:spacing w:before="0" w:beforeAutospacing="0" w:after="0" w:afterAutospacing="0"/>
+        <w:textAlignment w:val="baseline"/>
+        <w:rPr>
+          <w:rFonts w:ascii="Segoe UI" w:hAnsi="Segoe UI" w:cs="Segoe UI"/>
+          <w:sz w:val="18"/>
+          <w:szCs w:val="18"/>
+        </w:rPr>
+      </w:pPr>
+      <w:r>
+        <w:rPr>
+          <w:rFonts w:ascii="Segoe UI" w:hAnsi="Segoe UI" w:cs="Segoe UI"/>
+          <w:sz w:val="18"/>
+          <w:szCs w:val="18"/>
+        </w:rPr>
+        <w:t>para poder resolver problemas técnicos como errores de reserva, pagos fallidos o problemas con mi cuenta de forma eficiente.</w:t>
+      </w:r>
+    </w:p>
+    <w:p>
+      <w:pPr>
+        <w:pStyle w:val="paragraph"/>
+        <w:spacing w:before="0" w:beforeAutospacing="0" w:after="0" w:afterAutospacing="0"/>
+        <w:textAlignment w:val="baseline"/>
+        <w:rPr>
+          <w:rFonts w:ascii="Segoe UI" w:hAnsi="Segoe UI" w:cs="Segoe UI"/>
+          <w:sz w:val="18"/>
+          <w:szCs w:val="18"/>
+        </w:rPr>
+      </w:pPr>
+    </w:p>
+    <w:p>
+      <w:pPr>
+        <w:pStyle w:val="paragraph"/>
+        <w:textAlignment w:val="baseline"/>
+        <w:rPr>
+          <w:rFonts w:ascii="Segoe UI" w:hAnsi="Segoe UI" w:cs="Segoe UI"/>
+          <w:b/>
+          <w:sz w:val="18"/>
+          <w:szCs w:val="18"/>
+        </w:rPr>
+      </w:pPr>
+      <w:r>
+        <w:rPr>
+          <w:rFonts w:ascii="Segoe UI" w:hAnsi="Segoe UI" w:cs="Segoe UI"/>
+          <w:b/>
+          <w:sz w:val="18"/>
+          <w:szCs w:val="18"/>
+        </w:rPr>
+        <w:t>HUAG-026:</w:t>
+      </w:r>
+    </w:p>
+    <w:p>
+      <w:pPr>
+        <w:pStyle w:val="paragraph"/>
+        <w:textAlignment w:val="baseline"/>
+        <w:rPr>
+          <w:rFonts w:ascii="Segoe UI" w:hAnsi="Segoe UI" w:cs="Segoe UI"/>
+          <w:sz w:val="18"/>
+          <w:szCs w:val="18"/>
+        </w:rPr>
+      </w:pPr>
+      <w:r>
+        <w:rPr>
+          <w:rFonts w:ascii="Segoe UI" w:hAnsi="Segoe UI" w:cs="Segoe UI"/>
+          <w:sz w:val="18"/>
+          <w:szCs w:val="18"/>
+        </w:rPr>
+        <w:t>Como técnico de soporte,</w:t>
+      </w:r>
+    </w:p>
+    <w:p>
+      <w:pPr>
+        <w:pStyle w:val="paragraph"/>
+        <w:textAlignment w:val="baseline"/>
+        <w:rPr>
+          <w:rFonts w:ascii="Segoe UI" w:hAnsi="Segoe UI" w:cs="Segoe UI"/>
+          <w:sz w:val="18"/>
+          <w:szCs w:val="18"/>
+        </w:rPr>
+      </w:pPr>
+      <w:r>
+        <w:rPr>
+          <w:rFonts w:ascii="Segoe UI" w:hAnsi="Segoe UI" w:cs="Segoe UI"/>
+          <w:sz w:val="18"/>
+          <w:szCs w:val="18"/>
+        </w:rPr>
+        <w:t>quiero ver una lista de tickets pendientes y asignarme uno,</w:t>
+      </w:r>
+    </w:p>
+    <w:p>
+      <w:pPr>
+        <w:pStyle w:val="paragraph"/>
+        <w:spacing w:before="0" w:beforeAutospacing="0" w:after="0" w:afterAutospacing="0"/>
+        <w:textAlignment w:val="baseline"/>
+        <w:rPr>
+          <w:rFonts w:ascii="Segoe UI" w:hAnsi="Segoe UI" w:cs="Segoe UI"/>
+          <w:sz w:val="18"/>
+          <w:szCs w:val="18"/>
+        </w:rPr>
+      </w:pPr>
+      <w:r>
+        <w:rPr>
+          <w:rFonts w:ascii="Segoe UI" w:hAnsi="Segoe UI" w:cs="Segoe UI"/>
+          <w:sz w:val="18"/>
+          <w:szCs w:val="18"/>
+        </w:rPr>
+        <w:t>para poder empezar a resolverlo de forma organizada.</w:t>
+      </w:r>
+    </w:p>
+    <w:p>
+      <w:pPr>
+        <w:pStyle w:val="paragraph"/>
+        <w:spacing w:before="0" w:beforeAutospacing="0" w:after="0" w:afterAutospacing="0"/>
+        <w:textAlignment w:val="baseline"/>
+        <w:rPr>
+          <w:rFonts w:ascii="Segoe UI" w:hAnsi="Segoe UI" w:cs="Segoe UI"/>
+          <w:sz w:val="18"/>
+          <w:szCs w:val="18"/>
+        </w:rPr>
+      </w:pPr>
+    </w:p>
+    <w:p>
+      <w:pPr>
+        <w:pStyle w:val="paragraph"/>
+        <w:textAlignment w:val="baseline"/>
+        <w:rPr>
+          <w:rFonts w:ascii="Segoe UI" w:hAnsi="Segoe UI" w:cs="Segoe UI"/>
+          <w:b/>
+          <w:sz w:val="18"/>
+          <w:szCs w:val="18"/>
+        </w:rPr>
+      </w:pPr>
+      <w:r>
+        <w:rPr>
+          <w:rFonts w:ascii="Segoe UI" w:hAnsi="Segoe UI" w:cs="Segoe UI"/>
+          <w:b/>
+          <w:sz w:val="18"/>
+          <w:szCs w:val="18"/>
+        </w:rPr>
+        <w:t>HUAG-027:</w:t>
+      </w:r>
+    </w:p>
+    <w:p>
+      <w:pPr>
+        <w:pStyle w:val="paragraph"/>
+        <w:textAlignment w:val="baseline"/>
+        <w:rPr>
+          <w:rFonts w:ascii="Segoe UI" w:hAnsi="Segoe UI" w:cs="Segoe UI"/>
+          <w:sz w:val="18"/>
+          <w:szCs w:val="18"/>
+        </w:rPr>
+      </w:pPr>
+      <w:r>
+        <w:rPr>
+          <w:rFonts w:ascii="Segoe UI" w:hAnsi="Segoe UI" w:cs="Segoe UI"/>
+          <w:sz w:val="18"/>
+          <w:szCs w:val="18"/>
+        </w:rPr>
+        <w:t>Como administrador de soporte,</w:t>
+      </w:r>
+    </w:p>
+    <w:p>
+      <w:pPr>
+        <w:pStyle w:val="paragraph"/>
+        <w:textAlignment w:val="baseline"/>
+        <w:rPr>
+          <w:rFonts w:ascii="Segoe UI" w:hAnsi="Segoe UI" w:cs="Segoe UI"/>
+          <w:sz w:val="18"/>
+          <w:szCs w:val="18"/>
+        </w:rPr>
+      </w:pPr>
+      <w:r>
+        <w:rPr>
+          <w:rFonts w:ascii="Segoe UI" w:hAnsi="Segoe UI" w:cs="Segoe UI"/>
+          <w:sz w:val="18"/>
+          <w:szCs w:val="18"/>
+        </w:rPr>
+        <w:t>quiero poder hacer seguimiento al estado de cada ticket (pendiente, en proceso, resuelto),</w:t>
+      </w:r>
+    </w:p>
+    <w:p>
+      <w:pPr>
+        <w:pStyle w:val="paragraph"/>
+        <w:spacing w:before="0" w:beforeAutospacing="0" w:after="0" w:afterAutospacing="0"/>
+        <w:textAlignment w:val="baseline"/>
+        <w:rPr>
+          <w:rFonts w:ascii="Segoe UI" w:hAnsi="Segoe UI" w:cs="Segoe UI"/>
+          <w:sz w:val="18"/>
+          <w:szCs w:val="18"/>
+        </w:rPr>
+      </w:pPr>
+      <w:r>
+        <w:rPr>
+          <w:rFonts w:ascii="Segoe UI" w:hAnsi="Segoe UI" w:cs="Segoe UI"/>
+          <w:sz w:val="18"/>
+          <w:szCs w:val="18"/>
+        </w:rPr>
+        <w:t>para asegurarme de que los problemas se están resolviendo eficientemente.</w:t>
+      </w:r>
+    </w:p>
+    <w:p>
+      <w:pPr>
+        <w:pStyle w:val="paragraph"/>
+        <w:spacing w:before="0" w:beforeAutospacing="0" w:after="0" w:afterAutospacing="0"/>
+        <w:textAlignment w:val="baseline"/>
+        <w:rPr>
+          <w:rFonts w:ascii="Segoe UI" w:hAnsi="Segoe UI" w:cs="Segoe UI"/>
+          <w:sz w:val="18"/>
+          <w:szCs w:val="18"/>
+        </w:rPr>
+      </w:pPr>
+    </w:p>
+    <w:p>
+      <w:pPr>
+        <w:pStyle w:val="paragraph"/>
+        <w:spacing w:before="0" w:beforeAutospacing="0" w:after="0" w:afterAutospacing="0"/>
+        <w:textAlignment w:val="baseline"/>
+        <w:rPr>
+          <w:rFonts w:ascii="Segoe UI" w:hAnsi="Segoe UI" w:cs="Segoe UI"/>
+          <w:b/>
+          <w:bCs/>
+          <w:sz w:val="20"/>
+          <w:szCs w:val="20"/>
+        </w:rPr>
+      </w:pPr>
+      <w:r>
+        <w:rPr>
+          <w:rFonts w:ascii="Segoe UI" w:hAnsi="Segoe UI" w:cs="Segoe UI"/>
+          <w:b/>
+          <w:bCs/>
+          <w:sz w:val="20"/>
+          <w:szCs w:val="20"/>
+        </w:rPr>
+        <w:t xml:space="preserve">Tupla: Empleados </w:t>
+      </w:r>
+    </w:p>
+    <w:p>
+      <w:pPr>
+        <w:pStyle w:val="paragraph"/>
+        <w:spacing w:before="0" w:beforeAutospacing="0" w:after="0" w:afterAutospacing="0"/>
+        <w:textAlignment w:val="baseline"/>
+        <w:rPr>
+          <w:rFonts w:ascii="Segoe UI" w:hAnsi="Segoe UI" w:cs="Segoe UI"/>
+          <w:b/>
+          <w:bCs/>
+          <w:sz w:val="20"/>
+          <w:szCs w:val="20"/>
+        </w:rPr>
+      </w:pPr>
+    </w:p>
+    <w:p>
+      <w:pPr>
+        <w:pStyle w:val="paragraph"/>
+        <w:spacing w:before="0" w:beforeAutospacing="0" w:after="0" w:afterAutospacing="0" w:line="480" w:lineRule="auto"/>
+        <w:textAlignment w:val="baseline"/>
+        <w:rPr>
+          <w:rFonts w:ascii="Segoe UI" w:hAnsi="Segoe UI" w:cs="Segoe UI"/>
+          <w:sz w:val="18"/>
+          <w:szCs w:val="18"/>
+        </w:rPr>
+      </w:pPr>
+      <w:r>
+        <w:rPr>
+          <w:rFonts w:ascii="Segoe UI" w:hAnsi="Segoe UI" w:cs="Segoe UI"/>
+          <w:b/>
+          <w:bCs/>
+          <w:sz w:val="18"/>
+          <w:szCs w:val="18"/>
+        </w:rPr>
+        <w:t>HUFP-0</w:t>
+      </w:r>
+      <w:r>
+        <w:rPr>
+          <w:rFonts w:ascii="Segoe UI" w:hAnsi="Segoe UI" w:cs="Segoe UI"/>
+          <w:b/>
+          <w:bCs/>
+          <w:sz w:val="18"/>
+          <w:szCs w:val="18"/>
+        </w:rPr>
+        <w:t>28</w:t>
+      </w:r>
+      <w:r>
+        <w:rPr>
+          <w:rFonts w:ascii="Segoe UI" w:hAnsi="Segoe UI" w:cs="Segoe UI"/>
+          <w:sz w:val="18"/>
+          <w:szCs w:val="18"/>
+        </w:rPr>
+        <w:t xml:space="preserve"> </w:t>
+      </w:r>
+    </w:p>
+    <w:p>
+      <w:pPr>
+        <w:pStyle w:val="paragraph"/>
+        <w:spacing w:before="0" w:beforeAutospacing="0" w:after="0" w:afterAutospacing="0" w:line="480" w:lineRule="auto"/>
+        <w:textAlignment w:val="baseline"/>
+        <w:rPr>
+          <w:rFonts w:ascii="Segoe UI" w:hAnsi="Segoe UI" w:cs="Segoe UI"/>
+          <w:sz w:val="18"/>
+          <w:szCs w:val="18"/>
+        </w:rPr>
+      </w:pPr>
+      <w:r>
+        <w:rPr>
+          <w:rFonts w:ascii="Segoe UI" w:hAnsi="Segoe UI" w:cs="Segoe UI"/>
+          <w:sz w:val="18"/>
+          <w:szCs w:val="18"/>
+        </w:rPr>
+        <w:t xml:space="preserve">Lista de los empleados </w:t>
+      </w:r>
+    </w:p>
+    <w:p>
+      <w:pPr>
+        <w:pStyle w:val="paragraph"/>
+        <w:spacing w:before="0" w:beforeAutospacing="0" w:after="0" w:afterAutospacing="0" w:line="480" w:lineRule="auto"/>
+        <w:textAlignment w:val="baseline"/>
+        <w:rPr>
+          <w:rFonts w:ascii="Segoe UI" w:hAnsi="Segoe UI" w:cs="Segoe UI"/>
+          <w:sz w:val="18"/>
+          <w:szCs w:val="18"/>
+        </w:rPr>
+      </w:pPr>
+      <w:r>
+        <w:rPr>
+          <w:rFonts w:ascii="Segoe UI" w:hAnsi="Segoe UI" w:cs="Segoe UI"/>
+          <w:sz w:val="18"/>
+          <w:szCs w:val="18"/>
+        </w:rPr>
+        <w:t xml:space="preserve">Como: Administrador de recursos humanos </w:t>
+      </w:r>
+    </w:p>
+    <w:p>
+      <w:pPr>
+        <w:pStyle w:val="paragraph"/>
+        <w:spacing w:before="0" w:beforeAutospacing="0" w:after="0" w:afterAutospacing="0" w:line="480" w:lineRule="auto"/>
+        <w:textAlignment w:val="baseline"/>
+        <w:rPr>
+          <w:rFonts w:ascii="Segoe UI" w:hAnsi="Segoe UI" w:cs="Segoe UI"/>
+          <w:sz w:val="18"/>
+          <w:szCs w:val="18"/>
+        </w:rPr>
+      </w:pPr>
+      <w:r>
+        <w:rPr>
+          <w:rFonts w:ascii="Segoe UI" w:hAnsi="Segoe UI" w:cs="Segoe UI"/>
+          <w:sz w:val="18"/>
+          <w:szCs w:val="18"/>
+        </w:rPr>
+        <w:t xml:space="preserve">Quiero: Poder ver una lista de empleados activos </w:t>
+      </w:r>
+    </w:p>
+    <w:p>
+      <w:pPr>
+        <w:pStyle w:val="paragraph"/>
+        <w:spacing w:before="0" w:beforeAutospacing="0" w:after="0" w:afterAutospacing="0" w:line="480" w:lineRule="auto"/>
+        <w:textAlignment w:val="baseline"/>
+        <w:rPr>
+          <w:rFonts w:ascii="Segoe UI" w:hAnsi="Segoe UI" w:cs="Segoe UI"/>
+          <w:sz w:val="18"/>
+          <w:szCs w:val="18"/>
+        </w:rPr>
+      </w:pPr>
+      <w:r>
+        <w:rPr>
+          <w:rFonts w:ascii="Segoe UI" w:hAnsi="Segoe UI" w:cs="Segoe UI"/>
+          <w:sz w:val="18"/>
+          <w:szCs w:val="18"/>
+        </w:rPr>
+        <w:t>Para: Poder gestionar de manera eficiente los recursos y asegurarme de que solo los empleados vigentes están siendo considerados en los procesos internos.</w:t>
+      </w:r>
+    </w:p>
+    <w:p>
+      <w:pPr>
+        <w:pStyle w:val="paragraph"/>
+        <w:spacing w:before="0" w:beforeAutospacing="0" w:after="0" w:afterAutospacing="0" w:line="480" w:lineRule="auto"/>
+        <w:textAlignment w:val="baseline"/>
+        <w:rPr>
+          <w:rFonts w:ascii="Segoe UI" w:hAnsi="Segoe UI" w:cs="Segoe UI"/>
+          <w:b/>
+          <w:bCs/>
+          <w:sz w:val="18"/>
+          <w:szCs w:val="18"/>
+        </w:rPr>
+      </w:pPr>
+      <w:r>
+        <w:rPr>
+          <w:rFonts w:ascii="Segoe UI" w:hAnsi="Segoe UI" w:cs="Segoe UI"/>
+          <w:b/>
+          <w:bCs/>
+          <w:sz w:val="18"/>
+          <w:szCs w:val="18"/>
+        </w:rPr>
+        <w:t>HUFP-0</w:t>
+      </w:r>
+      <w:r>
+        <w:rPr>
+          <w:rFonts w:ascii="Segoe UI" w:hAnsi="Segoe UI" w:cs="Segoe UI"/>
+          <w:b/>
+          <w:bCs/>
+          <w:sz w:val="18"/>
+          <w:szCs w:val="18"/>
+        </w:rPr>
+        <w:t>29</w:t>
+      </w:r>
+      <w:r>
+        <w:rPr>
+          <w:rFonts w:ascii="Segoe UI" w:hAnsi="Segoe UI" w:cs="Segoe UI"/>
+          <w:b/>
+          <w:bCs/>
+          <w:sz w:val="18"/>
+          <w:szCs w:val="18"/>
+        </w:rPr>
+        <w:t xml:space="preserve">: Registro de nuevos empleados </w:t>
+      </w:r>
+    </w:p>
+    <w:p>
+      <w:pPr>
+        <w:pStyle w:val="paragraph"/>
+        <w:spacing w:before="0" w:beforeAutospacing="0" w:after="0" w:afterAutospacing="0" w:line="480" w:lineRule="auto"/>
+        <w:textAlignment w:val="baseline"/>
+        <w:rPr>
+          <w:rFonts w:ascii="Segoe UI" w:hAnsi="Segoe UI" w:cs="Segoe UI"/>
+          <w:sz w:val="18"/>
+          <w:szCs w:val="18"/>
+        </w:rPr>
+      </w:pPr>
+      <w:r>
+        <w:rPr>
+          <w:rFonts w:ascii="Segoe UI" w:hAnsi="Segoe UI" w:cs="Segoe UI"/>
+          <w:sz w:val="18"/>
+          <w:szCs w:val="18"/>
+        </w:rPr>
+        <w:t xml:space="preserve">Como: Responsable de contratación </w:t>
+      </w:r>
+    </w:p>
+    <w:p>
+      <w:pPr>
+        <w:pStyle w:val="paragraph"/>
+        <w:spacing w:before="0" w:beforeAutospacing="0" w:after="0" w:afterAutospacing="0" w:line="480" w:lineRule="auto"/>
+        <w:textAlignment w:val="baseline"/>
+        <w:rPr>
+          <w:rFonts w:ascii="Segoe UI" w:hAnsi="Segoe UI" w:cs="Segoe UI"/>
+          <w:sz w:val="18"/>
+          <w:szCs w:val="18"/>
+        </w:rPr>
+      </w:pPr>
+      <w:r>
+        <w:rPr>
+          <w:rFonts w:ascii="Segoe UI" w:hAnsi="Segoe UI" w:cs="Segoe UI"/>
+          <w:sz w:val="18"/>
+          <w:szCs w:val="18"/>
+        </w:rPr>
+        <w:t xml:space="preserve">Quiero: Poder agregar nuevos empleados con su información (nombre, apellido, correo, teléfono, cargo, fecha de contratación) </w:t>
+      </w:r>
+    </w:p>
+    <w:p>
+      <w:pPr>
+        <w:pStyle w:val="paragraph"/>
+        <w:spacing w:before="0" w:beforeAutospacing="0" w:after="0" w:afterAutospacing="0" w:line="480" w:lineRule="auto"/>
+        <w:textAlignment w:val="baseline"/>
+        <w:rPr>
+          <w:rFonts w:ascii="Segoe UI" w:hAnsi="Segoe UI" w:cs="Segoe UI"/>
+          <w:sz w:val="18"/>
+          <w:szCs w:val="18"/>
+        </w:rPr>
+      </w:pPr>
+      <w:r>
+        <w:rPr>
+          <w:rFonts w:ascii="Segoe UI" w:hAnsi="Segoe UI" w:cs="Segoe UI"/>
+          <w:sz w:val="18"/>
+          <w:szCs w:val="18"/>
+        </w:rPr>
+        <w:t>Para: Mantener la base de datos actualizada y asegurarme de que se realice un registro adecuado y completo de todos los empleados nuevos.</w:t>
+      </w:r>
+    </w:p>
+    <w:p>
+      <w:pPr>
+        <w:pStyle w:val="paragraph"/>
+        <w:spacing w:before="0" w:beforeAutospacing="0" w:after="0" w:afterAutospacing="0" w:line="480" w:lineRule="auto"/>
+        <w:textAlignment w:val="baseline"/>
+        <w:rPr>
+          <w:rFonts w:ascii="Segoe UI" w:hAnsi="Segoe UI" w:cs="Segoe UI"/>
+          <w:b/>
+          <w:bCs/>
+          <w:sz w:val="20"/>
+          <w:szCs w:val="20"/>
+        </w:rPr>
+      </w:pPr>
+      <w:r>
+        <w:rPr>
+          <w:rFonts w:ascii="Segoe UI" w:hAnsi="Segoe UI" w:cs="Segoe UI"/>
+          <w:b/>
+          <w:bCs/>
+          <w:sz w:val="20"/>
+          <w:szCs w:val="20"/>
+        </w:rPr>
+        <w:t>HUFP-0</w:t>
+      </w:r>
+      <w:r>
+        <w:rPr>
+          <w:rFonts w:ascii="Segoe UI" w:hAnsi="Segoe UI" w:cs="Segoe UI"/>
+          <w:b/>
+          <w:bCs/>
+          <w:sz w:val="20"/>
+          <w:szCs w:val="20"/>
+        </w:rPr>
+        <w:t>30</w:t>
+      </w:r>
+      <w:r>
+        <w:rPr>
+          <w:rFonts w:ascii="Segoe UI" w:hAnsi="Segoe UI" w:cs="Segoe UI"/>
+          <w:b/>
+          <w:bCs/>
+          <w:sz w:val="20"/>
+          <w:szCs w:val="20"/>
+        </w:rPr>
+        <w:t xml:space="preserve">: Actualización de la información del empleado </w:t>
+      </w:r>
+    </w:p>
+    <w:p>
+      <w:pPr>
+        <w:pStyle w:val="paragraph"/>
+        <w:spacing w:before="0" w:beforeAutospacing="0" w:after="0" w:afterAutospacing="0" w:line="480" w:lineRule="auto"/>
+        <w:textAlignment w:val="baseline"/>
+        <w:rPr>
+          <w:rFonts w:ascii="Segoe UI" w:hAnsi="Segoe UI" w:cs="Segoe UI"/>
+          <w:sz w:val="18"/>
+          <w:szCs w:val="18"/>
+        </w:rPr>
+      </w:pPr>
+      <w:r>
+        <w:rPr>
+          <w:rFonts w:ascii="Segoe UI" w:hAnsi="Segoe UI" w:cs="Segoe UI"/>
+          <w:sz w:val="18"/>
+          <w:szCs w:val="18"/>
+        </w:rPr>
+        <w:t xml:space="preserve">Como: Gerente de departamento </w:t>
+      </w:r>
+    </w:p>
+    <w:p>
+      <w:pPr>
+        <w:pStyle w:val="paragraph"/>
+        <w:spacing w:before="0" w:beforeAutospacing="0" w:after="0" w:afterAutospacing="0" w:line="480" w:lineRule="auto"/>
+        <w:textAlignment w:val="baseline"/>
+        <w:rPr>
+          <w:rFonts w:ascii="Segoe UI" w:hAnsi="Segoe UI" w:cs="Segoe UI"/>
+          <w:sz w:val="18"/>
+          <w:szCs w:val="18"/>
+        </w:rPr>
+      </w:pPr>
+      <w:r>
+        <w:rPr>
+          <w:rFonts w:ascii="Segoe UI" w:hAnsi="Segoe UI" w:cs="Segoe UI"/>
+          <w:sz w:val="18"/>
+          <w:szCs w:val="18"/>
+        </w:rPr>
+        <w:lastRenderedPageBreak/>
+        <w:t xml:space="preserve">Quiero: Poder actualizar la información de los empleados (cargo, teléfono, correo) </w:t>
+      </w:r>
+    </w:p>
+    <w:p>
+      <w:pPr>
+        <w:pStyle w:val="paragraph"/>
+        <w:spacing w:before="0" w:beforeAutospacing="0" w:after="0" w:afterAutospacing="0" w:line="480" w:lineRule="auto"/>
+        <w:textAlignment w:val="baseline"/>
+        <w:rPr>
+          <w:rFonts w:ascii="Segoe UI" w:hAnsi="Segoe UI" w:cs="Segoe UI"/>
+          <w:sz w:val="18"/>
+          <w:szCs w:val="18"/>
+        </w:rPr>
+      </w:pPr>
+      <w:r>
+        <w:rPr>
+          <w:rFonts w:ascii="Segoe UI" w:hAnsi="Segoe UI" w:cs="Segoe UI"/>
+          <w:sz w:val="18"/>
+          <w:szCs w:val="18"/>
+        </w:rPr>
+        <w:t>Para: Asegurarme de que la base de datos siempre refleje la información más actual y optimizar la comunicación dentro del equipo.</w:t>
+      </w:r>
+    </w:p>
+    <w:p>
+      <w:pPr>
+        <w:pStyle w:val="paragraph"/>
+        <w:spacing w:before="0" w:beforeAutospacing="0" w:after="0" w:afterAutospacing="0"/>
+        <w:textAlignment w:val="baseline"/>
+        <w:rPr>
+          <w:rFonts w:ascii="Segoe UI" w:hAnsi="Segoe UI" w:cs="Segoe UI"/>
+          <w:sz w:val="18"/>
+          <w:szCs w:val="18"/>
+        </w:rPr>
+      </w:pPr>
+    </w:p>
+    <w:p>
+      <w:pPr>
+        <w:spacing w:before="100" w:beforeAutospacing="1" w:after="100" w:afterAutospacing="1" w:line="240" w:lineRule="auto"/>
+        <w:rPr>
+          <w:rFonts w:ascii="Arial" w:eastAsiaTheme="minorHAnsi" w:hAnsi="Arial" w:cs="Arial"/>
+          <w:b/>
+          <w:sz w:val="20"/>
+          <w:szCs w:val="20"/>
+          <w:lang w:val="es-MX"/>
+        </w:rPr>
+      </w:pPr>
+      <w:r>
+        <w:rPr>
+          <w:rFonts w:ascii="Arial" w:eastAsiaTheme="minorHAnsi" w:hAnsi="Arial" w:cs="Arial"/>
+          <w:b/>
+          <w:sz w:val="20"/>
+          <w:szCs w:val="20"/>
+          <w:lang w:val="es-MX"/>
+        </w:rPr>
+        <w:t>Tupla : Reserva</w:t>
+      </w:r>
+    </w:p>
+    <w:p>
+      <w:pPr>
+        <w:spacing w:before="100" w:beforeAutospacing="1" w:after="100" w:afterAutospacing="1" w:line="240" w:lineRule="auto"/>
+        <w:rPr>
+          <w:rFonts w:ascii="Arial" w:eastAsiaTheme="minorHAnsi" w:hAnsi="Arial" w:cs="Arial"/>
+          <w:sz w:val="20"/>
+          <w:szCs w:val="20"/>
+          <w:lang w:val="es-MX"/>
+        </w:rPr>
+      </w:pPr>
+      <w:r>
+        <w:rPr>
+          <w:rFonts w:ascii="Arial" w:eastAsiaTheme="minorHAnsi" w:hAnsi="Arial" w:cs="Arial"/>
+          <w:sz w:val="20"/>
+          <w:szCs w:val="20"/>
+          <w:lang w:val="es-MX"/>
+        </w:rPr>
+        <w:t>HUCP-03</w:t>
+      </w:r>
+      <w:r>
+        <w:rPr>
+          <w:rFonts w:ascii="Arial" w:eastAsiaTheme="minorHAnsi" w:hAnsi="Arial" w:cs="Arial"/>
+          <w:sz w:val="20"/>
+          <w:szCs w:val="20"/>
+          <w:lang w:val="es-MX"/>
+        </w:rPr>
+        <w:t>1 Realizar Nueva Reserva</w:t>
+      </w:r>
+    </w:p>
+    <w:p>
+      <w:pPr>
+        <w:spacing w:before="100" w:beforeAutospacing="1" w:after="100" w:afterAutospacing="1" w:line="240" w:lineRule="auto"/>
+        <w:rPr>
+          <w:rFonts w:ascii="Arial" w:eastAsiaTheme="minorHAnsi" w:hAnsi="Arial" w:cs="Arial"/>
+          <w:sz w:val="20"/>
+          <w:szCs w:val="20"/>
+          <w:lang w:val="es-MX"/>
+        </w:rPr>
+      </w:pPr>
+      <w:r>
+        <w:rPr>
+          <w:rFonts w:ascii="Arial" w:eastAsiaTheme="minorHAnsi" w:hAnsi="Arial" w:cs="Arial"/>
+          <w:sz w:val="20"/>
+          <w:szCs w:val="20"/>
+          <w:lang w:val="es-MX"/>
+        </w:rPr>
+        <w:t>Como: Un invitado</w:t>
+      </w:r>
+    </w:p>
+    <w:p>
+      <w:pPr>
+        <w:spacing w:before="100" w:beforeAutospacing="1" w:after="100" w:afterAutospacing="1" w:line="240" w:lineRule="auto"/>
+        <w:rPr>
+          <w:rFonts w:ascii="Arial" w:eastAsiaTheme="minorHAnsi" w:hAnsi="Arial" w:cs="Arial"/>
+          <w:sz w:val="20"/>
+          <w:szCs w:val="20"/>
+          <w:lang w:val="es-MX"/>
+        </w:rPr>
+      </w:pPr>
+      <w:r>
+        <w:rPr>
+          <w:rFonts w:ascii="Arial" w:eastAsiaTheme="minorHAnsi" w:hAnsi="Arial" w:cs="Arial"/>
+          <w:sz w:val="20"/>
+          <w:szCs w:val="20"/>
+          <w:lang w:val="es-MX"/>
+        </w:rPr>
+        <w:t>Quiero: Seleccionar una propiedad, elegir mis fechas de inicio y fin, y confirmar una reserva</w:t>
+      </w:r>
+    </w:p>
+    <w:p>
+      <w:pPr>
+        <w:spacing w:before="100" w:beforeAutospacing="1" w:after="100" w:afterAutospacing="1" w:line="240" w:lineRule="auto"/>
+        <w:rPr>
+          <w:rFonts w:ascii="Arial" w:eastAsiaTheme="minorHAnsi" w:hAnsi="Arial" w:cs="Arial"/>
+          <w:sz w:val="20"/>
+          <w:szCs w:val="20"/>
+          <w:lang w:val="es-MX"/>
+        </w:rPr>
+      </w:pPr>
+      <w:r>
+        <w:rPr>
+          <w:rFonts w:ascii="Arial" w:eastAsiaTheme="minorHAnsi" w:hAnsi="Arial" w:cs="Arial"/>
+          <w:sz w:val="20"/>
+          <w:szCs w:val="20"/>
+          <w:lang w:val="es-MX"/>
+        </w:rPr>
+        <w:t>Para: Asegurar mi estancia en la propiedad deseada.</w:t>
+      </w:r>
+    </w:p>
+    <w:p>
+      <w:pPr>
+        <w:spacing w:before="100" w:beforeAutospacing="1" w:after="100" w:afterAutospacing="1" w:line="240" w:lineRule="auto"/>
+        <w:rPr>
+          <w:rFonts w:ascii="Arial" w:eastAsiaTheme="minorHAnsi" w:hAnsi="Arial" w:cs="Arial"/>
+          <w:sz w:val="20"/>
+          <w:szCs w:val="20"/>
+          <w:lang w:val="es-MX"/>
+        </w:rPr>
+      </w:pPr>
+    </w:p>
+    <w:p>
+      <w:pPr>
+        <w:spacing w:before="100" w:beforeAutospacing="1" w:after="100" w:afterAutospacing="1" w:line="240" w:lineRule="auto"/>
+        <w:rPr>
+          <w:rFonts w:ascii="Arial" w:eastAsiaTheme="minorHAnsi" w:hAnsi="Arial" w:cs="Arial"/>
+          <w:b/>
+          <w:sz w:val="20"/>
+          <w:szCs w:val="20"/>
+          <w:lang w:val="es-MX"/>
+        </w:rPr>
+      </w:pPr>
+      <w:r>
+        <w:rPr>
+          <w:rFonts w:ascii="Arial" w:eastAsiaTheme="minorHAnsi" w:hAnsi="Arial" w:cs="Arial"/>
+          <w:b/>
+          <w:sz w:val="20"/>
+          <w:szCs w:val="20"/>
+          <w:lang w:val="es-MX"/>
+        </w:rPr>
+        <w:t>HUCP-032 Gestionar Mis Reservas</w:t>
+      </w:r>
+    </w:p>
+    <w:p>
+      <w:pPr>
+        <w:spacing w:before="100" w:beforeAutospacing="1" w:after="100" w:afterAutospacing="1" w:line="240" w:lineRule="auto"/>
+        <w:rPr>
+          <w:rFonts w:ascii="Arial" w:eastAsiaTheme="minorHAnsi" w:hAnsi="Arial" w:cs="Arial"/>
+          <w:sz w:val="20"/>
+          <w:szCs w:val="20"/>
+          <w:lang w:val="es-MX"/>
+        </w:rPr>
+      </w:pPr>
+      <w:r>
+        <w:rPr>
+          <w:rFonts w:ascii="Arial" w:eastAsiaTheme="minorHAnsi" w:hAnsi="Arial" w:cs="Arial"/>
+          <w:sz w:val="20"/>
+          <w:szCs w:val="20"/>
+          <w:lang w:val="es-MX"/>
+        </w:rPr>
+        <w:t>Como: Un invitado o un anfitrión</w:t>
+      </w:r>
+    </w:p>
+    <w:p>
+      <w:pPr>
+        <w:spacing w:before="100" w:beforeAutospacing="1" w:after="100" w:afterAutospacing="1" w:line="240" w:lineRule="auto"/>
+        <w:rPr>
+          <w:rFonts w:ascii="Arial" w:eastAsiaTheme="minorHAnsi" w:hAnsi="Arial" w:cs="Arial"/>
+          <w:sz w:val="20"/>
+          <w:szCs w:val="20"/>
+          <w:lang w:val="es-MX"/>
+        </w:rPr>
+      </w:pPr>
+      <w:r>
+        <w:rPr>
+          <w:rFonts w:ascii="Arial" w:eastAsiaTheme="minorHAnsi" w:hAnsi="Arial" w:cs="Arial"/>
+          <w:sz w:val="20"/>
+          <w:szCs w:val="20"/>
+          <w:lang w:val="es-MX"/>
+        </w:rPr>
+        <w:t>Quiero: Ver el estado de mis reservas (confirmado, cancelado, completado) y tener la opción de modificar o cancelar una reserva si es necesario</w:t>
+      </w:r>
+    </w:p>
+    <w:p>
+      <w:pPr>
+        <w:spacing w:before="100" w:beforeAutospacing="1" w:after="100" w:afterAutospacing="1" w:line="240" w:lineRule="auto"/>
+        <w:rPr>
+          <w:rFonts w:ascii="Arial" w:eastAsiaTheme="minorHAnsi" w:hAnsi="Arial" w:cs="Arial"/>
+          <w:sz w:val="20"/>
+          <w:szCs w:val="20"/>
+          <w:lang w:val="es-MX"/>
+        </w:rPr>
+      </w:pPr>
+      <w:r>
+        <w:rPr>
+          <w:rFonts w:ascii="Arial" w:eastAsiaTheme="minorHAnsi" w:hAnsi="Arial" w:cs="Arial"/>
+          <w:sz w:val="20"/>
+          <w:szCs w:val="20"/>
+          <w:lang w:val="es-MX"/>
+        </w:rPr>
+        <w:t>Para: Tener control y visibilidad sobre mis estancias o la ocupación de mi propiedad.</w:t>
+      </w:r>
+    </w:p>
+    <w:p>
+      <w:pPr>
+        <w:spacing w:before="100" w:beforeAutospacing="1" w:after="100" w:afterAutospacing="1" w:line="240" w:lineRule="auto"/>
+        <w:rPr>
+          <w:rFonts w:ascii="Arial" w:eastAsiaTheme="minorHAnsi" w:hAnsi="Arial" w:cs="Arial"/>
+          <w:sz w:val="20"/>
+          <w:szCs w:val="20"/>
+          <w:lang w:val="es-MX"/>
+        </w:rPr>
+      </w:pPr>
+    </w:p>
+    <w:p>
+      <w:pPr>
+        <w:spacing w:before="100" w:beforeAutospacing="1" w:after="100" w:afterAutospacing="1" w:line="240" w:lineRule="auto"/>
+        <w:rPr>
+          <w:rFonts w:ascii="Arial" w:eastAsiaTheme="minorHAnsi" w:hAnsi="Arial" w:cs="Arial"/>
+          <w:b/>
+          <w:sz w:val="20"/>
+          <w:szCs w:val="20"/>
+          <w:lang w:val="es-MX"/>
+        </w:rPr>
+      </w:pPr>
+      <w:r>
+        <w:rPr>
+          <w:rFonts w:ascii="Arial" w:eastAsiaTheme="minorHAnsi" w:hAnsi="Arial" w:cs="Arial"/>
+          <w:b/>
+          <w:sz w:val="20"/>
+          <w:szCs w:val="20"/>
+          <w:lang w:val="es-MX"/>
+        </w:rPr>
+        <w:t>HUCP-003 Consultar Disponibilidad y Precios de Propiedades</w:t>
+      </w:r>
+    </w:p>
+    <w:p>
+      <w:pPr>
+        <w:spacing w:before="100" w:beforeAutospacing="1" w:after="100" w:afterAutospacing="1" w:line="240" w:lineRule="auto"/>
+        <w:rPr>
+          <w:rFonts w:ascii="Arial" w:eastAsiaTheme="minorHAnsi" w:hAnsi="Arial" w:cs="Arial"/>
+          <w:sz w:val="20"/>
+          <w:szCs w:val="20"/>
+          <w:lang w:val="es-MX"/>
+        </w:rPr>
+      </w:pPr>
+      <w:r>
+        <w:rPr>
+          <w:rFonts w:ascii="Arial" w:eastAsiaTheme="minorHAnsi" w:hAnsi="Arial" w:cs="Arial"/>
+          <w:sz w:val="20"/>
+          <w:szCs w:val="20"/>
+          <w:lang w:val="es-MX"/>
+        </w:rPr>
+        <w:t>Como: Un invitado</w:t>
+      </w:r>
+    </w:p>
+    <w:p>
+      <w:pPr>
+        <w:spacing w:before="100" w:beforeAutospacing="1" w:after="100" w:afterAutospacing="1" w:line="240" w:lineRule="auto"/>
+        <w:rPr>
+          <w:rFonts w:ascii="Arial" w:eastAsiaTheme="minorHAnsi" w:hAnsi="Arial" w:cs="Arial"/>
+          <w:sz w:val="20"/>
+          <w:szCs w:val="20"/>
+          <w:lang w:val="es-MX"/>
+        </w:rPr>
+      </w:pPr>
+      <w:r>
+        <w:rPr>
+          <w:rFonts w:ascii="Arial" w:eastAsiaTheme="minorHAnsi" w:hAnsi="Arial" w:cs="Arial"/>
+          <w:sz w:val="20"/>
+          <w:szCs w:val="20"/>
+          <w:lang w:val="es-MX"/>
+        </w:rPr>
+        <w:t>Quiero: Buscar propiedades y ver su precio por día y disponibilidad en un rango de fechas</w:t>
+      </w:r>
+    </w:p>
+    <w:p>
+      <w:pPr>
+        <w:spacing w:before="100" w:beforeAutospacing="1" w:after="100" w:afterAutospacing="1" w:line="240" w:lineRule="auto"/>
+        <w:rPr>
+          <w:rFonts w:ascii="Arial" w:eastAsiaTheme="minorHAnsi" w:hAnsi="Arial" w:cs="Arial"/>
+          <w:sz w:val="20"/>
+          <w:szCs w:val="20"/>
+          <w:lang w:val="es-MX"/>
+        </w:rPr>
+      </w:pPr>
+      <w:r>
+        <w:rPr>
+          <w:rFonts w:ascii="Arial" w:eastAsiaTheme="minorHAnsi" w:hAnsi="Arial" w:cs="Arial"/>
+          <w:sz w:val="20"/>
+          <w:szCs w:val="20"/>
+          <w:lang w:val="es-MX"/>
+        </w:rPr>
+        <w:t>Para: Encontrar la propiedad que mejor se adapte a mis necesidades y presupuesto para mis fechas de viaje</w:t>
+      </w:r>
+    </w:p>
+    <w:p>
+      <w:pPr>
+        <w:spacing w:before="100" w:beforeAutospacing="1" w:after="100" w:afterAutospacing="1" w:line="240" w:lineRule="auto"/>
+        <w:rPr>
+          <w:rFonts w:ascii="Arial" w:eastAsia="Times New Roman" w:hAnsi="Arial" w:cs="Arial"/>
+          <w:sz w:val="24"/>
+          <w:szCs w:val="24"/>
+          <w:lang w:eastAsia="es-GT"/>
+        </w:rPr>
+      </w:pPr>
+    </w:p>
+    <w:p>
+      <w:pPr>
+        <w:spacing w:before="100" w:beforeAutospacing="1" w:after="100" w:afterAutospacing="1" w:line="240" w:lineRule="auto"/>
+        <w:rPr>
+          <w:rFonts w:ascii="Arial" w:eastAsia="Times New Roman" w:hAnsi="Arial" w:cs="Arial"/>
+          <w:sz w:val="24"/>
+          <w:szCs w:val="24"/>
+          <w:lang w:eastAsia="es-GT"/>
+        </w:rPr>
+      </w:pPr>
+    </w:p>
+    <w:p>
+      <w:pPr>
+        <w:spacing w:before="100" w:beforeAutospacing="1" w:after="100" w:afterAutospacing="1" w:line="240" w:lineRule="auto"/>
+        <w:rPr>
+          <w:rFonts w:ascii="Arial" w:eastAsia="Times New Roman" w:hAnsi="Arial" w:cs="Arial"/>
+          <w:sz w:val="24"/>
+          <w:szCs w:val="24"/>
+          <w:lang w:eastAsia="es-GT"/>
+        </w:rPr>
+      </w:pPr>
+    </w:p>
+    <w:p>
+      <w:pPr>
+        <w:spacing w:before="100" w:beforeAutospacing="1" w:after="100" w:afterAutospacing="1" w:line="240" w:lineRule="auto"/>
+        <w:rPr>
+          <w:rFonts w:ascii="Arial" w:eastAsia="Times New Roman" w:hAnsi="Arial" w:cs="Arial"/>
+          <w:sz w:val="24"/>
+          <w:szCs w:val="24"/>
+          <w:lang w:eastAsia="es-GT"/>
+        </w:rPr>
+      </w:pPr>
+    </w:p>
+    <w:p>
+      <w:pPr>
+        <w:spacing w:before="100" w:beforeAutospacing="1" w:after="100" w:afterAutospacing="1" w:line="240" w:lineRule="auto"/>
+        <w:rPr>
+          <w:rFonts w:ascii="Arial" w:eastAsia="Times New Roman" w:hAnsi="Arial" w:cs="Arial"/>
+          <w:sz w:val="24"/>
+          <w:szCs w:val="24"/>
+          <w:lang w:eastAsia="es-GT"/>
+        </w:rPr>
+      </w:pPr>
+    </w:p>
+    <w:p>
+      <w:pPr>
+        <w:spacing w:before="100" w:beforeAutospacing="1" w:after="100" w:afterAutospacing="1" w:line="240" w:lineRule="auto"/>
+        <w:rPr>
+          <w:rFonts w:ascii="Arial" w:eastAsia="Times New Roman" w:hAnsi="Arial" w:cs="Arial"/>
+          <w:sz w:val="24"/>
+          <w:szCs w:val="24"/>
+          <w:lang w:eastAsia="es-GT"/>
+        </w:rPr>
+      </w:pPr>
+    </w:p>
+    <w:p>
+      <w:pPr>
+        <w:spacing w:before="100" w:beforeAutospacing="1" w:after="100" w:afterAutospacing="1" w:line="240" w:lineRule="auto"/>
+        <w:rPr>
+          <w:rFonts w:ascii="Arial" w:eastAsia="Times New Roman" w:hAnsi="Arial" w:cs="Arial"/>
+          <w:sz w:val="24"/>
+          <w:szCs w:val="24"/>
+          <w:lang w:eastAsia="es-GT"/>
+        </w:rPr>
+      </w:pPr>
+    </w:p>
+    <w:p>
+      <w:pPr>
+        <w:spacing w:before="100" w:beforeAutospacing="1" w:after="100" w:afterAutospacing="1" w:line="240" w:lineRule="auto"/>
+        <w:rPr>
+          <w:rFonts w:ascii="Arial" w:eastAsia="Times New Roman" w:hAnsi="Arial" w:cs="Arial"/>
+          <w:sz w:val="24"/>
+          <w:szCs w:val="24"/>
+          <w:lang w:eastAsia="es-GT"/>
+        </w:rPr>
+      </w:pPr>
+    </w:p>
+    <w:p>
+      <w:pPr>
+        <w:spacing w:before="100" w:beforeAutospacing="1" w:after="100" w:afterAutospacing="1" w:line="240" w:lineRule="auto"/>
+        <w:rPr>
+          <w:rFonts w:ascii="Arial" w:eastAsia="Times New Roman" w:hAnsi="Arial" w:cs="Arial"/>
+          <w:sz w:val="24"/>
+          <w:szCs w:val="24"/>
+          <w:lang w:eastAsia="es-GT"/>
+        </w:rPr>
+      </w:pPr>
+    </w:p>
+    <w:p>
+      <w:pPr>
+        <w:spacing w:before="100" w:beforeAutospacing="1" w:after="100" w:afterAutospacing="1" w:line="240" w:lineRule="auto"/>
+        <w:rPr>
+          <w:rFonts w:ascii="Arial" w:eastAsia="Times New Roman" w:hAnsi="Arial" w:cs="Arial"/>
+          <w:sz w:val="24"/>
+          <w:szCs w:val="24"/>
+          <w:lang w:eastAsia="es-GT"/>
+        </w:rPr>
+      </w:pPr>
+    </w:p>
+    <w:p>
+      <w:pPr>
+        <w:spacing w:before="100" w:beforeAutospacing="1" w:after="100" w:afterAutospacing="1" w:line="240" w:lineRule="auto"/>
+        <w:rPr>
+          <w:rFonts w:ascii="Arial" w:eastAsia="Times New Roman" w:hAnsi="Arial" w:cs="Arial"/>
+          <w:sz w:val="24"/>
+          <w:szCs w:val="24"/>
+          <w:lang w:eastAsia="es-GT"/>
+        </w:rPr>
+      </w:pPr>
+    </w:p>
+    <w:p>
+      <w:pPr>
+        <w:spacing w:before="100" w:beforeAutospacing="1" w:after="100" w:afterAutospacing="1" w:line="240" w:lineRule="auto"/>
+        <w:rPr>
+          <w:rFonts w:ascii="Arial" w:eastAsia="Times New Roman" w:hAnsi="Arial" w:cs="Arial"/>
+          <w:sz w:val="24"/>
+          <w:szCs w:val="24"/>
+          <w:lang w:eastAsia="es-GT"/>
+        </w:rPr>
+      </w:pPr>
+    </w:p>
+    <w:p>
+      <w:pPr>
+        <w:spacing w:before="100" w:beforeAutospacing="1" w:after="100" w:afterAutospacing="1" w:line="240" w:lineRule="auto"/>
+        <w:rPr>
+          <w:rFonts w:ascii="Arial" w:eastAsia="Times New Roman" w:hAnsi="Arial" w:cs="Arial"/>
+          <w:sz w:val="24"/>
+          <w:szCs w:val="24"/>
+          <w:lang w:eastAsia="es-GT"/>
+        </w:rPr>
+      </w:pPr>
+      <w:r>
+        <w:rPr>
+          <w:rFonts w:ascii="Arial" w:eastAsia="Times New Roman" w:hAnsi="Arial" w:cs="Arial"/>
+          <w:sz w:val="24"/>
+          <w:szCs w:val="24"/>
+          <w:lang w:eastAsia="es-GT"/>
+        </w:rPr>
+        <w:t>MODELO DE ENTIDADES</w:t>
+      </w:r>
+      <w:r>
+        <w:rPr>
+          <w:rFonts w:ascii="Arial" w:eastAsia="Times New Roman" w:hAnsi="Arial" w:cs="Arial"/>
+          <w:sz w:val="24"/>
+          <w:szCs w:val="24"/>
+          <w:lang w:eastAsia="es-GT"/>
+        </w:rPr>
+        <w:br/>
+      </w:r>
+      <w:r>
+        <w:rPr>
+          <w:rFonts w:ascii="Arial" w:eastAsia="Times New Roman" w:hAnsi="Arial" w:cs="Arial"/>
+          <w:sz w:val="24"/>
+          <w:szCs w:val="24"/>
+          <w:lang w:eastAsia="es-GT"/>
+        </w:rPr>
+        <w:br/>
+      </w:r>
+      <w:r>
+        <w:rPr>
+          <w:rFonts w:ascii="Arial" w:eastAsia="Times New Roman" w:hAnsi="Arial" w:cs="Arial"/>
+          <w:noProof/>
+          <w:sz w:val="24"/>
+          <w:szCs w:val="24"/>
+          <w:lang w:eastAsia="es-GT"/>
+        </w:rPr>
+        <w:drawing>
+          <wp:inline distT="0" distB="0" distL="0" distR="0" wp14:anchorId="6563345A" wp14:editId="17787815">
+            <wp:extent cx="5652076" cy="4848225"/>
+            <wp:effectExtent l="0" t="0" r="6350" b="0"/>
+            <wp:docPr id="1098701964" name="Imagen 2"/>
+            <wp:cNvGraphicFramePr>
+              <a:graphicFrameLocks xmlns:a="http://schemas.openxmlformats.org/drawingml/2006/main" noChangeAspect="1"/>
+            </wp:cNvGraphicFramePr>
+            <a:graphic xmlns:a="http://schemas.openxmlformats.org/drawingml/2006/main">
+              <a:graphicData uri="http://schemas.openxmlformats.org/drawingml/2006/picture">
+                <pic:pic xmlns:pic="http://schemas.openxmlformats.org/drawingml/2006/picture">
+                  <pic:nvPicPr>
+                    <pic:cNvPr id="0" name="Picture 2"/>
+                    <pic:cNvPicPr>
+                      <a:picLocks noChangeAspect="1" noChangeArrowheads="1"/>
+                    </pic:cNvPicPr>
+                  </pic:nvPicPr>
+                  <pic:blipFill>
+                    <a:blip r:embed="rId7">
+                      <a:extLst>
+                        <a:ext uri="{28A0092B-C50C-407E-A947-70E740481C1C}">
+                          <a14:useLocalDpi xmlns:a14="http://schemas.microsoft.com/office/drawing/2010/main" val="0"/>
+                        </a:ext>
+                      </a:extLst>
+                    </a:blip>
+                    <a:srcRect/>
+                    <a:stretch>
+                      <a:fillRect/>
+                    </a:stretch>
+                  </pic:blipFill>
+                  <pic:spPr bwMode="auto">
+                    <a:xfrm>
+                      <a:off x="0" y="0"/>
+                      <a:ext cx="5661730" cy="4856506"/>
+                    </a:xfrm>
+                    <a:prstGeom prst="rect">
+                      <a:avLst/>
+                    </a:prstGeom>
+                    <a:noFill/>
+                  </pic:spPr>
+                </pic:pic>
+              </a:graphicData>
+            </a:graphic>
+          </wp:inline>
+        </w:drawing>
+      </w:r>
     </w:p>
     <w:p>
       <w:pPr>
@@ -4656,7 +7125,7 @@
     <w:rPrDefault>
       <w:rPr>
         <w:rFonts w:asciiTheme="minorHAnsi" w:eastAsiaTheme="minorHAnsi" w:hAnsiTheme="minorHAnsi" w:cstheme="minorBidi"/>
-        <w:lang w:val="es-MX" w:eastAsia="es-MX" w:bidi="ar-SA"/>
+        <w:lang w:val="en-US" w:eastAsia="en-US" w:bidi="ar-SA"/>
       </w:rPr>
     </w:rPrDefault>
     <w:pPrDefault/>
@@ -4818,7 +7287,7 @@
     <w:lsdException w:name="Balloon Text" w:semiHidden="1" w:unhideWhenUsed="1" w:qFormat="1"/>
     <w:lsdException w:name="Table Grid" w:uiPriority="39" w:qFormat="1"/>
     <w:lsdException w:name="Table Theme" w:semiHidden="1" w:unhideWhenUsed="1"/>
-    <w:lsdException w:name="Placeholder Text" w:semiHidden="1" w:unhideWhenUsed="1"/>
+    <w:lsdException w:name="Placeholder Text" w:semiHidden="1"/>
     <w:lsdException w:name="No Spacing" w:uiPriority="1" w:qFormat="1"/>
     <w:lsdException w:name="Light Shading"/>
     <w:lsdException w:name="Light List"/>
@@ -4840,10 +7309,7 @@
     <w:lsdException w:name="Medium Shading 1 Accent 1"/>
     <w:lsdException w:name="Medium Shading 2 Accent 1"/>
     <w:lsdException w:name="Medium List 1 Accent 1"/>
-    <w:lsdException w:name="Revision" w:semiHidden="1" w:unhideWhenUsed="1"/>
-    <w:lsdException w:name="List Paragraph" w:semiHidden="1" w:unhideWhenUsed="1"/>
-    <w:lsdException w:name="Quote" w:semiHidden="1" w:unhideWhenUsed="1"/>
-    <w:lsdException w:name="Intense Quote" w:semiHidden="1" w:unhideWhenUsed="1"/>
+    <w:lsdException w:name="Revision" w:semiHidden="1"/>
     <w:lsdException w:name="Medium List 2 Accent 1"/>
     <w:lsdException w:name="Medium Grid 1 Accent 1"/>
     <w:lsdException w:name="Medium Grid 2 Accent 1"/>
@@ -5049,7 +7515,7 @@
       <w:rFonts w:eastAsia="MS Mincho"/>
       <w:sz w:val="22"/>
       <w:szCs w:val="22"/>
-      <w:lang w:val="es-GT" w:eastAsia="en-US"/>
+      <w:lang w:val="es-GT"/>
     </w:rPr>
   </w:style>
   <w:style w:type="character" w:default="1" w:styleId="Fuentedeprrafopredeter">
@@ -5187,7 +7653,7 @@
     <w:rPr>
       <w:sz w:val="22"/>
       <w:szCs w:val="22"/>
-      <w:lang w:val="es-GT" w:eastAsia="en-US"/>
+      <w:lang w:val="es-GT"/>
     </w:rPr>
   </w:style>
   <w:style w:type="character" w:customStyle="1" w:styleId="TextocomentarioCar">

</xml_diff>

<commit_message>
add: Se agrego modelo de entidad relacion al documento Peaceathome.docx en la rama jcano-2024386
</commit_message>
<xml_diff>
--- a/Peaceathome.docx
+++ b/Peaceathome.docx
@@ -15,7 +15,7 @@
         <w:rPr>
           <w:rFonts w:ascii="Arial" w:hAnsi="Arial" w:cs="Arial"/>
           <w:b/>
-          <w:lang w:eastAsia="es-GT"/>
+          <w:lang w:val="es-MX" w:eastAsia="es-MX"/>
         </w:rPr>
         <w:drawing>
           <wp:inline distT="0" distB="0" distL="0" distR="0">
@@ -2506,24 +2506,7 @@
           <w:sz w:val="22"/>
           <w:szCs w:val="22"/>
         </w:rPr>
-        <w:t>HUJC-0</w:t>
-      </w:r>
-      <w:r>
-        <w:rPr>
-          <w:rFonts w:hint="default" w:ascii="Segoe UI" w:hAnsi="Segoe UI" w:cs="Segoe UI"/>
-          <w:sz w:val="22"/>
-          <w:szCs w:val="22"/>
-          <w:lang w:val="es-GT"/>
-        </w:rPr>
-        <w:t>07</w:t>
-      </w:r>
-      <w:r>
-        <w:rPr>
-          <w:rFonts w:ascii="Segoe UI" w:hAnsi="Segoe UI" w:cs="Segoe UI"/>
-          <w:sz w:val="22"/>
-          <w:szCs w:val="22"/>
-        </w:rPr>
-        <w:t>: Registo de nueva reseña</w:t>
+        <w:t>HUJC-007: Registo de nueva reseña</w:t>
       </w:r>
     </w:p>
     <w:p>
@@ -2604,11 +2587,10 @@
         <w:spacing w:after="0"/>
         <w:textAlignment w:val="baseline"/>
         <w:rPr>
-          <w:rFonts w:hint="default" w:ascii="Segoe UI" w:hAnsi="Segoe UI" w:cs="Segoe UI"/>
+          <w:rFonts w:ascii="Segoe UI" w:hAnsi="Segoe UI" w:cs="Segoe UI"/>
           <w:b/>
           <w:sz w:val="22"/>
           <w:szCs w:val="22"/>
-          <w:lang w:val="es-GT"/>
         </w:rPr>
       </w:pPr>
       <w:r>
@@ -2618,125 +2600,102 @@
           <w:sz w:val="22"/>
           <w:szCs w:val="22"/>
         </w:rPr>
-        <w:t>HUJC-0</w:t>
-      </w:r>
-      <w:r>
-        <w:rPr>
-          <w:rFonts w:hint="default" w:ascii="Segoe UI" w:hAnsi="Segoe UI" w:cs="Segoe UI"/>
+        <w:t>HUJC-008</w:t>
+      </w:r>
+    </w:p>
+    <w:p>
+      <w:pPr>
+        <w:pStyle w:val="16"/>
+        <w:spacing w:after="0"/>
+        <w:textAlignment w:val="baseline"/>
+        <w:rPr>
+          <w:rFonts w:ascii="Segoe UI" w:hAnsi="Segoe UI" w:cs="Segoe UI"/>
+          <w:sz w:val="22"/>
+          <w:szCs w:val="22"/>
+        </w:rPr>
+      </w:pPr>
+      <w:r>
+        <w:rPr>
+          <w:rFonts w:ascii="Segoe UI" w:hAnsi="Segoe UI" w:cs="Segoe UI"/>
+          <w:sz w:val="22"/>
+          <w:szCs w:val="22"/>
+        </w:rPr>
+        <w:t>Como: Empresario</w:t>
+      </w:r>
+    </w:p>
+    <w:p>
+      <w:pPr>
+        <w:pStyle w:val="16"/>
+        <w:spacing w:after="0"/>
+        <w:textAlignment w:val="baseline"/>
+        <w:rPr>
+          <w:rFonts w:ascii="Segoe UI" w:hAnsi="Segoe UI" w:cs="Segoe UI"/>
+          <w:sz w:val="22"/>
+          <w:szCs w:val="22"/>
+        </w:rPr>
+      </w:pPr>
+      <w:r>
+        <w:rPr>
+          <w:rFonts w:ascii="Segoe UI" w:hAnsi="Segoe UI" w:cs="Segoe UI"/>
+          <w:sz w:val="22"/>
+          <w:szCs w:val="22"/>
+        </w:rPr>
+        <w:t>Quiero: Registrar una reseña sobre la propiedad que me fue otorgada en Peace At Home</w:t>
+      </w:r>
+    </w:p>
+    <w:p>
+      <w:pPr>
+        <w:pStyle w:val="16"/>
+        <w:spacing w:before="0" w:beforeAutospacing="0" w:after="0" w:afterAutospacing="0"/>
+        <w:textAlignment w:val="baseline"/>
+        <w:rPr>
+          <w:rFonts w:ascii="Segoe UI" w:hAnsi="Segoe UI" w:cs="Segoe UI"/>
+          <w:sz w:val="22"/>
+          <w:szCs w:val="22"/>
+        </w:rPr>
+      </w:pPr>
+      <w:r>
+        <w:rPr>
+          <w:rFonts w:ascii="Segoe UI" w:hAnsi="Segoe UI" w:cs="Segoe UI"/>
+          <w:sz w:val="22"/>
+          <w:szCs w:val="22"/>
+        </w:rPr>
+        <w:t>Para: Que los nuevos huéspedes sepan de las comodidades y ventajas de esta propiedad en especifico</w:t>
+      </w:r>
+    </w:p>
+    <w:p>
+      <w:pPr>
+        <w:pStyle w:val="16"/>
+        <w:spacing w:before="0" w:beforeAutospacing="0" w:after="0" w:afterAutospacing="0"/>
+        <w:textAlignment w:val="baseline"/>
+        <w:rPr>
+          <w:rFonts w:ascii="Segoe UI" w:hAnsi="Segoe UI" w:cs="Segoe UI"/>
+          <w:sz w:val="22"/>
+          <w:szCs w:val="22"/>
+        </w:rPr>
+      </w:pPr>
+    </w:p>
+    <w:p>
+      <w:pPr>
+        <w:pStyle w:val="16"/>
+        <w:spacing w:after="0"/>
+        <w:textAlignment w:val="baseline"/>
+        <w:rPr>
+          <w:rFonts w:ascii="Segoe UI" w:hAnsi="Segoe UI" w:cs="Segoe UI"/>
           <w:b/>
           <w:sz w:val="22"/>
           <w:szCs w:val="22"/>
-          <w:lang w:val="es-GT"/>
-        </w:rPr>
-        <w:t>08</w:t>
-      </w:r>
-    </w:p>
-    <w:p>
-      <w:pPr>
-        <w:pStyle w:val="16"/>
-        <w:spacing w:after="0"/>
-        <w:textAlignment w:val="baseline"/>
-        <w:rPr>
-          <w:rFonts w:ascii="Segoe UI" w:hAnsi="Segoe UI" w:cs="Segoe UI"/>
-          <w:sz w:val="22"/>
-          <w:szCs w:val="22"/>
-        </w:rPr>
-      </w:pPr>
-      <w:r>
-        <w:rPr>
-          <w:rFonts w:ascii="Segoe UI" w:hAnsi="Segoe UI" w:cs="Segoe UI"/>
-          <w:sz w:val="22"/>
-          <w:szCs w:val="22"/>
-        </w:rPr>
-        <w:t>Como: Empresario</w:t>
-      </w:r>
-    </w:p>
-    <w:p>
-      <w:pPr>
-        <w:pStyle w:val="16"/>
-        <w:spacing w:after="0"/>
-        <w:textAlignment w:val="baseline"/>
-        <w:rPr>
-          <w:rFonts w:ascii="Segoe UI" w:hAnsi="Segoe UI" w:cs="Segoe UI"/>
-          <w:sz w:val="22"/>
-          <w:szCs w:val="22"/>
-        </w:rPr>
-      </w:pPr>
-      <w:r>
-        <w:rPr>
-          <w:rFonts w:ascii="Segoe UI" w:hAnsi="Segoe UI" w:cs="Segoe UI"/>
-          <w:sz w:val="22"/>
-          <w:szCs w:val="22"/>
-        </w:rPr>
-        <w:t>Quiero: Registrar una reseña sobre la propiedad que me fue otorgada en Peace At Home</w:t>
-      </w:r>
-    </w:p>
-    <w:p>
-      <w:pPr>
-        <w:pStyle w:val="16"/>
-        <w:spacing w:before="0" w:beforeAutospacing="0" w:after="0" w:afterAutospacing="0"/>
-        <w:textAlignment w:val="baseline"/>
-        <w:rPr>
-          <w:rFonts w:ascii="Segoe UI" w:hAnsi="Segoe UI" w:cs="Segoe UI"/>
-          <w:sz w:val="22"/>
-          <w:szCs w:val="22"/>
-        </w:rPr>
-      </w:pPr>
-      <w:r>
-        <w:rPr>
-          <w:rFonts w:ascii="Segoe UI" w:hAnsi="Segoe UI" w:cs="Segoe UI"/>
-          <w:sz w:val="22"/>
-          <w:szCs w:val="22"/>
-        </w:rPr>
-        <w:t>Para: Que los nuevos huéspedes sepan de las comodidades y ventajas de esta propiedad en especifico</w:t>
-      </w:r>
-    </w:p>
-    <w:p>
-      <w:pPr>
-        <w:pStyle w:val="16"/>
-        <w:spacing w:before="0" w:beforeAutospacing="0" w:after="0" w:afterAutospacing="0"/>
-        <w:textAlignment w:val="baseline"/>
-        <w:rPr>
-          <w:rFonts w:ascii="Segoe UI" w:hAnsi="Segoe UI" w:cs="Segoe UI"/>
-          <w:sz w:val="22"/>
-          <w:szCs w:val="22"/>
-        </w:rPr>
-      </w:pPr>
-    </w:p>
-    <w:p>
-      <w:pPr>
-        <w:pStyle w:val="16"/>
-        <w:spacing w:after="0"/>
-        <w:textAlignment w:val="baseline"/>
-        <w:rPr>
-          <w:rFonts w:hint="default" w:ascii="Segoe UI" w:hAnsi="Segoe UI" w:cs="Segoe UI"/>
+        </w:rPr>
+      </w:pPr>
+      <w:r>
+        <w:rPr>
+          <w:rFonts w:ascii="Segoe UI" w:hAnsi="Segoe UI" w:cs="Segoe UI"/>
           <w:b/>
           <w:sz w:val="22"/>
           <w:szCs w:val="22"/>
-          <w:lang w:val="es-GT"/>
-        </w:rPr>
-      </w:pPr>
-      <w:r>
-        <w:rPr>
-          <w:rFonts w:ascii="Segoe UI" w:hAnsi="Segoe UI" w:cs="Segoe UI"/>
-          <w:b/>
-          <w:sz w:val="22"/>
-          <w:szCs w:val="22"/>
-        </w:rPr>
-        <w:t>HUJC-0</w:t>
-      </w:r>
-      <w:r>
-        <w:rPr>
-          <w:rFonts w:hint="default" w:ascii="Segoe UI" w:hAnsi="Segoe UI" w:cs="Segoe UI"/>
-          <w:b/>
-          <w:sz w:val="22"/>
-          <w:szCs w:val="22"/>
-          <w:lang w:val="es-GT"/>
-        </w:rPr>
-        <w:t>09</w:t>
-      </w:r>
-      <w:bookmarkStart w:id="0" w:name="_GoBack"/>
-      <w:bookmarkEnd w:id="0"/>
+        </w:rPr>
+        <w:t>HUJC-009</w:t>
+      </w:r>
     </w:p>
     <w:p>
       <w:pPr>
@@ -2884,397 +2843,2652 @@
     </w:p>
     <w:p>
       <w:pPr>
-        <w:spacing w:before="100" w:beforeAutospacing="1" w:after="100" w:afterAutospacing="1" w:line="240" w:lineRule="auto"/>
-        <w:rPr>
-          <w:rFonts w:ascii="Arial" w:hAnsi="Arial" w:eastAsia="Times New Roman" w:cs="Arial"/>
-          <w:sz w:val="24"/>
-          <w:szCs w:val="24"/>
-          <w:lang w:eastAsia="es-GT"/>
-        </w:rPr>
-      </w:pPr>
-    </w:p>
-    <w:p>
-      <w:pPr>
-        <w:spacing w:before="100" w:beforeAutospacing="1" w:after="100" w:afterAutospacing="1" w:line="240" w:lineRule="auto"/>
-        <w:rPr>
-          <w:rFonts w:ascii="Arial" w:hAnsi="Arial" w:eastAsia="Times New Roman" w:cs="Arial"/>
-          <w:sz w:val="24"/>
-          <w:szCs w:val="24"/>
-          <w:lang w:eastAsia="es-GT"/>
-        </w:rPr>
-      </w:pPr>
-    </w:p>
-    <w:p>
-      <w:pPr>
-        <w:spacing w:before="100" w:beforeAutospacing="1" w:after="100" w:afterAutospacing="1" w:line="240" w:lineRule="auto"/>
-        <w:rPr>
-          <w:rFonts w:ascii="Arial" w:hAnsi="Arial" w:eastAsia="Times New Roman" w:cs="Arial"/>
-          <w:sz w:val="24"/>
-          <w:szCs w:val="24"/>
-          <w:lang w:eastAsia="es-GT"/>
-        </w:rPr>
-      </w:pPr>
-    </w:p>
-    <w:p>
-      <w:pPr>
-        <w:spacing w:before="100" w:beforeAutospacing="1" w:after="100" w:afterAutospacing="1" w:line="240" w:lineRule="auto"/>
-        <w:rPr>
-          <w:rFonts w:ascii="Arial" w:hAnsi="Arial" w:eastAsia="Times New Roman" w:cs="Arial"/>
-          <w:sz w:val="24"/>
-          <w:szCs w:val="24"/>
-          <w:lang w:eastAsia="es-GT"/>
-        </w:rPr>
-      </w:pPr>
-    </w:p>
-    <w:p>
-      <w:pPr>
-        <w:spacing w:before="100" w:beforeAutospacing="1" w:after="100" w:afterAutospacing="1" w:line="240" w:lineRule="auto"/>
-        <w:rPr>
-          <w:rFonts w:ascii="Arial" w:hAnsi="Arial" w:eastAsia="Times New Roman" w:cs="Arial"/>
-          <w:sz w:val="24"/>
-          <w:szCs w:val="24"/>
-          <w:lang w:eastAsia="es-GT"/>
-        </w:rPr>
-      </w:pPr>
-    </w:p>
-    <w:p>
-      <w:pPr>
-        <w:spacing w:before="100" w:beforeAutospacing="1" w:after="100" w:afterAutospacing="1" w:line="240" w:lineRule="auto"/>
-        <w:rPr>
-          <w:rFonts w:ascii="Arial" w:hAnsi="Arial" w:eastAsia="Times New Roman" w:cs="Arial"/>
-          <w:sz w:val="24"/>
-          <w:szCs w:val="24"/>
-          <w:lang w:eastAsia="es-GT"/>
-        </w:rPr>
-      </w:pPr>
-    </w:p>
-    <w:p>
-      <w:pPr>
-        <w:spacing w:before="100" w:beforeAutospacing="1" w:after="100" w:afterAutospacing="1" w:line="240" w:lineRule="auto"/>
-        <w:rPr>
-          <w:rFonts w:ascii="Arial" w:hAnsi="Arial" w:eastAsia="Times New Roman" w:cs="Arial"/>
-          <w:sz w:val="24"/>
-          <w:szCs w:val="24"/>
-          <w:lang w:eastAsia="es-GT"/>
-        </w:rPr>
-      </w:pPr>
-    </w:p>
-    <w:p>
-      <w:pPr>
-        <w:spacing w:before="100" w:beforeAutospacing="1" w:after="100" w:afterAutospacing="1" w:line="240" w:lineRule="auto"/>
-        <w:rPr>
-          <w:rFonts w:ascii="Arial" w:hAnsi="Arial" w:eastAsia="Times New Roman" w:cs="Arial"/>
-          <w:sz w:val="24"/>
-          <w:szCs w:val="24"/>
-          <w:lang w:eastAsia="es-GT"/>
-        </w:rPr>
-      </w:pPr>
-    </w:p>
-    <w:p>
-      <w:pPr>
-        <w:spacing w:before="100" w:beforeAutospacing="1" w:after="100" w:afterAutospacing="1" w:line="240" w:lineRule="auto"/>
-        <w:rPr>
-          <w:rFonts w:ascii="Arial" w:hAnsi="Arial" w:eastAsia="Times New Roman" w:cs="Arial"/>
-          <w:sz w:val="24"/>
-          <w:szCs w:val="24"/>
-          <w:lang w:eastAsia="es-GT"/>
-        </w:rPr>
-      </w:pPr>
-    </w:p>
-    <w:p>
-      <w:pPr>
-        <w:spacing w:before="100" w:beforeAutospacing="1" w:after="100" w:afterAutospacing="1" w:line="240" w:lineRule="auto"/>
-        <w:rPr>
-          <w:rFonts w:ascii="Arial" w:hAnsi="Arial" w:eastAsia="Times New Roman" w:cs="Arial"/>
-          <w:sz w:val="24"/>
-          <w:szCs w:val="24"/>
-          <w:lang w:eastAsia="es-GT"/>
-        </w:rPr>
-      </w:pPr>
-    </w:p>
-    <w:p>
-      <w:pPr>
-        <w:spacing w:before="100" w:beforeAutospacing="1" w:after="100" w:afterAutospacing="1" w:line="240" w:lineRule="auto"/>
-        <w:rPr>
-          <w:rFonts w:ascii="Arial" w:hAnsi="Arial" w:eastAsia="Times New Roman" w:cs="Arial"/>
-          <w:sz w:val="24"/>
-          <w:szCs w:val="24"/>
-          <w:lang w:eastAsia="es-GT"/>
-        </w:rPr>
-      </w:pPr>
-    </w:p>
-    <w:p>
-      <w:pPr>
-        <w:spacing w:before="100" w:beforeAutospacing="1" w:after="100" w:afterAutospacing="1" w:line="240" w:lineRule="auto"/>
-        <w:rPr>
-          <w:rFonts w:ascii="Arial" w:hAnsi="Arial" w:eastAsia="Times New Roman" w:cs="Arial"/>
-          <w:sz w:val="24"/>
-          <w:szCs w:val="24"/>
-          <w:lang w:eastAsia="es-GT"/>
-        </w:rPr>
-      </w:pPr>
-    </w:p>
-    <w:p>
-      <w:pPr>
-        <w:spacing w:before="100" w:beforeAutospacing="1" w:after="100" w:afterAutospacing="1" w:line="240" w:lineRule="auto"/>
-        <w:rPr>
-          <w:rFonts w:ascii="Arial" w:hAnsi="Arial" w:eastAsia="Times New Roman" w:cs="Arial"/>
-          <w:sz w:val="24"/>
-          <w:szCs w:val="24"/>
-          <w:lang w:eastAsia="es-GT"/>
-        </w:rPr>
-      </w:pPr>
-    </w:p>
-    <w:p>
-      <w:pPr>
-        <w:spacing w:before="100" w:beforeAutospacing="1" w:after="100" w:afterAutospacing="1" w:line="240" w:lineRule="auto"/>
-        <w:rPr>
-          <w:rFonts w:ascii="Arial" w:hAnsi="Arial" w:eastAsia="Times New Roman" w:cs="Arial"/>
-          <w:sz w:val="24"/>
-          <w:szCs w:val="24"/>
-          <w:lang w:eastAsia="es-GT"/>
-        </w:rPr>
-      </w:pPr>
-    </w:p>
-    <w:p>
-      <w:pPr>
-        <w:spacing w:before="100" w:beforeAutospacing="1" w:after="100" w:afterAutospacing="1" w:line="240" w:lineRule="auto"/>
-        <w:rPr>
-          <w:rFonts w:ascii="Arial" w:hAnsi="Arial" w:eastAsia="Times New Roman" w:cs="Arial"/>
-          <w:sz w:val="24"/>
-          <w:szCs w:val="24"/>
-          <w:lang w:eastAsia="es-GT"/>
-        </w:rPr>
-      </w:pPr>
-    </w:p>
-    <w:p>
-      <w:pPr>
-        <w:spacing w:before="100" w:beforeAutospacing="1" w:after="100" w:afterAutospacing="1" w:line="240" w:lineRule="auto"/>
-        <w:rPr>
-          <w:rFonts w:ascii="Arial" w:hAnsi="Arial" w:eastAsia="Times New Roman" w:cs="Arial"/>
-          <w:sz w:val="24"/>
-          <w:szCs w:val="24"/>
-          <w:lang w:eastAsia="es-GT"/>
-        </w:rPr>
-      </w:pPr>
-    </w:p>
-    <w:p>
-      <w:pPr>
-        <w:spacing w:before="100" w:beforeAutospacing="1" w:after="100" w:afterAutospacing="1" w:line="240" w:lineRule="auto"/>
-        <w:rPr>
-          <w:rFonts w:ascii="Arial" w:hAnsi="Arial" w:eastAsia="Times New Roman" w:cs="Arial"/>
-          <w:sz w:val="24"/>
-          <w:szCs w:val="24"/>
-          <w:lang w:eastAsia="es-GT"/>
-        </w:rPr>
-      </w:pPr>
-    </w:p>
-    <w:p>
-      <w:pPr>
-        <w:spacing w:before="100" w:beforeAutospacing="1" w:after="100" w:afterAutospacing="1" w:line="240" w:lineRule="auto"/>
-        <w:rPr>
-          <w:rFonts w:ascii="Arial" w:hAnsi="Arial" w:eastAsia="Times New Roman" w:cs="Arial"/>
-          <w:sz w:val="24"/>
-          <w:szCs w:val="24"/>
-          <w:lang w:eastAsia="es-GT"/>
-        </w:rPr>
-      </w:pPr>
-    </w:p>
-    <w:p>
-      <w:pPr>
-        <w:spacing w:before="100" w:beforeAutospacing="1" w:after="100" w:afterAutospacing="1" w:line="240" w:lineRule="auto"/>
-        <w:rPr>
-          <w:rFonts w:ascii="Arial" w:hAnsi="Arial" w:eastAsia="Times New Roman" w:cs="Arial"/>
-          <w:sz w:val="24"/>
-          <w:szCs w:val="24"/>
-          <w:lang w:eastAsia="es-GT"/>
-        </w:rPr>
-      </w:pPr>
-    </w:p>
-    <w:p>
-      <w:pPr>
-        <w:spacing w:before="100" w:beforeAutospacing="1" w:after="100" w:afterAutospacing="1" w:line="240" w:lineRule="auto"/>
-        <w:rPr>
-          <w:rFonts w:ascii="Arial" w:hAnsi="Arial" w:eastAsia="Times New Roman" w:cs="Arial"/>
-          <w:sz w:val="24"/>
-          <w:szCs w:val="24"/>
-          <w:lang w:eastAsia="es-GT"/>
-        </w:rPr>
-      </w:pPr>
-    </w:p>
-    <w:p>
-      <w:pPr>
-        <w:spacing w:before="100" w:beforeAutospacing="1" w:after="100" w:afterAutospacing="1" w:line="240" w:lineRule="auto"/>
-        <w:rPr>
-          <w:rFonts w:ascii="Arial" w:hAnsi="Arial" w:eastAsia="Times New Roman" w:cs="Arial"/>
-          <w:sz w:val="24"/>
-          <w:szCs w:val="24"/>
-          <w:lang w:eastAsia="es-GT"/>
-        </w:rPr>
-      </w:pPr>
-    </w:p>
-    <w:p>
-      <w:pPr>
-        <w:spacing w:before="100" w:beforeAutospacing="1" w:after="100" w:afterAutospacing="1" w:line="240" w:lineRule="auto"/>
-        <w:rPr>
-          <w:rFonts w:ascii="Arial" w:hAnsi="Arial" w:eastAsia="Times New Roman" w:cs="Arial"/>
-          <w:sz w:val="24"/>
-          <w:szCs w:val="24"/>
-          <w:lang w:eastAsia="es-GT"/>
-        </w:rPr>
-      </w:pPr>
-    </w:p>
-    <w:p>
-      <w:pPr>
-        <w:spacing w:before="100" w:beforeAutospacing="1" w:after="100" w:afterAutospacing="1" w:line="240" w:lineRule="auto"/>
-        <w:rPr>
-          <w:rFonts w:ascii="Arial" w:hAnsi="Arial" w:eastAsia="Times New Roman" w:cs="Arial"/>
-          <w:sz w:val="24"/>
-          <w:szCs w:val="24"/>
-          <w:lang w:eastAsia="es-GT"/>
-        </w:rPr>
-      </w:pPr>
-    </w:p>
-    <w:p>
-      <w:pPr>
-        <w:spacing w:before="100" w:beforeAutospacing="1" w:after="100" w:afterAutospacing="1" w:line="240" w:lineRule="auto"/>
-        <w:rPr>
-          <w:rFonts w:ascii="Arial" w:hAnsi="Arial" w:eastAsia="Times New Roman" w:cs="Arial"/>
-          <w:sz w:val="24"/>
-          <w:szCs w:val="24"/>
-          <w:lang w:eastAsia="es-GT"/>
-        </w:rPr>
-      </w:pPr>
-    </w:p>
-    <w:p>
-      <w:pPr>
-        <w:spacing w:before="100" w:beforeAutospacing="1" w:after="100" w:afterAutospacing="1" w:line="240" w:lineRule="auto"/>
-        <w:rPr>
-          <w:rFonts w:ascii="Arial" w:hAnsi="Arial" w:eastAsia="Times New Roman" w:cs="Arial"/>
-          <w:sz w:val="24"/>
-          <w:szCs w:val="24"/>
-          <w:lang w:eastAsia="es-GT"/>
-        </w:rPr>
-      </w:pPr>
-    </w:p>
-    <w:p>
-      <w:pPr>
-        <w:spacing w:before="100" w:beforeAutospacing="1" w:after="100" w:afterAutospacing="1" w:line="240" w:lineRule="auto"/>
-        <w:rPr>
-          <w:rFonts w:ascii="Arial" w:hAnsi="Arial" w:eastAsia="Times New Roman" w:cs="Arial"/>
-          <w:sz w:val="24"/>
-          <w:szCs w:val="24"/>
-          <w:lang w:eastAsia="es-GT"/>
-        </w:rPr>
-      </w:pPr>
-    </w:p>
-    <w:p>
-      <w:pPr>
-        <w:spacing w:before="100" w:beforeAutospacing="1" w:after="100" w:afterAutospacing="1" w:line="240" w:lineRule="auto"/>
-        <w:rPr>
-          <w:rFonts w:ascii="Arial" w:hAnsi="Arial" w:eastAsia="Times New Roman" w:cs="Arial"/>
-          <w:sz w:val="24"/>
-          <w:szCs w:val="24"/>
-          <w:lang w:eastAsia="es-GT"/>
-        </w:rPr>
-      </w:pPr>
-    </w:p>
-    <w:p>
-      <w:pPr>
-        <w:spacing w:before="100" w:beforeAutospacing="1" w:after="100" w:afterAutospacing="1" w:line="240" w:lineRule="auto"/>
-        <w:rPr>
-          <w:rFonts w:ascii="Arial" w:hAnsi="Arial" w:eastAsia="Times New Roman" w:cs="Arial"/>
-          <w:sz w:val="24"/>
-          <w:szCs w:val="24"/>
-          <w:lang w:eastAsia="es-GT"/>
-        </w:rPr>
-      </w:pPr>
-    </w:p>
-    <w:p>
-      <w:pPr>
-        <w:spacing w:before="100" w:beforeAutospacing="1" w:after="100" w:afterAutospacing="1" w:line="240" w:lineRule="auto"/>
-        <w:rPr>
-          <w:rFonts w:ascii="Arial" w:hAnsi="Arial" w:eastAsia="Times New Roman" w:cs="Arial"/>
-          <w:sz w:val="24"/>
-          <w:szCs w:val="24"/>
-          <w:lang w:eastAsia="es-GT"/>
-        </w:rPr>
-      </w:pPr>
-    </w:p>
-    <w:p>
-      <w:pPr>
-        <w:spacing w:before="100" w:beforeAutospacing="1" w:after="100" w:afterAutospacing="1" w:line="240" w:lineRule="auto"/>
-        <w:rPr>
-          <w:rFonts w:ascii="Arial" w:hAnsi="Arial" w:eastAsia="Times New Roman" w:cs="Arial"/>
-          <w:sz w:val="24"/>
-          <w:szCs w:val="24"/>
-          <w:lang w:eastAsia="es-GT"/>
-        </w:rPr>
-      </w:pPr>
-    </w:p>
-    <w:p>
-      <w:pPr>
-        <w:spacing w:before="100" w:beforeAutospacing="1" w:after="100" w:afterAutospacing="1" w:line="240" w:lineRule="auto"/>
-        <w:rPr>
-          <w:rFonts w:ascii="Arial" w:hAnsi="Arial" w:eastAsia="Times New Roman" w:cs="Arial"/>
-          <w:sz w:val="24"/>
-          <w:szCs w:val="24"/>
-          <w:lang w:eastAsia="es-GT"/>
-        </w:rPr>
-      </w:pPr>
-    </w:p>
-    <w:p>
-      <w:pPr>
-        <w:spacing w:before="100" w:beforeAutospacing="1" w:after="100" w:afterAutospacing="1" w:line="240" w:lineRule="auto"/>
-        <w:rPr>
-          <w:rFonts w:ascii="Arial" w:hAnsi="Arial" w:eastAsia="Times New Roman" w:cs="Arial"/>
-          <w:sz w:val="24"/>
-          <w:szCs w:val="24"/>
-          <w:lang w:eastAsia="es-GT"/>
-        </w:rPr>
-      </w:pPr>
-    </w:p>
-    <w:p>
-      <w:pPr>
-        <w:spacing w:before="100" w:beforeAutospacing="1" w:after="100" w:afterAutospacing="1" w:line="240" w:lineRule="auto"/>
-        <w:rPr>
-          <w:rFonts w:ascii="Arial" w:hAnsi="Arial" w:eastAsia="Times New Roman" w:cs="Arial"/>
-          <w:sz w:val="24"/>
-          <w:szCs w:val="24"/>
-          <w:lang w:eastAsia="es-GT"/>
-        </w:rPr>
-      </w:pPr>
-    </w:p>
-    <w:p>
-      <w:pPr>
-        <w:spacing w:before="100" w:beforeAutospacing="1" w:after="100" w:afterAutospacing="1" w:line="240" w:lineRule="auto"/>
-        <w:rPr>
-          <w:rFonts w:ascii="Arial" w:hAnsi="Arial" w:eastAsia="Times New Roman" w:cs="Arial"/>
-          <w:sz w:val="24"/>
-          <w:szCs w:val="24"/>
-          <w:lang w:eastAsia="es-GT"/>
-        </w:rPr>
-      </w:pPr>
-    </w:p>
-    <w:p>
-      <w:pPr>
-        <w:spacing w:before="100" w:beforeAutospacing="1" w:after="100" w:afterAutospacing="1" w:line="240" w:lineRule="auto"/>
-        <w:rPr>
-          <w:rFonts w:ascii="Arial" w:hAnsi="Arial" w:eastAsia="Times New Roman" w:cs="Arial"/>
-          <w:sz w:val="24"/>
-          <w:szCs w:val="24"/>
-          <w:lang w:eastAsia="es-GT"/>
-        </w:rPr>
-      </w:pPr>
-    </w:p>
-    <w:p>
-      <w:pPr>
-        <w:spacing w:before="100" w:beforeAutospacing="1" w:after="100" w:afterAutospacing="1" w:line="240" w:lineRule="auto"/>
-        <w:rPr>
-          <w:rFonts w:ascii="Arial" w:hAnsi="Arial" w:eastAsia="Times New Roman" w:cs="Arial"/>
-          <w:sz w:val="24"/>
-          <w:szCs w:val="24"/>
-          <w:lang w:eastAsia="es-GT"/>
+        <w:rPr>
+          <w:b/>
+        </w:rPr>
+      </w:pPr>
+      <w:r>
+        <w:rPr>
+          <w:b/>
+        </w:rPr>
+        <w:t>Tupla: Pago</w:t>
+      </w:r>
+    </w:p>
+    <w:p>
+      <w:r>
+        <w:t>HURH-0010 Registro de pago:</w:t>
+      </w:r>
+    </w:p>
+    <w:p>
+      <w:r>
+        <w:t>1. Como un registro de pagos</w:t>
+      </w:r>
+    </w:p>
+    <w:p>
+      <w:r>
+        <w:t>2. Quiero que registre los datos del monto</w:t>
+      </w:r>
+    </w:p>
+    <w:p>
+      <w:r>
+        <w:t>3. Para poder confirmar que los datos del monto estén registrados</w:t>
+      </w:r>
+    </w:p>
+    <w:p/>
+    <w:p>
+      <w:r>
+        <w:t>HURH-0011 Validación de monto máximo</w:t>
+      </w:r>
+    </w:p>
+    <w:p>
+      <w:r>
+        <w:t xml:space="preserve">1. Como método de pago </w:t>
+      </w:r>
+    </w:p>
+    <w:p>
+      <w:r>
+        <w:t>2. Quiero que el monto sea en efectivo o en tarjeta</w:t>
+      </w:r>
+    </w:p>
+    <w:p>
+      <w:r>
+        <w:t>3. Para verificar si el monto de pago es valido</w:t>
+      </w:r>
+    </w:p>
+    <w:p/>
+    <w:p>
+      <w:r>
+        <w:t>HURH-0012 Generación de recibo de pago</w:t>
+      </w:r>
+    </w:p>
+    <w:p>
+      <w:r>
+        <w:t xml:space="preserve">1. Como registro de pago recibido </w:t>
+      </w:r>
+    </w:p>
+    <w:p>
+      <w:r>
+        <w:t>2. Quiero que me den la información del monto de pago</w:t>
+      </w:r>
+    </w:p>
+    <w:p>
+      <w:pPr>
+        <w:spacing w:before="100" w:beforeAutospacing="1" w:after="100" w:afterAutospacing="1" w:line="240" w:lineRule="auto"/>
+        <w:rPr>
+          <w:rFonts w:ascii="Arial" w:hAnsi="Arial" w:eastAsia="Times New Roman" w:cs="Arial"/>
+          <w:sz w:val="24"/>
+          <w:szCs w:val="24"/>
+          <w:lang w:eastAsia="es-GT"/>
+        </w:rPr>
+      </w:pPr>
+      <w:r>
+        <w:t>3. Para que registre el recibo y se almacene en el sistema</w:t>
+      </w:r>
+    </w:p>
+    <w:p>
+      <w:pPr>
+        <w:spacing w:before="100" w:beforeAutospacing="1" w:after="100" w:afterAutospacing="1" w:line="240" w:lineRule="auto"/>
+        <w:rPr>
+          <w:rFonts w:ascii="Arial" w:hAnsi="Arial" w:eastAsia="Times New Roman" w:cs="Arial"/>
+          <w:sz w:val="24"/>
+          <w:szCs w:val="24"/>
+          <w:lang w:eastAsia="es-GT"/>
+        </w:rPr>
+      </w:pPr>
+    </w:p>
+    <w:p>
+      <w:pPr>
+        <w:spacing w:before="100" w:beforeAutospacing="1" w:after="100" w:afterAutospacing="1" w:line="240" w:lineRule="auto"/>
+        <w:rPr>
+          <w:rFonts w:ascii="Arial" w:hAnsi="Arial" w:eastAsia="Times New Roman" w:cs="Arial"/>
+          <w:sz w:val="24"/>
+          <w:szCs w:val="24"/>
+          <w:lang w:eastAsia="es-GT"/>
+        </w:rPr>
+      </w:pPr>
+      <w:r>
+        <w:rPr>
+          <w:rFonts w:ascii="Arial" w:hAnsi="Arial" w:eastAsia="Times New Roman" w:cs="Arial"/>
+          <w:sz w:val="24"/>
+          <w:szCs w:val="24"/>
+          <w:lang w:eastAsia="es-GT"/>
+        </w:rPr>
+        <w:t xml:space="preserve">Tupla: Reembolso </w:t>
+      </w:r>
+    </w:p>
+    <w:p>
+      <w:pPr>
+        <w:spacing w:before="100" w:beforeAutospacing="1" w:after="100" w:afterAutospacing="1" w:line="240" w:lineRule="auto"/>
+        <w:rPr>
+          <w:rFonts w:ascii="Arial" w:hAnsi="Arial" w:eastAsia="Times New Roman" w:cs="Arial"/>
+          <w:sz w:val="24"/>
+          <w:szCs w:val="24"/>
+          <w:u w:val="single"/>
+          <w:lang w:eastAsia="es-GT"/>
+        </w:rPr>
+      </w:pPr>
+      <w:r>
+        <w:rPr>
+          <w:rFonts w:ascii="Arial" w:hAnsi="Arial" w:eastAsia="Times New Roman" w:cs="Arial"/>
+          <w:sz w:val="24"/>
+          <w:szCs w:val="24"/>
+          <w:lang w:eastAsia="es-GT"/>
+        </w:rPr>
+        <w:t>HUOV-013</w:t>
+      </w:r>
+    </w:p>
+    <w:p>
+      <w:pPr>
+        <w:spacing w:before="100" w:beforeAutospacing="1" w:after="100" w:afterAutospacing="1" w:line="240" w:lineRule="auto"/>
+        <w:rPr>
+          <w:rFonts w:ascii="Arial" w:hAnsi="Arial" w:eastAsia="Times New Roman" w:cs="Arial"/>
+          <w:sz w:val="24"/>
+          <w:szCs w:val="24"/>
+          <w:lang w:eastAsia="es-GT"/>
+        </w:rPr>
+      </w:pPr>
+      <w:r>
+        <w:rPr>
+          <w:rFonts w:ascii="Arial" w:hAnsi="Arial" w:eastAsia="Times New Roman" w:cs="Arial"/>
+          <w:sz w:val="24"/>
+          <w:szCs w:val="24"/>
+          <w:lang w:eastAsia="es-GT"/>
+        </w:rPr>
+        <w:t>Como: empleado</w:t>
+      </w:r>
+    </w:p>
+    <w:p>
+      <w:pPr>
+        <w:spacing w:before="100" w:beforeAutospacing="1" w:after="100" w:afterAutospacing="1" w:line="240" w:lineRule="auto"/>
+        <w:rPr>
+          <w:rFonts w:ascii="Arial" w:hAnsi="Arial" w:eastAsia="Times New Roman" w:cs="Arial"/>
+          <w:sz w:val="24"/>
+          <w:szCs w:val="24"/>
+          <w:lang w:eastAsia="es-GT"/>
+        </w:rPr>
+      </w:pPr>
+      <w:r>
+        <w:rPr>
+          <w:rFonts w:ascii="Arial" w:hAnsi="Arial" w:eastAsia="Times New Roman" w:cs="Arial"/>
+          <w:sz w:val="24"/>
+          <w:szCs w:val="24"/>
+          <w:lang w:eastAsia="es-GT"/>
+        </w:rPr>
+        <w:t xml:space="preserve">Quiero: Poder enviar una solicitud de reembolso cargando recibos y completando un formulario, </w:t>
+      </w:r>
+    </w:p>
+    <w:p>
+      <w:pPr>
+        <w:spacing w:before="100" w:beforeAutospacing="1" w:after="100" w:afterAutospacing="1" w:line="240" w:lineRule="auto"/>
+        <w:rPr>
+          <w:rFonts w:ascii="Arial" w:hAnsi="Arial" w:eastAsia="Times New Roman" w:cs="Arial"/>
+          <w:sz w:val="24"/>
+          <w:szCs w:val="24"/>
+          <w:lang w:eastAsia="es-GT"/>
+        </w:rPr>
+      </w:pPr>
+      <w:r>
+        <w:rPr>
+          <w:rFonts w:ascii="Arial" w:hAnsi="Arial" w:eastAsia="Times New Roman" w:cs="Arial"/>
+          <w:sz w:val="24"/>
+          <w:szCs w:val="24"/>
+          <w:lang w:eastAsia="es-GT"/>
+        </w:rPr>
+        <w:t>para que la administración pueda revisar y aprobar el reembolso de los gastos.</w:t>
+      </w:r>
+    </w:p>
+    <w:p>
+      <w:pPr>
+        <w:spacing w:before="100" w:beforeAutospacing="1" w:after="100" w:afterAutospacing="1" w:line="240" w:lineRule="auto"/>
+        <w:rPr>
+          <w:rFonts w:ascii="Arial" w:hAnsi="Arial" w:eastAsia="Times New Roman" w:cs="Arial"/>
+          <w:sz w:val="24"/>
+          <w:szCs w:val="24"/>
+          <w:lang w:eastAsia="es-GT"/>
+        </w:rPr>
+      </w:pPr>
+      <w:r>
+        <w:rPr>
+          <w:rFonts w:ascii="Arial" w:hAnsi="Arial" w:eastAsia="Times New Roman" w:cs="Arial"/>
+          <w:sz w:val="24"/>
+          <w:szCs w:val="24"/>
+          <w:lang w:eastAsia="es-GT"/>
+        </w:rPr>
+        <w:t xml:space="preserve">Para: Para ofrecer un rembolso cada que lo necesite un cliente. </w:t>
+      </w:r>
+    </w:p>
+    <w:p>
+      <w:pPr>
+        <w:spacing w:before="100" w:beforeAutospacing="1" w:after="100" w:afterAutospacing="1" w:line="240" w:lineRule="auto"/>
+        <w:rPr>
+          <w:rFonts w:ascii="Arial" w:hAnsi="Arial" w:eastAsia="Times New Roman" w:cs="Arial"/>
+          <w:sz w:val="24"/>
+          <w:szCs w:val="24"/>
+          <w:lang w:eastAsia="es-GT"/>
+        </w:rPr>
+      </w:pPr>
+      <w:r>
+        <w:rPr>
+          <w:rFonts w:ascii="Arial" w:hAnsi="Arial" w:eastAsia="Times New Roman" w:cs="Arial"/>
+          <w:sz w:val="24"/>
+          <w:szCs w:val="24"/>
+          <w:lang w:eastAsia="es-GT"/>
+        </w:rPr>
+        <w:t>HUOV-014</w:t>
+      </w:r>
+    </w:p>
+    <w:p>
+      <w:pPr>
+        <w:spacing w:before="100" w:beforeAutospacing="1" w:after="100" w:afterAutospacing="1" w:line="240" w:lineRule="auto"/>
+        <w:rPr>
+          <w:rFonts w:ascii="Arial" w:hAnsi="Arial" w:eastAsia="Times New Roman" w:cs="Arial"/>
+          <w:sz w:val="24"/>
+          <w:szCs w:val="24"/>
+          <w:lang w:eastAsia="es-GT"/>
+        </w:rPr>
+      </w:pPr>
+      <w:r>
+        <w:rPr>
+          <w:rFonts w:ascii="Arial" w:hAnsi="Arial" w:eastAsia="Times New Roman" w:cs="Arial"/>
+          <w:sz w:val="24"/>
+          <w:szCs w:val="24"/>
+          <w:lang w:eastAsia="es-GT"/>
+        </w:rPr>
+        <w:t xml:space="preserve">Como: Administrador financiero </w:t>
+      </w:r>
+    </w:p>
+    <w:p>
+      <w:pPr>
+        <w:spacing w:before="100" w:beforeAutospacing="1" w:after="100" w:afterAutospacing="1" w:line="240" w:lineRule="auto"/>
+        <w:rPr>
+          <w:rFonts w:ascii="Arial" w:hAnsi="Arial" w:eastAsia="Times New Roman" w:cs="Arial"/>
+          <w:sz w:val="24"/>
+          <w:szCs w:val="24"/>
+          <w:lang w:eastAsia="es-GT"/>
+        </w:rPr>
+      </w:pPr>
+      <w:r>
+        <w:rPr>
+          <w:rFonts w:ascii="Arial" w:hAnsi="Arial" w:eastAsia="Times New Roman" w:cs="Arial"/>
+          <w:sz w:val="24"/>
+          <w:szCs w:val="24"/>
+          <w:lang w:eastAsia="es-GT"/>
+        </w:rPr>
+        <w:t xml:space="preserve">Quiero: Acceder a todas las solicitudes de rembolso recibidas y poder aprobarlas o rechazarlas </w:t>
+      </w:r>
+    </w:p>
+    <w:p>
+      <w:pPr>
+        <w:spacing w:before="100" w:beforeAutospacing="1" w:after="100" w:afterAutospacing="1" w:line="240" w:lineRule="auto"/>
+        <w:rPr>
+          <w:rFonts w:ascii="Arial" w:hAnsi="Arial" w:eastAsia="Times New Roman" w:cs="Arial"/>
+          <w:sz w:val="24"/>
+          <w:szCs w:val="24"/>
+          <w:lang w:eastAsia="es-GT"/>
+        </w:rPr>
+      </w:pPr>
+      <w:r>
+        <w:rPr>
+          <w:rFonts w:ascii="Arial" w:hAnsi="Arial" w:eastAsia="Times New Roman" w:cs="Arial"/>
+          <w:sz w:val="24"/>
+          <w:szCs w:val="24"/>
+          <w:lang w:eastAsia="es-GT"/>
+        </w:rPr>
+        <w:t>o hasta incluso pedir más información sobre la solicitud de rembolso.</w:t>
+      </w:r>
+    </w:p>
+    <w:p>
+      <w:pPr>
+        <w:spacing w:before="100" w:beforeAutospacing="1" w:after="100" w:afterAutospacing="1" w:line="240" w:lineRule="auto"/>
+        <w:rPr>
+          <w:rFonts w:ascii="Arial" w:hAnsi="Arial" w:eastAsia="Times New Roman" w:cs="Arial"/>
+          <w:sz w:val="24"/>
+          <w:szCs w:val="24"/>
+          <w:lang w:eastAsia="es-GT"/>
+        </w:rPr>
+      </w:pPr>
+      <w:r>
+        <w:rPr>
+          <w:rFonts w:ascii="Arial" w:hAnsi="Arial" w:eastAsia="Times New Roman" w:cs="Arial"/>
+          <w:sz w:val="24"/>
+          <w:szCs w:val="24"/>
+          <w:lang w:eastAsia="es-GT"/>
+        </w:rPr>
+        <w:t>Para: Tener un registro de cada acción tomada con fecha y el usuario responsable.</w:t>
+      </w:r>
+    </w:p>
+    <w:p>
+      <w:pPr>
+        <w:spacing w:before="100" w:beforeAutospacing="1" w:after="100" w:afterAutospacing="1" w:line="240" w:lineRule="auto"/>
+        <w:rPr>
+          <w:rFonts w:ascii="Arial" w:hAnsi="Arial" w:eastAsia="Times New Roman" w:cs="Arial"/>
+          <w:sz w:val="24"/>
+          <w:szCs w:val="24"/>
+          <w:lang w:eastAsia="es-GT"/>
+        </w:rPr>
+      </w:pPr>
+    </w:p>
+    <w:p>
+      <w:pPr>
+        <w:spacing w:before="100" w:beforeAutospacing="1" w:after="100" w:afterAutospacing="1" w:line="240" w:lineRule="auto"/>
+        <w:rPr>
+          <w:rFonts w:ascii="Arial" w:hAnsi="Arial" w:eastAsia="Times New Roman" w:cs="Arial"/>
+          <w:sz w:val="24"/>
+          <w:szCs w:val="24"/>
+          <w:lang w:eastAsia="es-GT"/>
+        </w:rPr>
+      </w:pPr>
+    </w:p>
+    <w:p>
+      <w:pPr>
+        <w:spacing w:before="100" w:beforeAutospacing="1" w:after="100" w:afterAutospacing="1" w:line="240" w:lineRule="auto"/>
+        <w:rPr>
+          <w:rFonts w:ascii="Arial" w:hAnsi="Arial" w:eastAsia="Times New Roman" w:cs="Arial"/>
+          <w:sz w:val="24"/>
+          <w:szCs w:val="24"/>
+          <w:lang w:eastAsia="es-GT"/>
+        </w:rPr>
+      </w:pPr>
+      <w:r>
+        <w:rPr>
+          <w:rFonts w:ascii="Arial" w:hAnsi="Arial" w:eastAsia="Times New Roman" w:cs="Arial"/>
+          <w:sz w:val="24"/>
+          <w:szCs w:val="24"/>
+          <w:lang w:eastAsia="es-GT"/>
+        </w:rPr>
+        <w:t>HUOV-015</w:t>
+      </w:r>
+    </w:p>
+    <w:p>
+      <w:pPr>
+        <w:spacing w:before="100" w:beforeAutospacing="1" w:after="100" w:afterAutospacing="1" w:line="240" w:lineRule="auto"/>
+        <w:rPr>
+          <w:rFonts w:ascii="Arial" w:hAnsi="Arial" w:eastAsia="Times New Roman" w:cs="Arial"/>
+          <w:sz w:val="24"/>
+          <w:szCs w:val="24"/>
+          <w:lang w:eastAsia="es-GT"/>
+        </w:rPr>
+      </w:pPr>
+      <w:r>
+        <w:rPr>
+          <w:rFonts w:ascii="Arial" w:hAnsi="Arial" w:eastAsia="Times New Roman" w:cs="Arial"/>
+          <w:sz w:val="24"/>
+          <w:szCs w:val="24"/>
+          <w:lang w:eastAsia="es-GT"/>
+        </w:rPr>
+        <w:t xml:space="preserve">Como: Cliente </w:t>
+      </w:r>
+    </w:p>
+    <w:p>
+      <w:pPr>
+        <w:spacing w:before="100" w:beforeAutospacing="1" w:after="100" w:afterAutospacing="1" w:line="240" w:lineRule="auto"/>
+        <w:rPr>
+          <w:rFonts w:ascii="Arial" w:hAnsi="Arial" w:eastAsia="Times New Roman" w:cs="Arial"/>
+          <w:sz w:val="24"/>
+          <w:szCs w:val="24"/>
+          <w:lang w:eastAsia="es-GT"/>
+        </w:rPr>
+      </w:pPr>
+      <w:r>
+        <w:rPr>
+          <w:rFonts w:ascii="Arial" w:hAnsi="Arial" w:eastAsia="Times New Roman" w:cs="Arial"/>
+          <w:sz w:val="24"/>
+          <w:szCs w:val="24"/>
+          <w:lang w:eastAsia="es-GT"/>
+        </w:rPr>
+        <w:t xml:space="preserve">Quiero: Recibir notificaciones cada vez que cambie el estado de mi solicitud de reembolso, </w:t>
+      </w:r>
+    </w:p>
+    <w:p>
+      <w:pPr>
+        <w:spacing w:before="100" w:beforeAutospacing="1" w:after="100" w:afterAutospacing="1" w:line="240" w:lineRule="auto"/>
+        <w:rPr>
+          <w:rFonts w:ascii="Arial" w:hAnsi="Arial" w:eastAsia="Times New Roman" w:cs="Arial"/>
+          <w:sz w:val="24"/>
+          <w:szCs w:val="24"/>
+          <w:lang w:eastAsia="es-GT"/>
+        </w:rPr>
+      </w:pPr>
+      <w:r>
+        <w:rPr>
+          <w:rFonts w:ascii="Arial" w:hAnsi="Arial" w:eastAsia="Times New Roman" w:cs="Arial"/>
+          <w:sz w:val="24"/>
+          <w:szCs w:val="24"/>
+          <w:lang w:eastAsia="es-GT"/>
+        </w:rPr>
+        <w:t>para mantenerme informado sobre el avance y resultado de mi trámite.</w:t>
+      </w:r>
+    </w:p>
+    <w:p>
+      <w:pPr>
+        <w:spacing w:before="100" w:beforeAutospacing="1" w:after="100" w:afterAutospacing="1" w:line="240" w:lineRule="auto"/>
+        <w:rPr>
+          <w:rFonts w:ascii="Arial" w:hAnsi="Arial" w:eastAsia="Times New Roman" w:cs="Arial"/>
+          <w:sz w:val="24"/>
+          <w:szCs w:val="24"/>
+          <w:lang w:eastAsia="es-GT"/>
+        </w:rPr>
+      </w:pPr>
+      <w:r>
+        <w:rPr>
+          <w:rFonts w:ascii="Arial" w:hAnsi="Arial" w:eastAsia="Times New Roman" w:cs="Arial"/>
+          <w:sz w:val="24"/>
+          <w:szCs w:val="24"/>
+          <w:lang w:eastAsia="es-GT"/>
+        </w:rPr>
+        <w:t>Para: Tener un envio automático de notificaciones por correo electrónico y dentro del sistema.</w:t>
+      </w:r>
+    </w:p>
+    <w:p>
+      <w:pPr>
+        <w:spacing w:before="100" w:beforeAutospacing="1" w:after="100" w:afterAutospacing="1" w:line="240" w:lineRule="auto"/>
+        <w:rPr>
+          <w:rFonts w:ascii="Arial" w:hAnsi="Arial" w:eastAsia="Times New Roman" w:cs="Arial"/>
+          <w:sz w:val="24"/>
+          <w:szCs w:val="24"/>
+          <w:lang w:eastAsia="es-GT"/>
+        </w:rPr>
+      </w:pPr>
+    </w:p>
+    <w:p>
+      <w:pPr>
+        <w:pStyle w:val="9"/>
+        <w:rPr>
+          <w:rStyle w:val="19"/>
+          <w:rFonts w:cs="Arial"/>
+          <w:b/>
+          <w:sz w:val="24"/>
+          <w:szCs w:val="24"/>
+        </w:rPr>
+      </w:pPr>
+      <w:r>
+        <w:rPr>
+          <w:rStyle w:val="19"/>
+          <w:rFonts w:cs="Arial"/>
+          <w:b/>
+          <w:sz w:val="24"/>
+          <w:szCs w:val="24"/>
+        </w:rPr>
+        <w:t>Tupla: Comodidades</w:t>
+      </w:r>
+    </w:p>
+    <w:p>
+      <w:pPr>
+        <w:pStyle w:val="9"/>
+        <w:rPr>
+          <w:rFonts w:ascii="Arial" w:hAnsi="Arial" w:cs="Arial"/>
+          <w:sz w:val="22"/>
+          <w:szCs w:val="22"/>
+        </w:rPr>
+      </w:pPr>
+      <w:r>
+        <w:rPr>
+          <w:rFonts w:ascii="Arial" w:hAnsi="Arial" w:cs="Arial"/>
+          <w:sz w:val="22"/>
+          <w:szCs w:val="22"/>
+        </w:rPr>
+        <w:t>HUBA-016: Visualización Detallada de Comodidades Disponibles</w:t>
+      </w:r>
+    </w:p>
+    <w:p>
+      <w:pPr>
+        <w:pStyle w:val="9"/>
+        <w:rPr>
+          <w:rFonts w:ascii="Arial" w:hAnsi="Arial" w:cs="Arial"/>
+          <w:sz w:val="22"/>
+          <w:szCs w:val="22"/>
+        </w:rPr>
+      </w:pPr>
+      <w:r>
+        <w:rPr>
+          <w:rFonts w:ascii="Arial" w:hAnsi="Arial" w:cs="Arial"/>
+          <w:sz w:val="22"/>
+          <w:szCs w:val="22"/>
+        </w:rPr>
+        <w:t>Como: Comodidades</w:t>
+      </w:r>
+    </w:p>
+    <w:p>
+      <w:pPr>
+        <w:pStyle w:val="9"/>
+        <w:rPr>
+          <w:rFonts w:ascii="Arial" w:hAnsi="Arial" w:cs="Arial"/>
+          <w:sz w:val="22"/>
+          <w:szCs w:val="22"/>
+        </w:rPr>
+      </w:pPr>
+      <w:r>
+        <w:rPr>
+          <w:rFonts w:ascii="Arial" w:hAnsi="Arial" w:cs="Arial"/>
+          <w:sz w:val="22"/>
+          <w:szCs w:val="22"/>
+        </w:rPr>
+        <w:t>Quiero: poder ver una descripción completa y detallada de todas las comodidades disponibles en la propiedad</w:t>
+      </w:r>
+    </w:p>
+    <w:p>
+      <w:pPr>
+        <w:pStyle w:val="9"/>
+        <w:rPr>
+          <w:rFonts w:ascii="Arial" w:hAnsi="Arial" w:cs="Arial"/>
+          <w:sz w:val="22"/>
+          <w:szCs w:val="22"/>
+        </w:rPr>
+      </w:pPr>
+      <w:r>
+        <w:rPr>
+          <w:rFonts w:ascii="Arial" w:hAnsi="Arial" w:cs="Arial"/>
+          <w:sz w:val="22"/>
+          <w:szCs w:val="22"/>
+        </w:rPr>
+        <w:t>Para: ofrecer información precisa y enriquecedora que mejore significativamente la experiencia de búsqueda del usuario, permitiéndole tomar decisiones informadas.</w:t>
+      </w:r>
+    </w:p>
+    <w:p>
+      <w:pPr>
+        <w:pStyle w:val="9"/>
+        <w:rPr>
+          <w:rFonts w:ascii="Arial" w:hAnsi="Arial" w:cs="Arial"/>
+          <w:sz w:val="22"/>
+          <w:szCs w:val="22"/>
+        </w:rPr>
+      </w:pPr>
+    </w:p>
+    <w:p>
+      <w:pPr>
+        <w:rPr>
+          <w:rFonts w:ascii="Arial" w:hAnsi="Arial" w:cs="Arial" w:eastAsiaTheme="minorHAnsi"/>
+        </w:rPr>
+      </w:pPr>
+      <w:r>
+        <w:rPr>
+          <w:rFonts w:ascii="Arial" w:hAnsi="Arial" w:cs="Arial" w:eastAsiaTheme="minorHAnsi"/>
+        </w:rPr>
+        <w:t>HUBA-017: Identificación Clara de Comodidades No Disponibles</w:t>
+      </w:r>
+    </w:p>
+    <w:p>
+      <w:pPr>
+        <w:rPr>
+          <w:rFonts w:ascii="Arial" w:hAnsi="Arial" w:cs="Arial" w:eastAsiaTheme="minorHAnsi"/>
+        </w:rPr>
+      </w:pPr>
+      <w:r>
+        <w:rPr>
+          <w:rFonts w:ascii="Arial" w:hAnsi="Arial" w:cs="Arial" w:eastAsiaTheme="minorHAnsi"/>
+        </w:rPr>
+        <w:t>Como: Comodidades</w:t>
+      </w:r>
+    </w:p>
+    <w:p>
+      <w:pPr>
+        <w:rPr>
+          <w:rFonts w:ascii="Arial" w:hAnsi="Arial" w:cs="Arial" w:eastAsiaTheme="minorHAnsi"/>
+        </w:rPr>
+      </w:pPr>
+      <w:r>
+        <w:rPr>
+          <w:rFonts w:ascii="Arial" w:hAnsi="Arial" w:cs="Arial" w:eastAsiaTheme="minorHAnsi"/>
+        </w:rPr>
+        <w:t>Quiero: que el sistema muestre de forma clara las comodidades con las que la propiedad no cuenta,</w:t>
+      </w:r>
+    </w:p>
+    <w:p>
+      <w:pPr>
+        <w:rPr>
+          <w:rFonts w:ascii="Arial" w:hAnsi="Arial" w:cs="Arial" w:eastAsiaTheme="minorHAnsi"/>
+        </w:rPr>
+      </w:pPr>
+      <w:r>
+        <w:rPr>
+          <w:rFonts w:ascii="Arial" w:hAnsi="Arial" w:cs="Arial" w:eastAsiaTheme="minorHAnsi"/>
+        </w:rPr>
+        <w:t>Para: evitar cualquier expectativa errónea o inconveniente al momento de mi estancia, asegurando una total transparencia.</w:t>
+      </w:r>
+    </w:p>
+    <w:p>
+      <w:pPr>
+        <w:rPr>
+          <w:rFonts w:ascii="Arial" w:hAnsi="Arial" w:cs="Arial" w:eastAsiaTheme="minorHAnsi"/>
+        </w:rPr>
+      </w:pPr>
+    </w:p>
+    <w:p>
+      <w:pPr>
+        <w:rPr>
+          <w:rFonts w:ascii="Arial" w:hAnsi="Arial" w:cs="Arial" w:eastAsiaTheme="minorHAnsi"/>
+          <w:sz w:val="20"/>
+          <w:szCs w:val="20"/>
+        </w:rPr>
+      </w:pPr>
+      <w:r>
+        <w:rPr>
+          <w:rFonts w:ascii="Arial" w:hAnsi="Arial" w:cs="Arial" w:eastAsiaTheme="minorHAnsi"/>
+          <w:sz w:val="20"/>
+          <w:szCs w:val="20"/>
+        </w:rPr>
+        <w:t>HUBA-018: Administración Integral de Comodidades de la Propiedad</w:t>
+      </w:r>
+    </w:p>
+    <w:p>
+      <w:pPr>
+        <w:rPr>
+          <w:rFonts w:ascii="Arial" w:hAnsi="Arial" w:cs="Arial" w:eastAsiaTheme="minorHAnsi"/>
+          <w:sz w:val="20"/>
+          <w:szCs w:val="20"/>
+        </w:rPr>
+      </w:pPr>
+      <w:r>
+        <w:rPr>
+          <w:rFonts w:ascii="Arial" w:hAnsi="Arial" w:cs="Arial" w:eastAsiaTheme="minorHAnsi"/>
+          <w:sz w:val="20"/>
+          <w:szCs w:val="20"/>
+        </w:rPr>
+        <w:t>Como: Comodidades</w:t>
+      </w:r>
+    </w:p>
+    <w:p>
+      <w:pPr>
+        <w:rPr>
+          <w:rFonts w:ascii="Arial" w:hAnsi="Arial" w:cs="Arial" w:eastAsiaTheme="minorHAnsi"/>
+          <w:sz w:val="20"/>
+          <w:szCs w:val="20"/>
+        </w:rPr>
+      </w:pPr>
+      <w:r>
+        <w:rPr>
+          <w:rFonts w:ascii="Arial" w:hAnsi="Arial" w:cs="Arial" w:eastAsiaTheme="minorHAnsi"/>
+          <w:sz w:val="20"/>
+          <w:szCs w:val="20"/>
+        </w:rPr>
+        <w:t>Quiero: tener la capacidad de añadir nuevas comodidades, eliminar las existentes o actualizar la información de estas,</w:t>
+      </w:r>
+    </w:p>
+    <w:p>
+      <w:pPr>
+        <w:rPr>
+          <w:rFonts w:ascii="Arial" w:hAnsi="Arial" w:cs="Arial" w:eastAsiaTheme="minorHAnsi"/>
+          <w:sz w:val="20"/>
+          <w:szCs w:val="20"/>
+        </w:rPr>
+      </w:pPr>
+      <w:r>
+        <w:rPr>
+          <w:rFonts w:ascii="Arial" w:hAnsi="Arial" w:cs="Arial" w:eastAsiaTheme="minorHAnsi"/>
+          <w:sz w:val="20"/>
+          <w:szCs w:val="20"/>
+        </w:rPr>
+        <w:t>Para: mantener la lista de servicios siempre al día y así garantizar que los usuarios accedan a la información más precisa y relevante, mejorando constantemente la calidad de nuestro servicio.</w:t>
+      </w:r>
+    </w:p>
+    <w:p>
+      <w:pPr>
+        <w:rPr>
+          <w:rFonts w:ascii="Arial" w:hAnsi="Arial" w:cs="Arial" w:eastAsiaTheme="minorHAnsi"/>
+        </w:rPr>
+      </w:pPr>
+    </w:p>
+    <w:p>
+      <w:pPr>
+        <w:pStyle w:val="9"/>
+        <w:rPr>
+          <w:rFonts w:ascii="Arial" w:hAnsi="Arial" w:cs="Arial"/>
+          <w:sz w:val="22"/>
+          <w:szCs w:val="22"/>
+        </w:rPr>
+      </w:pPr>
+    </w:p>
+    <w:p>
+      <w:pPr>
+        <w:spacing w:before="100" w:beforeAutospacing="1" w:after="100" w:afterAutospacing="1" w:line="240" w:lineRule="auto"/>
+        <w:rPr>
+          <w:rFonts w:ascii="Arial" w:hAnsi="Arial" w:eastAsia="Times New Roman" w:cs="Arial"/>
+          <w:sz w:val="24"/>
+          <w:szCs w:val="24"/>
+          <w:lang w:eastAsia="es-GT"/>
+        </w:rPr>
+      </w:pPr>
+    </w:p>
+    <w:p>
+      <w:pPr>
+        <w:rPr>
+          <w:rFonts w:ascii="Arial" w:hAnsi="Arial" w:cs="Arial" w:eastAsiaTheme="minorHAnsi"/>
+          <w:b/>
+          <w:u w:val="single"/>
+          <w:lang w:val="es-MX"/>
+        </w:rPr>
+      </w:pPr>
+      <w:r>
+        <w:rPr>
+          <w:rFonts w:ascii="Arial" w:hAnsi="Arial" w:cs="Arial" w:eastAsiaTheme="minorHAnsi"/>
+          <w:b/>
+          <w:u w:val="single"/>
+          <w:lang w:val="es-MX"/>
+        </w:rPr>
+        <w:t>Tupla: Propiedades</w:t>
+      </w:r>
+    </w:p>
+    <w:p>
+      <w:pPr>
+        <w:rPr>
+          <w:rFonts w:ascii="Arial" w:hAnsi="Arial" w:cs="Arial" w:eastAsiaTheme="minorHAnsi"/>
+          <w:b/>
+          <w:bCs/>
+          <w:lang w:val="es-MX"/>
+        </w:rPr>
+      </w:pPr>
+      <w:r>
+        <w:rPr>
+          <w:rFonts w:ascii="Arial" w:hAnsi="Arial" w:cs="Arial" w:eastAsiaTheme="minorHAnsi"/>
+          <w:b/>
+          <w:bCs/>
+          <w:lang w:val="es-MX"/>
+        </w:rPr>
+        <w:t>HUCL-019: Registro de Propiedades</w:t>
+      </w:r>
+    </w:p>
+    <w:p>
+      <w:pPr>
+        <w:rPr>
+          <w:rFonts w:ascii="Arial" w:hAnsi="Arial" w:cs="Arial" w:eastAsiaTheme="minorHAnsi"/>
+          <w:sz w:val="20"/>
+          <w:szCs w:val="20"/>
+          <w:lang w:val="es-MX"/>
+        </w:rPr>
+      </w:pPr>
+      <w:r>
+        <w:rPr>
+          <w:rFonts w:ascii="Arial" w:hAnsi="Arial" w:cs="Arial" w:eastAsiaTheme="minorHAnsi"/>
+          <w:sz w:val="20"/>
+          <w:szCs w:val="20"/>
+          <w:lang w:val="es-MX"/>
+        </w:rPr>
+        <w:t xml:space="preserve">Como: Agente Inmobiliario </w:t>
+      </w:r>
+    </w:p>
+    <w:p>
+      <w:pPr>
+        <w:rPr>
+          <w:rFonts w:ascii="Arial" w:hAnsi="Arial" w:cs="Arial" w:eastAsiaTheme="minorHAnsi"/>
+          <w:sz w:val="20"/>
+          <w:szCs w:val="20"/>
+          <w:lang w:val="es-MX"/>
+        </w:rPr>
+      </w:pPr>
+      <w:r>
+        <w:rPr>
+          <w:rFonts w:ascii="Arial" w:hAnsi="Arial" w:cs="Arial" w:eastAsiaTheme="minorHAnsi"/>
+          <w:sz w:val="20"/>
+          <w:szCs w:val="20"/>
+          <w:lang w:val="es-MX"/>
+        </w:rPr>
+        <w:t>Quiero: Poder visualizar todas las propiedades registradas al nombre de algún  usuario</w:t>
+      </w:r>
+    </w:p>
+    <w:p>
+      <w:pPr>
+        <w:rPr>
+          <w:rFonts w:ascii="Arial" w:hAnsi="Arial" w:cs="Arial" w:eastAsiaTheme="minorHAnsi"/>
+          <w:sz w:val="20"/>
+          <w:szCs w:val="20"/>
+          <w:lang w:val="es-MX"/>
+        </w:rPr>
+      </w:pPr>
+      <w:r>
+        <w:rPr>
+          <w:rFonts w:ascii="Arial" w:hAnsi="Arial" w:cs="Arial" w:eastAsiaTheme="minorHAnsi"/>
+          <w:sz w:val="20"/>
+          <w:szCs w:val="20"/>
+          <w:lang w:val="es-MX"/>
+        </w:rPr>
+        <w:t>Para: Poder llevar un registro de sus facturas y remodelaciones</w:t>
+      </w:r>
+    </w:p>
+    <w:p>
+      <w:pPr>
+        <w:rPr>
+          <w:rFonts w:ascii="Arial" w:hAnsi="Arial" w:cs="Arial" w:eastAsiaTheme="minorHAnsi"/>
+          <w:sz w:val="20"/>
+          <w:szCs w:val="20"/>
+          <w:lang w:val="es-MX"/>
+        </w:rPr>
+      </w:pPr>
+    </w:p>
+    <w:p>
+      <w:pPr>
+        <w:rPr>
+          <w:rFonts w:ascii="Arial" w:hAnsi="Arial" w:cs="Arial" w:eastAsiaTheme="minorHAnsi"/>
+          <w:b/>
+          <w:bCs/>
+          <w:lang w:val="es-MX"/>
+        </w:rPr>
+      </w:pPr>
+      <w:r>
+        <w:rPr>
+          <w:rFonts w:ascii="Arial" w:hAnsi="Arial" w:cs="Arial" w:eastAsiaTheme="minorHAnsi"/>
+          <w:b/>
+          <w:bCs/>
+          <w:lang w:val="es-MX"/>
+        </w:rPr>
+        <w:t>HUCL-020: Registro de Nueva Propiedad</w:t>
+      </w:r>
+    </w:p>
+    <w:p>
+      <w:pPr>
+        <w:rPr>
+          <w:rFonts w:ascii="Arial" w:hAnsi="Arial" w:cs="Arial" w:eastAsiaTheme="minorHAnsi"/>
+          <w:sz w:val="20"/>
+          <w:szCs w:val="20"/>
+          <w:lang w:val="es-MX"/>
+        </w:rPr>
+      </w:pPr>
+      <w:r>
+        <w:rPr>
+          <w:rFonts w:ascii="Arial" w:hAnsi="Arial" w:cs="Arial" w:eastAsiaTheme="minorHAnsi"/>
+          <w:sz w:val="20"/>
+          <w:szCs w:val="20"/>
+          <w:lang w:val="es-MX"/>
+        </w:rPr>
+        <w:t>Como: Arrendador</w:t>
+      </w:r>
+    </w:p>
+    <w:p>
+      <w:pPr>
+        <w:rPr>
+          <w:rFonts w:ascii="Arial" w:hAnsi="Arial" w:cs="Arial" w:eastAsiaTheme="minorHAnsi"/>
+          <w:sz w:val="20"/>
+          <w:szCs w:val="20"/>
+          <w:lang w:val="es-MX"/>
+        </w:rPr>
+      </w:pPr>
+      <w:r>
+        <w:rPr>
+          <w:rFonts w:ascii="Arial" w:hAnsi="Arial" w:cs="Arial" w:eastAsiaTheme="minorHAnsi"/>
+          <w:sz w:val="20"/>
+          <w:szCs w:val="20"/>
+          <w:lang w:val="es-MX"/>
+        </w:rPr>
+        <w:t>Quiero: Registrar una nueva propiedad en Peace at Home</w:t>
+      </w:r>
+    </w:p>
+    <w:p>
+      <w:pPr>
+        <w:rPr>
+          <w:rFonts w:ascii="Arial" w:hAnsi="Arial" w:cs="Arial" w:eastAsiaTheme="minorHAnsi"/>
+          <w:sz w:val="20"/>
+          <w:szCs w:val="20"/>
+          <w:lang w:val="es-MX"/>
+        </w:rPr>
+      </w:pPr>
+      <w:r>
+        <w:rPr>
+          <w:rFonts w:ascii="Arial" w:hAnsi="Arial" w:cs="Arial" w:eastAsiaTheme="minorHAnsi"/>
+          <w:sz w:val="20"/>
+          <w:szCs w:val="20"/>
+          <w:lang w:val="es-MX"/>
+        </w:rPr>
+        <w:t>Para: Brindar una experiencia cómoda y agradable a los huéspedes que renten la propiedad</w:t>
+      </w:r>
+    </w:p>
+    <w:p>
+      <w:pPr>
+        <w:rPr>
+          <w:rFonts w:ascii="Arial" w:hAnsi="Arial" w:cs="Arial" w:eastAsiaTheme="minorHAnsi"/>
+          <w:sz w:val="20"/>
+          <w:szCs w:val="20"/>
+          <w:lang w:val="es-MX"/>
+        </w:rPr>
+      </w:pPr>
+    </w:p>
+    <w:p>
+      <w:pPr>
+        <w:rPr>
+          <w:rFonts w:ascii="Arial" w:hAnsi="Arial" w:cs="Arial" w:eastAsiaTheme="minorHAnsi"/>
+          <w:sz w:val="20"/>
+          <w:szCs w:val="20"/>
+          <w:lang w:val="es-MX"/>
+        </w:rPr>
+      </w:pPr>
+      <w:r>
+        <w:rPr>
+          <w:rFonts w:ascii="Arial" w:hAnsi="Arial" w:cs="Arial" w:eastAsiaTheme="minorHAnsi"/>
+          <w:b/>
+          <w:bCs/>
+          <w:lang w:val="es-MX"/>
+        </w:rPr>
+        <w:t>HUCL-021:</w:t>
+      </w:r>
+      <w:r>
+        <w:rPr>
+          <w:rFonts w:ascii="Arial" w:hAnsi="Arial" w:cs="Arial" w:eastAsiaTheme="minorHAnsi"/>
+          <w:sz w:val="20"/>
+          <w:szCs w:val="20"/>
+          <w:lang w:val="es-MX"/>
+        </w:rPr>
+        <w:t xml:space="preserve">  </w:t>
+      </w:r>
+      <w:r>
+        <w:rPr>
+          <w:rFonts w:ascii="Arial" w:hAnsi="Arial" w:cs="Arial" w:eastAsiaTheme="minorHAnsi"/>
+          <w:b/>
+          <w:bCs/>
+          <w:lang w:val="es-MX"/>
+        </w:rPr>
+        <w:t>descripción de propiedades</w:t>
+      </w:r>
+    </w:p>
+    <w:p>
+      <w:pPr>
+        <w:rPr>
+          <w:rFonts w:ascii="Arial" w:hAnsi="Arial" w:cs="Arial" w:eastAsiaTheme="minorHAnsi"/>
+          <w:sz w:val="20"/>
+          <w:szCs w:val="20"/>
+          <w:lang w:val="es-MX"/>
+        </w:rPr>
+      </w:pPr>
+      <w:r>
+        <w:rPr>
+          <w:rFonts w:ascii="Arial" w:hAnsi="Arial" w:cs="Arial" w:eastAsiaTheme="minorHAnsi"/>
+          <w:sz w:val="20"/>
+          <w:szCs w:val="20"/>
+          <w:lang w:val="es-MX"/>
+        </w:rPr>
+        <w:t>Como: Administrador</w:t>
+      </w:r>
+    </w:p>
+    <w:p>
+      <w:pPr>
+        <w:rPr>
+          <w:rFonts w:ascii="Arial" w:hAnsi="Arial" w:cs="Arial" w:eastAsiaTheme="minorHAnsi"/>
+          <w:sz w:val="20"/>
+          <w:szCs w:val="20"/>
+          <w:lang w:val="es-MX"/>
+        </w:rPr>
+      </w:pPr>
+      <w:r>
+        <w:rPr>
+          <w:rFonts w:ascii="Arial" w:hAnsi="Arial" w:cs="Arial" w:eastAsiaTheme="minorHAnsi"/>
+          <w:sz w:val="20"/>
+          <w:szCs w:val="20"/>
+          <w:lang w:val="es-MX"/>
+        </w:rPr>
+        <w:t>Quiero: Poder editar los estados y descripciones de las propiedades que se encuentren en remodelaciones o con atracciones nuevas</w:t>
+      </w:r>
+    </w:p>
+    <w:p>
+      <w:pPr>
+        <w:rPr>
+          <w:rFonts w:ascii="Arial" w:hAnsi="Arial" w:cs="Arial" w:eastAsiaTheme="minorHAnsi"/>
+          <w:sz w:val="20"/>
+          <w:szCs w:val="20"/>
+          <w:lang w:val="es-MX"/>
+        </w:rPr>
+      </w:pPr>
+      <w:r>
+        <w:rPr>
+          <w:rFonts w:ascii="Arial" w:hAnsi="Arial" w:cs="Arial" w:eastAsiaTheme="minorHAnsi"/>
+          <w:sz w:val="20"/>
+          <w:szCs w:val="20"/>
+          <w:lang w:val="es-MX"/>
+        </w:rPr>
+        <w:t>Para: Que los nuevos usuarios sepan de las nuevas características que poseen las propiedades</w:t>
+      </w:r>
+    </w:p>
+    <w:p>
+      <w:pPr>
+        <w:spacing w:before="100" w:beforeAutospacing="1" w:after="100" w:afterAutospacing="1" w:line="240" w:lineRule="auto"/>
+        <w:rPr>
+          <w:rFonts w:ascii="Arial" w:hAnsi="Arial" w:eastAsia="Times New Roman" w:cs="Arial"/>
+          <w:sz w:val="24"/>
+          <w:szCs w:val="24"/>
+          <w:lang w:eastAsia="es-GT"/>
+        </w:rPr>
+      </w:pPr>
+    </w:p>
+    <w:p>
+      <w:pPr>
+        <w:rPr>
+          <w:rFonts w:ascii="Arial" w:hAnsi="Arial" w:cs="Arial" w:eastAsiaTheme="minorHAnsi"/>
+          <w:b/>
+          <w:bCs/>
+          <w:lang w:val="es-MX"/>
+        </w:rPr>
+      </w:pPr>
+      <w:r>
+        <w:rPr>
+          <w:rFonts w:ascii="Arial" w:hAnsi="Arial" w:cs="Arial" w:eastAsiaTheme="minorHAnsi"/>
+          <w:b/>
+          <w:bCs/>
+          <w:lang w:val="es-MX"/>
+        </w:rPr>
+        <w:t>Tupla: Locación</w:t>
+      </w:r>
+    </w:p>
+    <w:p>
+      <w:pPr>
+        <w:rPr>
+          <w:rFonts w:ascii="Arial" w:hAnsi="Arial" w:cs="Arial" w:eastAsiaTheme="minorHAnsi"/>
+          <w:b/>
+          <w:bCs/>
+          <w:lang w:val="es-MX"/>
+        </w:rPr>
+      </w:pPr>
+      <w:r>
+        <w:rPr>
+          <w:rFonts w:ascii="Arial" w:hAnsi="Arial" w:cs="Arial" w:eastAsiaTheme="minorHAnsi"/>
+          <w:b/>
+          <w:bCs/>
+          <w:lang w:val="es-MX"/>
+        </w:rPr>
+        <w:t>HUAP-022 - Actualizar información de la locación</w:t>
+      </w:r>
+    </w:p>
+    <w:p>
+      <w:pPr>
+        <w:spacing w:before="100" w:beforeAutospacing="1" w:after="100" w:afterAutospacing="1" w:line="240" w:lineRule="auto"/>
+        <w:rPr>
+          <w:rFonts w:ascii="Arial" w:hAnsi="Arial" w:cs="Arial" w:eastAsiaTheme="minorHAnsi"/>
+          <w:sz w:val="20"/>
+          <w:szCs w:val="20"/>
+          <w:lang w:val="es-MX"/>
+        </w:rPr>
+      </w:pPr>
+      <w:r>
+        <w:rPr>
+          <w:rFonts w:ascii="Arial" w:hAnsi="Arial" w:cs="Arial" w:eastAsiaTheme="minorHAnsi"/>
+          <w:sz w:val="20"/>
+          <w:szCs w:val="20"/>
+          <w:lang w:val="es-MX"/>
+        </w:rPr>
+        <w:t>Cómo: Locación</w:t>
+      </w:r>
+    </w:p>
+    <w:p>
+      <w:pPr>
+        <w:spacing w:before="100" w:beforeAutospacing="1" w:after="100" w:afterAutospacing="1" w:line="240" w:lineRule="auto"/>
+        <w:rPr>
+          <w:rFonts w:ascii="Arial" w:hAnsi="Arial" w:cs="Arial" w:eastAsiaTheme="minorHAnsi"/>
+          <w:sz w:val="20"/>
+          <w:szCs w:val="20"/>
+          <w:lang w:val="es-MX"/>
+        </w:rPr>
+      </w:pPr>
+      <w:r>
+        <w:rPr>
+          <w:rFonts w:ascii="Arial" w:hAnsi="Arial" w:cs="Arial" w:eastAsiaTheme="minorHAnsi"/>
+          <w:sz w:val="20"/>
+          <w:szCs w:val="20"/>
+          <w:lang w:val="es-MX"/>
+        </w:rPr>
+        <w:t>Quiero: Editar mis datos como dirección, descripción, y contacto</w:t>
+      </w:r>
+    </w:p>
+    <w:p>
+      <w:pPr>
+        <w:spacing w:before="100" w:beforeAutospacing="1" w:after="100" w:afterAutospacing="1" w:line="240" w:lineRule="auto"/>
+        <w:rPr>
+          <w:rFonts w:ascii="Arial" w:hAnsi="Arial" w:cs="Arial" w:eastAsiaTheme="minorHAnsi"/>
+          <w:sz w:val="20"/>
+          <w:szCs w:val="20"/>
+          <w:lang w:val="es-MX"/>
+        </w:rPr>
+      </w:pPr>
+      <w:r>
+        <w:rPr>
+          <w:rFonts w:ascii="Arial" w:hAnsi="Arial" w:cs="Arial" w:eastAsiaTheme="minorHAnsi"/>
+          <w:sz w:val="20"/>
+          <w:szCs w:val="20"/>
+          <w:lang w:val="es-MX"/>
+        </w:rPr>
+        <w:t>Para: Mantener mi información actualizada y brindar datos correctos a los huéspedes</w:t>
+      </w:r>
+    </w:p>
+    <w:p>
+      <w:pPr>
+        <w:spacing w:before="100" w:beforeAutospacing="1" w:after="100" w:afterAutospacing="1" w:line="240" w:lineRule="auto"/>
+        <w:rPr>
+          <w:rFonts w:ascii="Arial" w:hAnsi="Arial" w:cs="Arial" w:eastAsiaTheme="minorHAnsi"/>
+          <w:sz w:val="20"/>
+          <w:szCs w:val="20"/>
+          <w:lang w:val="es-MX"/>
+        </w:rPr>
+      </w:pPr>
+    </w:p>
+    <w:p>
+      <w:pPr>
+        <w:rPr>
+          <w:rFonts w:ascii="Arial" w:hAnsi="Arial" w:cs="Arial" w:eastAsiaTheme="minorHAnsi"/>
+          <w:b/>
+          <w:bCs/>
+          <w:lang w:val="es-MX"/>
+        </w:rPr>
+      </w:pPr>
+      <w:r>
+        <w:rPr>
+          <w:rFonts w:ascii="Arial" w:hAnsi="Arial" w:cs="Arial" w:eastAsiaTheme="minorHAnsi"/>
+          <w:b/>
+          <w:bCs/>
+          <w:lang w:val="es-MX"/>
+        </w:rPr>
+        <w:t>HUAP-023 - Ver historial de reservas</w:t>
+      </w:r>
+    </w:p>
+    <w:p>
+      <w:pPr>
+        <w:spacing w:before="100" w:beforeAutospacing="1" w:after="100" w:afterAutospacing="1" w:line="240" w:lineRule="auto"/>
+        <w:rPr>
+          <w:rFonts w:ascii="Arial" w:hAnsi="Arial" w:cs="Arial" w:eastAsiaTheme="minorHAnsi"/>
+          <w:sz w:val="20"/>
+          <w:szCs w:val="20"/>
+          <w:lang w:val="es-MX"/>
+        </w:rPr>
+      </w:pPr>
+      <w:r>
+        <w:rPr>
+          <w:rFonts w:ascii="Arial" w:hAnsi="Arial" w:cs="Arial" w:eastAsiaTheme="minorHAnsi"/>
+          <w:sz w:val="20"/>
+          <w:szCs w:val="20"/>
+          <w:lang w:val="es-MX"/>
+        </w:rPr>
+        <w:t>Cómo: Locación</w:t>
+      </w:r>
+    </w:p>
+    <w:p>
+      <w:pPr>
+        <w:spacing w:before="100" w:beforeAutospacing="1" w:after="100" w:afterAutospacing="1" w:line="240" w:lineRule="auto"/>
+        <w:rPr>
+          <w:rFonts w:ascii="Arial" w:hAnsi="Arial" w:cs="Arial" w:eastAsiaTheme="minorHAnsi"/>
+          <w:sz w:val="20"/>
+          <w:szCs w:val="20"/>
+          <w:lang w:val="es-MX"/>
+        </w:rPr>
+      </w:pPr>
+      <w:r>
+        <w:rPr>
+          <w:rFonts w:ascii="Arial" w:hAnsi="Arial" w:cs="Arial" w:eastAsiaTheme="minorHAnsi"/>
+          <w:sz w:val="20"/>
+          <w:szCs w:val="20"/>
+          <w:lang w:val="es-MX"/>
+        </w:rPr>
+        <w:t>Quiero: Consultar las reservas que se han realizado en mi espacio</w:t>
+      </w:r>
+    </w:p>
+    <w:p>
+      <w:pPr>
+        <w:spacing w:before="100" w:beforeAutospacing="1" w:after="100" w:afterAutospacing="1" w:line="240" w:lineRule="auto"/>
+        <w:rPr>
+          <w:rFonts w:ascii="Arial" w:hAnsi="Arial" w:cs="Arial" w:eastAsiaTheme="minorHAnsi"/>
+          <w:sz w:val="20"/>
+          <w:szCs w:val="20"/>
+          <w:lang w:val="es-MX"/>
+        </w:rPr>
+      </w:pPr>
+      <w:r>
+        <w:rPr>
+          <w:rFonts w:ascii="Arial" w:hAnsi="Arial" w:cs="Arial" w:eastAsiaTheme="minorHAnsi"/>
+          <w:sz w:val="20"/>
+          <w:szCs w:val="20"/>
+          <w:lang w:val="es-MX"/>
+        </w:rPr>
+        <w:t>Para: Llevar un control de los huéspedes que me han visitado</w:t>
+      </w:r>
+    </w:p>
+    <w:p>
+      <w:pPr>
+        <w:spacing w:before="100" w:beforeAutospacing="1" w:after="100" w:afterAutospacing="1" w:line="240" w:lineRule="auto"/>
+        <w:rPr>
+          <w:rFonts w:ascii="Arial" w:hAnsi="Arial" w:cs="Arial" w:eastAsiaTheme="minorHAnsi"/>
+          <w:sz w:val="20"/>
+          <w:szCs w:val="20"/>
+          <w:lang w:val="es-MX"/>
+        </w:rPr>
+      </w:pPr>
+    </w:p>
+    <w:p>
+      <w:pPr>
+        <w:spacing w:before="100" w:beforeAutospacing="1" w:after="100" w:afterAutospacing="1" w:line="240" w:lineRule="auto"/>
+        <w:rPr>
+          <w:rFonts w:ascii="Arial" w:hAnsi="Arial" w:cs="Arial" w:eastAsiaTheme="minorHAnsi"/>
+          <w:sz w:val="20"/>
+          <w:szCs w:val="20"/>
+          <w:lang w:val="es-MX"/>
+        </w:rPr>
+      </w:pPr>
+      <w:r>
+        <w:rPr>
+          <w:rFonts w:ascii="Arial" w:hAnsi="Arial" w:cs="Arial" w:eastAsiaTheme="minorHAnsi"/>
+          <w:b/>
+          <w:bCs/>
+          <w:lang w:val="es-MX"/>
+        </w:rPr>
+        <w:t>HUJM-024 - Establecer horario de check-in y del check-out</w:t>
+      </w:r>
+    </w:p>
+    <w:p>
+      <w:pPr>
+        <w:spacing w:before="100" w:beforeAutospacing="1" w:after="100" w:afterAutospacing="1" w:line="240" w:lineRule="auto"/>
+        <w:rPr>
+          <w:rFonts w:ascii="Arial" w:hAnsi="Arial" w:cs="Arial" w:eastAsiaTheme="minorHAnsi"/>
+          <w:sz w:val="20"/>
+          <w:szCs w:val="20"/>
+          <w:lang w:val="es-MX"/>
+        </w:rPr>
+      </w:pPr>
+      <w:r>
+        <w:rPr>
+          <w:rFonts w:ascii="Arial" w:hAnsi="Arial" w:cs="Arial" w:eastAsiaTheme="minorHAnsi"/>
+          <w:sz w:val="20"/>
+          <w:szCs w:val="20"/>
+          <w:lang w:val="es-MX"/>
+        </w:rPr>
+        <w:t>Cómo: Locación</w:t>
+      </w:r>
+    </w:p>
+    <w:p>
+      <w:pPr>
+        <w:spacing w:before="100" w:beforeAutospacing="1" w:after="100" w:afterAutospacing="1" w:line="240" w:lineRule="auto"/>
+        <w:rPr>
+          <w:rFonts w:ascii="Arial" w:hAnsi="Arial" w:cs="Arial" w:eastAsiaTheme="minorHAnsi"/>
+          <w:sz w:val="20"/>
+          <w:szCs w:val="20"/>
+          <w:lang w:val="es-MX"/>
+        </w:rPr>
+      </w:pPr>
+      <w:r>
+        <w:rPr>
+          <w:rFonts w:ascii="Arial" w:hAnsi="Arial" w:cs="Arial" w:eastAsiaTheme="minorHAnsi"/>
+          <w:sz w:val="20"/>
+          <w:szCs w:val="20"/>
+          <w:lang w:val="es-MX"/>
+        </w:rPr>
+        <w:t>Quiero: Definir un horario disponible para la llegada y salida de los huéspedes</w:t>
+      </w:r>
+    </w:p>
+    <w:p>
+      <w:pPr>
+        <w:spacing w:before="100" w:beforeAutospacing="1" w:after="100" w:afterAutospacing="1" w:line="240" w:lineRule="auto"/>
+        <w:rPr>
+          <w:rFonts w:ascii="Arial" w:hAnsi="Arial" w:cs="Arial" w:eastAsiaTheme="minorHAnsi"/>
+          <w:sz w:val="20"/>
+          <w:szCs w:val="20"/>
+          <w:lang w:val="es-MX"/>
+        </w:rPr>
+      </w:pPr>
+      <w:r>
+        <w:rPr>
+          <w:rFonts w:ascii="Arial" w:hAnsi="Arial" w:cs="Arial" w:eastAsiaTheme="minorHAnsi"/>
+          <w:sz w:val="20"/>
+          <w:szCs w:val="20"/>
+          <w:lang w:val="es-MX"/>
+        </w:rPr>
+        <w:t>Para: Asegurar que las estancias se organicen de forma eficiente y sin conflictos</w:t>
+      </w:r>
+    </w:p>
+    <w:p>
+      <w:pPr>
+        <w:spacing w:before="100" w:beforeAutospacing="1" w:after="100" w:afterAutospacing="1" w:line="240" w:lineRule="auto"/>
+        <w:rPr>
+          <w:rFonts w:ascii="Arial" w:hAnsi="Arial" w:cs="Arial" w:eastAsiaTheme="minorHAnsi"/>
+          <w:b/>
+          <w:bCs/>
+          <w:sz w:val="20"/>
+          <w:szCs w:val="20"/>
+          <w:lang w:val="es-MX"/>
+        </w:rPr>
+      </w:pPr>
+      <w:r>
+        <w:rPr>
+          <w:rFonts w:ascii="Arial" w:hAnsi="Arial" w:cs="Arial" w:eastAsiaTheme="minorHAnsi"/>
+          <w:b/>
+          <w:bCs/>
+          <w:sz w:val="20"/>
+          <w:szCs w:val="20"/>
+          <w:lang w:val="es-MX"/>
+        </w:rPr>
+        <w:t>Tupla: Soporte Técnico</w:t>
+      </w:r>
+    </w:p>
+    <w:p>
+      <w:pPr>
+        <w:pStyle w:val="16"/>
+        <w:textAlignment w:val="baseline"/>
+        <w:rPr>
+          <w:rFonts w:ascii="Segoe UI" w:hAnsi="Segoe UI" w:cs="Segoe UI"/>
+          <w:b/>
+          <w:sz w:val="18"/>
+          <w:szCs w:val="18"/>
+        </w:rPr>
+      </w:pPr>
+      <w:r>
+        <w:rPr>
+          <w:rFonts w:ascii="Segoe UI" w:hAnsi="Segoe UI" w:cs="Segoe UI"/>
+          <w:b/>
+          <w:sz w:val="18"/>
+          <w:szCs w:val="18"/>
+        </w:rPr>
+        <w:t xml:space="preserve">HUAG-025: </w:t>
+      </w:r>
+    </w:p>
+    <w:p>
+      <w:pPr>
+        <w:pStyle w:val="16"/>
+        <w:textAlignment w:val="baseline"/>
+        <w:rPr>
+          <w:rFonts w:ascii="Segoe UI" w:hAnsi="Segoe UI" w:cs="Segoe UI"/>
+          <w:sz w:val="18"/>
+          <w:szCs w:val="18"/>
+        </w:rPr>
+      </w:pPr>
+      <w:r>
+        <w:rPr>
+          <w:rFonts w:ascii="Segoe UI" w:hAnsi="Segoe UI" w:cs="Segoe UI"/>
+          <w:sz w:val="18"/>
+          <w:szCs w:val="18"/>
+        </w:rPr>
+        <w:t>Como huésped o anfitrión de Airbnb,</w:t>
+      </w:r>
+    </w:p>
+    <w:p>
+      <w:pPr>
+        <w:pStyle w:val="16"/>
+        <w:textAlignment w:val="baseline"/>
+        <w:rPr>
+          <w:rFonts w:ascii="Segoe UI" w:hAnsi="Segoe UI" w:cs="Segoe UI"/>
+          <w:sz w:val="18"/>
+          <w:szCs w:val="18"/>
+        </w:rPr>
+      </w:pPr>
+      <w:r>
+        <w:rPr>
+          <w:rFonts w:ascii="Segoe UI" w:hAnsi="Segoe UI" w:cs="Segoe UI"/>
+          <w:sz w:val="18"/>
+          <w:szCs w:val="18"/>
+        </w:rPr>
+        <w:t>quiero poder contactar al soporte técnico rápidamente a través de un chat en la plataforma,</w:t>
+      </w:r>
+    </w:p>
+    <w:p>
+      <w:pPr>
+        <w:pStyle w:val="16"/>
+        <w:spacing w:before="0" w:beforeAutospacing="0" w:after="0" w:afterAutospacing="0"/>
+        <w:textAlignment w:val="baseline"/>
+        <w:rPr>
+          <w:rFonts w:ascii="Segoe UI" w:hAnsi="Segoe UI" w:cs="Segoe UI"/>
+          <w:sz w:val="18"/>
+          <w:szCs w:val="18"/>
+        </w:rPr>
+      </w:pPr>
+      <w:r>
+        <w:rPr>
+          <w:rFonts w:ascii="Segoe UI" w:hAnsi="Segoe UI" w:cs="Segoe UI"/>
+          <w:sz w:val="18"/>
+          <w:szCs w:val="18"/>
+        </w:rPr>
+        <w:t>para poder resolver problemas técnicos como errores de reserva, pagos fallidos o problemas con mi cuenta de forma eficiente.</w:t>
+      </w:r>
+    </w:p>
+    <w:p>
+      <w:pPr>
+        <w:pStyle w:val="16"/>
+        <w:spacing w:before="0" w:beforeAutospacing="0" w:after="0" w:afterAutospacing="0"/>
+        <w:textAlignment w:val="baseline"/>
+        <w:rPr>
+          <w:rFonts w:ascii="Segoe UI" w:hAnsi="Segoe UI" w:cs="Segoe UI"/>
+          <w:sz w:val="18"/>
+          <w:szCs w:val="18"/>
+        </w:rPr>
+      </w:pPr>
+    </w:p>
+    <w:p>
+      <w:pPr>
+        <w:pStyle w:val="16"/>
+        <w:textAlignment w:val="baseline"/>
+        <w:rPr>
+          <w:rFonts w:ascii="Segoe UI" w:hAnsi="Segoe UI" w:cs="Segoe UI"/>
+          <w:b/>
+          <w:sz w:val="18"/>
+          <w:szCs w:val="18"/>
+        </w:rPr>
+      </w:pPr>
+      <w:r>
+        <w:rPr>
+          <w:rFonts w:ascii="Segoe UI" w:hAnsi="Segoe UI" w:cs="Segoe UI"/>
+          <w:b/>
+          <w:sz w:val="18"/>
+          <w:szCs w:val="18"/>
+        </w:rPr>
+        <w:t>HUAG-026:</w:t>
+      </w:r>
+    </w:p>
+    <w:p>
+      <w:pPr>
+        <w:pStyle w:val="16"/>
+        <w:textAlignment w:val="baseline"/>
+        <w:rPr>
+          <w:rFonts w:ascii="Segoe UI" w:hAnsi="Segoe UI" w:cs="Segoe UI"/>
+          <w:sz w:val="18"/>
+          <w:szCs w:val="18"/>
+        </w:rPr>
+      </w:pPr>
+      <w:r>
+        <w:rPr>
+          <w:rFonts w:ascii="Segoe UI" w:hAnsi="Segoe UI" w:cs="Segoe UI"/>
+          <w:sz w:val="18"/>
+          <w:szCs w:val="18"/>
+        </w:rPr>
+        <w:t>Como técnico de soporte,</w:t>
+      </w:r>
+    </w:p>
+    <w:p>
+      <w:pPr>
+        <w:pStyle w:val="16"/>
+        <w:textAlignment w:val="baseline"/>
+        <w:rPr>
+          <w:rFonts w:ascii="Segoe UI" w:hAnsi="Segoe UI" w:cs="Segoe UI"/>
+          <w:sz w:val="18"/>
+          <w:szCs w:val="18"/>
+        </w:rPr>
+      </w:pPr>
+      <w:r>
+        <w:rPr>
+          <w:rFonts w:ascii="Segoe UI" w:hAnsi="Segoe UI" w:cs="Segoe UI"/>
+          <w:sz w:val="18"/>
+          <w:szCs w:val="18"/>
+        </w:rPr>
+        <w:t>quiero ver una lista de tickets pendientes y asignarme uno,</w:t>
+      </w:r>
+    </w:p>
+    <w:p>
+      <w:pPr>
+        <w:pStyle w:val="16"/>
+        <w:spacing w:before="0" w:beforeAutospacing="0" w:after="0" w:afterAutospacing="0"/>
+        <w:textAlignment w:val="baseline"/>
+        <w:rPr>
+          <w:rFonts w:ascii="Segoe UI" w:hAnsi="Segoe UI" w:cs="Segoe UI"/>
+          <w:sz w:val="18"/>
+          <w:szCs w:val="18"/>
+        </w:rPr>
+      </w:pPr>
+      <w:r>
+        <w:rPr>
+          <w:rFonts w:ascii="Segoe UI" w:hAnsi="Segoe UI" w:cs="Segoe UI"/>
+          <w:sz w:val="18"/>
+          <w:szCs w:val="18"/>
+        </w:rPr>
+        <w:t>para poder empezar a resolverlo de forma organizada.</w:t>
+      </w:r>
+    </w:p>
+    <w:p>
+      <w:pPr>
+        <w:pStyle w:val="16"/>
+        <w:spacing w:before="0" w:beforeAutospacing="0" w:after="0" w:afterAutospacing="0"/>
+        <w:textAlignment w:val="baseline"/>
+        <w:rPr>
+          <w:rFonts w:ascii="Segoe UI" w:hAnsi="Segoe UI" w:cs="Segoe UI"/>
+          <w:sz w:val="18"/>
+          <w:szCs w:val="18"/>
+        </w:rPr>
+      </w:pPr>
+    </w:p>
+    <w:p>
+      <w:pPr>
+        <w:pStyle w:val="16"/>
+        <w:textAlignment w:val="baseline"/>
+        <w:rPr>
+          <w:rFonts w:ascii="Segoe UI" w:hAnsi="Segoe UI" w:cs="Segoe UI"/>
+          <w:b/>
+          <w:sz w:val="18"/>
+          <w:szCs w:val="18"/>
+        </w:rPr>
+      </w:pPr>
+      <w:r>
+        <w:rPr>
+          <w:rFonts w:ascii="Segoe UI" w:hAnsi="Segoe UI" w:cs="Segoe UI"/>
+          <w:b/>
+          <w:sz w:val="18"/>
+          <w:szCs w:val="18"/>
+        </w:rPr>
+        <w:t>HUAG-027:</w:t>
+      </w:r>
+    </w:p>
+    <w:p>
+      <w:pPr>
+        <w:pStyle w:val="16"/>
+        <w:textAlignment w:val="baseline"/>
+        <w:rPr>
+          <w:rFonts w:ascii="Segoe UI" w:hAnsi="Segoe UI" w:cs="Segoe UI"/>
+          <w:sz w:val="18"/>
+          <w:szCs w:val="18"/>
+        </w:rPr>
+      </w:pPr>
+      <w:r>
+        <w:rPr>
+          <w:rFonts w:ascii="Segoe UI" w:hAnsi="Segoe UI" w:cs="Segoe UI"/>
+          <w:sz w:val="18"/>
+          <w:szCs w:val="18"/>
+        </w:rPr>
+        <w:t>Como administrador de soporte,</w:t>
+      </w:r>
+    </w:p>
+    <w:p>
+      <w:pPr>
+        <w:pStyle w:val="16"/>
+        <w:textAlignment w:val="baseline"/>
+        <w:rPr>
+          <w:rFonts w:ascii="Segoe UI" w:hAnsi="Segoe UI" w:cs="Segoe UI"/>
+          <w:sz w:val="18"/>
+          <w:szCs w:val="18"/>
+        </w:rPr>
+      </w:pPr>
+      <w:r>
+        <w:rPr>
+          <w:rFonts w:ascii="Segoe UI" w:hAnsi="Segoe UI" w:cs="Segoe UI"/>
+          <w:sz w:val="18"/>
+          <w:szCs w:val="18"/>
+        </w:rPr>
+        <w:t>quiero poder hacer seguimiento al estado de cada ticket (pendiente, en proceso, resuelto),</w:t>
+      </w:r>
+    </w:p>
+    <w:p>
+      <w:pPr>
+        <w:pStyle w:val="16"/>
+        <w:spacing w:before="0" w:beforeAutospacing="0" w:after="0" w:afterAutospacing="0"/>
+        <w:textAlignment w:val="baseline"/>
+        <w:rPr>
+          <w:rFonts w:ascii="Segoe UI" w:hAnsi="Segoe UI" w:cs="Segoe UI"/>
+          <w:sz w:val="18"/>
+          <w:szCs w:val="18"/>
+        </w:rPr>
+      </w:pPr>
+      <w:r>
+        <w:rPr>
+          <w:rFonts w:ascii="Segoe UI" w:hAnsi="Segoe UI" w:cs="Segoe UI"/>
+          <w:sz w:val="18"/>
+          <w:szCs w:val="18"/>
+        </w:rPr>
+        <w:t>para asegurarme de que los problemas se están resolviendo eficientemente.</w:t>
+      </w:r>
+    </w:p>
+    <w:p>
+      <w:pPr>
+        <w:pStyle w:val="16"/>
+        <w:spacing w:before="0" w:beforeAutospacing="0" w:after="0" w:afterAutospacing="0"/>
+        <w:textAlignment w:val="baseline"/>
+        <w:rPr>
+          <w:rFonts w:ascii="Segoe UI" w:hAnsi="Segoe UI" w:cs="Segoe UI"/>
+          <w:sz w:val="18"/>
+          <w:szCs w:val="18"/>
+        </w:rPr>
+      </w:pPr>
+    </w:p>
+    <w:p>
+      <w:pPr>
+        <w:pStyle w:val="16"/>
+        <w:spacing w:before="0" w:beforeAutospacing="0" w:after="0" w:afterAutospacing="0"/>
+        <w:textAlignment w:val="baseline"/>
+        <w:rPr>
+          <w:rFonts w:ascii="Segoe UI" w:hAnsi="Segoe UI" w:cs="Segoe UI"/>
+          <w:b/>
+          <w:bCs/>
+          <w:sz w:val="20"/>
+          <w:szCs w:val="20"/>
+        </w:rPr>
+      </w:pPr>
+      <w:r>
+        <w:rPr>
+          <w:rFonts w:ascii="Segoe UI" w:hAnsi="Segoe UI" w:cs="Segoe UI"/>
+          <w:b/>
+          <w:bCs/>
+          <w:sz w:val="20"/>
+          <w:szCs w:val="20"/>
+        </w:rPr>
+        <w:t xml:space="preserve">Tupla: Empleados </w:t>
+      </w:r>
+    </w:p>
+    <w:p>
+      <w:pPr>
+        <w:pStyle w:val="16"/>
+        <w:spacing w:before="0" w:beforeAutospacing="0" w:after="0" w:afterAutospacing="0"/>
+        <w:textAlignment w:val="baseline"/>
+        <w:rPr>
+          <w:rFonts w:ascii="Segoe UI" w:hAnsi="Segoe UI" w:cs="Segoe UI"/>
+          <w:b/>
+          <w:bCs/>
+          <w:sz w:val="20"/>
+          <w:szCs w:val="20"/>
+        </w:rPr>
+      </w:pPr>
+    </w:p>
+    <w:p>
+      <w:pPr>
+        <w:pStyle w:val="16"/>
+        <w:spacing w:before="0" w:beforeAutospacing="0" w:after="0" w:afterAutospacing="0" w:line="480" w:lineRule="auto"/>
+        <w:textAlignment w:val="baseline"/>
+        <w:rPr>
+          <w:rFonts w:ascii="Segoe UI" w:hAnsi="Segoe UI" w:cs="Segoe UI"/>
+          <w:sz w:val="18"/>
+          <w:szCs w:val="18"/>
+        </w:rPr>
+      </w:pPr>
+      <w:r>
+        <w:rPr>
+          <w:rFonts w:ascii="Segoe UI" w:hAnsi="Segoe UI" w:cs="Segoe UI"/>
+          <w:b/>
+          <w:bCs/>
+          <w:sz w:val="18"/>
+          <w:szCs w:val="18"/>
+        </w:rPr>
+        <w:t>HUFP-028</w:t>
+      </w:r>
+      <w:r>
+        <w:rPr>
+          <w:rFonts w:ascii="Segoe UI" w:hAnsi="Segoe UI" w:cs="Segoe UI"/>
+          <w:sz w:val="18"/>
+          <w:szCs w:val="18"/>
+        </w:rPr>
+        <w:t xml:space="preserve"> </w:t>
+      </w:r>
+    </w:p>
+    <w:p>
+      <w:pPr>
+        <w:pStyle w:val="16"/>
+        <w:spacing w:before="0" w:beforeAutospacing="0" w:after="0" w:afterAutospacing="0" w:line="480" w:lineRule="auto"/>
+        <w:textAlignment w:val="baseline"/>
+        <w:rPr>
+          <w:rFonts w:ascii="Segoe UI" w:hAnsi="Segoe UI" w:cs="Segoe UI"/>
+          <w:sz w:val="18"/>
+          <w:szCs w:val="18"/>
+        </w:rPr>
+      </w:pPr>
+      <w:r>
+        <w:rPr>
+          <w:rFonts w:ascii="Segoe UI" w:hAnsi="Segoe UI" w:cs="Segoe UI"/>
+          <w:sz w:val="18"/>
+          <w:szCs w:val="18"/>
+        </w:rPr>
+        <w:t xml:space="preserve">Lista de los empleados </w:t>
+      </w:r>
+    </w:p>
+    <w:p>
+      <w:pPr>
+        <w:pStyle w:val="16"/>
+        <w:spacing w:before="0" w:beforeAutospacing="0" w:after="0" w:afterAutospacing="0" w:line="480" w:lineRule="auto"/>
+        <w:textAlignment w:val="baseline"/>
+        <w:rPr>
+          <w:rFonts w:ascii="Segoe UI" w:hAnsi="Segoe UI" w:cs="Segoe UI"/>
+          <w:sz w:val="18"/>
+          <w:szCs w:val="18"/>
+        </w:rPr>
+      </w:pPr>
+      <w:r>
+        <w:rPr>
+          <w:rFonts w:ascii="Segoe UI" w:hAnsi="Segoe UI" w:cs="Segoe UI"/>
+          <w:sz w:val="18"/>
+          <w:szCs w:val="18"/>
+        </w:rPr>
+        <w:t xml:space="preserve">Como: Administrador de recursos humanos </w:t>
+      </w:r>
+    </w:p>
+    <w:p>
+      <w:pPr>
+        <w:pStyle w:val="16"/>
+        <w:spacing w:before="0" w:beforeAutospacing="0" w:after="0" w:afterAutospacing="0" w:line="480" w:lineRule="auto"/>
+        <w:textAlignment w:val="baseline"/>
+        <w:rPr>
+          <w:rFonts w:ascii="Segoe UI" w:hAnsi="Segoe UI" w:cs="Segoe UI"/>
+          <w:sz w:val="18"/>
+          <w:szCs w:val="18"/>
+        </w:rPr>
+      </w:pPr>
+      <w:r>
+        <w:rPr>
+          <w:rFonts w:ascii="Segoe UI" w:hAnsi="Segoe UI" w:cs="Segoe UI"/>
+          <w:sz w:val="18"/>
+          <w:szCs w:val="18"/>
+        </w:rPr>
+        <w:t xml:space="preserve">Quiero: Poder ver una lista de empleados activos </w:t>
+      </w:r>
+    </w:p>
+    <w:p>
+      <w:pPr>
+        <w:pStyle w:val="16"/>
+        <w:spacing w:before="0" w:beforeAutospacing="0" w:after="0" w:afterAutospacing="0" w:line="480" w:lineRule="auto"/>
+        <w:textAlignment w:val="baseline"/>
+        <w:rPr>
+          <w:rFonts w:ascii="Segoe UI" w:hAnsi="Segoe UI" w:cs="Segoe UI"/>
+          <w:sz w:val="18"/>
+          <w:szCs w:val="18"/>
+        </w:rPr>
+      </w:pPr>
+      <w:r>
+        <w:rPr>
+          <w:rFonts w:ascii="Segoe UI" w:hAnsi="Segoe UI" w:cs="Segoe UI"/>
+          <w:sz w:val="18"/>
+          <w:szCs w:val="18"/>
+        </w:rPr>
+        <w:t>Para: Poder gestionar de manera eficiente los recursos y asegurarme de que solo los empleados vigentes están siendo considerados en los procesos internos.</w:t>
+      </w:r>
+    </w:p>
+    <w:p>
+      <w:pPr>
+        <w:pStyle w:val="16"/>
+        <w:spacing w:before="0" w:beforeAutospacing="0" w:after="0" w:afterAutospacing="0" w:line="480" w:lineRule="auto"/>
+        <w:textAlignment w:val="baseline"/>
+        <w:rPr>
+          <w:rFonts w:ascii="Segoe UI" w:hAnsi="Segoe UI" w:cs="Segoe UI"/>
+          <w:b/>
+          <w:bCs/>
+          <w:sz w:val="18"/>
+          <w:szCs w:val="18"/>
+        </w:rPr>
+      </w:pPr>
+      <w:r>
+        <w:rPr>
+          <w:rFonts w:ascii="Segoe UI" w:hAnsi="Segoe UI" w:cs="Segoe UI"/>
+          <w:b/>
+          <w:bCs/>
+          <w:sz w:val="18"/>
+          <w:szCs w:val="18"/>
+        </w:rPr>
+        <w:t xml:space="preserve">HUFP-029: Registro de nuevos empleados </w:t>
+      </w:r>
+    </w:p>
+    <w:p>
+      <w:pPr>
+        <w:pStyle w:val="16"/>
+        <w:spacing w:before="0" w:beforeAutospacing="0" w:after="0" w:afterAutospacing="0" w:line="480" w:lineRule="auto"/>
+        <w:textAlignment w:val="baseline"/>
+        <w:rPr>
+          <w:rFonts w:ascii="Segoe UI" w:hAnsi="Segoe UI" w:cs="Segoe UI"/>
+          <w:sz w:val="18"/>
+          <w:szCs w:val="18"/>
+        </w:rPr>
+      </w:pPr>
+      <w:r>
+        <w:rPr>
+          <w:rFonts w:ascii="Segoe UI" w:hAnsi="Segoe UI" w:cs="Segoe UI"/>
+          <w:sz w:val="18"/>
+          <w:szCs w:val="18"/>
+        </w:rPr>
+        <w:t xml:space="preserve">Como: Responsable de contratación </w:t>
+      </w:r>
+    </w:p>
+    <w:p>
+      <w:pPr>
+        <w:pStyle w:val="16"/>
+        <w:spacing w:before="0" w:beforeAutospacing="0" w:after="0" w:afterAutospacing="0" w:line="480" w:lineRule="auto"/>
+        <w:textAlignment w:val="baseline"/>
+        <w:rPr>
+          <w:rFonts w:ascii="Segoe UI" w:hAnsi="Segoe UI" w:cs="Segoe UI"/>
+          <w:sz w:val="18"/>
+          <w:szCs w:val="18"/>
+        </w:rPr>
+      </w:pPr>
+      <w:r>
+        <w:rPr>
+          <w:rFonts w:ascii="Segoe UI" w:hAnsi="Segoe UI" w:cs="Segoe UI"/>
+          <w:sz w:val="18"/>
+          <w:szCs w:val="18"/>
+        </w:rPr>
+        <w:t xml:space="preserve">Quiero: Poder agregar nuevos empleados con su información (nombre, apellido, correo, teléfono, cargo, fecha de contratación) </w:t>
+      </w:r>
+    </w:p>
+    <w:p>
+      <w:pPr>
+        <w:pStyle w:val="16"/>
+        <w:spacing w:before="0" w:beforeAutospacing="0" w:after="0" w:afterAutospacing="0" w:line="480" w:lineRule="auto"/>
+        <w:textAlignment w:val="baseline"/>
+        <w:rPr>
+          <w:rFonts w:ascii="Segoe UI" w:hAnsi="Segoe UI" w:cs="Segoe UI"/>
+          <w:sz w:val="18"/>
+          <w:szCs w:val="18"/>
+        </w:rPr>
+      </w:pPr>
+      <w:r>
+        <w:rPr>
+          <w:rFonts w:ascii="Segoe UI" w:hAnsi="Segoe UI" w:cs="Segoe UI"/>
+          <w:sz w:val="18"/>
+          <w:szCs w:val="18"/>
+        </w:rPr>
+        <w:t>Para: Mantener la base de datos actualizada y asegurarme de que se realice un registro adecuado y completo de todos los empleados nuevos.</w:t>
+      </w:r>
+    </w:p>
+    <w:p>
+      <w:pPr>
+        <w:pStyle w:val="16"/>
+        <w:spacing w:before="0" w:beforeAutospacing="0" w:after="0" w:afterAutospacing="0" w:line="480" w:lineRule="auto"/>
+        <w:textAlignment w:val="baseline"/>
+        <w:rPr>
+          <w:rFonts w:ascii="Segoe UI" w:hAnsi="Segoe UI" w:cs="Segoe UI"/>
+          <w:b/>
+          <w:bCs/>
+          <w:sz w:val="20"/>
+          <w:szCs w:val="20"/>
+        </w:rPr>
+      </w:pPr>
+      <w:r>
+        <w:rPr>
+          <w:rFonts w:ascii="Segoe UI" w:hAnsi="Segoe UI" w:cs="Segoe UI"/>
+          <w:b/>
+          <w:bCs/>
+          <w:sz w:val="20"/>
+          <w:szCs w:val="20"/>
+        </w:rPr>
+        <w:t xml:space="preserve">HUFP-030: Actualización de la información del empleado </w:t>
+      </w:r>
+    </w:p>
+    <w:p>
+      <w:pPr>
+        <w:pStyle w:val="16"/>
+        <w:spacing w:before="0" w:beforeAutospacing="0" w:after="0" w:afterAutospacing="0" w:line="480" w:lineRule="auto"/>
+        <w:textAlignment w:val="baseline"/>
+        <w:rPr>
+          <w:rFonts w:ascii="Segoe UI" w:hAnsi="Segoe UI" w:cs="Segoe UI"/>
+          <w:sz w:val="18"/>
+          <w:szCs w:val="18"/>
+        </w:rPr>
+      </w:pPr>
+      <w:r>
+        <w:rPr>
+          <w:rFonts w:ascii="Segoe UI" w:hAnsi="Segoe UI" w:cs="Segoe UI"/>
+          <w:sz w:val="18"/>
+          <w:szCs w:val="18"/>
+        </w:rPr>
+        <w:t xml:space="preserve">Como: Gerente de departamento </w:t>
+      </w:r>
+    </w:p>
+    <w:p>
+      <w:pPr>
+        <w:pStyle w:val="16"/>
+        <w:spacing w:before="0" w:beforeAutospacing="0" w:after="0" w:afterAutospacing="0" w:line="480" w:lineRule="auto"/>
+        <w:textAlignment w:val="baseline"/>
+        <w:rPr>
+          <w:rFonts w:ascii="Segoe UI" w:hAnsi="Segoe UI" w:cs="Segoe UI"/>
+          <w:sz w:val="18"/>
+          <w:szCs w:val="18"/>
+        </w:rPr>
+      </w:pPr>
+      <w:r>
+        <w:rPr>
+          <w:rFonts w:ascii="Segoe UI" w:hAnsi="Segoe UI" w:cs="Segoe UI"/>
+          <w:sz w:val="18"/>
+          <w:szCs w:val="18"/>
+        </w:rPr>
+        <w:t xml:space="preserve">Quiero: Poder actualizar la información de los empleados (cargo, teléfono, correo) </w:t>
+      </w:r>
+    </w:p>
+    <w:p>
+      <w:pPr>
+        <w:pStyle w:val="16"/>
+        <w:spacing w:before="0" w:beforeAutospacing="0" w:after="0" w:afterAutospacing="0" w:line="480" w:lineRule="auto"/>
+        <w:textAlignment w:val="baseline"/>
+        <w:rPr>
+          <w:rFonts w:ascii="Segoe UI" w:hAnsi="Segoe UI" w:cs="Segoe UI"/>
+          <w:sz w:val="18"/>
+          <w:szCs w:val="18"/>
+        </w:rPr>
+      </w:pPr>
+      <w:r>
+        <w:rPr>
+          <w:rFonts w:ascii="Segoe UI" w:hAnsi="Segoe UI" w:cs="Segoe UI"/>
+          <w:sz w:val="18"/>
+          <w:szCs w:val="18"/>
+        </w:rPr>
+        <w:t>Para: Asegurarme de que la base de datos siempre refleje la información más actual y optimizar la comunicación dentro del equipo.</w:t>
+      </w:r>
+    </w:p>
+    <w:p>
+      <w:pPr>
+        <w:pStyle w:val="16"/>
+        <w:spacing w:before="0" w:beforeAutospacing="0" w:after="0" w:afterAutospacing="0"/>
+        <w:textAlignment w:val="baseline"/>
+        <w:rPr>
+          <w:rFonts w:ascii="Segoe UI" w:hAnsi="Segoe UI" w:cs="Segoe UI"/>
+          <w:sz w:val="18"/>
+          <w:szCs w:val="18"/>
+        </w:rPr>
+      </w:pPr>
+    </w:p>
+    <w:p>
+      <w:pPr>
+        <w:spacing w:before="100" w:beforeAutospacing="1" w:after="100" w:afterAutospacing="1" w:line="240" w:lineRule="auto"/>
+        <w:rPr>
+          <w:rFonts w:ascii="Arial" w:hAnsi="Arial" w:cs="Arial" w:eastAsiaTheme="minorHAnsi"/>
+          <w:b/>
+          <w:sz w:val="20"/>
+          <w:szCs w:val="20"/>
+          <w:lang w:val="es-MX"/>
+        </w:rPr>
+      </w:pPr>
+      <w:r>
+        <w:rPr>
+          <w:rFonts w:ascii="Arial" w:hAnsi="Arial" w:cs="Arial" w:eastAsiaTheme="minorHAnsi"/>
+          <w:b/>
+          <w:sz w:val="20"/>
+          <w:szCs w:val="20"/>
+          <w:lang w:val="es-MX"/>
+        </w:rPr>
+        <w:t>Tupla : Reserva</w:t>
+      </w:r>
+    </w:p>
+    <w:p>
+      <w:pPr>
+        <w:spacing w:before="100" w:beforeAutospacing="1" w:after="100" w:afterAutospacing="1" w:line="240" w:lineRule="auto"/>
+        <w:rPr>
+          <w:rFonts w:ascii="Arial" w:hAnsi="Arial" w:cs="Arial" w:eastAsiaTheme="minorHAnsi"/>
+          <w:sz w:val="20"/>
+          <w:szCs w:val="20"/>
+          <w:lang w:val="es-MX"/>
+        </w:rPr>
+      </w:pPr>
+      <w:r>
+        <w:rPr>
+          <w:rFonts w:ascii="Arial" w:hAnsi="Arial" w:cs="Arial" w:eastAsiaTheme="minorHAnsi"/>
+          <w:sz w:val="20"/>
+          <w:szCs w:val="20"/>
+          <w:lang w:val="es-MX"/>
+        </w:rPr>
+        <w:t>HUCP-031 Realizar Nueva Reserva</w:t>
+      </w:r>
+    </w:p>
+    <w:p>
+      <w:pPr>
+        <w:spacing w:before="100" w:beforeAutospacing="1" w:after="100" w:afterAutospacing="1" w:line="240" w:lineRule="auto"/>
+        <w:rPr>
+          <w:rFonts w:ascii="Arial" w:hAnsi="Arial" w:cs="Arial" w:eastAsiaTheme="minorHAnsi"/>
+          <w:sz w:val="20"/>
+          <w:szCs w:val="20"/>
+          <w:lang w:val="es-MX"/>
+        </w:rPr>
+      </w:pPr>
+      <w:r>
+        <w:rPr>
+          <w:rFonts w:ascii="Arial" w:hAnsi="Arial" w:cs="Arial" w:eastAsiaTheme="minorHAnsi"/>
+          <w:sz w:val="20"/>
+          <w:szCs w:val="20"/>
+          <w:lang w:val="es-MX"/>
+        </w:rPr>
+        <w:t>Como: Un invitado</w:t>
+      </w:r>
+    </w:p>
+    <w:p>
+      <w:pPr>
+        <w:spacing w:before="100" w:beforeAutospacing="1" w:after="100" w:afterAutospacing="1" w:line="240" w:lineRule="auto"/>
+        <w:rPr>
+          <w:rFonts w:ascii="Arial" w:hAnsi="Arial" w:cs="Arial" w:eastAsiaTheme="minorHAnsi"/>
+          <w:sz w:val="20"/>
+          <w:szCs w:val="20"/>
+          <w:lang w:val="es-MX"/>
+        </w:rPr>
+      </w:pPr>
+      <w:r>
+        <w:rPr>
+          <w:rFonts w:ascii="Arial" w:hAnsi="Arial" w:cs="Arial" w:eastAsiaTheme="minorHAnsi"/>
+          <w:sz w:val="20"/>
+          <w:szCs w:val="20"/>
+          <w:lang w:val="es-MX"/>
+        </w:rPr>
+        <w:t>Quiero: Seleccionar una propiedad, elegir mis fechas de inicio y fin, y confirmar una reserva</w:t>
+      </w:r>
+    </w:p>
+    <w:p>
+      <w:pPr>
+        <w:spacing w:before="100" w:beforeAutospacing="1" w:after="100" w:afterAutospacing="1" w:line="240" w:lineRule="auto"/>
+        <w:rPr>
+          <w:rFonts w:ascii="Arial" w:hAnsi="Arial" w:cs="Arial" w:eastAsiaTheme="minorHAnsi"/>
+          <w:sz w:val="20"/>
+          <w:szCs w:val="20"/>
+          <w:lang w:val="es-MX"/>
+        </w:rPr>
+      </w:pPr>
+      <w:r>
+        <w:rPr>
+          <w:rFonts w:ascii="Arial" w:hAnsi="Arial" w:cs="Arial" w:eastAsiaTheme="minorHAnsi"/>
+          <w:sz w:val="20"/>
+          <w:szCs w:val="20"/>
+          <w:lang w:val="es-MX"/>
+        </w:rPr>
+        <w:t>Para: Asegurar mi estancia en la propiedad deseada.</w:t>
+      </w:r>
+    </w:p>
+    <w:p>
+      <w:pPr>
+        <w:spacing w:before="100" w:beforeAutospacing="1" w:after="100" w:afterAutospacing="1" w:line="240" w:lineRule="auto"/>
+        <w:rPr>
+          <w:rFonts w:ascii="Arial" w:hAnsi="Arial" w:cs="Arial" w:eastAsiaTheme="minorHAnsi"/>
+          <w:sz w:val="20"/>
+          <w:szCs w:val="20"/>
+          <w:lang w:val="es-MX"/>
+        </w:rPr>
+      </w:pPr>
+    </w:p>
+    <w:p>
+      <w:pPr>
+        <w:spacing w:before="100" w:beforeAutospacing="1" w:after="100" w:afterAutospacing="1" w:line="240" w:lineRule="auto"/>
+        <w:rPr>
+          <w:rFonts w:ascii="Arial" w:hAnsi="Arial" w:cs="Arial" w:eastAsiaTheme="minorHAnsi"/>
+          <w:b/>
+          <w:sz w:val="20"/>
+          <w:szCs w:val="20"/>
+          <w:lang w:val="es-MX"/>
+        </w:rPr>
+      </w:pPr>
+      <w:r>
+        <w:rPr>
+          <w:rFonts w:ascii="Arial" w:hAnsi="Arial" w:cs="Arial" w:eastAsiaTheme="minorHAnsi"/>
+          <w:b/>
+          <w:sz w:val="20"/>
+          <w:szCs w:val="20"/>
+          <w:lang w:val="es-MX"/>
+        </w:rPr>
+        <w:t>HUCP-032 Gestionar Mis Reservas</w:t>
+      </w:r>
+    </w:p>
+    <w:p>
+      <w:pPr>
+        <w:spacing w:before="100" w:beforeAutospacing="1" w:after="100" w:afterAutospacing="1" w:line="240" w:lineRule="auto"/>
+        <w:rPr>
+          <w:rFonts w:ascii="Arial" w:hAnsi="Arial" w:cs="Arial" w:eastAsiaTheme="minorHAnsi"/>
+          <w:sz w:val="20"/>
+          <w:szCs w:val="20"/>
+          <w:lang w:val="es-MX"/>
+        </w:rPr>
+      </w:pPr>
+      <w:r>
+        <w:rPr>
+          <w:rFonts w:ascii="Arial" w:hAnsi="Arial" w:cs="Arial" w:eastAsiaTheme="minorHAnsi"/>
+          <w:sz w:val="20"/>
+          <w:szCs w:val="20"/>
+          <w:lang w:val="es-MX"/>
+        </w:rPr>
+        <w:t>Como: Un invitado o un anfitrión</w:t>
+      </w:r>
+    </w:p>
+    <w:p>
+      <w:pPr>
+        <w:spacing w:before="100" w:beforeAutospacing="1" w:after="100" w:afterAutospacing="1" w:line="240" w:lineRule="auto"/>
+        <w:rPr>
+          <w:rFonts w:ascii="Arial" w:hAnsi="Arial" w:cs="Arial" w:eastAsiaTheme="minorHAnsi"/>
+          <w:sz w:val="20"/>
+          <w:szCs w:val="20"/>
+          <w:lang w:val="es-MX"/>
+        </w:rPr>
+      </w:pPr>
+      <w:r>
+        <w:rPr>
+          <w:rFonts w:ascii="Arial" w:hAnsi="Arial" w:cs="Arial" w:eastAsiaTheme="minorHAnsi"/>
+          <w:sz w:val="20"/>
+          <w:szCs w:val="20"/>
+          <w:lang w:val="es-MX"/>
+        </w:rPr>
+        <w:t>Quiero: Ver el estado de mis reservas (confirmado, cancelado, completado) y tener la opción de modificar o cancelar una reserva si es necesario</w:t>
+      </w:r>
+    </w:p>
+    <w:p>
+      <w:pPr>
+        <w:spacing w:before="100" w:beforeAutospacing="1" w:after="100" w:afterAutospacing="1" w:line="240" w:lineRule="auto"/>
+        <w:rPr>
+          <w:rFonts w:ascii="Arial" w:hAnsi="Arial" w:cs="Arial" w:eastAsiaTheme="minorHAnsi"/>
+          <w:sz w:val="20"/>
+          <w:szCs w:val="20"/>
+          <w:lang w:val="es-MX"/>
+        </w:rPr>
+      </w:pPr>
+      <w:r>
+        <w:rPr>
+          <w:rFonts w:ascii="Arial" w:hAnsi="Arial" w:cs="Arial" w:eastAsiaTheme="minorHAnsi"/>
+          <w:sz w:val="20"/>
+          <w:szCs w:val="20"/>
+          <w:lang w:val="es-MX"/>
+        </w:rPr>
+        <w:t>Para: Tener control y visibilidad sobre mis estancias o la ocupación de mi propiedad.</w:t>
+      </w:r>
+    </w:p>
+    <w:p>
+      <w:pPr>
+        <w:spacing w:before="100" w:beforeAutospacing="1" w:after="100" w:afterAutospacing="1" w:line="240" w:lineRule="auto"/>
+        <w:rPr>
+          <w:rFonts w:ascii="Arial" w:hAnsi="Arial" w:cs="Arial" w:eastAsiaTheme="minorHAnsi"/>
+          <w:sz w:val="20"/>
+          <w:szCs w:val="20"/>
+          <w:lang w:val="es-MX"/>
+        </w:rPr>
+      </w:pPr>
+    </w:p>
+    <w:p>
+      <w:pPr>
+        <w:spacing w:before="100" w:beforeAutospacing="1" w:after="100" w:afterAutospacing="1" w:line="240" w:lineRule="auto"/>
+        <w:rPr>
+          <w:rFonts w:ascii="Arial" w:hAnsi="Arial" w:cs="Arial" w:eastAsiaTheme="minorHAnsi"/>
+          <w:b/>
+          <w:sz w:val="20"/>
+          <w:szCs w:val="20"/>
+          <w:lang w:val="es-MX"/>
+        </w:rPr>
+      </w:pPr>
+      <w:r>
+        <w:rPr>
+          <w:rFonts w:ascii="Arial" w:hAnsi="Arial" w:cs="Arial" w:eastAsiaTheme="minorHAnsi"/>
+          <w:b/>
+          <w:sz w:val="20"/>
+          <w:szCs w:val="20"/>
+          <w:lang w:val="es-MX"/>
+        </w:rPr>
+        <w:t>HUCP-003 Consultar Disponibilidad y Precios de Propiedades</w:t>
+      </w:r>
+    </w:p>
+    <w:p>
+      <w:pPr>
+        <w:spacing w:before="100" w:beforeAutospacing="1" w:after="100" w:afterAutospacing="1" w:line="240" w:lineRule="auto"/>
+        <w:rPr>
+          <w:rFonts w:ascii="Arial" w:hAnsi="Arial" w:cs="Arial" w:eastAsiaTheme="minorHAnsi"/>
+          <w:sz w:val="20"/>
+          <w:szCs w:val="20"/>
+          <w:lang w:val="es-MX"/>
+        </w:rPr>
+      </w:pPr>
+      <w:r>
+        <w:rPr>
+          <w:rFonts w:ascii="Arial" w:hAnsi="Arial" w:cs="Arial" w:eastAsiaTheme="minorHAnsi"/>
+          <w:sz w:val="20"/>
+          <w:szCs w:val="20"/>
+          <w:lang w:val="es-MX"/>
+        </w:rPr>
+        <w:t>Como: Un invitado</w:t>
+      </w:r>
+    </w:p>
+    <w:p>
+      <w:pPr>
+        <w:spacing w:before="100" w:beforeAutospacing="1" w:after="100" w:afterAutospacing="1" w:line="240" w:lineRule="auto"/>
+        <w:rPr>
+          <w:rFonts w:ascii="Arial" w:hAnsi="Arial" w:cs="Arial" w:eastAsiaTheme="minorHAnsi"/>
+          <w:sz w:val="20"/>
+          <w:szCs w:val="20"/>
+          <w:lang w:val="es-MX"/>
+        </w:rPr>
+      </w:pPr>
+      <w:r>
+        <w:rPr>
+          <w:rFonts w:ascii="Arial" w:hAnsi="Arial" w:cs="Arial" w:eastAsiaTheme="minorHAnsi"/>
+          <w:sz w:val="20"/>
+          <w:szCs w:val="20"/>
+          <w:lang w:val="es-MX"/>
+        </w:rPr>
+        <w:t>Quiero: Buscar propiedades y ver su precio por día y disponibilidad en un rango de fechas</w:t>
+      </w:r>
+    </w:p>
+    <w:p>
+      <w:pPr>
+        <w:spacing w:before="100" w:beforeAutospacing="1" w:after="100" w:afterAutospacing="1" w:line="240" w:lineRule="auto"/>
+        <w:rPr>
+          <w:rFonts w:ascii="Arial" w:hAnsi="Arial" w:cs="Arial" w:eastAsiaTheme="minorHAnsi"/>
+          <w:sz w:val="20"/>
+          <w:szCs w:val="20"/>
+          <w:lang w:val="es-MX"/>
+        </w:rPr>
+      </w:pPr>
+      <w:r>
+        <w:rPr>
+          <w:rFonts w:ascii="Arial" w:hAnsi="Arial" w:cs="Arial" w:eastAsiaTheme="minorHAnsi"/>
+          <w:sz w:val="20"/>
+          <w:szCs w:val="20"/>
+          <w:lang w:val="es-MX"/>
+        </w:rPr>
+        <w:t>Para: Encontrar la propiedad que mejor se adapte a mis necesidades y presupuesto para mis fechas de viaje</w:t>
+      </w:r>
+    </w:p>
+    <w:p>
+      <w:pPr>
+        <w:spacing w:before="100" w:beforeAutospacing="1" w:after="100" w:afterAutospacing="1" w:line="240" w:lineRule="auto"/>
+        <w:rPr>
+          <w:rFonts w:ascii="Arial" w:hAnsi="Arial" w:eastAsia="Times New Roman" w:cs="Arial"/>
+          <w:sz w:val="24"/>
+          <w:szCs w:val="24"/>
+          <w:lang w:eastAsia="es-GT"/>
+        </w:rPr>
+      </w:pPr>
+    </w:p>
+    <w:p>
+      <w:pPr>
+        <w:spacing w:before="100" w:beforeAutospacing="1" w:after="100" w:afterAutospacing="1" w:line="240" w:lineRule="auto"/>
+        <w:rPr>
+          <w:rFonts w:ascii="Arial" w:hAnsi="Arial" w:eastAsia="Times New Roman" w:cs="Arial"/>
+          <w:sz w:val="24"/>
+          <w:szCs w:val="24"/>
+          <w:lang w:eastAsia="es-GT"/>
+        </w:rPr>
+      </w:pPr>
+    </w:p>
+    <w:p>
+      <w:pPr>
+        <w:spacing w:before="100" w:beforeAutospacing="1" w:after="100" w:afterAutospacing="1" w:line="240" w:lineRule="auto"/>
+        <w:rPr>
+          <w:rFonts w:ascii="Arial" w:hAnsi="Arial" w:eastAsia="Times New Roman" w:cs="Arial"/>
+          <w:sz w:val="24"/>
+          <w:szCs w:val="24"/>
+          <w:lang w:eastAsia="es-GT"/>
+        </w:rPr>
+      </w:pPr>
+    </w:p>
+    <w:p>
+      <w:pPr>
+        <w:spacing w:before="100" w:beforeAutospacing="1" w:after="100" w:afterAutospacing="1" w:line="240" w:lineRule="auto"/>
+        <w:rPr>
+          <w:rFonts w:ascii="Arial" w:hAnsi="Arial" w:eastAsia="Times New Roman" w:cs="Arial"/>
+          <w:sz w:val="24"/>
+          <w:szCs w:val="24"/>
+          <w:lang w:eastAsia="es-GT"/>
+        </w:rPr>
+      </w:pPr>
+    </w:p>
+    <w:p>
+      <w:pPr>
+        <w:spacing w:before="100" w:beforeAutospacing="1" w:after="100" w:afterAutospacing="1" w:line="240" w:lineRule="auto"/>
+        <w:rPr>
+          <w:rFonts w:ascii="Arial" w:hAnsi="Arial" w:eastAsia="Times New Roman" w:cs="Arial"/>
+          <w:sz w:val="24"/>
+          <w:szCs w:val="24"/>
+          <w:lang w:eastAsia="es-GT"/>
+        </w:rPr>
+      </w:pPr>
+    </w:p>
+    <w:p>
+      <w:pPr>
+        <w:spacing w:before="100" w:beforeAutospacing="1" w:after="100" w:afterAutospacing="1" w:line="240" w:lineRule="auto"/>
+        <w:rPr>
+          <w:rFonts w:ascii="Arial" w:hAnsi="Arial" w:eastAsia="Times New Roman" w:cs="Arial"/>
+          <w:sz w:val="24"/>
+          <w:szCs w:val="24"/>
+          <w:lang w:eastAsia="es-GT"/>
+        </w:rPr>
+      </w:pPr>
+    </w:p>
+    <w:p>
+      <w:pPr>
+        <w:spacing w:before="100" w:beforeAutospacing="1" w:after="100" w:afterAutospacing="1" w:line="240" w:lineRule="auto"/>
+        <w:rPr>
+          <w:rFonts w:ascii="Arial" w:hAnsi="Arial" w:eastAsia="Times New Roman" w:cs="Arial"/>
+          <w:sz w:val="24"/>
+          <w:szCs w:val="24"/>
+          <w:lang w:eastAsia="es-GT"/>
+        </w:rPr>
+      </w:pPr>
+    </w:p>
+    <w:p>
+      <w:pPr>
+        <w:spacing w:before="100" w:beforeAutospacing="1" w:after="100" w:afterAutospacing="1" w:line="240" w:lineRule="auto"/>
+        <w:rPr>
+          <w:rFonts w:ascii="Arial" w:hAnsi="Arial" w:eastAsia="Times New Roman" w:cs="Arial"/>
+          <w:sz w:val="24"/>
+          <w:szCs w:val="24"/>
+          <w:lang w:eastAsia="es-GT"/>
+        </w:rPr>
+      </w:pPr>
+    </w:p>
+    <w:p>
+      <w:pPr>
+        <w:spacing w:before="100" w:beforeAutospacing="1" w:after="100" w:afterAutospacing="1" w:line="240" w:lineRule="auto"/>
+        <w:rPr>
+          <w:rFonts w:ascii="Arial" w:hAnsi="Arial" w:eastAsia="Times New Roman" w:cs="Arial"/>
+          <w:sz w:val="24"/>
+          <w:szCs w:val="24"/>
+          <w:lang w:eastAsia="es-GT"/>
+        </w:rPr>
+      </w:pPr>
+    </w:p>
+    <w:p>
+      <w:pPr>
+        <w:spacing w:before="100" w:beforeAutospacing="1" w:after="100" w:afterAutospacing="1" w:line="240" w:lineRule="auto"/>
+        <w:rPr>
+          <w:rFonts w:ascii="Arial" w:hAnsi="Arial" w:eastAsia="Times New Roman" w:cs="Arial"/>
+          <w:sz w:val="24"/>
+          <w:szCs w:val="24"/>
+          <w:lang w:eastAsia="es-GT"/>
+        </w:rPr>
+      </w:pPr>
+    </w:p>
+    <w:p>
+      <w:pPr>
+        <w:spacing w:before="100" w:beforeAutospacing="1" w:after="100" w:afterAutospacing="1" w:line="240" w:lineRule="auto"/>
+        <w:rPr>
+          <w:rFonts w:ascii="Arial" w:hAnsi="Arial" w:eastAsia="Times New Roman" w:cs="Arial"/>
+          <w:sz w:val="24"/>
+          <w:szCs w:val="24"/>
+          <w:lang w:eastAsia="es-GT"/>
+        </w:rPr>
+      </w:pPr>
+    </w:p>
+    <w:p>
+      <w:pPr>
+        <w:spacing w:before="100" w:beforeAutospacing="1" w:after="100" w:afterAutospacing="1" w:line="240" w:lineRule="auto"/>
+        <w:rPr>
+          <w:rFonts w:ascii="Arial" w:hAnsi="Arial" w:eastAsia="Times New Roman" w:cs="Arial"/>
+          <w:sz w:val="24"/>
+          <w:szCs w:val="24"/>
+          <w:lang w:eastAsia="es-GT"/>
+        </w:rPr>
+      </w:pPr>
+    </w:p>
+    <w:p>
+      <w:pPr>
+        <w:spacing w:before="100" w:beforeAutospacing="1" w:after="100" w:afterAutospacing="1" w:line="240" w:lineRule="auto"/>
+        <w:rPr>
+          <w:rFonts w:ascii="Arial" w:hAnsi="Arial" w:eastAsia="Times New Roman" w:cs="Arial"/>
+          <w:sz w:val="24"/>
+          <w:szCs w:val="24"/>
+          <w:lang w:eastAsia="es-GT"/>
+        </w:rPr>
+      </w:pPr>
+      <w:r>
+        <w:rPr>
+          <w:rFonts w:ascii="Arial" w:hAnsi="Arial" w:eastAsia="Times New Roman" w:cs="Arial"/>
+          <w:sz w:val="24"/>
+          <w:szCs w:val="24"/>
+          <w:lang w:eastAsia="es-GT"/>
+        </w:rPr>
+        <w:t>MODELO DE ENTIDADES</w:t>
+      </w:r>
+      <w:r>
+        <w:rPr>
+          <w:rFonts w:ascii="Arial" w:hAnsi="Arial" w:eastAsia="Times New Roman" w:cs="Arial"/>
+          <w:sz w:val="24"/>
+          <w:szCs w:val="24"/>
+          <w:lang w:eastAsia="es-GT"/>
+        </w:rPr>
+        <w:br w:type="textWrapping"/>
+      </w:r>
+      <w:r>
+        <w:rPr>
+          <w:rFonts w:ascii="Arial" w:hAnsi="Arial" w:eastAsia="Times New Roman" w:cs="Arial"/>
+          <w:sz w:val="24"/>
+          <w:szCs w:val="24"/>
+          <w:lang w:eastAsia="es-GT"/>
+        </w:rPr>
+        <w:br w:type="textWrapping"/>
+      </w:r>
+      <w:r>
+        <w:rPr>
+          <w:rFonts w:ascii="Arial" w:hAnsi="Arial" w:eastAsia="Times New Roman" w:cs="Arial"/>
+          <w:sz w:val="24"/>
+          <w:szCs w:val="24"/>
+          <w:lang w:eastAsia="es-GT"/>
+        </w:rPr>
+        <w:drawing>
+          <wp:inline distT="0" distB="0" distL="0" distR="0">
+            <wp:extent cx="5651500" cy="4848225"/>
+            <wp:effectExtent l="0" t="0" r="6350" b="0"/>
+            <wp:docPr id="1098701964" name="Imagen 2"/>
+            <wp:cNvGraphicFramePr>
+              <a:graphicFrameLocks xmlns:a="http://schemas.openxmlformats.org/drawingml/2006/main" noChangeAspect="1"/>
+            </wp:cNvGraphicFramePr>
+            <a:graphic xmlns:a="http://schemas.openxmlformats.org/drawingml/2006/main">
+              <a:graphicData uri="http://schemas.openxmlformats.org/drawingml/2006/picture">
+                <pic:pic xmlns:pic="http://schemas.openxmlformats.org/drawingml/2006/picture">
+                  <pic:nvPicPr>
+                    <pic:cNvPr id="1098701964" name="Imagen 2"/>
+                    <pic:cNvPicPr>
+                      <a:picLocks noChangeAspect="1" noChangeArrowheads="1"/>
+                    </pic:cNvPicPr>
+                  </pic:nvPicPr>
+                  <pic:blipFill>
+                    <a:blip r:embed="rId7">
+                      <a:extLst>
+                        <a:ext uri="{28A0092B-C50C-407E-A947-70E740481C1C}">
+                          <a14:useLocalDpi xmlns:a14="http://schemas.microsoft.com/office/drawing/2010/main" val="0"/>
+                        </a:ext>
+                      </a:extLst>
+                    </a:blip>
+                    <a:srcRect/>
+                    <a:stretch>
+                      <a:fillRect/>
+                    </a:stretch>
+                  </pic:blipFill>
+                  <pic:spPr>
+                    <a:xfrm>
+                      <a:off x="0" y="0"/>
+                      <a:ext cx="5661730" cy="4856506"/>
+                    </a:xfrm>
+                    <a:prstGeom prst="rect">
+                      <a:avLst/>
+                    </a:prstGeom>
+                    <a:noFill/>
+                  </pic:spPr>
+                </pic:pic>
+              </a:graphicData>
+            </a:graphic>
+          </wp:inline>
+        </w:drawing>
+      </w:r>
+    </w:p>
+    <w:p>
+      <w:pPr>
+        <w:spacing w:before="100" w:beforeAutospacing="1" w:after="100" w:afterAutospacing="1" w:line="240" w:lineRule="auto"/>
+        <w:rPr>
+          <w:rFonts w:ascii="Arial" w:hAnsi="Arial" w:eastAsia="Times New Roman" w:cs="Arial"/>
+          <w:sz w:val="24"/>
+          <w:szCs w:val="24"/>
+          <w:lang w:eastAsia="es-GT"/>
+        </w:rPr>
+      </w:pPr>
+    </w:p>
+    <w:p>
+      <w:pPr>
+        <w:spacing w:before="100" w:beforeAutospacing="1" w:after="100" w:afterAutospacing="1" w:line="240" w:lineRule="auto"/>
+        <w:rPr>
+          <w:rFonts w:ascii="Arial" w:hAnsi="Arial" w:eastAsia="Times New Roman" w:cs="Arial"/>
+          <w:sz w:val="24"/>
+          <w:szCs w:val="24"/>
+          <w:lang w:eastAsia="es-GT"/>
+        </w:rPr>
+      </w:pPr>
+    </w:p>
+    <w:p>
+      <w:pPr>
+        <w:spacing w:before="100" w:beforeAutospacing="1" w:after="100" w:afterAutospacing="1" w:line="240" w:lineRule="auto"/>
+        <w:rPr>
+          <w:rFonts w:ascii="Arial" w:hAnsi="Arial" w:eastAsia="Times New Roman" w:cs="Arial"/>
+          <w:sz w:val="24"/>
+          <w:szCs w:val="24"/>
+          <w:lang w:eastAsia="es-GT"/>
+        </w:rPr>
+      </w:pPr>
+    </w:p>
+    <w:p>
+      <w:pPr>
+        <w:spacing w:before="100" w:beforeAutospacing="1" w:after="100" w:afterAutospacing="1" w:line="240" w:lineRule="auto"/>
+        <w:rPr>
+          <w:rFonts w:ascii="Arial" w:hAnsi="Arial" w:eastAsia="Times New Roman" w:cs="Arial"/>
+          <w:sz w:val="24"/>
+          <w:szCs w:val="24"/>
+          <w:lang w:eastAsia="es-GT"/>
+        </w:rPr>
+      </w:pPr>
+    </w:p>
+    <w:p>
+      <w:pPr>
+        <w:spacing w:before="100" w:beforeAutospacing="1" w:after="100" w:afterAutospacing="1" w:line="240" w:lineRule="auto"/>
+        <w:rPr>
+          <w:rFonts w:ascii="Arial" w:hAnsi="Arial" w:eastAsia="Times New Roman" w:cs="Arial"/>
+          <w:sz w:val="24"/>
+          <w:szCs w:val="24"/>
+          <w:lang w:eastAsia="es-GT"/>
+        </w:rPr>
+      </w:pPr>
+    </w:p>
+    <w:p>
+      <w:pPr>
+        <w:spacing w:before="100" w:beforeAutospacing="1" w:after="100" w:afterAutospacing="1" w:line="240" w:lineRule="auto"/>
+        <w:rPr>
+          <w:rFonts w:ascii="Arial" w:hAnsi="Arial" w:eastAsia="Times New Roman" w:cs="Arial"/>
+          <w:sz w:val="24"/>
+          <w:szCs w:val="24"/>
+          <w:lang w:eastAsia="es-GT"/>
+        </w:rPr>
+      </w:pPr>
+    </w:p>
+    <w:p>
+      <w:pPr>
+        <w:spacing w:before="100" w:beforeAutospacing="1" w:after="100" w:afterAutospacing="1" w:line="240" w:lineRule="auto"/>
+        <w:rPr>
+          <w:rFonts w:ascii="Arial" w:hAnsi="Arial" w:eastAsia="Times New Roman" w:cs="Arial"/>
+          <w:sz w:val="24"/>
+          <w:szCs w:val="24"/>
+          <w:lang w:eastAsia="es-GT"/>
+        </w:rPr>
+      </w:pPr>
+    </w:p>
+    <w:p>
+      <w:pPr>
+        <w:spacing w:before="100" w:beforeAutospacing="1" w:after="100" w:afterAutospacing="1" w:line="240" w:lineRule="auto"/>
+        <w:rPr>
+          <w:rFonts w:ascii="Arial" w:hAnsi="Arial" w:eastAsia="Times New Roman" w:cs="Arial"/>
+          <w:sz w:val="24"/>
+          <w:szCs w:val="24"/>
+          <w:lang w:eastAsia="es-GT"/>
+        </w:rPr>
+      </w:pPr>
+    </w:p>
+    <w:p>
+      <w:pPr>
+        <w:spacing w:before="100" w:beforeAutospacing="1" w:after="100" w:afterAutospacing="1" w:line="240" w:lineRule="auto"/>
+        <w:rPr>
+          <w:rFonts w:ascii="Arial" w:hAnsi="Arial" w:eastAsia="Times New Roman" w:cs="Arial"/>
+          <w:sz w:val="24"/>
+          <w:szCs w:val="24"/>
+          <w:lang w:eastAsia="es-GT"/>
+        </w:rPr>
+      </w:pPr>
+    </w:p>
+    <w:p>
+      <w:pPr>
+        <w:spacing w:before="100" w:beforeAutospacing="1" w:after="100" w:afterAutospacing="1" w:line="240" w:lineRule="auto"/>
+        <w:rPr>
+          <w:rFonts w:hint="default" w:ascii="Arial" w:hAnsi="Arial" w:eastAsia="Times New Roman" w:cs="Arial"/>
+          <w:sz w:val="24"/>
+          <w:szCs w:val="24"/>
+          <w:lang w:val="en-US" w:eastAsia="es-GT"/>
+        </w:rPr>
+      </w:pPr>
+      <w:bookmarkStart w:id="0" w:name="_GoBack"/>
+      <w:bookmarkEnd w:id="0"/>
+    </w:p>
+    <w:p>
+      <w:pPr>
+        <w:pStyle w:val="9"/>
+        <w:keepNext w:val="0"/>
+        <w:keepLines w:val="0"/>
+        <w:widowControl/>
+        <w:suppressLineNumbers w:val="0"/>
+      </w:pPr>
+      <w:r>
+        <w:rPr>
+          <w:rFonts w:hint="default" w:ascii="Arial" w:hAnsi="Arial" w:cs="Arial"/>
+          <w:sz w:val="28"/>
+          <w:szCs w:val="28"/>
+          <w:lang w:val="en-US" w:eastAsia="es-GT"/>
+        </w:rPr>
+        <w:t>MODELO ENTIDAD RELACION</w:t>
+      </w:r>
+      <w:r>
+        <w:rPr>
+          <w:rFonts w:ascii="SimSun" w:hAnsi="SimSun" w:eastAsia="SimSun" w:cs="SimSun"/>
+          <w:sz w:val="24"/>
+          <w:szCs w:val="24"/>
+        </w:rPr>
+        <w:drawing>
+          <wp:inline distT="0" distB="0" distL="114300" distR="114300">
+            <wp:extent cx="304800" cy="304800"/>
+            <wp:effectExtent l="0" t="0" r="0" b="0"/>
+            <wp:docPr id="1" name="Imagen 1" descr="IMG_256"/>
+            <wp:cNvGraphicFramePr>
+              <a:graphicFrameLocks xmlns:a="http://schemas.openxmlformats.org/drawingml/2006/main" noChangeAspect="1"/>
+            </wp:cNvGraphicFramePr>
+            <a:graphic xmlns:a="http://schemas.openxmlformats.org/drawingml/2006/main">
+              <a:graphicData uri="http://schemas.openxmlformats.org/drawingml/2006/picture">
+                <pic:pic xmlns:pic="http://schemas.openxmlformats.org/drawingml/2006/picture">
+                  <pic:nvPicPr>
+                    <pic:cNvPr id="1" name="Imagen 1" descr="IMG_256"/>
+                    <pic:cNvPicPr>
+                      <a:picLocks noChangeAspect="1"/>
+                    </pic:cNvPicPr>
+                  </pic:nvPicPr>
+                  <pic:blipFill>
+                    <a:blip r:embed="rId8"/>
+                    <a:stretch>
+                      <a:fillRect/>
+                    </a:stretch>
+                  </pic:blipFill>
+                  <pic:spPr>
+                    <a:xfrm>
+                      <a:off x="0" y="0"/>
+                      <a:ext cx="304800" cy="304800"/>
+                    </a:xfrm>
+                    <a:prstGeom prst="rect">
+                      <a:avLst/>
+                    </a:prstGeom>
+                    <a:noFill/>
+                    <a:ln w="9525">
+                      <a:noFill/>
+                    </a:ln>
+                  </pic:spPr>
+                </pic:pic>
+              </a:graphicData>
+            </a:graphic>
+          </wp:inline>
+        </w:drawing>
+      </w:r>
+      <w:r>
+        <w:drawing>
+          <wp:inline distT="0" distB="0" distL="114300" distR="114300">
+            <wp:extent cx="7270750" cy="6459855"/>
+            <wp:effectExtent l="0" t="0" r="6350" b="17145"/>
+            <wp:docPr id="3" name="Imagen 2" descr="IMG_256"/>
+            <wp:cNvGraphicFramePr>
+              <a:graphicFrameLocks xmlns:a="http://schemas.openxmlformats.org/drawingml/2006/main" noChangeAspect="1"/>
+            </wp:cNvGraphicFramePr>
+            <a:graphic xmlns:a="http://schemas.openxmlformats.org/drawingml/2006/main">
+              <a:graphicData uri="http://schemas.openxmlformats.org/drawingml/2006/picture">
+                <pic:pic xmlns:pic="http://schemas.openxmlformats.org/drawingml/2006/picture">
+                  <pic:nvPicPr>
+                    <pic:cNvPr id="3" name="Imagen 2" descr="IMG_256"/>
+                    <pic:cNvPicPr>
+                      <a:picLocks noChangeAspect="1"/>
+                    </pic:cNvPicPr>
+                  </pic:nvPicPr>
+                  <pic:blipFill>
+                    <a:blip r:embed="rId9"/>
+                    <a:stretch>
+                      <a:fillRect/>
+                    </a:stretch>
+                  </pic:blipFill>
+                  <pic:spPr>
+                    <a:xfrm>
+                      <a:off x="0" y="0"/>
+                      <a:ext cx="7270750" cy="6459855"/>
+                    </a:xfrm>
+                    <a:prstGeom prst="rect">
+                      <a:avLst/>
+                    </a:prstGeom>
+                    <a:noFill/>
+                    <a:ln w="9525">
+                      <a:noFill/>
+                    </a:ln>
+                  </pic:spPr>
+                </pic:pic>
+              </a:graphicData>
+            </a:graphic>
+          </wp:inline>
+        </w:drawing>
+      </w:r>
+    </w:p>
+    <w:p>
+      <w:pPr>
+        <w:spacing w:before="100" w:beforeAutospacing="1" w:after="100" w:afterAutospacing="1" w:line="240" w:lineRule="auto"/>
+        <w:rPr>
+          <w:rFonts w:hint="default" w:ascii="Arial" w:hAnsi="Arial" w:eastAsia="Times New Roman" w:cs="Arial"/>
+          <w:sz w:val="24"/>
+          <w:szCs w:val="24"/>
+          <w:lang w:val="es-GT" w:eastAsia="es-GT"/>
         </w:rPr>
       </w:pPr>
     </w:p>
@@ -5002,7 +7216,7 @@
   <w:docDefaults>
     <w:rPrDefault>
       <w:rPr>
-        <w:rFonts w:asciiTheme="minorHAnsi" w:hAnsiTheme="minorHAnsi" w:eastAsiaTheme="minorHAnsi" w:cstheme="minorBidi"/>
+        <w:rFonts w:ascii="Times New Roman" w:hAnsi="Times New Roman" w:eastAsia="SimSun" w:cs="Times New Roman"/>
       </w:rPr>
     </w:rPrDefault>
     <w:pPrDefault/>
@@ -5047,7 +7261,7 @@
     <w:lsdException w:uiPriority="99" w:name="envelope address"/>
     <w:lsdException w:uiPriority="99" w:name="envelope return"/>
     <w:lsdException w:uiPriority="99" w:name="footnote reference"/>
-    <w:lsdException w:uiPriority="99" w:name="annotation reference"/>
+    <w:lsdException w:qFormat="1" w:uiPriority="99" w:name="annotation reference"/>
     <w:lsdException w:uiPriority="99" w:name="line number"/>
     <w:lsdException w:uiPriority="99" w:name="page number"/>
     <w:lsdException w:uiPriority="99" w:name="endnote reference"/>
@@ -5111,7 +7325,7 @@
     <w:lsdException w:uiPriority="99" w:name="HTML Sample"/>
     <w:lsdException w:uiPriority="99" w:name="HTML Typewriter"/>
     <w:lsdException w:uiPriority="99" w:name="HTML Variable"/>
-    <w:lsdException w:qFormat="1" w:uiPriority="99" w:name="Normal Table"/>
+    <w:lsdException w:uiPriority="99" w:name="Normal Table"/>
     <w:lsdException w:qFormat="1" w:uiPriority="99" w:name="annotation subject"/>
     <w:lsdException w:uiPriority="99" w:name="Table Simple 1"/>
     <w:lsdException w:uiPriority="99" w:name="Table Simple 2"/>
@@ -5184,7 +7398,6 @@
     <w:name w:val="Normal Table"/>
     <w:semiHidden/>
     <w:unhideWhenUsed/>
-    <w:qFormat/>
     <w:uiPriority w:val="99"/>
     <w:tblPr>
       <w:tblCellMar>
@@ -5200,6 +7413,7 @@
     <w:basedOn w:val="2"/>
     <w:semiHidden/>
     <w:unhideWhenUsed/>
+    <w:qFormat/>
     <w:uiPriority w:val="99"/>
     <w:rPr>
       <w:sz w:val="16"/>

</xml_diff>

<commit_message>
add: Se agrego diagrama entidad relacion al documento Peaceathome.docx en la rama rhernandez-2024310
</commit_message>
<xml_diff>
--- a/Peaceathome.docx
+++ b/Peaceathome.docx
@@ -2358,23 +2358,7 @@
           <w:sz w:val="22"/>
           <w:szCs w:val="22"/>
         </w:rPr>
-        <w:t>HUJC-0</w:t>
-      </w:r>
-      <w:r>
-        <w:rPr>
-          <w:rFonts w:ascii="Segoe UI" w:hAnsi="Segoe UI" w:cs="Segoe UI"/>
-          <w:sz w:val="22"/>
-          <w:szCs w:val="22"/>
-        </w:rPr>
-        <w:t>07</w:t>
-      </w:r>
-      <w:r>
-        <w:rPr>
-          <w:rFonts w:ascii="Segoe UI" w:hAnsi="Segoe UI" w:cs="Segoe UI"/>
-          <w:sz w:val="22"/>
-          <w:szCs w:val="22"/>
-        </w:rPr>
-        <w:t>: Registo de nueva reseña</w:t>
+        <w:t>HUJC-007: Registo de nueva reseña</w:t>
       </w:r>
     </w:p>
     <w:p>
@@ -2476,119 +2460,101 @@
           <w:sz w:val="22"/>
           <w:szCs w:val="22"/>
         </w:rPr>
-        <w:t>HUJC-0</w:t>
-      </w:r>
-      <w:r>
+        <w:t>HUJC-008</w:t>
+      </w:r>
+    </w:p>
+    <w:p>
+      <w:pPr>
+        <w:pStyle w:val="paragraph"/>
+        <w:spacing w:after="0"/>
+        <w:textAlignment w:val="baseline"/>
+        <w:rPr>
+          <w:rFonts w:ascii="Segoe UI" w:hAnsi="Segoe UI" w:cs="Segoe UI"/>
+          <w:sz w:val="22"/>
+          <w:szCs w:val="22"/>
+        </w:rPr>
+      </w:pPr>
+      <w:r>
+        <w:rPr>
+          <w:rFonts w:ascii="Segoe UI" w:hAnsi="Segoe UI" w:cs="Segoe UI"/>
+          <w:sz w:val="22"/>
+          <w:szCs w:val="22"/>
+        </w:rPr>
+        <w:t>Como: Empresario</w:t>
+      </w:r>
+    </w:p>
+    <w:p>
+      <w:pPr>
+        <w:pStyle w:val="paragraph"/>
+        <w:spacing w:after="0"/>
+        <w:textAlignment w:val="baseline"/>
+        <w:rPr>
+          <w:rFonts w:ascii="Segoe UI" w:hAnsi="Segoe UI" w:cs="Segoe UI"/>
+          <w:sz w:val="22"/>
+          <w:szCs w:val="22"/>
+        </w:rPr>
+      </w:pPr>
+      <w:r>
+        <w:rPr>
+          <w:rFonts w:ascii="Segoe UI" w:hAnsi="Segoe UI" w:cs="Segoe UI"/>
+          <w:sz w:val="22"/>
+          <w:szCs w:val="22"/>
+        </w:rPr>
+        <w:t>Quiero: Registrar una reseña sobre la propiedad que me fue otorgada en Peace At Home</w:t>
+      </w:r>
+    </w:p>
+    <w:p>
+      <w:pPr>
+        <w:pStyle w:val="paragraph"/>
+        <w:spacing w:before="0" w:beforeAutospacing="0" w:after="0" w:afterAutospacing="0"/>
+        <w:textAlignment w:val="baseline"/>
+        <w:rPr>
+          <w:rFonts w:ascii="Segoe UI" w:hAnsi="Segoe UI" w:cs="Segoe UI"/>
+          <w:sz w:val="22"/>
+          <w:szCs w:val="22"/>
+        </w:rPr>
+      </w:pPr>
+      <w:r>
+        <w:rPr>
+          <w:rFonts w:ascii="Segoe UI" w:hAnsi="Segoe UI" w:cs="Segoe UI"/>
+          <w:sz w:val="22"/>
+          <w:szCs w:val="22"/>
+        </w:rPr>
+        <w:t>Para: Que los nuevos huéspedes sepan de las comodidades y ventajas de esta propiedad en especifico</w:t>
+      </w:r>
+    </w:p>
+    <w:p>
+      <w:pPr>
+        <w:pStyle w:val="paragraph"/>
+        <w:spacing w:before="0" w:beforeAutospacing="0" w:after="0" w:afterAutospacing="0"/>
+        <w:textAlignment w:val="baseline"/>
+        <w:rPr>
+          <w:rFonts w:ascii="Segoe UI" w:hAnsi="Segoe UI" w:cs="Segoe UI"/>
+          <w:sz w:val="22"/>
+          <w:szCs w:val="22"/>
+        </w:rPr>
+      </w:pPr>
+    </w:p>
+    <w:p>
+      <w:pPr>
+        <w:pStyle w:val="paragraph"/>
+        <w:spacing w:after="0"/>
+        <w:textAlignment w:val="baseline"/>
         <w:rPr>
           <w:rFonts w:ascii="Segoe UI" w:hAnsi="Segoe UI" w:cs="Segoe UI"/>
           <w:b/>
           <w:sz w:val="22"/>
           <w:szCs w:val="22"/>
         </w:rPr>
-        <w:t>08</w:t>
-      </w:r>
-    </w:p>
-    <w:p>
-      <w:pPr>
-        <w:pStyle w:val="paragraph"/>
-        <w:spacing w:after="0"/>
-        <w:textAlignment w:val="baseline"/>
-        <w:rPr>
-          <w:rFonts w:ascii="Segoe UI" w:hAnsi="Segoe UI" w:cs="Segoe UI"/>
-          <w:sz w:val="22"/>
-          <w:szCs w:val="22"/>
-        </w:rPr>
-      </w:pPr>
-      <w:r>
-        <w:rPr>
-          <w:rFonts w:ascii="Segoe UI" w:hAnsi="Segoe UI" w:cs="Segoe UI"/>
-          <w:sz w:val="22"/>
-          <w:szCs w:val="22"/>
-        </w:rPr>
-        <w:t>Como: Empresario</w:t>
-      </w:r>
-    </w:p>
-    <w:p>
-      <w:pPr>
-        <w:pStyle w:val="paragraph"/>
-        <w:spacing w:after="0"/>
-        <w:textAlignment w:val="baseline"/>
-        <w:rPr>
-          <w:rFonts w:ascii="Segoe UI" w:hAnsi="Segoe UI" w:cs="Segoe UI"/>
-          <w:sz w:val="22"/>
-          <w:szCs w:val="22"/>
-        </w:rPr>
-      </w:pPr>
-      <w:r>
-        <w:rPr>
-          <w:rFonts w:ascii="Segoe UI" w:hAnsi="Segoe UI" w:cs="Segoe UI"/>
-          <w:sz w:val="22"/>
-          <w:szCs w:val="22"/>
-        </w:rPr>
-        <w:t>Quiero: Registrar una reseña sobre la propiedad que me fue otorgada en Peace At Home</w:t>
-      </w:r>
-    </w:p>
-    <w:p>
-      <w:pPr>
-        <w:pStyle w:val="paragraph"/>
-        <w:spacing w:before="0" w:beforeAutospacing="0" w:after="0" w:afterAutospacing="0"/>
-        <w:textAlignment w:val="baseline"/>
-        <w:rPr>
-          <w:rFonts w:ascii="Segoe UI" w:hAnsi="Segoe UI" w:cs="Segoe UI"/>
-          <w:sz w:val="22"/>
-          <w:szCs w:val="22"/>
-        </w:rPr>
-      </w:pPr>
-      <w:r>
-        <w:rPr>
-          <w:rFonts w:ascii="Segoe UI" w:hAnsi="Segoe UI" w:cs="Segoe UI"/>
-          <w:sz w:val="22"/>
-          <w:szCs w:val="22"/>
-        </w:rPr>
-        <w:t>Para: Que los nuevos huéspedes sepan de las comodidades y ventajas de esta propiedad en especifico</w:t>
-      </w:r>
-    </w:p>
-    <w:p>
-      <w:pPr>
-        <w:pStyle w:val="paragraph"/>
-        <w:spacing w:before="0" w:beforeAutospacing="0" w:after="0" w:afterAutospacing="0"/>
-        <w:textAlignment w:val="baseline"/>
-        <w:rPr>
-          <w:rFonts w:ascii="Segoe UI" w:hAnsi="Segoe UI" w:cs="Segoe UI"/>
-          <w:sz w:val="22"/>
-          <w:szCs w:val="22"/>
-        </w:rPr>
-      </w:pPr>
-    </w:p>
-    <w:p>
-      <w:pPr>
-        <w:pStyle w:val="paragraph"/>
-        <w:spacing w:after="0"/>
-        <w:textAlignment w:val="baseline"/>
+      </w:pPr>
+      <w:r>
         <w:rPr>
           <w:rFonts w:ascii="Segoe UI" w:hAnsi="Segoe UI" w:cs="Segoe UI"/>
           <w:b/>
           <w:sz w:val="22"/>
           <w:szCs w:val="22"/>
         </w:rPr>
-      </w:pPr>
-      <w:r>
-        <w:rPr>
-          <w:rFonts w:ascii="Segoe UI" w:hAnsi="Segoe UI" w:cs="Segoe UI"/>
-          <w:b/>
-          <w:sz w:val="22"/>
-          <w:szCs w:val="22"/>
-        </w:rPr>
-        <w:t>HUJC-0</w:t>
-      </w:r>
-      <w:r>
-        <w:rPr>
-          <w:rFonts w:ascii="Segoe UI" w:hAnsi="Segoe UI" w:cs="Segoe UI"/>
-          <w:b/>
-          <w:sz w:val="22"/>
-          <w:szCs w:val="22"/>
-        </w:rPr>
-        <w:t>09</w:t>
+        <w:t>HUJC-009</w:t>
       </w:r>
     </w:p>
     <w:p>
@@ -2758,15 +2724,15 @@
     </w:p>
     <w:p>
       <w:r>
-        <w:t>HURH-0010</w:t>
-      </w:r>
-      <w:r>
-        <w:t xml:space="preserve"> Registro de pago:</w:t>
-      </w:r>
-    </w:p>
-    <w:p>
-      <w:r>
-        <w:t>1. Como un registro de pagos</w:t>
+        <w:t>HURH-0010 Registro de pago:</w:t>
+      </w:r>
+    </w:p>
+    <w:p>
+      <w:r>
+        <w:t>1. Como un</w:t>
+      </w:r>
+      <w:r>
+        <w:t xml:space="preserve"> registro de pagos</w:t>
       </w:r>
     </w:p>
     <w:p>
@@ -2782,10 +2748,7 @@
     <w:p/>
     <w:p>
       <w:r>
-        <w:t>HURH-0011</w:t>
-      </w:r>
-      <w:r>
-        <w:t xml:space="preserve"> Validación de monto máximo</w:t>
+        <w:t>HURH-0011 Validación de monto máximo</w:t>
       </w:r>
     </w:p>
     <w:p>
@@ -2800,597 +2763,2929 @@
     </w:p>
     <w:p>
       <w:r>
-        <w:t>3. Para verificar si el monto de pago es valido</w:t>
-      </w:r>
-    </w:p>
-    <w:p>
+        <w:t xml:space="preserve">3. Para </w:t>
+      </w:r>
+      <w:r>
+        <w:t>verificar si el monto de pago es valido</w:t>
+      </w:r>
+    </w:p>
+    <w:p/>
+    <w:p>
+      <w:r>
+        <w:t>HURH-0012 Generación de recibo de pago</w:t>
+      </w:r>
+    </w:p>
+    <w:p>
+      <w:r>
+        <w:t xml:space="preserve">1. Como registro de pago recibido </w:t>
+      </w:r>
+    </w:p>
+    <w:p>
+      <w:r>
+        <w:t>2. Quiero que me den la información del monto de pago</w:t>
+      </w:r>
+    </w:p>
+    <w:p>
+      <w:pPr>
+        <w:spacing w:before="100" w:beforeAutospacing="1" w:after="100" w:afterAutospacing="1" w:line="240" w:lineRule="auto"/>
+        <w:rPr>
+          <w:rFonts w:ascii="Arial" w:eastAsia="Times New Roman" w:hAnsi="Arial" w:cs="Arial"/>
+          <w:sz w:val="24"/>
+          <w:szCs w:val="24"/>
+          <w:lang w:eastAsia="es-GT"/>
+        </w:rPr>
+      </w:pPr>
+      <w:r>
+        <w:t>3. Para que registre el recibo y se almacene en el sistema</w:t>
+      </w:r>
+    </w:p>
+    <w:p>
+      <w:pPr>
+        <w:spacing w:before="100" w:beforeAutospacing="1" w:after="100" w:afterAutospacing="1" w:line="240" w:lineRule="auto"/>
+        <w:rPr>
+          <w:rFonts w:ascii="Arial" w:eastAsia="Times New Roman" w:hAnsi="Arial" w:cs="Arial"/>
+          <w:sz w:val="24"/>
+          <w:szCs w:val="24"/>
+          <w:lang w:eastAsia="es-GT"/>
+        </w:rPr>
+      </w:pPr>
+    </w:p>
+    <w:p>
+      <w:pPr>
+        <w:spacing w:before="100" w:beforeAutospacing="1" w:after="100" w:afterAutospacing="1" w:line="240" w:lineRule="auto"/>
+        <w:rPr>
+          <w:rFonts w:ascii="Arial" w:eastAsia="Times New Roman" w:hAnsi="Arial" w:cs="Arial"/>
+          <w:sz w:val="24"/>
+          <w:szCs w:val="24"/>
+          <w:lang w:eastAsia="es-GT"/>
+        </w:rPr>
+      </w:pPr>
+      <w:r>
+        <w:rPr>
+          <w:rFonts w:ascii="Arial" w:eastAsia="Times New Roman" w:hAnsi="Arial" w:cs="Arial"/>
+          <w:sz w:val="24"/>
+          <w:szCs w:val="24"/>
+          <w:lang w:eastAsia="es-GT"/>
+        </w:rPr>
+        <w:t xml:space="preserve">Tupla: Reembolso </w:t>
+      </w:r>
+    </w:p>
+    <w:p>
+      <w:pPr>
+        <w:spacing w:before="100" w:beforeAutospacing="1" w:after="100" w:afterAutospacing="1" w:line="240" w:lineRule="auto"/>
+        <w:rPr>
+          <w:rFonts w:ascii="Arial" w:eastAsia="Times New Roman" w:hAnsi="Arial" w:cs="Arial"/>
+          <w:sz w:val="24"/>
+          <w:szCs w:val="24"/>
+          <w:u w:val="single"/>
+          <w:lang w:eastAsia="es-GT"/>
+        </w:rPr>
+      </w:pPr>
+      <w:r>
+        <w:rPr>
+          <w:rFonts w:ascii="Arial" w:eastAsia="Times New Roman" w:hAnsi="Arial" w:cs="Arial"/>
+          <w:sz w:val="24"/>
+          <w:szCs w:val="24"/>
+          <w:lang w:eastAsia="es-GT"/>
+        </w:rPr>
+        <w:t>HUOV-013</w:t>
+      </w:r>
+    </w:p>
+    <w:p>
+      <w:pPr>
+        <w:spacing w:before="100" w:beforeAutospacing="1" w:after="100" w:afterAutospacing="1" w:line="240" w:lineRule="auto"/>
+        <w:rPr>
+          <w:rFonts w:ascii="Arial" w:eastAsia="Times New Roman" w:hAnsi="Arial" w:cs="Arial"/>
+          <w:sz w:val="24"/>
+          <w:szCs w:val="24"/>
+          <w:lang w:eastAsia="es-GT"/>
+        </w:rPr>
+      </w:pPr>
+      <w:r>
+        <w:rPr>
+          <w:rFonts w:ascii="Arial" w:eastAsia="Times New Roman" w:hAnsi="Arial" w:cs="Arial"/>
+          <w:sz w:val="24"/>
+          <w:szCs w:val="24"/>
+          <w:lang w:eastAsia="es-GT"/>
+        </w:rPr>
+        <w:t>Como: empleado</w:t>
+      </w:r>
+    </w:p>
+    <w:p>
+      <w:pPr>
+        <w:spacing w:before="100" w:beforeAutospacing="1" w:after="100" w:afterAutospacing="1" w:line="240" w:lineRule="auto"/>
+        <w:rPr>
+          <w:rFonts w:ascii="Arial" w:eastAsia="Times New Roman" w:hAnsi="Arial" w:cs="Arial"/>
+          <w:sz w:val="24"/>
+          <w:szCs w:val="24"/>
+          <w:lang w:eastAsia="es-GT"/>
+        </w:rPr>
+      </w:pPr>
+      <w:r>
+        <w:rPr>
+          <w:rFonts w:ascii="Arial" w:eastAsia="Times New Roman" w:hAnsi="Arial" w:cs="Arial"/>
+          <w:sz w:val="24"/>
+          <w:szCs w:val="24"/>
+          <w:lang w:eastAsia="es-GT"/>
+        </w:rPr>
+        <w:t xml:space="preserve">Quiero: Poder enviar una solicitud de reembolso cargando recibos y completando un formulario, </w:t>
+      </w:r>
+    </w:p>
+    <w:p>
+      <w:pPr>
+        <w:spacing w:before="100" w:beforeAutospacing="1" w:after="100" w:afterAutospacing="1" w:line="240" w:lineRule="auto"/>
+        <w:rPr>
+          <w:rFonts w:ascii="Arial" w:eastAsia="Times New Roman" w:hAnsi="Arial" w:cs="Arial"/>
+          <w:sz w:val="24"/>
+          <w:szCs w:val="24"/>
+          <w:lang w:eastAsia="es-GT"/>
+        </w:rPr>
+      </w:pPr>
+      <w:r>
+        <w:rPr>
+          <w:rFonts w:ascii="Arial" w:eastAsia="Times New Roman" w:hAnsi="Arial" w:cs="Arial"/>
+          <w:sz w:val="24"/>
+          <w:szCs w:val="24"/>
+          <w:lang w:eastAsia="es-GT"/>
+        </w:rPr>
+        <w:t>para que la administración pueda revisar y aprobar el reembolso de los gastos.</w:t>
+      </w:r>
+    </w:p>
+    <w:p>
+      <w:pPr>
+        <w:spacing w:before="100" w:beforeAutospacing="1" w:after="100" w:afterAutospacing="1" w:line="240" w:lineRule="auto"/>
+        <w:rPr>
+          <w:rFonts w:ascii="Arial" w:eastAsia="Times New Roman" w:hAnsi="Arial" w:cs="Arial"/>
+          <w:sz w:val="24"/>
+          <w:szCs w:val="24"/>
+          <w:lang w:eastAsia="es-GT"/>
+        </w:rPr>
+      </w:pPr>
+      <w:r>
+        <w:rPr>
+          <w:rFonts w:ascii="Arial" w:eastAsia="Times New Roman" w:hAnsi="Arial" w:cs="Arial"/>
+          <w:sz w:val="24"/>
+          <w:szCs w:val="24"/>
+          <w:lang w:eastAsia="es-GT"/>
+        </w:rPr>
+        <w:t xml:space="preserve">Para: Para ofrecer un rembolso cada que lo necesite un cliente. </w:t>
+      </w:r>
+    </w:p>
+    <w:p>
+      <w:pPr>
+        <w:spacing w:before="100" w:beforeAutospacing="1" w:after="100" w:afterAutospacing="1" w:line="240" w:lineRule="auto"/>
+        <w:rPr>
+          <w:rFonts w:ascii="Arial" w:eastAsia="Times New Roman" w:hAnsi="Arial" w:cs="Arial"/>
+          <w:sz w:val="24"/>
+          <w:szCs w:val="24"/>
+          <w:lang w:eastAsia="es-GT"/>
+        </w:rPr>
+      </w:pPr>
+      <w:r>
+        <w:rPr>
+          <w:rFonts w:ascii="Arial" w:eastAsia="Times New Roman" w:hAnsi="Arial" w:cs="Arial"/>
+          <w:sz w:val="24"/>
+          <w:szCs w:val="24"/>
+          <w:lang w:eastAsia="es-GT"/>
+        </w:rPr>
+        <w:t>HU</w:t>
+      </w:r>
+      <w:r>
+        <w:rPr>
+          <w:rFonts w:ascii="Arial" w:eastAsia="Times New Roman" w:hAnsi="Arial" w:cs="Arial"/>
+          <w:sz w:val="24"/>
+          <w:szCs w:val="24"/>
+          <w:lang w:eastAsia="es-GT"/>
+        </w:rPr>
+        <w:t>OV-014</w:t>
+      </w:r>
+    </w:p>
+    <w:p>
+      <w:pPr>
+        <w:spacing w:before="100" w:beforeAutospacing="1" w:after="100" w:afterAutospacing="1" w:line="240" w:lineRule="auto"/>
+        <w:rPr>
+          <w:rFonts w:ascii="Arial" w:eastAsia="Times New Roman" w:hAnsi="Arial" w:cs="Arial"/>
+          <w:sz w:val="24"/>
+          <w:szCs w:val="24"/>
+          <w:lang w:eastAsia="es-GT"/>
+        </w:rPr>
+      </w:pPr>
+      <w:r>
+        <w:rPr>
+          <w:rFonts w:ascii="Arial" w:eastAsia="Times New Roman" w:hAnsi="Arial" w:cs="Arial"/>
+          <w:sz w:val="24"/>
+          <w:szCs w:val="24"/>
+          <w:lang w:eastAsia="es-GT"/>
+        </w:rPr>
+        <w:t xml:space="preserve">Como: Administrador financiero </w:t>
+      </w:r>
+    </w:p>
+    <w:p>
+      <w:pPr>
+        <w:spacing w:before="100" w:beforeAutospacing="1" w:after="100" w:afterAutospacing="1" w:line="240" w:lineRule="auto"/>
+        <w:rPr>
+          <w:rFonts w:ascii="Arial" w:eastAsia="Times New Roman" w:hAnsi="Arial" w:cs="Arial"/>
+          <w:sz w:val="24"/>
+          <w:szCs w:val="24"/>
+          <w:lang w:eastAsia="es-GT"/>
+        </w:rPr>
+      </w:pPr>
+      <w:r>
+        <w:rPr>
+          <w:rFonts w:ascii="Arial" w:eastAsia="Times New Roman" w:hAnsi="Arial" w:cs="Arial"/>
+          <w:sz w:val="24"/>
+          <w:szCs w:val="24"/>
+          <w:lang w:eastAsia="es-GT"/>
+        </w:rPr>
+        <w:t xml:space="preserve">Quiero: Acceder a todas las solicitudes de rembolso recibidas y poder aprobarlas o rechazarlas </w:t>
+      </w:r>
+    </w:p>
+    <w:p>
+      <w:pPr>
+        <w:spacing w:before="100" w:beforeAutospacing="1" w:after="100" w:afterAutospacing="1" w:line="240" w:lineRule="auto"/>
+        <w:rPr>
+          <w:rFonts w:ascii="Arial" w:eastAsia="Times New Roman" w:hAnsi="Arial" w:cs="Arial"/>
+          <w:sz w:val="24"/>
+          <w:szCs w:val="24"/>
+          <w:lang w:eastAsia="es-GT"/>
+        </w:rPr>
+      </w:pPr>
+      <w:r>
+        <w:rPr>
+          <w:rFonts w:ascii="Arial" w:eastAsia="Times New Roman" w:hAnsi="Arial" w:cs="Arial"/>
+          <w:sz w:val="24"/>
+          <w:szCs w:val="24"/>
+          <w:lang w:eastAsia="es-GT"/>
+        </w:rPr>
+        <w:t>o hasta incluso pedir más información sobre la solicitud de rembolso.</w:t>
+      </w:r>
+    </w:p>
+    <w:p>
+      <w:pPr>
+        <w:spacing w:before="100" w:beforeAutospacing="1" w:after="100" w:afterAutospacing="1" w:line="240" w:lineRule="auto"/>
+        <w:rPr>
+          <w:rFonts w:ascii="Arial" w:eastAsia="Times New Roman" w:hAnsi="Arial" w:cs="Arial"/>
+          <w:sz w:val="24"/>
+          <w:szCs w:val="24"/>
+          <w:lang w:eastAsia="es-GT"/>
+        </w:rPr>
+      </w:pPr>
+      <w:r>
+        <w:rPr>
+          <w:rFonts w:ascii="Arial" w:eastAsia="Times New Roman" w:hAnsi="Arial" w:cs="Arial"/>
+          <w:sz w:val="24"/>
+          <w:szCs w:val="24"/>
+          <w:lang w:eastAsia="es-GT"/>
+        </w:rPr>
+        <w:t>Para: Tener un registro de cada acción tomada con f</w:t>
+      </w:r>
+      <w:r>
+        <w:rPr>
+          <w:rFonts w:ascii="Arial" w:eastAsia="Times New Roman" w:hAnsi="Arial" w:cs="Arial"/>
+          <w:sz w:val="24"/>
+          <w:szCs w:val="24"/>
+          <w:lang w:eastAsia="es-GT"/>
+        </w:rPr>
+        <w:t>echa y el usuario responsable.</w:t>
+      </w:r>
+    </w:p>
+    <w:p>
+      <w:pPr>
+        <w:spacing w:before="100" w:beforeAutospacing="1" w:after="100" w:afterAutospacing="1" w:line="240" w:lineRule="auto"/>
+        <w:rPr>
+          <w:rFonts w:ascii="Arial" w:eastAsia="Times New Roman" w:hAnsi="Arial" w:cs="Arial"/>
+          <w:sz w:val="24"/>
+          <w:szCs w:val="24"/>
+          <w:lang w:eastAsia="es-GT"/>
+        </w:rPr>
+      </w:pPr>
+    </w:p>
+    <w:p>
+      <w:pPr>
+        <w:spacing w:before="100" w:beforeAutospacing="1" w:after="100" w:afterAutospacing="1" w:line="240" w:lineRule="auto"/>
+        <w:rPr>
+          <w:rFonts w:ascii="Arial" w:eastAsia="Times New Roman" w:hAnsi="Arial" w:cs="Arial"/>
+          <w:sz w:val="24"/>
+          <w:szCs w:val="24"/>
+          <w:lang w:eastAsia="es-GT"/>
+        </w:rPr>
+      </w:pPr>
+    </w:p>
+    <w:p>
+      <w:pPr>
+        <w:spacing w:before="100" w:beforeAutospacing="1" w:after="100" w:afterAutospacing="1" w:line="240" w:lineRule="auto"/>
+        <w:rPr>
+          <w:rFonts w:ascii="Arial" w:eastAsia="Times New Roman" w:hAnsi="Arial" w:cs="Arial"/>
+          <w:sz w:val="24"/>
+          <w:szCs w:val="24"/>
+          <w:lang w:eastAsia="es-GT"/>
+        </w:rPr>
+      </w:pPr>
+      <w:r>
+        <w:rPr>
+          <w:rFonts w:ascii="Arial" w:eastAsia="Times New Roman" w:hAnsi="Arial" w:cs="Arial"/>
+          <w:sz w:val="24"/>
+          <w:szCs w:val="24"/>
+          <w:lang w:eastAsia="es-GT"/>
+        </w:rPr>
+        <w:t>HUOV-015</w:t>
+      </w:r>
+    </w:p>
+    <w:p>
+      <w:pPr>
+        <w:spacing w:before="100" w:beforeAutospacing="1" w:after="100" w:afterAutospacing="1" w:line="240" w:lineRule="auto"/>
+        <w:rPr>
+          <w:rFonts w:ascii="Arial" w:eastAsia="Times New Roman" w:hAnsi="Arial" w:cs="Arial"/>
+          <w:sz w:val="24"/>
+          <w:szCs w:val="24"/>
+          <w:lang w:eastAsia="es-GT"/>
+        </w:rPr>
+      </w:pPr>
+      <w:r>
+        <w:rPr>
+          <w:rFonts w:ascii="Arial" w:eastAsia="Times New Roman" w:hAnsi="Arial" w:cs="Arial"/>
+          <w:sz w:val="24"/>
+          <w:szCs w:val="24"/>
+          <w:lang w:eastAsia="es-GT"/>
+        </w:rPr>
+        <w:t xml:space="preserve">Como: Cliente </w:t>
+      </w:r>
+    </w:p>
+    <w:p>
+      <w:pPr>
+        <w:spacing w:before="100" w:beforeAutospacing="1" w:after="100" w:afterAutospacing="1" w:line="240" w:lineRule="auto"/>
+        <w:rPr>
+          <w:rFonts w:ascii="Arial" w:eastAsia="Times New Roman" w:hAnsi="Arial" w:cs="Arial"/>
+          <w:sz w:val="24"/>
+          <w:szCs w:val="24"/>
+          <w:lang w:eastAsia="es-GT"/>
+        </w:rPr>
+      </w:pPr>
+      <w:r>
+        <w:rPr>
+          <w:rFonts w:ascii="Arial" w:eastAsia="Times New Roman" w:hAnsi="Arial" w:cs="Arial"/>
+          <w:sz w:val="24"/>
+          <w:szCs w:val="24"/>
+          <w:lang w:eastAsia="es-GT"/>
+        </w:rPr>
+        <w:t xml:space="preserve">Quiero: Recibir notificaciones cada vez que cambie el estado de mi solicitud de reembolso, </w:t>
+      </w:r>
+    </w:p>
+    <w:p>
+      <w:pPr>
+        <w:spacing w:before="100" w:beforeAutospacing="1" w:after="100" w:afterAutospacing="1" w:line="240" w:lineRule="auto"/>
+        <w:rPr>
+          <w:rFonts w:ascii="Arial" w:eastAsia="Times New Roman" w:hAnsi="Arial" w:cs="Arial"/>
+          <w:sz w:val="24"/>
+          <w:szCs w:val="24"/>
+          <w:lang w:eastAsia="es-GT"/>
+        </w:rPr>
+      </w:pPr>
+      <w:r>
+        <w:rPr>
+          <w:rFonts w:ascii="Arial" w:eastAsia="Times New Roman" w:hAnsi="Arial" w:cs="Arial"/>
+          <w:sz w:val="24"/>
+          <w:szCs w:val="24"/>
+          <w:lang w:eastAsia="es-GT"/>
+        </w:rPr>
+        <w:t>para mantenerme informado sobre el avance y resultado de mi trámite.</w:t>
+      </w:r>
+    </w:p>
+    <w:p>
+      <w:pPr>
+        <w:spacing w:before="100" w:beforeAutospacing="1" w:after="100" w:afterAutospacing="1" w:line="240" w:lineRule="auto"/>
+        <w:rPr>
+          <w:rFonts w:ascii="Arial" w:eastAsia="Times New Roman" w:hAnsi="Arial" w:cs="Arial"/>
+          <w:sz w:val="24"/>
+          <w:szCs w:val="24"/>
+          <w:lang w:eastAsia="es-GT"/>
+        </w:rPr>
+      </w:pPr>
+      <w:r>
+        <w:rPr>
+          <w:rFonts w:ascii="Arial" w:eastAsia="Times New Roman" w:hAnsi="Arial" w:cs="Arial"/>
+          <w:sz w:val="24"/>
+          <w:szCs w:val="24"/>
+          <w:lang w:eastAsia="es-GT"/>
+        </w:rPr>
+        <w:t>Para: Tener un envio automático de not</w:t>
+      </w:r>
+      <w:r>
+        <w:rPr>
+          <w:rFonts w:ascii="Arial" w:eastAsia="Times New Roman" w:hAnsi="Arial" w:cs="Arial"/>
+          <w:sz w:val="24"/>
+          <w:szCs w:val="24"/>
+          <w:lang w:eastAsia="es-GT"/>
+        </w:rPr>
+        <w:t>ificaciones por correo electrónico y dentro del sistema.</w:t>
+      </w:r>
+    </w:p>
+    <w:p>
+      <w:pPr>
+        <w:spacing w:before="100" w:beforeAutospacing="1" w:after="100" w:afterAutospacing="1" w:line="240" w:lineRule="auto"/>
+        <w:rPr>
+          <w:rFonts w:ascii="Arial" w:eastAsia="Times New Roman" w:hAnsi="Arial" w:cs="Arial"/>
+          <w:sz w:val="24"/>
+          <w:szCs w:val="24"/>
+          <w:lang w:eastAsia="es-GT"/>
+        </w:rPr>
+      </w:pPr>
+    </w:p>
+    <w:p>
+      <w:pPr>
+        <w:pStyle w:val="NormalWeb"/>
+        <w:rPr>
+          <w:rStyle w:val="cf01"/>
+          <w:rFonts w:cs="Arial"/>
+          <w:b/>
+          <w:sz w:val="24"/>
+          <w:szCs w:val="24"/>
+        </w:rPr>
+      </w:pPr>
+      <w:r>
+        <w:rPr>
+          <w:rStyle w:val="cf01"/>
+          <w:rFonts w:cs="Arial"/>
+          <w:b/>
+          <w:sz w:val="24"/>
+          <w:szCs w:val="24"/>
+        </w:rPr>
+        <w:t>Tupla: Comodidades</w:t>
+      </w:r>
+    </w:p>
+    <w:p>
+      <w:pPr>
+        <w:pStyle w:val="NormalWeb"/>
+        <w:rPr>
+          <w:rFonts w:ascii="Arial" w:hAnsi="Arial" w:cs="Arial"/>
+          <w:sz w:val="22"/>
+          <w:szCs w:val="22"/>
+        </w:rPr>
+      </w:pPr>
+      <w:r>
+        <w:rPr>
+          <w:rFonts w:ascii="Arial" w:hAnsi="Arial" w:cs="Arial"/>
+          <w:sz w:val="22"/>
+          <w:szCs w:val="22"/>
+        </w:rPr>
+        <w:t>HUBA-016: Visualización Detallada de Comodidades Disponibles</w:t>
+      </w:r>
+    </w:p>
+    <w:p>
+      <w:pPr>
+        <w:pStyle w:val="NormalWeb"/>
+        <w:rPr>
+          <w:rFonts w:ascii="Arial" w:hAnsi="Arial" w:cs="Arial"/>
+          <w:sz w:val="22"/>
+          <w:szCs w:val="22"/>
+        </w:rPr>
+      </w:pPr>
+      <w:r>
+        <w:rPr>
+          <w:rFonts w:ascii="Arial" w:hAnsi="Arial" w:cs="Arial"/>
+          <w:sz w:val="22"/>
+          <w:szCs w:val="22"/>
+        </w:rPr>
+        <w:t>Como: Comodidades</w:t>
+      </w:r>
+    </w:p>
+    <w:p>
+      <w:pPr>
+        <w:pStyle w:val="NormalWeb"/>
+        <w:rPr>
+          <w:rFonts w:ascii="Arial" w:hAnsi="Arial" w:cs="Arial"/>
+          <w:sz w:val="22"/>
+          <w:szCs w:val="22"/>
+        </w:rPr>
+      </w:pPr>
+      <w:r>
+        <w:rPr>
+          <w:rFonts w:ascii="Arial" w:hAnsi="Arial" w:cs="Arial"/>
+          <w:sz w:val="22"/>
+          <w:szCs w:val="22"/>
+        </w:rPr>
+        <w:t xml:space="preserve">Quiero: poder ver una descripción completa y detallada de todas las comodidades disponibles en la </w:t>
+      </w:r>
+      <w:r>
+        <w:rPr>
+          <w:rFonts w:ascii="Arial" w:hAnsi="Arial" w:cs="Arial"/>
+          <w:sz w:val="22"/>
+          <w:szCs w:val="22"/>
+        </w:rPr>
+        <w:t>propiedad</w:t>
+      </w:r>
+    </w:p>
+    <w:p>
+      <w:pPr>
+        <w:pStyle w:val="NormalWeb"/>
+        <w:rPr>
+          <w:rFonts w:ascii="Arial" w:hAnsi="Arial" w:cs="Arial"/>
+          <w:sz w:val="22"/>
+          <w:szCs w:val="22"/>
+        </w:rPr>
+      </w:pPr>
+      <w:r>
+        <w:rPr>
+          <w:rFonts w:ascii="Arial" w:hAnsi="Arial" w:cs="Arial"/>
+          <w:sz w:val="22"/>
+          <w:szCs w:val="22"/>
+        </w:rPr>
+        <w:t>Para: ofrecer información precisa y enriquecedora que mejore significativamente la experiencia de búsqueda del usuario, permitiéndole tomar decisiones informadas.</w:t>
+      </w:r>
+    </w:p>
+    <w:p>
+      <w:pPr>
+        <w:pStyle w:val="NormalWeb"/>
+        <w:rPr>
+          <w:rFonts w:ascii="Arial" w:hAnsi="Arial" w:cs="Arial"/>
+          <w:sz w:val="22"/>
+          <w:szCs w:val="22"/>
+        </w:rPr>
+      </w:pPr>
+    </w:p>
+    <w:p>
+      <w:pPr>
+        <w:rPr>
+          <w:rFonts w:ascii="Arial" w:eastAsiaTheme="minorHAnsi" w:hAnsi="Arial" w:cs="Arial"/>
+        </w:rPr>
+      </w:pPr>
+      <w:r>
+        <w:rPr>
+          <w:rFonts w:ascii="Arial" w:eastAsiaTheme="minorHAnsi" w:hAnsi="Arial" w:cs="Arial"/>
+        </w:rPr>
+        <w:t>HUBA-017: Identificación Clara de Comodidades No Disponibles</w:t>
+      </w:r>
+    </w:p>
+    <w:p>
+      <w:pPr>
+        <w:rPr>
+          <w:rFonts w:ascii="Arial" w:eastAsiaTheme="minorHAnsi" w:hAnsi="Arial" w:cs="Arial"/>
+        </w:rPr>
+      </w:pPr>
+      <w:r>
+        <w:rPr>
+          <w:rFonts w:ascii="Arial" w:eastAsiaTheme="minorHAnsi" w:hAnsi="Arial" w:cs="Arial"/>
+        </w:rPr>
+        <w:t>Como: Comodidades</w:t>
+      </w:r>
+    </w:p>
+    <w:p>
+      <w:pPr>
+        <w:rPr>
+          <w:rFonts w:ascii="Arial" w:eastAsiaTheme="minorHAnsi" w:hAnsi="Arial" w:cs="Arial"/>
+        </w:rPr>
+      </w:pPr>
+      <w:r>
+        <w:rPr>
+          <w:rFonts w:ascii="Arial" w:eastAsiaTheme="minorHAnsi" w:hAnsi="Arial" w:cs="Arial"/>
+        </w:rPr>
+        <w:t>Quiero: que el sistema muestre de forma clara las comodidades con las que la propiedad no cuenta,</w:t>
+      </w:r>
+    </w:p>
+    <w:p>
+      <w:pPr>
+        <w:rPr>
+          <w:rFonts w:ascii="Arial" w:eastAsiaTheme="minorHAnsi" w:hAnsi="Arial" w:cs="Arial"/>
+        </w:rPr>
+      </w:pPr>
+      <w:r>
+        <w:rPr>
+          <w:rFonts w:ascii="Arial" w:eastAsiaTheme="minorHAnsi" w:hAnsi="Arial" w:cs="Arial"/>
+        </w:rPr>
+        <w:t>Para: evitar cualquier expectativa errónea o inconveniente al momento de mi estancia, asegurando una total transparencia.</w:t>
+      </w:r>
+    </w:p>
+    <w:p>
+      <w:pPr>
+        <w:rPr>
+          <w:rFonts w:ascii="Arial" w:eastAsiaTheme="minorHAnsi" w:hAnsi="Arial" w:cs="Arial"/>
+        </w:rPr>
+      </w:pPr>
+    </w:p>
+    <w:p>
+      <w:pPr>
+        <w:rPr>
+          <w:rFonts w:ascii="Arial" w:eastAsiaTheme="minorHAnsi" w:hAnsi="Arial" w:cs="Arial"/>
+          <w:sz w:val="20"/>
+          <w:szCs w:val="20"/>
+        </w:rPr>
+      </w:pPr>
+      <w:r>
+        <w:rPr>
+          <w:rFonts w:ascii="Arial" w:eastAsiaTheme="minorHAnsi" w:hAnsi="Arial" w:cs="Arial"/>
+          <w:sz w:val="20"/>
+          <w:szCs w:val="20"/>
+        </w:rPr>
+        <w:t>HUBA-018: Administración Integral d</w:t>
+      </w:r>
+      <w:r>
+        <w:rPr>
+          <w:rFonts w:ascii="Arial" w:eastAsiaTheme="minorHAnsi" w:hAnsi="Arial" w:cs="Arial"/>
+          <w:sz w:val="20"/>
+          <w:szCs w:val="20"/>
+        </w:rPr>
+        <w:t>e Comodidades de la Propiedad</w:t>
+      </w:r>
+    </w:p>
+    <w:p>
+      <w:pPr>
+        <w:rPr>
+          <w:rFonts w:ascii="Arial" w:eastAsiaTheme="minorHAnsi" w:hAnsi="Arial" w:cs="Arial"/>
+          <w:sz w:val="20"/>
+          <w:szCs w:val="20"/>
+        </w:rPr>
+      </w:pPr>
+      <w:r>
+        <w:rPr>
+          <w:rFonts w:ascii="Arial" w:eastAsiaTheme="minorHAnsi" w:hAnsi="Arial" w:cs="Arial"/>
+          <w:sz w:val="20"/>
+          <w:szCs w:val="20"/>
+        </w:rPr>
+        <w:t>Como: Comodidades</w:t>
+      </w:r>
+    </w:p>
+    <w:p>
+      <w:pPr>
+        <w:rPr>
+          <w:rFonts w:ascii="Arial" w:eastAsiaTheme="minorHAnsi" w:hAnsi="Arial" w:cs="Arial"/>
+          <w:sz w:val="20"/>
+          <w:szCs w:val="20"/>
+        </w:rPr>
+      </w:pPr>
+      <w:r>
+        <w:rPr>
+          <w:rFonts w:ascii="Arial" w:eastAsiaTheme="minorHAnsi" w:hAnsi="Arial" w:cs="Arial"/>
+          <w:sz w:val="20"/>
+          <w:szCs w:val="20"/>
+        </w:rPr>
+        <w:t>Quiero: tener la capacidad de añadir nuevas comodidades, eliminar las existentes o actualizar la información de estas,</w:t>
+      </w:r>
+    </w:p>
+    <w:p>
+      <w:pPr>
+        <w:rPr>
+          <w:rFonts w:ascii="Arial" w:eastAsiaTheme="minorHAnsi" w:hAnsi="Arial" w:cs="Arial"/>
+          <w:sz w:val="20"/>
+          <w:szCs w:val="20"/>
+        </w:rPr>
+      </w:pPr>
+      <w:r>
+        <w:rPr>
+          <w:rFonts w:ascii="Arial" w:eastAsiaTheme="minorHAnsi" w:hAnsi="Arial" w:cs="Arial"/>
+          <w:sz w:val="20"/>
+          <w:szCs w:val="20"/>
+        </w:rPr>
+        <w:t>Para: mantener la lista de servicios siempre al día y así garantizar que los usuarios acc</w:t>
+      </w:r>
+      <w:r>
+        <w:rPr>
+          <w:rFonts w:ascii="Arial" w:eastAsiaTheme="minorHAnsi" w:hAnsi="Arial" w:cs="Arial"/>
+          <w:sz w:val="20"/>
+          <w:szCs w:val="20"/>
+        </w:rPr>
+        <w:t>edan a la información más precisa y relevante, mejorando constantemente la calidad de nuestro servicio.</w:t>
+      </w:r>
+    </w:p>
+    <w:p>
+      <w:pPr>
+        <w:rPr>
+          <w:rFonts w:ascii="Arial" w:eastAsiaTheme="minorHAnsi" w:hAnsi="Arial" w:cs="Arial"/>
+        </w:rPr>
+      </w:pPr>
+    </w:p>
+    <w:p>
+      <w:pPr>
+        <w:pStyle w:val="NormalWeb"/>
+        <w:rPr>
+          <w:rFonts w:ascii="Arial" w:hAnsi="Arial" w:cs="Arial"/>
+          <w:sz w:val="22"/>
+          <w:szCs w:val="22"/>
+        </w:rPr>
+      </w:pPr>
+    </w:p>
+    <w:p>
+      <w:pPr>
+        <w:spacing w:before="100" w:beforeAutospacing="1" w:after="100" w:afterAutospacing="1" w:line="240" w:lineRule="auto"/>
+        <w:rPr>
+          <w:rFonts w:ascii="Arial" w:eastAsia="Times New Roman" w:hAnsi="Arial" w:cs="Arial"/>
+          <w:sz w:val="24"/>
+          <w:szCs w:val="24"/>
+          <w:lang w:eastAsia="es-GT"/>
+        </w:rPr>
+      </w:pPr>
+    </w:p>
+    <w:p>
+      <w:pPr>
+        <w:rPr>
+          <w:rFonts w:ascii="Arial" w:eastAsiaTheme="minorHAnsi" w:hAnsi="Arial" w:cs="Arial"/>
+          <w:b/>
+          <w:u w:val="single"/>
+          <w:lang w:val="es-MX"/>
+        </w:rPr>
+      </w:pPr>
+      <w:r>
+        <w:rPr>
+          <w:rFonts w:ascii="Arial" w:eastAsiaTheme="minorHAnsi" w:hAnsi="Arial" w:cs="Arial"/>
+          <w:b/>
+          <w:u w:val="single"/>
+          <w:lang w:val="es-MX"/>
+        </w:rPr>
+        <w:t>Tupla: Propiedades</w:t>
+      </w:r>
+    </w:p>
+    <w:p>
+      <w:pPr>
+        <w:rPr>
+          <w:rFonts w:ascii="Arial" w:eastAsiaTheme="minorHAnsi" w:hAnsi="Arial" w:cs="Arial"/>
+          <w:b/>
+          <w:bCs/>
+          <w:lang w:val="es-MX"/>
+        </w:rPr>
+      </w:pPr>
+      <w:r>
+        <w:rPr>
+          <w:rFonts w:ascii="Arial" w:eastAsiaTheme="minorHAnsi" w:hAnsi="Arial" w:cs="Arial"/>
+          <w:b/>
+          <w:bCs/>
+          <w:lang w:val="es-MX"/>
+        </w:rPr>
+        <w:t>HUCL-019: Registro de Propiedades</w:t>
+      </w:r>
+    </w:p>
+    <w:p>
+      <w:pPr>
+        <w:rPr>
+          <w:rFonts w:ascii="Arial" w:eastAsiaTheme="minorHAnsi" w:hAnsi="Arial" w:cs="Arial"/>
+          <w:sz w:val="20"/>
+          <w:szCs w:val="20"/>
+          <w:lang w:val="es-MX"/>
+        </w:rPr>
+      </w:pPr>
+      <w:r>
+        <w:rPr>
+          <w:rFonts w:ascii="Arial" w:eastAsiaTheme="minorHAnsi" w:hAnsi="Arial" w:cs="Arial"/>
+          <w:sz w:val="20"/>
+          <w:szCs w:val="20"/>
+          <w:lang w:val="es-MX"/>
+        </w:rPr>
+        <w:t xml:space="preserve">Como: Agente Inmobiliario </w:t>
+      </w:r>
+    </w:p>
+    <w:p>
+      <w:pPr>
+        <w:rPr>
+          <w:rFonts w:ascii="Arial" w:eastAsiaTheme="minorHAnsi" w:hAnsi="Arial" w:cs="Arial"/>
+          <w:sz w:val="20"/>
+          <w:szCs w:val="20"/>
+          <w:lang w:val="es-MX"/>
+        </w:rPr>
+      </w:pPr>
+      <w:r>
+        <w:rPr>
+          <w:rFonts w:ascii="Arial" w:eastAsiaTheme="minorHAnsi" w:hAnsi="Arial" w:cs="Arial"/>
+          <w:sz w:val="20"/>
+          <w:szCs w:val="20"/>
+          <w:lang w:val="es-MX"/>
+        </w:rPr>
+        <w:t xml:space="preserve">Quiero: Poder visualizar todas las propiedades registradas al nombre </w:t>
+      </w:r>
+      <w:r>
+        <w:rPr>
+          <w:rFonts w:ascii="Arial" w:eastAsiaTheme="minorHAnsi" w:hAnsi="Arial" w:cs="Arial"/>
+          <w:sz w:val="20"/>
+          <w:szCs w:val="20"/>
+          <w:lang w:val="es-MX"/>
+        </w:rPr>
+        <w:t>de algún  usuario</w:t>
+      </w:r>
+    </w:p>
+    <w:p>
+      <w:pPr>
+        <w:rPr>
+          <w:rFonts w:ascii="Arial" w:eastAsiaTheme="minorHAnsi" w:hAnsi="Arial" w:cs="Arial"/>
+          <w:sz w:val="20"/>
+          <w:szCs w:val="20"/>
+          <w:lang w:val="es-MX"/>
+        </w:rPr>
+      </w:pPr>
+      <w:r>
+        <w:rPr>
+          <w:rFonts w:ascii="Arial" w:eastAsiaTheme="minorHAnsi" w:hAnsi="Arial" w:cs="Arial"/>
+          <w:sz w:val="20"/>
+          <w:szCs w:val="20"/>
+          <w:lang w:val="es-MX"/>
+        </w:rPr>
+        <w:t>Para: Poder llevar un registro de sus facturas y remodelaciones</w:t>
+      </w:r>
+    </w:p>
+    <w:p>
+      <w:pPr>
+        <w:rPr>
+          <w:rFonts w:ascii="Arial" w:eastAsiaTheme="minorHAnsi" w:hAnsi="Arial" w:cs="Arial"/>
+          <w:sz w:val="20"/>
+          <w:szCs w:val="20"/>
+          <w:lang w:val="es-MX"/>
+        </w:rPr>
+      </w:pPr>
+    </w:p>
+    <w:p>
+      <w:pPr>
+        <w:rPr>
+          <w:rFonts w:ascii="Arial" w:eastAsiaTheme="minorHAnsi" w:hAnsi="Arial" w:cs="Arial"/>
+          <w:b/>
+          <w:bCs/>
+          <w:lang w:val="es-MX"/>
+        </w:rPr>
+      </w:pPr>
+      <w:r>
+        <w:rPr>
+          <w:rFonts w:ascii="Arial" w:eastAsiaTheme="minorHAnsi" w:hAnsi="Arial" w:cs="Arial"/>
+          <w:b/>
+          <w:bCs/>
+          <w:lang w:val="es-MX"/>
+        </w:rPr>
+        <w:t>HUCL-020: Registro de Nueva Propiedad</w:t>
+      </w:r>
+    </w:p>
+    <w:p>
+      <w:pPr>
+        <w:rPr>
+          <w:rFonts w:ascii="Arial" w:eastAsiaTheme="minorHAnsi" w:hAnsi="Arial" w:cs="Arial"/>
+          <w:sz w:val="20"/>
+          <w:szCs w:val="20"/>
+          <w:lang w:val="es-MX"/>
+        </w:rPr>
+      </w:pPr>
+      <w:r>
+        <w:rPr>
+          <w:rFonts w:ascii="Arial" w:eastAsiaTheme="minorHAnsi" w:hAnsi="Arial" w:cs="Arial"/>
+          <w:sz w:val="20"/>
+          <w:szCs w:val="20"/>
+          <w:lang w:val="es-MX"/>
+        </w:rPr>
+        <w:t>Como: Arrendador</w:t>
+      </w:r>
+    </w:p>
+    <w:p>
+      <w:pPr>
+        <w:rPr>
+          <w:rFonts w:ascii="Arial" w:eastAsiaTheme="minorHAnsi" w:hAnsi="Arial" w:cs="Arial"/>
+          <w:sz w:val="20"/>
+          <w:szCs w:val="20"/>
+          <w:lang w:val="es-MX"/>
+        </w:rPr>
+      </w:pPr>
+      <w:r>
+        <w:rPr>
+          <w:rFonts w:ascii="Arial" w:eastAsiaTheme="minorHAnsi" w:hAnsi="Arial" w:cs="Arial"/>
+          <w:sz w:val="20"/>
+          <w:szCs w:val="20"/>
+          <w:lang w:val="es-MX"/>
+        </w:rPr>
+        <w:t>Quiero: Registrar una nueva propiedad en Peace at Home</w:t>
+      </w:r>
+    </w:p>
+    <w:p>
+      <w:pPr>
+        <w:rPr>
+          <w:rFonts w:ascii="Arial" w:eastAsiaTheme="minorHAnsi" w:hAnsi="Arial" w:cs="Arial"/>
+          <w:sz w:val="20"/>
+          <w:szCs w:val="20"/>
+          <w:lang w:val="es-MX"/>
+        </w:rPr>
+      </w:pPr>
+      <w:r>
+        <w:rPr>
+          <w:rFonts w:ascii="Arial" w:eastAsiaTheme="minorHAnsi" w:hAnsi="Arial" w:cs="Arial"/>
+          <w:sz w:val="20"/>
+          <w:szCs w:val="20"/>
+          <w:lang w:val="es-MX"/>
+        </w:rPr>
+        <w:t xml:space="preserve">Para: Brindar una experiencia cómoda y agradable a los </w:t>
+      </w:r>
+      <w:r>
+        <w:rPr>
+          <w:rFonts w:ascii="Arial" w:eastAsiaTheme="minorHAnsi" w:hAnsi="Arial" w:cs="Arial"/>
+          <w:sz w:val="20"/>
+          <w:szCs w:val="20"/>
+          <w:lang w:val="es-MX"/>
+        </w:rPr>
+        <w:t>huéspedes que renten la propiedad</w:t>
+      </w:r>
+    </w:p>
+    <w:p>
+      <w:pPr>
+        <w:rPr>
+          <w:rFonts w:ascii="Arial" w:eastAsiaTheme="minorHAnsi" w:hAnsi="Arial" w:cs="Arial"/>
+          <w:sz w:val="20"/>
+          <w:szCs w:val="20"/>
+          <w:lang w:val="es-MX"/>
+        </w:rPr>
+      </w:pPr>
+    </w:p>
+    <w:p>
+      <w:pPr>
+        <w:rPr>
+          <w:rFonts w:ascii="Arial" w:eastAsiaTheme="minorHAnsi" w:hAnsi="Arial" w:cs="Arial"/>
+          <w:sz w:val="20"/>
+          <w:szCs w:val="20"/>
+          <w:lang w:val="es-MX"/>
+        </w:rPr>
+      </w:pPr>
+      <w:r>
+        <w:rPr>
+          <w:rFonts w:ascii="Arial" w:eastAsiaTheme="minorHAnsi" w:hAnsi="Arial" w:cs="Arial"/>
+          <w:b/>
+          <w:bCs/>
+          <w:lang w:val="es-MX"/>
+        </w:rPr>
+        <w:t>HUCL-021:</w:t>
+      </w:r>
+      <w:r>
+        <w:rPr>
+          <w:rFonts w:ascii="Arial" w:eastAsiaTheme="minorHAnsi" w:hAnsi="Arial" w:cs="Arial"/>
+          <w:sz w:val="20"/>
+          <w:szCs w:val="20"/>
+          <w:lang w:val="es-MX"/>
+        </w:rPr>
+        <w:t xml:space="preserve">  </w:t>
+      </w:r>
+      <w:r>
+        <w:rPr>
+          <w:rFonts w:ascii="Arial" w:eastAsiaTheme="minorHAnsi" w:hAnsi="Arial" w:cs="Arial"/>
+          <w:b/>
+          <w:bCs/>
+          <w:lang w:val="es-MX"/>
+        </w:rPr>
+        <w:t>descripción de propiedades</w:t>
+      </w:r>
+    </w:p>
+    <w:p>
+      <w:pPr>
+        <w:rPr>
+          <w:rFonts w:ascii="Arial" w:eastAsiaTheme="minorHAnsi" w:hAnsi="Arial" w:cs="Arial"/>
+          <w:sz w:val="20"/>
+          <w:szCs w:val="20"/>
+          <w:lang w:val="es-MX"/>
+        </w:rPr>
+      </w:pPr>
+      <w:r>
+        <w:rPr>
+          <w:rFonts w:ascii="Arial" w:eastAsiaTheme="minorHAnsi" w:hAnsi="Arial" w:cs="Arial"/>
+          <w:sz w:val="20"/>
+          <w:szCs w:val="20"/>
+          <w:lang w:val="es-MX"/>
+        </w:rPr>
+        <w:t>Como: Administrador</w:t>
+      </w:r>
+    </w:p>
+    <w:p>
+      <w:pPr>
+        <w:rPr>
+          <w:rFonts w:ascii="Arial" w:eastAsiaTheme="minorHAnsi" w:hAnsi="Arial" w:cs="Arial"/>
+          <w:sz w:val="20"/>
+          <w:szCs w:val="20"/>
+          <w:lang w:val="es-MX"/>
+        </w:rPr>
+      </w:pPr>
+      <w:r>
+        <w:rPr>
+          <w:rFonts w:ascii="Arial" w:eastAsiaTheme="minorHAnsi" w:hAnsi="Arial" w:cs="Arial"/>
+          <w:sz w:val="20"/>
+          <w:szCs w:val="20"/>
+          <w:lang w:val="es-MX"/>
+        </w:rPr>
+        <w:t>Quiero: Poder editar los estados y descripciones de las propiedades que se encuentren en remodelaciones o con atracciones nuevas</w:t>
+      </w:r>
+    </w:p>
+    <w:p>
+      <w:pPr>
+        <w:rPr>
+          <w:rFonts w:ascii="Arial" w:eastAsiaTheme="minorHAnsi" w:hAnsi="Arial" w:cs="Arial"/>
+          <w:sz w:val="20"/>
+          <w:szCs w:val="20"/>
+          <w:lang w:val="es-MX"/>
+        </w:rPr>
+      </w:pPr>
+      <w:r>
+        <w:rPr>
+          <w:rFonts w:ascii="Arial" w:eastAsiaTheme="minorHAnsi" w:hAnsi="Arial" w:cs="Arial"/>
+          <w:sz w:val="20"/>
+          <w:szCs w:val="20"/>
+          <w:lang w:val="es-MX"/>
+        </w:rPr>
+        <w:t>Para: Que los nuevos usuarios sepa</w:t>
+      </w:r>
+      <w:r>
+        <w:rPr>
+          <w:rFonts w:ascii="Arial" w:eastAsiaTheme="minorHAnsi" w:hAnsi="Arial" w:cs="Arial"/>
+          <w:sz w:val="20"/>
+          <w:szCs w:val="20"/>
+          <w:lang w:val="es-MX"/>
+        </w:rPr>
+        <w:t>n de las nuevas características que poseen las propiedades</w:t>
+      </w:r>
+    </w:p>
+    <w:p>
+      <w:pPr>
+        <w:spacing w:before="100" w:beforeAutospacing="1" w:after="100" w:afterAutospacing="1" w:line="240" w:lineRule="auto"/>
+        <w:rPr>
+          <w:rFonts w:ascii="Arial" w:eastAsia="Times New Roman" w:hAnsi="Arial" w:cs="Arial"/>
+          <w:sz w:val="24"/>
+          <w:szCs w:val="24"/>
+          <w:lang w:eastAsia="es-GT"/>
+        </w:rPr>
+      </w:pPr>
+    </w:p>
+    <w:p>
+      <w:pPr>
+        <w:rPr>
+          <w:rFonts w:ascii="Arial" w:eastAsiaTheme="minorHAnsi" w:hAnsi="Arial" w:cs="Arial"/>
+          <w:b/>
+          <w:bCs/>
+          <w:lang w:val="es-MX"/>
+        </w:rPr>
+      </w:pPr>
+      <w:r>
+        <w:rPr>
+          <w:rFonts w:ascii="Arial" w:eastAsiaTheme="minorHAnsi" w:hAnsi="Arial" w:cs="Arial"/>
+          <w:b/>
+          <w:bCs/>
+          <w:lang w:val="es-MX"/>
+        </w:rPr>
+        <w:t>Tupla: Locación</w:t>
+      </w:r>
+    </w:p>
+    <w:p>
+      <w:pPr>
+        <w:rPr>
+          <w:rFonts w:ascii="Arial" w:eastAsiaTheme="minorHAnsi" w:hAnsi="Arial" w:cs="Arial"/>
+          <w:b/>
+          <w:bCs/>
+          <w:lang w:val="es-MX"/>
+        </w:rPr>
+      </w:pPr>
+      <w:r>
+        <w:rPr>
+          <w:rFonts w:ascii="Arial" w:eastAsiaTheme="minorHAnsi" w:hAnsi="Arial" w:cs="Arial"/>
+          <w:b/>
+          <w:bCs/>
+          <w:lang w:val="es-MX"/>
+        </w:rPr>
+        <w:t>HUAP-022 - Actualizar información de la locación</w:t>
+      </w:r>
+    </w:p>
+    <w:p>
+      <w:pPr>
+        <w:spacing w:before="100" w:beforeAutospacing="1" w:after="100" w:afterAutospacing="1" w:line="240" w:lineRule="auto"/>
+        <w:rPr>
+          <w:rFonts w:ascii="Arial" w:eastAsiaTheme="minorHAnsi" w:hAnsi="Arial" w:cs="Arial"/>
+          <w:sz w:val="20"/>
+          <w:szCs w:val="20"/>
+          <w:lang w:val="es-MX"/>
+        </w:rPr>
+      </w:pPr>
+      <w:r>
+        <w:rPr>
+          <w:rFonts w:ascii="Arial" w:eastAsiaTheme="minorHAnsi" w:hAnsi="Arial" w:cs="Arial"/>
+          <w:sz w:val="20"/>
+          <w:szCs w:val="20"/>
+          <w:lang w:val="es-MX"/>
+        </w:rPr>
+        <w:t>Cómo: Locación</w:t>
+      </w:r>
+    </w:p>
+    <w:p>
+      <w:pPr>
+        <w:spacing w:before="100" w:beforeAutospacing="1" w:after="100" w:afterAutospacing="1" w:line="240" w:lineRule="auto"/>
+        <w:rPr>
+          <w:rFonts w:ascii="Arial" w:eastAsiaTheme="minorHAnsi" w:hAnsi="Arial" w:cs="Arial"/>
+          <w:sz w:val="20"/>
+          <w:szCs w:val="20"/>
+          <w:lang w:val="es-MX"/>
+        </w:rPr>
+      </w:pPr>
+      <w:r>
+        <w:rPr>
+          <w:rFonts w:ascii="Arial" w:eastAsiaTheme="minorHAnsi" w:hAnsi="Arial" w:cs="Arial"/>
+          <w:sz w:val="20"/>
+          <w:szCs w:val="20"/>
+          <w:lang w:val="es-MX"/>
+        </w:rPr>
+        <w:t>Quiero: Editar mis datos como dirección, descripción, y contacto</w:t>
+      </w:r>
+    </w:p>
+    <w:p>
+      <w:pPr>
+        <w:spacing w:before="100" w:beforeAutospacing="1" w:after="100" w:afterAutospacing="1" w:line="240" w:lineRule="auto"/>
+        <w:rPr>
+          <w:rFonts w:ascii="Arial" w:eastAsiaTheme="minorHAnsi" w:hAnsi="Arial" w:cs="Arial"/>
+          <w:sz w:val="20"/>
+          <w:szCs w:val="20"/>
+          <w:lang w:val="es-MX"/>
+        </w:rPr>
+      </w:pPr>
+      <w:r>
+        <w:rPr>
+          <w:rFonts w:ascii="Arial" w:eastAsiaTheme="minorHAnsi" w:hAnsi="Arial" w:cs="Arial"/>
+          <w:sz w:val="20"/>
+          <w:szCs w:val="20"/>
+          <w:lang w:val="es-MX"/>
+        </w:rPr>
+        <w:t>Para: Mantener mi información actualizada y brindar</w:t>
+      </w:r>
+      <w:r>
+        <w:rPr>
+          <w:rFonts w:ascii="Arial" w:eastAsiaTheme="minorHAnsi" w:hAnsi="Arial" w:cs="Arial"/>
+          <w:sz w:val="20"/>
+          <w:szCs w:val="20"/>
+          <w:lang w:val="es-MX"/>
+        </w:rPr>
+        <w:t xml:space="preserve"> datos correctos a los huéspedes</w:t>
+      </w:r>
+    </w:p>
+    <w:p>
+      <w:pPr>
+        <w:spacing w:before="100" w:beforeAutospacing="1" w:after="100" w:afterAutospacing="1" w:line="240" w:lineRule="auto"/>
+        <w:rPr>
+          <w:rFonts w:ascii="Arial" w:eastAsiaTheme="minorHAnsi" w:hAnsi="Arial" w:cs="Arial"/>
+          <w:sz w:val="20"/>
+          <w:szCs w:val="20"/>
+          <w:lang w:val="es-MX"/>
+        </w:rPr>
+      </w:pPr>
+    </w:p>
+    <w:p>
+      <w:pPr>
+        <w:rPr>
+          <w:rFonts w:ascii="Arial" w:eastAsiaTheme="minorHAnsi" w:hAnsi="Arial" w:cs="Arial"/>
+          <w:b/>
+          <w:bCs/>
+          <w:lang w:val="es-MX"/>
+        </w:rPr>
+      </w:pPr>
+      <w:r>
+        <w:rPr>
+          <w:rFonts w:ascii="Arial" w:eastAsiaTheme="minorHAnsi" w:hAnsi="Arial" w:cs="Arial"/>
+          <w:b/>
+          <w:bCs/>
+          <w:lang w:val="es-MX"/>
+        </w:rPr>
+        <w:t>HUAP-023 - Ver historial de reservas</w:t>
+      </w:r>
+    </w:p>
+    <w:p>
+      <w:pPr>
+        <w:spacing w:before="100" w:beforeAutospacing="1" w:after="100" w:afterAutospacing="1" w:line="240" w:lineRule="auto"/>
+        <w:rPr>
+          <w:rFonts w:ascii="Arial" w:eastAsiaTheme="minorHAnsi" w:hAnsi="Arial" w:cs="Arial"/>
+          <w:sz w:val="20"/>
+          <w:szCs w:val="20"/>
+          <w:lang w:val="es-MX"/>
+        </w:rPr>
+      </w:pPr>
+      <w:r>
+        <w:rPr>
+          <w:rFonts w:ascii="Arial" w:eastAsiaTheme="minorHAnsi" w:hAnsi="Arial" w:cs="Arial"/>
+          <w:sz w:val="20"/>
+          <w:szCs w:val="20"/>
+          <w:lang w:val="es-MX"/>
+        </w:rPr>
+        <w:t>Cómo: Locación</w:t>
+      </w:r>
+    </w:p>
+    <w:p>
+      <w:pPr>
+        <w:spacing w:before="100" w:beforeAutospacing="1" w:after="100" w:afterAutospacing="1" w:line="240" w:lineRule="auto"/>
+        <w:rPr>
+          <w:rFonts w:ascii="Arial" w:eastAsiaTheme="minorHAnsi" w:hAnsi="Arial" w:cs="Arial"/>
+          <w:sz w:val="20"/>
+          <w:szCs w:val="20"/>
+          <w:lang w:val="es-MX"/>
+        </w:rPr>
+      </w:pPr>
+      <w:r>
+        <w:rPr>
+          <w:rFonts w:ascii="Arial" w:eastAsiaTheme="minorHAnsi" w:hAnsi="Arial" w:cs="Arial"/>
+          <w:sz w:val="20"/>
+          <w:szCs w:val="20"/>
+          <w:lang w:val="es-MX"/>
+        </w:rPr>
+        <w:t>Quiero: Consultar las reservas que se han realizado en mi espacio</w:t>
+      </w:r>
+    </w:p>
+    <w:p>
+      <w:pPr>
+        <w:spacing w:before="100" w:beforeAutospacing="1" w:after="100" w:afterAutospacing="1" w:line="240" w:lineRule="auto"/>
+        <w:rPr>
+          <w:rFonts w:ascii="Arial" w:eastAsiaTheme="minorHAnsi" w:hAnsi="Arial" w:cs="Arial"/>
+          <w:sz w:val="20"/>
+          <w:szCs w:val="20"/>
+          <w:lang w:val="es-MX"/>
+        </w:rPr>
+      </w:pPr>
+      <w:r>
+        <w:rPr>
+          <w:rFonts w:ascii="Arial" w:eastAsiaTheme="minorHAnsi" w:hAnsi="Arial" w:cs="Arial"/>
+          <w:sz w:val="20"/>
+          <w:szCs w:val="20"/>
+          <w:lang w:val="es-MX"/>
+        </w:rPr>
+        <w:t>Para: Llevar un control de los huéspedes que me han visitado</w:t>
+      </w:r>
+    </w:p>
+    <w:p>
+      <w:pPr>
+        <w:spacing w:before="100" w:beforeAutospacing="1" w:after="100" w:afterAutospacing="1" w:line="240" w:lineRule="auto"/>
+        <w:rPr>
+          <w:rFonts w:ascii="Arial" w:eastAsiaTheme="minorHAnsi" w:hAnsi="Arial" w:cs="Arial"/>
+          <w:sz w:val="20"/>
+          <w:szCs w:val="20"/>
+          <w:lang w:val="es-MX"/>
+        </w:rPr>
+      </w:pPr>
+    </w:p>
+    <w:p>
+      <w:pPr>
+        <w:spacing w:before="100" w:beforeAutospacing="1" w:after="100" w:afterAutospacing="1" w:line="240" w:lineRule="auto"/>
+        <w:rPr>
+          <w:rFonts w:ascii="Arial" w:eastAsiaTheme="minorHAnsi" w:hAnsi="Arial" w:cs="Arial"/>
+          <w:sz w:val="20"/>
+          <w:szCs w:val="20"/>
+          <w:lang w:val="es-MX"/>
+        </w:rPr>
+      </w:pPr>
+      <w:r>
+        <w:rPr>
+          <w:rFonts w:ascii="Arial" w:eastAsiaTheme="minorHAnsi" w:hAnsi="Arial" w:cs="Arial"/>
+          <w:b/>
+          <w:bCs/>
+          <w:lang w:val="es-MX"/>
+        </w:rPr>
+        <w:t xml:space="preserve">HUJM-024 - Establecer horario de check-in </w:t>
+      </w:r>
+      <w:r>
+        <w:rPr>
+          <w:rFonts w:ascii="Arial" w:eastAsiaTheme="minorHAnsi" w:hAnsi="Arial" w:cs="Arial"/>
+          <w:b/>
+          <w:bCs/>
+          <w:lang w:val="es-MX"/>
+        </w:rPr>
+        <w:t>y del check-out</w:t>
+      </w:r>
+    </w:p>
+    <w:p>
+      <w:pPr>
+        <w:spacing w:before="100" w:beforeAutospacing="1" w:after="100" w:afterAutospacing="1" w:line="240" w:lineRule="auto"/>
+        <w:rPr>
+          <w:rFonts w:ascii="Arial" w:eastAsiaTheme="minorHAnsi" w:hAnsi="Arial" w:cs="Arial"/>
+          <w:sz w:val="20"/>
+          <w:szCs w:val="20"/>
+          <w:lang w:val="es-MX"/>
+        </w:rPr>
+      </w:pPr>
+      <w:r>
+        <w:rPr>
+          <w:rFonts w:ascii="Arial" w:eastAsiaTheme="minorHAnsi" w:hAnsi="Arial" w:cs="Arial"/>
+          <w:sz w:val="20"/>
+          <w:szCs w:val="20"/>
+          <w:lang w:val="es-MX"/>
+        </w:rPr>
+        <w:t>Cómo: Locación</w:t>
+      </w:r>
+    </w:p>
+    <w:p>
+      <w:pPr>
+        <w:spacing w:before="100" w:beforeAutospacing="1" w:after="100" w:afterAutospacing="1" w:line="240" w:lineRule="auto"/>
+        <w:rPr>
+          <w:rFonts w:ascii="Arial" w:eastAsiaTheme="minorHAnsi" w:hAnsi="Arial" w:cs="Arial"/>
+          <w:sz w:val="20"/>
+          <w:szCs w:val="20"/>
+          <w:lang w:val="es-MX"/>
+        </w:rPr>
+      </w:pPr>
+      <w:r>
+        <w:rPr>
+          <w:rFonts w:ascii="Arial" w:eastAsiaTheme="minorHAnsi" w:hAnsi="Arial" w:cs="Arial"/>
+          <w:sz w:val="20"/>
+          <w:szCs w:val="20"/>
+          <w:lang w:val="es-MX"/>
+        </w:rPr>
+        <w:t>Quiero: Definir un horario disponible para la llegada y salida de los huéspedes</w:t>
+      </w:r>
+    </w:p>
+    <w:p>
+      <w:pPr>
+        <w:spacing w:before="100" w:beforeAutospacing="1" w:after="100" w:afterAutospacing="1" w:line="240" w:lineRule="auto"/>
+        <w:rPr>
+          <w:rFonts w:ascii="Arial" w:eastAsiaTheme="minorHAnsi" w:hAnsi="Arial" w:cs="Arial"/>
+          <w:sz w:val="20"/>
+          <w:szCs w:val="20"/>
+          <w:lang w:val="es-MX"/>
+        </w:rPr>
+      </w:pPr>
+      <w:r>
+        <w:rPr>
+          <w:rFonts w:ascii="Arial" w:eastAsiaTheme="minorHAnsi" w:hAnsi="Arial" w:cs="Arial"/>
+          <w:sz w:val="20"/>
+          <w:szCs w:val="20"/>
+          <w:lang w:val="es-MX"/>
+        </w:rPr>
+        <w:t>Para: Asegurar que las estancias se organicen de forma eficiente y sin conflictos</w:t>
+      </w:r>
+    </w:p>
+    <w:p>
+      <w:pPr>
+        <w:spacing w:before="100" w:beforeAutospacing="1" w:after="100" w:afterAutospacing="1" w:line="240" w:lineRule="auto"/>
+        <w:rPr>
+          <w:rFonts w:ascii="Arial" w:eastAsiaTheme="minorHAnsi" w:hAnsi="Arial" w:cs="Arial"/>
+          <w:b/>
+          <w:bCs/>
+          <w:sz w:val="20"/>
+          <w:szCs w:val="20"/>
+          <w:lang w:val="es-MX"/>
+        </w:rPr>
+      </w:pPr>
+      <w:r>
+        <w:rPr>
+          <w:rFonts w:ascii="Arial" w:eastAsiaTheme="minorHAnsi" w:hAnsi="Arial" w:cs="Arial"/>
+          <w:b/>
+          <w:bCs/>
+          <w:sz w:val="20"/>
+          <w:szCs w:val="20"/>
+          <w:lang w:val="es-MX"/>
+        </w:rPr>
+        <w:t>Tupla: Soporte Técnico</w:t>
+      </w:r>
+    </w:p>
+    <w:p>
+      <w:pPr>
+        <w:pStyle w:val="paragraph"/>
+        <w:textAlignment w:val="baseline"/>
+        <w:rPr>
+          <w:rFonts w:ascii="Segoe UI" w:hAnsi="Segoe UI" w:cs="Segoe UI"/>
+          <w:b/>
+          <w:sz w:val="18"/>
+          <w:szCs w:val="18"/>
+        </w:rPr>
+      </w:pPr>
+      <w:r>
+        <w:rPr>
+          <w:rFonts w:ascii="Segoe UI" w:hAnsi="Segoe UI" w:cs="Segoe UI"/>
+          <w:b/>
+          <w:sz w:val="18"/>
+          <w:szCs w:val="18"/>
+        </w:rPr>
+        <w:t xml:space="preserve">HUAG-025: </w:t>
+      </w:r>
+    </w:p>
+    <w:p>
+      <w:pPr>
+        <w:pStyle w:val="paragraph"/>
+        <w:textAlignment w:val="baseline"/>
+        <w:rPr>
+          <w:rFonts w:ascii="Segoe UI" w:hAnsi="Segoe UI" w:cs="Segoe UI"/>
+          <w:sz w:val="18"/>
+          <w:szCs w:val="18"/>
+        </w:rPr>
+      </w:pPr>
+      <w:r>
+        <w:rPr>
+          <w:rFonts w:ascii="Segoe UI" w:hAnsi="Segoe UI" w:cs="Segoe UI"/>
+          <w:sz w:val="18"/>
+          <w:szCs w:val="18"/>
+        </w:rPr>
+        <w:t xml:space="preserve">Como huésped o anfitrión de </w:t>
+      </w:r>
+      <w:r>
+        <w:rPr>
+          <w:rFonts w:ascii="Segoe UI" w:hAnsi="Segoe UI" w:cs="Segoe UI"/>
+          <w:sz w:val="18"/>
+          <w:szCs w:val="18"/>
+        </w:rPr>
+        <w:t>Airbnb,</w:t>
+      </w:r>
+    </w:p>
+    <w:p>
+      <w:pPr>
+        <w:pStyle w:val="paragraph"/>
+        <w:textAlignment w:val="baseline"/>
+        <w:rPr>
+          <w:rFonts w:ascii="Segoe UI" w:hAnsi="Segoe UI" w:cs="Segoe UI"/>
+          <w:sz w:val="18"/>
+          <w:szCs w:val="18"/>
+        </w:rPr>
+      </w:pPr>
+      <w:r>
+        <w:rPr>
+          <w:rFonts w:ascii="Segoe UI" w:hAnsi="Segoe UI" w:cs="Segoe UI"/>
+          <w:sz w:val="18"/>
+          <w:szCs w:val="18"/>
+        </w:rPr>
+        <w:t>quiero poder contactar al soporte técnico rápidamente a través de un chat en la plataforma,</w:t>
+      </w:r>
+    </w:p>
+    <w:p>
+      <w:pPr>
+        <w:pStyle w:val="paragraph"/>
+        <w:spacing w:before="0" w:beforeAutospacing="0" w:after="0" w:afterAutospacing="0"/>
+        <w:textAlignment w:val="baseline"/>
+        <w:rPr>
+          <w:rFonts w:ascii="Segoe UI" w:hAnsi="Segoe UI" w:cs="Segoe UI"/>
+          <w:sz w:val="18"/>
+          <w:szCs w:val="18"/>
+        </w:rPr>
+      </w:pPr>
+      <w:r>
+        <w:rPr>
+          <w:rFonts w:ascii="Segoe UI" w:hAnsi="Segoe UI" w:cs="Segoe UI"/>
+          <w:sz w:val="18"/>
+          <w:szCs w:val="18"/>
+        </w:rPr>
+        <w:t>para poder resolver problemas técnicos como errores de reserva, pagos fallidos o problemas con mi cuenta de forma eficiente.</w:t>
+      </w:r>
+    </w:p>
+    <w:p>
+      <w:pPr>
+        <w:pStyle w:val="paragraph"/>
+        <w:spacing w:before="0" w:beforeAutospacing="0" w:after="0" w:afterAutospacing="0"/>
+        <w:textAlignment w:val="baseline"/>
+        <w:rPr>
+          <w:rFonts w:ascii="Segoe UI" w:hAnsi="Segoe UI" w:cs="Segoe UI"/>
+          <w:sz w:val="18"/>
+          <w:szCs w:val="18"/>
+        </w:rPr>
+      </w:pPr>
+    </w:p>
+    <w:p>
+      <w:pPr>
+        <w:pStyle w:val="paragraph"/>
+        <w:textAlignment w:val="baseline"/>
+        <w:rPr>
+          <w:rFonts w:ascii="Segoe UI" w:hAnsi="Segoe UI" w:cs="Segoe UI"/>
+          <w:b/>
+          <w:sz w:val="18"/>
+          <w:szCs w:val="18"/>
+        </w:rPr>
+      </w:pPr>
+      <w:r>
+        <w:rPr>
+          <w:rFonts w:ascii="Segoe UI" w:hAnsi="Segoe UI" w:cs="Segoe UI"/>
+          <w:b/>
+          <w:sz w:val="18"/>
+          <w:szCs w:val="18"/>
+        </w:rPr>
+        <w:t>HUAG-026:</w:t>
+      </w:r>
+    </w:p>
+    <w:p>
+      <w:pPr>
+        <w:pStyle w:val="paragraph"/>
+        <w:textAlignment w:val="baseline"/>
+        <w:rPr>
+          <w:rFonts w:ascii="Segoe UI" w:hAnsi="Segoe UI" w:cs="Segoe UI"/>
+          <w:sz w:val="18"/>
+          <w:szCs w:val="18"/>
+        </w:rPr>
+      </w:pPr>
+      <w:r>
+        <w:rPr>
+          <w:rFonts w:ascii="Segoe UI" w:hAnsi="Segoe UI" w:cs="Segoe UI"/>
+          <w:sz w:val="18"/>
+          <w:szCs w:val="18"/>
+        </w:rPr>
+        <w:t xml:space="preserve">Como técnico de </w:t>
+      </w:r>
+      <w:r>
+        <w:rPr>
+          <w:rFonts w:ascii="Segoe UI" w:hAnsi="Segoe UI" w:cs="Segoe UI"/>
+          <w:sz w:val="18"/>
+          <w:szCs w:val="18"/>
+        </w:rPr>
+        <w:t>soporte,</w:t>
+      </w:r>
+    </w:p>
+    <w:p>
+      <w:pPr>
+        <w:pStyle w:val="paragraph"/>
+        <w:textAlignment w:val="baseline"/>
+        <w:rPr>
+          <w:rFonts w:ascii="Segoe UI" w:hAnsi="Segoe UI" w:cs="Segoe UI"/>
+          <w:sz w:val="18"/>
+          <w:szCs w:val="18"/>
+        </w:rPr>
+      </w:pPr>
+      <w:r>
+        <w:rPr>
+          <w:rFonts w:ascii="Segoe UI" w:hAnsi="Segoe UI" w:cs="Segoe UI"/>
+          <w:sz w:val="18"/>
+          <w:szCs w:val="18"/>
+        </w:rPr>
+        <w:t>quiero ver una lista de tickets pendientes y asignarme uno,</w:t>
+      </w:r>
+    </w:p>
+    <w:p>
+      <w:pPr>
+        <w:pStyle w:val="paragraph"/>
+        <w:spacing w:before="0" w:beforeAutospacing="0" w:after="0" w:afterAutospacing="0"/>
+        <w:textAlignment w:val="baseline"/>
+        <w:rPr>
+          <w:rFonts w:ascii="Segoe UI" w:hAnsi="Segoe UI" w:cs="Segoe UI"/>
+          <w:sz w:val="18"/>
+          <w:szCs w:val="18"/>
+        </w:rPr>
+      </w:pPr>
+      <w:r>
+        <w:rPr>
+          <w:rFonts w:ascii="Segoe UI" w:hAnsi="Segoe UI" w:cs="Segoe UI"/>
+          <w:sz w:val="18"/>
+          <w:szCs w:val="18"/>
+        </w:rPr>
+        <w:t>para poder empezar a resolverlo de forma organizada.</w:t>
+      </w:r>
+    </w:p>
+    <w:p>
+      <w:pPr>
+        <w:pStyle w:val="paragraph"/>
+        <w:spacing w:before="0" w:beforeAutospacing="0" w:after="0" w:afterAutospacing="0"/>
+        <w:textAlignment w:val="baseline"/>
+        <w:rPr>
+          <w:rFonts w:ascii="Segoe UI" w:hAnsi="Segoe UI" w:cs="Segoe UI"/>
+          <w:sz w:val="18"/>
+          <w:szCs w:val="18"/>
+        </w:rPr>
+      </w:pPr>
+    </w:p>
+    <w:p>
+      <w:pPr>
+        <w:pStyle w:val="paragraph"/>
+        <w:textAlignment w:val="baseline"/>
+        <w:rPr>
+          <w:rFonts w:ascii="Segoe UI" w:hAnsi="Segoe UI" w:cs="Segoe UI"/>
+          <w:b/>
+          <w:sz w:val="18"/>
+          <w:szCs w:val="18"/>
+        </w:rPr>
+      </w:pPr>
+      <w:r>
+        <w:rPr>
+          <w:rFonts w:ascii="Segoe UI" w:hAnsi="Segoe UI" w:cs="Segoe UI"/>
+          <w:b/>
+          <w:sz w:val="18"/>
+          <w:szCs w:val="18"/>
+        </w:rPr>
+        <w:t>HUAG-027:</w:t>
+      </w:r>
+    </w:p>
+    <w:p>
+      <w:pPr>
+        <w:pStyle w:val="paragraph"/>
+        <w:textAlignment w:val="baseline"/>
+        <w:rPr>
+          <w:rFonts w:ascii="Segoe UI" w:hAnsi="Segoe UI" w:cs="Segoe UI"/>
+          <w:sz w:val="18"/>
+          <w:szCs w:val="18"/>
+        </w:rPr>
+      </w:pPr>
+      <w:r>
+        <w:rPr>
+          <w:rFonts w:ascii="Segoe UI" w:hAnsi="Segoe UI" w:cs="Segoe UI"/>
+          <w:sz w:val="18"/>
+          <w:szCs w:val="18"/>
+        </w:rPr>
+        <w:t>Como administrador de soporte,</w:t>
+      </w:r>
+    </w:p>
+    <w:p>
+      <w:pPr>
+        <w:pStyle w:val="paragraph"/>
+        <w:textAlignment w:val="baseline"/>
+        <w:rPr>
+          <w:rFonts w:ascii="Segoe UI" w:hAnsi="Segoe UI" w:cs="Segoe UI"/>
+          <w:sz w:val="18"/>
+          <w:szCs w:val="18"/>
+        </w:rPr>
+      </w:pPr>
+      <w:r>
+        <w:rPr>
+          <w:rFonts w:ascii="Segoe UI" w:hAnsi="Segoe UI" w:cs="Segoe UI"/>
+          <w:sz w:val="18"/>
+          <w:szCs w:val="18"/>
+        </w:rPr>
+        <w:t>quiero poder hacer seguimiento al estado de cada ticket (pendiente, en proceso, resuelto),</w:t>
+      </w:r>
+    </w:p>
+    <w:p>
+      <w:pPr>
+        <w:pStyle w:val="paragraph"/>
+        <w:spacing w:before="0" w:beforeAutospacing="0" w:after="0" w:afterAutospacing="0"/>
+        <w:textAlignment w:val="baseline"/>
+        <w:rPr>
+          <w:rFonts w:ascii="Segoe UI" w:hAnsi="Segoe UI" w:cs="Segoe UI"/>
+          <w:sz w:val="18"/>
+          <w:szCs w:val="18"/>
+        </w:rPr>
+      </w:pPr>
+      <w:r>
+        <w:rPr>
+          <w:rFonts w:ascii="Segoe UI" w:hAnsi="Segoe UI" w:cs="Segoe UI"/>
+          <w:sz w:val="18"/>
+          <w:szCs w:val="18"/>
+        </w:rPr>
+        <w:t>p</w:t>
+      </w:r>
+      <w:r>
+        <w:rPr>
+          <w:rFonts w:ascii="Segoe UI" w:hAnsi="Segoe UI" w:cs="Segoe UI"/>
+          <w:sz w:val="18"/>
+          <w:szCs w:val="18"/>
+        </w:rPr>
+        <w:t>ara asegurarme de que los problemas se están resolviendo eficientemente.</w:t>
+      </w:r>
+    </w:p>
+    <w:p>
+      <w:pPr>
+        <w:pStyle w:val="paragraph"/>
+        <w:spacing w:before="0" w:beforeAutospacing="0" w:after="0" w:afterAutospacing="0"/>
+        <w:textAlignment w:val="baseline"/>
+        <w:rPr>
+          <w:rFonts w:ascii="Segoe UI" w:hAnsi="Segoe UI" w:cs="Segoe UI"/>
+          <w:sz w:val="18"/>
+          <w:szCs w:val="18"/>
+        </w:rPr>
+      </w:pPr>
+    </w:p>
+    <w:p>
+      <w:pPr>
+        <w:pStyle w:val="paragraph"/>
+        <w:spacing w:before="0" w:beforeAutospacing="0" w:after="0" w:afterAutospacing="0"/>
+        <w:textAlignment w:val="baseline"/>
+        <w:rPr>
+          <w:rFonts w:ascii="Segoe UI" w:hAnsi="Segoe UI" w:cs="Segoe UI"/>
+          <w:b/>
+          <w:bCs/>
+          <w:sz w:val="20"/>
+          <w:szCs w:val="20"/>
+        </w:rPr>
+      </w:pPr>
+      <w:r>
+        <w:rPr>
+          <w:rFonts w:ascii="Segoe UI" w:hAnsi="Segoe UI" w:cs="Segoe UI"/>
+          <w:b/>
+          <w:bCs/>
+          <w:sz w:val="20"/>
+          <w:szCs w:val="20"/>
+        </w:rPr>
+        <w:t xml:space="preserve">Tupla: Empleados </w:t>
+      </w:r>
+    </w:p>
+    <w:p>
+      <w:pPr>
+        <w:pStyle w:val="paragraph"/>
+        <w:spacing w:before="0" w:beforeAutospacing="0" w:after="0" w:afterAutospacing="0"/>
+        <w:textAlignment w:val="baseline"/>
+        <w:rPr>
+          <w:rFonts w:ascii="Segoe UI" w:hAnsi="Segoe UI" w:cs="Segoe UI"/>
+          <w:b/>
+          <w:bCs/>
+          <w:sz w:val="20"/>
+          <w:szCs w:val="20"/>
+        </w:rPr>
+      </w:pPr>
+    </w:p>
+    <w:p>
+      <w:pPr>
+        <w:pStyle w:val="paragraph"/>
+        <w:spacing w:before="0" w:beforeAutospacing="0" w:after="0" w:afterAutospacing="0" w:line="480" w:lineRule="auto"/>
+        <w:textAlignment w:val="baseline"/>
+        <w:rPr>
+          <w:rFonts w:ascii="Segoe UI" w:hAnsi="Segoe UI" w:cs="Segoe UI"/>
+          <w:sz w:val="18"/>
+          <w:szCs w:val="18"/>
+        </w:rPr>
+      </w:pPr>
+      <w:r>
+        <w:rPr>
+          <w:rFonts w:ascii="Segoe UI" w:hAnsi="Segoe UI" w:cs="Segoe UI"/>
+          <w:b/>
+          <w:bCs/>
+          <w:sz w:val="18"/>
+          <w:szCs w:val="18"/>
+        </w:rPr>
+        <w:t>HUFP-028</w:t>
+      </w:r>
+      <w:r>
+        <w:rPr>
+          <w:rFonts w:ascii="Segoe UI" w:hAnsi="Segoe UI" w:cs="Segoe UI"/>
+          <w:sz w:val="18"/>
+          <w:szCs w:val="18"/>
+        </w:rPr>
+        <w:t xml:space="preserve"> </w:t>
+      </w:r>
+    </w:p>
+    <w:p>
+      <w:pPr>
+        <w:pStyle w:val="paragraph"/>
+        <w:spacing w:before="0" w:beforeAutospacing="0" w:after="0" w:afterAutospacing="0" w:line="480" w:lineRule="auto"/>
+        <w:textAlignment w:val="baseline"/>
+        <w:rPr>
+          <w:rFonts w:ascii="Segoe UI" w:hAnsi="Segoe UI" w:cs="Segoe UI"/>
+          <w:sz w:val="18"/>
+          <w:szCs w:val="18"/>
+        </w:rPr>
+      </w:pPr>
+      <w:r>
+        <w:rPr>
+          <w:rFonts w:ascii="Segoe UI" w:hAnsi="Segoe UI" w:cs="Segoe UI"/>
+          <w:sz w:val="18"/>
+          <w:szCs w:val="18"/>
+        </w:rPr>
+        <w:t xml:space="preserve">Lista de los empleados </w:t>
+      </w:r>
+    </w:p>
+    <w:p>
+      <w:pPr>
+        <w:pStyle w:val="paragraph"/>
+        <w:spacing w:before="0" w:beforeAutospacing="0" w:after="0" w:afterAutospacing="0" w:line="480" w:lineRule="auto"/>
+        <w:textAlignment w:val="baseline"/>
+        <w:rPr>
+          <w:rFonts w:ascii="Segoe UI" w:hAnsi="Segoe UI" w:cs="Segoe UI"/>
+          <w:sz w:val="18"/>
+          <w:szCs w:val="18"/>
+        </w:rPr>
+      </w:pPr>
+      <w:r>
+        <w:rPr>
+          <w:rFonts w:ascii="Segoe UI" w:hAnsi="Segoe UI" w:cs="Segoe UI"/>
+          <w:sz w:val="18"/>
+          <w:szCs w:val="18"/>
+        </w:rPr>
+        <w:t xml:space="preserve">Como: Administrador de recursos humanos </w:t>
+      </w:r>
+    </w:p>
+    <w:p>
+      <w:pPr>
+        <w:pStyle w:val="paragraph"/>
+        <w:spacing w:before="0" w:beforeAutospacing="0" w:after="0" w:afterAutospacing="0" w:line="480" w:lineRule="auto"/>
+        <w:textAlignment w:val="baseline"/>
+        <w:rPr>
+          <w:rFonts w:ascii="Segoe UI" w:hAnsi="Segoe UI" w:cs="Segoe UI"/>
+          <w:sz w:val="18"/>
+          <w:szCs w:val="18"/>
+        </w:rPr>
+      </w:pPr>
+      <w:r>
+        <w:rPr>
+          <w:rFonts w:ascii="Segoe UI" w:hAnsi="Segoe UI" w:cs="Segoe UI"/>
+          <w:sz w:val="18"/>
+          <w:szCs w:val="18"/>
+        </w:rPr>
+        <w:t xml:space="preserve">Quiero: Poder ver una lista de empleados activos </w:t>
+      </w:r>
+    </w:p>
+    <w:p>
+      <w:pPr>
+        <w:pStyle w:val="paragraph"/>
+        <w:spacing w:before="0" w:beforeAutospacing="0" w:after="0" w:afterAutospacing="0" w:line="480" w:lineRule="auto"/>
+        <w:textAlignment w:val="baseline"/>
+        <w:rPr>
+          <w:rFonts w:ascii="Segoe UI" w:hAnsi="Segoe UI" w:cs="Segoe UI"/>
+          <w:sz w:val="18"/>
+          <w:szCs w:val="18"/>
+        </w:rPr>
+      </w:pPr>
+      <w:r>
+        <w:rPr>
+          <w:rFonts w:ascii="Segoe UI" w:hAnsi="Segoe UI" w:cs="Segoe UI"/>
+          <w:sz w:val="18"/>
+          <w:szCs w:val="18"/>
+        </w:rPr>
+        <w:t>Para: Poder gestionar de manera eficie</w:t>
+      </w:r>
+      <w:r>
+        <w:rPr>
+          <w:rFonts w:ascii="Segoe UI" w:hAnsi="Segoe UI" w:cs="Segoe UI"/>
+          <w:sz w:val="18"/>
+          <w:szCs w:val="18"/>
+        </w:rPr>
+        <w:t>nte los recursos y asegurarme de que solo los empleados vigentes están siendo considerados en los procesos internos.</w:t>
+      </w:r>
+    </w:p>
+    <w:p>
+      <w:pPr>
+        <w:pStyle w:val="paragraph"/>
+        <w:spacing w:before="0" w:beforeAutospacing="0" w:after="0" w:afterAutospacing="0" w:line="480" w:lineRule="auto"/>
+        <w:textAlignment w:val="baseline"/>
+        <w:rPr>
+          <w:rFonts w:ascii="Segoe UI" w:hAnsi="Segoe UI" w:cs="Segoe UI"/>
+          <w:b/>
+          <w:bCs/>
+          <w:sz w:val="18"/>
+          <w:szCs w:val="18"/>
+        </w:rPr>
+      </w:pPr>
+      <w:r>
+        <w:rPr>
+          <w:rFonts w:ascii="Segoe UI" w:hAnsi="Segoe UI" w:cs="Segoe UI"/>
+          <w:b/>
+          <w:bCs/>
+          <w:sz w:val="18"/>
+          <w:szCs w:val="18"/>
+        </w:rPr>
+        <w:t xml:space="preserve">HUFP-029: Registro de nuevos empleados </w:t>
+      </w:r>
+    </w:p>
+    <w:p>
+      <w:pPr>
+        <w:pStyle w:val="paragraph"/>
+        <w:spacing w:before="0" w:beforeAutospacing="0" w:after="0" w:afterAutospacing="0" w:line="480" w:lineRule="auto"/>
+        <w:textAlignment w:val="baseline"/>
+        <w:rPr>
+          <w:rFonts w:ascii="Segoe UI" w:hAnsi="Segoe UI" w:cs="Segoe UI"/>
+          <w:sz w:val="18"/>
+          <w:szCs w:val="18"/>
+        </w:rPr>
+      </w:pPr>
+      <w:r>
+        <w:rPr>
+          <w:rFonts w:ascii="Segoe UI" w:hAnsi="Segoe UI" w:cs="Segoe UI"/>
+          <w:sz w:val="18"/>
+          <w:szCs w:val="18"/>
+        </w:rPr>
+        <w:t xml:space="preserve">Como: Responsable de contratación </w:t>
+      </w:r>
+    </w:p>
+    <w:p>
+      <w:pPr>
+        <w:pStyle w:val="paragraph"/>
+        <w:spacing w:before="0" w:beforeAutospacing="0" w:after="0" w:afterAutospacing="0" w:line="480" w:lineRule="auto"/>
+        <w:textAlignment w:val="baseline"/>
+        <w:rPr>
+          <w:rFonts w:ascii="Segoe UI" w:hAnsi="Segoe UI" w:cs="Segoe UI"/>
+          <w:sz w:val="18"/>
+          <w:szCs w:val="18"/>
+        </w:rPr>
+      </w:pPr>
+      <w:r>
+        <w:rPr>
+          <w:rFonts w:ascii="Segoe UI" w:hAnsi="Segoe UI" w:cs="Segoe UI"/>
+          <w:sz w:val="18"/>
+          <w:szCs w:val="18"/>
+        </w:rPr>
+        <w:t>Quiero: Poder agregar nuevos empleados con su información (nombr</w:t>
+      </w:r>
+      <w:r>
+        <w:rPr>
+          <w:rFonts w:ascii="Segoe UI" w:hAnsi="Segoe UI" w:cs="Segoe UI"/>
+          <w:sz w:val="18"/>
+          <w:szCs w:val="18"/>
+        </w:rPr>
+        <w:t xml:space="preserve">e, apellido, correo, teléfono, cargo, fecha de contratación) </w:t>
+      </w:r>
+    </w:p>
+    <w:p>
+      <w:pPr>
+        <w:pStyle w:val="paragraph"/>
+        <w:spacing w:before="0" w:beforeAutospacing="0" w:after="0" w:afterAutospacing="0" w:line="480" w:lineRule="auto"/>
+        <w:textAlignment w:val="baseline"/>
+        <w:rPr>
+          <w:rFonts w:ascii="Segoe UI" w:hAnsi="Segoe UI" w:cs="Segoe UI"/>
+          <w:sz w:val="18"/>
+          <w:szCs w:val="18"/>
+        </w:rPr>
+      </w:pPr>
+      <w:r>
+        <w:rPr>
+          <w:rFonts w:ascii="Segoe UI" w:hAnsi="Segoe UI" w:cs="Segoe UI"/>
+          <w:sz w:val="18"/>
+          <w:szCs w:val="18"/>
+        </w:rPr>
+        <w:t>Para: Mantener la base de datos actualizada y asegurarme de que se realice un registro adecuado y completo de todos los empleados nuevos.</w:t>
+      </w:r>
+    </w:p>
+    <w:p>
+      <w:pPr>
+        <w:pStyle w:val="paragraph"/>
+        <w:spacing w:before="0" w:beforeAutospacing="0" w:after="0" w:afterAutospacing="0" w:line="480" w:lineRule="auto"/>
+        <w:textAlignment w:val="baseline"/>
+        <w:rPr>
+          <w:rFonts w:ascii="Segoe UI" w:hAnsi="Segoe UI" w:cs="Segoe UI"/>
+          <w:b/>
+          <w:bCs/>
+          <w:sz w:val="20"/>
+          <w:szCs w:val="20"/>
+        </w:rPr>
+      </w:pPr>
+      <w:r>
+        <w:rPr>
+          <w:rFonts w:ascii="Segoe UI" w:hAnsi="Segoe UI" w:cs="Segoe UI"/>
+          <w:b/>
+          <w:bCs/>
+          <w:sz w:val="20"/>
+          <w:szCs w:val="20"/>
+        </w:rPr>
+        <w:t xml:space="preserve">HUFP-030: Actualización de la información del empleado </w:t>
+      </w:r>
+    </w:p>
+    <w:p>
+      <w:pPr>
+        <w:pStyle w:val="paragraph"/>
+        <w:spacing w:before="0" w:beforeAutospacing="0" w:after="0" w:afterAutospacing="0" w:line="480" w:lineRule="auto"/>
+        <w:textAlignment w:val="baseline"/>
+        <w:rPr>
+          <w:rFonts w:ascii="Segoe UI" w:hAnsi="Segoe UI" w:cs="Segoe UI"/>
+          <w:sz w:val="18"/>
+          <w:szCs w:val="18"/>
+        </w:rPr>
+      </w:pPr>
+      <w:r>
+        <w:rPr>
+          <w:rFonts w:ascii="Segoe UI" w:hAnsi="Segoe UI" w:cs="Segoe UI"/>
+          <w:sz w:val="18"/>
+          <w:szCs w:val="18"/>
+        </w:rPr>
+        <w:t xml:space="preserve">Como: Gerente de departamento </w:t>
+      </w:r>
+    </w:p>
+    <w:p>
+      <w:pPr>
+        <w:pStyle w:val="paragraph"/>
+        <w:spacing w:before="0" w:beforeAutospacing="0" w:after="0" w:afterAutospacing="0" w:line="480" w:lineRule="auto"/>
+        <w:textAlignment w:val="baseline"/>
+        <w:rPr>
+          <w:rFonts w:ascii="Segoe UI" w:hAnsi="Segoe UI" w:cs="Segoe UI"/>
+          <w:sz w:val="18"/>
+          <w:szCs w:val="18"/>
+        </w:rPr>
+      </w:pPr>
+      <w:r>
+        <w:rPr>
+          <w:rFonts w:ascii="Segoe UI" w:hAnsi="Segoe UI" w:cs="Segoe UI"/>
+          <w:sz w:val="18"/>
+          <w:szCs w:val="18"/>
+        </w:rPr>
+        <w:t xml:space="preserve">Quiero: Poder actualizar la información de los empleados (cargo, teléfono, correo) </w:t>
+      </w:r>
+    </w:p>
+    <w:p>
+      <w:pPr>
+        <w:pStyle w:val="paragraph"/>
+        <w:spacing w:before="0" w:beforeAutospacing="0" w:after="0" w:afterAutospacing="0" w:line="480" w:lineRule="auto"/>
+        <w:textAlignment w:val="baseline"/>
+        <w:rPr>
+          <w:rFonts w:ascii="Segoe UI" w:hAnsi="Segoe UI" w:cs="Segoe UI"/>
+          <w:sz w:val="18"/>
+          <w:szCs w:val="18"/>
+        </w:rPr>
+      </w:pPr>
+      <w:r>
+        <w:rPr>
+          <w:rFonts w:ascii="Segoe UI" w:hAnsi="Segoe UI" w:cs="Segoe UI"/>
+          <w:sz w:val="18"/>
+          <w:szCs w:val="18"/>
+        </w:rPr>
+        <w:t>Para: Asegurarme de que la base de datos siempre refleje la información más actual y optimizar la comunicación dentro del equipo.</w:t>
+      </w:r>
+    </w:p>
+    <w:p>
+      <w:pPr>
+        <w:pStyle w:val="paragraph"/>
+        <w:spacing w:before="0" w:beforeAutospacing="0" w:after="0" w:afterAutospacing="0"/>
+        <w:textAlignment w:val="baseline"/>
+        <w:rPr>
+          <w:rFonts w:ascii="Segoe UI" w:hAnsi="Segoe UI" w:cs="Segoe UI"/>
+          <w:sz w:val="18"/>
+          <w:szCs w:val="18"/>
+        </w:rPr>
+      </w:pPr>
+    </w:p>
+    <w:p>
+      <w:pPr>
+        <w:spacing w:before="100" w:beforeAutospacing="1" w:after="100" w:afterAutospacing="1" w:line="240" w:lineRule="auto"/>
+        <w:rPr>
+          <w:rFonts w:ascii="Arial" w:eastAsiaTheme="minorHAnsi" w:hAnsi="Arial" w:cs="Arial"/>
+          <w:b/>
+          <w:sz w:val="20"/>
+          <w:szCs w:val="20"/>
+          <w:lang w:val="es-MX"/>
+        </w:rPr>
+      </w:pPr>
+      <w:r>
+        <w:rPr>
+          <w:rFonts w:ascii="Arial" w:eastAsiaTheme="minorHAnsi" w:hAnsi="Arial" w:cs="Arial"/>
+          <w:b/>
+          <w:sz w:val="20"/>
+          <w:szCs w:val="20"/>
+          <w:lang w:val="es-MX"/>
+        </w:rPr>
+        <w:t xml:space="preserve">Tupla : </w:t>
+      </w:r>
+      <w:r>
+        <w:rPr>
+          <w:rFonts w:ascii="Arial" w:eastAsiaTheme="minorHAnsi" w:hAnsi="Arial" w:cs="Arial"/>
+          <w:b/>
+          <w:sz w:val="20"/>
+          <w:szCs w:val="20"/>
+          <w:lang w:val="es-MX"/>
+        </w:rPr>
+        <w:t>Reserva</w:t>
+      </w:r>
+    </w:p>
+    <w:p>
+      <w:pPr>
+        <w:spacing w:before="100" w:beforeAutospacing="1" w:after="100" w:afterAutospacing="1" w:line="240" w:lineRule="auto"/>
+        <w:rPr>
+          <w:rFonts w:ascii="Arial" w:eastAsiaTheme="minorHAnsi" w:hAnsi="Arial" w:cs="Arial"/>
+          <w:sz w:val="20"/>
+          <w:szCs w:val="20"/>
+          <w:lang w:val="es-MX"/>
+        </w:rPr>
+      </w:pPr>
+      <w:r>
+        <w:rPr>
+          <w:rFonts w:ascii="Arial" w:eastAsiaTheme="minorHAnsi" w:hAnsi="Arial" w:cs="Arial"/>
+          <w:sz w:val="20"/>
+          <w:szCs w:val="20"/>
+          <w:lang w:val="es-MX"/>
+        </w:rPr>
+        <w:t>HUCP-031 Realizar Nueva Reserva</w:t>
+      </w:r>
+    </w:p>
+    <w:p>
+      <w:pPr>
+        <w:spacing w:before="100" w:beforeAutospacing="1" w:after="100" w:afterAutospacing="1" w:line="240" w:lineRule="auto"/>
+        <w:rPr>
+          <w:rFonts w:ascii="Arial" w:eastAsiaTheme="minorHAnsi" w:hAnsi="Arial" w:cs="Arial"/>
+          <w:sz w:val="20"/>
+          <w:szCs w:val="20"/>
+          <w:lang w:val="es-MX"/>
+        </w:rPr>
+      </w:pPr>
+      <w:r>
+        <w:rPr>
+          <w:rFonts w:ascii="Arial" w:eastAsiaTheme="minorHAnsi" w:hAnsi="Arial" w:cs="Arial"/>
+          <w:sz w:val="20"/>
+          <w:szCs w:val="20"/>
+          <w:lang w:val="es-MX"/>
+        </w:rPr>
+        <w:t>Como: Un invitado</w:t>
+      </w:r>
+    </w:p>
+    <w:p>
+      <w:pPr>
+        <w:spacing w:before="100" w:beforeAutospacing="1" w:after="100" w:afterAutospacing="1" w:line="240" w:lineRule="auto"/>
+        <w:rPr>
+          <w:rFonts w:ascii="Arial" w:eastAsiaTheme="minorHAnsi" w:hAnsi="Arial" w:cs="Arial"/>
+          <w:sz w:val="20"/>
+          <w:szCs w:val="20"/>
+          <w:lang w:val="es-MX"/>
+        </w:rPr>
+      </w:pPr>
+      <w:r>
+        <w:rPr>
+          <w:rFonts w:ascii="Arial" w:eastAsiaTheme="minorHAnsi" w:hAnsi="Arial" w:cs="Arial"/>
+          <w:sz w:val="20"/>
+          <w:szCs w:val="20"/>
+          <w:lang w:val="es-MX"/>
+        </w:rPr>
+        <w:t>Quiero: Seleccionar una propiedad, elegir mis fechas de inicio y fin, y confirmar una reserva</w:t>
+      </w:r>
+    </w:p>
+    <w:p>
+      <w:pPr>
+        <w:spacing w:before="100" w:beforeAutospacing="1" w:after="100" w:afterAutospacing="1" w:line="240" w:lineRule="auto"/>
+        <w:rPr>
+          <w:rFonts w:ascii="Arial" w:eastAsiaTheme="minorHAnsi" w:hAnsi="Arial" w:cs="Arial"/>
+          <w:sz w:val="20"/>
+          <w:szCs w:val="20"/>
+          <w:lang w:val="es-MX"/>
+        </w:rPr>
+      </w:pPr>
+      <w:r>
+        <w:rPr>
+          <w:rFonts w:ascii="Arial" w:eastAsiaTheme="minorHAnsi" w:hAnsi="Arial" w:cs="Arial"/>
+          <w:sz w:val="20"/>
+          <w:szCs w:val="20"/>
+          <w:lang w:val="es-MX"/>
+        </w:rPr>
+        <w:t>Para: Asegurar mi estancia en la propiedad deseada.</w:t>
+      </w:r>
+    </w:p>
+    <w:p>
+      <w:pPr>
+        <w:spacing w:before="100" w:beforeAutospacing="1" w:after="100" w:afterAutospacing="1" w:line="240" w:lineRule="auto"/>
+        <w:rPr>
+          <w:rFonts w:ascii="Arial" w:eastAsiaTheme="minorHAnsi" w:hAnsi="Arial" w:cs="Arial"/>
+          <w:sz w:val="20"/>
+          <w:szCs w:val="20"/>
+          <w:lang w:val="es-MX"/>
+        </w:rPr>
+      </w:pPr>
+    </w:p>
+    <w:p>
+      <w:pPr>
+        <w:spacing w:before="100" w:beforeAutospacing="1" w:after="100" w:afterAutospacing="1" w:line="240" w:lineRule="auto"/>
+        <w:rPr>
+          <w:rFonts w:ascii="Arial" w:eastAsiaTheme="minorHAnsi" w:hAnsi="Arial" w:cs="Arial"/>
+          <w:b/>
+          <w:sz w:val="20"/>
+          <w:szCs w:val="20"/>
+          <w:lang w:val="es-MX"/>
+        </w:rPr>
+      </w:pPr>
+      <w:r>
+        <w:rPr>
+          <w:rFonts w:ascii="Arial" w:eastAsiaTheme="minorHAnsi" w:hAnsi="Arial" w:cs="Arial"/>
+          <w:b/>
+          <w:sz w:val="20"/>
+          <w:szCs w:val="20"/>
+          <w:lang w:val="es-MX"/>
+        </w:rPr>
+        <w:t>HUCP-032 Gestionar Mis Reservas</w:t>
+      </w:r>
+    </w:p>
+    <w:p>
+      <w:pPr>
+        <w:spacing w:before="100" w:beforeAutospacing="1" w:after="100" w:afterAutospacing="1" w:line="240" w:lineRule="auto"/>
+        <w:rPr>
+          <w:rFonts w:ascii="Arial" w:eastAsiaTheme="minorHAnsi" w:hAnsi="Arial" w:cs="Arial"/>
+          <w:sz w:val="20"/>
+          <w:szCs w:val="20"/>
+          <w:lang w:val="es-MX"/>
+        </w:rPr>
+      </w:pPr>
+      <w:r>
+        <w:rPr>
+          <w:rFonts w:ascii="Arial" w:eastAsiaTheme="minorHAnsi" w:hAnsi="Arial" w:cs="Arial"/>
+          <w:sz w:val="20"/>
+          <w:szCs w:val="20"/>
+          <w:lang w:val="es-MX"/>
+        </w:rPr>
+        <w:t>Como: Un invitado o</w:t>
+      </w:r>
+      <w:r>
+        <w:rPr>
+          <w:rFonts w:ascii="Arial" w:eastAsiaTheme="minorHAnsi" w:hAnsi="Arial" w:cs="Arial"/>
+          <w:sz w:val="20"/>
+          <w:szCs w:val="20"/>
+          <w:lang w:val="es-MX"/>
+        </w:rPr>
+        <w:t xml:space="preserve"> un anfitrión</w:t>
+      </w:r>
+    </w:p>
+    <w:p>
+      <w:pPr>
+        <w:spacing w:before="100" w:beforeAutospacing="1" w:after="100" w:afterAutospacing="1" w:line="240" w:lineRule="auto"/>
+        <w:rPr>
+          <w:rFonts w:ascii="Arial" w:eastAsiaTheme="minorHAnsi" w:hAnsi="Arial" w:cs="Arial"/>
+          <w:sz w:val="20"/>
+          <w:szCs w:val="20"/>
+          <w:lang w:val="es-MX"/>
+        </w:rPr>
+      </w:pPr>
+      <w:r>
+        <w:rPr>
+          <w:rFonts w:ascii="Arial" w:eastAsiaTheme="minorHAnsi" w:hAnsi="Arial" w:cs="Arial"/>
+          <w:sz w:val="20"/>
+          <w:szCs w:val="20"/>
+          <w:lang w:val="es-MX"/>
+        </w:rPr>
+        <w:t>Quiero: Ver el estado de mis reservas (confirmado, cancelado, completado) y tener la opción de modificar o cancelar una reserva si es necesario</w:t>
+      </w:r>
+    </w:p>
+    <w:p>
+      <w:pPr>
+        <w:spacing w:before="100" w:beforeAutospacing="1" w:after="100" w:afterAutospacing="1" w:line="240" w:lineRule="auto"/>
+        <w:rPr>
+          <w:rFonts w:ascii="Arial" w:eastAsiaTheme="minorHAnsi" w:hAnsi="Arial" w:cs="Arial"/>
+          <w:sz w:val="20"/>
+          <w:szCs w:val="20"/>
+          <w:lang w:val="es-MX"/>
+        </w:rPr>
+      </w:pPr>
+      <w:r>
+        <w:rPr>
+          <w:rFonts w:ascii="Arial" w:eastAsiaTheme="minorHAnsi" w:hAnsi="Arial" w:cs="Arial"/>
+          <w:sz w:val="20"/>
+          <w:szCs w:val="20"/>
+          <w:lang w:val="es-MX"/>
+        </w:rPr>
+        <w:t>Para: Tener control y visibilidad sobre mis estancias o la ocupación de mi propiedad.</w:t>
+      </w:r>
+    </w:p>
+    <w:p>
+      <w:pPr>
+        <w:spacing w:before="100" w:beforeAutospacing="1" w:after="100" w:afterAutospacing="1" w:line="240" w:lineRule="auto"/>
+        <w:rPr>
+          <w:rFonts w:ascii="Arial" w:eastAsiaTheme="minorHAnsi" w:hAnsi="Arial" w:cs="Arial"/>
+          <w:sz w:val="20"/>
+          <w:szCs w:val="20"/>
+          <w:lang w:val="es-MX"/>
+        </w:rPr>
+      </w:pPr>
+    </w:p>
+    <w:p>
+      <w:pPr>
+        <w:spacing w:before="100" w:beforeAutospacing="1" w:after="100" w:afterAutospacing="1" w:line="240" w:lineRule="auto"/>
+        <w:rPr>
+          <w:rFonts w:ascii="Arial" w:eastAsiaTheme="minorHAnsi" w:hAnsi="Arial" w:cs="Arial"/>
+          <w:b/>
+          <w:sz w:val="20"/>
+          <w:szCs w:val="20"/>
+          <w:lang w:val="es-MX"/>
+        </w:rPr>
+      </w:pPr>
+      <w:r>
+        <w:rPr>
+          <w:rFonts w:ascii="Arial" w:eastAsiaTheme="minorHAnsi" w:hAnsi="Arial" w:cs="Arial"/>
+          <w:b/>
+          <w:sz w:val="20"/>
+          <w:szCs w:val="20"/>
+          <w:lang w:val="es-MX"/>
+        </w:rPr>
+        <w:t>HUCP-003 Co</w:t>
+      </w:r>
+      <w:r>
+        <w:rPr>
+          <w:rFonts w:ascii="Arial" w:eastAsiaTheme="minorHAnsi" w:hAnsi="Arial" w:cs="Arial"/>
+          <w:b/>
+          <w:sz w:val="20"/>
+          <w:szCs w:val="20"/>
+          <w:lang w:val="es-MX"/>
+        </w:rPr>
+        <w:t>nsultar Disponibilidad y Precios de Propiedades</w:t>
+      </w:r>
+    </w:p>
+    <w:p>
+      <w:pPr>
+        <w:spacing w:before="100" w:beforeAutospacing="1" w:after="100" w:afterAutospacing="1" w:line="240" w:lineRule="auto"/>
+        <w:rPr>
+          <w:rFonts w:ascii="Arial" w:eastAsiaTheme="minorHAnsi" w:hAnsi="Arial" w:cs="Arial"/>
+          <w:sz w:val="20"/>
+          <w:szCs w:val="20"/>
+          <w:lang w:val="es-MX"/>
+        </w:rPr>
+      </w:pPr>
+      <w:r>
+        <w:rPr>
+          <w:rFonts w:ascii="Arial" w:eastAsiaTheme="minorHAnsi" w:hAnsi="Arial" w:cs="Arial"/>
+          <w:sz w:val="20"/>
+          <w:szCs w:val="20"/>
+          <w:lang w:val="es-MX"/>
+        </w:rPr>
+        <w:t>Como: Un invitado</w:t>
+      </w:r>
+    </w:p>
+    <w:p>
+      <w:pPr>
+        <w:spacing w:before="100" w:beforeAutospacing="1" w:after="100" w:afterAutospacing="1" w:line="240" w:lineRule="auto"/>
+        <w:rPr>
+          <w:rFonts w:ascii="Arial" w:eastAsiaTheme="minorHAnsi" w:hAnsi="Arial" w:cs="Arial"/>
+          <w:sz w:val="20"/>
+          <w:szCs w:val="20"/>
+          <w:lang w:val="es-MX"/>
+        </w:rPr>
+      </w:pPr>
+      <w:r>
+        <w:rPr>
+          <w:rFonts w:ascii="Arial" w:eastAsiaTheme="minorHAnsi" w:hAnsi="Arial" w:cs="Arial"/>
+          <w:sz w:val="20"/>
+          <w:szCs w:val="20"/>
+          <w:lang w:val="es-MX"/>
+        </w:rPr>
+        <w:t>Quiero: Buscar propiedades y ver su precio por día y disponibilidad en un rango de fechas</w:t>
+      </w:r>
+    </w:p>
+    <w:p>
+      <w:pPr>
+        <w:spacing w:before="100" w:beforeAutospacing="1" w:after="100" w:afterAutospacing="1" w:line="240" w:lineRule="auto"/>
+        <w:rPr>
+          <w:rFonts w:ascii="Arial" w:eastAsiaTheme="minorHAnsi" w:hAnsi="Arial" w:cs="Arial"/>
+          <w:sz w:val="20"/>
+          <w:szCs w:val="20"/>
+          <w:lang w:val="es-MX"/>
+        </w:rPr>
+      </w:pPr>
+      <w:r>
+        <w:rPr>
+          <w:rFonts w:ascii="Arial" w:eastAsiaTheme="minorHAnsi" w:hAnsi="Arial" w:cs="Arial"/>
+          <w:sz w:val="20"/>
+          <w:szCs w:val="20"/>
+          <w:lang w:val="es-MX"/>
+        </w:rPr>
+        <w:t>Para: Encontrar la propiedad que mejor se adapte a mis necesidades y presupuesto para mis fechas de </w:t>
+      </w:r>
+      <w:r>
+        <w:rPr>
+          <w:rFonts w:ascii="Arial" w:eastAsiaTheme="minorHAnsi" w:hAnsi="Arial" w:cs="Arial"/>
+          <w:sz w:val="20"/>
+          <w:szCs w:val="20"/>
+          <w:lang w:val="es-MX"/>
+        </w:rPr>
+        <w:t>viaje</w:t>
+      </w:r>
+    </w:p>
+    <w:p>
+      <w:pPr>
+        <w:spacing w:before="100" w:beforeAutospacing="1" w:after="100" w:afterAutospacing="1" w:line="240" w:lineRule="auto"/>
+        <w:rPr>
+          <w:rFonts w:ascii="Arial" w:eastAsia="Times New Roman" w:hAnsi="Arial" w:cs="Arial"/>
+          <w:sz w:val="24"/>
+          <w:szCs w:val="24"/>
+          <w:lang w:eastAsia="es-GT"/>
+        </w:rPr>
+      </w:pPr>
+    </w:p>
+    <w:p>
+      <w:pPr>
+        <w:spacing w:before="100" w:beforeAutospacing="1" w:after="100" w:afterAutospacing="1" w:line="240" w:lineRule="auto"/>
+        <w:rPr>
+          <w:rFonts w:ascii="Arial" w:eastAsia="Times New Roman" w:hAnsi="Arial" w:cs="Arial"/>
+          <w:sz w:val="24"/>
+          <w:szCs w:val="24"/>
+          <w:lang w:eastAsia="es-GT"/>
+        </w:rPr>
+      </w:pPr>
+    </w:p>
+    <w:p>
+      <w:pPr>
+        <w:spacing w:before="100" w:beforeAutospacing="1" w:after="100" w:afterAutospacing="1" w:line="240" w:lineRule="auto"/>
+        <w:rPr>
+          <w:rFonts w:ascii="Arial" w:eastAsia="Times New Roman" w:hAnsi="Arial" w:cs="Arial"/>
+          <w:sz w:val="24"/>
+          <w:szCs w:val="24"/>
+          <w:lang w:eastAsia="es-GT"/>
+        </w:rPr>
+      </w:pPr>
+    </w:p>
+    <w:p>
+      <w:pPr>
+        <w:spacing w:before="100" w:beforeAutospacing="1" w:after="100" w:afterAutospacing="1" w:line="240" w:lineRule="auto"/>
+        <w:rPr>
+          <w:rFonts w:ascii="Arial" w:eastAsia="Times New Roman" w:hAnsi="Arial" w:cs="Arial"/>
+          <w:sz w:val="24"/>
+          <w:szCs w:val="24"/>
+          <w:lang w:eastAsia="es-GT"/>
+        </w:rPr>
+      </w:pPr>
+    </w:p>
+    <w:p>
+      <w:pPr>
+        <w:spacing w:before="100" w:beforeAutospacing="1" w:after="100" w:afterAutospacing="1" w:line="240" w:lineRule="auto"/>
+        <w:rPr>
+          <w:rFonts w:ascii="Arial" w:eastAsia="Times New Roman" w:hAnsi="Arial" w:cs="Arial"/>
+          <w:sz w:val="24"/>
+          <w:szCs w:val="24"/>
+          <w:lang w:eastAsia="es-GT"/>
+        </w:rPr>
+      </w:pPr>
+    </w:p>
+    <w:p>
+      <w:pPr>
+        <w:spacing w:before="100" w:beforeAutospacing="1" w:after="100" w:afterAutospacing="1" w:line="240" w:lineRule="auto"/>
+        <w:rPr>
+          <w:rFonts w:ascii="Arial" w:eastAsia="Times New Roman" w:hAnsi="Arial" w:cs="Arial"/>
+          <w:sz w:val="24"/>
+          <w:szCs w:val="24"/>
+          <w:lang w:eastAsia="es-GT"/>
+        </w:rPr>
+      </w:pPr>
+    </w:p>
+    <w:p>
+      <w:pPr>
+        <w:spacing w:before="100" w:beforeAutospacing="1" w:after="100" w:afterAutospacing="1" w:line="240" w:lineRule="auto"/>
+        <w:rPr>
+          <w:rFonts w:ascii="Arial" w:eastAsia="Times New Roman" w:hAnsi="Arial" w:cs="Arial"/>
+          <w:sz w:val="24"/>
+          <w:szCs w:val="24"/>
+          <w:lang w:eastAsia="es-GT"/>
+        </w:rPr>
+      </w:pPr>
+    </w:p>
+    <w:p>
+      <w:pPr>
+        <w:spacing w:before="100" w:beforeAutospacing="1" w:after="100" w:afterAutospacing="1" w:line="240" w:lineRule="auto"/>
+        <w:rPr>
+          <w:rFonts w:ascii="Arial" w:eastAsia="Times New Roman" w:hAnsi="Arial" w:cs="Arial"/>
+          <w:sz w:val="24"/>
+          <w:szCs w:val="24"/>
+          <w:lang w:eastAsia="es-GT"/>
+        </w:rPr>
+      </w:pPr>
+    </w:p>
+    <w:p>
+      <w:pPr>
+        <w:spacing w:before="100" w:beforeAutospacing="1" w:after="100" w:afterAutospacing="1" w:line="240" w:lineRule="auto"/>
+        <w:rPr>
+          <w:rFonts w:ascii="Arial" w:eastAsia="Times New Roman" w:hAnsi="Arial" w:cs="Arial"/>
+          <w:sz w:val="24"/>
+          <w:szCs w:val="24"/>
+          <w:lang w:eastAsia="es-GT"/>
+        </w:rPr>
+      </w:pPr>
+    </w:p>
+    <w:p>
+      <w:pPr>
+        <w:spacing w:before="100" w:beforeAutospacing="1" w:after="100" w:afterAutospacing="1" w:line="240" w:lineRule="auto"/>
+        <w:rPr>
+          <w:rFonts w:ascii="Arial" w:eastAsia="Times New Roman" w:hAnsi="Arial" w:cs="Arial"/>
+          <w:sz w:val="24"/>
+          <w:szCs w:val="24"/>
+          <w:lang w:eastAsia="es-GT"/>
+        </w:rPr>
+      </w:pPr>
+    </w:p>
+    <w:p>
+      <w:pPr>
+        <w:spacing w:before="100" w:beforeAutospacing="1" w:after="100" w:afterAutospacing="1" w:line="240" w:lineRule="auto"/>
+        <w:rPr>
+          <w:rFonts w:ascii="Arial" w:eastAsia="Times New Roman" w:hAnsi="Arial" w:cs="Arial"/>
+          <w:sz w:val="24"/>
+          <w:szCs w:val="24"/>
+          <w:lang w:eastAsia="es-GT"/>
+        </w:rPr>
+      </w:pPr>
+    </w:p>
+    <w:p>
+      <w:pPr>
+        <w:spacing w:before="100" w:beforeAutospacing="1" w:after="100" w:afterAutospacing="1" w:line="240" w:lineRule="auto"/>
+        <w:rPr>
+          <w:rFonts w:ascii="Arial" w:eastAsia="Times New Roman" w:hAnsi="Arial" w:cs="Arial"/>
+          <w:sz w:val="24"/>
+          <w:szCs w:val="24"/>
+          <w:lang w:eastAsia="es-GT"/>
+        </w:rPr>
+      </w:pPr>
+    </w:p>
+    <w:p>
+      <w:pPr>
+        <w:spacing w:before="100" w:beforeAutospacing="1" w:after="100" w:afterAutospacing="1" w:line="240" w:lineRule="auto"/>
+        <w:rPr>
+          <w:rFonts w:ascii="Arial" w:eastAsia="Times New Roman" w:hAnsi="Arial" w:cs="Arial"/>
+          <w:sz w:val="24"/>
+          <w:szCs w:val="24"/>
+          <w:lang w:eastAsia="es-GT"/>
+        </w:rPr>
+      </w:pPr>
+      <w:r>
+        <w:rPr>
+          <w:rFonts w:ascii="Arial" w:eastAsia="Times New Roman" w:hAnsi="Arial" w:cs="Arial"/>
+          <w:sz w:val="24"/>
+          <w:szCs w:val="24"/>
+          <w:lang w:eastAsia="es-GT"/>
+        </w:rPr>
+        <w:t>MODELO DE ENTIDADES</w:t>
+      </w:r>
+      <w:r>
+        <w:rPr>
+          <w:rFonts w:ascii="Arial" w:eastAsia="Times New Roman" w:hAnsi="Arial" w:cs="Arial"/>
+          <w:sz w:val="24"/>
+          <w:szCs w:val="24"/>
+          <w:lang w:eastAsia="es-GT"/>
+        </w:rPr>
+        <w:br/>
+      </w:r>
+      <w:r>
+        <w:rPr>
+          <w:rFonts w:ascii="Arial" w:eastAsia="Times New Roman" w:hAnsi="Arial" w:cs="Arial"/>
+          <w:sz w:val="24"/>
+          <w:szCs w:val="24"/>
+          <w:lang w:eastAsia="es-GT"/>
+        </w:rPr>
+        <w:br/>
+      </w:r>
+      <w:r>
+        <w:rPr>
+          <w:rFonts w:ascii="Arial" w:eastAsia="Times New Roman" w:hAnsi="Arial" w:cs="Arial"/>
+          <w:noProof/>
+          <w:sz w:val="24"/>
+          <w:szCs w:val="24"/>
+          <w:lang w:val="en-US"/>
+        </w:rPr>
+        <w:drawing>
+          <wp:inline distT="0" distB="0" distL="0" distR="0">
+            <wp:extent cx="5651500" cy="4848225"/>
+            <wp:effectExtent l="0" t="0" r="6350" b="0"/>
+            <wp:docPr id="1098701964" name="Imagen 2"/>
+            <wp:cNvGraphicFramePr>
+              <a:graphicFrameLocks xmlns:a="http://schemas.openxmlformats.org/drawingml/2006/main" noChangeAspect="1"/>
+            </wp:cNvGraphicFramePr>
+            <a:graphic xmlns:a="http://schemas.openxmlformats.org/drawingml/2006/main">
+              <a:graphicData uri="http://schemas.openxmlformats.org/drawingml/2006/picture">
+                <pic:pic xmlns:pic="http://schemas.openxmlformats.org/drawingml/2006/picture">
+                  <pic:nvPicPr>
+                    <pic:cNvPr id="1098701964" name="Imagen 2"/>
+                    <pic:cNvPicPr>
+                      <a:picLocks noChangeAspect="1" noChangeArrowheads="1"/>
+                    </pic:cNvPicPr>
+                  </pic:nvPicPr>
+                  <pic:blipFill>
+                    <a:blip r:embed="rId7">
+                      <a:extLst>
+                        <a:ext uri="{28A0092B-C50C-407E-A947-70E740481C1C}">
+                          <a14:useLocalDpi xmlns:a14="http://schemas.microsoft.com/office/drawing/2010/main" val="0"/>
+                        </a:ext>
+                      </a:extLst>
+                    </a:blip>
+                    <a:srcRect/>
+                    <a:stretch>
+                      <a:fillRect/>
+                    </a:stretch>
+                  </pic:blipFill>
+                  <pic:spPr>
+                    <a:xfrm>
+                      <a:off x="0" y="0"/>
+                      <a:ext cx="5661730" cy="4856506"/>
+                    </a:xfrm>
+                    <a:prstGeom prst="rect">
+                      <a:avLst/>
+                    </a:prstGeom>
+                    <a:noFill/>
+                  </pic:spPr>
+                </pic:pic>
+              </a:graphicData>
+            </a:graphic>
+          </wp:inline>
+        </w:drawing>
+      </w:r>
+    </w:p>
+    <w:p>
+      <w:pPr>
+        <w:spacing w:before="100" w:beforeAutospacing="1" w:after="100" w:afterAutospacing="1" w:line="240" w:lineRule="auto"/>
+        <w:rPr>
+          <w:rFonts w:ascii="Arial" w:eastAsia="Times New Roman" w:hAnsi="Arial" w:cs="Arial"/>
+          <w:sz w:val="24"/>
+          <w:szCs w:val="24"/>
+          <w:lang w:eastAsia="es-GT"/>
+        </w:rPr>
+      </w:pPr>
+    </w:p>
+    <w:p>
+      <w:pPr>
+        <w:spacing w:before="100" w:beforeAutospacing="1" w:after="100" w:afterAutospacing="1" w:line="240" w:lineRule="auto"/>
+        <w:rPr>
+          <w:rFonts w:ascii="Arial" w:eastAsia="Times New Roman" w:hAnsi="Arial" w:cs="Arial"/>
+          <w:sz w:val="24"/>
+          <w:szCs w:val="24"/>
+          <w:lang w:eastAsia="es-GT"/>
+        </w:rPr>
+      </w:pPr>
+    </w:p>
+    <w:p>
+      <w:pPr>
+        <w:spacing w:before="100" w:beforeAutospacing="1" w:after="100" w:afterAutospacing="1" w:line="240" w:lineRule="auto"/>
+        <w:rPr>
+          <w:rFonts w:ascii="Arial" w:eastAsia="Times New Roman" w:hAnsi="Arial" w:cs="Arial"/>
+          <w:sz w:val="24"/>
+          <w:szCs w:val="24"/>
+          <w:lang w:eastAsia="es-GT"/>
+        </w:rPr>
+      </w:pPr>
+    </w:p>
+    <w:p>
+      <w:pPr>
+        <w:spacing w:before="100" w:beforeAutospacing="1" w:after="100" w:afterAutospacing="1" w:line="240" w:lineRule="auto"/>
+        <w:rPr>
+          <w:rFonts w:ascii="Arial" w:eastAsia="Times New Roman" w:hAnsi="Arial" w:cs="Arial"/>
+          <w:sz w:val="24"/>
+          <w:szCs w:val="24"/>
+          <w:lang w:eastAsia="es-GT"/>
+        </w:rPr>
+      </w:pPr>
+    </w:p>
+    <w:p>
+      <w:pPr>
+        <w:spacing w:before="100" w:beforeAutospacing="1" w:after="100" w:afterAutospacing="1" w:line="240" w:lineRule="auto"/>
+        <w:rPr>
+          <w:rFonts w:ascii="Arial" w:eastAsia="Times New Roman" w:hAnsi="Arial" w:cs="Arial"/>
+          <w:sz w:val="24"/>
+          <w:szCs w:val="24"/>
+          <w:lang w:eastAsia="es-GT"/>
+        </w:rPr>
+      </w:pPr>
+    </w:p>
+    <w:p>
+      <w:pPr>
+        <w:spacing w:before="100" w:beforeAutospacing="1" w:after="100" w:afterAutospacing="1" w:line="240" w:lineRule="auto"/>
+        <w:rPr>
+          <w:rFonts w:ascii="Arial" w:eastAsia="Times New Roman" w:hAnsi="Arial" w:cs="Arial"/>
+          <w:sz w:val="24"/>
+          <w:szCs w:val="24"/>
+          <w:lang w:eastAsia="es-GT"/>
+        </w:rPr>
+      </w:pPr>
+    </w:p>
+    <w:p>
+      <w:pPr>
+        <w:spacing w:before="100" w:beforeAutospacing="1" w:after="100" w:afterAutospacing="1" w:line="240" w:lineRule="auto"/>
+        <w:rPr>
+          <w:rFonts w:ascii="Arial" w:eastAsia="Times New Roman" w:hAnsi="Arial" w:cs="Arial"/>
+          <w:sz w:val="24"/>
+          <w:szCs w:val="24"/>
+          <w:lang w:eastAsia="es-GT"/>
+        </w:rPr>
+      </w:pPr>
+    </w:p>
+    <w:p>
+      <w:pPr>
+        <w:spacing w:before="100" w:beforeAutospacing="1" w:after="100" w:afterAutospacing="1" w:line="240" w:lineRule="auto"/>
+        <w:rPr>
+          <w:rFonts w:ascii="Arial" w:eastAsia="Times New Roman" w:hAnsi="Arial" w:cs="Arial"/>
+          <w:sz w:val="24"/>
+          <w:szCs w:val="24"/>
+          <w:lang w:eastAsia="es-GT"/>
+        </w:rPr>
+      </w:pPr>
+    </w:p>
+    <w:p>
+      <w:pPr>
+        <w:spacing w:before="100" w:beforeAutospacing="1" w:after="100" w:afterAutospacing="1" w:line="240" w:lineRule="auto"/>
+        <w:rPr>
+          <w:rFonts w:ascii="Arial" w:eastAsia="Times New Roman" w:hAnsi="Arial" w:cs="Arial"/>
+          <w:sz w:val="24"/>
+          <w:szCs w:val="24"/>
+          <w:lang w:eastAsia="es-GT"/>
+        </w:rPr>
+      </w:pPr>
+    </w:p>
+    <w:p>
+      <w:pPr>
+        <w:spacing w:before="100" w:beforeAutospacing="1" w:after="100" w:afterAutospacing="1" w:line="240" w:lineRule="auto"/>
+        <w:rPr>
+          <w:rFonts w:ascii="Arial" w:eastAsia="Times New Roman" w:hAnsi="Arial" w:cs="Arial"/>
+          <w:sz w:val="24"/>
+          <w:szCs w:val="24"/>
+          <w:lang w:eastAsia="es-GT"/>
+        </w:rPr>
+      </w:pPr>
+    </w:p>
+    <w:p>
+      <w:pPr>
+        <w:pStyle w:val="NormalWeb"/>
+      </w:pPr>
+      <w:r>
+        <w:rPr>
+          <w:rFonts w:ascii="Arial" w:hAnsi="Arial" w:cs="Arial"/>
+          <w:sz w:val="28"/>
+          <w:szCs w:val="28"/>
+        </w:rPr>
+        <w:t>MODELO ENTIDAD RELACION</w:t>
+      </w:r>
+      <w:r>
+        <w:rPr>
+          <w:rFonts w:ascii="SimSun" w:eastAsia="SimSun" w:hAnsi="SimSun" w:cs="SimSun"/>
+          <w:noProof/>
+          <w:lang w:val="en-US" w:eastAsia="en-US"/>
+        </w:rPr>
+        <w:drawing>
+          <wp:inline distT="0" distB="0" distL="114300" distR="114300">
+            <wp:extent cx="304800" cy="304800"/>
+            <wp:effectExtent l="0" t="0" r="0" b="0"/>
+            <wp:docPr id="1" name="Imagen 1" descr="IMG_256"/>
+            <wp:cNvGraphicFramePr>
+              <a:graphicFrameLocks xmlns:a="http://schemas.openxmlformats.org/drawingml/2006/main" noChangeAspect="1"/>
+            </wp:cNvGraphicFramePr>
+            <a:graphic xmlns:a="http://schemas.openxmlformats.org/drawingml/2006/main">
+              <a:graphicData uri="http://schemas.openxmlformats.org/drawingml/2006/picture">
+                <pic:pic xmlns:pic="http://schemas.openxmlformats.org/drawingml/2006/picture">
+                  <pic:nvPicPr>
+                    <pic:cNvPr id="1" name="Imagen 1" descr="IMG_256"/>
+                    <pic:cNvPicPr>
+                      <a:picLocks noChangeAspect="1"/>
+                    </pic:cNvPicPr>
+                  </pic:nvPicPr>
+                  <pic:blipFill>
+                    <a:blip r:embed="rId8"/>
+                    <a:stretch>
+                      <a:fillRect/>
+                    </a:stretch>
+                  </pic:blipFill>
+                  <pic:spPr>
+                    <a:xfrm>
+                      <a:off x="0" y="0"/>
+                      <a:ext cx="304800" cy="304800"/>
+                    </a:xfrm>
+                    <a:prstGeom prst="rect">
+                      <a:avLst/>
+                    </a:prstGeom>
+                    <a:noFill/>
+                    <a:ln w="9525">
+                      <a:noFill/>
+                    </a:ln>
+                  </pic:spPr>
+                </pic:pic>
+              </a:graphicData>
+            </a:graphic>
+          </wp:inline>
+        </w:drawing>
+      </w:r>
+      <w:r>
+        <w:rPr>
+          <w:noProof/>
+          <w:lang w:val="en-US" w:eastAsia="en-US"/>
+        </w:rPr>
+        <w:drawing>
+          <wp:inline distT="0" distB="0" distL="114300" distR="114300">
+            <wp:extent cx="7270750" cy="6459855"/>
+            <wp:effectExtent l="0" t="0" r="6350" b="17145"/>
+            <wp:docPr id="3" name="Imagen 2" descr="IMG_256"/>
+            <wp:cNvGraphicFramePr>
+              <a:graphicFrameLocks xmlns:a="http://schemas.openxmlformats.org/drawingml/2006/main" noChangeAspect="1"/>
+            </wp:cNvGraphicFramePr>
+            <a:graphic xmlns:a="http://schemas.openxmlformats.org/drawingml/2006/main">
+              <a:graphicData uri="http://schemas.openxmlformats.org/drawingml/2006/picture">
+                <pic:pic xmlns:pic="http://schemas.openxmlformats.org/drawingml/2006/picture">
+                  <pic:nvPicPr>
+                    <pic:cNvPr id="3" name="Imagen 2" descr="IMG_256"/>
+                    <pic:cNvPicPr>
+                      <a:picLocks noChangeAspect="1"/>
+                    </pic:cNvPicPr>
+                  </pic:nvPicPr>
+                  <pic:blipFill>
+                    <a:blip r:embed="rId9"/>
+                    <a:stretch>
+                      <a:fillRect/>
+                    </a:stretch>
+                  </pic:blipFill>
+                  <pic:spPr>
+                    <a:xfrm>
+                      <a:off x="0" y="0"/>
+                      <a:ext cx="7270750" cy="6459855"/>
+                    </a:xfrm>
+                    <a:prstGeom prst="rect">
+                      <a:avLst/>
+                    </a:prstGeom>
+                    <a:noFill/>
+                    <a:ln w="9525">
+                      <a:noFill/>
+                    </a:ln>
+                  </pic:spPr>
+                </pic:pic>
+              </a:graphicData>
+            </a:graphic>
+          </wp:inline>
+        </w:drawing>
+      </w:r>
+    </w:p>
+    <w:p>
+      <w:pPr>
+        <w:spacing w:before="100" w:beforeAutospacing="1" w:after="100" w:afterAutospacing="1" w:line="240" w:lineRule="auto"/>
+        <w:rPr>
+          <w:rFonts w:ascii="Arial" w:eastAsia="Times New Roman" w:hAnsi="Arial" w:cs="Arial"/>
+          <w:sz w:val="24"/>
+          <w:szCs w:val="24"/>
+          <w:lang w:eastAsia="es-GT"/>
+        </w:rPr>
+      </w:pPr>
+    </w:p>
+    <w:p>
+      <w:pPr>
+        <w:spacing w:before="100" w:beforeAutospacing="1" w:after="100" w:afterAutospacing="1" w:line="240" w:lineRule="auto"/>
+        <w:rPr>
+          <w:rFonts w:ascii="Arial" w:eastAsia="Times New Roman" w:hAnsi="Arial" w:cs="Arial"/>
+          <w:sz w:val="24"/>
+          <w:szCs w:val="24"/>
+          <w:lang w:eastAsia="es-GT"/>
+        </w:rPr>
+      </w:pPr>
+    </w:p>
+    <w:p>
+      <w:pPr>
+        <w:spacing w:before="100" w:beforeAutospacing="1" w:after="100" w:afterAutospacing="1" w:line="240" w:lineRule="auto"/>
+        <w:rPr>
+          <w:rFonts w:ascii="Arial" w:eastAsia="Times New Roman" w:hAnsi="Arial" w:cs="Arial"/>
+          <w:sz w:val="24"/>
+          <w:szCs w:val="24"/>
+          <w:lang w:eastAsia="es-GT"/>
+        </w:rPr>
+      </w:pPr>
+    </w:p>
+    <w:p>
+      <w:pPr>
+        <w:spacing w:before="100" w:beforeAutospacing="1" w:after="100" w:afterAutospacing="1" w:line="240" w:lineRule="auto"/>
+        <w:rPr>
+          <w:rFonts w:ascii="Arial" w:eastAsia="Times New Roman" w:hAnsi="Arial" w:cs="Arial"/>
+          <w:sz w:val="24"/>
+          <w:szCs w:val="24"/>
+          <w:lang w:eastAsia="es-GT"/>
+        </w:rPr>
+      </w:pPr>
+    </w:p>
+    <w:p>
+      <w:pPr>
+        <w:spacing w:before="100" w:beforeAutospacing="1" w:after="100" w:afterAutospacing="1" w:line="240" w:lineRule="auto"/>
+        <w:rPr>
+          <w:rFonts w:ascii="Arial" w:eastAsia="Times New Roman" w:hAnsi="Arial" w:cs="Arial"/>
+          <w:sz w:val="24"/>
+          <w:szCs w:val="24"/>
+          <w:lang w:eastAsia="es-GT"/>
+        </w:rPr>
+      </w:pPr>
+    </w:p>
+    <w:p>
+      <w:pPr>
+        <w:spacing w:before="100" w:beforeAutospacing="1" w:after="100" w:afterAutospacing="1" w:line="240" w:lineRule="auto"/>
+        <w:rPr>
+          <w:rFonts w:ascii="Arial" w:eastAsia="Times New Roman" w:hAnsi="Arial" w:cs="Arial"/>
+          <w:sz w:val="24"/>
+          <w:szCs w:val="24"/>
+          <w:lang w:eastAsia="es-GT"/>
+        </w:rPr>
+      </w:pPr>
+    </w:p>
+    <w:p>
+      <w:pPr>
+        <w:spacing w:before="100" w:beforeAutospacing="1" w:after="100" w:afterAutospacing="1" w:line="240" w:lineRule="auto"/>
+        <w:rPr>
+          <w:rFonts w:ascii="Arial" w:eastAsia="Times New Roman" w:hAnsi="Arial" w:cs="Arial"/>
+          <w:sz w:val="24"/>
+          <w:szCs w:val="24"/>
+          <w:lang w:eastAsia="es-GT"/>
+        </w:rPr>
+      </w:pPr>
+      <w:r>
+        <w:rPr>
+          <w:rFonts w:ascii="Arial" w:eastAsia="Times New Roman" w:hAnsi="Arial" w:cs="Arial"/>
+          <w:sz w:val="24"/>
+          <w:szCs w:val="24"/>
+          <w:lang w:eastAsia="es-GT"/>
+        </w:rPr>
+        <w:t xml:space="preserve">DIAGRAMA ENTIDAD RELACION </w:t>
+      </w:r>
+    </w:p>
+    <w:p>
+      <w:pPr>
+        <w:spacing w:before="100" w:beforeAutospacing="1" w:after="100" w:afterAutospacing="1" w:line="240" w:lineRule="auto"/>
+        <w:rPr>
+          <w:rFonts w:ascii="Arial" w:eastAsia="Times New Roman" w:hAnsi="Arial" w:cs="Arial"/>
+          <w:sz w:val="24"/>
+          <w:szCs w:val="24"/>
+          <w:lang w:eastAsia="es-GT"/>
+        </w:rPr>
+      </w:pPr>
+      <w:r>
+        <w:rPr>
+          <w:rFonts w:ascii="Arial" w:eastAsia="Times New Roman" w:hAnsi="Arial" w:cs="Arial"/>
+          <w:sz w:val="24"/>
+          <w:szCs w:val="24"/>
+          <w:lang w:eastAsia="es-GT"/>
+        </w:rPr>
+        <w:drawing>
+          <wp:inline distT="0" distB="0" distL="0" distR="0" wp14:anchorId="025C1A0B" wp14:editId="2FD3BBCA">
+            <wp:extent cx="6858000" cy="4918075"/>
+            <wp:effectExtent l="0" t="0" r="0" b="0"/>
+            <wp:docPr id="7" name="Imagen 7"/>
+            <wp:cNvGraphicFramePr>
+              <a:graphicFrameLocks xmlns:a="http://schemas.openxmlformats.org/drawingml/2006/main" noChangeAspect="1"/>
+            </wp:cNvGraphicFramePr>
+            <a:graphic xmlns:a="http://schemas.openxmlformats.org/drawingml/2006/main">
+              <a:graphicData uri="http://schemas.openxmlformats.org/drawingml/2006/picture">
+                <pic:pic xmlns:pic="http://schemas.openxmlformats.org/drawingml/2006/picture">
+                  <pic:nvPicPr>
+                    <pic:cNvPr id="1" name=""/>
+                    <pic:cNvPicPr/>
+                  </pic:nvPicPr>
+                  <pic:blipFill rotWithShape="1">
+                    <a:blip r:embed="rId10"/>
+                    <a:srcRect t="577" b="1"/>
+                    <a:stretch/>
+                  </pic:blipFill>
+                  <pic:spPr bwMode="auto">
+                    <a:xfrm>
+                      <a:off x="0" y="0"/>
+                      <a:ext cx="6858000" cy="4918075"/>
+                    </a:xfrm>
+                    <a:prstGeom prst="rect">
+                      <a:avLst/>
+                    </a:prstGeom>
+                    <a:ln>
+                      <a:noFill/>
+                    </a:ln>
+                    <a:extLst>
+                      <a:ext uri="{53640926-AAD7-44D8-BBD7-CCE9431645EC}">
+                        <a14:shadowObscured xmlns:a14="http://schemas.microsoft.com/office/drawing/2010/main"/>
+                      </a:ext>
+                    </a:extLst>
+                  </pic:spPr>
+                </pic:pic>
+              </a:graphicData>
+            </a:graphic>
+          </wp:inline>
+        </w:drawing>
+      </w:r>
+    </w:p>
+    <w:p>
+      <w:pPr>
+        <w:spacing w:before="100" w:beforeAutospacing="1" w:after="100" w:afterAutospacing="1" w:line="240" w:lineRule="auto"/>
+        <w:rPr>
+          <w:rFonts w:ascii="Arial" w:eastAsia="Times New Roman" w:hAnsi="Arial" w:cs="Arial"/>
+          <w:sz w:val="24"/>
+          <w:szCs w:val="24"/>
+          <w:lang w:eastAsia="es-GT"/>
+        </w:rPr>
+      </w:pPr>
       <w:bookmarkStart w:id="0" w:name="_GoBack"/>
       <w:bookmarkEnd w:id="0"/>
-    </w:p>
-    <w:p>
-      <w:r>
-        <w:t>HURH</w:t>
-      </w:r>
-      <w:r>
-        <w:t>-0012</w:t>
-      </w:r>
-      <w:r>
-        <w:t xml:space="preserve"> Generación de recibo de pago</w:t>
-      </w:r>
-    </w:p>
-    <w:p>
-      <w:r>
-        <w:t xml:space="preserve">1. Como registro de pago recibido </w:t>
-      </w:r>
-    </w:p>
-    <w:p>
-      <w:r>
-        <w:t>2. Quiero que me den la información del monto de pago</w:t>
-      </w:r>
-    </w:p>
-    <w:p>
-      <w:pPr>
-        <w:spacing w:before="100" w:beforeAutospacing="1" w:after="100" w:afterAutospacing="1" w:line="240" w:lineRule="auto"/>
-        <w:rPr>
-          <w:rFonts w:ascii="Arial" w:eastAsia="Times New Roman" w:hAnsi="Arial" w:cs="Arial"/>
-          <w:sz w:val="24"/>
-          <w:szCs w:val="24"/>
-          <w:lang w:eastAsia="es-GT"/>
-        </w:rPr>
-      </w:pPr>
-      <w:r>
-        <w:t>3. Para que registre el recibo y se almacene en el sistema</w:t>
-      </w:r>
-    </w:p>
-    <w:p>
-      <w:pPr>
-        <w:spacing w:before="100" w:beforeAutospacing="1" w:after="100" w:afterAutospacing="1" w:line="240" w:lineRule="auto"/>
-        <w:rPr>
-          <w:rFonts w:ascii="Arial" w:eastAsia="Times New Roman" w:hAnsi="Arial" w:cs="Arial"/>
-          <w:sz w:val="24"/>
-          <w:szCs w:val="24"/>
-          <w:lang w:eastAsia="es-GT"/>
-        </w:rPr>
-      </w:pPr>
-    </w:p>
-    <w:p>
-      <w:pPr>
-        <w:spacing w:before="100" w:beforeAutospacing="1" w:after="100" w:afterAutospacing="1" w:line="240" w:lineRule="auto"/>
-        <w:rPr>
-          <w:rFonts w:ascii="Arial" w:eastAsia="Times New Roman" w:hAnsi="Arial" w:cs="Arial"/>
-          <w:sz w:val="24"/>
-          <w:szCs w:val="24"/>
-          <w:lang w:eastAsia="es-GT"/>
-        </w:rPr>
-      </w:pPr>
-    </w:p>
-    <w:p>
-      <w:pPr>
-        <w:spacing w:before="100" w:beforeAutospacing="1" w:after="100" w:afterAutospacing="1" w:line="240" w:lineRule="auto"/>
-        <w:rPr>
-          <w:rFonts w:ascii="Arial" w:eastAsia="Times New Roman" w:hAnsi="Arial" w:cs="Arial"/>
-          <w:sz w:val="24"/>
-          <w:szCs w:val="24"/>
-          <w:lang w:eastAsia="es-GT"/>
-        </w:rPr>
-      </w:pPr>
-    </w:p>
-    <w:p>
-      <w:pPr>
-        <w:spacing w:before="100" w:beforeAutospacing="1" w:after="100" w:afterAutospacing="1" w:line="240" w:lineRule="auto"/>
-        <w:rPr>
-          <w:rFonts w:ascii="Arial" w:eastAsia="Times New Roman" w:hAnsi="Arial" w:cs="Arial"/>
-          <w:sz w:val="24"/>
-          <w:szCs w:val="24"/>
-          <w:lang w:eastAsia="es-GT"/>
-        </w:rPr>
-      </w:pPr>
-    </w:p>
-    <w:p>
-      <w:pPr>
-        <w:spacing w:before="100" w:beforeAutospacing="1" w:after="100" w:afterAutospacing="1" w:line="240" w:lineRule="auto"/>
-        <w:rPr>
-          <w:rFonts w:ascii="Arial" w:eastAsia="Times New Roman" w:hAnsi="Arial" w:cs="Arial"/>
-          <w:sz w:val="24"/>
-          <w:szCs w:val="24"/>
-          <w:lang w:eastAsia="es-GT"/>
-        </w:rPr>
-      </w:pPr>
-    </w:p>
-    <w:p>
-      <w:pPr>
-        <w:spacing w:before="100" w:beforeAutospacing="1" w:after="100" w:afterAutospacing="1" w:line="240" w:lineRule="auto"/>
-        <w:rPr>
-          <w:rFonts w:ascii="Arial" w:eastAsia="Times New Roman" w:hAnsi="Arial" w:cs="Arial"/>
-          <w:sz w:val="24"/>
-          <w:szCs w:val="24"/>
-          <w:lang w:eastAsia="es-GT"/>
-        </w:rPr>
-      </w:pPr>
-    </w:p>
-    <w:p>
-      <w:pPr>
-        <w:spacing w:before="100" w:beforeAutospacing="1" w:after="100" w:afterAutospacing="1" w:line="240" w:lineRule="auto"/>
-        <w:rPr>
-          <w:rFonts w:ascii="Arial" w:eastAsia="Times New Roman" w:hAnsi="Arial" w:cs="Arial"/>
-          <w:sz w:val="24"/>
-          <w:szCs w:val="24"/>
-          <w:lang w:eastAsia="es-GT"/>
-        </w:rPr>
-      </w:pPr>
-    </w:p>
-    <w:p>
-      <w:pPr>
-        <w:spacing w:before="100" w:beforeAutospacing="1" w:after="100" w:afterAutospacing="1" w:line="240" w:lineRule="auto"/>
-        <w:rPr>
-          <w:rFonts w:ascii="Arial" w:eastAsia="Times New Roman" w:hAnsi="Arial" w:cs="Arial"/>
-          <w:sz w:val="24"/>
-          <w:szCs w:val="24"/>
-          <w:lang w:eastAsia="es-GT"/>
-        </w:rPr>
-      </w:pPr>
-    </w:p>
-    <w:p>
-      <w:pPr>
-        <w:spacing w:before="100" w:beforeAutospacing="1" w:after="100" w:afterAutospacing="1" w:line="240" w:lineRule="auto"/>
-        <w:rPr>
-          <w:rFonts w:ascii="Arial" w:eastAsia="Times New Roman" w:hAnsi="Arial" w:cs="Arial"/>
-          <w:sz w:val="24"/>
-          <w:szCs w:val="24"/>
-          <w:lang w:eastAsia="es-GT"/>
-        </w:rPr>
-      </w:pPr>
-    </w:p>
-    <w:p>
-      <w:pPr>
-        <w:spacing w:before="100" w:beforeAutospacing="1" w:after="100" w:afterAutospacing="1" w:line="240" w:lineRule="auto"/>
-        <w:rPr>
-          <w:rFonts w:ascii="Arial" w:eastAsia="Times New Roman" w:hAnsi="Arial" w:cs="Arial"/>
-          <w:sz w:val="24"/>
-          <w:szCs w:val="24"/>
-          <w:lang w:eastAsia="es-GT"/>
-        </w:rPr>
-      </w:pPr>
-    </w:p>
-    <w:p>
-      <w:pPr>
-        <w:spacing w:before="100" w:beforeAutospacing="1" w:after="100" w:afterAutospacing="1" w:line="240" w:lineRule="auto"/>
-        <w:rPr>
-          <w:rFonts w:ascii="Arial" w:eastAsia="Times New Roman" w:hAnsi="Arial" w:cs="Arial"/>
-          <w:sz w:val="24"/>
-          <w:szCs w:val="24"/>
-          <w:lang w:eastAsia="es-GT"/>
-        </w:rPr>
-      </w:pPr>
-    </w:p>
-    <w:p>
-      <w:pPr>
-        <w:spacing w:before="100" w:beforeAutospacing="1" w:after="100" w:afterAutospacing="1" w:line="240" w:lineRule="auto"/>
-        <w:rPr>
-          <w:rFonts w:ascii="Arial" w:eastAsia="Times New Roman" w:hAnsi="Arial" w:cs="Arial"/>
-          <w:sz w:val="24"/>
-          <w:szCs w:val="24"/>
-          <w:lang w:eastAsia="es-GT"/>
-        </w:rPr>
-      </w:pPr>
-    </w:p>
-    <w:p>
-      <w:pPr>
-        <w:spacing w:before="100" w:beforeAutospacing="1" w:after="100" w:afterAutospacing="1" w:line="240" w:lineRule="auto"/>
-        <w:rPr>
-          <w:rFonts w:ascii="Arial" w:eastAsia="Times New Roman" w:hAnsi="Arial" w:cs="Arial"/>
-          <w:sz w:val="24"/>
-          <w:szCs w:val="24"/>
-          <w:lang w:eastAsia="es-GT"/>
-        </w:rPr>
-      </w:pPr>
-    </w:p>
-    <w:p>
-      <w:pPr>
-        <w:spacing w:before="100" w:beforeAutospacing="1" w:after="100" w:afterAutospacing="1" w:line="240" w:lineRule="auto"/>
-        <w:rPr>
-          <w:rFonts w:ascii="Arial" w:eastAsia="Times New Roman" w:hAnsi="Arial" w:cs="Arial"/>
-          <w:sz w:val="24"/>
-          <w:szCs w:val="24"/>
-          <w:lang w:eastAsia="es-GT"/>
-        </w:rPr>
-      </w:pPr>
-    </w:p>
-    <w:p>
-      <w:pPr>
-        <w:spacing w:before="100" w:beforeAutospacing="1" w:after="100" w:afterAutospacing="1" w:line="240" w:lineRule="auto"/>
-        <w:rPr>
-          <w:rFonts w:ascii="Arial" w:eastAsia="Times New Roman" w:hAnsi="Arial" w:cs="Arial"/>
-          <w:sz w:val="24"/>
-          <w:szCs w:val="24"/>
-          <w:lang w:eastAsia="es-GT"/>
-        </w:rPr>
-      </w:pPr>
-    </w:p>
-    <w:p>
-      <w:pPr>
-        <w:spacing w:before="100" w:beforeAutospacing="1" w:after="100" w:afterAutospacing="1" w:line="240" w:lineRule="auto"/>
-        <w:rPr>
-          <w:rFonts w:ascii="Arial" w:eastAsia="Times New Roman" w:hAnsi="Arial" w:cs="Arial"/>
-          <w:sz w:val="24"/>
-          <w:szCs w:val="24"/>
-          <w:lang w:eastAsia="es-GT"/>
-        </w:rPr>
-      </w:pPr>
-    </w:p>
-    <w:p>
-      <w:pPr>
-        <w:spacing w:before="100" w:beforeAutospacing="1" w:after="100" w:afterAutospacing="1" w:line="240" w:lineRule="auto"/>
-        <w:rPr>
-          <w:rFonts w:ascii="Arial" w:eastAsia="Times New Roman" w:hAnsi="Arial" w:cs="Arial"/>
-          <w:sz w:val="24"/>
-          <w:szCs w:val="24"/>
-          <w:lang w:eastAsia="es-GT"/>
-        </w:rPr>
-      </w:pPr>
-    </w:p>
-    <w:p>
-      <w:pPr>
-        <w:spacing w:before="100" w:beforeAutospacing="1" w:after="100" w:afterAutospacing="1" w:line="240" w:lineRule="auto"/>
-        <w:rPr>
-          <w:rFonts w:ascii="Arial" w:eastAsia="Times New Roman" w:hAnsi="Arial" w:cs="Arial"/>
-          <w:sz w:val="24"/>
-          <w:szCs w:val="24"/>
-          <w:lang w:eastAsia="es-GT"/>
-        </w:rPr>
-      </w:pPr>
-    </w:p>
-    <w:p>
-      <w:pPr>
-        <w:spacing w:before="100" w:beforeAutospacing="1" w:after="100" w:afterAutospacing="1" w:line="240" w:lineRule="auto"/>
-        <w:rPr>
-          <w:rFonts w:ascii="Arial" w:eastAsia="Times New Roman" w:hAnsi="Arial" w:cs="Arial"/>
-          <w:sz w:val="24"/>
-          <w:szCs w:val="24"/>
-          <w:lang w:eastAsia="es-GT"/>
-        </w:rPr>
-      </w:pPr>
-    </w:p>
-    <w:p>
-      <w:pPr>
-        <w:spacing w:before="100" w:beforeAutospacing="1" w:after="100" w:afterAutospacing="1" w:line="240" w:lineRule="auto"/>
-        <w:rPr>
-          <w:rFonts w:ascii="Arial" w:eastAsia="Times New Roman" w:hAnsi="Arial" w:cs="Arial"/>
-          <w:sz w:val="24"/>
-          <w:szCs w:val="24"/>
-          <w:lang w:eastAsia="es-GT"/>
-        </w:rPr>
-      </w:pPr>
-    </w:p>
-    <w:p>
-      <w:pPr>
-        <w:spacing w:before="100" w:beforeAutospacing="1" w:after="100" w:afterAutospacing="1" w:line="240" w:lineRule="auto"/>
-        <w:rPr>
-          <w:rFonts w:ascii="Arial" w:eastAsia="Times New Roman" w:hAnsi="Arial" w:cs="Arial"/>
-          <w:sz w:val="24"/>
-          <w:szCs w:val="24"/>
-          <w:lang w:eastAsia="es-GT"/>
-        </w:rPr>
-      </w:pPr>
-    </w:p>
-    <w:p>
-      <w:pPr>
-        <w:spacing w:before="100" w:beforeAutospacing="1" w:after="100" w:afterAutospacing="1" w:line="240" w:lineRule="auto"/>
-        <w:rPr>
-          <w:rFonts w:ascii="Arial" w:eastAsia="Times New Roman" w:hAnsi="Arial" w:cs="Arial"/>
-          <w:sz w:val="24"/>
-          <w:szCs w:val="24"/>
-          <w:lang w:eastAsia="es-GT"/>
-        </w:rPr>
-      </w:pPr>
-    </w:p>
-    <w:p>
-      <w:pPr>
-        <w:spacing w:before="100" w:beforeAutospacing="1" w:after="100" w:afterAutospacing="1" w:line="240" w:lineRule="auto"/>
-        <w:rPr>
-          <w:rFonts w:ascii="Arial" w:eastAsia="Times New Roman" w:hAnsi="Arial" w:cs="Arial"/>
-          <w:sz w:val="24"/>
-          <w:szCs w:val="24"/>
-          <w:lang w:eastAsia="es-GT"/>
-        </w:rPr>
-      </w:pPr>
-    </w:p>
-    <w:p>
-      <w:pPr>
-        <w:spacing w:before="100" w:beforeAutospacing="1" w:after="100" w:afterAutospacing="1" w:line="240" w:lineRule="auto"/>
-        <w:rPr>
-          <w:rFonts w:ascii="Arial" w:eastAsia="Times New Roman" w:hAnsi="Arial" w:cs="Arial"/>
-          <w:sz w:val="24"/>
-          <w:szCs w:val="24"/>
-          <w:lang w:eastAsia="es-GT"/>
-        </w:rPr>
-      </w:pPr>
-    </w:p>
-    <w:p>
-      <w:pPr>
-        <w:spacing w:before="100" w:beforeAutospacing="1" w:after="100" w:afterAutospacing="1" w:line="240" w:lineRule="auto"/>
-        <w:rPr>
-          <w:rFonts w:ascii="Arial" w:eastAsia="Times New Roman" w:hAnsi="Arial" w:cs="Arial"/>
-          <w:sz w:val="24"/>
-          <w:szCs w:val="24"/>
-          <w:lang w:eastAsia="es-GT"/>
-        </w:rPr>
-      </w:pPr>
-    </w:p>
-    <w:p>
-      <w:pPr>
-        <w:spacing w:before="100" w:beforeAutospacing="1" w:after="100" w:afterAutospacing="1" w:line="240" w:lineRule="auto"/>
-        <w:rPr>
-          <w:rFonts w:ascii="Arial" w:eastAsia="Times New Roman" w:hAnsi="Arial" w:cs="Arial"/>
-          <w:sz w:val="24"/>
-          <w:szCs w:val="24"/>
-          <w:lang w:eastAsia="es-GT"/>
-        </w:rPr>
-      </w:pPr>
-    </w:p>
-    <w:p>
-      <w:pPr>
-        <w:spacing w:before="100" w:beforeAutospacing="1" w:after="100" w:afterAutospacing="1" w:line="240" w:lineRule="auto"/>
-        <w:rPr>
-          <w:rFonts w:ascii="Arial" w:eastAsia="Times New Roman" w:hAnsi="Arial" w:cs="Arial"/>
-          <w:sz w:val="24"/>
-          <w:szCs w:val="24"/>
-          <w:lang w:eastAsia="es-GT"/>
-        </w:rPr>
-      </w:pPr>
-    </w:p>
-    <w:p>
-      <w:pPr>
-        <w:spacing w:before="100" w:beforeAutospacing="1" w:after="100" w:afterAutospacing="1" w:line="240" w:lineRule="auto"/>
-        <w:rPr>
-          <w:rFonts w:ascii="Arial" w:eastAsia="Times New Roman" w:hAnsi="Arial" w:cs="Arial"/>
-          <w:sz w:val="24"/>
-          <w:szCs w:val="24"/>
-          <w:lang w:eastAsia="es-GT"/>
-        </w:rPr>
-      </w:pPr>
-    </w:p>
-    <w:p>
-      <w:pPr>
-        <w:spacing w:before="100" w:beforeAutospacing="1" w:after="100" w:afterAutospacing="1" w:line="240" w:lineRule="auto"/>
-        <w:rPr>
-          <w:rFonts w:ascii="Arial" w:eastAsia="Times New Roman" w:hAnsi="Arial" w:cs="Arial"/>
-          <w:sz w:val="24"/>
-          <w:szCs w:val="24"/>
-          <w:lang w:eastAsia="es-GT"/>
-        </w:rPr>
-      </w:pPr>
-    </w:p>
-    <w:p>
-      <w:pPr>
-        <w:spacing w:before="100" w:beforeAutospacing="1" w:after="100" w:afterAutospacing="1" w:line="240" w:lineRule="auto"/>
-        <w:rPr>
-          <w:rFonts w:ascii="Arial" w:eastAsia="Times New Roman" w:hAnsi="Arial" w:cs="Arial"/>
-          <w:sz w:val="24"/>
-          <w:szCs w:val="24"/>
-          <w:lang w:eastAsia="es-GT"/>
-        </w:rPr>
-      </w:pPr>
-    </w:p>
-    <w:p>
-      <w:pPr>
-        <w:spacing w:before="100" w:beforeAutospacing="1" w:after="100" w:afterAutospacing="1" w:line="240" w:lineRule="auto"/>
-        <w:rPr>
-          <w:rFonts w:ascii="Arial" w:eastAsia="Times New Roman" w:hAnsi="Arial" w:cs="Arial"/>
-          <w:sz w:val="24"/>
-          <w:szCs w:val="24"/>
-          <w:lang w:eastAsia="es-GT"/>
-        </w:rPr>
-      </w:pPr>
-    </w:p>
-    <w:p>
-      <w:pPr>
-        <w:spacing w:before="100" w:beforeAutospacing="1" w:after="100" w:afterAutospacing="1" w:line="240" w:lineRule="auto"/>
-        <w:rPr>
-          <w:rFonts w:ascii="Arial" w:eastAsia="Times New Roman" w:hAnsi="Arial" w:cs="Arial"/>
-          <w:sz w:val="24"/>
-          <w:szCs w:val="24"/>
-          <w:lang w:eastAsia="es-GT"/>
-        </w:rPr>
-      </w:pPr>
-    </w:p>
-    <w:p>
-      <w:pPr>
-        <w:spacing w:before="100" w:beforeAutospacing="1" w:after="100" w:afterAutospacing="1" w:line="240" w:lineRule="auto"/>
-        <w:rPr>
-          <w:rFonts w:ascii="Arial" w:eastAsia="Times New Roman" w:hAnsi="Arial" w:cs="Arial"/>
-          <w:sz w:val="24"/>
-          <w:szCs w:val="24"/>
-          <w:lang w:eastAsia="es-GT"/>
-        </w:rPr>
-      </w:pPr>
-    </w:p>
-    <w:p>
-      <w:pPr>
-        <w:spacing w:before="100" w:beforeAutospacing="1" w:after="100" w:afterAutospacing="1" w:line="240" w:lineRule="auto"/>
-        <w:rPr>
-          <w:rFonts w:ascii="Arial" w:eastAsia="Times New Roman" w:hAnsi="Arial" w:cs="Arial"/>
-          <w:sz w:val="24"/>
-          <w:szCs w:val="24"/>
-          <w:lang w:eastAsia="es-GT"/>
-        </w:rPr>
-      </w:pPr>
-    </w:p>
-    <w:p>
-      <w:pPr>
-        <w:spacing w:before="100" w:beforeAutospacing="1" w:after="100" w:afterAutospacing="1" w:line="240" w:lineRule="auto"/>
-        <w:rPr>
-          <w:rFonts w:ascii="Arial" w:eastAsia="Times New Roman" w:hAnsi="Arial" w:cs="Arial"/>
-          <w:sz w:val="24"/>
-          <w:szCs w:val="24"/>
-          <w:lang w:eastAsia="es-GT"/>
-        </w:rPr>
-      </w:pPr>
-    </w:p>
-    <w:p>
-      <w:pPr>
-        <w:spacing w:before="100" w:beforeAutospacing="1" w:after="100" w:afterAutospacing="1" w:line="240" w:lineRule="auto"/>
-        <w:rPr>
-          <w:rFonts w:ascii="Arial" w:eastAsia="Times New Roman" w:hAnsi="Arial" w:cs="Arial"/>
-          <w:sz w:val="24"/>
-          <w:szCs w:val="24"/>
-          <w:lang w:eastAsia="es-GT"/>
-        </w:rPr>
-      </w:pPr>
-    </w:p>
-    <w:p>
-      <w:pPr>
-        <w:spacing w:before="100" w:beforeAutospacing="1" w:after="100" w:afterAutospacing="1" w:line="240" w:lineRule="auto"/>
-        <w:rPr>
-          <w:rFonts w:ascii="Arial" w:eastAsia="Times New Roman" w:hAnsi="Arial" w:cs="Arial"/>
-          <w:sz w:val="24"/>
-          <w:szCs w:val="24"/>
-          <w:lang w:eastAsia="es-GT"/>
-        </w:rPr>
-      </w:pPr>
-    </w:p>
-    <w:p>
-      <w:pPr>
-        <w:spacing w:before="100" w:beforeAutospacing="1" w:after="100" w:afterAutospacing="1" w:line="240" w:lineRule="auto"/>
-        <w:rPr>
-          <w:rFonts w:ascii="Arial" w:eastAsia="Times New Roman" w:hAnsi="Arial" w:cs="Arial"/>
-          <w:sz w:val="24"/>
-          <w:szCs w:val="24"/>
-          <w:lang w:eastAsia="es-GT"/>
-        </w:rPr>
-      </w:pPr>
-    </w:p>
-    <w:p>
-      <w:pPr>
-        <w:spacing w:before="100" w:beforeAutospacing="1" w:after="100" w:afterAutospacing="1" w:line="240" w:lineRule="auto"/>
-        <w:rPr>
-          <w:rFonts w:ascii="Arial" w:eastAsia="Times New Roman" w:hAnsi="Arial" w:cs="Arial"/>
-          <w:sz w:val="24"/>
-          <w:szCs w:val="24"/>
-          <w:lang w:eastAsia="es-GT"/>
-        </w:rPr>
-      </w:pPr>
-    </w:p>
-    <w:p>
-      <w:pPr>
-        <w:spacing w:before="100" w:beforeAutospacing="1" w:after="100" w:afterAutospacing="1" w:line="240" w:lineRule="auto"/>
-        <w:rPr>
-          <w:rFonts w:ascii="Arial" w:eastAsia="Times New Roman" w:hAnsi="Arial" w:cs="Arial"/>
-          <w:sz w:val="24"/>
-          <w:szCs w:val="24"/>
-          <w:lang w:eastAsia="es-GT"/>
-        </w:rPr>
-      </w:pPr>
-    </w:p>
-    <w:p>
-      <w:pPr>
-        <w:spacing w:before="100" w:beforeAutospacing="1" w:after="100" w:afterAutospacing="1" w:line="240" w:lineRule="auto"/>
-        <w:rPr>
-          <w:rFonts w:ascii="Arial" w:eastAsia="Times New Roman" w:hAnsi="Arial" w:cs="Arial"/>
-          <w:sz w:val="24"/>
-          <w:szCs w:val="24"/>
-          <w:lang w:eastAsia="es-GT"/>
-        </w:rPr>
-      </w:pPr>
-    </w:p>
-    <w:p>
-      <w:pPr>
-        <w:spacing w:before="100" w:beforeAutospacing="1" w:after="100" w:afterAutospacing="1" w:line="240" w:lineRule="auto"/>
-        <w:rPr>
-          <w:rFonts w:ascii="Arial" w:eastAsia="Times New Roman" w:hAnsi="Arial" w:cs="Arial"/>
-          <w:sz w:val="24"/>
-          <w:szCs w:val="24"/>
-          <w:lang w:eastAsia="es-GT"/>
-        </w:rPr>
-      </w:pPr>
-    </w:p>
-    <w:p>
-      <w:pPr>
-        <w:spacing w:before="100" w:beforeAutospacing="1" w:after="100" w:afterAutospacing="1" w:line="240" w:lineRule="auto"/>
-        <w:rPr>
-          <w:rFonts w:ascii="Arial" w:eastAsia="Times New Roman" w:hAnsi="Arial" w:cs="Arial"/>
-          <w:sz w:val="24"/>
-          <w:szCs w:val="24"/>
-          <w:lang w:eastAsia="es-GT"/>
-        </w:rPr>
-      </w:pPr>
-    </w:p>
-    <w:p>
-      <w:pPr>
-        <w:spacing w:before="100" w:beforeAutospacing="1" w:after="100" w:afterAutospacing="1" w:line="240" w:lineRule="auto"/>
-        <w:rPr>
-          <w:rFonts w:ascii="Arial" w:eastAsia="Times New Roman" w:hAnsi="Arial" w:cs="Arial"/>
-          <w:sz w:val="24"/>
-          <w:szCs w:val="24"/>
-          <w:lang w:eastAsia="es-GT"/>
-        </w:rPr>
-      </w:pPr>
-    </w:p>
-    <w:p>
-      <w:pPr>
-        <w:spacing w:before="100" w:beforeAutospacing="1" w:after="100" w:afterAutospacing="1" w:line="240" w:lineRule="auto"/>
-        <w:rPr>
-          <w:rFonts w:ascii="Arial" w:eastAsia="Times New Roman" w:hAnsi="Arial" w:cs="Arial"/>
-          <w:sz w:val="24"/>
-          <w:szCs w:val="24"/>
-          <w:lang w:eastAsia="es-GT"/>
-        </w:rPr>
-      </w:pPr>
-    </w:p>
-    <w:p>
-      <w:pPr>
-        <w:spacing w:before="100" w:beforeAutospacing="1" w:after="100" w:afterAutospacing="1" w:line="240" w:lineRule="auto"/>
-        <w:rPr>
-          <w:rFonts w:ascii="Arial" w:eastAsia="Times New Roman" w:hAnsi="Arial" w:cs="Arial"/>
-          <w:sz w:val="24"/>
-          <w:szCs w:val="24"/>
-          <w:lang w:eastAsia="es-GT"/>
-        </w:rPr>
-      </w:pPr>
-    </w:p>
-    <w:p>
-      <w:pPr>
-        <w:spacing w:before="100" w:beforeAutospacing="1" w:after="100" w:afterAutospacing="1" w:line="240" w:lineRule="auto"/>
-        <w:rPr>
-          <w:rFonts w:ascii="Arial" w:eastAsia="Times New Roman" w:hAnsi="Arial" w:cs="Arial"/>
-          <w:sz w:val="24"/>
-          <w:szCs w:val="24"/>
-          <w:lang w:eastAsia="es-GT"/>
-        </w:rPr>
-      </w:pPr>
-    </w:p>
-    <w:p>
-      <w:pPr>
-        <w:spacing w:before="100" w:beforeAutospacing="1" w:after="100" w:afterAutospacing="1" w:line="240" w:lineRule="auto"/>
-        <w:rPr>
-          <w:rFonts w:ascii="Arial" w:eastAsia="Times New Roman" w:hAnsi="Arial" w:cs="Arial"/>
-          <w:sz w:val="24"/>
-          <w:szCs w:val="24"/>
-          <w:lang w:eastAsia="es-GT"/>
-        </w:rPr>
-      </w:pPr>
-    </w:p>
-    <w:p>
-      <w:pPr>
-        <w:spacing w:before="100" w:beforeAutospacing="1" w:after="100" w:afterAutospacing="1" w:line="240" w:lineRule="auto"/>
-        <w:rPr>
-          <w:rFonts w:ascii="Arial" w:eastAsia="Times New Roman" w:hAnsi="Arial" w:cs="Arial"/>
-          <w:sz w:val="24"/>
-          <w:szCs w:val="24"/>
-          <w:lang w:eastAsia="es-GT"/>
-        </w:rPr>
-      </w:pPr>
-    </w:p>
-    <w:p>
-      <w:pPr>
-        <w:spacing w:before="100" w:beforeAutospacing="1" w:after="100" w:afterAutospacing="1" w:line="240" w:lineRule="auto"/>
-        <w:rPr>
-          <w:rFonts w:ascii="Arial" w:eastAsia="Times New Roman" w:hAnsi="Arial" w:cs="Arial"/>
-          <w:sz w:val="24"/>
-          <w:szCs w:val="24"/>
-          <w:lang w:eastAsia="es-GT"/>
-        </w:rPr>
-      </w:pPr>
     </w:p>
     <w:p>
       <w:pPr>
@@ -4951,7 +7246,7 @@
   <w:docDefaults>
     <w:rPrDefault>
       <w:rPr>
-        <w:rFonts w:asciiTheme="minorHAnsi" w:eastAsiaTheme="minorHAnsi" w:hAnsiTheme="minorHAnsi" w:cstheme="minorBidi"/>
+        <w:rFonts w:ascii="Times New Roman" w:eastAsia="SimSun" w:hAnsi="Times New Roman" w:cs="Times New Roman"/>
         <w:lang w:val="en-US" w:eastAsia="en-US" w:bidi="ar-SA"/>
       </w:rPr>
     </w:rPrDefault>
@@ -4997,7 +7292,7 @@
     <w:lsdException w:name="envelope address" w:semiHidden="1" w:unhideWhenUsed="1"/>
     <w:lsdException w:name="envelope return" w:semiHidden="1" w:unhideWhenUsed="1"/>
     <w:lsdException w:name="footnote reference" w:semiHidden="1" w:unhideWhenUsed="1"/>
-    <w:lsdException w:name="annotation reference" w:semiHidden="1" w:unhideWhenUsed="1"/>
+    <w:lsdException w:name="annotation reference" w:semiHidden="1" w:unhideWhenUsed="1" w:qFormat="1"/>
     <w:lsdException w:name="line number" w:semiHidden="1" w:unhideWhenUsed="1"/>
     <w:lsdException w:name="page number" w:semiHidden="1" w:unhideWhenUsed="1"/>
     <w:lsdException w:name="endnote reference" w:semiHidden="1" w:unhideWhenUsed="1"/>
@@ -5063,7 +7358,7 @@
     <w:lsdException w:name="HTML Sample" w:semiHidden="1" w:unhideWhenUsed="1"/>
     <w:lsdException w:name="HTML Typewriter" w:semiHidden="1" w:unhideWhenUsed="1"/>
     <w:lsdException w:name="HTML Variable" w:semiHidden="1" w:unhideWhenUsed="1"/>
-    <w:lsdException w:name="Normal Table" w:semiHidden="1" w:unhideWhenUsed="1" w:qFormat="1"/>
+    <w:lsdException w:name="Normal Table" w:semiHidden="1" w:unhideWhenUsed="1"/>
     <w:lsdException w:name="annotation subject" w:semiHidden="1" w:unhideWhenUsed="1" w:qFormat="1"/>
     <w:lsdException w:name="No List" w:semiHidden="1" w:unhideWhenUsed="1"/>
     <w:lsdException w:name="Outline List 1" w:semiHidden="1" w:unhideWhenUsed="1"/>
@@ -5334,7 +7629,7 @@
       <w:spacing w:after="160" w:line="259" w:lineRule="auto"/>
     </w:pPr>
     <w:rPr>
-      <w:rFonts w:eastAsia="MS Mincho"/>
+      <w:rFonts w:asciiTheme="minorHAnsi" w:eastAsia="MS Mincho" w:hAnsiTheme="minorHAnsi" w:cstheme="minorBidi"/>
       <w:sz w:val="22"/>
       <w:szCs w:val="22"/>
       <w:lang w:val="es-GT"/>
@@ -5373,6 +7668,7 @@
     <w:uiPriority w:val="99"/>
     <w:semiHidden/>
     <w:unhideWhenUsed/>
+    <w:qFormat/>
     <w:rPr>
       <w:sz w:val="16"/>
       <w:szCs w:val="16"/>
@@ -5473,6 +7769,7 @@
     <w:uiPriority w:val="1"/>
     <w:qFormat/>
     <w:rPr>
+      <w:rFonts w:asciiTheme="minorHAnsi" w:eastAsiaTheme="minorHAnsi" w:hAnsiTheme="minorHAnsi" w:cstheme="minorBidi"/>
       <w:sz w:val="22"/>
       <w:szCs w:val="22"/>
       <w:lang w:val="es-GT"/>

</xml_diff>

<commit_message>
Se actualizo los insert de usuario en la base de datos, en el documento peaceathome
</commit_message>
<xml_diff>
--- a/Peaceathome.docx
+++ b/Peaceathome.docx
@@ -2948,7 +2948,6 @@
           <w:szCs w:val="24"/>
           <w:lang w:eastAsia="es-GT"/>
         </w:rPr>
-        <w:lastRenderedPageBreak/>
         <w:t>Para: Tener un registro de cada acción tomada con fecha y el usuario responsable.</w:t>
       </w:r>
     </w:p>
@@ -3360,7 +3359,6 @@
           <w:u w:val="single"/>
           <w:lang w:val="es-MX"/>
         </w:rPr>
-        <w:lastRenderedPageBreak/>
         <w:t>Tupla: Propiedades</w:t>
       </w:r>
     </w:p>
@@ -3917,7 +3915,6 @@
           <w:szCs w:val="20"/>
           <w:lang w:val="es-MX"/>
         </w:rPr>
-        <w:lastRenderedPageBreak/>
         <w:t>Para: Asegurar que las estancias se organicen de forma eficiente y sin conflictos</w:t>
       </w:r>
     </w:p>
@@ -4511,7 +4508,6 @@
           <w:sz w:val="18"/>
           <w:szCs w:val="18"/>
         </w:rPr>
-        <w:lastRenderedPageBreak/>
         <w:t xml:space="preserve">Quiero: Poder actualizar la información de los empleados (cargo, teléfono, correo) </w:t>
       </w:r>
     </w:p>
@@ -4959,7 +4955,6 @@
           <w:szCs w:val="24"/>
           <w:lang w:eastAsia="es-GT"/>
         </w:rPr>
-        <w:lastRenderedPageBreak/>
         <w:drawing>
           <wp:anchor distT="0" distB="0" distL="114300" distR="114300" simplePos="0" relativeHeight="251666432" behindDoc="0" locked="0" layoutInCell="1" allowOverlap="1" wp14:anchorId="5D78E781" wp14:editId="15B37808">
             <wp:simplePos x="0" y="0"/>
@@ -5060,7 +5055,6 @@
           <w:sz w:val="20"/>
           <w:szCs w:val="20"/>
         </w:rPr>
-        <w:lastRenderedPageBreak/>
         <w:drawing>
           <wp:anchor distT="0" distB="0" distL="114300" distR="114300" simplePos="0" relativeHeight="251668480" behindDoc="0" locked="0" layoutInCell="1" allowOverlap="1" wp14:anchorId="42255C04" wp14:editId="47B3E2F4">
             <wp:simplePos x="0" y="0"/>
@@ -5349,7 +5343,6 @@
           <w:szCs w:val="24"/>
           <w:lang w:eastAsia="es-GT"/>
         </w:rPr>
-        <w:lastRenderedPageBreak/>
         <w:t>DIAGRAMA ENTIDAD RELACION</w:t>
       </w:r>
     </w:p>
@@ -5516,7 +5509,6 @@
           <w:szCs w:val="20"/>
           <w:lang w:val="en-US"/>
         </w:rPr>
-        <w:lastRenderedPageBreak/>
         <w:t>Base De Datos MySQL</w:t>
       </w:r>
     </w:p>
@@ -6005,7 +5997,6 @@
           <w:bCs/>
           <w:lang w:val="en-US"/>
         </w:rPr>
-        <w:lastRenderedPageBreak/>
         <w:t xml:space="preserve">    correoUsuario varchar(120) not null,</w:t>
       </w:r>
     </w:p>
@@ -6618,7 +6609,6 @@
           <w:rFonts w:ascii="Arial" w:eastAsiaTheme="minorHAnsi" w:hAnsi="Arial" w:cs="Arial"/>
           <w:bCs/>
         </w:rPr>
-        <w:lastRenderedPageBreak/>
         <w:tab/>
       </w:r>
       <w:r>
@@ -7218,7 +7208,6 @@
           <w:bCs/>
           <w:lang w:val="en-US"/>
         </w:rPr>
-        <w:lastRenderedPageBreak/>
         <w:t xml:space="preserve">    transaccionReembolso enum("Transferencia","PayPal"),</w:t>
       </w:r>
     </w:p>
@@ -7800,7 +7789,6 @@
           <w:rFonts w:ascii="Arial" w:eastAsiaTheme="minorHAnsi" w:hAnsi="Arial" w:cs="Arial"/>
           <w:bCs/>
         </w:rPr>
-        <w:lastRenderedPageBreak/>
         <w:t xml:space="preserve">        references Reserva(codigoReserva)</w:t>
       </w:r>
     </w:p>
@@ -8332,17 +8320,6 @@
           <w:lang w:eastAsia="es-GT"/>
         </w:rPr>
       </w:pPr>
-    </w:p>
-    <w:p>
-      <w:pPr>
-        <w:spacing w:before="100" w:beforeAutospacing="1" w:after="100" w:afterAutospacing="1" w:line="240" w:lineRule="auto"/>
-        <w:rPr>
-          <w:rFonts w:ascii="Arial" w:eastAsia="Times New Roman" w:hAnsi="Arial" w:cs="Arial"/>
-          <w:sz w:val="24"/>
-          <w:szCs w:val="24"/>
-          <w:lang w:eastAsia="es-GT"/>
-        </w:rPr>
-      </w:pPr>
       <w:r>
         <w:rPr>
           <w:rFonts w:ascii="Arial" w:eastAsia="Times New Roman" w:hAnsi="Arial" w:cs="Arial"/>
@@ -8443,6 +8420,46 @@
           <w:lang w:eastAsia="es-GT"/>
         </w:rPr>
       </w:pPr>
+      <w:r>
+        <w:rPr>
+          <w:rFonts w:ascii="Arial" w:eastAsia="Times New Roman" w:hAnsi="Arial" w:cs="Arial"/>
+          <w:sz w:val="24"/>
+          <w:szCs w:val="24"/>
+          <w:lang w:eastAsia="es-GT"/>
+        </w:rPr>
+        <w:t>insert into Usuario (correoUsuario, nombreUsuario, telefonoUsuario, fechaNacimiento, contrasenia, tipoUsuario) values ('k', 'Kenet', '55330129', '1999-02-28', '123', 'Administrador');</w:t>
+      </w:r>
+    </w:p>
+    <w:p>
+      <w:pPr>
+        <w:spacing w:before="100" w:beforeAutospacing="1" w:after="100" w:afterAutospacing="1" w:line="240" w:lineRule="auto"/>
+        <w:rPr>
+          <w:rFonts w:ascii="Arial" w:eastAsia="Times New Roman" w:hAnsi="Arial" w:cs="Arial"/>
+          <w:sz w:val="24"/>
+          <w:szCs w:val="24"/>
+          <w:lang w:eastAsia="es-GT"/>
+        </w:rPr>
+      </w:pPr>
+      <w:r>
+        <w:rPr>
+          <w:rFonts w:ascii="Arial" w:eastAsia="Times New Roman" w:hAnsi="Arial" w:cs="Arial"/>
+          <w:sz w:val="24"/>
+          <w:szCs w:val="24"/>
+          <w:lang w:eastAsia="es-GT"/>
+        </w:rPr>
+        <w:t>insert into Usuario (correoUsuario, nombreUsuario, telefonoUsuario, fechaNacimiento, contrasenia, tipoUsuario) values ('j', 'Kenet', '55330129', '1999-02-28', '123', 'Huesped');</w:t>
+      </w:r>
+    </w:p>
+    <w:p>
+      <w:pPr>
+        <w:spacing w:before="100" w:beforeAutospacing="1" w:after="100" w:afterAutospacing="1" w:line="240" w:lineRule="auto"/>
+        <w:rPr>
+          <w:rFonts w:ascii="Arial" w:eastAsia="Times New Roman" w:hAnsi="Arial" w:cs="Arial"/>
+          <w:sz w:val="24"/>
+          <w:szCs w:val="24"/>
+          <w:lang w:eastAsia="es-GT"/>
+        </w:rPr>
+      </w:pPr>
     </w:p>
     <w:p>
       <w:pPr>
@@ -8632,7 +8649,6 @@
           <w:szCs w:val="24"/>
           <w:lang w:eastAsia="es-GT"/>
         </w:rPr>
-        <w:lastRenderedPageBreak/>
         <w:t>insert into Propiedad(titulo,descripcion,tipoPropiedad,numHabitaciones,maxHuesped,correoUsuario) values ('Villa con jacuzzi', 'Villa de lujo con jacuzzi y jardín privado', 'Villa', 4, 10, 'carlosruiz@gmail.com');</w:t>
       </w:r>
     </w:p>
@@ -8926,7 +8942,6 @@
           <w:szCs w:val="24"/>
           <w:lang w:eastAsia="es-GT"/>
         </w:rPr>
-        <w:lastRenderedPageBreak/>
         <w:t>insert into Resenia (rating, comentario, fechaResenia, codigoReserva) values (4, 'Buen servicio, aunque tardaron un poco en atender.', '2025-07-18',2);</w:t>
       </w:r>
     </w:p>
@@ -9229,7 +9244,6 @@
           <w:szCs w:val="24"/>
           <w:lang w:eastAsia="es-GT"/>
         </w:rPr>
-        <w:lastRenderedPageBreak/>
         <w:t xml:space="preserve"> </w:t>
       </w:r>
     </w:p>
@@ -9472,88 +9486,87 @@
           <w:szCs w:val="24"/>
           <w:lang w:eastAsia="es-GT"/>
         </w:rPr>
-        <w:t>insert into Empleado (nombreEmpleado, apellidoEmpleado, telefonoEmpleado, correoEmpleado, cargo, fechaContratacion, estado)values ('Juan', 'Pérez', '555-1234', 'juanperez@gmail.com', 'Desarrollador', '2022-03-15', 'Activo');</w:t>
-      </w:r>
-    </w:p>
-    <w:p>
-      <w:pPr>
-        <w:spacing w:before="100" w:beforeAutospacing="1" w:after="100" w:afterAutospacing="1" w:line="240" w:lineRule="auto"/>
-        <w:rPr>
-          <w:rFonts w:ascii="Arial" w:eastAsia="Times New Roman" w:hAnsi="Arial" w:cs="Arial"/>
-          <w:sz w:val="24"/>
-          <w:szCs w:val="24"/>
-          <w:lang w:eastAsia="es-GT"/>
-        </w:rPr>
-      </w:pPr>
-      <w:r>
-        <w:rPr>
-          <w:rFonts w:ascii="Arial" w:eastAsia="Times New Roman" w:hAnsi="Arial" w:cs="Arial"/>
-          <w:sz w:val="24"/>
-          <w:szCs w:val="24"/>
-          <w:lang w:eastAsia="es-GT"/>
-        </w:rPr>
-        <w:t>insert into Empleado (nombreEmpleado, apellidoEmpleado, telefonoEmpleado, correoEmpleado, cargo, fechaContratacion, estado)values ('Ana', 'Gómez', '555-5678', 'anagomez@gmail.com', 'Analista de Datos', '2021-07-20', 'Activo');</w:t>
-      </w:r>
-    </w:p>
-    <w:p>
-      <w:pPr>
-        <w:spacing w:before="100" w:beforeAutospacing="1" w:after="100" w:afterAutospacing="1" w:line="240" w:lineRule="auto"/>
-        <w:rPr>
-          <w:rFonts w:ascii="Arial" w:eastAsia="Times New Roman" w:hAnsi="Arial" w:cs="Arial"/>
-          <w:sz w:val="24"/>
-          <w:szCs w:val="24"/>
-          <w:lang w:eastAsia="es-GT"/>
-        </w:rPr>
-      </w:pPr>
-      <w:r>
-        <w:rPr>
-          <w:rFonts w:ascii="Arial" w:eastAsia="Times New Roman" w:hAnsi="Arial" w:cs="Arial"/>
-          <w:sz w:val="24"/>
-          <w:szCs w:val="24"/>
-          <w:lang w:eastAsia="es-GT"/>
-        </w:rPr>
-        <w:lastRenderedPageBreak/>
-        <w:t>insert into Empleado (nombreEmpleado, apellidoEmpleado, telefonoEmpleado, correoEmpleado, cargo, fechaContratacion, estado)values ('Carlos', 'López', '555-8765', 'carloslopez@gmail.com', 'Gerente de Proyecto', '2020-11-01', 'Activo');</w:t>
-      </w:r>
-    </w:p>
-    <w:p>
-      <w:pPr>
-        <w:spacing w:before="100" w:beforeAutospacing="1" w:after="100" w:afterAutospacing="1" w:line="240" w:lineRule="auto"/>
-        <w:rPr>
-          <w:rFonts w:ascii="Arial" w:eastAsia="Times New Roman" w:hAnsi="Arial" w:cs="Arial"/>
-          <w:sz w:val="24"/>
-          <w:szCs w:val="24"/>
-          <w:lang w:eastAsia="es-GT"/>
-        </w:rPr>
-      </w:pPr>
-      <w:r>
-        <w:rPr>
-          <w:rFonts w:ascii="Arial" w:eastAsia="Times New Roman" w:hAnsi="Arial" w:cs="Arial"/>
-          <w:sz w:val="24"/>
-          <w:szCs w:val="24"/>
-          <w:lang w:eastAsia="es-GT"/>
-        </w:rPr>
-        <w:t>insert into Empleado (nombreEmpleado, apellidoEmpleado, telefonoEmpleado, correoEmpleado, cargo, fechaContratacion, estado)values ('María', 'Sánchez', '555-4321', 'mariasanchez@gmail.com', 'Diseñadora', '2023-01-10', 'Activo');</w:t>
-      </w:r>
-    </w:p>
-    <w:p>
-      <w:pPr>
-        <w:spacing w:before="100" w:beforeAutospacing="1" w:after="100" w:afterAutospacing="1" w:line="240" w:lineRule="auto"/>
-        <w:rPr>
-          <w:rFonts w:ascii="Arial" w:eastAsia="Times New Roman" w:hAnsi="Arial" w:cs="Arial"/>
-          <w:sz w:val="24"/>
-          <w:szCs w:val="24"/>
-          <w:lang w:eastAsia="es-GT"/>
-        </w:rPr>
-      </w:pPr>
-      <w:r>
-        <w:rPr>
-          <w:rFonts w:ascii="Arial" w:eastAsia="Times New Roman" w:hAnsi="Arial" w:cs="Arial"/>
-          <w:sz w:val="24"/>
-          <w:szCs w:val="24"/>
-          <w:lang w:eastAsia="es-GT"/>
-        </w:rPr>
-        <w:t>insert into Empleado (nombreEmpleado, apellidoEmpleado, telefonoEmpleado, correoEmpleado, cargo, fechaContratacion, estado)values ('Luis', 'Martínez', '555-6789', 'luismartinez@gmail.com', 'Administrador de Sistemas', '2022-05-05', 'Activo');</w:t>
+        <w:t>insert into Empleado (nombres, apellidos, telefono, correo, cargo, fechaContratacion, estado)values ('Juan', 'Pérez', '555-1234', 'juanperez@gmail.com', 'Desarrollador', '2022-03-15', 'Activo');</w:t>
+      </w:r>
+    </w:p>
+    <w:p>
+      <w:pPr>
+        <w:spacing w:before="100" w:beforeAutospacing="1" w:after="100" w:afterAutospacing="1" w:line="240" w:lineRule="auto"/>
+        <w:rPr>
+          <w:rFonts w:ascii="Arial" w:eastAsia="Times New Roman" w:hAnsi="Arial" w:cs="Arial"/>
+          <w:sz w:val="24"/>
+          <w:szCs w:val="24"/>
+          <w:lang w:eastAsia="es-GT"/>
+        </w:rPr>
+      </w:pPr>
+      <w:r>
+        <w:rPr>
+          <w:rFonts w:ascii="Arial" w:eastAsia="Times New Roman" w:hAnsi="Arial" w:cs="Arial"/>
+          <w:sz w:val="24"/>
+          <w:szCs w:val="24"/>
+          <w:lang w:eastAsia="es-GT"/>
+        </w:rPr>
+        <w:t>insert into Empleado (nombres, apellidos, telefono, correo, cargo, fechaContratacion, estado)values ('Ana', 'Gómez', '555-5678', 'anagomez@gmail.com', 'Analista de Datos', '2021-07-20', 'Activo');</w:t>
+      </w:r>
+    </w:p>
+    <w:p>
+      <w:pPr>
+        <w:spacing w:before="100" w:beforeAutospacing="1" w:after="100" w:afterAutospacing="1" w:line="240" w:lineRule="auto"/>
+        <w:rPr>
+          <w:rFonts w:ascii="Arial" w:eastAsia="Times New Roman" w:hAnsi="Arial" w:cs="Arial"/>
+          <w:sz w:val="24"/>
+          <w:szCs w:val="24"/>
+          <w:lang w:eastAsia="es-GT"/>
+        </w:rPr>
+      </w:pPr>
+      <w:r>
+        <w:rPr>
+          <w:rFonts w:ascii="Arial" w:eastAsia="Times New Roman" w:hAnsi="Arial" w:cs="Arial"/>
+          <w:sz w:val="24"/>
+          <w:szCs w:val="24"/>
+          <w:lang w:eastAsia="es-GT"/>
+        </w:rPr>
+        <w:t>insert into Empleado (nombres, apellidos, telefono, correo, cargo, fechaContratacion, estado)values ('Carlos', 'López', '555-8765', 'carloslopez@gmail.com', 'Gerente de Proyecto', '2020-11-01', 'Activo');</w:t>
+      </w:r>
+    </w:p>
+    <w:p>
+      <w:pPr>
+        <w:spacing w:before="100" w:beforeAutospacing="1" w:after="100" w:afterAutospacing="1" w:line="240" w:lineRule="auto"/>
+        <w:rPr>
+          <w:rFonts w:ascii="Arial" w:eastAsia="Times New Roman" w:hAnsi="Arial" w:cs="Arial"/>
+          <w:sz w:val="24"/>
+          <w:szCs w:val="24"/>
+          <w:lang w:eastAsia="es-GT"/>
+        </w:rPr>
+      </w:pPr>
+      <w:r>
+        <w:rPr>
+          <w:rFonts w:ascii="Arial" w:eastAsia="Times New Roman" w:hAnsi="Arial" w:cs="Arial"/>
+          <w:sz w:val="24"/>
+          <w:szCs w:val="24"/>
+          <w:lang w:eastAsia="es-GT"/>
+        </w:rPr>
+        <w:t>insert into Empleado (nombres, apellidos, telefono, correo, cargo, fechaContratacion, estado)values ('María', 'Sánchez', '555-4321', 'mariasanchez@gmail.com', 'Diseñadora', '2023-01-10', 'Activo');</w:t>
+      </w:r>
+    </w:p>
+    <w:p>
+      <w:pPr>
+        <w:spacing w:before="100" w:beforeAutospacing="1" w:after="100" w:afterAutospacing="1" w:line="240" w:lineRule="auto"/>
+        <w:rPr>
+          <w:rFonts w:ascii="Arial" w:eastAsia="Times New Roman" w:hAnsi="Arial" w:cs="Arial"/>
+          <w:sz w:val="24"/>
+          <w:szCs w:val="24"/>
+          <w:lang w:eastAsia="es-GT"/>
+        </w:rPr>
+      </w:pPr>
+      <w:r>
+        <w:rPr>
+          <w:rFonts w:ascii="Arial" w:eastAsia="Times New Roman" w:hAnsi="Arial" w:cs="Arial"/>
+          <w:sz w:val="24"/>
+          <w:szCs w:val="24"/>
+          <w:lang w:eastAsia="es-GT"/>
+        </w:r